<commit_message>
diario giornaliero e aggiornamento gantt
</commit_message>
<xml_diff>
--- a/4_Diari/Diario.docx
+++ b/4_Diari/Diario.docx
@@ -193,7 +193,21 @@
               <w:rPr>
                 <w:rFonts w:ascii="Arial" w:hAnsi="Arial" w:cs="Arial"/>
               </w:rPr>
-              <w:t>Riflettuto sui requisiti e user story del gioco, creato i primi template per gantt e diario</w:t>
+              <w:t xml:space="preserve">Riflettuto sui requisiti e user story del gioco, creato i primi template per </w:t>
+            </w:r>
+            <w:proofErr w:type="spellStart"/>
+            <w:r>
+              <w:rPr>
+                <w:rFonts w:ascii="Arial" w:hAnsi="Arial" w:cs="Arial"/>
+              </w:rPr>
+              <w:t>gantt</w:t>
+            </w:r>
+            <w:proofErr w:type="spellEnd"/>
+            <w:r>
+              <w:rPr>
+                <w:rFonts w:ascii="Arial" w:hAnsi="Arial" w:cs="Arial"/>
+              </w:rPr>
+              <w:t xml:space="preserve"> e diario</w:t>
             </w:r>
           </w:p>
         </w:tc>
@@ -234,13 +248,21 @@
               <w:rPr>
                 <w:rFonts w:ascii="Arial" w:hAnsi="Arial" w:cs="Arial"/>
               </w:rPr>
-              <w:t>Riflettuto sui requisiti e user story del gioco</w:t>
+              <w:t xml:space="preserve">Riflettuto sui requisiti e user story del gioco, iniziato scrittura documentazione e sincronizzazione progetto a </w:t>
             </w:r>
+            <w:proofErr w:type="spellStart"/>
             <w:r>
               <w:rPr>
                 <w:rFonts w:ascii="Arial" w:hAnsi="Arial" w:cs="Arial"/>
               </w:rPr>
-              <w:t>, iniziato scrittura documentazione e sincronizzazione progetto a GitLab.</w:t>
+              <w:t>GitLab</w:t>
+            </w:r>
+            <w:proofErr w:type="spellEnd"/>
+            <w:r>
+              <w:rPr>
+                <w:rFonts w:ascii="Arial" w:hAnsi="Arial" w:cs="Arial"/>
+              </w:rPr>
+              <w:t>.</w:t>
             </w:r>
           </w:p>
         </w:tc>
@@ -681,7 +703,25 @@
               <w:b/>
               <w:bCs/>
             </w:rPr>
-            <w:t>Nomi AI utilizzati</w:t>
+            <w:t xml:space="preserve">Nomi </w:t>
+          </w:r>
+          <w:proofErr w:type="gramStart"/>
+          <w:r>
+            <w:rPr>
+              <w:rStyle w:val="Testosegnaposto"/>
+              <w:b/>
+              <w:bCs/>
+            </w:rPr>
+            <w:t>AI</w:t>
+          </w:r>
+          <w:proofErr w:type="gramEnd"/>
+          <w:r>
+            <w:rPr>
+              <w:rStyle w:val="Testosegnaposto"/>
+              <w:b/>
+              <w:bCs/>
+            </w:rPr>
+            <w:t xml:space="preserve"> utilizzati</w:t>
           </w:r>
         </w:sdtContent>
       </w:sdt>
@@ -1308,6 +1348,1327 @@
         </w:p>
       </w:sdtContent>
     </w:sdt>
+    <w:p>
+      <w:pPr>
+        <w:rPr>
+          <w:rFonts w:ascii="Arial" w:hAnsi="Arial" w:cs="Arial"/>
+        </w:rPr>
+      </w:pPr>
+      <w:r>
+        <w:rPr>
+          <w:rFonts w:ascii="Arial" w:hAnsi="Arial" w:cs="Arial"/>
+        </w:rPr>
+        <w:br w:type="page"/>
+      </w:r>
+    </w:p>
+    <w:tbl>
+      <w:tblPr>
+        <w:tblStyle w:val="Grigliatabella"/>
+        <w:tblW w:w="5000" w:type="pct"/>
+        <w:tblLook w:val="04A0" w:firstRow="1" w:lastRow="0" w:firstColumn="1" w:lastColumn="0" w:noHBand="0" w:noVBand="1"/>
+      </w:tblPr>
+      <w:tblGrid>
+        <w:gridCol w:w="2407"/>
+        <w:gridCol w:w="7221"/>
+      </w:tblGrid>
+      <w:tr>
+        <w:trPr>
+          <w:trHeight w:val="199"/>
+        </w:trPr>
+        <w:tc>
+          <w:tcPr>
+            <w:tcW w:w="1250" w:type="pct"/>
+            <w:vAlign w:val="center"/>
+          </w:tcPr>
+          <w:p>
+            <w:pPr>
+              <w:rPr>
+                <w:rFonts w:ascii="Arial" w:hAnsi="Arial" w:cs="Arial"/>
+              </w:rPr>
+            </w:pPr>
+            <w:r>
+              <w:rPr>
+                <w:rFonts w:ascii="Arial" w:hAnsi="Arial" w:cs="Arial"/>
+              </w:rPr>
+              <w:lastRenderedPageBreak/>
+              <w:t>Luogo</w:t>
+            </w:r>
+          </w:p>
+        </w:tc>
+        <w:tc>
+          <w:tcPr>
+            <w:tcW w:w="3750" w:type="pct"/>
+            <w:vAlign w:val="center"/>
+          </w:tcPr>
+          <w:p>
+            <w:pPr>
+              <w:rPr>
+                <w:rFonts w:ascii="Arial" w:hAnsi="Arial" w:cs="Arial"/>
+              </w:rPr>
+            </w:pPr>
+            <w:r>
+              <w:rPr>
+                <w:rFonts w:ascii="Arial" w:hAnsi="Arial" w:cs="Arial"/>
+              </w:rPr>
+              <w:t>Scuola Arti e Mestieri Trevano</w:t>
+            </w:r>
+          </w:p>
+        </w:tc>
+      </w:tr>
+      <w:tr>
+        <w:trPr>
+          <w:trHeight w:val="196"/>
+        </w:trPr>
+        <w:tc>
+          <w:tcPr>
+            <w:tcW w:w="1250" w:type="pct"/>
+            <w:vAlign w:val="center"/>
+          </w:tcPr>
+          <w:p>
+            <w:pPr>
+              <w:rPr>
+                <w:rFonts w:ascii="Arial" w:hAnsi="Arial" w:cs="Arial"/>
+              </w:rPr>
+            </w:pPr>
+            <w:r>
+              <w:rPr>
+                <w:rFonts w:ascii="Arial" w:hAnsi="Arial" w:cs="Arial"/>
+              </w:rPr>
+              <w:t>Data</w:t>
+            </w:r>
+          </w:p>
+        </w:tc>
+        <w:tc>
+          <w:tcPr>
+            <w:tcW w:w="3750" w:type="pct"/>
+            <w:vAlign w:val="center"/>
+          </w:tcPr>
+          <w:p>
+            <w:pPr>
+              <w:rPr>
+                <w:rFonts w:ascii="Arial" w:hAnsi="Arial" w:cs="Arial"/>
+              </w:rPr>
+            </w:pPr>
+            <w:r>
+              <w:rPr>
+                <w:rFonts w:ascii="Arial" w:hAnsi="Arial" w:cs="Arial"/>
+              </w:rPr>
+              <w:t>0</w:t>
+            </w:r>
+            <w:r>
+              <w:rPr>
+                <w:rFonts w:ascii="Arial" w:hAnsi="Arial" w:cs="Arial"/>
+              </w:rPr>
+              <w:t>8</w:t>
+            </w:r>
+            <w:r>
+              <w:rPr>
+                <w:rFonts w:ascii="Arial" w:hAnsi="Arial" w:cs="Arial"/>
+              </w:rPr>
+              <w:t>.09.2026</w:t>
+            </w:r>
+          </w:p>
+        </w:tc>
+      </w:tr>
+    </w:tbl>
+    <w:p>
+      <w:pPr>
+        <w:rPr>
+          <w:rFonts w:ascii="Arial" w:hAnsi="Arial" w:cs="Arial"/>
+        </w:rPr>
+      </w:pPr>
+    </w:p>
+    <w:tbl>
+      <w:tblPr>
+        <w:tblStyle w:val="Grigliatabella"/>
+        <w:tblW w:w="0" w:type="auto"/>
+        <w:tblLook w:val="04A0" w:firstRow="1" w:lastRow="0" w:firstColumn="1" w:lastColumn="0" w:noHBand="0" w:noVBand="1"/>
+      </w:tblPr>
+      <w:tblGrid>
+        <w:gridCol w:w="1271"/>
+        <w:gridCol w:w="8357"/>
+      </w:tblGrid>
+      <w:tr>
+        <w:tc>
+          <w:tcPr>
+            <w:tcW w:w="9628" w:type="dxa"/>
+            <w:gridSpan w:val="2"/>
+            <w:shd w:val="clear" w:color="auto" w:fill="D9D9D9" w:themeFill="background1" w:themeFillShade="D9"/>
+          </w:tcPr>
+          <w:p>
+            <w:pPr>
+              <w:rPr>
+                <w:rFonts w:ascii="Arial" w:hAnsi="Arial" w:cs="Arial"/>
+              </w:rPr>
+            </w:pPr>
+            <w:r>
+              <w:rPr>
+                <w:rFonts w:ascii="Arial" w:hAnsi="Arial" w:cs="Arial"/>
+              </w:rPr>
+              <w:t>Lavori svolti</w:t>
+            </w:r>
+          </w:p>
+        </w:tc>
+      </w:tr>
+      <w:tr>
+        <w:tc>
+          <w:tcPr>
+            <w:tcW w:w="1271" w:type="dxa"/>
+          </w:tcPr>
+          <w:p>
+            <w:pPr>
+              <w:rPr>
+                <w:rFonts w:ascii="Arial" w:hAnsi="Arial" w:cs="Arial"/>
+              </w:rPr>
+            </w:pPr>
+            <w:r>
+              <w:rPr>
+                <w:rFonts w:ascii="Arial" w:hAnsi="Arial" w:cs="Arial"/>
+              </w:rPr>
+              <w:t>Riley</w:t>
+            </w:r>
+          </w:p>
+        </w:tc>
+        <w:tc>
+          <w:tcPr>
+            <w:tcW w:w="8357" w:type="dxa"/>
+          </w:tcPr>
+          <w:p>
+            <w:pPr>
+              <w:rPr>
+                <w:rFonts w:ascii="Arial" w:hAnsi="Arial" w:cs="Arial"/>
+              </w:rPr>
+            </w:pPr>
+            <w:r>
+              <w:rPr>
+                <w:rFonts w:ascii="Arial" w:hAnsi="Arial" w:cs="Arial"/>
+              </w:rPr>
+              <w:t>Completamento raccolta e analisi requisiti</w:t>
+            </w:r>
+          </w:p>
+        </w:tc>
+      </w:tr>
+      <w:tr>
+        <w:tc>
+          <w:tcPr>
+            <w:tcW w:w="1271" w:type="dxa"/>
+          </w:tcPr>
+          <w:p>
+            <w:pPr>
+              <w:rPr>
+                <w:rFonts w:ascii="Arial" w:hAnsi="Arial" w:cs="Arial"/>
+              </w:rPr>
+            </w:pPr>
+            <w:r>
+              <w:rPr>
+                <w:rFonts w:ascii="Arial" w:hAnsi="Arial" w:cs="Arial"/>
+              </w:rPr>
+              <w:t>Bryan</w:t>
+            </w:r>
+          </w:p>
+        </w:tc>
+        <w:tc>
+          <w:tcPr>
+            <w:tcW w:w="8357" w:type="dxa"/>
+          </w:tcPr>
+          <w:p>
+            <w:pPr>
+              <w:rPr>
+                <w:rFonts w:ascii="Arial" w:hAnsi="Arial" w:cs="Arial"/>
+              </w:rPr>
+            </w:pPr>
+            <w:r>
+              <w:rPr>
+                <w:rFonts w:ascii="Arial" w:hAnsi="Arial" w:cs="Arial"/>
+              </w:rPr>
+              <w:t>Completamento raccolta e analisi requisiti</w:t>
+            </w:r>
+          </w:p>
+        </w:tc>
+      </w:tr>
+    </w:tbl>
+    <w:p>
+      <w:pPr>
+        <w:rPr>
+          <w:rFonts w:ascii="Arial" w:hAnsi="Arial" w:cs="Arial"/>
+        </w:rPr>
+      </w:pPr>
+    </w:p>
+    <w:tbl>
+      <w:tblPr>
+        <w:tblStyle w:val="Grigliatabella"/>
+        <w:tblW w:w="0" w:type="auto"/>
+        <w:tblInd w:w="-5" w:type="dxa"/>
+        <w:tblLook w:val="04A0" w:firstRow="1" w:lastRow="0" w:firstColumn="1" w:lastColumn="0" w:noHBand="0" w:noVBand="1"/>
+      </w:tblPr>
+      <w:tblGrid>
+        <w:gridCol w:w="1276"/>
+        <w:gridCol w:w="8357"/>
+      </w:tblGrid>
+      <w:tr>
+        <w:tc>
+          <w:tcPr>
+            <w:tcW w:w="9628" w:type="dxa"/>
+            <w:gridSpan w:val="2"/>
+            <w:shd w:val="clear" w:color="auto" w:fill="D9D9D9" w:themeFill="background1" w:themeFillShade="D9"/>
+          </w:tcPr>
+          <w:p>
+            <w:pPr>
+              <w:rPr>
+                <w:rFonts w:ascii="Arial" w:hAnsi="Arial" w:cs="Arial"/>
+              </w:rPr>
+            </w:pPr>
+            <w:r>
+              <w:rPr>
+                <w:rFonts w:ascii="Arial" w:hAnsi="Arial" w:cs="Arial"/>
+              </w:rPr>
+              <w:t>Problemi riscontrati e soluzioni adottate</w:t>
+            </w:r>
+          </w:p>
+        </w:tc>
+      </w:tr>
+      <w:tr>
+        <w:tc>
+          <w:tcPr>
+            <w:tcW w:w="1276" w:type="dxa"/>
+          </w:tcPr>
+          <w:p>
+            <w:pPr>
+              <w:rPr>
+                <w:rFonts w:ascii="Arial" w:hAnsi="Arial" w:cs="Arial"/>
+              </w:rPr>
+            </w:pPr>
+            <w:r>
+              <w:rPr>
+                <w:rFonts w:ascii="Arial" w:hAnsi="Arial" w:cs="Arial"/>
+              </w:rPr>
+              <w:t>Riley</w:t>
+            </w:r>
+          </w:p>
+        </w:tc>
+        <w:tc>
+          <w:tcPr>
+            <w:tcW w:w="8357" w:type="dxa"/>
+          </w:tcPr>
+          <w:p>
+            <w:pPr>
+              <w:rPr>
+                <w:rFonts w:ascii="Arial" w:hAnsi="Arial" w:cs="Arial"/>
+              </w:rPr>
+            </w:pPr>
+            <w:r>
+              <w:rPr>
+                <w:rFonts w:ascii="Arial" w:hAnsi="Arial" w:cs="Arial"/>
+              </w:rPr>
+              <w:t>-</w:t>
+            </w:r>
+          </w:p>
+        </w:tc>
+      </w:tr>
+      <w:tr>
+        <w:tc>
+          <w:tcPr>
+            <w:tcW w:w="1276" w:type="dxa"/>
+          </w:tcPr>
+          <w:p>
+            <w:pPr>
+              <w:rPr>
+                <w:rFonts w:ascii="Arial" w:hAnsi="Arial" w:cs="Arial"/>
+              </w:rPr>
+            </w:pPr>
+            <w:r>
+              <w:rPr>
+                <w:rFonts w:ascii="Arial" w:hAnsi="Arial" w:cs="Arial"/>
+              </w:rPr>
+              <w:t>Bryan</w:t>
+            </w:r>
+          </w:p>
+        </w:tc>
+        <w:tc>
+          <w:tcPr>
+            <w:tcW w:w="8357" w:type="dxa"/>
+          </w:tcPr>
+          <w:p>
+            <w:pPr>
+              <w:rPr>
+                <w:rFonts w:ascii="Arial" w:hAnsi="Arial" w:cs="Arial"/>
+              </w:rPr>
+            </w:pPr>
+            <w:r>
+              <w:rPr>
+                <w:rFonts w:ascii="Arial" w:hAnsi="Arial" w:cs="Arial"/>
+              </w:rPr>
+              <w:t>-</w:t>
+            </w:r>
+          </w:p>
+        </w:tc>
+      </w:tr>
+    </w:tbl>
+    <w:p>
+      <w:pPr>
+        <w:rPr>
+          <w:rFonts w:ascii="Arial" w:hAnsi="Arial" w:cs="Arial"/>
+        </w:rPr>
+      </w:pPr>
+    </w:p>
+    <w:tbl>
+      <w:tblPr>
+        <w:tblStyle w:val="Grigliatabella"/>
+        <w:tblW w:w="0" w:type="auto"/>
+        <w:tblLook w:val="04A0" w:firstRow="1" w:lastRow="0" w:firstColumn="1" w:lastColumn="0" w:noHBand="0" w:noVBand="1"/>
+      </w:tblPr>
+      <w:tblGrid>
+        <w:gridCol w:w="9628"/>
+      </w:tblGrid>
+      <w:tr>
+        <w:tc>
+          <w:tcPr>
+            <w:tcW w:w="9854" w:type="dxa"/>
+            <w:shd w:val="clear" w:color="auto" w:fill="D9D9D9" w:themeFill="background1" w:themeFillShade="D9"/>
+          </w:tcPr>
+          <w:p>
+            <w:pPr>
+              <w:rPr>
+                <w:rFonts w:ascii="Arial" w:hAnsi="Arial" w:cs="Arial"/>
+              </w:rPr>
+            </w:pPr>
+            <w:r>
+              <w:rPr>
+                <w:rFonts w:ascii="Arial" w:hAnsi="Arial" w:cs="Arial"/>
+              </w:rPr>
+              <w:t>Punto della situazione rispetto alla pianificazione</w:t>
+            </w:r>
+          </w:p>
+        </w:tc>
+      </w:tr>
+      <w:tr>
+        <w:tc>
+          <w:tcPr>
+            <w:tcW w:w="9854" w:type="dxa"/>
+          </w:tcPr>
+          <w:p>
+            <w:pPr>
+              <w:rPr>
+                <w:rFonts w:ascii="Arial" w:hAnsi="Arial" w:cs="Arial"/>
+              </w:rPr>
+            </w:pPr>
+            <w:r>
+              <w:rPr>
+                <w:rFonts w:ascii="Arial" w:hAnsi="Arial" w:cs="Arial"/>
+              </w:rPr>
+              <w:t>-</w:t>
+            </w:r>
+          </w:p>
+        </w:tc>
+      </w:tr>
+    </w:tbl>
+    <w:p>
+      <w:pPr>
+        <w:rPr>
+          <w:rFonts w:ascii="Arial" w:hAnsi="Arial" w:cs="Arial"/>
+        </w:rPr>
+      </w:pPr>
+    </w:p>
+    <w:tbl>
+      <w:tblPr>
+        <w:tblStyle w:val="Grigliatabella"/>
+        <w:tblW w:w="0" w:type="auto"/>
+        <w:tblLook w:val="04A0" w:firstRow="1" w:lastRow="0" w:firstColumn="1" w:lastColumn="0" w:noHBand="0" w:noVBand="1"/>
+      </w:tblPr>
+      <w:tblGrid>
+        <w:gridCol w:w="9628"/>
+      </w:tblGrid>
+      <w:tr>
+        <w:tc>
+          <w:tcPr>
+            <w:tcW w:w="9854" w:type="dxa"/>
+            <w:shd w:val="clear" w:color="auto" w:fill="D9D9D9" w:themeFill="background1" w:themeFillShade="D9"/>
+          </w:tcPr>
+          <w:p>
+            <w:pPr>
+              <w:rPr>
+                <w:rFonts w:ascii="Arial" w:hAnsi="Arial" w:cs="Arial"/>
+              </w:rPr>
+            </w:pPr>
+            <w:r>
+              <w:rPr>
+                <w:rFonts w:ascii="Arial" w:hAnsi="Arial" w:cs="Arial"/>
+              </w:rPr>
+              <w:t>Programma di massima per la prossima giornata di lavoro</w:t>
+            </w:r>
+          </w:p>
+        </w:tc>
+      </w:tr>
+      <w:tr>
+        <w:tc>
+          <w:tcPr>
+            <w:tcW w:w="9854" w:type="dxa"/>
+          </w:tcPr>
+          <w:p>
+            <w:pPr>
+              <w:rPr>
+                <w:rFonts w:ascii="Arial" w:hAnsi="Arial" w:cs="Arial"/>
+              </w:rPr>
+            </w:pPr>
+            <w:r>
+              <w:rPr>
+                <w:rFonts w:ascii="Arial" w:hAnsi="Arial" w:cs="Arial"/>
+              </w:rPr>
+              <w:t xml:space="preserve">Iniziare e completare analisi dei mezzi, creare </w:t>
+            </w:r>
+            <w:proofErr w:type="gramStart"/>
+            <w:r>
+              <w:rPr>
+                <w:rFonts w:ascii="Arial" w:hAnsi="Arial" w:cs="Arial"/>
+              </w:rPr>
+              <w:t>lo use</w:t>
+            </w:r>
+            <w:proofErr w:type="gramEnd"/>
+            <w:r>
+              <w:rPr>
+                <w:rFonts w:ascii="Arial" w:hAnsi="Arial" w:cs="Arial"/>
+              </w:rPr>
+              <w:t xml:space="preserve"> case</w:t>
+            </w:r>
+            <w:r>
+              <w:rPr>
+                <w:rFonts w:ascii="Arial" w:hAnsi="Arial" w:cs="Arial"/>
+              </w:rPr>
+              <w:t xml:space="preserve"> e schema ER</w:t>
+            </w:r>
+          </w:p>
+        </w:tc>
+      </w:tr>
+    </w:tbl>
+    <w:p>
+      <w:pPr>
+        <w:rPr>
+          <w:rFonts w:ascii="Arial" w:hAnsi="Arial" w:cs="Arial"/>
+        </w:rPr>
+      </w:pPr>
+    </w:p>
+    <w:p>
+      <w:pPr>
+        <w:rPr>
+          <w:rFonts w:ascii="Arial" w:hAnsi="Arial" w:cs="Arial"/>
+        </w:rPr>
+      </w:pPr>
+      <w:r>
+        <w:rPr>
+          <w:rFonts w:ascii="Arial" w:hAnsi="Arial" w:cs="Arial"/>
+        </w:rPr>
+        <w:br w:type="page"/>
+      </w:r>
+    </w:p>
+    <w:p>
+      <w:pPr>
+        <w:pStyle w:val="Titolo2"/>
+        <w:pBdr>
+          <w:bottom w:val="single" w:sz="4" w:space="1" w:color="auto"/>
+        </w:pBdr>
+      </w:pPr>
+      <w:r>
+        <w:lastRenderedPageBreak/>
+        <w:t>Utilizzo Intelligenza Artificiale</w:t>
+      </w:r>
+      <w:r>
+        <w:t xml:space="preserve"> nella giornata</w:t>
+      </w:r>
+    </w:p>
+    <w:p>
+      <w:pPr>
+        <w:pStyle w:val="Nessunaspaziatura"/>
+        <w:rPr>
+          <w:rFonts w:ascii="Arial" w:hAnsi="Arial" w:cs="Arial"/>
+          <w:b/>
+          <w:bCs/>
+        </w:rPr>
+      </w:pPr>
+    </w:p>
+    <w:p>
+      <w:pPr>
+        <w:pStyle w:val="Nessunaspaziatura"/>
+        <w:rPr>
+          <w:rFonts w:ascii="Arial" w:hAnsi="Arial" w:cs="Arial"/>
+        </w:rPr>
+      </w:pPr>
+      <w:sdt>
+        <w:sdtPr>
+          <w:rPr>
+            <w:rFonts w:ascii="Segoe UI Symbol" w:hAnsi="Segoe UI Symbol" w:cs="Segoe UI Symbol"/>
+          </w:rPr>
+          <w:id w:val="1627131432"/>
+          <w14:checkbox>
+            <w14:checked w14:val="0"/>
+            <w14:checkedState w14:val="2612" w14:font="MS Gothic"/>
+            <w14:uncheckedState w14:val="2610" w14:font="MS Gothic"/>
+          </w14:checkbox>
+        </w:sdtPr>
+        <w:sdtContent>
+          <w:r>
+            <w:rPr>
+              <w:rFonts w:ascii="MS Gothic" w:eastAsia="MS Gothic" w:hAnsi="MS Gothic" w:cs="Segoe UI Symbol" w:hint="eastAsia"/>
+            </w:rPr>
+            <w:t>☐</w:t>
+          </w:r>
+        </w:sdtContent>
+      </w:sdt>
+      <w:r>
+        <w:rPr>
+          <w:rFonts w:ascii="Arial" w:hAnsi="Arial" w:cs="Arial"/>
+        </w:rPr>
+        <w:t xml:space="preserve"> Nessuno</w:t>
+      </w:r>
+      <w:r>
+        <w:br/>
+      </w:r>
+      <w:sdt>
+        <w:sdtPr>
+          <w:rPr>
+            <w:rFonts w:ascii="Segoe UI Symbol" w:hAnsi="Segoe UI Symbol" w:cs="Segoe UI Symbol"/>
+          </w:rPr>
+          <w:id w:val="1878579272"/>
+          <w14:checkbox>
+            <w14:checked w14:val="1"/>
+            <w14:checkedState w14:val="2612" w14:font="MS Gothic"/>
+            <w14:uncheckedState w14:val="2610" w14:font="MS Gothic"/>
+          </w14:checkbox>
+        </w:sdtPr>
+        <w:sdtContent>
+          <w:r>
+            <w:rPr>
+              <w:rFonts w:ascii="MS Gothic" w:eastAsia="MS Gothic" w:hAnsi="MS Gothic" w:cs="Segoe UI Symbol" w:hint="eastAsia"/>
+            </w:rPr>
+            <w:t>☒</w:t>
+          </w:r>
+        </w:sdtContent>
+      </w:sdt>
+      <w:r>
+        <w:rPr>
+          <w:rFonts w:ascii="Arial" w:hAnsi="Arial" w:cs="Arial"/>
+        </w:rPr>
+        <w:t xml:space="preserve"> Occasionale</w:t>
+      </w:r>
+      <w:r>
+        <w:br/>
+      </w:r>
+      <w:sdt>
+        <w:sdtPr>
+          <w:rPr>
+            <w:rFonts w:ascii="Segoe UI Symbol" w:hAnsi="Segoe UI Symbol" w:cs="Segoe UI Symbol"/>
+          </w:rPr>
+          <w:id w:val="-1637718771"/>
+          <w14:checkbox>
+            <w14:checked w14:val="0"/>
+            <w14:checkedState w14:val="2612" w14:font="MS Gothic"/>
+            <w14:uncheckedState w14:val="2610" w14:font="MS Gothic"/>
+          </w14:checkbox>
+        </w:sdtPr>
+        <w:sdtContent>
+          <w:r>
+            <w:rPr>
+              <w:rFonts w:ascii="MS Gothic" w:eastAsia="MS Gothic" w:hAnsi="MS Gothic" w:cs="Segoe UI Symbol"/>
+            </w:rPr>
+            <w:t>☐</w:t>
+          </w:r>
+        </w:sdtContent>
+      </w:sdt>
+      <w:r>
+        <w:rPr>
+          <w:rFonts w:ascii="Arial" w:hAnsi="Arial" w:cs="Arial"/>
+        </w:rPr>
+        <w:t xml:space="preserve"> Frequente</w:t>
+      </w:r>
+    </w:p>
+    <w:p>
+      <w:pPr>
+        <w:pStyle w:val="Nessunaspaziatura"/>
+        <w:rPr>
+          <w:rFonts w:ascii="Arial" w:hAnsi="Arial" w:cs="Arial"/>
+        </w:rPr>
+      </w:pPr>
+    </w:p>
+    <w:p>
+      <w:pPr>
+        <w:pStyle w:val="Nessunaspaziatura"/>
+        <w:spacing w:line="276" w:lineRule="auto"/>
+        <w:rPr>
+          <w:rFonts w:ascii="Arial" w:hAnsi="Arial" w:cs="Arial"/>
+        </w:rPr>
+      </w:pPr>
+      <w:r>
+        <w:rPr>
+          <w:rFonts w:ascii="Arial" w:hAnsi="Arial" w:cs="Arial"/>
+          <w:b/>
+          <w:bCs/>
+        </w:rPr>
+        <w:t>Strumento/i utilizzato/i</w:t>
+      </w:r>
+      <w:r>
+        <w:rPr>
+          <w:rFonts w:ascii="Arial" w:hAnsi="Arial" w:cs="Arial"/>
+          <w:b/>
+          <w:bCs/>
+        </w:rPr>
+        <w:t xml:space="preserve"> </w:t>
+      </w:r>
+      <w:r>
+        <w:rPr>
+          <w:rFonts w:ascii="Arial" w:hAnsi="Arial" w:cs="Arial"/>
+        </w:rPr>
+        <w:t>(es. ChatGPT)</w:t>
+      </w:r>
+      <w:r>
+        <w:rPr>
+          <w:rFonts w:ascii="Arial" w:hAnsi="Arial" w:cs="Arial"/>
+        </w:rPr>
+        <w:t xml:space="preserve">: </w:t>
+      </w:r>
+      <w:sdt>
+        <w:sdtPr>
+          <w:rPr>
+            <w:rFonts w:ascii="Arial" w:hAnsi="Arial" w:cs="Arial"/>
+          </w:rPr>
+          <w:id w:val="242159615"/>
+          <w:placeholder>
+            <w:docPart w:val="1CBF60CF0E11475D8F54CEAAE596C311"/>
+          </w:placeholder>
+          <w:showingPlcHdr/>
+        </w:sdtPr>
+        <w:sdtContent>
+          <w:r>
+            <w:rPr>
+              <w:rStyle w:val="Testosegnaposto"/>
+              <w:b/>
+              <w:bCs/>
+            </w:rPr>
+            <w:t xml:space="preserve">Nomi </w:t>
+          </w:r>
+          <w:proofErr w:type="gramStart"/>
+          <w:r>
+            <w:rPr>
+              <w:rStyle w:val="Testosegnaposto"/>
+              <w:b/>
+              <w:bCs/>
+            </w:rPr>
+            <w:t>AI</w:t>
+          </w:r>
+          <w:proofErr w:type="gramEnd"/>
+          <w:r>
+            <w:rPr>
+              <w:rStyle w:val="Testosegnaposto"/>
+              <w:b/>
+              <w:bCs/>
+            </w:rPr>
+            <w:t xml:space="preserve"> utilizzati</w:t>
+          </w:r>
+        </w:sdtContent>
+      </w:sdt>
+    </w:p>
+    <w:p>
+      <w:pPr>
+        <w:pStyle w:val="Nessunaspaziatura"/>
+        <w:rPr>
+          <w:rFonts w:ascii="Arial" w:hAnsi="Arial" w:cs="Arial"/>
+        </w:rPr>
+      </w:pPr>
+    </w:p>
+    <w:p>
+      <w:pPr>
+        <w:pStyle w:val="Nessunaspaziatura"/>
+        <w:rPr>
+          <w:rFonts w:ascii="Arial" w:hAnsi="Arial" w:cs="Arial"/>
+        </w:rPr>
+      </w:pPr>
+      <w:r>
+        <w:rPr>
+          <w:rFonts w:ascii="Arial" w:hAnsi="Arial" w:cs="Arial"/>
+          <w:b/>
+          <w:bCs/>
+        </w:rPr>
+        <w:t>Per cosa l’ho usata oggi</w:t>
+      </w:r>
+      <w:r>
+        <w:br/>
+      </w:r>
+      <w:sdt>
+        <w:sdtPr>
+          <w:rPr>
+            <w:rFonts w:ascii="Segoe UI Symbol" w:hAnsi="Segoe UI Symbol" w:cs="Segoe UI Symbol"/>
+          </w:rPr>
+          <w:id w:val="-373627953"/>
+          <w14:checkbox>
+            <w14:checked w14:val="0"/>
+            <w14:checkedState w14:val="2612" w14:font="MS Gothic"/>
+            <w14:uncheckedState w14:val="2610" w14:font="MS Gothic"/>
+          </w14:checkbox>
+        </w:sdtPr>
+        <w:sdtContent>
+          <w:r>
+            <w:rPr>
+              <w:rFonts w:ascii="MS Gothic" w:eastAsia="MS Gothic" w:hAnsi="MS Gothic" w:cs="MS Gothic"/>
+            </w:rPr>
+            <w:t>☐</w:t>
+          </w:r>
+        </w:sdtContent>
+      </w:sdt>
+      <w:r>
+        <w:rPr>
+          <w:rFonts w:ascii="Arial" w:hAnsi="Arial" w:cs="Arial"/>
+        </w:rPr>
+        <w:t xml:space="preserve"> Chiarire concetti</w:t>
+      </w:r>
+      <w:r>
+        <w:br/>
+      </w:r>
+      <w:sdt>
+        <w:sdtPr>
+          <w:rPr>
+            <w:rFonts w:ascii="Segoe UI Symbol" w:hAnsi="Segoe UI Symbol" w:cs="Segoe UI Symbol"/>
+          </w:rPr>
+          <w:id w:val="-174269808"/>
+          <w14:checkbox>
+            <w14:checked w14:val="0"/>
+            <w14:checkedState w14:val="2612" w14:font="MS Gothic"/>
+            <w14:uncheckedState w14:val="2610" w14:font="MS Gothic"/>
+          </w14:checkbox>
+        </w:sdtPr>
+        <w:sdtContent>
+          <w:r>
+            <w:rPr>
+              <w:rFonts w:ascii="MS Gothic" w:eastAsia="MS Gothic" w:hAnsi="MS Gothic" w:cs="Segoe UI Symbol"/>
+            </w:rPr>
+            <w:t>☐</w:t>
+          </w:r>
+        </w:sdtContent>
+      </w:sdt>
+      <w:r>
+        <w:rPr>
+          <w:rFonts w:ascii="Arial" w:hAnsi="Arial" w:cs="Arial"/>
+        </w:rPr>
+        <w:t xml:space="preserve"> Supporto al codice</w:t>
+      </w:r>
+      <w:r>
+        <w:br/>
+      </w:r>
+      <w:sdt>
+        <w:sdtPr>
+          <w:rPr>
+            <w:rFonts w:ascii="Segoe UI Symbol" w:hAnsi="Segoe UI Symbol" w:cs="Segoe UI Symbol"/>
+          </w:rPr>
+          <w:id w:val="967010255"/>
+          <w14:checkbox>
+            <w14:checked w14:val="0"/>
+            <w14:checkedState w14:val="2612" w14:font="MS Gothic"/>
+            <w14:uncheckedState w14:val="2610" w14:font="MS Gothic"/>
+          </w14:checkbox>
+        </w:sdtPr>
+        <w:sdtContent>
+          <w:r>
+            <w:rPr>
+              <w:rFonts w:ascii="MS Gothic" w:eastAsia="MS Gothic" w:hAnsi="MS Gothic" w:cs="Segoe UI Symbol"/>
+            </w:rPr>
+            <w:t>☐</w:t>
+          </w:r>
+        </w:sdtContent>
+      </w:sdt>
+      <w:r>
+        <w:rPr>
+          <w:rFonts w:ascii="Arial" w:hAnsi="Arial" w:cs="Arial"/>
+        </w:rPr>
+        <w:t xml:space="preserve"> Debug</w:t>
+      </w:r>
+      <w:r>
+        <w:br/>
+      </w:r>
+      <w:sdt>
+        <w:sdtPr>
+          <w:rPr>
+            <w:rFonts w:ascii="Segoe UI Symbol" w:hAnsi="Segoe UI Symbol" w:cs="Segoe UI Symbol"/>
+          </w:rPr>
+          <w:id w:val="-858353239"/>
+          <w14:checkbox>
+            <w14:checked w14:val="1"/>
+            <w14:checkedState w14:val="2612" w14:font="MS Gothic"/>
+            <w14:uncheckedState w14:val="2610" w14:font="MS Gothic"/>
+          </w14:checkbox>
+        </w:sdtPr>
+        <w:sdtContent>
+          <w:r>
+            <w:rPr>
+              <w:rFonts w:ascii="MS Gothic" w:eastAsia="MS Gothic" w:hAnsi="MS Gothic" w:cs="Segoe UI Symbol" w:hint="eastAsia"/>
+            </w:rPr>
+            <w:t>☒</w:t>
+          </w:r>
+        </w:sdtContent>
+      </w:sdt>
+      <w:r>
+        <w:rPr>
+          <w:rFonts w:ascii="Arial" w:hAnsi="Arial" w:cs="Arial"/>
+        </w:rPr>
+        <w:t xml:space="preserve"> Riorganizzare idee / testi</w:t>
+      </w:r>
+      <w:r>
+        <w:br/>
+      </w:r>
+      <w:sdt>
+        <w:sdtPr>
+          <w:rPr>
+            <w:rFonts w:ascii="Segoe UI Symbol" w:hAnsi="Segoe UI Symbol" w:cs="Segoe UI Symbol"/>
+          </w:rPr>
+          <w:id w:val="1860694002"/>
+          <w14:checkbox>
+            <w14:checked w14:val="0"/>
+            <w14:checkedState w14:val="2612" w14:font="MS Gothic"/>
+            <w14:uncheckedState w14:val="2610" w14:font="MS Gothic"/>
+          </w14:checkbox>
+        </w:sdtPr>
+        <w:sdtContent>
+          <w:r>
+            <w:rPr>
+              <w:rFonts w:ascii="MS Gothic" w:eastAsia="MS Gothic" w:hAnsi="MS Gothic" w:cs="Segoe UI Symbol"/>
+            </w:rPr>
+            <w:t>☐</w:t>
+          </w:r>
+        </w:sdtContent>
+      </w:sdt>
+      <w:r>
+        <w:rPr>
+          <w:rFonts w:ascii="Arial" w:hAnsi="Arial" w:cs="Arial"/>
+        </w:rPr>
+        <w:t xml:space="preserve"> Altro: …</w:t>
+      </w:r>
+    </w:p>
+    <w:p>
+      <w:pPr>
+        <w:pStyle w:val="Nessunaspaziatura"/>
+        <w:rPr>
+          <w:rFonts w:ascii="Arial" w:hAnsi="Arial" w:cs="Arial"/>
+        </w:rPr>
+      </w:pPr>
+    </w:p>
+    <w:p>
+      <w:pPr>
+        <w:pStyle w:val="Nessunaspaziatura"/>
+        <w:rPr>
+          <w:rFonts w:ascii="Arial" w:hAnsi="Arial" w:cs="Arial"/>
+          <w:b/>
+          <w:bCs/>
+        </w:rPr>
+      </w:pPr>
+      <w:r>
+        <w:rPr>
+          <w:rFonts w:ascii="Arial" w:hAnsi="Arial" w:cs="Arial"/>
+          <w:b/>
+          <w:bCs/>
+        </w:rPr>
+        <w:t>Esempio significativo di utilizzo (UNO SOLO)</w:t>
+      </w:r>
+    </w:p>
+    <w:p>
+      <w:pPr>
+        <w:pStyle w:val="Nessunaspaziatura"/>
+        <w:rPr>
+          <w:rFonts w:ascii="Arial" w:hAnsi="Arial" w:cs="Arial"/>
+        </w:rPr>
+      </w:pPr>
+      <w:r>
+        <w:rPr>
+          <w:rFonts w:ascii="Arial" w:hAnsi="Arial" w:cs="Arial"/>
+        </w:rPr>
+        <w:t xml:space="preserve">Riporta </w:t>
+      </w:r>
+      <w:r>
+        <w:rPr>
+          <w:rFonts w:ascii="Arial" w:hAnsi="Arial" w:cs="Arial"/>
+          <w:i/>
+          <w:iCs/>
+        </w:rPr>
+        <w:t>un</w:t>
+      </w:r>
+      <w:r>
+        <w:rPr>
+          <w:rFonts w:ascii="Arial" w:hAnsi="Arial" w:cs="Arial"/>
+        </w:rPr>
+        <w:t xml:space="preserve"> prompt rilevante oppure descrivilo a parole se ce ne sono stati molti.</w:t>
+      </w:r>
+    </w:p>
+    <w:p>
+      <w:pPr>
+        <w:pStyle w:val="Nessunaspaziatura"/>
+        <w:rPr>
+          <w:rFonts w:ascii="Arial" w:hAnsi="Arial" w:cs="Arial"/>
+        </w:rPr>
+      </w:pPr>
+    </w:p>
+    <w:sdt>
+      <w:sdtPr>
+        <w:rPr>
+          <w:rFonts w:ascii="Arial" w:hAnsi="Arial" w:cs="Arial"/>
+        </w:rPr>
+        <w:alias w:val="Prompt AI"/>
+        <w:tag w:val="Prompt AI"/>
+        <w:id w:val="-1782097444"/>
+        <w:placeholder>
+          <w:docPart w:val="078549E3A6C34AD59342C9F7BD1E35DA"/>
+        </w:placeholder>
+        <w15:color w:val="C0C0C0"/>
+      </w:sdtPr>
+      <w:sdtContent>
+        <w:p>
+          <w:pPr>
+            <w:pStyle w:val="Nessunaspaziatura"/>
+            <w:spacing w:line="276" w:lineRule="auto"/>
+            <w:rPr>
+              <w:rFonts w:ascii="Arial" w:hAnsi="Arial" w:cs="Arial"/>
+            </w:rPr>
+          </w:pPr>
+          <w:r>
+            <w:rPr>
+              <w:rFonts w:ascii="Arial" w:hAnsi="Arial" w:cs="Arial"/>
+            </w:rPr>
+            <w:t xml:space="preserve">Aitami a generare dei </w:t>
+          </w:r>
+          <w:proofErr w:type="spellStart"/>
+          <w:r>
+            <w:rPr>
+              <w:rFonts w:ascii="Arial" w:hAnsi="Arial" w:cs="Arial"/>
+            </w:rPr>
+            <w:t>requesiti</w:t>
+          </w:r>
+          <w:proofErr w:type="spellEnd"/>
+          <w:r>
+            <w:rPr>
+              <w:rFonts w:ascii="Arial" w:hAnsi="Arial" w:cs="Arial"/>
+            </w:rPr>
+            <w:t xml:space="preserve"> in base ai seguenti dati</w:t>
+          </w:r>
+        </w:p>
+      </w:sdtContent>
+    </w:sdt>
+    <w:p>
+      <w:pPr>
+        <w:pStyle w:val="Nessunaspaziatura"/>
+        <w:rPr>
+          <w:rFonts w:ascii="Arial" w:hAnsi="Arial" w:cs="Arial"/>
+        </w:rPr>
+      </w:pPr>
+    </w:p>
+    <w:p>
+      <w:pPr>
+        <w:pStyle w:val="Nessunaspaziatura"/>
+        <w:rPr>
+          <w:rFonts w:ascii="Arial" w:hAnsi="Arial" w:cs="Arial"/>
+        </w:rPr>
+      </w:pPr>
+    </w:p>
+    <w:p>
+      <w:pPr>
+        <w:pStyle w:val="Nessunaspaziatura"/>
+        <w:rPr>
+          <w:rFonts w:ascii="Arial" w:hAnsi="Arial" w:cs="Arial"/>
+        </w:rPr>
+      </w:pPr>
+      <w:r>
+        <w:rPr>
+          <w:rFonts w:ascii="Arial" w:hAnsi="Arial" w:cs="Arial"/>
+          <w:b/>
+          <w:bCs/>
+        </w:rPr>
+        <w:t>Cosa mi ha dato l’AI</w:t>
+      </w:r>
+    </w:p>
+    <w:p>
+      <w:pPr>
+        <w:pStyle w:val="Nessunaspaziatura"/>
+        <w:rPr>
+          <w:rFonts w:ascii="Arial" w:hAnsi="Arial" w:cs="Arial"/>
+        </w:rPr>
+      </w:pPr>
+      <w:r>
+        <w:rPr>
+          <w:rFonts w:ascii="Arial" w:hAnsi="Arial" w:cs="Arial"/>
+        </w:rPr>
+        <w:t>Spiegazione, esempio, soluzione, suggerimento…</w:t>
+      </w:r>
+    </w:p>
+    <w:p>
+      <w:pPr>
+        <w:pStyle w:val="Nessunaspaziatura"/>
+        <w:rPr>
+          <w:rFonts w:ascii="Arial" w:hAnsi="Arial" w:cs="Arial"/>
+        </w:rPr>
+      </w:pPr>
+    </w:p>
+    <w:sdt>
+      <w:sdtPr>
+        <w:rPr>
+          <w:rFonts w:ascii="Arial" w:hAnsi="Arial" w:cs="Arial"/>
+        </w:rPr>
+        <w:alias w:val="Risposta AI"/>
+        <w:tag w:val="Risposta AI"/>
+        <w:id w:val="-1336305233"/>
+        <w:placeholder>
+          <w:docPart w:val="FF8558DE245548E095C7EC16A4E3DB69"/>
+        </w:placeholder>
+        <w15:color w:val="C0C0C0"/>
+      </w:sdtPr>
+      <w:sdtContent>
+        <w:p>
+          <w:pPr>
+            <w:pStyle w:val="Nessunaspaziatura"/>
+            <w:spacing w:line="276" w:lineRule="auto"/>
+            <w:rPr>
+              <w:rFonts w:ascii="Arial" w:hAnsi="Arial" w:cs="Arial"/>
+            </w:rPr>
+          </w:pPr>
+          <w:r>
+            <w:rPr>
+              <w:rFonts w:ascii="Arial" w:hAnsi="Arial" w:cs="Arial"/>
+            </w:rPr>
+            <w:t>Delle idee di requisiti</w:t>
+          </w:r>
+        </w:p>
+      </w:sdtContent>
+    </w:sdt>
+    <w:p>
+      <w:pPr>
+        <w:pStyle w:val="Nessunaspaziatura"/>
+        <w:rPr>
+          <w:rFonts w:ascii="Arial" w:hAnsi="Arial" w:cs="Arial"/>
+          <w:b/>
+          <w:bCs/>
+        </w:rPr>
+      </w:pPr>
+    </w:p>
+    <w:p>
+      <w:pPr>
+        <w:pStyle w:val="Nessunaspaziatura"/>
+        <w:rPr>
+          <w:rFonts w:ascii="Arial" w:hAnsi="Arial" w:cs="Arial"/>
+        </w:rPr>
+      </w:pPr>
+      <w:r>
+        <w:rPr>
+          <w:rFonts w:ascii="Arial" w:hAnsi="Arial" w:cs="Arial"/>
+          <w:b/>
+          <w:bCs/>
+        </w:rPr>
+        <w:t>Come l’ho usato io</w:t>
+      </w:r>
+      <w:r>
+        <w:rPr>
+          <w:rFonts w:ascii="Arial" w:hAnsi="Arial" w:cs="Arial"/>
+        </w:rPr>
+        <w:br/>
+      </w:r>
+      <w:sdt>
+        <w:sdtPr>
+          <w:rPr>
+            <w:rFonts w:ascii="Segoe UI Symbol" w:hAnsi="Segoe UI Symbol" w:cs="Segoe UI Symbol"/>
+          </w:rPr>
+          <w:id w:val="1002626490"/>
+          <w14:checkbox>
+            <w14:checked w14:val="0"/>
+            <w14:checkedState w14:val="2612" w14:font="MS Gothic"/>
+            <w14:uncheckedState w14:val="2610" w14:font="MS Gothic"/>
+          </w14:checkbox>
+        </w:sdtPr>
+        <w:sdtContent>
+          <w:r>
+            <w:rPr>
+              <w:rFonts w:ascii="MS Gothic" w:eastAsia="MS Gothic" w:hAnsi="MS Gothic" w:cs="Segoe UI Symbol" w:hint="eastAsia"/>
+            </w:rPr>
+            <w:t>☐</w:t>
+          </w:r>
+        </w:sdtContent>
+      </w:sdt>
+      <w:r>
+        <w:rPr>
+          <w:rFonts w:ascii="Arial" w:hAnsi="Arial" w:cs="Arial"/>
+        </w:rPr>
+        <w:t xml:space="preserve"> Copiato</w:t>
+      </w:r>
+      <w:r>
+        <w:rPr>
+          <w:rFonts w:ascii="Arial" w:hAnsi="Arial" w:cs="Arial"/>
+        </w:rPr>
+        <w:br/>
+      </w:r>
+      <w:sdt>
+        <w:sdtPr>
+          <w:rPr>
+            <w:rFonts w:ascii="Segoe UI Symbol" w:hAnsi="Segoe UI Symbol" w:cs="Segoe UI Symbol"/>
+          </w:rPr>
+          <w:id w:val="-2063473576"/>
+          <w14:checkbox>
+            <w14:checked w14:val="1"/>
+            <w14:checkedState w14:val="2612" w14:font="MS Gothic"/>
+            <w14:uncheckedState w14:val="2610" w14:font="MS Gothic"/>
+          </w14:checkbox>
+        </w:sdtPr>
+        <w:sdtContent>
+          <w:r>
+            <w:rPr>
+              <w:rFonts w:ascii="MS Gothic" w:eastAsia="MS Gothic" w:hAnsi="MS Gothic" w:cs="Segoe UI Symbol" w:hint="eastAsia"/>
+            </w:rPr>
+            <w:t>☒</w:t>
+          </w:r>
+        </w:sdtContent>
+      </w:sdt>
+      <w:r>
+        <w:rPr>
+          <w:rFonts w:ascii="Arial" w:hAnsi="Arial" w:cs="Arial"/>
+        </w:rPr>
+        <w:t xml:space="preserve"> Adattato</w:t>
+      </w:r>
+      <w:r>
+        <w:rPr>
+          <w:rFonts w:ascii="Arial" w:hAnsi="Arial" w:cs="Arial"/>
+        </w:rPr>
+        <w:br/>
+      </w:r>
+      <w:sdt>
+        <w:sdtPr>
+          <w:rPr>
+            <w:rFonts w:ascii="Segoe UI Symbol" w:hAnsi="Segoe UI Symbol" w:cs="Segoe UI Symbol"/>
+          </w:rPr>
+          <w:id w:val="2142765656"/>
+          <w14:checkbox>
+            <w14:checked w14:val="0"/>
+            <w14:checkedState w14:val="2612" w14:font="MS Gothic"/>
+            <w14:uncheckedState w14:val="2610" w14:font="MS Gothic"/>
+          </w14:checkbox>
+        </w:sdtPr>
+        <w:sdtContent>
+          <w:r>
+            <w:rPr>
+              <w:rFonts w:ascii="MS Gothic" w:eastAsia="MS Gothic" w:hAnsi="MS Gothic" w:cs="Segoe UI Symbol" w:hint="eastAsia"/>
+            </w:rPr>
+            <w:t>☐</w:t>
+          </w:r>
+        </w:sdtContent>
+      </w:sdt>
+      <w:r>
+        <w:rPr>
+          <w:rFonts w:ascii="Arial" w:hAnsi="Arial" w:cs="Arial"/>
+        </w:rPr>
+        <w:t xml:space="preserve"> Usato solo per capire</w:t>
+      </w:r>
+      <w:r>
+        <w:rPr>
+          <w:rFonts w:ascii="Arial" w:hAnsi="Arial" w:cs="Arial"/>
+        </w:rPr>
+        <w:br/>
+      </w:r>
+      <w:sdt>
+        <w:sdtPr>
+          <w:rPr>
+            <w:rFonts w:ascii="Segoe UI Symbol" w:hAnsi="Segoe UI Symbol" w:cs="Segoe UI Symbol"/>
+          </w:rPr>
+          <w:id w:val="1164045006"/>
+          <w14:checkbox>
+            <w14:checked w14:val="0"/>
+            <w14:checkedState w14:val="2612" w14:font="MS Gothic"/>
+            <w14:uncheckedState w14:val="2610" w14:font="MS Gothic"/>
+          </w14:checkbox>
+        </w:sdtPr>
+        <w:sdtContent>
+          <w:r>
+            <w:rPr>
+              <w:rFonts w:ascii="MS Gothic" w:eastAsia="MS Gothic" w:hAnsi="MS Gothic" w:cs="Segoe UI Symbol" w:hint="eastAsia"/>
+            </w:rPr>
+            <w:t>☐</w:t>
+          </w:r>
+        </w:sdtContent>
+      </w:sdt>
+      <w:r>
+        <w:rPr>
+          <w:rFonts w:ascii="Arial" w:hAnsi="Arial" w:cs="Arial"/>
+        </w:rPr>
+        <w:t xml:space="preserve"> Scartato</w:t>
+      </w:r>
+    </w:p>
+    <w:p>
+      <w:pPr>
+        <w:pStyle w:val="Nessunaspaziatura"/>
+        <w:rPr>
+          <w:rFonts w:ascii="Arial" w:hAnsi="Arial" w:cs="Arial"/>
+        </w:rPr>
+      </w:pPr>
+    </w:p>
+    <w:p>
+      <w:pPr>
+        <w:pStyle w:val="Nessunaspaziatura"/>
+        <w:rPr>
+          <w:rFonts w:ascii="Arial" w:hAnsi="Arial" w:cs="Arial"/>
+        </w:rPr>
+      </w:pPr>
+    </w:p>
+    <w:p>
+      <w:pPr>
+        <w:pStyle w:val="Nessunaspaziatura"/>
+        <w:rPr>
+          <w:rFonts w:ascii="Arial" w:hAnsi="Arial" w:cs="Arial"/>
+        </w:rPr>
+      </w:pPr>
+      <w:r>
+        <w:rPr>
+          <w:rFonts w:ascii="Arial" w:hAnsi="Arial" w:cs="Arial"/>
+          <w:b/>
+          <w:bCs/>
+        </w:rPr>
+        <w:t>Cosa avrei fatto senza AI?</w:t>
+      </w:r>
+    </w:p>
+    <w:p>
+      <w:pPr>
+        <w:pStyle w:val="Nessunaspaziatura"/>
+        <w:rPr>
+          <w:rFonts w:ascii="Arial" w:hAnsi="Arial" w:cs="Arial"/>
+        </w:rPr>
+      </w:pPr>
+    </w:p>
+    <w:sdt>
+      <w:sdtPr>
+        <w:rPr>
+          <w:rFonts w:ascii="Arial" w:hAnsi="Arial" w:cs="Arial"/>
+        </w:rPr>
+        <w:alias w:val="Proprio commento"/>
+        <w:tag w:val="Proprio commento"/>
+        <w:id w:val="1223870042"/>
+        <w:placeholder>
+          <w:docPart w:val="FF8558DE245548E095C7EC16A4E3DB69"/>
+        </w:placeholder>
+        <w15:color w:val="C0C0C0"/>
+      </w:sdtPr>
+      <w:sdtContent>
+        <w:p>
+          <w:pPr>
+            <w:pStyle w:val="Nessunaspaziatura"/>
+            <w:spacing w:line="276" w:lineRule="auto"/>
+            <w:rPr>
+              <w:rFonts w:ascii="Arial" w:hAnsi="Arial" w:cs="Arial"/>
+            </w:rPr>
+          </w:pPr>
+          <w:r>
+            <w:rPr>
+              <w:rFonts w:ascii="Arial" w:hAnsi="Arial" w:cs="Arial"/>
+            </w:rPr>
+            <w:t>Averi analizzato manualmente, incrementando il tempo necessario per concludere il lavoro</w:t>
+          </w:r>
+        </w:p>
+      </w:sdtContent>
+    </w:sdt>
+    <w:p>
+      <w:pPr>
+        <w:pStyle w:val="Nessunaspaziatura"/>
+        <w:spacing w:line="276" w:lineRule="auto"/>
+        <w:rPr>
+          <w:rFonts w:ascii="Arial" w:hAnsi="Arial" w:cs="Arial"/>
+        </w:rPr>
+      </w:pPr>
+    </w:p>
     <w:sectPr>
       <w:headerReference w:type="default" r:id="rId8"/>
       <w:footerReference w:type="default" r:id="rId9"/>
@@ -1525,8 +2886,17 @@
         <w:rFonts w:ascii="Arial" w:hAnsi="Arial" w:cs="Arial"/>
         <w:lang w:val="fr-CH"/>
       </w:rPr>
-      <w:t>Riley Bianchi &amp; Bryan Ciaponi</w:t>
+      <w:t xml:space="preserve">Riley Bianchi &amp; Bryan </w:t>
     </w:r>
+    <w:proofErr w:type="spellStart"/>
+    <w:r>
+      <w:rPr>
+        <w:rFonts w:ascii="Arial" w:hAnsi="Arial" w:cs="Arial"/>
+        <w:lang w:val="fr-CH"/>
+      </w:rPr>
+      <w:t>Ciaponi</w:t>
+    </w:r>
+    <w:proofErr w:type="spellEnd"/>
   </w:p>
 </w:hdr>
 </file>
@@ -5009,6 +6379,107 @@
         </w:p>
       </w:docPartBody>
     </w:docPart>
+    <w:docPart>
+      <w:docPartPr>
+        <w:name w:val="1CBF60CF0E11475D8F54CEAAE596C311"/>
+        <w:category>
+          <w:name w:val="Generale"/>
+          <w:gallery w:val="placeholder"/>
+        </w:category>
+        <w:types>
+          <w:type w:val="bbPlcHdr"/>
+        </w:types>
+        <w:behaviors>
+          <w:behavior w:val="content"/>
+        </w:behaviors>
+        <w:guid w:val="{7FC2B813-C432-4ED3-859C-B3F05B65B73F}"/>
+      </w:docPartPr>
+      <w:docPartBody>
+        <w:p>
+          <w:pPr>
+            <w:pStyle w:val="1CBF60CF0E11475D8F54CEAAE596C311"/>
+          </w:pPr>
+          <w:r>
+            <w:rPr>
+              <w:rStyle w:val="Testosegnaposto"/>
+              <w:b/>
+              <w:bCs/>
+            </w:rPr>
+            <w:t>Nomi AI utilizzati</w:t>
+          </w:r>
+        </w:p>
+      </w:docPartBody>
+    </w:docPart>
+    <w:docPart>
+      <w:docPartPr>
+        <w:name w:val="078549E3A6C34AD59342C9F7BD1E35DA"/>
+        <w:category>
+          <w:name w:val="Generale"/>
+          <w:gallery w:val="placeholder"/>
+        </w:category>
+        <w:types>
+          <w:type w:val="bbPlcHdr"/>
+        </w:types>
+        <w:behaviors>
+          <w:behavior w:val="content"/>
+        </w:behaviors>
+        <w:guid w:val="{EDE08C64-CEA8-4857-9CED-A78AC548CB72}"/>
+      </w:docPartPr>
+      <w:docPartBody>
+        <w:p>
+          <w:pPr>
+            <w:pStyle w:val="078549E3A6C34AD59342C9F7BD1E35DA"/>
+          </w:pPr>
+          <w:r>
+            <w:rPr>
+              <w:rStyle w:val="Testosegnaposto"/>
+            </w:rPr>
+            <w:t>Fare clic o toccare qui per immettere il testo.</w:t>
+          </w:r>
+        </w:p>
+      </w:docPartBody>
+    </w:docPart>
+    <w:docPart>
+      <w:docPartPr>
+        <w:name w:val="FF8558DE245548E095C7EC16A4E3DB69"/>
+        <w:category>
+          <w:name w:val="Generale"/>
+          <w:gallery w:val="placeholder"/>
+        </w:category>
+        <w:types>
+          <w:type w:val="bbPlcHdr"/>
+        </w:types>
+        <w:behaviors>
+          <w:behavior w:val="content"/>
+        </w:behaviors>
+        <w:guid w:val="{3468C812-E29A-46B6-8720-C1BB6249A2E7}"/>
+      </w:docPartPr>
+      <w:docPartBody>
+        <w:p>
+          <w:pPr>
+            <w:pStyle w:val="FF8558DE245548E095C7EC16A4E3DB69"/>
+          </w:pPr>
+          <w:r>
+            <w:rPr>
+              <w:rStyle w:val="Testosegnaposto"/>
+            </w:rPr>
+            <w:t xml:space="preserve">Fare clic o toccare qui per </w:t>
+          </w:r>
+          <w:r>
+            <w:rPr>
+              <w:rStyle w:val="Testosegnaposto"/>
+            </w:rPr>
+            <w:t>immettere</w:t>
+          </w:r>
+          <w:r>
+            <w:rPr>
+              <w:rStyle w:val="Testosegnaposto"/>
+            </w:rPr>
+            <w:t xml:space="preserve"> il testo.</w:t>
+          </w:r>
+        </w:p>
+      </w:docPartBody>
+    </w:docPart>
   </w:docParts>
 </w:glossaryDocument>
 </file>
@@ -5139,7 +6610,9 @@
   </w:compat>
   <w:rsids>
     <w:rsidRoot w:val="00BE72BC"/>
+    <w:rsid w:val="00352469"/>
     <w:rsid w:val="003B3A61"/>
+    <w:rsid w:val="00534571"/>
     <w:rsid w:val="0063588A"/>
     <w:rsid w:val="007F4556"/>
     <w:rsid w:val="0080736A"/>
@@ -5149,6 +6622,7 @@
     <w:rsid w:val="00BE72BC"/>
     <w:rsid w:val="00DE2402"/>
     <w:rsid w:val="00DE4EBE"/>
+    <w:rsid w:val="00EE3640"/>
     <w:rsid w:val="00F26F5B"/>
   </w:rsids>
   <m:mathPr>
@@ -5605,7 +7079,7 @@
     <w:basedOn w:val="Carpredefinitoparagrafo"/>
     <w:uiPriority w:val="99"/>
     <w:semiHidden/>
-    <w:rsid w:val="0080736A"/>
+    <w:rsid w:val="00EE3640"/>
     <w:rPr>
       <w:color w:val="666666"/>
     </w:rPr>
@@ -5654,6 +7128,18 @@
       <w:lang w:eastAsia="en-US"/>
       <w14:ligatures w14:val="none"/>
     </w:rPr>
+  </w:style>
+  <w:style w:type="paragraph" w:customStyle="1" w:styleId="1CBF60CF0E11475D8F54CEAAE596C311">
+    <w:name w:val="1CBF60CF0E11475D8F54CEAAE596C311"/>
+    <w:rsid w:val="00EE3640"/>
+  </w:style>
+  <w:style w:type="paragraph" w:customStyle="1" w:styleId="078549E3A6C34AD59342C9F7BD1E35DA">
+    <w:name w:val="078549E3A6C34AD59342C9F7BD1E35DA"/>
+    <w:rsid w:val="00EE3640"/>
+  </w:style>
+  <w:style w:type="paragraph" w:customStyle="1" w:styleId="FF8558DE245548E095C7EC16A4E3DB69">
+    <w:name w:val="FF8558DE245548E095C7EC16A4E3DB69"/>
+    <w:rsid w:val="00EE3640"/>
   </w:style>
 </w:styles>
 </file>

</xml_diff>

<commit_message>
Diagramma ER completo e aggiunta sitografia
</commit_message>
<xml_diff>
--- a/4_Diari/Diario.docx
+++ b/4_Diari/Diario.docx
@@ -2753,19 +2753,7 @@
               <w:rPr>
                 <w:rFonts w:ascii="Arial" w:hAnsi="Arial" w:cs="Arial"/>
               </w:rPr>
-              <w:t>0</w:t>
-            </w:r>
-            <w:r>
-              <w:rPr>
-                <w:rFonts w:ascii="Arial" w:hAnsi="Arial" w:cs="Arial"/>
-              </w:rPr>
-              <w:t>9</w:t>
-            </w:r>
-            <w:r>
-              <w:rPr>
-                <w:rFonts w:ascii="Arial" w:hAnsi="Arial" w:cs="Arial"/>
-              </w:rPr>
-              <w:t>.09.2026</w:t>
+              <w:t>09.09.2026</w:t>
             </w:r>
           </w:p>
         </w:tc>
@@ -3933,6 +3921,1306 @@
         <w:id w:val="1724553707"/>
         <w:placeholder>
           <w:docPart w:val="CB2155D438D4499DA3A0F630FDE35D43"/>
+        </w:placeholder>
+        <w15:color w:val="C0C0C0"/>
+      </w:sdtPr>
+      <w:sdtContent>
+        <w:p>
+          <w:pPr>
+            <w:pStyle w:val="Nessunaspaziatura"/>
+            <w:spacing w:line="276" w:lineRule="auto"/>
+            <w:rPr>
+              <w:rFonts w:ascii="Arial" w:hAnsi="Arial" w:cs="Arial"/>
+            </w:rPr>
+          </w:pPr>
+          <w:r>
+            <w:rPr>
+              <w:rFonts w:ascii="Arial" w:hAnsi="Arial" w:cs="Arial"/>
+            </w:rPr>
+            <w:t>Ricerca più approfondita e dispendiosa a livello di tempo per spiegare il concetto.</w:t>
+          </w:r>
+        </w:p>
+      </w:sdtContent>
+    </w:sdt>
+    <w:p>
+      <w:pPr>
+        <w:rPr>
+          <w:rFonts w:ascii="Arial" w:hAnsi="Arial" w:cs="Arial"/>
+        </w:rPr>
+      </w:pPr>
+      <w:r>
+        <w:rPr>
+          <w:rFonts w:ascii="Arial" w:hAnsi="Arial" w:cs="Arial"/>
+        </w:rPr>
+        <w:br w:type="page"/>
+      </w:r>
+    </w:p>
+    <w:tbl>
+      <w:tblPr>
+        <w:tblStyle w:val="Grigliatabella"/>
+        <w:tblW w:w="5000" w:type="pct"/>
+        <w:tblLook w:val="04A0" w:firstRow="1" w:lastRow="0" w:firstColumn="1" w:lastColumn="0" w:noHBand="0" w:noVBand="1"/>
+      </w:tblPr>
+      <w:tblGrid>
+        <w:gridCol w:w="2407"/>
+        <w:gridCol w:w="7221"/>
+      </w:tblGrid>
+      <w:tr>
+        <w:trPr>
+          <w:trHeight w:val="199"/>
+        </w:trPr>
+        <w:tc>
+          <w:tcPr>
+            <w:tcW w:w="1250" w:type="pct"/>
+            <w:vAlign w:val="center"/>
+          </w:tcPr>
+          <w:p>
+            <w:pPr>
+              <w:rPr>
+                <w:rFonts w:ascii="Arial" w:hAnsi="Arial" w:cs="Arial"/>
+              </w:rPr>
+            </w:pPr>
+            <w:r>
+              <w:rPr>
+                <w:rFonts w:ascii="Arial" w:hAnsi="Arial" w:cs="Arial"/>
+              </w:rPr>
+              <w:lastRenderedPageBreak/>
+              <w:t>Luogo</w:t>
+            </w:r>
+          </w:p>
+        </w:tc>
+        <w:tc>
+          <w:tcPr>
+            <w:tcW w:w="3750" w:type="pct"/>
+            <w:vAlign w:val="center"/>
+          </w:tcPr>
+          <w:p>
+            <w:pPr>
+              <w:rPr>
+                <w:rFonts w:ascii="Arial" w:hAnsi="Arial" w:cs="Arial"/>
+              </w:rPr>
+            </w:pPr>
+            <w:r>
+              <w:rPr>
+                <w:rFonts w:ascii="Arial" w:hAnsi="Arial" w:cs="Arial"/>
+              </w:rPr>
+              <w:t>Scuola Arti e Mestieri Trevano</w:t>
+            </w:r>
+          </w:p>
+        </w:tc>
+      </w:tr>
+      <w:tr>
+        <w:trPr>
+          <w:trHeight w:val="196"/>
+        </w:trPr>
+        <w:tc>
+          <w:tcPr>
+            <w:tcW w:w="1250" w:type="pct"/>
+            <w:vAlign w:val="center"/>
+          </w:tcPr>
+          <w:p>
+            <w:pPr>
+              <w:rPr>
+                <w:rFonts w:ascii="Arial" w:hAnsi="Arial" w:cs="Arial"/>
+              </w:rPr>
+            </w:pPr>
+            <w:r>
+              <w:rPr>
+                <w:rFonts w:ascii="Arial" w:hAnsi="Arial" w:cs="Arial"/>
+              </w:rPr>
+              <w:t>Data</w:t>
+            </w:r>
+          </w:p>
+        </w:tc>
+        <w:tc>
+          <w:tcPr>
+            <w:tcW w:w="3750" w:type="pct"/>
+            <w:vAlign w:val="center"/>
+          </w:tcPr>
+          <w:p>
+            <w:pPr>
+              <w:rPr>
+                <w:rFonts w:ascii="Arial" w:hAnsi="Arial" w:cs="Arial"/>
+              </w:rPr>
+            </w:pPr>
+            <w:r>
+              <w:rPr>
+                <w:rFonts w:ascii="Arial" w:hAnsi="Arial" w:cs="Arial"/>
+              </w:rPr>
+              <w:t>11</w:t>
+            </w:r>
+            <w:r>
+              <w:rPr>
+                <w:rFonts w:ascii="Arial" w:hAnsi="Arial" w:cs="Arial"/>
+              </w:rPr>
+              <w:t>.09.2026</w:t>
+            </w:r>
+          </w:p>
+        </w:tc>
+      </w:tr>
+    </w:tbl>
+    <w:p>
+      <w:pPr>
+        <w:rPr>
+          <w:rFonts w:ascii="Arial" w:hAnsi="Arial" w:cs="Arial"/>
+        </w:rPr>
+      </w:pPr>
+    </w:p>
+    <w:tbl>
+      <w:tblPr>
+        <w:tblStyle w:val="Grigliatabella"/>
+        <w:tblW w:w="0" w:type="auto"/>
+        <w:tblLook w:val="04A0" w:firstRow="1" w:lastRow="0" w:firstColumn="1" w:lastColumn="0" w:noHBand="0" w:noVBand="1"/>
+      </w:tblPr>
+      <w:tblGrid>
+        <w:gridCol w:w="1271"/>
+        <w:gridCol w:w="8357"/>
+      </w:tblGrid>
+      <w:tr>
+        <w:tc>
+          <w:tcPr>
+            <w:tcW w:w="9628" w:type="dxa"/>
+            <w:gridSpan w:val="2"/>
+            <w:shd w:val="clear" w:color="auto" w:fill="D9D9D9" w:themeFill="background1" w:themeFillShade="D9"/>
+          </w:tcPr>
+          <w:p>
+            <w:pPr>
+              <w:rPr>
+                <w:rFonts w:ascii="Arial" w:hAnsi="Arial" w:cs="Arial"/>
+              </w:rPr>
+            </w:pPr>
+            <w:r>
+              <w:rPr>
+                <w:rFonts w:ascii="Arial" w:hAnsi="Arial" w:cs="Arial"/>
+              </w:rPr>
+              <w:t>Lavori svolti</w:t>
+            </w:r>
+          </w:p>
+        </w:tc>
+      </w:tr>
+      <w:tr>
+        <w:tc>
+          <w:tcPr>
+            <w:tcW w:w="1271" w:type="dxa"/>
+          </w:tcPr>
+          <w:p>
+            <w:pPr>
+              <w:rPr>
+                <w:rFonts w:ascii="Arial" w:hAnsi="Arial" w:cs="Arial"/>
+              </w:rPr>
+            </w:pPr>
+            <w:r>
+              <w:rPr>
+                <w:rFonts w:ascii="Arial" w:hAnsi="Arial" w:cs="Arial"/>
+              </w:rPr>
+              <w:t>Riley</w:t>
+            </w:r>
+          </w:p>
+        </w:tc>
+        <w:tc>
+          <w:tcPr>
+            <w:tcW w:w="8357" w:type="dxa"/>
+          </w:tcPr>
+          <w:p>
+            <w:pPr>
+              <w:rPr>
+                <w:rFonts w:ascii="Arial" w:hAnsi="Arial" w:cs="Arial"/>
+              </w:rPr>
+            </w:pPr>
+            <w:r>
+              <w:rPr>
+                <w:rFonts w:ascii="Arial" w:hAnsi="Arial" w:cs="Arial"/>
+              </w:rPr>
+              <w:t>Inizio diagramma ER</w:t>
+            </w:r>
+          </w:p>
+        </w:tc>
+      </w:tr>
+      <w:tr>
+        <w:tc>
+          <w:tcPr>
+            <w:tcW w:w="1271" w:type="dxa"/>
+          </w:tcPr>
+          <w:p>
+            <w:pPr>
+              <w:rPr>
+                <w:rFonts w:ascii="Arial" w:hAnsi="Arial" w:cs="Arial"/>
+              </w:rPr>
+            </w:pPr>
+            <w:r>
+              <w:rPr>
+                <w:rFonts w:ascii="Arial" w:hAnsi="Arial" w:cs="Arial"/>
+              </w:rPr>
+              <w:t>Bryan</w:t>
+            </w:r>
+          </w:p>
+        </w:tc>
+        <w:tc>
+          <w:tcPr>
+            <w:tcW w:w="8357" w:type="dxa"/>
+          </w:tcPr>
+          <w:p>
+            <w:pPr>
+              <w:rPr>
+                <w:rFonts w:ascii="Arial" w:hAnsi="Arial" w:cs="Arial"/>
+              </w:rPr>
+            </w:pPr>
+            <w:r>
+              <w:rPr>
+                <w:rFonts w:ascii="Arial" w:hAnsi="Arial" w:cs="Arial"/>
+              </w:rPr>
+              <w:t xml:space="preserve">Completata la analisi del dominio nella documentazione, inizio ricerche riguardo </w:t>
+            </w:r>
+            <w:proofErr w:type="spellStart"/>
+            <w:r>
+              <w:rPr>
+                <w:rFonts w:ascii="Arial" w:hAnsi="Arial" w:cs="Arial"/>
+              </w:rPr>
+              <w:t>Unity</w:t>
+            </w:r>
+            <w:proofErr w:type="spellEnd"/>
+            <w:r>
+              <w:rPr>
+                <w:rFonts w:ascii="Arial" w:hAnsi="Arial" w:cs="Arial"/>
+              </w:rPr>
+              <w:t>.</w:t>
+            </w:r>
+          </w:p>
+        </w:tc>
+      </w:tr>
+    </w:tbl>
+    <w:p>
+      <w:pPr>
+        <w:rPr>
+          <w:rFonts w:ascii="Arial" w:hAnsi="Arial" w:cs="Arial"/>
+        </w:rPr>
+      </w:pPr>
+    </w:p>
+    <w:tbl>
+      <w:tblPr>
+        <w:tblStyle w:val="Grigliatabella"/>
+        <w:tblW w:w="0" w:type="auto"/>
+        <w:tblInd w:w="-5" w:type="dxa"/>
+        <w:tblLook w:val="04A0" w:firstRow="1" w:lastRow="0" w:firstColumn="1" w:lastColumn="0" w:noHBand="0" w:noVBand="1"/>
+      </w:tblPr>
+      <w:tblGrid>
+        <w:gridCol w:w="1276"/>
+        <w:gridCol w:w="8357"/>
+      </w:tblGrid>
+      <w:tr>
+        <w:tc>
+          <w:tcPr>
+            <w:tcW w:w="9628" w:type="dxa"/>
+            <w:gridSpan w:val="2"/>
+            <w:shd w:val="clear" w:color="auto" w:fill="D9D9D9" w:themeFill="background1" w:themeFillShade="D9"/>
+          </w:tcPr>
+          <w:p>
+            <w:pPr>
+              <w:rPr>
+                <w:rFonts w:ascii="Arial" w:hAnsi="Arial" w:cs="Arial"/>
+              </w:rPr>
+            </w:pPr>
+            <w:r>
+              <w:rPr>
+                <w:rFonts w:ascii="Arial" w:hAnsi="Arial" w:cs="Arial"/>
+              </w:rPr>
+              <w:t>Problemi riscontrati e soluzioni adottate</w:t>
+            </w:r>
+          </w:p>
+        </w:tc>
+      </w:tr>
+      <w:tr>
+        <w:tc>
+          <w:tcPr>
+            <w:tcW w:w="1276" w:type="dxa"/>
+          </w:tcPr>
+          <w:p>
+            <w:pPr>
+              <w:rPr>
+                <w:rFonts w:ascii="Arial" w:hAnsi="Arial" w:cs="Arial"/>
+              </w:rPr>
+            </w:pPr>
+            <w:r>
+              <w:rPr>
+                <w:rFonts w:ascii="Arial" w:hAnsi="Arial" w:cs="Arial"/>
+              </w:rPr>
+              <w:t>Riley</w:t>
+            </w:r>
+          </w:p>
+        </w:tc>
+        <w:tc>
+          <w:tcPr>
+            <w:tcW w:w="8357" w:type="dxa"/>
+          </w:tcPr>
+          <w:p>
+            <w:pPr>
+              <w:rPr>
+                <w:rFonts w:ascii="Arial" w:hAnsi="Arial" w:cs="Arial"/>
+              </w:rPr>
+            </w:pPr>
+            <w:r>
+              <w:rPr>
+                <w:rFonts w:ascii="Arial" w:hAnsi="Arial" w:cs="Arial"/>
+              </w:rPr>
+              <w:t>Indecisioni sulla struttura del DB e discorsi extracurricolari che anno portato via un po' di tempo</w:t>
+            </w:r>
+          </w:p>
+        </w:tc>
+      </w:tr>
+      <w:tr>
+        <w:tc>
+          <w:tcPr>
+            <w:tcW w:w="1276" w:type="dxa"/>
+          </w:tcPr>
+          <w:p>
+            <w:pPr>
+              <w:rPr>
+                <w:rFonts w:ascii="Arial" w:hAnsi="Arial" w:cs="Arial"/>
+              </w:rPr>
+            </w:pPr>
+            <w:r>
+              <w:rPr>
+                <w:rFonts w:ascii="Arial" w:hAnsi="Arial" w:cs="Arial"/>
+              </w:rPr>
+              <w:t>Bryan</w:t>
+            </w:r>
+          </w:p>
+        </w:tc>
+        <w:tc>
+          <w:tcPr>
+            <w:tcW w:w="8357" w:type="dxa"/>
+          </w:tcPr>
+          <w:p>
+            <w:pPr>
+              <w:rPr>
+                <w:rFonts w:ascii="Arial" w:hAnsi="Arial" w:cs="Arial"/>
+              </w:rPr>
+            </w:pPr>
+            <w:r>
+              <w:rPr>
+                <w:rFonts w:ascii="Arial" w:hAnsi="Arial" w:cs="Arial"/>
+              </w:rPr>
+              <w:t>-</w:t>
+            </w:r>
+          </w:p>
+        </w:tc>
+      </w:tr>
+    </w:tbl>
+    <w:p>
+      <w:pPr>
+        <w:rPr>
+          <w:rFonts w:ascii="Arial" w:hAnsi="Arial" w:cs="Arial"/>
+        </w:rPr>
+      </w:pPr>
+    </w:p>
+    <w:tbl>
+      <w:tblPr>
+        <w:tblStyle w:val="Grigliatabella"/>
+        <w:tblW w:w="0" w:type="auto"/>
+        <w:tblLook w:val="04A0" w:firstRow="1" w:lastRow="0" w:firstColumn="1" w:lastColumn="0" w:noHBand="0" w:noVBand="1"/>
+      </w:tblPr>
+      <w:tblGrid>
+        <w:gridCol w:w="9628"/>
+      </w:tblGrid>
+      <w:tr>
+        <w:tc>
+          <w:tcPr>
+            <w:tcW w:w="9854" w:type="dxa"/>
+            <w:shd w:val="clear" w:color="auto" w:fill="D9D9D9" w:themeFill="background1" w:themeFillShade="D9"/>
+          </w:tcPr>
+          <w:p>
+            <w:pPr>
+              <w:rPr>
+                <w:rFonts w:ascii="Arial" w:hAnsi="Arial" w:cs="Arial"/>
+              </w:rPr>
+            </w:pPr>
+            <w:r>
+              <w:rPr>
+                <w:rFonts w:ascii="Arial" w:hAnsi="Arial" w:cs="Arial"/>
+              </w:rPr>
+              <w:t>Punto della situazione rispetto alla pianificazione</w:t>
+            </w:r>
+          </w:p>
+        </w:tc>
+      </w:tr>
+      <w:tr>
+        <w:tc>
+          <w:tcPr>
+            <w:tcW w:w="9854" w:type="dxa"/>
+          </w:tcPr>
+          <w:p>
+            <w:pPr>
+              <w:rPr>
+                <w:rFonts w:ascii="Arial" w:hAnsi="Arial" w:cs="Arial"/>
+              </w:rPr>
+            </w:pPr>
+            <w:r>
+              <w:rPr>
+                <w:rFonts w:ascii="Arial" w:hAnsi="Arial" w:cs="Arial"/>
+              </w:rPr>
+              <w:t xml:space="preserve">Il diagramma ER non è completo e </w:t>
+            </w:r>
+            <w:proofErr w:type="gramStart"/>
+            <w:r>
+              <w:rPr>
+                <w:rFonts w:ascii="Arial" w:hAnsi="Arial" w:cs="Arial"/>
+              </w:rPr>
+              <w:t>lo use</w:t>
+            </w:r>
+            <w:proofErr w:type="gramEnd"/>
+            <w:r>
+              <w:rPr>
+                <w:rFonts w:ascii="Arial" w:hAnsi="Arial" w:cs="Arial"/>
+              </w:rPr>
+              <w:t xml:space="preserve"> case non è stato iniziato, analisi dei mezzi non ancora completata.</w:t>
+            </w:r>
+          </w:p>
+        </w:tc>
+      </w:tr>
+    </w:tbl>
+    <w:p>
+      <w:pPr>
+        <w:rPr>
+          <w:rFonts w:ascii="Arial" w:hAnsi="Arial" w:cs="Arial"/>
+        </w:rPr>
+      </w:pPr>
+    </w:p>
+    <w:tbl>
+      <w:tblPr>
+        <w:tblStyle w:val="Grigliatabella"/>
+        <w:tblW w:w="0" w:type="auto"/>
+        <w:tblLook w:val="04A0" w:firstRow="1" w:lastRow="0" w:firstColumn="1" w:lastColumn="0" w:noHBand="0" w:noVBand="1"/>
+      </w:tblPr>
+      <w:tblGrid>
+        <w:gridCol w:w="9628"/>
+      </w:tblGrid>
+      <w:tr>
+        <w:tc>
+          <w:tcPr>
+            <w:tcW w:w="9854" w:type="dxa"/>
+            <w:shd w:val="clear" w:color="auto" w:fill="D9D9D9" w:themeFill="background1" w:themeFillShade="D9"/>
+          </w:tcPr>
+          <w:p>
+            <w:pPr>
+              <w:rPr>
+                <w:rFonts w:ascii="Arial" w:hAnsi="Arial" w:cs="Arial"/>
+              </w:rPr>
+            </w:pPr>
+            <w:r>
+              <w:rPr>
+                <w:rFonts w:ascii="Arial" w:hAnsi="Arial" w:cs="Arial"/>
+              </w:rPr>
+              <w:t>Programma di massima per la prossima giornata di lavoro</w:t>
+            </w:r>
+          </w:p>
+        </w:tc>
+      </w:tr>
+      <w:tr>
+        <w:tc>
+          <w:tcPr>
+            <w:tcW w:w="9854" w:type="dxa"/>
+          </w:tcPr>
+          <w:p>
+            <w:pPr>
+              <w:rPr>
+                <w:rFonts w:ascii="Arial" w:hAnsi="Arial" w:cs="Arial"/>
+              </w:rPr>
+            </w:pPr>
+            <w:r>
+              <w:rPr>
+                <w:rFonts w:ascii="Arial" w:hAnsi="Arial" w:cs="Arial"/>
+              </w:rPr>
+              <w:t>Completamento fase analisi.</w:t>
+            </w:r>
+          </w:p>
+        </w:tc>
+      </w:tr>
+    </w:tbl>
+    <w:p>
+      <w:pPr>
+        <w:rPr>
+          <w:rFonts w:ascii="Arial" w:hAnsi="Arial" w:cs="Arial"/>
+        </w:rPr>
+      </w:pPr>
+    </w:p>
+    <w:p>
+      <w:pPr>
+        <w:rPr>
+          <w:rFonts w:ascii="Arial" w:hAnsi="Arial" w:cs="Arial"/>
+        </w:rPr>
+      </w:pPr>
+      <w:r>
+        <w:rPr>
+          <w:rFonts w:ascii="Arial" w:hAnsi="Arial" w:cs="Arial"/>
+        </w:rPr>
+        <w:br w:type="page"/>
+      </w:r>
+    </w:p>
+    <w:p>
+      <w:pPr>
+        <w:pStyle w:val="Titolo2"/>
+        <w:pBdr>
+          <w:bottom w:val="single" w:sz="4" w:space="1" w:color="auto"/>
+        </w:pBdr>
+      </w:pPr>
+      <w:r>
+        <w:lastRenderedPageBreak/>
+        <w:t>Utilizzo Intelligenza Artificiale</w:t>
+      </w:r>
+      <w:r>
+        <w:t xml:space="preserve"> nella giornata</w:t>
+      </w:r>
+    </w:p>
+    <w:p>
+      <w:pPr>
+        <w:pStyle w:val="Nessunaspaziatura"/>
+        <w:rPr>
+          <w:rFonts w:ascii="Arial" w:hAnsi="Arial" w:cs="Arial"/>
+          <w:b/>
+          <w:bCs/>
+        </w:rPr>
+      </w:pPr>
+    </w:p>
+    <w:p>
+      <w:pPr>
+        <w:pStyle w:val="Nessunaspaziatura"/>
+        <w:rPr>
+          <w:rFonts w:ascii="Arial" w:hAnsi="Arial" w:cs="Arial"/>
+        </w:rPr>
+      </w:pPr>
+      <w:sdt>
+        <w:sdtPr>
+          <w:rPr>
+            <w:rFonts w:ascii="Segoe UI Symbol" w:hAnsi="Segoe UI Symbol" w:cs="Segoe UI Symbol"/>
+          </w:rPr>
+          <w:id w:val="1064217132"/>
+          <w14:checkbox>
+            <w14:checked w14:val="0"/>
+            <w14:checkedState w14:val="2612" w14:font="MS Gothic"/>
+            <w14:uncheckedState w14:val="2610" w14:font="MS Gothic"/>
+          </w14:checkbox>
+        </w:sdtPr>
+        <w:sdtContent>
+          <w:r>
+            <w:rPr>
+              <w:rFonts w:ascii="MS Gothic" w:eastAsia="MS Gothic" w:hAnsi="MS Gothic" w:cs="Segoe UI Symbol" w:hint="eastAsia"/>
+            </w:rPr>
+            <w:t>☐</w:t>
+          </w:r>
+        </w:sdtContent>
+      </w:sdt>
+      <w:r>
+        <w:rPr>
+          <w:rFonts w:ascii="Arial" w:hAnsi="Arial" w:cs="Arial"/>
+        </w:rPr>
+        <w:t xml:space="preserve"> Nessuno</w:t>
+      </w:r>
+      <w:r>
+        <w:br/>
+      </w:r>
+      <w:sdt>
+        <w:sdtPr>
+          <w:rPr>
+            <w:rFonts w:ascii="Segoe UI Symbol" w:hAnsi="Segoe UI Symbol" w:cs="Segoe UI Symbol"/>
+          </w:rPr>
+          <w:id w:val="-1062485899"/>
+          <w14:checkbox>
+            <w14:checked w14:val="1"/>
+            <w14:checkedState w14:val="2612" w14:font="MS Gothic"/>
+            <w14:uncheckedState w14:val="2610" w14:font="MS Gothic"/>
+          </w14:checkbox>
+        </w:sdtPr>
+        <w:sdtContent>
+          <w:r>
+            <w:rPr>
+              <w:rFonts w:ascii="MS Gothic" w:eastAsia="MS Gothic" w:hAnsi="MS Gothic" w:cs="Segoe UI Symbol" w:hint="eastAsia"/>
+            </w:rPr>
+            <w:t>☒</w:t>
+          </w:r>
+        </w:sdtContent>
+      </w:sdt>
+      <w:r>
+        <w:rPr>
+          <w:rFonts w:ascii="Arial" w:hAnsi="Arial" w:cs="Arial"/>
+        </w:rPr>
+        <w:t xml:space="preserve"> Occasionale</w:t>
+      </w:r>
+      <w:r>
+        <w:br/>
+      </w:r>
+      <w:sdt>
+        <w:sdtPr>
+          <w:rPr>
+            <w:rFonts w:ascii="Segoe UI Symbol" w:hAnsi="Segoe UI Symbol" w:cs="Segoe UI Symbol"/>
+          </w:rPr>
+          <w:id w:val="-1368364789"/>
+          <w14:checkbox>
+            <w14:checked w14:val="0"/>
+            <w14:checkedState w14:val="2612" w14:font="MS Gothic"/>
+            <w14:uncheckedState w14:val="2610" w14:font="MS Gothic"/>
+          </w14:checkbox>
+        </w:sdtPr>
+        <w:sdtContent>
+          <w:r>
+            <w:rPr>
+              <w:rFonts w:ascii="MS Gothic" w:eastAsia="MS Gothic" w:hAnsi="MS Gothic" w:cs="Segoe UI Symbol"/>
+            </w:rPr>
+            <w:t>☐</w:t>
+          </w:r>
+        </w:sdtContent>
+      </w:sdt>
+      <w:r>
+        <w:rPr>
+          <w:rFonts w:ascii="Arial" w:hAnsi="Arial" w:cs="Arial"/>
+        </w:rPr>
+        <w:t xml:space="preserve"> Frequente</w:t>
+      </w:r>
+    </w:p>
+    <w:p>
+      <w:pPr>
+        <w:pStyle w:val="Nessunaspaziatura"/>
+        <w:rPr>
+          <w:rFonts w:ascii="Arial" w:hAnsi="Arial" w:cs="Arial"/>
+        </w:rPr>
+      </w:pPr>
+    </w:p>
+    <w:p>
+      <w:pPr>
+        <w:pStyle w:val="Nessunaspaziatura"/>
+        <w:spacing w:line="276" w:lineRule="auto"/>
+        <w:rPr>
+          <w:rFonts w:ascii="Arial" w:hAnsi="Arial" w:cs="Arial"/>
+        </w:rPr>
+      </w:pPr>
+      <w:r>
+        <w:rPr>
+          <w:rFonts w:ascii="Arial" w:hAnsi="Arial" w:cs="Arial"/>
+          <w:b/>
+          <w:bCs/>
+        </w:rPr>
+        <w:t>Strumento/i utilizzato/i</w:t>
+      </w:r>
+      <w:r>
+        <w:rPr>
+          <w:rFonts w:ascii="Arial" w:hAnsi="Arial" w:cs="Arial"/>
+          <w:b/>
+          <w:bCs/>
+        </w:rPr>
+        <w:t xml:space="preserve"> </w:t>
+      </w:r>
+      <w:r>
+        <w:rPr>
+          <w:rFonts w:ascii="Arial" w:hAnsi="Arial" w:cs="Arial"/>
+        </w:rPr>
+        <w:t>(es. ChatGPT)</w:t>
+      </w:r>
+      <w:r>
+        <w:rPr>
+          <w:rFonts w:ascii="Arial" w:hAnsi="Arial" w:cs="Arial"/>
+        </w:rPr>
+        <w:t xml:space="preserve">: </w:t>
+      </w:r>
+      <w:sdt>
+        <w:sdtPr>
+          <w:rPr>
+            <w:rFonts w:ascii="Arial" w:hAnsi="Arial" w:cs="Arial"/>
+          </w:rPr>
+          <w:id w:val="701911894"/>
+          <w:placeholder>
+            <w:docPart w:val="3205420654B042A293DDC5C0462DB8BB"/>
+          </w:placeholder>
+          <w:showingPlcHdr/>
+        </w:sdtPr>
+        <w:sdtContent>
+          <w:r>
+            <w:rPr>
+              <w:rStyle w:val="Testosegnaposto"/>
+              <w:b/>
+              <w:bCs/>
+            </w:rPr>
+            <w:t xml:space="preserve">Nomi </w:t>
+          </w:r>
+          <w:proofErr w:type="gramStart"/>
+          <w:r>
+            <w:rPr>
+              <w:rStyle w:val="Testosegnaposto"/>
+              <w:b/>
+              <w:bCs/>
+            </w:rPr>
+            <w:t>AI</w:t>
+          </w:r>
+          <w:proofErr w:type="gramEnd"/>
+          <w:r>
+            <w:rPr>
+              <w:rStyle w:val="Testosegnaposto"/>
+              <w:b/>
+              <w:bCs/>
+            </w:rPr>
+            <w:t xml:space="preserve"> utilizzati</w:t>
+          </w:r>
+        </w:sdtContent>
+      </w:sdt>
+    </w:p>
+    <w:p>
+      <w:pPr>
+        <w:pStyle w:val="Nessunaspaziatura"/>
+        <w:rPr>
+          <w:rFonts w:ascii="Arial" w:hAnsi="Arial" w:cs="Arial"/>
+        </w:rPr>
+      </w:pPr>
+    </w:p>
+    <w:p>
+      <w:pPr>
+        <w:pStyle w:val="Nessunaspaziatura"/>
+        <w:rPr>
+          <w:rFonts w:ascii="Arial" w:hAnsi="Arial" w:cs="Arial"/>
+        </w:rPr>
+      </w:pPr>
+      <w:r>
+        <w:rPr>
+          <w:rFonts w:ascii="Arial" w:hAnsi="Arial" w:cs="Arial"/>
+          <w:b/>
+          <w:bCs/>
+        </w:rPr>
+        <w:t>Per cosa l’ho usata oggi</w:t>
+      </w:r>
+      <w:r>
+        <w:br/>
+      </w:r>
+      <w:sdt>
+        <w:sdtPr>
+          <w:rPr>
+            <w:rFonts w:ascii="Segoe UI Symbol" w:hAnsi="Segoe UI Symbol" w:cs="Segoe UI Symbol"/>
+          </w:rPr>
+          <w:id w:val="1458380449"/>
+          <w14:checkbox>
+            <w14:checked w14:val="1"/>
+            <w14:checkedState w14:val="2612" w14:font="MS Gothic"/>
+            <w14:uncheckedState w14:val="2610" w14:font="MS Gothic"/>
+          </w14:checkbox>
+        </w:sdtPr>
+        <w:sdtContent>
+          <w:r>
+            <w:rPr>
+              <w:rFonts w:ascii="MS Gothic" w:eastAsia="MS Gothic" w:hAnsi="MS Gothic" w:cs="Segoe UI Symbol" w:hint="eastAsia"/>
+            </w:rPr>
+            <w:t>☒</w:t>
+          </w:r>
+        </w:sdtContent>
+      </w:sdt>
+      <w:r>
+        <w:rPr>
+          <w:rFonts w:ascii="Arial" w:hAnsi="Arial" w:cs="Arial"/>
+        </w:rPr>
+        <w:t xml:space="preserve"> Chiarire concetti</w:t>
+      </w:r>
+      <w:r>
+        <w:br/>
+      </w:r>
+      <w:sdt>
+        <w:sdtPr>
+          <w:rPr>
+            <w:rFonts w:ascii="Segoe UI Symbol" w:hAnsi="Segoe UI Symbol" w:cs="Segoe UI Symbol"/>
+          </w:rPr>
+          <w:id w:val="1349759347"/>
+          <w14:checkbox>
+            <w14:checked w14:val="0"/>
+            <w14:checkedState w14:val="2612" w14:font="MS Gothic"/>
+            <w14:uncheckedState w14:val="2610" w14:font="MS Gothic"/>
+          </w14:checkbox>
+        </w:sdtPr>
+        <w:sdtContent>
+          <w:r>
+            <w:rPr>
+              <w:rFonts w:ascii="MS Gothic" w:eastAsia="MS Gothic" w:hAnsi="MS Gothic" w:cs="Segoe UI Symbol"/>
+            </w:rPr>
+            <w:t>☐</w:t>
+          </w:r>
+        </w:sdtContent>
+      </w:sdt>
+      <w:r>
+        <w:rPr>
+          <w:rFonts w:ascii="Arial" w:hAnsi="Arial" w:cs="Arial"/>
+        </w:rPr>
+        <w:t xml:space="preserve"> Supporto al codice</w:t>
+      </w:r>
+      <w:r>
+        <w:br/>
+      </w:r>
+      <w:sdt>
+        <w:sdtPr>
+          <w:rPr>
+            <w:rFonts w:ascii="Segoe UI Symbol" w:hAnsi="Segoe UI Symbol" w:cs="Segoe UI Symbol"/>
+          </w:rPr>
+          <w:id w:val="-46618163"/>
+          <w14:checkbox>
+            <w14:checked w14:val="0"/>
+            <w14:checkedState w14:val="2612" w14:font="MS Gothic"/>
+            <w14:uncheckedState w14:val="2610" w14:font="MS Gothic"/>
+          </w14:checkbox>
+        </w:sdtPr>
+        <w:sdtContent>
+          <w:r>
+            <w:rPr>
+              <w:rFonts w:ascii="MS Gothic" w:eastAsia="MS Gothic" w:hAnsi="MS Gothic" w:cs="Segoe UI Symbol"/>
+            </w:rPr>
+            <w:t>☐</w:t>
+          </w:r>
+        </w:sdtContent>
+      </w:sdt>
+      <w:r>
+        <w:rPr>
+          <w:rFonts w:ascii="Arial" w:hAnsi="Arial" w:cs="Arial"/>
+        </w:rPr>
+        <w:t xml:space="preserve"> Debug</w:t>
+      </w:r>
+      <w:r>
+        <w:br/>
+      </w:r>
+      <w:sdt>
+        <w:sdtPr>
+          <w:rPr>
+            <w:rFonts w:ascii="Segoe UI Symbol" w:hAnsi="Segoe UI Symbol" w:cs="Segoe UI Symbol"/>
+          </w:rPr>
+          <w:id w:val="-2029945074"/>
+          <w14:checkbox>
+            <w14:checked w14:val="1"/>
+            <w14:checkedState w14:val="2612" w14:font="MS Gothic"/>
+            <w14:uncheckedState w14:val="2610" w14:font="MS Gothic"/>
+          </w14:checkbox>
+        </w:sdtPr>
+        <w:sdtContent>
+          <w:r>
+            <w:rPr>
+              <w:rFonts w:ascii="MS Gothic" w:eastAsia="MS Gothic" w:hAnsi="MS Gothic" w:cs="Segoe UI Symbol" w:hint="eastAsia"/>
+            </w:rPr>
+            <w:t>☒</w:t>
+          </w:r>
+        </w:sdtContent>
+      </w:sdt>
+      <w:r>
+        <w:rPr>
+          <w:rFonts w:ascii="Arial" w:hAnsi="Arial" w:cs="Arial"/>
+        </w:rPr>
+        <w:t xml:space="preserve"> Riorganizzare idee / testi</w:t>
+      </w:r>
+      <w:r>
+        <w:br/>
+      </w:r>
+      <w:sdt>
+        <w:sdtPr>
+          <w:rPr>
+            <w:rFonts w:ascii="Segoe UI Symbol" w:hAnsi="Segoe UI Symbol" w:cs="Segoe UI Symbol"/>
+          </w:rPr>
+          <w:id w:val="-1922251946"/>
+          <w14:checkbox>
+            <w14:checked w14:val="0"/>
+            <w14:checkedState w14:val="2612" w14:font="MS Gothic"/>
+            <w14:uncheckedState w14:val="2610" w14:font="MS Gothic"/>
+          </w14:checkbox>
+        </w:sdtPr>
+        <w:sdtContent>
+          <w:r>
+            <w:rPr>
+              <w:rFonts w:ascii="MS Gothic" w:eastAsia="MS Gothic" w:hAnsi="MS Gothic" w:cs="Segoe UI Symbol"/>
+            </w:rPr>
+            <w:t>☐</w:t>
+          </w:r>
+        </w:sdtContent>
+      </w:sdt>
+      <w:r>
+        <w:rPr>
+          <w:rFonts w:ascii="Arial" w:hAnsi="Arial" w:cs="Arial"/>
+        </w:rPr>
+        <w:t xml:space="preserve"> Altro: …</w:t>
+      </w:r>
+    </w:p>
+    <w:p>
+      <w:pPr>
+        <w:pStyle w:val="Nessunaspaziatura"/>
+        <w:rPr>
+          <w:rFonts w:ascii="Arial" w:hAnsi="Arial" w:cs="Arial"/>
+        </w:rPr>
+      </w:pPr>
+    </w:p>
+    <w:p>
+      <w:pPr>
+        <w:pStyle w:val="Nessunaspaziatura"/>
+        <w:rPr>
+          <w:rFonts w:ascii="Arial" w:hAnsi="Arial" w:cs="Arial"/>
+          <w:b/>
+          <w:bCs/>
+        </w:rPr>
+      </w:pPr>
+      <w:r>
+        <w:rPr>
+          <w:rFonts w:ascii="Arial" w:hAnsi="Arial" w:cs="Arial"/>
+          <w:b/>
+          <w:bCs/>
+        </w:rPr>
+        <w:t>Esempio significativo di utilizzo (UNO SOLO)</w:t>
+      </w:r>
+    </w:p>
+    <w:p>
+      <w:pPr>
+        <w:pStyle w:val="Nessunaspaziatura"/>
+        <w:rPr>
+          <w:rFonts w:ascii="Arial" w:hAnsi="Arial" w:cs="Arial"/>
+        </w:rPr>
+      </w:pPr>
+      <w:r>
+        <w:rPr>
+          <w:rFonts w:ascii="Arial" w:hAnsi="Arial" w:cs="Arial"/>
+        </w:rPr>
+        <w:t xml:space="preserve">Riporta </w:t>
+      </w:r>
+      <w:r>
+        <w:rPr>
+          <w:rFonts w:ascii="Arial" w:hAnsi="Arial" w:cs="Arial"/>
+          <w:i/>
+          <w:iCs/>
+        </w:rPr>
+        <w:t>un</w:t>
+      </w:r>
+      <w:r>
+        <w:rPr>
+          <w:rFonts w:ascii="Arial" w:hAnsi="Arial" w:cs="Arial"/>
+        </w:rPr>
+        <w:t xml:space="preserve"> prompt rilevante oppure descrivilo a parole se ce ne sono stati molti.</w:t>
+      </w:r>
+    </w:p>
+    <w:p>
+      <w:pPr>
+        <w:pStyle w:val="Nessunaspaziatura"/>
+        <w:rPr>
+          <w:rFonts w:ascii="Arial" w:hAnsi="Arial" w:cs="Arial"/>
+        </w:rPr>
+      </w:pPr>
+    </w:p>
+    <w:sdt>
+      <w:sdtPr>
+        <w:rPr>
+          <w:rFonts w:ascii="Arial" w:hAnsi="Arial" w:cs="Arial"/>
+        </w:rPr>
+        <w:alias w:val="Prompt AI"/>
+        <w:tag w:val="Prompt AI"/>
+        <w:id w:val="652261323"/>
+        <w:placeholder>
+          <w:docPart w:val="2D4137CC3410442AA6FDE66233BB9826"/>
+        </w:placeholder>
+        <w15:color w:val="C0C0C0"/>
+      </w:sdtPr>
+      <w:sdtContent>
+        <w:p>
+          <w:pPr>
+            <w:pStyle w:val="Nessunaspaziatura"/>
+            <w:spacing w:line="276" w:lineRule="auto"/>
+            <w:rPr>
+              <w:rFonts w:ascii="Arial" w:hAnsi="Arial" w:cs="Arial"/>
+            </w:rPr>
+          </w:pPr>
+          <w:r>
+            <w:rPr>
+              <w:rFonts w:ascii="Arial" w:hAnsi="Arial" w:cs="Arial"/>
+            </w:rPr>
+            <w:t>Aiutami a migliorare questo testo per spiegare meglio i concetti.</w:t>
+          </w:r>
+        </w:p>
+      </w:sdtContent>
+    </w:sdt>
+    <w:p>
+      <w:pPr>
+        <w:pStyle w:val="Nessunaspaziatura"/>
+        <w:rPr>
+          <w:rFonts w:ascii="Arial" w:hAnsi="Arial" w:cs="Arial"/>
+        </w:rPr>
+      </w:pPr>
+    </w:p>
+    <w:p>
+      <w:pPr>
+        <w:pStyle w:val="Nessunaspaziatura"/>
+        <w:rPr>
+          <w:rFonts w:ascii="Arial" w:hAnsi="Arial" w:cs="Arial"/>
+        </w:rPr>
+      </w:pPr>
+    </w:p>
+    <w:p>
+      <w:pPr>
+        <w:pStyle w:val="Nessunaspaziatura"/>
+        <w:rPr>
+          <w:rFonts w:ascii="Arial" w:hAnsi="Arial" w:cs="Arial"/>
+        </w:rPr>
+      </w:pPr>
+      <w:r>
+        <w:rPr>
+          <w:rFonts w:ascii="Arial" w:hAnsi="Arial" w:cs="Arial"/>
+          <w:b/>
+          <w:bCs/>
+        </w:rPr>
+        <w:t>Cosa mi ha dato l’AI</w:t>
+      </w:r>
+    </w:p>
+    <w:p>
+      <w:pPr>
+        <w:pStyle w:val="Nessunaspaziatura"/>
+        <w:rPr>
+          <w:rFonts w:ascii="Arial" w:hAnsi="Arial" w:cs="Arial"/>
+        </w:rPr>
+      </w:pPr>
+      <w:r>
+        <w:rPr>
+          <w:rFonts w:ascii="Arial" w:hAnsi="Arial" w:cs="Arial"/>
+        </w:rPr>
+        <w:t>Spiegazione, esempio, soluzione, suggerimento…</w:t>
+      </w:r>
+    </w:p>
+    <w:p>
+      <w:pPr>
+        <w:pStyle w:val="Nessunaspaziatura"/>
+        <w:rPr>
+          <w:rFonts w:ascii="Arial" w:hAnsi="Arial" w:cs="Arial"/>
+        </w:rPr>
+      </w:pPr>
+    </w:p>
+    <w:sdt>
+      <w:sdtPr>
+        <w:rPr>
+          <w:rFonts w:ascii="Arial" w:hAnsi="Arial" w:cs="Arial"/>
+        </w:rPr>
+        <w:alias w:val="Risposta AI"/>
+        <w:tag w:val="Risposta AI"/>
+        <w:id w:val="990598304"/>
+        <w:placeholder>
+          <w:docPart w:val="607F3FF7388E4923BFFA8DAF4796AEB1"/>
+        </w:placeholder>
+        <w15:color w:val="C0C0C0"/>
+      </w:sdtPr>
+      <w:sdtContent>
+        <w:p>
+          <w:pPr>
+            <w:pStyle w:val="Nessunaspaziatura"/>
+            <w:spacing w:line="276" w:lineRule="auto"/>
+            <w:rPr>
+              <w:rFonts w:ascii="Arial" w:hAnsi="Arial" w:cs="Arial"/>
+            </w:rPr>
+          </w:pPr>
+          <w:r>
+            <w:rPr>
+              <w:rFonts w:ascii="Arial" w:hAnsi="Arial" w:cs="Arial"/>
+            </w:rPr>
+            <w:t>Una base del contenuto dell’analisi del dominio.</w:t>
+          </w:r>
+        </w:p>
+      </w:sdtContent>
+    </w:sdt>
+    <w:p>
+      <w:pPr>
+        <w:pStyle w:val="Nessunaspaziatura"/>
+        <w:rPr>
+          <w:rFonts w:ascii="Arial" w:hAnsi="Arial" w:cs="Arial"/>
+          <w:b/>
+          <w:bCs/>
+        </w:rPr>
+      </w:pPr>
+    </w:p>
+    <w:p>
+      <w:pPr>
+        <w:pStyle w:val="Nessunaspaziatura"/>
+        <w:rPr>
+          <w:rFonts w:ascii="Arial" w:hAnsi="Arial" w:cs="Arial"/>
+        </w:rPr>
+      </w:pPr>
+      <w:r>
+        <w:rPr>
+          <w:rFonts w:ascii="Arial" w:hAnsi="Arial" w:cs="Arial"/>
+          <w:b/>
+          <w:bCs/>
+        </w:rPr>
+        <w:t>Come l’ho usato io</w:t>
+      </w:r>
+      <w:r>
+        <w:rPr>
+          <w:rFonts w:ascii="Arial" w:hAnsi="Arial" w:cs="Arial"/>
+        </w:rPr>
+        <w:br/>
+      </w:r>
+      <w:sdt>
+        <w:sdtPr>
+          <w:rPr>
+            <w:rFonts w:ascii="Segoe UI Symbol" w:hAnsi="Segoe UI Symbol" w:cs="Segoe UI Symbol"/>
+          </w:rPr>
+          <w:id w:val="-1043972392"/>
+          <w14:checkbox>
+            <w14:checked w14:val="0"/>
+            <w14:checkedState w14:val="2612" w14:font="MS Gothic"/>
+            <w14:uncheckedState w14:val="2610" w14:font="MS Gothic"/>
+          </w14:checkbox>
+        </w:sdtPr>
+        <w:sdtContent>
+          <w:r>
+            <w:rPr>
+              <w:rFonts w:ascii="MS Gothic" w:eastAsia="MS Gothic" w:hAnsi="MS Gothic" w:cs="Segoe UI Symbol" w:hint="eastAsia"/>
+            </w:rPr>
+            <w:t>☐</w:t>
+          </w:r>
+        </w:sdtContent>
+      </w:sdt>
+      <w:r>
+        <w:rPr>
+          <w:rFonts w:ascii="Arial" w:hAnsi="Arial" w:cs="Arial"/>
+        </w:rPr>
+        <w:t xml:space="preserve"> Copiato</w:t>
+      </w:r>
+      <w:r>
+        <w:rPr>
+          <w:rFonts w:ascii="Arial" w:hAnsi="Arial" w:cs="Arial"/>
+        </w:rPr>
+        <w:br/>
+      </w:r>
+      <w:sdt>
+        <w:sdtPr>
+          <w:rPr>
+            <w:rFonts w:ascii="Segoe UI Symbol" w:hAnsi="Segoe UI Symbol" w:cs="Segoe UI Symbol"/>
+          </w:rPr>
+          <w:id w:val="833874997"/>
+          <w14:checkbox>
+            <w14:checked w14:val="1"/>
+            <w14:checkedState w14:val="2612" w14:font="MS Gothic"/>
+            <w14:uncheckedState w14:val="2610" w14:font="MS Gothic"/>
+          </w14:checkbox>
+        </w:sdtPr>
+        <w:sdtContent>
+          <w:r>
+            <w:rPr>
+              <w:rFonts w:ascii="MS Gothic" w:eastAsia="MS Gothic" w:hAnsi="MS Gothic" w:cs="Segoe UI Symbol" w:hint="eastAsia"/>
+            </w:rPr>
+            <w:t>☒</w:t>
+          </w:r>
+        </w:sdtContent>
+      </w:sdt>
+      <w:r>
+        <w:rPr>
+          <w:rFonts w:ascii="Arial" w:hAnsi="Arial" w:cs="Arial"/>
+        </w:rPr>
+        <w:t xml:space="preserve"> Adattato</w:t>
+      </w:r>
+      <w:r>
+        <w:rPr>
+          <w:rFonts w:ascii="Arial" w:hAnsi="Arial" w:cs="Arial"/>
+        </w:rPr>
+        <w:br/>
+      </w:r>
+      <w:sdt>
+        <w:sdtPr>
+          <w:rPr>
+            <w:rFonts w:ascii="Segoe UI Symbol" w:hAnsi="Segoe UI Symbol" w:cs="Segoe UI Symbol"/>
+          </w:rPr>
+          <w:id w:val="236444252"/>
+          <w14:checkbox>
+            <w14:checked w14:val="0"/>
+            <w14:checkedState w14:val="2612" w14:font="MS Gothic"/>
+            <w14:uncheckedState w14:val="2610" w14:font="MS Gothic"/>
+          </w14:checkbox>
+        </w:sdtPr>
+        <w:sdtContent>
+          <w:r>
+            <w:rPr>
+              <w:rFonts w:ascii="MS Gothic" w:eastAsia="MS Gothic" w:hAnsi="MS Gothic" w:cs="Segoe UI Symbol" w:hint="eastAsia"/>
+            </w:rPr>
+            <w:t>☐</w:t>
+          </w:r>
+        </w:sdtContent>
+      </w:sdt>
+      <w:r>
+        <w:rPr>
+          <w:rFonts w:ascii="Arial" w:hAnsi="Arial" w:cs="Arial"/>
+        </w:rPr>
+        <w:t xml:space="preserve"> Usato solo per capire</w:t>
+      </w:r>
+      <w:r>
+        <w:rPr>
+          <w:rFonts w:ascii="Arial" w:hAnsi="Arial" w:cs="Arial"/>
+        </w:rPr>
+        <w:br/>
+      </w:r>
+      <w:sdt>
+        <w:sdtPr>
+          <w:rPr>
+            <w:rFonts w:ascii="Segoe UI Symbol" w:hAnsi="Segoe UI Symbol" w:cs="Segoe UI Symbol"/>
+          </w:rPr>
+          <w:id w:val="1849057019"/>
+          <w14:checkbox>
+            <w14:checked w14:val="0"/>
+            <w14:checkedState w14:val="2612" w14:font="MS Gothic"/>
+            <w14:uncheckedState w14:val="2610" w14:font="MS Gothic"/>
+          </w14:checkbox>
+        </w:sdtPr>
+        <w:sdtContent>
+          <w:r>
+            <w:rPr>
+              <w:rFonts w:ascii="MS Gothic" w:eastAsia="MS Gothic" w:hAnsi="MS Gothic" w:cs="Segoe UI Symbol" w:hint="eastAsia"/>
+            </w:rPr>
+            <w:t>☐</w:t>
+          </w:r>
+        </w:sdtContent>
+      </w:sdt>
+      <w:r>
+        <w:rPr>
+          <w:rFonts w:ascii="Arial" w:hAnsi="Arial" w:cs="Arial"/>
+        </w:rPr>
+        <w:t xml:space="preserve"> Scartato</w:t>
+      </w:r>
+    </w:p>
+    <w:p>
+      <w:pPr>
+        <w:pStyle w:val="Nessunaspaziatura"/>
+        <w:rPr>
+          <w:rFonts w:ascii="Arial" w:hAnsi="Arial" w:cs="Arial"/>
+        </w:rPr>
+      </w:pPr>
+    </w:p>
+    <w:p>
+      <w:pPr>
+        <w:pStyle w:val="Nessunaspaziatura"/>
+        <w:rPr>
+          <w:rFonts w:ascii="Arial" w:hAnsi="Arial" w:cs="Arial"/>
+        </w:rPr>
+      </w:pPr>
+    </w:p>
+    <w:p>
+      <w:pPr>
+        <w:pStyle w:val="Nessunaspaziatura"/>
+        <w:rPr>
+          <w:rFonts w:ascii="Arial" w:hAnsi="Arial" w:cs="Arial"/>
+        </w:rPr>
+      </w:pPr>
+      <w:r>
+        <w:rPr>
+          <w:rFonts w:ascii="Arial" w:hAnsi="Arial" w:cs="Arial"/>
+          <w:b/>
+          <w:bCs/>
+        </w:rPr>
+        <w:t>Cosa avrei fatto senza AI?</w:t>
+      </w:r>
+    </w:p>
+    <w:p>
+      <w:pPr>
+        <w:pStyle w:val="Nessunaspaziatura"/>
+        <w:rPr>
+          <w:rFonts w:ascii="Arial" w:hAnsi="Arial" w:cs="Arial"/>
+        </w:rPr>
+      </w:pPr>
+    </w:p>
+    <w:sdt>
+      <w:sdtPr>
+        <w:rPr>
+          <w:rFonts w:ascii="Arial" w:hAnsi="Arial" w:cs="Arial"/>
+        </w:rPr>
+        <w:alias w:val="Proprio commento"/>
+        <w:tag w:val="Proprio commento"/>
+        <w:id w:val="651333087"/>
+        <w:placeholder>
+          <w:docPart w:val="607F3FF7388E4923BFFA8DAF4796AEB1"/>
         </w:placeholder>
         <w15:color w:val="C0C0C0"/>
       </w:sdtPr>
@@ -7875,6 +9163,107 @@
         </w:p>
       </w:docPartBody>
     </w:docPart>
+    <w:docPart>
+      <w:docPartPr>
+        <w:name w:val="3205420654B042A293DDC5C0462DB8BB"/>
+        <w:category>
+          <w:name w:val="Generale"/>
+          <w:gallery w:val="placeholder"/>
+        </w:category>
+        <w:types>
+          <w:type w:val="bbPlcHdr"/>
+        </w:types>
+        <w:behaviors>
+          <w:behavior w:val="content"/>
+        </w:behaviors>
+        <w:guid w:val="{7781EE29-189B-4D0F-8A93-91DE410CAF32}"/>
+      </w:docPartPr>
+      <w:docPartBody>
+        <w:p>
+          <w:pPr>
+            <w:pStyle w:val="3205420654B042A293DDC5C0462DB8BB"/>
+          </w:pPr>
+          <w:r>
+            <w:rPr>
+              <w:rStyle w:val="Testosegnaposto"/>
+              <w:b/>
+              <w:bCs/>
+            </w:rPr>
+            <w:t>Nomi AI utilizzati</w:t>
+          </w:r>
+        </w:p>
+      </w:docPartBody>
+    </w:docPart>
+    <w:docPart>
+      <w:docPartPr>
+        <w:name w:val="2D4137CC3410442AA6FDE66233BB9826"/>
+        <w:category>
+          <w:name w:val="Generale"/>
+          <w:gallery w:val="placeholder"/>
+        </w:category>
+        <w:types>
+          <w:type w:val="bbPlcHdr"/>
+        </w:types>
+        <w:behaviors>
+          <w:behavior w:val="content"/>
+        </w:behaviors>
+        <w:guid w:val="{D804AF17-6B11-4A03-AA3C-21C4855056B2}"/>
+      </w:docPartPr>
+      <w:docPartBody>
+        <w:p>
+          <w:pPr>
+            <w:pStyle w:val="2D4137CC3410442AA6FDE66233BB9826"/>
+          </w:pPr>
+          <w:r>
+            <w:rPr>
+              <w:rStyle w:val="Testosegnaposto"/>
+            </w:rPr>
+            <w:t>Fare clic o toccare qui per immettere il testo.</w:t>
+          </w:r>
+        </w:p>
+      </w:docPartBody>
+    </w:docPart>
+    <w:docPart>
+      <w:docPartPr>
+        <w:name w:val="607F3FF7388E4923BFFA8DAF4796AEB1"/>
+        <w:category>
+          <w:name w:val="Generale"/>
+          <w:gallery w:val="placeholder"/>
+        </w:category>
+        <w:types>
+          <w:type w:val="bbPlcHdr"/>
+        </w:types>
+        <w:behaviors>
+          <w:behavior w:val="content"/>
+        </w:behaviors>
+        <w:guid w:val="{9F3F5A8F-E7F2-43BD-A3CE-231DEEE5FD68}"/>
+      </w:docPartPr>
+      <w:docPartBody>
+        <w:p>
+          <w:pPr>
+            <w:pStyle w:val="607F3FF7388E4923BFFA8DAF4796AEB1"/>
+          </w:pPr>
+          <w:r>
+            <w:rPr>
+              <w:rStyle w:val="Testosegnaposto"/>
+            </w:rPr>
+            <w:t xml:space="preserve">Fare clic o toccare qui per </w:t>
+          </w:r>
+          <w:r>
+            <w:rPr>
+              <w:rStyle w:val="Testosegnaposto"/>
+            </w:rPr>
+            <w:t>immettere</w:t>
+          </w:r>
+          <w:r>
+            <w:rPr>
+              <w:rStyle w:val="Testosegnaposto"/>
+            </w:rPr>
+            <w:t xml:space="preserve"> il testo.</w:t>
+          </w:r>
+        </w:p>
+      </w:docPartBody>
+    </w:docPart>
   </w:docParts>
 </w:glossaryDocument>
 </file>
@@ -8011,12 +9400,15 @@
     <w:rsid w:val="00534571"/>
     <w:rsid w:val="00565B11"/>
     <w:rsid w:val="0063588A"/>
+    <w:rsid w:val="0066686E"/>
+    <w:rsid w:val="00715227"/>
     <w:rsid w:val="007F4556"/>
     <w:rsid w:val="0080736A"/>
     <w:rsid w:val="009826E2"/>
     <w:rsid w:val="00A04D62"/>
     <w:rsid w:val="00A65B6C"/>
     <w:rsid w:val="00BE72BC"/>
+    <w:rsid w:val="00DA48BB"/>
     <w:rsid w:val="00DE2402"/>
     <w:rsid w:val="00DE4EBE"/>
     <w:rsid w:val="00ED4879"/>
@@ -8477,7 +9869,7 @@
     <w:basedOn w:val="Carpredefinitoparagrafo"/>
     <w:uiPriority w:val="99"/>
     <w:semiHidden/>
-    <w:rsid w:val="00565B11"/>
+    <w:rsid w:val="00715227"/>
     <w:rPr>
       <w:color w:val="666666"/>
     </w:rPr>
@@ -8550,6 +9942,18 @@
   <w:style w:type="paragraph" w:customStyle="1" w:styleId="CB2155D438D4499DA3A0F630FDE35D43">
     <w:name w:val="CB2155D438D4499DA3A0F630FDE35D43"/>
     <w:rsid w:val="00565B11"/>
+  </w:style>
+  <w:style w:type="paragraph" w:customStyle="1" w:styleId="3205420654B042A293DDC5C0462DB8BB">
+    <w:name w:val="3205420654B042A293DDC5C0462DB8BB"/>
+    <w:rsid w:val="00715227"/>
+  </w:style>
+  <w:style w:type="paragraph" w:customStyle="1" w:styleId="2D4137CC3410442AA6FDE66233BB9826">
+    <w:name w:val="2D4137CC3410442AA6FDE66233BB9826"/>
+    <w:rsid w:val="00715227"/>
+  </w:style>
+  <w:style w:type="paragraph" w:customStyle="1" w:styleId="607F3FF7388E4923BFFA8DAF4796AEB1">
+    <w:name w:val="607F3FF7388E4923BFFA8DAF4796AEB1"/>
+    <w:rsid w:val="00715227"/>
   </w:style>
 </w:styles>
 </file>

</xml_diff>

<commit_message>
Modifiche strutturali gantt e diario
</commit_message>
<xml_diff>
--- a/4_Diari/Diario.docx
+++ b/4_Diari/Diario.docx
@@ -4047,13 +4047,7 @@
               <w:rPr>
                 <w:rFonts w:ascii="Arial" w:hAnsi="Arial" w:cs="Arial"/>
               </w:rPr>
-              <w:t>11</w:t>
-            </w:r>
-            <w:r>
-              <w:rPr>
-                <w:rFonts w:ascii="Arial" w:hAnsi="Arial" w:cs="Arial"/>
-              </w:rPr>
-              <w:t>.09.2026</w:t>
+              <w:t>11.09.2026</w:t>
             </w:r>
           </w:p>
         </w:tc>
@@ -4131,8 +4125,16 @@
               <w:rPr>
                 <w:rFonts w:ascii="Arial" w:hAnsi="Arial" w:cs="Arial"/>
               </w:rPr>
-              <w:t>Inizio diagramma ER</w:t>
+              <w:t xml:space="preserve">Creato diagramma ER e modifiche strutturali </w:t>
             </w:r>
+            <w:proofErr w:type="spellStart"/>
+            <w:r>
+              <w:rPr>
+                <w:rFonts w:ascii="Arial" w:hAnsi="Arial" w:cs="Arial"/>
+              </w:rPr>
+              <w:t>gantt</w:t>
+            </w:r>
+            <w:proofErr w:type="spellEnd"/>
           </w:p>
         </w:tc>
       </w:tr>
@@ -4169,16 +4171,8 @@
               <w:rPr>
                 <w:rFonts w:ascii="Arial" w:hAnsi="Arial" w:cs="Arial"/>
               </w:rPr>
-              <w:t xml:space="preserve">Completata la analisi del dominio nella documentazione, inizio ricerche riguardo </w:t>
+              <w:t>Completato analisi dei del dominio e dei mezzi</w:t>
             </w:r>
-            <w:proofErr w:type="spellStart"/>
-            <w:r>
-              <w:rPr>
-                <w:rFonts w:ascii="Arial" w:hAnsi="Arial" w:cs="Arial"/>
-              </w:rPr>
-              <w:t>Unity</w:t>
-            </w:r>
-            <w:proofErr w:type="spellEnd"/>
             <w:r>
               <w:rPr>
                 <w:rFonts w:ascii="Arial" w:hAnsi="Arial" w:cs="Arial"/>
@@ -4262,7 +4256,7 @@
               <w:rPr>
                 <w:rFonts w:ascii="Arial" w:hAnsi="Arial" w:cs="Arial"/>
               </w:rPr>
-              <w:t>Indecisioni sulla struttura del DB e discorsi extracurricolari che anno portato via un po' di tempo</w:t>
+              <w:t>-</w:t>
             </w:r>
           </w:p>
         </w:tc>
@@ -4358,21 +4352,7 @@
               <w:rPr>
                 <w:rFonts w:ascii="Arial" w:hAnsi="Arial" w:cs="Arial"/>
               </w:rPr>
-              <w:t xml:space="preserve">Il diagramma ER non è completo e </w:t>
-            </w:r>
-            <w:proofErr w:type="gramStart"/>
-            <w:r>
-              <w:rPr>
-                <w:rFonts w:ascii="Arial" w:hAnsi="Arial" w:cs="Arial"/>
-              </w:rPr>
-              <w:t>lo use</w:t>
-            </w:r>
-            <w:proofErr w:type="gramEnd"/>
-            <w:r>
-              <w:rPr>
-                <w:rFonts w:ascii="Arial" w:hAnsi="Arial" w:cs="Arial"/>
-              </w:rPr>
-              <w:t xml:space="preserve"> case non è stato iniziato, analisi dei mezzi non ancora completata.</w:t>
+              <w:t>Use case non ancora iniziato</w:t>
             </w:r>
           </w:p>
         </w:tc>
@@ -4430,7 +4410,7 @@
               <w:rPr>
                 <w:rFonts w:ascii="Arial" w:hAnsi="Arial" w:cs="Arial"/>
               </w:rPr>
-              <w:t>Completamento fase analisi.</w:t>
+              <w:t>Completamento use case e inizio progettazione</w:t>
             </w:r>
           </w:p>
         </w:tc>
@@ -4910,6 +4890,7 @@
         </w:placeholder>
         <w15:color w:val="C0C0C0"/>
       </w:sdtPr>
+      <w:sdtEndPr/>
       <w:sdtContent>
         <w:p>
           <w:pPr>
@@ -4923,19 +4904,52 @@
             <w:rPr>
               <w:rFonts w:ascii="Arial" w:hAnsi="Arial" w:cs="Arial"/>
             </w:rPr>
-            <w:t>Aiutami a migliorare questo testo per spiegare meglio i concetti.</w:t>
+            <w:t>Riley: p</w:t>
+          </w:r>
+          <w:r>
+            <w:rPr>
+              <w:rFonts w:ascii="Arial" w:hAnsi="Arial" w:cs="Arial"/>
+            </w:rPr>
+            <w:t xml:space="preserve">uoi dirmi delle classiche impostazioni per un gioco di guida in stile </w:t>
+          </w:r>
+          <w:proofErr w:type="spellStart"/>
+          <w:r>
+            <w:rPr>
+              <w:rFonts w:ascii="Arial" w:hAnsi="Arial" w:cs="Arial"/>
+            </w:rPr>
+            <w:t>br</w:t>
+          </w:r>
+          <w:proofErr w:type="spellEnd"/>
+          <w:r>
+            <w:rPr>
+              <w:rFonts w:ascii="Arial" w:hAnsi="Arial" w:cs="Arial"/>
+            </w:rPr>
+            <w:t xml:space="preserve">. </w:t>
+          </w:r>
+          <w:r>
+            <w:rPr>
+              <w:rFonts w:ascii="Arial" w:hAnsi="Arial" w:cs="Arial"/>
+            </w:rPr>
+            <w:br/>
+            <w:t xml:space="preserve">Bryan: Spiegami </w:t>
+          </w:r>
+          <w:proofErr w:type="spellStart"/>
+          <w:r>
+            <w:rPr>
+              <w:rFonts w:ascii="Arial" w:hAnsi="Arial" w:cs="Arial"/>
+            </w:rPr>
+            <w:t>Unity</w:t>
+          </w:r>
+          <w:proofErr w:type="spellEnd"/>
+          <w:r>
+            <w:rPr>
+              <w:rFonts w:ascii="Arial" w:hAnsi="Arial" w:cs="Arial"/>
+            </w:rPr>
+            <w:t xml:space="preserve"> ed i suoi vantaggi.</w:t>
           </w:r>
         </w:p>
       </w:sdtContent>
     </w:sdt>
-    <w:p>
-      <w:pPr>
-        <w:pStyle w:val="Nessunaspaziatura"/>
-        <w:rPr>
-          <w:rFonts w:ascii="Arial" w:hAnsi="Arial" w:cs="Arial"/>
-        </w:rPr>
-      </w:pPr>
-    </w:p>
     <w:p>
       <w:pPr>
         <w:pStyle w:val="Nessunaspaziatura"/>
@@ -5008,7 +5022,7 @@
             <w:rPr>
               <w:rFonts w:ascii="Arial" w:hAnsi="Arial" w:cs="Arial"/>
             </w:rPr>
-            <w:t>Una base del contenuto dell’analisi del dominio.</w:t>
+            <w:t xml:space="preserve">Una lista di varie impostazioni possibili, </w:t>
           </w:r>
         </w:p>
       </w:sdtContent>
@@ -5051,7 +5065,7 @@
           </w:rPr>
           <w:id w:val="-1043972392"/>
           <w14:checkbox>
-            <w14:checked w14:val="0"/>
+            <w14:checked w14:val="1"/>
             <w14:checkedState w14:val="2612" w14:font="MS Gothic"/>
             <w14:uncheckedState w14:val="2610" w14:font="MS Gothic"/>
           </w14:checkbox>
@@ -5061,7 +5075,7 @@
             <w:rPr>
               <w:rFonts w:ascii="MS Gothic" w:eastAsia="MS Gothic" w:hAnsi="MS Gothic" w:cs="Segoe UI Symbol" w:hint="eastAsia"/>
             </w:rPr>
-            <w:t>☐</w:t>
+            <w:t>☒</w:t>
           </w:r>
         </w:sdtContent>
       </w:sdt>
@@ -5084,7 +5098,7 @@
           </w:rPr>
           <w:id w:val="833874997"/>
           <w14:checkbox>
-            <w14:checked w14:val="1"/>
+            <w14:checked w14:val="0"/>
             <w14:checkedState w14:val="2612" w14:font="MS Gothic"/>
             <w14:uncheckedState w14:val="2610" w14:font="MS Gothic"/>
           </w14:checkbox>
@@ -5094,7 +5108,7 @@
             <w:rPr>
               <w:rFonts w:ascii="MS Gothic" w:eastAsia="MS Gothic" w:hAnsi="MS Gothic" w:cs="Segoe UI Symbol" w:hint="eastAsia"/>
             </w:rPr>
-            <w:t>☒</w:t>
+            <w:t>☐</w:t>
           </w:r>
         </w:sdtContent>
       </w:sdt>
@@ -5117,7 +5131,7 @@
           </w:rPr>
           <w:id w:val="236444252"/>
           <w14:checkbox>
-            <w14:checked w14:val="0"/>
+            <w14:checked w14:val="1"/>
             <w14:checkedState w14:val="2612" w14:font="MS Gothic"/>
             <w14:uncheckedState w14:val="2610" w14:font="MS Gothic"/>
           </w14:checkbox>
@@ -5127,7 +5141,7 @@
             <w:rPr>
               <w:rFonts w:ascii="MS Gothic" w:eastAsia="MS Gothic" w:hAnsi="MS Gothic" w:cs="Segoe UI Symbol" w:hint="eastAsia"/>
             </w:rPr>
-            <w:t>☐</w:t>
+            <w:t>☒</w:t>
           </w:r>
         </w:sdtContent>
       </w:sdt>
@@ -5211,37 +5225,6 @@
         </w:rPr>
       </w:pPr>
     </w:p>
-    <w:sdt>
-      <w:sdtPr>
-        <w:rPr>
-          <w:rFonts w:ascii="Arial" w:hAnsi="Arial" w:cs="Arial"/>
-        </w:rPr>
-        <w:alias w:val="Proprio commento"/>
-        <w:tag w:val="Proprio commento"/>
-        <w:id w:val="651333087"/>
-        <w:placeholder>
-          <w:docPart w:val="607F3FF7388E4923BFFA8DAF4796AEB1"/>
-        </w:placeholder>
-        <w15:color w:val="C0C0C0"/>
-      </w:sdtPr>
-      <w:sdtContent>
-        <w:p>
-          <w:pPr>
-            <w:pStyle w:val="Nessunaspaziatura"/>
-            <w:spacing w:line="276" w:lineRule="auto"/>
-            <w:rPr>
-              <w:rFonts w:ascii="Arial" w:hAnsi="Arial" w:cs="Arial"/>
-            </w:rPr>
-          </w:pPr>
-          <w:r>
-            <w:rPr>
-              <w:rFonts w:ascii="Arial" w:hAnsi="Arial" w:cs="Arial"/>
-            </w:rPr>
-            <w:t>Ricerca più approfondita e dispendiosa a livello di tempo per spiegare il concetto.</w:t>
-          </w:r>
-        </w:p>
-      </w:sdtContent>
-    </w:sdt>
     <w:p>
       <w:pPr>
         <w:pStyle w:val="Nessunaspaziatura"/>
@@ -5250,6 +5233,12 @@
           <w:rFonts w:ascii="Arial" w:hAnsi="Arial" w:cs="Arial"/>
         </w:rPr>
       </w:pPr>
+      <w:r>
+        <w:rPr>
+          <w:rFonts w:ascii="Arial" w:hAnsi="Arial" w:cs="Arial"/>
+        </w:rPr>
+        <w:t>Pensato in modo autonomo a delle possibili impostazioni</w:t>
+      </w:r>
     </w:p>
     <w:sectPr>
       <w:headerReference w:type="default" r:id="rId8"/>
@@ -8377,7 +8366,6 @@
   <w:style w:type="character" w:default="1" w:styleId="Carpredefinitoparagrafo">
     <w:name w:val="Default Paragraph Font"/>
     <w:uiPriority w:val="1"/>
-    <w:semiHidden/>
     <w:unhideWhenUsed/>
   </w:style>
   <w:style w:type="table" w:default="1" w:styleId="Tabellanormale">
@@ -9394,6 +9382,7 @@
   </w:compat>
   <w:rsids>
     <w:rsidRoot w:val="00BE72BC"/>
+    <w:rsid w:val="001A3B5C"/>
     <w:rsid w:val="00352469"/>
     <w:rsid w:val="00396FDF"/>
     <w:rsid w:val="003B3A61"/>
@@ -9407,10 +9396,12 @@
     <w:rsid w:val="009826E2"/>
     <w:rsid w:val="00A04D62"/>
     <w:rsid w:val="00A65B6C"/>
+    <w:rsid w:val="00BD5007"/>
     <w:rsid w:val="00BE72BC"/>
     <w:rsid w:val="00DA48BB"/>
     <w:rsid w:val="00DE2402"/>
     <w:rsid w:val="00DE4EBE"/>
+    <w:rsid w:val="00DF4754"/>
     <w:rsid w:val="00ED4879"/>
     <w:rsid w:val="00EE3640"/>
     <w:rsid w:val="00F26F5B"/>

</xml_diff>

<commit_message>
Modifiche gantt e diario
</commit_message>
<xml_diff>
--- a/4_Diari/Diario.docx
+++ b/4_Diari/Diario.docx
@@ -193,21 +193,7 @@
               <w:rPr>
                 <w:rFonts w:ascii="Arial" w:hAnsi="Arial" w:cs="Arial"/>
               </w:rPr>
-              <w:t xml:space="preserve">Riflettuto sui requisiti e user story del gioco, creato i primi template per </w:t>
-            </w:r>
-            <w:proofErr w:type="spellStart"/>
-            <w:r>
-              <w:rPr>
-                <w:rFonts w:ascii="Arial" w:hAnsi="Arial" w:cs="Arial"/>
-              </w:rPr>
-              <w:t>gantt</w:t>
-            </w:r>
-            <w:proofErr w:type="spellEnd"/>
-            <w:r>
-              <w:rPr>
-                <w:rFonts w:ascii="Arial" w:hAnsi="Arial" w:cs="Arial"/>
-              </w:rPr>
-              <w:t xml:space="preserve"> e diario</w:t>
+              <w:t>Riflettuto sui requisiti e user story del gioco, creato i primi template per gantt e diario</w:t>
             </w:r>
           </w:p>
         </w:tc>
@@ -248,21 +234,7 @@
               <w:rPr>
                 <w:rFonts w:ascii="Arial" w:hAnsi="Arial" w:cs="Arial"/>
               </w:rPr>
-              <w:t xml:space="preserve">Riflettuto sui requisiti e user story del gioco, iniziato scrittura documentazione e sincronizzazione progetto a </w:t>
-            </w:r>
-            <w:proofErr w:type="spellStart"/>
-            <w:r>
-              <w:rPr>
-                <w:rFonts w:ascii="Arial" w:hAnsi="Arial" w:cs="Arial"/>
-              </w:rPr>
-              <w:t>GitLab</w:t>
-            </w:r>
-            <w:proofErr w:type="spellEnd"/>
-            <w:r>
-              <w:rPr>
-                <w:rFonts w:ascii="Arial" w:hAnsi="Arial" w:cs="Arial"/>
-              </w:rPr>
-              <w:t>.</w:t>
+              <w:t>Riflettuto sui requisiti e user story del gioco, iniziato scrittura documentazione e sincronizzazione progetto a GitLab.</w:t>
             </w:r>
           </w:p>
         </w:tc>
@@ -703,25 +675,7 @@
               <w:b/>
               <w:bCs/>
             </w:rPr>
-            <w:t xml:space="preserve">Nomi </w:t>
-          </w:r>
-          <w:proofErr w:type="gramStart"/>
-          <w:r>
-            <w:rPr>
-              <w:rStyle w:val="Testosegnaposto"/>
-              <w:b/>
-              <w:bCs/>
-            </w:rPr>
-            <w:t>AI</w:t>
-          </w:r>
-          <w:proofErr w:type="gramEnd"/>
-          <w:r>
-            <w:rPr>
-              <w:rStyle w:val="Testosegnaposto"/>
-              <w:b/>
-              <w:bCs/>
-            </w:rPr>
-            <w:t xml:space="preserve"> utilizzati</w:t>
+            <w:t>Nomi AI utilizzati</w:t>
           </w:r>
         </w:sdtContent>
       </w:sdt>
@@ -1802,21 +1756,7 @@
               <w:rPr>
                 <w:rFonts w:ascii="Arial" w:hAnsi="Arial" w:cs="Arial"/>
               </w:rPr>
-              <w:t xml:space="preserve">Iniziare e completare analisi dei mezzi, creare </w:t>
-            </w:r>
-            <w:proofErr w:type="gramStart"/>
-            <w:r>
-              <w:rPr>
-                <w:rFonts w:ascii="Arial" w:hAnsi="Arial" w:cs="Arial"/>
-              </w:rPr>
-              <w:t>lo use</w:t>
-            </w:r>
-            <w:proofErr w:type="gramEnd"/>
-            <w:r>
-              <w:rPr>
-                <w:rFonts w:ascii="Arial" w:hAnsi="Arial" w:cs="Arial"/>
-              </w:rPr>
-              <w:t xml:space="preserve"> case</w:t>
+              <w:t>Iniziare e completare analisi dei mezzi, creare lo use case</w:t>
             </w:r>
             <w:r>
               <w:rPr>
@@ -2021,34 +1961,13 @@
           <w:placeholder>
             <w:docPart w:val="1CBF60CF0E11475D8F54CEAAE596C311"/>
           </w:placeholder>
-          <w:showingPlcHdr/>
         </w:sdtPr>
         <w:sdtContent>
           <w:r>
             <w:rPr>
-              <w:rStyle w:val="Testosegnaposto"/>
-              <w:b/>
-              <w:bCs/>
-            </w:rPr>
-            <w:t xml:space="preserve">Nomi </w:t>
-          </w:r>
-          <w:proofErr w:type="gramStart"/>
-          <w:r>
-            <w:rPr>
-              <w:rStyle w:val="Testosegnaposto"/>
-              <w:b/>
-              <w:bCs/>
-            </w:rPr>
-            <w:t>AI</w:t>
-          </w:r>
-          <w:proofErr w:type="gramEnd"/>
-          <w:r>
-            <w:rPr>
-              <w:rStyle w:val="Testosegnaposto"/>
-              <w:b/>
-              <w:bCs/>
-            </w:rPr>
-            <w:t xml:space="preserve"> utilizzati</w:t>
+              <w:rFonts w:ascii="Arial" w:hAnsi="Arial" w:cs="Arial"/>
+            </w:rPr>
+            <w:t>Gemini</w:t>
           </w:r>
         </w:sdtContent>
       </w:sdt>
@@ -2315,21 +2234,7 @@
             <w:rPr>
               <w:rFonts w:ascii="Arial" w:hAnsi="Arial" w:cs="Arial"/>
             </w:rPr>
-            <w:t xml:space="preserve">Aitami a generare dei </w:t>
-          </w:r>
-          <w:proofErr w:type="spellStart"/>
-          <w:r>
-            <w:rPr>
-              <w:rFonts w:ascii="Arial" w:hAnsi="Arial" w:cs="Arial"/>
-            </w:rPr>
-            <w:t>requesiti</w:t>
-          </w:r>
-          <w:proofErr w:type="spellEnd"/>
-          <w:r>
-            <w:rPr>
-              <w:rFonts w:ascii="Arial" w:hAnsi="Arial" w:cs="Arial"/>
-            </w:rPr>
-            <w:t xml:space="preserve"> in base ai seguenti dati</w:t>
+            <w:t>Aitami a generare dei requesiti in base ai seguenti dati</w:t>
           </w:r>
         </w:p>
       </w:sdtContent>
@@ -2869,21 +2774,7 @@
               <w:rPr>
                 <w:rFonts w:ascii="Arial" w:hAnsi="Arial" w:cs="Arial"/>
               </w:rPr>
-              <w:t xml:space="preserve">Completata la analisi del dominio nella documentazione, inizio ricerche riguardo </w:t>
-            </w:r>
-            <w:proofErr w:type="spellStart"/>
-            <w:r>
-              <w:rPr>
-                <w:rFonts w:ascii="Arial" w:hAnsi="Arial" w:cs="Arial"/>
-              </w:rPr>
-              <w:t>Unity</w:t>
-            </w:r>
-            <w:proofErr w:type="spellEnd"/>
-            <w:r>
-              <w:rPr>
-                <w:rFonts w:ascii="Arial" w:hAnsi="Arial" w:cs="Arial"/>
-              </w:rPr>
-              <w:t>.</w:t>
+              <w:t>Completata la analisi del dominio nella documentazione, inizio ricerche riguardo Unity.</w:t>
             </w:r>
           </w:p>
         </w:tc>
@@ -3058,21 +2949,7 @@
               <w:rPr>
                 <w:rFonts w:ascii="Arial" w:hAnsi="Arial" w:cs="Arial"/>
               </w:rPr>
-              <w:t xml:space="preserve">Il diagramma ER non è completo e </w:t>
-            </w:r>
-            <w:proofErr w:type="gramStart"/>
-            <w:r>
-              <w:rPr>
-                <w:rFonts w:ascii="Arial" w:hAnsi="Arial" w:cs="Arial"/>
-              </w:rPr>
-              <w:t>lo use</w:t>
-            </w:r>
-            <w:proofErr w:type="gramEnd"/>
-            <w:r>
-              <w:rPr>
-                <w:rFonts w:ascii="Arial" w:hAnsi="Arial" w:cs="Arial"/>
-              </w:rPr>
-              <w:t xml:space="preserve"> case non è stato iniziato, analisi dei mezzi non ancora completata.</w:t>
+              <w:t>Il diagramma ER non è completo e lo use case non è stato iniziato, analisi dei mezzi non ancora completata.</w:t>
             </w:r>
           </w:p>
         </w:tc>
@@ -3329,34 +3206,13 @@
           <w:placeholder>
             <w:docPart w:val="B5D3D17DB0E542DC9E74BBD77085F9ED"/>
           </w:placeholder>
-          <w:showingPlcHdr/>
         </w:sdtPr>
         <w:sdtContent>
           <w:r>
             <w:rPr>
-              <w:rStyle w:val="Testosegnaposto"/>
-              <w:b/>
-              <w:bCs/>
-            </w:rPr>
-            <w:t xml:space="preserve">Nomi </w:t>
-          </w:r>
-          <w:proofErr w:type="gramStart"/>
-          <w:r>
-            <w:rPr>
-              <w:rStyle w:val="Testosegnaposto"/>
-              <w:b/>
-              <w:bCs/>
-            </w:rPr>
-            <w:t>AI</w:t>
-          </w:r>
-          <w:proofErr w:type="gramEnd"/>
-          <w:r>
-            <w:rPr>
-              <w:rStyle w:val="Testosegnaposto"/>
-              <w:b/>
-              <w:bCs/>
-            </w:rPr>
-            <w:t xml:space="preserve"> utilizzati</w:t>
+              <w:rFonts w:ascii="Arial" w:hAnsi="Arial" w:cs="Arial"/>
+            </w:rPr>
+            <w:t>Gemini</w:t>
           </w:r>
         </w:sdtContent>
       </w:sdt>
@@ -4125,16 +3981,8 @@
               <w:rPr>
                 <w:rFonts w:ascii="Arial" w:hAnsi="Arial" w:cs="Arial"/>
               </w:rPr>
-              <w:t xml:space="preserve">Creato diagramma ER e modifiche strutturali </w:t>
+              <w:t>Creato diagramma ER e modifiche strutturali gantt</w:t>
             </w:r>
-            <w:proofErr w:type="spellStart"/>
-            <w:r>
-              <w:rPr>
-                <w:rFonts w:ascii="Arial" w:hAnsi="Arial" w:cs="Arial"/>
-              </w:rPr>
-              <w:t>gantt</w:t>
-            </w:r>
-            <w:proofErr w:type="spellEnd"/>
           </w:p>
         </w:tc>
       </w:tr>
@@ -4171,13 +4019,7 @@
               <w:rPr>
                 <w:rFonts w:ascii="Arial" w:hAnsi="Arial" w:cs="Arial"/>
               </w:rPr>
-              <w:t>Completato analisi dei del dominio e dei mezzi</w:t>
-            </w:r>
-            <w:r>
-              <w:rPr>
-                <w:rFonts w:ascii="Arial" w:hAnsi="Arial" w:cs="Arial"/>
-              </w:rPr>
-              <w:t>.</w:t>
+              <w:t>Completato analisi dei del dominio e dei mezzi.</w:t>
             </w:r>
           </w:p>
         </w:tc>
@@ -4609,34 +4451,13 @@
           <w:placeholder>
             <w:docPart w:val="3205420654B042A293DDC5C0462DB8BB"/>
           </w:placeholder>
-          <w:showingPlcHdr/>
         </w:sdtPr>
         <w:sdtContent>
           <w:r>
             <w:rPr>
-              <w:rStyle w:val="Testosegnaposto"/>
-              <w:b/>
-              <w:bCs/>
-            </w:rPr>
-            <w:t xml:space="preserve">Nomi </w:t>
-          </w:r>
-          <w:proofErr w:type="gramStart"/>
-          <w:r>
-            <w:rPr>
-              <w:rStyle w:val="Testosegnaposto"/>
-              <w:b/>
-              <w:bCs/>
-            </w:rPr>
-            <w:t>AI</w:t>
-          </w:r>
-          <w:proofErr w:type="gramEnd"/>
-          <w:r>
-            <w:rPr>
-              <w:rStyle w:val="Testosegnaposto"/>
-              <w:b/>
-              <w:bCs/>
-            </w:rPr>
-            <w:t xml:space="preserve"> utilizzati</w:t>
+              <w:rFonts w:ascii="Arial" w:hAnsi="Arial" w:cs="Arial"/>
+            </w:rPr>
+            <w:t>ChatGPT, Gemini</w:t>
           </w:r>
         </w:sdtContent>
       </w:sdt>
@@ -4890,7 +4711,6 @@
         </w:placeholder>
         <w15:color w:val="C0C0C0"/>
       </w:sdtPr>
-      <w:sdtEndPr/>
       <w:sdtContent>
         <w:p>
           <w:pPr>
@@ -4910,16 +4730,8 @@
             <w:rPr>
               <w:rFonts w:ascii="Arial" w:hAnsi="Arial" w:cs="Arial"/>
             </w:rPr>
-            <w:t xml:space="preserve">uoi dirmi delle classiche impostazioni per un gioco di guida in stile </w:t>
+            <w:t>uoi dirmi delle classiche impostazioni per un gioco di guida in stile br</w:t>
           </w:r>
-          <w:proofErr w:type="spellStart"/>
-          <w:r>
-            <w:rPr>
-              <w:rFonts w:ascii="Arial" w:hAnsi="Arial" w:cs="Arial"/>
-            </w:rPr>
-            <w:t>br</w:t>
-          </w:r>
-          <w:proofErr w:type="spellEnd"/>
           <w:r>
             <w:rPr>
               <w:rFonts w:ascii="Arial" w:hAnsi="Arial" w:cs="Arial"/>
@@ -4931,21 +4743,7 @@
               <w:rFonts w:ascii="Arial" w:hAnsi="Arial" w:cs="Arial"/>
             </w:rPr>
             <w:br/>
-            <w:t xml:space="preserve">Bryan: Spiegami </w:t>
-          </w:r>
-          <w:proofErr w:type="spellStart"/>
-          <w:r>
-            <w:rPr>
-              <w:rFonts w:ascii="Arial" w:hAnsi="Arial" w:cs="Arial"/>
-            </w:rPr>
-            <w:t>Unity</w:t>
-          </w:r>
-          <w:proofErr w:type="spellEnd"/>
-          <w:r>
-            <w:rPr>
-              <w:rFonts w:ascii="Arial" w:hAnsi="Arial" w:cs="Arial"/>
-            </w:rPr>
-            <w:t xml:space="preserve"> ed i suoi vantaggi.</w:t>
+            <w:t>Bryan: Spiegami Unity ed i suoi vantaggi.</w:t>
           </w:r>
         </w:p>
       </w:sdtContent>
@@ -5238,6 +5036,1262 @@
           <w:rFonts w:ascii="Arial" w:hAnsi="Arial" w:cs="Arial"/>
         </w:rPr>
         <w:t>Pensato in modo autonomo a delle possibili impostazioni</w:t>
+      </w:r>
+    </w:p>
+    <w:p>
+      <w:pPr>
+        <w:rPr>
+          <w:rFonts w:ascii="Arial" w:hAnsi="Arial" w:cs="Arial"/>
+        </w:rPr>
+      </w:pPr>
+      <w:r>
+        <w:rPr>
+          <w:rFonts w:ascii="Arial" w:hAnsi="Arial" w:cs="Arial"/>
+        </w:rPr>
+        <w:br w:type="page"/>
+      </w:r>
+    </w:p>
+    <w:tbl>
+      <w:tblPr>
+        <w:tblStyle w:val="Grigliatabella"/>
+        <w:tblW w:w="5000" w:type="pct"/>
+        <w:tblLook w:val="04A0" w:firstRow="1" w:lastRow="0" w:firstColumn="1" w:lastColumn="0" w:noHBand="0" w:noVBand="1"/>
+      </w:tblPr>
+      <w:tblGrid>
+        <w:gridCol w:w="2407"/>
+        <w:gridCol w:w="7221"/>
+      </w:tblGrid>
+      <w:tr>
+        <w:trPr>
+          <w:trHeight w:val="199"/>
+        </w:trPr>
+        <w:tc>
+          <w:tcPr>
+            <w:tcW w:w="1250" w:type="pct"/>
+            <w:vAlign w:val="center"/>
+          </w:tcPr>
+          <w:p>
+            <w:pPr>
+              <w:rPr>
+                <w:rFonts w:ascii="Arial" w:hAnsi="Arial" w:cs="Arial"/>
+              </w:rPr>
+            </w:pPr>
+            <w:r>
+              <w:rPr>
+                <w:rFonts w:ascii="Arial" w:hAnsi="Arial" w:cs="Arial"/>
+              </w:rPr>
+              <w:lastRenderedPageBreak/>
+              <w:t>Luogo</w:t>
+            </w:r>
+          </w:p>
+        </w:tc>
+        <w:tc>
+          <w:tcPr>
+            <w:tcW w:w="3750" w:type="pct"/>
+            <w:vAlign w:val="center"/>
+          </w:tcPr>
+          <w:p>
+            <w:pPr>
+              <w:rPr>
+                <w:rFonts w:ascii="Arial" w:hAnsi="Arial" w:cs="Arial"/>
+              </w:rPr>
+            </w:pPr>
+            <w:r>
+              <w:rPr>
+                <w:rFonts w:ascii="Arial" w:hAnsi="Arial" w:cs="Arial"/>
+              </w:rPr>
+              <w:t>Scuola Arti e Mestieri Trevano</w:t>
+            </w:r>
+          </w:p>
+        </w:tc>
+      </w:tr>
+      <w:tr>
+        <w:trPr>
+          <w:trHeight w:val="196"/>
+        </w:trPr>
+        <w:tc>
+          <w:tcPr>
+            <w:tcW w:w="1250" w:type="pct"/>
+            <w:vAlign w:val="center"/>
+          </w:tcPr>
+          <w:p>
+            <w:pPr>
+              <w:rPr>
+                <w:rFonts w:ascii="Arial" w:hAnsi="Arial" w:cs="Arial"/>
+              </w:rPr>
+            </w:pPr>
+            <w:r>
+              <w:rPr>
+                <w:rFonts w:ascii="Arial" w:hAnsi="Arial" w:cs="Arial"/>
+              </w:rPr>
+              <w:t>Data</w:t>
+            </w:r>
+          </w:p>
+        </w:tc>
+        <w:tc>
+          <w:tcPr>
+            <w:tcW w:w="3750" w:type="pct"/>
+            <w:vAlign w:val="center"/>
+          </w:tcPr>
+          <w:p>
+            <w:pPr>
+              <w:rPr>
+                <w:rFonts w:ascii="Arial" w:hAnsi="Arial" w:cs="Arial"/>
+              </w:rPr>
+            </w:pPr>
+            <w:r>
+              <w:rPr>
+                <w:rFonts w:ascii="Arial" w:hAnsi="Arial" w:cs="Arial"/>
+              </w:rPr>
+              <w:t>14.09.2026</w:t>
+            </w:r>
+          </w:p>
+        </w:tc>
+      </w:tr>
+    </w:tbl>
+    <w:p>
+      <w:pPr>
+        <w:rPr>
+          <w:rFonts w:ascii="Arial" w:hAnsi="Arial" w:cs="Arial"/>
+        </w:rPr>
+      </w:pPr>
+    </w:p>
+    <w:tbl>
+      <w:tblPr>
+        <w:tblStyle w:val="Grigliatabella"/>
+        <w:tblW w:w="0" w:type="auto"/>
+        <w:tblLook w:val="04A0" w:firstRow="1" w:lastRow="0" w:firstColumn="1" w:lastColumn="0" w:noHBand="0" w:noVBand="1"/>
+      </w:tblPr>
+      <w:tblGrid>
+        <w:gridCol w:w="1271"/>
+        <w:gridCol w:w="8357"/>
+      </w:tblGrid>
+      <w:tr>
+        <w:tc>
+          <w:tcPr>
+            <w:tcW w:w="9628" w:type="dxa"/>
+            <w:gridSpan w:val="2"/>
+            <w:shd w:val="clear" w:color="auto" w:fill="D9D9D9" w:themeFill="background1" w:themeFillShade="D9"/>
+          </w:tcPr>
+          <w:p>
+            <w:pPr>
+              <w:rPr>
+                <w:rFonts w:ascii="Arial" w:hAnsi="Arial" w:cs="Arial"/>
+              </w:rPr>
+            </w:pPr>
+            <w:r>
+              <w:rPr>
+                <w:rFonts w:ascii="Arial" w:hAnsi="Arial" w:cs="Arial"/>
+              </w:rPr>
+              <w:t>Lavori svolti</w:t>
+            </w:r>
+          </w:p>
+        </w:tc>
+      </w:tr>
+      <w:tr>
+        <w:tc>
+          <w:tcPr>
+            <w:tcW w:w="1271" w:type="dxa"/>
+          </w:tcPr>
+          <w:p>
+            <w:pPr>
+              <w:rPr>
+                <w:rFonts w:ascii="Arial" w:hAnsi="Arial" w:cs="Arial"/>
+              </w:rPr>
+            </w:pPr>
+            <w:r>
+              <w:rPr>
+                <w:rFonts w:ascii="Arial" w:hAnsi="Arial" w:cs="Arial"/>
+              </w:rPr>
+              <w:t>Riley</w:t>
+            </w:r>
+          </w:p>
+        </w:tc>
+        <w:tc>
+          <w:tcPr>
+            <w:tcW w:w="8357" w:type="dxa"/>
+          </w:tcPr>
+          <w:p>
+            <w:pPr>
+              <w:rPr>
+                <w:rFonts w:ascii="Arial" w:hAnsi="Arial" w:cs="Arial"/>
+              </w:rPr>
+            </w:pPr>
+            <w:r>
+              <w:rPr>
+                <w:rFonts w:ascii="Arial" w:hAnsi="Arial" w:cs="Arial"/>
+              </w:rPr>
+              <w:t>Creato Diagramma ER e aggiornato gannt</w:t>
+            </w:r>
+          </w:p>
+        </w:tc>
+      </w:tr>
+      <w:tr>
+        <w:tc>
+          <w:tcPr>
+            <w:tcW w:w="1271" w:type="dxa"/>
+          </w:tcPr>
+          <w:p>
+            <w:pPr>
+              <w:rPr>
+                <w:rFonts w:ascii="Arial" w:hAnsi="Arial" w:cs="Arial"/>
+              </w:rPr>
+            </w:pPr>
+            <w:r>
+              <w:rPr>
+                <w:rFonts w:ascii="Arial" w:hAnsi="Arial" w:cs="Arial"/>
+              </w:rPr>
+              <w:t>Bryan</w:t>
+            </w:r>
+          </w:p>
+        </w:tc>
+        <w:tc>
+          <w:tcPr>
+            <w:tcW w:w="8357" w:type="dxa"/>
+          </w:tcPr>
+          <w:p>
+            <w:pPr>
+              <w:rPr>
+                <w:rFonts w:ascii="Arial" w:hAnsi="Arial" w:cs="Arial"/>
+              </w:rPr>
+            </w:pPr>
+            <w:r>
+              <w:rPr>
+                <w:rFonts w:ascii="Arial" w:hAnsi="Arial" w:cs="Arial"/>
+              </w:rPr>
+              <w:t>Use Case finito, Inizio creazione e documentazione mockup UI.</w:t>
+            </w:r>
+          </w:p>
+        </w:tc>
+      </w:tr>
+    </w:tbl>
+    <w:p>
+      <w:pPr>
+        <w:rPr>
+          <w:rFonts w:ascii="Arial" w:hAnsi="Arial" w:cs="Arial"/>
+        </w:rPr>
+      </w:pPr>
+    </w:p>
+    <w:tbl>
+      <w:tblPr>
+        <w:tblStyle w:val="Grigliatabella"/>
+        <w:tblW w:w="0" w:type="auto"/>
+        <w:tblInd w:w="-5" w:type="dxa"/>
+        <w:tblLook w:val="04A0" w:firstRow="1" w:lastRow="0" w:firstColumn="1" w:lastColumn="0" w:noHBand="0" w:noVBand="1"/>
+      </w:tblPr>
+      <w:tblGrid>
+        <w:gridCol w:w="1276"/>
+        <w:gridCol w:w="8357"/>
+      </w:tblGrid>
+      <w:tr>
+        <w:tc>
+          <w:tcPr>
+            <w:tcW w:w="9628" w:type="dxa"/>
+            <w:gridSpan w:val="2"/>
+            <w:shd w:val="clear" w:color="auto" w:fill="D9D9D9" w:themeFill="background1" w:themeFillShade="D9"/>
+          </w:tcPr>
+          <w:p>
+            <w:pPr>
+              <w:rPr>
+                <w:rFonts w:ascii="Arial" w:hAnsi="Arial" w:cs="Arial"/>
+              </w:rPr>
+            </w:pPr>
+            <w:r>
+              <w:rPr>
+                <w:rFonts w:ascii="Arial" w:hAnsi="Arial" w:cs="Arial"/>
+              </w:rPr>
+              <w:t>Problemi riscontrati e soluzioni adottate</w:t>
+            </w:r>
+          </w:p>
+        </w:tc>
+      </w:tr>
+      <w:tr>
+        <w:tc>
+          <w:tcPr>
+            <w:tcW w:w="1276" w:type="dxa"/>
+          </w:tcPr>
+          <w:p>
+            <w:pPr>
+              <w:rPr>
+                <w:rFonts w:ascii="Arial" w:hAnsi="Arial" w:cs="Arial"/>
+              </w:rPr>
+            </w:pPr>
+            <w:r>
+              <w:rPr>
+                <w:rFonts w:ascii="Arial" w:hAnsi="Arial" w:cs="Arial"/>
+              </w:rPr>
+              <w:t>Riley</w:t>
+            </w:r>
+          </w:p>
+        </w:tc>
+        <w:tc>
+          <w:tcPr>
+            <w:tcW w:w="8357" w:type="dxa"/>
+          </w:tcPr>
+          <w:p>
+            <w:pPr>
+              <w:rPr>
+                <w:rFonts w:ascii="Arial" w:hAnsi="Arial" w:cs="Arial"/>
+              </w:rPr>
+            </w:pPr>
+            <w:r>
+              <w:rPr>
+                <w:rFonts w:ascii="Arial" w:hAnsi="Arial" w:cs="Arial"/>
+              </w:rPr>
+              <w:t>-</w:t>
+            </w:r>
+          </w:p>
+        </w:tc>
+      </w:tr>
+      <w:tr>
+        <w:tc>
+          <w:tcPr>
+            <w:tcW w:w="1276" w:type="dxa"/>
+          </w:tcPr>
+          <w:p>
+            <w:pPr>
+              <w:rPr>
+                <w:rFonts w:ascii="Arial" w:hAnsi="Arial" w:cs="Arial"/>
+              </w:rPr>
+            </w:pPr>
+            <w:r>
+              <w:rPr>
+                <w:rFonts w:ascii="Arial" w:hAnsi="Arial" w:cs="Arial"/>
+              </w:rPr>
+              <w:t>Bryan</w:t>
+            </w:r>
+          </w:p>
+        </w:tc>
+        <w:tc>
+          <w:tcPr>
+            <w:tcW w:w="8357" w:type="dxa"/>
+          </w:tcPr>
+          <w:p>
+            <w:pPr>
+              <w:rPr>
+                <w:rFonts w:ascii="Arial" w:hAnsi="Arial" w:cs="Arial"/>
+              </w:rPr>
+            </w:pPr>
+            <w:r>
+              <w:rPr>
+                <w:rFonts w:ascii="Arial" w:hAnsi="Arial" w:cs="Arial"/>
+              </w:rPr>
+              <w:t>Riuscire a definire le azioni degli attori nel Use Case, risolto approfondendo meglio.</w:t>
+            </w:r>
+          </w:p>
+        </w:tc>
+      </w:tr>
+    </w:tbl>
+    <w:p>
+      <w:pPr>
+        <w:rPr>
+          <w:rFonts w:ascii="Arial" w:hAnsi="Arial" w:cs="Arial"/>
+        </w:rPr>
+      </w:pPr>
+    </w:p>
+    <w:tbl>
+      <w:tblPr>
+        <w:tblStyle w:val="Grigliatabella"/>
+        <w:tblW w:w="0" w:type="auto"/>
+        <w:tblLook w:val="04A0" w:firstRow="1" w:lastRow="0" w:firstColumn="1" w:lastColumn="0" w:noHBand="0" w:noVBand="1"/>
+      </w:tblPr>
+      <w:tblGrid>
+        <w:gridCol w:w="9628"/>
+      </w:tblGrid>
+      <w:tr>
+        <w:tc>
+          <w:tcPr>
+            <w:tcW w:w="9854" w:type="dxa"/>
+            <w:shd w:val="clear" w:color="auto" w:fill="D9D9D9" w:themeFill="background1" w:themeFillShade="D9"/>
+          </w:tcPr>
+          <w:p>
+            <w:pPr>
+              <w:rPr>
+                <w:rFonts w:ascii="Arial" w:hAnsi="Arial" w:cs="Arial"/>
+              </w:rPr>
+            </w:pPr>
+            <w:r>
+              <w:rPr>
+                <w:rFonts w:ascii="Arial" w:hAnsi="Arial" w:cs="Arial"/>
+              </w:rPr>
+              <w:t>Punto della situazione rispetto alla pianificazione</w:t>
+            </w:r>
+          </w:p>
+        </w:tc>
+      </w:tr>
+      <w:tr>
+        <w:tc>
+          <w:tcPr>
+            <w:tcW w:w="9854" w:type="dxa"/>
+          </w:tcPr>
+          <w:p>
+            <w:pPr>
+              <w:rPr>
+                <w:rFonts w:ascii="Arial" w:hAnsi="Arial" w:cs="Arial"/>
+              </w:rPr>
+            </w:pPr>
+            <w:r>
+              <w:rPr>
+                <w:rFonts w:ascii="Arial" w:hAnsi="Arial" w:cs="Arial"/>
+              </w:rPr>
+              <w:t>Pianificazione non ancora conclusa mancano ancora un paio di punti da verificare.</w:t>
+            </w:r>
+          </w:p>
+        </w:tc>
+      </w:tr>
+    </w:tbl>
+    <w:p>
+      <w:pPr>
+        <w:rPr>
+          <w:rFonts w:ascii="Arial" w:hAnsi="Arial" w:cs="Arial"/>
+        </w:rPr>
+      </w:pPr>
+    </w:p>
+    <w:tbl>
+      <w:tblPr>
+        <w:tblStyle w:val="Grigliatabella"/>
+        <w:tblW w:w="0" w:type="auto"/>
+        <w:tblLook w:val="04A0" w:firstRow="1" w:lastRow="0" w:firstColumn="1" w:lastColumn="0" w:noHBand="0" w:noVBand="1"/>
+      </w:tblPr>
+      <w:tblGrid>
+        <w:gridCol w:w="9628"/>
+      </w:tblGrid>
+      <w:tr>
+        <w:tc>
+          <w:tcPr>
+            <w:tcW w:w="9854" w:type="dxa"/>
+            <w:shd w:val="clear" w:color="auto" w:fill="D9D9D9" w:themeFill="background1" w:themeFillShade="D9"/>
+          </w:tcPr>
+          <w:p>
+            <w:pPr>
+              <w:rPr>
+                <w:rFonts w:ascii="Arial" w:hAnsi="Arial" w:cs="Arial"/>
+              </w:rPr>
+            </w:pPr>
+            <w:r>
+              <w:rPr>
+                <w:rFonts w:ascii="Arial" w:hAnsi="Arial" w:cs="Arial"/>
+              </w:rPr>
+              <w:t>Programma di massima per la prossima giornata di lavoro</w:t>
+            </w:r>
+          </w:p>
+        </w:tc>
+      </w:tr>
+      <w:tr>
+        <w:tc>
+          <w:tcPr>
+            <w:tcW w:w="9854" w:type="dxa"/>
+          </w:tcPr>
+          <w:p>
+            <w:pPr>
+              <w:rPr>
+                <w:rFonts w:ascii="Arial" w:hAnsi="Arial" w:cs="Arial"/>
+              </w:rPr>
+            </w:pPr>
+            <w:r>
+              <w:rPr>
+                <w:rFonts w:ascii="Arial" w:hAnsi="Arial" w:cs="Arial"/>
+              </w:rPr>
+              <w:t>Terminare la pianificazione e se possibile iniziare con lo sviluppo.</w:t>
+            </w:r>
+          </w:p>
+          <w:p>
+            <w:pPr>
+              <w:rPr>
+                <w:rFonts w:ascii="Arial" w:hAnsi="Arial" w:cs="Arial"/>
+              </w:rPr>
+            </w:pPr>
+            <w:r>
+              <w:rPr>
+                <w:rFonts w:ascii="Arial" w:hAnsi="Arial" w:cs="Arial"/>
+              </w:rPr>
+              <w:t>Continuo creazione Mockup UI.</w:t>
+            </w:r>
+          </w:p>
+        </w:tc>
+      </w:tr>
+    </w:tbl>
+    <w:p>
+      <w:pPr>
+        <w:rPr>
+          <w:rFonts w:ascii="Arial" w:hAnsi="Arial" w:cs="Arial"/>
+        </w:rPr>
+      </w:pPr>
+    </w:p>
+    <w:p>
+      <w:pPr>
+        <w:rPr>
+          <w:rFonts w:ascii="Arial" w:hAnsi="Arial" w:cs="Arial"/>
+        </w:rPr>
+      </w:pPr>
+      <w:r>
+        <w:rPr>
+          <w:rFonts w:ascii="Arial" w:hAnsi="Arial" w:cs="Arial"/>
+        </w:rPr>
+        <w:br w:type="page"/>
+      </w:r>
+    </w:p>
+    <w:p>
+      <w:pPr>
+        <w:pStyle w:val="Titolo2"/>
+        <w:pBdr>
+          <w:bottom w:val="single" w:sz="4" w:space="1" w:color="auto"/>
+        </w:pBdr>
+      </w:pPr>
+      <w:r>
+        <w:lastRenderedPageBreak/>
+        <w:t>Utilizzo Intelligenza Artificiale</w:t>
+      </w:r>
+      <w:r>
+        <w:t xml:space="preserve"> nella giornata</w:t>
+      </w:r>
+    </w:p>
+    <w:p>
+      <w:pPr>
+        <w:pStyle w:val="Nessunaspaziatura"/>
+        <w:rPr>
+          <w:rFonts w:ascii="Arial" w:hAnsi="Arial" w:cs="Arial"/>
+          <w:b/>
+          <w:bCs/>
+        </w:rPr>
+      </w:pPr>
+    </w:p>
+    <w:p>
+      <w:pPr>
+        <w:pStyle w:val="Nessunaspaziatura"/>
+        <w:rPr>
+          <w:rFonts w:ascii="Arial" w:hAnsi="Arial" w:cs="Arial"/>
+        </w:rPr>
+      </w:pPr>
+      <w:sdt>
+        <w:sdtPr>
+          <w:rPr>
+            <w:rFonts w:ascii="Segoe UI Symbol" w:hAnsi="Segoe UI Symbol" w:cs="Segoe UI Symbol"/>
+          </w:rPr>
+          <w:id w:val="-1810314379"/>
+          <w14:checkbox>
+            <w14:checked w14:val="0"/>
+            <w14:checkedState w14:val="2612" w14:font="MS Gothic"/>
+            <w14:uncheckedState w14:val="2610" w14:font="MS Gothic"/>
+          </w14:checkbox>
+        </w:sdtPr>
+        <w:sdtContent>
+          <w:r>
+            <w:rPr>
+              <w:rFonts w:ascii="MS Gothic" w:eastAsia="MS Gothic" w:hAnsi="MS Gothic" w:cs="Segoe UI Symbol" w:hint="eastAsia"/>
+            </w:rPr>
+            <w:t>☐</w:t>
+          </w:r>
+        </w:sdtContent>
+      </w:sdt>
+      <w:r>
+        <w:rPr>
+          <w:rFonts w:ascii="Arial" w:hAnsi="Arial" w:cs="Arial"/>
+        </w:rPr>
+        <w:t xml:space="preserve"> Nessuno</w:t>
+      </w:r>
+      <w:r>
+        <w:br/>
+      </w:r>
+      <w:sdt>
+        <w:sdtPr>
+          <w:rPr>
+            <w:rFonts w:ascii="Segoe UI Symbol" w:hAnsi="Segoe UI Symbol" w:cs="Segoe UI Symbol"/>
+          </w:rPr>
+          <w:id w:val="-1118675275"/>
+          <w14:checkbox>
+            <w14:checked w14:val="0"/>
+            <w14:checkedState w14:val="2612" w14:font="MS Gothic"/>
+            <w14:uncheckedState w14:val="2610" w14:font="MS Gothic"/>
+          </w14:checkbox>
+        </w:sdtPr>
+        <w:sdtContent>
+          <w:r>
+            <w:rPr>
+              <w:rFonts w:ascii="MS Gothic" w:eastAsia="MS Gothic" w:hAnsi="MS Gothic" w:cs="Segoe UI Symbol" w:hint="eastAsia"/>
+            </w:rPr>
+            <w:t>☐</w:t>
+          </w:r>
+        </w:sdtContent>
+      </w:sdt>
+      <w:r>
+        <w:rPr>
+          <w:rFonts w:ascii="Arial" w:hAnsi="Arial" w:cs="Arial"/>
+        </w:rPr>
+        <w:t xml:space="preserve"> Occasionale</w:t>
+      </w:r>
+      <w:r>
+        <w:br/>
+      </w:r>
+      <w:sdt>
+        <w:sdtPr>
+          <w:rPr>
+            <w:rFonts w:ascii="Segoe UI Symbol" w:hAnsi="Segoe UI Symbol" w:cs="Segoe UI Symbol"/>
+          </w:rPr>
+          <w:id w:val="-1834210930"/>
+          <w14:checkbox>
+            <w14:checked w14:val="1"/>
+            <w14:checkedState w14:val="2612" w14:font="MS Gothic"/>
+            <w14:uncheckedState w14:val="2610" w14:font="MS Gothic"/>
+          </w14:checkbox>
+        </w:sdtPr>
+        <w:sdtContent>
+          <w:r>
+            <w:rPr>
+              <w:rFonts w:ascii="MS Gothic" w:eastAsia="MS Gothic" w:hAnsi="MS Gothic" w:cs="Segoe UI Symbol" w:hint="eastAsia"/>
+            </w:rPr>
+            <w:t>☒</w:t>
+          </w:r>
+        </w:sdtContent>
+      </w:sdt>
+      <w:r>
+        <w:rPr>
+          <w:rFonts w:ascii="Arial" w:hAnsi="Arial" w:cs="Arial"/>
+        </w:rPr>
+        <w:t xml:space="preserve"> Frequente</w:t>
+      </w:r>
+    </w:p>
+    <w:p>
+      <w:pPr>
+        <w:pStyle w:val="Nessunaspaziatura"/>
+        <w:rPr>
+          <w:rFonts w:ascii="Arial" w:hAnsi="Arial" w:cs="Arial"/>
+        </w:rPr>
+      </w:pPr>
+    </w:p>
+    <w:p>
+      <w:pPr>
+        <w:pStyle w:val="Nessunaspaziatura"/>
+        <w:spacing w:line="276" w:lineRule="auto"/>
+        <w:rPr>
+          <w:rFonts w:ascii="Arial" w:hAnsi="Arial" w:cs="Arial"/>
+        </w:rPr>
+      </w:pPr>
+      <w:r>
+        <w:rPr>
+          <w:rFonts w:ascii="Arial" w:hAnsi="Arial" w:cs="Arial"/>
+          <w:b/>
+          <w:bCs/>
+        </w:rPr>
+        <w:t>Strumento/i utilizzato/i</w:t>
+      </w:r>
+      <w:r>
+        <w:rPr>
+          <w:rFonts w:ascii="Arial" w:hAnsi="Arial" w:cs="Arial"/>
+          <w:b/>
+          <w:bCs/>
+        </w:rPr>
+        <w:t xml:space="preserve"> </w:t>
+      </w:r>
+      <w:r>
+        <w:rPr>
+          <w:rFonts w:ascii="Arial" w:hAnsi="Arial" w:cs="Arial"/>
+        </w:rPr>
+        <w:t>(es. ChatGPT)</w:t>
+      </w:r>
+      <w:r>
+        <w:rPr>
+          <w:rFonts w:ascii="Arial" w:hAnsi="Arial" w:cs="Arial"/>
+        </w:rPr>
+        <w:t xml:space="preserve">: </w:t>
+      </w:r>
+      <w:sdt>
+        <w:sdtPr>
+          <w:rPr>
+            <w:rFonts w:ascii="Arial" w:hAnsi="Arial" w:cs="Arial"/>
+          </w:rPr>
+          <w:id w:val="-1922548670"/>
+          <w:placeholder>
+            <w:docPart w:val="266D87AC85394CAEB0812BA9E79795F2"/>
+          </w:placeholder>
+        </w:sdtPr>
+        <w:sdtContent>
+          <w:r>
+            <w:rPr>
+              <w:rFonts w:ascii="Arial" w:hAnsi="Arial" w:cs="Arial"/>
+            </w:rPr>
+            <w:t>Gemini, ChatGPT</w:t>
+          </w:r>
+        </w:sdtContent>
+      </w:sdt>
+    </w:p>
+    <w:p>
+      <w:pPr>
+        <w:pStyle w:val="Nessunaspaziatura"/>
+        <w:rPr>
+          <w:rFonts w:ascii="Arial" w:hAnsi="Arial" w:cs="Arial"/>
+        </w:rPr>
+      </w:pPr>
+    </w:p>
+    <w:p>
+      <w:pPr>
+        <w:pStyle w:val="Nessunaspaziatura"/>
+        <w:rPr>
+          <w:rFonts w:ascii="Arial" w:hAnsi="Arial" w:cs="Arial"/>
+        </w:rPr>
+      </w:pPr>
+      <w:r>
+        <w:rPr>
+          <w:rFonts w:ascii="Arial" w:hAnsi="Arial" w:cs="Arial"/>
+          <w:b/>
+          <w:bCs/>
+        </w:rPr>
+        <w:t>Per cosa l’ho usata oggi</w:t>
+      </w:r>
+      <w:r>
+        <w:br/>
+      </w:r>
+      <w:sdt>
+        <w:sdtPr>
+          <w:rPr>
+            <w:rFonts w:ascii="Segoe UI Symbol" w:hAnsi="Segoe UI Symbol" w:cs="Segoe UI Symbol"/>
+          </w:rPr>
+          <w:id w:val="47503980"/>
+          <w14:checkbox>
+            <w14:checked w14:val="1"/>
+            <w14:checkedState w14:val="2612" w14:font="MS Gothic"/>
+            <w14:uncheckedState w14:val="2610" w14:font="MS Gothic"/>
+          </w14:checkbox>
+        </w:sdtPr>
+        <w:sdtContent>
+          <w:r>
+            <w:rPr>
+              <w:rFonts w:ascii="MS Gothic" w:eastAsia="MS Gothic" w:hAnsi="MS Gothic" w:cs="Segoe UI Symbol" w:hint="eastAsia"/>
+            </w:rPr>
+            <w:t>☒</w:t>
+          </w:r>
+        </w:sdtContent>
+      </w:sdt>
+      <w:r>
+        <w:rPr>
+          <w:rFonts w:ascii="Arial" w:hAnsi="Arial" w:cs="Arial"/>
+        </w:rPr>
+        <w:t xml:space="preserve"> Chiarire concetti</w:t>
+      </w:r>
+      <w:r>
+        <w:br/>
+      </w:r>
+      <w:sdt>
+        <w:sdtPr>
+          <w:rPr>
+            <w:rFonts w:ascii="Segoe UI Symbol" w:hAnsi="Segoe UI Symbol" w:cs="Segoe UI Symbol"/>
+          </w:rPr>
+          <w:id w:val="-969673912"/>
+          <w14:checkbox>
+            <w14:checked w14:val="0"/>
+            <w14:checkedState w14:val="2612" w14:font="MS Gothic"/>
+            <w14:uncheckedState w14:val="2610" w14:font="MS Gothic"/>
+          </w14:checkbox>
+        </w:sdtPr>
+        <w:sdtContent>
+          <w:r>
+            <w:rPr>
+              <w:rFonts w:ascii="MS Gothic" w:eastAsia="MS Gothic" w:hAnsi="MS Gothic" w:cs="Segoe UI Symbol"/>
+            </w:rPr>
+            <w:t>☐</w:t>
+          </w:r>
+        </w:sdtContent>
+      </w:sdt>
+      <w:r>
+        <w:rPr>
+          <w:rFonts w:ascii="Arial" w:hAnsi="Arial" w:cs="Arial"/>
+        </w:rPr>
+        <w:t xml:space="preserve"> Supporto al codice</w:t>
+      </w:r>
+      <w:r>
+        <w:br/>
+      </w:r>
+      <w:sdt>
+        <w:sdtPr>
+          <w:rPr>
+            <w:rFonts w:ascii="Segoe UI Symbol" w:hAnsi="Segoe UI Symbol" w:cs="Segoe UI Symbol"/>
+          </w:rPr>
+          <w:id w:val="1923761459"/>
+          <w14:checkbox>
+            <w14:checked w14:val="0"/>
+            <w14:checkedState w14:val="2612" w14:font="MS Gothic"/>
+            <w14:uncheckedState w14:val="2610" w14:font="MS Gothic"/>
+          </w14:checkbox>
+        </w:sdtPr>
+        <w:sdtContent>
+          <w:r>
+            <w:rPr>
+              <w:rFonts w:ascii="MS Gothic" w:eastAsia="MS Gothic" w:hAnsi="MS Gothic" w:cs="Segoe UI Symbol"/>
+            </w:rPr>
+            <w:t>☐</w:t>
+          </w:r>
+        </w:sdtContent>
+      </w:sdt>
+      <w:r>
+        <w:rPr>
+          <w:rFonts w:ascii="Arial" w:hAnsi="Arial" w:cs="Arial"/>
+        </w:rPr>
+        <w:t xml:space="preserve"> Debug</w:t>
+      </w:r>
+      <w:r>
+        <w:br/>
+      </w:r>
+      <w:sdt>
+        <w:sdtPr>
+          <w:rPr>
+            <w:rFonts w:ascii="Segoe UI Symbol" w:hAnsi="Segoe UI Symbol" w:cs="Segoe UI Symbol"/>
+          </w:rPr>
+          <w:id w:val="473644590"/>
+          <w14:checkbox>
+            <w14:checked w14:val="1"/>
+            <w14:checkedState w14:val="2612" w14:font="MS Gothic"/>
+            <w14:uncheckedState w14:val="2610" w14:font="MS Gothic"/>
+          </w14:checkbox>
+        </w:sdtPr>
+        <w:sdtContent>
+          <w:r>
+            <w:rPr>
+              <w:rFonts w:ascii="MS Gothic" w:eastAsia="MS Gothic" w:hAnsi="MS Gothic" w:cs="Segoe UI Symbol" w:hint="eastAsia"/>
+            </w:rPr>
+            <w:t>☒</w:t>
+          </w:r>
+        </w:sdtContent>
+      </w:sdt>
+      <w:r>
+        <w:rPr>
+          <w:rFonts w:ascii="Arial" w:hAnsi="Arial" w:cs="Arial"/>
+        </w:rPr>
+        <w:t xml:space="preserve"> Riorganizzare idee / testi</w:t>
+      </w:r>
+      <w:r>
+        <w:br/>
+      </w:r>
+      <w:sdt>
+        <w:sdtPr>
+          <w:rPr>
+            <w:rFonts w:ascii="Segoe UI Symbol" w:hAnsi="Segoe UI Symbol" w:cs="Segoe UI Symbol"/>
+          </w:rPr>
+          <w:id w:val="-1318268962"/>
+          <w14:checkbox>
+            <w14:checked w14:val="0"/>
+            <w14:checkedState w14:val="2612" w14:font="MS Gothic"/>
+            <w14:uncheckedState w14:val="2610" w14:font="MS Gothic"/>
+          </w14:checkbox>
+        </w:sdtPr>
+        <w:sdtContent>
+          <w:r>
+            <w:rPr>
+              <w:rFonts w:ascii="MS Gothic" w:eastAsia="MS Gothic" w:hAnsi="MS Gothic" w:cs="Segoe UI Symbol"/>
+            </w:rPr>
+            <w:t>☐</w:t>
+          </w:r>
+        </w:sdtContent>
+      </w:sdt>
+      <w:r>
+        <w:rPr>
+          <w:rFonts w:ascii="Arial" w:hAnsi="Arial" w:cs="Arial"/>
+        </w:rPr>
+        <w:t xml:space="preserve"> Altro: …</w:t>
+      </w:r>
+    </w:p>
+    <w:p>
+      <w:pPr>
+        <w:pStyle w:val="Nessunaspaziatura"/>
+        <w:rPr>
+          <w:rFonts w:ascii="Arial" w:hAnsi="Arial" w:cs="Arial"/>
+        </w:rPr>
+      </w:pPr>
+    </w:p>
+    <w:p>
+      <w:pPr>
+        <w:pStyle w:val="Nessunaspaziatura"/>
+        <w:rPr>
+          <w:rFonts w:ascii="Arial" w:hAnsi="Arial" w:cs="Arial"/>
+          <w:b/>
+          <w:bCs/>
+        </w:rPr>
+      </w:pPr>
+      <w:r>
+        <w:rPr>
+          <w:rFonts w:ascii="Arial" w:hAnsi="Arial" w:cs="Arial"/>
+          <w:b/>
+          <w:bCs/>
+        </w:rPr>
+        <w:t>Esempio significativo di utilizzo (UNO SOLO)</w:t>
+      </w:r>
+    </w:p>
+    <w:p>
+      <w:pPr>
+        <w:pStyle w:val="Nessunaspaziatura"/>
+        <w:rPr>
+          <w:rFonts w:ascii="Arial" w:hAnsi="Arial" w:cs="Arial"/>
+        </w:rPr>
+      </w:pPr>
+      <w:r>
+        <w:rPr>
+          <w:rFonts w:ascii="Arial" w:hAnsi="Arial" w:cs="Arial"/>
+        </w:rPr>
+        <w:t xml:space="preserve">Riporta </w:t>
+      </w:r>
+      <w:r>
+        <w:rPr>
+          <w:rFonts w:ascii="Arial" w:hAnsi="Arial" w:cs="Arial"/>
+          <w:i/>
+          <w:iCs/>
+        </w:rPr>
+        <w:t>un</w:t>
+      </w:r>
+      <w:r>
+        <w:rPr>
+          <w:rFonts w:ascii="Arial" w:hAnsi="Arial" w:cs="Arial"/>
+        </w:rPr>
+        <w:t xml:space="preserve"> prompt rilevante oppure descrivilo a parole se ce ne sono stati molti.</w:t>
+      </w:r>
+    </w:p>
+    <w:p>
+      <w:pPr>
+        <w:pStyle w:val="Nessunaspaziatura"/>
+        <w:rPr>
+          <w:rFonts w:ascii="Arial" w:hAnsi="Arial" w:cs="Arial"/>
+        </w:rPr>
+      </w:pPr>
+    </w:p>
+    <w:sdt>
+      <w:sdtPr>
+        <w:rPr>
+          <w:rFonts w:ascii="Arial" w:hAnsi="Arial" w:cs="Arial"/>
+        </w:rPr>
+        <w:alias w:val="Prompt AI"/>
+        <w:tag w:val="Prompt AI"/>
+        <w:id w:val="-276330765"/>
+        <w:placeholder>
+          <w:docPart w:val="03BE4E7B5CC94AF4A46689B864A614E2"/>
+        </w:placeholder>
+        <w15:color w:val="C0C0C0"/>
+      </w:sdtPr>
+      <w:sdtContent>
+        <w:p>
+          <w:pPr>
+            <w:pStyle w:val="Nessunaspaziatura"/>
+            <w:spacing w:line="276" w:lineRule="auto"/>
+            <w:rPr>
+              <w:rFonts w:ascii="Arial" w:hAnsi="Arial" w:cs="Arial"/>
+            </w:rPr>
+          </w:pPr>
+          <w:r>
+            <w:rPr>
+              <w:rFonts w:ascii="Arial" w:hAnsi="Arial" w:cs="Arial"/>
+            </w:rPr>
+            <w:t>Bryan: aiutami a capire le azioni di ogni attore nel seguente progetto.</w:t>
+          </w:r>
+        </w:p>
+        <w:p>
+          <w:pPr>
+            <w:pStyle w:val="Nessunaspaziatura"/>
+            <w:spacing w:line="276" w:lineRule="auto"/>
+            <w:rPr>
+              <w:rFonts w:ascii="Arial" w:hAnsi="Arial" w:cs="Arial"/>
+            </w:rPr>
+          </w:pPr>
+          <w:r>
+            <w:rPr>
+              <w:rFonts w:ascii="Arial" w:hAnsi="Arial" w:cs="Arial"/>
+            </w:rPr>
+            <w:t>Riley: Dammi un esempio di use case in base alle memorie che hai del nostro progetto</w:t>
+          </w:r>
+        </w:p>
+      </w:sdtContent>
+    </w:sdt>
+    <w:p>
+      <w:pPr>
+        <w:pStyle w:val="Nessunaspaziatura"/>
+        <w:rPr>
+          <w:rFonts w:ascii="Arial" w:hAnsi="Arial" w:cs="Arial"/>
+        </w:rPr>
+      </w:pPr>
+    </w:p>
+    <w:p>
+      <w:pPr>
+        <w:pStyle w:val="Nessunaspaziatura"/>
+        <w:rPr>
+          <w:rFonts w:ascii="Arial" w:hAnsi="Arial" w:cs="Arial"/>
+        </w:rPr>
+      </w:pPr>
+      <w:r>
+        <w:rPr>
+          <w:rFonts w:ascii="Arial" w:hAnsi="Arial" w:cs="Arial"/>
+          <w:b/>
+          <w:bCs/>
+        </w:rPr>
+        <w:t>Cosa mi ha dato l’AI</w:t>
+      </w:r>
+    </w:p>
+    <w:p>
+      <w:pPr>
+        <w:pStyle w:val="Nessunaspaziatura"/>
+        <w:rPr>
+          <w:rFonts w:ascii="Arial" w:hAnsi="Arial" w:cs="Arial"/>
+        </w:rPr>
+      </w:pPr>
+      <w:r>
+        <w:rPr>
+          <w:rFonts w:ascii="Arial" w:hAnsi="Arial" w:cs="Arial"/>
+        </w:rPr>
+        <w:t>Spiegazione, esempio, soluzione, suggerimento…</w:t>
+      </w:r>
+    </w:p>
+    <w:p>
+      <w:pPr>
+        <w:pStyle w:val="Nessunaspaziatura"/>
+        <w:rPr>
+          <w:rFonts w:ascii="Arial" w:hAnsi="Arial" w:cs="Arial"/>
+        </w:rPr>
+      </w:pPr>
+    </w:p>
+    <w:sdt>
+      <w:sdtPr>
+        <w:rPr>
+          <w:rFonts w:ascii="Arial" w:hAnsi="Arial" w:cs="Arial"/>
+        </w:rPr>
+        <w:alias w:val="Risposta AI"/>
+        <w:tag w:val="Risposta AI"/>
+        <w:id w:val="-2056535809"/>
+        <w:placeholder>
+          <w:docPart w:val="D73AAF87839447058EB0CCB272B978AC"/>
+        </w:placeholder>
+        <w15:color w:val="C0C0C0"/>
+      </w:sdtPr>
+      <w:sdtContent>
+        <w:p>
+          <w:pPr>
+            <w:pStyle w:val="Nessunaspaziatura"/>
+            <w:spacing w:line="276" w:lineRule="auto"/>
+            <w:rPr>
+              <w:rFonts w:ascii="Arial" w:hAnsi="Arial" w:cs="Arial"/>
+            </w:rPr>
+          </w:pPr>
+          <w:r>
+            <w:rPr>
+              <w:rFonts w:ascii="Arial" w:hAnsi="Arial" w:cs="Arial"/>
+            </w:rPr>
+            <w:t>Riley: Mi ha dato degli esempi grafici ed infine una base use case</w:t>
+          </w:r>
+          <w:r>
+            <w:rPr>
+              <w:rFonts w:ascii="Arial" w:hAnsi="Arial" w:cs="Arial"/>
+            </w:rPr>
+            <w:br/>
+            <w:t>Bryan: Correzioni dello use case generato dal colega</w:t>
+          </w:r>
+        </w:p>
+      </w:sdtContent>
+    </w:sdt>
+    <w:p>
+      <w:pPr>
+        <w:pStyle w:val="Nessunaspaziatura"/>
+        <w:rPr>
+          <w:rFonts w:ascii="Arial" w:hAnsi="Arial" w:cs="Arial"/>
+          <w:b/>
+          <w:bCs/>
+        </w:rPr>
+      </w:pPr>
+    </w:p>
+    <w:p>
+      <w:pPr>
+        <w:pStyle w:val="Nessunaspaziatura"/>
+        <w:rPr>
+          <w:rFonts w:ascii="Arial" w:hAnsi="Arial" w:cs="Arial"/>
+        </w:rPr>
+      </w:pPr>
+      <w:r>
+        <w:rPr>
+          <w:rFonts w:ascii="Arial" w:hAnsi="Arial" w:cs="Arial"/>
+          <w:b/>
+          <w:bCs/>
+        </w:rPr>
+        <w:t>Come l’ho usato io</w:t>
+      </w:r>
+      <w:r>
+        <w:rPr>
+          <w:rFonts w:ascii="Arial" w:hAnsi="Arial" w:cs="Arial"/>
+        </w:rPr>
+        <w:br/>
+      </w:r>
+      <w:sdt>
+        <w:sdtPr>
+          <w:rPr>
+            <w:rFonts w:ascii="Segoe UI Symbol" w:hAnsi="Segoe UI Symbol" w:cs="Segoe UI Symbol"/>
+          </w:rPr>
+          <w:id w:val="1552498758"/>
+          <w14:checkbox>
+            <w14:checked w14:val="1"/>
+            <w14:checkedState w14:val="2612" w14:font="MS Gothic"/>
+            <w14:uncheckedState w14:val="2610" w14:font="MS Gothic"/>
+          </w14:checkbox>
+        </w:sdtPr>
+        <w:sdtContent>
+          <w:r>
+            <w:rPr>
+              <w:rFonts w:ascii="MS Gothic" w:eastAsia="MS Gothic" w:hAnsi="MS Gothic" w:cs="Segoe UI Symbol" w:hint="eastAsia"/>
+            </w:rPr>
+            <w:t>☒</w:t>
+          </w:r>
+        </w:sdtContent>
+      </w:sdt>
+      <w:r>
+        <w:rPr>
+          <w:rFonts w:ascii="Arial" w:hAnsi="Arial" w:cs="Arial"/>
+        </w:rPr>
+        <w:t xml:space="preserve"> Copiato</w:t>
+      </w:r>
+      <w:r>
+        <w:rPr>
+          <w:rFonts w:ascii="Arial" w:hAnsi="Arial" w:cs="Arial"/>
+        </w:rPr>
+        <w:br/>
+      </w:r>
+      <w:sdt>
+        <w:sdtPr>
+          <w:rPr>
+            <w:rFonts w:ascii="Segoe UI Symbol" w:hAnsi="Segoe UI Symbol" w:cs="Segoe UI Symbol"/>
+          </w:rPr>
+          <w:id w:val="395240221"/>
+          <w14:checkbox>
+            <w14:checked w14:val="1"/>
+            <w14:checkedState w14:val="2612" w14:font="MS Gothic"/>
+            <w14:uncheckedState w14:val="2610" w14:font="MS Gothic"/>
+          </w14:checkbox>
+        </w:sdtPr>
+        <w:sdtContent>
+          <w:r>
+            <w:rPr>
+              <w:rFonts w:ascii="MS Gothic" w:eastAsia="MS Gothic" w:hAnsi="MS Gothic" w:cs="Segoe UI Symbol" w:hint="eastAsia"/>
+            </w:rPr>
+            <w:t>☒</w:t>
+          </w:r>
+        </w:sdtContent>
+      </w:sdt>
+      <w:r>
+        <w:rPr>
+          <w:rFonts w:ascii="Arial" w:hAnsi="Arial" w:cs="Arial"/>
+        </w:rPr>
+        <w:t xml:space="preserve"> Adattato</w:t>
+      </w:r>
+      <w:r>
+        <w:rPr>
+          <w:rFonts w:ascii="Arial" w:hAnsi="Arial" w:cs="Arial"/>
+        </w:rPr>
+        <w:br/>
+      </w:r>
+      <w:sdt>
+        <w:sdtPr>
+          <w:rPr>
+            <w:rFonts w:ascii="Segoe UI Symbol" w:hAnsi="Segoe UI Symbol" w:cs="Segoe UI Symbol"/>
+          </w:rPr>
+          <w:id w:val="820390656"/>
+          <w14:checkbox>
+            <w14:checked w14:val="0"/>
+            <w14:checkedState w14:val="2612" w14:font="MS Gothic"/>
+            <w14:uncheckedState w14:val="2610" w14:font="MS Gothic"/>
+          </w14:checkbox>
+        </w:sdtPr>
+        <w:sdtContent>
+          <w:r>
+            <w:rPr>
+              <w:rFonts w:ascii="MS Gothic" w:eastAsia="MS Gothic" w:hAnsi="MS Gothic" w:cs="Segoe UI Symbol" w:hint="eastAsia"/>
+            </w:rPr>
+            <w:t>☐</w:t>
+          </w:r>
+        </w:sdtContent>
+      </w:sdt>
+      <w:r>
+        <w:rPr>
+          <w:rFonts w:ascii="Arial" w:hAnsi="Arial" w:cs="Arial"/>
+        </w:rPr>
+        <w:t xml:space="preserve"> Usato solo per capire</w:t>
+      </w:r>
+      <w:r>
+        <w:rPr>
+          <w:rFonts w:ascii="Arial" w:hAnsi="Arial" w:cs="Arial"/>
+        </w:rPr>
+        <w:br/>
+      </w:r>
+      <w:sdt>
+        <w:sdtPr>
+          <w:rPr>
+            <w:rFonts w:ascii="Segoe UI Symbol" w:hAnsi="Segoe UI Symbol" w:cs="Segoe UI Symbol"/>
+          </w:rPr>
+          <w:id w:val="-573122780"/>
+          <w14:checkbox>
+            <w14:checked w14:val="0"/>
+            <w14:checkedState w14:val="2612" w14:font="MS Gothic"/>
+            <w14:uncheckedState w14:val="2610" w14:font="MS Gothic"/>
+          </w14:checkbox>
+        </w:sdtPr>
+        <w:sdtContent>
+          <w:r>
+            <w:rPr>
+              <w:rFonts w:ascii="MS Gothic" w:eastAsia="MS Gothic" w:hAnsi="MS Gothic" w:cs="Segoe UI Symbol" w:hint="eastAsia"/>
+            </w:rPr>
+            <w:t>☐</w:t>
+          </w:r>
+        </w:sdtContent>
+      </w:sdt>
+      <w:r>
+        <w:rPr>
+          <w:rFonts w:ascii="Arial" w:hAnsi="Arial" w:cs="Arial"/>
+        </w:rPr>
+        <w:t xml:space="preserve"> Scartato</w:t>
+      </w:r>
+    </w:p>
+    <w:p>
+      <w:pPr>
+        <w:pStyle w:val="Nessunaspaziatura"/>
+        <w:rPr>
+          <w:rFonts w:ascii="Arial" w:hAnsi="Arial" w:cs="Arial"/>
+        </w:rPr>
+      </w:pPr>
+    </w:p>
+    <w:p>
+      <w:pPr>
+        <w:pStyle w:val="Nessunaspaziatura"/>
+        <w:rPr>
+          <w:rFonts w:ascii="Arial" w:hAnsi="Arial" w:cs="Arial"/>
+        </w:rPr>
+      </w:pPr>
+    </w:p>
+    <w:p>
+      <w:pPr>
+        <w:pStyle w:val="Nessunaspaziatura"/>
+        <w:rPr>
+          <w:rFonts w:ascii="Arial" w:hAnsi="Arial" w:cs="Arial"/>
+        </w:rPr>
+      </w:pPr>
+      <w:r>
+        <w:rPr>
+          <w:rFonts w:ascii="Arial" w:hAnsi="Arial" w:cs="Arial"/>
+          <w:b/>
+          <w:bCs/>
+        </w:rPr>
+        <w:t>Cosa avrei fatto senza AI?</w:t>
+      </w:r>
+    </w:p>
+    <w:p>
+      <w:pPr>
+        <w:pStyle w:val="Nessunaspaziatura"/>
+        <w:rPr>
+          <w:rFonts w:ascii="Arial" w:hAnsi="Arial" w:cs="Arial"/>
+        </w:rPr>
+      </w:pPr>
+    </w:p>
+    <w:p>
+      <w:pPr>
+        <w:pStyle w:val="Nessunaspaziatura"/>
+        <w:spacing w:line="276" w:lineRule="auto"/>
+        <w:rPr>
+          <w:rFonts w:ascii="Arial" w:hAnsi="Arial" w:cs="Arial"/>
+        </w:rPr>
+      </w:pPr>
+      <w:r>
+        <w:rPr>
+          <w:rFonts w:ascii="Arial" w:hAnsi="Arial" w:cs="Arial"/>
+        </w:rPr>
+        <w:t>Analizzerei con calma e attenzione tutti i processi che devono essere svolti, richiedendo un tempo maggiore per l’analisi.</w:t>
       </w:r>
     </w:p>
     <w:sectPr>
@@ -5457,17 +6511,8 @@
         <w:rFonts w:ascii="Arial" w:hAnsi="Arial" w:cs="Arial"/>
         <w:lang w:val="fr-CH"/>
       </w:rPr>
-      <w:t xml:space="preserve">Riley Bianchi &amp; Bryan </w:t>
+      <w:t>Riley Bianchi &amp; Bryan Ciaponi</w:t>
     </w:r>
-    <w:proofErr w:type="spellStart"/>
-    <w:r>
-      <w:rPr>
-        <w:rFonts w:ascii="Arial" w:hAnsi="Arial" w:cs="Arial"/>
-        <w:lang w:val="fr-CH"/>
-      </w:rPr>
-      <w:t>Ciaponi</w:t>
-    </w:r>
-    <w:proofErr w:type="spellEnd"/>
   </w:p>
 </w:hdr>
 </file>
@@ -8366,6 +9411,7 @@
   <w:style w:type="character" w:default="1" w:styleId="Carpredefinitoparagrafo">
     <w:name w:val="Default Paragraph Font"/>
     <w:uiPriority w:val="1"/>
+    <w:semiHidden/>
     <w:unhideWhenUsed/>
   </w:style>
   <w:style w:type="table" w:default="1" w:styleId="Tabellanormale">
@@ -9252,6 +10298,107 @@
         </w:p>
       </w:docPartBody>
     </w:docPart>
+    <w:docPart>
+      <w:docPartPr>
+        <w:name w:val="266D87AC85394CAEB0812BA9E79795F2"/>
+        <w:category>
+          <w:name w:val="Generale"/>
+          <w:gallery w:val="placeholder"/>
+        </w:category>
+        <w:types>
+          <w:type w:val="bbPlcHdr"/>
+        </w:types>
+        <w:behaviors>
+          <w:behavior w:val="content"/>
+        </w:behaviors>
+        <w:guid w:val="{88255D3D-B40C-46BC-BCC0-830308F4558E}"/>
+      </w:docPartPr>
+      <w:docPartBody>
+        <w:p>
+          <w:pPr>
+            <w:pStyle w:val="266D87AC85394CAEB0812BA9E79795F2"/>
+          </w:pPr>
+          <w:r>
+            <w:rPr>
+              <w:rStyle w:val="Testosegnaposto"/>
+              <w:b/>
+              <w:bCs/>
+            </w:rPr>
+            <w:t>Nomi AI utilizzati</w:t>
+          </w:r>
+        </w:p>
+      </w:docPartBody>
+    </w:docPart>
+    <w:docPart>
+      <w:docPartPr>
+        <w:name w:val="03BE4E7B5CC94AF4A46689B864A614E2"/>
+        <w:category>
+          <w:name w:val="Generale"/>
+          <w:gallery w:val="placeholder"/>
+        </w:category>
+        <w:types>
+          <w:type w:val="bbPlcHdr"/>
+        </w:types>
+        <w:behaviors>
+          <w:behavior w:val="content"/>
+        </w:behaviors>
+        <w:guid w:val="{A287A7C1-CC30-483D-A6FE-0CDD837217BA}"/>
+      </w:docPartPr>
+      <w:docPartBody>
+        <w:p>
+          <w:pPr>
+            <w:pStyle w:val="03BE4E7B5CC94AF4A46689B864A614E2"/>
+          </w:pPr>
+          <w:r>
+            <w:rPr>
+              <w:rStyle w:val="Testosegnaposto"/>
+            </w:rPr>
+            <w:t>Fare clic o toccare qui per immettere il testo.</w:t>
+          </w:r>
+        </w:p>
+      </w:docPartBody>
+    </w:docPart>
+    <w:docPart>
+      <w:docPartPr>
+        <w:name w:val="D73AAF87839447058EB0CCB272B978AC"/>
+        <w:category>
+          <w:name w:val="Generale"/>
+          <w:gallery w:val="placeholder"/>
+        </w:category>
+        <w:types>
+          <w:type w:val="bbPlcHdr"/>
+        </w:types>
+        <w:behaviors>
+          <w:behavior w:val="content"/>
+        </w:behaviors>
+        <w:guid w:val="{ABCDC275-E4D6-478B-917D-3FA1530FB550}"/>
+      </w:docPartPr>
+      <w:docPartBody>
+        <w:p>
+          <w:pPr>
+            <w:pStyle w:val="D73AAF87839447058EB0CCB272B978AC"/>
+          </w:pPr>
+          <w:r>
+            <w:rPr>
+              <w:rStyle w:val="Testosegnaposto"/>
+            </w:rPr>
+            <w:t xml:space="preserve">Fare clic o toccare qui per </w:t>
+          </w:r>
+          <w:r>
+            <w:rPr>
+              <w:rStyle w:val="Testosegnaposto"/>
+            </w:rPr>
+            <w:t>immettere</w:t>
+          </w:r>
+          <w:r>
+            <w:rPr>
+              <w:rStyle w:val="Testosegnaposto"/>
+            </w:rPr>
+            <w:t xml:space="preserve"> il testo.</w:t>
+          </w:r>
+        </w:p>
+      </w:docPartBody>
+    </w:docPart>
   </w:docParts>
 </w:glossaryDocument>
 </file>
@@ -9384,8 +10531,11 @@
     <w:rsidRoot w:val="00BE72BC"/>
     <w:rsid w:val="001A3B5C"/>
     <w:rsid w:val="00352469"/>
+    <w:rsid w:val="00356BEF"/>
     <w:rsid w:val="00396FDF"/>
     <w:rsid w:val="003B3A61"/>
+    <w:rsid w:val="004834F6"/>
+    <w:rsid w:val="004B57DE"/>
     <w:rsid w:val="00534571"/>
     <w:rsid w:val="00565B11"/>
     <w:rsid w:val="0063588A"/>
@@ -9395,12 +10545,15 @@
     <w:rsid w:val="0080736A"/>
     <w:rsid w:val="009826E2"/>
     <w:rsid w:val="00A04D62"/>
+    <w:rsid w:val="00A27299"/>
     <w:rsid w:val="00A65B6C"/>
+    <w:rsid w:val="00B555FF"/>
     <w:rsid w:val="00BD5007"/>
     <w:rsid w:val="00BE72BC"/>
     <w:rsid w:val="00DA48BB"/>
     <w:rsid w:val="00DE2402"/>
     <w:rsid w:val="00DE4EBE"/>
+    <w:rsid w:val="00DF3FD5"/>
     <w:rsid w:val="00DF4754"/>
     <w:rsid w:val="00ED4879"/>
     <w:rsid w:val="00EE3640"/>
@@ -9860,7 +11013,7 @@
     <w:basedOn w:val="Carpredefinitoparagrafo"/>
     <w:uiPriority w:val="99"/>
     <w:semiHidden/>
-    <w:rsid w:val="00715227"/>
+    <w:rsid w:val="00B555FF"/>
     <w:rPr>
       <w:color w:val="666666"/>
     </w:rPr>
@@ -9945,6 +11098,18 @@
   <w:style w:type="paragraph" w:customStyle="1" w:styleId="607F3FF7388E4923BFFA8DAF4796AEB1">
     <w:name w:val="607F3FF7388E4923BFFA8DAF4796AEB1"/>
     <w:rsid w:val="00715227"/>
+  </w:style>
+  <w:style w:type="paragraph" w:customStyle="1" w:styleId="266D87AC85394CAEB0812BA9E79795F2">
+    <w:name w:val="266D87AC85394CAEB0812BA9E79795F2"/>
+    <w:rsid w:val="00B555FF"/>
+  </w:style>
+  <w:style w:type="paragraph" w:customStyle="1" w:styleId="03BE4E7B5CC94AF4A46689B864A614E2">
+    <w:name w:val="03BE4E7B5CC94AF4A46689B864A614E2"/>
+    <w:rsid w:val="00B555FF"/>
+  </w:style>
+  <w:style w:type="paragraph" w:customStyle="1" w:styleId="D73AAF87839447058EB0CCB272B978AC">
+    <w:name w:val="D73AAF87839447058EB0CCB272B978AC"/>
+    <w:rsid w:val="00B555FF"/>
   </w:style>
 </w:styles>
 </file>

</xml_diff>

<commit_message>
diario e creazione gantt consuntivo
</commit_message>
<xml_diff>
--- a/4_Diari/Diario.docx
+++ b/4_Diari/Diario.docx
@@ -6399,19 +6399,7 @@
               <w:rPr>
                 <w:rFonts w:ascii="Arial" w:hAnsi="Arial" w:cs="Arial"/>
               </w:rPr>
-              <w:t>1</w:t>
-            </w:r>
-            <w:r>
-              <w:rPr>
-                <w:rFonts w:ascii="Arial" w:hAnsi="Arial" w:cs="Arial"/>
-              </w:rPr>
-              <w:t>5</w:t>
-            </w:r>
-            <w:r>
-              <w:rPr>
-                <w:rFonts w:ascii="Arial" w:hAnsi="Arial" w:cs="Arial"/>
-              </w:rPr>
-              <w:t>.09.2026</w:t>
+              <w:t>15.09.2026</w:t>
             </w:r>
           </w:p>
         </w:tc>
@@ -6644,13 +6632,7 @@
               <w:rPr>
                 <w:rFonts w:ascii="Arial" w:hAnsi="Arial" w:cs="Arial"/>
               </w:rPr>
-              <w:t>-</w:t>
-            </w:r>
-            <w:r>
-              <w:rPr>
-                <w:rFonts w:ascii="Arial" w:hAnsi="Arial" w:cs="Arial"/>
-              </w:rPr>
-              <w:t>.</w:t>
+              <w:t>-.</w:t>
             </w:r>
           </w:p>
         </w:tc>
@@ -7238,13 +7220,7 @@
             <w:rPr>
               <w:rFonts w:ascii="Arial" w:hAnsi="Arial" w:cs="Arial"/>
             </w:rPr>
-            <w:t xml:space="preserve">Bryan: </w:t>
-          </w:r>
-          <w:r>
-            <w:rPr>
-              <w:rFonts w:ascii="Arial" w:hAnsi="Arial" w:cs="Arial"/>
-            </w:rPr>
-            <w:t>Generami un’immagine di mockup basandoti sul seguente stile: “stile”</w:t>
+            <w:t>Bryan: Generami un’immagine di mockup basandoti sul seguente stile: “stile”</w:t>
           </w:r>
         </w:p>
         <w:p>
@@ -7259,13 +7235,7 @@
             <w:rPr>
               <w:rFonts w:ascii="Arial" w:hAnsi="Arial" w:cs="Arial"/>
             </w:rPr>
-            <w:t xml:space="preserve">Riley: </w:t>
-          </w:r>
-          <w:r>
-            <w:rPr>
-              <w:rFonts w:ascii="Arial" w:hAnsi="Arial" w:cs="Arial"/>
-            </w:rPr>
-            <w:t>Aiutami a comprendere cosa causa questo errore: “errore”</w:t>
+            <w:t>Riley: Aiutami a comprendere cosa causa questo errore: “errore”</w:t>
           </w:r>
         </w:p>
       </w:sdtContent>
@@ -7342,31 +7312,14 @@
             <w:rPr>
               <w:rFonts w:ascii="Arial" w:hAnsi="Arial" w:cs="Arial"/>
             </w:rPr>
-            <w:t xml:space="preserve">Riley: </w:t>
+            <w:t>Riley: Mi ha fornito una spiegazione e come risolvere</w:t>
           </w:r>
           <w:r>
             <w:rPr>
               <w:rFonts w:ascii="Arial" w:hAnsi="Arial" w:cs="Arial"/>
             </w:rPr>
-            <w:t>Mi ha fornito una spiegazione e come risolvere</w:t>
-          </w:r>
-          <w:r>
-            <w:rPr>
-              <w:rFonts w:ascii="Arial" w:hAnsi="Arial" w:cs="Arial"/>
-            </w:rPr>
             <w:br/>
-          </w:r>
-          <w:r>
-            <w:rPr>
-              <w:rFonts w:ascii="Arial" w:hAnsi="Arial" w:cs="Arial"/>
-            </w:rPr>
-            <w:t xml:space="preserve">Bryan: </w:t>
-          </w:r>
-          <w:r>
-            <w:rPr>
-              <w:rFonts w:ascii="Arial" w:hAnsi="Arial" w:cs="Arial"/>
-            </w:rPr>
-            <w:t>Mi ha fornito le immagini richieste</w:t>
+            <w:t>Bryan: Mi ha fornito le immagini richieste</w:t>
           </w:r>
         </w:p>
       </w:sdtContent>
@@ -7590,6 +7543,1531 @@
         <w:br/>
         <w:t>Bryan: Averi creato un’immagine su paint che avrebbe reso i mockup molto più confusi.</w:t>
       </w:r>
+    </w:p>
+    <w:p>
+      <w:pPr>
+        <w:rPr>
+          <w:rFonts w:ascii="Arial" w:hAnsi="Arial" w:cs="Arial"/>
+        </w:rPr>
+      </w:pPr>
+      <w:r>
+        <w:rPr>
+          <w:rFonts w:ascii="Arial" w:hAnsi="Arial" w:cs="Arial"/>
+        </w:rPr>
+        <w:br w:type="page"/>
+      </w:r>
+    </w:p>
+    <w:tbl>
+      <w:tblPr>
+        <w:tblStyle w:val="Grigliatabella"/>
+        <w:tblW w:w="5000" w:type="pct"/>
+        <w:tblLook w:val="04A0" w:firstRow="1" w:lastRow="0" w:firstColumn="1" w:lastColumn="0" w:noHBand="0" w:noVBand="1"/>
+      </w:tblPr>
+      <w:tblGrid>
+        <w:gridCol w:w="2407"/>
+        <w:gridCol w:w="7221"/>
+      </w:tblGrid>
+      <w:tr>
+        <w:trPr>
+          <w:trHeight w:val="199"/>
+        </w:trPr>
+        <w:tc>
+          <w:tcPr>
+            <w:tcW w:w="1250" w:type="pct"/>
+            <w:vAlign w:val="center"/>
+          </w:tcPr>
+          <w:p>
+            <w:pPr>
+              <w:rPr>
+                <w:rFonts w:ascii="Arial" w:hAnsi="Arial" w:cs="Arial"/>
+              </w:rPr>
+            </w:pPr>
+            <w:r>
+              <w:rPr>
+                <w:rFonts w:ascii="Arial" w:hAnsi="Arial" w:cs="Arial"/>
+              </w:rPr>
+              <w:lastRenderedPageBreak/>
+              <w:t>Luogo</w:t>
+            </w:r>
+          </w:p>
+        </w:tc>
+        <w:tc>
+          <w:tcPr>
+            <w:tcW w:w="3750" w:type="pct"/>
+            <w:vAlign w:val="center"/>
+          </w:tcPr>
+          <w:p>
+            <w:pPr>
+              <w:rPr>
+                <w:rFonts w:ascii="Arial" w:hAnsi="Arial" w:cs="Arial"/>
+              </w:rPr>
+            </w:pPr>
+            <w:r>
+              <w:rPr>
+                <w:rFonts w:ascii="Arial" w:hAnsi="Arial" w:cs="Arial"/>
+              </w:rPr>
+              <w:t>Scuola Arti e Mestieri Trevano</w:t>
+            </w:r>
+          </w:p>
+        </w:tc>
+      </w:tr>
+      <w:tr>
+        <w:trPr>
+          <w:trHeight w:val="196"/>
+        </w:trPr>
+        <w:tc>
+          <w:tcPr>
+            <w:tcW w:w="1250" w:type="pct"/>
+            <w:vAlign w:val="center"/>
+          </w:tcPr>
+          <w:p>
+            <w:pPr>
+              <w:rPr>
+                <w:rFonts w:ascii="Arial" w:hAnsi="Arial" w:cs="Arial"/>
+              </w:rPr>
+            </w:pPr>
+            <w:r>
+              <w:rPr>
+                <w:rFonts w:ascii="Arial" w:hAnsi="Arial" w:cs="Arial"/>
+              </w:rPr>
+              <w:t>Data</w:t>
+            </w:r>
+          </w:p>
+        </w:tc>
+        <w:tc>
+          <w:tcPr>
+            <w:tcW w:w="3750" w:type="pct"/>
+            <w:vAlign w:val="center"/>
+          </w:tcPr>
+          <w:p>
+            <w:pPr>
+              <w:rPr>
+                <w:rFonts w:ascii="Arial" w:hAnsi="Arial" w:cs="Arial"/>
+              </w:rPr>
+            </w:pPr>
+            <w:r>
+              <w:rPr>
+                <w:rFonts w:ascii="Arial" w:hAnsi="Arial" w:cs="Arial"/>
+              </w:rPr>
+              <w:t>16.09.2026</w:t>
+            </w:r>
+          </w:p>
+        </w:tc>
+      </w:tr>
+    </w:tbl>
+    <w:p>
+      <w:pPr>
+        <w:rPr>
+          <w:rFonts w:ascii="Arial" w:hAnsi="Arial" w:cs="Arial"/>
+        </w:rPr>
+      </w:pPr>
+    </w:p>
+    <w:tbl>
+      <w:tblPr>
+        <w:tblStyle w:val="Grigliatabella"/>
+        <w:tblW w:w="0" w:type="auto"/>
+        <w:tblLook w:val="04A0" w:firstRow="1" w:lastRow="0" w:firstColumn="1" w:lastColumn="0" w:noHBand="0" w:noVBand="1"/>
+      </w:tblPr>
+      <w:tblGrid>
+        <w:gridCol w:w="1271"/>
+        <w:gridCol w:w="8357"/>
+      </w:tblGrid>
+      <w:tr>
+        <w:tc>
+          <w:tcPr>
+            <w:tcW w:w="9628" w:type="dxa"/>
+            <w:gridSpan w:val="2"/>
+            <w:shd w:val="clear" w:color="auto" w:fill="D9D9D9" w:themeFill="background1" w:themeFillShade="D9"/>
+          </w:tcPr>
+          <w:p>
+            <w:pPr>
+              <w:rPr>
+                <w:rFonts w:ascii="Arial" w:hAnsi="Arial" w:cs="Arial"/>
+              </w:rPr>
+            </w:pPr>
+            <w:r>
+              <w:rPr>
+                <w:rFonts w:ascii="Arial" w:hAnsi="Arial" w:cs="Arial"/>
+              </w:rPr>
+              <w:t>Lavori svolti</w:t>
+            </w:r>
+          </w:p>
+        </w:tc>
+      </w:tr>
+      <w:tr>
+        <w:tc>
+          <w:tcPr>
+            <w:tcW w:w="1271" w:type="dxa"/>
+          </w:tcPr>
+          <w:p>
+            <w:pPr>
+              <w:rPr>
+                <w:rFonts w:ascii="Arial" w:hAnsi="Arial" w:cs="Arial"/>
+              </w:rPr>
+            </w:pPr>
+            <w:r>
+              <w:rPr>
+                <w:rFonts w:ascii="Arial" w:hAnsi="Arial" w:cs="Arial"/>
+              </w:rPr>
+              <w:t>Riley</w:t>
+            </w:r>
+          </w:p>
+        </w:tc>
+        <w:tc>
+          <w:tcPr>
+            <w:tcW w:w="8357" w:type="dxa"/>
+          </w:tcPr>
+          <w:p>
+            <w:pPr>
+              <w:rPr>
+                <w:rFonts w:ascii="Arial" w:hAnsi="Arial" w:cs="Arial"/>
+              </w:rPr>
+            </w:pPr>
+            <w:r>
+              <w:rPr>
+                <w:rFonts w:ascii="Arial" w:hAnsi="Arial" w:cs="Arial"/>
+              </w:rPr>
+              <w:t>Inizio sviluppo ui statistiche</w:t>
+            </w:r>
+          </w:p>
+        </w:tc>
+      </w:tr>
+      <w:tr>
+        <w:tc>
+          <w:tcPr>
+            <w:tcW w:w="1271" w:type="dxa"/>
+          </w:tcPr>
+          <w:p>
+            <w:pPr>
+              <w:rPr>
+                <w:rFonts w:ascii="Arial" w:hAnsi="Arial" w:cs="Arial"/>
+              </w:rPr>
+            </w:pPr>
+            <w:r>
+              <w:rPr>
+                <w:rFonts w:ascii="Arial" w:hAnsi="Arial" w:cs="Arial"/>
+              </w:rPr>
+              <w:t>Bryan</w:t>
+            </w:r>
+          </w:p>
+        </w:tc>
+        <w:tc>
+          <w:tcPr>
+            <w:tcW w:w="8357" w:type="dxa"/>
+          </w:tcPr>
+          <w:p>
+            <w:pPr>
+              <w:rPr>
+                <w:rFonts w:ascii="Arial" w:hAnsi="Arial" w:cs="Arial"/>
+              </w:rPr>
+            </w:pPr>
+            <w:r>
+              <w:rPr>
+                <w:rFonts w:ascii="Arial" w:hAnsi="Arial" w:cs="Arial"/>
+              </w:rPr>
+              <w:t>Inizio sviluppo ui statistiche</w:t>
+            </w:r>
+          </w:p>
+        </w:tc>
+      </w:tr>
+    </w:tbl>
+    <w:p>
+      <w:pPr>
+        <w:rPr>
+          <w:rFonts w:ascii="Arial" w:hAnsi="Arial" w:cs="Arial"/>
+        </w:rPr>
+      </w:pPr>
+    </w:p>
+    <w:tbl>
+      <w:tblPr>
+        <w:tblStyle w:val="Grigliatabella"/>
+        <w:tblW w:w="0" w:type="auto"/>
+        <w:tblInd w:w="-5" w:type="dxa"/>
+        <w:tblLook w:val="04A0" w:firstRow="1" w:lastRow="0" w:firstColumn="1" w:lastColumn="0" w:noHBand="0" w:noVBand="1"/>
+      </w:tblPr>
+      <w:tblGrid>
+        <w:gridCol w:w="1276"/>
+        <w:gridCol w:w="8357"/>
+      </w:tblGrid>
+      <w:tr>
+        <w:tc>
+          <w:tcPr>
+            <w:tcW w:w="9628" w:type="dxa"/>
+            <w:gridSpan w:val="2"/>
+            <w:shd w:val="clear" w:color="auto" w:fill="D9D9D9" w:themeFill="background1" w:themeFillShade="D9"/>
+          </w:tcPr>
+          <w:p>
+            <w:pPr>
+              <w:rPr>
+                <w:rFonts w:ascii="Arial" w:hAnsi="Arial" w:cs="Arial"/>
+              </w:rPr>
+            </w:pPr>
+            <w:r>
+              <w:rPr>
+                <w:rFonts w:ascii="Arial" w:hAnsi="Arial" w:cs="Arial"/>
+              </w:rPr>
+              <w:t>Problemi riscontrati e soluzioni adottate</w:t>
+            </w:r>
+          </w:p>
+        </w:tc>
+      </w:tr>
+      <w:tr>
+        <w:tc>
+          <w:tcPr>
+            <w:tcW w:w="1276" w:type="dxa"/>
+          </w:tcPr>
+          <w:p>
+            <w:pPr>
+              <w:rPr>
+                <w:rFonts w:ascii="Arial" w:hAnsi="Arial" w:cs="Arial"/>
+              </w:rPr>
+            </w:pPr>
+            <w:r>
+              <w:rPr>
+                <w:rFonts w:ascii="Arial" w:hAnsi="Arial" w:cs="Arial"/>
+              </w:rPr>
+              <w:t>Riley</w:t>
+            </w:r>
+          </w:p>
+        </w:tc>
+        <w:tc>
+          <w:tcPr>
+            <w:tcW w:w="8357" w:type="dxa"/>
+          </w:tcPr>
+          <w:p>
+            <w:pPr>
+              <w:rPr>
+                <w:rFonts w:ascii="Arial" w:hAnsi="Arial" w:cs="Arial"/>
+              </w:rPr>
+            </w:pPr>
+            <w:r>
+              <w:rPr>
+                <w:rFonts w:ascii="Arial" w:hAnsi="Arial" w:cs="Arial"/>
+              </w:rPr>
+              <w:t>-</w:t>
+            </w:r>
+          </w:p>
+        </w:tc>
+      </w:tr>
+      <w:tr>
+        <w:tc>
+          <w:tcPr>
+            <w:tcW w:w="1276" w:type="dxa"/>
+          </w:tcPr>
+          <w:p>
+            <w:pPr>
+              <w:rPr>
+                <w:rFonts w:ascii="Arial" w:hAnsi="Arial" w:cs="Arial"/>
+              </w:rPr>
+            </w:pPr>
+            <w:r>
+              <w:rPr>
+                <w:rFonts w:ascii="Arial" w:hAnsi="Arial" w:cs="Arial"/>
+              </w:rPr>
+              <w:t>Bryan</w:t>
+            </w:r>
+          </w:p>
+        </w:tc>
+        <w:tc>
+          <w:tcPr>
+            <w:tcW w:w="8357" w:type="dxa"/>
+          </w:tcPr>
+          <w:p>
+            <w:pPr>
+              <w:rPr>
+                <w:rFonts w:ascii="Arial" w:hAnsi="Arial" w:cs="Arial"/>
+              </w:rPr>
+            </w:pPr>
+            <w:r>
+              <w:rPr>
+                <w:rFonts w:ascii="Arial" w:hAnsi="Arial" w:cs="Arial"/>
+              </w:rPr>
+              <w:t>-.</w:t>
+            </w:r>
+          </w:p>
+        </w:tc>
+      </w:tr>
+    </w:tbl>
+    <w:p>
+      <w:pPr>
+        <w:rPr>
+          <w:rFonts w:ascii="Arial" w:hAnsi="Arial" w:cs="Arial"/>
+        </w:rPr>
+      </w:pPr>
+    </w:p>
+    <w:tbl>
+      <w:tblPr>
+        <w:tblStyle w:val="Grigliatabella"/>
+        <w:tblW w:w="0" w:type="auto"/>
+        <w:tblLook w:val="04A0" w:firstRow="1" w:lastRow="0" w:firstColumn="1" w:lastColumn="0" w:noHBand="0" w:noVBand="1"/>
+      </w:tblPr>
+      <w:tblGrid>
+        <w:gridCol w:w="9628"/>
+      </w:tblGrid>
+      <w:tr>
+        <w:tc>
+          <w:tcPr>
+            <w:tcW w:w="9854" w:type="dxa"/>
+            <w:shd w:val="clear" w:color="auto" w:fill="D9D9D9" w:themeFill="background1" w:themeFillShade="D9"/>
+          </w:tcPr>
+          <w:p>
+            <w:pPr>
+              <w:rPr>
+                <w:rFonts w:ascii="Arial" w:hAnsi="Arial" w:cs="Arial"/>
+              </w:rPr>
+            </w:pPr>
+            <w:r>
+              <w:rPr>
+                <w:rFonts w:ascii="Arial" w:hAnsi="Arial" w:cs="Arial"/>
+              </w:rPr>
+              <w:t>Punto della situazione rispetto alla pianificazione</w:t>
+            </w:r>
+          </w:p>
+        </w:tc>
+      </w:tr>
+      <w:tr>
+        <w:tc>
+          <w:tcPr>
+            <w:tcW w:w="9854" w:type="dxa"/>
+          </w:tcPr>
+          <w:p>
+            <w:pPr>
+              <w:rPr>
+                <w:rFonts w:ascii="Arial" w:hAnsi="Arial" w:cs="Arial"/>
+              </w:rPr>
+            </w:pPr>
+            <w:r>
+              <w:rPr>
+                <w:rFonts w:ascii="Arial" w:hAnsi="Arial" w:cs="Arial"/>
+              </w:rPr>
+              <w:t>-</w:t>
+            </w:r>
+          </w:p>
+        </w:tc>
+      </w:tr>
+    </w:tbl>
+    <w:p>
+      <w:pPr>
+        <w:rPr>
+          <w:rFonts w:ascii="Arial" w:hAnsi="Arial" w:cs="Arial"/>
+        </w:rPr>
+      </w:pPr>
+    </w:p>
+    <w:tbl>
+      <w:tblPr>
+        <w:tblStyle w:val="Grigliatabella"/>
+        <w:tblW w:w="0" w:type="auto"/>
+        <w:tblLook w:val="04A0" w:firstRow="1" w:lastRow="0" w:firstColumn="1" w:lastColumn="0" w:noHBand="0" w:noVBand="1"/>
+      </w:tblPr>
+      <w:tblGrid>
+        <w:gridCol w:w="9628"/>
+      </w:tblGrid>
+      <w:tr>
+        <w:tc>
+          <w:tcPr>
+            <w:tcW w:w="9854" w:type="dxa"/>
+            <w:shd w:val="clear" w:color="auto" w:fill="D9D9D9" w:themeFill="background1" w:themeFillShade="D9"/>
+          </w:tcPr>
+          <w:p>
+            <w:pPr>
+              <w:rPr>
+                <w:rFonts w:ascii="Arial" w:hAnsi="Arial" w:cs="Arial"/>
+              </w:rPr>
+            </w:pPr>
+            <w:r>
+              <w:rPr>
+                <w:rFonts w:ascii="Arial" w:hAnsi="Arial" w:cs="Arial"/>
+              </w:rPr>
+              <w:t>Programma di massima per la prossima giornata di lavoro</w:t>
+            </w:r>
+          </w:p>
+        </w:tc>
+      </w:tr>
+      <w:tr>
+        <w:tc>
+          <w:tcPr>
+            <w:tcW w:w="9854" w:type="dxa"/>
+          </w:tcPr>
+          <w:p>
+            <w:pPr>
+              <w:rPr>
+                <w:rFonts w:ascii="Arial" w:hAnsi="Arial" w:cs="Arial"/>
+              </w:rPr>
+            </w:pPr>
+            <w:r>
+              <w:rPr>
+                <w:rFonts w:ascii="Arial" w:hAnsi="Arial" w:cs="Arial"/>
+              </w:rPr>
+              <w:t>Completare la ui delle statistiche</w:t>
+            </w:r>
+          </w:p>
+        </w:tc>
+      </w:tr>
+    </w:tbl>
+    <w:p>
+      <w:pPr>
+        <w:rPr>
+          <w:rFonts w:ascii="Arial" w:hAnsi="Arial" w:cs="Arial"/>
+        </w:rPr>
+      </w:pPr>
+    </w:p>
+    <w:p>
+      <w:pPr>
+        <w:pStyle w:val="Titolo1"/>
+      </w:pPr>
+      <w:r>
+        <w:t>Agile - Resoconto</w:t>
+      </w:r>
+    </w:p>
+    <w:tbl>
+      <w:tblPr>
+        <w:tblStyle w:val="Grigliatabella"/>
+        <w:tblW w:w="0" w:type="auto"/>
+        <w:tblLook w:val="04A0" w:firstRow="1" w:lastRow="0" w:firstColumn="1" w:lastColumn="0" w:noHBand="0" w:noVBand="1"/>
+      </w:tblPr>
+      <w:tblGrid>
+        <w:gridCol w:w="9628"/>
+      </w:tblGrid>
+      <w:tr>
+        <w:tc>
+          <w:tcPr>
+            <w:tcW w:w="9628" w:type="dxa"/>
+            <w:tcBorders>
+              <w:top w:val="single" w:sz="4" w:space="0" w:color="auto"/>
+              <w:left w:val="single" w:sz="4" w:space="0" w:color="auto"/>
+              <w:bottom w:val="single" w:sz="4" w:space="0" w:color="auto"/>
+              <w:right w:val="single" w:sz="4" w:space="0" w:color="auto"/>
+            </w:tcBorders>
+            <w:shd w:val="clear" w:color="auto" w:fill="D9D9D9" w:themeFill="background1" w:themeFillShade="D9"/>
+            <w:hideMark/>
+          </w:tcPr>
+          <w:p>
+            <w:pPr>
+              <w:spacing w:after="200" w:line="276" w:lineRule="auto"/>
+              <w:rPr>
+                <w:rFonts w:ascii="Arial" w:hAnsi="Arial" w:cs="Arial"/>
+              </w:rPr>
+            </w:pPr>
+            <w:r>
+              <w:rPr>
+                <w:rFonts w:ascii="Arial" w:hAnsi="Arial" w:cs="Arial"/>
+              </w:rPr>
+              <w:t>Daily Scrum</w:t>
+            </w:r>
+          </w:p>
+        </w:tc>
+      </w:tr>
+      <w:tr>
+        <w:tc>
+          <w:tcPr>
+            <w:tcW w:w="9628" w:type="dxa"/>
+            <w:tcBorders>
+              <w:top w:val="single" w:sz="4" w:space="0" w:color="auto"/>
+              <w:left w:val="single" w:sz="4" w:space="0" w:color="auto"/>
+              <w:bottom w:val="single" w:sz="4" w:space="0" w:color="auto"/>
+              <w:right w:val="single" w:sz="4" w:space="0" w:color="auto"/>
+            </w:tcBorders>
+            <w:hideMark/>
+          </w:tcPr>
+          <w:p>
+            <w:pPr>
+              <w:spacing w:after="200" w:line="276" w:lineRule="auto"/>
+              <w:rPr>
+                <w:rFonts w:ascii="Arial" w:hAnsi="Arial" w:cs="Arial"/>
+              </w:rPr>
+            </w:pPr>
+          </w:p>
+        </w:tc>
+      </w:tr>
+      <w:tr>
+        <w:tc>
+          <w:tcPr>
+            <w:tcW w:w="9628" w:type="dxa"/>
+            <w:tcBorders>
+              <w:top w:val="single" w:sz="4" w:space="0" w:color="auto"/>
+              <w:left w:val="single" w:sz="4" w:space="0" w:color="auto"/>
+              <w:bottom w:val="single" w:sz="4" w:space="0" w:color="auto"/>
+              <w:right w:val="single" w:sz="4" w:space="0" w:color="auto"/>
+            </w:tcBorders>
+          </w:tcPr>
+          <w:p>
+            <w:pPr>
+              <w:spacing w:after="200" w:line="276" w:lineRule="auto"/>
+              <w:rPr>
+                <w:rFonts w:ascii="Arial" w:hAnsi="Arial" w:cs="Arial"/>
+              </w:rPr>
+            </w:pPr>
+            <w:r>
+              <w:rPr>
+                <w:rFonts w:ascii="Arial" w:hAnsi="Arial" w:cs="Arial"/>
+              </w:rPr>
+              <w:t>Introduzione ambiente unity e inizio imostazione layout statistiche</w:t>
+            </w:r>
+          </w:p>
+        </w:tc>
+      </w:tr>
+    </w:tbl>
+    <w:p>
+      <w:pPr>
+        <w:rPr>
+          <w:rFonts w:ascii="Arial" w:hAnsi="Arial" w:cs="Arial"/>
+        </w:rPr>
+      </w:pPr>
+    </w:p>
+    <w:tbl>
+      <w:tblPr>
+        <w:tblStyle w:val="Grigliatabella"/>
+        <w:tblW w:w="0" w:type="auto"/>
+        <w:tblLook w:val="04A0" w:firstRow="1" w:lastRow="0" w:firstColumn="1" w:lastColumn="0" w:noHBand="0" w:noVBand="1"/>
+      </w:tblPr>
+      <w:tblGrid>
+        <w:gridCol w:w="9628"/>
+      </w:tblGrid>
+      <w:tr>
+        <w:tc>
+          <w:tcPr>
+            <w:tcW w:w="9854" w:type="dxa"/>
+            <w:tcBorders>
+              <w:top w:val="single" w:sz="4" w:space="0" w:color="auto"/>
+              <w:left w:val="single" w:sz="4" w:space="0" w:color="auto"/>
+              <w:bottom w:val="single" w:sz="4" w:space="0" w:color="auto"/>
+              <w:right w:val="single" w:sz="4" w:space="0" w:color="auto"/>
+            </w:tcBorders>
+            <w:shd w:val="clear" w:color="auto" w:fill="D9D9D9" w:themeFill="background1" w:themeFillShade="D9"/>
+            <w:hideMark/>
+          </w:tcPr>
+          <w:p>
+            <w:pPr>
+              <w:spacing w:after="200" w:line="276" w:lineRule="auto"/>
+              <w:rPr>
+                <w:rFonts w:ascii="Arial" w:hAnsi="Arial" w:cs="Arial"/>
+              </w:rPr>
+            </w:pPr>
+            <w:r>
+              <w:rPr>
+                <w:rFonts w:ascii="Arial" w:hAnsi="Arial" w:cs="Arial"/>
+              </w:rPr>
+              <w:t>Sprint Planning</w:t>
+            </w:r>
+          </w:p>
+        </w:tc>
+      </w:tr>
+      <w:tr>
+        <w:tc>
+          <w:tcPr>
+            <w:tcW w:w="9854" w:type="dxa"/>
+            <w:tcBorders>
+              <w:top w:val="single" w:sz="4" w:space="0" w:color="auto"/>
+              <w:left w:val="single" w:sz="4" w:space="0" w:color="auto"/>
+              <w:bottom w:val="single" w:sz="4" w:space="0" w:color="auto"/>
+              <w:right w:val="single" w:sz="4" w:space="0" w:color="auto"/>
+            </w:tcBorders>
+          </w:tcPr>
+          <w:p>
+            <w:pPr>
+              <w:spacing w:after="200" w:line="276" w:lineRule="auto"/>
+              <w:rPr>
+                <w:rFonts w:ascii="Arial" w:hAnsi="Arial" w:cs="Arial"/>
+              </w:rPr>
+            </w:pPr>
+          </w:p>
+        </w:tc>
+      </w:tr>
+    </w:tbl>
+    <w:p>
+      <w:pPr>
+        <w:rPr>
+          <w:rFonts w:ascii="Arial" w:hAnsi="Arial" w:cs="Arial"/>
+        </w:rPr>
+      </w:pPr>
+    </w:p>
+    <w:tbl>
+      <w:tblPr>
+        <w:tblStyle w:val="Grigliatabella"/>
+        <w:tblW w:w="0" w:type="auto"/>
+        <w:tblLook w:val="04A0" w:firstRow="1" w:lastRow="0" w:firstColumn="1" w:lastColumn="0" w:noHBand="0" w:noVBand="1"/>
+      </w:tblPr>
+      <w:tblGrid>
+        <w:gridCol w:w="9628"/>
+      </w:tblGrid>
+      <w:tr>
+        <w:tc>
+          <w:tcPr>
+            <w:tcW w:w="9854" w:type="dxa"/>
+            <w:tcBorders>
+              <w:top w:val="single" w:sz="4" w:space="0" w:color="auto"/>
+              <w:left w:val="single" w:sz="4" w:space="0" w:color="auto"/>
+              <w:bottom w:val="single" w:sz="4" w:space="0" w:color="auto"/>
+              <w:right w:val="single" w:sz="4" w:space="0" w:color="auto"/>
+            </w:tcBorders>
+            <w:shd w:val="clear" w:color="auto" w:fill="D9D9D9" w:themeFill="background1" w:themeFillShade="D9"/>
+            <w:hideMark/>
+          </w:tcPr>
+          <w:p>
+            <w:pPr>
+              <w:spacing w:after="200" w:line="276" w:lineRule="auto"/>
+              <w:rPr>
+                <w:rFonts w:ascii="Arial" w:hAnsi="Arial" w:cs="Arial"/>
+              </w:rPr>
+            </w:pPr>
+            <w:r>
+              <w:rPr>
+                <w:rFonts w:ascii="Arial" w:hAnsi="Arial" w:cs="Arial"/>
+              </w:rPr>
+              <w:t>Sprint Review</w:t>
+            </w:r>
+          </w:p>
+        </w:tc>
+      </w:tr>
+      <w:tr>
+        <w:tc>
+          <w:tcPr>
+            <w:tcW w:w="9854" w:type="dxa"/>
+            <w:tcBorders>
+              <w:top w:val="single" w:sz="4" w:space="0" w:color="auto"/>
+              <w:left w:val="single" w:sz="4" w:space="0" w:color="auto"/>
+              <w:bottom w:val="single" w:sz="4" w:space="0" w:color="auto"/>
+              <w:right w:val="single" w:sz="4" w:space="0" w:color="auto"/>
+            </w:tcBorders>
+          </w:tcPr>
+          <w:p>
+            <w:pPr>
+              <w:spacing w:after="200" w:line="276" w:lineRule="auto"/>
+              <w:rPr>
+                <w:rFonts w:ascii="Arial" w:hAnsi="Arial" w:cs="Arial"/>
+              </w:rPr>
+            </w:pPr>
+          </w:p>
+        </w:tc>
+      </w:tr>
+    </w:tbl>
+    <w:p>
+      <w:pPr>
+        <w:rPr>
+          <w:rFonts w:ascii="Arial" w:hAnsi="Arial" w:cs="Arial"/>
+        </w:rPr>
+      </w:pPr>
+    </w:p>
+    <w:tbl>
+      <w:tblPr>
+        <w:tblStyle w:val="Grigliatabella"/>
+        <w:tblW w:w="0" w:type="auto"/>
+        <w:tblLook w:val="04A0" w:firstRow="1" w:lastRow="0" w:firstColumn="1" w:lastColumn="0" w:noHBand="0" w:noVBand="1"/>
+      </w:tblPr>
+      <w:tblGrid>
+        <w:gridCol w:w="9628"/>
+      </w:tblGrid>
+      <w:tr>
+        <w:tc>
+          <w:tcPr>
+            <w:tcW w:w="9854" w:type="dxa"/>
+            <w:tcBorders>
+              <w:top w:val="single" w:sz="4" w:space="0" w:color="auto"/>
+              <w:left w:val="single" w:sz="4" w:space="0" w:color="auto"/>
+              <w:bottom w:val="single" w:sz="4" w:space="0" w:color="auto"/>
+              <w:right w:val="single" w:sz="4" w:space="0" w:color="auto"/>
+            </w:tcBorders>
+            <w:shd w:val="clear" w:color="auto" w:fill="D9D9D9" w:themeFill="background1" w:themeFillShade="D9"/>
+            <w:hideMark/>
+          </w:tcPr>
+          <w:p>
+            <w:pPr>
+              <w:spacing w:after="200" w:line="276" w:lineRule="auto"/>
+              <w:rPr>
+                <w:rFonts w:ascii="Arial" w:hAnsi="Arial" w:cs="Arial"/>
+              </w:rPr>
+            </w:pPr>
+            <w:r>
+              <w:rPr>
+                <w:rFonts w:ascii="Arial" w:hAnsi="Arial" w:cs="Arial"/>
+              </w:rPr>
+              <w:t>Sprint Retrospective</w:t>
+            </w:r>
+          </w:p>
+        </w:tc>
+      </w:tr>
+      <w:tr>
+        <w:tc>
+          <w:tcPr>
+            <w:tcW w:w="9854" w:type="dxa"/>
+            <w:tcBorders>
+              <w:top w:val="single" w:sz="4" w:space="0" w:color="auto"/>
+              <w:left w:val="single" w:sz="4" w:space="0" w:color="auto"/>
+              <w:bottom w:val="single" w:sz="4" w:space="0" w:color="auto"/>
+              <w:right w:val="single" w:sz="4" w:space="0" w:color="auto"/>
+            </w:tcBorders>
+          </w:tcPr>
+          <w:p>
+            <w:pPr>
+              <w:spacing w:after="200" w:line="276" w:lineRule="auto"/>
+              <w:rPr>
+                <w:rFonts w:ascii="Arial" w:hAnsi="Arial" w:cs="Arial"/>
+              </w:rPr>
+            </w:pPr>
+          </w:p>
+        </w:tc>
+      </w:tr>
+    </w:tbl>
+    <w:p>
+      <w:pPr>
+        <w:rPr>
+          <w:rFonts w:ascii="Arial" w:hAnsi="Arial" w:cs="Arial"/>
+        </w:rPr>
+      </w:pPr>
+    </w:p>
+    <w:p>
+      <w:pPr>
+        <w:rPr>
+          <w:rFonts w:ascii="Arial" w:hAnsi="Arial" w:cs="Arial"/>
+        </w:rPr>
+      </w:pPr>
+      <w:r>
+        <w:rPr>
+          <w:rFonts w:ascii="Arial" w:hAnsi="Arial" w:cs="Arial"/>
+        </w:rPr>
+        <w:br w:type="page"/>
+      </w:r>
+    </w:p>
+    <w:p>
+      <w:pPr>
+        <w:pStyle w:val="Titolo2"/>
+        <w:pBdr>
+          <w:bottom w:val="single" w:sz="4" w:space="1" w:color="auto"/>
+        </w:pBdr>
+      </w:pPr>
+      <w:r>
+        <w:lastRenderedPageBreak/>
+        <w:t>Utilizzo Intelligenza Artificiale</w:t>
+      </w:r>
+      <w:r>
+        <w:t xml:space="preserve"> nella giornata</w:t>
+      </w:r>
+    </w:p>
+    <w:p>
+      <w:pPr>
+        <w:pStyle w:val="Nessunaspaziatura"/>
+        <w:rPr>
+          <w:rFonts w:ascii="Arial" w:hAnsi="Arial" w:cs="Arial"/>
+          <w:b/>
+          <w:bCs/>
+        </w:rPr>
+      </w:pPr>
+    </w:p>
+    <w:p>
+      <w:pPr>
+        <w:pStyle w:val="Nessunaspaziatura"/>
+        <w:rPr>
+          <w:rFonts w:ascii="Arial" w:hAnsi="Arial" w:cs="Arial"/>
+        </w:rPr>
+      </w:pPr>
+      <w:sdt>
+        <w:sdtPr>
+          <w:rPr>
+            <w:rFonts w:ascii="Segoe UI Symbol" w:hAnsi="Segoe UI Symbol" w:cs="Segoe UI Symbol"/>
+          </w:rPr>
+          <w:id w:val="1643999748"/>
+          <w14:checkbox>
+            <w14:checked w14:val="1"/>
+            <w14:checkedState w14:val="2612" w14:font="MS Gothic"/>
+            <w14:uncheckedState w14:val="2610" w14:font="MS Gothic"/>
+          </w14:checkbox>
+        </w:sdtPr>
+        <w:sdtContent>
+          <w:r>
+            <w:rPr>
+              <w:rFonts w:ascii="MS Gothic" w:eastAsia="MS Gothic" w:hAnsi="MS Gothic" w:cs="Segoe UI Symbol" w:hint="eastAsia"/>
+            </w:rPr>
+            <w:t>☒</w:t>
+          </w:r>
+        </w:sdtContent>
+      </w:sdt>
+      <w:r>
+        <w:rPr>
+          <w:rFonts w:ascii="Arial" w:hAnsi="Arial" w:cs="Arial"/>
+        </w:rPr>
+        <w:t xml:space="preserve"> Nessuno</w:t>
+      </w:r>
+      <w:r>
+        <w:br/>
+      </w:r>
+      <w:sdt>
+        <w:sdtPr>
+          <w:rPr>
+            <w:rFonts w:ascii="Segoe UI Symbol" w:hAnsi="Segoe UI Symbol" w:cs="Segoe UI Symbol"/>
+          </w:rPr>
+          <w:id w:val="1411574166"/>
+          <w14:checkbox>
+            <w14:checked w14:val="0"/>
+            <w14:checkedState w14:val="2612" w14:font="MS Gothic"/>
+            <w14:uncheckedState w14:val="2610" w14:font="MS Gothic"/>
+          </w14:checkbox>
+        </w:sdtPr>
+        <w:sdtContent>
+          <w:r>
+            <w:rPr>
+              <w:rFonts w:ascii="MS Gothic" w:eastAsia="MS Gothic" w:hAnsi="MS Gothic" w:cs="Segoe UI Symbol" w:hint="eastAsia"/>
+            </w:rPr>
+            <w:t>☐</w:t>
+          </w:r>
+        </w:sdtContent>
+      </w:sdt>
+      <w:r>
+        <w:rPr>
+          <w:rFonts w:ascii="Arial" w:hAnsi="Arial" w:cs="Arial"/>
+        </w:rPr>
+        <w:t xml:space="preserve"> Occasionale</w:t>
+      </w:r>
+      <w:r>
+        <w:br/>
+      </w:r>
+      <w:sdt>
+        <w:sdtPr>
+          <w:rPr>
+            <w:rFonts w:ascii="Segoe UI Symbol" w:hAnsi="Segoe UI Symbol" w:cs="Segoe UI Symbol"/>
+          </w:rPr>
+          <w:id w:val="2087801612"/>
+          <w14:checkbox>
+            <w14:checked w14:val="0"/>
+            <w14:checkedState w14:val="2612" w14:font="MS Gothic"/>
+            <w14:uncheckedState w14:val="2610" w14:font="MS Gothic"/>
+          </w14:checkbox>
+        </w:sdtPr>
+        <w:sdtContent>
+          <w:r>
+            <w:rPr>
+              <w:rFonts w:ascii="MS Gothic" w:eastAsia="MS Gothic" w:hAnsi="MS Gothic" w:cs="Segoe UI Symbol" w:hint="eastAsia"/>
+            </w:rPr>
+            <w:t>☐</w:t>
+          </w:r>
+        </w:sdtContent>
+      </w:sdt>
+      <w:r>
+        <w:rPr>
+          <w:rFonts w:ascii="Arial" w:hAnsi="Arial" w:cs="Arial"/>
+        </w:rPr>
+        <w:t xml:space="preserve"> Frequente</w:t>
+      </w:r>
+    </w:p>
+    <w:p>
+      <w:pPr>
+        <w:pStyle w:val="Nessunaspaziatura"/>
+        <w:rPr>
+          <w:rFonts w:ascii="Arial" w:hAnsi="Arial" w:cs="Arial"/>
+        </w:rPr>
+      </w:pPr>
+    </w:p>
+    <w:p>
+      <w:pPr>
+        <w:pStyle w:val="Nessunaspaziatura"/>
+        <w:spacing w:line="276" w:lineRule="auto"/>
+        <w:rPr>
+          <w:rFonts w:ascii="Arial" w:hAnsi="Arial" w:cs="Arial"/>
+        </w:rPr>
+      </w:pPr>
+      <w:r>
+        <w:rPr>
+          <w:rFonts w:ascii="Arial" w:hAnsi="Arial" w:cs="Arial"/>
+          <w:b/>
+          <w:bCs/>
+        </w:rPr>
+        <w:t>Strumento/i utilizzato/i</w:t>
+      </w:r>
+      <w:r>
+        <w:rPr>
+          <w:rFonts w:ascii="Arial" w:hAnsi="Arial" w:cs="Arial"/>
+          <w:b/>
+          <w:bCs/>
+        </w:rPr>
+        <w:t xml:space="preserve"> </w:t>
+      </w:r>
+      <w:r>
+        <w:rPr>
+          <w:rFonts w:ascii="Arial" w:hAnsi="Arial" w:cs="Arial"/>
+        </w:rPr>
+        <w:t>(es. ChatGPT)</w:t>
+      </w:r>
+      <w:r>
+        <w:rPr>
+          <w:rFonts w:ascii="Arial" w:hAnsi="Arial" w:cs="Arial"/>
+        </w:rPr>
+        <w:t xml:space="preserve">: </w:t>
+      </w:r>
+      <w:sdt>
+        <w:sdtPr>
+          <w:rPr>
+            <w:rFonts w:ascii="Arial" w:hAnsi="Arial" w:cs="Arial"/>
+          </w:rPr>
+          <w:id w:val="1131903266"/>
+          <w:placeholder>
+            <w:docPart w:val="764F1DB10DAF4182B82C72D4E1234D4F"/>
+          </w:placeholder>
+        </w:sdtPr>
+        <w:sdtContent/>
+      </w:sdt>
+    </w:p>
+    <w:p>
+      <w:pPr>
+        <w:pStyle w:val="Nessunaspaziatura"/>
+        <w:rPr>
+          <w:rFonts w:ascii="Arial" w:hAnsi="Arial" w:cs="Arial"/>
+        </w:rPr>
+      </w:pPr>
+    </w:p>
+    <w:p>
+      <w:pPr>
+        <w:pStyle w:val="Nessunaspaziatura"/>
+        <w:rPr>
+          <w:rFonts w:ascii="Arial" w:hAnsi="Arial" w:cs="Arial"/>
+        </w:rPr>
+      </w:pPr>
+      <w:r>
+        <w:rPr>
+          <w:rFonts w:ascii="Arial" w:hAnsi="Arial" w:cs="Arial"/>
+          <w:b/>
+          <w:bCs/>
+        </w:rPr>
+        <w:t>Per cosa l’ho usata oggi</w:t>
+      </w:r>
+      <w:r>
+        <w:br/>
+      </w:r>
+      <w:sdt>
+        <w:sdtPr>
+          <w:rPr>
+            <w:rFonts w:ascii="Segoe UI Symbol" w:hAnsi="Segoe UI Symbol" w:cs="Segoe UI Symbol"/>
+          </w:rPr>
+          <w:id w:val="1452829311"/>
+          <w14:checkbox>
+            <w14:checked w14:val="0"/>
+            <w14:checkedState w14:val="2612" w14:font="MS Gothic"/>
+            <w14:uncheckedState w14:val="2610" w14:font="MS Gothic"/>
+          </w14:checkbox>
+        </w:sdtPr>
+        <w:sdtContent>
+          <w:r>
+            <w:rPr>
+              <w:rFonts w:ascii="MS Gothic" w:eastAsia="MS Gothic" w:hAnsi="MS Gothic" w:cs="Segoe UI Symbol" w:hint="eastAsia"/>
+            </w:rPr>
+            <w:t>☐</w:t>
+          </w:r>
+        </w:sdtContent>
+      </w:sdt>
+      <w:r>
+        <w:rPr>
+          <w:rFonts w:ascii="Arial" w:hAnsi="Arial" w:cs="Arial"/>
+        </w:rPr>
+        <w:t xml:space="preserve"> Chiarire concetti</w:t>
+      </w:r>
+      <w:r>
+        <w:br/>
+      </w:r>
+      <w:sdt>
+        <w:sdtPr>
+          <w:rPr>
+            <w:rFonts w:ascii="Segoe UI Symbol" w:hAnsi="Segoe UI Symbol" w:cs="Segoe UI Symbol"/>
+          </w:rPr>
+          <w:id w:val="-763303326"/>
+          <w14:checkbox>
+            <w14:checked w14:val="0"/>
+            <w14:checkedState w14:val="2612" w14:font="MS Gothic"/>
+            <w14:uncheckedState w14:val="2610" w14:font="MS Gothic"/>
+          </w14:checkbox>
+        </w:sdtPr>
+        <w:sdtContent>
+          <w:r>
+            <w:rPr>
+              <w:rFonts w:ascii="MS Gothic" w:eastAsia="MS Gothic" w:hAnsi="MS Gothic" w:cs="Segoe UI Symbol"/>
+            </w:rPr>
+            <w:t>☐</w:t>
+          </w:r>
+        </w:sdtContent>
+      </w:sdt>
+      <w:r>
+        <w:rPr>
+          <w:rFonts w:ascii="Arial" w:hAnsi="Arial" w:cs="Arial"/>
+        </w:rPr>
+        <w:t xml:space="preserve"> Supporto al codice</w:t>
+      </w:r>
+      <w:r>
+        <w:br/>
+      </w:r>
+      <w:sdt>
+        <w:sdtPr>
+          <w:rPr>
+            <w:rFonts w:ascii="Segoe UI Symbol" w:hAnsi="Segoe UI Symbol" w:cs="Segoe UI Symbol"/>
+          </w:rPr>
+          <w:id w:val="723654169"/>
+          <w14:checkbox>
+            <w14:checked w14:val="0"/>
+            <w14:checkedState w14:val="2612" w14:font="MS Gothic"/>
+            <w14:uncheckedState w14:val="2610" w14:font="MS Gothic"/>
+          </w14:checkbox>
+        </w:sdtPr>
+        <w:sdtContent>
+          <w:r>
+            <w:rPr>
+              <w:rFonts w:ascii="MS Gothic" w:eastAsia="MS Gothic" w:hAnsi="MS Gothic" w:cs="Segoe UI Symbol" w:hint="eastAsia"/>
+            </w:rPr>
+            <w:t>☐</w:t>
+          </w:r>
+        </w:sdtContent>
+      </w:sdt>
+      <w:r>
+        <w:rPr>
+          <w:rFonts w:ascii="Arial" w:hAnsi="Arial" w:cs="Arial"/>
+        </w:rPr>
+        <w:t xml:space="preserve"> Debug</w:t>
+      </w:r>
+      <w:r>
+        <w:br/>
+      </w:r>
+      <w:sdt>
+        <w:sdtPr>
+          <w:rPr>
+            <w:rFonts w:ascii="Segoe UI Symbol" w:hAnsi="Segoe UI Symbol" w:cs="Segoe UI Symbol"/>
+          </w:rPr>
+          <w:id w:val="438801180"/>
+          <w14:checkbox>
+            <w14:checked w14:val="0"/>
+            <w14:checkedState w14:val="2612" w14:font="MS Gothic"/>
+            <w14:uncheckedState w14:val="2610" w14:font="MS Gothic"/>
+          </w14:checkbox>
+        </w:sdtPr>
+        <w:sdtContent>
+          <w:r>
+            <w:rPr>
+              <w:rFonts w:ascii="MS Gothic" w:eastAsia="MS Gothic" w:hAnsi="MS Gothic" w:cs="Segoe UI Symbol" w:hint="eastAsia"/>
+            </w:rPr>
+            <w:t>☐</w:t>
+          </w:r>
+        </w:sdtContent>
+      </w:sdt>
+      <w:r>
+        <w:rPr>
+          <w:rFonts w:ascii="Arial" w:hAnsi="Arial" w:cs="Arial"/>
+        </w:rPr>
+        <w:t xml:space="preserve"> Riorganizzare idee / testi</w:t>
+      </w:r>
+      <w:r>
+        <w:br/>
+      </w:r>
+      <w:sdt>
+        <w:sdtPr>
+          <w:rPr>
+            <w:rFonts w:ascii="Segoe UI Symbol" w:hAnsi="Segoe UI Symbol" w:cs="Segoe UI Symbol"/>
+          </w:rPr>
+          <w:id w:val="-110368791"/>
+          <w14:checkbox>
+            <w14:checked w14:val="0"/>
+            <w14:checkedState w14:val="2612" w14:font="MS Gothic"/>
+            <w14:uncheckedState w14:val="2610" w14:font="MS Gothic"/>
+          </w14:checkbox>
+        </w:sdtPr>
+        <w:sdtContent>
+          <w:r>
+            <w:rPr>
+              <w:rFonts w:ascii="MS Gothic" w:eastAsia="MS Gothic" w:hAnsi="MS Gothic" w:cs="Segoe UI Symbol" w:hint="eastAsia"/>
+            </w:rPr>
+            <w:t>☐</w:t>
+          </w:r>
+        </w:sdtContent>
+      </w:sdt>
+      <w:r>
+        <w:rPr>
+          <w:rFonts w:ascii="Arial" w:hAnsi="Arial" w:cs="Arial"/>
+        </w:rPr>
+        <w:t xml:space="preserve"> Altro: …</w:t>
+      </w:r>
+    </w:p>
+    <w:p>
+      <w:pPr>
+        <w:pStyle w:val="Nessunaspaziatura"/>
+        <w:rPr>
+          <w:rFonts w:ascii="Arial" w:hAnsi="Arial" w:cs="Arial"/>
+        </w:rPr>
+      </w:pPr>
+    </w:p>
+    <w:p>
+      <w:pPr>
+        <w:pStyle w:val="Nessunaspaziatura"/>
+        <w:rPr>
+          <w:rFonts w:ascii="Arial" w:hAnsi="Arial" w:cs="Arial"/>
+          <w:b/>
+          <w:bCs/>
+        </w:rPr>
+      </w:pPr>
+      <w:r>
+        <w:rPr>
+          <w:rFonts w:ascii="Arial" w:hAnsi="Arial" w:cs="Arial"/>
+          <w:b/>
+          <w:bCs/>
+        </w:rPr>
+        <w:t>Esempio significativo di utilizzo (UNO SOLO)</w:t>
+      </w:r>
+    </w:p>
+    <w:p>
+      <w:pPr>
+        <w:pStyle w:val="Nessunaspaziatura"/>
+        <w:rPr>
+          <w:rFonts w:ascii="Arial" w:hAnsi="Arial" w:cs="Arial"/>
+        </w:rPr>
+      </w:pPr>
+      <w:r>
+        <w:rPr>
+          <w:rFonts w:ascii="Arial" w:hAnsi="Arial" w:cs="Arial"/>
+        </w:rPr>
+        <w:t xml:space="preserve">Riporta </w:t>
+      </w:r>
+      <w:r>
+        <w:rPr>
+          <w:rFonts w:ascii="Arial" w:hAnsi="Arial" w:cs="Arial"/>
+          <w:i/>
+          <w:iCs/>
+        </w:rPr>
+        <w:t>un</w:t>
+      </w:r>
+      <w:r>
+        <w:rPr>
+          <w:rFonts w:ascii="Arial" w:hAnsi="Arial" w:cs="Arial"/>
+        </w:rPr>
+        <w:t xml:space="preserve"> prompt rilevante oppure descrivilo a parole se ce ne sono stati molti.</w:t>
+      </w:r>
+    </w:p>
+    <w:p>
+      <w:pPr>
+        <w:pStyle w:val="Nessunaspaziatura"/>
+        <w:rPr>
+          <w:rFonts w:ascii="Arial" w:hAnsi="Arial" w:cs="Arial"/>
+        </w:rPr>
+      </w:pPr>
+    </w:p>
+    <w:sdt>
+      <w:sdtPr>
+        <w:rPr>
+          <w:rFonts w:ascii="Arial" w:hAnsi="Arial" w:cs="Arial"/>
+        </w:rPr>
+        <w:alias w:val="Prompt AI"/>
+        <w:tag w:val="Prompt AI"/>
+        <w:id w:val="1404027652"/>
+        <w:placeholder>
+          <w:docPart w:val="68DBC01E9EDC4391BE6A79D004B07D0F"/>
+        </w:placeholder>
+        <w15:color w:val="C0C0C0"/>
+      </w:sdtPr>
+      <w:sdtContent>
+        <w:p>
+          <w:pPr>
+            <w:pStyle w:val="Nessunaspaziatura"/>
+            <w:spacing w:line="276" w:lineRule="auto"/>
+          </w:pPr>
+        </w:p>
+        <w:p>
+          <w:pPr>
+            <w:pStyle w:val="Nessunaspaziatura"/>
+            <w:spacing w:line="276" w:lineRule="auto"/>
+            <w:rPr>
+              <w:rFonts w:ascii="Arial" w:hAnsi="Arial" w:cs="Arial"/>
+            </w:rPr>
+          </w:pPr>
+        </w:p>
+      </w:sdtContent>
+    </w:sdt>
+    <w:p>
+      <w:pPr>
+        <w:pStyle w:val="Nessunaspaziatura"/>
+        <w:rPr>
+          <w:rFonts w:ascii="Arial" w:hAnsi="Arial" w:cs="Arial"/>
+        </w:rPr>
+      </w:pPr>
+    </w:p>
+    <w:p>
+      <w:pPr>
+        <w:pStyle w:val="Nessunaspaziatura"/>
+        <w:rPr>
+          <w:rFonts w:ascii="Arial" w:hAnsi="Arial" w:cs="Arial"/>
+        </w:rPr>
+      </w:pPr>
+      <w:r>
+        <w:rPr>
+          <w:rFonts w:ascii="Arial" w:hAnsi="Arial" w:cs="Arial"/>
+          <w:b/>
+          <w:bCs/>
+        </w:rPr>
+        <w:t>Cosa mi ha dato l’AI</w:t>
+      </w:r>
+    </w:p>
+    <w:p>
+      <w:pPr>
+        <w:pStyle w:val="Nessunaspaziatura"/>
+        <w:rPr>
+          <w:rFonts w:ascii="Arial" w:hAnsi="Arial" w:cs="Arial"/>
+        </w:rPr>
+      </w:pPr>
+      <w:r>
+        <w:rPr>
+          <w:rFonts w:ascii="Arial" w:hAnsi="Arial" w:cs="Arial"/>
+        </w:rPr>
+        <w:t>Spiegazione, esempio, soluzione, suggerimento…</w:t>
+      </w:r>
+    </w:p>
+    <w:p>
+      <w:pPr>
+        <w:pStyle w:val="Nessunaspaziatura"/>
+        <w:rPr>
+          <w:rFonts w:ascii="Arial" w:hAnsi="Arial" w:cs="Arial"/>
+        </w:rPr>
+      </w:pPr>
+    </w:p>
+    <w:sdt>
+      <w:sdtPr>
+        <w:rPr>
+          <w:rFonts w:ascii="Arial" w:hAnsi="Arial" w:cs="Arial"/>
+        </w:rPr>
+        <w:alias w:val="Risposta AI"/>
+        <w:tag w:val="Risposta AI"/>
+        <w:id w:val="-663008494"/>
+        <w:placeholder>
+          <w:docPart w:val="416DA010D8784AD4B3C3FCE8857688D9"/>
+        </w:placeholder>
+        <w:showingPlcHdr/>
+        <w15:color w:val="C0C0C0"/>
+      </w:sdtPr>
+      <w:sdtContent>
+        <w:p>
+          <w:pPr>
+            <w:pStyle w:val="Nessunaspaziatura"/>
+            <w:spacing w:line="276" w:lineRule="auto"/>
+            <w:rPr>
+              <w:rFonts w:ascii="Arial" w:hAnsi="Arial" w:cs="Arial"/>
+            </w:rPr>
+          </w:pPr>
+          <w:r>
+            <w:rPr>
+              <w:rStyle w:val="Testosegnaposto"/>
+            </w:rPr>
+            <w:t xml:space="preserve">Fare clic o toccare qui per </w:t>
+          </w:r>
+          <w:r>
+            <w:rPr>
+              <w:rStyle w:val="Testosegnaposto"/>
+            </w:rPr>
+            <w:t>immettere</w:t>
+          </w:r>
+          <w:r>
+            <w:rPr>
+              <w:rStyle w:val="Testosegnaposto"/>
+            </w:rPr>
+            <w:t xml:space="preserve"> il testo.</w:t>
+          </w:r>
+        </w:p>
+      </w:sdtContent>
+    </w:sdt>
+    <w:p>
+      <w:pPr>
+        <w:pStyle w:val="Nessunaspaziatura"/>
+        <w:rPr>
+          <w:rFonts w:ascii="Arial" w:hAnsi="Arial" w:cs="Arial"/>
+          <w:b/>
+          <w:bCs/>
+        </w:rPr>
+      </w:pPr>
+    </w:p>
+    <w:p>
+      <w:pPr>
+        <w:pStyle w:val="Nessunaspaziatura"/>
+        <w:rPr>
+          <w:rFonts w:ascii="Arial" w:hAnsi="Arial" w:cs="Arial"/>
+        </w:rPr>
+      </w:pPr>
+      <w:r>
+        <w:rPr>
+          <w:rFonts w:ascii="Arial" w:hAnsi="Arial" w:cs="Arial"/>
+          <w:b/>
+          <w:bCs/>
+        </w:rPr>
+        <w:t>Come l’ho usato io</w:t>
+      </w:r>
+      <w:r>
+        <w:rPr>
+          <w:rFonts w:ascii="Arial" w:hAnsi="Arial" w:cs="Arial"/>
+        </w:rPr>
+        <w:br/>
+      </w:r>
+      <w:sdt>
+        <w:sdtPr>
+          <w:rPr>
+            <w:rFonts w:ascii="Segoe UI Symbol" w:hAnsi="Segoe UI Symbol" w:cs="Segoe UI Symbol"/>
+          </w:rPr>
+          <w:id w:val="952832575"/>
+          <w14:checkbox>
+            <w14:checked w14:val="0"/>
+            <w14:checkedState w14:val="2612" w14:font="MS Gothic"/>
+            <w14:uncheckedState w14:val="2610" w14:font="MS Gothic"/>
+          </w14:checkbox>
+        </w:sdtPr>
+        <w:sdtContent>
+          <w:r>
+            <w:rPr>
+              <w:rFonts w:ascii="MS Gothic" w:eastAsia="MS Gothic" w:hAnsi="MS Gothic" w:cs="Segoe UI Symbol" w:hint="eastAsia"/>
+            </w:rPr>
+            <w:t>☐</w:t>
+          </w:r>
+        </w:sdtContent>
+      </w:sdt>
+      <w:r>
+        <w:rPr>
+          <w:rFonts w:ascii="Arial" w:hAnsi="Arial" w:cs="Arial"/>
+        </w:rPr>
+        <w:t xml:space="preserve"> Copiato</w:t>
+      </w:r>
+      <w:r>
+        <w:rPr>
+          <w:rFonts w:ascii="Arial" w:hAnsi="Arial" w:cs="Arial"/>
+        </w:rPr>
+        <w:br/>
+      </w:r>
+      <w:sdt>
+        <w:sdtPr>
+          <w:rPr>
+            <w:rFonts w:ascii="Segoe UI Symbol" w:hAnsi="Segoe UI Symbol" w:cs="Segoe UI Symbol"/>
+          </w:rPr>
+          <w:id w:val="1325479953"/>
+          <w14:checkbox>
+            <w14:checked w14:val="0"/>
+            <w14:checkedState w14:val="2612" w14:font="MS Gothic"/>
+            <w14:uncheckedState w14:val="2610" w14:font="MS Gothic"/>
+          </w14:checkbox>
+        </w:sdtPr>
+        <w:sdtContent>
+          <w:r>
+            <w:rPr>
+              <w:rFonts w:ascii="MS Gothic" w:eastAsia="MS Gothic" w:hAnsi="MS Gothic" w:cs="Segoe UI Symbol" w:hint="eastAsia"/>
+            </w:rPr>
+            <w:t>☐</w:t>
+          </w:r>
+        </w:sdtContent>
+      </w:sdt>
+      <w:r>
+        <w:rPr>
+          <w:rFonts w:ascii="Arial" w:hAnsi="Arial" w:cs="Arial"/>
+        </w:rPr>
+        <w:t xml:space="preserve"> Adattato</w:t>
+      </w:r>
+      <w:r>
+        <w:rPr>
+          <w:rFonts w:ascii="Arial" w:hAnsi="Arial" w:cs="Arial"/>
+        </w:rPr>
+        <w:br/>
+      </w:r>
+      <w:sdt>
+        <w:sdtPr>
+          <w:rPr>
+            <w:rFonts w:ascii="Segoe UI Symbol" w:hAnsi="Segoe UI Symbol" w:cs="Segoe UI Symbol"/>
+          </w:rPr>
+          <w:id w:val="988522056"/>
+          <w14:checkbox>
+            <w14:checked w14:val="0"/>
+            <w14:checkedState w14:val="2612" w14:font="MS Gothic"/>
+            <w14:uncheckedState w14:val="2610" w14:font="MS Gothic"/>
+          </w14:checkbox>
+        </w:sdtPr>
+        <w:sdtContent>
+          <w:r>
+            <w:rPr>
+              <w:rFonts w:ascii="MS Gothic" w:eastAsia="MS Gothic" w:hAnsi="MS Gothic" w:cs="Segoe UI Symbol" w:hint="eastAsia"/>
+            </w:rPr>
+            <w:t>☐</w:t>
+          </w:r>
+        </w:sdtContent>
+      </w:sdt>
+      <w:r>
+        <w:rPr>
+          <w:rFonts w:ascii="Arial" w:hAnsi="Arial" w:cs="Arial"/>
+        </w:rPr>
+        <w:t xml:space="preserve"> Usato solo per capire</w:t>
+      </w:r>
+      <w:r>
+        <w:rPr>
+          <w:rFonts w:ascii="Arial" w:hAnsi="Arial" w:cs="Arial"/>
+        </w:rPr>
+        <w:br/>
+      </w:r>
+      <w:sdt>
+        <w:sdtPr>
+          <w:rPr>
+            <w:rFonts w:ascii="Segoe UI Symbol" w:hAnsi="Segoe UI Symbol" w:cs="Segoe UI Symbol"/>
+          </w:rPr>
+          <w:id w:val="-1976355135"/>
+          <w14:checkbox>
+            <w14:checked w14:val="0"/>
+            <w14:checkedState w14:val="2612" w14:font="MS Gothic"/>
+            <w14:uncheckedState w14:val="2610" w14:font="MS Gothic"/>
+          </w14:checkbox>
+        </w:sdtPr>
+        <w:sdtContent>
+          <w:r>
+            <w:rPr>
+              <w:rFonts w:ascii="MS Gothic" w:eastAsia="MS Gothic" w:hAnsi="MS Gothic" w:cs="Segoe UI Symbol" w:hint="eastAsia"/>
+            </w:rPr>
+            <w:t>☐</w:t>
+          </w:r>
+        </w:sdtContent>
+      </w:sdt>
+      <w:r>
+        <w:rPr>
+          <w:rFonts w:ascii="Arial" w:hAnsi="Arial" w:cs="Arial"/>
+        </w:rPr>
+        <w:t xml:space="preserve"> Scartato</w:t>
+      </w:r>
+    </w:p>
+    <w:p>
+      <w:pPr>
+        <w:pStyle w:val="Nessunaspaziatura"/>
+        <w:rPr>
+          <w:rFonts w:ascii="Arial" w:hAnsi="Arial" w:cs="Arial"/>
+        </w:rPr>
+      </w:pPr>
+    </w:p>
+    <w:p>
+      <w:pPr>
+        <w:pStyle w:val="Nessunaspaziatura"/>
+        <w:rPr>
+          <w:rFonts w:ascii="Arial" w:hAnsi="Arial" w:cs="Arial"/>
+        </w:rPr>
+      </w:pPr>
+    </w:p>
+    <w:p>
+      <w:pPr>
+        <w:pStyle w:val="Nessunaspaziatura"/>
+        <w:rPr>
+          <w:rFonts w:ascii="Arial" w:hAnsi="Arial" w:cs="Arial"/>
+        </w:rPr>
+      </w:pPr>
+      <w:r>
+        <w:rPr>
+          <w:rFonts w:ascii="Arial" w:hAnsi="Arial" w:cs="Arial"/>
+          <w:b/>
+          <w:bCs/>
+        </w:rPr>
+        <w:t>Cosa avrei fatto senza AI?</w:t>
+      </w:r>
+    </w:p>
+    <w:p>
+      <w:pPr>
+        <w:pStyle w:val="Nessunaspaziatura"/>
+        <w:rPr>
+          <w:rFonts w:ascii="Arial" w:hAnsi="Arial" w:cs="Arial"/>
+        </w:rPr>
+      </w:pPr>
+    </w:p>
+    <w:p>
+      <w:pPr>
+        <w:pStyle w:val="Nessunaspaziatura"/>
+        <w:spacing w:line="276" w:lineRule="auto"/>
+        <w:rPr>
+          <w:rFonts w:ascii="Arial" w:hAnsi="Arial" w:cs="Arial"/>
+        </w:rPr>
+      </w:pPr>
     </w:p>
     <w:sectPr>
       <w:headerReference w:type="default" r:id="rId8"/>
@@ -10659,6 +12137,27 @@
     <w:qFormat/>
     <w:rsid w:val="00632B06"/>
   </w:style>
+  <w:style w:type="paragraph" w:styleId="Titolo1">
+    <w:name w:val="heading 1"/>
+    <w:basedOn w:val="Normale"/>
+    <w:next w:val="Normale"/>
+    <w:link w:val="Titolo1Carattere"/>
+    <w:uiPriority w:val="9"/>
+    <w:qFormat/>
+    <w:rsid w:val="00AB3ABA"/>
+    <w:pPr>
+      <w:keepNext/>
+      <w:keepLines/>
+      <w:spacing w:before="240" w:after="0"/>
+      <w:outlineLvl w:val="0"/>
+    </w:pPr>
+    <w:rPr>
+      <w:rFonts w:asciiTheme="majorHAnsi" w:eastAsiaTheme="majorEastAsia" w:hAnsiTheme="majorHAnsi" w:cstheme="majorBidi"/>
+      <w:color w:val="365F91" w:themeColor="accent1" w:themeShade="BF"/>
+      <w:sz w:val="32"/>
+      <w:szCs w:val="32"/>
+    </w:rPr>
+  </w:style>
   <w:style w:type="paragraph" w:styleId="Titolo2">
     <w:name w:val="heading 2"/>
     <w:basedOn w:val="Normale"/>
@@ -11185,6 +12684,19 @@
       <w:color w:val="666666"/>
     </w:rPr>
   </w:style>
+  <w:style w:type="character" w:customStyle="1" w:styleId="Titolo1Carattere">
+    <w:name w:val="Titolo 1 Carattere"/>
+    <w:basedOn w:val="Carpredefinitoparagrafo"/>
+    <w:link w:val="Titolo1"/>
+    <w:uiPriority w:val="9"/>
+    <w:rsid w:val="00AB3ABA"/>
+    <w:rPr>
+      <w:rFonts w:asciiTheme="majorHAnsi" w:eastAsiaTheme="majorEastAsia" w:hAnsiTheme="majorHAnsi" w:cstheme="majorBidi"/>
+      <w:color w:val="365F91" w:themeColor="accent1" w:themeShade="BF"/>
+      <w:sz w:val="32"/>
+      <w:szCs w:val="32"/>
+    </w:rPr>
+  </w:style>
 </w:styles>
 </file>
 
@@ -11775,6 +13287,107 @@
         <w:p>
           <w:pPr>
             <w:pStyle w:val="158810A0B37A4D9F892C9EF70BFD9821"/>
+          </w:pPr>
+          <w:r>
+            <w:rPr>
+              <w:rStyle w:val="Testosegnaposto"/>
+            </w:rPr>
+            <w:t xml:space="preserve">Fare clic o toccare qui per </w:t>
+          </w:r>
+          <w:r>
+            <w:rPr>
+              <w:rStyle w:val="Testosegnaposto"/>
+            </w:rPr>
+            <w:t>immettere</w:t>
+          </w:r>
+          <w:r>
+            <w:rPr>
+              <w:rStyle w:val="Testosegnaposto"/>
+            </w:rPr>
+            <w:t xml:space="preserve"> il testo.</w:t>
+          </w:r>
+        </w:p>
+      </w:docPartBody>
+    </w:docPart>
+    <w:docPart>
+      <w:docPartPr>
+        <w:name w:val="764F1DB10DAF4182B82C72D4E1234D4F"/>
+        <w:category>
+          <w:name w:val="Generale"/>
+          <w:gallery w:val="placeholder"/>
+        </w:category>
+        <w:types>
+          <w:type w:val="bbPlcHdr"/>
+        </w:types>
+        <w:behaviors>
+          <w:behavior w:val="content"/>
+        </w:behaviors>
+        <w:guid w:val="{C5BABD7A-11AA-4CCC-B938-D740CFA9802C}"/>
+      </w:docPartPr>
+      <w:docPartBody>
+        <w:p>
+          <w:pPr>
+            <w:pStyle w:val="764F1DB10DAF4182B82C72D4E1234D4F"/>
+          </w:pPr>
+          <w:r>
+            <w:rPr>
+              <w:rStyle w:val="Testosegnaposto"/>
+              <w:b/>
+              <w:bCs/>
+            </w:rPr>
+            <w:t>Nomi AI utilizzati</w:t>
+          </w:r>
+        </w:p>
+      </w:docPartBody>
+    </w:docPart>
+    <w:docPart>
+      <w:docPartPr>
+        <w:name w:val="68DBC01E9EDC4391BE6A79D004B07D0F"/>
+        <w:category>
+          <w:name w:val="Generale"/>
+          <w:gallery w:val="placeholder"/>
+        </w:category>
+        <w:types>
+          <w:type w:val="bbPlcHdr"/>
+        </w:types>
+        <w:behaviors>
+          <w:behavior w:val="content"/>
+        </w:behaviors>
+        <w:guid w:val="{A285FFC7-03AE-4FAE-A388-968A04B33A5B}"/>
+      </w:docPartPr>
+      <w:docPartBody>
+        <w:p>
+          <w:pPr>
+            <w:pStyle w:val="68DBC01E9EDC4391BE6A79D004B07D0F"/>
+          </w:pPr>
+          <w:r>
+            <w:rPr>
+              <w:rStyle w:val="Testosegnaposto"/>
+            </w:rPr>
+            <w:t>Fare clic o toccare qui per immettere il testo.</w:t>
+          </w:r>
+        </w:p>
+      </w:docPartBody>
+    </w:docPart>
+    <w:docPart>
+      <w:docPartPr>
+        <w:name w:val="416DA010D8784AD4B3C3FCE8857688D9"/>
+        <w:category>
+          <w:name w:val="Generale"/>
+          <w:gallery w:val="placeholder"/>
+        </w:category>
+        <w:types>
+          <w:type w:val="bbPlcHdr"/>
+        </w:types>
+        <w:behaviors>
+          <w:behavior w:val="content"/>
+        </w:behaviors>
+        <w:guid w:val="{96BEBDD8-40E9-4906-BBA0-EEB4CEEF2C92}"/>
+      </w:docPartPr>
+      <w:docPartBody>
+        <w:p>
+          <w:pPr>
+            <w:pStyle w:val="416DA010D8784AD4B3C3FCE8857688D9"/>
           </w:pPr>
           <w:r>
             <w:rPr>
@@ -11845,6 +13458,13 @@
     <w:pitch w:val="variable"/>
     <w:sig w:usb0="E0002EFF" w:usb1="C000785B" w:usb2="00000009" w:usb3="00000000" w:csb0="000001FF" w:csb1="00000000"/>
   </w:font>
+  <w:font w:name="Cambria">
+    <w:panose1 w:val="02040503050406030204"/>
+    <w:charset w:val="00"/>
+    <w:family w:val="roman"/>
+    <w:pitch w:val="variable"/>
+    <w:sig w:usb0="E00006FF" w:usb1="420024FF" w:usb2="02000000" w:usb3="00000000" w:csb0="0000019F" w:csb1="00000000"/>
+  </w:font>
   <w:font w:name="MS Gothic">
     <w:altName w:val="ＭＳ ゴシック"/>
     <w:panose1 w:val="020B0609070205080204"/>
@@ -11852,13 +13472,6 @@
     <w:family w:val="modern"/>
     <w:pitch w:val="fixed"/>
     <w:sig w:usb0="E00002FF" w:usb1="6AC7FDFB" w:usb2="08000012" w:usb3="00000000" w:csb0="0002009F" w:csb1="00000000"/>
-  </w:font>
-  <w:font w:name="Cambria">
-    <w:panose1 w:val="02040503050406030204"/>
-    <w:charset w:val="00"/>
-    <w:family w:val="roman"/>
-    <w:pitch w:val="variable"/>
-    <w:sig w:usb0="E00006FF" w:usb1="420024FF" w:usb2="02000000" w:usb3="00000000" w:csb0="0000019F" w:csb1="00000000"/>
   </w:font>
   <w:font w:name="Tahoma">
     <w:panose1 w:val="020B0604030504040204"/>
@@ -11927,6 +13540,7 @@
   </w:compat>
   <w:rsids>
     <w:rsidRoot w:val="00BE72BC"/>
+    <w:rsid w:val="00045F3C"/>
     <w:rsid w:val="000D07AC"/>
     <w:rsid w:val="001A3B5C"/>
     <w:rsid w:val="001C42CE"/>
@@ -11941,11 +13555,15 @@
     <w:rsid w:val="0063588A"/>
     <w:rsid w:val="0066686E"/>
     <w:rsid w:val="00715227"/>
+    <w:rsid w:val="007312C2"/>
+    <w:rsid w:val="00754A35"/>
     <w:rsid w:val="007F4556"/>
     <w:rsid w:val="0080736A"/>
+    <w:rsid w:val="00924F9E"/>
     <w:rsid w:val="009826E2"/>
     <w:rsid w:val="00A04D62"/>
     <w:rsid w:val="00A27299"/>
+    <w:rsid w:val="00A629CF"/>
     <w:rsid w:val="00A65B6C"/>
     <w:rsid w:val="00B555FF"/>
     <w:rsid w:val="00BD5007"/>
@@ -11958,6 +13576,7 @@
     <w:rsid w:val="00ED4879"/>
     <w:rsid w:val="00EE3640"/>
     <w:rsid w:val="00EF520A"/>
+    <w:rsid w:val="00F15724"/>
     <w:rsid w:val="00F26F5B"/>
   </w:rsids>
   <m:mathPr>
@@ -12414,7 +14033,7 @@
     <w:basedOn w:val="Carpredefinitoparagrafo"/>
     <w:uiPriority w:val="99"/>
     <w:semiHidden/>
-    <w:rsid w:val="000D07AC"/>
+    <w:rsid w:val="00F15724"/>
     <w:rPr>
       <w:color w:val="666666"/>
     </w:rPr>
@@ -12523,6 +14142,18 @@
   <w:style w:type="paragraph" w:customStyle="1" w:styleId="158810A0B37A4D9F892C9EF70BFD9821">
     <w:name w:val="158810A0B37A4D9F892C9EF70BFD9821"/>
     <w:rsid w:val="000D07AC"/>
+  </w:style>
+  <w:style w:type="paragraph" w:customStyle="1" w:styleId="764F1DB10DAF4182B82C72D4E1234D4F">
+    <w:name w:val="764F1DB10DAF4182B82C72D4E1234D4F"/>
+    <w:rsid w:val="00F15724"/>
+  </w:style>
+  <w:style w:type="paragraph" w:customStyle="1" w:styleId="68DBC01E9EDC4391BE6A79D004B07D0F">
+    <w:name w:val="68DBC01E9EDC4391BE6A79D004B07D0F"/>
+    <w:rsid w:val="00F15724"/>
+  </w:style>
+  <w:style w:type="paragraph" w:customStyle="1" w:styleId="416DA010D8784AD4B3C3FCE8857688D9">
+    <w:name w:val="416DA010D8784AD4B3C3FCE8857688D9"/>
+    <w:rsid w:val="00F15724"/>
   </w:style>
 </w:styles>
 </file>

</xml_diff>

<commit_message>
'mockup' salvataggio/caricamento statistiche e diario
</commit_message>
<xml_diff>
--- a/4_Diari/Diario.docx
+++ b/4_Diari/Diario.docx
@@ -9165,19 +9165,7 @@
               <w:rPr>
                 <w:rFonts w:ascii="Arial" w:hAnsi="Arial" w:cs="Arial"/>
               </w:rPr>
-              <w:t>1</w:t>
-            </w:r>
-            <w:r>
-              <w:rPr>
-                <w:rFonts w:ascii="Arial" w:hAnsi="Arial" w:cs="Arial"/>
-              </w:rPr>
-              <w:t>8</w:t>
-            </w:r>
-            <w:r>
-              <w:rPr>
-                <w:rFonts w:ascii="Arial" w:hAnsi="Arial" w:cs="Arial"/>
-              </w:rPr>
-              <w:t>.09.2026</w:t>
+              <w:t>18.09.2026</w:t>
             </w:r>
           </w:p>
         </w:tc>
@@ -9251,6 +9239,12 @@
                 <w:rFonts w:ascii="Arial" w:hAnsi="Arial" w:cs="Arial"/>
               </w:rPr>
             </w:pPr>
+            <w:r>
+              <w:rPr>
+                <w:rFonts w:ascii="Arial" w:hAnsi="Arial" w:cs="Arial"/>
+              </w:rPr>
+              <w:t>Ricerca e sviluppo per salvataggio statistiche su json, non ancora completo, questo verrà utilizzato come test per verificare il funzionamento delle varie schermate ui poi verrà adattato per il db</w:t>
+            </w:r>
           </w:p>
         </w:tc>
       </w:tr>
@@ -9283,6 +9277,12 @@
                 <w:rFonts w:ascii="Arial" w:hAnsi="Arial" w:cs="Arial"/>
               </w:rPr>
             </w:pPr>
+            <w:r>
+              <w:rPr>
+                <w:rFonts w:ascii="Arial" w:hAnsi="Arial" w:cs="Arial"/>
+              </w:rPr>
+              <w:t>Sviluppo grafico della interfaccia utente della schermata delle Statistiche</w:t>
+            </w:r>
           </w:p>
         </w:tc>
       </w:tr>
@@ -9398,7 +9398,7 @@
               <w:rPr>
                 <w:rFonts w:ascii="Arial" w:hAnsi="Arial" w:cs="Arial"/>
               </w:rPr>
-              <w:t>-.</w:t>
+              <w:t>Non trovavo la cartella degli assets, risolto cercando su google.</w:t>
             </w:r>
           </w:p>
         </w:tc>
@@ -9456,7 +9456,7 @@
               <w:rPr>
                 <w:rFonts w:ascii="Arial" w:hAnsi="Arial" w:cs="Arial"/>
               </w:rPr>
-              <w:t>-</w:t>
+              <w:t>Le statistiche non sono concluse, manca una piccola parte della ui e la logica di salvataggio e caricamento</w:t>
             </w:r>
           </w:p>
         </w:tc>
@@ -9510,6 +9510,12 @@
                 <w:rFonts w:ascii="Arial" w:hAnsi="Arial" w:cs="Arial"/>
               </w:rPr>
             </w:pPr>
+            <w:r>
+              <w:rPr>
+                <w:rFonts w:ascii="Arial" w:hAnsi="Arial" w:cs="Arial"/>
+              </w:rPr>
+              <w:t>Terminare completamente le statistiche e possibilmente cominciare con le impostazioni</w:t>
+            </w:r>
           </w:p>
         </w:tc>
       </w:tr>
@@ -9877,7 +9883,7 @@
           </w:rPr>
           <w:id w:val="-1362277052"/>
           <w14:checkbox>
-            <w14:checked w14:val="1"/>
+            <w14:checked w14:val="0"/>
             <w14:checkedState w14:val="2612" w14:font="MS Gothic"/>
             <w14:uncheckedState w14:val="2610" w14:font="MS Gothic"/>
           </w14:checkbox>
@@ -9887,7 +9893,7 @@
             <w:rPr>
               <w:rFonts w:ascii="MS Gothic" w:eastAsia="MS Gothic" w:hAnsi="MS Gothic" w:cs="Segoe UI Symbol" w:hint="eastAsia"/>
             </w:rPr>
-            <w:t>☒</w:t>
+            <w:t>☐</w:t>
           </w:r>
         </w:sdtContent>
       </w:sdt>
@@ -9937,7 +9943,7 @@
           </w:rPr>
           <w:id w:val="38254706"/>
           <w14:checkbox>
-            <w14:checked w14:val="0"/>
+            <w14:checked w14:val="1"/>
             <w14:checkedState w14:val="2612" w14:font="MS Gothic"/>
             <w14:uncheckedState w14:val="2610" w14:font="MS Gothic"/>
           </w14:checkbox>
@@ -9947,7 +9953,7 @@
             <w:rPr>
               <w:rFonts w:ascii="MS Gothic" w:eastAsia="MS Gothic" w:hAnsi="MS Gothic" w:cs="Segoe UI Symbol" w:hint="eastAsia"/>
             </w:rPr>
-            <w:t>☐</w:t>
+            <w:t>☒</w:t>
           </w:r>
         </w:sdtContent>
       </w:sdt>
@@ -10012,7 +10018,14 @@
             <w:docPart w:val="61914382B9F74FF8A6A059160206082F"/>
           </w:placeholder>
         </w:sdtPr>
-        <w:sdtContent/>
+        <w:sdtContent>
+          <w:r>
+            <w:rPr>
+              <w:rFonts w:ascii="Arial" w:hAnsi="Arial" w:cs="Arial"/>
+            </w:rPr>
+            <w:t>ChatGPT</w:t>
+          </w:r>
+        </w:sdtContent>
       </w:sdt>
     </w:p>
     <w:p>
@@ -10048,7 +10061,7 @@
           </w:rPr>
           <w:id w:val="-1515150333"/>
           <w14:checkbox>
-            <w14:checked w14:val="0"/>
+            <w14:checked w14:val="1"/>
             <w14:checkedState w14:val="2612" w14:font="MS Gothic"/>
             <w14:uncheckedState w14:val="2610" w14:font="MS Gothic"/>
           </w14:checkbox>
@@ -10058,7 +10071,7 @@
             <w:rPr>
               <w:rFonts w:ascii="MS Gothic" w:eastAsia="MS Gothic" w:hAnsi="MS Gothic" w:cs="Segoe UI Symbol" w:hint="eastAsia"/>
             </w:rPr>
-            <w:t>☐</w:t>
+            <w:t>☒</w:t>
           </w:r>
         </w:sdtContent>
       </w:sdt>
@@ -10078,7 +10091,7 @@
           </w:rPr>
           <w:id w:val="1673923131"/>
           <w14:checkbox>
-            <w14:checked w14:val="0"/>
+            <w14:checked w14:val="1"/>
             <w14:checkedState w14:val="2612" w14:font="MS Gothic"/>
             <w14:uncheckedState w14:val="2610" w14:font="MS Gothic"/>
           </w14:checkbox>
@@ -10086,9 +10099,9 @@
         <w:sdtContent>
           <w:r>
             <w:rPr>
-              <w:rFonts w:ascii="MS Gothic" w:eastAsia="MS Gothic" w:hAnsi="MS Gothic" w:cs="Segoe UI Symbol"/>
-            </w:rPr>
-            <w:t>☐</w:t>
+              <w:rFonts w:ascii="MS Gothic" w:eastAsia="MS Gothic" w:hAnsi="MS Gothic" w:cs="Segoe UI Symbol" w:hint="eastAsia"/>
+            </w:rPr>
+            <w:t>☒</w:t>
           </w:r>
         </w:sdtContent>
       </w:sdt>
@@ -10269,16 +10282,16 @@
           <w:pPr>
             <w:pStyle w:val="Nessunaspaziatura"/>
             <w:spacing w:line="276" w:lineRule="auto"/>
+            <w:rPr>
+              <w:rFonts w:ascii="Arial" w:hAnsi="Arial" w:cs="Arial"/>
+            </w:rPr>
           </w:pPr>
-        </w:p>
-        <w:p>
-          <w:pPr>
-            <w:pStyle w:val="Nessunaspaziatura"/>
-            <w:spacing w:line="276" w:lineRule="auto"/>
+          <w:r>
             <w:rPr>
               <w:rFonts w:ascii="Arial" w:hAnsi="Arial" w:cs="Arial"/>
             </w:rPr>
-          </w:pPr>
+            <w:t>Riley: aiutami a comprendere come salvare dei dati unity su un json</w:t>
+          </w:r>
         </w:p>
       </w:sdtContent>
     </w:sdt>
@@ -10339,7 +10352,6 @@
         <w:placeholder>
           <w:docPart w:val="7278956B576944158FA3C037CBFCB52B"/>
         </w:placeholder>
-        <w:showingPlcHdr/>
         <w15:color w:val="C0C0C0"/>
       </w:sdtPr>
       <w:sdtContent>
@@ -10353,21 +10365,9 @@
           </w:pPr>
           <w:r>
             <w:rPr>
-              <w:rStyle w:val="Testosegnaposto"/>
-            </w:rPr>
-            <w:t xml:space="preserve">Fare clic o toccare qui per </w:t>
-          </w:r>
-          <w:r>
-            <w:rPr>
-              <w:rStyle w:val="Testosegnaposto"/>
-            </w:rPr>
-            <w:t>immettere</w:t>
-          </w:r>
-          <w:r>
-            <w:rPr>
-              <w:rStyle w:val="Testosegnaposto"/>
-            </w:rPr>
-            <w:t xml:space="preserve"> il testo.</w:t>
+              <w:rFonts w:ascii="Arial" w:hAnsi="Arial" w:cs="Arial"/>
+            </w:rPr>
+            <w:t>Spiegazione della struttura e del codice</w:t>
           </w:r>
         </w:p>
       </w:sdtContent>
@@ -10410,7 +10410,7 @@
           </w:rPr>
           <w:id w:val="-1462023651"/>
           <w14:checkbox>
-            <w14:checked w14:val="0"/>
+            <w14:checked w14:val="1"/>
             <w14:checkedState w14:val="2612" w14:font="MS Gothic"/>
             <w14:uncheckedState w14:val="2610" w14:font="MS Gothic"/>
           </w14:checkbox>
@@ -10420,7 +10420,7 @@
             <w:rPr>
               <w:rFonts w:ascii="MS Gothic" w:eastAsia="MS Gothic" w:hAnsi="MS Gothic" w:cs="Segoe UI Symbol" w:hint="eastAsia"/>
             </w:rPr>
-            <w:t>☐</w:t>
+            <w:t>☒</w:t>
           </w:r>
         </w:sdtContent>
       </w:sdt>
@@ -10443,7 +10443,7 @@
           </w:rPr>
           <w:id w:val="-1702244754"/>
           <w14:checkbox>
-            <w14:checked w14:val="0"/>
+            <w14:checked w14:val="1"/>
             <w14:checkedState w14:val="2612" w14:font="MS Gothic"/>
             <w14:uncheckedState w14:val="2610" w14:font="MS Gothic"/>
           </w14:checkbox>
@@ -10453,7 +10453,7 @@
             <w:rPr>
               <w:rFonts w:ascii="MS Gothic" w:eastAsia="MS Gothic" w:hAnsi="MS Gothic" w:cs="Segoe UI Symbol" w:hint="eastAsia"/>
             </w:rPr>
-            <w:t>☐</w:t>
+            <w:t>☒</w:t>
           </w:r>
         </w:sdtContent>
       </w:sdt>
@@ -10565,11 +10565,16 @@
     <w:p>
       <w:pPr>
         <w:pStyle w:val="Nessunaspaziatura"/>
-        <w:spacing w:line="276" w:lineRule="auto"/>
-        <w:rPr>
-          <w:rFonts w:ascii="Arial" w:hAnsi="Arial" w:cs="Arial"/>
-        </w:rPr>
-      </w:pPr>
+        <w:rPr>
+          <w:rFonts w:ascii="Arial" w:hAnsi="Arial" w:cs="Arial"/>
+        </w:rPr>
+      </w:pPr>
+      <w:r>
+        <w:rPr>
+          <w:rFonts w:ascii="Arial" w:hAnsi="Arial" w:cs="Arial"/>
+        </w:rPr>
+        <w:t>Arei cercato sulla documentazione ufficiale.</w:t>
+      </w:r>
     </w:p>
     <w:sectPr>
       <w:headerReference w:type="default" r:id="rId8"/>
@@ -15160,8 +15165,10 @@
     <w:rsid w:val="00715227"/>
     <w:rsid w:val="007312C2"/>
     <w:rsid w:val="00754A35"/>
+    <w:rsid w:val="00786637"/>
     <w:rsid w:val="007F4556"/>
     <w:rsid w:val="0080736A"/>
+    <w:rsid w:val="008736ED"/>
     <w:rsid w:val="00924F9E"/>
     <w:rsid w:val="009826E2"/>
     <w:rsid w:val="009A56C6"/>
@@ -15171,6 +15178,7 @@
     <w:rsid w:val="00A65B6C"/>
     <w:rsid w:val="00AD46CF"/>
     <w:rsid w:val="00B555FF"/>
+    <w:rsid w:val="00BD3686"/>
     <w:rsid w:val="00BD5007"/>
     <w:rsid w:val="00BE72BC"/>
     <w:rsid w:val="00DA48BB"/>

</xml_diff>

<commit_message>
aggiunte script statistiche, modifiche nomi oggetti e diario
</commit_message>
<xml_diff>
--- a/4_Diari/Diario.docx
+++ b/4_Diari/Diario.docx
@@ -193,7 +193,21 @@
               <w:rPr>
                 <w:rFonts w:ascii="Arial" w:hAnsi="Arial" w:cs="Arial"/>
               </w:rPr>
-              <w:t>Riflettuto sui requisiti e user story del gioco, creato i primi template per gantt e diario</w:t>
+              <w:t xml:space="preserve">Riflettuto sui requisiti e user story del gioco, creato i primi template per </w:t>
+            </w:r>
+            <w:proofErr w:type="spellStart"/>
+            <w:r>
+              <w:rPr>
+                <w:rFonts w:ascii="Arial" w:hAnsi="Arial" w:cs="Arial"/>
+              </w:rPr>
+              <w:t>gantt</w:t>
+            </w:r>
+            <w:proofErr w:type="spellEnd"/>
+            <w:r>
+              <w:rPr>
+                <w:rFonts w:ascii="Arial" w:hAnsi="Arial" w:cs="Arial"/>
+              </w:rPr>
+              <w:t xml:space="preserve"> e diario</w:t>
             </w:r>
           </w:p>
         </w:tc>
@@ -234,7 +248,21 @@
               <w:rPr>
                 <w:rFonts w:ascii="Arial" w:hAnsi="Arial" w:cs="Arial"/>
               </w:rPr>
-              <w:t>Riflettuto sui requisiti e user story del gioco, iniziato scrittura documentazione e sincronizzazione progetto a GitLab.</w:t>
+              <w:t xml:space="preserve">Riflettuto sui requisiti e user story del gioco, iniziato scrittura documentazione e sincronizzazione progetto a </w:t>
+            </w:r>
+            <w:proofErr w:type="spellStart"/>
+            <w:r>
+              <w:rPr>
+                <w:rFonts w:ascii="Arial" w:hAnsi="Arial" w:cs="Arial"/>
+              </w:rPr>
+              <w:t>GitLab</w:t>
+            </w:r>
+            <w:proofErr w:type="spellEnd"/>
+            <w:r>
+              <w:rPr>
+                <w:rFonts w:ascii="Arial" w:hAnsi="Arial" w:cs="Arial"/>
+              </w:rPr>
+              <w:t>.</w:t>
             </w:r>
           </w:p>
         </w:tc>
@@ -675,7 +703,25 @@
               <w:b/>
               <w:bCs/>
             </w:rPr>
-            <w:t>Nomi AI utilizzati</w:t>
+            <w:t xml:space="preserve">Nomi </w:t>
+          </w:r>
+          <w:proofErr w:type="gramStart"/>
+          <w:r>
+            <w:rPr>
+              <w:rStyle w:val="Testosegnaposto"/>
+              <w:b/>
+              <w:bCs/>
+            </w:rPr>
+            <w:t>AI</w:t>
+          </w:r>
+          <w:proofErr w:type="gramEnd"/>
+          <w:r>
+            <w:rPr>
+              <w:rStyle w:val="Testosegnaposto"/>
+              <w:b/>
+              <w:bCs/>
+            </w:rPr>
+            <w:t xml:space="preserve"> utilizzati</w:t>
           </w:r>
         </w:sdtContent>
       </w:sdt>
@@ -1756,7 +1802,21 @@
               <w:rPr>
                 <w:rFonts w:ascii="Arial" w:hAnsi="Arial" w:cs="Arial"/>
               </w:rPr>
-              <w:t>Iniziare e completare analisi dei mezzi, creare lo use case</w:t>
+              <w:t xml:space="preserve">Iniziare e completare analisi dei mezzi, creare </w:t>
+            </w:r>
+            <w:proofErr w:type="gramStart"/>
+            <w:r>
+              <w:rPr>
+                <w:rFonts w:ascii="Arial" w:hAnsi="Arial" w:cs="Arial"/>
+              </w:rPr>
+              <w:t>lo use</w:t>
+            </w:r>
+            <w:proofErr w:type="gramEnd"/>
+            <w:r>
+              <w:rPr>
+                <w:rFonts w:ascii="Arial" w:hAnsi="Arial" w:cs="Arial"/>
+              </w:rPr>
+              <w:t xml:space="preserve"> case</w:t>
             </w:r>
             <w:r>
               <w:rPr>
@@ -2234,7 +2294,21 @@
             <w:rPr>
               <w:rFonts w:ascii="Arial" w:hAnsi="Arial" w:cs="Arial"/>
             </w:rPr>
-            <w:t>Aitami a generare dei requesiti in base ai seguenti dati</w:t>
+            <w:t xml:space="preserve">Aitami a generare dei </w:t>
+          </w:r>
+          <w:proofErr w:type="spellStart"/>
+          <w:r>
+            <w:rPr>
+              <w:rFonts w:ascii="Arial" w:hAnsi="Arial" w:cs="Arial"/>
+            </w:rPr>
+            <w:t>requesiti</w:t>
+          </w:r>
+          <w:proofErr w:type="spellEnd"/>
+          <w:r>
+            <w:rPr>
+              <w:rFonts w:ascii="Arial" w:hAnsi="Arial" w:cs="Arial"/>
+            </w:rPr>
+            <w:t xml:space="preserve"> in base ai seguenti dati</w:t>
           </w:r>
         </w:p>
       </w:sdtContent>
@@ -2774,7 +2848,21 @@
               <w:rPr>
                 <w:rFonts w:ascii="Arial" w:hAnsi="Arial" w:cs="Arial"/>
               </w:rPr>
-              <w:t>Completata la analisi del dominio nella documentazione, inizio ricerche riguardo Unity.</w:t>
+              <w:t xml:space="preserve">Completata la analisi del dominio nella documentazione, inizio ricerche riguardo </w:t>
+            </w:r>
+            <w:proofErr w:type="spellStart"/>
+            <w:r>
+              <w:rPr>
+                <w:rFonts w:ascii="Arial" w:hAnsi="Arial" w:cs="Arial"/>
+              </w:rPr>
+              <w:t>Unity</w:t>
+            </w:r>
+            <w:proofErr w:type="spellEnd"/>
+            <w:r>
+              <w:rPr>
+                <w:rFonts w:ascii="Arial" w:hAnsi="Arial" w:cs="Arial"/>
+              </w:rPr>
+              <w:t>.</w:t>
             </w:r>
           </w:p>
         </w:tc>
@@ -2949,7 +3037,21 @@
               <w:rPr>
                 <w:rFonts w:ascii="Arial" w:hAnsi="Arial" w:cs="Arial"/>
               </w:rPr>
-              <w:t>Il diagramma ER non è completo e lo use case non è stato iniziato, analisi dei mezzi non ancora completata.</w:t>
+              <w:t xml:space="preserve">Il diagramma ER non è completo e </w:t>
+            </w:r>
+            <w:proofErr w:type="gramStart"/>
+            <w:r>
+              <w:rPr>
+                <w:rFonts w:ascii="Arial" w:hAnsi="Arial" w:cs="Arial"/>
+              </w:rPr>
+              <w:t>lo use</w:t>
+            </w:r>
+            <w:proofErr w:type="gramEnd"/>
+            <w:r>
+              <w:rPr>
+                <w:rFonts w:ascii="Arial" w:hAnsi="Arial" w:cs="Arial"/>
+              </w:rPr>
+              <w:t xml:space="preserve"> case non è stato iniziato, analisi dei mezzi non ancora completata.</w:t>
             </w:r>
           </w:p>
         </w:tc>
@@ -3981,8 +4083,16 @@
               <w:rPr>
                 <w:rFonts w:ascii="Arial" w:hAnsi="Arial" w:cs="Arial"/>
               </w:rPr>
-              <w:t>Creato diagramma ER e modifiche strutturali gantt</w:t>
-            </w:r>
+              <w:t xml:space="preserve">Creato diagramma ER e modifiche strutturali </w:t>
+            </w:r>
+            <w:proofErr w:type="spellStart"/>
+            <w:r>
+              <w:rPr>
+                <w:rFonts w:ascii="Arial" w:hAnsi="Arial" w:cs="Arial"/>
+              </w:rPr>
+              <w:t>gantt</w:t>
+            </w:r>
+            <w:proofErr w:type="spellEnd"/>
           </w:p>
         </w:tc>
       </w:tr>
@@ -4730,12 +4840,20 @@
             <w:rPr>
               <w:rFonts w:ascii="Arial" w:hAnsi="Arial" w:cs="Arial"/>
             </w:rPr>
-            <w:t>uoi dirmi delle classiche impostazioni per un gioco di guida in stile br</w:t>
-          </w:r>
+            <w:t xml:space="preserve">uoi dirmi delle classiche impostazioni per un gioco di guida in stile </w:t>
+          </w:r>
+          <w:proofErr w:type="spellStart"/>
           <w:r>
             <w:rPr>
               <w:rFonts w:ascii="Arial" w:hAnsi="Arial" w:cs="Arial"/>
             </w:rPr>
+            <w:t>br</w:t>
+          </w:r>
+          <w:proofErr w:type="spellEnd"/>
+          <w:r>
+            <w:rPr>
+              <w:rFonts w:ascii="Arial" w:hAnsi="Arial" w:cs="Arial"/>
+            </w:rPr>
             <w:t xml:space="preserve">. </w:t>
           </w:r>
           <w:r>
@@ -4743,7 +4861,21 @@
               <w:rFonts w:ascii="Arial" w:hAnsi="Arial" w:cs="Arial"/>
             </w:rPr>
             <w:br/>
-            <w:t>Bryan: Spiegami Unity ed i suoi vantaggi.</w:t>
+            <w:t xml:space="preserve">Bryan: Spiegami </w:t>
+          </w:r>
+          <w:proofErr w:type="spellStart"/>
+          <w:r>
+            <w:rPr>
+              <w:rFonts w:ascii="Arial" w:hAnsi="Arial" w:cs="Arial"/>
+            </w:rPr>
+            <w:t>Unity</w:t>
+          </w:r>
+          <w:proofErr w:type="spellEnd"/>
+          <w:r>
+            <w:rPr>
+              <w:rFonts w:ascii="Arial" w:hAnsi="Arial" w:cs="Arial"/>
+            </w:rPr>
+            <w:t xml:space="preserve"> ed i suoi vantaggi.</w:t>
           </w:r>
         </w:p>
       </w:sdtContent>
@@ -5221,8 +5353,16 @@
               <w:rPr>
                 <w:rFonts w:ascii="Arial" w:hAnsi="Arial" w:cs="Arial"/>
               </w:rPr>
-              <w:t>Creato Diagramma ER e aggiornato gannt</w:t>
-            </w:r>
+              <w:t xml:space="preserve">Creato Diagramma ER e aggiornato </w:t>
+            </w:r>
+            <w:proofErr w:type="spellStart"/>
+            <w:r>
+              <w:rPr>
+                <w:rFonts w:ascii="Arial" w:hAnsi="Arial" w:cs="Arial"/>
+              </w:rPr>
+              <w:t>gannt</w:t>
+            </w:r>
+            <w:proofErr w:type="spellEnd"/>
           </w:p>
         </w:tc>
       </w:tr>
@@ -5259,7 +5399,21 @@
               <w:rPr>
                 <w:rFonts w:ascii="Arial" w:hAnsi="Arial" w:cs="Arial"/>
               </w:rPr>
-              <w:t>Use Case finito, Inizio creazione e documentazione mockup UI.</w:t>
+              <w:t xml:space="preserve">Use Case finito, Inizio creazione e documentazione </w:t>
+            </w:r>
+            <w:proofErr w:type="spellStart"/>
+            <w:r>
+              <w:rPr>
+                <w:rFonts w:ascii="Arial" w:hAnsi="Arial" w:cs="Arial"/>
+              </w:rPr>
+              <w:t>mockup</w:t>
+            </w:r>
+            <w:proofErr w:type="spellEnd"/>
+            <w:r>
+              <w:rPr>
+                <w:rFonts w:ascii="Arial" w:hAnsi="Arial" w:cs="Arial"/>
+              </w:rPr>
+              <w:t xml:space="preserve"> UI.</w:t>
             </w:r>
           </w:p>
         </w:tc>
@@ -5376,7 +5530,21 @@
               <w:rPr>
                 <w:rFonts w:ascii="Arial" w:hAnsi="Arial" w:cs="Arial"/>
               </w:rPr>
-              <w:t>Riuscire a definire le azioni degli attori nel Use Case, risolto approfondendo meglio.</w:t>
+              <w:t xml:space="preserve">Riuscire a definire le azioni degli attori </w:t>
+            </w:r>
+            <w:proofErr w:type="gramStart"/>
+            <w:r>
+              <w:rPr>
+                <w:rFonts w:ascii="Arial" w:hAnsi="Arial" w:cs="Arial"/>
+              </w:rPr>
+              <w:t>nel Use</w:t>
+            </w:r>
+            <w:proofErr w:type="gramEnd"/>
+            <w:r>
+              <w:rPr>
+                <w:rFonts w:ascii="Arial" w:hAnsi="Arial" w:cs="Arial"/>
+              </w:rPr>
+              <w:t xml:space="preserve"> Case, risolto approfondendo meglio.</w:t>
             </w:r>
           </w:p>
         </w:tc>
@@ -5505,7 +5673,21 @@
               <w:rPr>
                 <w:rFonts w:ascii="Arial" w:hAnsi="Arial" w:cs="Arial"/>
               </w:rPr>
-              <w:t>Continuo creazione Mockup UI.</w:t>
+              <w:t xml:space="preserve">Continuo creazione </w:t>
+            </w:r>
+            <w:proofErr w:type="spellStart"/>
+            <w:r>
+              <w:rPr>
+                <w:rFonts w:ascii="Arial" w:hAnsi="Arial" w:cs="Arial"/>
+              </w:rPr>
+              <w:t>Mockup</w:t>
+            </w:r>
+            <w:proofErr w:type="spellEnd"/>
+            <w:r>
+              <w:rPr>
+                <w:rFonts w:ascii="Arial" w:hAnsi="Arial" w:cs="Arial"/>
+              </w:rPr>
+              <w:t xml:space="preserve"> UI.</w:t>
             </w:r>
           </w:p>
         </w:tc>
@@ -6076,8 +6258,30 @@
               <w:rFonts w:ascii="Arial" w:hAnsi="Arial" w:cs="Arial"/>
             </w:rPr>
             <w:br/>
-            <w:t>Bryan: Correzioni dello use case generato dal colega</w:t>
-          </w:r>
+            <w:t xml:space="preserve">Bryan: Correzioni </w:t>
+          </w:r>
+          <w:proofErr w:type="gramStart"/>
+          <w:r>
+            <w:rPr>
+              <w:rFonts w:ascii="Arial" w:hAnsi="Arial" w:cs="Arial"/>
+            </w:rPr>
+            <w:t>dello use</w:t>
+          </w:r>
+          <w:proofErr w:type="gramEnd"/>
+          <w:r>
+            <w:rPr>
+              <w:rFonts w:ascii="Arial" w:hAnsi="Arial" w:cs="Arial"/>
+            </w:rPr>
+            <w:t xml:space="preserve"> case generato dal </w:t>
+          </w:r>
+          <w:proofErr w:type="spellStart"/>
+          <w:r>
+            <w:rPr>
+              <w:rFonts w:ascii="Arial" w:hAnsi="Arial" w:cs="Arial"/>
+            </w:rPr>
+            <w:t>colega</w:t>
+          </w:r>
+          <w:proofErr w:type="spellEnd"/>
         </w:p>
       </w:sdtContent>
     </w:sdt>
@@ -6477,8 +6681,16 @@
               <w:rPr>
                 <w:rFonts w:ascii="Arial" w:hAnsi="Arial" w:cs="Arial"/>
               </w:rPr>
-              <w:t>Completata progettazione e creazione progetto unity</w:t>
-            </w:r>
+              <w:t xml:space="preserve">Completata progettazione e creazione progetto </w:t>
+            </w:r>
+            <w:proofErr w:type="spellStart"/>
+            <w:r>
+              <w:rPr>
+                <w:rFonts w:ascii="Arial" w:hAnsi="Arial" w:cs="Arial"/>
+              </w:rPr>
+              <w:t>unity</w:t>
+            </w:r>
+            <w:proofErr w:type="spellEnd"/>
           </w:p>
         </w:tc>
       </w:tr>
@@ -6515,8 +6727,16 @@
               <w:rPr>
                 <w:rFonts w:ascii="Arial" w:hAnsi="Arial" w:cs="Arial"/>
               </w:rPr>
-              <w:t>Fine Mockup</w:t>
-            </w:r>
+              <w:t xml:space="preserve">Fine </w:t>
+            </w:r>
+            <w:proofErr w:type="spellStart"/>
+            <w:r>
+              <w:rPr>
+                <w:rFonts w:ascii="Arial" w:hAnsi="Arial" w:cs="Arial"/>
+              </w:rPr>
+              <w:t>Mockup</w:t>
+            </w:r>
+            <w:proofErr w:type="spellEnd"/>
           </w:p>
         </w:tc>
       </w:tr>
@@ -6594,8 +6814,52 @@
               <w:rPr>
                 <w:rFonts w:ascii="Arial" w:hAnsi="Arial" w:cs="Arial"/>
               </w:rPr>
-              <w:t>Problemi nel pushare il progetto uinity, risolto grazie alla creazione di un file .gitignore</w:t>
-            </w:r>
+              <w:t xml:space="preserve">Problemi nel </w:t>
+            </w:r>
+            <w:proofErr w:type="spellStart"/>
+            <w:r>
+              <w:rPr>
+                <w:rFonts w:ascii="Arial" w:hAnsi="Arial" w:cs="Arial"/>
+              </w:rPr>
+              <w:t>pushare</w:t>
+            </w:r>
+            <w:proofErr w:type="spellEnd"/>
+            <w:r>
+              <w:rPr>
+                <w:rFonts w:ascii="Arial" w:hAnsi="Arial" w:cs="Arial"/>
+              </w:rPr>
+              <w:t xml:space="preserve"> il progetto </w:t>
+            </w:r>
+            <w:proofErr w:type="spellStart"/>
+            <w:r>
+              <w:rPr>
+                <w:rFonts w:ascii="Arial" w:hAnsi="Arial" w:cs="Arial"/>
+              </w:rPr>
+              <w:t>uinity</w:t>
+            </w:r>
+            <w:proofErr w:type="spellEnd"/>
+            <w:r>
+              <w:rPr>
+                <w:rFonts w:ascii="Arial" w:hAnsi="Arial" w:cs="Arial"/>
+              </w:rPr>
+              <w:t xml:space="preserve">, risolto grazie alla creazione di un </w:t>
+            </w:r>
+            <w:proofErr w:type="gramStart"/>
+            <w:r>
+              <w:rPr>
+                <w:rFonts w:ascii="Arial" w:hAnsi="Arial" w:cs="Arial"/>
+              </w:rPr>
+              <w:t>file .</w:t>
+            </w:r>
+            <w:proofErr w:type="spellStart"/>
+            <w:r>
+              <w:rPr>
+                <w:rFonts w:ascii="Arial" w:hAnsi="Arial" w:cs="Arial"/>
+              </w:rPr>
+              <w:t>gitignore</w:t>
+            </w:r>
+            <w:proofErr w:type="spellEnd"/>
+            <w:proofErr w:type="gramEnd"/>
           </w:p>
         </w:tc>
       </w:tr>
@@ -6748,7 +7012,35 @@
               <w:rPr>
                 <w:rFonts w:ascii="Arial" w:hAnsi="Arial" w:cs="Arial"/>
               </w:rPr>
-              <w:t>Ambientarsi nel game engine di unity e quindi cominciare a creare la schermata di statistiche</w:t>
+              <w:t xml:space="preserve">Ambientarsi nel game </w:t>
+            </w:r>
+            <w:proofErr w:type="spellStart"/>
+            <w:r>
+              <w:rPr>
+                <w:rFonts w:ascii="Arial" w:hAnsi="Arial" w:cs="Arial"/>
+              </w:rPr>
+              <w:t>engine</w:t>
+            </w:r>
+            <w:proofErr w:type="spellEnd"/>
+            <w:r>
+              <w:rPr>
+                <w:rFonts w:ascii="Arial" w:hAnsi="Arial" w:cs="Arial"/>
+              </w:rPr>
+              <w:t xml:space="preserve"> di </w:t>
+            </w:r>
+            <w:proofErr w:type="spellStart"/>
+            <w:r>
+              <w:rPr>
+                <w:rFonts w:ascii="Arial" w:hAnsi="Arial" w:cs="Arial"/>
+              </w:rPr>
+              <w:t>unity</w:t>
+            </w:r>
+            <w:proofErr w:type="spellEnd"/>
+            <w:r>
+              <w:rPr>
+                <w:rFonts w:ascii="Arial" w:hAnsi="Arial" w:cs="Arial"/>
+              </w:rPr>
+              <w:t xml:space="preserve"> e quindi cominciare a creare la schermata di statistiche</w:t>
             </w:r>
           </w:p>
         </w:tc>
@@ -7220,7 +7512,21 @@
             <w:rPr>
               <w:rFonts w:ascii="Arial" w:hAnsi="Arial" w:cs="Arial"/>
             </w:rPr>
-            <w:t>Bryan: Generami un’immagine di mockup basandoti sul seguente stile: “stile”</w:t>
+            <w:t xml:space="preserve">Bryan: Generami un’immagine di </w:t>
+          </w:r>
+          <w:proofErr w:type="spellStart"/>
+          <w:r>
+            <w:rPr>
+              <w:rFonts w:ascii="Arial" w:hAnsi="Arial" w:cs="Arial"/>
+            </w:rPr>
+            <w:t>mockup</w:t>
+          </w:r>
+          <w:proofErr w:type="spellEnd"/>
+          <w:r>
+            <w:rPr>
+              <w:rFonts w:ascii="Arial" w:hAnsi="Arial" w:cs="Arial"/>
+            </w:rPr>
+            <w:t xml:space="preserve"> basandoti sul seguente stile: “stile”</w:t>
           </w:r>
         </w:p>
         <w:p>
@@ -7534,14 +7840,58 @@
         <w:rPr>
           <w:rFonts w:ascii="Arial" w:hAnsi="Arial" w:cs="Arial"/>
         </w:rPr>
-        <w:t>Riley: probabilmente non sarei riuscito a risolvere questo problema non avendo un’esperienza molto avanzata con i file .gitignore</w:t>
-      </w:r>
+        <w:t xml:space="preserve">Riley: probabilmente non sarei riuscito a risolvere questo problema non avendo un’esperienza molto avanzata con i </w:t>
+      </w:r>
+      <w:proofErr w:type="gramStart"/>
+      <w:r>
+        <w:rPr>
+          <w:rFonts w:ascii="Arial" w:hAnsi="Arial" w:cs="Arial"/>
+        </w:rPr>
+        <w:t>file .</w:t>
+      </w:r>
+      <w:proofErr w:type="spellStart"/>
+      <w:r>
+        <w:rPr>
+          <w:rFonts w:ascii="Arial" w:hAnsi="Arial" w:cs="Arial"/>
+        </w:rPr>
+        <w:t>gitignore</w:t>
+      </w:r>
+      <w:proofErr w:type="spellEnd"/>
+      <w:proofErr w:type="gramEnd"/>
       <w:r>
         <w:rPr>
           <w:rFonts w:ascii="Arial" w:hAnsi="Arial" w:cs="Arial"/>
         </w:rPr>
         <w:br/>
-        <w:t>Bryan: Averi creato un’immagine su paint che avrebbe reso i mockup molto più confusi.</w:t>
+        <w:t xml:space="preserve">Bryan: Averi creato un’immagine su </w:t>
+      </w:r>
+      <w:proofErr w:type="spellStart"/>
+      <w:r>
+        <w:rPr>
+          <w:rFonts w:ascii="Arial" w:hAnsi="Arial" w:cs="Arial"/>
+        </w:rPr>
+        <w:t>paint</w:t>
+      </w:r>
+      <w:proofErr w:type="spellEnd"/>
+      <w:r>
+        <w:rPr>
+          <w:rFonts w:ascii="Arial" w:hAnsi="Arial" w:cs="Arial"/>
+        </w:rPr>
+        <w:t xml:space="preserve"> che avrebbe reso i </w:t>
+      </w:r>
+      <w:proofErr w:type="spellStart"/>
+      <w:r>
+        <w:rPr>
+          <w:rFonts w:ascii="Arial" w:hAnsi="Arial" w:cs="Arial"/>
+        </w:rPr>
+        <w:t>mockup</w:t>
+      </w:r>
+      <w:proofErr w:type="spellEnd"/>
+      <w:r>
+        <w:rPr>
+          <w:rFonts w:ascii="Arial" w:hAnsi="Arial" w:cs="Arial"/>
+        </w:rPr>
+        <w:t xml:space="preserve"> molto più confusi.</w:t>
       </w:r>
     </w:p>
     <w:p>
@@ -7727,7 +8077,21 @@
               <w:rPr>
                 <w:rFonts w:ascii="Arial" w:hAnsi="Arial" w:cs="Arial"/>
               </w:rPr>
-              <w:t>Inizio sviluppo ui statistiche</w:t>
+              <w:t xml:space="preserve">Inizio sviluppo </w:t>
+            </w:r>
+            <w:proofErr w:type="spellStart"/>
+            <w:r>
+              <w:rPr>
+                <w:rFonts w:ascii="Arial" w:hAnsi="Arial" w:cs="Arial"/>
+              </w:rPr>
+              <w:t>ui</w:t>
+            </w:r>
+            <w:proofErr w:type="spellEnd"/>
+            <w:r>
+              <w:rPr>
+                <w:rFonts w:ascii="Arial" w:hAnsi="Arial" w:cs="Arial"/>
+              </w:rPr>
+              <w:t xml:space="preserve"> statistiche</w:t>
             </w:r>
           </w:p>
         </w:tc>
@@ -7765,7 +8129,21 @@
               <w:rPr>
                 <w:rFonts w:ascii="Arial" w:hAnsi="Arial" w:cs="Arial"/>
               </w:rPr>
-              <w:t>Inizio sviluppo ui statistiche</w:t>
+              <w:t xml:space="preserve">Inizio sviluppo </w:t>
+            </w:r>
+            <w:proofErr w:type="spellStart"/>
+            <w:r>
+              <w:rPr>
+                <w:rFonts w:ascii="Arial" w:hAnsi="Arial" w:cs="Arial"/>
+              </w:rPr>
+              <w:t>ui</w:t>
+            </w:r>
+            <w:proofErr w:type="spellEnd"/>
+            <w:r>
+              <w:rPr>
+                <w:rFonts w:ascii="Arial" w:hAnsi="Arial" w:cs="Arial"/>
+              </w:rPr>
+              <w:t xml:space="preserve"> statistiche</w:t>
             </w:r>
           </w:p>
         </w:tc>
@@ -7998,7 +8376,21 @@
               <w:rPr>
                 <w:rFonts w:ascii="Arial" w:hAnsi="Arial" w:cs="Arial"/>
               </w:rPr>
-              <w:t>Completare la ui delle statistiche</w:t>
+              <w:t xml:space="preserve">Completare la </w:t>
+            </w:r>
+            <w:proofErr w:type="spellStart"/>
+            <w:r>
+              <w:rPr>
+                <w:rFonts w:ascii="Arial" w:hAnsi="Arial" w:cs="Arial"/>
+              </w:rPr>
+              <w:t>ui</w:t>
+            </w:r>
+            <w:proofErr w:type="spellEnd"/>
+            <w:r>
+              <w:rPr>
+                <w:rFonts w:ascii="Arial" w:hAnsi="Arial" w:cs="Arial"/>
+              </w:rPr>
+              <w:t xml:space="preserve"> delle statistiche</w:t>
             </w:r>
           </w:p>
         </w:tc>
@@ -8048,12 +8440,28 @@
                 <w:rFonts w:ascii="Arial" w:hAnsi="Arial" w:cs="Arial"/>
               </w:rPr>
             </w:pPr>
-            <w:r>
-              <w:rPr>
-                <w:rFonts w:ascii="Arial" w:hAnsi="Arial" w:cs="Arial"/>
-              </w:rPr>
-              <w:t>Daily Scrum</w:t>
-            </w:r>
+            <w:proofErr w:type="spellStart"/>
+            <w:r>
+              <w:rPr>
+                <w:rFonts w:ascii="Arial" w:hAnsi="Arial" w:cs="Arial"/>
+              </w:rPr>
+              <w:t>Daily</w:t>
+            </w:r>
+            <w:proofErr w:type="spellEnd"/>
+            <w:r>
+              <w:rPr>
+                <w:rFonts w:ascii="Arial" w:hAnsi="Arial" w:cs="Arial"/>
+              </w:rPr>
+              <w:t xml:space="preserve"> </w:t>
+            </w:r>
+            <w:proofErr w:type="spellStart"/>
+            <w:r>
+              <w:rPr>
+                <w:rFonts w:ascii="Arial" w:hAnsi="Arial" w:cs="Arial"/>
+              </w:rPr>
+              <w:t>Scrum</w:t>
+            </w:r>
+            <w:proofErr w:type="spellEnd"/>
           </w:p>
         </w:tc>
       </w:tr>
@@ -8101,7 +8509,35 @@
               <w:rPr>
                 <w:rFonts w:ascii="Arial" w:hAnsi="Arial" w:cs="Arial"/>
               </w:rPr>
-              <w:t>Introduzione ambiente unity e inizio imostazione layout statistiche</w:t>
+              <w:t xml:space="preserve">Introduzione ambiente </w:t>
+            </w:r>
+            <w:proofErr w:type="spellStart"/>
+            <w:r>
+              <w:rPr>
+                <w:rFonts w:ascii="Arial" w:hAnsi="Arial" w:cs="Arial"/>
+              </w:rPr>
+              <w:t>unity</w:t>
+            </w:r>
+            <w:proofErr w:type="spellEnd"/>
+            <w:r>
+              <w:rPr>
+                <w:rFonts w:ascii="Arial" w:hAnsi="Arial" w:cs="Arial"/>
+              </w:rPr>
+              <w:t xml:space="preserve"> e inizio </w:t>
+            </w:r>
+            <w:proofErr w:type="spellStart"/>
+            <w:r>
+              <w:rPr>
+                <w:rFonts w:ascii="Arial" w:hAnsi="Arial" w:cs="Arial"/>
+              </w:rPr>
+              <w:t>imostazione</w:t>
+            </w:r>
+            <w:proofErr w:type="spellEnd"/>
+            <w:r>
+              <w:rPr>
+                <w:rFonts w:ascii="Arial" w:hAnsi="Arial" w:cs="Arial"/>
+              </w:rPr>
+              <w:t xml:space="preserve"> layout statistiche</w:t>
             </w:r>
           </w:p>
         </w:tc>
@@ -8281,8 +8717,16 @@
               <w:rPr>
                 <w:rFonts w:ascii="Arial" w:hAnsi="Arial" w:cs="Arial"/>
               </w:rPr>
-              <w:t>Sprint Retrospective</w:t>
-            </w:r>
+              <w:t xml:space="preserve">Sprint </w:t>
+            </w:r>
+            <w:proofErr w:type="spellStart"/>
+            <w:r>
+              <w:rPr>
+                <w:rFonts w:ascii="Arial" w:hAnsi="Arial" w:cs="Arial"/>
+              </w:rPr>
+              <w:t>Retrospective</w:t>
+            </w:r>
+            <w:proofErr w:type="spellEnd"/>
           </w:p>
         </w:tc>
       </w:tr>
@@ -9243,8 +9687,44 @@
               <w:rPr>
                 <w:rFonts w:ascii="Arial" w:hAnsi="Arial" w:cs="Arial"/>
               </w:rPr>
-              <w:t>Ricerca e sviluppo per salvataggio statistiche su json, non ancora completo, questo verrà utilizzato come test per verificare il funzionamento delle varie schermate ui poi verrà adattato per il db</w:t>
-            </w:r>
+              <w:t xml:space="preserve">Ricerca e sviluppo per salvataggio statistiche su </w:t>
+            </w:r>
+            <w:proofErr w:type="spellStart"/>
+            <w:r>
+              <w:rPr>
+                <w:rFonts w:ascii="Arial" w:hAnsi="Arial" w:cs="Arial"/>
+              </w:rPr>
+              <w:t>json</w:t>
+            </w:r>
+            <w:proofErr w:type="spellEnd"/>
+            <w:r>
+              <w:rPr>
+                <w:rFonts w:ascii="Arial" w:hAnsi="Arial" w:cs="Arial"/>
+              </w:rPr>
+              <w:t xml:space="preserve">, non ancora completo, questo verrà utilizzato come test per verificare il funzionamento delle varie schermate </w:t>
+            </w:r>
+            <w:proofErr w:type="spellStart"/>
+            <w:r>
+              <w:rPr>
+                <w:rFonts w:ascii="Arial" w:hAnsi="Arial" w:cs="Arial"/>
+              </w:rPr>
+              <w:t>ui</w:t>
+            </w:r>
+            <w:proofErr w:type="spellEnd"/>
+            <w:r>
+              <w:rPr>
+                <w:rFonts w:ascii="Arial" w:hAnsi="Arial" w:cs="Arial"/>
+              </w:rPr>
+              <w:t xml:space="preserve"> poi verrà adattato per il </w:t>
+            </w:r>
+            <w:proofErr w:type="spellStart"/>
+            <w:r>
+              <w:rPr>
+                <w:rFonts w:ascii="Arial" w:hAnsi="Arial" w:cs="Arial"/>
+              </w:rPr>
+              <w:t>db</w:t>
+            </w:r>
+            <w:proofErr w:type="spellEnd"/>
           </w:p>
         </w:tc>
       </w:tr>
@@ -9398,7 +9878,21 @@
               <w:rPr>
                 <w:rFonts w:ascii="Arial" w:hAnsi="Arial" w:cs="Arial"/>
               </w:rPr>
-              <w:t>Non trovavo la cartella degli assets, risolto cercando su google.</w:t>
+              <w:t xml:space="preserve">Non trovavo la cartella degli assets, risolto cercando su </w:t>
+            </w:r>
+            <w:proofErr w:type="spellStart"/>
+            <w:r>
+              <w:rPr>
+                <w:rFonts w:ascii="Arial" w:hAnsi="Arial" w:cs="Arial"/>
+              </w:rPr>
+              <w:t>google</w:t>
+            </w:r>
+            <w:proofErr w:type="spellEnd"/>
+            <w:r>
+              <w:rPr>
+                <w:rFonts w:ascii="Arial" w:hAnsi="Arial" w:cs="Arial"/>
+              </w:rPr>
+              <w:t>.</w:t>
             </w:r>
           </w:p>
         </w:tc>
@@ -9456,7 +9950,21 @@
               <w:rPr>
                 <w:rFonts w:ascii="Arial" w:hAnsi="Arial" w:cs="Arial"/>
               </w:rPr>
-              <w:t>Le statistiche non sono concluse, manca una piccola parte della ui e la logica di salvataggio e caricamento</w:t>
+              <w:t xml:space="preserve">Le statistiche non sono concluse, manca una piccola parte della </w:t>
+            </w:r>
+            <w:proofErr w:type="spellStart"/>
+            <w:r>
+              <w:rPr>
+                <w:rFonts w:ascii="Arial" w:hAnsi="Arial" w:cs="Arial"/>
+              </w:rPr>
+              <w:t>ui</w:t>
+            </w:r>
+            <w:proofErr w:type="spellEnd"/>
+            <w:r>
+              <w:rPr>
+                <w:rFonts w:ascii="Arial" w:hAnsi="Arial" w:cs="Arial"/>
+              </w:rPr>
+              <w:t xml:space="preserve"> e la logica di salvataggio e caricamento</w:t>
             </w:r>
           </w:p>
         </w:tc>
@@ -9564,12 +10072,28 @@
                 <w:rFonts w:ascii="Arial" w:hAnsi="Arial" w:cs="Arial"/>
               </w:rPr>
             </w:pPr>
-            <w:r>
-              <w:rPr>
-                <w:rFonts w:ascii="Arial" w:hAnsi="Arial" w:cs="Arial"/>
-              </w:rPr>
-              <w:t>Daily Scrum</w:t>
-            </w:r>
+            <w:proofErr w:type="spellStart"/>
+            <w:r>
+              <w:rPr>
+                <w:rFonts w:ascii="Arial" w:hAnsi="Arial" w:cs="Arial"/>
+              </w:rPr>
+              <w:t>Daily</w:t>
+            </w:r>
+            <w:proofErr w:type="spellEnd"/>
+            <w:r>
+              <w:rPr>
+                <w:rFonts w:ascii="Arial" w:hAnsi="Arial" w:cs="Arial"/>
+              </w:rPr>
+              <w:t xml:space="preserve"> </w:t>
+            </w:r>
+            <w:proofErr w:type="spellStart"/>
+            <w:r>
+              <w:rPr>
+                <w:rFonts w:ascii="Arial" w:hAnsi="Arial" w:cs="Arial"/>
+              </w:rPr>
+              <w:t>Scrum</w:t>
+            </w:r>
+            <w:proofErr w:type="spellEnd"/>
           </w:p>
         </w:tc>
       </w:tr>
@@ -9617,7 +10141,35 @@
               <w:rPr>
                 <w:rFonts w:ascii="Arial" w:hAnsi="Arial" w:cs="Arial"/>
               </w:rPr>
-              <w:t>Entrambi completeremo la ui delle statistiche in modo tale che ci ambientiamo completamente per lo sviluppo 2D e gli script C# per poterci permettere di lavorare separatamente in fututro.</w:t>
+              <w:t xml:space="preserve">Entrambi completeremo la </w:t>
+            </w:r>
+            <w:proofErr w:type="spellStart"/>
+            <w:r>
+              <w:rPr>
+                <w:rFonts w:ascii="Arial" w:hAnsi="Arial" w:cs="Arial"/>
+              </w:rPr>
+              <w:t>ui</w:t>
+            </w:r>
+            <w:proofErr w:type="spellEnd"/>
+            <w:r>
+              <w:rPr>
+                <w:rFonts w:ascii="Arial" w:hAnsi="Arial" w:cs="Arial"/>
+              </w:rPr>
+              <w:t xml:space="preserve"> delle statistiche in modo tale che ci ambientiamo completamente per lo sviluppo 2D e gli script C# per poterci permettere di lavorare separatamente in </w:t>
+            </w:r>
+            <w:proofErr w:type="spellStart"/>
+            <w:r>
+              <w:rPr>
+                <w:rFonts w:ascii="Arial" w:hAnsi="Arial" w:cs="Arial"/>
+              </w:rPr>
+              <w:t>fututro</w:t>
+            </w:r>
+            <w:proofErr w:type="spellEnd"/>
+            <w:r>
+              <w:rPr>
+                <w:rFonts w:ascii="Arial" w:hAnsi="Arial" w:cs="Arial"/>
+              </w:rPr>
+              <w:t>.</w:t>
             </w:r>
           </w:p>
         </w:tc>
@@ -9797,8 +10349,16 @@
               <w:rPr>
                 <w:rFonts w:ascii="Arial" w:hAnsi="Arial" w:cs="Arial"/>
               </w:rPr>
-              <w:t>Sprint Retrospective</w:t>
-            </w:r>
+              <w:t xml:space="preserve">Sprint </w:t>
+            </w:r>
+            <w:proofErr w:type="spellStart"/>
+            <w:r>
+              <w:rPr>
+                <w:rFonts w:ascii="Arial" w:hAnsi="Arial" w:cs="Arial"/>
+              </w:rPr>
+              <w:t>Retrospective</w:t>
+            </w:r>
+            <w:proofErr w:type="spellEnd"/>
           </w:p>
         </w:tc>
       </w:tr>
@@ -10290,8 +10850,30 @@
             <w:rPr>
               <w:rFonts w:ascii="Arial" w:hAnsi="Arial" w:cs="Arial"/>
             </w:rPr>
-            <w:t>Riley: aiutami a comprendere come salvare dei dati unity su un json</w:t>
-          </w:r>
+            <w:t xml:space="preserve">Riley: aiutami a comprendere come salvare dei dati </w:t>
+          </w:r>
+          <w:proofErr w:type="spellStart"/>
+          <w:r>
+            <w:rPr>
+              <w:rFonts w:ascii="Arial" w:hAnsi="Arial" w:cs="Arial"/>
+            </w:rPr>
+            <w:t>unity</w:t>
+          </w:r>
+          <w:proofErr w:type="spellEnd"/>
+          <w:r>
+            <w:rPr>
+              <w:rFonts w:ascii="Arial" w:hAnsi="Arial" w:cs="Arial"/>
+            </w:rPr>
+            <w:t xml:space="preserve"> su un </w:t>
+          </w:r>
+          <w:proofErr w:type="spellStart"/>
+          <w:r>
+            <w:rPr>
+              <w:rFonts w:ascii="Arial" w:hAnsi="Arial" w:cs="Arial"/>
+            </w:rPr>
+            <w:t>json</w:t>
+          </w:r>
+          <w:proofErr w:type="spellEnd"/>
         </w:p>
       </w:sdtContent>
     </w:sdt>
@@ -10574,6 +11156,1788 @@
           <w:rFonts w:ascii="Arial" w:hAnsi="Arial" w:cs="Arial"/>
         </w:rPr>
         <w:t>Arei cercato sulla documentazione ufficiale.</w:t>
+      </w:r>
+    </w:p>
+    <w:p>
+      <w:pPr>
+        <w:rPr>
+          <w:rFonts w:ascii="Arial" w:hAnsi="Arial" w:cs="Arial"/>
+        </w:rPr>
+      </w:pPr>
+      <w:r>
+        <w:rPr>
+          <w:rFonts w:ascii="Arial" w:hAnsi="Arial" w:cs="Arial"/>
+        </w:rPr>
+        <w:br w:type="page"/>
+      </w:r>
+    </w:p>
+    <w:tbl>
+      <w:tblPr>
+        <w:tblStyle w:val="Grigliatabella"/>
+        <w:tblW w:w="5000" w:type="pct"/>
+        <w:tblLook w:val="04A0" w:firstRow="1" w:lastRow="0" w:firstColumn="1" w:lastColumn="0" w:noHBand="0" w:noVBand="1"/>
+      </w:tblPr>
+      <w:tblGrid>
+        <w:gridCol w:w="2407"/>
+        <w:gridCol w:w="7221"/>
+      </w:tblGrid>
+      <w:tr>
+        <w:trPr>
+          <w:trHeight w:val="199"/>
+        </w:trPr>
+        <w:tc>
+          <w:tcPr>
+            <w:tcW w:w="1250" w:type="pct"/>
+            <w:vAlign w:val="center"/>
+          </w:tcPr>
+          <w:p>
+            <w:pPr>
+              <w:rPr>
+                <w:rFonts w:ascii="Arial" w:hAnsi="Arial" w:cs="Arial"/>
+              </w:rPr>
+            </w:pPr>
+            <w:r>
+              <w:rPr>
+                <w:rFonts w:ascii="Arial" w:hAnsi="Arial" w:cs="Arial"/>
+              </w:rPr>
+              <w:lastRenderedPageBreak/>
+              <w:t>Luogo</w:t>
+            </w:r>
+          </w:p>
+        </w:tc>
+        <w:tc>
+          <w:tcPr>
+            <w:tcW w:w="3750" w:type="pct"/>
+            <w:vAlign w:val="center"/>
+          </w:tcPr>
+          <w:p>
+            <w:pPr>
+              <w:rPr>
+                <w:rFonts w:ascii="Arial" w:hAnsi="Arial" w:cs="Arial"/>
+              </w:rPr>
+            </w:pPr>
+            <w:r>
+              <w:rPr>
+                <w:rFonts w:ascii="Arial" w:hAnsi="Arial" w:cs="Arial"/>
+              </w:rPr>
+              <w:t>Scuola Arti e Mestieri Trevano</w:t>
+            </w:r>
+          </w:p>
+        </w:tc>
+      </w:tr>
+      <w:tr>
+        <w:trPr>
+          <w:trHeight w:val="196"/>
+        </w:trPr>
+        <w:tc>
+          <w:tcPr>
+            <w:tcW w:w="1250" w:type="pct"/>
+            <w:vAlign w:val="center"/>
+          </w:tcPr>
+          <w:p>
+            <w:pPr>
+              <w:rPr>
+                <w:rFonts w:ascii="Arial" w:hAnsi="Arial" w:cs="Arial"/>
+              </w:rPr>
+            </w:pPr>
+            <w:r>
+              <w:rPr>
+                <w:rFonts w:ascii="Arial" w:hAnsi="Arial" w:cs="Arial"/>
+              </w:rPr>
+              <w:t>Data</w:t>
+            </w:r>
+          </w:p>
+        </w:tc>
+        <w:tc>
+          <w:tcPr>
+            <w:tcW w:w="3750" w:type="pct"/>
+            <w:vAlign w:val="center"/>
+          </w:tcPr>
+          <w:p>
+            <w:pPr>
+              <w:rPr>
+                <w:rFonts w:ascii="Arial" w:hAnsi="Arial" w:cs="Arial"/>
+              </w:rPr>
+            </w:pPr>
+            <w:r>
+              <w:rPr>
+                <w:rFonts w:ascii="Arial" w:hAnsi="Arial" w:cs="Arial"/>
+              </w:rPr>
+              <w:t>21</w:t>
+            </w:r>
+            <w:r>
+              <w:rPr>
+                <w:rFonts w:ascii="Arial" w:hAnsi="Arial" w:cs="Arial"/>
+              </w:rPr>
+              <w:t>.09.2026</w:t>
+            </w:r>
+          </w:p>
+        </w:tc>
+      </w:tr>
+    </w:tbl>
+    <w:p>
+      <w:pPr>
+        <w:rPr>
+          <w:rFonts w:ascii="Arial" w:hAnsi="Arial" w:cs="Arial"/>
+        </w:rPr>
+      </w:pPr>
+    </w:p>
+    <w:tbl>
+      <w:tblPr>
+        <w:tblStyle w:val="Grigliatabella"/>
+        <w:tblW w:w="0" w:type="auto"/>
+        <w:tblLook w:val="04A0" w:firstRow="1" w:lastRow="0" w:firstColumn="1" w:lastColumn="0" w:noHBand="0" w:noVBand="1"/>
+      </w:tblPr>
+      <w:tblGrid>
+        <w:gridCol w:w="1271"/>
+        <w:gridCol w:w="8357"/>
+      </w:tblGrid>
+      <w:tr>
+        <w:tc>
+          <w:tcPr>
+            <w:tcW w:w="9628" w:type="dxa"/>
+            <w:gridSpan w:val="2"/>
+            <w:shd w:val="clear" w:color="auto" w:fill="D9D9D9" w:themeFill="background1" w:themeFillShade="D9"/>
+          </w:tcPr>
+          <w:p>
+            <w:pPr>
+              <w:rPr>
+                <w:rFonts w:ascii="Arial" w:hAnsi="Arial" w:cs="Arial"/>
+              </w:rPr>
+            </w:pPr>
+            <w:r>
+              <w:rPr>
+                <w:rFonts w:ascii="Arial" w:hAnsi="Arial" w:cs="Arial"/>
+              </w:rPr>
+              <w:t>Lavori svolti</w:t>
+            </w:r>
+          </w:p>
+        </w:tc>
+      </w:tr>
+      <w:tr>
+        <w:tc>
+          <w:tcPr>
+            <w:tcW w:w="1271" w:type="dxa"/>
+          </w:tcPr>
+          <w:p>
+            <w:pPr>
+              <w:rPr>
+                <w:rFonts w:ascii="Arial" w:hAnsi="Arial" w:cs="Arial"/>
+              </w:rPr>
+            </w:pPr>
+            <w:r>
+              <w:rPr>
+                <w:rFonts w:ascii="Arial" w:hAnsi="Arial" w:cs="Arial"/>
+              </w:rPr>
+              <w:t>Riley</w:t>
+            </w:r>
+          </w:p>
+        </w:tc>
+        <w:tc>
+          <w:tcPr>
+            <w:tcW w:w="8357" w:type="dxa"/>
+          </w:tcPr>
+          <w:p>
+            <w:pPr>
+              <w:rPr>
+                <w:rFonts w:ascii="Arial" w:hAnsi="Arial" w:cs="Arial"/>
+              </w:rPr>
+            </w:pPr>
+            <w:r>
+              <w:rPr>
+                <w:rFonts w:ascii="Arial" w:hAnsi="Arial" w:cs="Arial"/>
+              </w:rPr>
+              <w:t>Risolto problema di merge</w:t>
+            </w:r>
+            <w:r>
+              <w:rPr>
+                <w:rFonts w:ascii="Arial" w:hAnsi="Arial" w:cs="Arial"/>
+              </w:rPr>
+              <w:t>, aggiornato script per statistiche (quasi completo)</w:t>
+            </w:r>
+          </w:p>
+        </w:tc>
+      </w:tr>
+      <w:tr>
+        <w:tc>
+          <w:tcPr>
+            <w:tcW w:w="1271" w:type="dxa"/>
+          </w:tcPr>
+          <w:p>
+            <w:pPr>
+              <w:rPr>
+                <w:rFonts w:ascii="Arial" w:hAnsi="Arial" w:cs="Arial"/>
+              </w:rPr>
+            </w:pPr>
+            <w:r>
+              <w:rPr>
+                <w:rFonts w:ascii="Arial" w:hAnsi="Arial" w:cs="Arial"/>
+              </w:rPr>
+              <w:t>Bryan</w:t>
+            </w:r>
+          </w:p>
+        </w:tc>
+        <w:tc>
+          <w:tcPr>
+            <w:tcW w:w="8357" w:type="dxa"/>
+          </w:tcPr>
+          <w:p>
+            <w:pPr>
+              <w:rPr>
+                <w:rFonts w:ascii="Arial" w:hAnsi="Arial" w:cs="Arial"/>
+              </w:rPr>
+            </w:pPr>
+            <w:r>
+              <w:rPr>
+                <w:rFonts w:ascii="Arial" w:hAnsi="Arial" w:cs="Arial"/>
+              </w:rPr>
+              <w:t xml:space="preserve">Terminato </w:t>
+            </w:r>
+            <w:proofErr w:type="spellStart"/>
+            <w:r>
+              <w:rPr>
+                <w:rFonts w:ascii="Arial" w:hAnsi="Arial" w:cs="Arial"/>
+              </w:rPr>
+              <w:t>ui</w:t>
+            </w:r>
+            <w:proofErr w:type="spellEnd"/>
+            <w:r>
+              <w:rPr>
+                <w:rFonts w:ascii="Arial" w:hAnsi="Arial" w:cs="Arial"/>
+              </w:rPr>
+              <w:t xml:space="preserve"> statistiche e iniziato quella delle impostazioni</w:t>
+            </w:r>
+          </w:p>
+        </w:tc>
+      </w:tr>
+    </w:tbl>
+    <w:p>
+      <w:pPr>
+        <w:rPr>
+          <w:rFonts w:ascii="Arial" w:hAnsi="Arial" w:cs="Arial"/>
+        </w:rPr>
+      </w:pPr>
+    </w:p>
+    <w:tbl>
+      <w:tblPr>
+        <w:tblStyle w:val="Grigliatabella"/>
+        <w:tblW w:w="0" w:type="auto"/>
+        <w:tblInd w:w="-5" w:type="dxa"/>
+        <w:tblLook w:val="04A0" w:firstRow="1" w:lastRow="0" w:firstColumn="1" w:lastColumn="0" w:noHBand="0" w:noVBand="1"/>
+      </w:tblPr>
+      <w:tblGrid>
+        <w:gridCol w:w="1276"/>
+        <w:gridCol w:w="8357"/>
+      </w:tblGrid>
+      <w:tr>
+        <w:tc>
+          <w:tcPr>
+            <w:tcW w:w="9628" w:type="dxa"/>
+            <w:gridSpan w:val="2"/>
+            <w:shd w:val="clear" w:color="auto" w:fill="D9D9D9" w:themeFill="background1" w:themeFillShade="D9"/>
+          </w:tcPr>
+          <w:p>
+            <w:pPr>
+              <w:rPr>
+                <w:rFonts w:ascii="Arial" w:hAnsi="Arial" w:cs="Arial"/>
+              </w:rPr>
+            </w:pPr>
+            <w:r>
+              <w:rPr>
+                <w:rFonts w:ascii="Arial" w:hAnsi="Arial" w:cs="Arial"/>
+              </w:rPr>
+              <w:t>Problemi riscontrati e soluzioni adottate</w:t>
+            </w:r>
+          </w:p>
+        </w:tc>
+      </w:tr>
+      <w:tr>
+        <w:tc>
+          <w:tcPr>
+            <w:tcW w:w="1276" w:type="dxa"/>
+          </w:tcPr>
+          <w:p>
+            <w:pPr>
+              <w:rPr>
+                <w:rFonts w:ascii="Arial" w:hAnsi="Arial" w:cs="Arial"/>
+              </w:rPr>
+            </w:pPr>
+            <w:r>
+              <w:rPr>
+                <w:rFonts w:ascii="Arial" w:hAnsi="Arial" w:cs="Arial"/>
+              </w:rPr>
+              <w:t>Riley</w:t>
+            </w:r>
+          </w:p>
+        </w:tc>
+        <w:tc>
+          <w:tcPr>
+            <w:tcW w:w="8357" w:type="dxa"/>
+          </w:tcPr>
+          <w:p>
+            <w:pPr>
+              <w:rPr>
+                <w:rFonts w:ascii="Arial" w:hAnsi="Arial" w:cs="Arial"/>
+              </w:rPr>
+            </w:pPr>
+            <w:r>
+              <w:rPr>
+                <w:rFonts w:ascii="Arial" w:hAnsi="Arial" w:cs="Arial"/>
+              </w:rPr>
+              <w:t xml:space="preserve">Problemi di merge, risolto tramite una configurazione di un tool di </w:t>
+            </w:r>
+            <w:proofErr w:type="spellStart"/>
+            <w:r>
+              <w:rPr>
+                <w:rFonts w:ascii="Arial" w:hAnsi="Arial" w:cs="Arial"/>
+              </w:rPr>
+              <w:t>unity</w:t>
+            </w:r>
+            <w:proofErr w:type="spellEnd"/>
+            <w:r>
+              <w:rPr>
+                <w:rFonts w:ascii="Arial" w:hAnsi="Arial" w:cs="Arial"/>
+              </w:rPr>
+              <w:t xml:space="preserve"> che permette di risolvere automaticamente i conflitti, è stato fatto una configurazione che fa avvia un file .</w:t>
+            </w:r>
+            <w:proofErr w:type="spellStart"/>
+            <w:r>
+              <w:rPr>
+                <w:rFonts w:ascii="Arial" w:hAnsi="Arial" w:cs="Arial"/>
+              </w:rPr>
+              <w:t>cmd</w:t>
+            </w:r>
+            <w:proofErr w:type="spellEnd"/>
+            <w:r>
+              <w:rPr>
+                <w:rFonts w:ascii="Arial" w:hAnsi="Arial" w:cs="Arial"/>
+              </w:rPr>
+              <w:t xml:space="preserve"> sotto la cartella tools questo piccolo script prende i file con conflitti rilevati da </w:t>
+            </w:r>
+            <w:proofErr w:type="spellStart"/>
+            <w:r>
+              <w:rPr>
+                <w:rFonts w:ascii="Arial" w:hAnsi="Arial" w:cs="Arial"/>
+              </w:rPr>
+              <w:t>git</w:t>
+            </w:r>
+            <w:proofErr w:type="spellEnd"/>
+            <w:r>
+              <w:rPr>
+                <w:rFonts w:ascii="Arial" w:hAnsi="Arial" w:cs="Arial"/>
+              </w:rPr>
+              <w:t xml:space="preserve"> e li traduce per </w:t>
+            </w:r>
+            <w:proofErr w:type="spellStart"/>
+            <w:r>
+              <w:rPr>
+                <w:rFonts w:ascii="Arial" w:hAnsi="Arial" w:cs="Arial"/>
+              </w:rPr>
+              <w:t>unityyalmmerge</w:t>
+            </w:r>
+            <w:proofErr w:type="spellEnd"/>
+            <w:r>
+              <w:rPr>
+                <w:rFonts w:ascii="Arial" w:hAnsi="Arial" w:cs="Arial"/>
+              </w:rPr>
+              <w:t xml:space="preserve"> facendo in modo che una volta usato il comando </w:t>
+            </w:r>
+            <w:proofErr w:type="spellStart"/>
+            <w:r>
+              <w:rPr>
+                <w:rFonts w:ascii="Arial" w:hAnsi="Arial" w:cs="Arial"/>
+              </w:rPr>
+              <w:t>git</w:t>
+            </w:r>
+            <w:proofErr w:type="spellEnd"/>
+            <w:r>
+              <w:rPr>
+                <w:rFonts w:ascii="Arial" w:hAnsi="Arial" w:cs="Arial"/>
+              </w:rPr>
+              <w:t xml:space="preserve"> pull non risultino più errori.</w:t>
+            </w:r>
+            <w:r>
+              <w:rPr>
+                <w:rFonts w:ascii="Arial" w:hAnsi="Arial" w:cs="Arial"/>
+              </w:rPr>
+              <w:t xml:space="preserve"> </w:t>
+            </w:r>
+            <w:proofErr w:type="spellStart"/>
+            <w:r>
+              <w:rPr>
+                <w:rFonts w:ascii="Arial" w:hAnsi="Arial" w:cs="Arial"/>
+              </w:rPr>
+              <w:t>Chatgpt</w:t>
+            </w:r>
+            <w:proofErr w:type="spellEnd"/>
+            <w:r>
+              <w:rPr>
+                <w:rFonts w:ascii="Arial" w:hAnsi="Arial" w:cs="Arial"/>
+              </w:rPr>
+              <w:t xml:space="preserve"> mi ha supportato nella risoluzione di questo problema</w:t>
+            </w:r>
+          </w:p>
+        </w:tc>
+      </w:tr>
+      <w:tr>
+        <w:tc>
+          <w:tcPr>
+            <w:tcW w:w="1276" w:type="dxa"/>
+          </w:tcPr>
+          <w:p>
+            <w:pPr>
+              <w:rPr>
+                <w:rFonts w:ascii="Arial" w:hAnsi="Arial" w:cs="Arial"/>
+              </w:rPr>
+            </w:pPr>
+            <w:r>
+              <w:rPr>
+                <w:rFonts w:ascii="Arial" w:hAnsi="Arial" w:cs="Arial"/>
+              </w:rPr>
+              <w:t>Bryan</w:t>
+            </w:r>
+          </w:p>
+        </w:tc>
+        <w:tc>
+          <w:tcPr>
+            <w:tcW w:w="8357" w:type="dxa"/>
+          </w:tcPr>
+          <w:p>
+            <w:pPr>
+              <w:rPr>
+                <w:rFonts w:ascii="Arial" w:hAnsi="Arial" w:cs="Arial"/>
+              </w:rPr>
+            </w:pPr>
+            <w:r>
+              <w:rPr>
+                <w:rFonts w:ascii="Arial" w:hAnsi="Arial" w:cs="Arial"/>
+              </w:rPr>
+              <w:t>-</w:t>
+            </w:r>
+          </w:p>
+        </w:tc>
+      </w:tr>
+    </w:tbl>
+    <w:p>
+      <w:pPr>
+        <w:rPr>
+          <w:rFonts w:ascii="Arial" w:hAnsi="Arial" w:cs="Arial"/>
+        </w:rPr>
+      </w:pPr>
+    </w:p>
+    <w:tbl>
+      <w:tblPr>
+        <w:tblStyle w:val="Grigliatabella"/>
+        <w:tblW w:w="0" w:type="auto"/>
+        <w:tblLook w:val="04A0" w:firstRow="1" w:lastRow="0" w:firstColumn="1" w:lastColumn="0" w:noHBand="0" w:noVBand="1"/>
+      </w:tblPr>
+      <w:tblGrid>
+        <w:gridCol w:w="9628"/>
+      </w:tblGrid>
+      <w:tr>
+        <w:tc>
+          <w:tcPr>
+            <w:tcW w:w="9854" w:type="dxa"/>
+            <w:shd w:val="clear" w:color="auto" w:fill="D9D9D9" w:themeFill="background1" w:themeFillShade="D9"/>
+          </w:tcPr>
+          <w:p>
+            <w:pPr>
+              <w:rPr>
+                <w:rFonts w:ascii="Arial" w:hAnsi="Arial" w:cs="Arial"/>
+              </w:rPr>
+            </w:pPr>
+            <w:r>
+              <w:rPr>
+                <w:rFonts w:ascii="Arial" w:hAnsi="Arial" w:cs="Arial"/>
+              </w:rPr>
+              <w:t>Punto della situazione rispetto alla pianificazione</w:t>
+            </w:r>
+          </w:p>
+        </w:tc>
+      </w:tr>
+      <w:tr>
+        <w:tc>
+          <w:tcPr>
+            <w:tcW w:w="9854" w:type="dxa"/>
+          </w:tcPr>
+          <w:p>
+            <w:pPr>
+              <w:rPr>
+                <w:rFonts w:ascii="Arial" w:hAnsi="Arial" w:cs="Arial"/>
+              </w:rPr>
+            </w:pPr>
+            <w:r>
+              <w:rPr>
+                <w:rFonts w:ascii="Arial" w:hAnsi="Arial" w:cs="Arial"/>
+              </w:rPr>
+              <w:t xml:space="preserve">La </w:t>
+            </w:r>
+            <w:proofErr w:type="spellStart"/>
+            <w:r>
+              <w:rPr>
+                <w:rFonts w:ascii="Arial" w:hAnsi="Arial" w:cs="Arial"/>
+              </w:rPr>
+              <w:t>ui</w:t>
+            </w:r>
+            <w:proofErr w:type="spellEnd"/>
+            <w:r>
+              <w:rPr>
+                <w:rFonts w:ascii="Arial" w:hAnsi="Arial" w:cs="Arial"/>
+              </w:rPr>
+              <w:t xml:space="preserve"> delle statistiche è completa ma mancano alcune parti dello script, di conseguenza abbiamo un ritardo generale.</w:t>
+            </w:r>
+          </w:p>
+        </w:tc>
+      </w:tr>
+    </w:tbl>
+    <w:p>
+      <w:pPr>
+        <w:rPr>
+          <w:rFonts w:ascii="Arial" w:hAnsi="Arial" w:cs="Arial"/>
+        </w:rPr>
+      </w:pPr>
+    </w:p>
+    <w:tbl>
+      <w:tblPr>
+        <w:tblStyle w:val="Grigliatabella"/>
+        <w:tblW w:w="0" w:type="auto"/>
+        <w:tblLook w:val="04A0" w:firstRow="1" w:lastRow="0" w:firstColumn="1" w:lastColumn="0" w:noHBand="0" w:noVBand="1"/>
+      </w:tblPr>
+      <w:tblGrid>
+        <w:gridCol w:w="9628"/>
+      </w:tblGrid>
+      <w:tr>
+        <w:tc>
+          <w:tcPr>
+            <w:tcW w:w="9854" w:type="dxa"/>
+            <w:shd w:val="clear" w:color="auto" w:fill="D9D9D9" w:themeFill="background1" w:themeFillShade="D9"/>
+          </w:tcPr>
+          <w:p>
+            <w:pPr>
+              <w:rPr>
+                <w:rFonts w:ascii="Arial" w:hAnsi="Arial" w:cs="Arial"/>
+              </w:rPr>
+            </w:pPr>
+            <w:r>
+              <w:rPr>
+                <w:rFonts w:ascii="Arial" w:hAnsi="Arial" w:cs="Arial"/>
+              </w:rPr>
+              <w:t>Programma di massima per la prossima giornata di lavoro</w:t>
+            </w:r>
+          </w:p>
+        </w:tc>
+      </w:tr>
+      <w:tr>
+        <w:tc>
+          <w:tcPr>
+            <w:tcW w:w="9854" w:type="dxa"/>
+          </w:tcPr>
+          <w:p>
+            <w:pPr>
+              <w:rPr>
+                <w:rFonts w:ascii="Arial" w:hAnsi="Arial" w:cs="Arial"/>
+              </w:rPr>
+            </w:pPr>
+            <w:r>
+              <w:rPr>
+                <w:rFonts w:ascii="Arial" w:hAnsi="Arial" w:cs="Arial"/>
+              </w:rPr>
+              <w:t xml:space="preserve">Terminare script statistiche, continuare </w:t>
+            </w:r>
+            <w:proofErr w:type="spellStart"/>
+            <w:r>
+              <w:rPr>
+                <w:rFonts w:ascii="Arial" w:hAnsi="Arial" w:cs="Arial"/>
+              </w:rPr>
+              <w:t>ui</w:t>
+            </w:r>
+            <w:proofErr w:type="spellEnd"/>
+            <w:r>
+              <w:rPr>
+                <w:rFonts w:ascii="Arial" w:hAnsi="Arial" w:cs="Arial"/>
+              </w:rPr>
+              <w:t xml:space="preserve"> impostazioni</w:t>
+            </w:r>
+          </w:p>
+        </w:tc>
+      </w:tr>
+    </w:tbl>
+    <w:p>
+      <w:pPr>
+        <w:rPr>
+          <w:rFonts w:ascii="Arial" w:hAnsi="Arial" w:cs="Arial"/>
+        </w:rPr>
+      </w:pPr>
+    </w:p>
+    <w:p>
+      <w:pPr>
+        <w:pStyle w:val="Titolo1"/>
+      </w:pPr>
+      <w:r>
+        <w:t>Agile - Resoconto</w:t>
+      </w:r>
+    </w:p>
+    <w:tbl>
+      <w:tblPr>
+        <w:tblStyle w:val="Grigliatabella"/>
+        <w:tblW w:w="0" w:type="auto"/>
+        <w:tblLook w:val="04A0" w:firstRow="1" w:lastRow="0" w:firstColumn="1" w:lastColumn="0" w:noHBand="0" w:noVBand="1"/>
+      </w:tblPr>
+      <w:tblGrid>
+        <w:gridCol w:w="9628"/>
+      </w:tblGrid>
+      <w:tr>
+        <w:tc>
+          <w:tcPr>
+            <w:tcW w:w="9628" w:type="dxa"/>
+            <w:tcBorders>
+              <w:top w:val="single" w:sz="4" w:space="0" w:color="auto"/>
+              <w:left w:val="single" w:sz="4" w:space="0" w:color="auto"/>
+              <w:bottom w:val="single" w:sz="4" w:space="0" w:color="auto"/>
+              <w:right w:val="single" w:sz="4" w:space="0" w:color="auto"/>
+            </w:tcBorders>
+            <w:shd w:val="clear" w:color="auto" w:fill="D9D9D9" w:themeFill="background1" w:themeFillShade="D9"/>
+            <w:hideMark/>
+          </w:tcPr>
+          <w:p>
+            <w:pPr>
+              <w:spacing w:after="200" w:line="276" w:lineRule="auto"/>
+              <w:rPr>
+                <w:rFonts w:ascii="Arial" w:hAnsi="Arial" w:cs="Arial"/>
+              </w:rPr>
+            </w:pPr>
+            <w:proofErr w:type="spellStart"/>
+            <w:r>
+              <w:rPr>
+                <w:rFonts w:ascii="Arial" w:hAnsi="Arial" w:cs="Arial"/>
+              </w:rPr>
+              <w:t>Daily</w:t>
+            </w:r>
+            <w:proofErr w:type="spellEnd"/>
+            <w:r>
+              <w:rPr>
+                <w:rFonts w:ascii="Arial" w:hAnsi="Arial" w:cs="Arial"/>
+              </w:rPr>
+              <w:t xml:space="preserve"> </w:t>
+            </w:r>
+            <w:proofErr w:type="spellStart"/>
+            <w:r>
+              <w:rPr>
+                <w:rFonts w:ascii="Arial" w:hAnsi="Arial" w:cs="Arial"/>
+              </w:rPr>
+              <w:t>Scrum</w:t>
+            </w:r>
+            <w:proofErr w:type="spellEnd"/>
+          </w:p>
+        </w:tc>
+      </w:tr>
+      <w:tr>
+        <w:tc>
+          <w:tcPr>
+            <w:tcW w:w="9628" w:type="dxa"/>
+            <w:tcBorders>
+              <w:top w:val="single" w:sz="4" w:space="0" w:color="auto"/>
+              <w:left w:val="single" w:sz="4" w:space="0" w:color="auto"/>
+              <w:bottom w:val="single" w:sz="4" w:space="0" w:color="auto"/>
+              <w:right w:val="single" w:sz="4" w:space="0" w:color="auto"/>
+            </w:tcBorders>
+            <w:hideMark/>
+          </w:tcPr>
+          <w:p>
+            <w:pPr>
+              <w:spacing w:after="200" w:line="276" w:lineRule="auto"/>
+              <w:rPr>
+                <w:rFonts w:ascii="Arial" w:hAnsi="Arial" w:cs="Arial"/>
+              </w:rPr>
+            </w:pPr>
+          </w:p>
+        </w:tc>
+      </w:tr>
+      <w:tr>
+        <w:tc>
+          <w:tcPr>
+            <w:tcW w:w="9628" w:type="dxa"/>
+            <w:tcBorders>
+              <w:top w:val="single" w:sz="4" w:space="0" w:color="auto"/>
+              <w:left w:val="single" w:sz="4" w:space="0" w:color="auto"/>
+              <w:bottom w:val="single" w:sz="4" w:space="0" w:color="auto"/>
+              <w:right w:val="single" w:sz="4" w:space="0" w:color="auto"/>
+            </w:tcBorders>
+          </w:tcPr>
+          <w:p>
+            <w:pPr>
+              <w:spacing w:after="200" w:line="276" w:lineRule="auto"/>
+              <w:rPr>
+                <w:rFonts w:ascii="Arial" w:hAnsi="Arial" w:cs="Arial"/>
+              </w:rPr>
+            </w:pPr>
+            <w:r>
+              <w:rPr>
+                <w:rFonts w:ascii="Arial" w:hAnsi="Arial" w:cs="Arial"/>
+              </w:rPr>
+              <w:t xml:space="preserve">Riley deve risolvere un problema di merge riscontrato al tentativo di pull e poi continuare con lo script delle statistiche, invece Bryan deve fine la </w:t>
+            </w:r>
+            <w:proofErr w:type="spellStart"/>
+            <w:r>
+              <w:rPr>
+                <w:rFonts w:ascii="Arial" w:hAnsi="Arial" w:cs="Arial"/>
+              </w:rPr>
+              <w:t>ui</w:t>
+            </w:r>
+            <w:proofErr w:type="spellEnd"/>
+            <w:r>
+              <w:rPr>
+                <w:rFonts w:ascii="Arial" w:hAnsi="Arial" w:cs="Arial"/>
+              </w:rPr>
+              <w:t xml:space="preserve"> delle statistiche e preferibilmente iniziare con le impostazioni.</w:t>
+            </w:r>
+          </w:p>
+        </w:tc>
+      </w:tr>
+    </w:tbl>
+    <w:p>
+      <w:pPr>
+        <w:rPr>
+          <w:rFonts w:ascii="Arial" w:hAnsi="Arial" w:cs="Arial"/>
+        </w:rPr>
+      </w:pPr>
+    </w:p>
+    <w:tbl>
+      <w:tblPr>
+        <w:tblStyle w:val="Grigliatabella"/>
+        <w:tblW w:w="0" w:type="auto"/>
+        <w:tblLook w:val="04A0" w:firstRow="1" w:lastRow="0" w:firstColumn="1" w:lastColumn="0" w:noHBand="0" w:noVBand="1"/>
+      </w:tblPr>
+      <w:tblGrid>
+        <w:gridCol w:w="9628"/>
+      </w:tblGrid>
+      <w:tr>
+        <w:tc>
+          <w:tcPr>
+            <w:tcW w:w="9854" w:type="dxa"/>
+            <w:tcBorders>
+              <w:top w:val="single" w:sz="4" w:space="0" w:color="auto"/>
+              <w:left w:val="single" w:sz="4" w:space="0" w:color="auto"/>
+              <w:bottom w:val="single" w:sz="4" w:space="0" w:color="auto"/>
+              <w:right w:val="single" w:sz="4" w:space="0" w:color="auto"/>
+            </w:tcBorders>
+            <w:shd w:val="clear" w:color="auto" w:fill="D9D9D9" w:themeFill="background1" w:themeFillShade="D9"/>
+            <w:hideMark/>
+          </w:tcPr>
+          <w:p>
+            <w:pPr>
+              <w:spacing w:after="200" w:line="276" w:lineRule="auto"/>
+              <w:rPr>
+                <w:rFonts w:ascii="Arial" w:hAnsi="Arial" w:cs="Arial"/>
+              </w:rPr>
+            </w:pPr>
+            <w:r>
+              <w:rPr>
+                <w:rFonts w:ascii="Arial" w:hAnsi="Arial" w:cs="Arial"/>
+              </w:rPr>
+              <w:t>Sprint Planning</w:t>
+            </w:r>
+          </w:p>
+        </w:tc>
+      </w:tr>
+      <w:tr>
+        <w:tc>
+          <w:tcPr>
+            <w:tcW w:w="9854" w:type="dxa"/>
+            <w:tcBorders>
+              <w:top w:val="single" w:sz="4" w:space="0" w:color="auto"/>
+              <w:left w:val="single" w:sz="4" w:space="0" w:color="auto"/>
+              <w:bottom w:val="single" w:sz="4" w:space="0" w:color="auto"/>
+              <w:right w:val="single" w:sz="4" w:space="0" w:color="auto"/>
+            </w:tcBorders>
+          </w:tcPr>
+          <w:p>
+            <w:pPr>
+              <w:spacing w:after="200" w:line="276" w:lineRule="auto"/>
+              <w:rPr>
+                <w:rFonts w:ascii="Arial" w:hAnsi="Arial" w:cs="Arial"/>
+              </w:rPr>
+            </w:pPr>
+          </w:p>
+        </w:tc>
+      </w:tr>
+    </w:tbl>
+    <w:p>
+      <w:pPr>
+        <w:rPr>
+          <w:rFonts w:ascii="Arial" w:hAnsi="Arial" w:cs="Arial"/>
+        </w:rPr>
+      </w:pPr>
+    </w:p>
+    <w:tbl>
+      <w:tblPr>
+        <w:tblStyle w:val="Grigliatabella"/>
+        <w:tblW w:w="0" w:type="auto"/>
+        <w:tblLook w:val="04A0" w:firstRow="1" w:lastRow="0" w:firstColumn="1" w:lastColumn="0" w:noHBand="0" w:noVBand="1"/>
+      </w:tblPr>
+      <w:tblGrid>
+        <w:gridCol w:w="9628"/>
+      </w:tblGrid>
+      <w:tr>
+        <w:tc>
+          <w:tcPr>
+            <w:tcW w:w="9854" w:type="dxa"/>
+            <w:tcBorders>
+              <w:top w:val="single" w:sz="4" w:space="0" w:color="auto"/>
+              <w:left w:val="single" w:sz="4" w:space="0" w:color="auto"/>
+              <w:bottom w:val="single" w:sz="4" w:space="0" w:color="auto"/>
+              <w:right w:val="single" w:sz="4" w:space="0" w:color="auto"/>
+            </w:tcBorders>
+            <w:shd w:val="clear" w:color="auto" w:fill="D9D9D9" w:themeFill="background1" w:themeFillShade="D9"/>
+            <w:hideMark/>
+          </w:tcPr>
+          <w:p>
+            <w:pPr>
+              <w:spacing w:after="200" w:line="276" w:lineRule="auto"/>
+              <w:rPr>
+                <w:rFonts w:ascii="Arial" w:hAnsi="Arial" w:cs="Arial"/>
+              </w:rPr>
+            </w:pPr>
+            <w:r>
+              <w:rPr>
+                <w:rFonts w:ascii="Arial" w:hAnsi="Arial" w:cs="Arial"/>
+              </w:rPr>
+              <w:t>Sprint Review</w:t>
+            </w:r>
+          </w:p>
+        </w:tc>
+      </w:tr>
+      <w:tr>
+        <w:tc>
+          <w:tcPr>
+            <w:tcW w:w="9854" w:type="dxa"/>
+            <w:tcBorders>
+              <w:top w:val="single" w:sz="4" w:space="0" w:color="auto"/>
+              <w:left w:val="single" w:sz="4" w:space="0" w:color="auto"/>
+              <w:bottom w:val="single" w:sz="4" w:space="0" w:color="auto"/>
+              <w:right w:val="single" w:sz="4" w:space="0" w:color="auto"/>
+            </w:tcBorders>
+          </w:tcPr>
+          <w:p>
+            <w:pPr>
+              <w:spacing w:after="200" w:line="276" w:lineRule="auto"/>
+              <w:rPr>
+                <w:rFonts w:ascii="Arial" w:hAnsi="Arial" w:cs="Arial"/>
+              </w:rPr>
+            </w:pPr>
+          </w:p>
+        </w:tc>
+      </w:tr>
+    </w:tbl>
+    <w:p>
+      <w:pPr>
+        <w:rPr>
+          <w:rFonts w:ascii="Arial" w:hAnsi="Arial" w:cs="Arial"/>
+        </w:rPr>
+      </w:pPr>
+    </w:p>
+    <w:tbl>
+      <w:tblPr>
+        <w:tblStyle w:val="Grigliatabella"/>
+        <w:tblW w:w="0" w:type="auto"/>
+        <w:tblLook w:val="04A0" w:firstRow="1" w:lastRow="0" w:firstColumn="1" w:lastColumn="0" w:noHBand="0" w:noVBand="1"/>
+      </w:tblPr>
+      <w:tblGrid>
+        <w:gridCol w:w="9628"/>
+      </w:tblGrid>
+      <w:tr>
+        <w:tc>
+          <w:tcPr>
+            <w:tcW w:w="9854" w:type="dxa"/>
+            <w:tcBorders>
+              <w:top w:val="single" w:sz="4" w:space="0" w:color="auto"/>
+              <w:left w:val="single" w:sz="4" w:space="0" w:color="auto"/>
+              <w:bottom w:val="single" w:sz="4" w:space="0" w:color="auto"/>
+              <w:right w:val="single" w:sz="4" w:space="0" w:color="auto"/>
+            </w:tcBorders>
+            <w:shd w:val="clear" w:color="auto" w:fill="D9D9D9" w:themeFill="background1" w:themeFillShade="D9"/>
+            <w:hideMark/>
+          </w:tcPr>
+          <w:p>
+            <w:pPr>
+              <w:spacing w:after="200" w:line="276" w:lineRule="auto"/>
+              <w:rPr>
+                <w:rFonts w:ascii="Arial" w:hAnsi="Arial" w:cs="Arial"/>
+              </w:rPr>
+            </w:pPr>
+            <w:r>
+              <w:rPr>
+                <w:rFonts w:ascii="Arial" w:hAnsi="Arial" w:cs="Arial"/>
+              </w:rPr>
+              <w:t xml:space="preserve">Sprint </w:t>
+            </w:r>
+            <w:proofErr w:type="spellStart"/>
+            <w:r>
+              <w:rPr>
+                <w:rFonts w:ascii="Arial" w:hAnsi="Arial" w:cs="Arial"/>
+              </w:rPr>
+              <w:t>Retrospective</w:t>
+            </w:r>
+            <w:proofErr w:type="spellEnd"/>
+          </w:p>
+        </w:tc>
+      </w:tr>
+      <w:tr>
+        <w:tc>
+          <w:tcPr>
+            <w:tcW w:w="9854" w:type="dxa"/>
+            <w:tcBorders>
+              <w:top w:val="single" w:sz="4" w:space="0" w:color="auto"/>
+              <w:left w:val="single" w:sz="4" w:space="0" w:color="auto"/>
+              <w:bottom w:val="single" w:sz="4" w:space="0" w:color="auto"/>
+              <w:right w:val="single" w:sz="4" w:space="0" w:color="auto"/>
+            </w:tcBorders>
+          </w:tcPr>
+          <w:p>
+            <w:pPr>
+              <w:spacing w:after="200" w:line="276" w:lineRule="auto"/>
+              <w:rPr>
+                <w:rFonts w:ascii="Arial" w:hAnsi="Arial" w:cs="Arial"/>
+              </w:rPr>
+            </w:pPr>
+          </w:p>
+        </w:tc>
+      </w:tr>
+    </w:tbl>
+    <w:p>
+      <w:pPr>
+        <w:rPr>
+          <w:rFonts w:ascii="Arial" w:hAnsi="Arial" w:cs="Arial"/>
+        </w:rPr>
+      </w:pPr>
+    </w:p>
+    <w:p>
+      <w:pPr>
+        <w:rPr>
+          <w:rFonts w:ascii="Arial" w:hAnsi="Arial" w:cs="Arial"/>
+        </w:rPr>
+      </w:pPr>
+      <w:r>
+        <w:rPr>
+          <w:rFonts w:ascii="Arial" w:hAnsi="Arial" w:cs="Arial"/>
+        </w:rPr>
+        <w:br w:type="page"/>
+      </w:r>
+    </w:p>
+    <w:p>
+      <w:pPr>
+        <w:pStyle w:val="Titolo2"/>
+        <w:pBdr>
+          <w:bottom w:val="single" w:sz="4" w:space="1" w:color="auto"/>
+        </w:pBdr>
+      </w:pPr>
+      <w:r>
+        <w:lastRenderedPageBreak/>
+        <w:t>Utilizzo Intelligenza Artificiale</w:t>
+      </w:r>
+      <w:r>
+        <w:t xml:space="preserve"> nella giornata</w:t>
+      </w:r>
+    </w:p>
+    <w:p>
+      <w:pPr>
+        <w:pStyle w:val="Nessunaspaziatura"/>
+        <w:rPr>
+          <w:rFonts w:ascii="Arial" w:hAnsi="Arial" w:cs="Arial"/>
+          <w:b/>
+          <w:bCs/>
+        </w:rPr>
+      </w:pPr>
+    </w:p>
+    <w:p>
+      <w:pPr>
+        <w:pStyle w:val="Nessunaspaziatura"/>
+        <w:rPr>
+          <w:rFonts w:ascii="Arial" w:hAnsi="Arial" w:cs="Arial"/>
+        </w:rPr>
+      </w:pPr>
+      <w:sdt>
+        <w:sdtPr>
+          <w:rPr>
+            <w:rFonts w:ascii="Segoe UI Symbol" w:hAnsi="Segoe UI Symbol" w:cs="Segoe UI Symbol"/>
+          </w:rPr>
+          <w:id w:val="-1436130562"/>
+          <w14:checkbox>
+            <w14:checked w14:val="0"/>
+            <w14:checkedState w14:val="2612" w14:font="MS Gothic"/>
+            <w14:uncheckedState w14:val="2610" w14:font="MS Gothic"/>
+          </w14:checkbox>
+        </w:sdtPr>
+        <w:sdtContent>
+          <w:r>
+            <w:rPr>
+              <w:rFonts w:ascii="MS Gothic" w:eastAsia="MS Gothic" w:hAnsi="MS Gothic" w:cs="Segoe UI Symbol" w:hint="eastAsia"/>
+            </w:rPr>
+            <w:t>☐</w:t>
+          </w:r>
+        </w:sdtContent>
+      </w:sdt>
+      <w:r>
+        <w:rPr>
+          <w:rFonts w:ascii="Arial" w:hAnsi="Arial" w:cs="Arial"/>
+        </w:rPr>
+        <w:t xml:space="preserve"> Nessuno</w:t>
+      </w:r>
+      <w:r>
+        <w:br/>
+      </w:r>
+      <w:sdt>
+        <w:sdtPr>
+          <w:rPr>
+            <w:rFonts w:ascii="Segoe UI Symbol" w:hAnsi="Segoe UI Symbol" w:cs="Segoe UI Symbol"/>
+          </w:rPr>
+          <w:id w:val="-177426071"/>
+          <w14:checkbox>
+            <w14:checked w14:val="0"/>
+            <w14:checkedState w14:val="2612" w14:font="MS Gothic"/>
+            <w14:uncheckedState w14:val="2610" w14:font="MS Gothic"/>
+          </w14:checkbox>
+        </w:sdtPr>
+        <w:sdtContent>
+          <w:r>
+            <w:rPr>
+              <w:rFonts w:ascii="MS Gothic" w:eastAsia="MS Gothic" w:hAnsi="MS Gothic" w:cs="Segoe UI Symbol" w:hint="eastAsia"/>
+            </w:rPr>
+            <w:t>☐</w:t>
+          </w:r>
+        </w:sdtContent>
+      </w:sdt>
+      <w:r>
+        <w:rPr>
+          <w:rFonts w:ascii="Arial" w:hAnsi="Arial" w:cs="Arial"/>
+        </w:rPr>
+        <w:t xml:space="preserve"> Occasionale</w:t>
+      </w:r>
+      <w:r>
+        <w:br/>
+      </w:r>
+      <w:sdt>
+        <w:sdtPr>
+          <w:rPr>
+            <w:rFonts w:ascii="Segoe UI Symbol" w:hAnsi="Segoe UI Symbol" w:cs="Segoe UI Symbol"/>
+          </w:rPr>
+          <w:id w:val="2145618481"/>
+          <w14:checkbox>
+            <w14:checked w14:val="1"/>
+            <w14:checkedState w14:val="2612" w14:font="MS Gothic"/>
+            <w14:uncheckedState w14:val="2610" w14:font="MS Gothic"/>
+          </w14:checkbox>
+        </w:sdtPr>
+        <w:sdtContent>
+          <w:r>
+            <w:rPr>
+              <w:rFonts w:ascii="MS Gothic" w:eastAsia="MS Gothic" w:hAnsi="MS Gothic" w:cs="Segoe UI Symbol" w:hint="eastAsia"/>
+            </w:rPr>
+            <w:t>☒</w:t>
+          </w:r>
+        </w:sdtContent>
+      </w:sdt>
+      <w:r>
+        <w:rPr>
+          <w:rFonts w:ascii="Arial" w:hAnsi="Arial" w:cs="Arial"/>
+        </w:rPr>
+        <w:t xml:space="preserve"> Frequente</w:t>
+      </w:r>
+    </w:p>
+    <w:p>
+      <w:pPr>
+        <w:pStyle w:val="Nessunaspaziatura"/>
+        <w:rPr>
+          <w:rFonts w:ascii="Arial" w:hAnsi="Arial" w:cs="Arial"/>
+        </w:rPr>
+      </w:pPr>
+    </w:p>
+    <w:p>
+      <w:pPr>
+        <w:pStyle w:val="Nessunaspaziatura"/>
+        <w:spacing w:line="276" w:lineRule="auto"/>
+        <w:rPr>
+          <w:rFonts w:ascii="Arial" w:hAnsi="Arial" w:cs="Arial"/>
+        </w:rPr>
+      </w:pPr>
+      <w:r>
+        <w:rPr>
+          <w:rFonts w:ascii="Arial" w:hAnsi="Arial" w:cs="Arial"/>
+          <w:b/>
+          <w:bCs/>
+        </w:rPr>
+        <w:t>Strumento/i utilizzato/i</w:t>
+      </w:r>
+      <w:r>
+        <w:rPr>
+          <w:rFonts w:ascii="Arial" w:hAnsi="Arial" w:cs="Arial"/>
+          <w:b/>
+          <w:bCs/>
+        </w:rPr>
+        <w:t xml:space="preserve"> </w:t>
+      </w:r>
+      <w:r>
+        <w:rPr>
+          <w:rFonts w:ascii="Arial" w:hAnsi="Arial" w:cs="Arial"/>
+        </w:rPr>
+        <w:t>(es. ChatGPT)</w:t>
+      </w:r>
+      <w:r>
+        <w:rPr>
+          <w:rFonts w:ascii="Arial" w:hAnsi="Arial" w:cs="Arial"/>
+        </w:rPr>
+        <w:t xml:space="preserve">: </w:t>
+      </w:r>
+      <w:sdt>
+        <w:sdtPr>
+          <w:rPr>
+            <w:rFonts w:ascii="Arial" w:hAnsi="Arial" w:cs="Arial"/>
+          </w:rPr>
+          <w:id w:val="-412320091"/>
+          <w:placeholder>
+            <w:docPart w:val="2914FE12113848D0B4DB7D5B369B56BC"/>
+          </w:placeholder>
+        </w:sdtPr>
+        <w:sdtContent>
+          <w:r>
+            <w:rPr>
+              <w:rFonts w:ascii="Arial" w:hAnsi="Arial" w:cs="Arial"/>
+            </w:rPr>
+            <w:t>ChatGPT</w:t>
+          </w:r>
+          <w:r>
+            <w:rPr>
+              <w:rFonts w:ascii="Arial" w:hAnsi="Arial" w:cs="Arial"/>
+            </w:rPr>
+            <w:t>, Gemini</w:t>
+          </w:r>
+        </w:sdtContent>
+      </w:sdt>
+    </w:p>
+    <w:p>
+      <w:pPr>
+        <w:pStyle w:val="Nessunaspaziatura"/>
+        <w:rPr>
+          <w:rFonts w:ascii="Arial" w:hAnsi="Arial" w:cs="Arial"/>
+        </w:rPr>
+      </w:pPr>
+    </w:p>
+    <w:p>
+      <w:pPr>
+        <w:pStyle w:val="Nessunaspaziatura"/>
+        <w:rPr>
+          <w:rFonts w:ascii="Arial" w:hAnsi="Arial" w:cs="Arial"/>
+        </w:rPr>
+      </w:pPr>
+      <w:r>
+        <w:rPr>
+          <w:rFonts w:ascii="Arial" w:hAnsi="Arial" w:cs="Arial"/>
+          <w:b/>
+          <w:bCs/>
+        </w:rPr>
+        <w:t>Per cosa l’ho usata oggi</w:t>
+      </w:r>
+      <w:r>
+        <w:br/>
+      </w:r>
+      <w:sdt>
+        <w:sdtPr>
+          <w:rPr>
+            <w:rFonts w:ascii="Segoe UI Symbol" w:hAnsi="Segoe UI Symbol" w:cs="Segoe UI Symbol"/>
+          </w:rPr>
+          <w:id w:val="-551696030"/>
+          <w14:checkbox>
+            <w14:checked w14:val="1"/>
+            <w14:checkedState w14:val="2612" w14:font="MS Gothic"/>
+            <w14:uncheckedState w14:val="2610" w14:font="MS Gothic"/>
+          </w14:checkbox>
+        </w:sdtPr>
+        <w:sdtContent>
+          <w:r>
+            <w:rPr>
+              <w:rFonts w:ascii="MS Gothic" w:eastAsia="MS Gothic" w:hAnsi="MS Gothic" w:cs="Segoe UI Symbol" w:hint="eastAsia"/>
+            </w:rPr>
+            <w:t>☒</w:t>
+          </w:r>
+        </w:sdtContent>
+      </w:sdt>
+      <w:r>
+        <w:rPr>
+          <w:rFonts w:ascii="Arial" w:hAnsi="Arial" w:cs="Arial"/>
+        </w:rPr>
+        <w:t xml:space="preserve"> Chiarire concetti</w:t>
+      </w:r>
+      <w:r>
+        <w:br/>
+      </w:r>
+      <w:sdt>
+        <w:sdtPr>
+          <w:rPr>
+            <w:rFonts w:ascii="Segoe UI Symbol" w:hAnsi="Segoe UI Symbol" w:cs="Segoe UI Symbol"/>
+          </w:rPr>
+          <w:id w:val="674230463"/>
+          <w14:checkbox>
+            <w14:checked w14:val="1"/>
+            <w14:checkedState w14:val="2612" w14:font="MS Gothic"/>
+            <w14:uncheckedState w14:val="2610" w14:font="MS Gothic"/>
+          </w14:checkbox>
+        </w:sdtPr>
+        <w:sdtContent>
+          <w:r>
+            <w:rPr>
+              <w:rFonts w:ascii="MS Gothic" w:eastAsia="MS Gothic" w:hAnsi="MS Gothic" w:cs="Segoe UI Symbol" w:hint="eastAsia"/>
+            </w:rPr>
+            <w:t>☒</w:t>
+          </w:r>
+        </w:sdtContent>
+      </w:sdt>
+      <w:r>
+        <w:rPr>
+          <w:rFonts w:ascii="Arial" w:hAnsi="Arial" w:cs="Arial"/>
+        </w:rPr>
+        <w:t xml:space="preserve"> Supporto al codice</w:t>
+      </w:r>
+      <w:r>
+        <w:br/>
+      </w:r>
+      <w:sdt>
+        <w:sdtPr>
+          <w:rPr>
+            <w:rFonts w:ascii="Segoe UI Symbol" w:hAnsi="Segoe UI Symbol" w:cs="Segoe UI Symbol"/>
+          </w:rPr>
+          <w:id w:val="738977732"/>
+          <w14:checkbox>
+            <w14:checked w14:val="1"/>
+            <w14:checkedState w14:val="2612" w14:font="MS Gothic"/>
+            <w14:uncheckedState w14:val="2610" w14:font="MS Gothic"/>
+          </w14:checkbox>
+        </w:sdtPr>
+        <w:sdtContent>
+          <w:r>
+            <w:rPr>
+              <w:rFonts w:ascii="MS Gothic" w:eastAsia="MS Gothic" w:hAnsi="MS Gothic" w:cs="Segoe UI Symbol" w:hint="eastAsia"/>
+            </w:rPr>
+            <w:t>☒</w:t>
+          </w:r>
+        </w:sdtContent>
+      </w:sdt>
+      <w:r>
+        <w:rPr>
+          <w:rFonts w:ascii="Arial" w:hAnsi="Arial" w:cs="Arial"/>
+        </w:rPr>
+        <w:t xml:space="preserve"> Debug</w:t>
+      </w:r>
+      <w:r>
+        <w:br/>
+      </w:r>
+      <w:sdt>
+        <w:sdtPr>
+          <w:rPr>
+            <w:rFonts w:ascii="Segoe UI Symbol" w:hAnsi="Segoe UI Symbol" w:cs="Segoe UI Symbol"/>
+          </w:rPr>
+          <w:id w:val="-1210800522"/>
+          <w14:checkbox>
+            <w14:checked w14:val="0"/>
+            <w14:checkedState w14:val="2612" w14:font="MS Gothic"/>
+            <w14:uncheckedState w14:val="2610" w14:font="MS Gothic"/>
+          </w14:checkbox>
+        </w:sdtPr>
+        <w:sdtContent>
+          <w:r>
+            <w:rPr>
+              <w:rFonts w:ascii="MS Gothic" w:eastAsia="MS Gothic" w:hAnsi="MS Gothic" w:cs="Segoe UI Symbol" w:hint="eastAsia"/>
+            </w:rPr>
+            <w:t>☐</w:t>
+          </w:r>
+        </w:sdtContent>
+      </w:sdt>
+      <w:r>
+        <w:rPr>
+          <w:rFonts w:ascii="Arial" w:hAnsi="Arial" w:cs="Arial"/>
+        </w:rPr>
+        <w:t xml:space="preserve"> Riorganizzare idee / testi</w:t>
+      </w:r>
+      <w:r>
+        <w:br/>
+      </w:r>
+      <w:sdt>
+        <w:sdtPr>
+          <w:rPr>
+            <w:rFonts w:ascii="Segoe UI Symbol" w:hAnsi="Segoe UI Symbol" w:cs="Segoe UI Symbol"/>
+          </w:rPr>
+          <w:id w:val="1822535157"/>
+          <w14:checkbox>
+            <w14:checked w14:val="0"/>
+            <w14:checkedState w14:val="2612" w14:font="MS Gothic"/>
+            <w14:uncheckedState w14:val="2610" w14:font="MS Gothic"/>
+          </w14:checkbox>
+        </w:sdtPr>
+        <w:sdtContent>
+          <w:r>
+            <w:rPr>
+              <w:rFonts w:ascii="MS Gothic" w:eastAsia="MS Gothic" w:hAnsi="MS Gothic" w:cs="Segoe UI Symbol" w:hint="eastAsia"/>
+            </w:rPr>
+            <w:t>☐</w:t>
+          </w:r>
+        </w:sdtContent>
+      </w:sdt>
+      <w:r>
+        <w:rPr>
+          <w:rFonts w:ascii="Arial" w:hAnsi="Arial" w:cs="Arial"/>
+        </w:rPr>
+        <w:t xml:space="preserve"> Altro: …</w:t>
+      </w:r>
+    </w:p>
+    <w:p>
+      <w:pPr>
+        <w:pStyle w:val="Nessunaspaziatura"/>
+        <w:rPr>
+          <w:rFonts w:ascii="Arial" w:hAnsi="Arial" w:cs="Arial"/>
+        </w:rPr>
+      </w:pPr>
+    </w:p>
+    <w:p>
+      <w:pPr>
+        <w:pStyle w:val="Nessunaspaziatura"/>
+        <w:rPr>
+          <w:rFonts w:ascii="Arial" w:hAnsi="Arial" w:cs="Arial"/>
+          <w:b/>
+          <w:bCs/>
+        </w:rPr>
+      </w:pPr>
+      <w:r>
+        <w:rPr>
+          <w:rFonts w:ascii="Arial" w:hAnsi="Arial" w:cs="Arial"/>
+          <w:b/>
+          <w:bCs/>
+        </w:rPr>
+        <w:t>Esempio significativo di utilizzo (UNO SOLO)</w:t>
+      </w:r>
+    </w:p>
+    <w:p>
+      <w:pPr>
+        <w:pStyle w:val="Nessunaspaziatura"/>
+        <w:rPr>
+          <w:rFonts w:ascii="Arial" w:hAnsi="Arial" w:cs="Arial"/>
+        </w:rPr>
+      </w:pPr>
+      <w:r>
+        <w:rPr>
+          <w:rFonts w:ascii="Arial" w:hAnsi="Arial" w:cs="Arial"/>
+        </w:rPr>
+        <w:t xml:space="preserve">Riporta </w:t>
+      </w:r>
+      <w:r>
+        <w:rPr>
+          <w:rFonts w:ascii="Arial" w:hAnsi="Arial" w:cs="Arial"/>
+          <w:i/>
+          <w:iCs/>
+        </w:rPr>
+        <w:t>un</w:t>
+      </w:r>
+      <w:r>
+        <w:rPr>
+          <w:rFonts w:ascii="Arial" w:hAnsi="Arial" w:cs="Arial"/>
+        </w:rPr>
+        <w:t xml:space="preserve"> prompt rilevante oppure descrivilo a parole se ce ne sono stati molti.</w:t>
+      </w:r>
+    </w:p>
+    <w:p>
+      <w:pPr>
+        <w:pStyle w:val="Nessunaspaziatura"/>
+        <w:rPr>
+          <w:rFonts w:ascii="Arial" w:hAnsi="Arial" w:cs="Arial"/>
+        </w:rPr>
+      </w:pPr>
+    </w:p>
+    <w:sdt>
+      <w:sdtPr>
+        <w:rPr>
+          <w:rFonts w:ascii="Arial" w:hAnsi="Arial" w:cs="Arial"/>
+        </w:rPr>
+        <w:alias w:val="Prompt AI"/>
+        <w:tag w:val="Prompt AI"/>
+        <w:id w:val="-438759089"/>
+        <w:placeholder>
+          <w:docPart w:val="7EF59447D18C41E3BBAD18097625FAC0"/>
+        </w:placeholder>
+        <w15:color w:val="C0C0C0"/>
+      </w:sdtPr>
+      <w:sdtContent>
+        <w:p>
+          <w:pPr>
+            <w:pStyle w:val="Nessunaspaziatura"/>
+            <w:spacing w:line="276" w:lineRule="auto"/>
+            <w:rPr>
+              <w:rFonts w:ascii="Arial" w:hAnsi="Arial" w:cs="Arial"/>
+            </w:rPr>
+          </w:pPr>
+          <w:r>
+            <w:rPr>
+              <w:rFonts w:ascii="Arial" w:hAnsi="Arial" w:cs="Arial"/>
+            </w:rPr>
+            <w:t xml:space="preserve">Riley: </w:t>
+          </w:r>
+          <w:r>
+            <w:rPr>
+              <w:rFonts w:ascii="Arial" w:hAnsi="Arial" w:cs="Arial"/>
+            </w:rPr>
+            <w:t xml:space="preserve">Ho riscontrato un problema di merge nonostante abbiamo impostato un sistema con un tool </w:t>
+          </w:r>
+          <w:proofErr w:type="spellStart"/>
+          <w:r>
+            <w:rPr>
+              <w:rFonts w:ascii="Arial" w:hAnsi="Arial" w:cs="Arial"/>
+            </w:rPr>
+            <w:t>unity</w:t>
+          </w:r>
+          <w:proofErr w:type="spellEnd"/>
+          <w:r>
+            <w:rPr>
+              <w:rFonts w:ascii="Arial" w:hAnsi="Arial" w:cs="Arial"/>
+            </w:rPr>
+            <w:t>, puoi dirmi cosa analizzare per risolvere?</w:t>
+          </w:r>
+        </w:p>
+        <w:p>
+          <w:pPr>
+            <w:pStyle w:val="Nessunaspaziatura"/>
+            <w:spacing w:line="276" w:lineRule="auto"/>
+            <w:rPr>
+              <w:rFonts w:ascii="Arial" w:hAnsi="Arial" w:cs="Arial"/>
+            </w:rPr>
+          </w:pPr>
+          <w:r>
+            <w:rPr>
+              <w:rFonts w:ascii="Arial" w:hAnsi="Arial" w:cs="Arial"/>
+            </w:rPr>
+            <w:t xml:space="preserve">Bryan: come si implementa un font in </w:t>
+          </w:r>
+          <w:proofErr w:type="spellStart"/>
+          <w:r>
+            <w:rPr>
+              <w:rFonts w:ascii="Arial" w:hAnsi="Arial" w:cs="Arial"/>
+            </w:rPr>
+            <w:t>unity</w:t>
+          </w:r>
+          <w:proofErr w:type="spellEnd"/>
+          <w:r>
+            <w:rPr>
+              <w:rFonts w:ascii="Arial" w:hAnsi="Arial" w:cs="Arial"/>
+            </w:rPr>
+            <w:t>?</w:t>
+          </w:r>
+        </w:p>
+      </w:sdtContent>
+    </w:sdt>
+    <w:p>
+      <w:pPr>
+        <w:pStyle w:val="Nessunaspaziatura"/>
+        <w:rPr>
+          <w:rFonts w:ascii="Arial" w:hAnsi="Arial" w:cs="Arial"/>
+        </w:rPr>
+      </w:pPr>
+    </w:p>
+    <w:p>
+      <w:pPr>
+        <w:pStyle w:val="Nessunaspaziatura"/>
+        <w:rPr>
+          <w:rFonts w:ascii="Arial" w:hAnsi="Arial" w:cs="Arial"/>
+        </w:rPr>
+      </w:pPr>
+      <w:r>
+        <w:rPr>
+          <w:rFonts w:ascii="Arial" w:hAnsi="Arial" w:cs="Arial"/>
+          <w:b/>
+          <w:bCs/>
+        </w:rPr>
+        <w:t>Cosa mi ha dato l’AI</w:t>
+      </w:r>
+    </w:p>
+    <w:p>
+      <w:pPr>
+        <w:pStyle w:val="Nessunaspaziatura"/>
+        <w:rPr>
+          <w:rFonts w:ascii="Arial" w:hAnsi="Arial" w:cs="Arial"/>
+        </w:rPr>
+      </w:pPr>
+      <w:r>
+        <w:rPr>
+          <w:rFonts w:ascii="Arial" w:hAnsi="Arial" w:cs="Arial"/>
+        </w:rPr>
+        <w:t>Spiegazione, esempio, soluzione, suggerimento…</w:t>
+      </w:r>
+    </w:p>
+    <w:p>
+      <w:pPr>
+        <w:pStyle w:val="Nessunaspaziatura"/>
+        <w:rPr>
+          <w:rFonts w:ascii="Arial" w:hAnsi="Arial" w:cs="Arial"/>
+        </w:rPr>
+      </w:pPr>
+    </w:p>
+    <w:sdt>
+      <w:sdtPr>
+        <w:rPr>
+          <w:rFonts w:ascii="Arial" w:hAnsi="Arial" w:cs="Arial"/>
+        </w:rPr>
+        <w:alias w:val="Risposta AI"/>
+        <w:tag w:val="Risposta AI"/>
+        <w:id w:val="1520808540"/>
+        <w:placeholder>
+          <w:docPart w:val="441814869F024490A12585532A8B8967"/>
+        </w:placeholder>
+        <w15:color w:val="C0C0C0"/>
+      </w:sdtPr>
+      <w:sdtContent>
+        <w:p>
+          <w:pPr>
+            <w:pStyle w:val="Nessunaspaziatura"/>
+            <w:spacing w:line="276" w:lineRule="auto"/>
+            <w:rPr>
+              <w:rFonts w:ascii="Arial" w:hAnsi="Arial" w:cs="Arial"/>
+            </w:rPr>
+          </w:pPr>
+          <w:r>
+            <w:rPr>
+              <w:rFonts w:ascii="Arial" w:hAnsi="Arial" w:cs="Arial"/>
+            </w:rPr>
+            <w:t>Riley: una serie di comandi per eseguire il debug necessario</w:t>
+          </w:r>
+        </w:p>
+        <w:p>
+          <w:pPr>
+            <w:pStyle w:val="Nessunaspaziatura"/>
+            <w:spacing w:line="276" w:lineRule="auto"/>
+            <w:rPr>
+              <w:rFonts w:ascii="Arial" w:hAnsi="Arial" w:cs="Arial"/>
+            </w:rPr>
+          </w:pPr>
+          <w:r>
+            <w:rPr>
+              <w:rFonts w:ascii="Arial" w:hAnsi="Arial" w:cs="Arial"/>
+            </w:rPr>
+            <w:t>Bryan: la risposta aspettata con la soluzione</w:t>
+          </w:r>
+        </w:p>
+      </w:sdtContent>
+    </w:sdt>
+    <w:p>
+      <w:pPr>
+        <w:pStyle w:val="Nessunaspaziatura"/>
+        <w:rPr>
+          <w:rFonts w:ascii="Arial" w:hAnsi="Arial" w:cs="Arial"/>
+          <w:b/>
+          <w:bCs/>
+        </w:rPr>
+      </w:pPr>
+    </w:p>
+    <w:p>
+      <w:pPr>
+        <w:pStyle w:val="Nessunaspaziatura"/>
+        <w:rPr>
+          <w:rFonts w:ascii="Arial" w:hAnsi="Arial" w:cs="Arial"/>
+        </w:rPr>
+      </w:pPr>
+      <w:r>
+        <w:rPr>
+          <w:rFonts w:ascii="Arial" w:hAnsi="Arial" w:cs="Arial"/>
+          <w:b/>
+          <w:bCs/>
+        </w:rPr>
+        <w:t>Come l’ho usato io</w:t>
+      </w:r>
+      <w:r>
+        <w:rPr>
+          <w:rFonts w:ascii="Arial" w:hAnsi="Arial" w:cs="Arial"/>
+        </w:rPr>
+        <w:br/>
+      </w:r>
+      <w:sdt>
+        <w:sdtPr>
+          <w:rPr>
+            <w:rFonts w:ascii="Segoe UI Symbol" w:hAnsi="Segoe UI Symbol" w:cs="Segoe UI Symbol"/>
+          </w:rPr>
+          <w:id w:val="-599485336"/>
+          <w14:checkbox>
+            <w14:checked w14:val="1"/>
+            <w14:checkedState w14:val="2612" w14:font="MS Gothic"/>
+            <w14:uncheckedState w14:val="2610" w14:font="MS Gothic"/>
+          </w14:checkbox>
+        </w:sdtPr>
+        <w:sdtContent>
+          <w:r>
+            <w:rPr>
+              <w:rFonts w:ascii="MS Gothic" w:eastAsia="MS Gothic" w:hAnsi="MS Gothic" w:cs="Segoe UI Symbol" w:hint="eastAsia"/>
+            </w:rPr>
+            <w:t>☒</w:t>
+          </w:r>
+        </w:sdtContent>
+      </w:sdt>
+      <w:r>
+        <w:rPr>
+          <w:rFonts w:ascii="Arial" w:hAnsi="Arial" w:cs="Arial"/>
+        </w:rPr>
+        <w:t xml:space="preserve"> Copiato</w:t>
+      </w:r>
+      <w:r>
+        <w:rPr>
+          <w:rFonts w:ascii="Arial" w:hAnsi="Arial" w:cs="Arial"/>
+        </w:rPr>
+        <w:br/>
+      </w:r>
+      <w:sdt>
+        <w:sdtPr>
+          <w:rPr>
+            <w:rFonts w:ascii="Segoe UI Symbol" w:hAnsi="Segoe UI Symbol" w:cs="Segoe UI Symbol"/>
+          </w:rPr>
+          <w:id w:val="-1176335564"/>
+          <w14:checkbox>
+            <w14:checked w14:val="1"/>
+            <w14:checkedState w14:val="2612" w14:font="MS Gothic"/>
+            <w14:uncheckedState w14:val="2610" w14:font="MS Gothic"/>
+          </w14:checkbox>
+        </w:sdtPr>
+        <w:sdtContent>
+          <w:r>
+            <w:rPr>
+              <w:rFonts w:ascii="MS Gothic" w:eastAsia="MS Gothic" w:hAnsi="MS Gothic" w:cs="Segoe UI Symbol" w:hint="eastAsia"/>
+            </w:rPr>
+            <w:t>☒</w:t>
+          </w:r>
+        </w:sdtContent>
+      </w:sdt>
+      <w:r>
+        <w:rPr>
+          <w:rFonts w:ascii="Arial" w:hAnsi="Arial" w:cs="Arial"/>
+        </w:rPr>
+        <w:t xml:space="preserve"> Adattato</w:t>
+      </w:r>
+      <w:r>
+        <w:rPr>
+          <w:rFonts w:ascii="Arial" w:hAnsi="Arial" w:cs="Arial"/>
+        </w:rPr>
+        <w:br/>
+      </w:r>
+      <w:sdt>
+        <w:sdtPr>
+          <w:rPr>
+            <w:rFonts w:ascii="Segoe UI Symbol" w:hAnsi="Segoe UI Symbol" w:cs="Segoe UI Symbol"/>
+          </w:rPr>
+          <w:id w:val="-1275795098"/>
+          <w14:checkbox>
+            <w14:checked w14:val="0"/>
+            <w14:checkedState w14:val="2612" w14:font="MS Gothic"/>
+            <w14:uncheckedState w14:val="2610" w14:font="MS Gothic"/>
+          </w14:checkbox>
+        </w:sdtPr>
+        <w:sdtContent>
+          <w:r>
+            <w:rPr>
+              <w:rFonts w:ascii="MS Gothic" w:eastAsia="MS Gothic" w:hAnsi="MS Gothic" w:cs="Segoe UI Symbol" w:hint="eastAsia"/>
+            </w:rPr>
+            <w:t>☐</w:t>
+          </w:r>
+        </w:sdtContent>
+      </w:sdt>
+      <w:r>
+        <w:rPr>
+          <w:rFonts w:ascii="Arial" w:hAnsi="Arial" w:cs="Arial"/>
+        </w:rPr>
+        <w:t xml:space="preserve"> Usato solo per capire</w:t>
+      </w:r>
+      <w:r>
+        <w:rPr>
+          <w:rFonts w:ascii="Arial" w:hAnsi="Arial" w:cs="Arial"/>
+        </w:rPr>
+        <w:br/>
+      </w:r>
+      <w:sdt>
+        <w:sdtPr>
+          <w:rPr>
+            <w:rFonts w:ascii="Segoe UI Symbol" w:hAnsi="Segoe UI Symbol" w:cs="Segoe UI Symbol"/>
+          </w:rPr>
+          <w:id w:val="1437870933"/>
+          <w14:checkbox>
+            <w14:checked w14:val="0"/>
+            <w14:checkedState w14:val="2612" w14:font="MS Gothic"/>
+            <w14:uncheckedState w14:val="2610" w14:font="MS Gothic"/>
+          </w14:checkbox>
+        </w:sdtPr>
+        <w:sdtContent>
+          <w:r>
+            <w:rPr>
+              <w:rFonts w:ascii="MS Gothic" w:eastAsia="MS Gothic" w:hAnsi="MS Gothic" w:cs="Segoe UI Symbol" w:hint="eastAsia"/>
+            </w:rPr>
+            <w:t>☐</w:t>
+          </w:r>
+        </w:sdtContent>
+      </w:sdt>
+      <w:r>
+        <w:rPr>
+          <w:rFonts w:ascii="Arial" w:hAnsi="Arial" w:cs="Arial"/>
+        </w:rPr>
+        <w:t xml:space="preserve"> Scartato</w:t>
+      </w:r>
+    </w:p>
+    <w:p>
+      <w:pPr>
+        <w:pStyle w:val="Nessunaspaziatura"/>
+        <w:rPr>
+          <w:rFonts w:ascii="Arial" w:hAnsi="Arial" w:cs="Arial"/>
+        </w:rPr>
+      </w:pPr>
+    </w:p>
+    <w:p>
+      <w:pPr>
+        <w:pStyle w:val="Nessunaspaziatura"/>
+        <w:rPr>
+          <w:rFonts w:ascii="Arial" w:hAnsi="Arial" w:cs="Arial"/>
+        </w:rPr>
+      </w:pPr>
+    </w:p>
+    <w:p>
+      <w:pPr>
+        <w:pStyle w:val="Nessunaspaziatura"/>
+        <w:rPr>
+          <w:rFonts w:ascii="Arial" w:hAnsi="Arial" w:cs="Arial"/>
+        </w:rPr>
+      </w:pPr>
+      <w:r>
+        <w:rPr>
+          <w:rFonts w:ascii="Arial" w:hAnsi="Arial" w:cs="Arial"/>
+          <w:b/>
+          <w:bCs/>
+        </w:rPr>
+        <w:t>Cosa avrei fatto senza AI?</w:t>
+      </w:r>
+    </w:p>
+    <w:p>
+      <w:pPr>
+        <w:pStyle w:val="Nessunaspaziatura"/>
+        <w:rPr>
+          <w:rFonts w:ascii="Arial" w:hAnsi="Arial" w:cs="Arial"/>
+        </w:rPr>
+      </w:pPr>
+      <w:r>
+        <w:rPr>
+          <w:rFonts w:ascii="Arial" w:hAnsi="Arial" w:cs="Arial"/>
+        </w:rPr>
+        <w:t>Arei cercato sulla documentazione ufficiale.</w:t>
+      </w:r>
+    </w:p>
+    <w:p>
+      <w:pPr>
+        <w:pStyle w:val="Nessunaspaziatura"/>
+        <w:rPr>
+          <w:rFonts w:ascii="Arial" w:hAnsi="Arial" w:cs="Arial"/>
+        </w:rPr>
+      </w:pPr>
+      <w:r>
+        <w:rPr>
+          <w:rFonts w:ascii="Arial" w:hAnsi="Arial" w:cs="Arial"/>
+        </w:rPr>
+        <w:t>Saremmo stati persi aumentando notevolmente il ritardo</w:t>
       </w:r>
     </w:p>
     <w:sectPr>
@@ -10793,8 +13157,17 @@
         <w:rFonts w:ascii="Arial" w:hAnsi="Arial" w:cs="Arial"/>
         <w:lang w:val="fr-CH"/>
       </w:rPr>
-      <w:t>Riley Bianchi &amp; Bryan Ciaponi</w:t>
+      <w:t xml:space="preserve">Riley Bianchi &amp; Bryan </w:t>
     </w:r>
+    <w:proofErr w:type="spellStart"/>
+    <w:r>
+      <w:rPr>
+        <w:rFonts w:ascii="Arial" w:hAnsi="Arial" w:cs="Arial"/>
+        <w:lang w:val="fr-CH"/>
+      </w:rPr>
+      <w:t>Ciaponi</w:t>
+    </w:r>
+    <w:proofErr w:type="spellEnd"/>
   </w:p>
 </w:hdr>
 </file>
@@ -15018,6 +17391,107 @@
         </w:p>
       </w:docPartBody>
     </w:docPart>
+    <w:docPart>
+      <w:docPartPr>
+        <w:name w:val="2914FE12113848D0B4DB7D5B369B56BC"/>
+        <w:category>
+          <w:name w:val="Generale"/>
+          <w:gallery w:val="placeholder"/>
+        </w:category>
+        <w:types>
+          <w:type w:val="bbPlcHdr"/>
+        </w:types>
+        <w:behaviors>
+          <w:behavior w:val="content"/>
+        </w:behaviors>
+        <w:guid w:val="{80E7A349-5D55-4ED0-A161-315CF97869E4}"/>
+      </w:docPartPr>
+      <w:docPartBody>
+        <w:p>
+          <w:pPr>
+            <w:pStyle w:val="2914FE12113848D0B4DB7D5B369B56BC"/>
+          </w:pPr>
+          <w:r>
+            <w:rPr>
+              <w:rStyle w:val="Testosegnaposto"/>
+              <w:b/>
+              <w:bCs/>
+            </w:rPr>
+            <w:t>Nomi AI utilizzati</w:t>
+          </w:r>
+        </w:p>
+      </w:docPartBody>
+    </w:docPart>
+    <w:docPart>
+      <w:docPartPr>
+        <w:name w:val="7EF59447D18C41E3BBAD18097625FAC0"/>
+        <w:category>
+          <w:name w:val="Generale"/>
+          <w:gallery w:val="placeholder"/>
+        </w:category>
+        <w:types>
+          <w:type w:val="bbPlcHdr"/>
+        </w:types>
+        <w:behaviors>
+          <w:behavior w:val="content"/>
+        </w:behaviors>
+        <w:guid w:val="{90271391-B50B-4969-965C-40E8D233736E}"/>
+      </w:docPartPr>
+      <w:docPartBody>
+        <w:p>
+          <w:pPr>
+            <w:pStyle w:val="7EF59447D18C41E3BBAD18097625FAC0"/>
+          </w:pPr>
+          <w:r>
+            <w:rPr>
+              <w:rStyle w:val="Testosegnaposto"/>
+            </w:rPr>
+            <w:t>Fare clic o toccare qui per immettere il testo.</w:t>
+          </w:r>
+        </w:p>
+      </w:docPartBody>
+    </w:docPart>
+    <w:docPart>
+      <w:docPartPr>
+        <w:name w:val="441814869F024490A12585532A8B8967"/>
+        <w:category>
+          <w:name w:val="Generale"/>
+          <w:gallery w:val="placeholder"/>
+        </w:category>
+        <w:types>
+          <w:type w:val="bbPlcHdr"/>
+        </w:types>
+        <w:behaviors>
+          <w:behavior w:val="content"/>
+        </w:behaviors>
+        <w:guid w:val="{2A7598C6-7B13-4A70-8FE4-1F615E23DE61}"/>
+      </w:docPartPr>
+      <w:docPartBody>
+        <w:p>
+          <w:pPr>
+            <w:pStyle w:val="441814869F024490A12585532A8B8967"/>
+          </w:pPr>
+          <w:r>
+            <w:rPr>
+              <w:rStyle w:val="Testosegnaposto"/>
+            </w:rPr>
+            <w:t xml:space="preserve">Fare clic o toccare qui per </w:t>
+          </w:r>
+          <w:r>
+            <w:rPr>
+              <w:rStyle w:val="Testosegnaposto"/>
+            </w:rPr>
+            <w:t>immettere</w:t>
+          </w:r>
+          <w:r>
+            <w:rPr>
+              <w:rStyle w:val="Testosegnaposto"/>
+            </w:rPr>
+            <w:t xml:space="preserve"> il testo.</w:t>
+          </w:r>
+        </w:p>
+      </w:docPartBody>
+    </w:docPart>
   </w:docParts>
 </w:glossaryDocument>
 </file>
@@ -15156,6 +17630,7 @@
     <w:rsid w:val="00356BEF"/>
     <w:rsid w:val="00396FDF"/>
     <w:rsid w:val="003B3A61"/>
+    <w:rsid w:val="00434CC7"/>
     <w:rsid w:val="004834F6"/>
     <w:rsid w:val="004B57DE"/>
     <w:rsid w:val="00534571"/>
@@ -15169,6 +17644,7 @@
     <w:rsid w:val="007F4556"/>
     <w:rsid w:val="0080736A"/>
     <w:rsid w:val="008736ED"/>
+    <w:rsid w:val="0089581E"/>
     <w:rsid w:val="00924F9E"/>
     <w:rsid w:val="009826E2"/>
     <w:rsid w:val="009A56C6"/>
@@ -15176,6 +17652,7 @@
     <w:rsid w:val="00A27299"/>
     <w:rsid w:val="00A629CF"/>
     <w:rsid w:val="00A65B6C"/>
+    <w:rsid w:val="00AA022F"/>
     <w:rsid w:val="00AD46CF"/>
     <w:rsid w:val="00B555FF"/>
     <w:rsid w:val="00BD3686"/>
@@ -15647,7 +18124,7 @@
     <w:basedOn w:val="Carpredefinitoparagrafo"/>
     <w:uiPriority w:val="99"/>
     <w:semiHidden/>
-    <w:rsid w:val="009A56C6"/>
+    <w:rsid w:val="0089581E"/>
     <w:rPr>
       <w:color w:val="666666"/>
     </w:rPr>
@@ -15780,6 +18257,18 @@
   <w:style w:type="paragraph" w:customStyle="1" w:styleId="7278956B576944158FA3C037CBFCB52B">
     <w:name w:val="7278956B576944158FA3C037CBFCB52B"/>
     <w:rsid w:val="009A56C6"/>
+  </w:style>
+  <w:style w:type="paragraph" w:customStyle="1" w:styleId="2914FE12113848D0B4DB7D5B369B56BC">
+    <w:name w:val="2914FE12113848D0B4DB7D5B369B56BC"/>
+    <w:rsid w:val="0089581E"/>
+  </w:style>
+  <w:style w:type="paragraph" w:customStyle="1" w:styleId="7EF59447D18C41E3BBAD18097625FAC0">
+    <w:name w:val="7EF59447D18C41E3BBAD18097625FAC0"/>
+    <w:rsid w:val="0089581E"/>
+  </w:style>
+  <w:style w:type="paragraph" w:customStyle="1" w:styleId="441814869F024490A12585532A8B8967">
+    <w:name w:val="441814869F024490A12585532A8B8967"/>
+    <w:rsid w:val="0089581E"/>
   </w:style>
 </w:styles>
 </file>

</xml_diff>

<commit_message>
Completamento script statistiche, agiornamento gannt cons e diario
</commit_message>
<xml_diff>
--- a/4_Diari/Diario.docx
+++ b/4_Diari/Diario.docx
@@ -11263,13 +11263,7 @@
               <w:rPr>
                 <w:rFonts w:ascii="Arial" w:hAnsi="Arial" w:cs="Arial"/>
               </w:rPr>
-              <w:t>21</w:t>
-            </w:r>
-            <w:r>
-              <w:rPr>
-                <w:rFonts w:ascii="Arial" w:hAnsi="Arial" w:cs="Arial"/>
-              </w:rPr>
-              <w:t>.09.2026</w:t>
+              <w:t>21.09.2026</w:t>
             </w:r>
           </w:p>
         </w:tc>
@@ -12923,21 +12917,1682 @@
         <w:rPr>
           <w:rFonts w:ascii="Arial" w:hAnsi="Arial" w:cs="Arial"/>
         </w:rPr>
-        <w:t>Arei cercato sulla documentazione ufficiale.</w:t>
-      </w:r>
-    </w:p>
-    <w:p>
-      <w:pPr>
-        <w:pStyle w:val="Nessunaspaziatura"/>
-        <w:rPr>
-          <w:rFonts w:ascii="Arial" w:hAnsi="Arial" w:cs="Arial"/>
-        </w:rPr>
-      </w:pPr>
-      <w:r>
-        <w:rPr>
-          <w:rFonts w:ascii="Arial" w:hAnsi="Arial" w:cs="Arial"/>
-        </w:rPr>
         <w:t>Saremmo stati persi aumentando notevolmente il ritardo</w:t>
+      </w:r>
+    </w:p>
+    <w:p>
+      <w:pPr>
+        <w:rPr>
+          <w:rFonts w:ascii="Arial" w:hAnsi="Arial" w:cs="Arial"/>
+        </w:rPr>
+      </w:pPr>
+      <w:r>
+        <w:rPr>
+          <w:rFonts w:ascii="Arial" w:hAnsi="Arial" w:cs="Arial"/>
+        </w:rPr>
+        <w:br w:type="page"/>
+      </w:r>
+    </w:p>
+    <w:tbl>
+      <w:tblPr>
+        <w:tblStyle w:val="Grigliatabella"/>
+        <w:tblW w:w="5000" w:type="pct"/>
+        <w:tblLook w:val="04A0" w:firstRow="1" w:lastRow="0" w:firstColumn="1" w:lastColumn="0" w:noHBand="0" w:noVBand="1"/>
+      </w:tblPr>
+      <w:tblGrid>
+        <w:gridCol w:w="2407"/>
+        <w:gridCol w:w="7221"/>
+      </w:tblGrid>
+      <w:tr>
+        <w:trPr>
+          <w:trHeight w:val="199"/>
+        </w:trPr>
+        <w:tc>
+          <w:tcPr>
+            <w:tcW w:w="1250" w:type="pct"/>
+            <w:vAlign w:val="center"/>
+          </w:tcPr>
+          <w:p>
+            <w:pPr>
+              <w:rPr>
+                <w:rFonts w:ascii="Arial" w:hAnsi="Arial" w:cs="Arial"/>
+              </w:rPr>
+            </w:pPr>
+            <w:r>
+              <w:rPr>
+                <w:rFonts w:ascii="Arial" w:hAnsi="Arial" w:cs="Arial"/>
+              </w:rPr>
+              <w:lastRenderedPageBreak/>
+              <w:t>Luogo</w:t>
+            </w:r>
+          </w:p>
+        </w:tc>
+        <w:tc>
+          <w:tcPr>
+            <w:tcW w:w="3750" w:type="pct"/>
+            <w:vAlign w:val="center"/>
+          </w:tcPr>
+          <w:p>
+            <w:pPr>
+              <w:rPr>
+                <w:rFonts w:ascii="Arial" w:hAnsi="Arial" w:cs="Arial"/>
+              </w:rPr>
+            </w:pPr>
+            <w:r>
+              <w:rPr>
+                <w:rFonts w:ascii="Arial" w:hAnsi="Arial" w:cs="Arial"/>
+              </w:rPr>
+              <w:t>Scuola Arti e Mestieri Trevano</w:t>
+            </w:r>
+          </w:p>
+        </w:tc>
+      </w:tr>
+      <w:tr>
+        <w:trPr>
+          <w:trHeight w:val="196"/>
+        </w:trPr>
+        <w:tc>
+          <w:tcPr>
+            <w:tcW w:w="1250" w:type="pct"/>
+            <w:vAlign w:val="center"/>
+          </w:tcPr>
+          <w:p>
+            <w:pPr>
+              <w:rPr>
+                <w:rFonts w:ascii="Arial" w:hAnsi="Arial" w:cs="Arial"/>
+              </w:rPr>
+            </w:pPr>
+            <w:r>
+              <w:rPr>
+                <w:rFonts w:ascii="Arial" w:hAnsi="Arial" w:cs="Arial"/>
+              </w:rPr>
+              <w:t>Data</w:t>
+            </w:r>
+          </w:p>
+        </w:tc>
+        <w:tc>
+          <w:tcPr>
+            <w:tcW w:w="3750" w:type="pct"/>
+            <w:vAlign w:val="center"/>
+          </w:tcPr>
+          <w:p>
+            <w:pPr>
+              <w:rPr>
+                <w:rFonts w:ascii="Arial" w:hAnsi="Arial" w:cs="Arial"/>
+              </w:rPr>
+            </w:pPr>
+            <w:r>
+              <w:rPr>
+                <w:rFonts w:ascii="Arial" w:hAnsi="Arial" w:cs="Arial"/>
+              </w:rPr>
+              <w:t>21.09.2026</w:t>
+            </w:r>
+          </w:p>
+        </w:tc>
+      </w:tr>
+    </w:tbl>
+    <w:p>
+      <w:pPr>
+        <w:rPr>
+          <w:rFonts w:ascii="Arial" w:hAnsi="Arial" w:cs="Arial"/>
+        </w:rPr>
+      </w:pPr>
+    </w:p>
+    <w:tbl>
+      <w:tblPr>
+        <w:tblStyle w:val="Grigliatabella"/>
+        <w:tblW w:w="0" w:type="auto"/>
+        <w:tblLook w:val="04A0" w:firstRow="1" w:lastRow="0" w:firstColumn="1" w:lastColumn="0" w:noHBand="0" w:noVBand="1"/>
+      </w:tblPr>
+      <w:tblGrid>
+        <w:gridCol w:w="1271"/>
+        <w:gridCol w:w="8357"/>
+      </w:tblGrid>
+      <w:tr>
+        <w:tc>
+          <w:tcPr>
+            <w:tcW w:w="9628" w:type="dxa"/>
+            <w:gridSpan w:val="2"/>
+            <w:shd w:val="clear" w:color="auto" w:fill="D9D9D9" w:themeFill="background1" w:themeFillShade="D9"/>
+          </w:tcPr>
+          <w:p>
+            <w:pPr>
+              <w:rPr>
+                <w:rFonts w:ascii="Arial" w:hAnsi="Arial" w:cs="Arial"/>
+              </w:rPr>
+            </w:pPr>
+            <w:r>
+              <w:rPr>
+                <w:rFonts w:ascii="Arial" w:hAnsi="Arial" w:cs="Arial"/>
+              </w:rPr>
+              <w:t>Lavori svolti</w:t>
+            </w:r>
+          </w:p>
+        </w:tc>
+      </w:tr>
+      <w:tr>
+        <w:tc>
+          <w:tcPr>
+            <w:tcW w:w="1271" w:type="dxa"/>
+          </w:tcPr>
+          <w:p>
+            <w:pPr>
+              <w:rPr>
+                <w:rFonts w:ascii="Arial" w:hAnsi="Arial" w:cs="Arial"/>
+              </w:rPr>
+            </w:pPr>
+            <w:r>
+              <w:rPr>
+                <w:rFonts w:ascii="Arial" w:hAnsi="Arial" w:cs="Arial"/>
+              </w:rPr>
+              <w:t>Riley</w:t>
+            </w:r>
+          </w:p>
+        </w:tc>
+        <w:tc>
+          <w:tcPr>
+            <w:tcW w:w="8357" w:type="dxa"/>
+          </w:tcPr>
+          <w:p>
+            <w:pPr>
+              <w:rPr>
+                <w:rFonts w:ascii="Arial" w:hAnsi="Arial" w:cs="Arial"/>
+              </w:rPr>
+            </w:pPr>
+            <w:r>
+              <w:rPr>
+                <w:rFonts w:ascii="Arial" w:hAnsi="Arial" w:cs="Arial"/>
+              </w:rPr>
+              <w:t>Terminato script statistiche.</w:t>
+            </w:r>
+          </w:p>
+        </w:tc>
+      </w:tr>
+      <w:tr>
+        <w:tc>
+          <w:tcPr>
+            <w:tcW w:w="1271" w:type="dxa"/>
+          </w:tcPr>
+          <w:p>
+            <w:pPr>
+              <w:rPr>
+                <w:rFonts w:ascii="Arial" w:hAnsi="Arial" w:cs="Arial"/>
+              </w:rPr>
+            </w:pPr>
+            <w:r>
+              <w:rPr>
+                <w:rFonts w:ascii="Arial" w:hAnsi="Arial" w:cs="Arial"/>
+              </w:rPr>
+              <w:t>Bryan</w:t>
+            </w:r>
+          </w:p>
+        </w:tc>
+        <w:tc>
+          <w:tcPr>
+            <w:tcW w:w="8357" w:type="dxa"/>
+          </w:tcPr>
+          <w:p>
+            <w:pPr>
+              <w:rPr>
+                <w:rFonts w:ascii="Arial" w:hAnsi="Arial" w:cs="Arial"/>
+              </w:rPr>
+            </w:pPr>
+            <w:r>
+              <w:rPr>
+                <w:rFonts w:ascii="Arial" w:hAnsi="Arial" w:cs="Arial"/>
+              </w:rPr>
+              <w:t>Terminata UI Impostazioni e Comandi, aggiornata la documentazione.</w:t>
+            </w:r>
+          </w:p>
+        </w:tc>
+      </w:tr>
+    </w:tbl>
+    <w:p>
+      <w:pPr>
+        <w:rPr>
+          <w:rFonts w:ascii="Arial" w:hAnsi="Arial" w:cs="Arial"/>
+        </w:rPr>
+      </w:pPr>
+    </w:p>
+    <w:tbl>
+      <w:tblPr>
+        <w:tblStyle w:val="Grigliatabella"/>
+        <w:tblW w:w="0" w:type="auto"/>
+        <w:tblInd w:w="-5" w:type="dxa"/>
+        <w:tblLook w:val="04A0" w:firstRow="1" w:lastRow="0" w:firstColumn="1" w:lastColumn="0" w:noHBand="0" w:noVBand="1"/>
+      </w:tblPr>
+      <w:tblGrid>
+        <w:gridCol w:w="1276"/>
+        <w:gridCol w:w="8357"/>
+      </w:tblGrid>
+      <w:tr>
+        <w:tc>
+          <w:tcPr>
+            <w:tcW w:w="9628" w:type="dxa"/>
+            <w:gridSpan w:val="2"/>
+            <w:shd w:val="clear" w:color="auto" w:fill="D9D9D9" w:themeFill="background1" w:themeFillShade="D9"/>
+          </w:tcPr>
+          <w:p>
+            <w:pPr>
+              <w:rPr>
+                <w:rFonts w:ascii="Arial" w:hAnsi="Arial" w:cs="Arial"/>
+              </w:rPr>
+            </w:pPr>
+            <w:r>
+              <w:rPr>
+                <w:rFonts w:ascii="Arial" w:hAnsi="Arial" w:cs="Arial"/>
+              </w:rPr>
+              <w:t>Problemi riscontrati e soluzioni adottate</w:t>
+            </w:r>
+          </w:p>
+        </w:tc>
+      </w:tr>
+      <w:tr>
+        <w:tc>
+          <w:tcPr>
+            <w:tcW w:w="1276" w:type="dxa"/>
+          </w:tcPr>
+          <w:p>
+            <w:pPr>
+              <w:rPr>
+                <w:rFonts w:ascii="Arial" w:hAnsi="Arial" w:cs="Arial"/>
+              </w:rPr>
+            </w:pPr>
+            <w:r>
+              <w:rPr>
+                <w:rFonts w:ascii="Arial" w:hAnsi="Arial" w:cs="Arial"/>
+              </w:rPr>
+              <w:t>Riley</w:t>
+            </w:r>
+          </w:p>
+        </w:tc>
+        <w:tc>
+          <w:tcPr>
+            <w:tcW w:w="8357" w:type="dxa"/>
+          </w:tcPr>
+          <w:p>
+            <w:pPr>
+              <w:rPr>
+                <w:rFonts w:ascii="Arial" w:hAnsi="Arial" w:cs="Arial"/>
+              </w:rPr>
+            </w:pPr>
+            <w:r>
+              <w:rPr>
+                <w:rFonts w:ascii="Arial" w:hAnsi="Arial" w:cs="Arial"/>
+              </w:rPr>
+              <w:t>-</w:t>
+            </w:r>
+          </w:p>
+        </w:tc>
+      </w:tr>
+      <w:tr>
+        <w:tc>
+          <w:tcPr>
+            <w:tcW w:w="1276" w:type="dxa"/>
+          </w:tcPr>
+          <w:p>
+            <w:pPr>
+              <w:rPr>
+                <w:rFonts w:ascii="Arial" w:hAnsi="Arial" w:cs="Arial"/>
+              </w:rPr>
+            </w:pPr>
+            <w:r>
+              <w:rPr>
+                <w:rFonts w:ascii="Arial" w:hAnsi="Arial" w:cs="Arial"/>
+              </w:rPr>
+              <w:t>Bryan</w:t>
+            </w:r>
+          </w:p>
+        </w:tc>
+        <w:tc>
+          <w:tcPr>
+            <w:tcW w:w="8357" w:type="dxa"/>
+          </w:tcPr>
+          <w:p>
+            <w:pPr>
+              <w:rPr>
+                <w:rFonts w:ascii="Arial" w:hAnsi="Arial" w:cs="Arial"/>
+              </w:rPr>
+            </w:pPr>
+            <w:r>
+              <w:rPr>
+                <w:rFonts w:ascii="Arial" w:hAnsi="Arial" w:cs="Arial"/>
+              </w:rPr>
+              <w:t>-</w:t>
+            </w:r>
+          </w:p>
+        </w:tc>
+      </w:tr>
+    </w:tbl>
+    <w:p>
+      <w:pPr>
+        <w:rPr>
+          <w:rFonts w:ascii="Arial" w:hAnsi="Arial" w:cs="Arial"/>
+        </w:rPr>
+      </w:pPr>
+    </w:p>
+    <w:tbl>
+      <w:tblPr>
+        <w:tblStyle w:val="Grigliatabella"/>
+        <w:tblW w:w="0" w:type="auto"/>
+        <w:tblLook w:val="04A0" w:firstRow="1" w:lastRow="0" w:firstColumn="1" w:lastColumn="0" w:noHBand="0" w:noVBand="1"/>
+      </w:tblPr>
+      <w:tblGrid>
+        <w:gridCol w:w="9628"/>
+      </w:tblGrid>
+      <w:tr>
+        <w:tc>
+          <w:tcPr>
+            <w:tcW w:w="9854" w:type="dxa"/>
+            <w:shd w:val="clear" w:color="auto" w:fill="D9D9D9" w:themeFill="background1" w:themeFillShade="D9"/>
+          </w:tcPr>
+          <w:p>
+            <w:pPr>
+              <w:rPr>
+                <w:rFonts w:ascii="Arial" w:hAnsi="Arial" w:cs="Arial"/>
+              </w:rPr>
+            </w:pPr>
+            <w:r>
+              <w:rPr>
+                <w:rFonts w:ascii="Arial" w:hAnsi="Arial" w:cs="Arial"/>
+              </w:rPr>
+              <w:t>Punto della situazione rispetto alla pianificazione</w:t>
+            </w:r>
+          </w:p>
+        </w:tc>
+      </w:tr>
+      <w:tr>
+        <w:tc>
+          <w:tcPr>
+            <w:tcW w:w="9854" w:type="dxa"/>
+          </w:tcPr>
+          <w:p>
+            <w:pPr>
+              <w:rPr>
+                <w:rFonts w:ascii="Arial" w:hAnsi="Arial" w:cs="Arial"/>
+              </w:rPr>
+            </w:pPr>
+            <w:r>
+              <w:rPr>
+                <w:rFonts w:ascii="Arial" w:hAnsi="Arial" w:cs="Arial"/>
+              </w:rPr>
+              <w:t xml:space="preserve">Rispetto alla pianificazione abbiamo un leggero ritardo avendo finito solo oggi le statistiche, ma questo risulta recuperabile essendo che lavoriamo separatamente dividendo </w:t>
+            </w:r>
+            <w:proofErr w:type="spellStart"/>
+            <w:r>
+              <w:rPr>
+                <w:rFonts w:ascii="Arial" w:hAnsi="Arial" w:cs="Arial"/>
+              </w:rPr>
+              <w:t>ui</w:t>
+            </w:r>
+            <w:proofErr w:type="spellEnd"/>
+            <w:r>
+              <w:rPr>
+                <w:rFonts w:ascii="Arial" w:hAnsi="Arial" w:cs="Arial"/>
+              </w:rPr>
+              <w:t xml:space="preserve"> e scripting, infatti </w:t>
+            </w:r>
+            <w:proofErr w:type="spellStart"/>
+            <w:r>
+              <w:rPr>
+                <w:rFonts w:ascii="Arial" w:hAnsi="Arial" w:cs="Arial"/>
+              </w:rPr>
+              <w:t>bryan</w:t>
+            </w:r>
+            <w:proofErr w:type="spellEnd"/>
+            <w:r>
+              <w:rPr>
+                <w:rFonts w:ascii="Arial" w:hAnsi="Arial" w:cs="Arial"/>
+              </w:rPr>
+              <w:t xml:space="preserve"> ha iniziato la </w:t>
+            </w:r>
+            <w:proofErr w:type="spellStart"/>
+            <w:r>
+              <w:rPr>
+                <w:rFonts w:ascii="Arial" w:hAnsi="Arial" w:cs="Arial"/>
+              </w:rPr>
+              <w:t>ui</w:t>
+            </w:r>
+            <w:proofErr w:type="spellEnd"/>
+            <w:r>
+              <w:rPr>
+                <w:rFonts w:ascii="Arial" w:hAnsi="Arial" w:cs="Arial"/>
+              </w:rPr>
+              <w:t xml:space="preserve"> delle impostazioni il giorno previsto.</w:t>
+            </w:r>
+          </w:p>
+        </w:tc>
+      </w:tr>
+    </w:tbl>
+    <w:p>
+      <w:pPr>
+        <w:rPr>
+          <w:rFonts w:ascii="Arial" w:hAnsi="Arial" w:cs="Arial"/>
+        </w:rPr>
+      </w:pPr>
+    </w:p>
+    <w:tbl>
+      <w:tblPr>
+        <w:tblStyle w:val="Grigliatabella"/>
+        <w:tblW w:w="0" w:type="auto"/>
+        <w:tblLook w:val="04A0" w:firstRow="1" w:lastRow="0" w:firstColumn="1" w:lastColumn="0" w:noHBand="0" w:noVBand="1"/>
+      </w:tblPr>
+      <w:tblGrid>
+        <w:gridCol w:w="9628"/>
+      </w:tblGrid>
+      <w:tr>
+        <w:tc>
+          <w:tcPr>
+            <w:tcW w:w="9854" w:type="dxa"/>
+            <w:shd w:val="clear" w:color="auto" w:fill="D9D9D9" w:themeFill="background1" w:themeFillShade="D9"/>
+          </w:tcPr>
+          <w:p>
+            <w:pPr>
+              <w:rPr>
+                <w:rFonts w:ascii="Arial" w:hAnsi="Arial" w:cs="Arial"/>
+              </w:rPr>
+            </w:pPr>
+            <w:r>
+              <w:rPr>
+                <w:rFonts w:ascii="Arial" w:hAnsi="Arial" w:cs="Arial"/>
+              </w:rPr>
+              <w:t>Programma di massima per la prossima giornata di lavoro</w:t>
+            </w:r>
+          </w:p>
+        </w:tc>
+      </w:tr>
+      <w:tr>
+        <w:tc>
+          <w:tcPr>
+            <w:tcW w:w="9854" w:type="dxa"/>
+          </w:tcPr>
+          <w:p>
+            <w:pPr>
+              <w:rPr>
+                <w:rFonts w:ascii="Arial" w:hAnsi="Arial" w:cs="Arial"/>
+              </w:rPr>
+            </w:pPr>
+            <w:r>
+              <w:rPr>
+                <w:rFonts w:ascii="Arial" w:hAnsi="Arial" w:cs="Arial"/>
+              </w:rPr>
+              <w:t>Riley non sarà presente mercoledì 23 perciò cercherà di iniziare e concludere gli script per le impostazioni.</w:t>
+            </w:r>
+          </w:p>
+          <w:p>
+            <w:pPr>
+              <w:rPr>
+                <w:rFonts w:ascii="Arial" w:hAnsi="Arial" w:cs="Arial"/>
+              </w:rPr>
+            </w:pPr>
+            <w:r>
+              <w:rPr>
+                <w:rFonts w:ascii="Arial" w:hAnsi="Arial" w:cs="Arial"/>
+              </w:rPr>
+              <w:t>Bryan comincerà la logica di gestione dei comandi.</w:t>
+            </w:r>
+          </w:p>
+        </w:tc>
+      </w:tr>
+    </w:tbl>
+    <w:p>
+      <w:pPr>
+        <w:rPr>
+          <w:rFonts w:ascii="Arial" w:hAnsi="Arial" w:cs="Arial"/>
+        </w:rPr>
+      </w:pPr>
+    </w:p>
+    <w:p>
+      <w:pPr>
+        <w:pStyle w:val="Titolo1"/>
+      </w:pPr>
+      <w:r>
+        <w:t>Agile - Resoconto</w:t>
+      </w:r>
+    </w:p>
+    <w:tbl>
+      <w:tblPr>
+        <w:tblStyle w:val="Grigliatabella"/>
+        <w:tblW w:w="0" w:type="auto"/>
+        <w:tblLook w:val="04A0" w:firstRow="1" w:lastRow="0" w:firstColumn="1" w:lastColumn="0" w:noHBand="0" w:noVBand="1"/>
+      </w:tblPr>
+      <w:tblGrid>
+        <w:gridCol w:w="9628"/>
+      </w:tblGrid>
+      <w:tr>
+        <w:tc>
+          <w:tcPr>
+            <w:tcW w:w="9628" w:type="dxa"/>
+            <w:tcBorders>
+              <w:top w:val="single" w:sz="4" w:space="0" w:color="auto"/>
+              <w:left w:val="single" w:sz="4" w:space="0" w:color="auto"/>
+              <w:bottom w:val="single" w:sz="4" w:space="0" w:color="auto"/>
+              <w:right w:val="single" w:sz="4" w:space="0" w:color="auto"/>
+            </w:tcBorders>
+            <w:shd w:val="clear" w:color="auto" w:fill="D9D9D9" w:themeFill="background1" w:themeFillShade="D9"/>
+            <w:hideMark/>
+          </w:tcPr>
+          <w:p>
+            <w:pPr>
+              <w:spacing w:after="200" w:line="276" w:lineRule="auto"/>
+              <w:rPr>
+                <w:rFonts w:ascii="Arial" w:hAnsi="Arial" w:cs="Arial"/>
+              </w:rPr>
+            </w:pPr>
+            <w:proofErr w:type="spellStart"/>
+            <w:r>
+              <w:rPr>
+                <w:rFonts w:ascii="Arial" w:hAnsi="Arial" w:cs="Arial"/>
+              </w:rPr>
+              <w:t>Daily</w:t>
+            </w:r>
+            <w:proofErr w:type="spellEnd"/>
+            <w:r>
+              <w:rPr>
+                <w:rFonts w:ascii="Arial" w:hAnsi="Arial" w:cs="Arial"/>
+              </w:rPr>
+              <w:t xml:space="preserve"> </w:t>
+            </w:r>
+            <w:proofErr w:type="spellStart"/>
+            <w:r>
+              <w:rPr>
+                <w:rFonts w:ascii="Arial" w:hAnsi="Arial" w:cs="Arial"/>
+              </w:rPr>
+              <w:t>Scrum</w:t>
+            </w:r>
+            <w:proofErr w:type="spellEnd"/>
+          </w:p>
+        </w:tc>
+      </w:tr>
+      <w:tr>
+        <w:tc>
+          <w:tcPr>
+            <w:tcW w:w="9628" w:type="dxa"/>
+            <w:tcBorders>
+              <w:top w:val="single" w:sz="4" w:space="0" w:color="auto"/>
+              <w:left w:val="single" w:sz="4" w:space="0" w:color="auto"/>
+              <w:bottom w:val="single" w:sz="4" w:space="0" w:color="auto"/>
+              <w:right w:val="single" w:sz="4" w:space="0" w:color="auto"/>
+            </w:tcBorders>
+            <w:hideMark/>
+          </w:tcPr>
+          <w:p>
+            <w:pPr>
+              <w:spacing w:after="200" w:line="276" w:lineRule="auto"/>
+              <w:rPr>
+                <w:rFonts w:ascii="Arial" w:hAnsi="Arial" w:cs="Arial"/>
+              </w:rPr>
+            </w:pPr>
+          </w:p>
+        </w:tc>
+      </w:tr>
+      <w:tr>
+        <w:tc>
+          <w:tcPr>
+            <w:tcW w:w="9628" w:type="dxa"/>
+            <w:tcBorders>
+              <w:top w:val="single" w:sz="4" w:space="0" w:color="auto"/>
+              <w:left w:val="single" w:sz="4" w:space="0" w:color="auto"/>
+              <w:bottom w:val="single" w:sz="4" w:space="0" w:color="auto"/>
+              <w:right w:val="single" w:sz="4" w:space="0" w:color="auto"/>
+            </w:tcBorders>
+          </w:tcPr>
+          <w:p>
+            <w:pPr>
+              <w:spacing w:after="200" w:line="276" w:lineRule="auto"/>
+              <w:rPr>
+                <w:rFonts w:ascii="Arial" w:hAnsi="Arial" w:cs="Arial"/>
+              </w:rPr>
+            </w:pPr>
+            <w:r>
+              <w:rPr>
+                <w:rFonts w:ascii="Arial" w:hAnsi="Arial" w:cs="Arial"/>
+              </w:rPr>
+              <w:t>Riley: Finire completamente lo script per le statistiche e cominciare con quello per le impostazioni.</w:t>
+            </w:r>
+          </w:p>
+          <w:p>
+            <w:pPr>
+              <w:spacing w:after="200" w:line="276" w:lineRule="auto"/>
+              <w:rPr>
+                <w:rFonts w:ascii="Arial" w:hAnsi="Arial" w:cs="Arial"/>
+              </w:rPr>
+            </w:pPr>
+            <w:r>
+              <w:rPr>
+                <w:rFonts w:ascii="Arial" w:hAnsi="Arial" w:cs="Arial"/>
+              </w:rPr>
+              <w:t xml:space="preserve">Bryan: Finire la </w:t>
+            </w:r>
+            <w:proofErr w:type="spellStart"/>
+            <w:r>
+              <w:rPr>
+                <w:rFonts w:ascii="Arial" w:hAnsi="Arial" w:cs="Arial"/>
+              </w:rPr>
+              <w:t>ui</w:t>
+            </w:r>
+            <w:proofErr w:type="spellEnd"/>
+            <w:r>
+              <w:rPr>
+                <w:rFonts w:ascii="Arial" w:hAnsi="Arial" w:cs="Arial"/>
+              </w:rPr>
+              <w:t xml:space="preserve"> del</w:t>
+            </w:r>
+            <w:r>
+              <w:rPr>
+                <w:rFonts w:ascii="Arial" w:hAnsi="Arial" w:cs="Arial"/>
+              </w:rPr>
+              <w:t>le impostazioni e progettazione sviluppo del prossimo sprint.</w:t>
+            </w:r>
+          </w:p>
+        </w:tc>
+      </w:tr>
+    </w:tbl>
+    <w:p>
+      <w:pPr>
+        <w:rPr>
+          <w:rFonts w:ascii="Arial" w:hAnsi="Arial" w:cs="Arial"/>
+        </w:rPr>
+      </w:pPr>
+    </w:p>
+    <w:tbl>
+      <w:tblPr>
+        <w:tblStyle w:val="Grigliatabella"/>
+        <w:tblW w:w="0" w:type="auto"/>
+        <w:tblLook w:val="04A0" w:firstRow="1" w:lastRow="0" w:firstColumn="1" w:lastColumn="0" w:noHBand="0" w:noVBand="1"/>
+      </w:tblPr>
+      <w:tblGrid>
+        <w:gridCol w:w="9628"/>
+      </w:tblGrid>
+      <w:tr>
+        <w:tc>
+          <w:tcPr>
+            <w:tcW w:w="9854" w:type="dxa"/>
+            <w:tcBorders>
+              <w:top w:val="single" w:sz="4" w:space="0" w:color="auto"/>
+              <w:left w:val="single" w:sz="4" w:space="0" w:color="auto"/>
+              <w:bottom w:val="single" w:sz="4" w:space="0" w:color="auto"/>
+              <w:right w:val="single" w:sz="4" w:space="0" w:color="auto"/>
+            </w:tcBorders>
+            <w:shd w:val="clear" w:color="auto" w:fill="D9D9D9" w:themeFill="background1" w:themeFillShade="D9"/>
+            <w:hideMark/>
+          </w:tcPr>
+          <w:p>
+            <w:pPr>
+              <w:spacing w:after="200" w:line="276" w:lineRule="auto"/>
+              <w:rPr>
+                <w:rFonts w:ascii="Arial" w:hAnsi="Arial" w:cs="Arial"/>
+              </w:rPr>
+            </w:pPr>
+            <w:r>
+              <w:rPr>
+                <w:rFonts w:ascii="Arial" w:hAnsi="Arial" w:cs="Arial"/>
+              </w:rPr>
+              <w:t>Sprint Planning</w:t>
+            </w:r>
+          </w:p>
+        </w:tc>
+      </w:tr>
+      <w:tr>
+        <w:tc>
+          <w:tcPr>
+            <w:tcW w:w="9854" w:type="dxa"/>
+            <w:tcBorders>
+              <w:top w:val="single" w:sz="4" w:space="0" w:color="auto"/>
+              <w:left w:val="single" w:sz="4" w:space="0" w:color="auto"/>
+              <w:bottom w:val="single" w:sz="4" w:space="0" w:color="auto"/>
+              <w:right w:val="single" w:sz="4" w:space="0" w:color="auto"/>
+            </w:tcBorders>
+          </w:tcPr>
+          <w:p>
+            <w:pPr>
+              <w:spacing w:after="200" w:line="276" w:lineRule="auto"/>
+              <w:rPr>
+                <w:rFonts w:ascii="Arial" w:hAnsi="Arial" w:cs="Arial"/>
+              </w:rPr>
+            </w:pPr>
+          </w:p>
+        </w:tc>
+      </w:tr>
+    </w:tbl>
+    <w:p>
+      <w:pPr>
+        <w:rPr>
+          <w:rFonts w:ascii="Arial" w:hAnsi="Arial" w:cs="Arial"/>
+        </w:rPr>
+      </w:pPr>
+    </w:p>
+    <w:tbl>
+      <w:tblPr>
+        <w:tblStyle w:val="Grigliatabella"/>
+        <w:tblW w:w="0" w:type="auto"/>
+        <w:tblLook w:val="04A0" w:firstRow="1" w:lastRow="0" w:firstColumn="1" w:lastColumn="0" w:noHBand="0" w:noVBand="1"/>
+      </w:tblPr>
+      <w:tblGrid>
+        <w:gridCol w:w="9628"/>
+      </w:tblGrid>
+      <w:tr>
+        <w:tc>
+          <w:tcPr>
+            <w:tcW w:w="9854" w:type="dxa"/>
+            <w:tcBorders>
+              <w:top w:val="single" w:sz="4" w:space="0" w:color="auto"/>
+              <w:left w:val="single" w:sz="4" w:space="0" w:color="auto"/>
+              <w:bottom w:val="single" w:sz="4" w:space="0" w:color="auto"/>
+              <w:right w:val="single" w:sz="4" w:space="0" w:color="auto"/>
+            </w:tcBorders>
+            <w:shd w:val="clear" w:color="auto" w:fill="D9D9D9" w:themeFill="background1" w:themeFillShade="D9"/>
+            <w:hideMark/>
+          </w:tcPr>
+          <w:p>
+            <w:pPr>
+              <w:spacing w:after="200" w:line="276" w:lineRule="auto"/>
+              <w:rPr>
+                <w:rFonts w:ascii="Arial" w:hAnsi="Arial" w:cs="Arial"/>
+              </w:rPr>
+            </w:pPr>
+            <w:r>
+              <w:rPr>
+                <w:rFonts w:ascii="Arial" w:hAnsi="Arial" w:cs="Arial"/>
+              </w:rPr>
+              <w:t>Sprint Review</w:t>
+            </w:r>
+          </w:p>
+        </w:tc>
+      </w:tr>
+      <w:tr>
+        <w:tc>
+          <w:tcPr>
+            <w:tcW w:w="9854" w:type="dxa"/>
+            <w:tcBorders>
+              <w:top w:val="single" w:sz="4" w:space="0" w:color="auto"/>
+              <w:left w:val="single" w:sz="4" w:space="0" w:color="auto"/>
+              <w:bottom w:val="single" w:sz="4" w:space="0" w:color="auto"/>
+              <w:right w:val="single" w:sz="4" w:space="0" w:color="auto"/>
+            </w:tcBorders>
+          </w:tcPr>
+          <w:p>
+            <w:pPr>
+              <w:spacing w:after="200" w:line="276" w:lineRule="auto"/>
+              <w:rPr>
+                <w:rFonts w:ascii="Arial" w:hAnsi="Arial" w:cs="Arial"/>
+              </w:rPr>
+            </w:pPr>
+          </w:p>
+        </w:tc>
+      </w:tr>
+    </w:tbl>
+    <w:p>
+      <w:pPr>
+        <w:rPr>
+          <w:rFonts w:ascii="Arial" w:hAnsi="Arial" w:cs="Arial"/>
+        </w:rPr>
+      </w:pPr>
+    </w:p>
+    <w:tbl>
+      <w:tblPr>
+        <w:tblStyle w:val="Grigliatabella"/>
+        <w:tblW w:w="0" w:type="auto"/>
+        <w:tblLook w:val="04A0" w:firstRow="1" w:lastRow="0" w:firstColumn="1" w:lastColumn="0" w:noHBand="0" w:noVBand="1"/>
+      </w:tblPr>
+      <w:tblGrid>
+        <w:gridCol w:w="9628"/>
+      </w:tblGrid>
+      <w:tr>
+        <w:tc>
+          <w:tcPr>
+            <w:tcW w:w="9854" w:type="dxa"/>
+            <w:tcBorders>
+              <w:top w:val="single" w:sz="4" w:space="0" w:color="auto"/>
+              <w:left w:val="single" w:sz="4" w:space="0" w:color="auto"/>
+              <w:bottom w:val="single" w:sz="4" w:space="0" w:color="auto"/>
+              <w:right w:val="single" w:sz="4" w:space="0" w:color="auto"/>
+            </w:tcBorders>
+            <w:shd w:val="clear" w:color="auto" w:fill="D9D9D9" w:themeFill="background1" w:themeFillShade="D9"/>
+            <w:hideMark/>
+          </w:tcPr>
+          <w:p>
+            <w:pPr>
+              <w:spacing w:after="200" w:line="276" w:lineRule="auto"/>
+              <w:rPr>
+                <w:rFonts w:ascii="Arial" w:hAnsi="Arial" w:cs="Arial"/>
+              </w:rPr>
+            </w:pPr>
+            <w:r>
+              <w:rPr>
+                <w:rFonts w:ascii="Arial" w:hAnsi="Arial" w:cs="Arial"/>
+              </w:rPr>
+              <w:t xml:space="preserve">Sprint </w:t>
+            </w:r>
+            <w:proofErr w:type="spellStart"/>
+            <w:r>
+              <w:rPr>
+                <w:rFonts w:ascii="Arial" w:hAnsi="Arial" w:cs="Arial"/>
+              </w:rPr>
+              <w:t>Retrospective</w:t>
+            </w:r>
+            <w:proofErr w:type="spellEnd"/>
+          </w:p>
+        </w:tc>
+      </w:tr>
+      <w:tr>
+        <w:tc>
+          <w:tcPr>
+            <w:tcW w:w="9854" w:type="dxa"/>
+            <w:tcBorders>
+              <w:top w:val="single" w:sz="4" w:space="0" w:color="auto"/>
+              <w:left w:val="single" w:sz="4" w:space="0" w:color="auto"/>
+              <w:bottom w:val="single" w:sz="4" w:space="0" w:color="auto"/>
+              <w:right w:val="single" w:sz="4" w:space="0" w:color="auto"/>
+            </w:tcBorders>
+          </w:tcPr>
+          <w:p>
+            <w:pPr>
+              <w:spacing w:after="200" w:line="276" w:lineRule="auto"/>
+              <w:rPr>
+                <w:rFonts w:ascii="Arial" w:hAnsi="Arial" w:cs="Arial"/>
+              </w:rPr>
+            </w:pPr>
+          </w:p>
+        </w:tc>
+      </w:tr>
+    </w:tbl>
+    <w:p>
+      <w:pPr>
+        <w:rPr>
+          <w:rFonts w:ascii="Arial" w:hAnsi="Arial" w:cs="Arial"/>
+        </w:rPr>
+      </w:pPr>
+    </w:p>
+    <w:p>
+      <w:pPr>
+        <w:pStyle w:val="Titolo2"/>
+        <w:pBdr>
+          <w:bottom w:val="single" w:sz="4" w:space="1" w:color="auto"/>
+        </w:pBdr>
+      </w:pPr>
+      <w:r>
+        <w:t>Utilizzo Intelligenza Artificiale</w:t>
+      </w:r>
+      <w:r>
+        <w:t xml:space="preserve"> nella giornata</w:t>
+      </w:r>
+    </w:p>
+    <w:p>
+      <w:pPr>
+        <w:pStyle w:val="Nessunaspaziatura"/>
+        <w:rPr>
+          <w:rFonts w:ascii="Arial" w:hAnsi="Arial" w:cs="Arial"/>
+          <w:b/>
+          <w:bCs/>
+        </w:rPr>
+      </w:pPr>
+    </w:p>
+    <w:p>
+      <w:pPr>
+        <w:pStyle w:val="Nessunaspaziatura"/>
+        <w:rPr>
+          <w:rFonts w:ascii="Arial" w:hAnsi="Arial" w:cs="Arial"/>
+        </w:rPr>
+      </w:pPr>
+      <w:sdt>
+        <w:sdtPr>
+          <w:rPr>
+            <w:rFonts w:ascii="Segoe UI Symbol" w:hAnsi="Segoe UI Symbol" w:cs="Segoe UI Symbol"/>
+          </w:rPr>
+          <w:id w:val="-1451775707"/>
+          <w14:checkbox>
+            <w14:checked w14:val="0"/>
+            <w14:checkedState w14:val="2612" w14:font="MS Gothic"/>
+            <w14:uncheckedState w14:val="2610" w14:font="MS Gothic"/>
+          </w14:checkbox>
+        </w:sdtPr>
+        <w:sdtContent>
+          <w:r>
+            <w:rPr>
+              <w:rFonts w:ascii="MS Gothic" w:eastAsia="MS Gothic" w:hAnsi="MS Gothic" w:cs="Segoe UI Symbol" w:hint="eastAsia"/>
+            </w:rPr>
+            <w:t>☐</w:t>
+          </w:r>
+        </w:sdtContent>
+      </w:sdt>
+      <w:r>
+        <w:rPr>
+          <w:rFonts w:ascii="Arial" w:hAnsi="Arial" w:cs="Arial"/>
+        </w:rPr>
+        <w:t xml:space="preserve"> Nessuno</w:t>
+      </w:r>
+      <w:r>
+        <w:br/>
+      </w:r>
+      <w:sdt>
+        <w:sdtPr>
+          <w:rPr>
+            <w:rFonts w:ascii="Segoe UI Symbol" w:hAnsi="Segoe UI Symbol" w:cs="Segoe UI Symbol"/>
+          </w:rPr>
+          <w:id w:val="1688397386"/>
+          <w14:checkbox>
+            <w14:checked w14:val="0"/>
+            <w14:checkedState w14:val="2612" w14:font="MS Gothic"/>
+            <w14:uncheckedState w14:val="2610" w14:font="MS Gothic"/>
+          </w14:checkbox>
+        </w:sdtPr>
+        <w:sdtContent>
+          <w:r>
+            <w:rPr>
+              <w:rFonts w:ascii="MS Gothic" w:eastAsia="MS Gothic" w:hAnsi="MS Gothic" w:cs="Segoe UI Symbol" w:hint="eastAsia"/>
+            </w:rPr>
+            <w:t>☐</w:t>
+          </w:r>
+        </w:sdtContent>
+      </w:sdt>
+      <w:r>
+        <w:rPr>
+          <w:rFonts w:ascii="Arial" w:hAnsi="Arial" w:cs="Arial"/>
+        </w:rPr>
+        <w:t xml:space="preserve"> Occasionale</w:t>
+      </w:r>
+      <w:r>
+        <w:br/>
+      </w:r>
+      <w:sdt>
+        <w:sdtPr>
+          <w:rPr>
+            <w:rFonts w:ascii="Segoe UI Symbol" w:hAnsi="Segoe UI Symbol" w:cs="Segoe UI Symbol"/>
+          </w:rPr>
+          <w:id w:val="550419592"/>
+          <w14:checkbox>
+            <w14:checked w14:val="1"/>
+            <w14:checkedState w14:val="2612" w14:font="MS Gothic"/>
+            <w14:uncheckedState w14:val="2610" w14:font="MS Gothic"/>
+          </w14:checkbox>
+        </w:sdtPr>
+        <w:sdtContent>
+          <w:r>
+            <w:rPr>
+              <w:rFonts w:ascii="MS Gothic" w:eastAsia="MS Gothic" w:hAnsi="MS Gothic" w:cs="Segoe UI Symbol" w:hint="eastAsia"/>
+            </w:rPr>
+            <w:t>☒</w:t>
+          </w:r>
+        </w:sdtContent>
+      </w:sdt>
+      <w:r>
+        <w:rPr>
+          <w:rFonts w:ascii="Arial" w:hAnsi="Arial" w:cs="Arial"/>
+        </w:rPr>
+        <w:t xml:space="preserve"> Frequente</w:t>
+      </w:r>
+    </w:p>
+    <w:p>
+      <w:pPr>
+        <w:pStyle w:val="Nessunaspaziatura"/>
+        <w:rPr>
+          <w:rFonts w:ascii="Arial" w:hAnsi="Arial" w:cs="Arial"/>
+        </w:rPr>
+      </w:pPr>
+    </w:p>
+    <w:p>
+      <w:pPr>
+        <w:pStyle w:val="Nessunaspaziatura"/>
+        <w:spacing w:line="276" w:lineRule="auto"/>
+        <w:rPr>
+          <w:rFonts w:ascii="Arial" w:hAnsi="Arial" w:cs="Arial"/>
+        </w:rPr>
+      </w:pPr>
+      <w:r>
+        <w:rPr>
+          <w:rFonts w:ascii="Arial" w:hAnsi="Arial" w:cs="Arial"/>
+          <w:b/>
+          <w:bCs/>
+        </w:rPr>
+        <w:t>Strumento/i utilizzato/i</w:t>
+      </w:r>
+      <w:r>
+        <w:rPr>
+          <w:rFonts w:ascii="Arial" w:hAnsi="Arial" w:cs="Arial"/>
+          <w:b/>
+          <w:bCs/>
+        </w:rPr>
+        <w:t xml:space="preserve"> </w:t>
+      </w:r>
+      <w:r>
+        <w:rPr>
+          <w:rFonts w:ascii="Arial" w:hAnsi="Arial" w:cs="Arial"/>
+        </w:rPr>
+        <w:t>(es. ChatGPT)</w:t>
+      </w:r>
+      <w:r>
+        <w:rPr>
+          <w:rFonts w:ascii="Arial" w:hAnsi="Arial" w:cs="Arial"/>
+        </w:rPr>
+        <w:t xml:space="preserve">: </w:t>
+      </w:r>
+      <w:sdt>
+        <w:sdtPr>
+          <w:rPr>
+            <w:rFonts w:ascii="Arial" w:hAnsi="Arial" w:cs="Arial"/>
+          </w:rPr>
+          <w:id w:val="290252435"/>
+          <w:placeholder>
+            <w:docPart w:val="1E948FAFC0604F878ED8739B479C4621"/>
+          </w:placeholder>
+        </w:sdtPr>
+        <w:sdtContent>
+          <w:r>
+            <w:rPr>
+              <w:rFonts w:ascii="Arial" w:hAnsi="Arial" w:cs="Arial"/>
+            </w:rPr>
+            <w:t>ChatGPT</w:t>
+          </w:r>
+        </w:sdtContent>
+      </w:sdt>
+    </w:p>
+    <w:p>
+      <w:pPr>
+        <w:pStyle w:val="Nessunaspaziatura"/>
+        <w:rPr>
+          <w:rFonts w:ascii="Arial" w:hAnsi="Arial" w:cs="Arial"/>
+        </w:rPr>
+      </w:pPr>
+    </w:p>
+    <w:p>
+      <w:pPr>
+        <w:pStyle w:val="Nessunaspaziatura"/>
+        <w:rPr>
+          <w:rFonts w:ascii="Arial" w:hAnsi="Arial" w:cs="Arial"/>
+        </w:rPr>
+      </w:pPr>
+      <w:r>
+        <w:rPr>
+          <w:rFonts w:ascii="Arial" w:hAnsi="Arial" w:cs="Arial"/>
+          <w:b/>
+          <w:bCs/>
+        </w:rPr>
+        <w:t>Per cosa l’ho usata oggi</w:t>
+      </w:r>
+      <w:r>
+        <w:br/>
+      </w:r>
+      <w:sdt>
+        <w:sdtPr>
+          <w:rPr>
+            <w:rFonts w:ascii="Segoe UI Symbol" w:hAnsi="Segoe UI Symbol" w:cs="Segoe UI Symbol"/>
+          </w:rPr>
+          <w:id w:val="-285434592"/>
+          <w14:checkbox>
+            <w14:checked w14:val="1"/>
+            <w14:checkedState w14:val="2612" w14:font="MS Gothic"/>
+            <w14:uncheckedState w14:val="2610" w14:font="MS Gothic"/>
+          </w14:checkbox>
+        </w:sdtPr>
+        <w:sdtContent>
+          <w:r>
+            <w:rPr>
+              <w:rFonts w:ascii="MS Gothic" w:eastAsia="MS Gothic" w:hAnsi="MS Gothic" w:cs="Segoe UI Symbol" w:hint="eastAsia"/>
+            </w:rPr>
+            <w:t>☒</w:t>
+          </w:r>
+        </w:sdtContent>
+      </w:sdt>
+      <w:r>
+        <w:rPr>
+          <w:rFonts w:ascii="Arial" w:hAnsi="Arial" w:cs="Arial"/>
+        </w:rPr>
+        <w:t xml:space="preserve"> Chiarire concetti</w:t>
+      </w:r>
+      <w:r>
+        <w:br/>
+      </w:r>
+      <w:sdt>
+        <w:sdtPr>
+          <w:rPr>
+            <w:rFonts w:ascii="Segoe UI Symbol" w:hAnsi="Segoe UI Symbol" w:cs="Segoe UI Symbol"/>
+          </w:rPr>
+          <w:id w:val="639618571"/>
+          <w14:checkbox>
+            <w14:checked w14:val="1"/>
+            <w14:checkedState w14:val="2612" w14:font="MS Gothic"/>
+            <w14:uncheckedState w14:val="2610" w14:font="MS Gothic"/>
+          </w14:checkbox>
+        </w:sdtPr>
+        <w:sdtContent>
+          <w:r>
+            <w:rPr>
+              <w:rFonts w:ascii="MS Gothic" w:eastAsia="MS Gothic" w:hAnsi="MS Gothic" w:cs="Segoe UI Symbol" w:hint="eastAsia"/>
+            </w:rPr>
+            <w:t>☒</w:t>
+          </w:r>
+        </w:sdtContent>
+      </w:sdt>
+      <w:r>
+        <w:rPr>
+          <w:rFonts w:ascii="Arial" w:hAnsi="Arial" w:cs="Arial"/>
+        </w:rPr>
+        <w:t xml:space="preserve"> Supporto al codice</w:t>
+      </w:r>
+      <w:r>
+        <w:br/>
+      </w:r>
+      <w:sdt>
+        <w:sdtPr>
+          <w:rPr>
+            <w:rFonts w:ascii="Segoe UI Symbol" w:hAnsi="Segoe UI Symbol" w:cs="Segoe UI Symbol"/>
+          </w:rPr>
+          <w:id w:val="-553856046"/>
+          <w14:checkbox>
+            <w14:checked w14:val="1"/>
+            <w14:checkedState w14:val="2612" w14:font="MS Gothic"/>
+            <w14:uncheckedState w14:val="2610" w14:font="MS Gothic"/>
+          </w14:checkbox>
+        </w:sdtPr>
+        <w:sdtContent>
+          <w:r>
+            <w:rPr>
+              <w:rFonts w:ascii="MS Gothic" w:eastAsia="MS Gothic" w:hAnsi="MS Gothic" w:cs="Segoe UI Symbol" w:hint="eastAsia"/>
+            </w:rPr>
+            <w:t>☒</w:t>
+          </w:r>
+        </w:sdtContent>
+      </w:sdt>
+      <w:r>
+        <w:rPr>
+          <w:rFonts w:ascii="Arial" w:hAnsi="Arial" w:cs="Arial"/>
+        </w:rPr>
+        <w:t xml:space="preserve"> Debug</w:t>
+      </w:r>
+      <w:r>
+        <w:br/>
+      </w:r>
+      <w:sdt>
+        <w:sdtPr>
+          <w:rPr>
+            <w:rFonts w:ascii="Segoe UI Symbol" w:hAnsi="Segoe UI Symbol" w:cs="Segoe UI Symbol"/>
+          </w:rPr>
+          <w:id w:val="2054425941"/>
+          <w14:checkbox>
+            <w14:checked w14:val="0"/>
+            <w14:checkedState w14:val="2612" w14:font="MS Gothic"/>
+            <w14:uncheckedState w14:val="2610" w14:font="MS Gothic"/>
+          </w14:checkbox>
+        </w:sdtPr>
+        <w:sdtContent>
+          <w:r>
+            <w:rPr>
+              <w:rFonts w:ascii="MS Gothic" w:eastAsia="MS Gothic" w:hAnsi="MS Gothic" w:cs="Segoe UI Symbol" w:hint="eastAsia"/>
+            </w:rPr>
+            <w:t>☐</w:t>
+          </w:r>
+        </w:sdtContent>
+      </w:sdt>
+      <w:r>
+        <w:rPr>
+          <w:rFonts w:ascii="Arial" w:hAnsi="Arial" w:cs="Arial"/>
+        </w:rPr>
+        <w:t xml:space="preserve"> Riorganizzare idee / testi</w:t>
+      </w:r>
+      <w:r>
+        <w:br/>
+      </w:r>
+      <w:sdt>
+        <w:sdtPr>
+          <w:rPr>
+            <w:rFonts w:ascii="Segoe UI Symbol" w:hAnsi="Segoe UI Symbol" w:cs="Segoe UI Symbol"/>
+          </w:rPr>
+          <w:id w:val="-1149979680"/>
+          <w14:checkbox>
+            <w14:checked w14:val="0"/>
+            <w14:checkedState w14:val="2612" w14:font="MS Gothic"/>
+            <w14:uncheckedState w14:val="2610" w14:font="MS Gothic"/>
+          </w14:checkbox>
+        </w:sdtPr>
+        <w:sdtContent>
+          <w:r>
+            <w:rPr>
+              <w:rFonts w:ascii="MS Gothic" w:eastAsia="MS Gothic" w:hAnsi="MS Gothic" w:cs="Segoe UI Symbol" w:hint="eastAsia"/>
+            </w:rPr>
+            <w:t>☐</w:t>
+          </w:r>
+        </w:sdtContent>
+      </w:sdt>
+      <w:r>
+        <w:rPr>
+          <w:rFonts w:ascii="Arial" w:hAnsi="Arial" w:cs="Arial"/>
+        </w:rPr>
+        <w:t xml:space="preserve"> Altro: …</w:t>
+      </w:r>
+    </w:p>
+    <w:p>
+      <w:pPr>
+        <w:pStyle w:val="Nessunaspaziatura"/>
+        <w:rPr>
+          <w:rFonts w:ascii="Arial" w:hAnsi="Arial" w:cs="Arial"/>
+        </w:rPr>
+      </w:pPr>
+    </w:p>
+    <w:p>
+      <w:pPr>
+        <w:pStyle w:val="Nessunaspaziatura"/>
+        <w:rPr>
+          <w:rFonts w:ascii="Arial" w:hAnsi="Arial" w:cs="Arial"/>
+          <w:b/>
+          <w:bCs/>
+        </w:rPr>
+      </w:pPr>
+      <w:r>
+        <w:rPr>
+          <w:rFonts w:ascii="Arial" w:hAnsi="Arial" w:cs="Arial"/>
+          <w:b/>
+          <w:bCs/>
+        </w:rPr>
+        <w:t>Esempio significativo di utilizzo (UNO SOLO)</w:t>
+      </w:r>
+    </w:p>
+    <w:p>
+      <w:pPr>
+        <w:pStyle w:val="Nessunaspaziatura"/>
+        <w:rPr>
+          <w:rFonts w:ascii="Arial" w:hAnsi="Arial" w:cs="Arial"/>
+        </w:rPr>
+      </w:pPr>
+      <w:r>
+        <w:rPr>
+          <w:rFonts w:ascii="Arial" w:hAnsi="Arial" w:cs="Arial"/>
+        </w:rPr>
+        <w:t xml:space="preserve">Riporta </w:t>
+      </w:r>
+      <w:r>
+        <w:rPr>
+          <w:rFonts w:ascii="Arial" w:hAnsi="Arial" w:cs="Arial"/>
+          <w:i/>
+          <w:iCs/>
+        </w:rPr>
+        <w:t>un</w:t>
+      </w:r>
+      <w:r>
+        <w:rPr>
+          <w:rFonts w:ascii="Arial" w:hAnsi="Arial" w:cs="Arial"/>
+        </w:rPr>
+        <w:t xml:space="preserve"> prompt rilevante oppure descrivilo a parole se ce ne sono stati molti.</w:t>
+      </w:r>
+    </w:p>
+    <w:p>
+      <w:pPr>
+        <w:pStyle w:val="Nessunaspaziatura"/>
+        <w:rPr>
+          <w:rFonts w:ascii="Arial" w:hAnsi="Arial" w:cs="Arial"/>
+        </w:rPr>
+      </w:pPr>
+    </w:p>
+    <w:sdt>
+      <w:sdtPr>
+        <w:rPr>
+          <w:rFonts w:ascii="Arial" w:hAnsi="Arial" w:cs="Arial"/>
+        </w:rPr>
+        <w:alias w:val="Prompt AI"/>
+        <w:tag w:val="Prompt AI"/>
+        <w:id w:val="-155071829"/>
+        <w:placeholder>
+          <w:docPart w:val="389EC1687F374A18B9EF7D0C026BCFD7"/>
+        </w:placeholder>
+        <w15:color w:val="C0C0C0"/>
+      </w:sdtPr>
+      <w:sdtContent>
+        <w:p>
+          <w:pPr>
+            <w:pStyle w:val="Nessunaspaziatura"/>
+            <w:spacing w:line="276" w:lineRule="auto"/>
+            <w:rPr>
+              <w:rFonts w:ascii="Arial" w:hAnsi="Arial" w:cs="Arial"/>
+            </w:rPr>
+          </w:pPr>
+          <w:r>
+            <w:rPr>
+              <w:rFonts w:ascii="Arial" w:hAnsi="Arial" w:cs="Arial"/>
+            </w:rPr>
+            <w:t xml:space="preserve">Riley: </w:t>
+          </w:r>
+          <w:r>
+            <w:rPr>
+              <w:rFonts w:ascii="Arial" w:hAnsi="Arial" w:cs="Arial"/>
+            </w:rPr>
+            <w:t xml:space="preserve">Il numero inserito nel </w:t>
+          </w:r>
+          <w:proofErr w:type="spellStart"/>
+          <w:r>
+            <w:rPr>
+              <w:rFonts w:ascii="Arial" w:hAnsi="Arial" w:cs="Arial"/>
+            </w:rPr>
+            <w:t>json</w:t>
+          </w:r>
+          <w:proofErr w:type="spellEnd"/>
+          <w:r>
+            <w:rPr>
+              <w:rFonts w:ascii="Arial" w:hAnsi="Arial" w:cs="Arial"/>
+            </w:rPr>
+            <w:t xml:space="preserve"> risulta essere un numero che va dal miliardo in su, ma l’applicativo lo riduce a milioni, per caso i valori </w:t>
+          </w:r>
+          <w:proofErr w:type="spellStart"/>
+          <w:r>
+            <w:rPr>
+              <w:rFonts w:ascii="Arial" w:hAnsi="Arial" w:cs="Arial"/>
+            </w:rPr>
+            <w:t>int</w:t>
+          </w:r>
+          <w:proofErr w:type="spellEnd"/>
+          <w:r>
+            <w:rPr>
+              <w:rFonts w:ascii="Arial" w:hAnsi="Arial" w:cs="Arial"/>
+            </w:rPr>
+            <w:t xml:space="preserve"> non supportano i miliardi?</w:t>
+          </w:r>
+          <w:r>
+            <w:rPr>
+              <w:rFonts w:ascii="Arial" w:hAnsi="Arial" w:cs="Arial"/>
+            </w:rPr>
+            <w:t xml:space="preserve"> </w:t>
+          </w:r>
+        </w:p>
+      </w:sdtContent>
+    </w:sdt>
+    <w:p>
+      <w:pPr>
+        <w:pStyle w:val="Nessunaspaziatura"/>
+        <w:rPr>
+          <w:rFonts w:ascii="Arial" w:hAnsi="Arial" w:cs="Arial"/>
+        </w:rPr>
+      </w:pPr>
+    </w:p>
+    <w:p>
+      <w:pPr>
+        <w:pStyle w:val="Nessunaspaziatura"/>
+        <w:rPr>
+          <w:rFonts w:ascii="Arial" w:hAnsi="Arial" w:cs="Arial"/>
+        </w:rPr>
+      </w:pPr>
+      <w:r>
+        <w:rPr>
+          <w:rFonts w:ascii="Arial" w:hAnsi="Arial" w:cs="Arial"/>
+          <w:b/>
+          <w:bCs/>
+        </w:rPr>
+        <w:t>Cosa mi ha dato l’AI</w:t>
+      </w:r>
+    </w:p>
+    <w:p>
+      <w:pPr>
+        <w:pStyle w:val="Nessunaspaziatura"/>
+        <w:rPr>
+          <w:rFonts w:ascii="Arial" w:hAnsi="Arial" w:cs="Arial"/>
+        </w:rPr>
+      </w:pPr>
+      <w:r>
+        <w:rPr>
+          <w:rFonts w:ascii="Arial" w:hAnsi="Arial" w:cs="Arial"/>
+        </w:rPr>
+        <w:t>Spiegazione, esempio, soluzione, suggerimento…</w:t>
+      </w:r>
+    </w:p>
+    <w:p>
+      <w:pPr>
+        <w:pStyle w:val="Nessunaspaziatura"/>
+        <w:rPr>
+          <w:rFonts w:ascii="Arial" w:hAnsi="Arial" w:cs="Arial"/>
+        </w:rPr>
+      </w:pPr>
+    </w:p>
+    <w:sdt>
+      <w:sdtPr>
+        <w:rPr>
+          <w:rFonts w:ascii="Arial" w:hAnsi="Arial" w:cs="Arial"/>
+        </w:rPr>
+        <w:alias w:val="Risposta AI"/>
+        <w:tag w:val="Risposta AI"/>
+        <w:id w:val="1675768618"/>
+        <w:placeholder>
+          <w:docPart w:val="7A579F43FD344C24AA05428EF85192A5"/>
+        </w:placeholder>
+        <w15:color w:val="C0C0C0"/>
+      </w:sdtPr>
+      <w:sdtContent>
+        <w:p>
+          <w:pPr>
+            <w:pStyle w:val="Nessunaspaziatura"/>
+            <w:spacing w:line="276" w:lineRule="auto"/>
+            <w:rPr>
+              <w:rFonts w:ascii="Arial" w:hAnsi="Arial" w:cs="Arial"/>
+            </w:rPr>
+          </w:pPr>
+          <w:r>
+            <w:rPr>
+              <w:rFonts w:ascii="Arial" w:hAnsi="Arial" w:cs="Arial"/>
+            </w:rPr>
+            <w:t xml:space="preserve">Riley: </w:t>
+          </w:r>
+          <w:r>
+            <w:rPr>
+              <w:rFonts w:ascii="Arial" w:hAnsi="Arial" w:cs="Arial"/>
+            </w:rPr>
+            <w:t xml:space="preserve">Mi ha detto che </w:t>
+          </w:r>
+          <w:proofErr w:type="spellStart"/>
+          <w:r>
+            <w:rPr>
+              <w:rFonts w:ascii="Arial" w:hAnsi="Arial" w:cs="Arial"/>
+            </w:rPr>
+            <w:t>int</w:t>
+          </w:r>
+          <w:proofErr w:type="spellEnd"/>
+          <w:r>
+            <w:rPr>
+              <w:rFonts w:ascii="Arial" w:hAnsi="Arial" w:cs="Arial"/>
+            </w:rPr>
+            <w:t xml:space="preserve"> supporta i miliardi ma che ha un massimo di circa 2,2 miliardi ed il numero risultava più grande quindi ho ripiegato su un long</w:t>
+          </w:r>
+        </w:p>
+      </w:sdtContent>
+    </w:sdt>
+    <w:p>
+      <w:pPr>
+        <w:pStyle w:val="Nessunaspaziatura"/>
+        <w:rPr>
+          <w:rFonts w:ascii="Arial" w:hAnsi="Arial" w:cs="Arial"/>
+          <w:b/>
+          <w:bCs/>
+        </w:rPr>
+      </w:pPr>
+    </w:p>
+    <w:p>
+      <w:pPr>
+        <w:pStyle w:val="Nessunaspaziatura"/>
+        <w:rPr>
+          <w:rFonts w:ascii="Arial" w:hAnsi="Arial" w:cs="Arial"/>
+        </w:rPr>
+      </w:pPr>
+      <w:r>
+        <w:rPr>
+          <w:rFonts w:ascii="Arial" w:hAnsi="Arial" w:cs="Arial"/>
+          <w:b/>
+          <w:bCs/>
+        </w:rPr>
+        <w:t>Come l’ho usato io</w:t>
+      </w:r>
+      <w:r>
+        <w:rPr>
+          <w:rFonts w:ascii="Arial" w:hAnsi="Arial" w:cs="Arial"/>
+        </w:rPr>
+        <w:br/>
+      </w:r>
+      <w:sdt>
+        <w:sdtPr>
+          <w:rPr>
+            <w:rFonts w:ascii="Segoe UI Symbol" w:hAnsi="Segoe UI Symbol" w:cs="Segoe UI Symbol"/>
+          </w:rPr>
+          <w:id w:val="769746856"/>
+          <w14:checkbox>
+            <w14:checked w14:val="1"/>
+            <w14:checkedState w14:val="2612" w14:font="MS Gothic"/>
+            <w14:uncheckedState w14:val="2610" w14:font="MS Gothic"/>
+          </w14:checkbox>
+        </w:sdtPr>
+        <w:sdtContent>
+          <w:r>
+            <w:rPr>
+              <w:rFonts w:ascii="MS Gothic" w:eastAsia="MS Gothic" w:hAnsi="MS Gothic" w:cs="Segoe UI Symbol" w:hint="eastAsia"/>
+            </w:rPr>
+            <w:t>☒</w:t>
+          </w:r>
+        </w:sdtContent>
+      </w:sdt>
+      <w:r>
+        <w:rPr>
+          <w:rFonts w:ascii="Arial" w:hAnsi="Arial" w:cs="Arial"/>
+        </w:rPr>
+        <w:t xml:space="preserve"> Copiato</w:t>
+      </w:r>
+      <w:r>
+        <w:rPr>
+          <w:rFonts w:ascii="Arial" w:hAnsi="Arial" w:cs="Arial"/>
+        </w:rPr>
+        <w:br/>
+      </w:r>
+      <w:sdt>
+        <w:sdtPr>
+          <w:rPr>
+            <w:rFonts w:ascii="Segoe UI Symbol" w:hAnsi="Segoe UI Symbol" w:cs="Segoe UI Symbol"/>
+          </w:rPr>
+          <w:id w:val="-151761635"/>
+          <w14:checkbox>
+            <w14:checked w14:val="1"/>
+            <w14:checkedState w14:val="2612" w14:font="MS Gothic"/>
+            <w14:uncheckedState w14:val="2610" w14:font="MS Gothic"/>
+          </w14:checkbox>
+        </w:sdtPr>
+        <w:sdtContent>
+          <w:r>
+            <w:rPr>
+              <w:rFonts w:ascii="MS Gothic" w:eastAsia="MS Gothic" w:hAnsi="MS Gothic" w:cs="Segoe UI Symbol" w:hint="eastAsia"/>
+            </w:rPr>
+            <w:t>☒</w:t>
+          </w:r>
+        </w:sdtContent>
+      </w:sdt>
+      <w:r>
+        <w:rPr>
+          <w:rFonts w:ascii="Arial" w:hAnsi="Arial" w:cs="Arial"/>
+        </w:rPr>
+        <w:t xml:space="preserve"> Adattato</w:t>
+      </w:r>
+      <w:r>
+        <w:rPr>
+          <w:rFonts w:ascii="Arial" w:hAnsi="Arial" w:cs="Arial"/>
+        </w:rPr>
+        <w:br/>
+      </w:r>
+      <w:sdt>
+        <w:sdtPr>
+          <w:rPr>
+            <w:rFonts w:ascii="Segoe UI Symbol" w:hAnsi="Segoe UI Symbol" w:cs="Segoe UI Symbol"/>
+          </w:rPr>
+          <w:id w:val="-1531336212"/>
+          <w14:checkbox>
+            <w14:checked w14:val="0"/>
+            <w14:checkedState w14:val="2612" w14:font="MS Gothic"/>
+            <w14:uncheckedState w14:val="2610" w14:font="MS Gothic"/>
+          </w14:checkbox>
+        </w:sdtPr>
+        <w:sdtContent>
+          <w:r>
+            <w:rPr>
+              <w:rFonts w:ascii="MS Gothic" w:eastAsia="MS Gothic" w:hAnsi="MS Gothic" w:cs="Segoe UI Symbol" w:hint="eastAsia"/>
+            </w:rPr>
+            <w:t>☐</w:t>
+          </w:r>
+        </w:sdtContent>
+      </w:sdt>
+      <w:r>
+        <w:rPr>
+          <w:rFonts w:ascii="Arial" w:hAnsi="Arial" w:cs="Arial"/>
+        </w:rPr>
+        <w:t xml:space="preserve"> Usato solo per capire</w:t>
+      </w:r>
+      <w:r>
+        <w:rPr>
+          <w:rFonts w:ascii="Arial" w:hAnsi="Arial" w:cs="Arial"/>
+        </w:rPr>
+        <w:br/>
+      </w:r>
+      <w:sdt>
+        <w:sdtPr>
+          <w:rPr>
+            <w:rFonts w:ascii="Segoe UI Symbol" w:hAnsi="Segoe UI Symbol" w:cs="Segoe UI Symbol"/>
+          </w:rPr>
+          <w:id w:val="347915117"/>
+          <w14:checkbox>
+            <w14:checked w14:val="0"/>
+            <w14:checkedState w14:val="2612" w14:font="MS Gothic"/>
+            <w14:uncheckedState w14:val="2610" w14:font="MS Gothic"/>
+          </w14:checkbox>
+        </w:sdtPr>
+        <w:sdtContent>
+          <w:r>
+            <w:rPr>
+              <w:rFonts w:ascii="MS Gothic" w:eastAsia="MS Gothic" w:hAnsi="MS Gothic" w:cs="Segoe UI Symbol" w:hint="eastAsia"/>
+            </w:rPr>
+            <w:t>☐</w:t>
+          </w:r>
+        </w:sdtContent>
+      </w:sdt>
+      <w:r>
+        <w:rPr>
+          <w:rFonts w:ascii="Arial" w:hAnsi="Arial" w:cs="Arial"/>
+        </w:rPr>
+        <w:t xml:space="preserve"> Scartato</w:t>
+      </w:r>
+    </w:p>
+    <w:p>
+      <w:pPr>
+        <w:pStyle w:val="Nessunaspaziatura"/>
+        <w:rPr>
+          <w:rFonts w:ascii="Arial" w:hAnsi="Arial" w:cs="Arial"/>
+        </w:rPr>
+      </w:pPr>
+    </w:p>
+    <w:p>
+      <w:pPr>
+        <w:pStyle w:val="Nessunaspaziatura"/>
+        <w:rPr>
+          <w:rFonts w:ascii="Arial" w:hAnsi="Arial" w:cs="Arial"/>
+        </w:rPr>
+      </w:pPr>
+    </w:p>
+    <w:p>
+      <w:pPr>
+        <w:pStyle w:val="Nessunaspaziatura"/>
+        <w:rPr>
+          <w:rFonts w:ascii="Arial" w:hAnsi="Arial" w:cs="Arial"/>
+        </w:rPr>
+      </w:pPr>
+      <w:r>
+        <w:rPr>
+          <w:rFonts w:ascii="Arial" w:hAnsi="Arial" w:cs="Arial"/>
+          <w:b/>
+          <w:bCs/>
+        </w:rPr>
+        <w:t>Cosa avrei fatto senza AI?</w:t>
+      </w:r>
+    </w:p>
+    <w:p>
+      <w:pPr>
+        <w:pStyle w:val="Nessunaspaziatura"/>
+        <w:rPr>
+          <w:rFonts w:ascii="Arial" w:hAnsi="Arial" w:cs="Arial"/>
+        </w:rPr>
+      </w:pPr>
+      <w:r>
+        <w:rPr>
+          <w:rFonts w:ascii="Arial" w:hAnsi="Arial" w:cs="Arial"/>
+        </w:rPr>
+        <w:t>Riley: cercato in dei forum o documentazioni.</w:t>
       </w:r>
     </w:p>
     <w:sectPr>
@@ -17492,6 +19147,107 @@
         </w:p>
       </w:docPartBody>
     </w:docPart>
+    <w:docPart>
+      <w:docPartPr>
+        <w:name w:val="1E948FAFC0604F878ED8739B479C4621"/>
+        <w:category>
+          <w:name w:val="Generale"/>
+          <w:gallery w:val="placeholder"/>
+        </w:category>
+        <w:types>
+          <w:type w:val="bbPlcHdr"/>
+        </w:types>
+        <w:behaviors>
+          <w:behavior w:val="content"/>
+        </w:behaviors>
+        <w:guid w:val="{AFB82C3C-B049-43E2-84FE-1A4BB4FD6F63}"/>
+      </w:docPartPr>
+      <w:docPartBody>
+        <w:p>
+          <w:pPr>
+            <w:pStyle w:val="1E948FAFC0604F878ED8739B479C4621"/>
+          </w:pPr>
+          <w:r>
+            <w:rPr>
+              <w:rStyle w:val="Testosegnaposto"/>
+              <w:b/>
+              <w:bCs/>
+            </w:rPr>
+            <w:t>Nomi AI utilizzati</w:t>
+          </w:r>
+        </w:p>
+      </w:docPartBody>
+    </w:docPart>
+    <w:docPart>
+      <w:docPartPr>
+        <w:name w:val="389EC1687F374A18B9EF7D0C026BCFD7"/>
+        <w:category>
+          <w:name w:val="Generale"/>
+          <w:gallery w:val="placeholder"/>
+        </w:category>
+        <w:types>
+          <w:type w:val="bbPlcHdr"/>
+        </w:types>
+        <w:behaviors>
+          <w:behavior w:val="content"/>
+        </w:behaviors>
+        <w:guid w:val="{C044EEE2-559D-4ABC-826B-1466B6A80947}"/>
+      </w:docPartPr>
+      <w:docPartBody>
+        <w:p>
+          <w:pPr>
+            <w:pStyle w:val="389EC1687F374A18B9EF7D0C026BCFD7"/>
+          </w:pPr>
+          <w:r>
+            <w:rPr>
+              <w:rStyle w:val="Testosegnaposto"/>
+            </w:rPr>
+            <w:t>Fare clic o toccare qui per immettere il testo.</w:t>
+          </w:r>
+        </w:p>
+      </w:docPartBody>
+    </w:docPart>
+    <w:docPart>
+      <w:docPartPr>
+        <w:name w:val="7A579F43FD344C24AA05428EF85192A5"/>
+        <w:category>
+          <w:name w:val="Generale"/>
+          <w:gallery w:val="placeholder"/>
+        </w:category>
+        <w:types>
+          <w:type w:val="bbPlcHdr"/>
+        </w:types>
+        <w:behaviors>
+          <w:behavior w:val="content"/>
+        </w:behaviors>
+        <w:guid w:val="{BB76523D-74C6-408B-BDF7-49A58F149C1F}"/>
+      </w:docPartPr>
+      <w:docPartBody>
+        <w:p>
+          <w:pPr>
+            <w:pStyle w:val="7A579F43FD344C24AA05428EF85192A5"/>
+          </w:pPr>
+          <w:r>
+            <w:rPr>
+              <w:rStyle w:val="Testosegnaposto"/>
+            </w:rPr>
+            <w:t xml:space="preserve">Fare clic o toccare qui per </w:t>
+          </w:r>
+          <w:r>
+            <w:rPr>
+              <w:rStyle w:val="Testosegnaposto"/>
+            </w:rPr>
+            <w:t>immettere</w:t>
+          </w:r>
+          <w:r>
+            <w:rPr>
+              <w:rStyle w:val="Testosegnaposto"/>
+            </w:rPr>
+            <w:t xml:space="preserve"> il testo.</w:t>
+          </w:r>
+        </w:p>
+      </w:docPartBody>
+    </w:docPart>
   </w:docParts>
 </w:glossaryDocument>
 </file>
@@ -17623,9 +19379,11 @@
   <w:rsids>
     <w:rsidRoot w:val="00BE72BC"/>
     <w:rsid w:val="00045F3C"/>
+    <w:rsid w:val="000B54FB"/>
     <w:rsid w:val="000D07AC"/>
     <w:rsid w:val="001A3B5C"/>
     <w:rsid w:val="001C42CE"/>
+    <w:rsid w:val="00254718"/>
     <w:rsid w:val="00352469"/>
     <w:rsid w:val="00356BEF"/>
     <w:rsid w:val="00396FDF"/>
@@ -17638,13 +19396,16 @@
     <w:rsid w:val="0063588A"/>
     <w:rsid w:val="0066686E"/>
     <w:rsid w:val="00715227"/>
+    <w:rsid w:val="00727854"/>
     <w:rsid w:val="007312C2"/>
     <w:rsid w:val="00754A35"/>
     <w:rsid w:val="00786637"/>
     <w:rsid w:val="007F4556"/>
     <w:rsid w:val="0080736A"/>
+    <w:rsid w:val="00832BBC"/>
     <w:rsid w:val="008736ED"/>
     <w:rsid w:val="0089581E"/>
+    <w:rsid w:val="008A28AA"/>
     <w:rsid w:val="00924F9E"/>
     <w:rsid w:val="009826E2"/>
     <w:rsid w:val="009A56C6"/>
@@ -17659,6 +19420,7 @@
     <w:rsid w:val="00BD5007"/>
     <w:rsid w:val="00BE72BC"/>
     <w:rsid w:val="00DA48BB"/>
+    <w:rsid w:val="00DC33C8"/>
     <w:rsid w:val="00DE2402"/>
     <w:rsid w:val="00DE4EBE"/>
     <w:rsid w:val="00DF3FD5"/>
@@ -18124,7 +19886,7 @@
     <w:basedOn w:val="Carpredefinitoparagrafo"/>
     <w:uiPriority w:val="99"/>
     <w:semiHidden/>
-    <w:rsid w:val="0089581E"/>
+    <w:rsid w:val="00DC33C8"/>
     <w:rPr>
       <w:color w:val="666666"/>
     </w:rPr>
@@ -18269,6 +20031,18 @@
   <w:style w:type="paragraph" w:customStyle="1" w:styleId="441814869F024490A12585532A8B8967">
     <w:name w:val="441814869F024490A12585532A8B8967"/>
     <w:rsid w:val="0089581E"/>
+  </w:style>
+  <w:style w:type="paragraph" w:customStyle="1" w:styleId="1E948FAFC0604F878ED8739B479C4621">
+    <w:name w:val="1E948FAFC0604F878ED8739B479C4621"/>
+    <w:rsid w:val="00DC33C8"/>
+  </w:style>
+  <w:style w:type="paragraph" w:customStyle="1" w:styleId="389EC1687F374A18B9EF7D0C026BCFD7">
+    <w:name w:val="389EC1687F374A18B9EF7D0C026BCFD7"/>
+    <w:rsid w:val="00DC33C8"/>
+  </w:style>
+  <w:style w:type="paragraph" w:customStyle="1" w:styleId="7A579F43FD344C24AA05428EF85192A5">
+    <w:name w:val="7A579F43FD344C24AA05428EF85192A5"/>
+    <w:rsid w:val="00DC33C8"/>
   </w:style>
 </w:styles>
 </file>

</xml_diff>

<commit_message>
creazione file data per statistiche
</commit_message>
<xml_diff>
--- a/4_Diari/Diario.docx
+++ b/4_Diari/Diario.docx
@@ -13025,7 +13025,19 @@
               <w:rPr>
                 <w:rFonts w:ascii="Arial" w:hAnsi="Arial" w:cs="Arial"/>
               </w:rPr>
-              <w:t>21.09.2026</w:t>
+              <w:t>2</w:t>
+            </w:r>
+            <w:r>
+              <w:rPr>
+                <w:rFonts w:ascii="Arial" w:hAnsi="Arial" w:cs="Arial"/>
+              </w:rPr>
+              <w:t>2</w:t>
+            </w:r>
+            <w:r>
+              <w:rPr>
+                <w:rFonts w:ascii="Arial" w:hAnsi="Arial" w:cs="Arial"/>
+              </w:rPr>
+              <w:t>.09.2026</w:t>
             </w:r>
           </w:p>
         </w:tc>
@@ -13806,12 +13818,20 @@
     </w:p>
     <w:p>
       <w:pPr>
+        <w:rPr>
+          <w:rFonts w:ascii="Arial" w:hAnsi="Arial" w:cs="Arial"/>
+        </w:rPr>
+      </w:pPr>
+    </w:p>
+    <w:p>
+      <w:pPr>
         <w:pStyle w:val="Titolo2"/>
         <w:pBdr>
           <w:bottom w:val="single" w:sz="4" w:space="1" w:color="auto"/>
         </w:pBdr>
       </w:pPr>
       <w:r>
+        <w:lastRenderedPageBreak/>
         <w:t>Utilizzo Intelligenza Artificiale</w:t>
       </w:r>
       <w:r>
@@ -14594,6 +14614,1683 @@
         </w:rPr>
         <w:t>Riley: cercato in dei forum o documentazioni.</w:t>
       </w:r>
+    </w:p>
+    <w:p>
+      <w:pPr>
+        <w:rPr>
+          <w:rFonts w:ascii="Arial" w:hAnsi="Arial" w:cs="Arial"/>
+        </w:rPr>
+      </w:pPr>
+      <w:r>
+        <w:rPr>
+          <w:rFonts w:ascii="Arial" w:hAnsi="Arial" w:cs="Arial"/>
+        </w:rPr>
+        <w:br w:type="page"/>
+      </w:r>
+    </w:p>
+    <w:tbl>
+      <w:tblPr>
+        <w:tblStyle w:val="Grigliatabella"/>
+        <w:tblW w:w="5000" w:type="pct"/>
+        <w:tblLook w:val="04A0" w:firstRow="1" w:lastRow="0" w:firstColumn="1" w:lastColumn="0" w:noHBand="0" w:noVBand="1"/>
+      </w:tblPr>
+      <w:tblGrid>
+        <w:gridCol w:w="2407"/>
+        <w:gridCol w:w="7221"/>
+      </w:tblGrid>
+      <w:tr>
+        <w:trPr>
+          <w:trHeight w:val="199"/>
+        </w:trPr>
+        <w:tc>
+          <w:tcPr>
+            <w:tcW w:w="1250" w:type="pct"/>
+            <w:vAlign w:val="center"/>
+          </w:tcPr>
+          <w:p>
+            <w:pPr>
+              <w:rPr>
+                <w:rFonts w:ascii="Arial" w:hAnsi="Arial" w:cs="Arial"/>
+              </w:rPr>
+            </w:pPr>
+            <w:r>
+              <w:rPr>
+                <w:rFonts w:ascii="Arial" w:hAnsi="Arial" w:cs="Arial"/>
+              </w:rPr>
+              <w:lastRenderedPageBreak/>
+              <w:t>Luogo</w:t>
+            </w:r>
+          </w:p>
+        </w:tc>
+        <w:tc>
+          <w:tcPr>
+            <w:tcW w:w="3750" w:type="pct"/>
+            <w:vAlign w:val="center"/>
+          </w:tcPr>
+          <w:p>
+            <w:pPr>
+              <w:rPr>
+                <w:rFonts w:ascii="Arial" w:hAnsi="Arial" w:cs="Arial"/>
+              </w:rPr>
+            </w:pPr>
+            <w:r>
+              <w:rPr>
+                <w:rFonts w:ascii="Arial" w:hAnsi="Arial" w:cs="Arial"/>
+              </w:rPr>
+              <w:t>Scuola Arti e Mestieri Trevano</w:t>
+            </w:r>
+          </w:p>
+        </w:tc>
+      </w:tr>
+      <w:tr>
+        <w:trPr>
+          <w:trHeight w:val="196"/>
+        </w:trPr>
+        <w:tc>
+          <w:tcPr>
+            <w:tcW w:w="1250" w:type="pct"/>
+            <w:vAlign w:val="center"/>
+          </w:tcPr>
+          <w:p>
+            <w:pPr>
+              <w:rPr>
+                <w:rFonts w:ascii="Arial" w:hAnsi="Arial" w:cs="Arial"/>
+              </w:rPr>
+            </w:pPr>
+            <w:r>
+              <w:rPr>
+                <w:rFonts w:ascii="Arial" w:hAnsi="Arial" w:cs="Arial"/>
+              </w:rPr>
+              <w:t>Data</w:t>
+            </w:r>
+          </w:p>
+        </w:tc>
+        <w:tc>
+          <w:tcPr>
+            <w:tcW w:w="3750" w:type="pct"/>
+            <w:vAlign w:val="center"/>
+          </w:tcPr>
+          <w:p>
+            <w:pPr>
+              <w:rPr>
+                <w:rFonts w:ascii="Arial" w:hAnsi="Arial" w:cs="Arial"/>
+              </w:rPr>
+            </w:pPr>
+            <w:r>
+              <w:rPr>
+                <w:rFonts w:ascii="Arial" w:hAnsi="Arial" w:cs="Arial"/>
+              </w:rPr>
+              <w:t>2</w:t>
+            </w:r>
+            <w:r>
+              <w:rPr>
+                <w:rFonts w:ascii="Arial" w:hAnsi="Arial" w:cs="Arial"/>
+              </w:rPr>
+              <w:t>5</w:t>
+            </w:r>
+            <w:r>
+              <w:rPr>
+                <w:rFonts w:ascii="Arial" w:hAnsi="Arial" w:cs="Arial"/>
+              </w:rPr>
+              <w:t>.09.2026</w:t>
+            </w:r>
+          </w:p>
+        </w:tc>
+      </w:tr>
+    </w:tbl>
+    <w:p>
+      <w:pPr>
+        <w:rPr>
+          <w:rFonts w:ascii="Arial" w:hAnsi="Arial" w:cs="Arial"/>
+        </w:rPr>
+      </w:pPr>
+    </w:p>
+    <w:tbl>
+      <w:tblPr>
+        <w:tblStyle w:val="Grigliatabella"/>
+        <w:tblW w:w="0" w:type="auto"/>
+        <w:tblLook w:val="04A0" w:firstRow="1" w:lastRow="0" w:firstColumn="1" w:lastColumn="0" w:noHBand="0" w:noVBand="1"/>
+      </w:tblPr>
+      <w:tblGrid>
+        <w:gridCol w:w="1271"/>
+        <w:gridCol w:w="8357"/>
+      </w:tblGrid>
+      <w:tr>
+        <w:tc>
+          <w:tcPr>
+            <w:tcW w:w="9628" w:type="dxa"/>
+            <w:gridSpan w:val="2"/>
+            <w:shd w:val="clear" w:color="auto" w:fill="D9D9D9" w:themeFill="background1" w:themeFillShade="D9"/>
+          </w:tcPr>
+          <w:p>
+            <w:pPr>
+              <w:rPr>
+                <w:rFonts w:ascii="Arial" w:hAnsi="Arial" w:cs="Arial"/>
+              </w:rPr>
+            </w:pPr>
+            <w:r>
+              <w:rPr>
+                <w:rFonts w:ascii="Arial" w:hAnsi="Arial" w:cs="Arial"/>
+              </w:rPr>
+              <w:t>Lavori svolti</w:t>
+            </w:r>
+          </w:p>
+        </w:tc>
+      </w:tr>
+      <w:tr>
+        <w:tc>
+          <w:tcPr>
+            <w:tcW w:w="1271" w:type="dxa"/>
+          </w:tcPr>
+          <w:p>
+            <w:pPr>
+              <w:rPr>
+                <w:rFonts w:ascii="Arial" w:hAnsi="Arial" w:cs="Arial"/>
+              </w:rPr>
+            </w:pPr>
+            <w:r>
+              <w:rPr>
+                <w:rFonts w:ascii="Arial" w:hAnsi="Arial" w:cs="Arial"/>
+              </w:rPr>
+              <w:t>Riley</w:t>
+            </w:r>
+          </w:p>
+        </w:tc>
+        <w:tc>
+          <w:tcPr>
+            <w:tcW w:w="8357" w:type="dxa"/>
+          </w:tcPr>
+          <w:p>
+            <w:pPr>
+              <w:rPr>
+                <w:rFonts w:ascii="Arial" w:hAnsi="Arial" w:cs="Arial"/>
+              </w:rPr>
+            </w:pPr>
+            <w:r>
+              <w:rPr>
+                <w:rFonts w:ascii="Arial" w:hAnsi="Arial" w:cs="Arial"/>
+              </w:rPr>
+              <w:t>Terminato script statistiche.</w:t>
+            </w:r>
+          </w:p>
+        </w:tc>
+      </w:tr>
+      <w:tr>
+        <w:tc>
+          <w:tcPr>
+            <w:tcW w:w="1271" w:type="dxa"/>
+          </w:tcPr>
+          <w:p>
+            <w:pPr>
+              <w:rPr>
+                <w:rFonts w:ascii="Arial" w:hAnsi="Arial" w:cs="Arial"/>
+              </w:rPr>
+            </w:pPr>
+            <w:r>
+              <w:rPr>
+                <w:rFonts w:ascii="Arial" w:hAnsi="Arial" w:cs="Arial"/>
+              </w:rPr>
+              <w:t>Bryan</w:t>
+            </w:r>
+          </w:p>
+        </w:tc>
+        <w:tc>
+          <w:tcPr>
+            <w:tcW w:w="8357" w:type="dxa"/>
+          </w:tcPr>
+          <w:p>
+            <w:pPr>
+              <w:rPr>
+                <w:rFonts w:ascii="Arial" w:hAnsi="Arial" w:cs="Arial"/>
+              </w:rPr>
+            </w:pPr>
+            <w:r>
+              <w:rPr>
+                <w:rFonts w:ascii="Arial" w:hAnsi="Arial" w:cs="Arial"/>
+              </w:rPr>
+              <w:t>Terminata UI Impostazioni e Comandi, aggiornata la documentazione.</w:t>
+            </w:r>
+          </w:p>
+        </w:tc>
+      </w:tr>
+    </w:tbl>
+    <w:p>
+      <w:pPr>
+        <w:rPr>
+          <w:rFonts w:ascii="Arial" w:hAnsi="Arial" w:cs="Arial"/>
+        </w:rPr>
+      </w:pPr>
+    </w:p>
+    <w:tbl>
+      <w:tblPr>
+        <w:tblStyle w:val="Grigliatabella"/>
+        <w:tblW w:w="0" w:type="auto"/>
+        <w:tblInd w:w="-5" w:type="dxa"/>
+        <w:tblLook w:val="04A0" w:firstRow="1" w:lastRow="0" w:firstColumn="1" w:lastColumn="0" w:noHBand="0" w:noVBand="1"/>
+      </w:tblPr>
+      <w:tblGrid>
+        <w:gridCol w:w="1276"/>
+        <w:gridCol w:w="8357"/>
+      </w:tblGrid>
+      <w:tr>
+        <w:tc>
+          <w:tcPr>
+            <w:tcW w:w="9628" w:type="dxa"/>
+            <w:gridSpan w:val="2"/>
+            <w:shd w:val="clear" w:color="auto" w:fill="D9D9D9" w:themeFill="background1" w:themeFillShade="D9"/>
+          </w:tcPr>
+          <w:p>
+            <w:pPr>
+              <w:rPr>
+                <w:rFonts w:ascii="Arial" w:hAnsi="Arial" w:cs="Arial"/>
+              </w:rPr>
+            </w:pPr>
+            <w:r>
+              <w:rPr>
+                <w:rFonts w:ascii="Arial" w:hAnsi="Arial" w:cs="Arial"/>
+              </w:rPr>
+              <w:t>Problemi riscontrati e soluzioni adottate</w:t>
+            </w:r>
+          </w:p>
+        </w:tc>
+      </w:tr>
+      <w:tr>
+        <w:tc>
+          <w:tcPr>
+            <w:tcW w:w="1276" w:type="dxa"/>
+          </w:tcPr>
+          <w:p>
+            <w:pPr>
+              <w:rPr>
+                <w:rFonts w:ascii="Arial" w:hAnsi="Arial" w:cs="Arial"/>
+              </w:rPr>
+            </w:pPr>
+            <w:r>
+              <w:rPr>
+                <w:rFonts w:ascii="Arial" w:hAnsi="Arial" w:cs="Arial"/>
+              </w:rPr>
+              <w:t>Riley</w:t>
+            </w:r>
+          </w:p>
+        </w:tc>
+        <w:tc>
+          <w:tcPr>
+            <w:tcW w:w="8357" w:type="dxa"/>
+          </w:tcPr>
+          <w:p>
+            <w:pPr>
+              <w:rPr>
+                <w:rFonts w:ascii="Arial" w:hAnsi="Arial" w:cs="Arial"/>
+              </w:rPr>
+            </w:pPr>
+            <w:r>
+              <w:rPr>
+                <w:rFonts w:ascii="Arial" w:hAnsi="Arial" w:cs="Arial"/>
+              </w:rPr>
+              <w:t>-</w:t>
+            </w:r>
+          </w:p>
+        </w:tc>
+      </w:tr>
+      <w:tr>
+        <w:tc>
+          <w:tcPr>
+            <w:tcW w:w="1276" w:type="dxa"/>
+          </w:tcPr>
+          <w:p>
+            <w:pPr>
+              <w:rPr>
+                <w:rFonts w:ascii="Arial" w:hAnsi="Arial" w:cs="Arial"/>
+              </w:rPr>
+            </w:pPr>
+            <w:r>
+              <w:rPr>
+                <w:rFonts w:ascii="Arial" w:hAnsi="Arial" w:cs="Arial"/>
+              </w:rPr>
+              <w:t>Bryan</w:t>
+            </w:r>
+          </w:p>
+        </w:tc>
+        <w:tc>
+          <w:tcPr>
+            <w:tcW w:w="8357" w:type="dxa"/>
+          </w:tcPr>
+          <w:p>
+            <w:pPr>
+              <w:rPr>
+                <w:rFonts w:ascii="Arial" w:hAnsi="Arial" w:cs="Arial"/>
+              </w:rPr>
+            </w:pPr>
+            <w:r>
+              <w:rPr>
+                <w:rFonts w:ascii="Arial" w:hAnsi="Arial" w:cs="Arial"/>
+              </w:rPr>
+              <w:t>-</w:t>
+            </w:r>
+          </w:p>
+        </w:tc>
+      </w:tr>
+    </w:tbl>
+    <w:p>
+      <w:pPr>
+        <w:rPr>
+          <w:rFonts w:ascii="Arial" w:hAnsi="Arial" w:cs="Arial"/>
+        </w:rPr>
+      </w:pPr>
+    </w:p>
+    <w:tbl>
+      <w:tblPr>
+        <w:tblStyle w:val="Grigliatabella"/>
+        <w:tblW w:w="0" w:type="auto"/>
+        <w:tblLook w:val="04A0" w:firstRow="1" w:lastRow="0" w:firstColumn="1" w:lastColumn="0" w:noHBand="0" w:noVBand="1"/>
+      </w:tblPr>
+      <w:tblGrid>
+        <w:gridCol w:w="9628"/>
+      </w:tblGrid>
+      <w:tr>
+        <w:tc>
+          <w:tcPr>
+            <w:tcW w:w="9854" w:type="dxa"/>
+            <w:shd w:val="clear" w:color="auto" w:fill="D9D9D9" w:themeFill="background1" w:themeFillShade="D9"/>
+          </w:tcPr>
+          <w:p>
+            <w:pPr>
+              <w:rPr>
+                <w:rFonts w:ascii="Arial" w:hAnsi="Arial" w:cs="Arial"/>
+              </w:rPr>
+            </w:pPr>
+            <w:r>
+              <w:rPr>
+                <w:rFonts w:ascii="Arial" w:hAnsi="Arial" w:cs="Arial"/>
+              </w:rPr>
+              <w:t>Punto della situazione rispetto alla pianificazione</w:t>
+            </w:r>
+          </w:p>
+        </w:tc>
+      </w:tr>
+      <w:tr>
+        <w:tc>
+          <w:tcPr>
+            <w:tcW w:w="9854" w:type="dxa"/>
+          </w:tcPr>
+          <w:p>
+            <w:pPr>
+              <w:rPr>
+                <w:rFonts w:ascii="Arial" w:hAnsi="Arial" w:cs="Arial"/>
+              </w:rPr>
+            </w:pPr>
+            <w:r>
+              <w:rPr>
+                <w:rFonts w:ascii="Arial" w:hAnsi="Arial" w:cs="Arial"/>
+              </w:rPr>
+              <w:t xml:space="preserve">Rispetto alla pianificazione abbiamo un leggero ritardo avendo finito solo oggi le statistiche, ma questo risulta recuperabile essendo che lavoriamo separatamente dividendo </w:t>
+            </w:r>
+            <w:proofErr w:type="spellStart"/>
+            <w:r>
+              <w:rPr>
+                <w:rFonts w:ascii="Arial" w:hAnsi="Arial" w:cs="Arial"/>
+              </w:rPr>
+              <w:t>ui</w:t>
+            </w:r>
+            <w:proofErr w:type="spellEnd"/>
+            <w:r>
+              <w:rPr>
+                <w:rFonts w:ascii="Arial" w:hAnsi="Arial" w:cs="Arial"/>
+              </w:rPr>
+              <w:t xml:space="preserve"> e scripting, infatti </w:t>
+            </w:r>
+            <w:proofErr w:type="spellStart"/>
+            <w:r>
+              <w:rPr>
+                <w:rFonts w:ascii="Arial" w:hAnsi="Arial" w:cs="Arial"/>
+              </w:rPr>
+              <w:t>bryan</w:t>
+            </w:r>
+            <w:proofErr w:type="spellEnd"/>
+            <w:r>
+              <w:rPr>
+                <w:rFonts w:ascii="Arial" w:hAnsi="Arial" w:cs="Arial"/>
+              </w:rPr>
+              <w:t xml:space="preserve"> ha iniziato la </w:t>
+            </w:r>
+            <w:proofErr w:type="spellStart"/>
+            <w:r>
+              <w:rPr>
+                <w:rFonts w:ascii="Arial" w:hAnsi="Arial" w:cs="Arial"/>
+              </w:rPr>
+              <w:t>ui</w:t>
+            </w:r>
+            <w:proofErr w:type="spellEnd"/>
+            <w:r>
+              <w:rPr>
+                <w:rFonts w:ascii="Arial" w:hAnsi="Arial" w:cs="Arial"/>
+              </w:rPr>
+              <w:t xml:space="preserve"> delle impostazioni il giorno previsto.</w:t>
+            </w:r>
+          </w:p>
+        </w:tc>
+      </w:tr>
+    </w:tbl>
+    <w:p>
+      <w:pPr>
+        <w:rPr>
+          <w:rFonts w:ascii="Arial" w:hAnsi="Arial" w:cs="Arial"/>
+        </w:rPr>
+      </w:pPr>
+    </w:p>
+    <w:tbl>
+      <w:tblPr>
+        <w:tblStyle w:val="Grigliatabella"/>
+        <w:tblW w:w="0" w:type="auto"/>
+        <w:tblLook w:val="04A0" w:firstRow="1" w:lastRow="0" w:firstColumn="1" w:lastColumn="0" w:noHBand="0" w:noVBand="1"/>
+      </w:tblPr>
+      <w:tblGrid>
+        <w:gridCol w:w="9628"/>
+      </w:tblGrid>
+      <w:tr>
+        <w:tc>
+          <w:tcPr>
+            <w:tcW w:w="9854" w:type="dxa"/>
+            <w:shd w:val="clear" w:color="auto" w:fill="D9D9D9" w:themeFill="background1" w:themeFillShade="D9"/>
+          </w:tcPr>
+          <w:p>
+            <w:pPr>
+              <w:rPr>
+                <w:rFonts w:ascii="Arial" w:hAnsi="Arial" w:cs="Arial"/>
+              </w:rPr>
+            </w:pPr>
+            <w:r>
+              <w:rPr>
+                <w:rFonts w:ascii="Arial" w:hAnsi="Arial" w:cs="Arial"/>
+              </w:rPr>
+              <w:t>Programma di massima per la prossima giornata di lavoro</w:t>
+            </w:r>
+          </w:p>
+        </w:tc>
+      </w:tr>
+      <w:tr>
+        <w:tc>
+          <w:tcPr>
+            <w:tcW w:w="9854" w:type="dxa"/>
+          </w:tcPr>
+          <w:p>
+            <w:pPr>
+              <w:rPr>
+                <w:rFonts w:ascii="Arial" w:hAnsi="Arial" w:cs="Arial"/>
+              </w:rPr>
+            </w:pPr>
+            <w:r>
+              <w:rPr>
+                <w:rFonts w:ascii="Arial" w:hAnsi="Arial" w:cs="Arial"/>
+              </w:rPr>
+              <w:t>Riley non sarà presente mercoledì 23 perciò cercherà di iniziare e concludere gli script per le impostazioni.</w:t>
+            </w:r>
+          </w:p>
+          <w:p>
+            <w:pPr>
+              <w:rPr>
+                <w:rFonts w:ascii="Arial" w:hAnsi="Arial" w:cs="Arial"/>
+              </w:rPr>
+            </w:pPr>
+            <w:r>
+              <w:rPr>
+                <w:rFonts w:ascii="Arial" w:hAnsi="Arial" w:cs="Arial"/>
+              </w:rPr>
+              <w:t>Bryan comincerà la logica di gestione dei comandi.</w:t>
+            </w:r>
+          </w:p>
+        </w:tc>
+      </w:tr>
+    </w:tbl>
+    <w:p>
+      <w:pPr>
+        <w:rPr>
+          <w:rFonts w:ascii="Arial" w:hAnsi="Arial" w:cs="Arial"/>
+        </w:rPr>
+      </w:pPr>
+    </w:p>
+    <w:p>
+      <w:pPr>
+        <w:pStyle w:val="Titolo1"/>
+      </w:pPr>
+      <w:r>
+        <w:t>Agile - Resoconto</w:t>
+      </w:r>
+    </w:p>
+    <w:tbl>
+      <w:tblPr>
+        <w:tblStyle w:val="Grigliatabella"/>
+        <w:tblW w:w="0" w:type="auto"/>
+        <w:tblLook w:val="04A0" w:firstRow="1" w:lastRow="0" w:firstColumn="1" w:lastColumn="0" w:noHBand="0" w:noVBand="1"/>
+      </w:tblPr>
+      <w:tblGrid>
+        <w:gridCol w:w="9628"/>
+      </w:tblGrid>
+      <w:tr>
+        <w:tc>
+          <w:tcPr>
+            <w:tcW w:w="9628" w:type="dxa"/>
+            <w:tcBorders>
+              <w:top w:val="single" w:sz="4" w:space="0" w:color="auto"/>
+              <w:left w:val="single" w:sz="4" w:space="0" w:color="auto"/>
+              <w:bottom w:val="single" w:sz="4" w:space="0" w:color="auto"/>
+              <w:right w:val="single" w:sz="4" w:space="0" w:color="auto"/>
+            </w:tcBorders>
+            <w:shd w:val="clear" w:color="auto" w:fill="D9D9D9" w:themeFill="background1" w:themeFillShade="D9"/>
+            <w:hideMark/>
+          </w:tcPr>
+          <w:p>
+            <w:pPr>
+              <w:spacing w:after="200" w:line="276" w:lineRule="auto"/>
+              <w:rPr>
+                <w:rFonts w:ascii="Arial" w:hAnsi="Arial" w:cs="Arial"/>
+              </w:rPr>
+            </w:pPr>
+            <w:proofErr w:type="spellStart"/>
+            <w:r>
+              <w:rPr>
+                <w:rFonts w:ascii="Arial" w:hAnsi="Arial" w:cs="Arial"/>
+              </w:rPr>
+              <w:t>Daily</w:t>
+            </w:r>
+            <w:proofErr w:type="spellEnd"/>
+            <w:r>
+              <w:rPr>
+                <w:rFonts w:ascii="Arial" w:hAnsi="Arial" w:cs="Arial"/>
+              </w:rPr>
+              <w:t xml:space="preserve"> </w:t>
+            </w:r>
+            <w:proofErr w:type="spellStart"/>
+            <w:r>
+              <w:rPr>
+                <w:rFonts w:ascii="Arial" w:hAnsi="Arial" w:cs="Arial"/>
+              </w:rPr>
+              <w:t>Scrum</w:t>
+            </w:r>
+            <w:proofErr w:type="spellEnd"/>
+          </w:p>
+        </w:tc>
+      </w:tr>
+      <w:tr>
+        <w:tc>
+          <w:tcPr>
+            <w:tcW w:w="9628" w:type="dxa"/>
+            <w:tcBorders>
+              <w:top w:val="single" w:sz="4" w:space="0" w:color="auto"/>
+              <w:left w:val="single" w:sz="4" w:space="0" w:color="auto"/>
+              <w:bottom w:val="single" w:sz="4" w:space="0" w:color="auto"/>
+              <w:right w:val="single" w:sz="4" w:space="0" w:color="auto"/>
+            </w:tcBorders>
+            <w:hideMark/>
+          </w:tcPr>
+          <w:p>
+            <w:pPr>
+              <w:spacing w:after="200" w:line="276" w:lineRule="auto"/>
+              <w:rPr>
+                <w:rFonts w:ascii="Arial" w:hAnsi="Arial" w:cs="Arial"/>
+              </w:rPr>
+            </w:pPr>
+          </w:p>
+        </w:tc>
+      </w:tr>
+      <w:tr>
+        <w:tc>
+          <w:tcPr>
+            <w:tcW w:w="9628" w:type="dxa"/>
+            <w:tcBorders>
+              <w:top w:val="single" w:sz="4" w:space="0" w:color="auto"/>
+              <w:left w:val="single" w:sz="4" w:space="0" w:color="auto"/>
+              <w:bottom w:val="single" w:sz="4" w:space="0" w:color="auto"/>
+              <w:right w:val="single" w:sz="4" w:space="0" w:color="auto"/>
+            </w:tcBorders>
+          </w:tcPr>
+          <w:p>
+            <w:pPr>
+              <w:spacing w:after="200" w:line="276" w:lineRule="auto"/>
+              <w:rPr>
+                <w:rFonts w:ascii="Arial" w:hAnsi="Arial" w:cs="Arial"/>
+              </w:rPr>
+            </w:pPr>
+            <w:r>
+              <w:rPr>
+                <w:rFonts w:ascii="Arial" w:hAnsi="Arial" w:cs="Arial"/>
+              </w:rPr>
+              <w:t xml:space="preserve">Riley: </w:t>
+            </w:r>
+            <w:r>
+              <w:rPr>
+                <w:rFonts w:ascii="Arial" w:hAnsi="Arial" w:cs="Arial"/>
+              </w:rPr>
+              <w:t>Fare e completare lo script per le impostazioni.</w:t>
+            </w:r>
+          </w:p>
+          <w:p>
+            <w:pPr>
+              <w:spacing w:after="200" w:line="276" w:lineRule="auto"/>
+              <w:rPr>
+                <w:rFonts w:ascii="Arial" w:hAnsi="Arial" w:cs="Arial"/>
+              </w:rPr>
+            </w:pPr>
+            <w:r>
+              <w:rPr>
+                <w:rFonts w:ascii="Arial" w:hAnsi="Arial" w:cs="Arial"/>
+              </w:rPr>
+              <w:t xml:space="preserve">Bryan: </w:t>
+            </w:r>
+            <w:r>
+              <w:rPr>
+                <w:rFonts w:ascii="Arial" w:hAnsi="Arial" w:cs="Arial"/>
+              </w:rPr>
+              <w:t>Finestra dei comandi modulare</w:t>
+            </w:r>
+          </w:p>
+        </w:tc>
+      </w:tr>
+    </w:tbl>
+    <w:p>
+      <w:pPr>
+        <w:rPr>
+          <w:rFonts w:ascii="Arial" w:hAnsi="Arial" w:cs="Arial"/>
+        </w:rPr>
+      </w:pPr>
+    </w:p>
+    <w:tbl>
+      <w:tblPr>
+        <w:tblStyle w:val="Grigliatabella"/>
+        <w:tblW w:w="0" w:type="auto"/>
+        <w:tblLook w:val="04A0" w:firstRow="1" w:lastRow="0" w:firstColumn="1" w:lastColumn="0" w:noHBand="0" w:noVBand="1"/>
+      </w:tblPr>
+      <w:tblGrid>
+        <w:gridCol w:w="9628"/>
+      </w:tblGrid>
+      <w:tr>
+        <w:tc>
+          <w:tcPr>
+            <w:tcW w:w="9854" w:type="dxa"/>
+            <w:tcBorders>
+              <w:top w:val="single" w:sz="4" w:space="0" w:color="auto"/>
+              <w:left w:val="single" w:sz="4" w:space="0" w:color="auto"/>
+              <w:bottom w:val="single" w:sz="4" w:space="0" w:color="auto"/>
+              <w:right w:val="single" w:sz="4" w:space="0" w:color="auto"/>
+            </w:tcBorders>
+            <w:shd w:val="clear" w:color="auto" w:fill="D9D9D9" w:themeFill="background1" w:themeFillShade="D9"/>
+            <w:hideMark/>
+          </w:tcPr>
+          <w:p>
+            <w:pPr>
+              <w:spacing w:after="200" w:line="276" w:lineRule="auto"/>
+              <w:rPr>
+                <w:rFonts w:ascii="Arial" w:hAnsi="Arial" w:cs="Arial"/>
+              </w:rPr>
+            </w:pPr>
+            <w:r>
+              <w:rPr>
+                <w:rFonts w:ascii="Arial" w:hAnsi="Arial" w:cs="Arial"/>
+              </w:rPr>
+              <w:t>Sprint Planning</w:t>
+            </w:r>
+          </w:p>
+        </w:tc>
+      </w:tr>
+      <w:tr>
+        <w:tc>
+          <w:tcPr>
+            <w:tcW w:w="9854" w:type="dxa"/>
+            <w:tcBorders>
+              <w:top w:val="single" w:sz="4" w:space="0" w:color="auto"/>
+              <w:left w:val="single" w:sz="4" w:space="0" w:color="auto"/>
+              <w:bottom w:val="single" w:sz="4" w:space="0" w:color="auto"/>
+              <w:right w:val="single" w:sz="4" w:space="0" w:color="auto"/>
+            </w:tcBorders>
+          </w:tcPr>
+          <w:p>
+            <w:pPr>
+              <w:spacing w:after="200" w:line="276" w:lineRule="auto"/>
+              <w:rPr>
+                <w:rFonts w:ascii="Arial" w:hAnsi="Arial" w:cs="Arial"/>
+              </w:rPr>
+            </w:pPr>
+          </w:p>
+        </w:tc>
+      </w:tr>
+    </w:tbl>
+    <w:p>
+      <w:pPr>
+        <w:rPr>
+          <w:rFonts w:ascii="Arial" w:hAnsi="Arial" w:cs="Arial"/>
+        </w:rPr>
+      </w:pPr>
+    </w:p>
+    <w:tbl>
+      <w:tblPr>
+        <w:tblStyle w:val="Grigliatabella"/>
+        <w:tblW w:w="0" w:type="auto"/>
+        <w:tblLook w:val="04A0" w:firstRow="1" w:lastRow="0" w:firstColumn="1" w:lastColumn="0" w:noHBand="0" w:noVBand="1"/>
+      </w:tblPr>
+      <w:tblGrid>
+        <w:gridCol w:w="9628"/>
+      </w:tblGrid>
+      <w:tr>
+        <w:tc>
+          <w:tcPr>
+            <w:tcW w:w="9854" w:type="dxa"/>
+            <w:tcBorders>
+              <w:top w:val="single" w:sz="4" w:space="0" w:color="auto"/>
+              <w:left w:val="single" w:sz="4" w:space="0" w:color="auto"/>
+              <w:bottom w:val="single" w:sz="4" w:space="0" w:color="auto"/>
+              <w:right w:val="single" w:sz="4" w:space="0" w:color="auto"/>
+            </w:tcBorders>
+            <w:shd w:val="clear" w:color="auto" w:fill="D9D9D9" w:themeFill="background1" w:themeFillShade="D9"/>
+            <w:hideMark/>
+          </w:tcPr>
+          <w:p>
+            <w:pPr>
+              <w:spacing w:after="200" w:line="276" w:lineRule="auto"/>
+              <w:rPr>
+                <w:rFonts w:ascii="Arial" w:hAnsi="Arial" w:cs="Arial"/>
+              </w:rPr>
+            </w:pPr>
+            <w:r>
+              <w:rPr>
+                <w:rFonts w:ascii="Arial" w:hAnsi="Arial" w:cs="Arial"/>
+              </w:rPr>
+              <w:t>Sprint Review</w:t>
+            </w:r>
+          </w:p>
+        </w:tc>
+      </w:tr>
+      <w:tr>
+        <w:tc>
+          <w:tcPr>
+            <w:tcW w:w="9854" w:type="dxa"/>
+            <w:tcBorders>
+              <w:top w:val="single" w:sz="4" w:space="0" w:color="auto"/>
+              <w:left w:val="single" w:sz="4" w:space="0" w:color="auto"/>
+              <w:bottom w:val="single" w:sz="4" w:space="0" w:color="auto"/>
+              <w:right w:val="single" w:sz="4" w:space="0" w:color="auto"/>
+            </w:tcBorders>
+          </w:tcPr>
+          <w:p>
+            <w:pPr>
+              <w:spacing w:after="200" w:line="276" w:lineRule="auto"/>
+              <w:rPr>
+                <w:rFonts w:ascii="Arial" w:hAnsi="Arial" w:cs="Arial"/>
+              </w:rPr>
+            </w:pPr>
+          </w:p>
+        </w:tc>
+      </w:tr>
+    </w:tbl>
+    <w:p>
+      <w:pPr>
+        <w:rPr>
+          <w:rFonts w:ascii="Arial" w:hAnsi="Arial" w:cs="Arial"/>
+        </w:rPr>
+      </w:pPr>
+    </w:p>
+    <w:tbl>
+      <w:tblPr>
+        <w:tblStyle w:val="Grigliatabella"/>
+        <w:tblW w:w="0" w:type="auto"/>
+        <w:tblLook w:val="04A0" w:firstRow="1" w:lastRow="0" w:firstColumn="1" w:lastColumn="0" w:noHBand="0" w:noVBand="1"/>
+      </w:tblPr>
+      <w:tblGrid>
+        <w:gridCol w:w="9628"/>
+      </w:tblGrid>
+      <w:tr>
+        <w:tc>
+          <w:tcPr>
+            <w:tcW w:w="9854" w:type="dxa"/>
+            <w:tcBorders>
+              <w:top w:val="single" w:sz="4" w:space="0" w:color="auto"/>
+              <w:left w:val="single" w:sz="4" w:space="0" w:color="auto"/>
+              <w:bottom w:val="single" w:sz="4" w:space="0" w:color="auto"/>
+              <w:right w:val="single" w:sz="4" w:space="0" w:color="auto"/>
+            </w:tcBorders>
+            <w:shd w:val="clear" w:color="auto" w:fill="D9D9D9" w:themeFill="background1" w:themeFillShade="D9"/>
+            <w:hideMark/>
+          </w:tcPr>
+          <w:p>
+            <w:pPr>
+              <w:spacing w:after="200" w:line="276" w:lineRule="auto"/>
+              <w:rPr>
+                <w:rFonts w:ascii="Arial" w:hAnsi="Arial" w:cs="Arial"/>
+              </w:rPr>
+            </w:pPr>
+            <w:r>
+              <w:rPr>
+                <w:rFonts w:ascii="Arial" w:hAnsi="Arial" w:cs="Arial"/>
+              </w:rPr>
+              <w:t xml:space="preserve">Sprint </w:t>
+            </w:r>
+            <w:proofErr w:type="spellStart"/>
+            <w:r>
+              <w:rPr>
+                <w:rFonts w:ascii="Arial" w:hAnsi="Arial" w:cs="Arial"/>
+              </w:rPr>
+              <w:t>Retrospective</w:t>
+            </w:r>
+            <w:proofErr w:type="spellEnd"/>
+          </w:p>
+        </w:tc>
+      </w:tr>
+      <w:tr>
+        <w:tc>
+          <w:tcPr>
+            <w:tcW w:w="9854" w:type="dxa"/>
+            <w:tcBorders>
+              <w:top w:val="single" w:sz="4" w:space="0" w:color="auto"/>
+              <w:left w:val="single" w:sz="4" w:space="0" w:color="auto"/>
+              <w:bottom w:val="single" w:sz="4" w:space="0" w:color="auto"/>
+              <w:right w:val="single" w:sz="4" w:space="0" w:color="auto"/>
+            </w:tcBorders>
+          </w:tcPr>
+          <w:p>
+            <w:pPr>
+              <w:spacing w:after="200" w:line="276" w:lineRule="auto"/>
+              <w:rPr>
+                <w:rFonts w:ascii="Arial" w:hAnsi="Arial" w:cs="Arial"/>
+              </w:rPr>
+            </w:pPr>
+          </w:p>
+        </w:tc>
+      </w:tr>
+    </w:tbl>
+    <w:p>
+      <w:pPr>
+        <w:rPr>
+          <w:rFonts w:ascii="Arial" w:hAnsi="Arial" w:cs="Arial"/>
+        </w:rPr>
+      </w:pPr>
+    </w:p>
+    <w:p>
+      <w:pPr>
+        <w:rPr>
+          <w:rFonts w:ascii="Arial" w:hAnsi="Arial" w:cs="Arial"/>
+        </w:rPr>
+      </w:pPr>
+    </w:p>
+    <w:p>
+      <w:pPr>
+        <w:pStyle w:val="Titolo2"/>
+        <w:pBdr>
+          <w:bottom w:val="single" w:sz="4" w:space="1" w:color="auto"/>
+        </w:pBdr>
+      </w:pPr>
+      <w:r>
+        <w:lastRenderedPageBreak/>
+        <w:t>Utilizzo Intelligenza Artificiale</w:t>
+      </w:r>
+      <w:r>
+        <w:t xml:space="preserve"> nella giornata</w:t>
+      </w:r>
+    </w:p>
+    <w:p>
+      <w:pPr>
+        <w:pStyle w:val="Nessunaspaziatura"/>
+        <w:rPr>
+          <w:rFonts w:ascii="Arial" w:hAnsi="Arial" w:cs="Arial"/>
+          <w:b/>
+          <w:bCs/>
+        </w:rPr>
+      </w:pPr>
+    </w:p>
+    <w:p>
+      <w:pPr>
+        <w:pStyle w:val="Nessunaspaziatura"/>
+        <w:rPr>
+          <w:rFonts w:ascii="Arial" w:hAnsi="Arial" w:cs="Arial"/>
+        </w:rPr>
+      </w:pPr>
+      <w:sdt>
+        <w:sdtPr>
+          <w:rPr>
+            <w:rFonts w:ascii="Segoe UI Symbol" w:hAnsi="Segoe UI Symbol" w:cs="Segoe UI Symbol"/>
+          </w:rPr>
+          <w:id w:val="1314533433"/>
+          <w14:checkbox>
+            <w14:checked w14:val="0"/>
+            <w14:checkedState w14:val="2612" w14:font="MS Gothic"/>
+            <w14:uncheckedState w14:val="2610" w14:font="MS Gothic"/>
+          </w14:checkbox>
+        </w:sdtPr>
+        <w:sdtContent>
+          <w:r>
+            <w:rPr>
+              <w:rFonts w:ascii="MS Gothic" w:eastAsia="MS Gothic" w:hAnsi="MS Gothic" w:cs="Segoe UI Symbol" w:hint="eastAsia"/>
+            </w:rPr>
+            <w:t>☐</w:t>
+          </w:r>
+        </w:sdtContent>
+      </w:sdt>
+      <w:r>
+        <w:rPr>
+          <w:rFonts w:ascii="Arial" w:hAnsi="Arial" w:cs="Arial"/>
+        </w:rPr>
+        <w:t xml:space="preserve"> Nessuno</w:t>
+      </w:r>
+      <w:r>
+        <w:br/>
+      </w:r>
+      <w:sdt>
+        <w:sdtPr>
+          <w:rPr>
+            <w:rFonts w:ascii="Segoe UI Symbol" w:hAnsi="Segoe UI Symbol" w:cs="Segoe UI Symbol"/>
+          </w:rPr>
+          <w:id w:val="966550306"/>
+          <w14:checkbox>
+            <w14:checked w14:val="0"/>
+            <w14:checkedState w14:val="2612" w14:font="MS Gothic"/>
+            <w14:uncheckedState w14:val="2610" w14:font="MS Gothic"/>
+          </w14:checkbox>
+        </w:sdtPr>
+        <w:sdtContent>
+          <w:r>
+            <w:rPr>
+              <w:rFonts w:ascii="MS Gothic" w:eastAsia="MS Gothic" w:hAnsi="MS Gothic" w:cs="Segoe UI Symbol" w:hint="eastAsia"/>
+            </w:rPr>
+            <w:t>☐</w:t>
+          </w:r>
+        </w:sdtContent>
+      </w:sdt>
+      <w:r>
+        <w:rPr>
+          <w:rFonts w:ascii="Arial" w:hAnsi="Arial" w:cs="Arial"/>
+        </w:rPr>
+        <w:t xml:space="preserve"> Occasionale</w:t>
+      </w:r>
+      <w:r>
+        <w:br/>
+      </w:r>
+      <w:sdt>
+        <w:sdtPr>
+          <w:rPr>
+            <w:rFonts w:ascii="Segoe UI Symbol" w:hAnsi="Segoe UI Symbol" w:cs="Segoe UI Symbol"/>
+          </w:rPr>
+          <w:id w:val="1813447318"/>
+          <w14:checkbox>
+            <w14:checked w14:val="1"/>
+            <w14:checkedState w14:val="2612" w14:font="MS Gothic"/>
+            <w14:uncheckedState w14:val="2610" w14:font="MS Gothic"/>
+          </w14:checkbox>
+        </w:sdtPr>
+        <w:sdtContent>
+          <w:r>
+            <w:rPr>
+              <w:rFonts w:ascii="MS Gothic" w:eastAsia="MS Gothic" w:hAnsi="MS Gothic" w:cs="Segoe UI Symbol" w:hint="eastAsia"/>
+            </w:rPr>
+            <w:t>☒</w:t>
+          </w:r>
+        </w:sdtContent>
+      </w:sdt>
+      <w:r>
+        <w:rPr>
+          <w:rFonts w:ascii="Arial" w:hAnsi="Arial" w:cs="Arial"/>
+        </w:rPr>
+        <w:t xml:space="preserve"> Frequente</w:t>
+      </w:r>
+    </w:p>
+    <w:p>
+      <w:pPr>
+        <w:pStyle w:val="Nessunaspaziatura"/>
+        <w:rPr>
+          <w:rFonts w:ascii="Arial" w:hAnsi="Arial" w:cs="Arial"/>
+        </w:rPr>
+      </w:pPr>
+    </w:p>
+    <w:p>
+      <w:pPr>
+        <w:pStyle w:val="Nessunaspaziatura"/>
+        <w:spacing w:line="276" w:lineRule="auto"/>
+        <w:rPr>
+          <w:rFonts w:ascii="Arial" w:hAnsi="Arial" w:cs="Arial"/>
+        </w:rPr>
+      </w:pPr>
+      <w:r>
+        <w:rPr>
+          <w:rFonts w:ascii="Arial" w:hAnsi="Arial" w:cs="Arial"/>
+          <w:b/>
+          <w:bCs/>
+        </w:rPr>
+        <w:t>Strumento/i utilizzato/i</w:t>
+      </w:r>
+      <w:r>
+        <w:rPr>
+          <w:rFonts w:ascii="Arial" w:hAnsi="Arial" w:cs="Arial"/>
+          <w:b/>
+          <w:bCs/>
+        </w:rPr>
+        <w:t xml:space="preserve"> </w:t>
+      </w:r>
+      <w:r>
+        <w:rPr>
+          <w:rFonts w:ascii="Arial" w:hAnsi="Arial" w:cs="Arial"/>
+        </w:rPr>
+        <w:t>(es. ChatGPT)</w:t>
+      </w:r>
+      <w:r>
+        <w:rPr>
+          <w:rFonts w:ascii="Arial" w:hAnsi="Arial" w:cs="Arial"/>
+        </w:rPr>
+        <w:t xml:space="preserve">: </w:t>
+      </w:r>
+      <w:sdt>
+        <w:sdtPr>
+          <w:rPr>
+            <w:rFonts w:ascii="Arial" w:hAnsi="Arial" w:cs="Arial"/>
+          </w:rPr>
+          <w:id w:val="1820914094"/>
+          <w:placeholder>
+            <w:docPart w:val="579B214641DE4214B93F23AFD732EFF2"/>
+          </w:placeholder>
+        </w:sdtPr>
+        <w:sdtContent>
+          <w:r>
+            <w:rPr>
+              <w:rFonts w:ascii="Arial" w:hAnsi="Arial" w:cs="Arial"/>
+            </w:rPr>
+            <w:t>ChatGPT</w:t>
+          </w:r>
+        </w:sdtContent>
+      </w:sdt>
+    </w:p>
+    <w:p>
+      <w:pPr>
+        <w:pStyle w:val="Nessunaspaziatura"/>
+        <w:rPr>
+          <w:rFonts w:ascii="Arial" w:hAnsi="Arial" w:cs="Arial"/>
+        </w:rPr>
+      </w:pPr>
+    </w:p>
+    <w:p>
+      <w:pPr>
+        <w:pStyle w:val="Nessunaspaziatura"/>
+        <w:rPr>
+          <w:rFonts w:ascii="Arial" w:hAnsi="Arial" w:cs="Arial"/>
+        </w:rPr>
+      </w:pPr>
+      <w:r>
+        <w:rPr>
+          <w:rFonts w:ascii="Arial" w:hAnsi="Arial" w:cs="Arial"/>
+          <w:b/>
+          <w:bCs/>
+        </w:rPr>
+        <w:t>Per cosa l’ho usata oggi</w:t>
+      </w:r>
+      <w:r>
+        <w:br/>
+      </w:r>
+      <w:sdt>
+        <w:sdtPr>
+          <w:rPr>
+            <w:rFonts w:ascii="Segoe UI Symbol" w:hAnsi="Segoe UI Symbol" w:cs="Segoe UI Symbol"/>
+          </w:rPr>
+          <w:id w:val="120886950"/>
+          <w14:checkbox>
+            <w14:checked w14:val="1"/>
+            <w14:checkedState w14:val="2612" w14:font="MS Gothic"/>
+            <w14:uncheckedState w14:val="2610" w14:font="MS Gothic"/>
+          </w14:checkbox>
+        </w:sdtPr>
+        <w:sdtContent>
+          <w:r>
+            <w:rPr>
+              <w:rFonts w:ascii="MS Gothic" w:eastAsia="MS Gothic" w:hAnsi="MS Gothic" w:cs="Segoe UI Symbol" w:hint="eastAsia"/>
+            </w:rPr>
+            <w:t>☒</w:t>
+          </w:r>
+        </w:sdtContent>
+      </w:sdt>
+      <w:r>
+        <w:rPr>
+          <w:rFonts w:ascii="Arial" w:hAnsi="Arial" w:cs="Arial"/>
+        </w:rPr>
+        <w:t xml:space="preserve"> Chiarire concetti</w:t>
+      </w:r>
+      <w:r>
+        <w:br/>
+      </w:r>
+      <w:sdt>
+        <w:sdtPr>
+          <w:rPr>
+            <w:rFonts w:ascii="Segoe UI Symbol" w:hAnsi="Segoe UI Symbol" w:cs="Segoe UI Symbol"/>
+          </w:rPr>
+          <w:id w:val="-1200930613"/>
+          <w14:checkbox>
+            <w14:checked w14:val="1"/>
+            <w14:checkedState w14:val="2612" w14:font="MS Gothic"/>
+            <w14:uncheckedState w14:val="2610" w14:font="MS Gothic"/>
+          </w14:checkbox>
+        </w:sdtPr>
+        <w:sdtContent>
+          <w:r>
+            <w:rPr>
+              <w:rFonts w:ascii="MS Gothic" w:eastAsia="MS Gothic" w:hAnsi="MS Gothic" w:cs="Segoe UI Symbol" w:hint="eastAsia"/>
+            </w:rPr>
+            <w:t>☒</w:t>
+          </w:r>
+        </w:sdtContent>
+      </w:sdt>
+      <w:r>
+        <w:rPr>
+          <w:rFonts w:ascii="Arial" w:hAnsi="Arial" w:cs="Arial"/>
+        </w:rPr>
+        <w:t xml:space="preserve"> Supporto al codice</w:t>
+      </w:r>
+      <w:r>
+        <w:br/>
+      </w:r>
+      <w:sdt>
+        <w:sdtPr>
+          <w:rPr>
+            <w:rFonts w:ascii="Segoe UI Symbol" w:hAnsi="Segoe UI Symbol" w:cs="Segoe UI Symbol"/>
+          </w:rPr>
+          <w:id w:val="-91863208"/>
+          <w14:checkbox>
+            <w14:checked w14:val="1"/>
+            <w14:checkedState w14:val="2612" w14:font="MS Gothic"/>
+            <w14:uncheckedState w14:val="2610" w14:font="MS Gothic"/>
+          </w14:checkbox>
+        </w:sdtPr>
+        <w:sdtContent>
+          <w:r>
+            <w:rPr>
+              <w:rFonts w:ascii="MS Gothic" w:eastAsia="MS Gothic" w:hAnsi="MS Gothic" w:cs="Segoe UI Symbol" w:hint="eastAsia"/>
+            </w:rPr>
+            <w:t>☒</w:t>
+          </w:r>
+        </w:sdtContent>
+      </w:sdt>
+      <w:r>
+        <w:rPr>
+          <w:rFonts w:ascii="Arial" w:hAnsi="Arial" w:cs="Arial"/>
+        </w:rPr>
+        <w:t xml:space="preserve"> Debug</w:t>
+      </w:r>
+      <w:r>
+        <w:br/>
+      </w:r>
+      <w:sdt>
+        <w:sdtPr>
+          <w:rPr>
+            <w:rFonts w:ascii="Segoe UI Symbol" w:hAnsi="Segoe UI Symbol" w:cs="Segoe UI Symbol"/>
+          </w:rPr>
+          <w:id w:val="1433557101"/>
+          <w14:checkbox>
+            <w14:checked w14:val="0"/>
+            <w14:checkedState w14:val="2612" w14:font="MS Gothic"/>
+            <w14:uncheckedState w14:val="2610" w14:font="MS Gothic"/>
+          </w14:checkbox>
+        </w:sdtPr>
+        <w:sdtContent>
+          <w:r>
+            <w:rPr>
+              <w:rFonts w:ascii="MS Gothic" w:eastAsia="MS Gothic" w:hAnsi="MS Gothic" w:cs="Segoe UI Symbol" w:hint="eastAsia"/>
+            </w:rPr>
+            <w:t>☐</w:t>
+          </w:r>
+        </w:sdtContent>
+      </w:sdt>
+      <w:r>
+        <w:rPr>
+          <w:rFonts w:ascii="Arial" w:hAnsi="Arial" w:cs="Arial"/>
+        </w:rPr>
+        <w:t xml:space="preserve"> Riorganizzare idee / testi</w:t>
+      </w:r>
+      <w:r>
+        <w:br/>
+      </w:r>
+      <w:sdt>
+        <w:sdtPr>
+          <w:rPr>
+            <w:rFonts w:ascii="Segoe UI Symbol" w:hAnsi="Segoe UI Symbol" w:cs="Segoe UI Symbol"/>
+          </w:rPr>
+          <w:id w:val="-1582359753"/>
+          <w14:checkbox>
+            <w14:checked w14:val="0"/>
+            <w14:checkedState w14:val="2612" w14:font="MS Gothic"/>
+            <w14:uncheckedState w14:val="2610" w14:font="MS Gothic"/>
+          </w14:checkbox>
+        </w:sdtPr>
+        <w:sdtContent>
+          <w:r>
+            <w:rPr>
+              <w:rFonts w:ascii="MS Gothic" w:eastAsia="MS Gothic" w:hAnsi="MS Gothic" w:cs="Segoe UI Symbol" w:hint="eastAsia"/>
+            </w:rPr>
+            <w:t>☐</w:t>
+          </w:r>
+        </w:sdtContent>
+      </w:sdt>
+      <w:r>
+        <w:rPr>
+          <w:rFonts w:ascii="Arial" w:hAnsi="Arial" w:cs="Arial"/>
+        </w:rPr>
+        <w:t xml:space="preserve"> Altro: …</w:t>
+      </w:r>
+    </w:p>
+    <w:p>
+      <w:pPr>
+        <w:pStyle w:val="Nessunaspaziatura"/>
+        <w:rPr>
+          <w:rFonts w:ascii="Arial" w:hAnsi="Arial" w:cs="Arial"/>
+        </w:rPr>
+      </w:pPr>
+    </w:p>
+    <w:p>
+      <w:pPr>
+        <w:pStyle w:val="Nessunaspaziatura"/>
+        <w:rPr>
+          <w:rFonts w:ascii="Arial" w:hAnsi="Arial" w:cs="Arial"/>
+          <w:b/>
+          <w:bCs/>
+        </w:rPr>
+      </w:pPr>
+      <w:r>
+        <w:rPr>
+          <w:rFonts w:ascii="Arial" w:hAnsi="Arial" w:cs="Arial"/>
+          <w:b/>
+          <w:bCs/>
+        </w:rPr>
+        <w:t>Esempio significativo di utilizzo (UNO SOLO)</w:t>
+      </w:r>
+    </w:p>
+    <w:p>
+      <w:pPr>
+        <w:pStyle w:val="Nessunaspaziatura"/>
+        <w:rPr>
+          <w:rFonts w:ascii="Arial" w:hAnsi="Arial" w:cs="Arial"/>
+        </w:rPr>
+      </w:pPr>
+      <w:r>
+        <w:rPr>
+          <w:rFonts w:ascii="Arial" w:hAnsi="Arial" w:cs="Arial"/>
+        </w:rPr>
+        <w:t xml:space="preserve">Riporta </w:t>
+      </w:r>
+      <w:r>
+        <w:rPr>
+          <w:rFonts w:ascii="Arial" w:hAnsi="Arial" w:cs="Arial"/>
+          <w:i/>
+          <w:iCs/>
+        </w:rPr>
+        <w:t>un</w:t>
+      </w:r>
+      <w:r>
+        <w:rPr>
+          <w:rFonts w:ascii="Arial" w:hAnsi="Arial" w:cs="Arial"/>
+        </w:rPr>
+        <w:t xml:space="preserve"> prompt rilevante oppure descrivilo a parole se ce ne sono stati molti.</w:t>
+      </w:r>
+    </w:p>
+    <w:p>
+      <w:pPr>
+        <w:pStyle w:val="Nessunaspaziatura"/>
+        <w:rPr>
+          <w:rFonts w:ascii="Arial" w:hAnsi="Arial" w:cs="Arial"/>
+        </w:rPr>
+      </w:pPr>
+    </w:p>
+    <w:sdt>
+      <w:sdtPr>
+        <w:rPr>
+          <w:rFonts w:ascii="Arial" w:hAnsi="Arial" w:cs="Arial"/>
+        </w:rPr>
+        <w:alias w:val="Prompt AI"/>
+        <w:tag w:val="Prompt AI"/>
+        <w:id w:val="1699357081"/>
+        <w:placeholder>
+          <w:docPart w:val="360F1EBE5B744EEF92EDBB46135B0D42"/>
+        </w:placeholder>
+        <w15:color w:val="C0C0C0"/>
+      </w:sdtPr>
+      <w:sdtContent>
+        <w:p>
+          <w:pPr>
+            <w:pStyle w:val="Nessunaspaziatura"/>
+            <w:spacing w:line="276" w:lineRule="auto"/>
+            <w:rPr>
+              <w:rFonts w:ascii="Arial" w:hAnsi="Arial" w:cs="Arial"/>
+            </w:rPr>
+          </w:pPr>
+          <w:r>
+            <w:rPr>
+              <w:rFonts w:ascii="Arial" w:hAnsi="Arial" w:cs="Arial"/>
+            </w:rPr>
+            <w:t xml:space="preserve">Riley: Il numero inserito nel </w:t>
+          </w:r>
+          <w:proofErr w:type="spellStart"/>
+          <w:r>
+            <w:rPr>
+              <w:rFonts w:ascii="Arial" w:hAnsi="Arial" w:cs="Arial"/>
+            </w:rPr>
+            <w:t>json</w:t>
+          </w:r>
+          <w:proofErr w:type="spellEnd"/>
+          <w:r>
+            <w:rPr>
+              <w:rFonts w:ascii="Arial" w:hAnsi="Arial" w:cs="Arial"/>
+            </w:rPr>
+            <w:t xml:space="preserve"> risulta essere un numero che va dal miliardo in su, ma l’applicativo lo riduce a milioni, per caso i valori </w:t>
+          </w:r>
+          <w:proofErr w:type="spellStart"/>
+          <w:r>
+            <w:rPr>
+              <w:rFonts w:ascii="Arial" w:hAnsi="Arial" w:cs="Arial"/>
+            </w:rPr>
+            <w:t>int</w:t>
+          </w:r>
+          <w:proofErr w:type="spellEnd"/>
+          <w:r>
+            <w:rPr>
+              <w:rFonts w:ascii="Arial" w:hAnsi="Arial" w:cs="Arial"/>
+            </w:rPr>
+            <w:t xml:space="preserve"> non supportano i miliardi? </w:t>
+          </w:r>
+        </w:p>
+      </w:sdtContent>
+    </w:sdt>
+    <w:p>
+      <w:pPr>
+        <w:pStyle w:val="Nessunaspaziatura"/>
+        <w:rPr>
+          <w:rFonts w:ascii="Arial" w:hAnsi="Arial" w:cs="Arial"/>
+        </w:rPr>
+      </w:pPr>
+    </w:p>
+    <w:p>
+      <w:pPr>
+        <w:pStyle w:val="Nessunaspaziatura"/>
+        <w:rPr>
+          <w:rFonts w:ascii="Arial" w:hAnsi="Arial" w:cs="Arial"/>
+        </w:rPr>
+      </w:pPr>
+      <w:r>
+        <w:rPr>
+          <w:rFonts w:ascii="Arial" w:hAnsi="Arial" w:cs="Arial"/>
+          <w:b/>
+          <w:bCs/>
+        </w:rPr>
+        <w:t>Cosa mi ha dato l’AI</w:t>
+      </w:r>
+    </w:p>
+    <w:p>
+      <w:pPr>
+        <w:pStyle w:val="Nessunaspaziatura"/>
+        <w:rPr>
+          <w:rFonts w:ascii="Arial" w:hAnsi="Arial" w:cs="Arial"/>
+        </w:rPr>
+      </w:pPr>
+      <w:r>
+        <w:rPr>
+          <w:rFonts w:ascii="Arial" w:hAnsi="Arial" w:cs="Arial"/>
+        </w:rPr>
+        <w:t>Spiegazione, esempio, soluzione, suggerimento…</w:t>
+      </w:r>
+    </w:p>
+    <w:p>
+      <w:pPr>
+        <w:pStyle w:val="Nessunaspaziatura"/>
+        <w:rPr>
+          <w:rFonts w:ascii="Arial" w:hAnsi="Arial" w:cs="Arial"/>
+        </w:rPr>
+      </w:pPr>
+    </w:p>
+    <w:sdt>
+      <w:sdtPr>
+        <w:rPr>
+          <w:rFonts w:ascii="Arial" w:hAnsi="Arial" w:cs="Arial"/>
+        </w:rPr>
+        <w:alias w:val="Risposta AI"/>
+        <w:tag w:val="Risposta AI"/>
+        <w:id w:val="1244986921"/>
+        <w:placeholder>
+          <w:docPart w:val="F359F79EAE6A4C9AA4FCB7B83EB51A37"/>
+        </w:placeholder>
+        <w15:color w:val="C0C0C0"/>
+      </w:sdtPr>
+      <w:sdtContent>
+        <w:p>
+          <w:pPr>
+            <w:pStyle w:val="Nessunaspaziatura"/>
+            <w:spacing w:line="276" w:lineRule="auto"/>
+            <w:rPr>
+              <w:rFonts w:ascii="Arial" w:hAnsi="Arial" w:cs="Arial"/>
+            </w:rPr>
+          </w:pPr>
+          <w:r>
+            <w:rPr>
+              <w:rFonts w:ascii="Arial" w:hAnsi="Arial" w:cs="Arial"/>
+            </w:rPr>
+            <w:t xml:space="preserve">Riley: Mi ha detto che </w:t>
+          </w:r>
+          <w:proofErr w:type="spellStart"/>
+          <w:r>
+            <w:rPr>
+              <w:rFonts w:ascii="Arial" w:hAnsi="Arial" w:cs="Arial"/>
+            </w:rPr>
+            <w:t>int</w:t>
+          </w:r>
+          <w:proofErr w:type="spellEnd"/>
+          <w:r>
+            <w:rPr>
+              <w:rFonts w:ascii="Arial" w:hAnsi="Arial" w:cs="Arial"/>
+            </w:rPr>
+            <w:t xml:space="preserve"> supporta i miliardi ma che ha un massimo di circa 2,2 miliardi ed il numero risultava più grande quindi ho ripiegato su un long</w:t>
+          </w:r>
+        </w:p>
+      </w:sdtContent>
+    </w:sdt>
+    <w:p>
+      <w:pPr>
+        <w:pStyle w:val="Nessunaspaziatura"/>
+        <w:rPr>
+          <w:rFonts w:ascii="Arial" w:hAnsi="Arial" w:cs="Arial"/>
+          <w:b/>
+          <w:bCs/>
+        </w:rPr>
+      </w:pPr>
+    </w:p>
+    <w:p>
+      <w:pPr>
+        <w:pStyle w:val="Nessunaspaziatura"/>
+        <w:rPr>
+          <w:rFonts w:ascii="Arial" w:hAnsi="Arial" w:cs="Arial"/>
+        </w:rPr>
+      </w:pPr>
+      <w:r>
+        <w:rPr>
+          <w:rFonts w:ascii="Arial" w:hAnsi="Arial" w:cs="Arial"/>
+          <w:b/>
+          <w:bCs/>
+        </w:rPr>
+        <w:t>Come l’ho usato io</w:t>
+      </w:r>
+      <w:r>
+        <w:rPr>
+          <w:rFonts w:ascii="Arial" w:hAnsi="Arial" w:cs="Arial"/>
+        </w:rPr>
+        <w:br/>
+      </w:r>
+      <w:sdt>
+        <w:sdtPr>
+          <w:rPr>
+            <w:rFonts w:ascii="Segoe UI Symbol" w:hAnsi="Segoe UI Symbol" w:cs="Segoe UI Symbol"/>
+          </w:rPr>
+          <w:id w:val="-371767054"/>
+          <w14:checkbox>
+            <w14:checked w14:val="1"/>
+            <w14:checkedState w14:val="2612" w14:font="MS Gothic"/>
+            <w14:uncheckedState w14:val="2610" w14:font="MS Gothic"/>
+          </w14:checkbox>
+        </w:sdtPr>
+        <w:sdtContent>
+          <w:r>
+            <w:rPr>
+              <w:rFonts w:ascii="MS Gothic" w:eastAsia="MS Gothic" w:hAnsi="MS Gothic" w:cs="Segoe UI Symbol" w:hint="eastAsia"/>
+            </w:rPr>
+            <w:t>☒</w:t>
+          </w:r>
+        </w:sdtContent>
+      </w:sdt>
+      <w:r>
+        <w:rPr>
+          <w:rFonts w:ascii="Arial" w:hAnsi="Arial" w:cs="Arial"/>
+        </w:rPr>
+        <w:t xml:space="preserve"> Copiato</w:t>
+      </w:r>
+      <w:r>
+        <w:rPr>
+          <w:rFonts w:ascii="Arial" w:hAnsi="Arial" w:cs="Arial"/>
+        </w:rPr>
+        <w:br/>
+      </w:r>
+      <w:sdt>
+        <w:sdtPr>
+          <w:rPr>
+            <w:rFonts w:ascii="Segoe UI Symbol" w:hAnsi="Segoe UI Symbol" w:cs="Segoe UI Symbol"/>
+          </w:rPr>
+          <w:id w:val="-1288511704"/>
+          <w14:checkbox>
+            <w14:checked w14:val="1"/>
+            <w14:checkedState w14:val="2612" w14:font="MS Gothic"/>
+            <w14:uncheckedState w14:val="2610" w14:font="MS Gothic"/>
+          </w14:checkbox>
+        </w:sdtPr>
+        <w:sdtContent>
+          <w:r>
+            <w:rPr>
+              <w:rFonts w:ascii="MS Gothic" w:eastAsia="MS Gothic" w:hAnsi="MS Gothic" w:cs="Segoe UI Symbol" w:hint="eastAsia"/>
+            </w:rPr>
+            <w:t>☒</w:t>
+          </w:r>
+        </w:sdtContent>
+      </w:sdt>
+      <w:r>
+        <w:rPr>
+          <w:rFonts w:ascii="Arial" w:hAnsi="Arial" w:cs="Arial"/>
+        </w:rPr>
+        <w:t xml:space="preserve"> Adattato</w:t>
+      </w:r>
+      <w:r>
+        <w:rPr>
+          <w:rFonts w:ascii="Arial" w:hAnsi="Arial" w:cs="Arial"/>
+        </w:rPr>
+        <w:br/>
+      </w:r>
+      <w:sdt>
+        <w:sdtPr>
+          <w:rPr>
+            <w:rFonts w:ascii="Segoe UI Symbol" w:hAnsi="Segoe UI Symbol" w:cs="Segoe UI Symbol"/>
+          </w:rPr>
+          <w:id w:val="2016799366"/>
+          <w14:checkbox>
+            <w14:checked w14:val="0"/>
+            <w14:checkedState w14:val="2612" w14:font="MS Gothic"/>
+            <w14:uncheckedState w14:val="2610" w14:font="MS Gothic"/>
+          </w14:checkbox>
+        </w:sdtPr>
+        <w:sdtContent>
+          <w:r>
+            <w:rPr>
+              <w:rFonts w:ascii="MS Gothic" w:eastAsia="MS Gothic" w:hAnsi="MS Gothic" w:cs="Segoe UI Symbol" w:hint="eastAsia"/>
+            </w:rPr>
+            <w:t>☐</w:t>
+          </w:r>
+        </w:sdtContent>
+      </w:sdt>
+      <w:r>
+        <w:rPr>
+          <w:rFonts w:ascii="Arial" w:hAnsi="Arial" w:cs="Arial"/>
+        </w:rPr>
+        <w:t xml:space="preserve"> Usato solo per capire</w:t>
+      </w:r>
+      <w:r>
+        <w:rPr>
+          <w:rFonts w:ascii="Arial" w:hAnsi="Arial" w:cs="Arial"/>
+        </w:rPr>
+        <w:br/>
+      </w:r>
+      <w:sdt>
+        <w:sdtPr>
+          <w:rPr>
+            <w:rFonts w:ascii="Segoe UI Symbol" w:hAnsi="Segoe UI Symbol" w:cs="Segoe UI Symbol"/>
+          </w:rPr>
+          <w:id w:val="-2134468557"/>
+          <w14:checkbox>
+            <w14:checked w14:val="0"/>
+            <w14:checkedState w14:val="2612" w14:font="MS Gothic"/>
+            <w14:uncheckedState w14:val="2610" w14:font="MS Gothic"/>
+          </w14:checkbox>
+        </w:sdtPr>
+        <w:sdtContent>
+          <w:r>
+            <w:rPr>
+              <w:rFonts w:ascii="MS Gothic" w:eastAsia="MS Gothic" w:hAnsi="MS Gothic" w:cs="Segoe UI Symbol" w:hint="eastAsia"/>
+            </w:rPr>
+            <w:t>☐</w:t>
+          </w:r>
+        </w:sdtContent>
+      </w:sdt>
+      <w:r>
+        <w:rPr>
+          <w:rFonts w:ascii="Arial" w:hAnsi="Arial" w:cs="Arial"/>
+        </w:rPr>
+        <w:t xml:space="preserve"> Scartato</w:t>
+      </w:r>
+    </w:p>
+    <w:p>
+      <w:pPr>
+        <w:pStyle w:val="Nessunaspaziatura"/>
+        <w:rPr>
+          <w:rFonts w:ascii="Arial" w:hAnsi="Arial" w:cs="Arial"/>
+        </w:rPr>
+      </w:pPr>
+    </w:p>
+    <w:p>
+      <w:pPr>
+        <w:pStyle w:val="Nessunaspaziatura"/>
+        <w:rPr>
+          <w:rFonts w:ascii="Arial" w:hAnsi="Arial" w:cs="Arial"/>
+        </w:rPr>
+      </w:pPr>
+    </w:p>
+    <w:p>
+      <w:pPr>
+        <w:pStyle w:val="Nessunaspaziatura"/>
+        <w:rPr>
+          <w:rFonts w:ascii="Arial" w:hAnsi="Arial" w:cs="Arial"/>
+        </w:rPr>
+      </w:pPr>
+      <w:r>
+        <w:rPr>
+          <w:rFonts w:ascii="Arial" w:hAnsi="Arial" w:cs="Arial"/>
+          <w:b/>
+          <w:bCs/>
+        </w:rPr>
+        <w:t>Cosa avrei fatto senza AI?</w:t>
+      </w:r>
+    </w:p>
+    <w:p>
+      <w:pPr>
+        <w:pStyle w:val="Nessunaspaziatura"/>
+        <w:rPr>
+          <w:rFonts w:ascii="Arial" w:hAnsi="Arial" w:cs="Arial"/>
+        </w:rPr>
+      </w:pPr>
+      <w:r>
+        <w:rPr>
+          <w:rFonts w:ascii="Arial" w:hAnsi="Arial" w:cs="Arial"/>
+        </w:rPr>
+        <w:t>Riley: cercato in dei forum o documentazioni.</w:t>
+      </w:r>
+    </w:p>
+    <w:p>
+      <w:pPr>
+        <w:pStyle w:val="Nessunaspaziatura"/>
+        <w:rPr>
+          <w:rFonts w:ascii="Arial" w:hAnsi="Arial" w:cs="Arial"/>
+        </w:rPr>
+      </w:pPr>
     </w:p>
     <w:sectPr>
       <w:headerReference w:type="default" r:id="rId8"/>
@@ -19248,6 +20945,107 @@
         </w:p>
       </w:docPartBody>
     </w:docPart>
+    <w:docPart>
+      <w:docPartPr>
+        <w:name w:val="579B214641DE4214B93F23AFD732EFF2"/>
+        <w:category>
+          <w:name w:val="Generale"/>
+          <w:gallery w:val="placeholder"/>
+        </w:category>
+        <w:types>
+          <w:type w:val="bbPlcHdr"/>
+        </w:types>
+        <w:behaviors>
+          <w:behavior w:val="content"/>
+        </w:behaviors>
+        <w:guid w:val="{4796D053-999A-43A6-A0AD-3C8D150D4575}"/>
+      </w:docPartPr>
+      <w:docPartBody>
+        <w:p>
+          <w:pPr>
+            <w:pStyle w:val="579B214641DE4214B93F23AFD732EFF2"/>
+          </w:pPr>
+          <w:r>
+            <w:rPr>
+              <w:rStyle w:val="Testosegnaposto"/>
+              <w:b/>
+              <w:bCs/>
+            </w:rPr>
+            <w:t>Nomi AI utilizzati</w:t>
+          </w:r>
+        </w:p>
+      </w:docPartBody>
+    </w:docPart>
+    <w:docPart>
+      <w:docPartPr>
+        <w:name w:val="360F1EBE5B744EEF92EDBB46135B0D42"/>
+        <w:category>
+          <w:name w:val="Generale"/>
+          <w:gallery w:val="placeholder"/>
+        </w:category>
+        <w:types>
+          <w:type w:val="bbPlcHdr"/>
+        </w:types>
+        <w:behaviors>
+          <w:behavior w:val="content"/>
+        </w:behaviors>
+        <w:guid w:val="{27C948E3-3E06-4B28-A321-F675EDB5E7A2}"/>
+      </w:docPartPr>
+      <w:docPartBody>
+        <w:p>
+          <w:pPr>
+            <w:pStyle w:val="360F1EBE5B744EEF92EDBB46135B0D42"/>
+          </w:pPr>
+          <w:r>
+            <w:rPr>
+              <w:rStyle w:val="Testosegnaposto"/>
+            </w:rPr>
+            <w:t>Fare clic o toccare qui per immettere il testo.</w:t>
+          </w:r>
+        </w:p>
+      </w:docPartBody>
+    </w:docPart>
+    <w:docPart>
+      <w:docPartPr>
+        <w:name w:val="F359F79EAE6A4C9AA4FCB7B83EB51A37"/>
+        <w:category>
+          <w:name w:val="Generale"/>
+          <w:gallery w:val="placeholder"/>
+        </w:category>
+        <w:types>
+          <w:type w:val="bbPlcHdr"/>
+        </w:types>
+        <w:behaviors>
+          <w:behavior w:val="content"/>
+        </w:behaviors>
+        <w:guid w:val="{BDFA2FDF-5092-4411-8E74-5469EF965DAB}"/>
+      </w:docPartPr>
+      <w:docPartBody>
+        <w:p>
+          <w:pPr>
+            <w:pStyle w:val="F359F79EAE6A4C9AA4FCB7B83EB51A37"/>
+          </w:pPr>
+          <w:r>
+            <w:rPr>
+              <w:rStyle w:val="Testosegnaposto"/>
+            </w:rPr>
+            <w:t xml:space="preserve">Fare clic o toccare qui per </w:t>
+          </w:r>
+          <w:r>
+            <w:rPr>
+              <w:rStyle w:val="Testosegnaposto"/>
+            </w:rPr>
+            <w:t>immettere</w:t>
+          </w:r>
+          <w:r>
+            <w:rPr>
+              <w:rStyle w:val="Testosegnaposto"/>
+            </w:rPr>
+            <w:t xml:space="preserve"> il testo.</w:t>
+          </w:r>
+        </w:p>
+      </w:docPartBody>
+    </w:docPart>
   </w:docParts>
 </w:glossaryDocument>
 </file>
@@ -19407,6 +21205,7 @@
     <w:rsid w:val="0089581E"/>
     <w:rsid w:val="008A28AA"/>
     <w:rsid w:val="00924F9E"/>
+    <w:rsid w:val="00936AAC"/>
     <w:rsid w:val="009826E2"/>
     <w:rsid w:val="009A56C6"/>
     <w:rsid w:val="00A04D62"/>
@@ -19419,12 +21218,14 @@
     <w:rsid w:val="00BD3686"/>
     <w:rsid w:val="00BD5007"/>
     <w:rsid w:val="00BE72BC"/>
+    <w:rsid w:val="00D86101"/>
     <w:rsid w:val="00DA48BB"/>
     <w:rsid w:val="00DC33C8"/>
     <w:rsid w:val="00DE2402"/>
     <w:rsid w:val="00DE4EBE"/>
     <w:rsid w:val="00DF3FD5"/>
     <w:rsid w:val="00DF4754"/>
+    <w:rsid w:val="00E97CF5"/>
     <w:rsid w:val="00ED4879"/>
     <w:rsid w:val="00EE3640"/>
     <w:rsid w:val="00EF520A"/>
@@ -19886,7 +21687,7 @@
     <w:basedOn w:val="Carpredefinitoparagrafo"/>
     <w:uiPriority w:val="99"/>
     <w:semiHidden/>
-    <w:rsid w:val="00DC33C8"/>
+    <w:rsid w:val="00D86101"/>
     <w:rPr>
       <w:color w:val="666666"/>
     </w:rPr>
@@ -20043,6 +21844,18 @@
   <w:style w:type="paragraph" w:customStyle="1" w:styleId="7A579F43FD344C24AA05428EF85192A5">
     <w:name w:val="7A579F43FD344C24AA05428EF85192A5"/>
     <w:rsid w:val="00DC33C8"/>
+  </w:style>
+  <w:style w:type="paragraph" w:customStyle="1" w:styleId="579B214641DE4214B93F23AFD732EFF2">
+    <w:name w:val="579B214641DE4214B93F23AFD732EFF2"/>
+    <w:rsid w:val="00D86101"/>
+  </w:style>
+  <w:style w:type="paragraph" w:customStyle="1" w:styleId="360F1EBE5B744EEF92EDBB46135B0D42">
+    <w:name w:val="360F1EBE5B744EEF92EDBB46135B0D42"/>
+    <w:rsid w:val="00D86101"/>
+  </w:style>
+  <w:style w:type="paragraph" w:customStyle="1" w:styleId="F359F79EAE6A4C9AA4FCB7B83EB51A37">
+    <w:name w:val="F359F79EAE6A4C9AA4FCB7B83EB51A37"/>
+    <w:rsid w:val="00D86101"/>
   </w:style>
 </w:styles>
 </file>

</xml_diff>

<commit_message>
creazione manager e data per impostazioni, audio mixer per sistema audio e diario
</commit_message>
<xml_diff>
--- a/4_Diari/Diario.docx
+++ b/4_Diari/Diario.docx
@@ -14810,7 +14810,7 @@
               <w:rPr>
                 <w:rFonts w:ascii="Arial" w:hAnsi="Arial" w:cs="Arial"/>
               </w:rPr>
-              <w:t>Terminato script statistiche.</w:t>
+              <w:t>Praticamente terminato lo script per le impostazioni, in questo momento risultano mancare delle applicazioni per quello che riguarda l’audio e le sensibilità avendo scoperto che c’è un sistema da creare manualmente e non già costruito</w:t>
             </w:r>
           </w:p>
         </w:tc>
@@ -14848,7 +14848,7 @@
               <w:rPr>
                 <w:rFonts w:ascii="Arial" w:hAnsi="Arial" w:cs="Arial"/>
               </w:rPr>
-              <w:t>Terminata UI Impostazioni e Comandi, aggiornata la documentazione.</w:t>
+              <w:t>Praticamente concluso i comandi.</w:t>
             </w:r>
           </w:p>
         </w:tc>
@@ -14927,7 +14927,21 @@
               <w:rPr>
                 <w:rFonts w:ascii="Arial" w:hAnsi="Arial" w:cs="Arial"/>
               </w:rPr>
-              <w:t>-</w:t>
+              <w:t xml:space="preserve">Ho notato come certe impostazioni non sono modificabili con variabili di </w:t>
+            </w:r>
+            <w:proofErr w:type="spellStart"/>
+            <w:r>
+              <w:rPr>
+                <w:rFonts w:ascii="Arial" w:hAnsi="Arial" w:cs="Arial"/>
+              </w:rPr>
+              <w:t>unity</w:t>
+            </w:r>
+            <w:proofErr w:type="spellEnd"/>
+            <w:r>
+              <w:rPr>
+                <w:rFonts w:ascii="Arial" w:hAnsi="Arial" w:cs="Arial"/>
+              </w:rPr>
+              <w:t xml:space="preserve"> e quindi ho usato del tempo per eseguire qualche ricerca.</w:t>
             </w:r>
           </w:p>
         </w:tc>
@@ -15023,49 +15037,7 @@
               <w:rPr>
                 <w:rFonts w:ascii="Arial" w:hAnsi="Arial" w:cs="Arial"/>
               </w:rPr>
-              <w:t xml:space="preserve">Rispetto alla pianificazione abbiamo un leggero ritardo avendo finito solo oggi le statistiche, ma questo risulta recuperabile essendo che lavoriamo separatamente dividendo </w:t>
-            </w:r>
-            <w:proofErr w:type="spellStart"/>
-            <w:r>
-              <w:rPr>
-                <w:rFonts w:ascii="Arial" w:hAnsi="Arial" w:cs="Arial"/>
-              </w:rPr>
-              <w:t>ui</w:t>
-            </w:r>
-            <w:proofErr w:type="spellEnd"/>
-            <w:r>
-              <w:rPr>
-                <w:rFonts w:ascii="Arial" w:hAnsi="Arial" w:cs="Arial"/>
-              </w:rPr>
-              <w:t xml:space="preserve"> e scripting, infatti </w:t>
-            </w:r>
-            <w:proofErr w:type="spellStart"/>
-            <w:r>
-              <w:rPr>
-                <w:rFonts w:ascii="Arial" w:hAnsi="Arial" w:cs="Arial"/>
-              </w:rPr>
-              <w:t>bryan</w:t>
-            </w:r>
-            <w:proofErr w:type="spellEnd"/>
-            <w:r>
-              <w:rPr>
-                <w:rFonts w:ascii="Arial" w:hAnsi="Arial" w:cs="Arial"/>
-              </w:rPr>
-              <w:t xml:space="preserve"> ha iniziato la </w:t>
-            </w:r>
-            <w:proofErr w:type="spellStart"/>
-            <w:r>
-              <w:rPr>
-                <w:rFonts w:ascii="Arial" w:hAnsi="Arial" w:cs="Arial"/>
-              </w:rPr>
-              <w:t>ui</w:t>
-            </w:r>
-            <w:proofErr w:type="spellEnd"/>
-            <w:r>
-              <w:rPr>
-                <w:rFonts w:ascii="Arial" w:hAnsi="Arial" w:cs="Arial"/>
-              </w:rPr>
-              <w:t xml:space="preserve"> delle impostazioni il giorno previsto.</w:t>
+              <w:t>Purtroppo siamo in ritardo e quindi non abbiamo concluso a pieno il primo sprint come sperato, questo anche dovuto a delle assenze per motivi extrascolastici.</w:t>
             </w:r>
           </w:p>
         </w:tc>
@@ -15123,20 +15095,7 @@
               <w:rPr>
                 <w:rFonts w:ascii="Arial" w:hAnsi="Arial" w:cs="Arial"/>
               </w:rPr>
-              <w:t>Riley non sarà presente mercoledì 23 perciò cercherà di iniziare e concludere gli script per le impostazioni.</w:t>
-            </w:r>
-          </w:p>
-          <w:p>
-            <w:pPr>
-              <w:rPr>
-                <w:rFonts w:ascii="Arial" w:hAnsi="Arial" w:cs="Arial"/>
-              </w:rPr>
-            </w:pPr>
-            <w:r>
-              <w:rPr>
-                <w:rFonts w:ascii="Arial" w:hAnsi="Arial" w:cs="Arial"/>
-              </w:rPr>
-              <w:t>Bryan comincerà la logica di gestione dei comandi.</w:t>
+              <w:t>Eseguire lo sprint review, pianificare il prossimo sprint ed iniziarlo</w:t>
             </w:r>
           </w:p>
         </w:tc>
@@ -15691,6 +15650,12 @@
             </w:rPr>
             <w:t>ChatGPT</w:t>
           </w:r>
+          <w:r>
+            <w:rPr>
+              <w:rFonts w:ascii="Arial" w:hAnsi="Arial" w:cs="Arial"/>
+            </w:rPr>
+            <w:t>, Gemini</w:t>
+          </w:r>
         </w:sdtContent>
       </w:sdt>
     </w:p>
@@ -15956,36 +15921,85 @@
             <w:rPr>
               <w:rFonts w:ascii="Arial" w:hAnsi="Arial" w:cs="Arial"/>
             </w:rPr>
-            <w:t xml:space="preserve">Riley: Il numero inserito nel </w:t>
+            <w:t xml:space="preserve">Riley: </w:t>
+          </w:r>
+          <w:r>
+            <w:rPr>
+              <w:rFonts w:ascii="Arial" w:hAnsi="Arial" w:cs="Arial"/>
+            </w:rPr>
+            <w:t xml:space="preserve">sto creando il file data per le impostazioni con questi valori: “valori”. Puoi dirmi che valore effettivo usa </w:t>
           </w:r>
           <w:proofErr w:type="spellStart"/>
           <w:r>
             <w:rPr>
               <w:rFonts w:ascii="Arial" w:hAnsi="Arial" w:cs="Arial"/>
             </w:rPr>
-            <w:t>json</w:t>
+            <w:t>unity</w:t>
           </w:r>
           <w:proofErr w:type="spellEnd"/>
           <w:r>
             <w:rPr>
               <w:rFonts w:ascii="Arial" w:hAnsi="Arial" w:cs="Arial"/>
             </w:rPr>
-            <w:t xml:space="preserve"> risulta essere un numero che va dal miliardo in su, ma l’applicativo lo riduce a milioni, per caso i valori </w:t>
+            <w:t>?</w:t>
+          </w:r>
+          <w:r>
+            <w:rPr>
+              <w:rFonts w:ascii="Arial" w:hAnsi="Arial" w:cs="Arial"/>
+            </w:rPr>
+            <w:t xml:space="preserve"> </w:t>
+          </w:r>
+        </w:p>
+        <w:p>
+          <w:pPr>
+            <w:pStyle w:val="Nessunaspaziatura"/>
+            <w:spacing w:line="276" w:lineRule="auto"/>
+            <w:rPr>
+              <w:rFonts w:ascii="Arial" w:hAnsi="Arial" w:cs="Arial"/>
+            </w:rPr>
+          </w:pPr>
+          <w:r>
+            <w:rPr>
+              <w:rFonts w:ascii="Arial" w:hAnsi="Arial" w:cs="Arial"/>
+            </w:rPr>
+            <w:t xml:space="preserve">Bryan: Come creare un menu con componenti </w:t>
           </w:r>
           <w:proofErr w:type="spellStart"/>
           <w:r>
             <w:rPr>
               <w:rFonts w:ascii="Arial" w:hAnsi="Arial" w:cs="Arial"/>
             </w:rPr>
-            <w:t>int</w:t>
+            <w:t>ui</w:t>
           </w:r>
           <w:proofErr w:type="spellEnd"/>
           <w:r>
             <w:rPr>
               <w:rFonts w:ascii="Arial" w:hAnsi="Arial" w:cs="Arial"/>
             </w:rPr>
-            <w:t xml:space="preserve"> non supportano i miliardi? </w:t>
-          </w:r>
+            <w:t xml:space="preserve"> che si ripetono </w:t>
+          </w:r>
+          <w:proofErr w:type="spellStart"/>
+          <w:r>
+            <w:rPr>
+              <w:rFonts w:ascii="Arial" w:hAnsi="Arial" w:cs="Arial"/>
+            </w:rPr>
+            <w:t>modularmente</w:t>
+          </w:r>
+          <w:proofErr w:type="spellEnd"/>
+          <w:r>
+            <w:rPr>
+              <w:rFonts w:ascii="Arial" w:hAnsi="Arial" w:cs="Arial"/>
+            </w:rPr>
+            <w:t xml:space="preserve"> in </w:t>
+          </w:r>
+          <w:proofErr w:type="spellStart"/>
+          <w:r>
+            <w:rPr>
+              <w:rFonts w:ascii="Arial" w:hAnsi="Arial" w:cs="Arial"/>
+            </w:rPr>
+            <w:t>unity</w:t>
+          </w:r>
+          <w:proofErr w:type="spellEnd"/>
         </w:p>
       </w:sdtContent>
     </w:sdt>
@@ -16061,21 +16075,34 @@
             <w:rPr>
               <w:rFonts w:ascii="Arial" w:hAnsi="Arial" w:cs="Arial"/>
             </w:rPr>
-            <w:t xml:space="preserve">Riley: Mi ha detto che </w:t>
-          </w:r>
-          <w:proofErr w:type="spellStart"/>
+            <w:t xml:space="preserve">Riley: </w:t>
+          </w:r>
           <w:r>
             <w:rPr>
               <w:rFonts w:ascii="Arial" w:hAnsi="Arial" w:cs="Arial"/>
             </w:rPr>
-            <w:t>int</w:t>
-          </w:r>
-          <w:proofErr w:type="spellEnd"/>
+            <w:t>ho ottenuto una breve spiegazione dei vari valori</w:t>
+          </w:r>
           <w:r>
             <w:rPr>
               <w:rFonts w:ascii="Arial" w:hAnsi="Arial" w:cs="Arial"/>
             </w:rPr>
-            <w:t xml:space="preserve"> supporta i miliardi ma che ha un massimo di circa 2,2 miliardi ed il numero risultava più grande quindi ho ripiegato su un long</w:t>
+            <w:t>, specificando che alcuni devono essere definiti dallo sviluppatore</w:t>
+          </w:r>
+        </w:p>
+        <w:p>
+          <w:pPr>
+            <w:pStyle w:val="Nessunaspaziatura"/>
+            <w:spacing w:line="276" w:lineRule="auto"/>
+            <w:rPr>
+              <w:rFonts w:ascii="Arial" w:hAnsi="Arial" w:cs="Arial"/>
+            </w:rPr>
+          </w:pPr>
+          <w:r>
+            <w:rPr>
+              <w:rFonts w:ascii="Arial" w:hAnsi="Arial" w:cs="Arial"/>
+            </w:rPr>
+            <w:t>Bryan: restituito la struttura del codice.</w:t>
           </w:r>
         </w:p>
       </w:sdtContent>
@@ -16118,7 +16145,7 @@
           </w:rPr>
           <w:id w:val="-371767054"/>
           <w14:checkbox>
-            <w14:checked w14:val="1"/>
+            <w14:checked w14:val="0"/>
             <w14:checkedState w14:val="2612" w14:font="MS Gothic"/>
             <w14:uncheckedState w14:val="2610" w14:font="MS Gothic"/>
           </w14:checkbox>
@@ -16128,7 +16155,7 @@
             <w:rPr>
               <w:rFonts w:ascii="MS Gothic" w:eastAsia="MS Gothic" w:hAnsi="MS Gothic" w:cs="Segoe UI Symbol" w:hint="eastAsia"/>
             </w:rPr>
-            <w:t>☒</w:t>
+            <w:t>☐</w:t>
           </w:r>
         </w:sdtContent>
       </w:sdt>
@@ -16184,7 +16211,7 @@
           </w:rPr>
           <w:id w:val="2016799366"/>
           <w14:checkbox>
-            <w14:checked w14:val="0"/>
+            <w14:checked w14:val="1"/>
             <w14:checkedState w14:val="2612" w14:font="MS Gothic"/>
             <w14:uncheckedState w14:val="2610" w14:font="MS Gothic"/>
           </w14:checkbox>
@@ -16194,7 +16221,7 @@
             <w:rPr>
               <w:rFonts w:ascii="MS Gothic" w:eastAsia="MS Gothic" w:hAnsi="MS Gothic" w:cs="Segoe UI Symbol" w:hint="eastAsia"/>
             </w:rPr>
-            <w:t>☐</w:t>
+            <w:t>☒</w:t>
           </w:r>
         </w:sdtContent>
       </w:sdt>
@@ -16281,8 +16308,36 @@
         <w:rPr>
           <w:rFonts w:ascii="Arial" w:hAnsi="Arial" w:cs="Arial"/>
         </w:rPr>
-        <w:t>Riley: cercato in dei forum o documentazioni.</w:t>
-      </w:r>
+        <w:t xml:space="preserve">Riley: </w:t>
+      </w:r>
+      <w:r>
+        <w:rPr>
+          <w:rFonts w:ascii="Arial" w:hAnsi="Arial" w:cs="Arial"/>
+        </w:rPr>
+        <w:t>fatto ricerche online o sulla documentazione ufficiale</w:t>
+      </w:r>
+    </w:p>
+    <w:p>
+      <w:pPr>
+        <w:pStyle w:val="Nessunaspaziatura"/>
+        <w:rPr>
+          <w:rFonts w:ascii="Arial" w:hAnsi="Arial" w:cs="Arial"/>
+        </w:rPr>
+      </w:pPr>
+      <w:r>
+        <w:rPr>
+          <w:rFonts w:ascii="Arial" w:hAnsi="Arial" w:cs="Arial"/>
+        </w:rPr>
+        <w:t xml:space="preserve">Bryan: averi cercato un tutorial su </w:t>
+      </w:r>
+      <w:proofErr w:type="spellStart"/>
+      <w:r>
+        <w:rPr>
+          <w:rFonts w:ascii="Arial" w:hAnsi="Arial" w:cs="Arial"/>
+        </w:rPr>
+        <w:t>youtube</w:t>
+      </w:r>
+      <w:proofErr w:type="spellEnd"/>
     </w:p>
     <w:p>
       <w:pPr>
@@ -21186,6 +21241,7 @@
     <w:rsid w:val="00356BEF"/>
     <w:rsid w:val="00396FDF"/>
     <w:rsid w:val="003B3A61"/>
+    <w:rsid w:val="004335A8"/>
     <w:rsid w:val="00434CC7"/>
     <w:rsid w:val="004834F6"/>
     <w:rsid w:val="004B57DE"/>
@@ -21205,7 +21261,6 @@
     <w:rsid w:val="0089581E"/>
     <w:rsid w:val="008A28AA"/>
     <w:rsid w:val="00924F9E"/>
-    <w:rsid w:val="00936AAC"/>
     <w:rsid w:val="009826E2"/>
     <w:rsid w:val="009A56C6"/>
     <w:rsid w:val="00A04D62"/>

</xml_diff>

<commit_message>
continuo impostazioni e diario
</commit_message>
<xml_diff>
--- a/4_Diari/Diario.docx
+++ b/4_Diari/Diario.docx
@@ -193,21 +193,7 @@
               <w:rPr>
                 <w:rFonts w:ascii="Arial" w:hAnsi="Arial" w:cs="Arial"/>
               </w:rPr>
-              <w:t xml:space="preserve">Riflettuto sui requisiti e user story del gioco, creato i primi template per </w:t>
-            </w:r>
-            <w:proofErr w:type="spellStart"/>
-            <w:r>
-              <w:rPr>
-                <w:rFonts w:ascii="Arial" w:hAnsi="Arial" w:cs="Arial"/>
-              </w:rPr>
-              <w:t>gantt</w:t>
-            </w:r>
-            <w:proofErr w:type="spellEnd"/>
-            <w:r>
-              <w:rPr>
-                <w:rFonts w:ascii="Arial" w:hAnsi="Arial" w:cs="Arial"/>
-              </w:rPr>
-              <w:t xml:space="preserve"> e diario</w:t>
+              <w:t>Riflettuto sui requisiti e user story del gioco, creato i primi template per gantt e diario</w:t>
             </w:r>
           </w:p>
         </w:tc>
@@ -248,21 +234,7 @@
               <w:rPr>
                 <w:rFonts w:ascii="Arial" w:hAnsi="Arial" w:cs="Arial"/>
               </w:rPr>
-              <w:t xml:space="preserve">Riflettuto sui requisiti e user story del gioco, iniziato scrittura documentazione e sincronizzazione progetto a </w:t>
-            </w:r>
-            <w:proofErr w:type="spellStart"/>
-            <w:r>
-              <w:rPr>
-                <w:rFonts w:ascii="Arial" w:hAnsi="Arial" w:cs="Arial"/>
-              </w:rPr>
-              <w:t>GitLab</w:t>
-            </w:r>
-            <w:proofErr w:type="spellEnd"/>
-            <w:r>
-              <w:rPr>
-                <w:rFonts w:ascii="Arial" w:hAnsi="Arial" w:cs="Arial"/>
-              </w:rPr>
-              <w:t>.</w:t>
+              <w:t>Riflettuto sui requisiti e user story del gioco, iniziato scrittura documentazione e sincronizzazione progetto a GitLab.</w:t>
             </w:r>
           </w:p>
         </w:tc>
@@ -703,25 +675,7 @@
               <w:b/>
               <w:bCs/>
             </w:rPr>
-            <w:t xml:space="preserve">Nomi </w:t>
-          </w:r>
-          <w:proofErr w:type="gramStart"/>
-          <w:r>
-            <w:rPr>
-              <w:rStyle w:val="Testosegnaposto"/>
-              <w:b/>
-              <w:bCs/>
-            </w:rPr>
-            <w:t>AI</w:t>
-          </w:r>
-          <w:proofErr w:type="gramEnd"/>
-          <w:r>
-            <w:rPr>
-              <w:rStyle w:val="Testosegnaposto"/>
-              <w:b/>
-              <w:bCs/>
-            </w:rPr>
-            <w:t xml:space="preserve"> utilizzati</w:t>
+            <w:t>Nomi AI utilizzati</w:t>
           </w:r>
         </w:sdtContent>
       </w:sdt>
@@ -1802,21 +1756,7 @@
               <w:rPr>
                 <w:rFonts w:ascii="Arial" w:hAnsi="Arial" w:cs="Arial"/>
               </w:rPr>
-              <w:t xml:space="preserve">Iniziare e completare analisi dei mezzi, creare </w:t>
-            </w:r>
-            <w:proofErr w:type="gramStart"/>
-            <w:r>
-              <w:rPr>
-                <w:rFonts w:ascii="Arial" w:hAnsi="Arial" w:cs="Arial"/>
-              </w:rPr>
-              <w:t>lo use</w:t>
-            </w:r>
-            <w:proofErr w:type="gramEnd"/>
-            <w:r>
-              <w:rPr>
-                <w:rFonts w:ascii="Arial" w:hAnsi="Arial" w:cs="Arial"/>
-              </w:rPr>
-              <w:t xml:space="preserve"> case</w:t>
+              <w:t>Iniziare e completare analisi dei mezzi, creare lo use case</w:t>
             </w:r>
             <w:r>
               <w:rPr>
@@ -2294,21 +2234,7 @@
             <w:rPr>
               <w:rFonts w:ascii="Arial" w:hAnsi="Arial" w:cs="Arial"/>
             </w:rPr>
-            <w:t xml:space="preserve">Aitami a generare dei </w:t>
-          </w:r>
-          <w:proofErr w:type="spellStart"/>
-          <w:r>
-            <w:rPr>
-              <w:rFonts w:ascii="Arial" w:hAnsi="Arial" w:cs="Arial"/>
-            </w:rPr>
-            <w:t>requesiti</w:t>
-          </w:r>
-          <w:proofErr w:type="spellEnd"/>
-          <w:r>
-            <w:rPr>
-              <w:rFonts w:ascii="Arial" w:hAnsi="Arial" w:cs="Arial"/>
-            </w:rPr>
-            <w:t xml:space="preserve"> in base ai seguenti dati</w:t>
+            <w:t>Aitami a generare dei requesiti in base ai seguenti dati</w:t>
           </w:r>
         </w:p>
       </w:sdtContent>
@@ -2848,21 +2774,7 @@
               <w:rPr>
                 <w:rFonts w:ascii="Arial" w:hAnsi="Arial" w:cs="Arial"/>
               </w:rPr>
-              <w:t xml:space="preserve">Completata la analisi del dominio nella documentazione, inizio ricerche riguardo </w:t>
-            </w:r>
-            <w:proofErr w:type="spellStart"/>
-            <w:r>
-              <w:rPr>
-                <w:rFonts w:ascii="Arial" w:hAnsi="Arial" w:cs="Arial"/>
-              </w:rPr>
-              <w:t>Unity</w:t>
-            </w:r>
-            <w:proofErr w:type="spellEnd"/>
-            <w:r>
-              <w:rPr>
-                <w:rFonts w:ascii="Arial" w:hAnsi="Arial" w:cs="Arial"/>
-              </w:rPr>
-              <w:t>.</w:t>
+              <w:t>Completata la analisi del dominio nella documentazione, inizio ricerche riguardo Unity.</w:t>
             </w:r>
           </w:p>
         </w:tc>
@@ -3037,21 +2949,7 @@
               <w:rPr>
                 <w:rFonts w:ascii="Arial" w:hAnsi="Arial" w:cs="Arial"/>
               </w:rPr>
-              <w:t xml:space="preserve">Il diagramma ER non è completo e </w:t>
-            </w:r>
-            <w:proofErr w:type="gramStart"/>
-            <w:r>
-              <w:rPr>
-                <w:rFonts w:ascii="Arial" w:hAnsi="Arial" w:cs="Arial"/>
-              </w:rPr>
-              <w:t>lo use</w:t>
-            </w:r>
-            <w:proofErr w:type="gramEnd"/>
-            <w:r>
-              <w:rPr>
-                <w:rFonts w:ascii="Arial" w:hAnsi="Arial" w:cs="Arial"/>
-              </w:rPr>
-              <w:t xml:space="preserve"> case non è stato iniziato, analisi dei mezzi non ancora completata.</w:t>
+              <w:t>Il diagramma ER non è completo e lo use case non è stato iniziato, analisi dei mezzi non ancora completata.</w:t>
             </w:r>
           </w:p>
         </w:tc>
@@ -4083,16 +3981,8 @@
               <w:rPr>
                 <w:rFonts w:ascii="Arial" w:hAnsi="Arial" w:cs="Arial"/>
               </w:rPr>
-              <w:t xml:space="preserve">Creato diagramma ER e modifiche strutturali </w:t>
-            </w:r>
-            <w:proofErr w:type="spellStart"/>
-            <w:r>
-              <w:rPr>
-                <w:rFonts w:ascii="Arial" w:hAnsi="Arial" w:cs="Arial"/>
-              </w:rPr>
-              <w:t>gantt</w:t>
-            </w:r>
-            <w:proofErr w:type="spellEnd"/>
+              <w:t>Creato diagramma ER e modifiche strutturali gantt</w:t>
+            </w:r>
           </w:p>
         </w:tc>
       </w:tr>
@@ -4840,42 +4730,20 @@
             <w:rPr>
               <w:rFonts w:ascii="Arial" w:hAnsi="Arial" w:cs="Arial"/>
             </w:rPr>
-            <w:t xml:space="preserve">uoi dirmi delle classiche impostazioni per un gioco di guida in stile </w:t>
-          </w:r>
-          <w:proofErr w:type="spellStart"/>
+            <w:t>uoi dirmi delle classiche impostazioni per un gioco di guida in stile br</w:t>
+          </w:r>
           <w:r>
             <w:rPr>
               <w:rFonts w:ascii="Arial" w:hAnsi="Arial" w:cs="Arial"/>
             </w:rPr>
-            <w:t>br</w:t>
-          </w:r>
-          <w:proofErr w:type="spellEnd"/>
+            <w:t xml:space="preserve">. </w:t>
+          </w:r>
           <w:r>
             <w:rPr>
               <w:rFonts w:ascii="Arial" w:hAnsi="Arial" w:cs="Arial"/>
             </w:rPr>
-            <w:t xml:space="preserve">. </w:t>
-          </w:r>
-          <w:r>
-            <w:rPr>
-              <w:rFonts w:ascii="Arial" w:hAnsi="Arial" w:cs="Arial"/>
-            </w:rPr>
             <w:br/>
-            <w:t xml:space="preserve">Bryan: Spiegami </w:t>
-          </w:r>
-          <w:proofErr w:type="spellStart"/>
-          <w:r>
-            <w:rPr>
-              <w:rFonts w:ascii="Arial" w:hAnsi="Arial" w:cs="Arial"/>
-            </w:rPr>
-            <w:t>Unity</w:t>
-          </w:r>
-          <w:proofErr w:type="spellEnd"/>
-          <w:r>
-            <w:rPr>
-              <w:rFonts w:ascii="Arial" w:hAnsi="Arial" w:cs="Arial"/>
-            </w:rPr>
-            <w:t xml:space="preserve"> ed i suoi vantaggi.</w:t>
+            <w:t>Bryan: Spiegami Unity ed i suoi vantaggi.</w:t>
           </w:r>
         </w:p>
       </w:sdtContent>
@@ -5353,16 +5221,8 @@
               <w:rPr>
                 <w:rFonts w:ascii="Arial" w:hAnsi="Arial" w:cs="Arial"/>
               </w:rPr>
-              <w:t xml:space="preserve">Creato Diagramma ER e aggiornato </w:t>
-            </w:r>
-            <w:proofErr w:type="spellStart"/>
-            <w:r>
-              <w:rPr>
-                <w:rFonts w:ascii="Arial" w:hAnsi="Arial" w:cs="Arial"/>
-              </w:rPr>
-              <w:t>gannt</w:t>
-            </w:r>
-            <w:proofErr w:type="spellEnd"/>
+              <w:t>Creato Diagramma ER e aggiornato gannt</w:t>
+            </w:r>
           </w:p>
         </w:tc>
       </w:tr>
@@ -5399,21 +5259,7 @@
               <w:rPr>
                 <w:rFonts w:ascii="Arial" w:hAnsi="Arial" w:cs="Arial"/>
               </w:rPr>
-              <w:t xml:space="preserve">Use Case finito, Inizio creazione e documentazione </w:t>
-            </w:r>
-            <w:proofErr w:type="spellStart"/>
-            <w:r>
-              <w:rPr>
-                <w:rFonts w:ascii="Arial" w:hAnsi="Arial" w:cs="Arial"/>
-              </w:rPr>
-              <w:t>mockup</w:t>
-            </w:r>
-            <w:proofErr w:type="spellEnd"/>
-            <w:r>
-              <w:rPr>
-                <w:rFonts w:ascii="Arial" w:hAnsi="Arial" w:cs="Arial"/>
-              </w:rPr>
-              <w:t xml:space="preserve"> UI.</w:t>
+              <w:t>Use Case finito, Inizio creazione e documentazione mockup UI.</w:t>
             </w:r>
           </w:p>
         </w:tc>
@@ -5530,21 +5376,7 @@
               <w:rPr>
                 <w:rFonts w:ascii="Arial" w:hAnsi="Arial" w:cs="Arial"/>
               </w:rPr>
-              <w:t xml:space="preserve">Riuscire a definire le azioni degli attori </w:t>
-            </w:r>
-            <w:proofErr w:type="gramStart"/>
-            <w:r>
-              <w:rPr>
-                <w:rFonts w:ascii="Arial" w:hAnsi="Arial" w:cs="Arial"/>
-              </w:rPr>
-              <w:t>nel Use</w:t>
-            </w:r>
-            <w:proofErr w:type="gramEnd"/>
-            <w:r>
-              <w:rPr>
-                <w:rFonts w:ascii="Arial" w:hAnsi="Arial" w:cs="Arial"/>
-              </w:rPr>
-              <w:t xml:space="preserve"> Case, risolto approfondendo meglio.</w:t>
+              <w:t>Riuscire a definire le azioni degli attori nel Use Case, risolto approfondendo meglio.</w:t>
             </w:r>
           </w:p>
         </w:tc>
@@ -5673,21 +5505,7 @@
               <w:rPr>
                 <w:rFonts w:ascii="Arial" w:hAnsi="Arial" w:cs="Arial"/>
               </w:rPr>
-              <w:t xml:space="preserve">Continuo creazione </w:t>
-            </w:r>
-            <w:proofErr w:type="spellStart"/>
-            <w:r>
-              <w:rPr>
-                <w:rFonts w:ascii="Arial" w:hAnsi="Arial" w:cs="Arial"/>
-              </w:rPr>
-              <w:t>Mockup</w:t>
-            </w:r>
-            <w:proofErr w:type="spellEnd"/>
-            <w:r>
-              <w:rPr>
-                <w:rFonts w:ascii="Arial" w:hAnsi="Arial" w:cs="Arial"/>
-              </w:rPr>
-              <w:t xml:space="preserve"> UI.</w:t>
+              <w:t>Continuo creazione Mockup UI.</w:t>
             </w:r>
           </w:p>
         </w:tc>
@@ -6258,30 +6076,8 @@
               <w:rFonts w:ascii="Arial" w:hAnsi="Arial" w:cs="Arial"/>
             </w:rPr>
             <w:br/>
-            <w:t xml:space="preserve">Bryan: Correzioni </w:t>
-          </w:r>
-          <w:proofErr w:type="gramStart"/>
-          <w:r>
-            <w:rPr>
-              <w:rFonts w:ascii="Arial" w:hAnsi="Arial" w:cs="Arial"/>
-            </w:rPr>
-            <w:t>dello use</w:t>
-          </w:r>
-          <w:proofErr w:type="gramEnd"/>
-          <w:r>
-            <w:rPr>
-              <w:rFonts w:ascii="Arial" w:hAnsi="Arial" w:cs="Arial"/>
-            </w:rPr>
-            <w:t xml:space="preserve"> case generato dal </w:t>
-          </w:r>
-          <w:proofErr w:type="spellStart"/>
-          <w:r>
-            <w:rPr>
-              <w:rFonts w:ascii="Arial" w:hAnsi="Arial" w:cs="Arial"/>
-            </w:rPr>
-            <w:t>colega</w:t>
-          </w:r>
-          <w:proofErr w:type="spellEnd"/>
+            <w:t>Bryan: Correzioni dello use case generato dal colega</w:t>
+          </w:r>
         </w:p>
       </w:sdtContent>
     </w:sdt>
@@ -6681,16 +6477,8 @@
               <w:rPr>
                 <w:rFonts w:ascii="Arial" w:hAnsi="Arial" w:cs="Arial"/>
               </w:rPr>
-              <w:t xml:space="preserve">Completata progettazione e creazione progetto </w:t>
-            </w:r>
-            <w:proofErr w:type="spellStart"/>
-            <w:r>
-              <w:rPr>
-                <w:rFonts w:ascii="Arial" w:hAnsi="Arial" w:cs="Arial"/>
-              </w:rPr>
-              <w:t>unity</w:t>
-            </w:r>
-            <w:proofErr w:type="spellEnd"/>
+              <w:t>Completata progettazione e creazione progetto unity</w:t>
+            </w:r>
           </w:p>
         </w:tc>
       </w:tr>
@@ -6727,16 +6515,8 @@
               <w:rPr>
                 <w:rFonts w:ascii="Arial" w:hAnsi="Arial" w:cs="Arial"/>
               </w:rPr>
-              <w:t xml:space="preserve">Fine </w:t>
-            </w:r>
-            <w:proofErr w:type="spellStart"/>
-            <w:r>
-              <w:rPr>
-                <w:rFonts w:ascii="Arial" w:hAnsi="Arial" w:cs="Arial"/>
-              </w:rPr>
-              <w:t>Mockup</w:t>
-            </w:r>
-            <w:proofErr w:type="spellEnd"/>
+              <w:t>Fine Mockup</w:t>
+            </w:r>
           </w:p>
         </w:tc>
       </w:tr>
@@ -6814,52 +6594,8 @@
               <w:rPr>
                 <w:rFonts w:ascii="Arial" w:hAnsi="Arial" w:cs="Arial"/>
               </w:rPr>
-              <w:t xml:space="preserve">Problemi nel </w:t>
-            </w:r>
-            <w:proofErr w:type="spellStart"/>
-            <w:r>
-              <w:rPr>
-                <w:rFonts w:ascii="Arial" w:hAnsi="Arial" w:cs="Arial"/>
-              </w:rPr>
-              <w:t>pushare</w:t>
-            </w:r>
-            <w:proofErr w:type="spellEnd"/>
-            <w:r>
-              <w:rPr>
-                <w:rFonts w:ascii="Arial" w:hAnsi="Arial" w:cs="Arial"/>
-              </w:rPr>
-              <w:t xml:space="preserve"> il progetto </w:t>
-            </w:r>
-            <w:proofErr w:type="spellStart"/>
-            <w:r>
-              <w:rPr>
-                <w:rFonts w:ascii="Arial" w:hAnsi="Arial" w:cs="Arial"/>
-              </w:rPr>
-              <w:t>uinity</w:t>
-            </w:r>
-            <w:proofErr w:type="spellEnd"/>
-            <w:r>
-              <w:rPr>
-                <w:rFonts w:ascii="Arial" w:hAnsi="Arial" w:cs="Arial"/>
-              </w:rPr>
-              <w:t xml:space="preserve">, risolto grazie alla creazione di un </w:t>
-            </w:r>
-            <w:proofErr w:type="gramStart"/>
-            <w:r>
-              <w:rPr>
-                <w:rFonts w:ascii="Arial" w:hAnsi="Arial" w:cs="Arial"/>
-              </w:rPr>
-              <w:t>file .</w:t>
-            </w:r>
-            <w:proofErr w:type="spellStart"/>
-            <w:r>
-              <w:rPr>
-                <w:rFonts w:ascii="Arial" w:hAnsi="Arial" w:cs="Arial"/>
-              </w:rPr>
-              <w:t>gitignore</w:t>
-            </w:r>
-            <w:proofErr w:type="spellEnd"/>
-            <w:proofErr w:type="gramEnd"/>
+              <w:t>Problemi nel pushare il progetto uinity, risolto grazie alla creazione di un file .gitignore</w:t>
+            </w:r>
           </w:p>
         </w:tc>
       </w:tr>
@@ -7012,35 +6748,7 @@
               <w:rPr>
                 <w:rFonts w:ascii="Arial" w:hAnsi="Arial" w:cs="Arial"/>
               </w:rPr>
-              <w:t xml:space="preserve">Ambientarsi nel game </w:t>
-            </w:r>
-            <w:proofErr w:type="spellStart"/>
-            <w:r>
-              <w:rPr>
-                <w:rFonts w:ascii="Arial" w:hAnsi="Arial" w:cs="Arial"/>
-              </w:rPr>
-              <w:t>engine</w:t>
-            </w:r>
-            <w:proofErr w:type="spellEnd"/>
-            <w:r>
-              <w:rPr>
-                <w:rFonts w:ascii="Arial" w:hAnsi="Arial" w:cs="Arial"/>
-              </w:rPr>
-              <w:t xml:space="preserve"> di </w:t>
-            </w:r>
-            <w:proofErr w:type="spellStart"/>
-            <w:r>
-              <w:rPr>
-                <w:rFonts w:ascii="Arial" w:hAnsi="Arial" w:cs="Arial"/>
-              </w:rPr>
-              <w:t>unity</w:t>
-            </w:r>
-            <w:proofErr w:type="spellEnd"/>
-            <w:r>
-              <w:rPr>
-                <w:rFonts w:ascii="Arial" w:hAnsi="Arial" w:cs="Arial"/>
-              </w:rPr>
-              <w:t xml:space="preserve"> e quindi cominciare a creare la schermata di statistiche</w:t>
+              <w:t>Ambientarsi nel game engine di unity e quindi cominciare a creare la schermata di statistiche</w:t>
             </w:r>
           </w:p>
         </w:tc>
@@ -7512,21 +7220,7 @@
             <w:rPr>
               <w:rFonts w:ascii="Arial" w:hAnsi="Arial" w:cs="Arial"/>
             </w:rPr>
-            <w:t xml:space="preserve">Bryan: Generami un’immagine di </w:t>
-          </w:r>
-          <w:proofErr w:type="spellStart"/>
-          <w:r>
-            <w:rPr>
-              <w:rFonts w:ascii="Arial" w:hAnsi="Arial" w:cs="Arial"/>
-            </w:rPr>
-            <w:t>mockup</w:t>
-          </w:r>
-          <w:proofErr w:type="spellEnd"/>
-          <w:r>
-            <w:rPr>
-              <w:rFonts w:ascii="Arial" w:hAnsi="Arial" w:cs="Arial"/>
-            </w:rPr>
-            <w:t xml:space="preserve"> basandoti sul seguente stile: “stile”</w:t>
+            <w:t>Bryan: Generami un’immagine di mockup basandoti sul seguente stile: “stile”</w:t>
           </w:r>
         </w:p>
         <w:p>
@@ -7840,58 +7534,14 @@
         <w:rPr>
           <w:rFonts w:ascii="Arial" w:hAnsi="Arial" w:cs="Arial"/>
         </w:rPr>
-        <w:t xml:space="preserve">Riley: probabilmente non sarei riuscito a risolvere questo problema non avendo un’esperienza molto avanzata con i </w:t>
-      </w:r>
-      <w:proofErr w:type="gramStart"/>
-      <w:r>
-        <w:rPr>
-          <w:rFonts w:ascii="Arial" w:hAnsi="Arial" w:cs="Arial"/>
-        </w:rPr>
-        <w:t>file .</w:t>
-      </w:r>
-      <w:proofErr w:type="spellStart"/>
-      <w:r>
-        <w:rPr>
-          <w:rFonts w:ascii="Arial" w:hAnsi="Arial" w:cs="Arial"/>
-        </w:rPr>
-        <w:t>gitignore</w:t>
-      </w:r>
-      <w:proofErr w:type="spellEnd"/>
-      <w:proofErr w:type="gramEnd"/>
+        <w:t>Riley: probabilmente non sarei riuscito a risolvere questo problema non avendo un’esperienza molto avanzata con i file .gitignore</w:t>
+      </w:r>
       <w:r>
         <w:rPr>
           <w:rFonts w:ascii="Arial" w:hAnsi="Arial" w:cs="Arial"/>
         </w:rPr>
         <w:br/>
-        <w:t xml:space="preserve">Bryan: Averi creato un’immagine su </w:t>
-      </w:r>
-      <w:proofErr w:type="spellStart"/>
-      <w:r>
-        <w:rPr>
-          <w:rFonts w:ascii="Arial" w:hAnsi="Arial" w:cs="Arial"/>
-        </w:rPr>
-        <w:t>paint</w:t>
-      </w:r>
-      <w:proofErr w:type="spellEnd"/>
-      <w:r>
-        <w:rPr>
-          <w:rFonts w:ascii="Arial" w:hAnsi="Arial" w:cs="Arial"/>
-        </w:rPr>
-        <w:t xml:space="preserve"> che avrebbe reso i </w:t>
-      </w:r>
-      <w:proofErr w:type="spellStart"/>
-      <w:r>
-        <w:rPr>
-          <w:rFonts w:ascii="Arial" w:hAnsi="Arial" w:cs="Arial"/>
-        </w:rPr>
-        <w:t>mockup</w:t>
-      </w:r>
-      <w:proofErr w:type="spellEnd"/>
-      <w:r>
-        <w:rPr>
-          <w:rFonts w:ascii="Arial" w:hAnsi="Arial" w:cs="Arial"/>
-        </w:rPr>
-        <w:t xml:space="preserve"> molto più confusi.</w:t>
+        <w:t>Bryan: Averi creato un’immagine su paint che avrebbe reso i mockup molto più confusi.</w:t>
       </w:r>
     </w:p>
     <w:p>
@@ -8077,21 +7727,7 @@
               <w:rPr>
                 <w:rFonts w:ascii="Arial" w:hAnsi="Arial" w:cs="Arial"/>
               </w:rPr>
-              <w:t xml:space="preserve">Inizio sviluppo </w:t>
-            </w:r>
-            <w:proofErr w:type="spellStart"/>
-            <w:r>
-              <w:rPr>
-                <w:rFonts w:ascii="Arial" w:hAnsi="Arial" w:cs="Arial"/>
-              </w:rPr>
-              <w:t>ui</w:t>
-            </w:r>
-            <w:proofErr w:type="spellEnd"/>
-            <w:r>
-              <w:rPr>
-                <w:rFonts w:ascii="Arial" w:hAnsi="Arial" w:cs="Arial"/>
-              </w:rPr>
-              <w:t xml:space="preserve"> statistiche</w:t>
+              <w:t>Inizio sviluppo ui statistiche</w:t>
             </w:r>
           </w:p>
         </w:tc>
@@ -8129,21 +7765,7 @@
               <w:rPr>
                 <w:rFonts w:ascii="Arial" w:hAnsi="Arial" w:cs="Arial"/>
               </w:rPr>
-              <w:t xml:space="preserve">Inizio sviluppo </w:t>
-            </w:r>
-            <w:proofErr w:type="spellStart"/>
-            <w:r>
-              <w:rPr>
-                <w:rFonts w:ascii="Arial" w:hAnsi="Arial" w:cs="Arial"/>
-              </w:rPr>
-              <w:t>ui</w:t>
-            </w:r>
-            <w:proofErr w:type="spellEnd"/>
-            <w:r>
-              <w:rPr>
-                <w:rFonts w:ascii="Arial" w:hAnsi="Arial" w:cs="Arial"/>
-              </w:rPr>
-              <w:t xml:space="preserve"> statistiche</w:t>
+              <w:t>Inizio sviluppo ui statistiche</w:t>
             </w:r>
           </w:p>
         </w:tc>
@@ -8376,21 +7998,7 @@
               <w:rPr>
                 <w:rFonts w:ascii="Arial" w:hAnsi="Arial" w:cs="Arial"/>
               </w:rPr>
-              <w:t xml:space="preserve">Completare la </w:t>
-            </w:r>
-            <w:proofErr w:type="spellStart"/>
-            <w:r>
-              <w:rPr>
-                <w:rFonts w:ascii="Arial" w:hAnsi="Arial" w:cs="Arial"/>
-              </w:rPr>
-              <w:t>ui</w:t>
-            </w:r>
-            <w:proofErr w:type="spellEnd"/>
-            <w:r>
-              <w:rPr>
-                <w:rFonts w:ascii="Arial" w:hAnsi="Arial" w:cs="Arial"/>
-              </w:rPr>
-              <w:t xml:space="preserve"> delle statistiche</w:t>
+              <w:t>Completare la ui delle statistiche</w:t>
             </w:r>
           </w:p>
         </w:tc>
@@ -8440,28 +8048,12 @@
                 <w:rFonts w:ascii="Arial" w:hAnsi="Arial" w:cs="Arial"/>
               </w:rPr>
             </w:pPr>
-            <w:proofErr w:type="spellStart"/>
-            <w:r>
-              <w:rPr>
-                <w:rFonts w:ascii="Arial" w:hAnsi="Arial" w:cs="Arial"/>
-              </w:rPr>
-              <w:t>Daily</w:t>
-            </w:r>
-            <w:proofErr w:type="spellEnd"/>
-            <w:r>
-              <w:rPr>
-                <w:rFonts w:ascii="Arial" w:hAnsi="Arial" w:cs="Arial"/>
-              </w:rPr>
-              <w:t xml:space="preserve"> </w:t>
-            </w:r>
-            <w:proofErr w:type="spellStart"/>
-            <w:r>
-              <w:rPr>
-                <w:rFonts w:ascii="Arial" w:hAnsi="Arial" w:cs="Arial"/>
-              </w:rPr>
-              <w:t>Scrum</w:t>
-            </w:r>
-            <w:proofErr w:type="spellEnd"/>
+            <w:r>
+              <w:rPr>
+                <w:rFonts w:ascii="Arial" w:hAnsi="Arial" w:cs="Arial"/>
+              </w:rPr>
+              <w:t>Daily Scrum</w:t>
+            </w:r>
           </w:p>
         </w:tc>
       </w:tr>
@@ -8509,35 +8101,7 @@
               <w:rPr>
                 <w:rFonts w:ascii="Arial" w:hAnsi="Arial" w:cs="Arial"/>
               </w:rPr>
-              <w:t xml:space="preserve">Introduzione ambiente </w:t>
-            </w:r>
-            <w:proofErr w:type="spellStart"/>
-            <w:r>
-              <w:rPr>
-                <w:rFonts w:ascii="Arial" w:hAnsi="Arial" w:cs="Arial"/>
-              </w:rPr>
-              <w:t>unity</w:t>
-            </w:r>
-            <w:proofErr w:type="spellEnd"/>
-            <w:r>
-              <w:rPr>
-                <w:rFonts w:ascii="Arial" w:hAnsi="Arial" w:cs="Arial"/>
-              </w:rPr>
-              <w:t xml:space="preserve"> e inizio </w:t>
-            </w:r>
-            <w:proofErr w:type="spellStart"/>
-            <w:r>
-              <w:rPr>
-                <w:rFonts w:ascii="Arial" w:hAnsi="Arial" w:cs="Arial"/>
-              </w:rPr>
-              <w:t>imostazione</w:t>
-            </w:r>
-            <w:proofErr w:type="spellEnd"/>
-            <w:r>
-              <w:rPr>
-                <w:rFonts w:ascii="Arial" w:hAnsi="Arial" w:cs="Arial"/>
-              </w:rPr>
-              <w:t xml:space="preserve"> layout statistiche</w:t>
+              <w:t>Introduzione ambiente unity e inizio imostazione layout statistiche</w:t>
             </w:r>
           </w:p>
         </w:tc>
@@ -8717,16 +8281,8 @@
               <w:rPr>
                 <w:rFonts w:ascii="Arial" w:hAnsi="Arial" w:cs="Arial"/>
               </w:rPr>
-              <w:t xml:space="preserve">Sprint </w:t>
-            </w:r>
-            <w:proofErr w:type="spellStart"/>
-            <w:r>
-              <w:rPr>
-                <w:rFonts w:ascii="Arial" w:hAnsi="Arial" w:cs="Arial"/>
-              </w:rPr>
-              <w:t>Retrospective</w:t>
-            </w:r>
-            <w:proofErr w:type="spellEnd"/>
+              <w:t>Sprint Retrospective</w:t>
+            </w:r>
           </w:p>
         </w:tc>
       </w:tr>
@@ -9687,44 +9243,8 @@
               <w:rPr>
                 <w:rFonts w:ascii="Arial" w:hAnsi="Arial" w:cs="Arial"/>
               </w:rPr>
-              <w:t xml:space="preserve">Ricerca e sviluppo per salvataggio statistiche su </w:t>
-            </w:r>
-            <w:proofErr w:type="spellStart"/>
-            <w:r>
-              <w:rPr>
-                <w:rFonts w:ascii="Arial" w:hAnsi="Arial" w:cs="Arial"/>
-              </w:rPr>
-              <w:t>json</w:t>
-            </w:r>
-            <w:proofErr w:type="spellEnd"/>
-            <w:r>
-              <w:rPr>
-                <w:rFonts w:ascii="Arial" w:hAnsi="Arial" w:cs="Arial"/>
-              </w:rPr>
-              <w:t xml:space="preserve">, non ancora completo, questo verrà utilizzato come test per verificare il funzionamento delle varie schermate </w:t>
-            </w:r>
-            <w:proofErr w:type="spellStart"/>
-            <w:r>
-              <w:rPr>
-                <w:rFonts w:ascii="Arial" w:hAnsi="Arial" w:cs="Arial"/>
-              </w:rPr>
-              <w:t>ui</w:t>
-            </w:r>
-            <w:proofErr w:type="spellEnd"/>
-            <w:r>
-              <w:rPr>
-                <w:rFonts w:ascii="Arial" w:hAnsi="Arial" w:cs="Arial"/>
-              </w:rPr>
-              <w:t xml:space="preserve"> poi verrà adattato per il </w:t>
-            </w:r>
-            <w:proofErr w:type="spellStart"/>
-            <w:r>
-              <w:rPr>
-                <w:rFonts w:ascii="Arial" w:hAnsi="Arial" w:cs="Arial"/>
-              </w:rPr>
-              <w:t>db</w:t>
-            </w:r>
-            <w:proofErr w:type="spellEnd"/>
+              <w:t>Ricerca e sviluppo per salvataggio statistiche su json, non ancora completo, questo verrà utilizzato come test per verificare il funzionamento delle varie schermate ui poi verrà adattato per il db</w:t>
+            </w:r>
           </w:p>
         </w:tc>
       </w:tr>
@@ -9878,21 +9398,7 @@
               <w:rPr>
                 <w:rFonts w:ascii="Arial" w:hAnsi="Arial" w:cs="Arial"/>
               </w:rPr>
-              <w:t xml:space="preserve">Non trovavo la cartella degli assets, risolto cercando su </w:t>
-            </w:r>
-            <w:proofErr w:type="spellStart"/>
-            <w:r>
-              <w:rPr>
-                <w:rFonts w:ascii="Arial" w:hAnsi="Arial" w:cs="Arial"/>
-              </w:rPr>
-              <w:t>google</w:t>
-            </w:r>
-            <w:proofErr w:type="spellEnd"/>
-            <w:r>
-              <w:rPr>
-                <w:rFonts w:ascii="Arial" w:hAnsi="Arial" w:cs="Arial"/>
-              </w:rPr>
-              <w:t>.</w:t>
+              <w:t>Non trovavo la cartella degli assets, risolto cercando su google.</w:t>
             </w:r>
           </w:p>
         </w:tc>
@@ -9950,21 +9456,7 @@
               <w:rPr>
                 <w:rFonts w:ascii="Arial" w:hAnsi="Arial" w:cs="Arial"/>
               </w:rPr>
-              <w:t xml:space="preserve">Le statistiche non sono concluse, manca una piccola parte della </w:t>
-            </w:r>
-            <w:proofErr w:type="spellStart"/>
-            <w:r>
-              <w:rPr>
-                <w:rFonts w:ascii="Arial" w:hAnsi="Arial" w:cs="Arial"/>
-              </w:rPr>
-              <w:t>ui</w:t>
-            </w:r>
-            <w:proofErr w:type="spellEnd"/>
-            <w:r>
-              <w:rPr>
-                <w:rFonts w:ascii="Arial" w:hAnsi="Arial" w:cs="Arial"/>
-              </w:rPr>
-              <w:t xml:space="preserve"> e la logica di salvataggio e caricamento</w:t>
+              <w:t>Le statistiche non sono concluse, manca una piccola parte della ui e la logica di salvataggio e caricamento</w:t>
             </w:r>
           </w:p>
         </w:tc>
@@ -10072,28 +9564,12 @@
                 <w:rFonts w:ascii="Arial" w:hAnsi="Arial" w:cs="Arial"/>
               </w:rPr>
             </w:pPr>
-            <w:proofErr w:type="spellStart"/>
-            <w:r>
-              <w:rPr>
-                <w:rFonts w:ascii="Arial" w:hAnsi="Arial" w:cs="Arial"/>
-              </w:rPr>
-              <w:t>Daily</w:t>
-            </w:r>
-            <w:proofErr w:type="spellEnd"/>
-            <w:r>
-              <w:rPr>
-                <w:rFonts w:ascii="Arial" w:hAnsi="Arial" w:cs="Arial"/>
-              </w:rPr>
-              <w:t xml:space="preserve"> </w:t>
-            </w:r>
-            <w:proofErr w:type="spellStart"/>
-            <w:r>
-              <w:rPr>
-                <w:rFonts w:ascii="Arial" w:hAnsi="Arial" w:cs="Arial"/>
-              </w:rPr>
-              <w:t>Scrum</w:t>
-            </w:r>
-            <w:proofErr w:type="spellEnd"/>
+            <w:r>
+              <w:rPr>
+                <w:rFonts w:ascii="Arial" w:hAnsi="Arial" w:cs="Arial"/>
+              </w:rPr>
+              <w:t>Daily Scrum</w:t>
+            </w:r>
           </w:p>
         </w:tc>
       </w:tr>
@@ -10141,35 +9617,7 @@
               <w:rPr>
                 <w:rFonts w:ascii="Arial" w:hAnsi="Arial" w:cs="Arial"/>
               </w:rPr>
-              <w:t xml:space="preserve">Entrambi completeremo la </w:t>
-            </w:r>
-            <w:proofErr w:type="spellStart"/>
-            <w:r>
-              <w:rPr>
-                <w:rFonts w:ascii="Arial" w:hAnsi="Arial" w:cs="Arial"/>
-              </w:rPr>
-              <w:t>ui</w:t>
-            </w:r>
-            <w:proofErr w:type="spellEnd"/>
-            <w:r>
-              <w:rPr>
-                <w:rFonts w:ascii="Arial" w:hAnsi="Arial" w:cs="Arial"/>
-              </w:rPr>
-              <w:t xml:space="preserve"> delle statistiche in modo tale che ci ambientiamo completamente per lo sviluppo 2D e gli script C# per poterci permettere di lavorare separatamente in </w:t>
-            </w:r>
-            <w:proofErr w:type="spellStart"/>
-            <w:r>
-              <w:rPr>
-                <w:rFonts w:ascii="Arial" w:hAnsi="Arial" w:cs="Arial"/>
-              </w:rPr>
-              <w:t>fututro</w:t>
-            </w:r>
-            <w:proofErr w:type="spellEnd"/>
-            <w:r>
-              <w:rPr>
-                <w:rFonts w:ascii="Arial" w:hAnsi="Arial" w:cs="Arial"/>
-              </w:rPr>
-              <w:t>.</w:t>
+              <w:t>Entrambi completeremo la ui delle statistiche in modo tale che ci ambientiamo completamente per lo sviluppo 2D e gli script C# per poterci permettere di lavorare separatamente in fututro.</w:t>
             </w:r>
           </w:p>
         </w:tc>
@@ -10349,16 +9797,8 @@
               <w:rPr>
                 <w:rFonts w:ascii="Arial" w:hAnsi="Arial" w:cs="Arial"/>
               </w:rPr>
-              <w:t xml:space="preserve">Sprint </w:t>
-            </w:r>
-            <w:proofErr w:type="spellStart"/>
-            <w:r>
-              <w:rPr>
-                <w:rFonts w:ascii="Arial" w:hAnsi="Arial" w:cs="Arial"/>
-              </w:rPr>
-              <w:t>Retrospective</w:t>
-            </w:r>
-            <w:proofErr w:type="spellEnd"/>
+              <w:t>Sprint Retrospective</w:t>
+            </w:r>
           </w:p>
         </w:tc>
       </w:tr>
@@ -10850,30 +10290,8 @@
             <w:rPr>
               <w:rFonts w:ascii="Arial" w:hAnsi="Arial" w:cs="Arial"/>
             </w:rPr>
-            <w:t xml:space="preserve">Riley: aiutami a comprendere come salvare dei dati </w:t>
-          </w:r>
-          <w:proofErr w:type="spellStart"/>
-          <w:r>
-            <w:rPr>
-              <w:rFonts w:ascii="Arial" w:hAnsi="Arial" w:cs="Arial"/>
-            </w:rPr>
-            <w:t>unity</w:t>
-          </w:r>
-          <w:proofErr w:type="spellEnd"/>
-          <w:r>
-            <w:rPr>
-              <w:rFonts w:ascii="Arial" w:hAnsi="Arial" w:cs="Arial"/>
-            </w:rPr>
-            <w:t xml:space="preserve"> su un </w:t>
-          </w:r>
-          <w:proofErr w:type="spellStart"/>
-          <w:r>
-            <w:rPr>
-              <w:rFonts w:ascii="Arial" w:hAnsi="Arial" w:cs="Arial"/>
-            </w:rPr>
-            <w:t>json</w:t>
-          </w:r>
-          <w:proofErr w:type="spellEnd"/>
+            <w:t>Riley: aiutami a comprendere come salvare dei dati unity su un json</w:t>
+          </w:r>
         </w:p>
       </w:sdtContent>
     </w:sdt>
@@ -11385,21 +10803,7 @@
               <w:rPr>
                 <w:rFonts w:ascii="Arial" w:hAnsi="Arial" w:cs="Arial"/>
               </w:rPr>
-              <w:t xml:space="preserve">Terminato </w:t>
-            </w:r>
-            <w:proofErr w:type="spellStart"/>
-            <w:r>
-              <w:rPr>
-                <w:rFonts w:ascii="Arial" w:hAnsi="Arial" w:cs="Arial"/>
-              </w:rPr>
-              <w:t>ui</w:t>
-            </w:r>
-            <w:proofErr w:type="spellEnd"/>
-            <w:r>
-              <w:rPr>
-                <w:rFonts w:ascii="Arial" w:hAnsi="Arial" w:cs="Arial"/>
-              </w:rPr>
-              <w:t xml:space="preserve"> statistiche e iniziato quella delle impostazioni</w:t>
+              <w:t>Terminato ui statistiche e iniziato quella delle impostazioni</w:t>
             </w:r>
           </w:p>
         </w:tc>
@@ -11478,97 +10882,13 @@
               <w:rPr>
                 <w:rFonts w:ascii="Arial" w:hAnsi="Arial" w:cs="Arial"/>
               </w:rPr>
-              <w:t xml:space="preserve">Problemi di merge, risolto tramite una configurazione di un tool di </w:t>
-            </w:r>
-            <w:proofErr w:type="spellStart"/>
-            <w:r>
-              <w:rPr>
-                <w:rFonts w:ascii="Arial" w:hAnsi="Arial" w:cs="Arial"/>
-              </w:rPr>
-              <w:t>unity</w:t>
-            </w:r>
-            <w:proofErr w:type="spellEnd"/>
-            <w:r>
-              <w:rPr>
-                <w:rFonts w:ascii="Arial" w:hAnsi="Arial" w:cs="Arial"/>
-              </w:rPr>
-              <w:t xml:space="preserve"> che permette di risolvere automaticamente i conflitti, è stato fatto una configurazione che fa avvia un file .</w:t>
-            </w:r>
-            <w:proofErr w:type="spellStart"/>
-            <w:r>
-              <w:rPr>
-                <w:rFonts w:ascii="Arial" w:hAnsi="Arial" w:cs="Arial"/>
-              </w:rPr>
-              <w:t>cmd</w:t>
-            </w:r>
-            <w:proofErr w:type="spellEnd"/>
-            <w:r>
-              <w:rPr>
-                <w:rFonts w:ascii="Arial" w:hAnsi="Arial" w:cs="Arial"/>
-              </w:rPr>
-              <w:t xml:space="preserve"> sotto la cartella tools questo piccolo script prende i file con conflitti rilevati da </w:t>
-            </w:r>
-            <w:proofErr w:type="spellStart"/>
-            <w:r>
-              <w:rPr>
-                <w:rFonts w:ascii="Arial" w:hAnsi="Arial" w:cs="Arial"/>
-              </w:rPr>
-              <w:t>git</w:t>
-            </w:r>
-            <w:proofErr w:type="spellEnd"/>
-            <w:r>
-              <w:rPr>
-                <w:rFonts w:ascii="Arial" w:hAnsi="Arial" w:cs="Arial"/>
-              </w:rPr>
-              <w:t xml:space="preserve"> e li traduce per </w:t>
-            </w:r>
-            <w:proofErr w:type="spellStart"/>
-            <w:r>
-              <w:rPr>
-                <w:rFonts w:ascii="Arial" w:hAnsi="Arial" w:cs="Arial"/>
-              </w:rPr>
-              <w:t>unityyalmmerge</w:t>
-            </w:r>
-            <w:proofErr w:type="spellEnd"/>
-            <w:r>
-              <w:rPr>
-                <w:rFonts w:ascii="Arial" w:hAnsi="Arial" w:cs="Arial"/>
-              </w:rPr>
-              <w:t xml:space="preserve"> facendo in modo che una volta usato il comando </w:t>
-            </w:r>
-            <w:proofErr w:type="spellStart"/>
-            <w:r>
-              <w:rPr>
-                <w:rFonts w:ascii="Arial" w:hAnsi="Arial" w:cs="Arial"/>
-              </w:rPr>
-              <w:t>git</w:t>
-            </w:r>
-            <w:proofErr w:type="spellEnd"/>
-            <w:r>
-              <w:rPr>
-                <w:rFonts w:ascii="Arial" w:hAnsi="Arial" w:cs="Arial"/>
-              </w:rPr>
-              <w:t xml:space="preserve"> pull non risultino più errori.</w:t>
-            </w:r>
-            <w:r>
-              <w:rPr>
-                <w:rFonts w:ascii="Arial" w:hAnsi="Arial" w:cs="Arial"/>
-              </w:rPr>
-              <w:t xml:space="preserve"> </w:t>
-            </w:r>
-            <w:proofErr w:type="spellStart"/>
-            <w:r>
-              <w:rPr>
-                <w:rFonts w:ascii="Arial" w:hAnsi="Arial" w:cs="Arial"/>
-              </w:rPr>
-              <w:t>Chatgpt</w:t>
-            </w:r>
-            <w:proofErr w:type="spellEnd"/>
-            <w:r>
-              <w:rPr>
-                <w:rFonts w:ascii="Arial" w:hAnsi="Arial" w:cs="Arial"/>
-              </w:rPr>
-              <w:t xml:space="preserve"> mi ha supportato nella risoluzione di questo problema</w:t>
+              <w:t>Problemi di merge, risolto tramite una configurazione di un tool di unity che permette di risolvere automaticamente i conflitti, è stato fatto una configurazione che fa avvia un file .cmd sotto la cartella tools questo piccolo script prende i file con conflitti rilevati da git e li traduce per unityyalmmerge facendo in modo che una volta usato il comando git pull non risultino più errori.</w:t>
+            </w:r>
+            <w:r>
+              <w:rPr>
+                <w:rFonts w:ascii="Arial" w:hAnsi="Arial" w:cs="Arial"/>
+              </w:rPr>
+              <w:t xml:space="preserve"> Chatgpt mi ha supportato nella risoluzione di questo problema</w:t>
             </w:r>
           </w:p>
         </w:tc>
@@ -11664,21 +10984,7 @@
               <w:rPr>
                 <w:rFonts w:ascii="Arial" w:hAnsi="Arial" w:cs="Arial"/>
               </w:rPr>
-              <w:t xml:space="preserve">La </w:t>
-            </w:r>
-            <w:proofErr w:type="spellStart"/>
-            <w:r>
-              <w:rPr>
-                <w:rFonts w:ascii="Arial" w:hAnsi="Arial" w:cs="Arial"/>
-              </w:rPr>
-              <w:t>ui</w:t>
-            </w:r>
-            <w:proofErr w:type="spellEnd"/>
-            <w:r>
-              <w:rPr>
-                <w:rFonts w:ascii="Arial" w:hAnsi="Arial" w:cs="Arial"/>
-              </w:rPr>
-              <w:t xml:space="preserve"> delle statistiche è completa ma mancano alcune parti dello script, di conseguenza abbiamo un ritardo generale.</w:t>
+              <w:t>La ui delle statistiche è completa ma mancano alcune parti dello script, di conseguenza abbiamo un ritardo generale.</w:t>
             </w:r>
           </w:p>
         </w:tc>
@@ -11736,21 +11042,7 @@
               <w:rPr>
                 <w:rFonts w:ascii="Arial" w:hAnsi="Arial" w:cs="Arial"/>
               </w:rPr>
-              <w:t xml:space="preserve">Terminare script statistiche, continuare </w:t>
-            </w:r>
-            <w:proofErr w:type="spellStart"/>
-            <w:r>
-              <w:rPr>
-                <w:rFonts w:ascii="Arial" w:hAnsi="Arial" w:cs="Arial"/>
-              </w:rPr>
-              <w:t>ui</w:t>
-            </w:r>
-            <w:proofErr w:type="spellEnd"/>
-            <w:r>
-              <w:rPr>
-                <w:rFonts w:ascii="Arial" w:hAnsi="Arial" w:cs="Arial"/>
-              </w:rPr>
-              <w:t xml:space="preserve"> impostazioni</w:t>
+              <w:t>Terminare script statistiche, continuare ui impostazioni</w:t>
             </w:r>
           </w:p>
         </w:tc>
@@ -11800,28 +11092,12 @@
                 <w:rFonts w:ascii="Arial" w:hAnsi="Arial" w:cs="Arial"/>
               </w:rPr>
             </w:pPr>
-            <w:proofErr w:type="spellStart"/>
-            <w:r>
-              <w:rPr>
-                <w:rFonts w:ascii="Arial" w:hAnsi="Arial" w:cs="Arial"/>
-              </w:rPr>
-              <w:t>Daily</w:t>
-            </w:r>
-            <w:proofErr w:type="spellEnd"/>
-            <w:r>
-              <w:rPr>
-                <w:rFonts w:ascii="Arial" w:hAnsi="Arial" w:cs="Arial"/>
-              </w:rPr>
-              <w:t xml:space="preserve"> </w:t>
-            </w:r>
-            <w:proofErr w:type="spellStart"/>
-            <w:r>
-              <w:rPr>
-                <w:rFonts w:ascii="Arial" w:hAnsi="Arial" w:cs="Arial"/>
-              </w:rPr>
-              <w:t>Scrum</w:t>
-            </w:r>
-            <w:proofErr w:type="spellEnd"/>
+            <w:r>
+              <w:rPr>
+                <w:rFonts w:ascii="Arial" w:hAnsi="Arial" w:cs="Arial"/>
+              </w:rPr>
+              <w:t>Daily Scrum</w:t>
+            </w:r>
           </w:p>
         </w:tc>
       </w:tr>
@@ -11869,21 +11145,7 @@
               <w:rPr>
                 <w:rFonts w:ascii="Arial" w:hAnsi="Arial" w:cs="Arial"/>
               </w:rPr>
-              <w:t xml:space="preserve">Riley deve risolvere un problema di merge riscontrato al tentativo di pull e poi continuare con lo script delle statistiche, invece Bryan deve fine la </w:t>
-            </w:r>
-            <w:proofErr w:type="spellStart"/>
-            <w:r>
-              <w:rPr>
-                <w:rFonts w:ascii="Arial" w:hAnsi="Arial" w:cs="Arial"/>
-              </w:rPr>
-              <w:t>ui</w:t>
-            </w:r>
-            <w:proofErr w:type="spellEnd"/>
-            <w:r>
-              <w:rPr>
-                <w:rFonts w:ascii="Arial" w:hAnsi="Arial" w:cs="Arial"/>
-              </w:rPr>
-              <w:t xml:space="preserve"> delle statistiche e preferibilmente iniziare con le impostazioni.</w:t>
+              <w:t>Riley deve risolvere un problema di merge riscontrato al tentativo di pull e poi continuare con lo script delle statistiche, invece Bryan deve fine la ui delle statistiche e preferibilmente iniziare con le impostazioni.</w:t>
             </w:r>
           </w:p>
         </w:tc>
@@ -12063,16 +11325,8 @@
               <w:rPr>
                 <w:rFonts w:ascii="Arial" w:hAnsi="Arial" w:cs="Arial"/>
               </w:rPr>
-              <w:t xml:space="preserve">Sprint </w:t>
-            </w:r>
-            <w:proofErr w:type="spellStart"/>
-            <w:r>
-              <w:rPr>
-                <w:rFonts w:ascii="Arial" w:hAnsi="Arial" w:cs="Arial"/>
-              </w:rPr>
-              <w:t>Retrospective</w:t>
-            </w:r>
-            <w:proofErr w:type="spellEnd"/>
+              <w:t>Sprint Retrospective</w:t>
+            </w:r>
           </w:p>
         </w:tc>
       </w:tr>
@@ -12576,21 +11830,7 @@
             <w:rPr>
               <w:rFonts w:ascii="Arial" w:hAnsi="Arial" w:cs="Arial"/>
             </w:rPr>
-            <w:t xml:space="preserve">Ho riscontrato un problema di merge nonostante abbiamo impostato un sistema con un tool </w:t>
-          </w:r>
-          <w:proofErr w:type="spellStart"/>
-          <w:r>
-            <w:rPr>
-              <w:rFonts w:ascii="Arial" w:hAnsi="Arial" w:cs="Arial"/>
-            </w:rPr>
-            <w:t>unity</w:t>
-          </w:r>
-          <w:proofErr w:type="spellEnd"/>
-          <w:r>
-            <w:rPr>
-              <w:rFonts w:ascii="Arial" w:hAnsi="Arial" w:cs="Arial"/>
-            </w:rPr>
-            <w:t>, puoi dirmi cosa analizzare per risolvere?</w:t>
+            <w:t>Ho riscontrato un problema di merge nonostante abbiamo impostato un sistema con un tool unity, puoi dirmi cosa analizzare per risolvere?</w:t>
           </w:r>
         </w:p>
         <w:p>
@@ -12605,21 +11845,7 @@
             <w:rPr>
               <w:rFonts w:ascii="Arial" w:hAnsi="Arial" w:cs="Arial"/>
             </w:rPr>
-            <w:t xml:space="preserve">Bryan: come si implementa un font in </w:t>
-          </w:r>
-          <w:proofErr w:type="spellStart"/>
-          <w:r>
-            <w:rPr>
-              <w:rFonts w:ascii="Arial" w:hAnsi="Arial" w:cs="Arial"/>
-            </w:rPr>
-            <w:t>unity</w:t>
-          </w:r>
-          <w:proofErr w:type="spellEnd"/>
-          <w:r>
-            <w:rPr>
-              <w:rFonts w:ascii="Arial" w:hAnsi="Arial" w:cs="Arial"/>
-            </w:rPr>
-            <w:t>?</w:t>
+            <w:t>Bryan: come si implementa un font in unity?</w:t>
           </w:r>
         </w:p>
       </w:sdtContent>
@@ -13328,49 +12554,7 @@
               <w:rPr>
                 <w:rFonts w:ascii="Arial" w:hAnsi="Arial" w:cs="Arial"/>
               </w:rPr>
-              <w:t xml:space="preserve">Rispetto alla pianificazione abbiamo un leggero ritardo avendo finito solo oggi le statistiche, ma questo risulta recuperabile essendo che lavoriamo separatamente dividendo </w:t>
-            </w:r>
-            <w:proofErr w:type="spellStart"/>
-            <w:r>
-              <w:rPr>
-                <w:rFonts w:ascii="Arial" w:hAnsi="Arial" w:cs="Arial"/>
-              </w:rPr>
-              <w:t>ui</w:t>
-            </w:r>
-            <w:proofErr w:type="spellEnd"/>
-            <w:r>
-              <w:rPr>
-                <w:rFonts w:ascii="Arial" w:hAnsi="Arial" w:cs="Arial"/>
-              </w:rPr>
-              <w:t xml:space="preserve"> e scripting, infatti </w:t>
-            </w:r>
-            <w:proofErr w:type="spellStart"/>
-            <w:r>
-              <w:rPr>
-                <w:rFonts w:ascii="Arial" w:hAnsi="Arial" w:cs="Arial"/>
-              </w:rPr>
-              <w:t>bryan</w:t>
-            </w:r>
-            <w:proofErr w:type="spellEnd"/>
-            <w:r>
-              <w:rPr>
-                <w:rFonts w:ascii="Arial" w:hAnsi="Arial" w:cs="Arial"/>
-              </w:rPr>
-              <w:t xml:space="preserve"> ha iniziato la </w:t>
-            </w:r>
-            <w:proofErr w:type="spellStart"/>
-            <w:r>
-              <w:rPr>
-                <w:rFonts w:ascii="Arial" w:hAnsi="Arial" w:cs="Arial"/>
-              </w:rPr>
-              <w:t>ui</w:t>
-            </w:r>
-            <w:proofErr w:type="spellEnd"/>
-            <w:r>
-              <w:rPr>
-                <w:rFonts w:ascii="Arial" w:hAnsi="Arial" w:cs="Arial"/>
-              </w:rPr>
-              <w:t xml:space="preserve"> delle impostazioni il giorno previsto.</w:t>
+              <w:t>Rispetto alla pianificazione abbiamo un leggero ritardo avendo finito solo oggi le statistiche, ma questo risulta recuperabile essendo che lavoriamo separatamente dividendo ui e scripting, infatti bryan ha iniziato la ui delle impostazioni il giorno previsto.</w:t>
             </w:r>
           </w:p>
         </w:tc>
@@ -13491,28 +12675,12 @@
                 <w:rFonts w:ascii="Arial" w:hAnsi="Arial" w:cs="Arial"/>
               </w:rPr>
             </w:pPr>
-            <w:proofErr w:type="spellStart"/>
-            <w:r>
-              <w:rPr>
-                <w:rFonts w:ascii="Arial" w:hAnsi="Arial" w:cs="Arial"/>
-              </w:rPr>
-              <w:t>Daily</w:t>
-            </w:r>
-            <w:proofErr w:type="spellEnd"/>
-            <w:r>
-              <w:rPr>
-                <w:rFonts w:ascii="Arial" w:hAnsi="Arial" w:cs="Arial"/>
-              </w:rPr>
-              <w:t xml:space="preserve"> </w:t>
-            </w:r>
-            <w:proofErr w:type="spellStart"/>
-            <w:r>
-              <w:rPr>
-                <w:rFonts w:ascii="Arial" w:hAnsi="Arial" w:cs="Arial"/>
-              </w:rPr>
-              <w:t>Scrum</w:t>
-            </w:r>
-            <w:proofErr w:type="spellEnd"/>
+            <w:r>
+              <w:rPr>
+                <w:rFonts w:ascii="Arial" w:hAnsi="Arial" w:cs="Arial"/>
+              </w:rPr>
+              <w:t>Daily Scrum</w:t>
+            </w:r>
           </w:p>
         </w:tc>
       </w:tr>
@@ -13574,21 +12742,7 @@
               <w:rPr>
                 <w:rFonts w:ascii="Arial" w:hAnsi="Arial" w:cs="Arial"/>
               </w:rPr>
-              <w:t xml:space="preserve">Bryan: Finire la </w:t>
-            </w:r>
-            <w:proofErr w:type="spellStart"/>
-            <w:r>
-              <w:rPr>
-                <w:rFonts w:ascii="Arial" w:hAnsi="Arial" w:cs="Arial"/>
-              </w:rPr>
-              <w:t>ui</w:t>
-            </w:r>
-            <w:proofErr w:type="spellEnd"/>
-            <w:r>
-              <w:rPr>
-                <w:rFonts w:ascii="Arial" w:hAnsi="Arial" w:cs="Arial"/>
-              </w:rPr>
-              <w:t xml:space="preserve"> del</w:t>
+              <w:t>Bryan: Finire la ui del</w:t>
             </w:r>
             <w:r>
               <w:rPr>
@@ -13774,16 +12928,8 @@
               <w:rPr>
                 <w:rFonts w:ascii="Arial" w:hAnsi="Arial" w:cs="Arial"/>
               </w:rPr>
-              <w:t xml:space="preserve">Sprint </w:t>
-            </w:r>
-            <w:proofErr w:type="spellStart"/>
-            <w:r>
-              <w:rPr>
-                <w:rFonts w:ascii="Arial" w:hAnsi="Arial" w:cs="Arial"/>
-              </w:rPr>
-              <w:t>Retrospective</w:t>
-            </w:r>
-            <w:proofErr w:type="spellEnd"/>
+              <w:t>Sprint Retrospective</w:t>
+            </w:r>
           </w:p>
         </w:tc>
       </w:tr>
@@ -14275,35 +13421,7 @@
             <w:rPr>
               <w:rFonts w:ascii="Arial" w:hAnsi="Arial" w:cs="Arial"/>
             </w:rPr>
-            <w:t xml:space="preserve">Il numero inserito nel </w:t>
-          </w:r>
-          <w:proofErr w:type="spellStart"/>
-          <w:r>
-            <w:rPr>
-              <w:rFonts w:ascii="Arial" w:hAnsi="Arial" w:cs="Arial"/>
-            </w:rPr>
-            <w:t>json</w:t>
-          </w:r>
-          <w:proofErr w:type="spellEnd"/>
-          <w:r>
-            <w:rPr>
-              <w:rFonts w:ascii="Arial" w:hAnsi="Arial" w:cs="Arial"/>
-            </w:rPr>
-            <w:t xml:space="preserve"> risulta essere un numero che va dal miliardo in su, ma l’applicativo lo riduce a milioni, per caso i valori </w:t>
-          </w:r>
-          <w:proofErr w:type="spellStart"/>
-          <w:r>
-            <w:rPr>
-              <w:rFonts w:ascii="Arial" w:hAnsi="Arial" w:cs="Arial"/>
-            </w:rPr>
-            <w:t>int</w:t>
-          </w:r>
-          <w:proofErr w:type="spellEnd"/>
-          <w:r>
-            <w:rPr>
-              <w:rFonts w:ascii="Arial" w:hAnsi="Arial" w:cs="Arial"/>
-            </w:rPr>
-            <w:t xml:space="preserve"> non supportano i miliardi?</w:t>
+            <w:t>Il numero inserito nel json risulta essere un numero che va dal miliardo in su, ma l’applicativo lo riduce a milioni, per caso i valori int non supportano i miliardi?</w:t>
           </w:r>
           <w:r>
             <w:rPr>
@@ -14392,21 +13510,7 @@
             <w:rPr>
               <w:rFonts w:ascii="Arial" w:hAnsi="Arial" w:cs="Arial"/>
             </w:rPr>
-            <w:t xml:space="preserve">Mi ha detto che </w:t>
-          </w:r>
-          <w:proofErr w:type="spellStart"/>
-          <w:r>
-            <w:rPr>
-              <w:rFonts w:ascii="Arial" w:hAnsi="Arial" w:cs="Arial"/>
-            </w:rPr>
-            <w:t>int</w:t>
-          </w:r>
-          <w:proofErr w:type="spellEnd"/>
-          <w:r>
-            <w:rPr>
-              <w:rFonts w:ascii="Arial" w:hAnsi="Arial" w:cs="Arial"/>
-            </w:rPr>
-            <w:t xml:space="preserve"> supporta i miliardi ma che ha un massimo di circa 2,2 miliardi ed il numero risultava più grande quindi ho ripiegato su un long</w:t>
+            <w:t>Mi ha detto che int supporta i miliardi ma che ha un massimo di circa 2,2 miliardi ed il numero risultava più grande quindi ho ripiegato su un long</w:t>
           </w:r>
         </w:p>
       </w:sdtContent>
@@ -14915,21 +14019,7 @@
               <w:rPr>
                 <w:rFonts w:ascii="Arial" w:hAnsi="Arial" w:cs="Arial"/>
               </w:rPr>
-              <w:t xml:space="preserve">Ho notato come certe impostazioni non sono modificabili con variabili di </w:t>
-            </w:r>
-            <w:proofErr w:type="spellStart"/>
-            <w:r>
-              <w:rPr>
-                <w:rFonts w:ascii="Arial" w:hAnsi="Arial" w:cs="Arial"/>
-              </w:rPr>
-              <w:t>unity</w:t>
-            </w:r>
-            <w:proofErr w:type="spellEnd"/>
-            <w:r>
-              <w:rPr>
-                <w:rFonts w:ascii="Arial" w:hAnsi="Arial" w:cs="Arial"/>
-              </w:rPr>
-              <w:t xml:space="preserve"> e quindi ho usato del tempo per eseguire qualche ricerca.</w:t>
+              <w:t>Ho notato come certe impostazioni non sono modificabili con variabili di unity e quindi ho usato del tempo per eseguire qualche ricerca.</w:t>
             </w:r>
           </w:p>
         </w:tc>
@@ -15133,28 +14223,12 @@
                 <w:rFonts w:ascii="Arial" w:hAnsi="Arial" w:cs="Arial"/>
               </w:rPr>
             </w:pPr>
-            <w:proofErr w:type="spellStart"/>
-            <w:r>
-              <w:rPr>
-                <w:rFonts w:ascii="Arial" w:hAnsi="Arial" w:cs="Arial"/>
-              </w:rPr>
-              <w:t>Daily</w:t>
-            </w:r>
-            <w:proofErr w:type="spellEnd"/>
-            <w:r>
-              <w:rPr>
-                <w:rFonts w:ascii="Arial" w:hAnsi="Arial" w:cs="Arial"/>
-              </w:rPr>
-              <w:t xml:space="preserve"> </w:t>
-            </w:r>
-            <w:proofErr w:type="spellStart"/>
-            <w:r>
-              <w:rPr>
-                <w:rFonts w:ascii="Arial" w:hAnsi="Arial" w:cs="Arial"/>
-              </w:rPr>
-              <w:t>Scrum</w:t>
-            </w:r>
-            <w:proofErr w:type="spellEnd"/>
+            <w:r>
+              <w:rPr>
+                <w:rFonts w:ascii="Arial" w:hAnsi="Arial" w:cs="Arial"/>
+              </w:rPr>
+              <w:t>Daily Scrum</w:t>
+            </w:r>
           </w:p>
         </w:tc>
       </w:tr>
@@ -15402,16 +14476,8 @@
               <w:rPr>
                 <w:rFonts w:ascii="Arial" w:hAnsi="Arial" w:cs="Arial"/>
               </w:rPr>
-              <w:t xml:space="preserve">Sprint </w:t>
-            </w:r>
-            <w:proofErr w:type="spellStart"/>
-            <w:r>
-              <w:rPr>
-                <w:rFonts w:ascii="Arial" w:hAnsi="Arial" w:cs="Arial"/>
-              </w:rPr>
-              <w:t>Retrospective</w:t>
-            </w:r>
-            <w:proofErr w:type="spellEnd"/>
+              <w:t>Sprint Retrospective</w:t>
+            </w:r>
           </w:p>
         </w:tc>
       </w:tr>
@@ -15897,21 +14963,7 @@
             <w:rPr>
               <w:rFonts w:ascii="Arial" w:hAnsi="Arial" w:cs="Arial"/>
             </w:rPr>
-            <w:t xml:space="preserve">Riley: sto creando il file data per le impostazioni con questi valori: “valori”. Puoi dirmi che valore effettivo usa </w:t>
-          </w:r>
-          <w:proofErr w:type="spellStart"/>
-          <w:r>
-            <w:rPr>
-              <w:rFonts w:ascii="Arial" w:hAnsi="Arial" w:cs="Arial"/>
-            </w:rPr>
-            <w:t>unity</w:t>
-          </w:r>
-          <w:proofErr w:type="spellEnd"/>
-          <w:r>
-            <w:rPr>
-              <w:rFonts w:ascii="Arial" w:hAnsi="Arial" w:cs="Arial"/>
-            </w:rPr>
-            <w:t xml:space="preserve">? </w:t>
+            <w:t xml:space="preserve">Riley: sto creando il file data per le impostazioni con questi valori: “valori”. Puoi dirmi che valore effettivo usa unity? </w:t>
           </w:r>
         </w:p>
         <w:p>
@@ -15926,44 +14978,8 @@
             <w:rPr>
               <w:rFonts w:ascii="Arial" w:hAnsi="Arial" w:cs="Arial"/>
             </w:rPr>
-            <w:t xml:space="preserve">Bryan: Come creare un menu con componenti </w:t>
-          </w:r>
-          <w:proofErr w:type="spellStart"/>
-          <w:r>
-            <w:rPr>
-              <w:rFonts w:ascii="Arial" w:hAnsi="Arial" w:cs="Arial"/>
-            </w:rPr>
-            <w:t>ui</w:t>
-          </w:r>
-          <w:proofErr w:type="spellEnd"/>
-          <w:r>
-            <w:rPr>
-              <w:rFonts w:ascii="Arial" w:hAnsi="Arial" w:cs="Arial"/>
-            </w:rPr>
-            <w:t xml:space="preserve"> che si ripetono </w:t>
-          </w:r>
-          <w:proofErr w:type="spellStart"/>
-          <w:r>
-            <w:rPr>
-              <w:rFonts w:ascii="Arial" w:hAnsi="Arial" w:cs="Arial"/>
-            </w:rPr>
-            <w:t>modularmente</w:t>
-          </w:r>
-          <w:proofErr w:type="spellEnd"/>
-          <w:r>
-            <w:rPr>
-              <w:rFonts w:ascii="Arial" w:hAnsi="Arial" w:cs="Arial"/>
-            </w:rPr>
-            <w:t xml:space="preserve"> in </w:t>
-          </w:r>
-          <w:proofErr w:type="spellStart"/>
-          <w:r>
-            <w:rPr>
-              <w:rFonts w:ascii="Arial" w:hAnsi="Arial" w:cs="Arial"/>
-            </w:rPr>
-            <w:t>unity</w:t>
-          </w:r>
-          <w:proofErr w:type="spellEnd"/>
+            <w:t>Bryan: Come creare un menu con componenti ui che si ripetono modularmente in unity</w:t>
+          </w:r>
         </w:p>
       </w:sdtContent>
     </w:sdt>
@@ -16274,16 +15290,8 @@
         <w:rPr>
           <w:rFonts w:ascii="Arial" w:hAnsi="Arial" w:cs="Arial"/>
         </w:rPr>
-        <w:t xml:space="preserve">Bryan: averi cercato un tutorial su </w:t>
-      </w:r>
-      <w:proofErr w:type="spellStart"/>
-      <w:r>
-        <w:rPr>
-          <w:rFonts w:ascii="Arial" w:hAnsi="Arial" w:cs="Arial"/>
-        </w:rPr>
-        <w:t>youtube</w:t>
-      </w:r>
-      <w:proofErr w:type="spellEnd"/>
+        <w:t>Bryan: averi cercato un tutorial su youtube</w:t>
+      </w:r>
     </w:p>
     <w:p>
       <w:pPr>
@@ -16391,19 +15399,7 @@
               <w:rPr>
                 <w:rFonts w:ascii="Arial" w:hAnsi="Arial" w:cs="Arial"/>
               </w:rPr>
-              <w:t>2</w:t>
-            </w:r>
-            <w:r>
-              <w:rPr>
-                <w:rFonts w:ascii="Arial" w:hAnsi="Arial" w:cs="Arial"/>
-              </w:rPr>
-              <w:t>8</w:t>
-            </w:r>
-            <w:r>
-              <w:rPr>
-                <w:rFonts w:ascii="Arial" w:hAnsi="Arial" w:cs="Arial"/>
-              </w:rPr>
-              <w:t>.09.2026</w:t>
+              <w:t>28.09.2026</w:t>
             </w:r>
           </w:p>
         </w:tc>
@@ -16477,6 +15473,12 @@
                 <w:rFonts w:ascii="Arial" w:hAnsi="Arial" w:cs="Arial"/>
               </w:rPr>
             </w:pPr>
+            <w:r>
+              <w:rPr>
+                <w:rFonts w:ascii="Arial" w:hAnsi="Arial" w:cs="Arial"/>
+              </w:rPr>
+              <w:t>Continuato script impostazioni per ui</w:t>
+            </w:r>
           </w:p>
         </w:tc>
       </w:tr>
@@ -16509,6 +15511,18 @@
                 <w:rFonts w:ascii="Arial" w:hAnsi="Arial" w:cs="Arial"/>
               </w:rPr>
             </w:pPr>
+            <w:r>
+              <w:rPr>
+                <w:rFonts w:ascii="Arial" w:hAnsi="Arial" w:cs="Arial"/>
+              </w:rPr>
+              <w:t>Sviluppo menu principale e navigazione tra i menu esistenti</w:t>
+            </w:r>
+            <w:r>
+              <w:rPr>
+                <w:rFonts w:ascii="Arial" w:hAnsi="Arial" w:cs="Arial"/>
+              </w:rPr>
+              <w:t xml:space="preserve"> e uscita dal gioco</w:t>
+            </w:r>
           </w:p>
         </w:tc>
       </w:tr>
@@ -16582,6 +15596,12 @@
                 <w:rFonts w:ascii="Arial" w:hAnsi="Arial" w:cs="Arial"/>
               </w:rPr>
             </w:pPr>
+            <w:r>
+              <w:rPr>
+                <w:rFonts w:ascii="Arial" w:hAnsi="Arial" w:cs="Arial"/>
+              </w:rPr>
+              <w:t xml:space="preserve">Alcuni problemi con i valori inviati dal togglle per fullscreen, scoperto che avevo selezionato un valore statico e non dinamico dell’elemento </w:t>
+            </w:r>
           </w:p>
         </w:tc>
       </w:tr>
@@ -16614,6 +15634,12 @@
                 <w:rFonts w:ascii="Arial" w:hAnsi="Arial" w:cs="Arial"/>
               </w:rPr>
             </w:pPr>
+            <w:r>
+              <w:rPr>
+                <w:rFonts w:ascii="Arial" w:hAnsi="Arial" w:cs="Arial"/>
+              </w:rPr>
+              <w:t>-</w:t>
+            </w:r>
           </w:p>
         </w:tc>
       </w:tr>
@@ -16666,6 +15692,12 @@
                 <w:rFonts w:ascii="Arial" w:hAnsi="Arial" w:cs="Arial"/>
               </w:rPr>
             </w:pPr>
+            <w:r>
+              <w:rPr>
+                <w:rFonts w:ascii="Arial" w:hAnsi="Arial" w:cs="Arial"/>
+              </w:rPr>
+              <w:t>Generalmente avendo già finito il menu con navigazione e uscita dal gioco il tempo perso è già stato nettamente recuperato.</w:t>
+            </w:r>
           </w:p>
         </w:tc>
       </w:tr>
@@ -16718,6 +15750,18 @@
                 <w:rFonts w:ascii="Arial" w:hAnsi="Arial" w:cs="Arial"/>
               </w:rPr>
             </w:pPr>
+            <w:r>
+              <w:rPr>
+                <w:rFonts w:ascii="Arial" w:hAnsi="Arial" w:cs="Arial"/>
+              </w:rPr>
+              <w:t>Terminare impostazioni, iniziare a creare il db effettivo</w:t>
+            </w:r>
+            <w:r>
+              <w:rPr>
+                <w:rFonts w:ascii="Arial" w:hAnsi="Arial" w:cs="Arial"/>
+              </w:rPr>
+              <w:t xml:space="preserve"> e inizio sviluppo mappa.</w:t>
+            </w:r>
           </w:p>
         </w:tc>
       </w:tr>
@@ -16766,28 +15810,12 @@
                 <w:rFonts w:ascii="Arial" w:hAnsi="Arial" w:cs="Arial"/>
               </w:rPr>
             </w:pPr>
-            <w:proofErr w:type="spellStart"/>
-            <w:r>
-              <w:rPr>
-                <w:rFonts w:ascii="Arial" w:hAnsi="Arial" w:cs="Arial"/>
-              </w:rPr>
-              <w:t>Daily</w:t>
-            </w:r>
-            <w:proofErr w:type="spellEnd"/>
-            <w:r>
-              <w:rPr>
-                <w:rFonts w:ascii="Arial" w:hAnsi="Arial" w:cs="Arial"/>
-              </w:rPr>
-              <w:t xml:space="preserve"> </w:t>
-            </w:r>
-            <w:proofErr w:type="spellStart"/>
-            <w:r>
-              <w:rPr>
-                <w:rFonts w:ascii="Arial" w:hAnsi="Arial" w:cs="Arial"/>
-              </w:rPr>
-              <w:t>Scrum</w:t>
-            </w:r>
-            <w:proofErr w:type="spellEnd"/>
+            <w:r>
+              <w:rPr>
+                <w:rFonts w:ascii="Arial" w:hAnsi="Arial" w:cs="Arial"/>
+              </w:rPr>
+              <w:t>Daily Scrum</w:t>
+            </w:r>
           </w:p>
         </w:tc>
       </w:tr>
@@ -16837,6 +15865,12 @@
               </w:rPr>
               <w:t>Riley:</w:t>
             </w:r>
+            <w:r>
+              <w:rPr>
+                <w:rFonts w:ascii="Arial" w:hAnsi="Arial" w:cs="Arial"/>
+              </w:rPr>
+              <w:t xml:space="preserve"> Terminare l’applicazione delle impostazioni nella ui</w:t>
+            </w:r>
           </w:p>
           <w:p>
             <w:pPr>
@@ -16850,6 +15884,12 @@
                 <w:rFonts w:ascii="Arial" w:hAnsi="Arial" w:cs="Arial"/>
               </w:rPr>
               <w:t>Bryan:</w:t>
+            </w:r>
+            <w:r>
+              <w:rPr>
+                <w:rFonts w:ascii="Arial" w:hAnsi="Arial" w:cs="Arial"/>
+              </w:rPr>
+              <w:t xml:space="preserve"> Iniziare sviluppo menu</w:t>
             </w:r>
           </w:p>
         </w:tc>
@@ -16918,6 +15958,12 @@
                 <w:rFonts w:ascii="Arial" w:hAnsi="Arial" w:cs="Arial"/>
               </w:rPr>
             </w:pPr>
+            <w:r>
+              <w:rPr>
+                <w:rFonts w:ascii="Arial" w:hAnsi="Arial" w:cs="Arial"/>
+              </w:rPr>
+              <w:t>Abbiamo deciso che, non avendo concluso a pieno lo sprint precedente, avremmo ripreso subito la parte mancante e contemporaneamente iniziato con lo sviluppo del menu per riuscire a riguadagnare del tempo.</w:t>
+            </w:r>
           </w:p>
         </w:tc>
       </w:tr>
@@ -16985,6 +16031,12 @@
                 <w:rFonts w:ascii="Arial" w:hAnsi="Arial" w:cs="Arial"/>
               </w:rPr>
             </w:pPr>
+            <w:r>
+              <w:rPr>
+                <w:rFonts w:ascii="Arial" w:hAnsi="Arial" w:cs="Arial"/>
+              </w:rPr>
+              <w:t xml:space="preserve">Quello che è stato svolto è piaciuto, e abbiamo notato necessità di qualche controllo sui tipi di dati  </w:t>
+            </w:r>
           </w:p>
         </w:tc>
       </w:tr>
@@ -17029,16 +16081,8 @@
               <w:rPr>
                 <w:rFonts w:ascii="Arial" w:hAnsi="Arial" w:cs="Arial"/>
               </w:rPr>
-              <w:t xml:space="preserve">Sprint </w:t>
-            </w:r>
-            <w:proofErr w:type="spellStart"/>
-            <w:r>
-              <w:rPr>
-                <w:rFonts w:ascii="Arial" w:hAnsi="Arial" w:cs="Arial"/>
-              </w:rPr>
-              <w:t>Retrospective</w:t>
-            </w:r>
-            <w:proofErr w:type="spellEnd"/>
+              <w:t>Sprint Retrospective</w:t>
+            </w:r>
           </w:p>
         </w:tc>
       </w:tr>
@@ -17060,6 +16104,12 @@
                 <w:rFonts w:ascii="Arial" w:hAnsi="Arial" w:cs="Arial"/>
               </w:rPr>
             </w:pPr>
+            <w:r>
+              <w:rPr>
+                <w:rFonts w:ascii="Arial" w:hAnsi="Arial" w:cs="Arial"/>
+              </w:rPr>
+              <w:t>Il lavoro svolto è stato gestito abbastanza bene, purtroppo ci sono stati un paio di imprevisti che hanno rallentato il lavoro, oltre ad aver sottovalutato leggermente la parte di scripting.</w:t>
+            </w:r>
           </w:p>
         </w:tc>
       </w:tr>
@@ -17153,7 +16203,7 @@
           </w:rPr>
           <w:id w:val="53200247"/>
           <w14:checkbox>
-            <w14:checked w14:val="0"/>
+            <w14:checked w14:val="1"/>
             <w14:checkedState w14:val="2612" w14:font="MS Gothic"/>
             <w14:uncheckedState w14:val="2610" w14:font="MS Gothic"/>
           </w14:checkbox>
@@ -17163,7 +16213,7 @@
             <w:rPr>
               <w:rFonts w:ascii="MS Gothic" w:eastAsia="MS Gothic" w:hAnsi="MS Gothic" w:cs="Segoe UI Symbol" w:hint="eastAsia"/>
             </w:rPr>
-            <w:t>☐</w:t>
+            <w:t>☒</w:t>
           </w:r>
         </w:sdtContent>
       </w:sdt>
@@ -17257,34 +16307,13 @@
           <w:placeholder>
             <w:docPart w:val="FED8253262DA427B9B4247B95CE37B88"/>
           </w:placeholder>
-          <w:showingPlcHdr/>
         </w:sdtPr>
         <w:sdtContent>
           <w:r>
             <w:rPr>
-              <w:rStyle w:val="Testosegnaposto"/>
-              <w:b/>
-              <w:bCs/>
-            </w:rPr>
-            <w:t xml:space="preserve">Nomi </w:t>
-          </w:r>
-          <w:proofErr w:type="gramStart"/>
-          <w:r>
-            <w:rPr>
-              <w:rStyle w:val="Testosegnaposto"/>
-              <w:b/>
-              <w:bCs/>
-            </w:rPr>
-            <w:t>AI</w:t>
-          </w:r>
-          <w:proofErr w:type="gramEnd"/>
-          <w:r>
-            <w:rPr>
-              <w:rStyle w:val="Testosegnaposto"/>
-              <w:b/>
-              <w:bCs/>
-            </w:rPr>
-            <w:t xml:space="preserve"> utilizzati</w:t>
+              <w:rFonts w:ascii="Arial" w:hAnsi="Arial" w:cs="Arial"/>
+            </w:rPr>
+            <w:t>ChatGPT</w:t>
           </w:r>
         </w:sdtContent>
       </w:sdt>
@@ -17352,7 +16381,7 @@
           </w:rPr>
           <w:id w:val="1448266842"/>
           <w14:checkbox>
-            <w14:checked w14:val="0"/>
+            <w14:checked w14:val="1"/>
             <w14:checkedState w14:val="2612" w14:font="MS Gothic"/>
             <w14:uncheckedState w14:val="2610" w14:font="MS Gothic"/>
           </w14:checkbox>
@@ -17362,7 +16391,7 @@
             <w:rPr>
               <w:rFonts w:ascii="MS Gothic" w:eastAsia="MS Gothic" w:hAnsi="MS Gothic" w:cs="Segoe UI Symbol" w:hint="eastAsia"/>
             </w:rPr>
-            <w:t>☐</w:t>
+            <w:t>☒</w:t>
           </w:r>
         </w:sdtContent>
       </w:sdt>
@@ -17382,7 +16411,7 @@
           </w:rPr>
           <w:id w:val="-220678419"/>
           <w14:checkbox>
-            <w14:checked w14:val="0"/>
+            <w14:checked w14:val="1"/>
             <w14:checkedState w14:val="2612" w14:font="MS Gothic"/>
             <w14:uncheckedState w14:val="2610" w14:font="MS Gothic"/>
           </w14:checkbox>
@@ -17392,7 +16421,7 @@
             <w:rPr>
               <w:rFonts w:ascii="MS Gothic" w:eastAsia="MS Gothic" w:hAnsi="MS Gothic" w:cs="Segoe UI Symbol" w:hint="eastAsia"/>
             </w:rPr>
-            <w:t>☐</w:t>
+            <w:t>☒</w:t>
           </w:r>
         </w:sdtContent>
       </w:sdt>
@@ -17542,7 +16571,6 @@
         <w:p>
           <w:pPr>
             <w:pStyle w:val="Nessunaspaziatura"/>
-            <w:spacing w:line="276" w:lineRule="auto"/>
             <w:rPr>
               <w:rFonts w:ascii="Arial" w:hAnsi="Arial" w:cs="Arial"/>
             </w:rPr>
@@ -17552,6 +16580,18 @@
               <w:rFonts w:ascii="Arial" w:hAnsi="Arial" w:cs="Arial"/>
             </w:rPr>
             <w:t xml:space="preserve">Riley: </w:t>
+          </w:r>
+          <w:r>
+            <w:rPr>
+              <w:rFonts w:ascii="Arial" w:hAnsi="Arial" w:cs="Arial"/>
+            </w:rPr>
+            <w:t>Non mi mette il valore corretto, quale potrebbe essere la causa</w:t>
+          </w:r>
+          <w:r>
+            <w:rPr>
+              <w:rFonts w:ascii="Arial" w:hAnsi="Arial" w:cs="Arial"/>
+            </w:rPr>
+            <w:t>.</w:t>
           </w:r>
         </w:p>
         <w:p>
@@ -17645,6 +16685,12 @@
             </w:rPr>
             <w:t xml:space="preserve">Riley: </w:t>
           </w:r>
+          <w:r>
+            <w:rPr>
+              <w:rFonts w:ascii="Arial" w:hAnsi="Arial" w:cs="Arial"/>
+            </w:rPr>
+            <w:t>mi ha elencato delle possibili soluzioni di debugging</w:t>
+          </w:r>
         </w:p>
         <w:p>
           <w:pPr>
@@ -17701,7 +16747,7 @@
           </w:rPr>
           <w:id w:val="527072011"/>
           <w14:checkbox>
-            <w14:checked w14:val="0"/>
+            <w14:checked w14:val="1"/>
             <w14:checkedState w14:val="2612" w14:font="MS Gothic"/>
             <w14:uncheckedState w14:val="2610" w14:font="MS Gothic"/>
           </w14:checkbox>
@@ -17711,7 +16757,7 @@
             <w:rPr>
               <w:rFonts w:ascii="MS Gothic" w:eastAsia="MS Gothic" w:hAnsi="MS Gothic" w:cs="Segoe UI Symbol" w:hint="eastAsia"/>
             </w:rPr>
-            <w:t>☐</w:t>
+            <w:t>☒</w:t>
           </w:r>
         </w:sdtContent>
       </w:sdt>
@@ -17767,7 +16813,7 @@
           </w:rPr>
           <w:id w:val="-720821492"/>
           <w14:checkbox>
-            <w14:checked w14:val="0"/>
+            <w14:checked w14:val="1"/>
             <w14:checkedState w14:val="2612" w14:font="MS Gothic"/>
             <w14:uncheckedState w14:val="2610" w14:font="MS Gothic"/>
           </w14:checkbox>
@@ -17777,7 +16823,7 @@
             <w:rPr>
               <w:rFonts w:ascii="MS Gothic" w:eastAsia="MS Gothic" w:hAnsi="MS Gothic" w:cs="Segoe UI Symbol" w:hint="eastAsia"/>
             </w:rPr>
-            <w:t>☐</w:t>
+            <w:t>☒</w:t>
           </w:r>
         </w:sdtContent>
       </w:sdt>
@@ -17865,6 +16911,12 @@
           <w:rFonts w:ascii="Arial" w:hAnsi="Arial" w:cs="Arial"/>
         </w:rPr>
         <w:t xml:space="preserve">Riley: </w:t>
+      </w:r>
+      <w:r>
+        <w:rPr>
+          <w:rFonts w:ascii="Arial" w:hAnsi="Arial" w:cs="Arial"/>
+        </w:rPr>
+        <w:t>cercato su forum o documentazioni ufficiali.</w:t>
       </w:r>
     </w:p>
     <w:p>
@@ -18106,17 +17158,8 @@
         <w:rFonts w:ascii="Arial" w:hAnsi="Arial" w:cs="Arial"/>
         <w:lang w:val="fr-CH"/>
       </w:rPr>
-      <w:t xml:space="preserve">Riley Bianchi &amp; Bryan </w:t>
+      <w:t>Riley Bianchi &amp; Bryan Ciaponi</w:t>
     </w:r>
-    <w:proofErr w:type="spellStart"/>
-    <w:r>
-      <w:rPr>
-        <w:rFonts w:ascii="Arial" w:hAnsi="Arial" w:cs="Arial"/>
-        <w:lang w:val="fr-CH"/>
-      </w:rPr>
-      <w:t>Ciaponi</w:t>
-    </w:r>
-    <w:proofErr w:type="spellEnd"/>
   </w:p>
 </w:hdr>
 </file>
@@ -22875,6 +21918,7 @@
   <w:rsids>
     <w:rsidRoot w:val="00BE72BC"/>
     <w:rsid w:val="00045F3C"/>
+    <w:rsid w:val="00083E28"/>
     <w:rsid w:val="000B54FB"/>
     <w:rsid w:val="000D07AC"/>
     <w:rsid w:val="001A3B5C"/>
@@ -22933,6 +21977,8 @@
     <w:rsid w:val="00F15724"/>
     <w:rsid w:val="00F26F5B"/>
     <w:rsid w:val="00F36694"/>
+    <w:rsid w:val="00F50717"/>
+    <w:rsid w:val="00F726EC"/>
   </w:rsids>
   <m:mathPr>
     <m:mathFont m:val="Cambria Math"/>

</xml_diff>

<commit_message>
termine salvataggio e visualizzazione impostazioni
</commit_message>
<xml_diff>
--- a/4_Diari/Diario.docx
+++ b/4_Diari/Diario.docx
@@ -15515,13 +15515,7 @@
               <w:rPr>
                 <w:rFonts w:ascii="Arial" w:hAnsi="Arial" w:cs="Arial"/>
               </w:rPr>
-              <w:t>Sviluppo menu principale e navigazione tra i menu esistenti</w:t>
-            </w:r>
-            <w:r>
-              <w:rPr>
-                <w:rFonts w:ascii="Arial" w:hAnsi="Arial" w:cs="Arial"/>
-              </w:rPr>
-              <w:t xml:space="preserve"> e uscita dal gioco</w:t>
+              <w:t>Sviluppo menu principale e navigazione tra i menu esistenti e uscita dal gioco</w:t>
             </w:r>
           </w:p>
         </w:tc>
@@ -16585,13 +16579,7 @@
             <w:rPr>
               <w:rFonts w:ascii="Arial" w:hAnsi="Arial" w:cs="Arial"/>
             </w:rPr>
-            <w:t>Non mi mette il valore corretto, quale potrebbe essere la causa</w:t>
-          </w:r>
-          <w:r>
-            <w:rPr>
-              <w:rFonts w:ascii="Arial" w:hAnsi="Arial" w:cs="Arial"/>
-            </w:rPr>
-            <w:t>.</w:t>
+            <w:t>Non mi mette il valore corretto, quale potrebbe essere la causa.</w:t>
           </w:r>
         </w:p>
         <w:p>
@@ -16917,6 +16905,1615 @@
           <w:rFonts w:ascii="Arial" w:hAnsi="Arial" w:cs="Arial"/>
         </w:rPr>
         <w:t>cercato su forum o documentazioni ufficiali.</w:t>
+      </w:r>
+    </w:p>
+    <w:p>
+      <w:pPr>
+        <w:pStyle w:val="Nessunaspaziatura"/>
+        <w:rPr>
+          <w:rFonts w:ascii="Arial" w:hAnsi="Arial" w:cs="Arial"/>
+        </w:rPr>
+      </w:pPr>
+      <w:r>
+        <w:rPr>
+          <w:rFonts w:ascii="Arial" w:hAnsi="Arial" w:cs="Arial"/>
+        </w:rPr>
+        <w:t xml:space="preserve">Bryan: </w:t>
+      </w:r>
+    </w:p>
+    <w:p>
+      <w:pPr>
+        <w:rPr>
+          <w:rFonts w:ascii="Arial" w:hAnsi="Arial" w:cs="Arial"/>
+        </w:rPr>
+      </w:pPr>
+      <w:r>
+        <w:rPr>
+          <w:rFonts w:ascii="Arial" w:hAnsi="Arial" w:cs="Arial"/>
+        </w:rPr>
+        <w:br w:type="page"/>
+      </w:r>
+    </w:p>
+    <w:tbl>
+      <w:tblPr>
+        <w:tblStyle w:val="Grigliatabella"/>
+        <w:tblW w:w="5000" w:type="pct"/>
+        <w:tblLook w:val="04A0" w:firstRow="1" w:lastRow="0" w:firstColumn="1" w:lastColumn="0" w:noHBand="0" w:noVBand="1"/>
+      </w:tblPr>
+      <w:tblGrid>
+        <w:gridCol w:w="2407"/>
+        <w:gridCol w:w="7221"/>
+      </w:tblGrid>
+      <w:tr>
+        <w:trPr>
+          <w:trHeight w:val="199"/>
+        </w:trPr>
+        <w:tc>
+          <w:tcPr>
+            <w:tcW w:w="1250" w:type="pct"/>
+            <w:vAlign w:val="center"/>
+          </w:tcPr>
+          <w:p>
+            <w:pPr>
+              <w:rPr>
+                <w:rFonts w:ascii="Arial" w:hAnsi="Arial" w:cs="Arial"/>
+              </w:rPr>
+            </w:pPr>
+            <w:r>
+              <w:rPr>
+                <w:rFonts w:ascii="Arial" w:hAnsi="Arial" w:cs="Arial"/>
+              </w:rPr>
+              <w:lastRenderedPageBreak/>
+              <w:t>Luogo</w:t>
+            </w:r>
+          </w:p>
+        </w:tc>
+        <w:tc>
+          <w:tcPr>
+            <w:tcW w:w="3750" w:type="pct"/>
+            <w:vAlign w:val="center"/>
+          </w:tcPr>
+          <w:p>
+            <w:pPr>
+              <w:rPr>
+                <w:rFonts w:ascii="Arial" w:hAnsi="Arial" w:cs="Arial"/>
+              </w:rPr>
+            </w:pPr>
+            <w:r>
+              <w:rPr>
+                <w:rFonts w:ascii="Arial" w:hAnsi="Arial" w:cs="Arial"/>
+              </w:rPr>
+              <w:t>Scuola Arti e Mestieri Trevano</w:t>
+            </w:r>
+          </w:p>
+        </w:tc>
+      </w:tr>
+      <w:tr>
+        <w:trPr>
+          <w:trHeight w:val="196"/>
+        </w:trPr>
+        <w:tc>
+          <w:tcPr>
+            <w:tcW w:w="1250" w:type="pct"/>
+            <w:vAlign w:val="center"/>
+          </w:tcPr>
+          <w:p>
+            <w:pPr>
+              <w:rPr>
+                <w:rFonts w:ascii="Arial" w:hAnsi="Arial" w:cs="Arial"/>
+              </w:rPr>
+            </w:pPr>
+            <w:r>
+              <w:rPr>
+                <w:rFonts w:ascii="Arial" w:hAnsi="Arial" w:cs="Arial"/>
+              </w:rPr>
+              <w:t>Data</w:t>
+            </w:r>
+          </w:p>
+        </w:tc>
+        <w:tc>
+          <w:tcPr>
+            <w:tcW w:w="3750" w:type="pct"/>
+            <w:vAlign w:val="center"/>
+          </w:tcPr>
+          <w:p>
+            <w:pPr>
+              <w:rPr>
+                <w:rFonts w:ascii="Arial" w:hAnsi="Arial" w:cs="Arial"/>
+              </w:rPr>
+            </w:pPr>
+            <w:r>
+              <w:rPr>
+                <w:rFonts w:ascii="Arial" w:hAnsi="Arial" w:cs="Arial"/>
+              </w:rPr>
+              <w:t>2</w:t>
+            </w:r>
+            <w:r>
+              <w:rPr>
+                <w:rFonts w:ascii="Arial" w:hAnsi="Arial" w:cs="Arial"/>
+              </w:rPr>
+              <w:t>9</w:t>
+            </w:r>
+            <w:r>
+              <w:rPr>
+                <w:rFonts w:ascii="Arial" w:hAnsi="Arial" w:cs="Arial"/>
+              </w:rPr>
+              <w:t>.09.2026</w:t>
+            </w:r>
+          </w:p>
+        </w:tc>
+      </w:tr>
+    </w:tbl>
+    <w:p>
+      <w:pPr>
+        <w:rPr>
+          <w:rFonts w:ascii="Arial" w:hAnsi="Arial" w:cs="Arial"/>
+        </w:rPr>
+      </w:pPr>
+    </w:p>
+    <w:tbl>
+      <w:tblPr>
+        <w:tblStyle w:val="Grigliatabella"/>
+        <w:tblW w:w="0" w:type="auto"/>
+        <w:tblLook w:val="04A0" w:firstRow="1" w:lastRow="0" w:firstColumn="1" w:lastColumn="0" w:noHBand="0" w:noVBand="1"/>
+      </w:tblPr>
+      <w:tblGrid>
+        <w:gridCol w:w="1271"/>
+        <w:gridCol w:w="8357"/>
+      </w:tblGrid>
+      <w:tr>
+        <w:tc>
+          <w:tcPr>
+            <w:tcW w:w="9628" w:type="dxa"/>
+            <w:gridSpan w:val="2"/>
+            <w:shd w:val="clear" w:color="auto" w:fill="D9D9D9" w:themeFill="background1" w:themeFillShade="D9"/>
+          </w:tcPr>
+          <w:p>
+            <w:pPr>
+              <w:rPr>
+                <w:rFonts w:ascii="Arial" w:hAnsi="Arial" w:cs="Arial"/>
+              </w:rPr>
+            </w:pPr>
+            <w:r>
+              <w:rPr>
+                <w:rFonts w:ascii="Arial" w:hAnsi="Arial" w:cs="Arial"/>
+              </w:rPr>
+              <w:t>Lavori svolti</w:t>
+            </w:r>
+          </w:p>
+        </w:tc>
+      </w:tr>
+      <w:tr>
+        <w:tc>
+          <w:tcPr>
+            <w:tcW w:w="1271" w:type="dxa"/>
+          </w:tcPr>
+          <w:p>
+            <w:pPr>
+              <w:rPr>
+                <w:rFonts w:ascii="Arial" w:hAnsi="Arial" w:cs="Arial"/>
+              </w:rPr>
+            </w:pPr>
+            <w:r>
+              <w:rPr>
+                <w:rFonts w:ascii="Arial" w:hAnsi="Arial" w:cs="Arial"/>
+              </w:rPr>
+              <w:t>Riley</w:t>
+            </w:r>
+          </w:p>
+        </w:tc>
+        <w:tc>
+          <w:tcPr>
+            <w:tcW w:w="8357" w:type="dxa"/>
+          </w:tcPr>
+          <w:p>
+            <w:pPr>
+              <w:rPr>
+                <w:rFonts w:ascii="Arial" w:hAnsi="Arial" w:cs="Arial"/>
+              </w:rPr>
+            </w:pPr>
+            <w:r>
+              <w:rPr>
+                <w:rFonts w:ascii="Arial" w:hAnsi="Arial" w:cs="Arial"/>
+              </w:rPr>
+              <w:t>Continuato script impostazioni per ui</w:t>
+            </w:r>
+          </w:p>
+        </w:tc>
+      </w:tr>
+      <w:tr>
+        <w:tc>
+          <w:tcPr>
+            <w:tcW w:w="1271" w:type="dxa"/>
+          </w:tcPr>
+          <w:p>
+            <w:pPr>
+              <w:rPr>
+                <w:rFonts w:ascii="Arial" w:hAnsi="Arial" w:cs="Arial"/>
+              </w:rPr>
+            </w:pPr>
+            <w:r>
+              <w:rPr>
+                <w:rFonts w:ascii="Arial" w:hAnsi="Arial" w:cs="Arial"/>
+              </w:rPr>
+              <w:t>Bryan</w:t>
+            </w:r>
+          </w:p>
+        </w:tc>
+        <w:tc>
+          <w:tcPr>
+            <w:tcW w:w="8357" w:type="dxa"/>
+          </w:tcPr>
+          <w:p>
+            <w:pPr>
+              <w:rPr>
+                <w:rFonts w:ascii="Arial" w:hAnsi="Arial" w:cs="Arial"/>
+              </w:rPr>
+            </w:pPr>
+            <w:r>
+              <w:rPr>
+                <w:rFonts w:ascii="Arial" w:hAnsi="Arial" w:cs="Arial"/>
+              </w:rPr>
+              <w:t>Sviluppo menu principale e navigazione tra i menu esistenti e uscita dal gioco</w:t>
+            </w:r>
+          </w:p>
+        </w:tc>
+      </w:tr>
+    </w:tbl>
+    <w:p>
+      <w:pPr>
+        <w:rPr>
+          <w:rFonts w:ascii="Arial" w:hAnsi="Arial" w:cs="Arial"/>
+        </w:rPr>
+      </w:pPr>
+    </w:p>
+    <w:tbl>
+      <w:tblPr>
+        <w:tblStyle w:val="Grigliatabella"/>
+        <w:tblW w:w="0" w:type="auto"/>
+        <w:tblInd w:w="-5" w:type="dxa"/>
+        <w:tblLook w:val="04A0" w:firstRow="1" w:lastRow="0" w:firstColumn="1" w:lastColumn="0" w:noHBand="0" w:noVBand="1"/>
+      </w:tblPr>
+      <w:tblGrid>
+        <w:gridCol w:w="1276"/>
+        <w:gridCol w:w="8357"/>
+      </w:tblGrid>
+      <w:tr>
+        <w:tc>
+          <w:tcPr>
+            <w:tcW w:w="9628" w:type="dxa"/>
+            <w:gridSpan w:val="2"/>
+            <w:shd w:val="clear" w:color="auto" w:fill="D9D9D9" w:themeFill="background1" w:themeFillShade="D9"/>
+          </w:tcPr>
+          <w:p>
+            <w:pPr>
+              <w:rPr>
+                <w:rFonts w:ascii="Arial" w:hAnsi="Arial" w:cs="Arial"/>
+              </w:rPr>
+            </w:pPr>
+            <w:r>
+              <w:rPr>
+                <w:rFonts w:ascii="Arial" w:hAnsi="Arial" w:cs="Arial"/>
+              </w:rPr>
+              <w:t>Problemi riscontrati e soluzioni adottate</w:t>
+            </w:r>
+          </w:p>
+        </w:tc>
+      </w:tr>
+      <w:tr>
+        <w:tc>
+          <w:tcPr>
+            <w:tcW w:w="1276" w:type="dxa"/>
+          </w:tcPr>
+          <w:p>
+            <w:pPr>
+              <w:rPr>
+                <w:rFonts w:ascii="Arial" w:hAnsi="Arial" w:cs="Arial"/>
+              </w:rPr>
+            </w:pPr>
+            <w:r>
+              <w:rPr>
+                <w:rFonts w:ascii="Arial" w:hAnsi="Arial" w:cs="Arial"/>
+              </w:rPr>
+              <w:t>Riley</w:t>
+            </w:r>
+          </w:p>
+        </w:tc>
+        <w:tc>
+          <w:tcPr>
+            <w:tcW w:w="8357" w:type="dxa"/>
+          </w:tcPr>
+          <w:p>
+            <w:pPr>
+              <w:rPr>
+                <w:rFonts w:ascii="Arial" w:hAnsi="Arial" w:cs="Arial"/>
+              </w:rPr>
+            </w:pPr>
+            <w:r>
+              <w:rPr>
+                <w:rFonts w:ascii="Arial" w:hAnsi="Arial" w:cs="Arial"/>
+              </w:rPr>
+              <w:t xml:space="preserve">Alcuni problemi con i valori inviati dal togglle per fullscreen, scoperto che avevo selezionato un valore statico e non dinamico dell’elemento </w:t>
+            </w:r>
+          </w:p>
+        </w:tc>
+      </w:tr>
+      <w:tr>
+        <w:tc>
+          <w:tcPr>
+            <w:tcW w:w="1276" w:type="dxa"/>
+          </w:tcPr>
+          <w:p>
+            <w:pPr>
+              <w:rPr>
+                <w:rFonts w:ascii="Arial" w:hAnsi="Arial" w:cs="Arial"/>
+              </w:rPr>
+            </w:pPr>
+            <w:r>
+              <w:rPr>
+                <w:rFonts w:ascii="Arial" w:hAnsi="Arial" w:cs="Arial"/>
+              </w:rPr>
+              <w:t>Bryan</w:t>
+            </w:r>
+          </w:p>
+        </w:tc>
+        <w:tc>
+          <w:tcPr>
+            <w:tcW w:w="8357" w:type="dxa"/>
+          </w:tcPr>
+          <w:p>
+            <w:pPr>
+              <w:rPr>
+                <w:rFonts w:ascii="Arial" w:hAnsi="Arial" w:cs="Arial"/>
+              </w:rPr>
+            </w:pPr>
+            <w:r>
+              <w:rPr>
+                <w:rFonts w:ascii="Arial" w:hAnsi="Arial" w:cs="Arial"/>
+              </w:rPr>
+              <w:t>-</w:t>
+            </w:r>
+          </w:p>
+        </w:tc>
+      </w:tr>
+    </w:tbl>
+    <w:p>
+      <w:pPr>
+        <w:rPr>
+          <w:rFonts w:ascii="Arial" w:hAnsi="Arial" w:cs="Arial"/>
+        </w:rPr>
+      </w:pPr>
+    </w:p>
+    <w:tbl>
+      <w:tblPr>
+        <w:tblStyle w:val="Grigliatabella"/>
+        <w:tblW w:w="0" w:type="auto"/>
+        <w:tblLook w:val="04A0" w:firstRow="1" w:lastRow="0" w:firstColumn="1" w:lastColumn="0" w:noHBand="0" w:noVBand="1"/>
+      </w:tblPr>
+      <w:tblGrid>
+        <w:gridCol w:w="9628"/>
+      </w:tblGrid>
+      <w:tr>
+        <w:tc>
+          <w:tcPr>
+            <w:tcW w:w="9854" w:type="dxa"/>
+            <w:shd w:val="clear" w:color="auto" w:fill="D9D9D9" w:themeFill="background1" w:themeFillShade="D9"/>
+          </w:tcPr>
+          <w:p>
+            <w:pPr>
+              <w:rPr>
+                <w:rFonts w:ascii="Arial" w:hAnsi="Arial" w:cs="Arial"/>
+              </w:rPr>
+            </w:pPr>
+            <w:r>
+              <w:rPr>
+                <w:rFonts w:ascii="Arial" w:hAnsi="Arial" w:cs="Arial"/>
+              </w:rPr>
+              <w:t>Punto della situazione rispetto alla pianificazione</w:t>
+            </w:r>
+          </w:p>
+        </w:tc>
+      </w:tr>
+      <w:tr>
+        <w:tc>
+          <w:tcPr>
+            <w:tcW w:w="9854" w:type="dxa"/>
+          </w:tcPr>
+          <w:p>
+            <w:pPr>
+              <w:rPr>
+                <w:rFonts w:ascii="Arial" w:hAnsi="Arial" w:cs="Arial"/>
+              </w:rPr>
+            </w:pPr>
+            <w:r>
+              <w:rPr>
+                <w:rFonts w:ascii="Arial" w:hAnsi="Arial" w:cs="Arial"/>
+              </w:rPr>
+              <w:t>Generalmente avendo già finito il menu con navigazione e uscita dal gioco il tempo perso è già stato nettamente recuperato.</w:t>
+            </w:r>
+          </w:p>
+        </w:tc>
+      </w:tr>
+    </w:tbl>
+    <w:p>
+      <w:pPr>
+        <w:rPr>
+          <w:rFonts w:ascii="Arial" w:hAnsi="Arial" w:cs="Arial"/>
+        </w:rPr>
+      </w:pPr>
+    </w:p>
+    <w:tbl>
+      <w:tblPr>
+        <w:tblStyle w:val="Grigliatabella"/>
+        <w:tblW w:w="0" w:type="auto"/>
+        <w:tblLook w:val="04A0" w:firstRow="1" w:lastRow="0" w:firstColumn="1" w:lastColumn="0" w:noHBand="0" w:noVBand="1"/>
+      </w:tblPr>
+      <w:tblGrid>
+        <w:gridCol w:w="9628"/>
+      </w:tblGrid>
+      <w:tr>
+        <w:tc>
+          <w:tcPr>
+            <w:tcW w:w="9854" w:type="dxa"/>
+            <w:shd w:val="clear" w:color="auto" w:fill="D9D9D9" w:themeFill="background1" w:themeFillShade="D9"/>
+          </w:tcPr>
+          <w:p>
+            <w:pPr>
+              <w:rPr>
+                <w:rFonts w:ascii="Arial" w:hAnsi="Arial" w:cs="Arial"/>
+              </w:rPr>
+            </w:pPr>
+            <w:r>
+              <w:rPr>
+                <w:rFonts w:ascii="Arial" w:hAnsi="Arial" w:cs="Arial"/>
+              </w:rPr>
+              <w:t>Programma di massima per la prossima giornata di lavoro</w:t>
+            </w:r>
+          </w:p>
+        </w:tc>
+      </w:tr>
+      <w:tr>
+        <w:tc>
+          <w:tcPr>
+            <w:tcW w:w="9854" w:type="dxa"/>
+          </w:tcPr>
+          <w:p>
+            <w:pPr>
+              <w:rPr>
+                <w:rFonts w:ascii="Arial" w:hAnsi="Arial" w:cs="Arial"/>
+              </w:rPr>
+            </w:pPr>
+            <w:r>
+              <w:rPr>
+                <w:rFonts w:ascii="Arial" w:hAnsi="Arial" w:cs="Arial"/>
+              </w:rPr>
+              <w:t>Terminare impostazioni, iniziare a creare il db effettivo e inizio sviluppo mappa.</w:t>
+            </w:r>
+          </w:p>
+        </w:tc>
+      </w:tr>
+    </w:tbl>
+    <w:p>
+      <w:pPr>
+        <w:rPr>
+          <w:rFonts w:ascii="Arial" w:hAnsi="Arial" w:cs="Arial"/>
+        </w:rPr>
+      </w:pPr>
+    </w:p>
+    <w:p>
+      <w:pPr>
+        <w:pStyle w:val="Titolo1"/>
+      </w:pPr>
+      <w:r>
+        <w:t>Agile - Resoconto</w:t>
+      </w:r>
+    </w:p>
+    <w:tbl>
+      <w:tblPr>
+        <w:tblStyle w:val="Grigliatabella"/>
+        <w:tblW w:w="0" w:type="auto"/>
+        <w:tblLook w:val="04A0" w:firstRow="1" w:lastRow="0" w:firstColumn="1" w:lastColumn="0" w:noHBand="0" w:noVBand="1"/>
+      </w:tblPr>
+      <w:tblGrid>
+        <w:gridCol w:w="9628"/>
+      </w:tblGrid>
+      <w:tr>
+        <w:tc>
+          <w:tcPr>
+            <w:tcW w:w="9628" w:type="dxa"/>
+            <w:tcBorders>
+              <w:top w:val="single" w:sz="4" w:space="0" w:color="auto"/>
+              <w:left w:val="single" w:sz="4" w:space="0" w:color="auto"/>
+              <w:bottom w:val="single" w:sz="4" w:space="0" w:color="auto"/>
+              <w:right w:val="single" w:sz="4" w:space="0" w:color="auto"/>
+            </w:tcBorders>
+            <w:shd w:val="clear" w:color="auto" w:fill="D9D9D9" w:themeFill="background1" w:themeFillShade="D9"/>
+            <w:hideMark/>
+          </w:tcPr>
+          <w:p>
+            <w:pPr>
+              <w:spacing w:after="200" w:line="276" w:lineRule="auto"/>
+              <w:rPr>
+                <w:rFonts w:ascii="Arial" w:hAnsi="Arial" w:cs="Arial"/>
+              </w:rPr>
+            </w:pPr>
+            <w:r>
+              <w:rPr>
+                <w:rFonts w:ascii="Arial" w:hAnsi="Arial" w:cs="Arial"/>
+              </w:rPr>
+              <w:t>Daily Scrum</w:t>
+            </w:r>
+          </w:p>
+        </w:tc>
+      </w:tr>
+      <w:tr>
+        <w:tc>
+          <w:tcPr>
+            <w:tcW w:w="9628" w:type="dxa"/>
+            <w:tcBorders>
+              <w:top w:val="single" w:sz="4" w:space="0" w:color="auto"/>
+              <w:left w:val="single" w:sz="4" w:space="0" w:color="auto"/>
+              <w:bottom w:val="single" w:sz="4" w:space="0" w:color="auto"/>
+              <w:right w:val="single" w:sz="4" w:space="0" w:color="auto"/>
+            </w:tcBorders>
+            <w:hideMark/>
+          </w:tcPr>
+          <w:p>
+            <w:pPr>
+              <w:spacing w:after="200" w:line="276" w:lineRule="auto"/>
+              <w:rPr>
+                <w:rFonts w:ascii="Arial" w:hAnsi="Arial" w:cs="Arial"/>
+              </w:rPr>
+            </w:pPr>
+          </w:p>
+        </w:tc>
+      </w:tr>
+      <w:tr>
+        <w:tc>
+          <w:tcPr>
+            <w:tcW w:w="9628" w:type="dxa"/>
+            <w:tcBorders>
+              <w:top w:val="single" w:sz="4" w:space="0" w:color="auto"/>
+              <w:left w:val="single" w:sz="4" w:space="0" w:color="auto"/>
+              <w:bottom w:val="single" w:sz="4" w:space="0" w:color="auto"/>
+              <w:right w:val="single" w:sz="4" w:space="0" w:color="auto"/>
+            </w:tcBorders>
+          </w:tcPr>
+          <w:p>
+            <w:pPr>
+              <w:spacing w:after="200" w:line="276" w:lineRule="auto"/>
+              <w:rPr>
+                <w:rFonts w:ascii="Arial" w:hAnsi="Arial" w:cs="Arial"/>
+              </w:rPr>
+            </w:pPr>
+            <w:r>
+              <w:rPr>
+                <w:rFonts w:ascii="Arial" w:hAnsi="Arial" w:cs="Arial"/>
+              </w:rPr>
+              <w:t>Riley: Terminare l’applicazione delle impostazioni nella ui</w:t>
+            </w:r>
+          </w:p>
+          <w:p>
+            <w:pPr>
+              <w:spacing w:after="200" w:line="276" w:lineRule="auto"/>
+              <w:rPr>
+                <w:rFonts w:ascii="Arial" w:hAnsi="Arial" w:cs="Arial"/>
+              </w:rPr>
+            </w:pPr>
+            <w:r>
+              <w:rPr>
+                <w:rFonts w:ascii="Arial" w:hAnsi="Arial" w:cs="Arial"/>
+              </w:rPr>
+              <w:t xml:space="preserve">Bryan: </w:t>
+            </w:r>
+            <w:r>
+              <w:rPr>
+                <w:rFonts w:ascii="Arial" w:hAnsi="Arial" w:cs="Arial"/>
+              </w:rPr>
+              <w:t>Sviluppo animazioni menu</w:t>
+            </w:r>
+          </w:p>
+        </w:tc>
+      </w:tr>
+    </w:tbl>
+    <w:p>
+      <w:pPr>
+        <w:rPr>
+          <w:rFonts w:ascii="Arial" w:hAnsi="Arial" w:cs="Arial"/>
+        </w:rPr>
+      </w:pPr>
+    </w:p>
+    <w:tbl>
+      <w:tblPr>
+        <w:tblStyle w:val="Grigliatabella"/>
+        <w:tblW w:w="0" w:type="auto"/>
+        <w:tblLook w:val="04A0" w:firstRow="1" w:lastRow="0" w:firstColumn="1" w:lastColumn="0" w:noHBand="0" w:noVBand="1"/>
+      </w:tblPr>
+      <w:tblGrid>
+        <w:gridCol w:w="9628"/>
+      </w:tblGrid>
+      <w:tr>
+        <w:tc>
+          <w:tcPr>
+            <w:tcW w:w="9854" w:type="dxa"/>
+            <w:tcBorders>
+              <w:top w:val="single" w:sz="4" w:space="0" w:color="auto"/>
+              <w:left w:val="single" w:sz="4" w:space="0" w:color="auto"/>
+              <w:bottom w:val="single" w:sz="4" w:space="0" w:color="auto"/>
+              <w:right w:val="single" w:sz="4" w:space="0" w:color="auto"/>
+            </w:tcBorders>
+            <w:shd w:val="clear" w:color="auto" w:fill="D9D9D9" w:themeFill="background1" w:themeFillShade="D9"/>
+            <w:hideMark/>
+          </w:tcPr>
+          <w:p>
+            <w:pPr>
+              <w:spacing w:after="200" w:line="276" w:lineRule="auto"/>
+              <w:rPr>
+                <w:rFonts w:ascii="Arial" w:hAnsi="Arial" w:cs="Arial"/>
+              </w:rPr>
+            </w:pPr>
+            <w:r>
+              <w:rPr>
+                <w:rFonts w:ascii="Arial" w:hAnsi="Arial" w:cs="Arial"/>
+              </w:rPr>
+              <w:t>Sprint Planning</w:t>
+            </w:r>
+          </w:p>
+        </w:tc>
+      </w:tr>
+      <w:tr>
+        <w:tc>
+          <w:tcPr>
+            <w:tcW w:w="9854" w:type="dxa"/>
+            <w:tcBorders>
+              <w:top w:val="single" w:sz="4" w:space="0" w:color="auto"/>
+              <w:left w:val="single" w:sz="4" w:space="0" w:color="auto"/>
+              <w:bottom w:val="single" w:sz="4" w:space="0" w:color="auto"/>
+              <w:right w:val="single" w:sz="4" w:space="0" w:color="auto"/>
+            </w:tcBorders>
+          </w:tcPr>
+          <w:p>
+            <w:pPr>
+              <w:spacing w:after="200" w:line="276" w:lineRule="auto"/>
+              <w:rPr>
+                <w:rFonts w:ascii="Arial" w:hAnsi="Arial" w:cs="Arial"/>
+              </w:rPr>
+            </w:pPr>
+            <w:r>
+              <w:rPr>
+                <w:rFonts w:ascii="Arial" w:hAnsi="Arial" w:cs="Arial"/>
+              </w:rPr>
+              <w:t>Abbiamo deciso che, non avendo concluso a pieno lo sprint precedente, avremmo ripreso subito la parte mancante e contemporaneamente iniziato con lo sviluppo del menu per riuscire a riguadagnare del tempo.</w:t>
+            </w:r>
+          </w:p>
+        </w:tc>
+      </w:tr>
+    </w:tbl>
+    <w:p>
+      <w:pPr>
+        <w:rPr>
+          <w:rFonts w:ascii="Arial" w:hAnsi="Arial" w:cs="Arial"/>
+        </w:rPr>
+      </w:pPr>
+    </w:p>
+    <w:tbl>
+      <w:tblPr>
+        <w:tblStyle w:val="Grigliatabella"/>
+        <w:tblW w:w="0" w:type="auto"/>
+        <w:tblLook w:val="04A0" w:firstRow="1" w:lastRow="0" w:firstColumn="1" w:lastColumn="0" w:noHBand="0" w:noVBand="1"/>
+      </w:tblPr>
+      <w:tblGrid>
+        <w:gridCol w:w="9628"/>
+      </w:tblGrid>
+      <w:tr>
+        <w:tc>
+          <w:tcPr>
+            <w:tcW w:w="9854" w:type="dxa"/>
+            <w:tcBorders>
+              <w:top w:val="single" w:sz="4" w:space="0" w:color="auto"/>
+              <w:left w:val="single" w:sz="4" w:space="0" w:color="auto"/>
+              <w:bottom w:val="single" w:sz="4" w:space="0" w:color="auto"/>
+              <w:right w:val="single" w:sz="4" w:space="0" w:color="auto"/>
+            </w:tcBorders>
+            <w:shd w:val="clear" w:color="auto" w:fill="D9D9D9" w:themeFill="background1" w:themeFillShade="D9"/>
+            <w:hideMark/>
+          </w:tcPr>
+          <w:p>
+            <w:pPr>
+              <w:spacing w:after="200" w:line="276" w:lineRule="auto"/>
+              <w:rPr>
+                <w:rFonts w:ascii="Arial" w:hAnsi="Arial" w:cs="Arial"/>
+              </w:rPr>
+            </w:pPr>
+            <w:r>
+              <w:rPr>
+                <w:rFonts w:ascii="Arial" w:hAnsi="Arial" w:cs="Arial"/>
+              </w:rPr>
+              <w:t>Sprint Review</w:t>
+            </w:r>
+          </w:p>
+        </w:tc>
+      </w:tr>
+      <w:tr>
+        <w:tc>
+          <w:tcPr>
+            <w:tcW w:w="9854" w:type="dxa"/>
+            <w:tcBorders>
+              <w:top w:val="single" w:sz="4" w:space="0" w:color="auto"/>
+              <w:left w:val="single" w:sz="4" w:space="0" w:color="auto"/>
+              <w:bottom w:val="single" w:sz="4" w:space="0" w:color="auto"/>
+              <w:right w:val="single" w:sz="4" w:space="0" w:color="auto"/>
+            </w:tcBorders>
+          </w:tcPr>
+          <w:p>
+            <w:pPr>
+              <w:spacing w:after="200" w:line="276" w:lineRule="auto"/>
+              <w:rPr>
+                <w:rFonts w:ascii="Arial" w:hAnsi="Arial" w:cs="Arial"/>
+              </w:rPr>
+            </w:pPr>
+            <w:r>
+              <w:rPr>
+                <w:rFonts w:ascii="Arial" w:hAnsi="Arial" w:cs="Arial"/>
+              </w:rPr>
+              <w:t xml:space="preserve">Quello che è stato svolto è piaciuto, e abbiamo notato necessità di qualche controllo sui tipi di dati  </w:t>
+            </w:r>
+          </w:p>
+        </w:tc>
+      </w:tr>
+    </w:tbl>
+    <w:p>
+      <w:pPr>
+        <w:rPr>
+          <w:rFonts w:ascii="Arial" w:hAnsi="Arial" w:cs="Arial"/>
+        </w:rPr>
+      </w:pPr>
+    </w:p>
+    <w:tbl>
+      <w:tblPr>
+        <w:tblStyle w:val="Grigliatabella"/>
+        <w:tblW w:w="0" w:type="auto"/>
+        <w:tblLook w:val="04A0" w:firstRow="1" w:lastRow="0" w:firstColumn="1" w:lastColumn="0" w:noHBand="0" w:noVBand="1"/>
+      </w:tblPr>
+      <w:tblGrid>
+        <w:gridCol w:w="9628"/>
+      </w:tblGrid>
+      <w:tr>
+        <w:tc>
+          <w:tcPr>
+            <w:tcW w:w="9854" w:type="dxa"/>
+            <w:tcBorders>
+              <w:top w:val="single" w:sz="4" w:space="0" w:color="auto"/>
+              <w:left w:val="single" w:sz="4" w:space="0" w:color="auto"/>
+              <w:bottom w:val="single" w:sz="4" w:space="0" w:color="auto"/>
+              <w:right w:val="single" w:sz="4" w:space="0" w:color="auto"/>
+            </w:tcBorders>
+            <w:shd w:val="clear" w:color="auto" w:fill="D9D9D9" w:themeFill="background1" w:themeFillShade="D9"/>
+            <w:hideMark/>
+          </w:tcPr>
+          <w:p>
+            <w:pPr>
+              <w:spacing w:after="200" w:line="276" w:lineRule="auto"/>
+              <w:rPr>
+                <w:rFonts w:ascii="Arial" w:hAnsi="Arial" w:cs="Arial"/>
+              </w:rPr>
+            </w:pPr>
+            <w:r>
+              <w:rPr>
+                <w:rFonts w:ascii="Arial" w:hAnsi="Arial" w:cs="Arial"/>
+              </w:rPr>
+              <w:t>Sprint Retrospective</w:t>
+            </w:r>
+          </w:p>
+        </w:tc>
+      </w:tr>
+      <w:tr>
+        <w:tc>
+          <w:tcPr>
+            <w:tcW w:w="9854" w:type="dxa"/>
+            <w:tcBorders>
+              <w:top w:val="single" w:sz="4" w:space="0" w:color="auto"/>
+              <w:left w:val="single" w:sz="4" w:space="0" w:color="auto"/>
+              <w:bottom w:val="single" w:sz="4" w:space="0" w:color="auto"/>
+              <w:right w:val="single" w:sz="4" w:space="0" w:color="auto"/>
+            </w:tcBorders>
+          </w:tcPr>
+          <w:p>
+            <w:pPr>
+              <w:spacing w:after="200" w:line="276" w:lineRule="auto"/>
+              <w:rPr>
+                <w:rFonts w:ascii="Arial" w:hAnsi="Arial" w:cs="Arial"/>
+              </w:rPr>
+            </w:pPr>
+            <w:r>
+              <w:rPr>
+                <w:rFonts w:ascii="Arial" w:hAnsi="Arial" w:cs="Arial"/>
+              </w:rPr>
+              <w:t>Il lavoro svolto è stato gestito abbastanza bene, purtroppo ci sono stati un paio di imprevisti che hanno rallentato il lavoro, oltre ad aver sottovalutato leggermente la parte di scripting.</w:t>
+            </w:r>
+          </w:p>
+        </w:tc>
+      </w:tr>
+    </w:tbl>
+    <w:p>
+      <w:pPr>
+        <w:rPr>
+          <w:rFonts w:ascii="Arial" w:hAnsi="Arial" w:cs="Arial"/>
+        </w:rPr>
+      </w:pPr>
+    </w:p>
+    <w:p>
+      <w:pPr>
+        <w:rPr>
+          <w:rFonts w:ascii="Arial" w:hAnsi="Arial" w:cs="Arial"/>
+        </w:rPr>
+      </w:pPr>
+      <w:r>
+        <w:rPr>
+          <w:rFonts w:ascii="Arial" w:hAnsi="Arial" w:cs="Arial"/>
+        </w:rPr>
+        <w:br w:type="page"/>
+      </w:r>
+    </w:p>
+    <w:p>
+      <w:pPr>
+        <w:pStyle w:val="Titolo2"/>
+        <w:pBdr>
+          <w:bottom w:val="single" w:sz="4" w:space="1" w:color="auto"/>
+        </w:pBdr>
+      </w:pPr>
+      <w:r>
+        <w:lastRenderedPageBreak/>
+        <w:t>Utilizzo Intelligenza Artificiale</w:t>
+      </w:r>
+      <w:r>
+        <w:t xml:space="preserve"> nella giornata</w:t>
+      </w:r>
+    </w:p>
+    <w:p>
+      <w:pPr>
+        <w:pStyle w:val="Nessunaspaziatura"/>
+        <w:rPr>
+          <w:rFonts w:ascii="Arial" w:hAnsi="Arial" w:cs="Arial"/>
+          <w:b/>
+          <w:bCs/>
+        </w:rPr>
+      </w:pPr>
+    </w:p>
+    <w:p>
+      <w:pPr>
+        <w:pStyle w:val="Nessunaspaziatura"/>
+        <w:rPr>
+          <w:rFonts w:ascii="Arial" w:hAnsi="Arial" w:cs="Arial"/>
+        </w:rPr>
+      </w:pPr>
+      <w:sdt>
+        <w:sdtPr>
+          <w:rPr>
+            <w:rFonts w:ascii="Segoe UI Symbol" w:hAnsi="Segoe UI Symbol" w:cs="Segoe UI Symbol"/>
+          </w:rPr>
+          <w:id w:val="1352840954"/>
+          <w14:checkbox>
+            <w14:checked w14:val="0"/>
+            <w14:checkedState w14:val="2612" w14:font="MS Gothic"/>
+            <w14:uncheckedState w14:val="2610" w14:font="MS Gothic"/>
+          </w14:checkbox>
+        </w:sdtPr>
+        <w:sdtContent>
+          <w:r>
+            <w:rPr>
+              <w:rFonts w:ascii="MS Gothic" w:eastAsia="MS Gothic" w:hAnsi="MS Gothic" w:cs="Segoe UI Symbol" w:hint="eastAsia"/>
+            </w:rPr>
+            <w:t>☐</w:t>
+          </w:r>
+        </w:sdtContent>
+      </w:sdt>
+      <w:r>
+        <w:rPr>
+          <w:rFonts w:ascii="Arial" w:hAnsi="Arial" w:cs="Arial"/>
+        </w:rPr>
+        <w:t xml:space="preserve"> Nessuno</w:t>
+      </w:r>
+      <w:r>
+        <w:br/>
+      </w:r>
+      <w:sdt>
+        <w:sdtPr>
+          <w:rPr>
+            <w:rFonts w:ascii="Segoe UI Symbol" w:hAnsi="Segoe UI Symbol" w:cs="Segoe UI Symbol"/>
+          </w:rPr>
+          <w:id w:val="166518262"/>
+          <w14:checkbox>
+            <w14:checked w14:val="1"/>
+            <w14:checkedState w14:val="2612" w14:font="MS Gothic"/>
+            <w14:uncheckedState w14:val="2610" w14:font="MS Gothic"/>
+          </w14:checkbox>
+        </w:sdtPr>
+        <w:sdtContent>
+          <w:r>
+            <w:rPr>
+              <w:rFonts w:ascii="MS Gothic" w:eastAsia="MS Gothic" w:hAnsi="MS Gothic" w:cs="Segoe UI Symbol" w:hint="eastAsia"/>
+            </w:rPr>
+            <w:t>☒</w:t>
+          </w:r>
+        </w:sdtContent>
+      </w:sdt>
+      <w:r>
+        <w:rPr>
+          <w:rFonts w:ascii="Arial" w:hAnsi="Arial" w:cs="Arial"/>
+        </w:rPr>
+        <w:t xml:space="preserve"> Occasionale</w:t>
+      </w:r>
+      <w:r>
+        <w:br/>
+      </w:r>
+      <w:sdt>
+        <w:sdtPr>
+          <w:rPr>
+            <w:rFonts w:ascii="Segoe UI Symbol" w:hAnsi="Segoe UI Symbol" w:cs="Segoe UI Symbol"/>
+          </w:rPr>
+          <w:id w:val="-1847392541"/>
+          <w14:checkbox>
+            <w14:checked w14:val="0"/>
+            <w14:checkedState w14:val="2612" w14:font="MS Gothic"/>
+            <w14:uncheckedState w14:val="2610" w14:font="MS Gothic"/>
+          </w14:checkbox>
+        </w:sdtPr>
+        <w:sdtContent>
+          <w:r>
+            <w:rPr>
+              <w:rFonts w:ascii="MS Gothic" w:eastAsia="MS Gothic" w:hAnsi="MS Gothic" w:cs="Segoe UI Symbol" w:hint="eastAsia"/>
+            </w:rPr>
+            <w:t>☐</w:t>
+          </w:r>
+        </w:sdtContent>
+      </w:sdt>
+      <w:r>
+        <w:rPr>
+          <w:rFonts w:ascii="Arial" w:hAnsi="Arial" w:cs="Arial"/>
+        </w:rPr>
+        <w:t xml:space="preserve"> Frequente</w:t>
+      </w:r>
+    </w:p>
+    <w:p>
+      <w:pPr>
+        <w:pStyle w:val="Nessunaspaziatura"/>
+        <w:rPr>
+          <w:rFonts w:ascii="Arial" w:hAnsi="Arial" w:cs="Arial"/>
+        </w:rPr>
+      </w:pPr>
+    </w:p>
+    <w:p>
+      <w:pPr>
+        <w:pStyle w:val="Nessunaspaziatura"/>
+        <w:spacing w:line="276" w:lineRule="auto"/>
+        <w:rPr>
+          <w:rFonts w:ascii="Arial" w:hAnsi="Arial" w:cs="Arial"/>
+        </w:rPr>
+      </w:pPr>
+      <w:r>
+        <w:rPr>
+          <w:rFonts w:ascii="Arial" w:hAnsi="Arial" w:cs="Arial"/>
+          <w:b/>
+          <w:bCs/>
+        </w:rPr>
+        <w:t>Strumento/i utilizzato/i</w:t>
+      </w:r>
+      <w:r>
+        <w:rPr>
+          <w:rFonts w:ascii="Arial" w:hAnsi="Arial" w:cs="Arial"/>
+          <w:b/>
+          <w:bCs/>
+        </w:rPr>
+        <w:t xml:space="preserve"> </w:t>
+      </w:r>
+      <w:r>
+        <w:rPr>
+          <w:rFonts w:ascii="Arial" w:hAnsi="Arial" w:cs="Arial"/>
+        </w:rPr>
+        <w:t>(es. ChatGPT)</w:t>
+      </w:r>
+      <w:r>
+        <w:rPr>
+          <w:rFonts w:ascii="Arial" w:hAnsi="Arial" w:cs="Arial"/>
+        </w:rPr>
+        <w:t xml:space="preserve">: </w:t>
+      </w:r>
+      <w:sdt>
+        <w:sdtPr>
+          <w:rPr>
+            <w:rFonts w:ascii="Arial" w:hAnsi="Arial" w:cs="Arial"/>
+          </w:rPr>
+          <w:id w:val="2127969182"/>
+          <w:placeholder>
+            <w:docPart w:val="C03C442A18B040F68F66D9575D08CC40"/>
+          </w:placeholder>
+        </w:sdtPr>
+        <w:sdtContent>
+          <w:r>
+            <w:rPr>
+              <w:rFonts w:ascii="Arial" w:hAnsi="Arial" w:cs="Arial"/>
+            </w:rPr>
+            <w:t>ChatGPT</w:t>
+          </w:r>
+        </w:sdtContent>
+      </w:sdt>
+    </w:p>
+    <w:p>
+      <w:pPr>
+        <w:pStyle w:val="Nessunaspaziatura"/>
+        <w:rPr>
+          <w:rFonts w:ascii="Arial" w:hAnsi="Arial" w:cs="Arial"/>
+        </w:rPr>
+      </w:pPr>
+    </w:p>
+    <w:p>
+      <w:pPr>
+        <w:pStyle w:val="Nessunaspaziatura"/>
+        <w:rPr>
+          <w:rFonts w:ascii="Arial" w:hAnsi="Arial" w:cs="Arial"/>
+        </w:rPr>
+      </w:pPr>
+      <w:r>
+        <w:rPr>
+          <w:rFonts w:ascii="Arial" w:hAnsi="Arial" w:cs="Arial"/>
+          <w:b/>
+          <w:bCs/>
+        </w:rPr>
+        <w:t>Per cosa l’ho usata oggi</w:t>
+      </w:r>
+      <w:r>
+        <w:br/>
+      </w:r>
+      <w:sdt>
+        <w:sdtPr>
+          <w:rPr>
+            <w:rFonts w:ascii="Segoe UI Symbol" w:hAnsi="Segoe UI Symbol" w:cs="Segoe UI Symbol"/>
+          </w:rPr>
+          <w:id w:val="1716852934"/>
+          <w14:checkbox>
+            <w14:checked w14:val="0"/>
+            <w14:checkedState w14:val="2612" w14:font="MS Gothic"/>
+            <w14:uncheckedState w14:val="2610" w14:font="MS Gothic"/>
+          </w14:checkbox>
+        </w:sdtPr>
+        <w:sdtContent>
+          <w:r>
+            <w:rPr>
+              <w:rFonts w:ascii="MS Gothic" w:eastAsia="MS Gothic" w:hAnsi="MS Gothic" w:cs="Segoe UI Symbol" w:hint="eastAsia"/>
+            </w:rPr>
+            <w:t>☐</w:t>
+          </w:r>
+        </w:sdtContent>
+      </w:sdt>
+      <w:r>
+        <w:rPr>
+          <w:rFonts w:ascii="Arial" w:hAnsi="Arial" w:cs="Arial"/>
+        </w:rPr>
+        <w:t xml:space="preserve"> Chiarire concetti</w:t>
+      </w:r>
+      <w:r>
+        <w:br/>
+      </w:r>
+      <w:sdt>
+        <w:sdtPr>
+          <w:rPr>
+            <w:rFonts w:ascii="Segoe UI Symbol" w:hAnsi="Segoe UI Symbol" w:cs="Segoe UI Symbol"/>
+          </w:rPr>
+          <w:id w:val="-1049839450"/>
+          <w14:checkbox>
+            <w14:checked w14:val="1"/>
+            <w14:checkedState w14:val="2612" w14:font="MS Gothic"/>
+            <w14:uncheckedState w14:val="2610" w14:font="MS Gothic"/>
+          </w14:checkbox>
+        </w:sdtPr>
+        <w:sdtContent>
+          <w:r>
+            <w:rPr>
+              <w:rFonts w:ascii="MS Gothic" w:eastAsia="MS Gothic" w:hAnsi="MS Gothic" w:cs="Segoe UI Symbol" w:hint="eastAsia"/>
+            </w:rPr>
+            <w:t>☒</w:t>
+          </w:r>
+        </w:sdtContent>
+      </w:sdt>
+      <w:r>
+        <w:rPr>
+          <w:rFonts w:ascii="Arial" w:hAnsi="Arial" w:cs="Arial"/>
+        </w:rPr>
+        <w:t xml:space="preserve"> Supporto al codice</w:t>
+      </w:r>
+      <w:r>
+        <w:br/>
+      </w:r>
+      <w:sdt>
+        <w:sdtPr>
+          <w:rPr>
+            <w:rFonts w:ascii="Segoe UI Symbol" w:hAnsi="Segoe UI Symbol" w:cs="Segoe UI Symbol"/>
+          </w:rPr>
+          <w:id w:val="409744439"/>
+          <w14:checkbox>
+            <w14:checked w14:val="1"/>
+            <w14:checkedState w14:val="2612" w14:font="MS Gothic"/>
+            <w14:uncheckedState w14:val="2610" w14:font="MS Gothic"/>
+          </w14:checkbox>
+        </w:sdtPr>
+        <w:sdtContent>
+          <w:r>
+            <w:rPr>
+              <w:rFonts w:ascii="MS Gothic" w:eastAsia="MS Gothic" w:hAnsi="MS Gothic" w:cs="Segoe UI Symbol" w:hint="eastAsia"/>
+            </w:rPr>
+            <w:t>☒</w:t>
+          </w:r>
+        </w:sdtContent>
+      </w:sdt>
+      <w:r>
+        <w:rPr>
+          <w:rFonts w:ascii="Arial" w:hAnsi="Arial" w:cs="Arial"/>
+        </w:rPr>
+        <w:t xml:space="preserve"> Debug</w:t>
+      </w:r>
+      <w:r>
+        <w:br/>
+      </w:r>
+      <w:sdt>
+        <w:sdtPr>
+          <w:rPr>
+            <w:rFonts w:ascii="Segoe UI Symbol" w:hAnsi="Segoe UI Symbol" w:cs="Segoe UI Symbol"/>
+          </w:rPr>
+          <w:id w:val="-2083124957"/>
+          <w14:checkbox>
+            <w14:checked w14:val="0"/>
+            <w14:checkedState w14:val="2612" w14:font="MS Gothic"/>
+            <w14:uncheckedState w14:val="2610" w14:font="MS Gothic"/>
+          </w14:checkbox>
+        </w:sdtPr>
+        <w:sdtContent>
+          <w:r>
+            <w:rPr>
+              <w:rFonts w:ascii="MS Gothic" w:eastAsia="MS Gothic" w:hAnsi="MS Gothic" w:cs="Segoe UI Symbol" w:hint="eastAsia"/>
+            </w:rPr>
+            <w:t>☐</w:t>
+          </w:r>
+        </w:sdtContent>
+      </w:sdt>
+      <w:r>
+        <w:rPr>
+          <w:rFonts w:ascii="Arial" w:hAnsi="Arial" w:cs="Arial"/>
+        </w:rPr>
+        <w:t xml:space="preserve"> Riorganizzare idee / testi</w:t>
+      </w:r>
+      <w:r>
+        <w:br/>
+      </w:r>
+      <w:sdt>
+        <w:sdtPr>
+          <w:rPr>
+            <w:rFonts w:ascii="Segoe UI Symbol" w:hAnsi="Segoe UI Symbol" w:cs="Segoe UI Symbol"/>
+          </w:rPr>
+          <w:id w:val="-727385482"/>
+          <w14:checkbox>
+            <w14:checked w14:val="0"/>
+            <w14:checkedState w14:val="2612" w14:font="MS Gothic"/>
+            <w14:uncheckedState w14:val="2610" w14:font="MS Gothic"/>
+          </w14:checkbox>
+        </w:sdtPr>
+        <w:sdtContent>
+          <w:r>
+            <w:rPr>
+              <w:rFonts w:ascii="MS Gothic" w:eastAsia="MS Gothic" w:hAnsi="MS Gothic" w:cs="Segoe UI Symbol" w:hint="eastAsia"/>
+            </w:rPr>
+            <w:t>☐</w:t>
+          </w:r>
+        </w:sdtContent>
+      </w:sdt>
+      <w:r>
+        <w:rPr>
+          <w:rFonts w:ascii="Arial" w:hAnsi="Arial" w:cs="Arial"/>
+        </w:rPr>
+        <w:t xml:space="preserve"> Altro: …</w:t>
+      </w:r>
+    </w:p>
+    <w:p>
+      <w:pPr>
+        <w:pStyle w:val="Nessunaspaziatura"/>
+        <w:rPr>
+          <w:rFonts w:ascii="Arial" w:hAnsi="Arial" w:cs="Arial"/>
+        </w:rPr>
+      </w:pPr>
+    </w:p>
+    <w:p>
+      <w:pPr>
+        <w:pStyle w:val="Nessunaspaziatura"/>
+        <w:rPr>
+          <w:rFonts w:ascii="Arial" w:hAnsi="Arial" w:cs="Arial"/>
+          <w:b/>
+          <w:bCs/>
+        </w:rPr>
+      </w:pPr>
+      <w:r>
+        <w:rPr>
+          <w:rFonts w:ascii="Arial" w:hAnsi="Arial" w:cs="Arial"/>
+          <w:b/>
+          <w:bCs/>
+        </w:rPr>
+        <w:t>Esempio significativo di utilizzo (UNO SOLO)</w:t>
+      </w:r>
+    </w:p>
+    <w:p>
+      <w:pPr>
+        <w:pStyle w:val="Nessunaspaziatura"/>
+        <w:rPr>
+          <w:rFonts w:ascii="Arial" w:hAnsi="Arial" w:cs="Arial"/>
+        </w:rPr>
+      </w:pPr>
+      <w:r>
+        <w:rPr>
+          <w:rFonts w:ascii="Arial" w:hAnsi="Arial" w:cs="Arial"/>
+        </w:rPr>
+        <w:t xml:space="preserve">Riporta </w:t>
+      </w:r>
+      <w:r>
+        <w:rPr>
+          <w:rFonts w:ascii="Arial" w:hAnsi="Arial" w:cs="Arial"/>
+          <w:i/>
+          <w:iCs/>
+        </w:rPr>
+        <w:t>un</w:t>
+      </w:r>
+      <w:r>
+        <w:rPr>
+          <w:rFonts w:ascii="Arial" w:hAnsi="Arial" w:cs="Arial"/>
+        </w:rPr>
+        <w:t xml:space="preserve"> prompt rilevante oppure descrivilo a parole se ce ne sono stati molti.</w:t>
+      </w:r>
+    </w:p>
+    <w:p>
+      <w:pPr>
+        <w:pStyle w:val="Nessunaspaziatura"/>
+        <w:rPr>
+          <w:rFonts w:ascii="Arial" w:hAnsi="Arial" w:cs="Arial"/>
+        </w:rPr>
+      </w:pPr>
+    </w:p>
+    <w:sdt>
+      <w:sdtPr>
+        <w:rPr>
+          <w:rFonts w:ascii="Arial" w:hAnsi="Arial" w:cs="Arial"/>
+        </w:rPr>
+        <w:alias w:val="Prompt AI"/>
+        <w:tag w:val="Prompt AI"/>
+        <w:id w:val="-227143254"/>
+        <w:placeholder>
+          <w:docPart w:val="68D57D3927ED41FC82736D5EFD477971"/>
+        </w:placeholder>
+        <w15:color w:val="C0C0C0"/>
+      </w:sdtPr>
+      <w:sdtContent>
+        <w:p>
+          <w:pPr>
+            <w:pStyle w:val="Nessunaspaziatura"/>
+            <w:rPr>
+              <w:rFonts w:ascii="Arial" w:hAnsi="Arial" w:cs="Arial"/>
+            </w:rPr>
+          </w:pPr>
+          <w:r>
+            <w:rPr>
+              <w:rFonts w:ascii="Arial" w:hAnsi="Arial" w:cs="Arial"/>
+            </w:rPr>
+            <w:t>Riley: Non mi mette il valore corretto, quale potrebbe essere la causa.</w:t>
+          </w:r>
+        </w:p>
+        <w:p>
+          <w:pPr>
+            <w:pStyle w:val="Nessunaspaziatura"/>
+            <w:spacing w:line="276" w:lineRule="auto"/>
+            <w:rPr>
+              <w:rFonts w:ascii="Arial" w:hAnsi="Arial" w:cs="Arial"/>
+            </w:rPr>
+          </w:pPr>
+          <w:r>
+            <w:rPr>
+              <w:rFonts w:ascii="Arial" w:hAnsi="Arial" w:cs="Arial"/>
+            </w:rPr>
+            <w:t xml:space="preserve">Bryan: </w:t>
+          </w:r>
+        </w:p>
+      </w:sdtContent>
+    </w:sdt>
+    <w:p>
+      <w:pPr>
+        <w:pStyle w:val="Nessunaspaziatura"/>
+        <w:rPr>
+          <w:rFonts w:ascii="Arial" w:hAnsi="Arial" w:cs="Arial"/>
+        </w:rPr>
+      </w:pPr>
+    </w:p>
+    <w:p>
+      <w:pPr>
+        <w:pStyle w:val="Nessunaspaziatura"/>
+        <w:rPr>
+          <w:rFonts w:ascii="Arial" w:hAnsi="Arial" w:cs="Arial"/>
+        </w:rPr>
+      </w:pPr>
+      <w:r>
+        <w:rPr>
+          <w:rFonts w:ascii="Arial" w:hAnsi="Arial" w:cs="Arial"/>
+          <w:b/>
+          <w:bCs/>
+        </w:rPr>
+        <w:t>Cosa mi ha dato l’AI</w:t>
+      </w:r>
+    </w:p>
+    <w:p>
+      <w:pPr>
+        <w:pStyle w:val="Nessunaspaziatura"/>
+        <w:rPr>
+          <w:rFonts w:ascii="Arial" w:hAnsi="Arial" w:cs="Arial"/>
+        </w:rPr>
+      </w:pPr>
+      <w:r>
+        <w:rPr>
+          <w:rFonts w:ascii="Arial" w:hAnsi="Arial" w:cs="Arial"/>
+        </w:rPr>
+        <w:t>Spiegazione, esempio, soluzione, suggerimento…</w:t>
+      </w:r>
+    </w:p>
+    <w:p>
+      <w:pPr>
+        <w:pStyle w:val="Nessunaspaziatura"/>
+        <w:rPr>
+          <w:rFonts w:ascii="Arial" w:hAnsi="Arial" w:cs="Arial"/>
+        </w:rPr>
+      </w:pPr>
+    </w:p>
+    <w:sdt>
+      <w:sdtPr>
+        <w:rPr>
+          <w:rFonts w:ascii="Arial" w:hAnsi="Arial" w:cs="Arial"/>
+        </w:rPr>
+        <w:alias w:val="Risposta AI"/>
+        <w:tag w:val="Risposta AI"/>
+        <w:id w:val="-224372810"/>
+        <w:placeholder>
+          <w:docPart w:val="37B60A0CBB654C6A874CE4D497BD4DCD"/>
+        </w:placeholder>
+        <w15:color w:val="C0C0C0"/>
+      </w:sdtPr>
+      <w:sdtContent>
+        <w:p>
+          <w:pPr>
+            <w:pStyle w:val="Nessunaspaziatura"/>
+            <w:spacing w:line="276" w:lineRule="auto"/>
+            <w:rPr>
+              <w:rFonts w:ascii="Arial" w:hAnsi="Arial" w:cs="Arial"/>
+            </w:rPr>
+          </w:pPr>
+          <w:r>
+            <w:rPr>
+              <w:rFonts w:ascii="Arial" w:hAnsi="Arial" w:cs="Arial"/>
+            </w:rPr>
+            <w:t>Riley: mi ha elencato delle possibili soluzioni di debugging</w:t>
+          </w:r>
+        </w:p>
+        <w:p>
+          <w:pPr>
+            <w:pStyle w:val="Nessunaspaziatura"/>
+            <w:spacing w:line="276" w:lineRule="auto"/>
+            <w:rPr>
+              <w:rFonts w:ascii="Arial" w:hAnsi="Arial" w:cs="Arial"/>
+            </w:rPr>
+          </w:pPr>
+          <w:r>
+            <w:rPr>
+              <w:rFonts w:ascii="Arial" w:hAnsi="Arial" w:cs="Arial"/>
+            </w:rPr>
+            <w:t>Bryan:</w:t>
+          </w:r>
+        </w:p>
+      </w:sdtContent>
+    </w:sdt>
+    <w:p>
+      <w:pPr>
+        <w:pStyle w:val="Nessunaspaziatura"/>
+        <w:rPr>
+          <w:rFonts w:ascii="Arial" w:hAnsi="Arial" w:cs="Arial"/>
+          <w:b/>
+          <w:bCs/>
+        </w:rPr>
+      </w:pPr>
+    </w:p>
+    <w:p>
+      <w:pPr>
+        <w:pStyle w:val="Nessunaspaziatura"/>
+        <w:rPr>
+          <w:rFonts w:ascii="Arial" w:hAnsi="Arial" w:cs="Arial"/>
+        </w:rPr>
+      </w:pPr>
+      <w:r>
+        <w:rPr>
+          <w:rFonts w:ascii="Arial" w:hAnsi="Arial" w:cs="Arial"/>
+          <w:b/>
+          <w:bCs/>
+        </w:rPr>
+        <w:t>Come l’ho usato io</w:t>
+      </w:r>
+      <w:r>
+        <w:rPr>
+          <w:rFonts w:ascii="Arial" w:hAnsi="Arial" w:cs="Arial"/>
+        </w:rPr>
+        <w:br/>
+      </w:r>
+      <w:sdt>
+        <w:sdtPr>
+          <w:rPr>
+            <w:rFonts w:ascii="Segoe UI Symbol" w:hAnsi="Segoe UI Symbol" w:cs="Segoe UI Symbol"/>
+          </w:rPr>
+          <w:id w:val="1170527478"/>
+          <w14:checkbox>
+            <w14:checked w14:val="1"/>
+            <w14:checkedState w14:val="2612" w14:font="MS Gothic"/>
+            <w14:uncheckedState w14:val="2610" w14:font="MS Gothic"/>
+          </w14:checkbox>
+        </w:sdtPr>
+        <w:sdtContent>
+          <w:r>
+            <w:rPr>
+              <w:rFonts w:ascii="MS Gothic" w:eastAsia="MS Gothic" w:hAnsi="MS Gothic" w:cs="Segoe UI Symbol" w:hint="eastAsia"/>
+            </w:rPr>
+            <w:t>☒</w:t>
+          </w:r>
+        </w:sdtContent>
+      </w:sdt>
+      <w:r>
+        <w:rPr>
+          <w:rFonts w:ascii="Arial" w:hAnsi="Arial" w:cs="Arial"/>
+        </w:rPr>
+        <w:t xml:space="preserve"> Copiato</w:t>
+      </w:r>
+      <w:r>
+        <w:rPr>
+          <w:rFonts w:ascii="Arial" w:hAnsi="Arial" w:cs="Arial"/>
+        </w:rPr>
+        <w:br/>
+      </w:r>
+      <w:sdt>
+        <w:sdtPr>
+          <w:rPr>
+            <w:rFonts w:ascii="Segoe UI Symbol" w:hAnsi="Segoe UI Symbol" w:cs="Segoe UI Symbol"/>
+          </w:rPr>
+          <w:id w:val="1144326251"/>
+          <w14:checkbox>
+            <w14:checked w14:val="0"/>
+            <w14:checkedState w14:val="2612" w14:font="MS Gothic"/>
+            <w14:uncheckedState w14:val="2610" w14:font="MS Gothic"/>
+          </w14:checkbox>
+        </w:sdtPr>
+        <w:sdtContent>
+          <w:r>
+            <w:rPr>
+              <w:rFonts w:ascii="MS Gothic" w:eastAsia="MS Gothic" w:hAnsi="MS Gothic" w:cs="Segoe UI Symbol" w:hint="eastAsia"/>
+            </w:rPr>
+            <w:t>☐</w:t>
+          </w:r>
+        </w:sdtContent>
+      </w:sdt>
+      <w:r>
+        <w:rPr>
+          <w:rFonts w:ascii="Arial" w:hAnsi="Arial" w:cs="Arial"/>
+        </w:rPr>
+        <w:t xml:space="preserve"> Adattato</w:t>
+      </w:r>
+      <w:r>
+        <w:rPr>
+          <w:rFonts w:ascii="Arial" w:hAnsi="Arial" w:cs="Arial"/>
+        </w:rPr>
+        <w:br/>
+      </w:r>
+      <w:sdt>
+        <w:sdtPr>
+          <w:rPr>
+            <w:rFonts w:ascii="Segoe UI Symbol" w:hAnsi="Segoe UI Symbol" w:cs="Segoe UI Symbol"/>
+          </w:rPr>
+          <w:id w:val="1216312582"/>
+          <w14:checkbox>
+            <w14:checked w14:val="1"/>
+            <w14:checkedState w14:val="2612" w14:font="MS Gothic"/>
+            <w14:uncheckedState w14:val="2610" w14:font="MS Gothic"/>
+          </w14:checkbox>
+        </w:sdtPr>
+        <w:sdtContent>
+          <w:r>
+            <w:rPr>
+              <w:rFonts w:ascii="MS Gothic" w:eastAsia="MS Gothic" w:hAnsi="MS Gothic" w:cs="Segoe UI Symbol" w:hint="eastAsia"/>
+            </w:rPr>
+            <w:t>☒</w:t>
+          </w:r>
+        </w:sdtContent>
+      </w:sdt>
+      <w:r>
+        <w:rPr>
+          <w:rFonts w:ascii="Arial" w:hAnsi="Arial" w:cs="Arial"/>
+        </w:rPr>
+        <w:t xml:space="preserve"> Usato solo per capire</w:t>
+      </w:r>
+      <w:r>
+        <w:rPr>
+          <w:rFonts w:ascii="Arial" w:hAnsi="Arial" w:cs="Arial"/>
+        </w:rPr>
+        <w:br/>
+      </w:r>
+      <w:sdt>
+        <w:sdtPr>
+          <w:rPr>
+            <w:rFonts w:ascii="Segoe UI Symbol" w:hAnsi="Segoe UI Symbol" w:cs="Segoe UI Symbol"/>
+          </w:rPr>
+          <w:id w:val="-968507934"/>
+          <w14:checkbox>
+            <w14:checked w14:val="0"/>
+            <w14:checkedState w14:val="2612" w14:font="MS Gothic"/>
+            <w14:uncheckedState w14:val="2610" w14:font="MS Gothic"/>
+          </w14:checkbox>
+        </w:sdtPr>
+        <w:sdtContent>
+          <w:r>
+            <w:rPr>
+              <w:rFonts w:ascii="MS Gothic" w:eastAsia="MS Gothic" w:hAnsi="MS Gothic" w:cs="Segoe UI Symbol" w:hint="eastAsia"/>
+            </w:rPr>
+            <w:t>☐</w:t>
+          </w:r>
+        </w:sdtContent>
+      </w:sdt>
+      <w:r>
+        <w:rPr>
+          <w:rFonts w:ascii="Arial" w:hAnsi="Arial" w:cs="Arial"/>
+        </w:rPr>
+        <w:t xml:space="preserve"> Scartato</w:t>
+      </w:r>
+    </w:p>
+    <w:p>
+      <w:pPr>
+        <w:pStyle w:val="Nessunaspaziatura"/>
+        <w:rPr>
+          <w:rFonts w:ascii="Arial" w:hAnsi="Arial" w:cs="Arial"/>
+        </w:rPr>
+      </w:pPr>
+    </w:p>
+    <w:p>
+      <w:pPr>
+        <w:pStyle w:val="Nessunaspaziatura"/>
+        <w:rPr>
+          <w:rFonts w:ascii="Arial" w:hAnsi="Arial" w:cs="Arial"/>
+        </w:rPr>
+      </w:pPr>
+    </w:p>
+    <w:p>
+      <w:pPr>
+        <w:pStyle w:val="Nessunaspaziatura"/>
+        <w:rPr>
+          <w:rFonts w:ascii="Arial" w:hAnsi="Arial" w:cs="Arial"/>
+        </w:rPr>
+      </w:pPr>
+      <w:r>
+        <w:rPr>
+          <w:rFonts w:ascii="Arial" w:hAnsi="Arial" w:cs="Arial"/>
+          <w:b/>
+          <w:bCs/>
+        </w:rPr>
+        <w:t>Cosa avrei fatto senza AI?</w:t>
+      </w:r>
+    </w:p>
+    <w:p>
+      <w:pPr>
+        <w:pStyle w:val="Nessunaspaziatura"/>
+        <w:rPr>
+          <w:rFonts w:ascii="Arial" w:hAnsi="Arial" w:cs="Arial"/>
+        </w:rPr>
+      </w:pPr>
+      <w:r>
+        <w:rPr>
+          <w:rFonts w:ascii="Arial" w:hAnsi="Arial" w:cs="Arial"/>
+        </w:rPr>
+        <w:t>Riley: cercato su forum o documentazioni ufficiali.</w:t>
       </w:r>
     </w:p>
     <w:p>
@@ -21787,6 +23384,107 @@
         </w:p>
       </w:docPartBody>
     </w:docPart>
+    <w:docPart>
+      <w:docPartPr>
+        <w:name w:val="C03C442A18B040F68F66D9575D08CC40"/>
+        <w:category>
+          <w:name w:val="Generale"/>
+          <w:gallery w:val="placeholder"/>
+        </w:category>
+        <w:types>
+          <w:type w:val="bbPlcHdr"/>
+        </w:types>
+        <w:behaviors>
+          <w:behavior w:val="content"/>
+        </w:behaviors>
+        <w:guid w:val="{2905DFD8-2F9D-4016-8CB3-0A8607531DB5}"/>
+      </w:docPartPr>
+      <w:docPartBody>
+        <w:p>
+          <w:pPr>
+            <w:pStyle w:val="C03C442A18B040F68F66D9575D08CC40"/>
+          </w:pPr>
+          <w:r>
+            <w:rPr>
+              <w:rStyle w:val="Testosegnaposto"/>
+              <w:b/>
+              <w:bCs/>
+            </w:rPr>
+            <w:t>Nomi AI utilizzati</w:t>
+          </w:r>
+        </w:p>
+      </w:docPartBody>
+    </w:docPart>
+    <w:docPart>
+      <w:docPartPr>
+        <w:name w:val="68D57D3927ED41FC82736D5EFD477971"/>
+        <w:category>
+          <w:name w:val="Generale"/>
+          <w:gallery w:val="placeholder"/>
+        </w:category>
+        <w:types>
+          <w:type w:val="bbPlcHdr"/>
+        </w:types>
+        <w:behaviors>
+          <w:behavior w:val="content"/>
+        </w:behaviors>
+        <w:guid w:val="{17D67A25-D865-4B14-9367-B138C2EB3B19}"/>
+      </w:docPartPr>
+      <w:docPartBody>
+        <w:p>
+          <w:pPr>
+            <w:pStyle w:val="68D57D3927ED41FC82736D5EFD477971"/>
+          </w:pPr>
+          <w:r>
+            <w:rPr>
+              <w:rStyle w:val="Testosegnaposto"/>
+            </w:rPr>
+            <w:t>Fare clic o toccare qui per immettere il testo.</w:t>
+          </w:r>
+        </w:p>
+      </w:docPartBody>
+    </w:docPart>
+    <w:docPart>
+      <w:docPartPr>
+        <w:name w:val="37B60A0CBB654C6A874CE4D497BD4DCD"/>
+        <w:category>
+          <w:name w:val="Generale"/>
+          <w:gallery w:val="placeholder"/>
+        </w:category>
+        <w:types>
+          <w:type w:val="bbPlcHdr"/>
+        </w:types>
+        <w:behaviors>
+          <w:behavior w:val="content"/>
+        </w:behaviors>
+        <w:guid w:val="{12085CFC-3384-4139-910C-DC32146A99FE}"/>
+      </w:docPartPr>
+      <w:docPartBody>
+        <w:p>
+          <w:pPr>
+            <w:pStyle w:val="37B60A0CBB654C6A874CE4D497BD4DCD"/>
+          </w:pPr>
+          <w:r>
+            <w:rPr>
+              <w:rStyle w:val="Testosegnaposto"/>
+            </w:rPr>
+            <w:t xml:space="preserve">Fare clic o toccare qui per </w:t>
+          </w:r>
+          <w:r>
+            <w:rPr>
+              <w:rStyle w:val="Testosegnaposto"/>
+            </w:rPr>
+            <w:t>immettere</w:t>
+          </w:r>
+          <w:r>
+            <w:rPr>
+              <w:rStyle w:val="Testosegnaposto"/>
+            </w:rPr>
+            <w:t xml:space="preserve"> il testo.</w:t>
+          </w:r>
+        </w:p>
+      </w:docPartBody>
+    </w:docPart>
   </w:docParts>
 </w:glossaryDocument>
 </file>
@@ -21928,6 +23626,7 @@
     <w:rsid w:val="00356BEF"/>
     <w:rsid w:val="00396FDF"/>
     <w:rsid w:val="003B3A61"/>
+    <w:rsid w:val="003C64D2"/>
     <w:rsid w:val="004335A8"/>
     <w:rsid w:val="00434CC7"/>
     <w:rsid w:val="004834F6"/>
@@ -21956,6 +23655,7 @@
     <w:rsid w:val="00A65B6C"/>
     <w:rsid w:val="00AA022F"/>
     <w:rsid w:val="00AD46CF"/>
+    <w:rsid w:val="00B06614"/>
     <w:rsid w:val="00B555FF"/>
     <w:rsid w:val="00BD3686"/>
     <w:rsid w:val="00BD5007"/>
@@ -21974,6 +23674,7 @@
     <w:rsid w:val="00ED4879"/>
     <w:rsid w:val="00EE3640"/>
     <w:rsid w:val="00EF520A"/>
+    <w:rsid w:val="00EF5C0D"/>
     <w:rsid w:val="00F15724"/>
     <w:rsid w:val="00F26F5B"/>
     <w:rsid w:val="00F36694"/>
@@ -22434,7 +24135,7 @@
     <w:basedOn w:val="Carpredefinitoparagrafo"/>
     <w:uiPriority w:val="99"/>
     <w:semiHidden/>
-    <w:rsid w:val="00D0757F"/>
+    <w:rsid w:val="003C64D2"/>
     <w:rPr>
       <w:color w:val="666666"/>
     </w:rPr>
@@ -22627,6 +24328,18 @@
   <w:style w:type="paragraph" w:customStyle="1" w:styleId="963EBB4542034BF881E654F013D95CB0">
     <w:name w:val="963EBB4542034BF881E654F013D95CB0"/>
     <w:rsid w:val="00D0757F"/>
+  </w:style>
+  <w:style w:type="paragraph" w:customStyle="1" w:styleId="C03C442A18B040F68F66D9575D08CC40">
+    <w:name w:val="C03C442A18B040F68F66D9575D08CC40"/>
+    <w:rsid w:val="003C64D2"/>
+  </w:style>
+  <w:style w:type="paragraph" w:customStyle="1" w:styleId="68D57D3927ED41FC82736D5EFD477971">
+    <w:name w:val="68D57D3927ED41FC82736D5EFD477971"/>
+    <w:rsid w:val="003C64D2"/>
+  </w:style>
+  <w:style w:type="paragraph" w:customStyle="1" w:styleId="37B60A0CBB654C6A874CE4D497BD4DCD">
+    <w:name w:val="37B60A0CBB654C6A874CE4D497BD4DCD"/>
+    <w:rsid w:val="003C64D2"/>
   </w:style>
 </w:styles>
 </file>

</xml_diff>

<commit_message>
aggiornamento sprint-planning e diario
</commit_message>
<xml_diff>
--- a/4_Diari/Diario.docx
+++ b/4_Diari/Diario.docx
@@ -15748,7 +15748,19 @@
               <w:rPr>
                 <w:rFonts w:ascii="Arial" w:hAnsi="Arial" w:cs="Arial"/>
               </w:rPr>
-              <w:t>Terminare impostazioni, iniziare a creare il db effettivo</w:t>
+              <w:t>Terminare impostazioni</w:t>
+            </w:r>
+            <w:r>
+              <w:rPr>
+                <w:rFonts w:ascii="Arial" w:hAnsi="Arial" w:cs="Arial"/>
+              </w:rPr>
+              <w:t xml:space="preserve"> e possibilmente</w:t>
+            </w:r>
+            <w:r>
+              <w:rPr>
+                <w:rFonts w:ascii="Arial" w:hAnsi="Arial" w:cs="Arial"/>
+              </w:rPr>
+              <w:t xml:space="preserve"> iniziare a creare il db effettivo</w:t>
             </w:r>
             <w:r>
               <w:rPr>
@@ -17026,19 +17038,7 @@
               <w:rPr>
                 <w:rFonts w:ascii="Arial" w:hAnsi="Arial" w:cs="Arial"/>
               </w:rPr>
-              <w:t>2</w:t>
-            </w:r>
-            <w:r>
-              <w:rPr>
-                <w:rFonts w:ascii="Arial" w:hAnsi="Arial" w:cs="Arial"/>
-              </w:rPr>
-              <w:t>9</w:t>
-            </w:r>
-            <w:r>
-              <w:rPr>
-                <w:rFonts w:ascii="Arial" w:hAnsi="Arial" w:cs="Arial"/>
-              </w:rPr>
-              <w:t>.09.2026</w:t>
+              <w:t>29.09.2026</w:t>
             </w:r>
           </w:p>
         </w:tc>
@@ -17116,7 +17116,7 @@
               <w:rPr>
                 <w:rFonts w:ascii="Arial" w:hAnsi="Arial" w:cs="Arial"/>
               </w:rPr>
-              <w:t>Continuato script impostazioni per ui</w:t>
+              <w:t>Completamento visualizzazione e salvataggio impostazioni, l’applicazione non è ancora completamente possibile dovendo creare dei gestori personalizzati ed è necessario avere un principio di gameplay.</w:t>
             </w:r>
           </w:p>
         </w:tc>
@@ -17154,7 +17154,7 @@
               <w:rPr>
                 <w:rFonts w:ascii="Arial" w:hAnsi="Arial" w:cs="Arial"/>
               </w:rPr>
-              <w:t>Sviluppo menu principale e navigazione tra i menu esistenti e uscita dal gioco</w:t>
+              <w:t>Cominciato a costruire la mappa di gioco</w:t>
             </w:r>
           </w:p>
         </w:tc>
@@ -17233,7 +17233,13 @@
               <w:rPr>
                 <w:rFonts w:ascii="Arial" w:hAnsi="Arial" w:cs="Arial"/>
               </w:rPr>
-              <w:t xml:space="preserve">Alcuni problemi con i valori inviati dal togglle per fullscreen, scoperto che avevo selezionato un valore statico e non dinamico dell’elemento </w:t>
+              <w:t>Uno script non risultava isolato rispetto agli altri, ho risolto eliminando i file generati da visual studio nel progetto e riaprendo la cartella asset come progetto in c#.</w:t>
+            </w:r>
+            <w:r>
+              <w:rPr>
+                <w:rFonts w:ascii="Arial" w:hAnsi="Arial" w:cs="Arial"/>
+              </w:rPr>
+              <w:t xml:space="preserve"> </w:t>
             </w:r>
           </w:p>
         </w:tc>
@@ -17329,7 +17335,7 @@
               <w:rPr>
                 <w:rFonts w:ascii="Arial" w:hAnsi="Arial" w:cs="Arial"/>
               </w:rPr>
-              <w:t>Generalmente avendo già finito il menu con navigazione e uscita dal gioco il tempo perso è già stato nettamente recuperato.</w:t>
+              <w:t>In questo momento possiamo praticamente considerarci in anticipo, dato che Bryan è riuscito a concludere il menu e l’uscita dal gioco con circa 12 ore di anticipo ed è già passato allo sviluppo della mappa</w:t>
             </w:r>
           </w:p>
         </w:tc>
@@ -17387,7 +17393,7 @@
               <w:rPr>
                 <w:rFonts w:ascii="Arial" w:hAnsi="Arial" w:cs="Arial"/>
               </w:rPr>
-              <w:t>Terminare impostazioni, iniziare a creare il db effettivo e inizio sviluppo mappa.</w:t>
+              <w:t>Brayn continuerà con lo sviluppo della mappa mentre Riley svilupperà il db effettivo</w:t>
             </w:r>
           </w:p>
         </w:tc>
@@ -17510,7 +17516,7 @@
               <w:rPr>
                 <w:rFonts w:ascii="Arial" w:hAnsi="Arial" w:cs="Arial"/>
               </w:rPr>
-              <w:t>Sviluppo animazioni menu</w:t>
+              <w:t>Inizio sviluppo mappa</w:t>
             </w:r>
           </w:p>
         </w:tc>
@@ -17579,12 +17585,6 @@
                 <w:rFonts w:ascii="Arial" w:hAnsi="Arial" w:cs="Arial"/>
               </w:rPr>
             </w:pPr>
-            <w:r>
-              <w:rPr>
-                <w:rFonts w:ascii="Arial" w:hAnsi="Arial" w:cs="Arial"/>
-              </w:rPr>
-              <w:t>Abbiamo deciso che, non avendo concluso a pieno lo sprint precedente, avremmo ripreso subito la parte mancante e contemporaneamente iniziato con lo sviluppo del menu per riuscire a riguadagnare del tempo.</w:t>
-            </w:r>
           </w:p>
         </w:tc>
       </w:tr>
@@ -17652,12 +17652,6 @@
                 <w:rFonts w:ascii="Arial" w:hAnsi="Arial" w:cs="Arial"/>
               </w:rPr>
             </w:pPr>
-            <w:r>
-              <w:rPr>
-                <w:rFonts w:ascii="Arial" w:hAnsi="Arial" w:cs="Arial"/>
-              </w:rPr>
-              <w:t xml:space="preserve">Quello che è stato svolto è piaciuto, e abbiamo notato necessità di qualche controllo sui tipi di dati  </w:t>
-            </w:r>
           </w:p>
         </w:tc>
       </w:tr>
@@ -17725,12 +17719,6 @@
                 <w:rFonts w:ascii="Arial" w:hAnsi="Arial" w:cs="Arial"/>
               </w:rPr>
             </w:pPr>
-            <w:r>
-              <w:rPr>
-                <w:rFonts w:ascii="Arial" w:hAnsi="Arial" w:cs="Arial"/>
-              </w:rPr>
-              <w:t>Il lavoro svolto è stato gestito abbastanza bene, purtroppo ci sono stati un paio di imprevisti che hanno rallentato il lavoro, oltre ad aver sottovalutato leggermente la parte di scripting.</w:t>
-            </w:r>
           </w:p>
         </w:tc>
       </w:tr>
@@ -17741,19 +17729,6 @@
           <w:rFonts w:ascii="Arial" w:hAnsi="Arial" w:cs="Arial"/>
         </w:rPr>
       </w:pPr>
-    </w:p>
-    <w:p>
-      <w:pPr>
-        <w:rPr>
-          <w:rFonts w:ascii="Arial" w:hAnsi="Arial" w:cs="Arial"/>
-        </w:rPr>
-      </w:pPr>
-      <w:r>
-        <w:rPr>
-          <w:rFonts w:ascii="Arial" w:hAnsi="Arial" w:cs="Arial"/>
-        </w:rPr>
-        <w:br w:type="page"/>
-      </w:r>
     </w:p>
     <w:p>
       <w:pPr>
@@ -17763,7 +17738,6 @@
         </w:pBdr>
       </w:pPr>
       <w:r>
-        <w:lastRenderedPageBreak/>
         <w:t>Utilizzo Intelligenza Artificiale</w:t>
       </w:r>
       <w:r>
@@ -18002,7 +17976,7 @@
           </w:rPr>
           <w:id w:val="-1049839450"/>
           <w14:checkbox>
-            <w14:checked w14:val="1"/>
+            <w14:checked w14:val="0"/>
             <w14:checkedState w14:val="2612" w14:font="MS Gothic"/>
             <w14:uncheckedState w14:val="2610" w14:font="MS Gothic"/>
           </w14:checkbox>
@@ -18012,7 +17986,7 @@
             <w:rPr>
               <w:rFonts w:ascii="MS Gothic" w:eastAsia="MS Gothic" w:hAnsi="MS Gothic" w:cs="Segoe UI Symbol" w:hint="eastAsia"/>
             </w:rPr>
-            <w:t>☒</w:t>
+            <w:t>☐</w:t>
           </w:r>
         </w:sdtContent>
       </w:sdt>
@@ -18200,7 +18174,13 @@
             <w:rPr>
               <w:rFonts w:ascii="Arial" w:hAnsi="Arial" w:cs="Arial"/>
             </w:rPr>
-            <w:t>Riley: Non mi mette il valore corretto, quale potrebbe essere la causa.</w:t>
+            <w:t xml:space="preserve">Riley: </w:t>
+          </w:r>
+          <w:r>
+            <w:rPr>
+              <w:rFonts w:ascii="Arial" w:hAnsi="Arial" w:cs="Arial"/>
+            </w:rPr>
+            <w:t>Lo script SettingsUI sembra essersi isolato dal resto del codice, cosa potrebbe essere la causa?</w:t>
           </w:r>
         </w:p>
         <w:p>
@@ -18292,7 +18272,19 @@
             <w:rPr>
               <w:rFonts w:ascii="Arial" w:hAnsi="Arial" w:cs="Arial"/>
             </w:rPr>
-            <w:t>Riley: mi ha elencato delle possibili soluzioni di debugging</w:t>
+            <w:t xml:space="preserve">Riley: </w:t>
+          </w:r>
+          <w:r>
+            <w:rPr>
+              <w:rFonts w:ascii="Arial" w:hAnsi="Arial" w:cs="Arial"/>
+            </w:rPr>
+            <w:t xml:space="preserve">mi ha mostrato varie possibili cause </w:t>
+          </w:r>
+          <w:r>
+            <w:rPr>
+              <w:rFonts w:ascii="Arial" w:hAnsi="Arial" w:cs="Arial"/>
+            </w:rPr>
+            <w:t>ed eventuali soluzioni, diventate più precise dopo mie altre descrizioni della situazione</w:t>
           </w:r>
         </w:p>
         <w:p>
@@ -18350,7 +18342,7 @@
           </w:rPr>
           <w:id w:val="1170527478"/>
           <w14:checkbox>
-            <w14:checked w14:val="1"/>
+            <w14:checked w14:val="0"/>
             <w14:checkedState w14:val="2612" w14:font="MS Gothic"/>
             <w14:uncheckedState w14:val="2610" w14:font="MS Gothic"/>
           </w14:checkbox>
@@ -18360,7 +18352,7 @@
             <w:rPr>
               <w:rFonts w:ascii="MS Gothic" w:eastAsia="MS Gothic" w:hAnsi="MS Gothic" w:cs="Segoe UI Symbol" w:hint="eastAsia"/>
             </w:rPr>
-            <w:t>☒</w:t>
+            <w:t>☐</w:t>
           </w:r>
         </w:sdtContent>
       </w:sdt>
@@ -18513,7 +18505,13 @@
         <w:rPr>
           <w:rFonts w:ascii="Arial" w:hAnsi="Arial" w:cs="Arial"/>
         </w:rPr>
-        <w:t>Riley: cercato su forum o documentazioni ufficiali.</w:t>
+        <w:t xml:space="preserve">Riley: </w:t>
+      </w:r>
+      <w:r>
+        <w:rPr>
+          <w:rFonts w:ascii="Arial" w:hAnsi="Arial" w:cs="Arial"/>
+        </w:rPr>
+        <w:t>Fatto qualche ricerca online, e probabilmente creato un nuovo file e copiato il contenuto ed eliminato l’originale, questo però avrebbe eliminato i riferimenti negli oggetti dovendo poi riassegnarli.</w:t>
       </w:r>
     </w:p>
     <w:p>
@@ -23615,6 +23613,7 @@
   </w:compat>
   <w:rsids>
     <w:rsidRoot w:val="00BE72BC"/>
+    <w:rsid w:val="00037477"/>
     <w:rsid w:val="00045F3C"/>
     <w:rsid w:val="00083E28"/>
     <w:rsid w:val="000B54FB"/>
@@ -23627,6 +23626,7 @@
     <w:rsid w:val="00396FDF"/>
     <w:rsid w:val="003B3A61"/>
     <w:rsid w:val="003C64D2"/>
+    <w:rsid w:val="00403615"/>
     <w:rsid w:val="004335A8"/>
     <w:rsid w:val="00434CC7"/>
     <w:rsid w:val="004834F6"/>
@@ -23638,6 +23638,7 @@
     <w:rsid w:val="00715227"/>
     <w:rsid w:val="00727854"/>
     <w:rsid w:val="007312C2"/>
+    <w:rsid w:val="00753720"/>
     <w:rsid w:val="00754A35"/>
     <w:rsid w:val="00786637"/>
     <w:rsid w:val="007F4556"/>
@@ -23649,6 +23650,7 @@
     <w:rsid w:val="00924F9E"/>
     <w:rsid w:val="009826E2"/>
     <w:rsid w:val="009A56C6"/>
+    <w:rsid w:val="009D6A55"/>
     <w:rsid w:val="00A04D62"/>
     <w:rsid w:val="00A27299"/>
     <w:rsid w:val="00A629CF"/>
@@ -23670,6 +23672,7 @@
     <w:rsid w:val="00DE4EBE"/>
     <w:rsid w:val="00DF3FD5"/>
     <w:rsid w:val="00DF4754"/>
+    <w:rsid w:val="00E067A9"/>
     <w:rsid w:val="00E97CF5"/>
     <w:rsid w:val="00ED4879"/>
     <w:rsid w:val="00EE3640"/>

</xml_diff>

<commit_message>
installazione sqlite, inizio sviluppo db e diario
</commit_message>
<xml_diff>
--- a/4_Diari/Diario.docx
+++ b/4_Diari/Diario.docx
@@ -17732,12 +17732,26 @@
     </w:p>
     <w:p>
       <w:pPr>
+        <w:rPr>
+          <w:rFonts w:ascii="Arial" w:hAnsi="Arial" w:cs="Arial"/>
+        </w:rPr>
+      </w:pPr>
+      <w:r>
+        <w:rPr>
+          <w:rFonts w:ascii="Arial" w:hAnsi="Arial" w:cs="Arial"/>
+        </w:rPr>
+        <w:br w:type="page"/>
+      </w:r>
+    </w:p>
+    <w:p>
+      <w:pPr>
         <w:pStyle w:val="Titolo2"/>
         <w:pBdr>
           <w:bottom w:val="single" w:sz="4" w:space="1" w:color="auto"/>
         </w:pBdr>
       </w:pPr>
       <w:r>
+        <w:lastRenderedPageBreak/>
         <w:t>Utilizzo Intelligenza Artificiale</w:t>
       </w:r>
       <w:r>
@@ -18512,6 +18526,1612 @@
           <w:rFonts w:ascii="Arial" w:hAnsi="Arial" w:cs="Arial"/>
         </w:rPr>
         <w:t>Fatto qualche ricerca online, e probabilmente creato un nuovo file e copiato il contenuto ed eliminato l’originale, questo però avrebbe eliminato i riferimenti negli oggetti dovendo poi riassegnarli.</w:t>
+      </w:r>
+    </w:p>
+    <w:p>
+      <w:pPr>
+        <w:pStyle w:val="Nessunaspaziatura"/>
+        <w:rPr>
+          <w:rFonts w:ascii="Arial" w:hAnsi="Arial" w:cs="Arial"/>
+        </w:rPr>
+      </w:pPr>
+      <w:r>
+        <w:rPr>
+          <w:rFonts w:ascii="Arial" w:hAnsi="Arial" w:cs="Arial"/>
+        </w:rPr>
+        <w:t xml:space="preserve">Bryan: </w:t>
+      </w:r>
+    </w:p>
+    <w:p>
+      <w:pPr>
+        <w:rPr>
+          <w:rFonts w:ascii="Arial" w:hAnsi="Arial" w:cs="Arial"/>
+        </w:rPr>
+      </w:pPr>
+      <w:r>
+        <w:rPr>
+          <w:rFonts w:ascii="Arial" w:hAnsi="Arial" w:cs="Arial"/>
+        </w:rPr>
+        <w:br w:type="page"/>
+      </w:r>
+    </w:p>
+    <w:tbl>
+      <w:tblPr>
+        <w:tblStyle w:val="Grigliatabella"/>
+        <w:tblW w:w="5000" w:type="pct"/>
+        <w:tblLook w:val="04A0" w:firstRow="1" w:lastRow="0" w:firstColumn="1" w:lastColumn="0" w:noHBand="0" w:noVBand="1"/>
+      </w:tblPr>
+      <w:tblGrid>
+        <w:gridCol w:w="2407"/>
+        <w:gridCol w:w="7221"/>
+      </w:tblGrid>
+      <w:tr>
+        <w:trPr>
+          <w:trHeight w:val="199"/>
+        </w:trPr>
+        <w:tc>
+          <w:tcPr>
+            <w:tcW w:w="1250" w:type="pct"/>
+            <w:vAlign w:val="center"/>
+          </w:tcPr>
+          <w:p>
+            <w:pPr>
+              <w:rPr>
+                <w:rFonts w:ascii="Arial" w:hAnsi="Arial" w:cs="Arial"/>
+              </w:rPr>
+            </w:pPr>
+            <w:r>
+              <w:rPr>
+                <w:rFonts w:ascii="Arial" w:hAnsi="Arial" w:cs="Arial"/>
+              </w:rPr>
+              <w:lastRenderedPageBreak/>
+              <w:t>Luogo</w:t>
+            </w:r>
+          </w:p>
+        </w:tc>
+        <w:tc>
+          <w:tcPr>
+            <w:tcW w:w="3750" w:type="pct"/>
+            <w:vAlign w:val="center"/>
+          </w:tcPr>
+          <w:p>
+            <w:pPr>
+              <w:rPr>
+                <w:rFonts w:ascii="Arial" w:hAnsi="Arial" w:cs="Arial"/>
+              </w:rPr>
+            </w:pPr>
+            <w:r>
+              <w:rPr>
+                <w:rFonts w:ascii="Arial" w:hAnsi="Arial" w:cs="Arial"/>
+              </w:rPr>
+              <w:t>Scuola Arti e Mestieri Trevano</w:t>
+            </w:r>
+          </w:p>
+        </w:tc>
+      </w:tr>
+      <w:tr>
+        <w:trPr>
+          <w:trHeight w:val="196"/>
+        </w:trPr>
+        <w:tc>
+          <w:tcPr>
+            <w:tcW w:w="1250" w:type="pct"/>
+            <w:vAlign w:val="center"/>
+          </w:tcPr>
+          <w:p>
+            <w:pPr>
+              <w:rPr>
+                <w:rFonts w:ascii="Arial" w:hAnsi="Arial" w:cs="Arial"/>
+              </w:rPr>
+            </w:pPr>
+            <w:r>
+              <w:rPr>
+                <w:rFonts w:ascii="Arial" w:hAnsi="Arial" w:cs="Arial"/>
+              </w:rPr>
+              <w:t>Data</w:t>
+            </w:r>
+          </w:p>
+        </w:tc>
+        <w:tc>
+          <w:tcPr>
+            <w:tcW w:w="3750" w:type="pct"/>
+            <w:vAlign w:val="center"/>
+          </w:tcPr>
+          <w:p>
+            <w:pPr>
+              <w:rPr>
+                <w:rFonts w:ascii="Arial" w:hAnsi="Arial" w:cs="Arial"/>
+              </w:rPr>
+            </w:pPr>
+            <w:r>
+              <w:rPr>
+                <w:rFonts w:ascii="Arial" w:hAnsi="Arial" w:cs="Arial"/>
+              </w:rPr>
+              <w:t>30</w:t>
+            </w:r>
+            <w:r>
+              <w:rPr>
+                <w:rFonts w:ascii="Arial" w:hAnsi="Arial" w:cs="Arial"/>
+              </w:rPr>
+              <w:t>.09.2026</w:t>
+            </w:r>
+          </w:p>
+        </w:tc>
+      </w:tr>
+    </w:tbl>
+    <w:p>
+      <w:pPr>
+        <w:rPr>
+          <w:rFonts w:ascii="Arial" w:hAnsi="Arial" w:cs="Arial"/>
+        </w:rPr>
+      </w:pPr>
+    </w:p>
+    <w:tbl>
+      <w:tblPr>
+        <w:tblStyle w:val="Grigliatabella"/>
+        <w:tblW w:w="0" w:type="auto"/>
+        <w:tblLook w:val="04A0" w:firstRow="1" w:lastRow="0" w:firstColumn="1" w:lastColumn="0" w:noHBand="0" w:noVBand="1"/>
+      </w:tblPr>
+      <w:tblGrid>
+        <w:gridCol w:w="1271"/>
+        <w:gridCol w:w="8357"/>
+      </w:tblGrid>
+      <w:tr>
+        <w:tc>
+          <w:tcPr>
+            <w:tcW w:w="9628" w:type="dxa"/>
+            <w:gridSpan w:val="2"/>
+            <w:shd w:val="clear" w:color="auto" w:fill="D9D9D9" w:themeFill="background1" w:themeFillShade="D9"/>
+          </w:tcPr>
+          <w:p>
+            <w:pPr>
+              <w:rPr>
+                <w:rFonts w:ascii="Arial" w:hAnsi="Arial" w:cs="Arial"/>
+              </w:rPr>
+            </w:pPr>
+            <w:r>
+              <w:rPr>
+                <w:rFonts w:ascii="Arial" w:hAnsi="Arial" w:cs="Arial"/>
+              </w:rPr>
+              <w:t>Lavori svolti</w:t>
+            </w:r>
+          </w:p>
+        </w:tc>
+      </w:tr>
+      <w:tr>
+        <w:tc>
+          <w:tcPr>
+            <w:tcW w:w="1271" w:type="dxa"/>
+          </w:tcPr>
+          <w:p>
+            <w:pPr>
+              <w:rPr>
+                <w:rFonts w:ascii="Arial" w:hAnsi="Arial" w:cs="Arial"/>
+              </w:rPr>
+            </w:pPr>
+            <w:r>
+              <w:rPr>
+                <w:rFonts w:ascii="Arial" w:hAnsi="Arial" w:cs="Arial"/>
+              </w:rPr>
+              <w:t>Riley</w:t>
+            </w:r>
+          </w:p>
+        </w:tc>
+        <w:tc>
+          <w:tcPr>
+            <w:tcW w:w="8357" w:type="dxa"/>
+          </w:tcPr>
+          <w:p>
+            <w:pPr>
+              <w:rPr>
+                <w:rFonts w:ascii="Arial" w:hAnsi="Arial" w:cs="Arial"/>
+              </w:rPr>
+            </w:pPr>
+            <w:r>
+              <w:rPr>
+                <w:rFonts w:ascii="Arial" w:hAnsi="Arial" w:cs="Arial"/>
+              </w:rPr>
+              <w:t>Inizio sviluppo db sqlite</w:t>
+            </w:r>
+          </w:p>
+        </w:tc>
+      </w:tr>
+      <w:tr>
+        <w:tc>
+          <w:tcPr>
+            <w:tcW w:w="1271" w:type="dxa"/>
+          </w:tcPr>
+          <w:p>
+            <w:pPr>
+              <w:rPr>
+                <w:rFonts w:ascii="Arial" w:hAnsi="Arial" w:cs="Arial"/>
+              </w:rPr>
+            </w:pPr>
+            <w:r>
+              <w:rPr>
+                <w:rFonts w:ascii="Arial" w:hAnsi="Arial" w:cs="Arial"/>
+              </w:rPr>
+              <w:t>Bryan</w:t>
+            </w:r>
+          </w:p>
+        </w:tc>
+        <w:tc>
+          <w:tcPr>
+            <w:tcW w:w="8357" w:type="dxa"/>
+          </w:tcPr>
+          <w:p>
+            <w:pPr>
+              <w:rPr>
+                <w:rFonts w:ascii="Arial" w:hAnsi="Arial" w:cs="Arial"/>
+              </w:rPr>
+            </w:pPr>
+            <w:r>
+              <w:rPr>
+                <w:rFonts w:ascii="Arial" w:hAnsi="Arial" w:cs="Arial"/>
+              </w:rPr>
+              <w:t>Continuo sviluppo mappa</w:t>
+            </w:r>
+          </w:p>
+        </w:tc>
+      </w:tr>
+    </w:tbl>
+    <w:p>
+      <w:pPr>
+        <w:rPr>
+          <w:rFonts w:ascii="Arial" w:hAnsi="Arial" w:cs="Arial"/>
+        </w:rPr>
+      </w:pPr>
+    </w:p>
+    <w:tbl>
+      <w:tblPr>
+        <w:tblStyle w:val="Grigliatabella"/>
+        <w:tblW w:w="0" w:type="auto"/>
+        <w:tblInd w:w="-5" w:type="dxa"/>
+        <w:tblLook w:val="04A0" w:firstRow="1" w:lastRow="0" w:firstColumn="1" w:lastColumn="0" w:noHBand="0" w:noVBand="1"/>
+      </w:tblPr>
+      <w:tblGrid>
+        <w:gridCol w:w="1276"/>
+        <w:gridCol w:w="8357"/>
+      </w:tblGrid>
+      <w:tr>
+        <w:tc>
+          <w:tcPr>
+            <w:tcW w:w="9628" w:type="dxa"/>
+            <w:gridSpan w:val="2"/>
+            <w:shd w:val="clear" w:color="auto" w:fill="D9D9D9" w:themeFill="background1" w:themeFillShade="D9"/>
+          </w:tcPr>
+          <w:p>
+            <w:pPr>
+              <w:rPr>
+                <w:rFonts w:ascii="Arial" w:hAnsi="Arial" w:cs="Arial"/>
+              </w:rPr>
+            </w:pPr>
+            <w:r>
+              <w:rPr>
+                <w:rFonts w:ascii="Arial" w:hAnsi="Arial" w:cs="Arial"/>
+              </w:rPr>
+              <w:t>Problemi riscontrati e soluzioni adottate</w:t>
+            </w:r>
+          </w:p>
+        </w:tc>
+      </w:tr>
+      <w:tr>
+        <w:tc>
+          <w:tcPr>
+            <w:tcW w:w="1276" w:type="dxa"/>
+          </w:tcPr>
+          <w:p>
+            <w:pPr>
+              <w:rPr>
+                <w:rFonts w:ascii="Arial" w:hAnsi="Arial" w:cs="Arial"/>
+              </w:rPr>
+            </w:pPr>
+            <w:r>
+              <w:rPr>
+                <w:rFonts w:ascii="Arial" w:hAnsi="Arial" w:cs="Arial"/>
+              </w:rPr>
+              <w:t>Riley</w:t>
+            </w:r>
+          </w:p>
+        </w:tc>
+        <w:tc>
+          <w:tcPr>
+            <w:tcW w:w="8357" w:type="dxa"/>
+          </w:tcPr>
+          <w:p>
+            <w:pPr>
+              <w:rPr>
+                <w:rFonts w:ascii="Arial" w:hAnsi="Arial" w:cs="Arial"/>
+              </w:rPr>
+            </w:pPr>
+            <w:r>
+              <w:rPr>
+                <w:rFonts w:ascii="Arial" w:hAnsi="Arial" w:cs="Arial"/>
+              </w:rPr>
+              <w:t>-</w:t>
+            </w:r>
+          </w:p>
+        </w:tc>
+      </w:tr>
+      <w:tr>
+        <w:tc>
+          <w:tcPr>
+            <w:tcW w:w="1276" w:type="dxa"/>
+          </w:tcPr>
+          <w:p>
+            <w:pPr>
+              <w:rPr>
+                <w:rFonts w:ascii="Arial" w:hAnsi="Arial" w:cs="Arial"/>
+              </w:rPr>
+            </w:pPr>
+            <w:r>
+              <w:rPr>
+                <w:rFonts w:ascii="Arial" w:hAnsi="Arial" w:cs="Arial"/>
+              </w:rPr>
+              <w:t>Bryan</w:t>
+            </w:r>
+          </w:p>
+        </w:tc>
+        <w:tc>
+          <w:tcPr>
+            <w:tcW w:w="8357" w:type="dxa"/>
+          </w:tcPr>
+          <w:p>
+            <w:pPr>
+              <w:rPr>
+                <w:rFonts w:ascii="Arial" w:hAnsi="Arial" w:cs="Arial"/>
+              </w:rPr>
+            </w:pPr>
+            <w:r>
+              <w:rPr>
+                <w:rFonts w:ascii="Arial" w:hAnsi="Arial" w:cs="Arial"/>
+              </w:rPr>
+              <w:t>-</w:t>
+            </w:r>
+          </w:p>
+        </w:tc>
+      </w:tr>
+    </w:tbl>
+    <w:p>
+      <w:pPr>
+        <w:rPr>
+          <w:rFonts w:ascii="Arial" w:hAnsi="Arial" w:cs="Arial"/>
+        </w:rPr>
+      </w:pPr>
+    </w:p>
+    <w:tbl>
+      <w:tblPr>
+        <w:tblStyle w:val="Grigliatabella"/>
+        <w:tblW w:w="0" w:type="auto"/>
+        <w:tblLook w:val="04A0" w:firstRow="1" w:lastRow="0" w:firstColumn="1" w:lastColumn="0" w:noHBand="0" w:noVBand="1"/>
+      </w:tblPr>
+      <w:tblGrid>
+        <w:gridCol w:w="9628"/>
+      </w:tblGrid>
+      <w:tr>
+        <w:tc>
+          <w:tcPr>
+            <w:tcW w:w="9854" w:type="dxa"/>
+            <w:shd w:val="clear" w:color="auto" w:fill="D9D9D9" w:themeFill="background1" w:themeFillShade="D9"/>
+          </w:tcPr>
+          <w:p>
+            <w:pPr>
+              <w:rPr>
+                <w:rFonts w:ascii="Arial" w:hAnsi="Arial" w:cs="Arial"/>
+              </w:rPr>
+            </w:pPr>
+            <w:r>
+              <w:rPr>
+                <w:rFonts w:ascii="Arial" w:hAnsi="Arial" w:cs="Arial"/>
+              </w:rPr>
+              <w:t>Punto della situazione rispetto alla pianificazione</w:t>
+            </w:r>
+          </w:p>
+        </w:tc>
+      </w:tr>
+      <w:tr>
+        <w:tc>
+          <w:tcPr>
+            <w:tcW w:w="9854" w:type="dxa"/>
+          </w:tcPr>
+          <w:p>
+            <w:pPr>
+              <w:rPr>
+                <w:rFonts w:ascii="Arial" w:hAnsi="Arial" w:cs="Arial"/>
+              </w:rPr>
+            </w:pPr>
+            <w:r>
+              <w:rPr>
+                <w:rFonts w:ascii="Arial" w:hAnsi="Arial" w:cs="Arial"/>
+              </w:rPr>
+              <w:t>Siamo in largo anticipo, per questo motivo Riley ha cominciato a creare un vero db</w:t>
+            </w:r>
+          </w:p>
+        </w:tc>
+      </w:tr>
+    </w:tbl>
+    <w:p>
+      <w:pPr>
+        <w:rPr>
+          <w:rFonts w:ascii="Arial" w:hAnsi="Arial" w:cs="Arial"/>
+        </w:rPr>
+      </w:pPr>
+    </w:p>
+    <w:tbl>
+      <w:tblPr>
+        <w:tblStyle w:val="Grigliatabella"/>
+        <w:tblW w:w="0" w:type="auto"/>
+        <w:tblLook w:val="04A0" w:firstRow="1" w:lastRow="0" w:firstColumn="1" w:lastColumn="0" w:noHBand="0" w:noVBand="1"/>
+      </w:tblPr>
+      <w:tblGrid>
+        <w:gridCol w:w="9628"/>
+      </w:tblGrid>
+      <w:tr>
+        <w:tc>
+          <w:tcPr>
+            <w:tcW w:w="9854" w:type="dxa"/>
+            <w:shd w:val="clear" w:color="auto" w:fill="D9D9D9" w:themeFill="background1" w:themeFillShade="D9"/>
+          </w:tcPr>
+          <w:p>
+            <w:pPr>
+              <w:rPr>
+                <w:rFonts w:ascii="Arial" w:hAnsi="Arial" w:cs="Arial"/>
+              </w:rPr>
+            </w:pPr>
+            <w:r>
+              <w:rPr>
+                <w:rFonts w:ascii="Arial" w:hAnsi="Arial" w:cs="Arial"/>
+              </w:rPr>
+              <w:t>Programma di massima per la prossima giornata di lavoro</w:t>
+            </w:r>
+          </w:p>
+        </w:tc>
+      </w:tr>
+      <w:tr>
+        <w:tc>
+          <w:tcPr>
+            <w:tcW w:w="9854" w:type="dxa"/>
+          </w:tcPr>
+          <w:p>
+            <w:pPr>
+              <w:rPr>
+                <w:rFonts w:ascii="Arial" w:hAnsi="Arial" w:cs="Arial"/>
+              </w:rPr>
+            </w:pPr>
+            <w:r>
+              <w:rPr>
+                <w:rFonts w:ascii="Arial" w:hAnsi="Arial" w:cs="Arial"/>
+              </w:rPr>
+              <w:t>Continuare rispettivamente lo sviluppo del db e della mappa</w:t>
+            </w:r>
+          </w:p>
+        </w:tc>
+      </w:tr>
+    </w:tbl>
+    <w:p>
+      <w:pPr>
+        <w:rPr>
+          <w:rFonts w:ascii="Arial" w:hAnsi="Arial" w:cs="Arial"/>
+        </w:rPr>
+      </w:pPr>
+    </w:p>
+    <w:p>
+      <w:pPr>
+        <w:pStyle w:val="Titolo1"/>
+      </w:pPr>
+      <w:r>
+        <w:t>Agile - Resoconto</w:t>
+      </w:r>
+    </w:p>
+    <w:tbl>
+      <w:tblPr>
+        <w:tblStyle w:val="Grigliatabella"/>
+        <w:tblW w:w="0" w:type="auto"/>
+        <w:tblLook w:val="04A0" w:firstRow="1" w:lastRow="0" w:firstColumn="1" w:lastColumn="0" w:noHBand="0" w:noVBand="1"/>
+      </w:tblPr>
+      <w:tblGrid>
+        <w:gridCol w:w="9628"/>
+      </w:tblGrid>
+      <w:tr>
+        <w:tc>
+          <w:tcPr>
+            <w:tcW w:w="9628" w:type="dxa"/>
+            <w:tcBorders>
+              <w:top w:val="single" w:sz="4" w:space="0" w:color="auto"/>
+              <w:left w:val="single" w:sz="4" w:space="0" w:color="auto"/>
+              <w:bottom w:val="single" w:sz="4" w:space="0" w:color="auto"/>
+              <w:right w:val="single" w:sz="4" w:space="0" w:color="auto"/>
+            </w:tcBorders>
+            <w:shd w:val="clear" w:color="auto" w:fill="D9D9D9" w:themeFill="background1" w:themeFillShade="D9"/>
+            <w:hideMark/>
+          </w:tcPr>
+          <w:p>
+            <w:pPr>
+              <w:spacing w:after="200" w:line="276" w:lineRule="auto"/>
+              <w:rPr>
+                <w:rFonts w:ascii="Arial" w:hAnsi="Arial" w:cs="Arial"/>
+              </w:rPr>
+            </w:pPr>
+            <w:r>
+              <w:rPr>
+                <w:rFonts w:ascii="Arial" w:hAnsi="Arial" w:cs="Arial"/>
+              </w:rPr>
+              <w:t>Daily Scrum</w:t>
+            </w:r>
+          </w:p>
+        </w:tc>
+      </w:tr>
+      <w:tr>
+        <w:tc>
+          <w:tcPr>
+            <w:tcW w:w="9628" w:type="dxa"/>
+            <w:tcBorders>
+              <w:top w:val="single" w:sz="4" w:space="0" w:color="auto"/>
+              <w:left w:val="single" w:sz="4" w:space="0" w:color="auto"/>
+              <w:bottom w:val="single" w:sz="4" w:space="0" w:color="auto"/>
+              <w:right w:val="single" w:sz="4" w:space="0" w:color="auto"/>
+            </w:tcBorders>
+            <w:hideMark/>
+          </w:tcPr>
+          <w:p>
+            <w:pPr>
+              <w:spacing w:after="200" w:line="276" w:lineRule="auto"/>
+              <w:rPr>
+                <w:rFonts w:ascii="Arial" w:hAnsi="Arial" w:cs="Arial"/>
+              </w:rPr>
+            </w:pPr>
+          </w:p>
+        </w:tc>
+      </w:tr>
+      <w:tr>
+        <w:tc>
+          <w:tcPr>
+            <w:tcW w:w="9628" w:type="dxa"/>
+            <w:tcBorders>
+              <w:top w:val="single" w:sz="4" w:space="0" w:color="auto"/>
+              <w:left w:val="single" w:sz="4" w:space="0" w:color="auto"/>
+              <w:bottom w:val="single" w:sz="4" w:space="0" w:color="auto"/>
+              <w:right w:val="single" w:sz="4" w:space="0" w:color="auto"/>
+            </w:tcBorders>
+          </w:tcPr>
+          <w:p>
+            <w:pPr>
+              <w:spacing w:after="200" w:line="276" w:lineRule="auto"/>
+              <w:rPr>
+                <w:rFonts w:ascii="Arial" w:hAnsi="Arial" w:cs="Arial"/>
+              </w:rPr>
+            </w:pPr>
+            <w:r>
+              <w:rPr>
+                <w:rFonts w:ascii="Arial" w:hAnsi="Arial" w:cs="Arial"/>
+              </w:rPr>
+              <w:t xml:space="preserve">Riley: </w:t>
+            </w:r>
+            <w:r>
+              <w:rPr>
+                <w:rFonts w:ascii="Arial" w:hAnsi="Arial" w:cs="Arial"/>
+              </w:rPr>
+              <w:t>Inizio sviluppo db</w:t>
+            </w:r>
+          </w:p>
+          <w:p>
+            <w:pPr>
+              <w:spacing w:after="200" w:line="276" w:lineRule="auto"/>
+              <w:rPr>
+                <w:rFonts w:ascii="Arial" w:hAnsi="Arial" w:cs="Arial"/>
+              </w:rPr>
+            </w:pPr>
+            <w:r>
+              <w:rPr>
+                <w:rFonts w:ascii="Arial" w:hAnsi="Arial" w:cs="Arial"/>
+              </w:rPr>
+              <w:t xml:space="preserve">Bryan: </w:t>
+            </w:r>
+            <w:r>
+              <w:rPr>
+                <w:rFonts w:ascii="Arial" w:hAnsi="Arial" w:cs="Arial"/>
+              </w:rPr>
+              <w:t>Continuo</w:t>
+            </w:r>
+            <w:r>
+              <w:rPr>
+                <w:rFonts w:ascii="Arial" w:hAnsi="Arial" w:cs="Arial"/>
+              </w:rPr>
+              <w:t xml:space="preserve"> sviluppo mappa</w:t>
+            </w:r>
+          </w:p>
+        </w:tc>
+      </w:tr>
+    </w:tbl>
+    <w:p>
+      <w:pPr>
+        <w:rPr>
+          <w:rFonts w:ascii="Arial" w:hAnsi="Arial" w:cs="Arial"/>
+        </w:rPr>
+      </w:pPr>
+    </w:p>
+    <w:tbl>
+      <w:tblPr>
+        <w:tblStyle w:val="Grigliatabella"/>
+        <w:tblW w:w="0" w:type="auto"/>
+        <w:tblLook w:val="04A0" w:firstRow="1" w:lastRow="0" w:firstColumn="1" w:lastColumn="0" w:noHBand="0" w:noVBand="1"/>
+      </w:tblPr>
+      <w:tblGrid>
+        <w:gridCol w:w="9628"/>
+      </w:tblGrid>
+      <w:tr>
+        <w:tc>
+          <w:tcPr>
+            <w:tcW w:w="9854" w:type="dxa"/>
+            <w:tcBorders>
+              <w:top w:val="single" w:sz="4" w:space="0" w:color="auto"/>
+              <w:left w:val="single" w:sz="4" w:space="0" w:color="auto"/>
+              <w:bottom w:val="single" w:sz="4" w:space="0" w:color="auto"/>
+              <w:right w:val="single" w:sz="4" w:space="0" w:color="auto"/>
+            </w:tcBorders>
+            <w:shd w:val="clear" w:color="auto" w:fill="D9D9D9" w:themeFill="background1" w:themeFillShade="D9"/>
+            <w:hideMark/>
+          </w:tcPr>
+          <w:p>
+            <w:pPr>
+              <w:spacing w:after="200" w:line="276" w:lineRule="auto"/>
+              <w:rPr>
+                <w:rFonts w:ascii="Arial" w:hAnsi="Arial" w:cs="Arial"/>
+              </w:rPr>
+            </w:pPr>
+            <w:r>
+              <w:rPr>
+                <w:rFonts w:ascii="Arial" w:hAnsi="Arial" w:cs="Arial"/>
+              </w:rPr>
+              <w:t>Sprint Planning</w:t>
+            </w:r>
+          </w:p>
+        </w:tc>
+      </w:tr>
+      <w:tr>
+        <w:tc>
+          <w:tcPr>
+            <w:tcW w:w="9854" w:type="dxa"/>
+            <w:tcBorders>
+              <w:top w:val="single" w:sz="4" w:space="0" w:color="auto"/>
+              <w:left w:val="single" w:sz="4" w:space="0" w:color="auto"/>
+              <w:bottom w:val="single" w:sz="4" w:space="0" w:color="auto"/>
+              <w:right w:val="single" w:sz="4" w:space="0" w:color="auto"/>
+            </w:tcBorders>
+          </w:tcPr>
+          <w:p>
+            <w:pPr>
+              <w:spacing w:after="200" w:line="276" w:lineRule="auto"/>
+              <w:rPr>
+                <w:rFonts w:ascii="Arial" w:hAnsi="Arial" w:cs="Arial"/>
+              </w:rPr>
+            </w:pPr>
+          </w:p>
+        </w:tc>
+      </w:tr>
+    </w:tbl>
+    <w:p>
+      <w:pPr>
+        <w:rPr>
+          <w:rFonts w:ascii="Arial" w:hAnsi="Arial" w:cs="Arial"/>
+        </w:rPr>
+      </w:pPr>
+    </w:p>
+    <w:tbl>
+      <w:tblPr>
+        <w:tblStyle w:val="Grigliatabella"/>
+        <w:tblW w:w="0" w:type="auto"/>
+        <w:tblLook w:val="04A0" w:firstRow="1" w:lastRow="0" w:firstColumn="1" w:lastColumn="0" w:noHBand="0" w:noVBand="1"/>
+      </w:tblPr>
+      <w:tblGrid>
+        <w:gridCol w:w="9628"/>
+      </w:tblGrid>
+      <w:tr>
+        <w:tc>
+          <w:tcPr>
+            <w:tcW w:w="9854" w:type="dxa"/>
+            <w:tcBorders>
+              <w:top w:val="single" w:sz="4" w:space="0" w:color="auto"/>
+              <w:left w:val="single" w:sz="4" w:space="0" w:color="auto"/>
+              <w:bottom w:val="single" w:sz="4" w:space="0" w:color="auto"/>
+              <w:right w:val="single" w:sz="4" w:space="0" w:color="auto"/>
+            </w:tcBorders>
+            <w:shd w:val="clear" w:color="auto" w:fill="D9D9D9" w:themeFill="background1" w:themeFillShade="D9"/>
+            <w:hideMark/>
+          </w:tcPr>
+          <w:p>
+            <w:pPr>
+              <w:spacing w:after="200" w:line="276" w:lineRule="auto"/>
+              <w:rPr>
+                <w:rFonts w:ascii="Arial" w:hAnsi="Arial" w:cs="Arial"/>
+              </w:rPr>
+            </w:pPr>
+            <w:r>
+              <w:rPr>
+                <w:rFonts w:ascii="Arial" w:hAnsi="Arial" w:cs="Arial"/>
+              </w:rPr>
+              <w:t>Sprint Review</w:t>
+            </w:r>
+          </w:p>
+        </w:tc>
+      </w:tr>
+      <w:tr>
+        <w:tc>
+          <w:tcPr>
+            <w:tcW w:w="9854" w:type="dxa"/>
+            <w:tcBorders>
+              <w:top w:val="single" w:sz="4" w:space="0" w:color="auto"/>
+              <w:left w:val="single" w:sz="4" w:space="0" w:color="auto"/>
+              <w:bottom w:val="single" w:sz="4" w:space="0" w:color="auto"/>
+              <w:right w:val="single" w:sz="4" w:space="0" w:color="auto"/>
+            </w:tcBorders>
+          </w:tcPr>
+          <w:p>
+            <w:pPr>
+              <w:spacing w:after="200" w:line="276" w:lineRule="auto"/>
+              <w:rPr>
+                <w:rFonts w:ascii="Arial" w:hAnsi="Arial" w:cs="Arial"/>
+              </w:rPr>
+            </w:pPr>
+          </w:p>
+        </w:tc>
+      </w:tr>
+    </w:tbl>
+    <w:p>
+      <w:pPr>
+        <w:rPr>
+          <w:rFonts w:ascii="Arial" w:hAnsi="Arial" w:cs="Arial"/>
+        </w:rPr>
+      </w:pPr>
+    </w:p>
+    <w:tbl>
+      <w:tblPr>
+        <w:tblStyle w:val="Grigliatabella"/>
+        <w:tblW w:w="0" w:type="auto"/>
+        <w:tblLook w:val="04A0" w:firstRow="1" w:lastRow="0" w:firstColumn="1" w:lastColumn="0" w:noHBand="0" w:noVBand="1"/>
+      </w:tblPr>
+      <w:tblGrid>
+        <w:gridCol w:w="9628"/>
+      </w:tblGrid>
+      <w:tr>
+        <w:tc>
+          <w:tcPr>
+            <w:tcW w:w="9854" w:type="dxa"/>
+            <w:tcBorders>
+              <w:top w:val="single" w:sz="4" w:space="0" w:color="auto"/>
+              <w:left w:val="single" w:sz="4" w:space="0" w:color="auto"/>
+              <w:bottom w:val="single" w:sz="4" w:space="0" w:color="auto"/>
+              <w:right w:val="single" w:sz="4" w:space="0" w:color="auto"/>
+            </w:tcBorders>
+            <w:shd w:val="clear" w:color="auto" w:fill="D9D9D9" w:themeFill="background1" w:themeFillShade="D9"/>
+            <w:hideMark/>
+          </w:tcPr>
+          <w:p>
+            <w:pPr>
+              <w:spacing w:after="200" w:line="276" w:lineRule="auto"/>
+              <w:rPr>
+                <w:rFonts w:ascii="Arial" w:hAnsi="Arial" w:cs="Arial"/>
+              </w:rPr>
+            </w:pPr>
+            <w:r>
+              <w:rPr>
+                <w:rFonts w:ascii="Arial" w:hAnsi="Arial" w:cs="Arial"/>
+              </w:rPr>
+              <w:t>Sprint Retrospective</w:t>
+            </w:r>
+          </w:p>
+        </w:tc>
+      </w:tr>
+      <w:tr>
+        <w:tc>
+          <w:tcPr>
+            <w:tcW w:w="9854" w:type="dxa"/>
+            <w:tcBorders>
+              <w:top w:val="single" w:sz="4" w:space="0" w:color="auto"/>
+              <w:left w:val="single" w:sz="4" w:space="0" w:color="auto"/>
+              <w:bottom w:val="single" w:sz="4" w:space="0" w:color="auto"/>
+              <w:right w:val="single" w:sz="4" w:space="0" w:color="auto"/>
+            </w:tcBorders>
+          </w:tcPr>
+          <w:p>
+            <w:pPr>
+              <w:spacing w:after="200" w:line="276" w:lineRule="auto"/>
+              <w:rPr>
+                <w:rFonts w:ascii="Arial" w:hAnsi="Arial" w:cs="Arial"/>
+              </w:rPr>
+            </w:pPr>
+          </w:p>
+        </w:tc>
+      </w:tr>
+    </w:tbl>
+    <w:p>
+      <w:pPr>
+        <w:rPr>
+          <w:rFonts w:ascii="Arial" w:hAnsi="Arial" w:cs="Arial"/>
+        </w:rPr>
+      </w:pPr>
+    </w:p>
+    <w:p>
+      <w:pPr>
+        <w:rPr>
+          <w:rFonts w:ascii="Arial" w:hAnsi="Arial" w:cs="Arial"/>
+        </w:rPr>
+      </w:pPr>
+      <w:r>
+        <w:rPr>
+          <w:rFonts w:ascii="Arial" w:hAnsi="Arial" w:cs="Arial"/>
+        </w:rPr>
+        <w:br w:type="page"/>
+      </w:r>
+    </w:p>
+    <w:p>
+      <w:pPr>
+        <w:pStyle w:val="Titolo2"/>
+        <w:pBdr>
+          <w:bottom w:val="single" w:sz="4" w:space="1" w:color="auto"/>
+        </w:pBdr>
+      </w:pPr>
+      <w:r>
+        <w:lastRenderedPageBreak/>
+        <w:t>Utilizzo Intelligenza Artificiale</w:t>
+      </w:r>
+      <w:r>
+        <w:t xml:space="preserve"> nella giornata</w:t>
+      </w:r>
+    </w:p>
+    <w:p>
+      <w:pPr>
+        <w:pStyle w:val="Nessunaspaziatura"/>
+        <w:rPr>
+          <w:rFonts w:ascii="Arial" w:hAnsi="Arial" w:cs="Arial"/>
+          <w:b/>
+          <w:bCs/>
+        </w:rPr>
+      </w:pPr>
+    </w:p>
+    <w:p>
+      <w:pPr>
+        <w:pStyle w:val="Nessunaspaziatura"/>
+        <w:rPr>
+          <w:rFonts w:ascii="Arial" w:hAnsi="Arial" w:cs="Arial"/>
+        </w:rPr>
+      </w:pPr>
+      <w:sdt>
+        <w:sdtPr>
+          <w:rPr>
+            <w:rFonts w:ascii="Segoe UI Symbol" w:hAnsi="Segoe UI Symbol" w:cs="Segoe UI Symbol"/>
+          </w:rPr>
+          <w:id w:val="15900154"/>
+          <w14:checkbox>
+            <w14:checked w14:val="1"/>
+            <w14:checkedState w14:val="2612" w14:font="MS Gothic"/>
+            <w14:uncheckedState w14:val="2610" w14:font="MS Gothic"/>
+          </w14:checkbox>
+        </w:sdtPr>
+        <w:sdtContent>
+          <w:r>
+            <w:rPr>
+              <w:rFonts w:ascii="MS Gothic" w:eastAsia="MS Gothic" w:hAnsi="MS Gothic" w:cs="Segoe UI Symbol" w:hint="eastAsia"/>
+            </w:rPr>
+            <w:t>☒</w:t>
+          </w:r>
+        </w:sdtContent>
+      </w:sdt>
+      <w:r>
+        <w:rPr>
+          <w:rFonts w:ascii="Arial" w:hAnsi="Arial" w:cs="Arial"/>
+        </w:rPr>
+        <w:t xml:space="preserve"> Nessuno</w:t>
+      </w:r>
+      <w:r>
+        <w:br/>
+      </w:r>
+      <w:sdt>
+        <w:sdtPr>
+          <w:rPr>
+            <w:rFonts w:ascii="Segoe UI Symbol" w:hAnsi="Segoe UI Symbol" w:cs="Segoe UI Symbol"/>
+          </w:rPr>
+          <w:id w:val="-324210150"/>
+          <w14:checkbox>
+            <w14:checked w14:val="0"/>
+            <w14:checkedState w14:val="2612" w14:font="MS Gothic"/>
+            <w14:uncheckedState w14:val="2610" w14:font="MS Gothic"/>
+          </w14:checkbox>
+        </w:sdtPr>
+        <w:sdtContent>
+          <w:r>
+            <w:rPr>
+              <w:rFonts w:ascii="MS Gothic" w:eastAsia="MS Gothic" w:hAnsi="MS Gothic" w:cs="Segoe UI Symbol" w:hint="eastAsia"/>
+            </w:rPr>
+            <w:t>☐</w:t>
+          </w:r>
+        </w:sdtContent>
+      </w:sdt>
+      <w:r>
+        <w:rPr>
+          <w:rFonts w:ascii="Arial" w:hAnsi="Arial" w:cs="Arial"/>
+        </w:rPr>
+        <w:t xml:space="preserve"> Occasionale</w:t>
+      </w:r>
+      <w:r>
+        <w:br/>
+      </w:r>
+      <w:sdt>
+        <w:sdtPr>
+          <w:rPr>
+            <w:rFonts w:ascii="Segoe UI Symbol" w:hAnsi="Segoe UI Symbol" w:cs="Segoe UI Symbol"/>
+          </w:rPr>
+          <w:id w:val="1172451281"/>
+          <w14:checkbox>
+            <w14:checked w14:val="0"/>
+            <w14:checkedState w14:val="2612" w14:font="MS Gothic"/>
+            <w14:uncheckedState w14:val="2610" w14:font="MS Gothic"/>
+          </w14:checkbox>
+        </w:sdtPr>
+        <w:sdtContent>
+          <w:r>
+            <w:rPr>
+              <w:rFonts w:ascii="MS Gothic" w:eastAsia="MS Gothic" w:hAnsi="MS Gothic" w:cs="Segoe UI Symbol" w:hint="eastAsia"/>
+            </w:rPr>
+            <w:t>☐</w:t>
+          </w:r>
+        </w:sdtContent>
+      </w:sdt>
+      <w:r>
+        <w:rPr>
+          <w:rFonts w:ascii="Arial" w:hAnsi="Arial" w:cs="Arial"/>
+        </w:rPr>
+        <w:t xml:space="preserve"> Frequente</w:t>
+      </w:r>
+    </w:p>
+    <w:p>
+      <w:pPr>
+        <w:pStyle w:val="Nessunaspaziatura"/>
+        <w:rPr>
+          <w:rFonts w:ascii="Arial" w:hAnsi="Arial" w:cs="Arial"/>
+        </w:rPr>
+      </w:pPr>
+    </w:p>
+    <w:p>
+      <w:pPr>
+        <w:pStyle w:val="Nessunaspaziatura"/>
+        <w:spacing w:line="276" w:lineRule="auto"/>
+        <w:rPr>
+          <w:rFonts w:ascii="Arial" w:hAnsi="Arial" w:cs="Arial"/>
+        </w:rPr>
+      </w:pPr>
+      <w:r>
+        <w:rPr>
+          <w:rFonts w:ascii="Arial" w:hAnsi="Arial" w:cs="Arial"/>
+          <w:b/>
+          <w:bCs/>
+        </w:rPr>
+        <w:t>Strumento/i utilizzato/i</w:t>
+      </w:r>
+      <w:r>
+        <w:rPr>
+          <w:rFonts w:ascii="Arial" w:hAnsi="Arial" w:cs="Arial"/>
+          <w:b/>
+          <w:bCs/>
+        </w:rPr>
+        <w:t xml:space="preserve"> </w:t>
+      </w:r>
+      <w:r>
+        <w:rPr>
+          <w:rFonts w:ascii="Arial" w:hAnsi="Arial" w:cs="Arial"/>
+        </w:rPr>
+        <w:t>(es. ChatGPT)</w:t>
+      </w:r>
+      <w:r>
+        <w:rPr>
+          <w:rFonts w:ascii="Arial" w:hAnsi="Arial" w:cs="Arial"/>
+        </w:rPr>
+        <w:t xml:space="preserve">: </w:t>
+      </w:r>
+      <w:sdt>
+        <w:sdtPr>
+          <w:rPr>
+            <w:rFonts w:ascii="Arial" w:hAnsi="Arial" w:cs="Arial"/>
+          </w:rPr>
+          <w:id w:val="-982381076"/>
+          <w:placeholder>
+            <w:docPart w:val="57274DFD148B4EEAB4E1D2AE6BC8F5DD"/>
+          </w:placeholder>
+          <w:showingPlcHdr/>
+        </w:sdtPr>
+        <w:sdtContent>
+          <w:r>
+            <w:rPr>
+              <w:rStyle w:val="Testosegnaposto"/>
+              <w:b/>
+              <w:bCs/>
+            </w:rPr>
+            <w:t>Nomi AI utilizzati</w:t>
+          </w:r>
+        </w:sdtContent>
+      </w:sdt>
+    </w:p>
+    <w:p>
+      <w:pPr>
+        <w:pStyle w:val="Nessunaspaziatura"/>
+        <w:rPr>
+          <w:rFonts w:ascii="Arial" w:hAnsi="Arial" w:cs="Arial"/>
+        </w:rPr>
+      </w:pPr>
+    </w:p>
+    <w:p>
+      <w:pPr>
+        <w:pStyle w:val="Nessunaspaziatura"/>
+        <w:rPr>
+          <w:rFonts w:ascii="Arial" w:hAnsi="Arial" w:cs="Arial"/>
+        </w:rPr>
+      </w:pPr>
+      <w:r>
+        <w:rPr>
+          <w:rFonts w:ascii="Arial" w:hAnsi="Arial" w:cs="Arial"/>
+          <w:b/>
+          <w:bCs/>
+        </w:rPr>
+        <w:t>Per cosa l’ho usata oggi</w:t>
+      </w:r>
+      <w:r>
+        <w:br/>
+      </w:r>
+      <w:sdt>
+        <w:sdtPr>
+          <w:rPr>
+            <w:rFonts w:ascii="Segoe UI Symbol" w:hAnsi="Segoe UI Symbol" w:cs="Segoe UI Symbol"/>
+          </w:rPr>
+          <w:id w:val="1398392908"/>
+          <w14:checkbox>
+            <w14:checked w14:val="0"/>
+            <w14:checkedState w14:val="2612" w14:font="MS Gothic"/>
+            <w14:uncheckedState w14:val="2610" w14:font="MS Gothic"/>
+          </w14:checkbox>
+        </w:sdtPr>
+        <w:sdtContent>
+          <w:r>
+            <w:rPr>
+              <w:rFonts w:ascii="MS Gothic" w:eastAsia="MS Gothic" w:hAnsi="MS Gothic" w:cs="Segoe UI Symbol" w:hint="eastAsia"/>
+            </w:rPr>
+            <w:t>☐</w:t>
+          </w:r>
+        </w:sdtContent>
+      </w:sdt>
+      <w:r>
+        <w:rPr>
+          <w:rFonts w:ascii="Arial" w:hAnsi="Arial" w:cs="Arial"/>
+        </w:rPr>
+        <w:t xml:space="preserve"> Chiarire concetti</w:t>
+      </w:r>
+      <w:r>
+        <w:br/>
+      </w:r>
+      <w:sdt>
+        <w:sdtPr>
+          <w:rPr>
+            <w:rFonts w:ascii="Segoe UI Symbol" w:hAnsi="Segoe UI Symbol" w:cs="Segoe UI Symbol"/>
+          </w:rPr>
+          <w:id w:val="1940871832"/>
+          <w14:checkbox>
+            <w14:checked w14:val="0"/>
+            <w14:checkedState w14:val="2612" w14:font="MS Gothic"/>
+            <w14:uncheckedState w14:val="2610" w14:font="MS Gothic"/>
+          </w14:checkbox>
+        </w:sdtPr>
+        <w:sdtContent>
+          <w:r>
+            <w:rPr>
+              <w:rFonts w:ascii="MS Gothic" w:eastAsia="MS Gothic" w:hAnsi="MS Gothic" w:cs="Segoe UI Symbol" w:hint="eastAsia"/>
+            </w:rPr>
+            <w:t>☐</w:t>
+          </w:r>
+        </w:sdtContent>
+      </w:sdt>
+      <w:r>
+        <w:rPr>
+          <w:rFonts w:ascii="Arial" w:hAnsi="Arial" w:cs="Arial"/>
+        </w:rPr>
+        <w:t xml:space="preserve"> Supporto al codice</w:t>
+      </w:r>
+      <w:r>
+        <w:br/>
+      </w:r>
+      <w:sdt>
+        <w:sdtPr>
+          <w:rPr>
+            <w:rFonts w:ascii="Segoe UI Symbol" w:hAnsi="Segoe UI Symbol" w:cs="Segoe UI Symbol"/>
+          </w:rPr>
+          <w:id w:val="-902059876"/>
+          <w14:checkbox>
+            <w14:checked w14:val="0"/>
+            <w14:checkedState w14:val="2612" w14:font="MS Gothic"/>
+            <w14:uncheckedState w14:val="2610" w14:font="MS Gothic"/>
+          </w14:checkbox>
+        </w:sdtPr>
+        <w:sdtContent>
+          <w:r>
+            <w:rPr>
+              <w:rFonts w:ascii="MS Gothic" w:eastAsia="MS Gothic" w:hAnsi="MS Gothic" w:cs="Segoe UI Symbol" w:hint="eastAsia"/>
+            </w:rPr>
+            <w:t>☐</w:t>
+          </w:r>
+        </w:sdtContent>
+      </w:sdt>
+      <w:r>
+        <w:rPr>
+          <w:rFonts w:ascii="Arial" w:hAnsi="Arial" w:cs="Arial"/>
+        </w:rPr>
+        <w:t xml:space="preserve"> Debug</w:t>
+      </w:r>
+      <w:r>
+        <w:br/>
+      </w:r>
+      <w:sdt>
+        <w:sdtPr>
+          <w:rPr>
+            <w:rFonts w:ascii="Segoe UI Symbol" w:hAnsi="Segoe UI Symbol" w:cs="Segoe UI Symbol"/>
+          </w:rPr>
+          <w:id w:val="-649126349"/>
+          <w14:checkbox>
+            <w14:checked w14:val="0"/>
+            <w14:checkedState w14:val="2612" w14:font="MS Gothic"/>
+            <w14:uncheckedState w14:val="2610" w14:font="MS Gothic"/>
+          </w14:checkbox>
+        </w:sdtPr>
+        <w:sdtContent>
+          <w:r>
+            <w:rPr>
+              <w:rFonts w:ascii="MS Gothic" w:eastAsia="MS Gothic" w:hAnsi="MS Gothic" w:cs="Segoe UI Symbol" w:hint="eastAsia"/>
+            </w:rPr>
+            <w:t>☐</w:t>
+          </w:r>
+        </w:sdtContent>
+      </w:sdt>
+      <w:r>
+        <w:rPr>
+          <w:rFonts w:ascii="Arial" w:hAnsi="Arial" w:cs="Arial"/>
+        </w:rPr>
+        <w:t xml:space="preserve"> Riorganizzare idee / testi</w:t>
+      </w:r>
+      <w:r>
+        <w:br/>
+      </w:r>
+      <w:sdt>
+        <w:sdtPr>
+          <w:rPr>
+            <w:rFonts w:ascii="Segoe UI Symbol" w:hAnsi="Segoe UI Symbol" w:cs="Segoe UI Symbol"/>
+          </w:rPr>
+          <w:id w:val="-922566212"/>
+          <w14:checkbox>
+            <w14:checked w14:val="0"/>
+            <w14:checkedState w14:val="2612" w14:font="MS Gothic"/>
+            <w14:uncheckedState w14:val="2610" w14:font="MS Gothic"/>
+          </w14:checkbox>
+        </w:sdtPr>
+        <w:sdtContent>
+          <w:r>
+            <w:rPr>
+              <w:rFonts w:ascii="MS Gothic" w:eastAsia="MS Gothic" w:hAnsi="MS Gothic" w:cs="Segoe UI Symbol" w:hint="eastAsia"/>
+            </w:rPr>
+            <w:t>☐</w:t>
+          </w:r>
+        </w:sdtContent>
+      </w:sdt>
+      <w:r>
+        <w:rPr>
+          <w:rFonts w:ascii="Arial" w:hAnsi="Arial" w:cs="Arial"/>
+        </w:rPr>
+        <w:t xml:space="preserve"> Altro: …</w:t>
+      </w:r>
+    </w:p>
+    <w:p>
+      <w:pPr>
+        <w:pStyle w:val="Nessunaspaziatura"/>
+        <w:rPr>
+          <w:rFonts w:ascii="Arial" w:hAnsi="Arial" w:cs="Arial"/>
+        </w:rPr>
+      </w:pPr>
+    </w:p>
+    <w:p>
+      <w:pPr>
+        <w:pStyle w:val="Nessunaspaziatura"/>
+        <w:rPr>
+          <w:rFonts w:ascii="Arial" w:hAnsi="Arial" w:cs="Arial"/>
+          <w:b/>
+          <w:bCs/>
+        </w:rPr>
+      </w:pPr>
+      <w:r>
+        <w:rPr>
+          <w:rFonts w:ascii="Arial" w:hAnsi="Arial" w:cs="Arial"/>
+          <w:b/>
+          <w:bCs/>
+        </w:rPr>
+        <w:t>Esempio significativo di utilizzo (UNO SOLO)</w:t>
+      </w:r>
+    </w:p>
+    <w:p>
+      <w:pPr>
+        <w:pStyle w:val="Nessunaspaziatura"/>
+        <w:rPr>
+          <w:rFonts w:ascii="Arial" w:hAnsi="Arial" w:cs="Arial"/>
+        </w:rPr>
+      </w:pPr>
+      <w:r>
+        <w:rPr>
+          <w:rFonts w:ascii="Arial" w:hAnsi="Arial" w:cs="Arial"/>
+        </w:rPr>
+        <w:t xml:space="preserve">Riporta </w:t>
+      </w:r>
+      <w:r>
+        <w:rPr>
+          <w:rFonts w:ascii="Arial" w:hAnsi="Arial" w:cs="Arial"/>
+          <w:i/>
+          <w:iCs/>
+        </w:rPr>
+        <w:t>un</w:t>
+      </w:r>
+      <w:r>
+        <w:rPr>
+          <w:rFonts w:ascii="Arial" w:hAnsi="Arial" w:cs="Arial"/>
+        </w:rPr>
+        <w:t xml:space="preserve"> prompt rilevante oppure descrivilo a parole se ce ne sono stati molti.</w:t>
+      </w:r>
+    </w:p>
+    <w:p>
+      <w:pPr>
+        <w:pStyle w:val="Nessunaspaziatura"/>
+        <w:rPr>
+          <w:rFonts w:ascii="Arial" w:hAnsi="Arial" w:cs="Arial"/>
+        </w:rPr>
+      </w:pPr>
+    </w:p>
+    <w:sdt>
+      <w:sdtPr>
+        <w:rPr>
+          <w:rFonts w:ascii="Arial" w:hAnsi="Arial" w:cs="Arial"/>
+        </w:rPr>
+        <w:alias w:val="Prompt AI"/>
+        <w:tag w:val="Prompt AI"/>
+        <w:id w:val="-1282034032"/>
+        <w:placeholder>
+          <w:docPart w:val="9104837C0B4940A5B6ED76ADD8B0E510"/>
+        </w:placeholder>
+        <w15:color w:val="C0C0C0"/>
+      </w:sdtPr>
+      <w:sdtContent>
+        <w:p>
+          <w:pPr>
+            <w:pStyle w:val="Nessunaspaziatura"/>
+            <w:rPr>
+              <w:rFonts w:ascii="Arial" w:hAnsi="Arial" w:cs="Arial"/>
+            </w:rPr>
+          </w:pPr>
+          <w:r>
+            <w:rPr>
+              <w:rFonts w:ascii="Arial" w:hAnsi="Arial" w:cs="Arial"/>
+            </w:rPr>
+            <w:t>Riley:</w:t>
+          </w:r>
+          <w:r>
+            <w:rPr>
+              <w:rFonts w:ascii="Arial" w:hAnsi="Arial" w:cs="Arial"/>
+            </w:rPr>
+            <w:t xml:space="preserve"> </w:t>
+          </w:r>
+        </w:p>
+        <w:p>
+          <w:pPr>
+            <w:pStyle w:val="Nessunaspaziatura"/>
+            <w:spacing w:line="276" w:lineRule="auto"/>
+            <w:rPr>
+              <w:rFonts w:ascii="Arial" w:hAnsi="Arial" w:cs="Arial"/>
+            </w:rPr>
+          </w:pPr>
+          <w:r>
+            <w:rPr>
+              <w:rFonts w:ascii="Arial" w:hAnsi="Arial" w:cs="Arial"/>
+            </w:rPr>
+            <w:t xml:space="preserve">Bryan: </w:t>
+          </w:r>
+        </w:p>
+      </w:sdtContent>
+    </w:sdt>
+    <w:p>
+      <w:pPr>
+        <w:pStyle w:val="Nessunaspaziatura"/>
+        <w:rPr>
+          <w:rFonts w:ascii="Arial" w:hAnsi="Arial" w:cs="Arial"/>
+        </w:rPr>
+      </w:pPr>
+    </w:p>
+    <w:p>
+      <w:pPr>
+        <w:pStyle w:val="Nessunaspaziatura"/>
+        <w:rPr>
+          <w:rFonts w:ascii="Arial" w:hAnsi="Arial" w:cs="Arial"/>
+        </w:rPr>
+      </w:pPr>
+      <w:r>
+        <w:rPr>
+          <w:rFonts w:ascii="Arial" w:hAnsi="Arial" w:cs="Arial"/>
+          <w:b/>
+          <w:bCs/>
+        </w:rPr>
+        <w:t>Cosa mi ha dato l’AI</w:t>
+      </w:r>
+    </w:p>
+    <w:p>
+      <w:pPr>
+        <w:pStyle w:val="Nessunaspaziatura"/>
+        <w:rPr>
+          <w:rFonts w:ascii="Arial" w:hAnsi="Arial" w:cs="Arial"/>
+        </w:rPr>
+      </w:pPr>
+      <w:r>
+        <w:rPr>
+          <w:rFonts w:ascii="Arial" w:hAnsi="Arial" w:cs="Arial"/>
+        </w:rPr>
+        <w:t>Spiegazione, esempio, soluzione, suggerimento…</w:t>
+      </w:r>
+    </w:p>
+    <w:p>
+      <w:pPr>
+        <w:pStyle w:val="Nessunaspaziatura"/>
+        <w:rPr>
+          <w:rFonts w:ascii="Arial" w:hAnsi="Arial" w:cs="Arial"/>
+        </w:rPr>
+      </w:pPr>
+    </w:p>
+    <w:sdt>
+      <w:sdtPr>
+        <w:rPr>
+          <w:rFonts w:ascii="Arial" w:hAnsi="Arial" w:cs="Arial"/>
+        </w:rPr>
+        <w:alias w:val="Risposta AI"/>
+        <w:tag w:val="Risposta AI"/>
+        <w:id w:val="553285343"/>
+        <w:placeholder>
+          <w:docPart w:val="64F37972D28244C28D86E1FC202C7FFA"/>
+        </w:placeholder>
+        <w15:color w:val="C0C0C0"/>
+      </w:sdtPr>
+      <w:sdtContent>
+        <w:p>
+          <w:pPr>
+            <w:pStyle w:val="Nessunaspaziatura"/>
+            <w:spacing w:line="276" w:lineRule="auto"/>
+            <w:rPr>
+              <w:rFonts w:ascii="Arial" w:hAnsi="Arial" w:cs="Arial"/>
+            </w:rPr>
+          </w:pPr>
+          <w:r>
+            <w:rPr>
+              <w:rFonts w:ascii="Arial" w:hAnsi="Arial" w:cs="Arial"/>
+            </w:rPr>
+            <w:t xml:space="preserve">Riley: </w:t>
+          </w:r>
+        </w:p>
+        <w:p>
+          <w:pPr>
+            <w:pStyle w:val="Nessunaspaziatura"/>
+            <w:spacing w:line="276" w:lineRule="auto"/>
+            <w:rPr>
+              <w:rFonts w:ascii="Arial" w:hAnsi="Arial" w:cs="Arial"/>
+            </w:rPr>
+          </w:pPr>
+          <w:r>
+            <w:rPr>
+              <w:rFonts w:ascii="Arial" w:hAnsi="Arial" w:cs="Arial"/>
+            </w:rPr>
+            <w:t>Bryan:</w:t>
+          </w:r>
+        </w:p>
+      </w:sdtContent>
+    </w:sdt>
+    <w:p>
+      <w:pPr>
+        <w:pStyle w:val="Nessunaspaziatura"/>
+        <w:rPr>
+          <w:rFonts w:ascii="Arial" w:hAnsi="Arial" w:cs="Arial"/>
+          <w:b/>
+          <w:bCs/>
+        </w:rPr>
+      </w:pPr>
+    </w:p>
+    <w:p>
+      <w:pPr>
+        <w:pStyle w:val="Nessunaspaziatura"/>
+        <w:rPr>
+          <w:rFonts w:ascii="Arial" w:hAnsi="Arial" w:cs="Arial"/>
+        </w:rPr>
+      </w:pPr>
+      <w:r>
+        <w:rPr>
+          <w:rFonts w:ascii="Arial" w:hAnsi="Arial" w:cs="Arial"/>
+          <w:b/>
+          <w:bCs/>
+        </w:rPr>
+        <w:t>Come l’ho usato io</w:t>
+      </w:r>
+      <w:r>
+        <w:rPr>
+          <w:rFonts w:ascii="Arial" w:hAnsi="Arial" w:cs="Arial"/>
+        </w:rPr>
+        <w:br/>
+      </w:r>
+      <w:sdt>
+        <w:sdtPr>
+          <w:rPr>
+            <w:rFonts w:ascii="Segoe UI Symbol" w:hAnsi="Segoe UI Symbol" w:cs="Segoe UI Symbol"/>
+          </w:rPr>
+          <w:id w:val="-1566329973"/>
+          <w14:checkbox>
+            <w14:checked w14:val="0"/>
+            <w14:checkedState w14:val="2612" w14:font="MS Gothic"/>
+            <w14:uncheckedState w14:val="2610" w14:font="MS Gothic"/>
+          </w14:checkbox>
+        </w:sdtPr>
+        <w:sdtContent>
+          <w:r>
+            <w:rPr>
+              <w:rFonts w:ascii="MS Gothic" w:eastAsia="MS Gothic" w:hAnsi="MS Gothic" w:cs="Segoe UI Symbol" w:hint="eastAsia"/>
+            </w:rPr>
+            <w:t>☐</w:t>
+          </w:r>
+        </w:sdtContent>
+      </w:sdt>
+      <w:r>
+        <w:rPr>
+          <w:rFonts w:ascii="Arial" w:hAnsi="Arial" w:cs="Arial"/>
+        </w:rPr>
+        <w:t xml:space="preserve"> Copiato</w:t>
+      </w:r>
+      <w:r>
+        <w:rPr>
+          <w:rFonts w:ascii="Arial" w:hAnsi="Arial" w:cs="Arial"/>
+        </w:rPr>
+        <w:br/>
+      </w:r>
+      <w:sdt>
+        <w:sdtPr>
+          <w:rPr>
+            <w:rFonts w:ascii="Segoe UI Symbol" w:hAnsi="Segoe UI Symbol" w:cs="Segoe UI Symbol"/>
+          </w:rPr>
+          <w:id w:val="993225148"/>
+          <w14:checkbox>
+            <w14:checked w14:val="0"/>
+            <w14:checkedState w14:val="2612" w14:font="MS Gothic"/>
+            <w14:uncheckedState w14:val="2610" w14:font="MS Gothic"/>
+          </w14:checkbox>
+        </w:sdtPr>
+        <w:sdtContent>
+          <w:r>
+            <w:rPr>
+              <w:rFonts w:ascii="MS Gothic" w:eastAsia="MS Gothic" w:hAnsi="MS Gothic" w:cs="Segoe UI Symbol" w:hint="eastAsia"/>
+            </w:rPr>
+            <w:t>☐</w:t>
+          </w:r>
+        </w:sdtContent>
+      </w:sdt>
+      <w:r>
+        <w:rPr>
+          <w:rFonts w:ascii="Arial" w:hAnsi="Arial" w:cs="Arial"/>
+        </w:rPr>
+        <w:t xml:space="preserve"> Adattato</w:t>
+      </w:r>
+      <w:r>
+        <w:rPr>
+          <w:rFonts w:ascii="Arial" w:hAnsi="Arial" w:cs="Arial"/>
+        </w:rPr>
+        <w:br/>
+      </w:r>
+      <w:sdt>
+        <w:sdtPr>
+          <w:rPr>
+            <w:rFonts w:ascii="Segoe UI Symbol" w:hAnsi="Segoe UI Symbol" w:cs="Segoe UI Symbol"/>
+          </w:rPr>
+          <w:id w:val="-1424109397"/>
+          <w14:checkbox>
+            <w14:checked w14:val="0"/>
+            <w14:checkedState w14:val="2612" w14:font="MS Gothic"/>
+            <w14:uncheckedState w14:val="2610" w14:font="MS Gothic"/>
+          </w14:checkbox>
+        </w:sdtPr>
+        <w:sdtContent>
+          <w:r>
+            <w:rPr>
+              <w:rFonts w:ascii="MS Gothic" w:eastAsia="MS Gothic" w:hAnsi="MS Gothic" w:cs="Segoe UI Symbol" w:hint="eastAsia"/>
+            </w:rPr>
+            <w:t>☐</w:t>
+          </w:r>
+        </w:sdtContent>
+      </w:sdt>
+      <w:r>
+        <w:rPr>
+          <w:rFonts w:ascii="Arial" w:hAnsi="Arial" w:cs="Arial"/>
+        </w:rPr>
+        <w:t xml:space="preserve"> Usato solo per capire</w:t>
+      </w:r>
+      <w:r>
+        <w:rPr>
+          <w:rFonts w:ascii="Arial" w:hAnsi="Arial" w:cs="Arial"/>
+        </w:rPr>
+        <w:br/>
+      </w:r>
+      <w:sdt>
+        <w:sdtPr>
+          <w:rPr>
+            <w:rFonts w:ascii="Segoe UI Symbol" w:hAnsi="Segoe UI Symbol" w:cs="Segoe UI Symbol"/>
+          </w:rPr>
+          <w:id w:val="-1695455405"/>
+          <w14:checkbox>
+            <w14:checked w14:val="0"/>
+            <w14:checkedState w14:val="2612" w14:font="MS Gothic"/>
+            <w14:uncheckedState w14:val="2610" w14:font="MS Gothic"/>
+          </w14:checkbox>
+        </w:sdtPr>
+        <w:sdtContent>
+          <w:r>
+            <w:rPr>
+              <w:rFonts w:ascii="MS Gothic" w:eastAsia="MS Gothic" w:hAnsi="MS Gothic" w:cs="Segoe UI Symbol" w:hint="eastAsia"/>
+            </w:rPr>
+            <w:t>☐</w:t>
+          </w:r>
+        </w:sdtContent>
+      </w:sdt>
+      <w:r>
+        <w:rPr>
+          <w:rFonts w:ascii="Arial" w:hAnsi="Arial" w:cs="Arial"/>
+        </w:rPr>
+        <w:t xml:space="preserve"> Scartato</w:t>
+      </w:r>
+    </w:p>
+    <w:p>
+      <w:pPr>
+        <w:pStyle w:val="Nessunaspaziatura"/>
+        <w:rPr>
+          <w:rFonts w:ascii="Arial" w:hAnsi="Arial" w:cs="Arial"/>
+        </w:rPr>
+      </w:pPr>
+    </w:p>
+    <w:p>
+      <w:pPr>
+        <w:pStyle w:val="Nessunaspaziatura"/>
+        <w:rPr>
+          <w:rFonts w:ascii="Arial" w:hAnsi="Arial" w:cs="Arial"/>
+        </w:rPr>
+      </w:pPr>
+    </w:p>
+    <w:p>
+      <w:pPr>
+        <w:pStyle w:val="Nessunaspaziatura"/>
+        <w:rPr>
+          <w:rFonts w:ascii="Arial" w:hAnsi="Arial" w:cs="Arial"/>
+        </w:rPr>
+      </w:pPr>
+      <w:r>
+        <w:rPr>
+          <w:rFonts w:ascii="Arial" w:hAnsi="Arial" w:cs="Arial"/>
+          <w:b/>
+          <w:bCs/>
+        </w:rPr>
+        <w:t>Cosa avrei fatto senza AI?</w:t>
+      </w:r>
+    </w:p>
+    <w:p>
+      <w:pPr>
+        <w:pStyle w:val="Nessunaspaziatura"/>
+        <w:rPr>
+          <w:rFonts w:ascii="Arial" w:hAnsi="Arial" w:cs="Arial"/>
+        </w:rPr>
+      </w:pPr>
+      <w:r>
+        <w:rPr>
+          <w:rFonts w:ascii="Arial" w:hAnsi="Arial" w:cs="Arial"/>
+        </w:rPr>
+        <w:t xml:space="preserve">Riley: </w:t>
       </w:r>
     </w:p>
     <w:p>
@@ -23483,6 +25103,107 @@
         </w:p>
       </w:docPartBody>
     </w:docPart>
+    <w:docPart>
+      <w:docPartPr>
+        <w:name w:val="57274DFD148B4EEAB4E1D2AE6BC8F5DD"/>
+        <w:category>
+          <w:name w:val="Generale"/>
+          <w:gallery w:val="placeholder"/>
+        </w:category>
+        <w:types>
+          <w:type w:val="bbPlcHdr"/>
+        </w:types>
+        <w:behaviors>
+          <w:behavior w:val="content"/>
+        </w:behaviors>
+        <w:guid w:val="{582896F5-04FC-49E3-A245-E13EBAB8D4F2}"/>
+      </w:docPartPr>
+      <w:docPartBody>
+        <w:p>
+          <w:pPr>
+            <w:pStyle w:val="57274DFD148B4EEAB4E1D2AE6BC8F5DD"/>
+          </w:pPr>
+          <w:r>
+            <w:rPr>
+              <w:rStyle w:val="Testosegnaposto"/>
+              <w:b/>
+              <w:bCs/>
+            </w:rPr>
+            <w:t>Nomi AI utilizzati</w:t>
+          </w:r>
+        </w:p>
+      </w:docPartBody>
+    </w:docPart>
+    <w:docPart>
+      <w:docPartPr>
+        <w:name w:val="9104837C0B4940A5B6ED76ADD8B0E510"/>
+        <w:category>
+          <w:name w:val="Generale"/>
+          <w:gallery w:val="placeholder"/>
+        </w:category>
+        <w:types>
+          <w:type w:val="bbPlcHdr"/>
+        </w:types>
+        <w:behaviors>
+          <w:behavior w:val="content"/>
+        </w:behaviors>
+        <w:guid w:val="{C4D45BDE-8A2F-459D-8626-31AE30CC16C9}"/>
+      </w:docPartPr>
+      <w:docPartBody>
+        <w:p>
+          <w:pPr>
+            <w:pStyle w:val="9104837C0B4940A5B6ED76ADD8B0E510"/>
+          </w:pPr>
+          <w:r>
+            <w:rPr>
+              <w:rStyle w:val="Testosegnaposto"/>
+            </w:rPr>
+            <w:t>Fare clic o toccare qui per immettere il testo.</w:t>
+          </w:r>
+        </w:p>
+      </w:docPartBody>
+    </w:docPart>
+    <w:docPart>
+      <w:docPartPr>
+        <w:name w:val="64F37972D28244C28D86E1FC202C7FFA"/>
+        <w:category>
+          <w:name w:val="Generale"/>
+          <w:gallery w:val="placeholder"/>
+        </w:category>
+        <w:types>
+          <w:type w:val="bbPlcHdr"/>
+        </w:types>
+        <w:behaviors>
+          <w:behavior w:val="content"/>
+        </w:behaviors>
+        <w:guid w:val="{EDDC21C3-C863-4862-B311-118D4C42EBA0}"/>
+      </w:docPartPr>
+      <w:docPartBody>
+        <w:p>
+          <w:pPr>
+            <w:pStyle w:val="64F37972D28244C28D86E1FC202C7FFA"/>
+          </w:pPr>
+          <w:r>
+            <w:rPr>
+              <w:rStyle w:val="Testosegnaposto"/>
+            </w:rPr>
+            <w:t xml:space="preserve">Fare clic o toccare qui per </w:t>
+          </w:r>
+          <w:r>
+            <w:rPr>
+              <w:rStyle w:val="Testosegnaposto"/>
+            </w:rPr>
+            <w:t>immettere</w:t>
+          </w:r>
+          <w:r>
+            <w:rPr>
+              <w:rStyle w:val="Testosegnaposto"/>
+            </w:rPr>
+            <w:t xml:space="preserve"> il testo.</w:t>
+          </w:r>
+        </w:p>
+      </w:docPartBody>
+    </w:docPart>
   </w:docParts>
 </w:glossaryDocument>
 </file>
@@ -23641,7 +25362,9 @@
     <w:rsid w:val="00753720"/>
     <w:rsid w:val="00754A35"/>
     <w:rsid w:val="00786637"/>
+    <w:rsid w:val="007B0D32"/>
     <w:rsid w:val="007F4556"/>
+    <w:rsid w:val="007F539F"/>
     <w:rsid w:val="0080736A"/>
     <w:rsid w:val="00832BBC"/>
     <w:rsid w:val="008736ED"/>
@@ -23662,6 +25385,7 @@
     <w:rsid w:val="00BD3686"/>
     <w:rsid w:val="00BD5007"/>
     <w:rsid w:val="00BE72BC"/>
+    <w:rsid w:val="00C60D7D"/>
     <w:rsid w:val="00D0757F"/>
     <w:rsid w:val="00D53511"/>
     <w:rsid w:val="00D86101"/>
@@ -24138,7 +25862,7 @@
     <w:basedOn w:val="Carpredefinitoparagrafo"/>
     <w:uiPriority w:val="99"/>
     <w:semiHidden/>
-    <w:rsid w:val="003C64D2"/>
+    <w:rsid w:val="00C60D7D"/>
     <w:rPr>
       <w:color w:val="666666"/>
     </w:rPr>
@@ -24343,6 +26067,18 @@
   <w:style w:type="paragraph" w:customStyle="1" w:styleId="37B60A0CBB654C6A874CE4D497BD4DCD">
     <w:name w:val="37B60A0CBB654C6A874CE4D497BD4DCD"/>
     <w:rsid w:val="003C64D2"/>
+  </w:style>
+  <w:style w:type="paragraph" w:customStyle="1" w:styleId="57274DFD148B4EEAB4E1D2AE6BC8F5DD">
+    <w:name w:val="57274DFD148B4EEAB4E1D2AE6BC8F5DD"/>
+    <w:rsid w:val="00C60D7D"/>
+  </w:style>
+  <w:style w:type="paragraph" w:customStyle="1" w:styleId="9104837C0B4940A5B6ED76ADD8B0E510">
+    <w:name w:val="9104837C0B4940A5B6ED76ADD8B0E510"/>
+    <w:rsid w:val="00C60D7D"/>
+  </w:style>
+  <w:style w:type="paragraph" w:customStyle="1" w:styleId="64F37972D28244C28D86E1FC202C7FFA">
+    <w:name w:val="64F37972D28244C28D86E1FC202C7FFA"/>
+    <w:rsid w:val="00C60D7D"/>
   </w:style>
 </w:styles>
 </file>

</xml_diff>

<commit_message>
continuo creazione db, modifica sprint planning e diario
</commit_message>
<xml_diff>
--- a/4_Diari/Diario.docx
+++ b/4_Diari/Diario.docx
@@ -18647,13 +18647,7 @@
               <w:rPr>
                 <w:rFonts w:ascii="Arial" w:hAnsi="Arial" w:cs="Arial"/>
               </w:rPr>
-              <w:t>30</w:t>
-            </w:r>
-            <w:r>
-              <w:rPr>
-                <w:rFonts w:ascii="Arial" w:hAnsi="Arial" w:cs="Arial"/>
-              </w:rPr>
-              <w:t>.09.2026</w:t>
+              <w:t>30.09.2026</w:t>
             </w:r>
           </w:p>
         </w:tc>
@@ -19105,13 +19099,7 @@
               <w:rPr>
                 <w:rFonts w:ascii="Arial" w:hAnsi="Arial" w:cs="Arial"/>
               </w:rPr>
-              <w:t xml:space="preserve">Riley: </w:t>
-            </w:r>
-            <w:r>
-              <w:rPr>
-                <w:rFonts w:ascii="Arial" w:hAnsi="Arial" w:cs="Arial"/>
-              </w:rPr>
-              <w:t>Inizio sviluppo db</w:t>
+              <w:t>Riley: Inizio sviluppo db</w:t>
             </w:r>
           </w:p>
           <w:p>
@@ -19125,19 +19113,7 @@
               <w:rPr>
                 <w:rFonts w:ascii="Arial" w:hAnsi="Arial" w:cs="Arial"/>
               </w:rPr>
-              <w:t xml:space="preserve">Bryan: </w:t>
-            </w:r>
-            <w:r>
-              <w:rPr>
-                <w:rFonts w:ascii="Arial" w:hAnsi="Arial" w:cs="Arial"/>
-              </w:rPr>
-              <w:t>Continuo</w:t>
-            </w:r>
-            <w:r>
-              <w:rPr>
-                <w:rFonts w:ascii="Arial" w:hAnsi="Arial" w:cs="Arial"/>
-              </w:rPr>
-              <w:t xml:space="preserve"> sviluppo mappa</w:t>
+              <w:t>Bryan: Continuo sviluppo mappa</w:t>
             </w:r>
           </w:p>
         </w:tc>
@@ -20146,6 +20122,1663 @@
           <w:rFonts w:ascii="Arial" w:hAnsi="Arial" w:cs="Arial"/>
         </w:rPr>
         <w:t xml:space="preserve">Bryan: </w:t>
+      </w:r>
+    </w:p>
+    <w:p>
+      <w:pPr>
+        <w:rPr>
+          <w:rFonts w:ascii="Arial" w:hAnsi="Arial" w:cs="Arial"/>
+        </w:rPr>
+      </w:pPr>
+      <w:r>
+        <w:rPr>
+          <w:rFonts w:ascii="Arial" w:hAnsi="Arial" w:cs="Arial"/>
+        </w:rPr>
+        <w:br w:type="page"/>
+      </w:r>
+    </w:p>
+    <w:tbl>
+      <w:tblPr>
+        <w:tblStyle w:val="Grigliatabella"/>
+        <w:tblW w:w="5000" w:type="pct"/>
+        <w:tblLook w:val="04A0" w:firstRow="1" w:lastRow="0" w:firstColumn="1" w:lastColumn="0" w:noHBand="0" w:noVBand="1"/>
+      </w:tblPr>
+      <w:tblGrid>
+        <w:gridCol w:w="2407"/>
+        <w:gridCol w:w="7221"/>
+      </w:tblGrid>
+      <w:tr>
+        <w:trPr>
+          <w:trHeight w:val="199"/>
+        </w:trPr>
+        <w:tc>
+          <w:tcPr>
+            <w:tcW w:w="1250" w:type="pct"/>
+            <w:vAlign w:val="center"/>
+          </w:tcPr>
+          <w:p>
+            <w:pPr>
+              <w:rPr>
+                <w:rFonts w:ascii="Arial" w:hAnsi="Arial" w:cs="Arial"/>
+              </w:rPr>
+            </w:pPr>
+            <w:r>
+              <w:rPr>
+                <w:rFonts w:ascii="Arial" w:hAnsi="Arial" w:cs="Arial"/>
+              </w:rPr>
+              <w:lastRenderedPageBreak/>
+              <w:t>Luogo</w:t>
+            </w:r>
+          </w:p>
+        </w:tc>
+        <w:tc>
+          <w:tcPr>
+            <w:tcW w:w="3750" w:type="pct"/>
+            <w:vAlign w:val="center"/>
+          </w:tcPr>
+          <w:p>
+            <w:pPr>
+              <w:rPr>
+                <w:rFonts w:ascii="Arial" w:hAnsi="Arial" w:cs="Arial"/>
+              </w:rPr>
+            </w:pPr>
+            <w:r>
+              <w:rPr>
+                <w:rFonts w:ascii="Arial" w:hAnsi="Arial" w:cs="Arial"/>
+              </w:rPr>
+              <w:t>Scuola Arti e Mestieri Trevano</w:t>
+            </w:r>
+          </w:p>
+        </w:tc>
+      </w:tr>
+      <w:tr>
+        <w:trPr>
+          <w:trHeight w:val="196"/>
+        </w:trPr>
+        <w:tc>
+          <w:tcPr>
+            <w:tcW w:w="1250" w:type="pct"/>
+            <w:vAlign w:val="center"/>
+          </w:tcPr>
+          <w:p>
+            <w:pPr>
+              <w:rPr>
+                <w:rFonts w:ascii="Arial" w:hAnsi="Arial" w:cs="Arial"/>
+              </w:rPr>
+            </w:pPr>
+            <w:r>
+              <w:rPr>
+                <w:rFonts w:ascii="Arial" w:hAnsi="Arial" w:cs="Arial"/>
+              </w:rPr>
+              <w:t>Data</w:t>
+            </w:r>
+          </w:p>
+        </w:tc>
+        <w:tc>
+          <w:tcPr>
+            <w:tcW w:w="3750" w:type="pct"/>
+            <w:vAlign w:val="center"/>
+          </w:tcPr>
+          <w:p>
+            <w:pPr>
+              <w:rPr>
+                <w:rFonts w:ascii="Arial" w:hAnsi="Arial" w:cs="Arial"/>
+              </w:rPr>
+            </w:pPr>
+            <w:r>
+              <w:rPr>
+                <w:rFonts w:ascii="Arial" w:hAnsi="Arial" w:cs="Arial"/>
+              </w:rPr>
+              <w:t>5</w:t>
+            </w:r>
+            <w:r>
+              <w:rPr>
+                <w:rFonts w:ascii="Arial" w:hAnsi="Arial" w:cs="Arial"/>
+              </w:rPr>
+              <w:t>.</w:t>
+            </w:r>
+            <w:r>
+              <w:rPr>
+                <w:rFonts w:ascii="Arial" w:hAnsi="Arial" w:cs="Arial"/>
+              </w:rPr>
+              <w:t>10</w:t>
+            </w:r>
+            <w:r>
+              <w:rPr>
+                <w:rFonts w:ascii="Arial" w:hAnsi="Arial" w:cs="Arial"/>
+              </w:rPr>
+              <w:t>.2026</w:t>
+            </w:r>
+          </w:p>
+        </w:tc>
+      </w:tr>
+    </w:tbl>
+    <w:p>
+      <w:pPr>
+        <w:rPr>
+          <w:rFonts w:ascii="Arial" w:hAnsi="Arial" w:cs="Arial"/>
+        </w:rPr>
+      </w:pPr>
+    </w:p>
+    <w:tbl>
+      <w:tblPr>
+        <w:tblStyle w:val="Grigliatabella"/>
+        <w:tblW w:w="0" w:type="auto"/>
+        <w:tblLook w:val="04A0" w:firstRow="1" w:lastRow="0" w:firstColumn="1" w:lastColumn="0" w:noHBand="0" w:noVBand="1"/>
+      </w:tblPr>
+      <w:tblGrid>
+        <w:gridCol w:w="1271"/>
+        <w:gridCol w:w="8357"/>
+      </w:tblGrid>
+      <w:tr>
+        <w:tc>
+          <w:tcPr>
+            <w:tcW w:w="9628" w:type="dxa"/>
+            <w:gridSpan w:val="2"/>
+            <w:shd w:val="clear" w:color="auto" w:fill="D9D9D9" w:themeFill="background1" w:themeFillShade="D9"/>
+          </w:tcPr>
+          <w:p>
+            <w:pPr>
+              <w:rPr>
+                <w:rFonts w:ascii="Arial" w:hAnsi="Arial" w:cs="Arial"/>
+              </w:rPr>
+            </w:pPr>
+            <w:r>
+              <w:rPr>
+                <w:rFonts w:ascii="Arial" w:hAnsi="Arial" w:cs="Arial"/>
+              </w:rPr>
+              <w:t>Lavori svolti</w:t>
+            </w:r>
+          </w:p>
+        </w:tc>
+      </w:tr>
+      <w:tr>
+        <w:tc>
+          <w:tcPr>
+            <w:tcW w:w="1271" w:type="dxa"/>
+          </w:tcPr>
+          <w:p>
+            <w:pPr>
+              <w:rPr>
+                <w:rFonts w:ascii="Arial" w:hAnsi="Arial" w:cs="Arial"/>
+              </w:rPr>
+            </w:pPr>
+            <w:r>
+              <w:rPr>
+                <w:rFonts w:ascii="Arial" w:hAnsi="Arial" w:cs="Arial"/>
+              </w:rPr>
+              <w:t>Riley</w:t>
+            </w:r>
+          </w:p>
+        </w:tc>
+        <w:tc>
+          <w:tcPr>
+            <w:tcW w:w="8357" w:type="dxa"/>
+          </w:tcPr>
+          <w:p>
+            <w:pPr>
+              <w:rPr>
+                <w:rFonts w:ascii="Arial" w:hAnsi="Arial" w:cs="Arial"/>
+              </w:rPr>
+            </w:pPr>
+            <w:r>
+              <w:rPr>
+                <w:rFonts w:ascii="Arial" w:hAnsi="Arial" w:cs="Arial"/>
+              </w:rPr>
+              <w:t>Continuo sviluppo DB</w:t>
+            </w:r>
+          </w:p>
+        </w:tc>
+      </w:tr>
+      <w:tr>
+        <w:tc>
+          <w:tcPr>
+            <w:tcW w:w="1271" w:type="dxa"/>
+          </w:tcPr>
+          <w:p>
+            <w:pPr>
+              <w:rPr>
+                <w:rFonts w:ascii="Arial" w:hAnsi="Arial" w:cs="Arial"/>
+              </w:rPr>
+            </w:pPr>
+            <w:r>
+              <w:rPr>
+                <w:rFonts w:ascii="Arial" w:hAnsi="Arial" w:cs="Arial"/>
+              </w:rPr>
+              <w:t>Bryan</w:t>
+            </w:r>
+          </w:p>
+        </w:tc>
+        <w:tc>
+          <w:tcPr>
+            <w:tcW w:w="8357" w:type="dxa"/>
+          </w:tcPr>
+          <w:p>
+            <w:pPr>
+              <w:rPr>
+                <w:rFonts w:ascii="Arial" w:hAnsi="Arial" w:cs="Arial"/>
+              </w:rPr>
+            </w:pPr>
+            <w:r>
+              <w:rPr>
+                <w:rFonts w:ascii="Arial" w:hAnsi="Arial" w:cs="Arial"/>
+              </w:rPr>
+              <w:t>Sviluppo Mappa completato, sviluppando cambiamenti tra menu con animazioni.</w:t>
+            </w:r>
+          </w:p>
+        </w:tc>
+      </w:tr>
+    </w:tbl>
+    <w:p>
+      <w:pPr>
+        <w:rPr>
+          <w:rFonts w:ascii="Arial" w:hAnsi="Arial" w:cs="Arial"/>
+        </w:rPr>
+      </w:pPr>
+    </w:p>
+    <w:tbl>
+      <w:tblPr>
+        <w:tblStyle w:val="Grigliatabella"/>
+        <w:tblW w:w="0" w:type="auto"/>
+        <w:tblInd w:w="-5" w:type="dxa"/>
+        <w:tblLook w:val="04A0" w:firstRow="1" w:lastRow="0" w:firstColumn="1" w:lastColumn="0" w:noHBand="0" w:noVBand="1"/>
+      </w:tblPr>
+      <w:tblGrid>
+        <w:gridCol w:w="1276"/>
+        <w:gridCol w:w="8357"/>
+      </w:tblGrid>
+      <w:tr>
+        <w:tc>
+          <w:tcPr>
+            <w:tcW w:w="9628" w:type="dxa"/>
+            <w:gridSpan w:val="2"/>
+            <w:shd w:val="clear" w:color="auto" w:fill="D9D9D9" w:themeFill="background1" w:themeFillShade="D9"/>
+          </w:tcPr>
+          <w:p>
+            <w:pPr>
+              <w:rPr>
+                <w:rFonts w:ascii="Arial" w:hAnsi="Arial" w:cs="Arial"/>
+              </w:rPr>
+            </w:pPr>
+            <w:r>
+              <w:rPr>
+                <w:rFonts w:ascii="Arial" w:hAnsi="Arial" w:cs="Arial"/>
+              </w:rPr>
+              <w:t>Problemi riscontrati e soluzioni adottate</w:t>
+            </w:r>
+          </w:p>
+        </w:tc>
+      </w:tr>
+      <w:tr>
+        <w:tc>
+          <w:tcPr>
+            <w:tcW w:w="1276" w:type="dxa"/>
+          </w:tcPr>
+          <w:p>
+            <w:pPr>
+              <w:rPr>
+                <w:rFonts w:ascii="Arial" w:hAnsi="Arial" w:cs="Arial"/>
+              </w:rPr>
+            </w:pPr>
+            <w:r>
+              <w:rPr>
+                <w:rFonts w:ascii="Arial" w:hAnsi="Arial" w:cs="Arial"/>
+              </w:rPr>
+              <w:t>Riley</w:t>
+            </w:r>
+          </w:p>
+        </w:tc>
+        <w:tc>
+          <w:tcPr>
+            <w:tcW w:w="8357" w:type="dxa"/>
+          </w:tcPr>
+          <w:p>
+            <w:pPr>
+              <w:rPr>
+                <w:rFonts w:ascii="Arial" w:hAnsi="Arial" w:cs="Arial"/>
+              </w:rPr>
+            </w:pPr>
+            <w:r>
+              <w:rPr>
+                <w:rFonts w:ascii="Arial" w:hAnsi="Arial" w:cs="Arial"/>
+              </w:rPr>
+              <w:t>-</w:t>
+            </w:r>
+          </w:p>
+        </w:tc>
+      </w:tr>
+      <w:tr>
+        <w:tc>
+          <w:tcPr>
+            <w:tcW w:w="1276" w:type="dxa"/>
+          </w:tcPr>
+          <w:p>
+            <w:pPr>
+              <w:rPr>
+                <w:rFonts w:ascii="Arial" w:hAnsi="Arial" w:cs="Arial"/>
+              </w:rPr>
+            </w:pPr>
+            <w:r>
+              <w:rPr>
+                <w:rFonts w:ascii="Arial" w:hAnsi="Arial" w:cs="Arial"/>
+              </w:rPr>
+              <w:t>Bryan</w:t>
+            </w:r>
+          </w:p>
+        </w:tc>
+        <w:tc>
+          <w:tcPr>
+            <w:tcW w:w="8357" w:type="dxa"/>
+          </w:tcPr>
+          <w:p>
+            <w:pPr>
+              <w:rPr>
+                <w:rFonts w:ascii="Arial" w:hAnsi="Arial" w:cs="Arial"/>
+              </w:rPr>
+            </w:pPr>
+            <w:r>
+              <w:rPr>
+                <w:rFonts w:ascii="Arial" w:hAnsi="Arial" w:cs="Arial"/>
+              </w:rPr>
+              <w:t>-</w:t>
+            </w:r>
+          </w:p>
+        </w:tc>
+      </w:tr>
+    </w:tbl>
+    <w:p>
+      <w:pPr>
+        <w:rPr>
+          <w:rFonts w:ascii="Arial" w:hAnsi="Arial" w:cs="Arial"/>
+        </w:rPr>
+      </w:pPr>
+    </w:p>
+    <w:tbl>
+      <w:tblPr>
+        <w:tblStyle w:val="Grigliatabella"/>
+        <w:tblW w:w="0" w:type="auto"/>
+        <w:tblLook w:val="04A0" w:firstRow="1" w:lastRow="0" w:firstColumn="1" w:lastColumn="0" w:noHBand="0" w:noVBand="1"/>
+      </w:tblPr>
+      <w:tblGrid>
+        <w:gridCol w:w="9628"/>
+      </w:tblGrid>
+      <w:tr>
+        <w:tc>
+          <w:tcPr>
+            <w:tcW w:w="9854" w:type="dxa"/>
+            <w:shd w:val="clear" w:color="auto" w:fill="D9D9D9" w:themeFill="background1" w:themeFillShade="D9"/>
+          </w:tcPr>
+          <w:p>
+            <w:pPr>
+              <w:rPr>
+                <w:rFonts w:ascii="Arial" w:hAnsi="Arial" w:cs="Arial"/>
+              </w:rPr>
+            </w:pPr>
+            <w:r>
+              <w:rPr>
+                <w:rFonts w:ascii="Arial" w:hAnsi="Arial" w:cs="Arial"/>
+              </w:rPr>
+              <w:t>Punto della situazione rispetto alla pianificazione</w:t>
+            </w:r>
+          </w:p>
+        </w:tc>
+      </w:tr>
+      <w:tr>
+        <w:tc>
+          <w:tcPr>
+            <w:tcW w:w="9854" w:type="dxa"/>
+          </w:tcPr>
+          <w:p>
+            <w:pPr>
+              <w:rPr>
+                <w:rFonts w:ascii="Arial" w:hAnsi="Arial" w:cs="Arial"/>
+              </w:rPr>
+            </w:pPr>
+            <w:r>
+              <w:rPr>
+                <w:rFonts w:ascii="Arial" w:hAnsi="Arial" w:cs="Arial"/>
+              </w:rPr>
+              <w:t>Rispetto al pianificato abbiamo qualche giornata, di lavoro, di anticipo infatti stiamo principalmente aggiungendo dettagli lavorando con un ritmo adeguato e sviluppando già un db più reale</w:t>
+            </w:r>
+          </w:p>
+        </w:tc>
+      </w:tr>
+    </w:tbl>
+    <w:p>
+      <w:pPr>
+        <w:rPr>
+          <w:rFonts w:ascii="Arial" w:hAnsi="Arial" w:cs="Arial"/>
+        </w:rPr>
+      </w:pPr>
+    </w:p>
+    <w:tbl>
+      <w:tblPr>
+        <w:tblStyle w:val="Grigliatabella"/>
+        <w:tblW w:w="0" w:type="auto"/>
+        <w:tblLook w:val="04A0" w:firstRow="1" w:lastRow="0" w:firstColumn="1" w:lastColumn="0" w:noHBand="0" w:noVBand="1"/>
+      </w:tblPr>
+      <w:tblGrid>
+        <w:gridCol w:w="9628"/>
+      </w:tblGrid>
+      <w:tr>
+        <w:tc>
+          <w:tcPr>
+            <w:tcW w:w="9854" w:type="dxa"/>
+            <w:shd w:val="clear" w:color="auto" w:fill="D9D9D9" w:themeFill="background1" w:themeFillShade="D9"/>
+          </w:tcPr>
+          <w:p>
+            <w:pPr>
+              <w:rPr>
+                <w:rFonts w:ascii="Arial" w:hAnsi="Arial" w:cs="Arial"/>
+              </w:rPr>
+            </w:pPr>
+            <w:r>
+              <w:rPr>
+                <w:rFonts w:ascii="Arial" w:hAnsi="Arial" w:cs="Arial"/>
+              </w:rPr>
+              <w:t>Programma di massima per la prossima giornata di lavoro</w:t>
+            </w:r>
+          </w:p>
+        </w:tc>
+      </w:tr>
+      <w:tr>
+        <w:tc>
+          <w:tcPr>
+            <w:tcW w:w="9854" w:type="dxa"/>
+          </w:tcPr>
+          <w:p>
+            <w:pPr>
+              <w:rPr>
+                <w:rFonts w:ascii="Arial" w:hAnsi="Arial" w:cs="Arial"/>
+              </w:rPr>
+            </w:pPr>
+            <w:r>
+              <w:rPr>
+                <w:rFonts w:ascii="Arial" w:hAnsi="Arial" w:cs="Arial"/>
+              </w:rPr>
+              <w:t>Procedere con i vari l’aggiunta di dettagli e del db</w:t>
+            </w:r>
+          </w:p>
+        </w:tc>
+      </w:tr>
+    </w:tbl>
+    <w:p>
+      <w:pPr>
+        <w:rPr>
+          <w:rFonts w:ascii="Arial" w:hAnsi="Arial" w:cs="Arial"/>
+        </w:rPr>
+      </w:pPr>
+    </w:p>
+    <w:p>
+      <w:pPr>
+        <w:pStyle w:val="Titolo1"/>
+      </w:pPr>
+      <w:r>
+        <w:t>Agile - Resoconto</w:t>
+      </w:r>
+    </w:p>
+    <w:tbl>
+      <w:tblPr>
+        <w:tblStyle w:val="Grigliatabella"/>
+        <w:tblW w:w="0" w:type="auto"/>
+        <w:tblLook w:val="04A0" w:firstRow="1" w:lastRow="0" w:firstColumn="1" w:lastColumn="0" w:noHBand="0" w:noVBand="1"/>
+      </w:tblPr>
+      <w:tblGrid>
+        <w:gridCol w:w="9628"/>
+      </w:tblGrid>
+      <w:tr>
+        <w:tc>
+          <w:tcPr>
+            <w:tcW w:w="9628" w:type="dxa"/>
+            <w:tcBorders>
+              <w:top w:val="single" w:sz="4" w:space="0" w:color="auto"/>
+              <w:left w:val="single" w:sz="4" w:space="0" w:color="auto"/>
+              <w:bottom w:val="single" w:sz="4" w:space="0" w:color="auto"/>
+              <w:right w:val="single" w:sz="4" w:space="0" w:color="auto"/>
+            </w:tcBorders>
+            <w:shd w:val="clear" w:color="auto" w:fill="D9D9D9" w:themeFill="background1" w:themeFillShade="D9"/>
+            <w:hideMark/>
+          </w:tcPr>
+          <w:p>
+            <w:pPr>
+              <w:spacing w:after="200" w:line="276" w:lineRule="auto"/>
+              <w:rPr>
+                <w:rFonts w:ascii="Arial" w:hAnsi="Arial" w:cs="Arial"/>
+              </w:rPr>
+            </w:pPr>
+            <w:r>
+              <w:rPr>
+                <w:rFonts w:ascii="Arial" w:hAnsi="Arial" w:cs="Arial"/>
+              </w:rPr>
+              <w:t>Daily Scrum</w:t>
+            </w:r>
+          </w:p>
+        </w:tc>
+      </w:tr>
+      <w:tr>
+        <w:tc>
+          <w:tcPr>
+            <w:tcW w:w="9628" w:type="dxa"/>
+            <w:tcBorders>
+              <w:top w:val="single" w:sz="4" w:space="0" w:color="auto"/>
+              <w:left w:val="single" w:sz="4" w:space="0" w:color="auto"/>
+              <w:bottom w:val="single" w:sz="4" w:space="0" w:color="auto"/>
+              <w:right w:val="single" w:sz="4" w:space="0" w:color="auto"/>
+            </w:tcBorders>
+            <w:hideMark/>
+          </w:tcPr>
+          <w:p>
+            <w:pPr>
+              <w:spacing w:after="200" w:line="276" w:lineRule="auto"/>
+              <w:rPr>
+                <w:rFonts w:ascii="Arial" w:hAnsi="Arial" w:cs="Arial"/>
+              </w:rPr>
+            </w:pPr>
+          </w:p>
+        </w:tc>
+      </w:tr>
+      <w:tr>
+        <w:tc>
+          <w:tcPr>
+            <w:tcW w:w="9628" w:type="dxa"/>
+            <w:tcBorders>
+              <w:top w:val="single" w:sz="4" w:space="0" w:color="auto"/>
+              <w:left w:val="single" w:sz="4" w:space="0" w:color="auto"/>
+              <w:bottom w:val="single" w:sz="4" w:space="0" w:color="auto"/>
+              <w:right w:val="single" w:sz="4" w:space="0" w:color="auto"/>
+            </w:tcBorders>
+          </w:tcPr>
+          <w:p>
+            <w:pPr>
+              <w:spacing w:after="200" w:line="276" w:lineRule="auto"/>
+              <w:rPr>
+                <w:rFonts w:ascii="Arial" w:hAnsi="Arial" w:cs="Arial"/>
+              </w:rPr>
+            </w:pPr>
+            <w:r>
+              <w:rPr>
+                <w:rFonts w:ascii="Arial" w:hAnsi="Arial" w:cs="Arial"/>
+              </w:rPr>
+              <w:t xml:space="preserve">Riley: </w:t>
+            </w:r>
+            <w:r>
+              <w:rPr>
+                <w:rFonts w:ascii="Arial" w:hAnsi="Arial" w:cs="Arial"/>
+              </w:rPr>
+              <w:t>C</w:t>
+            </w:r>
+            <w:r>
+              <w:rPr>
+                <w:rFonts w:ascii="Arial" w:hAnsi="Arial" w:cs="Arial"/>
+              </w:rPr>
+              <w:t>ontinuo</w:t>
+            </w:r>
+            <w:r>
+              <w:rPr>
+                <w:rFonts w:ascii="Arial" w:hAnsi="Arial" w:cs="Arial"/>
+              </w:rPr>
+              <w:t xml:space="preserve"> sviluppo db</w:t>
+            </w:r>
+          </w:p>
+          <w:p>
+            <w:pPr>
+              <w:spacing w:after="200" w:line="276" w:lineRule="auto"/>
+              <w:rPr>
+                <w:rFonts w:ascii="Arial" w:hAnsi="Arial" w:cs="Arial"/>
+              </w:rPr>
+            </w:pPr>
+            <w:r>
+              <w:rPr>
+                <w:rFonts w:ascii="Arial" w:hAnsi="Arial" w:cs="Arial"/>
+              </w:rPr>
+              <w:t>Bryan: Continuo sviluppo mappa</w:t>
+            </w:r>
+          </w:p>
+        </w:tc>
+      </w:tr>
+    </w:tbl>
+    <w:p>
+      <w:pPr>
+        <w:rPr>
+          <w:rFonts w:ascii="Arial" w:hAnsi="Arial" w:cs="Arial"/>
+        </w:rPr>
+      </w:pPr>
+    </w:p>
+    <w:tbl>
+      <w:tblPr>
+        <w:tblStyle w:val="Grigliatabella"/>
+        <w:tblW w:w="0" w:type="auto"/>
+        <w:tblLook w:val="04A0" w:firstRow="1" w:lastRow="0" w:firstColumn="1" w:lastColumn="0" w:noHBand="0" w:noVBand="1"/>
+      </w:tblPr>
+      <w:tblGrid>
+        <w:gridCol w:w="9628"/>
+      </w:tblGrid>
+      <w:tr>
+        <w:tc>
+          <w:tcPr>
+            <w:tcW w:w="9854" w:type="dxa"/>
+            <w:tcBorders>
+              <w:top w:val="single" w:sz="4" w:space="0" w:color="auto"/>
+              <w:left w:val="single" w:sz="4" w:space="0" w:color="auto"/>
+              <w:bottom w:val="single" w:sz="4" w:space="0" w:color="auto"/>
+              <w:right w:val="single" w:sz="4" w:space="0" w:color="auto"/>
+            </w:tcBorders>
+            <w:shd w:val="clear" w:color="auto" w:fill="D9D9D9" w:themeFill="background1" w:themeFillShade="D9"/>
+            <w:hideMark/>
+          </w:tcPr>
+          <w:p>
+            <w:pPr>
+              <w:spacing w:after="200" w:line="276" w:lineRule="auto"/>
+              <w:rPr>
+                <w:rFonts w:ascii="Arial" w:hAnsi="Arial" w:cs="Arial"/>
+              </w:rPr>
+            </w:pPr>
+            <w:r>
+              <w:rPr>
+                <w:rFonts w:ascii="Arial" w:hAnsi="Arial" w:cs="Arial"/>
+              </w:rPr>
+              <w:t>Sprint Planning</w:t>
+            </w:r>
+          </w:p>
+        </w:tc>
+      </w:tr>
+      <w:tr>
+        <w:tc>
+          <w:tcPr>
+            <w:tcW w:w="9854" w:type="dxa"/>
+            <w:tcBorders>
+              <w:top w:val="single" w:sz="4" w:space="0" w:color="auto"/>
+              <w:left w:val="single" w:sz="4" w:space="0" w:color="auto"/>
+              <w:bottom w:val="single" w:sz="4" w:space="0" w:color="auto"/>
+              <w:right w:val="single" w:sz="4" w:space="0" w:color="auto"/>
+            </w:tcBorders>
+          </w:tcPr>
+          <w:p>
+            <w:pPr>
+              <w:spacing w:after="200" w:line="276" w:lineRule="auto"/>
+              <w:rPr>
+                <w:rFonts w:ascii="Arial" w:hAnsi="Arial" w:cs="Arial"/>
+              </w:rPr>
+            </w:pPr>
+          </w:p>
+        </w:tc>
+      </w:tr>
+    </w:tbl>
+    <w:p>
+      <w:pPr>
+        <w:rPr>
+          <w:rFonts w:ascii="Arial" w:hAnsi="Arial" w:cs="Arial"/>
+        </w:rPr>
+      </w:pPr>
+    </w:p>
+    <w:tbl>
+      <w:tblPr>
+        <w:tblStyle w:val="Grigliatabella"/>
+        <w:tblW w:w="0" w:type="auto"/>
+        <w:tblLook w:val="04A0" w:firstRow="1" w:lastRow="0" w:firstColumn="1" w:lastColumn="0" w:noHBand="0" w:noVBand="1"/>
+      </w:tblPr>
+      <w:tblGrid>
+        <w:gridCol w:w="9628"/>
+      </w:tblGrid>
+      <w:tr>
+        <w:tc>
+          <w:tcPr>
+            <w:tcW w:w="9854" w:type="dxa"/>
+            <w:tcBorders>
+              <w:top w:val="single" w:sz="4" w:space="0" w:color="auto"/>
+              <w:left w:val="single" w:sz="4" w:space="0" w:color="auto"/>
+              <w:bottom w:val="single" w:sz="4" w:space="0" w:color="auto"/>
+              <w:right w:val="single" w:sz="4" w:space="0" w:color="auto"/>
+            </w:tcBorders>
+            <w:shd w:val="clear" w:color="auto" w:fill="D9D9D9" w:themeFill="background1" w:themeFillShade="D9"/>
+            <w:hideMark/>
+          </w:tcPr>
+          <w:p>
+            <w:pPr>
+              <w:spacing w:after="200" w:line="276" w:lineRule="auto"/>
+              <w:rPr>
+                <w:rFonts w:ascii="Arial" w:hAnsi="Arial" w:cs="Arial"/>
+              </w:rPr>
+            </w:pPr>
+            <w:r>
+              <w:rPr>
+                <w:rFonts w:ascii="Arial" w:hAnsi="Arial" w:cs="Arial"/>
+              </w:rPr>
+              <w:t>Sprint Review</w:t>
+            </w:r>
+          </w:p>
+        </w:tc>
+      </w:tr>
+      <w:tr>
+        <w:tc>
+          <w:tcPr>
+            <w:tcW w:w="9854" w:type="dxa"/>
+            <w:tcBorders>
+              <w:top w:val="single" w:sz="4" w:space="0" w:color="auto"/>
+              <w:left w:val="single" w:sz="4" w:space="0" w:color="auto"/>
+              <w:bottom w:val="single" w:sz="4" w:space="0" w:color="auto"/>
+              <w:right w:val="single" w:sz="4" w:space="0" w:color="auto"/>
+            </w:tcBorders>
+          </w:tcPr>
+          <w:p>
+            <w:pPr>
+              <w:spacing w:after="200" w:line="276" w:lineRule="auto"/>
+              <w:rPr>
+                <w:rFonts w:ascii="Arial" w:hAnsi="Arial" w:cs="Arial"/>
+              </w:rPr>
+            </w:pPr>
+          </w:p>
+        </w:tc>
+      </w:tr>
+    </w:tbl>
+    <w:p>
+      <w:pPr>
+        <w:rPr>
+          <w:rFonts w:ascii="Arial" w:hAnsi="Arial" w:cs="Arial"/>
+        </w:rPr>
+      </w:pPr>
+    </w:p>
+    <w:tbl>
+      <w:tblPr>
+        <w:tblStyle w:val="Grigliatabella"/>
+        <w:tblW w:w="0" w:type="auto"/>
+        <w:tblLook w:val="04A0" w:firstRow="1" w:lastRow="0" w:firstColumn="1" w:lastColumn="0" w:noHBand="0" w:noVBand="1"/>
+      </w:tblPr>
+      <w:tblGrid>
+        <w:gridCol w:w="9628"/>
+      </w:tblGrid>
+      <w:tr>
+        <w:tc>
+          <w:tcPr>
+            <w:tcW w:w="9854" w:type="dxa"/>
+            <w:tcBorders>
+              <w:top w:val="single" w:sz="4" w:space="0" w:color="auto"/>
+              <w:left w:val="single" w:sz="4" w:space="0" w:color="auto"/>
+              <w:bottom w:val="single" w:sz="4" w:space="0" w:color="auto"/>
+              <w:right w:val="single" w:sz="4" w:space="0" w:color="auto"/>
+            </w:tcBorders>
+            <w:shd w:val="clear" w:color="auto" w:fill="D9D9D9" w:themeFill="background1" w:themeFillShade="D9"/>
+            <w:hideMark/>
+          </w:tcPr>
+          <w:p>
+            <w:pPr>
+              <w:spacing w:after="200" w:line="276" w:lineRule="auto"/>
+              <w:rPr>
+                <w:rFonts w:ascii="Arial" w:hAnsi="Arial" w:cs="Arial"/>
+              </w:rPr>
+            </w:pPr>
+            <w:r>
+              <w:rPr>
+                <w:rFonts w:ascii="Arial" w:hAnsi="Arial" w:cs="Arial"/>
+              </w:rPr>
+              <w:t>Sprint Retrospective</w:t>
+            </w:r>
+          </w:p>
+        </w:tc>
+      </w:tr>
+      <w:tr>
+        <w:tc>
+          <w:tcPr>
+            <w:tcW w:w="9854" w:type="dxa"/>
+            <w:tcBorders>
+              <w:top w:val="single" w:sz="4" w:space="0" w:color="auto"/>
+              <w:left w:val="single" w:sz="4" w:space="0" w:color="auto"/>
+              <w:bottom w:val="single" w:sz="4" w:space="0" w:color="auto"/>
+              <w:right w:val="single" w:sz="4" w:space="0" w:color="auto"/>
+            </w:tcBorders>
+          </w:tcPr>
+          <w:p>
+            <w:pPr>
+              <w:spacing w:after="200" w:line="276" w:lineRule="auto"/>
+              <w:rPr>
+                <w:rFonts w:ascii="Arial" w:hAnsi="Arial" w:cs="Arial"/>
+              </w:rPr>
+            </w:pPr>
+          </w:p>
+        </w:tc>
+      </w:tr>
+    </w:tbl>
+    <w:p>
+      <w:pPr>
+        <w:rPr>
+          <w:rFonts w:ascii="Arial" w:hAnsi="Arial" w:cs="Arial"/>
+        </w:rPr>
+      </w:pPr>
+    </w:p>
+    <w:p>
+      <w:pPr>
+        <w:rPr>
+          <w:rFonts w:ascii="Arial" w:hAnsi="Arial" w:cs="Arial"/>
+        </w:rPr>
+      </w:pPr>
+      <w:r>
+        <w:rPr>
+          <w:rFonts w:ascii="Arial" w:hAnsi="Arial" w:cs="Arial"/>
+        </w:rPr>
+        <w:br w:type="page"/>
+      </w:r>
+    </w:p>
+    <w:p>
+      <w:pPr>
+        <w:pStyle w:val="Titolo2"/>
+        <w:pBdr>
+          <w:bottom w:val="single" w:sz="4" w:space="1" w:color="auto"/>
+        </w:pBdr>
+      </w:pPr>
+      <w:r>
+        <w:lastRenderedPageBreak/>
+        <w:t>Utilizzo Intelligenza Artificiale</w:t>
+      </w:r>
+      <w:r>
+        <w:t xml:space="preserve"> nella giornata</w:t>
+      </w:r>
+    </w:p>
+    <w:p>
+      <w:pPr>
+        <w:pStyle w:val="Nessunaspaziatura"/>
+        <w:rPr>
+          <w:rFonts w:ascii="Arial" w:hAnsi="Arial" w:cs="Arial"/>
+          <w:b/>
+          <w:bCs/>
+        </w:rPr>
+      </w:pPr>
+    </w:p>
+    <w:p>
+      <w:pPr>
+        <w:pStyle w:val="Nessunaspaziatura"/>
+        <w:rPr>
+          <w:rFonts w:ascii="Arial" w:hAnsi="Arial" w:cs="Arial"/>
+        </w:rPr>
+      </w:pPr>
+      <w:sdt>
+        <w:sdtPr>
+          <w:rPr>
+            <w:rFonts w:ascii="Segoe UI Symbol" w:hAnsi="Segoe UI Symbol" w:cs="Segoe UI Symbol"/>
+          </w:rPr>
+          <w:id w:val="1845660469"/>
+          <w14:checkbox>
+            <w14:checked w14:val="0"/>
+            <w14:checkedState w14:val="2612" w14:font="MS Gothic"/>
+            <w14:uncheckedState w14:val="2610" w14:font="MS Gothic"/>
+          </w14:checkbox>
+        </w:sdtPr>
+        <w:sdtContent>
+          <w:r>
+            <w:rPr>
+              <w:rFonts w:ascii="MS Gothic" w:eastAsia="MS Gothic" w:hAnsi="MS Gothic" w:cs="Segoe UI Symbol" w:hint="eastAsia"/>
+            </w:rPr>
+            <w:t>☐</w:t>
+          </w:r>
+        </w:sdtContent>
+      </w:sdt>
+      <w:r>
+        <w:rPr>
+          <w:rFonts w:ascii="Arial" w:hAnsi="Arial" w:cs="Arial"/>
+        </w:rPr>
+        <w:t xml:space="preserve"> Nessuno</w:t>
+      </w:r>
+      <w:r>
+        <w:br/>
+      </w:r>
+      <w:sdt>
+        <w:sdtPr>
+          <w:rPr>
+            <w:rFonts w:ascii="Segoe UI Symbol" w:hAnsi="Segoe UI Symbol" w:cs="Segoe UI Symbol"/>
+          </w:rPr>
+          <w:id w:val="-837387813"/>
+          <w14:checkbox>
+            <w14:checked w14:val="1"/>
+            <w14:checkedState w14:val="2612" w14:font="MS Gothic"/>
+            <w14:uncheckedState w14:val="2610" w14:font="MS Gothic"/>
+          </w14:checkbox>
+        </w:sdtPr>
+        <w:sdtContent>
+          <w:r>
+            <w:rPr>
+              <w:rFonts w:ascii="MS Gothic" w:eastAsia="MS Gothic" w:hAnsi="MS Gothic" w:cs="Segoe UI Symbol" w:hint="eastAsia"/>
+            </w:rPr>
+            <w:t>☒</w:t>
+          </w:r>
+        </w:sdtContent>
+      </w:sdt>
+      <w:r>
+        <w:rPr>
+          <w:rFonts w:ascii="Arial" w:hAnsi="Arial" w:cs="Arial"/>
+        </w:rPr>
+        <w:t xml:space="preserve"> Occasionale</w:t>
+      </w:r>
+      <w:r>
+        <w:br/>
+      </w:r>
+      <w:sdt>
+        <w:sdtPr>
+          <w:rPr>
+            <w:rFonts w:ascii="Segoe UI Symbol" w:hAnsi="Segoe UI Symbol" w:cs="Segoe UI Symbol"/>
+          </w:rPr>
+          <w:id w:val="657271397"/>
+          <w14:checkbox>
+            <w14:checked w14:val="0"/>
+            <w14:checkedState w14:val="2612" w14:font="MS Gothic"/>
+            <w14:uncheckedState w14:val="2610" w14:font="MS Gothic"/>
+          </w14:checkbox>
+        </w:sdtPr>
+        <w:sdtContent>
+          <w:r>
+            <w:rPr>
+              <w:rFonts w:ascii="MS Gothic" w:eastAsia="MS Gothic" w:hAnsi="MS Gothic" w:cs="Segoe UI Symbol" w:hint="eastAsia"/>
+            </w:rPr>
+            <w:t>☐</w:t>
+          </w:r>
+        </w:sdtContent>
+      </w:sdt>
+      <w:r>
+        <w:rPr>
+          <w:rFonts w:ascii="Arial" w:hAnsi="Arial" w:cs="Arial"/>
+        </w:rPr>
+        <w:t xml:space="preserve"> Frequente</w:t>
+      </w:r>
+    </w:p>
+    <w:p>
+      <w:pPr>
+        <w:pStyle w:val="Nessunaspaziatura"/>
+        <w:rPr>
+          <w:rFonts w:ascii="Arial" w:hAnsi="Arial" w:cs="Arial"/>
+        </w:rPr>
+      </w:pPr>
+    </w:p>
+    <w:p>
+      <w:pPr>
+        <w:pStyle w:val="Nessunaspaziatura"/>
+        <w:spacing w:line="276" w:lineRule="auto"/>
+        <w:rPr>
+          <w:rFonts w:ascii="Arial" w:hAnsi="Arial" w:cs="Arial"/>
+        </w:rPr>
+      </w:pPr>
+      <w:r>
+        <w:rPr>
+          <w:rFonts w:ascii="Arial" w:hAnsi="Arial" w:cs="Arial"/>
+          <w:b/>
+          <w:bCs/>
+        </w:rPr>
+        <w:t>Strumento/i utilizzato/i</w:t>
+      </w:r>
+      <w:r>
+        <w:rPr>
+          <w:rFonts w:ascii="Arial" w:hAnsi="Arial" w:cs="Arial"/>
+          <w:b/>
+          <w:bCs/>
+        </w:rPr>
+        <w:t xml:space="preserve"> </w:t>
+      </w:r>
+      <w:r>
+        <w:rPr>
+          <w:rFonts w:ascii="Arial" w:hAnsi="Arial" w:cs="Arial"/>
+        </w:rPr>
+        <w:t>(es. ChatGPT)</w:t>
+      </w:r>
+      <w:r>
+        <w:rPr>
+          <w:rFonts w:ascii="Arial" w:hAnsi="Arial" w:cs="Arial"/>
+        </w:rPr>
+        <w:t xml:space="preserve">: </w:t>
+      </w:r>
+      <w:sdt>
+        <w:sdtPr>
+          <w:rPr>
+            <w:rFonts w:ascii="Arial" w:hAnsi="Arial" w:cs="Arial"/>
+          </w:rPr>
+          <w:id w:val="-1054307435"/>
+          <w:placeholder>
+            <w:docPart w:val="A50642D10D8E4E31894C975A2EAE4C79"/>
+          </w:placeholder>
+        </w:sdtPr>
+        <w:sdtContent>
+          <w:r>
+            <w:rPr>
+              <w:rFonts w:ascii="Arial" w:hAnsi="Arial" w:cs="Arial"/>
+            </w:rPr>
+            <w:t>ChatGPT</w:t>
+          </w:r>
+          <w:r>
+            <w:rPr>
+              <w:rFonts w:ascii="Arial" w:hAnsi="Arial" w:cs="Arial"/>
+            </w:rPr>
+            <w:t>, Gemini</w:t>
+          </w:r>
+        </w:sdtContent>
+      </w:sdt>
+    </w:p>
+    <w:p>
+      <w:pPr>
+        <w:pStyle w:val="Nessunaspaziatura"/>
+        <w:rPr>
+          <w:rFonts w:ascii="Arial" w:hAnsi="Arial" w:cs="Arial"/>
+        </w:rPr>
+      </w:pPr>
+    </w:p>
+    <w:p>
+      <w:pPr>
+        <w:pStyle w:val="Nessunaspaziatura"/>
+        <w:rPr>
+          <w:rFonts w:ascii="Arial" w:hAnsi="Arial" w:cs="Arial"/>
+        </w:rPr>
+      </w:pPr>
+      <w:r>
+        <w:rPr>
+          <w:rFonts w:ascii="Arial" w:hAnsi="Arial" w:cs="Arial"/>
+          <w:b/>
+          <w:bCs/>
+        </w:rPr>
+        <w:t>Per cosa l’ho usata oggi</w:t>
+      </w:r>
+      <w:r>
+        <w:br/>
+      </w:r>
+      <w:sdt>
+        <w:sdtPr>
+          <w:rPr>
+            <w:rFonts w:ascii="Segoe UI Symbol" w:hAnsi="Segoe UI Symbol" w:cs="Segoe UI Symbol"/>
+          </w:rPr>
+          <w:id w:val="874665258"/>
+          <w14:checkbox>
+            <w14:checked w14:val="1"/>
+            <w14:checkedState w14:val="2612" w14:font="MS Gothic"/>
+            <w14:uncheckedState w14:val="2610" w14:font="MS Gothic"/>
+          </w14:checkbox>
+        </w:sdtPr>
+        <w:sdtContent>
+          <w:r>
+            <w:rPr>
+              <w:rFonts w:ascii="MS Gothic" w:eastAsia="MS Gothic" w:hAnsi="MS Gothic" w:cs="Segoe UI Symbol" w:hint="eastAsia"/>
+            </w:rPr>
+            <w:t>☒</w:t>
+          </w:r>
+        </w:sdtContent>
+      </w:sdt>
+      <w:r>
+        <w:rPr>
+          <w:rFonts w:ascii="Arial" w:hAnsi="Arial" w:cs="Arial"/>
+        </w:rPr>
+        <w:t xml:space="preserve"> Chiarire concetti</w:t>
+      </w:r>
+      <w:r>
+        <w:br/>
+      </w:r>
+      <w:sdt>
+        <w:sdtPr>
+          <w:rPr>
+            <w:rFonts w:ascii="Segoe UI Symbol" w:hAnsi="Segoe UI Symbol" w:cs="Segoe UI Symbol"/>
+          </w:rPr>
+          <w:id w:val="-1964259497"/>
+          <w14:checkbox>
+            <w14:checked w14:val="1"/>
+            <w14:checkedState w14:val="2612" w14:font="MS Gothic"/>
+            <w14:uncheckedState w14:val="2610" w14:font="MS Gothic"/>
+          </w14:checkbox>
+        </w:sdtPr>
+        <w:sdtContent>
+          <w:r>
+            <w:rPr>
+              <w:rFonts w:ascii="MS Gothic" w:eastAsia="MS Gothic" w:hAnsi="MS Gothic" w:cs="Segoe UI Symbol" w:hint="eastAsia"/>
+            </w:rPr>
+            <w:t>☒</w:t>
+          </w:r>
+        </w:sdtContent>
+      </w:sdt>
+      <w:r>
+        <w:rPr>
+          <w:rFonts w:ascii="Arial" w:hAnsi="Arial" w:cs="Arial"/>
+        </w:rPr>
+        <w:t xml:space="preserve"> Supporto al codice</w:t>
+      </w:r>
+      <w:r>
+        <w:br/>
+      </w:r>
+      <w:sdt>
+        <w:sdtPr>
+          <w:rPr>
+            <w:rFonts w:ascii="Segoe UI Symbol" w:hAnsi="Segoe UI Symbol" w:cs="Segoe UI Symbol"/>
+          </w:rPr>
+          <w:id w:val="-1193834498"/>
+          <w14:checkbox>
+            <w14:checked w14:val="0"/>
+            <w14:checkedState w14:val="2612" w14:font="MS Gothic"/>
+            <w14:uncheckedState w14:val="2610" w14:font="MS Gothic"/>
+          </w14:checkbox>
+        </w:sdtPr>
+        <w:sdtContent>
+          <w:r>
+            <w:rPr>
+              <w:rFonts w:ascii="MS Gothic" w:eastAsia="MS Gothic" w:hAnsi="MS Gothic" w:cs="Segoe UI Symbol" w:hint="eastAsia"/>
+            </w:rPr>
+            <w:t>☐</w:t>
+          </w:r>
+        </w:sdtContent>
+      </w:sdt>
+      <w:r>
+        <w:rPr>
+          <w:rFonts w:ascii="Arial" w:hAnsi="Arial" w:cs="Arial"/>
+        </w:rPr>
+        <w:t xml:space="preserve"> Debug</w:t>
+      </w:r>
+      <w:r>
+        <w:br/>
+      </w:r>
+      <w:sdt>
+        <w:sdtPr>
+          <w:rPr>
+            <w:rFonts w:ascii="Segoe UI Symbol" w:hAnsi="Segoe UI Symbol" w:cs="Segoe UI Symbol"/>
+          </w:rPr>
+          <w:id w:val="-2118050212"/>
+          <w14:checkbox>
+            <w14:checked w14:val="0"/>
+            <w14:checkedState w14:val="2612" w14:font="MS Gothic"/>
+            <w14:uncheckedState w14:val="2610" w14:font="MS Gothic"/>
+          </w14:checkbox>
+        </w:sdtPr>
+        <w:sdtContent>
+          <w:r>
+            <w:rPr>
+              <w:rFonts w:ascii="MS Gothic" w:eastAsia="MS Gothic" w:hAnsi="MS Gothic" w:cs="Segoe UI Symbol" w:hint="eastAsia"/>
+            </w:rPr>
+            <w:t>☐</w:t>
+          </w:r>
+        </w:sdtContent>
+      </w:sdt>
+      <w:r>
+        <w:rPr>
+          <w:rFonts w:ascii="Arial" w:hAnsi="Arial" w:cs="Arial"/>
+        </w:rPr>
+        <w:t xml:space="preserve"> Riorganizzare idee / testi</w:t>
+      </w:r>
+      <w:r>
+        <w:br/>
+      </w:r>
+      <w:sdt>
+        <w:sdtPr>
+          <w:rPr>
+            <w:rFonts w:ascii="Segoe UI Symbol" w:hAnsi="Segoe UI Symbol" w:cs="Segoe UI Symbol"/>
+          </w:rPr>
+          <w:id w:val="117340305"/>
+          <w14:checkbox>
+            <w14:checked w14:val="1"/>
+            <w14:checkedState w14:val="2612" w14:font="MS Gothic"/>
+            <w14:uncheckedState w14:val="2610" w14:font="MS Gothic"/>
+          </w14:checkbox>
+        </w:sdtPr>
+        <w:sdtContent>
+          <w:r>
+            <w:rPr>
+              <w:rFonts w:ascii="MS Gothic" w:eastAsia="MS Gothic" w:hAnsi="MS Gothic" w:cs="Segoe UI Symbol" w:hint="eastAsia"/>
+            </w:rPr>
+            <w:t>☒</w:t>
+          </w:r>
+        </w:sdtContent>
+      </w:sdt>
+      <w:r>
+        <w:rPr>
+          <w:rFonts w:ascii="Arial" w:hAnsi="Arial" w:cs="Arial"/>
+        </w:rPr>
+        <w:t xml:space="preserve"> Altro: …</w:t>
+      </w:r>
+    </w:p>
+    <w:p>
+      <w:pPr>
+        <w:pStyle w:val="Nessunaspaziatura"/>
+        <w:rPr>
+          <w:rFonts w:ascii="Arial" w:hAnsi="Arial" w:cs="Arial"/>
+        </w:rPr>
+      </w:pPr>
+    </w:p>
+    <w:p>
+      <w:pPr>
+        <w:pStyle w:val="Nessunaspaziatura"/>
+        <w:rPr>
+          <w:rFonts w:ascii="Arial" w:hAnsi="Arial" w:cs="Arial"/>
+          <w:b/>
+          <w:bCs/>
+        </w:rPr>
+      </w:pPr>
+      <w:r>
+        <w:rPr>
+          <w:rFonts w:ascii="Arial" w:hAnsi="Arial" w:cs="Arial"/>
+          <w:b/>
+          <w:bCs/>
+        </w:rPr>
+        <w:t>Esempio significativo di utilizzo (UNO SOLO)</w:t>
+      </w:r>
+    </w:p>
+    <w:p>
+      <w:pPr>
+        <w:pStyle w:val="Nessunaspaziatura"/>
+        <w:rPr>
+          <w:rFonts w:ascii="Arial" w:hAnsi="Arial" w:cs="Arial"/>
+        </w:rPr>
+      </w:pPr>
+      <w:r>
+        <w:rPr>
+          <w:rFonts w:ascii="Arial" w:hAnsi="Arial" w:cs="Arial"/>
+        </w:rPr>
+        <w:t xml:space="preserve">Riporta </w:t>
+      </w:r>
+      <w:r>
+        <w:rPr>
+          <w:rFonts w:ascii="Arial" w:hAnsi="Arial" w:cs="Arial"/>
+          <w:i/>
+          <w:iCs/>
+        </w:rPr>
+        <w:t>un</w:t>
+      </w:r>
+      <w:r>
+        <w:rPr>
+          <w:rFonts w:ascii="Arial" w:hAnsi="Arial" w:cs="Arial"/>
+        </w:rPr>
+        <w:t xml:space="preserve"> prompt rilevante oppure descrivilo a parole se ce ne sono stati molti.</w:t>
+      </w:r>
+    </w:p>
+    <w:p>
+      <w:pPr>
+        <w:pStyle w:val="Nessunaspaziatura"/>
+        <w:rPr>
+          <w:rFonts w:ascii="Arial" w:hAnsi="Arial" w:cs="Arial"/>
+        </w:rPr>
+      </w:pPr>
+    </w:p>
+    <w:sdt>
+      <w:sdtPr>
+        <w:rPr>
+          <w:rFonts w:ascii="Arial" w:hAnsi="Arial" w:cs="Arial"/>
+        </w:rPr>
+        <w:alias w:val="Prompt AI"/>
+        <w:tag w:val="Prompt AI"/>
+        <w:id w:val="-1543816558"/>
+        <w:placeholder>
+          <w:docPart w:val="11028D96C30E4870B503E636E28351A9"/>
+        </w:placeholder>
+        <w15:color w:val="C0C0C0"/>
+      </w:sdtPr>
+      <w:sdtContent>
+        <w:p>
+          <w:pPr>
+            <w:pStyle w:val="Nessunaspaziatura"/>
+            <w:rPr>
+              <w:rFonts w:ascii="Arial" w:hAnsi="Arial" w:cs="Arial"/>
+            </w:rPr>
+          </w:pPr>
+          <w:r>
+            <w:rPr>
+              <w:rFonts w:ascii="Arial" w:hAnsi="Arial" w:cs="Arial"/>
+            </w:rPr>
+            <w:t xml:space="preserve">Riley: </w:t>
+          </w:r>
+          <w:r>
+            <w:rPr>
+              <w:rFonts w:ascii="Arial" w:hAnsi="Arial" w:cs="Arial"/>
+            </w:rPr>
+            <w:t>non ho fatto dei veri e propri promt oggi, ma mi sono cimentato nel procedere con una spiegazione guidata per applicare SQLite alla base di dati sviluppata finora.</w:t>
+          </w:r>
+        </w:p>
+        <w:p>
+          <w:pPr>
+            <w:pStyle w:val="Nessunaspaziatura"/>
+            <w:spacing w:line="276" w:lineRule="auto"/>
+            <w:rPr>
+              <w:rFonts w:ascii="Arial" w:hAnsi="Arial" w:cs="Arial"/>
+            </w:rPr>
+          </w:pPr>
+          <w:r>
+            <w:rPr>
+              <w:rFonts w:ascii="Arial" w:hAnsi="Arial" w:cs="Arial"/>
+            </w:rPr>
+            <w:t xml:space="preserve">Bryan: </w:t>
+          </w:r>
+          <w:r>
+            <w:rPr>
+              <w:rFonts w:ascii="Arial" w:hAnsi="Arial" w:cs="Arial"/>
+            </w:rPr>
+            <w:t>Modificami questa immagine &lt;immagine&gt; in questo modo &lt;descrizione&gt;</w:t>
+          </w:r>
+        </w:p>
+      </w:sdtContent>
+    </w:sdt>
+    <w:p>
+      <w:pPr>
+        <w:pStyle w:val="Nessunaspaziatura"/>
+        <w:rPr>
+          <w:rFonts w:ascii="Arial" w:hAnsi="Arial" w:cs="Arial"/>
+        </w:rPr>
+      </w:pPr>
+    </w:p>
+    <w:p>
+      <w:pPr>
+        <w:pStyle w:val="Nessunaspaziatura"/>
+        <w:rPr>
+          <w:rFonts w:ascii="Arial" w:hAnsi="Arial" w:cs="Arial"/>
+        </w:rPr>
+      </w:pPr>
+      <w:r>
+        <w:rPr>
+          <w:rFonts w:ascii="Arial" w:hAnsi="Arial" w:cs="Arial"/>
+          <w:b/>
+          <w:bCs/>
+        </w:rPr>
+        <w:t>Cosa mi ha dato l’AI</w:t>
+      </w:r>
+    </w:p>
+    <w:p>
+      <w:pPr>
+        <w:pStyle w:val="Nessunaspaziatura"/>
+        <w:rPr>
+          <w:rFonts w:ascii="Arial" w:hAnsi="Arial" w:cs="Arial"/>
+        </w:rPr>
+      </w:pPr>
+      <w:r>
+        <w:rPr>
+          <w:rFonts w:ascii="Arial" w:hAnsi="Arial" w:cs="Arial"/>
+        </w:rPr>
+        <w:t>Spiegazione, esempio, soluzione, suggerimento…</w:t>
+      </w:r>
+    </w:p>
+    <w:p>
+      <w:pPr>
+        <w:pStyle w:val="Nessunaspaziatura"/>
+        <w:rPr>
+          <w:rFonts w:ascii="Arial" w:hAnsi="Arial" w:cs="Arial"/>
+        </w:rPr>
+      </w:pPr>
+    </w:p>
+    <w:sdt>
+      <w:sdtPr>
+        <w:rPr>
+          <w:rFonts w:ascii="Arial" w:hAnsi="Arial" w:cs="Arial"/>
+        </w:rPr>
+        <w:alias w:val="Risposta AI"/>
+        <w:tag w:val="Risposta AI"/>
+        <w:id w:val="1154871397"/>
+        <w:placeholder>
+          <w:docPart w:val="DD1A591C0F45438F9C72CC95A6991F47"/>
+        </w:placeholder>
+        <w15:color w:val="C0C0C0"/>
+      </w:sdtPr>
+      <w:sdtContent>
+        <w:p>
+          <w:pPr>
+            <w:pStyle w:val="Nessunaspaziatura"/>
+            <w:spacing w:line="276" w:lineRule="auto"/>
+            <w:rPr>
+              <w:rFonts w:ascii="Arial" w:hAnsi="Arial" w:cs="Arial"/>
+            </w:rPr>
+          </w:pPr>
+          <w:r>
+            <w:rPr>
+              <w:rFonts w:ascii="Arial" w:hAnsi="Arial" w:cs="Arial"/>
+            </w:rPr>
+            <w:t xml:space="preserve">Riley: </w:t>
+          </w:r>
+          <w:r>
+            <w:rPr>
+              <w:rFonts w:ascii="Arial" w:hAnsi="Arial" w:cs="Arial"/>
+            </w:rPr>
+            <w:t>Dopo avergli confermato che i test creati erano passati mi ha mostrato il resto della procedura che sono andato ad analizzare ed eventualmente adattare.</w:t>
+          </w:r>
+        </w:p>
+        <w:p>
+          <w:pPr>
+            <w:pStyle w:val="Nessunaspaziatura"/>
+            <w:spacing w:line="276" w:lineRule="auto"/>
+            <w:rPr>
+              <w:rFonts w:ascii="Arial" w:hAnsi="Arial" w:cs="Arial"/>
+            </w:rPr>
+          </w:pPr>
+          <w:r>
+            <w:rPr>
+              <w:rFonts w:ascii="Arial" w:hAnsi="Arial" w:cs="Arial"/>
+            </w:rPr>
+            <w:t>Bryan:</w:t>
+          </w:r>
+          <w:r>
+            <w:rPr>
+              <w:rFonts w:ascii="Arial" w:hAnsi="Arial" w:cs="Arial"/>
+            </w:rPr>
+            <w:t xml:space="preserve"> L’immagine modificata</w:t>
+          </w:r>
+        </w:p>
+      </w:sdtContent>
+    </w:sdt>
+    <w:p>
+      <w:pPr>
+        <w:pStyle w:val="Nessunaspaziatura"/>
+        <w:rPr>
+          <w:rFonts w:ascii="Arial" w:hAnsi="Arial" w:cs="Arial"/>
+          <w:b/>
+          <w:bCs/>
+        </w:rPr>
+      </w:pPr>
+    </w:p>
+    <w:p>
+      <w:pPr>
+        <w:pStyle w:val="Nessunaspaziatura"/>
+        <w:rPr>
+          <w:rFonts w:ascii="Arial" w:hAnsi="Arial" w:cs="Arial"/>
+        </w:rPr>
+      </w:pPr>
+      <w:r>
+        <w:rPr>
+          <w:rFonts w:ascii="Arial" w:hAnsi="Arial" w:cs="Arial"/>
+          <w:b/>
+          <w:bCs/>
+        </w:rPr>
+        <w:t>Come l’ho usato io</w:t>
+      </w:r>
+      <w:r>
+        <w:rPr>
+          <w:rFonts w:ascii="Arial" w:hAnsi="Arial" w:cs="Arial"/>
+        </w:rPr>
+        <w:br/>
+      </w:r>
+      <w:sdt>
+        <w:sdtPr>
+          <w:rPr>
+            <w:rFonts w:ascii="Segoe UI Symbol" w:hAnsi="Segoe UI Symbol" w:cs="Segoe UI Symbol"/>
+          </w:rPr>
+          <w:id w:val="-1077129862"/>
+          <w14:checkbox>
+            <w14:checked w14:val="1"/>
+            <w14:checkedState w14:val="2612" w14:font="MS Gothic"/>
+            <w14:uncheckedState w14:val="2610" w14:font="MS Gothic"/>
+          </w14:checkbox>
+        </w:sdtPr>
+        <w:sdtContent>
+          <w:r>
+            <w:rPr>
+              <w:rFonts w:ascii="MS Gothic" w:eastAsia="MS Gothic" w:hAnsi="MS Gothic" w:cs="Segoe UI Symbol" w:hint="eastAsia"/>
+            </w:rPr>
+            <w:t>☒</w:t>
+          </w:r>
+        </w:sdtContent>
+      </w:sdt>
+      <w:r>
+        <w:rPr>
+          <w:rFonts w:ascii="Arial" w:hAnsi="Arial" w:cs="Arial"/>
+        </w:rPr>
+        <w:t xml:space="preserve"> Copiato</w:t>
+      </w:r>
+      <w:r>
+        <w:rPr>
+          <w:rFonts w:ascii="Arial" w:hAnsi="Arial" w:cs="Arial"/>
+        </w:rPr>
+        <w:br/>
+      </w:r>
+      <w:sdt>
+        <w:sdtPr>
+          <w:rPr>
+            <w:rFonts w:ascii="Segoe UI Symbol" w:hAnsi="Segoe UI Symbol" w:cs="Segoe UI Symbol"/>
+          </w:rPr>
+          <w:id w:val="-2005271897"/>
+          <w14:checkbox>
+            <w14:checked w14:val="1"/>
+            <w14:checkedState w14:val="2612" w14:font="MS Gothic"/>
+            <w14:uncheckedState w14:val="2610" w14:font="MS Gothic"/>
+          </w14:checkbox>
+        </w:sdtPr>
+        <w:sdtContent>
+          <w:r>
+            <w:rPr>
+              <w:rFonts w:ascii="MS Gothic" w:eastAsia="MS Gothic" w:hAnsi="MS Gothic" w:cs="Segoe UI Symbol" w:hint="eastAsia"/>
+            </w:rPr>
+            <w:t>☒</w:t>
+          </w:r>
+        </w:sdtContent>
+      </w:sdt>
+      <w:r>
+        <w:rPr>
+          <w:rFonts w:ascii="Arial" w:hAnsi="Arial" w:cs="Arial"/>
+        </w:rPr>
+        <w:t xml:space="preserve"> Adattato</w:t>
+      </w:r>
+      <w:r>
+        <w:rPr>
+          <w:rFonts w:ascii="Arial" w:hAnsi="Arial" w:cs="Arial"/>
+        </w:rPr>
+        <w:br/>
+      </w:r>
+      <w:sdt>
+        <w:sdtPr>
+          <w:rPr>
+            <w:rFonts w:ascii="Segoe UI Symbol" w:hAnsi="Segoe UI Symbol" w:cs="Segoe UI Symbol"/>
+          </w:rPr>
+          <w:id w:val="1129436228"/>
+          <w14:checkbox>
+            <w14:checked w14:val="0"/>
+            <w14:checkedState w14:val="2612" w14:font="MS Gothic"/>
+            <w14:uncheckedState w14:val="2610" w14:font="MS Gothic"/>
+          </w14:checkbox>
+        </w:sdtPr>
+        <w:sdtContent>
+          <w:r>
+            <w:rPr>
+              <w:rFonts w:ascii="MS Gothic" w:eastAsia="MS Gothic" w:hAnsi="MS Gothic" w:cs="Segoe UI Symbol" w:hint="eastAsia"/>
+            </w:rPr>
+            <w:t>☐</w:t>
+          </w:r>
+        </w:sdtContent>
+      </w:sdt>
+      <w:r>
+        <w:rPr>
+          <w:rFonts w:ascii="Arial" w:hAnsi="Arial" w:cs="Arial"/>
+        </w:rPr>
+        <w:t xml:space="preserve"> Usato solo per capire</w:t>
+      </w:r>
+      <w:r>
+        <w:rPr>
+          <w:rFonts w:ascii="Arial" w:hAnsi="Arial" w:cs="Arial"/>
+        </w:rPr>
+        <w:br/>
+      </w:r>
+      <w:sdt>
+        <w:sdtPr>
+          <w:rPr>
+            <w:rFonts w:ascii="Segoe UI Symbol" w:hAnsi="Segoe UI Symbol" w:cs="Segoe UI Symbol"/>
+          </w:rPr>
+          <w:id w:val="-1357582439"/>
+          <w14:checkbox>
+            <w14:checked w14:val="0"/>
+            <w14:checkedState w14:val="2612" w14:font="MS Gothic"/>
+            <w14:uncheckedState w14:val="2610" w14:font="MS Gothic"/>
+          </w14:checkbox>
+        </w:sdtPr>
+        <w:sdtContent>
+          <w:r>
+            <w:rPr>
+              <w:rFonts w:ascii="MS Gothic" w:eastAsia="MS Gothic" w:hAnsi="MS Gothic" w:cs="Segoe UI Symbol" w:hint="eastAsia"/>
+            </w:rPr>
+            <w:t>☐</w:t>
+          </w:r>
+        </w:sdtContent>
+      </w:sdt>
+      <w:r>
+        <w:rPr>
+          <w:rFonts w:ascii="Arial" w:hAnsi="Arial" w:cs="Arial"/>
+        </w:rPr>
+        <w:t xml:space="preserve"> Scartato</w:t>
+      </w:r>
+    </w:p>
+    <w:p>
+      <w:pPr>
+        <w:pStyle w:val="Nessunaspaziatura"/>
+        <w:rPr>
+          <w:rFonts w:ascii="Arial" w:hAnsi="Arial" w:cs="Arial"/>
+        </w:rPr>
+      </w:pPr>
+    </w:p>
+    <w:p>
+      <w:pPr>
+        <w:pStyle w:val="Nessunaspaziatura"/>
+        <w:rPr>
+          <w:rFonts w:ascii="Arial" w:hAnsi="Arial" w:cs="Arial"/>
+        </w:rPr>
+      </w:pPr>
+    </w:p>
+    <w:p>
+      <w:pPr>
+        <w:pStyle w:val="Nessunaspaziatura"/>
+        <w:rPr>
+          <w:rFonts w:ascii="Arial" w:hAnsi="Arial" w:cs="Arial"/>
+        </w:rPr>
+      </w:pPr>
+      <w:r>
+        <w:rPr>
+          <w:rFonts w:ascii="Arial" w:hAnsi="Arial" w:cs="Arial"/>
+          <w:b/>
+          <w:bCs/>
+        </w:rPr>
+        <w:t>Cosa avrei fatto senza AI?</w:t>
+      </w:r>
+    </w:p>
+    <w:p>
+      <w:pPr>
+        <w:pStyle w:val="Nessunaspaziatura"/>
+        <w:rPr>
+          <w:rFonts w:ascii="Arial" w:hAnsi="Arial" w:cs="Arial"/>
+        </w:rPr>
+      </w:pPr>
+      <w:r>
+        <w:rPr>
+          <w:rFonts w:ascii="Arial" w:hAnsi="Arial" w:cs="Arial"/>
+        </w:rPr>
+        <w:t xml:space="preserve">Riley: </w:t>
+      </w:r>
+      <w:r>
+        <w:rPr>
+          <w:rFonts w:ascii="Arial" w:hAnsi="Arial" w:cs="Arial"/>
+        </w:rPr>
+        <w:t>Avrei probabilmente usato comunque l</w:t>
+      </w:r>
+      <w:r>
+        <w:rPr>
+          <w:rFonts w:ascii="Arial" w:hAnsi="Arial" w:cs="Arial"/>
+        </w:rPr>
+        <w:t>’AI ma facendomi mostrare del codice esempio per poi applicare manualmente, altrimenti avrei cercato nelle documentazioni ufficiali.</w:t>
+      </w:r>
+    </w:p>
+    <w:p>
+      <w:pPr>
+        <w:pStyle w:val="Nessunaspaziatura"/>
+        <w:rPr>
+          <w:rFonts w:ascii="Arial" w:hAnsi="Arial" w:cs="Arial"/>
+        </w:rPr>
+      </w:pPr>
+      <w:r>
+        <w:rPr>
+          <w:rFonts w:ascii="Arial" w:hAnsi="Arial" w:cs="Arial"/>
+        </w:rPr>
+        <w:t xml:space="preserve">Bryan: </w:t>
+      </w:r>
+      <w:r>
+        <w:rPr>
+          <w:rFonts w:ascii="Arial" w:hAnsi="Arial" w:cs="Arial"/>
+        </w:rPr>
+        <w:t xml:space="preserve"> Non sarei stato in grado di farlo.</w:t>
       </w:r>
     </w:p>
     <w:p>
@@ -25204,6 +26837,107 @@
         </w:p>
       </w:docPartBody>
     </w:docPart>
+    <w:docPart>
+      <w:docPartPr>
+        <w:name w:val="A50642D10D8E4E31894C975A2EAE4C79"/>
+        <w:category>
+          <w:name w:val="Generale"/>
+          <w:gallery w:val="placeholder"/>
+        </w:category>
+        <w:types>
+          <w:type w:val="bbPlcHdr"/>
+        </w:types>
+        <w:behaviors>
+          <w:behavior w:val="content"/>
+        </w:behaviors>
+        <w:guid w:val="{593A9BFD-8112-42AE-AF3E-BA72A8D71B61}"/>
+      </w:docPartPr>
+      <w:docPartBody>
+        <w:p>
+          <w:pPr>
+            <w:pStyle w:val="A50642D10D8E4E31894C975A2EAE4C79"/>
+          </w:pPr>
+          <w:r>
+            <w:rPr>
+              <w:rStyle w:val="Testosegnaposto"/>
+              <w:b/>
+              <w:bCs/>
+            </w:rPr>
+            <w:t>Nomi AI utilizzati</w:t>
+          </w:r>
+        </w:p>
+      </w:docPartBody>
+    </w:docPart>
+    <w:docPart>
+      <w:docPartPr>
+        <w:name w:val="11028D96C30E4870B503E636E28351A9"/>
+        <w:category>
+          <w:name w:val="Generale"/>
+          <w:gallery w:val="placeholder"/>
+        </w:category>
+        <w:types>
+          <w:type w:val="bbPlcHdr"/>
+        </w:types>
+        <w:behaviors>
+          <w:behavior w:val="content"/>
+        </w:behaviors>
+        <w:guid w:val="{8F40B7F4-8D09-4480-B1D7-3819FE20B25E}"/>
+      </w:docPartPr>
+      <w:docPartBody>
+        <w:p>
+          <w:pPr>
+            <w:pStyle w:val="11028D96C30E4870B503E636E28351A9"/>
+          </w:pPr>
+          <w:r>
+            <w:rPr>
+              <w:rStyle w:val="Testosegnaposto"/>
+            </w:rPr>
+            <w:t>Fare clic o toccare qui per immettere il testo.</w:t>
+          </w:r>
+        </w:p>
+      </w:docPartBody>
+    </w:docPart>
+    <w:docPart>
+      <w:docPartPr>
+        <w:name w:val="DD1A591C0F45438F9C72CC95A6991F47"/>
+        <w:category>
+          <w:name w:val="Generale"/>
+          <w:gallery w:val="placeholder"/>
+        </w:category>
+        <w:types>
+          <w:type w:val="bbPlcHdr"/>
+        </w:types>
+        <w:behaviors>
+          <w:behavior w:val="content"/>
+        </w:behaviors>
+        <w:guid w:val="{43491E4B-D295-4F25-81CA-3BF0A30F930D}"/>
+      </w:docPartPr>
+      <w:docPartBody>
+        <w:p>
+          <w:pPr>
+            <w:pStyle w:val="DD1A591C0F45438F9C72CC95A6991F47"/>
+          </w:pPr>
+          <w:r>
+            <w:rPr>
+              <w:rStyle w:val="Testosegnaposto"/>
+            </w:rPr>
+            <w:t xml:space="preserve">Fare clic o toccare qui per </w:t>
+          </w:r>
+          <w:r>
+            <w:rPr>
+              <w:rStyle w:val="Testosegnaposto"/>
+            </w:rPr>
+            <w:t>immettere</w:t>
+          </w:r>
+          <w:r>
+            <w:rPr>
+              <w:rStyle w:val="Testosegnaposto"/>
+            </w:rPr>
+            <w:t xml:space="preserve"> il testo.</w:t>
+          </w:r>
+        </w:p>
+      </w:docPartBody>
+    </w:docPart>
   </w:docParts>
 </w:glossaryDocument>
 </file>
@@ -25352,6 +27086,7 @@
     <w:rsid w:val="00434CC7"/>
     <w:rsid w:val="004834F6"/>
     <w:rsid w:val="004B57DE"/>
+    <w:rsid w:val="00530FEF"/>
     <w:rsid w:val="00534571"/>
     <w:rsid w:val="00565B11"/>
     <w:rsid w:val="0063588A"/>
@@ -25370,6 +27105,7 @@
     <w:rsid w:val="008736ED"/>
     <w:rsid w:val="0089581E"/>
     <w:rsid w:val="008A28AA"/>
+    <w:rsid w:val="00901364"/>
     <w:rsid w:val="00924F9E"/>
     <w:rsid w:val="009826E2"/>
     <w:rsid w:val="009A56C6"/>
@@ -25385,6 +27121,7 @@
     <w:rsid w:val="00BD3686"/>
     <w:rsid w:val="00BD5007"/>
     <w:rsid w:val="00BE72BC"/>
+    <w:rsid w:val="00C00D0B"/>
     <w:rsid w:val="00C60D7D"/>
     <w:rsid w:val="00D0757F"/>
     <w:rsid w:val="00D53511"/>
@@ -25862,7 +27599,7 @@
     <w:basedOn w:val="Carpredefinitoparagrafo"/>
     <w:uiPriority w:val="99"/>
     <w:semiHidden/>
-    <w:rsid w:val="00C60D7D"/>
+    <w:rsid w:val="00901364"/>
     <w:rPr>
       <w:color w:val="666666"/>
     </w:rPr>
@@ -26079,6 +27816,18 @@
   <w:style w:type="paragraph" w:customStyle="1" w:styleId="64F37972D28244C28D86E1FC202C7FFA">
     <w:name w:val="64F37972D28244C28D86E1FC202C7FFA"/>
     <w:rsid w:val="00C60D7D"/>
+  </w:style>
+  <w:style w:type="paragraph" w:customStyle="1" w:styleId="A50642D10D8E4E31894C975A2EAE4C79">
+    <w:name w:val="A50642D10D8E4E31894C975A2EAE4C79"/>
+    <w:rsid w:val="00901364"/>
+  </w:style>
+  <w:style w:type="paragraph" w:customStyle="1" w:styleId="11028D96C30E4870B503E636E28351A9">
+    <w:name w:val="11028D96C30E4870B503E636E28351A9"/>
+    <w:rsid w:val="00901364"/>
+  </w:style>
+  <w:style w:type="paragraph" w:customStyle="1" w:styleId="DD1A591C0F45438F9C72CC95A6991F47">
+    <w:name w:val="DD1A591C0F45438F9C72CC95A6991F47"/>
+    <w:rsid w:val="00901364"/>
   </w:style>
 </w:styles>
 </file>

</xml_diff>

<commit_message>
modifica sprint planning, impostazione salvate su db (mancano i comandi) e diario
</commit_message>
<xml_diff>
--- a/4_Diari/Diario.docx
+++ b/4_Diari/Diario.docx
@@ -20229,25 +20229,7 @@
               <w:rPr>
                 <w:rFonts w:ascii="Arial" w:hAnsi="Arial" w:cs="Arial"/>
               </w:rPr>
-              <w:t>5</w:t>
-            </w:r>
-            <w:r>
-              <w:rPr>
-                <w:rFonts w:ascii="Arial" w:hAnsi="Arial" w:cs="Arial"/>
-              </w:rPr>
-              <w:t>.</w:t>
-            </w:r>
-            <w:r>
-              <w:rPr>
-                <w:rFonts w:ascii="Arial" w:hAnsi="Arial" w:cs="Arial"/>
-              </w:rPr>
-              <w:t>10</w:t>
-            </w:r>
-            <w:r>
-              <w:rPr>
-                <w:rFonts w:ascii="Arial" w:hAnsi="Arial" w:cs="Arial"/>
-              </w:rPr>
-              <w:t>.2026</w:t>
+              <w:t>5.10.2026</w:t>
             </w:r>
           </w:p>
         </w:tc>
@@ -20711,13 +20693,7 @@
               <w:rPr>
                 <w:rFonts w:ascii="Arial" w:hAnsi="Arial" w:cs="Arial"/>
               </w:rPr>
-              <w:t>ontinuo</w:t>
-            </w:r>
-            <w:r>
-              <w:rPr>
-                <w:rFonts w:ascii="Arial" w:hAnsi="Arial" w:cs="Arial"/>
-              </w:rPr>
-              <w:t xml:space="preserve"> sviluppo db</w:t>
+              <w:t>ontinuo sviluppo db</w:t>
             </w:r>
           </w:p>
           <w:p>
@@ -21772,13 +21748,1607 @@
         <w:rPr>
           <w:rFonts w:ascii="Arial" w:hAnsi="Arial" w:cs="Arial"/>
         </w:rPr>
-        <w:t xml:space="preserve">Bryan: </w:t>
-      </w:r>
-      <w:r>
-        <w:rPr>
-          <w:rFonts w:ascii="Arial" w:hAnsi="Arial" w:cs="Arial"/>
-        </w:rPr>
-        <w:t xml:space="preserve"> Non sarei stato in grado di farlo.</w:t>
+        <w:t>Bryan:</w:t>
+      </w:r>
+      <w:r>
+        <w:rPr>
+          <w:rFonts w:ascii="Arial" w:hAnsi="Arial" w:cs="Arial"/>
+        </w:rPr>
+        <w:t xml:space="preserve"> </w:t>
+      </w:r>
+      <w:r>
+        <w:rPr>
+          <w:rFonts w:ascii="Arial" w:hAnsi="Arial" w:cs="Arial"/>
+        </w:rPr>
+        <w:t>Non sarei stato in grado di farlo.</w:t>
+      </w:r>
+    </w:p>
+    <w:p>
+      <w:pPr>
+        <w:rPr>
+          <w:rFonts w:ascii="Arial" w:hAnsi="Arial" w:cs="Arial"/>
+        </w:rPr>
+      </w:pPr>
+      <w:r>
+        <w:rPr>
+          <w:rFonts w:ascii="Arial" w:hAnsi="Arial" w:cs="Arial"/>
+        </w:rPr>
+        <w:br w:type="page"/>
+      </w:r>
+    </w:p>
+    <w:tbl>
+      <w:tblPr>
+        <w:tblStyle w:val="Grigliatabella"/>
+        <w:tblW w:w="5000" w:type="pct"/>
+        <w:tblLook w:val="04A0" w:firstRow="1" w:lastRow="0" w:firstColumn="1" w:lastColumn="0" w:noHBand="0" w:noVBand="1"/>
+      </w:tblPr>
+      <w:tblGrid>
+        <w:gridCol w:w="2407"/>
+        <w:gridCol w:w="7221"/>
+      </w:tblGrid>
+      <w:tr>
+        <w:trPr>
+          <w:trHeight w:val="199"/>
+        </w:trPr>
+        <w:tc>
+          <w:tcPr>
+            <w:tcW w:w="1250" w:type="pct"/>
+            <w:vAlign w:val="center"/>
+          </w:tcPr>
+          <w:p>
+            <w:pPr>
+              <w:rPr>
+                <w:rFonts w:ascii="Arial" w:hAnsi="Arial" w:cs="Arial"/>
+              </w:rPr>
+            </w:pPr>
+            <w:r>
+              <w:rPr>
+                <w:rFonts w:ascii="Arial" w:hAnsi="Arial" w:cs="Arial"/>
+              </w:rPr>
+              <w:lastRenderedPageBreak/>
+              <w:t>Luogo</w:t>
+            </w:r>
+          </w:p>
+        </w:tc>
+        <w:tc>
+          <w:tcPr>
+            <w:tcW w:w="3750" w:type="pct"/>
+            <w:vAlign w:val="center"/>
+          </w:tcPr>
+          <w:p>
+            <w:pPr>
+              <w:rPr>
+                <w:rFonts w:ascii="Arial" w:hAnsi="Arial" w:cs="Arial"/>
+              </w:rPr>
+            </w:pPr>
+            <w:r>
+              <w:rPr>
+                <w:rFonts w:ascii="Arial" w:hAnsi="Arial" w:cs="Arial"/>
+              </w:rPr>
+              <w:t>Scuola Arti e Mestieri Trevano</w:t>
+            </w:r>
+          </w:p>
+        </w:tc>
+      </w:tr>
+      <w:tr>
+        <w:trPr>
+          <w:trHeight w:val="196"/>
+        </w:trPr>
+        <w:tc>
+          <w:tcPr>
+            <w:tcW w:w="1250" w:type="pct"/>
+            <w:vAlign w:val="center"/>
+          </w:tcPr>
+          <w:p>
+            <w:pPr>
+              <w:rPr>
+                <w:rFonts w:ascii="Arial" w:hAnsi="Arial" w:cs="Arial"/>
+              </w:rPr>
+            </w:pPr>
+            <w:r>
+              <w:rPr>
+                <w:rFonts w:ascii="Arial" w:hAnsi="Arial" w:cs="Arial"/>
+              </w:rPr>
+              <w:t>Data</w:t>
+            </w:r>
+          </w:p>
+        </w:tc>
+        <w:tc>
+          <w:tcPr>
+            <w:tcW w:w="3750" w:type="pct"/>
+            <w:vAlign w:val="center"/>
+          </w:tcPr>
+          <w:p>
+            <w:pPr>
+              <w:rPr>
+                <w:rFonts w:ascii="Arial" w:hAnsi="Arial" w:cs="Arial"/>
+              </w:rPr>
+            </w:pPr>
+            <w:r>
+              <w:rPr>
+                <w:rFonts w:ascii="Arial" w:hAnsi="Arial" w:cs="Arial"/>
+              </w:rPr>
+              <w:t>6</w:t>
+            </w:r>
+            <w:r>
+              <w:rPr>
+                <w:rFonts w:ascii="Arial" w:hAnsi="Arial" w:cs="Arial"/>
+              </w:rPr>
+              <w:t>.10.2026</w:t>
+            </w:r>
+          </w:p>
+        </w:tc>
+      </w:tr>
+    </w:tbl>
+    <w:p>
+      <w:pPr>
+        <w:rPr>
+          <w:rFonts w:ascii="Arial" w:hAnsi="Arial" w:cs="Arial"/>
+        </w:rPr>
+      </w:pPr>
+    </w:p>
+    <w:tbl>
+      <w:tblPr>
+        <w:tblStyle w:val="Grigliatabella"/>
+        <w:tblW w:w="0" w:type="auto"/>
+        <w:tblLook w:val="04A0" w:firstRow="1" w:lastRow="0" w:firstColumn="1" w:lastColumn="0" w:noHBand="0" w:noVBand="1"/>
+      </w:tblPr>
+      <w:tblGrid>
+        <w:gridCol w:w="1271"/>
+        <w:gridCol w:w="8357"/>
+      </w:tblGrid>
+      <w:tr>
+        <w:tc>
+          <w:tcPr>
+            <w:tcW w:w="9628" w:type="dxa"/>
+            <w:gridSpan w:val="2"/>
+            <w:shd w:val="clear" w:color="auto" w:fill="D9D9D9" w:themeFill="background1" w:themeFillShade="D9"/>
+          </w:tcPr>
+          <w:p>
+            <w:pPr>
+              <w:rPr>
+                <w:rFonts w:ascii="Arial" w:hAnsi="Arial" w:cs="Arial"/>
+              </w:rPr>
+            </w:pPr>
+            <w:r>
+              <w:rPr>
+                <w:rFonts w:ascii="Arial" w:hAnsi="Arial" w:cs="Arial"/>
+              </w:rPr>
+              <w:t>Lavori svolti</w:t>
+            </w:r>
+          </w:p>
+        </w:tc>
+      </w:tr>
+      <w:tr>
+        <w:tc>
+          <w:tcPr>
+            <w:tcW w:w="1271" w:type="dxa"/>
+          </w:tcPr>
+          <w:p>
+            <w:pPr>
+              <w:rPr>
+                <w:rFonts w:ascii="Arial" w:hAnsi="Arial" w:cs="Arial"/>
+              </w:rPr>
+            </w:pPr>
+            <w:r>
+              <w:rPr>
+                <w:rFonts w:ascii="Arial" w:hAnsi="Arial" w:cs="Arial"/>
+              </w:rPr>
+              <w:t>Riley</w:t>
+            </w:r>
+          </w:p>
+        </w:tc>
+        <w:tc>
+          <w:tcPr>
+            <w:tcW w:w="8357" w:type="dxa"/>
+          </w:tcPr>
+          <w:p>
+            <w:pPr>
+              <w:rPr>
+                <w:rFonts w:ascii="Arial" w:hAnsi="Arial" w:cs="Arial"/>
+              </w:rPr>
+            </w:pPr>
+            <w:r>
+              <w:rPr>
+                <w:rFonts w:ascii="Arial" w:hAnsi="Arial" w:cs="Arial"/>
+              </w:rPr>
+              <w:t>Continuo sviluppo DB, manca l’inserimento dei comandi e un sistema di autenticazione per avere più record.</w:t>
+            </w:r>
+          </w:p>
+        </w:tc>
+      </w:tr>
+      <w:tr>
+        <w:tc>
+          <w:tcPr>
+            <w:tcW w:w="1271" w:type="dxa"/>
+          </w:tcPr>
+          <w:p>
+            <w:pPr>
+              <w:rPr>
+                <w:rFonts w:ascii="Arial" w:hAnsi="Arial" w:cs="Arial"/>
+              </w:rPr>
+            </w:pPr>
+            <w:r>
+              <w:rPr>
+                <w:rFonts w:ascii="Arial" w:hAnsi="Arial" w:cs="Arial"/>
+              </w:rPr>
+              <w:t>Bryan</w:t>
+            </w:r>
+          </w:p>
+        </w:tc>
+        <w:tc>
+          <w:tcPr>
+            <w:tcW w:w="8357" w:type="dxa"/>
+          </w:tcPr>
+          <w:p>
+            <w:pPr>
+              <w:rPr>
+                <w:rFonts w:ascii="Arial" w:hAnsi="Arial" w:cs="Arial"/>
+              </w:rPr>
+            </w:pPr>
+            <w:r>
+              <w:rPr>
+                <w:rFonts w:ascii="Arial" w:hAnsi="Arial" w:cs="Arial"/>
+              </w:rPr>
+              <w:t>Ho sistemato un problema di animazione, creato il build del progetto per certi test, ricerca modifica materiali auto ed inizio menu garage</w:t>
+            </w:r>
+          </w:p>
+        </w:tc>
+      </w:tr>
+    </w:tbl>
+    <w:p>
+      <w:pPr>
+        <w:rPr>
+          <w:rFonts w:ascii="Arial" w:hAnsi="Arial" w:cs="Arial"/>
+        </w:rPr>
+      </w:pPr>
+    </w:p>
+    <w:tbl>
+      <w:tblPr>
+        <w:tblStyle w:val="Grigliatabella"/>
+        <w:tblW w:w="0" w:type="auto"/>
+        <w:tblInd w:w="-5" w:type="dxa"/>
+        <w:tblLook w:val="04A0" w:firstRow="1" w:lastRow="0" w:firstColumn="1" w:lastColumn="0" w:noHBand="0" w:noVBand="1"/>
+      </w:tblPr>
+      <w:tblGrid>
+        <w:gridCol w:w="1276"/>
+        <w:gridCol w:w="8357"/>
+      </w:tblGrid>
+      <w:tr>
+        <w:tc>
+          <w:tcPr>
+            <w:tcW w:w="9628" w:type="dxa"/>
+            <w:gridSpan w:val="2"/>
+            <w:shd w:val="clear" w:color="auto" w:fill="D9D9D9" w:themeFill="background1" w:themeFillShade="D9"/>
+          </w:tcPr>
+          <w:p>
+            <w:pPr>
+              <w:rPr>
+                <w:rFonts w:ascii="Arial" w:hAnsi="Arial" w:cs="Arial"/>
+              </w:rPr>
+            </w:pPr>
+            <w:r>
+              <w:rPr>
+                <w:rFonts w:ascii="Arial" w:hAnsi="Arial" w:cs="Arial"/>
+              </w:rPr>
+              <w:t>Problemi riscontrati e soluzioni adottate</w:t>
+            </w:r>
+          </w:p>
+        </w:tc>
+      </w:tr>
+      <w:tr>
+        <w:tc>
+          <w:tcPr>
+            <w:tcW w:w="1276" w:type="dxa"/>
+          </w:tcPr>
+          <w:p>
+            <w:pPr>
+              <w:rPr>
+                <w:rFonts w:ascii="Arial" w:hAnsi="Arial" w:cs="Arial"/>
+              </w:rPr>
+            </w:pPr>
+            <w:r>
+              <w:rPr>
+                <w:rFonts w:ascii="Arial" w:hAnsi="Arial" w:cs="Arial"/>
+              </w:rPr>
+              <w:t>Riley</w:t>
+            </w:r>
+          </w:p>
+        </w:tc>
+        <w:tc>
+          <w:tcPr>
+            <w:tcW w:w="8357" w:type="dxa"/>
+          </w:tcPr>
+          <w:p>
+            <w:pPr>
+              <w:rPr>
+                <w:rFonts w:ascii="Arial" w:hAnsi="Arial" w:cs="Arial"/>
+              </w:rPr>
+            </w:pPr>
+            <w:r>
+              <w:rPr>
+                <w:rFonts w:ascii="Arial" w:hAnsi="Arial" w:cs="Arial"/>
+              </w:rPr>
+              <w:t>-</w:t>
+            </w:r>
+          </w:p>
+        </w:tc>
+      </w:tr>
+      <w:tr>
+        <w:tc>
+          <w:tcPr>
+            <w:tcW w:w="1276" w:type="dxa"/>
+          </w:tcPr>
+          <w:p>
+            <w:pPr>
+              <w:rPr>
+                <w:rFonts w:ascii="Arial" w:hAnsi="Arial" w:cs="Arial"/>
+              </w:rPr>
+            </w:pPr>
+            <w:r>
+              <w:rPr>
+                <w:rFonts w:ascii="Arial" w:hAnsi="Arial" w:cs="Arial"/>
+              </w:rPr>
+              <w:t>Bryan</w:t>
+            </w:r>
+          </w:p>
+        </w:tc>
+        <w:tc>
+          <w:tcPr>
+            <w:tcW w:w="8357" w:type="dxa"/>
+          </w:tcPr>
+          <w:p>
+            <w:pPr>
+              <w:rPr>
+                <w:rFonts w:ascii="Arial" w:hAnsi="Arial" w:cs="Arial"/>
+              </w:rPr>
+            </w:pPr>
+            <w:r>
+              <w:rPr>
+                <w:rFonts w:ascii="Arial" w:hAnsi="Arial" w:cs="Arial"/>
+              </w:rPr>
+              <w:t>-</w:t>
+            </w:r>
+          </w:p>
+        </w:tc>
+      </w:tr>
+    </w:tbl>
+    <w:p>
+      <w:pPr>
+        <w:rPr>
+          <w:rFonts w:ascii="Arial" w:hAnsi="Arial" w:cs="Arial"/>
+        </w:rPr>
+      </w:pPr>
+    </w:p>
+    <w:tbl>
+      <w:tblPr>
+        <w:tblStyle w:val="Grigliatabella"/>
+        <w:tblW w:w="0" w:type="auto"/>
+        <w:tblLook w:val="04A0" w:firstRow="1" w:lastRow="0" w:firstColumn="1" w:lastColumn="0" w:noHBand="0" w:noVBand="1"/>
+      </w:tblPr>
+      <w:tblGrid>
+        <w:gridCol w:w="9628"/>
+      </w:tblGrid>
+      <w:tr>
+        <w:tc>
+          <w:tcPr>
+            <w:tcW w:w="9854" w:type="dxa"/>
+            <w:shd w:val="clear" w:color="auto" w:fill="D9D9D9" w:themeFill="background1" w:themeFillShade="D9"/>
+          </w:tcPr>
+          <w:p>
+            <w:pPr>
+              <w:rPr>
+                <w:rFonts w:ascii="Arial" w:hAnsi="Arial" w:cs="Arial"/>
+              </w:rPr>
+            </w:pPr>
+            <w:r>
+              <w:rPr>
+                <w:rFonts w:ascii="Arial" w:hAnsi="Arial" w:cs="Arial"/>
+              </w:rPr>
+              <w:t>Punto della situazione rispetto alla pianificazione</w:t>
+            </w:r>
+          </w:p>
+        </w:tc>
+      </w:tr>
+      <w:tr>
+        <w:tc>
+          <w:tcPr>
+            <w:tcW w:w="9854" w:type="dxa"/>
+          </w:tcPr>
+          <w:p>
+            <w:pPr>
+              <w:rPr>
+                <w:rFonts w:ascii="Arial" w:hAnsi="Arial" w:cs="Arial"/>
+              </w:rPr>
+            </w:pPr>
+            <w:r>
+              <w:rPr>
+                <w:rFonts w:ascii="Arial" w:hAnsi="Arial" w:cs="Arial"/>
+              </w:rPr>
+              <w:t>Stiamo continuando a fare modifiche extra avendo già terminato lo sprint</w:t>
+            </w:r>
+          </w:p>
+        </w:tc>
+      </w:tr>
+    </w:tbl>
+    <w:p>
+      <w:pPr>
+        <w:rPr>
+          <w:rFonts w:ascii="Arial" w:hAnsi="Arial" w:cs="Arial"/>
+        </w:rPr>
+      </w:pPr>
+    </w:p>
+    <w:tbl>
+      <w:tblPr>
+        <w:tblStyle w:val="Grigliatabella"/>
+        <w:tblW w:w="0" w:type="auto"/>
+        <w:tblLook w:val="04A0" w:firstRow="1" w:lastRow="0" w:firstColumn="1" w:lastColumn="0" w:noHBand="0" w:noVBand="1"/>
+      </w:tblPr>
+      <w:tblGrid>
+        <w:gridCol w:w="9628"/>
+      </w:tblGrid>
+      <w:tr>
+        <w:tc>
+          <w:tcPr>
+            <w:tcW w:w="9854" w:type="dxa"/>
+            <w:shd w:val="clear" w:color="auto" w:fill="D9D9D9" w:themeFill="background1" w:themeFillShade="D9"/>
+          </w:tcPr>
+          <w:p>
+            <w:pPr>
+              <w:rPr>
+                <w:rFonts w:ascii="Arial" w:hAnsi="Arial" w:cs="Arial"/>
+              </w:rPr>
+            </w:pPr>
+            <w:r>
+              <w:rPr>
+                <w:rFonts w:ascii="Arial" w:hAnsi="Arial" w:cs="Arial"/>
+              </w:rPr>
+              <w:t>Programma di massima per la prossima giornata di lavoro</w:t>
+            </w:r>
+          </w:p>
+        </w:tc>
+      </w:tr>
+      <w:tr>
+        <w:tc>
+          <w:tcPr>
+            <w:tcW w:w="9854" w:type="dxa"/>
+          </w:tcPr>
+          <w:p>
+            <w:pPr>
+              <w:rPr>
+                <w:rFonts w:ascii="Arial" w:hAnsi="Arial" w:cs="Arial"/>
+              </w:rPr>
+            </w:pPr>
+            <w:r>
+              <w:rPr>
+                <w:rFonts w:ascii="Arial" w:hAnsi="Arial" w:cs="Arial"/>
+              </w:rPr>
+              <w:t>Continuare sviluppo garage e db.</w:t>
+            </w:r>
+          </w:p>
+        </w:tc>
+      </w:tr>
+    </w:tbl>
+    <w:p>
+      <w:pPr>
+        <w:rPr>
+          <w:rFonts w:ascii="Arial" w:hAnsi="Arial" w:cs="Arial"/>
+        </w:rPr>
+      </w:pPr>
+    </w:p>
+    <w:p>
+      <w:pPr>
+        <w:pStyle w:val="Titolo1"/>
+      </w:pPr>
+      <w:r>
+        <w:t>Agile - Resoconto</w:t>
+      </w:r>
+    </w:p>
+    <w:tbl>
+      <w:tblPr>
+        <w:tblStyle w:val="Grigliatabella"/>
+        <w:tblW w:w="0" w:type="auto"/>
+        <w:tblLook w:val="04A0" w:firstRow="1" w:lastRow="0" w:firstColumn="1" w:lastColumn="0" w:noHBand="0" w:noVBand="1"/>
+      </w:tblPr>
+      <w:tblGrid>
+        <w:gridCol w:w="9628"/>
+      </w:tblGrid>
+      <w:tr>
+        <w:tc>
+          <w:tcPr>
+            <w:tcW w:w="9628" w:type="dxa"/>
+            <w:tcBorders>
+              <w:top w:val="single" w:sz="4" w:space="0" w:color="auto"/>
+              <w:left w:val="single" w:sz="4" w:space="0" w:color="auto"/>
+              <w:bottom w:val="single" w:sz="4" w:space="0" w:color="auto"/>
+              <w:right w:val="single" w:sz="4" w:space="0" w:color="auto"/>
+            </w:tcBorders>
+            <w:shd w:val="clear" w:color="auto" w:fill="D9D9D9" w:themeFill="background1" w:themeFillShade="D9"/>
+            <w:hideMark/>
+          </w:tcPr>
+          <w:p>
+            <w:pPr>
+              <w:spacing w:after="200" w:line="276" w:lineRule="auto"/>
+              <w:rPr>
+                <w:rFonts w:ascii="Arial" w:hAnsi="Arial" w:cs="Arial"/>
+              </w:rPr>
+            </w:pPr>
+            <w:r>
+              <w:rPr>
+                <w:rFonts w:ascii="Arial" w:hAnsi="Arial" w:cs="Arial"/>
+              </w:rPr>
+              <w:t>Daily Scrum</w:t>
+            </w:r>
+          </w:p>
+        </w:tc>
+      </w:tr>
+      <w:tr>
+        <w:tc>
+          <w:tcPr>
+            <w:tcW w:w="9628" w:type="dxa"/>
+            <w:tcBorders>
+              <w:top w:val="single" w:sz="4" w:space="0" w:color="auto"/>
+              <w:left w:val="single" w:sz="4" w:space="0" w:color="auto"/>
+              <w:bottom w:val="single" w:sz="4" w:space="0" w:color="auto"/>
+              <w:right w:val="single" w:sz="4" w:space="0" w:color="auto"/>
+            </w:tcBorders>
+            <w:hideMark/>
+          </w:tcPr>
+          <w:p>
+            <w:pPr>
+              <w:spacing w:after="200" w:line="276" w:lineRule="auto"/>
+              <w:rPr>
+                <w:rFonts w:ascii="Arial" w:hAnsi="Arial" w:cs="Arial"/>
+              </w:rPr>
+            </w:pPr>
+          </w:p>
+        </w:tc>
+      </w:tr>
+      <w:tr>
+        <w:tc>
+          <w:tcPr>
+            <w:tcW w:w="9628" w:type="dxa"/>
+            <w:tcBorders>
+              <w:top w:val="single" w:sz="4" w:space="0" w:color="auto"/>
+              <w:left w:val="single" w:sz="4" w:space="0" w:color="auto"/>
+              <w:bottom w:val="single" w:sz="4" w:space="0" w:color="auto"/>
+              <w:right w:val="single" w:sz="4" w:space="0" w:color="auto"/>
+            </w:tcBorders>
+          </w:tcPr>
+          <w:p>
+            <w:pPr>
+              <w:spacing w:after="200" w:line="276" w:lineRule="auto"/>
+              <w:rPr>
+                <w:rFonts w:ascii="Arial" w:hAnsi="Arial" w:cs="Arial"/>
+              </w:rPr>
+            </w:pPr>
+            <w:r>
+              <w:rPr>
+                <w:rFonts w:ascii="Arial" w:hAnsi="Arial" w:cs="Arial"/>
+              </w:rPr>
+              <w:t>Riley: Continuo sviluppo db</w:t>
+            </w:r>
+          </w:p>
+          <w:p>
+            <w:pPr>
+              <w:spacing w:after="200" w:line="276" w:lineRule="auto"/>
+              <w:rPr>
+                <w:rFonts w:ascii="Arial" w:hAnsi="Arial" w:cs="Arial"/>
+              </w:rPr>
+            </w:pPr>
+            <w:r>
+              <w:rPr>
+                <w:rFonts w:ascii="Arial" w:hAnsi="Arial" w:cs="Arial"/>
+              </w:rPr>
+              <w:t xml:space="preserve">Bryan: </w:t>
+            </w:r>
+            <w:r>
+              <w:rPr>
+                <w:rFonts w:ascii="Arial" w:hAnsi="Arial" w:cs="Arial"/>
+              </w:rPr>
+              <w:t>Sviluppo garage</w:t>
+            </w:r>
+          </w:p>
+        </w:tc>
+      </w:tr>
+    </w:tbl>
+    <w:p>
+      <w:pPr>
+        <w:rPr>
+          <w:rFonts w:ascii="Arial" w:hAnsi="Arial" w:cs="Arial"/>
+        </w:rPr>
+      </w:pPr>
+    </w:p>
+    <w:tbl>
+      <w:tblPr>
+        <w:tblStyle w:val="Grigliatabella"/>
+        <w:tblW w:w="0" w:type="auto"/>
+        <w:tblLook w:val="04A0" w:firstRow="1" w:lastRow="0" w:firstColumn="1" w:lastColumn="0" w:noHBand="0" w:noVBand="1"/>
+      </w:tblPr>
+      <w:tblGrid>
+        <w:gridCol w:w="9628"/>
+      </w:tblGrid>
+      <w:tr>
+        <w:tc>
+          <w:tcPr>
+            <w:tcW w:w="9854" w:type="dxa"/>
+            <w:tcBorders>
+              <w:top w:val="single" w:sz="4" w:space="0" w:color="auto"/>
+              <w:left w:val="single" w:sz="4" w:space="0" w:color="auto"/>
+              <w:bottom w:val="single" w:sz="4" w:space="0" w:color="auto"/>
+              <w:right w:val="single" w:sz="4" w:space="0" w:color="auto"/>
+            </w:tcBorders>
+            <w:shd w:val="clear" w:color="auto" w:fill="D9D9D9" w:themeFill="background1" w:themeFillShade="D9"/>
+            <w:hideMark/>
+          </w:tcPr>
+          <w:p>
+            <w:pPr>
+              <w:spacing w:after="200" w:line="276" w:lineRule="auto"/>
+              <w:rPr>
+                <w:rFonts w:ascii="Arial" w:hAnsi="Arial" w:cs="Arial"/>
+              </w:rPr>
+            </w:pPr>
+            <w:r>
+              <w:rPr>
+                <w:rFonts w:ascii="Arial" w:hAnsi="Arial" w:cs="Arial"/>
+              </w:rPr>
+              <w:t>Sprint Planning</w:t>
+            </w:r>
+          </w:p>
+        </w:tc>
+      </w:tr>
+      <w:tr>
+        <w:tc>
+          <w:tcPr>
+            <w:tcW w:w="9854" w:type="dxa"/>
+            <w:tcBorders>
+              <w:top w:val="single" w:sz="4" w:space="0" w:color="auto"/>
+              <w:left w:val="single" w:sz="4" w:space="0" w:color="auto"/>
+              <w:bottom w:val="single" w:sz="4" w:space="0" w:color="auto"/>
+              <w:right w:val="single" w:sz="4" w:space="0" w:color="auto"/>
+            </w:tcBorders>
+          </w:tcPr>
+          <w:p>
+            <w:pPr>
+              <w:spacing w:after="200" w:line="276" w:lineRule="auto"/>
+              <w:rPr>
+                <w:rFonts w:ascii="Arial" w:hAnsi="Arial" w:cs="Arial"/>
+              </w:rPr>
+            </w:pPr>
+          </w:p>
+        </w:tc>
+      </w:tr>
+    </w:tbl>
+    <w:p>
+      <w:pPr>
+        <w:rPr>
+          <w:rFonts w:ascii="Arial" w:hAnsi="Arial" w:cs="Arial"/>
+        </w:rPr>
+      </w:pPr>
+    </w:p>
+    <w:tbl>
+      <w:tblPr>
+        <w:tblStyle w:val="Grigliatabella"/>
+        <w:tblW w:w="0" w:type="auto"/>
+        <w:tblLook w:val="04A0" w:firstRow="1" w:lastRow="0" w:firstColumn="1" w:lastColumn="0" w:noHBand="0" w:noVBand="1"/>
+      </w:tblPr>
+      <w:tblGrid>
+        <w:gridCol w:w="9628"/>
+      </w:tblGrid>
+      <w:tr>
+        <w:tc>
+          <w:tcPr>
+            <w:tcW w:w="9854" w:type="dxa"/>
+            <w:tcBorders>
+              <w:top w:val="single" w:sz="4" w:space="0" w:color="auto"/>
+              <w:left w:val="single" w:sz="4" w:space="0" w:color="auto"/>
+              <w:bottom w:val="single" w:sz="4" w:space="0" w:color="auto"/>
+              <w:right w:val="single" w:sz="4" w:space="0" w:color="auto"/>
+            </w:tcBorders>
+            <w:shd w:val="clear" w:color="auto" w:fill="D9D9D9" w:themeFill="background1" w:themeFillShade="D9"/>
+            <w:hideMark/>
+          </w:tcPr>
+          <w:p>
+            <w:pPr>
+              <w:spacing w:after="200" w:line="276" w:lineRule="auto"/>
+              <w:rPr>
+                <w:rFonts w:ascii="Arial" w:hAnsi="Arial" w:cs="Arial"/>
+              </w:rPr>
+            </w:pPr>
+            <w:r>
+              <w:rPr>
+                <w:rFonts w:ascii="Arial" w:hAnsi="Arial" w:cs="Arial"/>
+              </w:rPr>
+              <w:t>Sprint Review</w:t>
+            </w:r>
+          </w:p>
+        </w:tc>
+      </w:tr>
+      <w:tr>
+        <w:tc>
+          <w:tcPr>
+            <w:tcW w:w="9854" w:type="dxa"/>
+            <w:tcBorders>
+              <w:top w:val="single" w:sz="4" w:space="0" w:color="auto"/>
+              <w:left w:val="single" w:sz="4" w:space="0" w:color="auto"/>
+              <w:bottom w:val="single" w:sz="4" w:space="0" w:color="auto"/>
+              <w:right w:val="single" w:sz="4" w:space="0" w:color="auto"/>
+            </w:tcBorders>
+          </w:tcPr>
+          <w:p>
+            <w:pPr>
+              <w:spacing w:after="200" w:line="276" w:lineRule="auto"/>
+              <w:rPr>
+                <w:rFonts w:ascii="Arial" w:hAnsi="Arial" w:cs="Arial"/>
+              </w:rPr>
+            </w:pPr>
+          </w:p>
+        </w:tc>
+      </w:tr>
+    </w:tbl>
+    <w:p>
+      <w:pPr>
+        <w:rPr>
+          <w:rFonts w:ascii="Arial" w:hAnsi="Arial" w:cs="Arial"/>
+        </w:rPr>
+      </w:pPr>
+    </w:p>
+    <w:tbl>
+      <w:tblPr>
+        <w:tblStyle w:val="Grigliatabella"/>
+        <w:tblW w:w="0" w:type="auto"/>
+        <w:tblLook w:val="04A0" w:firstRow="1" w:lastRow="0" w:firstColumn="1" w:lastColumn="0" w:noHBand="0" w:noVBand="1"/>
+      </w:tblPr>
+      <w:tblGrid>
+        <w:gridCol w:w="9628"/>
+      </w:tblGrid>
+      <w:tr>
+        <w:tc>
+          <w:tcPr>
+            <w:tcW w:w="9854" w:type="dxa"/>
+            <w:tcBorders>
+              <w:top w:val="single" w:sz="4" w:space="0" w:color="auto"/>
+              <w:left w:val="single" w:sz="4" w:space="0" w:color="auto"/>
+              <w:bottom w:val="single" w:sz="4" w:space="0" w:color="auto"/>
+              <w:right w:val="single" w:sz="4" w:space="0" w:color="auto"/>
+            </w:tcBorders>
+            <w:shd w:val="clear" w:color="auto" w:fill="D9D9D9" w:themeFill="background1" w:themeFillShade="D9"/>
+            <w:hideMark/>
+          </w:tcPr>
+          <w:p>
+            <w:pPr>
+              <w:spacing w:after="200" w:line="276" w:lineRule="auto"/>
+              <w:rPr>
+                <w:rFonts w:ascii="Arial" w:hAnsi="Arial" w:cs="Arial"/>
+              </w:rPr>
+            </w:pPr>
+            <w:r>
+              <w:rPr>
+                <w:rFonts w:ascii="Arial" w:hAnsi="Arial" w:cs="Arial"/>
+              </w:rPr>
+              <w:t>Sprint Retrospective</w:t>
+            </w:r>
+          </w:p>
+        </w:tc>
+      </w:tr>
+      <w:tr>
+        <w:tc>
+          <w:tcPr>
+            <w:tcW w:w="9854" w:type="dxa"/>
+            <w:tcBorders>
+              <w:top w:val="single" w:sz="4" w:space="0" w:color="auto"/>
+              <w:left w:val="single" w:sz="4" w:space="0" w:color="auto"/>
+              <w:bottom w:val="single" w:sz="4" w:space="0" w:color="auto"/>
+              <w:right w:val="single" w:sz="4" w:space="0" w:color="auto"/>
+            </w:tcBorders>
+          </w:tcPr>
+          <w:p>
+            <w:pPr>
+              <w:spacing w:after="200" w:line="276" w:lineRule="auto"/>
+              <w:rPr>
+                <w:rFonts w:ascii="Arial" w:hAnsi="Arial" w:cs="Arial"/>
+              </w:rPr>
+            </w:pPr>
+          </w:p>
+        </w:tc>
+      </w:tr>
+    </w:tbl>
+    <w:p>
+      <w:pPr>
+        <w:rPr>
+          <w:rFonts w:ascii="Arial" w:hAnsi="Arial" w:cs="Arial"/>
+        </w:rPr>
+      </w:pPr>
+    </w:p>
+    <w:p>
+      <w:pPr>
+        <w:rPr>
+          <w:rFonts w:ascii="Arial" w:hAnsi="Arial" w:cs="Arial"/>
+        </w:rPr>
+      </w:pPr>
+      <w:r>
+        <w:rPr>
+          <w:rFonts w:ascii="Arial" w:hAnsi="Arial" w:cs="Arial"/>
+        </w:rPr>
+        <w:br w:type="page"/>
+      </w:r>
+    </w:p>
+    <w:p>
+      <w:pPr>
+        <w:pStyle w:val="Titolo2"/>
+        <w:pBdr>
+          <w:bottom w:val="single" w:sz="4" w:space="1" w:color="auto"/>
+        </w:pBdr>
+      </w:pPr>
+      <w:r>
+        <w:lastRenderedPageBreak/>
+        <w:t>Utilizzo Intelligenza Artificiale</w:t>
+      </w:r>
+      <w:r>
+        <w:t xml:space="preserve"> nella giornata</w:t>
+      </w:r>
+    </w:p>
+    <w:p>
+      <w:pPr>
+        <w:pStyle w:val="Nessunaspaziatura"/>
+        <w:rPr>
+          <w:rFonts w:ascii="Arial" w:hAnsi="Arial" w:cs="Arial"/>
+          <w:b/>
+          <w:bCs/>
+        </w:rPr>
+      </w:pPr>
+    </w:p>
+    <w:p>
+      <w:pPr>
+        <w:pStyle w:val="Nessunaspaziatura"/>
+        <w:rPr>
+          <w:rFonts w:ascii="Arial" w:hAnsi="Arial" w:cs="Arial"/>
+        </w:rPr>
+      </w:pPr>
+      <w:sdt>
+        <w:sdtPr>
+          <w:rPr>
+            <w:rFonts w:ascii="Segoe UI Symbol" w:hAnsi="Segoe UI Symbol" w:cs="Segoe UI Symbol"/>
+          </w:rPr>
+          <w:id w:val="1541323203"/>
+          <w14:checkbox>
+            <w14:checked w14:val="1"/>
+            <w14:checkedState w14:val="2612" w14:font="MS Gothic"/>
+            <w14:uncheckedState w14:val="2610" w14:font="MS Gothic"/>
+          </w14:checkbox>
+        </w:sdtPr>
+        <w:sdtContent>
+          <w:r>
+            <w:rPr>
+              <w:rFonts w:ascii="MS Gothic" w:eastAsia="MS Gothic" w:hAnsi="MS Gothic" w:cs="Segoe UI Symbol" w:hint="eastAsia"/>
+            </w:rPr>
+            <w:t>☒</w:t>
+          </w:r>
+        </w:sdtContent>
+      </w:sdt>
+      <w:r>
+        <w:rPr>
+          <w:rFonts w:ascii="Arial" w:hAnsi="Arial" w:cs="Arial"/>
+        </w:rPr>
+        <w:t xml:space="preserve"> Nessuno</w:t>
+      </w:r>
+      <w:r>
+        <w:br/>
+      </w:r>
+      <w:sdt>
+        <w:sdtPr>
+          <w:rPr>
+            <w:rFonts w:ascii="Segoe UI Symbol" w:hAnsi="Segoe UI Symbol" w:cs="Segoe UI Symbol"/>
+          </w:rPr>
+          <w:id w:val="-466898800"/>
+          <w14:checkbox>
+            <w14:checked w14:val="0"/>
+            <w14:checkedState w14:val="2612" w14:font="MS Gothic"/>
+            <w14:uncheckedState w14:val="2610" w14:font="MS Gothic"/>
+          </w14:checkbox>
+        </w:sdtPr>
+        <w:sdtContent>
+          <w:r>
+            <w:rPr>
+              <w:rFonts w:ascii="MS Gothic" w:eastAsia="MS Gothic" w:hAnsi="MS Gothic" w:cs="Segoe UI Symbol" w:hint="eastAsia"/>
+            </w:rPr>
+            <w:t>☐</w:t>
+          </w:r>
+        </w:sdtContent>
+      </w:sdt>
+      <w:r>
+        <w:rPr>
+          <w:rFonts w:ascii="Arial" w:hAnsi="Arial" w:cs="Arial"/>
+        </w:rPr>
+        <w:t xml:space="preserve"> Occasionale</w:t>
+      </w:r>
+      <w:r>
+        <w:br/>
+      </w:r>
+      <w:sdt>
+        <w:sdtPr>
+          <w:rPr>
+            <w:rFonts w:ascii="Segoe UI Symbol" w:hAnsi="Segoe UI Symbol" w:cs="Segoe UI Symbol"/>
+          </w:rPr>
+          <w:id w:val="-180736801"/>
+          <w14:checkbox>
+            <w14:checked w14:val="0"/>
+            <w14:checkedState w14:val="2612" w14:font="MS Gothic"/>
+            <w14:uncheckedState w14:val="2610" w14:font="MS Gothic"/>
+          </w14:checkbox>
+        </w:sdtPr>
+        <w:sdtContent>
+          <w:r>
+            <w:rPr>
+              <w:rFonts w:ascii="MS Gothic" w:eastAsia="MS Gothic" w:hAnsi="MS Gothic" w:cs="Segoe UI Symbol" w:hint="eastAsia"/>
+            </w:rPr>
+            <w:t>☐</w:t>
+          </w:r>
+        </w:sdtContent>
+      </w:sdt>
+      <w:r>
+        <w:rPr>
+          <w:rFonts w:ascii="Arial" w:hAnsi="Arial" w:cs="Arial"/>
+        </w:rPr>
+        <w:t xml:space="preserve"> Frequente</w:t>
+      </w:r>
+    </w:p>
+    <w:p>
+      <w:pPr>
+        <w:pStyle w:val="Nessunaspaziatura"/>
+        <w:rPr>
+          <w:rFonts w:ascii="Arial" w:hAnsi="Arial" w:cs="Arial"/>
+        </w:rPr>
+      </w:pPr>
+    </w:p>
+    <w:p>
+      <w:pPr>
+        <w:pStyle w:val="Nessunaspaziatura"/>
+        <w:spacing w:line="276" w:lineRule="auto"/>
+        <w:rPr>
+          <w:rFonts w:ascii="Arial" w:hAnsi="Arial" w:cs="Arial"/>
+        </w:rPr>
+      </w:pPr>
+      <w:r>
+        <w:rPr>
+          <w:rFonts w:ascii="Arial" w:hAnsi="Arial" w:cs="Arial"/>
+          <w:b/>
+          <w:bCs/>
+        </w:rPr>
+        <w:t>Strumento/i utilizzato/i</w:t>
+      </w:r>
+      <w:r>
+        <w:rPr>
+          <w:rFonts w:ascii="Arial" w:hAnsi="Arial" w:cs="Arial"/>
+          <w:b/>
+          <w:bCs/>
+        </w:rPr>
+        <w:t xml:space="preserve"> </w:t>
+      </w:r>
+      <w:r>
+        <w:rPr>
+          <w:rFonts w:ascii="Arial" w:hAnsi="Arial" w:cs="Arial"/>
+        </w:rPr>
+        <w:t>(es. ChatGPT)</w:t>
+      </w:r>
+      <w:r>
+        <w:rPr>
+          <w:rFonts w:ascii="Arial" w:hAnsi="Arial" w:cs="Arial"/>
+        </w:rPr>
+        <w:t xml:space="preserve">: </w:t>
+      </w:r>
+      <w:sdt>
+        <w:sdtPr>
+          <w:rPr>
+            <w:rFonts w:ascii="Arial" w:hAnsi="Arial" w:cs="Arial"/>
+          </w:rPr>
+          <w:id w:val="-1305533756"/>
+          <w:placeholder>
+            <w:docPart w:val="19C68653001B441C9DF07D1F950044D6"/>
+          </w:placeholder>
+          <w:showingPlcHdr/>
+        </w:sdtPr>
+        <w:sdtContent>
+          <w:r>
+            <w:rPr>
+              <w:rStyle w:val="Testosegnaposto"/>
+              <w:b/>
+              <w:bCs/>
+            </w:rPr>
+            <w:t>Nomi AI utilizzati</w:t>
+          </w:r>
+        </w:sdtContent>
+      </w:sdt>
+    </w:p>
+    <w:p>
+      <w:pPr>
+        <w:pStyle w:val="Nessunaspaziatura"/>
+        <w:rPr>
+          <w:rFonts w:ascii="Arial" w:hAnsi="Arial" w:cs="Arial"/>
+        </w:rPr>
+      </w:pPr>
+    </w:p>
+    <w:p>
+      <w:pPr>
+        <w:pStyle w:val="Nessunaspaziatura"/>
+        <w:rPr>
+          <w:rFonts w:ascii="Arial" w:hAnsi="Arial" w:cs="Arial"/>
+        </w:rPr>
+      </w:pPr>
+      <w:r>
+        <w:rPr>
+          <w:rFonts w:ascii="Arial" w:hAnsi="Arial" w:cs="Arial"/>
+          <w:b/>
+          <w:bCs/>
+        </w:rPr>
+        <w:t>Per cosa l’ho usata oggi</w:t>
+      </w:r>
+      <w:r>
+        <w:br/>
+      </w:r>
+      <w:sdt>
+        <w:sdtPr>
+          <w:rPr>
+            <w:rFonts w:ascii="Segoe UI Symbol" w:hAnsi="Segoe UI Symbol" w:cs="Segoe UI Symbol"/>
+          </w:rPr>
+          <w:id w:val="174235497"/>
+          <w14:checkbox>
+            <w14:checked w14:val="0"/>
+            <w14:checkedState w14:val="2612" w14:font="MS Gothic"/>
+            <w14:uncheckedState w14:val="2610" w14:font="MS Gothic"/>
+          </w14:checkbox>
+        </w:sdtPr>
+        <w:sdtContent>
+          <w:r>
+            <w:rPr>
+              <w:rFonts w:ascii="MS Gothic" w:eastAsia="MS Gothic" w:hAnsi="MS Gothic" w:cs="Segoe UI Symbol" w:hint="eastAsia"/>
+            </w:rPr>
+            <w:t>☐</w:t>
+          </w:r>
+        </w:sdtContent>
+      </w:sdt>
+      <w:r>
+        <w:rPr>
+          <w:rFonts w:ascii="Arial" w:hAnsi="Arial" w:cs="Arial"/>
+        </w:rPr>
+        <w:t xml:space="preserve"> Chiarire concetti</w:t>
+      </w:r>
+      <w:r>
+        <w:br/>
+      </w:r>
+      <w:sdt>
+        <w:sdtPr>
+          <w:rPr>
+            <w:rFonts w:ascii="Segoe UI Symbol" w:hAnsi="Segoe UI Symbol" w:cs="Segoe UI Symbol"/>
+          </w:rPr>
+          <w:id w:val="-572281586"/>
+          <w14:checkbox>
+            <w14:checked w14:val="0"/>
+            <w14:checkedState w14:val="2612" w14:font="MS Gothic"/>
+            <w14:uncheckedState w14:val="2610" w14:font="MS Gothic"/>
+          </w14:checkbox>
+        </w:sdtPr>
+        <w:sdtContent>
+          <w:r>
+            <w:rPr>
+              <w:rFonts w:ascii="MS Gothic" w:eastAsia="MS Gothic" w:hAnsi="MS Gothic" w:cs="Segoe UI Symbol" w:hint="eastAsia"/>
+            </w:rPr>
+            <w:t>☐</w:t>
+          </w:r>
+        </w:sdtContent>
+      </w:sdt>
+      <w:r>
+        <w:rPr>
+          <w:rFonts w:ascii="Arial" w:hAnsi="Arial" w:cs="Arial"/>
+        </w:rPr>
+        <w:t xml:space="preserve"> Supporto al codice</w:t>
+      </w:r>
+      <w:r>
+        <w:br/>
+      </w:r>
+      <w:sdt>
+        <w:sdtPr>
+          <w:rPr>
+            <w:rFonts w:ascii="Segoe UI Symbol" w:hAnsi="Segoe UI Symbol" w:cs="Segoe UI Symbol"/>
+          </w:rPr>
+          <w:id w:val="1384601830"/>
+          <w14:checkbox>
+            <w14:checked w14:val="0"/>
+            <w14:checkedState w14:val="2612" w14:font="MS Gothic"/>
+            <w14:uncheckedState w14:val="2610" w14:font="MS Gothic"/>
+          </w14:checkbox>
+        </w:sdtPr>
+        <w:sdtContent>
+          <w:r>
+            <w:rPr>
+              <w:rFonts w:ascii="MS Gothic" w:eastAsia="MS Gothic" w:hAnsi="MS Gothic" w:cs="Segoe UI Symbol" w:hint="eastAsia"/>
+            </w:rPr>
+            <w:t>☐</w:t>
+          </w:r>
+        </w:sdtContent>
+      </w:sdt>
+      <w:r>
+        <w:rPr>
+          <w:rFonts w:ascii="Arial" w:hAnsi="Arial" w:cs="Arial"/>
+        </w:rPr>
+        <w:t xml:space="preserve"> Debug</w:t>
+      </w:r>
+      <w:r>
+        <w:br/>
+      </w:r>
+      <w:sdt>
+        <w:sdtPr>
+          <w:rPr>
+            <w:rFonts w:ascii="Segoe UI Symbol" w:hAnsi="Segoe UI Symbol" w:cs="Segoe UI Symbol"/>
+          </w:rPr>
+          <w:id w:val="-985550659"/>
+          <w14:checkbox>
+            <w14:checked w14:val="0"/>
+            <w14:checkedState w14:val="2612" w14:font="MS Gothic"/>
+            <w14:uncheckedState w14:val="2610" w14:font="MS Gothic"/>
+          </w14:checkbox>
+        </w:sdtPr>
+        <w:sdtContent>
+          <w:r>
+            <w:rPr>
+              <w:rFonts w:ascii="MS Gothic" w:eastAsia="MS Gothic" w:hAnsi="MS Gothic" w:cs="Segoe UI Symbol" w:hint="eastAsia"/>
+            </w:rPr>
+            <w:t>☐</w:t>
+          </w:r>
+        </w:sdtContent>
+      </w:sdt>
+      <w:r>
+        <w:rPr>
+          <w:rFonts w:ascii="Arial" w:hAnsi="Arial" w:cs="Arial"/>
+        </w:rPr>
+        <w:t xml:space="preserve"> Riorganizzare idee / testi</w:t>
+      </w:r>
+      <w:r>
+        <w:br/>
+      </w:r>
+      <w:sdt>
+        <w:sdtPr>
+          <w:rPr>
+            <w:rFonts w:ascii="Segoe UI Symbol" w:hAnsi="Segoe UI Symbol" w:cs="Segoe UI Symbol"/>
+          </w:rPr>
+          <w:id w:val="-1516684619"/>
+          <w14:checkbox>
+            <w14:checked w14:val="0"/>
+            <w14:checkedState w14:val="2612" w14:font="MS Gothic"/>
+            <w14:uncheckedState w14:val="2610" w14:font="MS Gothic"/>
+          </w14:checkbox>
+        </w:sdtPr>
+        <w:sdtContent>
+          <w:r>
+            <w:rPr>
+              <w:rFonts w:ascii="MS Gothic" w:eastAsia="MS Gothic" w:hAnsi="MS Gothic" w:cs="Segoe UI Symbol" w:hint="eastAsia"/>
+            </w:rPr>
+            <w:t>☐</w:t>
+          </w:r>
+        </w:sdtContent>
+      </w:sdt>
+      <w:r>
+        <w:rPr>
+          <w:rFonts w:ascii="Arial" w:hAnsi="Arial" w:cs="Arial"/>
+        </w:rPr>
+        <w:t xml:space="preserve"> Altro: …</w:t>
+      </w:r>
+    </w:p>
+    <w:p>
+      <w:pPr>
+        <w:pStyle w:val="Nessunaspaziatura"/>
+        <w:rPr>
+          <w:rFonts w:ascii="Arial" w:hAnsi="Arial" w:cs="Arial"/>
+        </w:rPr>
+      </w:pPr>
+    </w:p>
+    <w:p>
+      <w:pPr>
+        <w:pStyle w:val="Nessunaspaziatura"/>
+        <w:rPr>
+          <w:rFonts w:ascii="Arial" w:hAnsi="Arial" w:cs="Arial"/>
+          <w:b/>
+          <w:bCs/>
+        </w:rPr>
+      </w:pPr>
+      <w:r>
+        <w:rPr>
+          <w:rFonts w:ascii="Arial" w:hAnsi="Arial" w:cs="Arial"/>
+          <w:b/>
+          <w:bCs/>
+        </w:rPr>
+        <w:t>Esempio significativo di utilizzo (UNO SOLO)</w:t>
+      </w:r>
+    </w:p>
+    <w:p>
+      <w:pPr>
+        <w:pStyle w:val="Nessunaspaziatura"/>
+        <w:rPr>
+          <w:rFonts w:ascii="Arial" w:hAnsi="Arial" w:cs="Arial"/>
+        </w:rPr>
+      </w:pPr>
+      <w:r>
+        <w:rPr>
+          <w:rFonts w:ascii="Arial" w:hAnsi="Arial" w:cs="Arial"/>
+        </w:rPr>
+        <w:t xml:space="preserve">Riporta </w:t>
+      </w:r>
+      <w:r>
+        <w:rPr>
+          <w:rFonts w:ascii="Arial" w:hAnsi="Arial" w:cs="Arial"/>
+          <w:i/>
+          <w:iCs/>
+        </w:rPr>
+        <w:t>un</w:t>
+      </w:r>
+      <w:r>
+        <w:rPr>
+          <w:rFonts w:ascii="Arial" w:hAnsi="Arial" w:cs="Arial"/>
+        </w:rPr>
+        <w:t xml:space="preserve"> prompt rilevante oppure descrivilo a parole se ce ne sono stati molti.</w:t>
+      </w:r>
+    </w:p>
+    <w:p>
+      <w:pPr>
+        <w:pStyle w:val="Nessunaspaziatura"/>
+        <w:rPr>
+          <w:rFonts w:ascii="Arial" w:hAnsi="Arial" w:cs="Arial"/>
+        </w:rPr>
+      </w:pPr>
+    </w:p>
+    <w:sdt>
+      <w:sdtPr>
+        <w:rPr>
+          <w:rFonts w:ascii="Arial" w:hAnsi="Arial" w:cs="Arial"/>
+        </w:rPr>
+        <w:alias w:val="Prompt AI"/>
+        <w:tag w:val="Prompt AI"/>
+        <w:id w:val="2090420913"/>
+        <w:placeholder>
+          <w:docPart w:val="CB141F0C269E442B9460357F6B4D1E86"/>
+        </w:placeholder>
+        <w15:color w:val="C0C0C0"/>
+      </w:sdtPr>
+      <w:sdtContent>
+        <w:p>
+          <w:pPr>
+            <w:pStyle w:val="Nessunaspaziatura"/>
+            <w:rPr>
+              <w:rFonts w:ascii="Arial" w:hAnsi="Arial" w:cs="Arial"/>
+            </w:rPr>
+          </w:pPr>
+          <w:r>
+            <w:rPr>
+              <w:rFonts w:ascii="Arial" w:hAnsi="Arial" w:cs="Arial"/>
+            </w:rPr>
+            <w:t xml:space="preserve">Riley: </w:t>
+          </w:r>
+        </w:p>
+        <w:p>
+          <w:pPr>
+            <w:pStyle w:val="Nessunaspaziatura"/>
+            <w:spacing w:line="276" w:lineRule="auto"/>
+            <w:rPr>
+              <w:rFonts w:ascii="Arial" w:hAnsi="Arial" w:cs="Arial"/>
+            </w:rPr>
+          </w:pPr>
+          <w:r>
+            <w:rPr>
+              <w:rFonts w:ascii="Arial" w:hAnsi="Arial" w:cs="Arial"/>
+            </w:rPr>
+            <w:t xml:space="preserve">Bryan: </w:t>
+          </w:r>
+        </w:p>
+      </w:sdtContent>
+    </w:sdt>
+    <w:p>
+      <w:pPr>
+        <w:pStyle w:val="Nessunaspaziatura"/>
+        <w:rPr>
+          <w:rFonts w:ascii="Arial" w:hAnsi="Arial" w:cs="Arial"/>
+        </w:rPr>
+      </w:pPr>
+    </w:p>
+    <w:p>
+      <w:pPr>
+        <w:pStyle w:val="Nessunaspaziatura"/>
+        <w:rPr>
+          <w:rFonts w:ascii="Arial" w:hAnsi="Arial" w:cs="Arial"/>
+        </w:rPr>
+      </w:pPr>
+      <w:r>
+        <w:rPr>
+          <w:rFonts w:ascii="Arial" w:hAnsi="Arial" w:cs="Arial"/>
+          <w:b/>
+          <w:bCs/>
+        </w:rPr>
+        <w:t>Cosa mi ha dato l’AI</w:t>
+      </w:r>
+    </w:p>
+    <w:p>
+      <w:pPr>
+        <w:pStyle w:val="Nessunaspaziatura"/>
+        <w:rPr>
+          <w:rFonts w:ascii="Arial" w:hAnsi="Arial" w:cs="Arial"/>
+        </w:rPr>
+      </w:pPr>
+      <w:r>
+        <w:rPr>
+          <w:rFonts w:ascii="Arial" w:hAnsi="Arial" w:cs="Arial"/>
+        </w:rPr>
+        <w:t>Spiegazione, esempio, soluzione, suggerimento…</w:t>
+      </w:r>
+    </w:p>
+    <w:p>
+      <w:pPr>
+        <w:pStyle w:val="Nessunaspaziatura"/>
+        <w:rPr>
+          <w:rFonts w:ascii="Arial" w:hAnsi="Arial" w:cs="Arial"/>
+        </w:rPr>
+      </w:pPr>
+    </w:p>
+    <w:sdt>
+      <w:sdtPr>
+        <w:rPr>
+          <w:rFonts w:ascii="Arial" w:hAnsi="Arial" w:cs="Arial"/>
+        </w:rPr>
+        <w:alias w:val="Risposta AI"/>
+        <w:tag w:val="Risposta AI"/>
+        <w:id w:val="-1331441256"/>
+        <w:placeholder>
+          <w:docPart w:val="57286425BAD647479152F371A1186F2C"/>
+        </w:placeholder>
+        <w15:color w:val="C0C0C0"/>
+      </w:sdtPr>
+      <w:sdtContent>
+        <w:p>
+          <w:pPr>
+            <w:pStyle w:val="Nessunaspaziatura"/>
+            <w:spacing w:line="276" w:lineRule="auto"/>
+            <w:rPr>
+              <w:rFonts w:ascii="Arial" w:hAnsi="Arial" w:cs="Arial"/>
+            </w:rPr>
+          </w:pPr>
+          <w:r>
+            <w:rPr>
+              <w:rFonts w:ascii="Arial" w:hAnsi="Arial" w:cs="Arial"/>
+            </w:rPr>
+            <w:t xml:space="preserve">Riley: </w:t>
+          </w:r>
+        </w:p>
+        <w:p>
+          <w:pPr>
+            <w:pStyle w:val="Nessunaspaziatura"/>
+            <w:spacing w:line="276" w:lineRule="auto"/>
+            <w:rPr>
+              <w:rFonts w:ascii="Arial" w:hAnsi="Arial" w:cs="Arial"/>
+            </w:rPr>
+          </w:pPr>
+          <w:r>
+            <w:rPr>
+              <w:rFonts w:ascii="Arial" w:hAnsi="Arial" w:cs="Arial"/>
+            </w:rPr>
+            <w:t xml:space="preserve">Bryan: </w:t>
+          </w:r>
+        </w:p>
+      </w:sdtContent>
+    </w:sdt>
+    <w:p>
+      <w:pPr>
+        <w:pStyle w:val="Nessunaspaziatura"/>
+        <w:rPr>
+          <w:rFonts w:ascii="Arial" w:hAnsi="Arial" w:cs="Arial"/>
+          <w:b/>
+          <w:bCs/>
+        </w:rPr>
+      </w:pPr>
+    </w:p>
+    <w:p>
+      <w:pPr>
+        <w:pStyle w:val="Nessunaspaziatura"/>
+        <w:rPr>
+          <w:rFonts w:ascii="Arial" w:hAnsi="Arial" w:cs="Arial"/>
+        </w:rPr>
+      </w:pPr>
+      <w:r>
+        <w:rPr>
+          <w:rFonts w:ascii="Arial" w:hAnsi="Arial" w:cs="Arial"/>
+          <w:b/>
+          <w:bCs/>
+        </w:rPr>
+        <w:t>Come l’ho usato io</w:t>
+      </w:r>
+      <w:r>
+        <w:rPr>
+          <w:rFonts w:ascii="Arial" w:hAnsi="Arial" w:cs="Arial"/>
+        </w:rPr>
+        <w:br/>
+      </w:r>
+      <w:sdt>
+        <w:sdtPr>
+          <w:rPr>
+            <w:rFonts w:ascii="Segoe UI Symbol" w:hAnsi="Segoe UI Symbol" w:cs="Segoe UI Symbol"/>
+          </w:rPr>
+          <w:id w:val="587267011"/>
+          <w14:checkbox>
+            <w14:checked w14:val="0"/>
+            <w14:checkedState w14:val="2612" w14:font="MS Gothic"/>
+            <w14:uncheckedState w14:val="2610" w14:font="MS Gothic"/>
+          </w14:checkbox>
+        </w:sdtPr>
+        <w:sdtContent>
+          <w:r>
+            <w:rPr>
+              <w:rFonts w:ascii="MS Gothic" w:eastAsia="MS Gothic" w:hAnsi="MS Gothic" w:cs="Segoe UI Symbol" w:hint="eastAsia"/>
+            </w:rPr>
+            <w:t>☐</w:t>
+          </w:r>
+        </w:sdtContent>
+      </w:sdt>
+      <w:r>
+        <w:rPr>
+          <w:rFonts w:ascii="Arial" w:hAnsi="Arial" w:cs="Arial"/>
+        </w:rPr>
+        <w:t xml:space="preserve"> Copiato</w:t>
+      </w:r>
+      <w:r>
+        <w:rPr>
+          <w:rFonts w:ascii="Arial" w:hAnsi="Arial" w:cs="Arial"/>
+        </w:rPr>
+        <w:br/>
+      </w:r>
+      <w:sdt>
+        <w:sdtPr>
+          <w:rPr>
+            <w:rFonts w:ascii="Segoe UI Symbol" w:hAnsi="Segoe UI Symbol" w:cs="Segoe UI Symbol"/>
+          </w:rPr>
+          <w:id w:val="-439144646"/>
+          <w14:checkbox>
+            <w14:checked w14:val="0"/>
+            <w14:checkedState w14:val="2612" w14:font="MS Gothic"/>
+            <w14:uncheckedState w14:val="2610" w14:font="MS Gothic"/>
+          </w14:checkbox>
+        </w:sdtPr>
+        <w:sdtContent>
+          <w:r>
+            <w:rPr>
+              <w:rFonts w:ascii="MS Gothic" w:eastAsia="MS Gothic" w:hAnsi="MS Gothic" w:cs="Segoe UI Symbol" w:hint="eastAsia"/>
+            </w:rPr>
+            <w:t>☐</w:t>
+          </w:r>
+        </w:sdtContent>
+      </w:sdt>
+      <w:r>
+        <w:rPr>
+          <w:rFonts w:ascii="Arial" w:hAnsi="Arial" w:cs="Arial"/>
+        </w:rPr>
+        <w:t xml:space="preserve"> Adattato</w:t>
+      </w:r>
+      <w:r>
+        <w:rPr>
+          <w:rFonts w:ascii="Arial" w:hAnsi="Arial" w:cs="Arial"/>
+        </w:rPr>
+        <w:br/>
+      </w:r>
+      <w:sdt>
+        <w:sdtPr>
+          <w:rPr>
+            <w:rFonts w:ascii="Segoe UI Symbol" w:hAnsi="Segoe UI Symbol" w:cs="Segoe UI Symbol"/>
+          </w:rPr>
+          <w:id w:val="284929815"/>
+          <w14:checkbox>
+            <w14:checked w14:val="0"/>
+            <w14:checkedState w14:val="2612" w14:font="MS Gothic"/>
+            <w14:uncheckedState w14:val="2610" w14:font="MS Gothic"/>
+          </w14:checkbox>
+        </w:sdtPr>
+        <w:sdtContent>
+          <w:r>
+            <w:rPr>
+              <w:rFonts w:ascii="MS Gothic" w:eastAsia="MS Gothic" w:hAnsi="MS Gothic" w:cs="Segoe UI Symbol" w:hint="eastAsia"/>
+            </w:rPr>
+            <w:t>☐</w:t>
+          </w:r>
+        </w:sdtContent>
+      </w:sdt>
+      <w:r>
+        <w:rPr>
+          <w:rFonts w:ascii="Arial" w:hAnsi="Arial" w:cs="Arial"/>
+        </w:rPr>
+        <w:t xml:space="preserve"> Usato solo per capire</w:t>
+      </w:r>
+      <w:r>
+        <w:rPr>
+          <w:rFonts w:ascii="Arial" w:hAnsi="Arial" w:cs="Arial"/>
+        </w:rPr>
+        <w:br/>
+      </w:r>
+      <w:sdt>
+        <w:sdtPr>
+          <w:rPr>
+            <w:rFonts w:ascii="Segoe UI Symbol" w:hAnsi="Segoe UI Symbol" w:cs="Segoe UI Symbol"/>
+          </w:rPr>
+          <w:id w:val="2032295924"/>
+          <w14:checkbox>
+            <w14:checked w14:val="0"/>
+            <w14:checkedState w14:val="2612" w14:font="MS Gothic"/>
+            <w14:uncheckedState w14:val="2610" w14:font="MS Gothic"/>
+          </w14:checkbox>
+        </w:sdtPr>
+        <w:sdtContent>
+          <w:r>
+            <w:rPr>
+              <w:rFonts w:ascii="MS Gothic" w:eastAsia="MS Gothic" w:hAnsi="MS Gothic" w:cs="Segoe UI Symbol" w:hint="eastAsia"/>
+            </w:rPr>
+            <w:t>☐</w:t>
+          </w:r>
+        </w:sdtContent>
+      </w:sdt>
+      <w:r>
+        <w:rPr>
+          <w:rFonts w:ascii="Arial" w:hAnsi="Arial" w:cs="Arial"/>
+        </w:rPr>
+        <w:t xml:space="preserve"> Scartato</w:t>
+      </w:r>
+    </w:p>
+    <w:p>
+      <w:pPr>
+        <w:pStyle w:val="Nessunaspaziatura"/>
+        <w:rPr>
+          <w:rFonts w:ascii="Arial" w:hAnsi="Arial" w:cs="Arial"/>
+        </w:rPr>
+      </w:pPr>
+    </w:p>
+    <w:p>
+      <w:pPr>
+        <w:pStyle w:val="Nessunaspaziatura"/>
+        <w:rPr>
+          <w:rFonts w:ascii="Arial" w:hAnsi="Arial" w:cs="Arial"/>
+        </w:rPr>
+      </w:pPr>
+    </w:p>
+    <w:p>
+      <w:pPr>
+        <w:pStyle w:val="Nessunaspaziatura"/>
+        <w:rPr>
+          <w:rFonts w:ascii="Arial" w:hAnsi="Arial" w:cs="Arial"/>
+        </w:rPr>
+      </w:pPr>
+      <w:r>
+        <w:rPr>
+          <w:rFonts w:ascii="Arial" w:hAnsi="Arial" w:cs="Arial"/>
+          <w:b/>
+          <w:bCs/>
+        </w:rPr>
+        <w:t>Cosa avrei fatto senza AI?</w:t>
+      </w:r>
+    </w:p>
+    <w:p>
+      <w:pPr>
+        <w:pStyle w:val="Nessunaspaziatura"/>
+        <w:rPr>
+          <w:rFonts w:ascii="Arial" w:hAnsi="Arial" w:cs="Arial"/>
+        </w:rPr>
+      </w:pPr>
+      <w:r>
+        <w:rPr>
+          <w:rFonts w:ascii="Arial" w:hAnsi="Arial" w:cs="Arial"/>
+        </w:rPr>
+        <w:t xml:space="preserve">Riley: </w:t>
+      </w:r>
+    </w:p>
+    <w:p>
+      <w:pPr>
+        <w:pStyle w:val="Nessunaspaziatura"/>
+        <w:rPr>
+          <w:rFonts w:ascii="Arial" w:hAnsi="Arial" w:cs="Arial"/>
+        </w:rPr>
+      </w:pPr>
+      <w:r>
+        <w:rPr>
+          <w:rFonts w:ascii="Arial" w:hAnsi="Arial" w:cs="Arial"/>
+        </w:rPr>
+        <w:t>Bryan:</w:t>
       </w:r>
     </w:p>
     <w:p>
@@ -26938,6 +28508,107 @@
         </w:p>
       </w:docPartBody>
     </w:docPart>
+    <w:docPart>
+      <w:docPartPr>
+        <w:name w:val="19C68653001B441C9DF07D1F950044D6"/>
+        <w:category>
+          <w:name w:val="Generale"/>
+          <w:gallery w:val="placeholder"/>
+        </w:category>
+        <w:types>
+          <w:type w:val="bbPlcHdr"/>
+        </w:types>
+        <w:behaviors>
+          <w:behavior w:val="content"/>
+        </w:behaviors>
+        <w:guid w:val="{13DAEDB7-D55B-49E8-8821-1196EF1F7991}"/>
+      </w:docPartPr>
+      <w:docPartBody>
+        <w:p>
+          <w:pPr>
+            <w:pStyle w:val="19C68653001B441C9DF07D1F950044D6"/>
+          </w:pPr>
+          <w:r>
+            <w:rPr>
+              <w:rStyle w:val="Testosegnaposto"/>
+              <w:b/>
+              <w:bCs/>
+            </w:rPr>
+            <w:t>Nomi AI utilizzati</w:t>
+          </w:r>
+        </w:p>
+      </w:docPartBody>
+    </w:docPart>
+    <w:docPart>
+      <w:docPartPr>
+        <w:name w:val="CB141F0C269E442B9460357F6B4D1E86"/>
+        <w:category>
+          <w:name w:val="Generale"/>
+          <w:gallery w:val="placeholder"/>
+        </w:category>
+        <w:types>
+          <w:type w:val="bbPlcHdr"/>
+        </w:types>
+        <w:behaviors>
+          <w:behavior w:val="content"/>
+        </w:behaviors>
+        <w:guid w:val="{F584500F-43A3-4C54-8129-37DAB7488011}"/>
+      </w:docPartPr>
+      <w:docPartBody>
+        <w:p>
+          <w:pPr>
+            <w:pStyle w:val="CB141F0C269E442B9460357F6B4D1E86"/>
+          </w:pPr>
+          <w:r>
+            <w:rPr>
+              <w:rStyle w:val="Testosegnaposto"/>
+            </w:rPr>
+            <w:t>Fare clic o toccare qui per immettere il testo.</w:t>
+          </w:r>
+        </w:p>
+      </w:docPartBody>
+    </w:docPart>
+    <w:docPart>
+      <w:docPartPr>
+        <w:name w:val="57286425BAD647479152F371A1186F2C"/>
+        <w:category>
+          <w:name w:val="Generale"/>
+          <w:gallery w:val="placeholder"/>
+        </w:category>
+        <w:types>
+          <w:type w:val="bbPlcHdr"/>
+        </w:types>
+        <w:behaviors>
+          <w:behavior w:val="content"/>
+        </w:behaviors>
+        <w:guid w:val="{2A167D26-13D2-490A-B9CE-048722AF051E}"/>
+      </w:docPartPr>
+      <w:docPartBody>
+        <w:p>
+          <w:pPr>
+            <w:pStyle w:val="57286425BAD647479152F371A1186F2C"/>
+          </w:pPr>
+          <w:r>
+            <w:rPr>
+              <w:rStyle w:val="Testosegnaposto"/>
+            </w:rPr>
+            <w:t xml:space="preserve">Fare clic o toccare qui per </w:t>
+          </w:r>
+          <w:r>
+            <w:rPr>
+              <w:rStyle w:val="Testosegnaposto"/>
+            </w:rPr>
+            <w:t>immettere</w:t>
+          </w:r>
+          <w:r>
+            <w:rPr>
+              <w:rStyle w:val="Testosegnaposto"/>
+            </w:rPr>
+            <w:t xml:space="preserve"> il testo.</w:t>
+          </w:r>
+        </w:p>
+      </w:docPartBody>
+    </w:docPart>
   </w:docParts>
 </w:glossaryDocument>
 </file>
@@ -27069,6 +28740,7 @@
   <w:rsids>
     <w:rsidRoot w:val="00BE72BC"/>
     <w:rsid w:val="00037477"/>
+    <w:rsid w:val="00040D54"/>
     <w:rsid w:val="00045F3C"/>
     <w:rsid w:val="00083E28"/>
     <w:rsid w:val="000B54FB"/>
@@ -27105,6 +28777,7 @@
     <w:rsid w:val="008736ED"/>
     <w:rsid w:val="0089581E"/>
     <w:rsid w:val="008A28AA"/>
+    <w:rsid w:val="008A2EC3"/>
     <w:rsid w:val="00901364"/>
     <w:rsid w:val="00924F9E"/>
     <w:rsid w:val="009826E2"/>
@@ -27122,6 +28795,7 @@
     <w:rsid w:val="00BD5007"/>
     <w:rsid w:val="00BE72BC"/>
     <w:rsid w:val="00C00D0B"/>
+    <w:rsid w:val="00C120D8"/>
     <w:rsid w:val="00C60D7D"/>
     <w:rsid w:val="00D0757F"/>
     <w:rsid w:val="00D53511"/>
@@ -27599,7 +29273,7 @@
     <w:basedOn w:val="Carpredefinitoparagrafo"/>
     <w:uiPriority w:val="99"/>
     <w:semiHidden/>
-    <w:rsid w:val="00901364"/>
+    <w:rsid w:val="00040D54"/>
     <w:rPr>
       <w:color w:val="666666"/>
     </w:rPr>
@@ -27828,6 +29502,18 @@
   <w:style w:type="paragraph" w:customStyle="1" w:styleId="DD1A591C0F45438F9C72CC95A6991F47">
     <w:name w:val="DD1A591C0F45438F9C72CC95A6991F47"/>
     <w:rsid w:val="00901364"/>
+  </w:style>
+  <w:style w:type="paragraph" w:customStyle="1" w:styleId="19C68653001B441C9DF07D1F950044D6">
+    <w:name w:val="19C68653001B441C9DF07D1F950044D6"/>
+    <w:rsid w:val="00040D54"/>
+  </w:style>
+  <w:style w:type="paragraph" w:customStyle="1" w:styleId="CB141F0C269E442B9460357F6B4D1E86">
+    <w:name w:val="CB141F0C269E442B9460357F6B4D1E86"/>
+    <w:rsid w:val="00040D54"/>
+  </w:style>
+  <w:style w:type="paragraph" w:customStyle="1" w:styleId="57286425BAD647479152F371A1186F2C">
+    <w:name w:val="57286425BAD647479152F371A1186F2C"/>
+    <w:rsid w:val="00040D54"/>
   </w:style>
 </w:styles>
 </file>

</xml_diff>

<commit_message>
progressi sviluppo db e diario
</commit_message>
<xml_diff>
--- a/4_Diari/Diario.docx
+++ b/4_Diari/Diario.docx
@@ -21868,13 +21868,7 @@
               <w:rPr>
                 <w:rFonts w:ascii="Arial" w:hAnsi="Arial" w:cs="Arial"/>
               </w:rPr>
-              <w:t>6</w:t>
-            </w:r>
-            <w:r>
-              <w:rPr>
-                <w:rFonts w:ascii="Arial" w:hAnsi="Arial" w:cs="Arial"/>
-              </w:rPr>
-              <w:t>.10.2026</w:t>
+              <w:t>6.10.2026</w:t>
             </w:r>
           </w:p>
         </w:tc>
@@ -22340,13 +22334,7 @@
               <w:rPr>
                 <w:rFonts w:ascii="Arial" w:hAnsi="Arial" w:cs="Arial"/>
               </w:rPr>
-              <w:t xml:space="preserve">Bryan: </w:t>
-            </w:r>
-            <w:r>
-              <w:rPr>
-                <w:rFonts w:ascii="Arial" w:hAnsi="Arial" w:cs="Arial"/>
-              </w:rPr>
-              <w:t>Sviluppo garage</w:t>
+              <w:t>Bryan: Sviluppo garage</w:t>
             </w:r>
           </w:p>
         </w:tc>
@@ -23335,6 +23323,1609 @@
           <w:rFonts w:ascii="Arial" w:hAnsi="Arial" w:cs="Arial"/>
         </w:rPr>
         <w:t xml:space="preserve">Riley: </w:t>
+      </w:r>
+    </w:p>
+    <w:p>
+      <w:pPr>
+        <w:pStyle w:val="Nessunaspaziatura"/>
+        <w:rPr>
+          <w:rFonts w:ascii="Arial" w:hAnsi="Arial" w:cs="Arial"/>
+        </w:rPr>
+      </w:pPr>
+      <w:r>
+        <w:rPr>
+          <w:rFonts w:ascii="Arial" w:hAnsi="Arial" w:cs="Arial"/>
+        </w:rPr>
+        <w:t>Bryan:</w:t>
+      </w:r>
+    </w:p>
+    <w:p>
+      <w:pPr>
+        <w:rPr>
+          <w:rFonts w:ascii="Arial" w:hAnsi="Arial" w:cs="Arial"/>
+        </w:rPr>
+      </w:pPr>
+      <w:r>
+        <w:rPr>
+          <w:rFonts w:ascii="Arial" w:hAnsi="Arial" w:cs="Arial"/>
+        </w:rPr>
+        <w:br w:type="page"/>
+      </w:r>
+    </w:p>
+    <w:tbl>
+      <w:tblPr>
+        <w:tblStyle w:val="Grigliatabella"/>
+        <w:tblW w:w="5000" w:type="pct"/>
+        <w:tblLook w:val="04A0" w:firstRow="1" w:lastRow="0" w:firstColumn="1" w:lastColumn="0" w:noHBand="0" w:noVBand="1"/>
+      </w:tblPr>
+      <w:tblGrid>
+        <w:gridCol w:w="2407"/>
+        <w:gridCol w:w="7221"/>
+      </w:tblGrid>
+      <w:tr>
+        <w:trPr>
+          <w:trHeight w:val="199"/>
+        </w:trPr>
+        <w:tc>
+          <w:tcPr>
+            <w:tcW w:w="1250" w:type="pct"/>
+            <w:vAlign w:val="center"/>
+          </w:tcPr>
+          <w:p>
+            <w:pPr>
+              <w:rPr>
+                <w:rFonts w:ascii="Arial" w:hAnsi="Arial" w:cs="Arial"/>
+              </w:rPr>
+            </w:pPr>
+            <w:r>
+              <w:rPr>
+                <w:rFonts w:ascii="Arial" w:hAnsi="Arial" w:cs="Arial"/>
+              </w:rPr>
+              <w:lastRenderedPageBreak/>
+              <w:t>Luogo</w:t>
+            </w:r>
+          </w:p>
+        </w:tc>
+        <w:tc>
+          <w:tcPr>
+            <w:tcW w:w="3750" w:type="pct"/>
+            <w:vAlign w:val="center"/>
+          </w:tcPr>
+          <w:p>
+            <w:pPr>
+              <w:rPr>
+                <w:rFonts w:ascii="Arial" w:hAnsi="Arial" w:cs="Arial"/>
+              </w:rPr>
+            </w:pPr>
+            <w:r>
+              <w:rPr>
+                <w:rFonts w:ascii="Arial" w:hAnsi="Arial" w:cs="Arial"/>
+              </w:rPr>
+              <w:t>Scuola Arti e Mestieri Trevano</w:t>
+            </w:r>
+          </w:p>
+        </w:tc>
+      </w:tr>
+      <w:tr>
+        <w:trPr>
+          <w:trHeight w:val="196"/>
+        </w:trPr>
+        <w:tc>
+          <w:tcPr>
+            <w:tcW w:w="1250" w:type="pct"/>
+            <w:vAlign w:val="center"/>
+          </w:tcPr>
+          <w:p>
+            <w:pPr>
+              <w:rPr>
+                <w:rFonts w:ascii="Arial" w:hAnsi="Arial" w:cs="Arial"/>
+              </w:rPr>
+            </w:pPr>
+            <w:r>
+              <w:rPr>
+                <w:rFonts w:ascii="Arial" w:hAnsi="Arial" w:cs="Arial"/>
+              </w:rPr>
+              <w:t>Data</w:t>
+            </w:r>
+          </w:p>
+        </w:tc>
+        <w:tc>
+          <w:tcPr>
+            <w:tcW w:w="3750" w:type="pct"/>
+            <w:vAlign w:val="center"/>
+          </w:tcPr>
+          <w:p>
+            <w:pPr>
+              <w:rPr>
+                <w:rFonts w:ascii="Arial" w:hAnsi="Arial" w:cs="Arial"/>
+              </w:rPr>
+            </w:pPr>
+            <w:r>
+              <w:rPr>
+                <w:rFonts w:ascii="Arial" w:hAnsi="Arial" w:cs="Arial"/>
+              </w:rPr>
+              <w:t>7</w:t>
+            </w:r>
+            <w:r>
+              <w:rPr>
+                <w:rFonts w:ascii="Arial" w:hAnsi="Arial" w:cs="Arial"/>
+              </w:rPr>
+              <w:t>.10.2026</w:t>
+            </w:r>
+          </w:p>
+        </w:tc>
+      </w:tr>
+    </w:tbl>
+    <w:p>
+      <w:pPr>
+        <w:rPr>
+          <w:rFonts w:ascii="Arial" w:hAnsi="Arial" w:cs="Arial"/>
+        </w:rPr>
+      </w:pPr>
+    </w:p>
+    <w:tbl>
+      <w:tblPr>
+        <w:tblStyle w:val="Grigliatabella"/>
+        <w:tblW w:w="0" w:type="auto"/>
+        <w:tblLook w:val="04A0" w:firstRow="1" w:lastRow="0" w:firstColumn="1" w:lastColumn="0" w:noHBand="0" w:noVBand="1"/>
+      </w:tblPr>
+      <w:tblGrid>
+        <w:gridCol w:w="1271"/>
+        <w:gridCol w:w="8357"/>
+      </w:tblGrid>
+      <w:tr>
+        <w:tc>
+          <w:tcPr>
+            <w:tcW w:w="9628" w:type="dxa"/>
+            <w:gridSpan w:val="2"/>
+            <w:shd w:val="clear" w:color="auto" w:fill="D9D9D9" w:themeFill="background1" w:themeFillShade="D9"/>
+          </w:tcPr>
+          <w:p>
+            <w:pPr>
+              <w:rPr>
+                <w:rFonts w:ascii="Arial" w:hAnsi="Arial" w:cs="Arial"/>
+              </w:rPr>
+            </w:pPr>
+            <w:r>
+              <w:rPr>
+                <w:rFonts w:ascii="Arial" w:hAnsi="Arial" w:cs="Arial"/>
+              </w:rPr>
+              <w:t>Lavori svolti</w:t>
+            </w:r>
+          </w:p>
+        </w:tc>
+      </w:tr>
+      <w:tr>
+        <w:tc>
+          <w:tcPr>
+            <w:tcW w:w="1271" w:type="dxa"/>
+          </w:tcPr>
+          <w:p>
+            <w:pPr>
+              <w:rPr>
+                <w:rFonts w:ascii="Arial" w:hAnsi="Arial" w:cs="Arial"/>
+              </w:rPr>
+            </w:pPr>
+            <w:r>
+              <w:rPr>
+                <w:rFonts w:ascii="Arial" w:hAnsi="Arial" w:cs="Arial"/>
+              </w:rPr>
+              <w:t>Riley</w:t>
+            </w:r>
+          </w:p>
+        </w:tc>
+        <w:tc>
+          <w:tcPr>
+            <w:tcW w:w="8357" w:type="dxa"/>
+          </w:tcPr>
+          <w:p>
+            <w:pPr>
+              <w:rPr>
+                <w:rFonts w:ascii="Arial" w:hAnsi="Arial" w:cs="Arial"/>
+              </w:rPr>
+            </w:pPr>
+            <w:r>
+              <w:rPr>
+                <w:rFonts w:ascii="Arial" w:hAnsi="Arial" w:cs="Arial"/>
+              </w:rPr>
+              <w:t>Continuato lo sviluppo del db</w:t>
+            </w:r>
+          </w:p>
+        </w:tc>
+      </w:tr>
+      <w:tr>
+        <w:tc>
+          <w:tcPr>
+            <w:tcW w:w="1271" w:type="dxa"/>
+          </w:tcPr>
+          <w:p>
+            <w:pPr>
+              <w:rPr>
+                <w:rFonts w:ascii="Arial" w:hAnsi="Arial" w:cs="Arial"/>
+              </w:rPr>
+            </w:pPr>
+            <w:r>
+              <w:rPr>
+                <w:rFonts w:ascii="Arial" w:hAnsi="Arial" w:cs="Arial"/>
+              </w:rPr>
+              <w:t>Bryan</w:t>
+            </w:r>
+          </w:p>
+        </w:tc>
+        <w:tc>
+          <w:tcPr>
+            <w:tcW w:w="8357" w:type="dxa"/>
+          </w:tcPr>
+          <w:p>
+            <w:pPr>
+              <w:rPr>
+                <w:rFonts w:ascii="Arial" w:hAnsi="Arial" w:cs="Arial"/>
+              </w:rPr>
+            </w:pPr>
+            <w:r>
+              <w:rPr>
+                <w:rFonts w:ascii="Arial" w:hAnsi="Arial" w:cs="Arial"/>
+              </w:rPr>
+              <w:t>Continuato il garage</w:t>
+            </w:r>
+          </w:p>
+        </w:tc>
+      </w:tr>
+    </w:tbl>
+    <w:p>
+      <w:pPr>
+        <w:rPr>
+          <w:rFonts w:ascii="Arial" w:hAnsi="Arial" w:cs="Arial"/>
+        </w:rPr>
+      </w:pPr>
+    </w:p>
+    <w:tbl>
+      <w:tblPr>
+        <w:tblStyle w:val="Grigliatabella"/>
+        <w:tblW w:w="0" w:type="auto"/>
+        <w:tblInd w:w="-5" w:type="dxa"/>
+        <w:tblLook w:val="04A0" w:firstRow="1" w:lastRow="0" w:firstColumn="1" w:lastColumn="0" w:noHBand="0" w:noVBand="1"/>
+      </w:tblPr>
+      <w:tblGrid>
+        <w:gridCol w:w="1276"/>
+        <w:gridCol w:w="8357"/>
+      </w:tblGrid>
+      <w:tr>
+        <w:tc>
+          <w:tcPr>
+            <w:tcW w:w="9628" w:type="dxa"/>
+            <w:gridSpan w:val="2"/>
+            <w:shd w:val="clear" w:color="auto" w:fill="D9D9D9" w:themeFill="background1" w:themeFillShade="D9"/>
+          </w:tcPr>
+          <w:p>
+            <w:pPr>
+              <w:rPr>
+                <w:rFonts w:ascii="Arial" w:hAnsi="Arial" w:cs="Arial"/>
+              </w:rPr>
+            </w:pPr>
+            <w:r>
+              <w:rPr>
+                <w:rFonts w:ascii="Arial" w:hAnsi="Arial" w:cs="Arial"/>
+              </w:rPr>
+              <w:t>Problemi riscontrati e soluzioni adottate</w:t>
+            </w:r>
+          </w:p>
+        </w:tc>
+      </w:tr>
+      <w:tr>
+        <w:tc>
+          <w:tcPr>
+            <w:tcW w:w="1276" w:type="dxa"/>
+          </w:tcPr>
+          <w:p>
+            <w:pPr>
+              <w:rPr>
+                <w:rFonts w:ascii="Arial" w:hAnsi="Arial" w:cs="Arial"/>
+              </w:rPr>
+            </w:pPr>
+            <w:r>
+              <w:rPr>
+                <w:rFonts w:ascii="Arial" w:hAnsi="Arial" w:cs="Arial"/>
+              </w:rPr>
+              <w:t>Riley</w:t>
+            </w:r>
+          </w:p>
+        </w:tc>
+        <w:tc>
+          <w:tcPr>
+            <w:tcW w:w="8357" w:type="dxa"/>
+          </w:tcPr>
+          <w:p>
+            <w:pPr>
+              <w:rPr>
+                <w:rFonts w:ascii="Arial" w:hAnsi="Arial" w:cs="Arial"/>
+              </w:rPr>
+            </w:pPr>
+            <w:r>
+              <w:rPr>
+                <w:rFonts w:ascii="Arial" w:hAnsi="Arial" w:cs="Arial"/>
+              </w:rPr>
+              <w:t>Struttura di assegnazione tasti diversa rispetto al resto, perciò è stato necessario adattare i due metodi, ancora in sviluppo</w:t>
+            </w:r>
+          </w:p>
+        </w:tc>
+      </w:tr>
+      <w:tr>
+        <w:tc>
+          <w:tcPr>
+            <w:tcW w:w="1276" w:type="dxa"/>
+          </w:tcPr>
+          <w:p>
+            <w:pPr>
+              <w:rPr>
+                <w:rFonts w:ascii="Arial" w:hAnsi="Arial" w:cs="Arial"/>
+              </w:rPr>
+            </w:pPr>
+            <w:r>
+              <w:rPr>
+                <w:rFonts w:ascii="Arial" w:hAnsi="Arial" w:cs="Arial"/>
+              </w:rPr>
+              <w:t>Bryan</w:t>
+            </w:r>
+          </w:p>
+        </w:tc>
+        <w:tc>
+          <w:tcPr>
+            <w:tcW w:w="8357" w:type="dxa"/>
+          </w:tcPr>
+          <w:p>
+            <w:pPr>
+              <w:rPr>
+                <w:rFonts w:ascii="Arial" w:hAnsi="Arial" w:cs="Arial"/>
+              </w:rPr>
+            </w:pPr>
+            <w:r>
+              <w:rPr>
+                <w:rFonts w:ascii="Arial" w:hAnsi="Arial" w:cs="Arial"/>
+              </w:rPr>
+              <w:t>-</w:t>
+            </w:r>
+          </w:p>
+        </w:tc>
+      </w:tr>
+    </w:tbl>
+    <w:p>
+      <w:pPr>
+        <w:rPr>
+          <w:rFonts w:ascii="Arial" w:hAnsi="Arial" w:cs="Arial"/>
+        </w:rPr>
+      </w:pPr>
+    </w:p>
+    <w:tbl>
+      <w:tblPr>
+        <w:tblStyle w:val="Grigliatabella"/>
+        <w:tblW w:w="0" w:type="auto"/>
+        <w:tblLook w:val="04A0" w:firstRow="1" w:lastRow="0" w:firstColumn="1" w:lastColumn="0" w:noHBand="0" w:noVBand="1"/>
+      </w:tblPr>
+      <w:tblGrid>
+        <w:gridCol w:w="9628"/>
+      </w:tblGrid>
+      <w:tr>
+        <w:tc>
+          <w:tcPr>
+            <w:tcW w:w="9854" w:type="dxa"/>
+            <w:shd w:val="clear" w:color="auto" w:fill="D9D9D9" w:themeFill="background1" w:themeFillShade="D9"/>
+          </w:tcPr>
+          <w:p>
+            <w:pPr>
+              <w:rPr>
+                <w:rFonts w:ascii="Arial" w:hAnsi="Arial" w:cs="Arial"/>
+              </w:rPr>
+            </w:pPr>
+            <w:r>
+              <w:rPr>
+                <w:rFonts w:ascii="Arial" w:hAnsi="Arial" w:cs="Arial"/>
+              </w:rPr>
+              <w:t>Punto della situazione rispetto alla pianificazione</w:t>
+            </w:r>
+          </w:p>
+        </w:tc>
+      </w:tr>
+      <w:tr>
+        <w:tc>
+          <w:tcPr>
+            <w:tcW w:w="9854" w:type="dxa"/>
+          </w:tcPr>
+          <w:p>
+            <w:pPr>
+              <w:rPr>
+                <w:rFonts w:ascii="Arial" w:hAnsi="Arial" w:cs="Arial"/>
+              </w:rPr>
+            </w:pPr>
+            <w:r>
+              <w:rPr>
+                <w:rFonts w:ascii="Arial" w:hAnsi="Arial" w:cs="Arial"/>
+              </w:rPr>
+              <w:t>Lavori dello sprint già conclusi, stanno essendo svolti dei lavori extra</w:t>
+            </w:r>
+          </w:p>
+        </w:tc>
+      </w:tr>
+    </w:tbl>
+    <w:p>
+      <w:pPr>
+        <w:rPr>
+          <w:rFonts w:ascii="Arial" w:hAnsi="Arial" w:cs="Arial"/>
+        </w:rPr>
+      </w:pPr>
+    </w:p>
+    <w:tbl>
+      <w:tblPr>
+        <w:tblStyle w:val="Grigliatabella"/>
+        <w:tblW w:w="0" w:type="auto"/>
+        <w:tblLook w:val="04A0" w:firstRow="1" w:lastRow="0" w:firstColumn="1" w:lastColumn="0" w:noHBand="0" w:noVBand="1"/>
+      </w:tblPr>
+      <w:tblGrid>
+        <w:gridCol w:w="9628"/>
+      </w:tblGrid>
+      <w:tr>
+        <w:tc>
+          <w:tcPr>
+            <w:tcW w:w="9854" w:type="dxa"/>
+            <w:shd w:val="clear" w:color="auto" w:fill="D9D9D9" w:themeFill="background1" w:themeFillShade="D9"/>
+          </w:tcPr>
+          <w:p>
+            <w:pPr>
+              <w:rPr>
+                <w:rFonts w:ascii="Arial" w:hAnsi="Arial" w:cs="Arial"/>
+              </w:rPr>
+            </w:pPr>
+            <w:r>
+              <w:rPr>
+                <w:rFonts w:ascii="Arial" w:hAnsi="Arial" w:cs="Arial"/>
+              </w:rPr>
+              <w:t>Programma di massima per la prossima giornata di lavoro</w:t>
+            </w:r>
+          </w:p>
+        </w:tc>
+      </w:tr>
+      <w:tr>
+        <w:tc>
+          <w:tcPr>
+            <w:tcW w:w="9854" w:type="dxa"/>
+          </w:tcPr>
+          <w:p>
+            <w:pPr>
+              <w:rPr>
+                <w:rFonts w:ascii="Arial" w:hAnsi="Arial" w:cs="Arial"/>
+              </w:rPr>
+            </w:pPr>
+            <w:r>
+              <w:rPr>
+                <w:rFonts w:ascii="Arial" w:hAnsi="Arial" w:cs="Arial"/>
+              </w:rPr>
+              <w:t>Continuare ognuno con i sviluppi di db e garage</w:t>
+            </w:r>
+          </w:p>
+        </w:tc>
+      </w:tr>
+    </w:tbl>
+    <w:p>
+      <w:pPr>
+        <w:rPr>
+          <w:rFonts w:ascii="Arial" w:hAnsi="Arial" w:cs="Arial"/>
+        </w:rPr>
+      </w:pPr>
+    </w:p>
+    <w:p>
+      <w:pPr>
+        <w:pStyle w:val="Titolo1"/>
+      </w:pPr>
+      <w:r>
+        <w:t>Agile - Resoconto</w:t>
+      </w:r>
+    </w:p>
+    <w:tbl>
+      <w:tblPr>
+        <w:tblStyle w:val="Grigliatabella"/>
+        <w:tblW w:w="0" w:type="auto"/>
+        <w:tblLook w:val="04A0" w:firstRow="1" w:lastRow="0" w:firstColumn="1" w:lastColumn="0" w:noHBand="0" w:noVBand="1"/>
+      </w:tblPr>
+      <w:tblGrid>
+        <w:gridCol w:w="9628"/>
+      </w:tblGrid>
+      <w:tr>
+        <w:tc>
+          <w:tcPr>
+            <w:tcW w:w="9628" w:type="dxa"/>
+            <w:tcBorders>
+              <w:top w:val="single" w:sz="4" w:space="0" w:color="auto"/>
+              <w:left w:val="single" w:sz="4" w:space="0" w:color="auto"/>
+              <w:bottom w:val="single" w:sz="4" w:space="0" w:color="auto"/>
+              <w:right w:val="single" w:sz="4" w:space="0" w:color="auto"/>
+            </w:tcBorders>
+            <w:shd w:val="clear" w:color="auto" w:fill="D9D9D9" w:themeFill="background1" w:themeFillShade="D9"/>
+            <w:hideMark/>
+          </w:tcPr>
+          <w:p>
+            <w:pPr>
+              <w:spacing w:after="200" w:line="276" w:lineRule="auto"/>
+              <w:rPr>
+                <w:rFonts w:ascii="Arial" w:hAnsi="Arial" w:cs="Arial"/>
+              </w:rPr>
+            </w:pPr>
+            <w:r>
+              <w:rPr>
+                <w:rFonts w:ascii="Arial" w:hAnsi="Arial" w:cs="Arial"/>
+              </w:rPr>
+              <w:t>Daily Scrum</w:t>
+            </w:r>
+          </w:p>
+        </w:tc>
+      </w:tr>
+      <w:tr>
+        <w:tc>
+          <w:tcPr>
+            <w:tcW w:w="9628" w:type="dxa"/>
+            <w:tcBorders>
+              <w:top w:val="single" w:sz="4" w:space="0" w:color="auto"/>
+              <w:left w:val="single" w:sz="4" w:space="0" w:color="auto"/>
+              <w:bottom w:val="single" w:sz="4" w:space="0" w:color="auto"/>
+              <w:right w:val="single" w:sz="4" w:space="0" w:color="auto"/>
+            </w:tcBorders>
+            <w:hideMark/>
+          </w:tcPr>
+          <w:p>
+            <w:pPr>
+              <w:spacing w:after="200" w:line="276" w:lineRule="auto"/>
+              <w:rPr>
+                <w:rFonts w:ascii="Arial" w:hAnsi="Arial" w:cs="Arial"/>
+              </w:rPr>
+            </w:pPr>
+          </w:p>
+        </w:tc>
+      </w:tr>
+      <w:tr>
+        <w:tc>
+          <w:tcPr>
+            <w:tcW w:w="9628" w:type="dxa"/>
+            <w:tcBorders>
+              <w:top w:val="single" w:sz="4" w:space="0" w:color="auto"/>
+              <w:left w:val="single" w:sz="4" w:space="0" w:color="auto"/>
+              <w:bottom w:val="single" w:sz="4" w:space="0" w:color="auto"/>
+              <w:right w:val="single" w:sz="4" w:space="0" w:color="auto"/>
+            </w:tcBorders>
+          </w:tcPr>
+          <w:p>
+            <w:pPr>
+              <w:spacing w:after="200" w:line="276" w:lineRule="auto"/>
+              <w:rPr>
+                <w:rFonts w:ascii="Arial" w:hAnsi="Arial" w:cs="Arial"/>
+              </w:rPr>
+            </w:pPr>
+            <w:r>
+              <w:rPr>
+                <w:rFonts w:ascii="Arial" w:hAnsi="Arial" w:cs="Arial"/>
+              </w:rPr>
+              <w:t>Riley: Continuo sviluppo db</w:t>
+            </w:r>
+          </w:p>
+          <w:p>
+            <w:pPr>
+              <w:spacing w:after="200" w:line="276" w:lineRule="auto"/>
+              <w:rPr>
+                <w:rFonts w:ascii="Arial" w:hAnsi="Arial" w:cs="Arial"/>
+              </w:rPr>
+            </w:pPr>
+            <w:r>
+              <w:rPr>
+                <w:rFonts w:ascii="Arial" w:hAnsi="Arial" w:cs="Arial"/>
+              </w:rPr>
+              <w:t xml:space="preserve">Bryan: </w:t>
+            </w:r>
+            <w:r>
+              <w:rPr>
+                <w:rFonts w:ascii="Arial" w:hAnsi="Arial" w:cs="Arial"/>
+              </w:rPr>
+              <w:t>Continuo sviluppo garage</w:t>
+            </w:r>
+          </w:p>
+        </w:tc>
+      </w:tr>
+    </w:tbl>
+    <w:p>
+      <w:pPr>
+        <w:rPr>
+          <w:rFonts w:ascii="Arial" w:hAnsi="Arial" w:cs="Arial"/>
+        </w:rPr>
+      </w:pPr>
+    </w:p>
+    <w:tbl>
+      <w:tblPr>
+        <w:tblStyle w:val="Grigliatabella"/>
+        <w:tblW w:w="0" w:type="auto"/>
+        <w:tblLook w:val="04A0" w:firstRow="1" w:lastRow="0" w:firstColumn="1" w:lastColumn="0" w:noHBand="0" w:noVBand="1"/>
+      </w:tblPr>
+      <w:tblGrid>
+        <w:gridCol w:w="9628"/>
+      </w:tblGrid>
+      <w:tr>
+        <w:tc>
+          <w:tcPr>
+            <w:tcW w:w="9854" w:type="dxa"/>
+            <w:tcBorders>
+              <w:top w:val="single" w:sz="4" w:space="0" w:color="auto"/>
+              <w:left w:val="single" w:sz="4" w:space="0" w:color="auto"/>
+              <w:bottom w:val="single" w:sz="4" w:space="0" w:color="auto"/>
+              <w:right w:val="single" w:sz="4" w:space="0" w:color="auto"/>
+            </w:tcBorders>
+            <w:shd w:val="clear" w:color="auto" w:fill="D9D9D9" w:themeFill="background1" w:themeFillShade="D9"/>
+            <w:hideMark/>
+          </w:tcPr>
+          <w:p>
+            <w:pPr>
+              <w:spacing w:after="200" w:line="276" w:lineRule="auto"/>
+              <w:rPr>
+                <w:rFonts w:ascii="Arial" w:hAnsi="Arial" w:cs="Arial"/>
+              </w:rPr>
+            </w:pPr>
+            <w:r>
+              <w:rPr>
+                <w:rFonts w:ascii="Arial" w:hAnsi="Arial" w:cs="Arial"/>
+              </w:rPr>
+              <w:t>Sprint Planning</w:t>
+            </w:r>
+          </w:p>
+        </w:tc>
+      </w:tr>
+      <w:tr>
+        <w:tc>
+          <w:tcPr>
+            <w:tcW w:w="9854" w:type="dxa"/>
+            <w:tcBorders>
+              <w:top w:val="single" w:sz="4" w:space="0" w:color="auto"/>
+              <w:left w:val="single" w:sz="4" w:space="0" w:color="auto"/>
+              <w:bottom w:val="single" w:sz="4" w:space="0" w:color="auto"/>
+              <w:right w:val="single" w:sz="4" w:space="0" w:color="auto"/>
+            </w:tcBorders>
+          </w:tcPr>
+          <w:p>
+            <w:pPr>
+              <w:spacing w:after="200" w:line="276" w:lineRule="auto"/>
+              <w:rPr>
+                <w:rFonts w:ascii="Arial" w:hAnsi="Arial" w:cs="Arial"/>
+              </w:rPr>
+            </w:pPr>
+          </w:p>
+        </w:tc>
+      </w:tr>
+    </w:tbl>
+    <w:p>
+      <w:pPr>
+        <w:rPr>
+          <w:rFonts w:ascii="Arial" w:hAnsi="Arial" w:cs="Arial"/>
+        </w:rPr>
+      </w:pPr>
+    </w:p>
+    <w:tbl>
+      <w:tblPr>
+        <w:tblStyle w:val="Grigliatabella"/>
+        <w:tblW w:w="0" w:type="auto"/>
+        <w:tblLook w:val="04A0" w:firstRow="1" w:lastRow="0" w:firstColumn="1" w:lastColumn="0" w:noHBand="0" w:noVBand="1"/>
+      </w:tblPr>
+      <w:tblGrid>
+        <w:gridCol w:w="9628"/>
+      </w:tblGrid>
+      <w:tr>
+        <w:tc>
+          <w:tcPr>
+            <w:tcW w:w="9854" w:type="dxa"/>
+            <w:tcBorders>
+              <w:top w:val="single" w:sz="4" w:space="0" w:color="auto"/>
+              <w:left w:val="single" w:sz="4" w:space="0" w:color="auto"/>
+              <w:bottom w:val="single" w:sz="4" w:space="0" w:color="auto"/>
+              <w:right w:val="single" w:sz="4" w:space="0" w:color="auto"/>
+            </w:tcBorders>
+            <w:shd w:val="clear" w:color="auto" w:fill="D9D9D9" w:themeFill="background1" w:themeFillShade="D9"/>
+            <w:hideMark/>
+          </w:tcPr>
+          <w:p>
+            <w:pPr>
+              <w:spacing w:after="200" w:line="276" w:lineRule="auto"/>
+              <w:rPr>
+                <w:rFonts w:ascii="Arial" w:hAnsi="Arial" w:cs="Arial"/>
+              </w:rPr>
+            </w:pPr>
+            <w:r>
+              <w:rPr>
+                <w:rFonts w:ascii="Arial" w:hAnsi="Arial" w:cs="Arial"/>
+              </w:rPr>
+              <w:t>Sprint Review</w:t>
+            </w:r>
+          </w:p>
+        </w:tc>
+      </w:tr>
+      <w:tr>
+        <w:tc>
+          <w:tcPr>
+            <w:tcW w:w="9854" w:type="dxa"/>
+            <w:tcBorders>
+              <w:top w:val="single" w:sz="4" w:space="0" w:color="auto"/>
+              <w:left w:val="single" w:sz="4" w:space="0" w:color="auto"/>
+              <w:bottom w:val="single" w:sz="4" w:space="0" w:color="auto"/>
+              <w:right w:val="single" w:sz="4" w:space="0" w:color="auto"/>
+            </w:tcBorders>
+          </w:tcPr>
+          <w:p>
+            <w:pPr>
+              <w:spacing w:after="200" w:line="276" w:lineRule="auto"/>
+              <w:rPr>
+                <w:rFonts w:ascii="Arial" w:hAnsi="Arial" w:cs="Arial"/>
+              </w:rPr>
+            </w:pPr>
+          </w:p>
+        </w:tc>
+      </w:tr>
+    </w:tbl>
+    <w:p>
+      <w:pPr>
+        <w:rPr>
+          <w:rFonts w:ascii="Arial" w:hAnsi="Arial" w:cs="Arial"/>
+        </w:rPr>
+      </w:pPr>
+    </w:p>
+    <w:tbl>
+      <w:tblPr>
+        <w:tblStyle w:val="Grigliatabella"/>
+        <w:tblW w:w="0" w:type="auto"/>
+        <w:tblLook w:val="04A0" w:firstRow="1" w:lastRow="0" w:firstColumn="1" w:lastColumn="0" w:noHBand="0" w:noVBand="1"/>
+      </w:tblPr>
+      <w:tblGrid>
+        <w:gridCol w:w="9628"/>
+      </w:tblGrid>
+      <w:tr>
+        <w:tc>
+          <w:tcPr>
+            <w:tcW w:w="9854" w:type="dxa"/>
+            <w:tcBorders>
+              <w:top w:val="single" w:sz="4" w:space="0" w:color="auto"/>
+              <w:left w:val="single" w:sz="4" w:space="0" w:color="auto"/>
+              <w:bottom w:val="single" w:sz="4" w:space="0" w:color="auto"/>
+              <w:right w:val="single" w:sz="4" w:space="0" w:color="auto"/>
+            </w:tcBorders>
+            <w:shd w:val="clear" w:color="auto" w:fill="D9D9D9" w:themeFill="background1" w:themeFillShade="D9"/>
+            <w:hideMark/>
+          </w:tcPr>
+          <w:p>
+            <w:pPr>
+              <w:spacing w:after="200" w:line="276" w:lineRule="auto"/>
+              <w:rPr>
+                <w:rFonts w:ascii="Arial" w:hAnsi="Arial" w:cs="Arial"/>
+              </w:rPr>
+            </w:pPr>
+            <w:r>
+              <w:rPr>
+                <w:rFonts w:ascii="Arial" w:hAnsi="Arial" w:cs="Arial"/>
+              </w:rPr>
+              <w:t>Sprint Retrospective</w:t>
+            </w:r>
+          </w:p>
+        </w:tc>
+      </w:tr>
+      <w:tr>
+        <w:tc>
+          <w:tcPr>
+            <w:tcW w:w="9854" w:type="dxa"/>
+            <w:tcBorders>
+              <w:top w:val="single" w:sz="4" w:space="0" w:color="auto"/>
+              <w:left w:val="single" w:sz="4" w:space="0" w:color="auto"/>
+              <w:bottom w:val="single" w:sz="4" w:space="0" w:color="auto"/>
+              <w:right w:val="single" w:sz="4" w:space="0" w:color="auto"/>
+            </w:tcBorders>
+          </w:tcPr>
+          <w:p>
+            <w:pPr>
+              <w:spacing w:after="200" w:line="276" w:lineRule="auto"/>
+              <w:rPr>
+                <w:rFonts w:ascii="Arial" w:hAnsi="Arial" w:cs="Arial"/>
+              </w:rPr>
+            </w:pPr>
+          </w:p>
+        </w:tc>
+      </w:tr>
+    </w:tbl>
+    <w:p>
+      <w:pPr>
+        <w:rPr>
+          <w:rFonts w:ascii="Arial" w:hAnsi="Arial" w:cs="Arial"/>
+        </w:rPr>
+      </w:pPr>
+    </w:p>
+    <w:p>
+      <w:pPr>
+        <w:rPr>
+          <w:rFonts w:ascii="Arial" w:hAnsi="Arial" w:cs="Arial"/>
+        </w:rPr>
+      </w:pPr>
+      <w:r>
+        <w:rPr>
+          <w:rFonts w:ascii="Arial" w:hAnsi="Arial" w:cs="Arial"/>
+        </w:rPr>
+        <w:br w:type="page"/>
+      </w:r>
+    </w:p>
+    <w:p>
+      <w:pPr>
+        <w:pStyle w:val="Titolo2"/>
+        <w:pBdr>
+          <w:bottom w:val="single" w:sz="4" w:space="1" w:color="auto"/>
+        </w:pBdr>
+      </w:pPr>
+      <w:r>
+        <w:lastRenderedPageBreak/>
+        <w:t>Utilizzo Intelligenza Artificiale</w:t>
+      </w:r>
+      <w:r>
+        <w:t xml:space="preserve"> nella giornata</w:t>
+      </w:r>
+    </w:p>
+    <w:p>
+      <w:pPr>
+        <w:pStyle w:val="Nessunaspaziatura"/>
+        <w:rPr>
+          <w:rFonts w:ascii="Arial" w:hAnsi="Arial" w:cs="Arial"/>
+          <w:b/>
+          <w:bCs/>
+        </w:rPr>
+      </w:pPr>
+    </w:p>
+    <w:p>
+      <w:pPr>
+        <w:pStyle w:val="Nessunaspaziatura"/>
+        <w:rPr>
+          <w:rFonts w:ascii="Arial" w:hAnsi="Arial" w:cs="Arial"/>
+        </w:rPr>
+      </w:pPr>
+      <w:sdt>
+        <w:sdtPr>
+          <w:rPr>
+            <w:rFonts w:ascii="Segoe UI Symbol" w:hAnsi="Segoe UI Symbol" w:cs="Segoe UI Symbol"/>
+          </w:rPr>
+          <w:id w:val="1435791599"/>
+          <w14:checkbox>
+            <w14:checked w14:val="0"/>
+            <w14:checkedState w14:val="2612" w14:font="MS Gothic"/>
+            <w14:uncheckedState w14:val="2610" w14:font="MS Gothic"/>
+          </w14:checkbox>
+        </w:sdtPr>
+        <w:sdtContent>
+          <w:r>
+            <w:rPr>
+              <w:rFonts w:ascii="MS Gothic" w:eastAsia="MS Gothic" w:hAnsi="MS Gothic" w:cs="Segoe UI Symbol" w:hint="eastAsia"/>
+            </w:rPr>
+            <w:t>☐</w:t>
+          </w:r>
+        </w:sdtContent>
+      </w:sdt>
+      <w:r>
+        <w:rPr>
+          <w:rFonts w:ascii="Arial" w:hAnsi="Arial" w:cs="Arial"/>
+        </w:rPr>
+        <w:t xml:space="preserve"> Nessuno</w:t>
+      </w:r>
+      <w:r>
+        <w:br/>
+      </w:r>
+      <w:sdt>
+        <w:sdtPr>
+          <w:rPr>
+            <w:rFonts w:ascii="Segoe UI Symbol" w:hAnsi="Segoe UI Symbol" w:cs="Segoe UI Symbol"/>
+          </w:rPr>
+          <w:id w:val="-555624959"/>
+          <w14:checkbox>
+            <w14:checked w14:val="1"/>
+            <w14:checkedState w14:val="2612" w14:font="MS Gothic"/>
+            <w14:uncheckedState w14:val="2610" w14:font="MS Gothic"/>
+          </w14:checkbox>
+        </w:sdtPr>
+        <w:sdtContent>
+          <w:r>
+            <w:rPr>
+              <w:rFonts w:ascii="MS Gothic" w:eastAsia="MS Gothic" w:hAnsi="MS Gothic" w:cs="Segoe UI Symbol" w:hint="eastAsia"/>
+            </w:rPr>
+            <w:t>☒</w:t>
+          </w:r>
+        </w:sdtContent>
+      </w:sdt>
+      <w:r>
+        <w:rPr>
+          <w:rFonts w:ascii="Arial" w:hAnsi="Arial" w:cs="Arial"/>
+        </w:rPr>
+        <w:t xml:space="preserve"> Occasionale</w:t>
+      </w:r>
+      <w:r>
+        <w:br/>
+      </w:r>
+      <w:sdt>
+        <w:sdtPr>
+          <w:rPr>
+            <w:rFonts w:ascii="Segoe UI Symbol" w:hAnsi="Segoe UI Symbol" w:cs="Segoe UI Symbol"/>
+          </w:rPr>
+          <w:id w:val="1260564251"/>
+          <w14:checkbox>
+            <w14:checked w14:val="0"/>
+            <w14:checkedState w14:val="2612" w14:font="MS Gothic"/>
+            <w14:uncheckedState w14:val="2610" w14:font="MS Gothic"/>
+          </w14:checkbox>
+        </w:sdtPr>
+        <w:sdtContent>
+          <w:r>
+            <w:rPr>
+              <w:rFonts w:ascii="MS Gothic" w:eastAsia="MS Gothic" w:hAnsi="MS Gothic" w:cs="Segoe UI Symbol" w:hint="eastAsia"/>
+            </w:rPr>
+            <w:t>☐</w:t>
+          </w:r>
+        </w:sdtContent>
+      </w:sdt>
+      <w:r>
+        <w:rPr>
+          <w:rFonts w:ascii="Arial" w:hAnsi="Arial" w:cs="Arial"/>
+        </w:rPr>
+        <w:t xml:space="preserve"> Frequente</w:t>
+      </w:r>
+    </w:p>
+    <w:p>
+      <w:pPr>
+        <w:pStyle w:val="Nessunaspaziatura"/>
+        <w:rPr>
+          <w:rFonts w:ascii="Arial" w:hAnsi="Arial" w:cs="Arial"/>
+        </w:rPr>
+      </w:pPr>
+    </w:p>
+    <w:p>
+      <w:pPr>
+        <w:pStyle w:val="Nessunaspaziatura"/>
+        <w:spacing w:line="276" w:lineRule="auto"/>
+        <w:rPr>
+          <w:rFonts w:ascii="Arial" w:hAnsi="Arial" w:cs="Arial"/>
+        </w:rPr>
+      </w:pPr>
+      <w:r>
+        <w:rPr>
+          <w:rFonts w:ascii="Arial" w:hAnsi="Arial" w:cs="Arial"/>
+          <w:b/>
+          <w:bCs/>
+        </w:rPr>
+        <w:t>Strumento/i utilizzato/i</w:t>
+      </w:r>
+      <w:r>
+        <w:rPr>
+          <w:rFonts w:ascii="Arial" w:hAnsi="Arial" w:cs="Arial"/>
+          <w:b/>
+          <w:bCs/>
+        </w:rPr>
+        <w:t xml:space="preserve"> </w:t>
+      </w:r>
+      <w:r>
+        <w:rPr>
+          <w:rFonts w:ascii="Arial" w:hAnsi="Arial" w:cs="Arial"/>
+        </w:rPr>
+        <w:t>(es. ChatGPT)</w:t>
+      </w:r>
+      <w:r>
+        <w:rPr>
+          <w:rFonts w:ascii="Arial" w:hAnsi="Arial" w:cs="Arial"/>
+        </w:rPr>
+        <w:t xml:space="preserve">: </w:t>
+      </w:r>
+      <w:sdt>
+        <w:sdtPr>
+          <w:rPr>
+            <w:rFonts w:ascii="Arial" w:hAnsi="Arial" w:cs="Arial"/>
+          </w:rPr>
+          <w:id w:val="265967888"/>
+          <w:placeholder>
+            <w:docPart w:val="C2D64BBDEBC540AC84636870EF0E1A74"/>
+          </w:placeholder>
+        </w:sdtPr>
+        <w:sdtContent>
+          <w:r>
+            <w:rPr>
+              <w:rFonts w:ascii="Arial" w:hAnsi="Arial" w:cs="Arial"/>
+            </w:rPr>
+            <w:t>ChatGPT</w:t>
+          </w:r>
+        </w:sdtContent>
+      </w:sdt>
+    </w:p>
+    <w:p>
+      <w:pPr>
+        <w:pStyle w:val="Nessunaspaziatura"/>
+        <w:rPr>
+          <w:rFonts w:ascii="Arial" w:hAnsi="Arial" w:cs="Arial"/>
+        </w:rPr>
+      </w:pPr>
+    </w:p>
+    <w:p>
+      <w:pPr>
+        <w:pStyle w:val="Nessunaspaziatura"/>
+        <w:rPr>
+          <w:rFonts w:ascii="Arial" w:hAnsi="Arial" w:cs="Arial"/>
+        </w:rPr>
+      </w:pPr>
+      <w:r>
+        <w:rPr>
+          <w:rFonts w:ascii="Arial" w:hAnsi="Arial" w:cs="Arial"/>
+          <w:b/>
+          <w:bCs/>
+        </w:rPr>
+        <w:t>Per cosa l’ho usata oggi</w:t>
+      </w:r>
+      <w:r>
+        <w:br/>
+      </w:r>
+      <w:sdt>
+        <w:sdtPr>
+          <w:rPr>
+            <w:rFonts w:ascii="Segoe UI Symbol" w:hAnsi="Segoe UI Symbol" w:cs="Segoe UI Symbol"/>
+          </w:rPr>
+          <w:id w:val="208933343"/>
+          <w14:checkbox>
+            <w14:checked w14:val="1"/>
+            <w14:checkedState w14:val="2612" w14:font="MS Gothic"/>
+            <w14:uncheckedState w14:val="2610" w14:font="MS Gothic"/>
+          </w14:checkbox>
+        </w:sdtPr>
+        <w:sdtContent>
+          <w:r>
+            <w:rPr>
+              <w:rFonts w:ascii="MS Gothic" w:eastAsia="MS Gothic" w:hAnsi="MS Gothic" w:cs="Segoe UI Symbol" w:hint="eastAsia"/>
+            </w:rPr>
+            <w:t>☒</w:t>
+          </w:r>
+        </w:sdtContent>
+      </w:sdt>
+      <w:r>
+        <w:rPr>
+          <w:rFonts w:ascii="Arial" w:hAnsi="Arial" w:cs="Arial"/>
+        </w:rPr>
+        <w:t xml:space="preserve"> Chiarire concetti</w:t>
+      </w:r>
+      <w:r>
+        <w:br/>
+      </w:r>
+      <w:sdt>
+        <w:sdtPr>
+          <w:rPr>
+            <w:rFonts w:ascii="Segoe UI Symbol" w:hAnsi="Segoe UI Symbol" w:cs="Segoe UI Symbol"/>
+          </w:rPr>
+          <w:id w:val="-595175062"/>
+          <w14:checkbox>
+            <w14:checked w14:val="1"/>
+            <w14:checkedState w14:val="2612" w14:font="MS Gothic"/>
+            <w14:uncheckedState w14:val="2610" w14:font="MS Gothic"/>
+          </w14:checkbox>
+        </w:sdtPr>
+        <w:sdtContent>
+          <w:r>
+            <w:rPr>
+              <w:rFonts w:ascii="MS Gothic" w:eastAsia="MS Gothic" w:hAnsi="MS Gothic" w:cs="Segoe UI Symbol" w:hint="eastAsia"/>
+            </w:rPr>
+            <w:t>☒</w:t>
+          </w:r>
+        </w:sdtContent>
+      </w:sdt>
+      <w:r>
+        <w:rPr>
+          <w:rFonts w:ascii="Arial" w:hAnsi="Arial" w:cs="Arial"/>
+        </w:rPr>
+        <w:t xml:space="preserve"> Supporto al codice</w:t>
+      </w:r>
+      <w:r>
+        <w:br/>
+      </w:r>
+      <w:sdt>
+        <w:sdtPr>
+          <w:rPr>
+            <w:rFonts w:ascii="Segoe UI Symbol" w:hAnsi="Segoe UI Symbol" w:cs="Segoe UI Symbol"/>
+          </w:rPr>
+          <w:id w:val="-1992098288"/>
+          <w14:checkbox>
+            <w14:checked w14:val="0"/>
+            <w14:checkedState w14:val="2612" w14:font="MS Gothic"/>
+            <w14:uncheckedState w14:val="2610" w14:font="MS Gothic"/>
+          </w14:checkbox>
+        </w:sdtPr>
+        <w:sdtContent>
+          <w:r>
+            <w:rPr>
+              <w:rFonts w:ascii="MS Gothic" w:eastAsia="MS Gothic" w:hAnsi="MS Gothic" w:cs="Segoe UI Symbol" w:hint="eastAsia"/>
+            </w:rPr>
+            <w:t>☐</w:t>
+          </w:r>
+        </w:sdtContent>
+      </w:sdt>
+      <w:r>
+        <w:rPr>
+          <w:rFonts w:ascii="Arial" w:hAnsi="Arial" w:cs="Arial"/>
+        </w:rPr>
+        <w:t xml:space="preserve"> Debug</w:t>
+      </w:r>
+      <w:r>
+        <w:br/>
+      </w:r>
+      <w:sdt>
+        <w:sdtPr>
+          <w:rPr>
+            <w:rFonts w:ascii="Segoe UI Symbol" w:hAnsi="Segoe UI Symbol" w:cs="Segoe UI Symbol"/>
+          </w:rPr>
+          <w:id w:val="613015700"/>
+          <w14:checkbox>
+            <w14:checked w14:val="0"/>
+            <w14:checkedState w14:val="2612" w14:font="MS Gothic"/>
+            <w14:uncheckedState w14:val="2610" w14:font="MS Gothic"/>
+          </w14:checkbox>
+        </w:sdtPr>
+        <w:sdtContent>
+          <w:r>
+            <w:rPr>
+              <w:rFonts w:ascii="MS Gothic" w:eastAsia="MS Gothic" w:hAnsi="MS Gothic" w:cs="Segoe UI Symbol" w:hint="eastAsia"/>
+            </w:rPr>
+            <w:t>☐</w:t>
+          </w:r>
+        </w:sdtContent>
+      </w:sdt>
+      <w:r>
+        <w:rPr>
+          <w:rFonts w:ascii="Arial" w:hAnsi="Arial" w:cs="Arial"/>
+        </w:rPr>
+        <w:t xml:space="preserve"> Riorganizzare idee / testi</w:t>
+      </w:r>
+      <w:r>
+        <w:br/>
+      </w:r>
+      <w:sdt>
+        <w:sdtPr>
+          <w:rPr>
+            <w:rFonts w:ascii="Segoe UI Symbol" w:hAnsi="Segoe UI Symbol" w:cs="Segoe UI Symbol"/>
+          </w:rPr>
+          <w:id w:val="94456296"/>
+          <w14:checkbox>
+            <w14:checked w14:val="0"/>
+            <w14:checkedState w14:val="2612" w14:font="MS Gothic"/>
+            <w14:uncheckedState w14:val="2610" w14:font="MS Gothic"/>
+          </w14:checkbox>
+        </w:sdtPr>
+        <w:sdtContent>
+          <w:r>
+            <w:rPr>
+              <w:rFonts w:ascii="MS Gothic" w:eastAsia="MS Gothic" w:hAnsi="MS Gothic" w:cs="Segoe UI Symbol" w:hint="eastAsia"/>
+            </w:rPr>
+            <w:t>☐</w:t>
+          </w:r>
+        </w:sdtContent>
+      </w:sdt>
+      <w:r>
+        <w:rPr>
+          <w:rFonts w:ascii="Arial" w:hAnsi="Arial" w:cs="Arial"/>
+        </w:rPr>
+        <w:t xml:space="preserve"> Altro: …</w:t>
+      </w:r>
+    </w:p>
+    <w:p>
+      <w:pPr>
+        <w:pStyle w:val="Nessunaspaziatura"/>
+        <w:rPr>
+          <w:rFonts w:ascii="Arial" w:hAnsi="Arial" w:cs="Arial"/>
+        </w:rPr>
+      </w:pPr>
+    </w:p>
+    <w:p>
+      <w:pPr>
+        <w:pStyle w:val="Nessunaspaziatura"/>
+        <w:rPr>
+          <w:rFonts w:ascii="Arial" w:hAnsi="Arial" w:cs="Arial"/>
+          <w:b/>
+          <w:bCs/>
+        </w:rPr>
+      </w:pPr>
+      <w:r>
+        <w:rPr>
+          <w:rFonts w:ascii="Arial" w:hAnsi="Arial" w:cs="Arial"/>
+          <w:b/>
+          <w:bCs/>
+        </w:rPr>
+        <w:t>Esempio significativo di utilizzo (UNO SOLO)</w:t>
+      </w:r>
+    </w:p>
+    <w:p>
+      <w:pPr>
+        <w:pStyle w:val="Nessunaspaziatura"/>
+        <w:rPr>
+          <w:rFonts w:ascii="Arial" w:hAnsi="Arial" w:cs="Arial"/>
+        </w:rPr>
+      </w:pPr>
+      <w:r>
+        <w:rPr>
+          <w:rFonts w:ascii="Arial" w:hAnsi="Arial" w:cs="Arial"/>
+        </w:rPr>
+        <w:t xml:space="preserve">Riporta </w:t>
+      </w:r>
+      <w:r>
+        <w:rPr>
+          <w:rFonts w:ascii="Arial" w:hAnsi="Arial" w:cs="Arial"/>
+          <w:i/>
+          <w:iCs/>
+        </w:rPr>
+        <w:t>un</w:t>
+      </w:r>
+      <w:r>
+        <w:rPr>
+          <w:rFonts w:ascii="Arial" w:hAnsi="Arial" w:cs="Arial"/>
+        </w:rPr>
+        <w:t xml:space="preserve"> prompt rilevante oppure descrivilo a parole se ce ne sono stati molti.</w:t>
+      </w:r>
+    </w:p>
+    <w:p>
+      <w:pPr>
+        <w:pStyle w:val="Nessunaspaziatura"/>
+        <w:rPr>
+          <w:rFonts w:ascii="Arial" w:hAnsi="Arial" w:cs="Arial"/>
+        </w:rPr>
+      </w:pPr>
+    </w:p>
+    <w:sdt>
+      <w:sdtPr>
+        <w:rPr>
+          <w:rFonts w:ascii="Arial" w:hAnsi="Arial" w:cs="Arial"/>
+        </w:rPr>
+        <w:alias w:val="Prompt AI"/>
+        <w:tag w:val="Prompt AI"/>
+        <w:id w:val="-1641873370"/>
+        <w:placeholder>
+          <w:docPart w:val="81865899836445DDB489617AFDB1CF69"/>
+        </w:placeholder>
+        <w15:color w:val="C0C0C0"/>
+      </w:sdtPr>
+      <w:sdtContent>
+        <w:p>
+          <w:pPr>
+            <w:pStyle w:val="Nessunaspaziatura"/>
+            <w:rPr>
+              <w:rFonts w:ascii="Arial" w:hAnsi="Arial" w:cs="Arial"/>
+            </w:rPr>
+          </w:pPr>
+          <w:r>
+            <w:rPr>
+              <w:rFonts w:ascii="Arial" w:hAnsi="Arial" w:cs="Arial"/>
+            </w:rPr>
+            <w:t xml:space="preserve">Riley: </w:t>
+          </w:r>
+          <w:r>
+            <w:rPr>
+              <w:rFonts w:ascii="Arial" w:hAnsi="Arial" w:cs="Arial"/>
+            </w:rPr>
+            <w:t>Dovrei introdurre nel db i comandi collegati alle impostazioni, ma la struttura usata è diversa da quelle precedenti, e viene usata una classe esterna.</w:t>
+          </w:r>
+        </w:p>
+        <w:p>
+          <w:pPr>
+            <w:pStyle w:val="Nessunaspaziatura"/>
+            <w:spacing w:line="276" w:lineRule="auto"/>
+            <w:rPr>
+              <w:rFonts w:ascii="Arial" w:hAnsi="Arial" w:cs="Arial"/>
+            </w:rPr>
+          </w:pPr>
+          <w:r>
+            <w:rPr>
+              <w:rFonts w:ascii="Arial" w:hAnsi="Arial" w:cs="Arial"/>
+            </w:rPr>
+            <w:t xml:space="preserve">Bryan: </w:t>
+          </w:r>
+        </w:p>
+      </w:sdtContent>
+    </w:sdt>
+    <w:p>
+      <w:pPr>
+        <w:pStyle w:val="Nessunaspaziatura"/>
+        <w:rPr>
+          <w:rFonts w:ascii="Arial" w:hAnsi="Arial" w:cs="Arial"/>
+        </w:rPr>
+      </w:pPr>
+    </w:p>
+    <w:p>
+      <w:pPr>
+        <w:pStyle w:val="Nessunaspaziatura"/>
+        <w:rPr>
+          <w:rFonts w:ascii="Arial" w:hAnsi="Arial" w:cs="Arial"/>
+        </w:rPr>
+      </w:pPr>
+      <w:r>
+        <w:rPr>
+          <w:rFonts w:ascii="Arial" w:hAnsi="Arial" w:cs="Arial"/>
+          <w:b/>
+          <w:bCs/>
+        </w:rPr>
+        <w:t>Cosa mi ha dato l’AI</w:t>
+      </w:r>
+    </w:p>
+    <w:p>
+      <w:pPr>
+        <w:pStyle w:val="Nessunaspaziatura"/>
+        <w:rPr>
+          <w:rFonts w:ascii="Arial" w:hAnsi="Arial" w:cs="Arial"/>
+        </w:rPr>
+      </w:pPr>
+      <w:r>
+        <w:rPr>
+          <w:rFonts w:ascii="Arial" w:hAnsi="Arial" w:cs="Arial"/>
+        </w:rPr>
+        <w:t>Spiegazione, esempio, soluzione, suggerimento…</w:t>
+      </w:r>
+    </w:p>
+    <w:p>
+      <w:pPr>
+        <w:pStyle w:val="Nessunaspaziatura"/>
+        <w:rPr>
+          <w:rFonts w:ascii="Arial" w:hAnsi="Arial" w:cs="Arial"/>
+        </w:rPr>
+      </w:pPr>
+    </w:p>
+    <w:sdt>
+      <w:sdtPr>
+        <w:rPr>
+          <w:rFonts w:ascii="Arial" w:hAnsi="Arial" w:cs="Arial"/>
+        </w:rPr>
+        <w:alias w:val="Risposta AI"/>
+        <w:tag w:val="Risposta AI"/>
+        <w:id w:val="-266011696"/>
+        <w:placeholder>
+          <w:docPart w:val="9CEFF2656A304FD4A2654EE3A2CDC5A8"/>
+        </w:placeholder>
+        <w15:color w:val="C0C0C0"/>
+      </w:sdtPr>
+      <w:sdtContent>
+        <w:p>
+          <w:pPr>
+            <w:pStyle w:val="Nessunaspaziatura"/>
+            <w:spacing w:line="276" w:lineRule="auto"/>
+            <w:rPr>
+              <w:rFonts w:ascii="Arial" w:hAnsi="Arial" w:cs="Arial"/>
+            </w:rPr>
+          </w:pPr>
+          <w:r>
+            <w:rPr>
+              <w:rFonts w:ascii="Arial" w:hAnsi="Arial" w:cs="Arial"/>
+            </w:rPr>
+            <w:t xml:space="preserve">Riley: </w:t>
+          </w:r>
+          <w:r>
+            <w:rPr>
+              <w:rFonts w:ascii="Arial" w:hAnsi="Arial" w:cs="Arial"/>
+            </w:rPr>
+            <w:t>Mi è stato detto come alcune parti della struttura siano ancora usabili e mi è stato chiesto qualche dettaglio per i comandi per potermi fornire delle risposte più corrette</w:t>
+          </w:r>
+        </w:p>
+        <w:p>
+          <w:pPr>
+            <w:pStyle w:val="Nessunaspaziatura"/>
+            <w:spacing w:line="276" w:lineRule="auto"/>
+            <w:rPr>
+              <w:rFonts w:ascii="Arial" w:hAnsi="Arial" w:cs="Arial"/>
+            </w:rPr>
+          </w:pPr>
+          <w:r>
+            <w:rPr>
+              <w:rFonts w:ascii="Arial" w:hAnsi="Arial" w:cs="Arial"/>
+            </w:rPr>
+            <w:t xml:space="preserve">Bryan: </w:t>
+          </w:r>
+        </w:p>
+      </w:sdtContent>
+    </w:sdt>
+    <w:p>
+      <w:pPr>
+        <w:pStyle w:val="Nessunaspaziatura"/>
+        <w:rPr>
+          <w:rFonts w:ascii="Arial" w:hAnsi="Arial" w:cs="Arial"/>
+          <w:b/>
+          <w:bCs/>
+        </w:rPr>
+      </w:pPr>
+    </w:p>
+    <w:p>
+      <w:pPr>
+        <w:pStyle w:val="Nessunaspaziatura"/>
+        <w:rPr>
+          <w:rFonts w:ascii="Arial" w:hAnsi="Arial" w:cs="Arial"/>
+        </w:rPr>
+      </w:pPr>
+      <w:r>
+        <w:rPr>
+          <w:rFonts w:ascii="Arial" w:hAnsi="Arial" w:cs="Arial"/>
+          <w:b/>
+          <w:bCs/>
+        </w:rPr>
+        <w:t>Come l’ho usato io</w:t>
+      </w:r>
+      <w:r>
+        <w:rPr>
+          <w:rFonts w:ascii="Arial" w:hAnsi="Arial" w:cs="Arial"/>
+        </w:rPr>
+        <w:br/>
+      </w:r>
+      <w:sdt>
+        <w:sdtPr>
+          <w:rPr>
+            <w:rFonts w:ascii="Segoe UI Symbol" w:hAnsi="Segoe UI Symbol" w:cs="Segoe UI Symbol"/>
+          </w:rPr>
+          <w:id w:val="-812796674"/>
+          <w14:checkbox>
+            <w14:checked w14:val="0"/>
+            <w14:checkedState w14:val="2612" w14:font="MS Gothic"/>
+            <w14:uncheckedState w14:val="2610" w14:font="MS Gothic"/>
+          </w14:checkbox>
+        </w:sdtPr>
+        <w:sdtContent>
+          <w:r>
+            <w:rPr>
+              <w:rFonts w:ascii="MS Gothic" w:eastAsia="MS Gothic" w:hAnsi="MS Gothic" w:cs="Segoe UI Symbol" w:hint="eastAsia"/>
+            </w:rPr>
+            <w:t>☐</w:t>
+          </w:r>
+        </w:sdtContent>
+      </w:sdt>
+      <w:r>
+        <w:rPr>
+          <w:rFonts w:ascii="Arial" w:hAnsi="Arial" w:cs="Arial"/>
+        </w:rPr>
+        <w:t xml:space="preserve"> Copiato</w:t>
+      </w:r>
+      <w:r>
+        <w:rPr>
+          <w:rFonts w:ascii="Arial" w:hAnsi="Arial" w:cs="Arial"/>
+        </w:rPr>
+        <w:br/>
+      </w:r>
+      <w:sdt>
+        <w:sdtPr>
+          <w:rPr>
+            <w:rFonts w:ascii="Segoe UI Symbol" w:hAnsi="Segoe UI Symbol" w:cs="Segoe UI Symbol"/>
+          </w:rPr>
+          <w:id w:val="-787822909"/>
+          <w14:checkbox>
+            <w14:checked w14:val="1"/>
+            <w14:checkedState w14:val="2612" w14:font="MS Gothic"/>
+            <w14:uncheckedState w14:val="2610" w14:font="MS Gothic"/>
+          </w14:checkbox>
+        </w:sdtPr>
+        <w:sdtContent>
+          <w:r>
+            <w:rPr>
+              <w:rFonts w:ascii="MS Gothic" w:eastAsia="MS Gothic" w:hAnsi="MS Gothic" w:cs="Segoe UI Symbol" w:hint="eastAsia"/>
+            </w:rPr>
+            <w:t>☒</w:t>
+          </w:r>
+        </w:sdtContent>
+      </w:sdt>
+      <w:r>
+        <w:rPr>
+          <w:rFonts w:ascii="Arial" w:hAnsi="Arial" w:cs="Arial"/>
+        </w:rPr>
+        <w:t xml:space="preserve"> Adattato</w:t>
+      </w:r>
+      <w:r>
+        <w:rPr>
+          <w:rFonts w:ascii="Arial" w:hAnsi="Arial" w:cs="Arial"/>
+        </w:rPr>
+        <w:br/>
+      </w:r>
+      <w:sdt>
+        <w:sdtPr>
+          <w:rPr>
+            <w:rFonts w:ascii="Segoe UI Symbol" w:hAnsi="Segoe UI Symbol" w:cs="Segoe UI Symbol"/>
+          </w:rPr>
+          <w:id w:val="-1800524180"/>
+          <w14:checkbox>
+            <w14:checked w14:val="0"/>
+            <w14:checkedState w14:val="2612" w14:font="MS Gothic"/>
+            <w14:uncheckedState w14:val="2610" w14:font="MS Gothic"/>
+          </w14:checkbox>
+        </w:sdtPr>
+        <w:sdtContent>
+          <w:r>
+            <w:rPr>
+              <w:rFonts w:ascii="MS Gothic" w:eastAsia="MS Gothic" w:hAnsi="MS Gothic" w:cs="Segoe UI Symbol" w:hint="eastAsia"/>
+            </w:rPr>
+            <w:t>☐</w:t>
+          </w:r>
+        </w:sdtContent>
+      </w:sdt>
+      <w:r>
+        <w:rPr>
+          <w:rFonts w:ascii="Arial" w:hAnsi="Arial" w:cs="Arial"/>
+        </w:rPr>
+        <w:t xml:space="preserve"> Usato solo per capire</w:t>
+      </w:r>
+      <w:r>
+        <w:rPr>
+          <w:rFonts w:ascii="Arial" w:hAnsi="Arial" w:cs="Arial"/>
+        </w:rPr>
+        <w:br/>
+      </w:r>
+      <w:sdt>
+        <w:sdtPr>
+          <w:rPr>
+            <w:rFonts w:ascii="Segoe UI Symbol" w:hAnsi="Segoe UI Symbol" w:cs="Segoe UI Symbol"/>
+          </w:rPr>
+          <w:id w:val="947045698"/>
+          <w14:checkbox>
+            <w14:checked w14:val="0"/>
+            <w14:checkedState w14:val="2612" w14:font="MS Gothic"/>
+            <w14:uncheckedState w14:val="2610" w14:font="MS Gothic"/>
+          </w14:checkbox>
+        </w:sdtPr>
+        <w:sdtContent>
+          <w:r>
+            <w:rPr>
+              <w:rFonts w:ascii="MS Gothic" w:eastAsia="MS Gothic" w:hAnsi="MS Gothic" w:cs="Segoe UI Symbol" w:hint="eastAsia"/>
+            </w:rPr>
+            <w:t>☐</w:t>
+          </w:r>
+        </w:sdtContent>
+      </w:sdt>
+      <w:r>
+        <w:rPr>
+          <w:rFonts w:ascii="Arial" w:hAnsi="Arial" w:cs="Arial"/>
+        </w:rPr>
+        <w:t xml:space="preserve"> Scartato</w:t>
+      </w:r>
+    </w:p>
+    <w:p>
+      <w:pPr>
+        <w:pStyle w:val="Nessunaspaziatura"/>
+        <w:rPr>
+          <w:rFonts w:ascii="Arial" w:hAnsi="Arial" w:cs="Arial"/>
+        </w:rPr>
+      </w:pPr>
+    </w:p>
+    <w:p>
+      <w:pPr>
+        <w:pStyle w:val="Nessunaspaziatura"/>
+        <w:rPr>
+          <w:rFonts w:ascii="Arial" w:hAnsi="Arial" w:cs="Arial"/>
+        </w:rPr>
+      </w:pPr>
+    </w:p>
+    <w:p>
+      <w:pPr>
+        <w:pStyle w:val="Nessunaspaziatura"/>
+        <w:rPr>
+          <w:rFonts w:ascii="Arial" w:hAnsi="Arial" w:cs="Arial"/>
+        </w:rPr>
+      </w:pPr>
+      <w:r>
+        <w:rPr>
+          <w:rFonts w:ascii="Arial" w:hAnsi="Arial" w:cs="Arial"/>
+          <w:b/>
+          <w:bCs/>
+        </w:rPr>
+        <w:t>Cosa avrei fatto senza AI?</w:t>
+      </w:r>
+    </w:p>
+    <w:p>
+      <w:pPr>
+        <w:pStyle w:val="Nessunaspaziatura"/>
+        <w:rPr>
+          <w:rFonts w:ascii="Arial" w:hAnsi="Arial" w:cs="Arial"/>
+        </w:rPr>
+      </w:pPr>
+      <w:r>
+        <w:rPr>
+          <w:rFonts w:ascii="Arial" w:hAnsi="Arial" w:cs="Arial"/>
+        </w:rPr>
+        <w:t xml:space="preserve">Riley: </w:t>
+      </w:r>
+      <w:r>
+        <w:rPr>
+          <w:rFonts w:ascii="Arial" w:hAnsi="Arial" w:cs="Arial"/>
+        </w:rPr>
+        <w:t>Avrei probabilmente cercato di comprendere il codice e chiesto a Bryan il funzionamento per potermi adattare</w:t>
       </w:r>
     </w:p>
     <w:p>
@@ -28609,6 +30200,107 @@
         </w:p>
       </w:docPartBody>
     </w:docPart>
+    <w:docPart>
+      <w:docPartPr>
+        <w:name w:val="C2D64BBDEBC540AC84636870EF0E1A74"/>
+        <w:category>
+          <w:name w:val="Generale"/>
+          <w:gallery w:val="placeholder"/>
+        </w:category>
+        <w:types>
+          <w:type w:val="bbPlcHdr"/>
+        </w:types>
+        <w:behaviors>
+          <w:behavior w:val="content"/>
+        </w:behaviors>
+        <w:guid w:val="{D6378C93-8A77-4EE0-BBF3-2B7A3BDEA4A6}"/>
+      </w:docPartPr>
+      <w:docPartBody>
+        <w:p>
+          <w:pPr>
+            <w:pStyle w:val="C2D64BBDEBC540AC84636870EF0E1A74"/>
+          </w:pPr>
+          <w:r>
+            <w:rPr>
+              <w:rStyle w:val="Testosegnaposto"/>
+              <w:b/>
+              <w:bCs/>
+            </w:rPr>
+            <w:t>Nomi AI utilizzati</w:t>
+          </w:r>
+        </w:p>
+      </w:docPartBody>
+    </w:docPart>
+    <w:docPart>
+      <w:docPartPr>
+        <w:name w:val="81865899836445DDB489617AFDB1CF69"/>
+        <w:category>
+          <w:name w:val="Generale"/>
+          <w:gallery w:val="placeholder"/>
+        </w:category>
+        <w:types>
+          <w:type w:val="bbPlcHdr"/>
+        </w:types>
+        <w:behaviors>
+          <w:behavior w:val="content"/>
+        </w:behaviors>
+        <w:guid w:val="{4F798F2F-30DB-49B5-A5F8-74296727436D}"/>
+      </w:docPartPr>
+      <w:docPartBody>
+        <w:p>
+          <w:pPr>
+            <w:pStyle w:val="81865899836445DDB489617AFDB1CF69"/>
+          </w:pPr>
+          <w:r>
+            <w:rPr>
+              <w:rStyle w:val="Testosegnaposto"/>
+            </w:rPr>
+            <w:t>Fare clic o toccare qui per immettere il testo.</w:t>
+          </w:r>
+        </w:p>
+      </w:docPartBody>
+    </w:docPart>
+    <w:docPart>
+      <w:docPartPr>
+        <w:name w:val="9CEFF2656A304FD4A2654EE3A2CDC5A8"/>
+        <w:category>
+          <w:name w:val="Generale"/>
+          <w:gallery w:val="placeholder"/>
+        </w:category>
+        <w:types>
+          <w:type w:val="bbPlcHdr"/>
+        </w:types>
+        <w:behaviors>
+          <w:behavior w:val="content"/>
+        </w:behaviors>
+        <w:guid w:val="{493DD2EA-73E2-49D4-9B6C-46629C01D243}"/>
+      </w:docPartPr>
+      <w:docPartBody>
+        <w:p>
+          <w:pPr>
+            <w:pStyle w:val="9CEFF2656A304FD4A2654EE3A2CDC5A8"/>
+          </w:pPr>
+          <w:r>
+            <w:rPr>
+              <w:rStyle w:val="Testosegnaposto"/>
+            </w:rPr>
+            <w:t xml:space="preserve">Fare clic o toccare qui per </w:t>
+          </w:r>
+          <w:r>
+            <w:rPr>
+              <w:rStyle w:val="Testosegnaposto"/>
+            </w:rPr>
+            <w:t>immettere</w:t>
+          </w:r>
+          <w:r>
+            <w:rPr>
+              <w:rStyle w:val="Testosegnaposto"/>
+            </w:rPr>
+            <w:t xml:space="preserve"> il testo.</w:t>
+          </w:r>
+        </w:p>
+      </w:docPartBody>
+    </w:docPart>
   </w:docParts>
 </w:glossaryDocument>
 </file>
@@ -28745,6 +30437,7 @@
     <w:rsid w:val="00083E28"/>
     <w:rsid w:val="000B54FB"/>
     <w:rsid w:val="000D07AC"/>
+    <w:rsid w:val="000E7E2F"/>
     <w:rsid w:val="001A3B5C"/>
     <w:rsid w:val="001C42CE"/>
     <w:rsid w:val="00254718"/>
@@ -28814,10 +30507,12 @@
     <w:rsid w:val="00EF520A"/>
     <w:rsid w:val="00EF5C0D"/>
     <w:rsid w:val="00F15724"/>
+    <w:rsid w:val="00F2496B"/>
     <w:rsid w:val="00F26F5B"/>
     <w:rsid w:val="00F36694"/>
     <w:rsid w:val="00F50717"/>
     <w:rsid w:val="00F726EC"/>
+    <w:rsid w:val="00F8713D"/>
   </w:rsids>
   <m:mathPr>
     <m:mathFont m:val="Cambria Math"/>
@@ -29273,7 +30968,7 @@
     <w:basedOn w:val="Carpredefinitoparagrafo"/>
     <w:uiPriority w:val="99"/>
     <w:semiHidden/>
-    <w:rsid w:val="00040D54"/>
+    <w:rsid w:val="000E7E2F"/>
     <w:rPr>
       <w:color w:val="666666"/>
     </w:rPr>
@@ -29514,6 +31209,18 @@
   <w:style w:type="paragraph" w:customStyle="1" w:styleId="57286425BAD647479152F371A1186F2C">
     <w:name w:val="57286425BAD647479152F371A1186F2C"/>
     <w:rsid w:val="00040D54"/>
+  </w:style>
+  <w:style w:type="paragraph" w:customStyle="1" w:styleId="C2D64BBDEBC540AC84636870EF0E1A74">
+    <w:name w:val="C2D64BBDEBC540AC84636870EF0E1A74"/>
+    <w:rsid w:val="000E7E2F"/>
+  </w:style>
+  <w:style w:type="paragraph" w:customStyle="1" w:styleId="81865899836445DDB489617AFDB1CF69">
+    <w:name w:val="81865899836445DDB489617AFDB1CF69"/>
+    <w:rsid w:val="000E7E2F"/>
+  </w:style>
+  <w:style w:type="paragraph" w:customStyle="1" w:styleId="9CEFF2656A304FD4A2654EE3A2CDC5A8">
+    <w:name w:val="9CEFF2656A304FD4A2654EE3A2CDC5A8"/>
+    <w:rsid w:val="000E7E2F"/>
   </w:style>
 </w:styles>
 </file>

</xml_diff>

<commit_message>
aggiunta comandi in DB, chiusura connessione e aggiunta pagina diario
</commit_message>
<xml_diff>
--- a/4_Diari/Diario.docx
+++ b/4_Diari/Diario.docx
@@ -193,7 +193,21 @@
               <w:rPr>
                 <w:rFonts w:ascii="Arial" w:hAnsi="Arial" w:cs="Arial"/>
               </w:rPr>
-              <w:t>Riflettuto sui requisiti e user story del gioco, creato i primi template per gantt e diario</w:t>
+              <w:t xml:space="preserve">Riflettuto sui requisiti e user story del gioco, creato i primi template per </w:t>
+            </w:r>
+            <w:proofErr w:type="spellStart"/>
+            <w:r>
+              <w:rPr>
+                <w:rFonts w:ascii="Arial" w:hAnsi="Arial" w:cs="Arial"/>
+              </w:rPr>
+              <w:t>gantt</w:t>
+            </w:r>
+            <w:proofErr w:type="spellEnd"/>
+            <w:r>
+              <w:rPr>
+                <w:rFonts w:ascii="Arial" w:hAnsi="Arial" w:cs="Arial"/>
+              </w:rPr>
+              <w:t xml:space="preserve"> e diario</w:t>
             </w:r>
           </w:p>
         </w:tc>
@@ -234,7 +248,21 @@
               <w:rPr>
                 <w:rFonts w:ascii="Arial" w:hAnsi="Arial" w:cs="Arial"/>
               </w:rPr>
-              <w:t>Riflettuto sui requisiti e user story del gioco, iniziato scrittura documentazione e sincronizzazione progetto a GitLab.</w:t>
+              <w:t xml:space="preserve">Riflettuto sui requisiti e user story del gioco, iniziato scrittura documentazione e sincronizzazione progetto a </w:t>
+            </w:r>
+            <w:proofErr w:type="spellStart"/>
+            <w:r>
+              <w:rPr>
+                <w:rFonts w:ascii="Arial" w:hAnsi="Arial" w:cs="Arial"/>
+              </w:rPr>
+              <w:t>GitLab</w:t>
+            </w:r>
+            <w:proofErr w:type="spellEnd"/>
+            <w:r>
+              <w:rPr>
+                <w:rFonts w:ascii="Arial" w:hAnsi="Arial" w:cs="Arial"/>
+              </w:rPr>
+              <w:t>.</w:t>
             </w:r>
           </w:p>
         </w:tc>
@@ -675,7 +703,25 @@
               <w:b/>
               <w:bCs/>
             </w:rPr>
-            <w:t>Nomi AI utilizzati</w:t>
+            <w:t xml:space="preserve">Nomi </w:t>
+          </w:r>
+          <w:proofErr w:type="gramStart"/>
+          <w:r>
+            <w:rPr>
+              <w:rStyle w:val="Testosegnaposto"/>
+              <w:b/>
+              <w:bCs/>
+            </w:rPr>
+            <w:t>AI</w:t>
+          </w:r>
+          <w:proofErr w:type="gramEnd"/>
+          <w:r>
+            <w:rPr>
+              <w:rStyle w:val="Testosegnaposto"/>
+              <w:b/>
+              <w:bCs/>
+            </w:rPr>
+            <w:t xml:space="preserve"> utilizzati</w:t>
           </w:r>
         </w:sdtContent>
       </w:sdt>
@@ -1756,7 +1802,21 @@
               <w:rPr>
                 <w:rFonts w:ascii="Arial" w:hAnsi="Arial" w:cs="Arial"/>
               </w:rPr>
-              <w:t>Iniziare e completare analisi dei mezzi, creare lo use case</w:t>
+              <w:t xml:space="preserve">Iniziare e completare analisi dei mezzi, creare </w:t>
+            </w:r>
+            <w:proofErr w:type="gramStart"/>
+            <w:r>
+              <w:rPr>
+                <w:rFonts w:ascii="Arial" w:hAnsi="Arial" w:cs="Arial"/>
+              </w:rPr>
+              <w:t>lo use</w:t>
+            </w:r>
+            <w:proofErr w:type="gramEnd"/>
+            <w:r>
+              <w:rPr>
+                <w:rFonts w:ascii="Arial" w:hAnsi="Arial" w:cs="Arial"/>
+              </w:rPr>
+              <w:t xml:space="preserve"> case</w:t>
             </w:r>
             <w:r>
               <w:rPr>
@@ -2234,7 +2294,21 @@
             <w:rPr>
               <w:rFonts w:ascii="Arial" w:hAnsi="Arial" w:cs="Arial"/>
             </w:rPr>
-            <w:t>Aitami a generare dei requesiti in base ai seguenti dati</w:t>
+            <w:t xml:space="preserve">Aitami a generare dei </w:t>
+          </w:r>
+          <w:proofErr w:type="spellStart"/>
+          <w:r>
+            <w:rPr>
+              <w:rFonts w:ascii="Arial" w:hAnsi="Arial" w:cs="Arial"/>
+            </w:rPr>
+            <w:t>requesiti</w:t>
+          </w:r>
+          <w:proofErr w:type="spellEnd"/>
+          <w:r>
+            <w:rPr>
+              <w:rFonts w:ascii="Arial" w:hAnsi="Arial" w:cs="Arial"/>
+            </w:rPr>
+            <w:t xml:space="preserve"> in base ai seguenti dati</w:t>
           </w:r>
         </w:p>
       </w:sdtContent>
@@ -2774,7 +2848,21 @@
               <w:rPr>
                 <w:rFonts w:ascii="Arial" w:hAnsi="Arial" w:cs="Arial"/>
               </w:rPr>
-              <w:t>Completata la analisi del dominio nella documentazione, inizio ricerche riguardo Unity.</w:t>
+              <w:t xml:space="preserve">Completata la analisi del dominio nella documentazione, inizio ricerche riguardo </w:t>
+            </w:r>
+            <w:proofErr w:type="spellStart"/>
+            <w:r>
+              <w:rPr>
+                <w:rFonts w:ascii="Arial" w:hAnsi="Arial" w:cs="Arial"/>
+              </w:rPr>
+              <w:t>Unity</w:t>
+            </w:r>
+            <w:proofErr w:type="spellEnd"/>
+            <w:r>
+              <w:rPr>
+                <w:rFonts w:ascii="Arial" w:hAnsi="Arial" w:cs="Arial"/>
+              </w:rPr>
+              <w:t>.</w:t>
             </w:r>
           </w:p>
         </w:tc>
@@ -2949,7 +3037,21 @@
               <w:rPr>
                 <w:rFonts w:ascii="Arial" w:hAnsi="Arial" w:cs="Arial"/>
               </w:rPr>
-              <w:t>Il diagramma ER non è completo e lo use case non è stato iniziato, analisi dei mezzi non ancora completata.</w:t>
+              <w:t xml:space="preserve">Il diagramma ER non è completo e </w:t>
+            </w:r>
+            <w:proofErr w:type="gramStart"/>
+            <w:r>
+              <w:rPr>
+                <w:rFonts w:ascii="Arial" w:hAnsi="Arial" w:cs="Arial"/>
+              </w:rPr>
+              <w:t>lo use</w:t>
+            </w:r>
+            <w:proofErr w:type="gramEnd"/>
+            <w:r>
+              <w:rPr>
+                <w:rFonts w:ascii="Arial" w:hAnsi="Arial" w:cs="Arial"/>
+              </w:rPr>
+              <w:t xml:space="preserve"> case non è stato iniziato, analisi dei mezzi non ancora completata.</w:t>
             </w:r>
           </w:p>
         </w:tc>
@@ -3981,8 +4083,16 @@
               <w:rPr>
                 <w:rFonts w:ascii="Arial" w:hAnsi="Arial" w:cs="Arial"/>
               </w:rPr>
-              <w:t>Creato diagramma ER e modifiche strutturali gantt</w:t>
-            </w:r>
+              <w:t xml:space="preserve">Creato diagramma ER e modifiche strutturali </w:t>
+            </w:r>
+            <w:proofErr w:type="spellStart"/>
+            <w:r>
+              <w:rPr>
+                <w:rFonts w:ascii="Arial" w:hAnsi="Arial" w:cs="Arial"/>
+              </w:rPr>
+              <w:t>gantt</w:t>
+            </w:r>
+            <w:proofErr w:type="spellEnd"/>
           </w:p>
         </w:tc>
       </w:tr>
@@ -4730,12 +4840,20 @@
             <w:rPr>
               <w:rFonts w:ascii="Arial" w:hAnsi="Arial" w:cs="Arial"/>
             </w:rPr>
-            <w:t>uoi dirmi delle classiche impostazioni per un gioco di guida in stile br</w:t>
-          </w:r>
+            <w:t xml:space="preserve">uoi dirmi delle classiche impostazioni per un gioco di guida in stile </w:t>
+          </w:r>
+          <w:proofErr w:type="spellStart"/>
           <w:r>
             <w:rPr>
               <w:rFonts w:ascii="Arial" w:hAnsi="Arial" w:cs="Arial"/>
             </w:rPr>
+            <w:t>br</w:t>
+          </w:r>
+          <w:proofErr w:type="spellEnd"/>
+          <w:r>
+            <w:rPr>
+              <w:rFonts w:ascii="Arial" w:hAnsi="Arial" w:cs="Arial"/>
+            </w:rPr>
             <w:t xml:space="preserve">. </w:t>
           </w:r>
           <w:r>
@@ -4743,7 +4861,21 @@
               <w:rFonts w:ascii="Arial" w:hAnsi="Arial" w:cs="Arial"/>
             </w:rPr>
             <w:br/>
-            <w:t>Bryan: Spiegami Unity ed i suoi vantaggi.</w:t>
+            <w:t xml:space="preserve">Bryan: Spiegami </w:t>
+          </w:r>
+          <w:proofErr w:type="spellStart"/>
+          <w:r>
+            <w:rPr>
+              <w:rFonts w:ascii="Arial" w:hAnsi="Arial" w:cs="Arial"/>
+            </w:rPr>
+            <w:t>Unity</w:t>
+          </w:r>
+          <w:proofErr w:type="spellEnd"/>
+          <w:r>
+            <w:rPr>
+              <w:rFonts w:ascii="Arial" w:hAnsi="Arial" w:cs="Arial"/>
+            </w:rPr>
+            <w:t xml:space="preserve"> ed i suoi vantaggi.</w:t>
           </w:r>
         </w:p>
       </w:sdtContent>
@@ -5221,8 +5353,16 @@
               <w:rPr>
                 <w:rFonts w:ascii="Arial" w:hAnsi="Arial" w:cs="Arial"/>
               </w:rPr>
-              <w:t>Creato Diagramma ER e aggiornato gannt</w:t>
-            </w:r>
+              <w:t xml:space="preserve">Creato Diagramma ER e aggiornato </w:t>
+            </w:r>
+            <w:proofErr w:type="spellStart"/>
+            <w:r>
+              <w:rPr>
+                <w:rFonts w:ascii="Arial" w:hAnsi="Arial" w:cs="Arial"/>
+              </w:rPr>
+              <w:t>gannt</w:t>
+            </w:r>
+            <w:proofErr w:type="spellEnd"/>
           </w:p>
         </w:tc>
       </w:tr>
@@ -5259,7 +5399,21 @@
               <w:rPr>
                 <w:rFonts w:ascii="Arial" w:hAnsi="Arial" w:cs="Arial"/>
               </w:rPr>
-              <w:t>Use Case finito, Inizio creazione e documentazione mockup UI.</w:t>
+              <w:t xml:space="preserve">Use Case finito, Inizio creazione e documentazione </w:t>
+            </w:r>
+            <w:proofErr w:type="spellStart"/>
+            <w:r>
+              <w:rPr>
+                <w:rFonts w:ascii="Arial" w:hAnsi="Arial" w:cs="Arial"/>
+              </w:rPr>
+              <w:t>mockup</w:t>
+            </w:r>
+            <w:proofErr w:type="spellEnd"/>
+            <w:r>
+              <w:rPr>
+                <w:rFonts w:ascii="Arial" w:hAnsi="Arial" w:cs="Arial"/>
+              </w:rPr>
+              <w:t xml:space="preserve"> UI.</w:t>
             </w:r>
           </w:p>
         </w:tc>
@@ -5376,7 +5530,21 @@
               <w:rPr>
                 <w:rFonts w:ascii="Arial" w:hAnsi="Arial" w:cs="Arial"/>
               </w:rPr>
-              <w:t>Riuscire a definire le azioni degli attori nel Use Case, risolto approfondendo meglio.</w:t>
+              <w:t xml:space="preserve">Riuscire a definire le azioni degli attori </w:t>
+            </w:r>
+            <w:proofErr w:type="gramStart"/>
+            <w:r>
+              <w:rPr>
+                <w:rFonts w:ascii="Arial" w:hAnsi="Arial" w:cs="Arial"/>
+              </w:rPr>
+              <w:t>nel Use</w:t>
+            </w:r>
+            <w:proofErr w:type="gramEnd"/>
+            <w:r>
+              <w:rPr>
+                <w:rFonts w:ascii="Arial" w:hAnsi="Arial" w:cs="Arial"/>
+              </w:rPr>
+              <w:t xml:space="preserve"> Case, risolto approfondendo meglio.</w:t>
             </w:r>
           </w:p>
         </w:tc>
@@ -5505,7 +5673,21 @@
               <w:rPr>
                 <w:rFonts w:ascii="Arial" w:hAnsi="Arial" w:cs="Arial"/>
               </w:rPr>
-              <w:t>Continuo creazione Mockup UI.</w:t>
+              <w:t xml:space="preserve">Continuo creazione </w:t>
+            </w:r>
+            <w:proofErr w:type="spellStart"/>
+            <w:r>
+              <w:rPr>
+                <w:rFonts w:ascii="Arial" w:hAnsi="Arial" w:cs="Arial"/>
+              </w:rPr>
+              <w:t>Mockup</w:t>
+            </w:r>
+            <w:proofErr w:type="spellEnd"/>
+            <w:r>
+              <w:rPr>
+                <w:rFonts w:ascii="Arial" w:hAnsi="Arial" w:cs="Arial"/>
+              </w:rPr>
+              <w:t xml:space="preserve"> UI.</w:t>
             </w:r>
           </w:p>
         </w:tc>
@@ -6076,8 +6258,30 @@
               <w:rFonts w:ascii="Arial" w:hAnsi="Arial" w:cs="Arial"/>
             </w:rPr>
             <w:br/>
-            <w:t>Bryan: Correzioni dello use case generato dal colega</w:t>
-          </w:r>
+            <w:t xml:space="preserve">Bryan: Correzioni </w:t>
+          </w:r>
+          <w:proofErr w:type="gramStart"/>
+          <w:r>
+            <w:rPr>
+              <w:rFonts w:ascii="Arial" w:hAnsi="Arial" w:cs="Arial"/>
+            </w:rPr>
+            <w:t>dello use</w:t>
+          </w:r>
+          <w:proofErr w:type="gramEnd"/>
+          <w:r>
+            <w:rPr>
+              <w:rFonts w:ascii="Arial" w:hAnsi="Arial" w:cs="Arial"/>
+            </w:rPr>
+            <w:t xml:space="preserve"> case generato dal </w:t>
+          </w:r>
+          <w:proofErr w:type="spellStart"/>
+          <w:r>
+            <w:rPr>
+              <w:rFonts w:ascii="Arial" w:hAnsi="Arial" w:cs="Arial"/>
+            </w:rPr>
+            <w:t>colega</w:t>
+          </w:r>
+          <w:proofErr w:type="spellEnd"/>
         </w:p>
       </w:sdtContent>
     </w:sdt>
@@ -6477,8 +6681,16 @@
               <w:rPr>
                 <w:rFonts w:ascii="Arial" w:hAnsi="Arial" w:cs="Arial"/>
               </w:rPr>
-              <w:t>Completata progettazione e creazione progetto unity</w:t>
-            </w:r>
+              <w:t xml:space="preserve">Completata progettazione e creazione progetto </w:t>
+            </w:r>
+            <w:proofErr w:type="spellStart"/>
+            <w:r>
+              <w:rPr>
+                <w:rFonts w:ascii="Arial" w:hAnsi="Arial" w:cs="Arial"/>
+              </w:rPr>
+              <w:t>unity</w:t>
+            </w:r>
+            <w:proofErr w:type="spellEnd"/>
           </w:p>
         </w:tc>
       </w:tr>
@@ -6515,8 +6727,16 @@
               <w:rPr>
                 <w:rFonts w:ascii="Arial" w:hAnsi="Arial" w:cs="Arial"/>
               </w:rPr>
-              <w:t>Fine Mockup</w:t>
-            </w:r>
+              <w:t xml:space="preserve">Fine </w:t>
+            </w:r>
+            <w:proofErr w:type="spellStart"/>
+            <w:r>
+              <w:rPr>
+                <w:rFonts w:ascii="Arial" w:hAnsi="Arial" w:cs="Arial"/>
+              </w:rPr>
+              <w:t>Mockup</w:t>
+            </w:r>
+            <w:proofErr w:type="spellEnd"/>
           </w:p>
         </w:tc>
       </w:tr>
@@ -6594,8 +6814,52 @@
               <w:rPr>
                 <w:rFonts w:ascii="Arial" w:hAnsi="Arial" w:cs="Arial"/>
               </w:rPr>
-              <w:t>Problemi nel pushare il progetto uinity, risolto grazie alla creazione di un file .gitignore</w:t>
-            </w:r>
+              <w:t xml:space="preserve">Problemi nel </w:t>
+            </w:r>
+            <w:proofErr w:type="spellStart"/>
+            <w:r>
+              <w:rPr>
+                <w:rFonts w:ascii="Arial" w:hAnsi="Arial" w:cs="Arial"/>
+              </w:rPr>
+              <w:t>pushare</w:t>
+            </w:r>
+            <w:proofErr w:type="spellEnd"/>
+            <w:r>
+              <w:rPr>
+                <w:rFonts w:ascii="Arial" w:hAnsi="Arial" w:cs="Arial"/>
+              </w:rPr>
+              <w:t xml:space="preserve"> il progetto </w:t>
+            </w:r>
+            <w:proofErr w:type="spellStart"/>
+            <w:r>
+              <w:rPr>
+                <w:rFonts w:ascii="Arial" w:hAnsi="Arial" w:cs="Arial"/>
+              </w:rPr>
+              <w:t>uinity</w:t>
+            </w:r>
+            <w:proofErr w:type="spellEnd"/>
+            <w:r>
+              <w:rPr>
+                <w:rFonts w:ascii="Arial" w:hAnsi="Arial" w:cs="Arial"/>
+              </w:rPr>
+              <w:t xml:space="preserve">, risolto grazie alla creazione di un </w:t>
+            </w:r>
+            <w:proofErr w:type="gramStart"/>
+            <w:r>
+              <w:rPr>
+                <w:rFonts w:ascii="Arial" w:hAnsi="Arial" w:cs="Arial"/>
+              </w:rPr>
+              <w:t>file .</w:t>
+            </w:r>
+            <w:proofErr w:type="spellStart"/>
+            <w:r>
+              <w:rPr>
+                <w:rFonts w:ascii="Arial" w:hAnsi="Arial" w:cs="Arial"/>
+              </w:rPr>
+              <w:t>gitignore</w:t>
+            </w:r>
+            <w:proofErr w:type="spellEnd"/>
+            <w:proofErr w:type="gramEnd"/>
           </w:p>
         </w:tc>
       </w:tr>
@@ -6748,7 +7012,35 @@
               <w:rPr>
                 <w:rFonts w:ascii="Arial" w:hAnsi="Arial" w:cs="Arial"/>
               </w:rPr>
-              <w:t>Ambientarsi nel game engine di unity e quindi cominciare a creare la schermata di statistiche</w:t>
+              <w:t xml:space="preserve">Ambientarsi nel game </w:t>
+            </w:r>
+            <w:proofErr w:type="spellStart"/>
+            <w:r>
+              <w:rPr>
+                <w:rFonts w:ascii="Arial" w:hAnsi="Arial" w:cs="Arial"/>
+              </w:rPr>
+              <w:t>engine</w:t>
+            </w:r>
+            <w:proofErr w:type="spellEnd"/>
+            <w:r>
+              <w:rPr>
+                <w:rFonts w:ascii="Arial" w:hAnsi="Arial" w:cs="Arial"/>
+              </w:rPr>
+              <w:t xml:space="preserve"> di </w:t>
+            </w:r>
+            <w:proofErr w:type="spellStart"/>
+            <w:r>
+              <w:rPr>
+                <w:rFonts w:ascii="Arial" w:hAnsi="Arial" w:cs="Arial"/>
+              </w:rPr>
+              <w:t>unity</w:t>
+            </w:r>
+            <w:proofErr w:type="spellEnd"/>
+            <w:r>
+              <w:rPr>
+                <w:rFonts w:ascii="Arial" w:hAnsi="Arial" w:cs="Arial"/>
+              </w:rPr>
+              <w:t xml:space="preserve"> e quindi cominciare a creare la schermata di statistiche</w:t>
             </w:r>
           </w:p>
         </w:tc>
@@ -7220,7 +7512,21 @@
             <w:rPr>
               <w:rFonts w:ascii="Arial" w:hAnsi="Arial" w:cs="Arial"/>
             </w:rPr>
-            <w:t>Bryan: Generami un’immagine di mockup basandoti sul seguente stile: “stile”</w:t>
+            <w:t xml:space="preserve">Bryan: Generami un’immagine di </w:t>
+          </w:r>
+          <w:proofErr w:type="spellStart"/>
+          <w:r>
+            <w:rPr>
+              <w:rFonts w:ascii="Arial" w:hAnsi="Arial" w:cs="Arial"/>
+            </w:rPr>
+            <w:t>mockup</w:t>
+          </w:r>
+          <w:proofErr w:type="spellEnd"/>
+          <w:r>
+            <w:rPr>
+              <w:rFonts w:ascii="Arial" w:hAnsi="Arial" w:cs="Arial"/>
+            </w:rPr>
+            <w:t xml:space="preserve"> basandoti sul seguente stile: “stile”</w:t>
           </w:r>
         </w:p>
         <w:p>
@@ -7534,14 +7840,58 @@
         <w:rPr>
           <w:rFonts w:ascii="Arial" w:hAnsi="Arial" w:cs="Arial"/>
         </w:rPr>
-        <w:t>Riley: probabilmente non sarei riuscito a risolvere questo problema non avendo un’esperienza molto avanzata con i file .gitignore</w:t>
-      </w:r>
+        <w:t xml:space="preserve">Riley: probabilmente non sarei riuscito a risolvere questo problema non avendo un’esperienza molto avanzata con i </w:t>
+      </w:r>
+      <w:proofErr w:type="gramStart"/>
+      <w:r>
+        <w:rPr>
+          <w:rFonts w:ascii="Arial" w:hAnsi="Arial" w:cs="Arial"/>
+        </w:rPr>
+        <w:t>file .</w:t>
+      </w:r>
+      <w:proofErr w:type="spellStart"/>
+      <w:r>
+        <w:rPr>
+          <w:rFonts w:ascii="Arial" w:hAnsi="Arial" w:cs="Arial"/>
+        </w:rPr>
+        <w:t>gitignore</w:t>
+      </w:r>
+      <w:proofErr w:type="spellEnd"/>
+      <w:proofErr w:type="gramEnd"/>
       <w:r>
         <w:rPr>
           <w:rFonts w:ascii="Arial" w:hAnsi="Arial" w:cs="Arial"/>
         </w:rPr>
         <w:br/>
-        <w:t>Bryan: Averi creato un’immagine su paint che avrebbe reso i mockup molto più confusi.</w:t>
+        <w:t xml:space="preserve">Bryan: Averi creato un’immagine su </w:t>
+      </w:r>
+      <w:proofErr w:type="spellStart"/>
+      <w:r>
+        <w:rPr>
+          <w:rFonts w:ascii="Arial" w:hAnsi="Arial" w:cs="Arial"/>
+        </w:rPr>
+        <w:t>paint</w:t>
+      </w:r>
+      <w:proofErr w:type="spellEnd"/>
+      <w:r>
+        <w:rPr>
+          <w:rFonts w:ascii="Arial" w:hAnsi="Arial" w:cs="Arial"/>
+        </w:rPr>
+        <w:t xml:space="preserve"> che avrebbe reso i </w:t>
+      </w:r>
+      <w:proofErr w:type="spellStart"/>
+      <w:r>
+        <w:rPr>
+          <w:rFonts w:ascii="Arial" w:hAnsi="Arial" w:cs="Arial"/>
+        </w:rPr>
+        <w:t>mockup</w:t>
+      </w:r>
+      <w:proofErr w:type="spellEnd"/>
+      <w:r>
+        <w:rPr>
+          <w:rFonts w:ascii="Arial" w:hAnsi="Arial" w:cs="Arial"/>
+        </w:rPr>
+        <w:t xml:space="preserve"> molto più confusi.</w:t>
       </w:r>
     </w:p>
     <w:p>
@@ -7727,7 +8077,21 @@
               <w:rPr>
                 <w:rFonts w:ascii="Arial" w:hAnsi="Arial" w:cs="Arial"/>
               </w:rPr>
-              <w:t>Inizio sviluppo ui statistiche</w:t>
+              <w:t xml:space="preserve">Inizio sviluppo </w:t>
+            </w:r>
+            <w:proofErr w:type="spellStart"/>
+            <w:r>
+              <w:rPr>
+                <w:rFonts w:ascii="Arial" w:hAnsi="Arial" w:cs="Arial"/>
+              </w:rPr>
+              <w:t>ui</w:t>
+            </w:r>
+            <w:proofErr w:type="spellEnd"/>
+            <w:r>
+              <w:rPr>
+                <w:rFonts w:ascii="Arial" w:hAnsi="Arial" w:cs="Arial"/>
+              </w:rPr>
+              <w:t xml:space="preserve"> statistiche</w:t>
             </w:r>
           </w:p>
         </w:tc>
@@ -7765,7 +8129,21 @@
               <w:rPr>
                 <w:rFonts w:ascii="Arial" w:hAnsi="Arial" w:cs="Arial"/>
               </w:rPr>
-              <w:t>Inizio sviluppo ui statistiche</w:t>
+              <w:t xml:space="preserve">Inizio sviluppo </w:t>
+            </w:r>
+            <w:proofErr w:type="spellStart"/>
+            <w:r>
+              <w:rPr>
+                <w:rFonts w:ascii="Arial" w:hAnsi="Arial" w:cs="Arial"/>
+              </w:rPr>
+              <w:t>ui</w:t>
+            </w:r>
+            <w:proofErr w:type="spellEnd"/>
+            <w:r>
+              <w:rPr>
+                <w:rFonts w:ascii="Arial" w:hAnsi="Arial" w:cs="Arial"/>
+              </w:rPr>
+              <w:t xml:space="preserve"> statistiche</w:t>
             </w:r>
           </w:p>
         </w:tc>
@@ -7998,7 +8376,21 @@
               <w:rPr>
                 <w:rFonts w:ascii="Arial" w:hAnsi="Arial" w:cs="Arial"/>
               </w:rPr>
-              <w:t>Completare la ui delle statistiche</w:t>
+              <w:t xml:space="preserve">Completare la </w:t>
+            </w:r>
+            <w:proofErr w:type="spellStart"/>
+            <w:r>
+              <w:rPr>
+                <w:rFonts w:ascii="Arial" w:hAnsi="Arial" w:cs="Arial"/>
+              </w:rPr>
+              <w:t>ui</w:t>
+            </w:r>
+            <w:proofErr w:type="spellEnd"/>
+            <w:r>
+              <w:rPr>
+                <w:rFonts w:ascii="Arial" w:hAnsi="Arial" w:cs="Arial"/>
+              </w:rPr>
+              <w:t xml:space="preserve"> delle statistiche</w:t>
             </w:r>
           </w:p>
         </w:tc>
@@ -8048,12 +8440,28 @@
                 <w:rFonts w:ascii="Arial" w:hAnsi="Arial" w:cs="Arial"/>
               </w:rPr>
             </w:pPr>
-            <w:r>
-              <w:rPr>
-                <w:rFonts w:ascii="Arial" w:hAnsi="Arial" w:cs="Arial"/>
-              </w:rPr>
-              <w:t>Daily Scrum</w:t>
-            </w:r>
+            <w:proofErr w:type="spellStart"/>
+            <w:r>
+              <w:rPr>
+                <w:rFonts w:ascii="Arial" w:hAnsi="Arial" w:cs="Arial"/>
+              </w:rPr>
+              <w:t>Daily</w:t>
+            </w:r>
+            <w:proofErr w:type="spellEnd"/>
+            <w:r>
+              <w:rPr>
+                <w:rFonts w:ascii="Arial" w:hAnsi="Arial" w:cs="Arial"/>
+              </w:rPr>
+              <w:t xml:space="preserve"> </w:t>
+            </w:r>
+            <w:proofErr w:type="spellStart"/>
+            <w:r>
+              <w:rPr>
+                <w:rFonts w:ascii="Arial" w:hAnsi="Arial" w:cs="Arial"/>
+              </w:rPr>
+              <w:t>Scrum</w:t>
+            </w:r>
+            <w:proofErr w:type="spellEnd"/>
           </w:p>
         </w:tc>
       </w:tr>
@@ -8101,7 +8509,35 @@
               <w:rPr>
                 <w:rFonts w:ascii="Arial" w:hAnsi="Arial" w:cs="Arial"/>
               </w:rPr>
-              <w:t>Introduzione ambiente unity e inizio imostazione layout statistiche</w:t>
+              <w:t xml:space="preserve">Introduzione ambiente </w:t>
+            </w:r>
+            <w:proofErr w:type="spellStart"/>
+            <w:r>
+              <w:rPr>
+                <w:rFonts w:ascii="Arial" w:hAnsi="Arial" w:cs="Arial"/>
+              </w:rPr>
+              <w:t>unity</w:t>
+            </w:r>
+            <w:proofErr w:type="spellEnd"/>
+            <w:r>
+              <w:rPr>
+                <w:rFonts w:ascii="Arial" w:hAnsi="Arial" w:cs="Arial"/>
+              </w:rPr>
+              <w:t xml:space="preserve"> e inizio </w:t>
+            </w:r>
+            <w:proofErr w:type="spellStart"/>
+            <w:r>
+              <w:rPr>
+                <w:rFonts w:ascii="Arial" w:hAnsi="Arial" w:cs="Arial"/>
+              </w:rPr>
+              <w:t>imostazione</w:t>
+            </w:r>
+            <w:proofErr w:type="spellEnd"/>
+            <w:r>
+              <w:rPr>
+                <w:rFonts w:ascii="Arial" w:hAnsi="Arial" w:cs="Arial"/>
+              </w:rPr>
+              <w:t xml:space="preserve"> layout statistiche</w:t>
             </w:r>
           </w:p>
         </w:tc>
@@ -8281,8 +8717,16 @@
               <w:rPr>
                 <w:rFonts w:ascii="Arial" w:hAnsi="Arial" w:cs="Arial"/>
               </w:rPr>
-              <w:t>Sprint Retrospective</w:t>
-            </w:r>
+              <w:t xml:space="preserve">Sprint </w:t>
+            </w:r>
+            <w:proofErr w:type="spellStart"/>
+            <w:r>
+              <w:rPr>
+                <w:rFonts w:ascii="Arial" w:hAnsi="Arial" w:cs="Arial"/>
+              </w:rPr>
+              <w:t>Retrospective</w:t>
+            </w:r>
+            <w:proofErr w:type="spellEnd"/>
           </w:p>
         </w:tc>
       </w:tr>
@@ -9243,8 +9687,44 @@
               <w:rPr>
                 <w:rFonts w:ascii="Arial" w:hAnsi="Arial" w:cs="Arial"/>
               </w:rPr>
-              <w:t>Ricerca e sviluppo per salvataggio statistiche su json, non ancora completo, questo verrà utilizzato come test per verificare il funzionamento delle varie schermate ui poi verrà adattato per il db</w:t>
-            </w:r>
+              <w:t xml:space="preserve">Ricerca e sviluppo per salvataggio statistiche su </w:t>
+            </w:r>
+            <w:proofErr w:type="spellStart"/>
+            <w:r>
+              <w:rPr>
+                <w:rFonts w:ascii="Arial" w:hAnsi="Arial" w:cs="Arial"/>
+              </w:rPr>
+              <w:t>json</w:t>
+            </w:r>
+            <w:proofErr w:type="spellEnd"/>
+            <w:r>
+              <w:rPr>
+                <w:rFonts w:ascii="Arial" w:hAnsi="Arial" w:cs="Arial"/>
+              </w:rPr>
+              <w:t xml:space="preserve">, non ancora completo, questo verrà utilizzato come test per verificare il funzionamento delle varie schermate </w:t>
+            </w:r>
+            <w:proofErr w:type="spellStart"/>
+            <w:r>
+              <w:rPr>
+                <w:rFonts w:ascii="Arial" w:hAnsi="Arial" w:cs="Arial"/>
+              </w:rPr>
+              <w:t>ui</w:t>
+            </w:r>
+            <w:proofErr w:type="spellEnd"/>
+            <w:r>
+              <w:rPr>
+                <w:rFonts w:ascii="Arial" w:hAnsi="Arial" w:cs="Arial"/>
+              </w:rPr>
+              <w:t xml:space="preserve"> poi verrà adattato per il </w:t>
+            </w:r>
+            <w:proofErr w:type="spellStart"/>
+            <w:r>
+              <w:rPr>
+                <w:rFonts w:ascii="Arial" w:hAnsi="Arial" w:cs="Arial"/>
+              </w:rPr>
+              <w:t>db</w:t>
+            </w:r>
+            <w:proofErr w:type="spellEnd"/>
           </w:p>
         </w:tc>
       </w:tr>
@@ -9398,7 +9878,21 @@
               <w:rPr>
                 <w:rFonts w:ascii="Arial" w:hAnsi="Arial" w:cs="Arial"/>
               </w:rPr>
-              <w:t>Non trovavo la cartella degli assets, risolto cercando su google.</w:t>
+              <w:t xml:space="preserve">Non trovavo la cartella degli assets, risolto cercando su </w:t>
+            </w:r>
+            <w:proofErr w:type="spellStart"/>
+            <w:r>
+              <w:rPr>
+                <w:rFonts w:ascii="Arial" w:hAnsi="Arial" w:cs="Arial"/>
+              </w:rPr>
+              <w:t>google</w:t>
+            </w:r>
+            <w:proofErr w:type="spellEnd"/>
+            <w:r>
+              <w:rPr>
+                <w:rFonts w:ascii="Arial" w:hAnsi="Arial" w:cs="Arial"/>
+              </w:rPr>
+              <w:t>.</w:t>
             </w:r>
           </w:p>
         </w:tc>
@@ -9456,7 +9950,21 @@
               <w:rPr>
                 <w:rFonts w:ascii="Arial" w:hAnsi="Arial" w:cs="Arial"/>
               </w:rPr>
-              <w:t>Le statistiche non sono concluse, manca una piccola parte della ui e la logica di salvataggio e caricamento</w:t>
+              <w:t xml:space="preserve">Le statistiche non sono concluse, manca una piccola parte della </w:t>
+            </w:r>
+            <w:proofErr w:type="spellStart"/>
+            <w:r>
+              <w:rPr>
+                <w:rFonts w:ascii="Arial" w:hAnsi="Arial" w:cs="Arial"/>
+              </w:rPr>
+              <w:t>ui</w:t>
+            </w:r>
+            <w:proofErr w:type="spellEnd"/>
+            <w:r>
+              <w:rPr>
+                <w:rFonts w:ascii="Arial" w:hAnsi="Arial" w:cs="Arial"/>
+              </w:rPr>
+              <w:t xml:space="preserve"> e la logica di salvataggio e caricamento</w:t>
             </w:r>
           </w:p>
         </w:tc>
@@ -9564,12 +10072,28 @@
                 <w:rFonts w:ascii="Arial" w:hAnsi="Arial" w:cs="Arial"/>
               </w:rPr>
             </w:pPr>
-            <w:r>
-              <w:rPr>
-                <w:rFonts w:ascii="Arial" w:hAnsi="Arial" w:cs="Arial"/>
-              </w:rPr>
-              <w:t>Daily Scrum</w:t>
-            </w:r>
+            <w:proofErr w:type="spellStart"/>
+            <w:r>
+              <w:rPr>
+                <w:rFonts w:ascii="Arial" w:hAnsi="Arial" w:cs="Arial"/>
+              </w:rPr>
+              <w:t>Daily</w:t>
+            </w:r>
+            <w:proofErr w:type="spellEnd"/>
+            <w:r>
+              <w:rPr>
+                <w:rFonts w:ascii="Arial" w:hAnsi="Arial" w:cs="Arial"/>
+              </w:rPr>
+              <w:t xml:space="preserve"> </w:t>
+            </w:r>
+            <w:proofErr w:type="spellStart"/>
+            <w:r>
+              <w:rPr>
+                <w:rFonts w:ascii="Arial" w:hAnsi="Arial" w:cs="Arial"/>
+              </w:rPr>
+              <w:t>Scrum</w:t>
+            </w:r>
+            <w:proofErr w:type="spellEnd"/>
           </w:p>
         </w:tc>
       </w:tr>
@@ -9617,7 +10141,35 @@
               <w:rPr>
                 <w:rFonts w:ascii="Arial" w:hAnsi="Arial" w:cs="Arial"/>
               </w:rPr>
-              <w:t>Entrambi completeremo la ui delle statistiche in modo tale che ci ambientiamo completamente per lo sviluppo 2D e gli script C# per poterci permettere di lavorare separatamente in fututro.</w:t>
+              <w:t xml:space="preserve">Entrambi completeremo la </w:t>
+            </w:r>
+            <w:proofErr w:type="spellStart"/>
+            <w:r>
+              <w:rPr>
+                <w:rFonts w:ascii="Arial" w:hAnsi="Arial" w:cs="Arial"/>
+              </w:rPr>
+              <w:t>ui</w:t>
+            </w:r>
+            <w:proofErr w:type="spellEnd"/>
+            <w:r>
+              <w:rPr>
+                <w:rFonts w:ascii="Arial" w:hAnsi="Arial" w:cs="Arial"/>
+              </w:rPr>
+              <w:t xml:space="preserve"> delle statistiche in modo tale che ci ambientiamo completamente per lo sviluppo 2D e gli script C# per poterci permettere di lavorare separatamente in </w:t>
+            </w:r>
+            <w:proofErr w:type="spellStart"/>
+            <w:r>
+              <w:rPr>
+                <w:rFonts w:ascii="Arial" w:hAnsi="Arial" w:cs="Arial"/>
+              </w:rPr>
+              <w:t>fututro</w:t>
+            </w:r>
+            <w:proofErr w:type="spellEnd"/>
+            <w:r>
+              <w:rPr>
+                <w:rFonts w:ascii="Arial" w:hAnsi="Arial" w:cs="Arial"/>
+              </w:rPr>
+              <w:t>.</w:t>
             </w:r>
           </w:p>
         </w:tc>
@@ -9797,8 +10349,16 @@
               <w:rPr>
                 <w:rFonts w:ascii="Arial" w:hAnsi="Arial" w:cs="Arial"/>
               </w:rPr>
-              <w:t>Sprint Retrospective</w:t>
-            </w:r>
+              <w:t xml:space="preserve">Sprint </w:t>
+            </w:r>
+            <w:proofErr w:type="spellStart"/>
+            <w:r>
+              <w:rPr>
+                <w:rFonts w:ascii="Arial" w:hAnsi="Arial" w:cs="Arial"/>
+              </w:rPr>
+              <w:t>Retrospective</w:t>
+            </w:r>
+            <w:proofErr w:type="spellEnd"/>
           </w:p>
         </w:tc>
       </w:tr>
@@ -10290,8 +10850,30 @@
             <w:rPr>
               <w:rFonts w:ascii="Arial" w:hAnsi="Arial" w:cs="Arial"/>
             </w:rPr>
-            <w:t>Riley: aiutami a comprendere come salvare dei dati unity su un json</w:t>
-          </w:r>
+            <w:t xml:space="preserve">Riley: aiutami a comprendere come salvare dei dati </w:t>
+          </w:r>
+          <w:proofErr w:type="spellStart"/>
+          <w:r>
+            <w:rPr>
+              <w:rFonts w:ascii="Arial" w:hAnsi="Arial" w:cs="Arial"/>
+            </w:rPr>
+            <w:t>unity</w:t>
+          </w:r>
+          <w:proofErr w:type="spellEnd"/>
+          <w:r>
+            <w:rPr>
+              <w:rFonts w:ascii="Arial" w:hAnsi="Arial" w:cs="Arial"/>
+            </w:rPr>
+            <w:t xml:space="preserve"> su un </w:t>
+          </w:r>
+          <w:proofErr w:type="spellStart"/>
+          <w:r>
+            <w:rPr>
+              <w:rFonts w:ascii="Arial" w:hAnsi="Arial" w:cs="Arial"/>
+            </w:rPr>
+            <w:t>json</w:t>
+          </w:r>
+          <w:proofErr w:type="spellEnd"/>
         </w:p>
       </w:sdtContent>
     </w:sdt>
@@ -10803,7 +11385,21 @@
               <w:rPr>
                 <w:rFonts w:ascii="Arial" w:hAnsi="Arial" w:cs="Arial"/>
               </w:rPr>
-              <w:t>Terminato ui statistiche e iniziato quella delle impostazioni</w:t>
+              <w:t xml:space="preserve">Terminato </w:t>
+            </w:r>
+            <w:proofErr w:type="spellStart"/>
+            <w:r>
+              <w:rPr>
+                <w:rFonts w:ascii="Arial" w:hAnsi="Arial" w:cs="Arial"/>
+              </w:rPr>
+              <w:t>ui</w:t>
+            </w:r>
+            <w:proofErr w:type="spellEnd"/>
+            <w:r>
+              <w:rPr>
+                <w:rFonts w:ascii="Arial" w:hAnsi="Arial" w:cs="Arial"/>
+              </w:rPr>
+              <w:t xml:space="preserve"> statistiche e iniziato quella delle impostazioni</w:t>
             </w:r>
           </w:p>
         </w:tc>
@@ -10882,13 +11478,97 @@
               <w:rPr>
                 <w:rFonts w:ascii="Arial" w:hAnsi="Arial" w:cs="Arial"/>
               </w:rPr>
-              <w:t>Problemi di merge, risolto tramite una configurazione di un tool di unity che permette di risolvere automaticamente i conflitti, è stato fatto una configurazione che fa avvia un file .cmd sotto la cartella tools questo piccolo script prende i file con conflitti rilevati da git e li traduce per unityyalmmerge facendo in modo che una volta usato il comando git pull non risultino più errori.</w:t>
-            </w:r>
-            <w:r>
-              <w:rPr>
-                <w:rFonts w:ascii="Arial" w:hAnsi="Arial" w:cs="Arial"/>
-              </w:rPr>
-              <w:t xml:space="preserve"> Chatgpt mi ha supportato nella risoluzione di questo problema</w:t>
+              <w:t xml:space="preserve">Problemi di merge, risolto tramite una configurazione di un tool di </w:t>
+            </w:r>
+            <w:proofErr w:type="spellStart"/>
+            <w:r>
+              <w:rPr>
+                <w:rFonts w:ascii="Arial" w:hAnsi="Arial" w:cs="Arial"/>
+              </w:rPr>
+              <w:t>unity</w:t>
+            </w:r>
+            <w:proofErr w:type="spellEnd"/>
+            <w:r>
+              <w:rPr>
+                <w:rFonts w:ascii="Arial" w:hAnsi="Arial" w:cs="Arial"/>
+              </w:rPr>
+              <w:t xml:space="preserve"> che permette di risolvere automaticamente i conflitti, è stato fatto una configurazione che fa avvia un file .</w:t>
+            </w:r>
+            <w:proofErr w:type="spellStart"/>
+            <w:r>
+              <w:rPr>
+                <w:rFonts w:ascii="Arial" w:hAnsi="Arial" w:cs="Arial"/>
+              </w:rPr>
+              <w:t>cmd</w:t>
+            </w:r>
+            <w:proofErr w:type="spellEnd"/>
+            <w:r>
+              <w:rPr>
+                <w:rFonts w:ascii="Arial" w:hAnsi="Arial" w:cs="Arial"/>
+              </w:rPr>
+              <w:t xml:space="preserve"> sotto la cartella tools questo piccolo script prende i file con conflitti rilevati da </w:t>
+            </w:r>
+            <w:proofErr w:type="spellStart"/>
+            <w:r>
+              <w:rPr>
+                <w:rFonts w:ascii="Arial" w:hAnsi="Arial" w:cs="Arial"/>
+              </w:rPr>
+              <w:t>git</w:t>
+            </w:r>
+            <w:proofErr w:type="spellEnd"/>
+            <w:r>
+              <w:rPr>
+                <w:rFonts w:ascii="Arial" w:hAnsi="Arial" w:cs="Arial"/>
+              </w:rPr>
+              <w:t xml:space="preserve"> e li traduce per </w:t>
+            </w:r>
+            <w:proofErr w:type="spellStart"/>
+            <w:r>
+              <w:rPr>
+                <w:rFonts w:ascii="Arial" w:hAnsi="Arial" w:cs="Arial"/>
+              </w:rPr>
+              <w:t>unityyalmmerge</w:t>
+            </w:r>
+            <w:proofErr w:type="spellEnd"/>
+            <w:r>
+              <w:rPr>
+                <w:rFonts w:ascii="Arial" w:hAnsi="Arial" w:cs="Arial"/>
+              </w:rPr>
+              <w:t xml:space="preserve"> facendo in modo che una volta usato il comando </w:t>
+            </w:r>
+            <w:proofErr w:type="spellStart"/>
+            <w:r>
+              <w:rPr>
+                <w:rFonts w:ascii="Arial" w:hAnsi="Arial" w:cs="Arial"/>
+              </w:rPr>
+              <w:t>git</w:t>
+            </w:r>
+            <w:proofErr w:type="spellEnd"/>
+            <w:r>
+              <w:rPr>
+                <w:rFonts w:ascii="Arial" w:hAnsi="Arial" w:cs="Arial"/>
+              </w:rPr>
+              <w:t xml:space="preserve"> pull non risultino più errori.</w:t>
+            </w:r>
+            <w:r>
+              <w:rPr>
+                <w:rFonts w:ascii="Arial" w:hAnsi="Arial" w:cs="Arial"/>
+              </w:rPr>
+              <w:t xml:space="preserve"> </w:t>
+            </w:r>
+            <w:proofErr w:type="spellStart"/>
+            <w:r>
+              <w:rPr>
+                <w:rFonts w:ascii="Arial" w:hAnsi="Arial" w:cs="Arial"/>
+              </w:rPr>
+              <w:t>Chatgpt</w:t>
+            </w:r>
+            <w:proofErr w:type="spellEnd"/>
+            <w:r>
+              <w:rPr>
+                <w:rFonts w:ascii="Arial" w:hAnsi="Arial" w:cs="Arial"/>
+              </w:rPr>
+              <w:t xml:space="preserve"> mi ha supportato nella risoluzione di questo problema</w:t>
             </w:r>
           </w:p>
         </w:tc>
@@ -10984,7 +11664,21 @@
               <w:rPr>
                 <w:rFonts w:ascii="Arial" w:hAnsi="Arial" w:cs="Arial"/>
               </w:rPr>
-              <w:t>La ui delle statistiche è completa ma mancano alcune parti dello script, di conseguenza abbiamo un ritardo generale.</w:t>
+              <w:t xml:space="preserve">La </w:t>
+            </w:r>
+            <w:proofErr w:type="spellStart"/>
+            <w:r>
+              <w:rPr>
+                <w:rFonts w:ascii="Arial" w:hAnsi="Arial" w:cs="Arial"/>
+              </w:rPr>
+              <w:t>ui</w:t>
+            </w:r>
+            <w:proofErr w:type="spellEnd"/>
+            <w:r>
+              <w:rPr>
+                <w:rFonts w:ascii="Arial" w:hAnsi="Arial" w:cs="Arial"/>
+              </w:rPr>
+              <w:t xml:space="preserve"> delle statistiche è completa ma mancano alcune parti dello script, di conseguenza abbiamo un ritardo generale.</w:t>
             </w:r>
           </w:p>
         </w:tc>
@@ -11042,7 +11736,21 @@
               <w:rPr>
                 <w:rFonts w:ascii="Arial" w:hAnsi="Arial" w:cs="Arial"/>
               </w:rPr>
-              <w:t>Terminare script statistiche, continuare ui impostazioni</w:t>
+              <w:t xml:space="preserve">Terminare script statistiche, continuare </w:t>
+            </w:r>
+            <w:proofErr w:type="spellStart"/>
+            <w:r>
+              <w:rPr>
+                <w:rFonts w:ascii="Arial" w:hAnsi="Arial" w:cs="Arial"/>
+              </w:rPr>
+              <w:t>ui</w:t>
+            </w:r>
+            <w:proofErr w:type="spellEnd"/>
+            <w:r>
+              <w:rPr>
+                <w:rFonts w:ascii="Arial" w:hAnsi="Arial" w:cs="Arial"/>
+              </w:rPr>
+              <w:t xml:space="preserve"> impostazioni</w:t>
             </w:r>
           </w:p>
         </w:tc>
@@ -11092,12 +11800,28 @@
                 <w:rFonts w:ascii="Arial" w:hAnsi="Arial" w:cs="Arial"/>
               </w:rPr>
             </w:pPr>
-            <w:r>
-              <w:rPr>
-                <w:rFonts w:ascii="Arial" w:hAnsi="Arial" w:cs="Arial"/>
-              </w:rPr>
-              <w:t>Daily Scrum</w:t>
-            </w:r>
+            <w:proofErr w:type="spellStart"/>
+            <w:r>
+              <w:rPr>
+                <w:rFonts w:ascii="Arial" w:hAnsi="Arial" w:cs="Arial"/>
+              </w:rPr>
+              <w:t>Daily</w:t>
+            </w:r>
+            <w:proofErr w:type="spellEnd"/>
+            <w:r>
+              <w:rPr>
+                <w:rFonts w:ascii="Arial" w:hAnsi="Arial" w:cs="Arial"/>
+              </w:rPr>
+              <w:t xml:space="preserve"> </w:t>
+            </w:r>
+            <w:proofErr w:type="spellStart"/>
+            <w:r>
+              <w:rPr>
+                <w:rFonts w:ascii="Arial" w:hAnsi="Arial" w:cs="Arial"/>
+              </w:rPr>
+              <w:t>Scrum</w:t>
+            </w:r>
+            <w:proofErr w:type="spellEnd"/>
           </w:p>
         </w:tc>
       </w:tr>
@@ -11145,7 +11869,21 @@
               <w:rPr>
                 <w:rFonts w:ascii="Arial" w:hAnsi="Arial" w:cs="Arial"/>
               </w:rPr>
-              <w:t>Riley deve risolvere un problema di merge riscontrato al tentativo di pull e poi continuare con lo script delle statistiche, invece Bryan deve fine la ui delle statistiche e preferibilmente iniziare con le impostazioni.</w:t>
+              <w:t xml:space="preserve">Riley deve risolvere un problema di merge riscontrato al tentativo di pull e poi continuare con lo script delle statistiche, invece Bryan deve fine la </w:t>
+            </w:r>
+            <w:proofErr w:type="spellStart"/>
+            <w:r>
+              <w:rPr>
+                <w:rFonts w:ascii="Arial" w:hAnsi="Arial" w:cs="Arial"/>
+              </w:rPr>
+              <w:t>ui</w:t>
+            </w:r>
+            <w:proofErr w:type="spellEnd"/>
+            <w:r>
+              <w:rPr>
+                <w:rFonts w:ascii="Arial" w:hAnsi="Arial" w:cs="Arial"/>
+              </w:rPr>
+              <w:t xml:space="preserve"> delle statistiche e preferibilmente iniziare con le impostazioni.</w:t>
             </w:r>
           </w:p>
         </w:tc>
@@ -11325,8 +12063,16 @@
               <w:rPr>
                 <w:rFonts w:ascii="Arial" w:hAnsi="Arial" w:cs="Arial"/>
               </w:rPr>
-              <w:t>Sprint Retrospective</w:t>
-            </w:r>
+              <w:t xml:space="preserve">Sprint </w:t>
+            </w:r>
+            <w:proofErr w:type="spellStart"/>
+            <w:r>
+              <w:rPr>
+                <w:rFonts w:ascii="Arial" w:hAnsi="Arial" w:cs="Arial"/>
+              </w:rPr>
+              <w:t>Retrospective</w:t>
+            </w:r>
+            <w:proofErr w:type="spellEnd"/>
           </w:p>
         </w:tc>
       </w:tr>
@@ -11830,7 +12576,21 @@
             <w:rPr>
               <w:rFonts w:ascii="Arial" w:hAnsi="Arial" w:cs="Arial"/>
             </w:rPr>
-            <w:t>Ho riscontrato un problema di merge nonostante abbiamo impostato un sistema con un tool unity, puoi dirmi cosa analizzare per risolvere?</w:t>
+            <w:t xml:space="preserve">Ho riscontrato un problema di merge nonostante abbiamo impostato un sistema con un tool </w:t>
+          </w:r>
+          <w:proofErr w:type="spellStart"/>
+          <w:r>
+            <w:rPr>
+              <w:rFonts w:ascii="Arial" w:hAnsi="Arial" w:cs="Arial"/>
+            </w:rPr>
+            <w:t>unity</w:t>
+          </w:r>
+          <w:proofErr w:type="spellEnd"/>
+          <w:r>
+            <w:rPr>
+              <w:rFonts w:ascii="Arial" w:hAnsi="Arial" w:cs="Arial"/>
+            </w:rPr>
+            <w:t>, puoi dirmi cosa analizzare per risolvere?</w:t>
           </w:r>
         </w:p>
         <w:p>
@@ -11845,7 +12605,21 @@
             <w:rPr>
               <w:rFonts w:ascii="Arial" w:hAnsi="Arial" w:cs="Arial"/>
             </w:rPr>
-            <w:t>Bryan: come si implementa un font in unity?</w:t>
+            <w:t xml:space="preserve">Bryan: come si implementa un font in </w:t>
+          </w:r>
+          <w:proofErr w:type="spellStart"/>
+          <w:r>
+            <w:rPr>
+              <w:rFonts w:ascii="Arial" w:hAnsi="Arial" w:cs="Arial"/>
+            </w:rPr>
+            <w:t>unity</w:t>
+          </w:r>
+          <w:proofErr w:type="spellEnd"/>
+          <w:r>
+            <w:rPr>
+              <w:rFonts w:ascii="Arial" w:hAnsi="Arial" w:cs="Arial"/>
+            </w:rPr>
+            <w:t>?</w:t>
           </w:r>
         </w:p>
       </w:sdtContent>
@@ -12554,7 +13328,49 @@
               <w:rPr>
                 <w:rFonts w:ascii="Arial" w:hAnsi="Arial" w:cs="Arial"/>
               </w:rPr>
-              <w:t>Rispetto alla pianificazione abbiamo un leggero ritardo avendo finito solo oggi le statistiche, ma questo risulta recuperabile essendo che lavoriamo separatamente dividendo ui e scripting, infatti bryan ha iniziato la ui delle impostazioni il giorno previsto.</w:t>
+              <w:t xml:space="preserve">Rispetto alla pianificazione abbiamo un leggero ritardo avendo finito solo oggi le statistiche, ma questo risulta recuperabile essendo che lavoriamo separatamente dividendo </w:t>
+            </w:r>
+            <w:proofErr w:type="spellStart"/>
+            <w:r>
+              <w:rPr>
+                <w:rFonts w:ascii="Arial" w:hAnsi="Arial" w:cs="Arial"/>
+              </w:rPr>
+              <w:t>ui</w:t>
+            </w:r>
+            <w:proofErr w:type="spellEnd"/>
+            <w:r>
+              <w:rPr>
+                <w:rFonts w:ascii="Arial" w:hAnsi="Arial" w:cs="Arial"/>
+              </w:rPr>
+              <w:t xml:space="preserve"> e scripting, infatti </w:t>
+            </w:r>
+            <w:proofErr w:type="spellStart"/>
+            <w:r>
+              <w:rPr>
+                <w:rFonts w:ascii="Arial" w:hAnsi="Arial" w:cs="Arial"/>
+              </w:rPr>
+              <w:t>bryan</w:t>
+            </w:r>
+            <w:proofErr w:type="spellEnd"/>
+            <w:r>
+              <w:rPr>
+                <w:rFonts w:ascii="Arial" w:hAnsi="Arial" w:cs="Arial"/>
+              </w:rPr>
+              <w:t xml:space="preserve"> ha iniziato la </w:t>
+            </w:r>
+            <w:proofErr w:type="spellStart"/>
+            <w:r>
+              <w:rPr>
+                <w:rFonts w:ascii="Arial" w:hAnsi="Arial" w:cs="Arial"/>
+              </w:rPr>
+              <w:t>ui</w:t>
+            </w:r>
+            <w:proofErr w:type="spellEnd"/>
+            <w:r>
+              <w:rPr>
+                <w:rFonts w:ascii="Arial" w:hAnsi="Arial" w:cs="Arial"/>
+              </w:rPr>
+              <w:t xml:space="preserve"> delle impostazioni il giorno previsto.</w:t>
             </w:r>
           </w:p>
         </w:tc>
@@ -12675,12 +13491,28 @@
                 <w:rFonts w:ascii="Arial" w:hAnsi="Arial" w:cs="Arial"/>
               </w:rPr>
             </w:pPr>
-            <w:r>
-              <w:rPr>
-                <w:rFonts w:ascii="Arial" w:hAnsi="Arial" w:cs="Arial"/>
-              </w:rPr>
-              <w:t>Daily Scrum</w:t>
-            </w:r>
+            <w:proofErr w:type="spellStart"/>
+            <w:r>
+              <w:rPr>
+                <w:rFonts w:ascii="Arial" w:hAnsi="Arial" w:cs="Arial"/>
+              </w:rPr>
+              <w:t>Daily</w:t>
+            </w:r>
+            <w:proofErr w:type="spellEnd"/>
+            <w:r>
+              <w:rPr>
+                <w:rFonts w:ascii="Arial" w:hAnsi="Arial" w:cs="Arial"/>
+              </w:rPr>
+              <w:t xml:space="preserve"> </w:t>
+            </w:r>
+            <w:proofErr w:type="spellStart"/>
+            <w:r>
+              <w:rPr>
+                <w:rFonts w:ascii="Arial" w:hAnsi="Arial" w:cs="Arial"/>
+              </w:rPr>
+              <w:t>Scrum</w:t>
+            </w:r>
+            <w:proofErr w:type="spellEnd"/>
           </w:p>
         </w:tc>
       </w:tr>
@@ -12742,7 +13574,21 @@
               <w:rPr>
                 <w:rFonts w:ascii="Arial" w:hAnsi="Arial" w:cs="Arial"/>
               </w:rPr>
-              <w:t>Bryan: Finire la ui del</w:t>
+              <w:t xml:space="preserve">Bryan: Finire la </w:t>
+            </w:r>
+            <w:proofErr w:type="spellStart"/>
+            <w:r>
+              <w:rPr>
+                <w:rFonts w:ascii="Arial" w:hAnsi="Arial" w:cs="Arial"/>
+              </w:rPr>
+              <w:t>ui</w:t>
+            </w:r>
+            <w:proofErr w:type="spellEnd"/>
+            <w:r>
+              <w:rPr>
+                <w:rFonts w:ascii="Arial" w:hAnsi="Arial" w:cs="Arial"/>
+              </w:rPr>
+              <w:t xml:space="preserve"> del</w:t>
             </w:r>
             <w:r>
               <w:rPr>
@@ -12928,8 +13774,16 @@
               <w:rPr>
                 <w:rFonts w:ascii="Arial" w:hAnsi="Arial" w:cs="Arial"/>
               </w:rPr>
-              <w:t>Sprint Retrospective</w:t>
-            </w:r>
+              <w:t xml:space="preserve">Sprint </w:t>
+            </w:r>
+            <w:proofErr w:type="spellStart"/>
+            <w:r>
+              <w:rPr>
+                <w:rFonts w:ascii="Arial" w:hAnsi="Arial" w:cs="Arial"/>
+              </w:rPr>
+              <w:t>Retrospective</w:t>
+            </w:r>
+            <w:proofErr w:type="spellEnd"/>
           </w:p>
         </w:tc>
       </w:tr>
@@ -13421,7 +14275,35 @@
             <w:rPr>
               <w:rFonts w:ascii="Arial" w:hAnsi="Arial" w:cs="Arial"/>
             </w:rPr>
-            <w:t>Il numero inserito nel json risulta essere un numero che va dal miliardo in su, ma l’applicativo lo riduce a milioni, per caso i valori int non supportano i miliardi?</w:t>
+            <w:t xml:space="preserve">Il numero inserito nel </w:t>
+          </w:r>
+          <w:proofErr w:type="spellStart"/>
+          <w:r>
+            <w:rPr>
+              <w:rFonts w:ascii="Arial" w:hAnsi="Arial" w:cs="Arial"/>
+            </w:rPr>
+            <w:t>json</w:t>
+          </w:r>
+          <w:proofErr w:type="spellEnd"/>
+          <w:r>
+            <w:rPr>
+              <w:rFonts w:ascii="Arial" w:hAnsi="Arial" w:cs="Arial"/>
+            </w:rPr>
+            <w:t xml:space="preserve"> risulta essere un numero che va dal miliardo in su, ma l’applicativo lo riduce a milioni, per caso i valori </w:t>
+          </w:r>
+          <w:proofErr w:type="spellStart"/>
+          <w:r>
+            <w:rPr>
+              <w:rFonts w:ascii="Arial" w:hAnsi="Arial" w:cs="Arial"/>
+            </w:rPr>
+            <w:t>int</w:t>
+          </w:r>
+          <w:proofErr w:type="spellEnd"/>
+          <w:r>
+            <w:rPr>
+              <w:rFonts w:ascii="Arial" w:hAnsi="Arial" w:cs="Arial"/>
+            </w:rPr>
+            <w:t xml:space="preserve"> non supportano i miliardi?</w:t>
           </w:r>
           <w:r>
             <w:rPr>
@@ -13510,7 +14392,21 @@
             <w:rPr>
               <w:rFonts w:ascii="Arial" w:hAnsi="Arial" w:cs="Arial"/>
             </w:rPr>
-            <w:t>Mi ha detto che int supporta i miliardi ma che ha un massimo di circa 2,2 miliardi ed il numero risultava più grande quindi ho ripiegato su un long</w:t>
+            <w:t xml:space="preserve">Mi ha detto che </w:t>
+          </w:r>
+          <w:proofErr w:type="spellStart"/>
+          <w:r>
+            <w:rPr>
+              <w:rFonts w:ascii="Arial" w:hAnsi="Arial" w:cs="Arial"/>
+            </w:rPr>
+            <w:t>int</w:t>
+          </w:r>
+          <w:proofErr w:type="spellEnd"/>
+          <w:r>
+            <w:rPr>
+              <w:rFonts w:ascii="Arial" w:hAnsi="Arial" w:cs="Arial"/>
+            </w:rPr>
+            <w:t xml:space="preserve"> supporta i miliardi ma che ha un massimo di circa 2,2 miliardi ed il numero risultava più grande quindi ho ripiegato su un long</w:t>
           </w:r>
         </w:p>
       </w:sdtContent>
@@ -14019,7 +14915,21 @@
               <w:rPr>
                 <w:rFonts w:ascii="Arial" w:hAnsi="Arial" w:cs="Arial"/>
               </w:rPr>
-              <w:t>Ho notato come certe impostazioni non sono modificabili con variabili di unity e quindi ho usato del tempo per eseguire qualche ricerca.</w:t>
+              <w:t xml:space="preserve">Ho notato come certe impostazioni non sono modificabili con variabili di </w:t>
+            </w:r>
+            <w:proofErr w:type="spellStart"/>
+            <w:r>
+              <w:rPr>
+                <w:rFonts w:ascii="Arial" w:hAnsi="Arial" w:cs="Arial"/>
+              </w:rPr>
+              <w:t>unity</w:t>
+            </w:r>
+            <w:proofErr w:type="spellEnd"/>
+            <w:r>
+              <w:rPr>
+                <w:rFonts w:ascii="Arial" w:hAnsi="Arial" w:cs="Arial"/>
+              </w:rPr>
+              <w:t xml:space="preserve"> e quindi ho usato del tempo per eseguire qualche ricerca.</w:t>
             </w:r>
           </w:p>
         </w:tc>
@@ -14223,12 +15133,28 @@
                 <w:rFonts w:ascii="Arial" w:hAnsi="Arial" w:cs="Arial"/>
               </w:rPr>
             </w:pPr>
-            <w:r>
-              <w:rPr>
-                <w:rFonts w:ascii="Arial" w:hAnsi="Arial" w:cs="Arial"/>
-              </w:rPr>
-              <w:t>Daily Scrum</w:t>
-            </w:r>
+            <w:proofErr w:type="spellStart"/>
+            <w:r>
+              <w:rPr>
+                <w:rFonts w:ascii="Arial" w:hAnsi="Arial" w:cs="Arial"/>
+              </w:rPr>
+              <w:t>Daily</w:t>
+            </w:r>
+            <w:proofErr w:type="spellEnd"/>
+            <w:r>
+              <w:rPr>
+                <w:rFonts w:ascii="Arial" w:hAnsi="Arial" w:cs="Arial"/>
+              </w:rPr>
+              <w:t xml:space="preserve"> </w:t>
+            </w:r>
+            <w:proofErr w:type="spellStart"/>
+            <w:r>
+              <w:rPr>
+                <w:rFonts w:ascii="Arial" w:hAnsi="Arial" w:cs="Arial"/>
+              </w:rPr>
+              <w:t>Scrum</w:t>
+            </w:r>
+            <w:proofErr w:type="spellEnd"/>
           </w:p>
         </w:tc>
       </w:tr>
@@ -14476,8 +15402,16 @@
               <w:rPr>
                 <w:rFonts w:ascii="Arial" w:hAnsi="Arial" w:cs="Arial"/>
               </w:rPr>
-              <w:t>Sprint Retrospective</w:t>
-            </w:r>
+              <w:t xml:space="preserve">Sprint </w:t>
+            </w:r>
+            <w:proofErr w:type="spellStart"/>
+            <w:r>
+              <w:rPr>
+                <w:rFonts w:ascii="Arial" w:hAnsi="Arial" w:cs="Arial"/>
+              </w:rPr>
+              <w:t>Retrospective</w:t>
+            </w:r>
+            <w:proofErr w:type="spellEnd"/>
           </w:p>
         </w:tc>
       </w:tr>
@@ -14963,7 +15897,21 @@
             <w:rPr>
               <w:rFonts w:ascii="Arial" w:hAnsi="Arial" w:cs="Arial"/>
             </w:rPr>
-            <w:t xml:space="preserve">Riley: sto creando il file data per le impostazioni con questi valori: “valori”. Puoi dirmi che valore effettivo usa unity? </w:t>
+            <w:t xml:space="preserve">Riley: sto creando il file data per le impostazioni con questi valori: “valori”. Puoi dirmi che valore effettivo usa </w:t>
+          </w:r>
+          <w:proofErr w:type="spellStart"/>
+          <w:r>
+            <w:rPr>
+              <w:rFonts w:ascii="Arial" w:hAnsi="Arial" w:cs="Arial"/>
+            </w:rPr>
+            <w:t>unity</w:t>
+          </w:r>
+          <w:proofErr w:type="spellEnd"/>
+          <w:r>
+            <w:rPr>
+              <w:rFonts w:ascii="Arial" w:hAnsi="Arial" w:cs="Arial"/>
+            </w:rPr>
+            <w:t xml:space="preserve">? </w:t>
           </w:r>
         </w:p>
         <w:p>
@@ -14978,8 +15926,44 @@
             <w:rPr>
               <w:rFonts w:ascii="Arial" w:hAnsi="Arial" w:cs="Arial"/>
             </w:rPr>
-            <w:t>Bryan: Come creare un menu con componenti ui che si ripetono modularmente in unity</w:t>
-          </w:r>
+            <w:t xml:space="preserve">Bryan: Come creare un menu con componenti </w:t>
+          </w:r>
+          <w:proofErr w:type="spellStart"/>
+          <w:r>
+            <w:rPr>
+              <w:rFonts w:ascii="Arial" w:hAnsi="Arial" w:cs="Arial"/>
+            </w:rPr>
+            <w:t>ui</w:t>
+          </w:r>
+          <w:proofErr w:type="spellEnd"/>
+          <w:r>
+            <w:rPr>
+              <w:rFonts w:ascii="Arial" w:hAnsi="Arial" w:cs="Arial"/>
+            </w:rPr>
+            <w:t xml:space="preserve"> che si ripetono </w:t>
+          </w:r>
+          <w:proofErr w:type="spellStart"/>
+          <w:r>
+            <w:rPr>
+              <w:rFonts w:ascii="Arial" w:hAnsi="Arial" w:cs="Arial"/>
+            </w:rPr>
+            <w:t>modularmente</w:t>
+          </w:r>
+          <w:proofErr w:type="spellEnd"/>
+          <w:r>
+            <w:rPr>
+              <w:rFonts w:ascii="Arial" w:hAnsi="Arial" w:cs="Arial"/>
+            </w:rPr>
+            <w:t xml:space="preserve"> in </w:t>
+          </w:r>
+          <w:proofErr w:type="spellStart"/>
+          <w:r>
+            <w:rPr>
+              <w:rFonts w:ascii="Arial" w:hAnsi="Arial" w:cs="Arial"/>
+            </w:rPr>
+            <w:t>unity</w:t>
+          </w:r>
+          <w:proofErr w:type="spellEnd"/>
         </w:p>
       </w:sdtContent>
     </w:sdt>
@@ -15290,8 +16274,16 @@
         <w:rPr>
           <w:rFonts w:ascii="Arial" w:hAnsi="Arial" w:cs="Arial"/>
         </w:rPr>
-        <w:t>Bryan: averi cercato un tutorial su youtube</w:t>
-      </w:r>
+        <w:t xml:space="preserve">Bryan: averi cercato un tutorial su </w:t>
+      </w:r>
+      <w:proofErr w:type="spellStart"/>
+      <w:r>
+        <w:rPr>
+          <w:rFonts w:ascii="Arial" w:hAnsi="Arial" w:cs="Arial"/>
+        </w:rPr>
+        <w:t>youtube</w:t>
+      </w:r>
+      <w:proofErr w:type="spellEnd"/>
     </w:p>
     <w:p>
       <w:pPr>
@@ -15477,8 +16469,16 @@
               <w:rPr>
                 <w:rFonts w:ascii="Arial" w:hAnsi="Arial" w:cs="Arial"/>
               </w:rPr>
-              <w:t>Continuato script impostazioni per ui</w:t>
-            </w:r>
+              <w:t xml:space="preserve">Continuato script impostazioni per </w:t>
+            </w:r>
+            <w:proofErr w:type="spellStart"/>
+            <w:r>
+              <w:rPr>
+                <w:rFonts w:ascii="Arial" w:hAnsi="Arial" w:cs="Arial"/>
+              </w:rPr>
+              <w:t>ui</w:t>
+            </w:r>
+            <w:proofErr w:type="spellEnd"/>
           </w:p>
         </w:tc>
       </w:tr>
@@ -15594,7 +16594,35 @@
               <w:rPr>
                 <w:rFonts w:ascii="Arial" w:hAnsi="Arial" w:cs="Arial"/>
               </w:rPr>
-              <w:t xml:space="preserve">Alcuni problemi con i valori inviati dal togglle per fullscreen, scoperto che avevo selezionato un valore statico e non dinamico dell’elemento </w:t>
+              <w:t xml:space="preserve">Alcuni problemi con i valori inviati dal </w:t>
+            </w:r>
+            <w:proofErr w:type="spellStart"/>
+            <w:r>
+              <w:rPr>
+                <w:rFonts w:ascii="Arial" w:hAnsi="Arial" w:cs="Arial"/>
+              </w:rPr>
+              <w:t>togglle</w:t>
+            </w:r>
+            <w:proofErr w:type="spellEnd"/>
+            <w:r>
+              <w:rPr>
+                <w:rFonts w:ascii="Arial" w:hAnsi="Arial" w:cs="Arial"/>
+              </w:rPr>
+              <w:t xml:space="preserve"> per </w:t>
+            </w:r>
+            <w:proofErr w:type="spellStart"/>
+            <w:r>
+              <w:rPr>
+                <w:rFonts w:ascii="Arial" w:hAnsi="Arial" w:cs="Arial"/>
+              </w:rPr>
+              <w:t>fullscreen</w:t>
+            </w:r>
+            <w:proofErr w:type="spellEnd"/>
+            <w:r>
+              <w:rPr>
+                <w:rFonts w:ascii="Arial" w:hAnsi="Arial" w:cs="Arial"/>
+              </w:rPr>
+              <w:t xml:space="preserve">, scoperto che avevo selezionato un valore statico e non dinamico dell’elemento </w:t>
             </w:r>
           </w:p>
         </w:tc>
@@ -15760,7 +16788,21 @@
               <w:rPr>
                 <w:rFonts w:ascii="Arial" w:hAnsi="Arial" w:cs="Arial"/>
               </w:rPr>
-              <w:t xml:space="preserve"> iniziare a creare il db effettivo</w:t>
+              <w:t xml:space="preserve"> iniziare a creare il </w:t>
+            </w:r>
+            <w:proofErr w:type="spellStart"/>
+            <w:r>
+              <w:rPr>
+                <w:rFonts w:ascii="Arial" w:hAnsi="Arial" w:cs="Arial"/>
+              </w:rPr>
+              <w:t>db</w:t>
+            </w:r>
+            <w:proofErr w:type="spellEnd"/>
+            <w:r>
+              <w:rPr>
+                <w:rFonts w:ascii="Arial" w:hAnsi="Arial" w:cs="Arial"/>
+              </w:rPr>
+              <w:t xml:space="preserve"> effettivo</w:t>
             </w:r>
             <w:r>
               <w:rPr>
@@ -15816,12 +16858,28 @@
                 <w:rFonts w:ascii="Arial" w:hAnsi="Arial" w:cs="Arial"/>
               </w:rPr>
             </w:pPr>
-            <w:r>
-              <w:rPr>
-                <w:rFonts w:ascii="Arial" w:hAnsi="Arial" w:cs="Arial"/>
-              </w:rPr>
-              <w:t>Daily Scrum</w:t>
-            </w:r>
+            <w:proofErr w:type="spellStart"/>
+            <w:r>
+              <w:rPr>
+                <w:rFonts w:ascii="Arial" w:hAnsi="Arial" w:cs="Arial"/>
+              </w:rPr>
+              <w:t>Daily</w:t>
+            </w:r>
+            <w:proofErr w:type="spellEnd"/>
+            <w:r>
+              <w:rPr>
+                <w:rFonts w:ascii="Arial" w:hAnsi="Arial" w:cs="Arial"/>
+              </w:rPr>
+              <w:t xml:space="preserve"> </w:t>
+            </w:r>
+            <w:proofErr w:type="spellStart"/>
+            <w:r>
+              <w:rPr>
+                <w:rFonts w:ascii="Arial" w:hAnsi="Arial" w:cs="Arial"/>
+              </w:rPr>
+              <w:t>Scrum</w:t>
+            </w:r>
+            <w:proofErr w:type="spellEnd"/>
           </w:p>
         </w:tc>
       </w:tr>
@@ -15875,8 +16933,16 @@
               <w:rPr>
                 <w:rFonts w:ascii="Arial" w:hAnsi="Arial" w:cs="Arial"/>
               </w:rPr>
-              <w:t xml:space="preserve"> Terminare l’applicazione delle impostazioni nella ui</w:t>
-            </w:r>
+              <w:t xml:space="preserve"> Terminare l’applicazione delle impostazioni nella </w:t>
+            </w:r>
+            <w:proofErr w:type="spellStart"/>
+            <w:r>
+              <w:rPr>
+                <w:rFonts w:ascii="Arial" w:hAnsi="Arial" w:cs="Arial"/>
+              </w:rPr>
+              <w:t>ui</w:t>
+            </w:r>
+            <w:proofErr w:type="spellEnd"/>
           </w:p>
           <w:p>
             <w:pPr>
@@ -16087,8 +17153,16 @@
               <w:rPr>
                 <w:rFonts w:ascii="Arial" w:hAnsi="Arial" w:cs="Arial"/>
               </w:rPr>
-              <w:t>Sprint Retrospective</w:t>
-            </w:r>
+              <w:t xml:space="preserve">Sprint </w:t>
+            </w:r>
+            <w:proofErr w:type="spellStart"/>
+            <w:r>
+              <w:rPr>
+                <w:rFonts w:ascii="Arial" w:hAnsi="Arial" w:cs="Arial"/>
+              </w:rPr>
+              <w:t>Retrospective</w:t>
+            </w:r>
+            <w:proofErr w:type="spellEnd"/>
           </w:p>
         </w:tc>
       </w:tr>
@@ -17389,11 +18463,33 @@
                 <w:rFonts w:ascii="Arial" w:hAnsi="Arial" w:cs="Arial"/>
               </w:rPr>
             </w:pPr>
-            <w:r>
-              <w:rPr>
-                <w:rFonts w:ascii="Arial" w:hAnsi="Arial" w:cs="Arial"/>
-              </w:rPr>
-              <w:t>Brayn continuerà con lo sviluppo della mappa mentre Riley svilupperà il db effettivo</w:t>
+            <w:proofErr w:type="spellStart"/>
+            <w:r>
+              <w:rPr>
+                <w:rFonts w:ascii="Arial" w:hAnsi="Arial" w:cs="Arial"/>
+              </w:rPr>
+              <w:t>Brayn</w:t>
+            </w:r>
+            <w:proofErr w:type="spellEnd"/>
+            <w:r>
+              <w:rPr>
+                <w:rFonts w:ascii="Arial" w:hAnsi="Arial" w:cs="Arial"/>
+              </w:rPr>
+              <w:t xml:space="preserve"> continuerà con lo sviluppo della mappa mentre Riley svilupperà il </w:t>
+            </w:r>
+            <w:proofErr w:type="spellStart"/>
+            <w:r>
+              <w:rPr>
+                <w:rFonts w:ascii="Arial" w:hAnsi="Arial" w:cs="Arial"/>
+              </w:rPr>
+              <w:t>db</w:t>
+            </w:r>
+            <w:proofErr w:type="spellEnd"/>
+            <w:r>
+              <w:rPr>
+                <w:rFonts w:ascii="Arial" w:hAnsi="Arial" w:cs="Arial"/>
+              </w:rPr>
+              <w:t xml:space="preserve"> effettivo</w:t>
             </w:r>
           </w:p>
         </w:tc>
@@ -17443,12 +18539,28 @@
                 <w:rFonts w:ascii="Arial" w:hAnsi="Arial" w:cs="Arial"/>
               </w:rPr>
             </w:pPr>
-            <w:r>
-              <w:rPr>
-                <w:rFonts w:ascii="Arial" w:hAnsi="Arial" w:cs="Arial"/>
-              </w:rPr>
-              <w:t>Daily Scrum</w:t>
-            </w:r>
+            <w:proofErr w:type="spellStart"/>
+            <w:r>
+              <w:rPr>
+                <w:rFonts w:ascii="Arial" w:hAnsi="Arial" w:cs="Arial"/>
+              </w:rPr>
+              <w:t>Daily</w:t>
+            </w:r>
+            <w:proofErr w:type="spellEnd"/>
+            <w:r>
+              <w:rPr>
+                <w:rFonts w:ascii="Arial" w:hAnsi="Arial" w:cs="Arial"/>
+              </w:rPr>
+              <w:t xml:space="preserve"> </w:t>
+            </w:r>
+            <w:proofErr w:type="spellStart"/>
+            <w:r>
+              <w:rPr>
+                <w:rFonts w:ascii="Arial" w:hAnsi="Arial" w:cs="Arial"/>
+              </w:rPr>
+              <w:t>Scrum</w:t>
+            </w:r>
+            <w:proofErr w:type="spellEnd"/>
           </w:p>
         </w:tc>
       </w:tr>
@@ -17496,8 +18608,16 @@
               <w:rPr>
                 <w:rFonts w:ascii="Arial" w:hAnsi="Arial" w:cs="Arial"/>
               </w:rPr>
-              <w:t>Riley: Terminare l’applicazione delle impostazioni nella ui</w:t>
-            </w:r>
+              <w:t xml:space="preserve">Riley: Terminare l’applicazione delle impostazioni nella </w:t>
+            </w:r>
+            <w:proofErr w:type="spellStart"/>
+            <w:r>
+              <w:rPr>
+                <w:rFonts w:ascii="Arial" w:hAnsi="Arial" w:cs="Arial"/>
+              </w:rPr>
+              <w:t>ui</w:t>
+            </w:r>
+            <w:proofErr w:type="spellEnd"/>
           </w:p>
           <w:p>
             <w:pPr>
@@ -17696,8 +18816,16 @@
               <w:rPr>
                 <w:rFonts w:ascii="Arial" w:hAnsi="Arial" w:cs="Arial"/>
               </w:rPr>
-              <w:t>Sprint Retrospective</w:t>
-            </w:r>
+              <w:t xml:space="preserve">Sprint </w:t>
+            </w:r>
+            <w:proofErr w:type="spellStart"/>
+            <w:r>
+              <w:rPr>
+                <w:rFonts w:ascii="Arial" w:hAnsi="Arial" w:cs="Arial"/>
+              </w:rPr>
+              <w:t>Retrospective</w:t>
+            </w:r>
+            <w:proofErr w:type="spellEnd"/>
           </w:p>
         </w:tc>
       </w:tr>
@@ -18194,7 +19322,21 @@
             <w:rPr>
               <w:rFonts w:ascii="Arial" w:hAnsi="Arial" w:cs="Arial"/>
             </w:rPr>
-            <w:t>Lo script SettingsUI sembra essersi isolato dal resto del codice, cosa potrebbe essere la causa?</w:t>
+            <w:t xml:space="preserve">Lo script </w:t>
+          </w:r>
+          <w:proofErr w:type="spellStart"/>
+          <w:r>
+            <w:rPr>
+              <w:rFonts w:ascii="Arial" w:hAnsi="Arial" w:cs="Arial"/>
+            </w:rPr>
+            <w:t>SettingsUI</w:t>
+          </w:r>
+          <w:proofErr w:type="spellEnd"/>
+          <w:r>
+            <w:rPr>
+              <w:rFonts w:ascii="Arial" w:hAnsi="Arial" w:cs="Arial"/>
+            </w:rPr>
+            <w:t xml:space="preserve"> sembra essersi isolato dal resto del codice, cosa potrebbe essere la causa?</w:t>
           </w:r>
         </w:p>
         <w:p>
@@ -18725,8 +19867,30 @@
               <w:rPr>
                 <w:rFonts w:ascii="Arial" w:hAnsi="Arial" w:cs="Arial"/>
               </w:rPr>
-              <w:t>Inizio sviluppo db sqlite</w:t>
-            </w:r>
+              <w:t xml:space="preserve">Inizio sviluppo </w:t>
+            </w:r>
+            <w:proofErr w:type="spellStart"/>
+            <w:r>
+              <w:rPr>
+                <w:rFonts w:ascii="Arial" w:hAnsi="Arial" w:cs="Arial"/>
+              </w:rPr>
+              <w:t>db</w:t>
+            </w:r>
+            <w:proofErr w:type="spellEnd"/>
+            <w:r>
+              <w:rPr>
+                <w:rFonts w:ascii="Arial" w:hAnsi="Arial" w:cs="Arial"/>
+              </w:rPr>
+              <w:t xml:space="preserve"> </w:t>
+            </w:r>
+            <w:proofErr w:type="spellStart"/>
+            <w:r>
+              <w:rPr>
+                <w:rFonts w:ascii="Arial" w:hAnsi="Arial" w:cs="Arial"/>
+              </w:rPr>
+              <w:t>sqlite</w:t>
+            </w:r>
+            <w:proofErr w:type="spellEnd"/>
           </w:p>
         </w:tc>
       </w:tr>
@@ -18938,8 +20102,16 @@
               <w:rPr>
                 <w:rFonts w:ascii="Arial" w:hAnsi="Arial" w:cs="Arial"/>
               </w:rPr>
-              <w:t>Siamo in largo anticipo, per questo motivo Riley ha cominciato a creare un vero db</w:t>
-            </w:r>
+              <w:t xml:space="preserve">Siamo in largo anticipo, per questo motivo Riley ha cominciato a creare un vero </w:t>
+            </w:r>
+            <w:proofErr w:type="spellStart"/>
+            <w:r>
+              <w:rPr>
+                <w:rFonts w:ascii="Arial" w:hAnsi="Arial" w:cs="Arial"/>
+              </w:rPr>
+              <w:t>db</w:t>
+            </w:r>
+            <w:proofErr w:type="spellEnd"/>
           </w:p>
         </w:tc>
       </w:tr>
@@ -18996,7 +20168,21 @@
               <w:rPr>
                 <w:rFonts w:ascii="Arial" w:hAnsi="Arial" w:cs="Arial"/>
               </w:rPr>
-              <w:t>Continuare rispettivamente lo sviluppo del db e della mappa</w:t>
+              <w:t xml:space="preserve">Continuare rispettivamente lo sviluppo del </w:t>
+            </w:r>
+            <w:proofErr w:type="spellStart"/>
+            <w:r>
+              <w:rPr>
+                <w:rFonts w:ascii="Arial" w:hAnsi="Arial" w:cs="Arial"/>
+              </w:rPr>
+              <w:t>db</w:t>
+            </w:r>
+            <w:proofErr w:type="spellEnd"/>
+            <w:r>
+              <w:rPr>
+                <w:rFonts w:ascii="Arial" w:hAnsi="Arial" w:cs="Arial"/>
+              </w:rPr>
+              <w:t xml:space="preserve"> e della mappa</w:t>
             </w:r>
           </w:p>
         </w:tc>
@@ -19046,12 +20232,28 @@
                 <w:rFonts w:ascii="Arial" w:hAnsi="Arial" w:cs="Arial"/>
               </w:rPr>
             </w:pPr>
-            <w:r>
-              <w:rPr>
-                <w:rFonts w:ascii="Arial" w:hAnsi="Arial" w:cs="Arial"/>
-              </w:rPr>
-              <w:t>Daily Scrum</w:t>
-            </w:r>
+            <w:proofErr w:type="spellStart"/>
+            <w:r>
+              <w:rPr>
+                <w:rFonts w:ascii="Arial" w:hAnsi="Arial" w:cs="Arial"/>
+              </w:rPr>
+              <w:t>Daily</w:t>
+            </w:r>
+            <w:proofErr w:type="spellEnd"/>
+            <w:r>
+              <w:rPr>
+                <w:rFonts w:ascii="Arial" w:hAnsi="Arial" w:cs="Arial"/>
+              </w:rPr>
+              <w:t xml:space="preserve"> </w:t>
+            </w:r>
+            <w:proofErr w:type="spellStart"/>
+            <w:r>
+              <w:rPr>
+                <w:rFonts w:ascii="Arial" w:hAnsi="Arial" w:cs="Arial"/>
+              </w:rPr>
+              <w:t>Scrum</w:t>
+            </w:r>
+            <w:proofErr w:type="spellEnd"/>
           </w:p>
         </w:tc>
       </w:tr>
@@ -19099,8 +20301,16 @@
               <w:rPr>
                 <w:rFonts w:ascii="Arial" w:hAnsi="Arial" w:cs="Arial"/>
               </w:rPr>
-              <w:t>Riley: Inizio sviluppo db</w:t>
-            </w:r>
+              <w:t xml:space="preserve">Riley: Inizio sviluppo </w:t>
+            </w:r>
+            <w:proofErr w:type="spellStart"/>
+            <w:r>
+              <w:rPr>
+                <w:rFonts w:ascii="Arial" w:hAnsi="Arial" w:cs="Arial"/>
+              </w:rPr>
+              <w:t>db</w:t>
+            </w:r>
+            <w:proofErr w:type="spellEnd"/>
           </w:p>
           <w:p>
             <w:pPr>
@@ -19293,8 +20503,16 @@
               <w:rPr>
                 <w:rFonts w:ascii="Arial" w:hAnsi="Arial" w:cs="Arial"/>
               </w:rPr>
-              <w:t>Sprint Retrospective</w:t>
-            </w:r>
+              <w:t xml:space="preserve">Sprint </w:t>
+            </w:r>
+            <w:proofErr w:type="spellStart"/>
+            <w:r>
+              <w:rPr>
+                <w:rFonts w:ascii="Arial" w:hAnsi="Arial" w:cs="Arial"/>
+              </w:rPr>
+              <w:t>Retrospective</w:t>
+            </w:r>
+            <w:proofErr w:type="spellEnd"/>
           </w:p>
         </w:tc>
       </w:tr>
@@ -19522,7 +20740,25 @@
               <w:b/>
               <w:bCs/>
             </w:rPr>
-            <w:t>Nomi AI utilizzati</w:t>
+            <w:t xml:space="preserve">Nomi </w:t>
+          </w:r>
+          <w:proofErr w:type="gramStart"/>
+          <w:r>
+            <w:rPr>
+              <w:rStyle w:val="Testosegnaposto"/>
+              <w:b/>
+              <w:bCs/>
+            </w:rPr>
+            <w:t>AI</w:t>
+          </w:r>
+          <w:proofErr w:type="gramEnd"/>
+          <w:r>
+            <w:rPr>
+              <w:rStyle w:val="Testosegnaposto"/>
+              <w:b/>
+              <w:bCs/>
+            </w:rPr>
+            <w:t xml:space="preserve"> utilizzati</w:t>
           </w:r>
         </w:sdtContent>
       </w:sdt>
@@ -20520,7 +21756,21 @@
               <w:rPr>
                 <w:rFonts w:ascii="Arial" w:hAnsi="Arial" w:cs="Arial"/>
               </w:rPr>
-              <w:t>Rispetto al pianificato abbiamo qualche giornata, di lavoro, di anticipo infatti stiamo principalmente aggiungendo dettagli lavorando con un ritmo adeguato e sviluppando già un db più reale</w:t>
+              <w:t xml:space="preserve">Rispetto al pianificato abbiamo qualche giornata, di lavoro, di anticipo infatti stiamo principalmente aggiungendo dettagli lavorando con un ritmo adeguato e sviluppando già un </w:t>
+            </w:r>
+            <w:proofErr w:type="spellStart"/>
+            <w:r>
+              <w:rPr>
+                <w:rFonts w:ascii="Arial" w:hAnsi="Arial" w:cs="Arial"/>
+              </w:rPr>
+              <w:t>db</w:t>
+            </w:r>
+            <w:proofErr w:type="spellEnd"/>
+            <w:r>
+              <w:rPr>
+                <w:rFonts w:ascii="Arial" w:hAnsi="Arial" w:cs="Arial"/>
+              </w:rPr>
+              <w:t xml:space="preserve"> più reale</w:t>
             </w:r>
           </w:p>
         </w:tc>
@@ -20578,8 +21828,16 @@
               <w:rPr>
                 <w:rFonts w:ascii="Arial" w:hAnsi="Arial" w:cs="Arial"/>
               </w:rPr>
-              <w:t>Procedere con i vari l’aggiunta di dettagli e del db</w:t>
-            </w:r>
+              <w:t xml:space="preserve">Procedere con i vari l’aggiunta di dettagli e del </w:t>
+            </w:r>
+            <w:proofErr w:type="spellStart"/>
+            <w:r>
+              <w:rPr>
+                <w:rFonts w:ascii="Arial" w:hAnsi="Arial" w:cs="Arial"/>
+              </w:rPr>
+              <w:t>db</w:t>
+            </w:r>
+            <w:proofErr w:type="spellEnd"/>
           </w:p>
         </w:tc>
       </w:tr>
@@ -20628,12 +21886,28 @@
                 <w:rFonts w:ascii="Arial" w:hAnsi="Arial" w:cs="Arial"/>
               </w:rPr>
             </w:pPr>
-            <w:r>
-              <w:rPr>
-                <w:rFonts w:ascii="Arial" w:hAnsi="Arial" w:cs="Arial"/>
-              </w:rPr>
-              <w:t>Daily Scrum</w:t>
-            </w:r>
+            <w:proofErr w:type="spellStart"/>
+            <w:r>
+              <w:rPr>
+                <w:rFonts w:ascii="Arial" w:hAnsi="Arial" w:cs="Arial"/>
+              </w:rPr>
+              <w:t>Daily</w:t>
+            </w:r>
+            <w:proofErr w:type="spellEnd"/>
+            <w:r>
+              <w:rPr>
+                <w:rFonts w:ascii="Arial" w:hAnsi="Arial" w:cs="Arial"/>
+              </w:rPr>
+              <w:t xml:space="preserve"> </w:t>
+            </w:r>
+            <w:proofErr w:type="spellStart"/>
+            <w:r>
+              <w:rPr>
+                <w:rFonts w:ascii="Arial" w:hAnsi="Arial" w:cs="Arial"/>
+              </w:rPr>
+              <w:t>Scrum</w:t>
+            </w:r>
+            <w:proofErr w:type="spellEnd"/>
           </w:p>
         </w:tc>
       </w:tr>
@@ -20693,8 +21967,16 @@
               <w:rPr>
                 <w:rFonts w:ascii="Arial" w:hAnsi="Arial" w:cs="Arial"/>
               </w:rPr>
-              <w:t>ontinuo sviluppo db</w:t>
-            </w:r>
+              <w:t xml:space="preserve">ontinuo sviluppo </w:t>
+            </w:r>
+            <w:proofErr w:type="spellStart"/>
+            <w:r>
+              <w:rPr>
+                <w:rFonts w:ascii="Arial" w:hAnsi="Arial" w:cs="Arial"/>
+              </w:rPr>
+              <w:t>db</w:t>
+            </w:r>
+            <w:proofErr w:type="spellEnd"/>
           </w:p>
           <w:p>
             <w:pPr>
@@ -20887,8 +22169,16 @@
               <w:rPr>
                 <w:rFonts w:ascii="Arial" w:hAnsi="Arial" w:cs="Arial"/>
               </w:rPr>
-              <w:t>Sprint Retrospective</w:t>
-            </w:r>
+              <w:t xml:space="preserve">Sprint </w:t>
+            </w:r>
+            <w:proofErr w:type="spellStart"/>
+            <w:r>
+              <w:rPr>
+                <w:rFonts w:ascii="Arial" w:hAnsi="Arial" w:cs="Arial"/>
+              </w:rPr>
+              <w:t>Retrospective</w:t>
+            </w:r>
+            <w:proofErr w:type="spellEnd"/>
           </w:p>
         </w:tc>
       </w:tr>
@@ -21391,7 +22681,35 @@
             <w:rPr>
               <w:rFonts w:ascii="Arial" w:hAnsi="Arial" w:cs="Arial"/>
             </w:rPr>
-            <w:t>non ho fatto dei veri e propri promt oggi, ma mi sono cimentato nel procedere con una spiegazione guidata per applicare SQLite alla base di dati sviluppata finora.</w:t>
+            <w:t xml:space="preserve">non ho fatto dei veri e propri </w:t>
+          </w:r>
+          <w:proofErr w:type="spellStart"/>
+          <w:r>
+            <w:rPr>
+              <w:rFonts w:ascii="Arial" w:hAnsi="Arial" w:cs="Arial"/>
+            </w:rPr>
+            <w:t>promt</w:t>
+          </w:r>
+          <w:proofErr w:type="spellEnd"/>
+          <w:r>
+            <w:rPr>
+              <w:rFonts w:ascii="Arial" w:hAnsi="Arial" w:cs="Arial"/>
+            </w:rPr>
+            <w:t xml:space="preserve"> oggi, ma mi sono cimentato nel procedere con una spiegazione guidata per applicare </w:t>
+          </w:r>
+          <w:proofErr w:type="spellStart"/>
+          <w:r>
+            <w:rPr>
+              <w:rFonts w:ascii="Arial" w:hAnsi="Arial" w:cs="Arial"/>
+            </w:rPr>
+            <w:t>SQLite</w:t>
+          </w:r>
+          <w:proofErr w:type="spellEnd"/>
+          <w:r>
+            <w:rPr>
+              <w:rFonts w:ascii="Arial" w:hAnsi="Arial" w:cs="Arial"/>
+            </w:rPr>
+            <w:t xml:space="preserve"> alla base di dati sviluppata finora.</w:t>
           </w:r>
         </w:p>
         <w:p>
@@ -21984,7 +23302,21 @@
               <w:rPr>
                 <w:rFonts w:ascii="Arial" w:hAnsi="Arial" w:cs="Arial"/>
               </w:rPr>
-              <w:t>Ho sistemato un problema di animazione, creato il build del progetto per certi test, ricerca modifica materiali auto ed inizio menu garage</w:t>
+              <w:t xml:space="preserve">Ho sistemato un problema di animazione, creato </w:t>
+            </w:r>
+            <w:proofErr w:type="gramStart"/>
+            <w:r>
+              <w:rPr>
+                <w:rFonts w:ascii="Arial" w:hAnsi="Arial" w:cs="Arial"/>
+              </w:rPr>
+              <w:t>il build</w:t>
+            </w:r>
+            <w:proofErr w:type="gramEnd"/>
+            <w:r>
+              <w:rPr>
+                <w:rFonts w:ascii="Arial" w:hAnsi="Arial" w:cs="Arial"/>
+              </w:rPr>
+              <w:t xml:space="preserve"> del progetto per certi test, ricerca modifica materiali auto ed inizio menu garage</w:t>
             </w:r>
           </w:p>
         </w:tc>
@@ -22217,7 +23549,21 @@
               <w:rPr>
                 <w:rFonts w:ascii="Arial" w:hAnsi="Arial" w:cs="Arial"/>
               </w:rPr>
-              <w:t>Continuare sviluppo garage e db.</w:t>
+              <w:t xml:space="preserve">Continuare sviluppo garage e </w:t>
+            </w:r>
+            <w:proofErr w:type="spellStart"/>
+            <w:r>
+              <w:rPr>
+                <w:rFonts w:ascii="Arial" w:hAnsi="Arial" w:cs="Arial"/>
+              </w:rPr>
+              <w:t>db</w:t>
+            </w:r>
+            <w:proofErr w:type="spellEnd"/>
+            <w:r>
+              <w:rPr>
+                <w:rFonts w:ascii="Arial" w:hAnsi="Arial" w:cs="Arial"/>
+              </w:rPr>
+              <w:t>.</w:t>
             </w:r>
           </w:p>
         </w:tc>
@@ -22267,12 +23613,28 @@
                 <w:rFonts w:ascii="Arial" w:hAnsi="Arial" w:cs="Arial"/>
               </w:rPr>
             </w:pPr>
-            <w:r>
-              <w:rPr>
-                <w:rFonts w:ascii="Arial" w:hAnsi="Arial" w:cs="Arial"/>
-              </w:rPr>
-              <w:t>Daily Scrum</w:t>
-            </w:r>
+            <w:proofErr w:type="spellStart"/>
+            <w:r>
+              <w:rPr>
+                <w:rFonts w:ascii="Arial" w:hAnsi="Arial" w:cs="Arial"/>
+              </w:rPr>
+              <w:t>Daily</w:t>
+            </w:r>
+            <w:proofErr w:type="spellEnd"/>
+            <w:r>
+              <w:rPr>
+                <w:rFonts w:ascii="Arial" w:hAnsi="Arial" w:cs="Arial"/>
+              </w:rPr>
+              <w:t xml:space="preserve"> </w:t>
+            </w:r>
+            <w:proofErr w:type="spellStart"/>
+            <w:r>
+              <w:rPr>
+                <w:rFonts w:ascii="Arial" w:hAnsi="Arial" w:cs="Arial"/>
+              </w:rPr>
+              <w:t>Scrum</w:t>
+            </w:r>
+            <w:proofErr w:type="spellEnd"/>
           </w:p>
         </w:tc>
       </w:tr>
@@ -22320,8 +23682,16 @@
               <w:rPr>
                 <w:rFonts w:ascii="Arial" w:hAnsi="Arial" w:cs="Arial"/>
               </w:rPr>
-              <w:t>Riley: Continuo sviluppo db</w:t>
-            </w:r>
+              <w:t xml:space="preserve">Riley: Continuo sviluppo </w:t>
+            </w:r>
+            <w:proofErr w:type="spellStart"/>
+            <w:r>
+              <w:rPr>
+                <w:rFonts w:ascii="Arial" w:hAnsi="Arial" w:cs="Arial"/>
+              </w:rPr>
+              <w:t>db</w:t>
+            </w:r>
+            <w:proofErr w:type="spellEnd"/>
           </w:p>
           <w:p>
             <w:pPr>
@@ -22514,8 +23884,16 @@
               <w:rPr>
                 <w:rFonts w:ascii="Arial" w:hAnsi="Arial" w:cs="Arial"/>
               </w:rPr>
-              <w:t>Sprint Retrospective</w:t>
-            </w:r>
+              <w:t xml:space="preserve">Sprint </w:t>
+            </w:r>
+            <w:proofErr w:type="spellStart"/>
+            <w:r>
+              <w:rPr>
+                <w:rFonts w:ascii="Arial" w:hAnsi="Arial" w:cs="Arial"/>
+              </w:rPr>
+              <w:t>Retrospective</w:t>
+            </w:r>
+            <w:proofErr w:type="spellEnd"/>
           </w:p>
         </w:tc>
       </w:tr>
@@ -22743,7 +24121,25 @@
               <w:b/>
               <w:bCs/>
             </w:rPr>
-            <w:t>Nomi AI utilizzati</w:t>
+            <w:t xml:space="preserve">Nomi </w:t>
+          </w:r>
+          <w:proofErr w:type="gramStart"/>
+          <w:r>
+            <w:rPr>
+              <w:rStyle w:val="Testosegnaposto"/>
+              <w:b/>
+              <w:bCs/>
+            </w:rPr>
+            <w:t>AI</w:t>
+          </w:r>
+          <w:proofErr w:type="gramEnd"/>
+          <w:r>
+            <w:rPr>
+              <w:rStyle w:val="Testosegnaposto"/>
+              <w:b/>
+              <w:bCs/>
+            </w:rPr>
+            <w:t xml:space="preserve"> utilizzati</w:t>
           </w:r>
         </w:sdtContent>
       </w:sdt>
@@ -23444,13 +24840,7 @@
               <w:rPr>
                 <w:rFonts w:ascii="Arial" w:hAnsi="Arial" w:cs="Arial"/>
               </w:rPr>
-              <w:t>7</w:t>
-            </w:r>
-            <w:r>
-              <w:rPr>
-                <w:rFonts w:ascii="Arial" w:hAnsi="Arial" w:cs="Arial"/>
-              </w:rPr>
-              <w:t>.10.2026</w:t>
+              <w:t>7.10.2026</w:t>
             </w:r>
           </w:p>
         </w:tc>
@@ -23528,8 +24918,16 @@
               <w:rPr>
                 <w:rFonts w:ascii="Arial" w:hAnsi="Arial" w:cs="Arial"/>
               </w:rPr>
-              <w:t>Continuato lo sviluppo del db</w:t>
-            </w:r>
+              <w:t xml:space="preserve">Continuato lo sviluppo del </w:t>
+            </w:r>
+            <w:proofErr w:type="spellStart"/>
+            <w:r>
+              <w:rPr>
+                <w:rFonts w:ascii="Arial" w:hAnsi="Arial" w:cs="Arial"/>
+              </w:rPr>
+              <w:t>db</w:t>
+            </w:r>
+            <w:proofErr w:type="spellEnd"/>
           </w:p>
         </w:tc>
       </w:tr>
@@ -23799,7 +25197,35 @@
               <w:rPr>
                 <w:rFonts w:ascii="Arial" w:hAnsi="Arial" w:cs="Arial"/>
               </w:rPr>
-              <w:t>Continuare ognuno con i sviluppi di db e garage</w:t>
+              <w:t xml:space="preserve">Continuare ognuno con </w:t>
+            </w:r>
+            <w:proofErr w:type="gramStart"/>
+            <w:r>
+              <w:rPr>
+                <w:rFonts w:ascii="Arial" w:hAnsi="Arial" w:cs="Arial"/>
+              </w:rPr>
+              <w:t>i</w:t>
+            </w:r>
+            <w:proofErr w:type="gramEnd"/>
+            <w:r>
+              <w:rPr>
+                <w:rFonts w:ascii="Arial" w:hAnsi="Arial" w:cs="Arial"/>
+              </w:rPr>
+              <w:t xml:space="preserve"> sviluppi di </w:t>
+            </w:r>
+            <w:proofErr w:type="spellStart"/>
+            <w:r>
+              <w:rPr>
+                <w:rFonts w:ascii="Arial" w:hAnsi="Arial" w:cs="Arial"/>
+              </w:rPr>
+              <w:t>db</w:t>
+            </w:r>
+            <w:proofErr w:type="spellEnd"/>
+            <w:r>
+              <w:rPr>
+                <w:rFonts w:ascii="Arial" w:hAnsi="Arial" w:cs="Arial"/>
+              </w:rPr>
+              <w:t xml:space="preserve"> e garage</w:t>
             </w:r>
           </w:p>
         </w:tc>
@@ -23849,12 +25275,28 @@
                 <w:rFonts w:ascii="Arial" w:hAnsi="Arial" w:cs="Arial"/>
               </w:rPr>
             </w:pPr>
-            <w:r>
-              <w:rPr>
-                <w:rFonts w:ascii="Arial" w:hAnsi="Arial" w:cs="Arial"/>
-              </w:rPr>
-              <w:t>Daily Scrum</w:t>
-            </w:r>
+            <w:proofErr w:type="spellStart"/>
+            <w:r>
+              <w:rPr>
+                <w:rFonts w:ascii="Arial" w:hAnsi="Arial" w:cs="Arial"/>
+              </w:rPr>
+              <w:t>Daily</w:t>
+            </w:r>
+            <w:proofErr w:type="spellEnd"/>
+            <w:r>
+              <w:rPr>
+                <w:rFonts w:ascii="Arial" w:hAnsi="Arial" w:cs="Arial"/>
+              </w:rPr>
+              <w:t xml:space="preserve"> </w:t>
+            </w:r>
+            <w:proofErr w:type="spellStart"/>
+            <w:r>
+              <w:rPr>
+                <w:rFonts w:ascii="Arial" w:hAnsi="Arial" w:cs="Arial"/>
+              </w:rPr>
+              <w:t>Scrum</w:t>
+            </w:r>
+            <w:proofErr w:type="spellEnd"/>
           </w:p>
         </w:tc>
       </w:tr>
@@ -23902,8 +25344,16 @@
               <w:rPr>
                 <w:rFonts w:ascii="Arial" w:hAnsi="Arial" w:cs="Arial"/>
               </w:rPr>
-              <w:t>Riley: Continuo sviluppo db</w:t>
-            </w:r>
+              <w:t xml:space="preserve">Riley: Continuo sviluppo </w:t>
+            </w:r>
+            <w:proofErr w:type="spellStart"/>
+            <w:r>
+              <w:rPr>
+                <w:rFonts w:ascii="Arial" w:hAnsi="Arial" w:cs="Arial"/>
+              </w:rPr>
+              <w:t>db</w:t>
+            </w:r>
+            <w:proofErr w:type="spellEnd"/>
           </w:p>
           <w:p>
             <w:pPr>
@@ -23916,13 +25366,7 @@
               <w:rPr>
                 <w:rFonts w:ascii="Arial" w:hAnsi="Arial" w:cs="Arial"/>
               </w:rPr>
-              <w:t xml:space="preserve">Bryan: </w:t>
-            </w:r>
-            <w:r>
-              <w:rPr>
-                <w:rFonts w:ascii="Arial" w:hAnsi="Arial" w:cs="Arial"/>
-              </w:rPr>
-              <w:t>Continuo sviluppo garage</w:t>
+              <w:t>Bryan: Continuo sviluppo garage</w:t>
             </w:r>
           </w:p>
         </w:tc>
@@ -24102,8 +25546,16 @@
               <w:rPr>
                 <w:rFonts w:ascii="Arial" w:hAnsi="Arial" w:cs="Arial"/>
               </w:rPr>
-              <w:t>Sprint Retrospective</w:t>
-            </w:r>
+              <w:t xml:space="preserve">Sprint </w:t>
+            </w:r>
+            <w:proofErr w:type="spellStart"/>
+            <w:r>
+              <w:rPr>
+                <w:rFonts w:ascii="Arial" w:hAnsi="Arial" w:cs="Arial"/>
+              </w:rPr>
+              <w:t>Retrospective</w:t>
+            </w:r>
+            <w:proofErr w:type="spellEnd"/>
           </w:p>
         </w:tc>
       </w:tr>
@@ -24600,7 +26052,21 @@
             <w:rPr>
               <w:rFonts w:ascii="Arial" w:hAnsi="Arial" w:cs="Arial"/>
             </w:rPr>
-            <w:t>Dovrei introdurre nel db i comandi collegati alle impostazioni, ma la struttura usata è diversa da quelle precedenti, e viene usata una classe esterna.</w:t>
+            <w:t xml:space="preserve">Dovrei introdurre nel </w:t>
+          </w:r>
+          <w:proofErr w:type="spellStart"/>
+          <w:r>
+            <w:rPr>
+              <w:rFonts w:ascii="Arial" w:hAnsi="Arial" w:cs="Arial"/>
+            </w:rPr>
+            <w:t>db</w:t>
+          </w:r>
+          <w:proofErr w:type="spellEnd"/>
+          <w:r>
+            <w:rPr>
+              <w:rFonts w:ascii="Arial" w:hAnsi="Arial" w:cs="Arial"/>
+            </w:rPr>
+            <w:t xml:space="preserve"> i comandi collegati alle impostazioni, ma la struttura usata è diversa da quelle precedenti, e viene usata una classe esterna.</w:t>
           </w:r>
         </w:p>
         <w:p>
@@ -24926,6 +26392,1667 @@
           <w:rFonts w:ascii="Arial" w:hAnsi="Arial" w:cs="Arial"/>
         </w:rPr>
         <w:t>Avrei probabilmente cercato di comprendere il codice e chiesto a Bryan il funzionamento per potermi adattare</w:t>
+      </w:r>
+    </w:p>
+    <w:p>
+      <w:pPr>
+        <w:pStyle w:val="Nessunaspaziatura"/>
+        <w:rPr>
+          <w:rFonts w:ascii="Arial" w:hAnsi="Arial" w:cs="Arial"/>
+        </w:rPr>
+      </w:pPr>
+      <w:r>
+        <w:rPr>
+          <w:rFonts w:ascii="Arial" w:hAnsi="Arial" w:cs="Arial"/>
+        </w:rPr>
+        <w:t>Bryan:</w:t>
+      </w:r>
+    </w:p>
+    <w:p>
+      <w:pPr>
+        <w:rPr>
+          <w:rFonts w:ascii="Arial" w:hAnsi="Arial" w:cs="Arial"/>
+        </w:rPr>
+      </w:pPr>
+      <w:r>
+        <w:rPr>
+          <w:rFonts w:ascii="Arial" w:hAnsi="Arial" w:cs="Arial"/>
+        </w:rPr>
+        <w:br w:type="page"/>
+      </w:r>
+    </w:p>
+    <w:tbl>
+      <w:tblPr>
+        <w:tblStyle w:val="Grigliatabella"/>
+        <w:tblW w:w="5000" w:type="pct"/>
+        <w:tblLook w:val="04A0" w:firstRow="1" w:lastRow="0" w:firstColumn="1" w:lastColumn="0" w:noHBand="0" w:noVBand="1"/>
+      </w:tblPr>
+      <w:tblGrid>
+        <w:gridCol w:w="2407"/>
+        <w:gridCol w:w="7221"/>
+      </w:tblGrid>
+      <w:tr>
+        <w:trPr>
+          <w:trHeight w:val="199"/>
+        </w:trPr>
+        <w:tc>
+          <w:tcPr>
+            <w:tcW w:w="1250" w:type="pct"/>
+            <w:vAlign w:val="center"/>
+          </w:tcPr>
+          <w:p>
+            <w:pPr>
+              <w:rPr>
+                <w:rFonts w:ascii="Arial" w:hAnsi="Arial" w:cs="Arial"/>
+              </w:rPr>
+            </w:pPr>
+            <w:r>
+              <w:rPr>
+                <w:rFonts w:ascii="Arial" w:hAnsi="Arial" w:cs="Arial"/>
+              </w:rPr>
+              <w:lastRenderedPageBreak/>
+              <w:t>Luogo</w:t>
+            </w:r>
+          </w:p>
+        </w:tc>
+        <w:tc>
+          <w:tcPr>
+            <w:tcW w:w="3750" w:type="pct"/>
+            <w:vAlign w:val="center"/>
+          </w:tcPr>
+          <w:p>
+            <w:pPr>
+              <w:rPr>
+                <w:rFonts w:ascii="Arial" w:hAnsi="Arial" w:cs="Arial"/>
+              </w:rPr>
+            </w:pPr>
+            <w:r>
+              <w:rPr>
+                <w:rFonts w:ascii="Arial" w:hAnsi="Arial" w:cs="Arial"/>
+              </w:rPr>
+              <w:t>Scuola Arti e Mestieri Trevano</w:t>
+            </w:r>
+          </w:p>
+        </w:tc>
+      </w:tr>
+      <w:tr>
+        <w:trPr>
+          <w:trHeight w:val="196"/>
+        </w:trPr>
+        <w:tc>
+          <w:tcPr>
+            <w:tcW w:w="1250" w:type="pct"/>
+            <w:vAlign w:val="center"/>
+          </w:tcPr>
+          <w:p>
+            <w:pPr>
+              <w:rPr>
+                <w:rFonts w:ascii="Arial" w:hAnsi="Arial" w:cs="Arial"/>
+              </w:rPr>
+            </w:pPr>
+            <w:r>
+              <w:rPr>
+                <w:rFonts w:ascii="Arial" w:hAnsi="Arial" w:cs="Arial"/>
+              </w:rPr>
+              <w:t>Data</w:t>
+            </w:r>
+          </w:p>
+        </w:tc>
+        <w:tc>
+          <w:tcPr>
+            <w:tcW w:w="3750" w:type="pct"/>
+            <w:vAlign w:val="center"/>
+          </w:tcPr>
+          <w:p>
+            <w:pPr>
+              <w:rPr>
+                <w:rFonts w:ascii="Arial" w:hAnsi="Arial" w:cs="Arial"/>
+              </w:rPr>
+            </w:pPr>
+            <w:r>
+              <w:rPr>
+                <w:rFonts w:ascii="Arial" w:hAnsi="Arial" w:cs="Arial"/>
+              </w:rPr>
+              <w:t>9</w:t>
+            </w:r>
+            <w:r>
+              <w:rPr>
+                <w:rFonts w:ascii="Arial" w:hAnsi="Arial" w:cs="Arial"/>
+              </w:rPr>
+              <w:t>.10.2026</w:t>
+            </w:r>
+          </w:p>
+        </w:tc>
+      </w:tr>
+    </w:tbl>
+    <w:p>
+      <w:pPr>
+        <w:rPr>
+          <w:rFonts w:ascii="Arial" w:hAnsi="Arial" w:cs="Arial"/>
+        </w:rPr>
+      </w:pPr>
+    </w:p>
+    <w:tbl>
+      <w:tblPr>
+        <w:tblStyle w:val="Grigliatabella"/>
+        <w:tblW w:w="0" w:type="auto"/>
+        <w:tblLook w:val="04A0" w:firstRow="1" w:lastRow="0" w:firstColumn="1" w:lastColumn="0" w:noHBand="0" w:noVBand="1"/>
+      </w:tblPr>
+      <w:tblGrid>
+        <w:gridCol w:w="1271"/>
+        <w:gridCol w:w="8357"/>
+      </w:tblGrid>
+      <w:tr>
+        <w:tc>
+          <w:tcPr>
+            <w:tcW w:w="9628" w:type="dxa"/>
+            <w:gridSpan w:val="2"/>
+            <w:shd w:val="clear" w:color="auto" w:fill="D9D9D9" w:themeFill="background1" w:themeFillShade="D9"/>
+          </w:tcPr>
+          <w:p>
+            <w:pPr>
+              <w:rPr>
+                <w:rFonts w:ascii="Arial" w:hAnsi="Arial" w:cs="Arial"/>
+              </w:rPr>
+            </w:pPr>
+            <w:r>
+              <w:rPr>
+                <w:rFonts w:ascii="Arial" w:hAnsi="Arial" w:cs="Arial"/>
+              </w:rPr>
+              <w:t>Lavori svolti</w:t>
+            </w:r>
+          </w:p>
+        </w:tc>
+      </w:tr>
+      <w:tr>
+        <w:tc>
+          <w:tcPr>
+            <w:tcW w:w="1271" w:type="dxa"/>
+          </w:tcPr>
+          <w:p>
+            <w:pPr>
+              <w:rPr>
+                <w:rFonts w:ascii="Arial" w:hAnsi="Arial" w:cs="Arial"/>
+              </w:rPr>
+            </w:pPr>
+            <w:r>
+              <w:rPr>
+                <w:rFonts w:ascii="Arial" w:hAnsi="Arial" w:cs="Arial"/>
+              </w:rPr>
+              <w:t>Riley</w:t>
+            </w:r>
+          </w:p>
+        </w:tc>
+        <w:tc>
+          <w:tcPr>
+            <w:tcW w:w="8357" w:type="dxa"/>
+          </w:tcPr>
+          <w:p>
+            <w:pPr>
+              <w:rPr>
+                <w:rFonts w:ascii="Arial" w:hAnsi="Arial" w:cs="Arial"/>
+              </w:rPr>
+            </w:pPr>
+            <w:r>
+              <w:rPr>
+                <w:rFonts w:ascii="Arial" w:hAnsi="Arial" w:cs="Arial"/>
+              </w:rPr>
+              <w:t xml:space="preserve">Continuato lo sviluppo del </w:t>
+            </w:r>
+            <w:proofErr w:type="spellStart"/>
+            <w:r>
+              <w:rPr>
+                <w:rFonts w:ascii="Arial" w:hAnsi="Arial" w:cs="Arial"/>
+              </w:rPr>
+              <w:t>db</w:t>
+            </w:r>
+            <w:proofErr w:type="spellEnd"/>
+          </w:p>
+        </w:tc>
+      </w:tr>
+      <w:tr>
+        <w:tc>
+          <w:tcPr>
+            <w:tcW w:w="1271" w:type="dxa"/>
+          </w:tcPr>
+          <w:p>
+            <w:pPr>
+              <w:rPr>
+                <w:rFonts w:ascii="Arial" w:hAnsi="Arial" w:cs="Arial"/>
+              </w:rPr>
+            </w:pPr>
+            <w:r>
+              <w:rPr>
+                <w:rFonts w:ascii="Arial" w:hAnsi="Arial" w:cs="Arial"/>
+              </w:rPr>
+              <w:t>Bryan</w:t>
+            </w:r>
+          </w:p>
+        </w:tc>
+        <w:tc>
+          <w:tcPr>
+            <w:tcW w:w="8357" w:type="dxa"/>
+          </w:tcPr>
+          <w:p>
+            <w:pPr>
+              <w:rPr>
+                <w:rFonts w:ascii="Arial" w:hAnsi="Arial" w:cs="Arial"/>
+              </w:rPr>
+            </w:pPr>
+            <w:r>
+              <w:rPr>
+                <w:rFonts w:ascii="Arial" w:hAnsi="Arial" w:cs="Arial"/>
+              </w:rPr>
+              <w:t>Continuato il garage</w:t>
+            </w:r>
+          </w:p>
+        </w:tc>
+      </w:tr>
+    </w:tbl>
+    <w:p>
+      <w:pPr>
+        <w:rPr>
+          <w:rFonts w:ascii="Arial" w:hAnsi="Arial" w:cs="Arial"/>
+        </w:rPr>
+      </w:pPr>
+    </w:p>
+    <w:tbl>
+      <w:tblPr>
+        <w:tblStyle w:val="Grigliatabella"/>
+        <w:tblW w:w="0" w:type="auto"/>
+        <w:tblInd w:w="-5" w:type="dxa"/>
+        <w:tblLook w:val="04A0" w:firstRow="1" w:lastRow="0" w:firstColumn="1" w:lastColumn="0" w:noHBand="0" w:noVBand="1"/>
+      </w:tblPr>
+      <w:tblGrid>
+        <w:gridCol w:w="1276"/>
+        <w:gridCol w:w="8357"/>
+      </w:tblGrid>
+      <w:tr>
+        <w:tc>
+          <w:tcPr>
+            <w:tcW w:w="9628" w:type="dxa"/>
+            <w:gridSpan w:val="2"/>
+            <w:shd w:val="clear" w:color="auto" w:fill="D9D9D9" w:themeFill="background1" w:themeFillShade="D9"/>
+          </w:tcPr>
+          <w:p>
+            <w:pPr>
+              <w:rPr>
+                <w:rFonts w:ascii="Arial" w:hAnsi="Arial" w:cs="Arial"/>
+              </w:rPr>
+            </w:pPr>
+            <w:r>
+              <w:rPr>
+                <w:rFonts w:ascii="Arial" w:hAnsi="Arial" w:cs="Arial"/>
+              </w:rPr>
+              <w:t>Problemi riscontrati e soluzioni adottate</w:t>
+            </w:r>
+          </w:p>
+        </w:tc>
+      </w:tr>
+      <w:tr>
+        <w:tc>
+          <w:tcPr>
+            <w:tcW w:w="1276" w:type="dxa"/>
+          </w:tcPr>
+          <w:p>
+            <w:pPr>
+              <w:rPr>
+                <w:rFonts w:ascii="Arial" w:hAnsi="Arial" w:cs="Arial"/>
+              </w:rPr>
+            </w:pPr>
+            <w:r>
+              <w:rPr>
+                <w:rFonts w:ascii="Arial" w:hAnsi="Arial" w:cs="Arial"/>
+              </w:rPr>
+              <w:t>Riley</w:t>
+            </w:r>
+          </w:p>
+        </w:tc>
+        <w:tc>
+          <w:tcPr>
+            <w:tcW w:w="8357" w:type="dxa"/>
+          </w:tcPr>
+          <w:p>
+            <w:pPr>
+              <w:rPr>
+                <w:rFonts w:ascii="Arial" w:hAnsi="Arial" w:cs="Arial"/>
+              </w:rPr>
+            </w:pPr>
+            <w:r>
+              <w:rPr>
+                <w:rFonts w:ascii="Arial" w:hAnsi="Arial" w:cs="Arial"/>
+              </w:rPr>
+              <w:t>Struttura di assegnazione tasti diversa rispetto al resto, perciò è stato necessario adattare i due metodi, ancora in sviluppo</w:t>
+            </w:r>
+          </w:p>
+        </w:tc>
+      </w:tr>
+      <w:tr>
+        <w:tc>
+          <w:tcPr>
+            <w:tcW w:w="1276" w:type="dxa"/>
+          </w:tcPr>
+          <w:p>
+            <w:pPr>
+              <w:rPr>
+                <w:rFonts w:ascii="Arial" w:hAnsi="Arial" w:cs="Arial"/>
+              </w:rPr>
+            </w:pPr>
+            <w:r>
+              <w:rPr>
+                <w:rFonts w:ascii="Arial" w:hAnsi="Arial" w:cs="Arial"/>
+              </w:rPr>
+              <w:t>Bryan</w:t>
+            </w:r>
+          </w:p>
+        </w:tc>
+        <w:tc>
+          <w:tcPr>
+            <w:tcW w:w="8357" w:type="dxa"/>
+          </w:tcPr>
+          <w:p>
+            <w:pPr>
+              <w:rPr>
+                <w:rFonts w:ascii="Arial" w:hAnsi="Arial" w:cs="Arial"/>
+              </w:rPr>
+            </w:pPr>
+            <w:r>
+              <w:rPr>
+                <w:rFonts w:ascii="Arial" w:hAnsi="Arial" w:cs="Arial"/>
+              </w:rPr>
+              <w:t>-</w:t>
+            </w:r>
+          </w:p>
+        </w:tc>
+      </w:tr>
+    </w:tbl>
+    <w:p>
+      <w:pPr>
+        <w:rPr>
+          <w:rFonts w:ascii="Arial" w:hAnsi="Arial" w:cs="Arial"/>
+        </w:rPr>
+      </w:pPr>
+    </w:p>
+    <w:tbl>
+      <w:tblPr>
+        <w:tblStyle w:val="Grigliatabella"/>
+        <w:tblW w:w="0" w:type="auto"/>
+        <w:tblLook w:val="04A0" w:firstRow="1" w:lastRow="0" w:firstColumn="1" w:lastColumn="0" w:noHBand="0" w:noVBand="1"/>
+      </w:tblPr>
+      <w:tblGrid>
+        <w:gridCol w:w="9628"/>
+      </w:tblGrid>
+      <w:tr>
+        <w:tc>
+          <w:tcPr>
+            <w:tcW w:w="9854" w:type="dxa"/>
+            <w:shd w:val="clear" w:color="auto" w:fill="D9D9D9" w:themeFill="background1" w:themeFillShade="D9"/>
+          </w:tcPr>
+          <w:p>
+            <w:pPr>
+              <w:rPr>
+                <w:rFonts w:ascii="Arial" w:hAnsi="Arial" w:cs="Arial"/>
+              </w:rPr>
+            </w:pPr>
+            <w:r>
+              <w:rPr>
+                <w:rFonts w:ascii="Arial" w:hAnsi="Arial" w:cs="Arial"/>
+              </w:rPr>
+              <w:t>Punto della situazione rispetto alla pianificazione</w:t>
+            </w:r>
+          </w:p>
+        </w:tc>
+      </w:tr>
+      <w:tr>
+        <w:tc>
+          <w:tcPr>
+            <w:tcW w:w="9854" w:type="dxa"/>
+          </w:tcPr>
+          <w:p>
+            <w:pPr>
+              <w:rPr>
+                <w:rFonts w:ascii="Arial" w:hAnsi="Arial" w:cs="Arial"/>
+              </w:rPr>
+            </w:pPr>
+            <w:r>
+              <w:rPr>
+                <w:rFonts w:ascii="Arial" w:hAnsi="Arial" w:cs="Arial"/>
+              </w:rPr>
+              <w:t>Lavori dello sprint già conclusi, stanno essendo svolti dei lavori extra</w:t>
+            </w:r>
+          </w:p>
+        </w:tc>
+      </w:tr>
+    </w:tbl>
+    <w:p>
+      <w:pPr>
+        <w:rPr>
+          <w:rFonts w:ascii="Arial" w:hAnsi="Arial" w:cs="Arial"/>
+        </w:rPr>
+      </w:pPr>
+    </w:p>
+    <w:tbl>
+      <w:tblPr>
+        <w:tblStyle w:val="Grigliatabella"/>
+        <w:tblW w:w="0" w:type="auto"/>
+        <w:tblLook w:val="04A0" w:firstRow="1" w:lastRow="0" w:firstColumn="1" w:lastColumn="0" w:noHBand="0" w:noVBand="1"/>
+      </w:tblPr>
+      <w:tblGrid>
+        <w:gridCol w:w="9628"/>
+      </w:tblGrid>
+      <w:tr>
+        <w:tc>
+          <w:tcPr>
+            <w:tcW w:w="9854" w:type="dxa"/>
+            <w:shd w:val="clear" w:color="auto" w:fill="D9D9D9" w:themeFill="background1" w:themeFillShade="D9"/>
+          </w:tcPr>
+          <w:p>
+            <w:pPr>
+              <w:rPr>
+                <w:rFonts w:ascii="Arial" w:hAnsi="Arial" w:cs="Arial"/>
+              </w:rPr>
+            </w:pPr>
+            <w:r>
+              <w:rPr>
+                <w:rFonts w:ascii="Arial" w:hAnsi="Arial" w:cs="Arial"/>
+              </w:rPr>
+              <w:t>Programma di massima per la prossima giornata di lavoro</w:t>
+            </w:r>
+          </w:p>
+        </w:tc>
+      </w:tr>
+      <w:tr>
+        <w:tc>
+          <w:tcPr>
+            <w:tcW w:w="9854" w:type="dxa"/>
+          </w:tcPr>
+          <w:p>
+            <w:pPr>
+              <w:rPr>
+                <w:rFonts w:ascii="Arial" w:hAnsi="Arial" w:cs="Arial"/>
+              </w:rPr>
+            </w:pPr>
+            <w:r>
+              <w:rPr>
+                <w:rFonts w:ascii="Arial" w:hAnsi="Arial" w:cs="Arial"/>
+              </w:rPr>
+              <w:t xml:space="preserve">Continuare ognuno con </w:t>
+            </w:r>
+            <w:proofErr w:type="gramStart"/>
+            <w:r>
+              <w:rPr>
+                <w:rFonts w:ascii="Arial" w:hAnsi="Arial" w:cs="Arial"/>
+              </w:rPr>
+              <w:t>i</w:t>
+            </w:r>
+            <w:proofErr w:type="gramEnd"/>
+            <w:r>
+              <w:rPr>
+                <w:rFonts w:ascii="Arial" w:hAnsi="Arial" w:cs="Arial"/>
+              </w:rPr>
+              <w:t xml:space="preserve"> sviluppi di </w:t>
+            </w:r>
+            <w:proofErr w:type="spellStart"/>
+            <w:r>
+              <w:rPr>
+                <w:rFonts w:ascii="Arial" w:hAnsi="Arial" w:cs="Arial"/>
+              </w:rPr>
+              <w:t>db</w:t>
+            </w:r>
+            <w:proofErr w:type="spellEnd"/>
+            <w:r>
+              <w:rPr>
+                <w:rFonts w:ascii="Arial" w:hAnsi="Arial" w:cs="Arial"/>
+              </w:rPr>
+              <w:t xml:space="preserve"> e garage</w:t>
+            </w:r>
+          </w:p>
+        </w:tc>
+      </w:tr>
+    </w:tbl>
+    <w:p>
+      <w:pPr>
+        <w:rPr>
+          <w:rFonts w:ascii="Arial" w:hAnsi="Arial" w:cs="Arial"/>
+        </w:rPr>
+      </w:pPr>
+    </w:p>
+    <w:p>
+      <w:pPr>
+        <w:pStyle w:val="Titolo1"/>
+      </w:pPr>
+      <w:r>
+        <w:t>Agile - Resoconto</w:t>
+      </w:r>
+    </w:p>
+    <w:tbl>
+      <w:tblPr>
+        <w:tblStyle w:val="Grigliatabella"/>
+        <w:tblW w:w="0" w:type="auto"/>
+        <w:tblLook w:val="04A0" w:firstRow="1" w:lastRow="0" w:firstColumn="1" w:lastColumn="0" w:noHBand="0" w:noVBand="1"/>
+      </w:tblPr>
+      <w:tblGrid>
+        <w:gridCol w:w="9628"/>
+      </w:tblGrid>
+      <w:tr>
+        <w:tc>
+          <w:tcPr>
+            <w:tcW w:w="9628" w:type="dxa"/>
+            <w:tcBorders>
+              <w:top w:val="single" w:sz="4" w:space="0" w:color="auto"/>
+              <w:left w:val="single" w:sz="4" w:space="0" w:color="auto"/>
+              <w:bottom w:val="single" w:sz="4" w:space="0" w:color="auto"/>
+              <w:right w:val="single" w:sz="4" w:space="0" w:color="auto"/>
+            </w:tcBorders>
+            <w:shd w:val="clear" w:color="auto" w:fill="D9D9D9" w:themeFill="background1" w:themeFillShade="D9"/>
+            <w:hideMark/>
+          </w:tcPr>
+          <w:p>
+            <w:pPr>
+              <w:spacing w:after="200" w:line="276" w:lineRule="auto"/>
+              <w:rPr>
+                <w:rFonts w:ascii="Arial" w:hAnsi="Arial" w:cs="Arial"/>
+              </w:rPr>
+            </w:pPr>
+            <w:proofErr w:type="spellStart"/>
+            <w:r>
+              <w:rPr>
+                <w:rFonts w:ascii="Arial" w:hAnsi="Arial" w:cs="Arial"/>
+              </w:rPr>
+              <w:t>Daily</w:t>
+            </w:r>
+            <w:proofErr w:type="spellEnd"/>
+            <w:r>
+              <w:rPr>
+                <w:rFonts w:ascii="Arial" w:hAnsi="Arial" w:cs="Arial"/>
+              </w:rPr>
+              <w:t xml:space="preserve"> </w:t>
+            </w:r>
+            <w:proofErr w:type="spellStart"/>
+            <w:r>
+              <w:rPr>
+                <w:rFonts w:ascii="Arial" w:hAnsi="Arial" w:cs="Arial"/>
+              </w:rPr>
+              <w:t>Scrum</w:t>
+            </w:r>
+            <w:proofErr w:type="spellEnd"/>
+          </w:p>
+        </w:tc>
+      </w:tr>
+      <w:tr>
+        <w:tc>
+          <w:tcPr>
+            <w:tcW w:w="9628" w:type="dxa"/>
+            <w:tcBorders>
+              <w:top w:val="single" w:sz="4" w:space="0" w:color="auto"/>
+              <w:left w:val="single" w:sz="4" w:space="0" w:color="auto"/>
+              <w:bottom w:val="single" w:sz="4" w:space="0" w:color="auto"/>
+              <w:right w:val="single" w:sz="4" w:space="0" w:color="auto"/>
+            </w:tcBorders>
+            <w:hideMark/>
+          </w:tcPr>
+          <w:p>
+            <w:pPr>
+              <w:spacing w:after="200" w:line="276" w:lineRule="auto"/>
+              <w:rPr>
+                <w:rFonts w:ascii="Arial" w:hAnsi="Arial" w:cs="Arial"/>
+              </w:rPr>
+            </w:pPr>
+          </w:p>
+        </w:tc>
+      </w:tr>
+      <w:tr>
+        <w:tc>
+          <w:tcPr>
+            <w:tcW w:w="9628" w:type="dxa"/>
+            <w:tcBorders>
+              <w:top w:val="single" w:sz="4" w:space="0" w:color="auto"/>
+              <w:left w:val="single" w:sz="4" w:space="0" w:color="auto"/>
+              <w:bottom w:val="single" w:sz="4" w:space="0" w:color="auto"/>
+              <w:right w:val="single" w:sz="4" w:space="0" w:color="auto"/>
+            </w:tcBorders>
+          </w:tcPr>
+          <w:p>
+            <w:pPr>
+              <w:spacing w:after="200" w:line="276" w:lineRule="auto"/>
+              <w:rPr>
+                <w:rFonts w:ascii="Arial" w:hAnsi="Arial" w:cs="Arial"/>
+              </w:rPr>
+            </w:pPr>
+            <w:r>
+              <w:rPr>
+                <w:rFonts w:ascii="Arial" w:hAnsi="Arial" w:cs="Arial"/>
+              </w:rPr>
+              <w:t xml:space="preserve">Riley: Continuo sviluppo </w:t>
+            </w:r>
+            <w:proofErr w:type="spellStart"/>
+            <w:r>
+              <w:rPr>
+                <w:rFonts w:ascii="Arial" w:hAnsi="Arial" w:cs="Arial"/>
+              </w:rPr>
+              <w:t>db</w:t>
+            </w:r>
+            <w:proofErr w:type="spellEnd"/>
+          </w:p>
+          <w:p>
+            <w:pPr>
+              <w:spacing w:after="200" w:line="276" w:lineRule="auto"/>
+              <w:rPr>
+                <w:rFonts w:ascii="Arial" w:hAnsi="Arial" w:cs="Arial"/>
+              </w:rPr>
+            </w:pPr>
+            <w:r>
+              <w:rPr>
+                <w:rFonts w:ascii="Arial" w:hAnsi="Arial" w:cs="Arial"/>
+              </w:rPr>
+              <w:t>Bryan: Continuo sviluppo garage</w:t>
+            </w:r>
+          </w:p>
+        </w:tc>
+      </w:tr>
+    </w:tbl>
+    <w:p>
+      <w:pPr>
+        <w:rPr>
+          <w:rFonts w:ascii="Arial" w:hAnsi="Arial" w:cs="Arial"/>
+        </w:rPr>
+      </w:pPr>
+    </w:p>
+    <w:tbl>
+      <w:tblPr>
+        <w:tblStyle w:val="Grigliatabella"/>
+        <w:tblW w:w="0" w:type="auto"/>
+        <w:tblLook w:val="04A0" w:firstRow="1" w:lastRow="0" w:firstColumn="1" w:lastColumn="0" w:noHBand="0" w:noVBand="1"/>
+      </w:tblPr>
+      <w:tblGrid>
+        <w:gridCol w:w="9628"/>
+      </w:tblGrid>
+      <w:tr>
+        <w:tc>
+          <w:tcPr>
+            <w:tcW w:w="9854" w:type="dxa"/>
+            <w:tcBorders>
+              <w:top w:val="single" w:sz="4" w:space="0" w:color="auto"/>
+              <w:left w:val="single" w:sz="4" w:space="0" w:color="auto"/>
+              <w:bottom w:val="single" w:sz="4" w:space="0" w:color="auto"/>
+              <w:right w:val="single" w:sz="4" w:space="0" w:color="auto"/>
+            </w:tcBorders>
+            <w:shd w:val="clear" w:color="auto" w:fill="D9D9D9" w:themeFill="background1" w:themeFillShade="D9"/>
+            <w:hideMark/>
+          </w:tcPr>
+          <w:p>
+            <w:pPr>
+              <w:spacing w:after="200" w:line="276" w:lineRule="auto"/>
+              <w:rPr>
+                <w:rFonts w:ascii="Arial" w:hAnsi="Arial" w:cs="Arial"/>
+              </w:rPr>
+            </w:pPr>
+            <w:r>
+              <w:rPr>
+                <w:rFonts w:ascii="Arial" w:hAnsi="Arial" w:cs="Arial"/>
+              </w:rPr>
+              <w:t>Sprint Planning</w:t>
+            </w:r>
+          </w:p>
+        </w:tc>
+      </w:tr>
+      <w:tr>
+        <w:tc>
+          <w:tcPr>
+            <w:tcW w:w="9854" w:type="dxa"/>
+            <w:tcBorders>
+              <w:top w:val="single" w:sz="4" w:space="0" w:color="auto"/>
+              <w:left w:val="single" w:sz="4" w:space="0" w:color="auto"/>
+              <w:bottom w:val="single" w:sz="4" w:space="0" w:color="auto"/>
+              <w:right w:val="single" w:sz="4" w:space="0" w:color="auto"/>
+            </w:tcBorders>
+          </w:tcPr>
+          <w:p>
+            <w:pPr>
+              <w:spacing w:after="200" w:line="276" w:lineRule="auto"/>
+              <w:rPr>
+                <w:rFonts w:ascii="Arial" w:hAnsi="Arial" w:cs="Arial"/>
+              </w:rPr>
+            </w:pPr>
+          </w:p>
+        </w:tc>
+      </w:tr>
+    </w:tbl>
+    <w:p>
+      <w:pPr>
+        <w:rPr>
+          <w:rFonts w:ascii="Arial" w:hAnsi="Arial" w:cs="Arial"/>
+        </w:rPr>
+      </w:pPr>
+    </w:p>
+    <w:tbl>
+      <w:tblPr>
+        <w:tblStyle w:val="Grigliatabella"/>
+        <w:tblW w:w="0" w:type="auto"/>
+        <w:tblLook w:val="04A0" w:firstRow="1" w:lastRow="0" w:firstColumn="1" w:lastColumn="0" w:noHBand="0" w:noVBand="1"/>
+      </w:tblPr>
+      <w:tblGrid>
+        <w:gridCol w:w="9628"/>
+      </w:tblGrid>
+      <w:tr>
+        <w:tc>
+          <w:tcPr>
+            <w:tcW w:w="9854" w:type="dxa"/>
+            <w:tcBorders>
+              <w:top w:val="single" w:sz="4" w:space="0" w:color="auto"/>
+              <w:left w:val="single" w:sz="4" w:space="0" w:color="auto"/>
+              <w:bottom w:val="single" w:sz="4" w:space="0" w:color="auto"/>
+              <w:right w:val="single" w:sz="4" w:space="0" w:color="auto"/>
+            </w:tcBorders>
+            <w:shd w:val="clear" w:color="auto" w:fill="D9D9D9" w:themeFill="background1" w:themeFillShade="D9"/>
+            <w:hideMark/>
+          </w:tcPr>
+          <w:p>
+            <w:pPr>
+              <w:spacing w:after="200" w:line="276" w:lineRule="auto"/>
+              <w:rPr>
+                <w:rFonts w:ascii="Arial" w:hAnsi="Arial" w:cs="Arial"/>
+              </w:rPr>
+            </w:pPr>
+            <w:r>
+              <w:rPr>
+                <w:rFonts w:ascii="Arial" w:hAnsi="Arial" w:cs="Arial"/>
+              </w:rPr>
+              <w:t>Sprint Review</w:t>
+            </w:r>
+          </w:p>
+        </w:tc>
+      </w:tr>
+      <w:tr>
+        <w:tc>
+          <w:tcPr>
+            <w:tcW w:w="9854" w:type="dxa"/>
+            <w:tcBorders>
+              <w:top w:val="single" w:sz="4" w:space="0" w:color="auto"/>
+              <w:left w:val="single" w:sz="4" w:space="0" w:color="auto"/>
+              <w:bottom w:val="single" w:sz="4" w:space="0" w:color="auto"/>
+              <w:right w:val="single" w:sz="4" w:space="0" w:color="auto"/>
+            </w:tcBorders>
+          </w:tcPr>
+          <w:p>
+            <w:pPr>
+              <w:spacing w:after="200" w:line="276" w:lineRule="auto"/>
+              <w:rPr>
+                <w:rFonts w:ascii="Arial" w:hAnsi="Arial" w:cs="Arial"/>
+              </w:rPr>
+            </w:pPr>
+          </w:p>
+        </w:tc>
+      </w:tr>
+    </w:tbl>
+    <w:p>
+      <w:pPr>
+        <w:rPr>
+          <w:rFonts w:ascii="Arial" w:hAnsi="Arial" w:cs="Arial"/>
+        </w:rPr>
+      </w:pPr>
+    </w:p>
+    <w:tbl>
+      <w:tblPr>
+        <w:tblStyle w:val="Grigliatabella"/>
+        <w:tblW w:w="0" w:type="auto"/>
+        <w:tblLook w:val="04A0" w:firstRow="1" w:lastRow="0" w:firstColumn="1" w:lastColumn="0" w:noHBand="0" w:noVBand="1"/>
+      </w:tblPr>
+      <w:tblGrid>
+        <w:gridCol w:w="9628"/>
+      </w:tblGrid>
+      <w:tr>
+        <w:tc>
+          <w:tcPr>
+            <w:tcW w:w="9854" w:type="dxa"/>
+            <w:tcBorders>
+              <w:top w:val="single" w:sz="4" w:space="0" w:color="auto"/>
+              <w:left w:val="single" w:sz="4" w:space="0" w:color="auto"/>
+              <w:bottom w:val="single" w:sz="4" w:space="0" w:color="auto"/>
+              <w:right w:val="single" w:sz="4" w:space="0" w:color="auto"/>
+            </w:tcBorders>
+            <w:shd w:val="clear" w:color="auto" w:fill="D9D9D9" w:themeFill="background1" w:themeFillShade="D9"/>
+            <w:hideMark/>
+          </w:tcPr>
+          <w:p>
+            <w:pPr>
+              <w:spacing w:after="200" w:line="276" w:lineRule="auto"/>
+              <w:rPr>
+                <w:rFonts w:ascii="Arial" w:hAnsi="Arial" w:cs="Arial"/>
+              </w:rPr>
+            </w:pPr>
+            <w:r>
+              <w:rPr>
+                <w:rFonts w:ascii="Arial" w:hAnsi="Arial" w:cs="Arial"/>
+              </w:rPr>
+              <w:t xml:space="preserve">Sprint </w:t>
+            </w:r>
+            <w:proofErr w:type="spellStart"/>
+            <w:r>
+              <w:rPr>
+                <w:rFonts w:ascii="Arial" w:hAnsi="Arial" w:cs="Arial"/>
+              </w:rPr>
+              <w:t>Retrospective</w:t>
+            </w:r>
+            <w:proofErr w:type="spellEnd"/>
+          </w:p>
+        </w:tc>
+      </w:tr>
+      <w:tr>
+        <w:tc>
+          <w:tcPr>
+            <w:tcW w:w="9854" w:type="dxa"/>
+            <w:tcBorders>
+              <w:top w:val="single" w:sz="4" w:space="0" w:color="auto"/>
+              <w:left w:val="single" w:sz="4" w:space="0" w:color="auto"/>
+              <w:bottom w:val="single" w:sz="4" w:space="0" w:color="auto"/>
+              <w:right w:val="single" w:sz="4" w:space="0" w:color="auto"/>
+            </w:tcBorders>
+          </w:tcPr>
+          <w:p>
+            <w:pPr>
+              <w:spacing w:after="200" w:line="276" w:lineRule="auto"/>
+              <w:rPr>
+                <w:rFonts w:ascii="Arial" w:hAnsi="Arial" w:cs="Arial"/>
+              </w:rPr>
+            </w:pPr>
+          </w:p>
+        </w:tc>
+      </w:tr>
+    </w:tbl>
+    <w:p>
+      <w:pPr>
+        <w:rPr>
+          <w:rFonts w:ascii="Arial" w:hAnsi="Arial" w:cs="Arial"/>
+        </w:rPr>
+      </w:pPr>
+    </w:p>
+    <w:p>
+      <w:pPr>
+        <w:rPr>
+          <w:rFonts w:ascii="Arial" w:hAnsi="Arial" w:cs="Arial"/>
+        </w:rPr>
+      </w:pPr>
+      <w:r>
+        <w:rPr>
+          <w:rFonts w:ascii="Arial" w:hAnsi="Arial" w:cs="Arial"/>
+        </w:rPr>
+        <w:br w:type="page"/>
+      </w:r>
+    </w:p>
+    <w:p>
+      <w:pPr>
+        <w:pStyle w:val="Titolo2"/>
+        <w:pBdr>
+          <w:bottom w:val="single" w:sz="4" w:space="1" w:color="auto"/>
+        </w:pBdr>
+      </w:pPr>
+      <w:r>
+        <w:lastRenderedPageBreak/>
+        <w:t>Utilizzo Intelligenza Artificiale</w:t>
+      </w:r>
+      <w:r>
+        <w:t xml:space="preserve"> nella giornata</w:t>
+      </w:r>
+    </w:p>
+    <w:p>
+      <w:pPr>
+        <w:pStyle w:val="Nessunaspaziatura"/>
+        <w:rPr>
+          <w:rFonts w:ascii="Arial" w:hAnsi="Arial" w:cs="Arial"/>
+          <w:b/>
+          <w:bCs/>
+        </w:rPr>
+      </w:pPr>
+    </w:p>
+    <w:p>
+      <w:pPr>
+        <w:pStyle w:val="Nessunaspaziatura"/>
+        <w:rPr>
+          <w:rFonts w:ascii="Arial" w:hAnsi="Arial" w:cs="Arial"/>
+        </w:rPr>
+      </w:pPr>
+      <w:sdt>
+        <w:sdtPr>
+          <w:rPr>
+            <w:rFonts w:ascii="Segoe UI Symbol" w:hAnsi="Segoe UI Symbol" w:cs="Segoe UI Symbol"/>
+          </w:rPr>
+          <w:id w:val="1384676816"/>
+          <w14:checkbox>
+            <w14:checked w14:val="0"/>
+            <w14:checkedState w14:val="2612" w14:font="MS Gothic"/>
+            <w14:uncheckedState w14:val="2610" w14:font="MS Gothic"/>
+          </w14:checkbox>
+        </w:sdtPr>
+        <w:sdtContent>
+          <w:r>
+            <w:rPr>
+              <w:rFonts w:ascii="MS Gothic" w:eastAsia="MS Gothic" w:hAnsi="MS Gothic" w:cs="Segoe UI Symbol" w:hint="eastAsia"/>
+            </w:rPr>
+            <w:t>☐</w:t>
+          </w:r>
+        </w:sdtContent>
+      </w:sdt>
+      <w:r>
+        <w:rPr>
+          <w:rFonts w:ascii="Arial" w:hAnsi="Arial" w:cs="Arial"/>
+        </w:rPr>
+        <w:t xml:space="preserve"> Nessuno</w:t>
+      </w:r>
+      <w:r>
+        <w:br/>
+      </w:r>
+      <w:sdt>
+        <w:sdtPr>
+          <w:rPr>
+            <w:rFonts w:ascii="Segoe UI Symbol" w:hAnsi="Segoe UI Symbol" w:cs="Segoe UI Symbol"/>
+          </w:rPr>
+          <w:id w:val="-56011435"/>
+          <w14:checkbox>
+            <w14:checked w14:val="1"/>
+            <w14:checkedState w14:val="2612" w14:font="MS Gothic"/>
+            <w14:uncheckedState w14:val="2610" w14:font="MS Gothic"/>
+          </w14:checkbox>
+        </w:sdtPr>
+        <w:sdtContent>
+          <w:r>
+            <w:rPr>
+              <w:rFonts w:ascii="MS Gothic" w:eastAsia="MS Gothic" w:hAnsi="MS Gothic" w:cs="Segoe UI Symbol" w:hint="eastAsia"/>
+            </w:rPr>
+            <w:t>☒</w:t>
+          </w:r>
+        </w:sdtContent>
+      </w:sdt>
+      <w:r>
+        <w:rPr>
+          <w:rFonts w:ascii="Arial" w:hAnsi="Arial" w:cs="Arial"/>
+        </w:rPr>
+        <w:t xml:space="preserve"> Occasionale</w:t>
+      </w:r>
+      <w:r>
+        <w:br/>
+      </w:r>
+      <w:sdt>
+        <w:sdtPr>
+          <w:rPr>
+            <w:rFonts w:ascii="Segoe UI Symbol" w:hAnsi="Segoe UI Symbol" w:cs="Segoe UI Symbol"/>
+          </w:rPr>
+          <w:id w:val="-198240390"/>
+          <w14:checkbox>
+            <w14:checked w14:val="0"/>
+            <w14:checkedState w14:val="2612" w14:font="MS Gothic"/>
+            <w14:uncheckedState w14:val="2610" w14:font="MS Gothic"/>
+          </w14:checkbox>
+        </w:sdtPr>
+        <w:sdtContent>
+          <w:r>
+            <w:rPr>
+              <w:rFonts w:ascii="MS Gothic" w:eastAsia="MS Gothic" w:hAnsi="MS Gothic" w:cs="Segoe UI Symbol" w:hint="eastAsia"/>
+            </w:rPr>
+            <w:t>☐</w:t>
+          </w:r>
+        </w:sdtContent>
+      </w:sdt>
+      <w:r>
+        <w:rPr>
+          <w:rFonts w:ascii="Arial" w:hAnsi="Arial" w:cs="Arial"/>
+        </w:rPr>
+        <w:t xml:space="preserve"> Frequente</w:t>
+      </w:r>
+    </w:p>
+    <w:p>
+      <w:pPr>
+        <w:pStyle w:val="Nessunaspaziatura"/>
+        <w:rPr>
+          <w:rFonts w:ascii="Arial" w:hAnsi="Arial" w:cs="Arial"/>
+        </w:rPr>
+      </w:pPr>
+    </w:p>
+    <w:p>
+      <w:pPr>
+        <w:pStyle w:val="Nessunaspaziatura"/>
+        <w:spacing w:line="276" w:lineRule="auto"/>
+        <w:rPr>
+          <w:rFonts w:ascii="Arial" w:hAnsi="Arial" w:cs="Arial"/>
+        </w:rPr>
+      </w:pPr>
+      <w:r>
+        <w:rPr>
+          <w:rFonts w:ascii="Arial" w:hAnsi="Arial" w:cs="Arial"/>
+          <w:b/>
+          <w:bCs/>
+        </w:rPr>
+        <w:t>Strumento/i utilizzato/i</w:t>
+      </w:r>
+      <w:r>
+        <w:rPr>
+          <w:rFonts w:ascii="Arial" w:hAnsi="Arial" w:cs="Arial"/>
+          <w:b/>
+          <w:bCs/>
+        </w:rPr>
+        <w:t xml:space="preserve"> </w:t>
+      </w:r>
+      <w:r>
+        <w:rPr>
+          <w:rFonts w:ascii="Arial" w:hAnsi="Arial" w:cs="Arial"/>
+        </w:rPr>
+        <w:t>(es. ChatGPT)</w:t>
+      </w:r>
+      <w:r>
+        <w:rPr>
+          <w:rFonts w:ascii="Arial" w:hAnsi="Arial" w:cs="Arial"/>
+        </w:rPr>
+        <w:t xml:space="preserve">: </w:t>
+      </w:r>
+      <w:sdt>
+        <w:sdtPr>
+          <w:rPr>
+            <w:rFonts w:ascii="Arial" w:hAnsi="Arial" w:cs="Arial"/>
+          </w:rPr>
+          <w:id w:val="-95566315"/>
+          <w:placeholder>
+            <w:docPart w:val="35B617DD762B4041834F0FB6C1C56E03"/>
+          </w:placeholder>
+        </w:sdtPr>
+        <w:sdtContent>
+          <w:r>
+            <w:rPr>
+              <w:rFonts w:ascii="Arial" w:hAnsi="Arial" w:cs="Arial"/>
+            </w:rPr>
+            <w:t>ChatGPT</w:t>
+          </w:r>
+        </w:sdtContent>
+      </w:sdt>
+    </w:p>
+    <w:p>
+      <w:pPr>
+        <w:pStyle w:val="Nessunaspaziatura"/>
+        <w:rPr>
+          <w:rFonts w:ascii="Arial" w:hAnsi="Arial" w:cs="Arial"/>
+        </w:rPr>
+      </w:pPr>
+    </w:p>
+    <w:p>
+      <w:pPr>
+        <w:pStyle w:val="Nessunaspaziatura"/>
+        <w:rPr>
+          <w:rFonts w:ascii="Arial" w:hAnsi="Arial" w:cs="Arial"/>
+        </w:rPr>
+      </w:pPr>
+      <w:r>
+        <w:rPr>
+          <w:rFonts w:ascii="Arial" w:hAnsi="Arial" w:cs="Arial"/>
+          <w:b/>
+          <w:bCs/>
+        </w:rPr>
+        <w:t>Per cosa l’ho usata oggi</w:t>
+      </w:r>
+      <w:r>
+        <w:br/>
+      </w:r>
+      <w:sdt>
+        <w:sdtPr>
+          <w:rPr>
+            <w:rFonts w:ascii="Segoe UI Symbol" w:hAnsi="Segoe UI Symbol" w:cs="Segoe UI Symbol"/>
+          </w:rPr>
+          <w:id w:val="1998455924"/>
+          <w14:checkbox>
+            <w14:checked w14:val="1"/>
+            <w14:checkedState w14:val="2612" w14:font="MS Gothic"/>
+            <w14:uncheckedState w14:val="2610" w14:font="MS Gothic"/>
+          </w14:checkbox>
+        </w:sdtPr>
+        <w:sdtContent>
+          <w:r>
+            <w:rPr>
+              <w:rFonts w:ascii="MS Gothic" w:eastAsia="MS Gothic" w:hAnsi="MS Gothic" w:cs="Segoe UI Symbol" w:hint="eastAsia"/>
+            </w:rPr>
+            <w:t>☒</w:t>
+          </w:r>
+        </w:sdtContent>
+      </w:sdt>
+      <w:r>
+        <w:rPr>
+          <w:rFonts w:ascii="Arial" w:hAnsi="Arial" w:cs="Arial"/>
+        </w:rPr>
+        <w:t xml:space="preserve"> Chiarire concetti</w:t>
+      </w:r>
+      <w:r>
+        <w:br/>
+      </w:r>
+      <w:sdt>
+        <w:sdtPr>
+          <w:rPr>
+            <w:rFonts w:ascii="Segoe UI Symbol" w:hAnsi="Segoe UI Symbol" w:cs="Segoe UI Symbol"/>
+          </w:rPr>
+          <w:id w:val="827020140"/>
+          <w14:checkbox>
+            <w14:checked w14:val="1"/>
+            <w14:checkedState w14:val="2612" w14:font="MS Gothic"/>
+            <w14:uncheckedState w14:val="2610" w14:font="MS Gothic"/>
+          </w14:checkbox>
+        </w:sdtPr>
+        <w:sdtContent>
+          <w:r>
+            <w:rPr>
+              <w:rFonts w:ascii="MS Gothic" w:eastAsia="MS Gothic" w:hAnsi="MS Gothic" w:cs="Segoe UI Symbol" w:hint="eastAsia"/>
+            </w:rPr>
+            <w:t>☒</w:t>
+          </w:r>
+        </w:sdtContent>
+      </w:sdt>
+      <w:r>
+        <w:rPr>
+          <w:rFonts w:ascii="Arial" w:hAnsi="Arial" w:cs="Arial"/>
+        </w:rPr>
+        <w:t xml:space="preserve"> Supporto al codice</w:t>
+      </w:r>
+      <w:r>
+        <w:br/>
+      </w:r>
+      <w:sdt>
+        <w:sdtPr>
+          <w:rPr>
+            <w:rFonts w:ascii="Segoe UI Symbol" w:hAnsi="Segoe UI Symbol" w:cs="Segoe UI Symbol"/>
+          </w:rPr>
+          <w:id w:val="-1424412563"/>
+          <w14:checkbox>
+            <w14:checked w14:val="0"/>
+            <w14:checkedState w14:val="2612" w14:font="MS Gothic"/>
+            <w14:uncheckedState w14:val="2610" w14:font="MS Gothic"/>
+          </w14:checkbox>
+        </w:sdtPr>
+        <w:sdtContent>
+          <w:r>
+            <w:rPr>
+              <w:rFonts w:ascii="MS Gothic" w:eastAsia="MS Gothic" w:hAnsi="MS Gothic" w:cs="Segoe UI Symbol" w:hint="eastAsia"/>
+            </w:rPr>
+            <w:t>☐</w:t>
+          </w:r>
+        </w:sdtContent>
+      </w:sdt>
+      <w:r>
+        <w:rPr>
+          <w:rFonts w:ascii="Arial" w:hAnsi="Arial" w:cs="Arial"/>
+        </w:rPr>
+        <w:t xml:space="preserve"> Debug</w:t>
+      </w:r>
+      <w:r>
+        <w:br/>
+      </w:r>
+      <w:sdt>
+        <w:sdtPr>
+          <w:rPr>
+            <w:rFonts w:ascii="Segoe UI Symbol" w:hAnsi="Segoe UI Symbol" w:cs="Segoe UI Symbol"/>
+          </w:rPr>
+          <w:id w:val="566229873"/>
+          <w14:checkbox>
+            <w14:checked w14:val="0"/>
+            <w14:checkedState w14:val="2612" w14:font="MS Gothic"/>
+            <w14:uncheckedState w14:val="2610" w14:font="MS Gothic"/>
+          </w14:checkbox>
+        </w:sdtPr>
+        <w:sdtContent>
+          <w:r>
+            <w:rPr>
+              <w:rFonts w:ascii="MS Gothic" w:eastAsia="MS Gothic" w:hAnsi="MS Gothic" w:cs="Segoe UI Symbol" w:hint="eastAsia"/>
+            </w:rPr>
+            <w:t>☐</w:t>
+          </w:r>
+        </w:sdtContent>
+      </w:sdt>
+      <w:r>
+        <w:rPr>
+          <w:rFonts w:ascii="Arial" w:hAnsi="Arial" w:cs="Arial"/>
+        </w:rPr>
+        <w:t xml:space="preserve"> Riorganizzare idee / testi</w:t>
+      </w:r>
+      <w:r>
+        <w:br/>
+      </w:r>
+      <w:sdt>
+        <w:sdtPr>
+          <w:rPr>
+            <w:rFonts w:ascii="Segoe UI Symbol" w:hAnsi="Segoe UI Symbol" w:cs="Segoe UI Symbol"/>
+          </w:rPr>
+          <w:id w:val="-1635475630"/>
+          <w14:checkbox>
+            <w14:checked w14:val="0"/>
+            <w14:checkedState w14:val="2612" w14:font="MS Gothic"/>
+            <w14:uncheckedState w14:val="2610" w14:font="MS Gothic"/>
+          </w14:checkbox>
+        </w:sdtPr>
+        <w:sdtContent>
+          <w:r>
+            <w:rPr>
+              <w:rFonts w:ascii="MS Gothic" w:eastAsia="MS Gothic" w:hAnsi="MS Gothic" w:cs="Segoe UI Symbol" w:hint="eastAsia"/>
+            </w:rPr>
+            <w:t>☐</w:t>
+          </w:r>
+        </w:sdtContent>
+      </w:sdt>
+      <w:r>
+        <w:rPr>
+          <w:rFonts w:ascii="Arial" w:hAnsi="Arial" w:cs="Arial"/>
+        </w:rPr>
+        <w:t xml:space="preserve"> Altro: …</w:t>
+      </w:r>
+    </w:p>
+    <w:p>
+      <w:pPr>
+        <w:pStyle w:val="Nessunaspaziatura"/>
+        <w:rPr>
+          <w:rFonts w:ascii="Arial" w:hAnsi="Arial" w:cs="Arial"/>
+        </w:rPr>
+      </w:pPr>
+    </w:p>
+    <w:p>
+      <w:pPr>
+        <w:pStyle w:val="Nessunaspaziatura"/>
+        <w:rPr>
+          <w:rFonts w:ascii="Arial" w:hAnsi="Arial" w:cs="Arial"/>
+          <w:b/>
+          <w:bCs/>
+        </w:rPr>
+      </w:pPr>
+      <w:r>
+        <w:rPr>
+          <w:rFonts w:ascii="Arial" w:hAnsi="Arial" w:cs="Arial"/>
+          <w:b/>
+          <w:bCs/>
+        </w:rPr>
+        <w:t>Esempio significativo di utilizzo (UNO SOLO)</w:t>
+      </w:r>
+    </w:p>
+    <w:p>
+      <w:pPr>
+        <w:pStyle w:val="Nessunaspaziatura"/>
+        <w:rPr>
+          <w:rFonts w:ascii="Arial" w:hAnsi="Arial" w:cs="Arial"/>
+        </w:rPr>
+      </w:pPr>
+      <w:r>
+        <w:rPr>
+          <w:rFonts w:ascii="Arial" w:hAnsi="Arial" w:cs="Arial"/>
+        </w:rPr>
+        <w:t xml:space="preserve">Riporta </w:t>
+      </w:r>
+      <w:r>
+        <w:rPr>
+          <w:rFonts w:ascii="Arial" w:hAnsi="Arial" w:cs="Arial"/>
+          <w:i/>
+          <w:iCs/>
+        </w:rPr>
+        <w:t>un</w:t>
+      </w:r>
+      <w:r>
+        <w:rPr>
+          <w:rFonts w:ascii="Arial" w:hAnsi="Arial" w:cs="Arial"/>
+        </w:rPr>
+        <w:t xml:space="preserve"> prompt rilevante oppure descrivilo a parole se ce ne sono stati molti.</w:t>
+      </w:r>
+    </w:p>
+    <w:p>
+      <w:pPr>
+        <w:pStyle w:val="Nessunaspaziatura"/>
+        <w:rPr>
+          <w:rFonts w:ascii="Arial" w:hAnsi="Arial" w:cs="Arial"/>
+        </w:rPr>
+      </w:pPr>
+    </w:p>
+    <w:sdt>
+      <w:sdtPr>
+        <w:rPr>
+          <w:rFonts w:ascii="Arial" w:hAnsi="Arial" w:cs="Arial"/>
+        </w:rPr>
+        <w:alias w:val="Prompt AI"/>
+        <w:tag w:val="Prompt AI"/>
+        <w:id w:val="1790006969"/>
+        <w:placeholder>
+          <w:docPart w:val="1A2D4B29C07942DBB144E0C18B7A5505"/>
+        </w:placeholder>
+        <w15:color w:val="C0C0C0"/>
+      </w:sdtPr>
+      <w:sdtContent>
+        <w:p>
+          <w:pPr>
+            <w:pStyle w:val="Nessunaspaziatura"/>
+            <w:rPr>
+              <w:rFonts w:ascii="Arial" w:hAnsi="Arial" w:cs="Arial"/>
+            </w:rPr>
+          </w:pPr>
+          <w:r>
+            <w:rPr>
+              <w:rFonts w:ascii="Arial" w:hAnsi="Arial" w:cs="Arial"/>
+            </w:rPr>
+            <w:t xml:space="preserve">Riley: Dovrei introdurre nel </w:t>
+          </w:r>
+          <w:proofErr w:type="spellStart"/>
+          <w:r>
+            <w:rPr>
+              <w:rFonts w:ascii="Arial" w:hAnsi="Arial" w:cs="Arial"/>
+            </w:rPr>
+            <w:t>db</w:t>
+          </w:r>
+          <w:proofErr w:type="spellEnd"/>
+          <w:r>
+            <w:rPr>
+              <w:rFonts w:ascii="Arial" w:hAnsi="Arial" w:cs="Arial"/>
+            </w:rPr>
+            <w:t xml:space="preserve"> i comandi collegati alle impostazioni, ma la struttura usata è diversa da quelle precedenti, e viene usata una classe esterna.</w:t>
+          </w:r>
+        </w:p>
+        <w:p>
+          <w:pPr>
+            <w:pStyle w:val="Nessunaspaziatura"/>
+            <w:spacing w:line="276" w:lineRule="auto"/>
+            <w:rPr>
+              <w:rFonts w:ascii="Arial" w:hAnsi="Arial" w:cs="Arial"/>
+            </w:rPr>
+          </w:pPr>
+          <w:r>
+            <w:rPr>
+              <w:rFonts w:ascii="Arial" w:hAnsi="Arial" w:cs="Arial"/>
+            </w:rPr>
+            <w:t xml:space="preserve">Bryan: </w:t>
+          </w:r>
+        </w:p>
+      </w:sdtContent>
+    </w:sdt>
+    <w:p>
+      <w:pPr>
+        <w:pStyle w:val="Nessunaspaziatura"/>
+        <w:rPr>
+          <w:rFonts w:ascii="Arial" w:hAnsi="Arial" w:cs="Arial"/>
+        </w:rPr>
+      </w:pPr>
+    </w:p>
+    <w:p>
+      <w:pPr>
+        <w:pStyle w:val="Nessunaspaziatura"/>
+        <w:rPr>
+          <w:rFonts w:ascii="Arial" w:hAnsi="Arial" w:cs="Arial"/>
+        </w:rPr>
+      </w:pPr>
+      <w:r>
+        <w:rPr>
+          <w:rFonts w:ascii="Arial" w:hAnsi="Arial" w:cs="Arial"/>
+          <w:b/>
+          <w:bCs/>
+        </w:rPr>
+        <w:t>Cosa mi ha dato l’AI</w:t>
+      </w:r>
+    </w:p>
+    <w:p>
+      <w:pPr>
+        <w:pStyle w:val="Nessunaspaziatura"/>
+        <w:rPr>
+          <w:rFonts w:ascii="Arial" w:hAnsi="Arial" w:cs="Arial"/>
+        </w:rPr>
+      </w:pPr>
+      <w:r>
+        <w:rPr>
+          <w:rFonts w:ascii="Arial" w:hAnsi="Arial" w:cs="Arial"/>
+        </w:rPr>
+        <w:t>Spiegazione, esempio, soluzione, suggerimento…</w:t>
+      </w:r>
+    </w:p>
+    <w:p>
+      <w:pPr>
+        <w:pStyle w:val="Nessunaspaziatura"/>
+        <w:rPr>
+          <w:rFonts w:ascii="Arial" w:hAnsi="Arial" w:cs="Arial"/>
+        </w:rPr>
+      </w:pPr>
+    </w:p>
+    <w:sdt>
+      <w:sdtPr>
+        <w:rPr>
+          <w:rFonts w:ascii="Arial" w:hAnsi="Arial" w:cs="Arial"/>
+        </w:rPr>
+        <w:alias w:val="Risposta AI"/>
+        <w:tag w:val="Risposta AI"/>
+        <w:id w:val="1542240549"/>
+        <w:placeholder>
+          <w:docPart w:val="3904DA71E4554269B7BAF466427E6984"/>
+        </w:placeholder>
+        <w15:color w:val="C0C0C0"/>
+      </w:sdtPr>
+      <w:sdtContent>
+        <w:p>
+          <w:pPr>
+            <w:pStyle w:val="Nessunaspaziatura"/>
+            <w:spacing w:line="276" w:lineRule="auto"/>
+            <w:rPr>
+              <w:rFonts w:ascii="Arial" w:hAnsi="Arial" w:cs="Arial"/>
+            </w:rPr>
+          </w:pPr>
+          <w:r>
+            <w:rPr>
+              <w:rFonts w:ascii="Arial" w:hAnsi="Arial" w:cs="Arial"/>
+            </w:rPr>
+            <w:t>Riley: Mi è stato detto come alcune parti della struttura siano ancora usabili e mi è stato chiesto qualche dettaglio per i comandi per potermi fornire delle risposte più corrette</w:t>
+          </w:r>
+        </w:p>
+        <w:p>
+          <w:pPr>
+            <w:pStyle w:val="Nessunaspaziatura"/>
+            <w:spacing w:line="276" w:lineRule="auto"/>
+            <w:rPr>
+              <w:rFonts w:ascii="Arial" w:hAnsi="Arial" w:cs="Arial"/>
+            </w:rPr>
+          </w:pPr>
+          <w:r>
+            <w:rPr>
+              <w:rFonts w:ascii="Arial" w:hAnsi="Arial" w:cs="Arial"/>
+            </w:rPr>
+            <w:t xml:space="preserve">Bryan: </w:t>
+          </w:r>
+        </w:p>
+      </w:sdtContent>
+    </w:sdt>
+    <w:p>
+      <w:pPr>
+        <w:pStyle w:val="Nessunaspaziatura"/>
+        <w:rPr>
+          <w:rFonts w:ascii="Arial" w:hAnsi="Arial" w:cs="Arial"/>
+          <w:b/>
+          <w:bCs/>
+        </w:rPr>
+      </w:pPr>
+    </w:p>
+    <w:p>
+      <w:pPr>
+        <w:pStyle w:val="Nessunaspaziatura"/>
+        <w:rPr>
+          <w:rFonts w:ascii="Arial" w:hAnsi="Arial" w:cs="Arial"/>
+        </w:rPr>
+      </w:pPr>
+      <w:r>
+        <w:rPr>
+          <w:rFonts w:ascii="Arial" w:hAnsi="Arial" w:cs="Arial"/>
+          <w:b/>
+          <w:bCs/>
+        </w:rPr>
+        <w:t>Come l’ho usato io</w:t>
+      </w:r>
+      <w:r>
+        <w:rPr>
+          <w:rFonts w:ascii="Arial" w:hAnsi="Arial" w:cs="Arial"/>
+        </w:rPr>
+        <w:br/>
+      </w:r>
+      <w:sdt>
+        <w:sdtPr>
+          <w:rPr>
+            <w:rFonts w:ascii="Segoe UI Symbol" w:hAnsi="Segoe UI Symbol" w:cs="Segoe UI Symbol"/>
+          </w:rPr>
+          <w:id w:val="915982531"/>
+          <w14:checkbox>
+            <w14:checked w14:val="0"/>
+            <w14:checkedState w14:val="2612" w14:font="MS Gothic"/>
+            <w14:uncheckedState w14:val="2610" w14:font="MS Gothic"/>
+          </w14:checkbox>
+        </w:sdtPr>
+        <w:sdtContent>
+          <w:r>
+            <w:rPr>
+              <w:rFonts w:ascii="MS Gothic" w:eastAsia="MS Gothic" w:hAnsi="MS Gothic" w:cs="Segoe UI Symbol" w:hint="eastAsia"/>
+            </w:rPr>
+            <w:t>☐</w:t>
+          </w:r>
+        </w:sdtContent>
+      </w:sdt>
+      <w:r>
+        <w:rPr>
+          <w:rFonts w:ascii="Arial" w:hAnsi="Arial" w:cs="Arial"/>
+        </w:rPr>
+        <w:t xml:space="preserve"> Copiato</w:t>
+      </w:r>
+      <w:r>
+        <w:rPr>
+          <w:rFonts w:ascii="Arial" w:hAnsi="Arial" w:cs="Arial"/>
+        </w:rPr>
+        <w:br/>
+      </w:r>
+      <w:sdt>
+        <w:sdtPr>
+          <w:rPr>
+            <w:rFonts w:ascii="Segoe UI Symbol" w:hAnsi="Segoe UI Symbol" w:cs="Segoe UI Symbol"/>
+          </w:rPr>
+          <w:id w:val="1212537762"/>
+          <w14:checkbox>
+            <w14:checked w14:val="1"/>
+            <w14:checkedState w14:val="2612" w14:font="MS Gothic"/>
+            <w14:uncheckedState w14:val="2610" w14:font="MS Gothic"/>
+          </w14:checkbox>
+        </w:sdtPr>
+        <w:sdtContent>
+          <w:r>
+            <w:rPr>
+              <w:rFonts w:ascii="MS Gothic" w:eastAsia="MS Gothic" w:hAnsi="MS Gothic" w:cs="Segoe UI Symbol" w:hint="eastAsia"/>
+            </w:rPr>
+            <w:t>☒</w:t>
+          </w:r>
+        </w:sdtContent>
+      </w:sdt>
+      <w:r>
+        <w:rPr>
+          <w:rFonts w:ascii="Arial" w:hAnsi="Arial" w:cs="Arial"/>
+        </w:rPr>
+        <w:t xml:space="preserve"> Adattato</w:t>
+      </w:r>
+      <w:r>
+        <w:rPr>
+          <w:rFonts w:ascii="Arial" w:hAnsi="Arial" w:cs="Arial"/>
+        </w:rPr>
+        <w:br/>
+      </w:r>
+      <w:sdt>
+        <w:sdtPr>
+          <w:rPr>
+            <w:rFonts w:ascii="Segoe UI Symbol" w:hAnsi="Segoe UI Symbol" w:cs="Segoe UI Symbol"/>
+          </w:rPr>
+          <w:id w:val="1086198916"/>
+          <w14:checkbox>
+            <w14:checked w14:val="0"/>
+            <w14:checkedState w14:val="2612" w14:font="MS Gothic"/>
+            <w14:uncheckedState w14:val="2610" w14:font="MS Gothic"/>
+          </w14:checkbox>
+        </w:sdtPr>
+        <w:sdtContent>
+          <w:r>
+            <w:rPr>
+              <w:rFonts w:ascii="MS Gothic" w:eastAsia="MS Gothic" w:hAnsi="MS Gothic" w:cs="Segoe UI Symbol" w:hint="eastAsia"/>
+            </w:rPr>
+            <w:t>☐</w:t>
+          </w:r>
+        </w:sdtContent>
+      </w:sdt>
+      <w:r>
+        <w:rPr>
+          <w:rFonts w:ascii="Arial" w:hAnsi="Arial" w:cs="Arial"/>
+        </w:rPr>
+        <w:t xml:space="preserve"> Usato solo per capire</w:t>
+      </w:r>
+      <w:r>
+        <w:rPr>
+          <w:rFonts w:ascii="Arial" w:hAnsi="Arial" w:cs="Arial"/>
+        </w:rPr>
+        <w:br/>
+      </w:r>
+      <w:sdt>
+        <w:sdtPr>
+          <w:rPr>
+            <w:rFonts w:ascii="Segoe UI Symbol" w:hAnsi="Segoe UI Symbol" w:cs="Segoe UI Symbol"/>
+          </w:rPr>
+          <w:id w:val="1554810703"/>
+          <w14:checkbox>
+            <w14:checked w14:val="0"/>
+            <w14:checkedState w14:val="2612" w14:font="MS Gothic"/>
+            <w14:uncheckedState w14:val="2610" w14:font="MS Gothic"/>
+          </w14:checkbox>
+        </w:sdtPr>
+        <w:sdtContent>
+          <w:r>
+            <w:rPr>
+              <w:rFonts w:ascii="MS Gothic" w:eastAsia="MS Gothic" w:hAnsi="MS Gothic" w:cs="Segoe UI Symbol" w:hint="eastAsia"/>
+            </w:rPr>
+            <w:t>☐</w:t>
+          </w:r>
+        </w:sdtContent>
+      </w:sdt>
+      <w:r>
+        <w:rPr>
+          <w:rFonts w:ascii="Arial" w:hAnsi="Arial" w:cs="Arial"/>
+        </w:rPr>
+        <w:t xml:space="preserve"> Scartato</w:t>
+      </w:r>
+    </w:p>
+    <w:p>
+      <w:pPr>
+        <w:pStyle w:val="Nessunaspaziatura"/>
+        <w:rPr>
+          <w:rFonts w:ascii="Arial" w:hAnsi="Arial" w:cs="Arial"/>
+        </w:rPr>
+      </w:pPr>
+    </w:p>
+    <w:p>
+      <w:pPr>
+        <w:pStyle w:val="Nessunaspaziatura"/>
+        <w:rPr>
+          <w:rFonts w:ascii="Arial" w:hAnsi="Arial" w:cs="Arial"/>
+        </w:rPr>
+      </w:pPr>
+    </w:p>
+    <w:p>
+      <w:pPr>
+        <w:pStyle w:val="Nessunaspaziatura"/>
+        <w:rPr>
+          <w:rFonts w:ascii="Arial" w:hAnsi="Arial" w:cs="Arial"/>
+        </w:rPr>
+      </w:pPr>
+      <w:r>
+        <w:rPr>
+          <w:rFonts w:ascii="Arial" w:hAnsi="Arial" w:cs="Arial"/>
+          <w:b/>
+          <w:bCs/>
+        </w:rPr>
+        <w:t>Cosa avrei fatto senza AI?</w:t>
+      </w:r>
+    </w:p>
+    <w:p>
+      <w:pPr>
+        <w:pStyle w:val="Nessunaspaziatura"/>
+        <w:rPr>
+          <w:rFonts w:ascii="Arial" w:hAnsi="Arial" w:cs="Arial"/>
+        </w:rPr>
+      </w:pPr>
+      <w:r>
+        <w:rPr>
+          <w:rFonts w:ascii="Arial" w:hAnsi="Arial" w:cs="Arial"/>
+        </w:rPr>
+        <w:t>Riley: Avrei probabilmente cercato di comprendere il codice e chiesto a Bryan il funzionamento per potermi adattare</w:t>
       </w:r>
     </w:p>
     <w:p>
@@ -25167,8 +28294,17 @@
         <w:rFonts w:ascii="Arial" w:hAnsi="Arial" w:cs="Arial"/>
         <w:lang w:val="fr-CH"/>
       </w:rPr>
-      <w:t>Riley Bianchi &amp; Bryan Ciaponi</w:t>
+      <w:t xml:space="preserve">Riley Bianchi &amp; Bryan </w:t>
     </w:r>
+    <w:proofErr w:type="spellStart"/>
+    <w:r>
+      <w:rPr>
+        <w:rFonts w:ascii="Arial" w:hAnsi="Arial" w:cs="Arial"/>
+        <w:lang w:val="fr-CH"/>
+      </w:rPr>
+      <w:t>Ciaponi</w:t>
+    </w:r>
+    <w:proofErr w:type="spellEnd"/>
   </w:p>
 </w:hdr>
 </file>
@@ -30301,6 +33437,107 @@
         </w:p>
       </w:docPartBody>
     </w:docPart>
+    <w:docPart>
+      <w:docPartPr>
+        <w:name w:val="35B617DD762B4041834F0FB6C1C56E03"/>
+        <w:category>
+          <w:name w:val="Generale"/>
+          <w:gallery w:val="placeholder"/>
+        </w:category>
+        <w:types>
+          <w:type w:val="bbPlcHdr"/>
+        </w:types>
+        <w:behaviors>
+          <w:behavior w:val="content"/>
+        </w:behaviors>
+        <w:guid w:val="{5F5AB549-A18D-4431-97B1-BE52EAAC8712}"/>
+      </w:docPartPr>
+      <w:docPartBody>
+        <w:p>
+          <w:pPr>
+            <w:pStyle w:val="35B617DD762B4041834F0FB6C1C56E03"/>
+          </w:pPr>
+          <w:r>
+            <w:rPr>
+              <w:rStyle w:val="Testosegnaposto"/>
+              <w:b/>
+              <w:bCs/>
+            </w:rPr>
+            <w:t>Nomi AI utilizzati</w:t>
+          </w:r>
+        </w:p>
+      </w:docPartBody>
+    </w:docPart>
+    <w:docPart>
+      <w:docPartPr>
+        <w:name w:val="1A2D4B29C07942DBB144E0C18B7A5505"/>
+        <w:category>
+          <w:name w:val="Generale"/>
+          <w:gallery w:val="placeholder"/>
+        </w:category>
+        <w:types>
+          <w:type w:val="bbPlcHdr"/>
+        </w:types>
+        <w:behaviors>
+          <w:behavior w:val="content"/>
+        </w:behaviors>
+        <w:guid w:val="{992A3554-0FC5-4B44-A293-22214A5A3C97}"/>
+      </w:docPartPr>
+      <w:docPartBody>
+        <w:p>
+          <w:pPr>
+            <w:pStyle w:val="1A2D4B29C07942DBB144E0C18B7A5505"/>
+          </w:pPr>
+          <w:r>
+            <w:rPr>
+              <w:rStyle w:val="Testosegnaposto"/>
+            </w:rPr>
+            <w:t>Fare clic o toccare qui per immettere il testo.</w:t>
+          </w:r>
+        </w:p>
+      </w:docPartBody>
+    </w:docPart>
+    <w:docPart>
+      <w:docPartPr>
+        <w:name w:val="3904DA71E4554269B7BAF466427E6984"/>
+        <w:category>
+          <w:name w:val="Generale"/>
+          <w:gallery w:val="placeholder"/>
+        </w:category>
+        <w:types>
+          <w:type w:val="bbPlcHdr"/>
+        </w:types>
+        <w:behaviors>
+          <w:behavior w:val="content"/>
+        </w:behaviors>
+        <w:guid w:val="{515FE542-4AED-4B6B-9EC3-9890A42FE71D}"/>
+      </w:docPartPr>
+      <w:docPartBody>
+        <w:p>
+          <w:pPr>
+            <w:pStyle w:val="3904DA71E4554269B7BAF466427E6984"/>
+          </w:pPr>
+          <w:r>
+            <w:rPr>
+              <w:rStyle w:val="Testosegnaposto"/>
+            </w:rPr>
+            <w:t xml:space="preserve">Fare clic o toccare qui per </w:t>
+          </w:r>
+          <w:r>
+            <w:rPr>
+              <w:rStyle w:val="Testosegnaposto"/>
+            </w:rPr>
+            <w:t>immettere</w:t>
+          </w:r>
+          <w:r>
+            <w:rPr>
+              <w:rStyle w:val="Testosegnaposto"/>
+            </w:rPr>
+            <w:t xml:space="preserve"> il testo.</w:t>
+          </w:r>
+        </w:p>
+      </w:docPartBody>
+    </w:docPart>
   </w:docParts>
 </w:glossaryDocument>
 </file>
@@ -30434,10 +33671,12 @@
     <w:rsid w:val="00037477"/>
     <w:rsid w:val="00040D54"/>
     <w:rsid w:val="00045F3C"/>
+    <w:rsid w:val="00080FDE"/>
     <w:rsid w:val="00083E28"/>
     <w:rsid w:val="000B54FB"/>
     <w:rsid w:val="000D07AC"/>
     <w:rsid w:val="000E7E2F"/>
+    <w:rsid w:val="00150838"/>
     <w:rsid w:val="001A3B5C"/>
     <w:rsid w:val="001C42CE"/>
     <w:rsid w:val="00254718"/>
@@ -30463,6 +33702,7 @@
     <w:rsid w:val="00754A35"/>
     <w:rsid w:val="00786637"/>
     <w:rsid w:val="007B0D32"/>
+    <w:rsid w:val="007E6540"/>
     <w:rsid w:val="007F4556"/>
     <w:rsid w:val="007F539F"/>
     <w:rsid w:val="0080736A"/>
@@ -30968,7 +34208,7 @@
     <w:basedOn w:val="Carpredefinitoparagrafo"/>
     <w:uiPriority w:val="99"/>
     <w:semiHidden/>
-    <w:rsid w:val="000E7E2F"/>
+    <w:rsid w:val="00080FDE"/>
     <w:rPr>
       <w:color w:val="666666"/>
     </w:rPr>
@@ -31221,6 +34461,18 @@
   <w:style w:type="paragraph" w:customStyle="1" w:styleId="9CEFF2656A304FD4A2654EE3A2CDC5A8">
     <w:name w:val="9CEFF2656A304FD4A2654EE3A2CDC5A8"/>
     <w:rsid w:val="000E7E2F"/>
+  </w:style>
+  <w:style w:type="paragraph" w:customStyle="1" w:styleId="35B617DD762B4041834F0FB6C1C56E03">
+    <w:name w:val="35B617DD762B4041834F0FB6C1C56E03"/>
+    <w:rsid w:val="00080FDE"/>
+  </w:style>
+  <w:style w:type="paragraph" w:customStyle="1" w:styleId="1A2D4B29C07942DBB144E0C18B7A5505">
+    <w:name w:val="1A2D4B29C07942DBB144E0C18B7A5505"/>
+    <w:rsid w:val="00080FDE"/>
+  </w:style>
+  <w:style w:type="paragraph" w:customStyle="1" w:styleId="3904DA71E4554269B7BAF466427E6984">
+    <w:name w:val="3904DA71E4554269B7BAF466427E6984"/>
+    <w:rsid w:val="00080FDE"/>
   </w:style>
 </w:styles>
 </file>

</xml_diff>

<commit_message>
inizio sviluppo tabella auto (extra) e diario
</commit_message>
<xml_diff>
--- a/4_Diari/Diario.docx
+++ b/4_Diari/Diario.docx
@@ -193,21 +193,7 @@
               <w:rPr>
                 <w:rFonts w:ascii="Arial" w:hAnsi="Arial" w:cs="Arial"/>
               </w:rPr>
-              <w:t xml:space="preserve">Riflettuto sui requisiti e user story del gioco, creato i primi template per </w:t>
-            </w:r>
-            <w:proofErr w:type="spellStart"/>
-            <w:r>
-              <w:rPr>
-                <w:rFonts w:ascii="Arial" w:hAnsi="Arial" w:cs="Arial"/>
-              </w:rPr>
-              <w:t>gantt</w:t>
-            </w:r>
-            <w:proofErr w:type="spellEnd"/>
-            <w:r>
-              <w:rPr>
-                <w:rFonts w:ascii="Arial" w:hAnsi="Arial" w:cs="Arial"/>
-              </w:rPr>
-              <w:t xml:space="preserve"> e diario</w:t>
+              <w:t>Riflettuto sui requisiti e user story del gioco, creato i primi template per gantt e diario</w:t>
             </w:r>
           </w:p>
         </w:tc>
@@ -248,21 +234,7 @@
               <w:rPr>
                 <w:rFonts w:ascii="Arial" w:hAnsi="Arial" w:cs="Arial"/>
               </w:rPr>
-              <w:t xml:space="preserve">Riflettuto sui requisiti e user story del gioco, iniziato scrittura documentazione e sincronizzazione progetto a </w:t>
-            </w:r>
-            <w:proofErr w:type="spellStart"/>
-            <w:r>
-              <w:rPr>
-                <w:rFonts w:ascii="Arial" w:hAnsi="Arial" w:cs="Arial"/>
-              </w:rPr>
-              <w:t>GitLab</w:t>
-            </w:r>
-            <w:proofErr w:type="spellEnd"/>
-            <w:r>
-              <w:rPr>
-                <w:rFonts w:ascii="Arial" w:hAnsi="Arial" w:cs="Arial"/>
-              </w:rPr>
-              <w:t>.</w:t>
+              <w:t>Riflettuto sui requisiti e user story del gioco, iniziato scrittura documentazione e sincronizzazione progetto a GitLab.</w:t>
             </w:r>
           </w:p>
         </w:tc>
@@ -703,25 +675,7 @@
               <w:b/>
               <w:bCs/>
             </w:rPr>
-            <w:t xml:space="preserve">Nomi </w:t>
-          </w:r>
-          <w:proofErr w:type="gramStart"/>
-          <w:r>
-            <w:rPr>
-              <w:rStyle w:val="Testosegnaposto"/>
-              <w:b/>
-              <w:bCs/>
-            </w:rPr>
-            <w:t>AI</w:t>
-          </w:r>
-          <w:proofErr w:type="gramEnd"/>
-          <w:r>
-            <w:rPr>
-              <w:rStyle w:val="Testosegnaposto"/>
-              <w:b/>
-              <w:bCs/>
-            </w:rPr>
-            <w:t xml:space="preserve"> utilizzati</w:t>
+            <w:t>Nomi AI utilizzati</w:t>
           </w:r>
         </w:sdtContent>
       </w:sdt>
@@ -1802,21 +1756,7 @@
               <w:rPr>
                 <w:rFonts w:ascii="Arial" w:hAnsi="Arial" w:cs="Arial"/>
               </w:rPr>
-              <w:t xml:space="preserve">Iniziare e completare analisi dei mezzi, creare </w:t>
-            </w:r>
-            <w:proofErr w:type="gramStart"/>
-            <w:r>
-              <w:rPr>
-                <w:rFonts w:ascii="Arial" w:hAnsi="Arial" w:cs="Arial"/>
-              </w:rPr>
-              <w:t>lo use</w:t>
-            </w:r>
-            <w:proofErr w:type="gramEnd"/>
-            <w:r>
-              <w:rPr>
-                <w:rFonts w:ascii="Arial" w:hAnsi="Arial" w:cs="Arial"/>
-              </w:rPr>
-              <w:t xml:space="preserve"> case</w:t>
+              <w:t>Iniziare e completare analisi dei mezzi, creare lo use case</w:t>
             </w:r>
             <w:r>
               <w:rPr>
@@ -2294,21 +2234,7 @@
             <w:rPr>
               <w:rFonts w:ascii="Arial" w:hAnsi="Arial" w:cs="Arial"/>
             </w:rPr>
-            <w:t xml:space="preserve">Aitami a generare dei </w:t>
-          </w:r>
-          <w:proofErr w:type="spellStart"/>
-          <w:r>
-            <w:rPr>
-              <w:rFonts w:ascii="Arial" w:hAnsi="Arial" w:cs="Arial"/>
-            </w:rPr>
-            <w:t>requesiti</w:t>
-          </w:r>
-          <w:proofErr w:type="spellEnd"/>
-          <w:r>
-            <w:rPr>
-              <w:rFonts w:ascii="Arial" w:hAnsi="Arial" w:cs="Arial"/>
-            </w:rPr>
-            <w:t xml:space="preserve"> in base ai seguenti dati</w:t>
+            <w:t>Aitami a generare dei requesiti in base ai seguenti dati</w:t>
           </w:r>
         </w:p>
       </w:sdtContent>
@@ -2848,21 +2774,7 @@
               <w:rPr>
                 <w:rFonts w:ascii="Arial" w:hAnsi="Arial" w:cs="Arial"/>
               </w:rPr>
-              <w:t xml:space="preserve">Completata la analisi del dominio nella documentazione, inizio ricerche riguardo </w:t>
-            </w:r>
-            <w:proofErr w:type="spellStart"/>
-            <w:r>
-              <w:rPr>
-                <w:rFonts w:ascii="Arial" w:hAnsi="Arial" w:cs="Arial"/>
-              </w:rPr>
-              <w:t>Unity</w:t>
-            </w:r>
-            <w:proofErr w:type="spellEnd"/>
-            <w:r>
-              <w:rPr>
-                <w:rFonts w:ascii="Arial" w:hAnsi="Arial" w:cs="Arial"/>
-              </w:rPr>
-              <w:t>.</w:t>
+              <w:t>Completata la analisi del dominio nella documentazione, inizio ricerche riguardo Unity.</w:t>
             </w:r>
           </w:p>
         </w:tc>
@@ -3037,21 +2949,7 @@
               <w:rPr>
                 <w:rFonts w:ascii="Arial" w:hAnsi="Arial" w:cs="Arial"/>
               </w:rPr>
-              <w:t xml:space="preserve">Il diagramma ER non è completo e </w:t>
-            </w:r>
-            <w:proofErr w:type="gramStart"/>
-            <w:r>
-              <w:rPr>
-                <w:rFonts w:ascii="Arial" w:hAnsi="Arial" w:cs="Arial"/>
-              </w:rPr>
-              <w:t>lo use</w:t>
-            </w:r>
-            <w:proofErr w:type="gramEnd"/>
-            <w:r>
-              <w:rPr>
-                <w:rFonts w:ascii="Arial" w:hAnsi="Arial" w:cs="Arial"/>
-              </w:rPr>
-              <w:t xml:space="preserve"> case non è stato iniziato, analisi dei mezzi non ancora completata.</w:t>
+              <w:t>Il diagramma ER non è completo e lo use case non è stato iniziato, analisi dei mezzi non ancora completata.</w:t>
             </w:r>
           </w:p>
         </w:tc>
@@ -4083,16 +3981,8 @@
               <w:rPr>
                 <w:rFonts w:ascii="Arial" w:hAnsi="Arial" w:cs="Arial"/>
               </w:rPr>
-              <w:t xml:space="preserve">Creato diagramma ER e modifiche strutturali </w:t>
-            </w:r>
-            <w:proofErr w:type="spellStart"/>
-            <w:r>
-              <w:rPr>
-                <w:rFonts w:ascii="Arial" w:hAnsi="Arial" w:cs="Arial"/>
-              </w:rPr>
-              <w:t>gantt</w:t>
-            </w:r>
-            <w:proofErr w:type="spellEnd"/>
+              <w:t>Creato diagramma ER e modifiche strutturali gantt</w:t>
+            </w:r>
           </w:p>
         </w:tc>
       </w:tr>
@@ -4840,42 +4730,20 @@
             <w:rPr>
               <w:rFonts w:ascii="Arial" w:hAnsi="Arial" w:cs="Arial"/>
             </w:rPr>
-            <w:t xml:space="preserve">uoi dirmi delle classiche impostazioni per un gioco di guida in stile </w:t>
-          </w:r>
-          <w:proofErr w:type="spellStart"/>
+            <w:t>uoi dirmi delle classiche impostazioni per un gioco di guida in stile br</w:t>
+          </w:r>
           <w:r>
             <w:rPr>
               <w:rFonts w:ascii="Arial" w:hAnsi="Arial" w:cs="Arial"/>
             </w:rPr>
-            <w:t>br</w:t>
-          </w:r>
-          <w:proofErr w:type="spellEnd"/>
+            <w:t xml:space="preserve">. </w:t>
+          </w:r>
           <w:r>
             <w:rPr>
               <w:rFonts w:ascii="Arial" w:hAnsi="Arial" w:cs="Arial"/>
             </w:rPr>
-            <w:t xml:space="preserve">. </w:t>
-          </w:r>
-          <w:r>
-            <w:rPr>
-              <w:rFonts w:ascii="Arial" w:hAnsi="Arial" w:cs="Arial"/>
-            </w:rPr>
             <w:br/>
-            <w:t xml:space="preserve">Bryan: Spiegami </w:t>
-          </w:r>
-          <w:proofErr w:type="spellStart"/>
-          <w:r>
-            <w:rPr>
-              <w:rFonts w:ascii="Arial" w:hAnsi="Arial" w:cs="Arial"/>
-            </w:rPr>
-            <w:t>Unity</w:t>
-          </w:r>
-          <w:proofErr w:type="spellEnd"/>
-          <w:r>
-            <w:rPr>
-              <w:rFonts w:ascii="Arial" w:hAnsi="Arial" w:cs="Arial"/>
-            </w:rPr>
-            <w:t xml:space="preserve"> ed i suoi vantaggi.</w:t>
+            <w:t>Bryan: Spiegami Unity ed i suoi vantaggi.</w:t>
           </w:r>
         </w:p>
       </w:sdtContent>
@@ -5353,16 +5221,8 @@
               <w:rPr>
                 <w:rFonts w:ascii="Arial" w:hAnsi="Arial" w:cs="Arial"/>
               </w:rPr>
-              <w:t xml:space="preserve">Creato Diagramma ER e aggiornato </w:t>
-            </w:r>
-            <w:proofErr w:type="spellStart"/>
-            <w:r>
-              <w:rPr>
-                <w:rFonts w:ascii="Arial" w:hAnsi="Arial" w:cs="Arial"/>
-              </w:rPr>
-              <w:t>gannt</w:t>
-            </w:r>
-            <w:proofErr w:type="spellEnd"/>
+              <w:t>Creato Diagramma ER e aggiornato gannt</w:t>
+            </w:r>
           </w:p>
         </w:tc>
       </w:tr>
@@ -5399,21 +5259,7 @@
               <w:rPr>
                 <w:rFonts w:ascii="Arial" w:hAnsi="Arial" w:cs="Arial"/>
               </w:rPr>
-              <w:t xml:space="preserve">Use Case finito, Inizio creazione e documentazione </w:t>
-            </w:r>
-            <w:proofErr w:type="spellStart"/>
-            <w:r>
-              <w:rPr>
-                <w:rFonts w:ascii="Arial" w:hAnsi="Arial" w:cs="Arial"/>
-              </w:rPr>
-              <w:t>mockup</w:t>
-            </w:r>
-            <w:proofErr w:type="spellEnd"/>
-            <w:r>
-              <w:rPr>
-                <w:rFonts w:ascii="Arial" w:hAnsi="Arial" w:cs="Arial"/>
-              </w:rPr>
-              <w:t xml:space="preserve"> UI.</w:t>
+              <w:t>Use Case finito, Inizio creazione e documentazione mockup UI.</w:t>
             </w:r>
           </w:p>
         </w:tc>
@@ -5530,21 +5376,7 @@
               <w:rPr>
                 <w:rFonts w:ascii="Arial" w:hAnsi="Arial" w:cs="Arial"/>
               </w:rPr>
-              <w:t xml:space="preserve">Riuscire a definire le azioni degli attori </w:t>
-            </w:r>
-            <w:proofErr w:type="gramStart"/>
-            <w:r>
-              <w:rPr>
-                <w:rFonts w:ascii="Arial" w:hAnsi="Arial" w:cs="Arial"/>
-              </w:rPr>
-              <w:t>nel Use</w:t>
-            </w:r>
-            <w:proofErr w:type="gramEnd"/>
-            <w:r>
-              <w:rPr>
-                <w:rFonts w:ascii="Arial" w:hAnsi="Arial" w:cs="Arial"/>
-              </w:rPr>
-              <w:t xml:space="preserve"> Case, risolto approfondendo meglio.</w:t>
+              <w:t>Riuscire a definire le azioni degli attori nel Use Case, risolto approfondendo meglio.</w:t>
             </w:r>
           </w:p>
         </w:tc>
@@ -5673,21 +5505,7 @@
               <w:rPr>
                 <w:rFonts w:ascii="Arial" w:hAnsi="Arial" w:cs="Arial"/>
               </w:rPr>
-              <w:t xml:space="preserve">Continuo creazione </w:t>
-            </w:r>
-            <w:proofErr w:type="spellStart"/>
-            <w:r>
-              <w:rPr>
-                <w:rFonts w:ascii="Arial" w:hAnsi="Arial" w:cs="Arial"/>
-              </w:rPr>
-              <w:t>Mockup</w:t>
-            </w:r>
-            <w:proofErr w:type="spellEnd"/>
-            <w:r>
-              <w:rPr>
-                <w:rFonts w:ascii="Arial" w:hAnsi="Arial" w:cs="Arial"/>
-              </w:rPr>
-              <w:t xml:space="preserve"> UI.</w:t>
+              <w:t>Continuo creazione Mockup UI.</w:t>
             </w:r>
           </w:p>
         </w:tc>
@@ -6258,30 +6076,8 @@
               <w:rFonts w:ascii="Arial" w:hAnsi="Arial" w:cs="Arial"/>
             </w:rPr>
             <w:br/>
-            <w:t xml:space="preserve">Bryan: Correzioni </w:t>
-          </w:r>
-          <w:proofErr w:type="gramStart"/>
-          <w:r>
-            <w:rPr>
-              <w:rFonts w:ascii="Arial" w:hAnsi="Arial" w:cs="Arial"/>
-            </w:rPr>
-            <w:t>dello use</w:t>
-          </w:r>
-          <w:proofErr w:type="gramEnd"/>
-          <w:r>
-            <w:rPr>
-              <w:rFonts w:ascii="Arial" w:hAnsi="Arial" w:cs="Arial"/>
-            </w:rPr>
-            <w:t xml:space="preserve"> case generato dal </w:t>
-          </w:r>
-          <w:proofErr w:type="spellStart"/>
-          <w:r>
-            <w:rPr>
-              <w:rFonts w:ascii="Arial" w:hAnsi="Arial" w:cs="Arial"/>
-            </w:rPr>
-            <w:t>colega</w:t>
-          </w:r>
-          <w:proofErr w:type="spellEnd"/>
+            <w:t>Bryan: Correzioni dello use case generato dal colega</w:t>
+          </w:r>
         </w:p>
       </w:sdtContent>
     </w:sdt>
@@ -6681,16 +6477,8 @@
               <w:rPr>
                 <w:rFonts w:ascii="Arial" w:hAnsi="Arial" w:cs="Arial"/>
               </w:rPr>
-              <w:t xml:space="preserve">Completata progettazione e creazione progetto </w:t>
-            </w:r>
-            <w:proofErr w:type="spellStart"/>
-            <w:r>
-              <w:rPr>
-                <w:rFonts w:ascii="Arial" w:hAnsi="Arial" w:cs="Arial"/>
-              </w:rPr>
-              <w:t>unity</w:t>
-            </w:r>
-            <w:proofErr w:type="spellEnd"/>
+              <w:t>Completata progettazione e creazione progetto unity</w:t>
+            </w:r>
           </w:p>
         </w:tc>
       </w:tr>
@@ -6727,16 +6515,8 @@
               <w:rPr>
                 <w:rFonts w:ascii="Arial" w:hAnsi="Arial" w:cs="Arial"/>
               </w:rPr>
-              <w:t xml:space="preserve">Fine </w:t>
-            </w:r>
-            <w:proofErr w:type="spellStart"/>
-            <w:r>
-              <w:rPr>
-                <w:rFonts w:ascii="Arial" w:hAnsi="Arial" w:cs="Arial"/>
-              </w:rPr>
-              <w:t>Mockup</w:t>
-            </w:r>
-            <w:proofErr w:type="spellEnd"/>
+              <w:t>Fine Mockup</w:t>
+            </w:r>
           </w:p>
         </w:tc>
       </w:tr>
@@ -6814,52 +6594,8 @@
               <w:rPr>
                 <w:rFonts w:ascii="Arial" w:hAnsi="Arial" w:cs="Arial"/>
               </w:rPr>
-              <w:t xml:space="preserve">Problemi nel </w:t>
-            </w:r>
-            <w:proofErr w:type="spellStart"/>
-            <w:r>
-              <w:rPr>
-                <w:rFonts w:ascii="Arial" w:hAnsi="Arial" w:cs="Arial"/>
-              </w:rPr>
-              <w:t>pushare</w:t>
-            </w:r>
-            <w:proofErr w:type="spellEnd"/>
-            <w:r>
-              <w:rPr>
-                <w:rFonts w:ascii="Arial" w:hAnsi="Arial" w:cs="Arial"/>
-              </w:rPr>
-              <w:t xml:space="preserve"> il progetto </w:t>
-            </w:r>
-            <w:proofErr w:type="spellStart"/>
-            <w:r>
-              <w:rPr>
-                <w:rFonts w:ascii="Arial" w:hAnsi="Arial" w:cs="Arial"/>
-              </w:rPr>
-              <w:t>uinity</w:t>
-            </w:r>
-            <w:proofErr w:type="spellEnd"/>
-            <w:r>
-              <w:rPr>
-                <w:rFonts w:ascii="Arial" w:hAnsi="Arial" w:cs="Arial"/>
-              </w:rPr>
-              <w:t xml:space="preserve">, risolto grazie alla creazione di un </w:t>
-            </w:r>
-            <w:proofErr w:type="gramStart"/>
-            <w:r>
-              <w:rPr>
-                <w:rFonts w:ascii="Arial" w:hAnsi="Arial" w:cs="Arial"/>
-              </w:rPr>
-              <w:t>file .</w:t>
-            </w:r>
-            <w:proofErr w:type="spellStart"/>
-            <w:r>
-              <w:rPr>
-                <w:rFonts w:ascii="Arial" w:hAnsi="Arial" w:cs="Arial"/>
-              </w:rPr>
-              <w:t>gitignore</w:t>
-            </w:r>
-            <w:proofErr w:type="spellEnd"/>
-            <w:proofErr w:type="gramEnd"/>
+              <w:t>Problemi nel pushare il progetto uinity, risolto grazie alla creazione di un file .gitignore</w:t>
+            </w:r>
           </w:p>
         </w:tc>
       </w:tr>
@@ -7012,35 +6748,7 @@
               <w:rPr>
                 <w:rFonts w:ascii="Arial" w:hAnsi="Arial" w:cs="Arial"/>
               </w:rPr>
-              <w:t xml:space="preserve">Ambientarsi nel game </w:t>
-            </w:r>
-            <w:proofErr w:type="spellStart"/>
-            <w:r>
-              <w:rPr>
-                <w:rFonts w:ascii="Arial" w:hAnsi="Arial" w:cs="Arial"/>
-              </w:rPr>
-              <w:t>engine</w:t>
-            </w:r>
-            <w:proofErr w:type="spellEnd"/>
-            <w:r>
-              <w:rPr>
-                <w:rFonts w:ascii="Arial" w:hAnsi="Arial" w:cs="Arial"/>
-              </w:rPr>
-              <w:t xml:space="preserve"> di </w:t>
-            </w:r>
-            <w:proofErr w:type="spellStart"/>
-            <w:r>
-              <w:rPr>
-                <w:rFonts w:ascii="Arial" w:hAnsi="Arial" w:cs="Arial"/>
-              </w:rPr>
-              <w:t>unity</w:t>
-            </w:r>
-            <w:proofErr w:type="spellEnd"/>
-            <w:r>
-              <w:rPr>
-                <w:rFonts w:ascii="Arial" w:hAnsi="Arial" w:cs="Arial"/>
-              </w:rPr>
-              <w:t xml:space="preserve"> e quindi cominciare a creare la schermata di statistiche</w:t>
+              <w:t>Ambientarsi nel game engine di unity e quindi cominciare a creare la schermata di statistiche</w:t>
             </w:r>
           </w:p>
         </w:tc>
@@ -7512,21 +7220,7 @@
             <w:rPr>
               <w:rFonts w:ascii="Arial" w:hAnsi="Arial" w:cs="Arial"/>
             </w:rPr>
-            <w:t xml:space="preserve">Bryan: Generami un’immagine di </w:t>
-          </w:r>
-          <w:proofErr w:type="spellStart"/>
-          <w:r>
-            <w:rPr>
-              <w:rFonts w:ascii="Arial" w:hAnsi="Arial" w:cs="Arial"/>
-            </w:rPr>
-            <w:t>mockup</w:t>
-          </w:r>
-          <w:proofErr w:type="spellEnd"/>
-          <w:r>
-            <w:rPr>
-              <w:rFonts w:ascii="Arial" w:hAnsi="Arial" w:cs="Arial"/>
-            </w:rPr>
-            <w:t xml:space="preserve"> basandoti sul seguente stile: “stile”</w:t>
+            <w:t>Bryan: Generami un’immagine di mockup basandoti sul seguente stile: “stile”</w:t>
           </w:r>
         </w:p>
         <w:p>
@@ -7840,58 +7534,14 @@
         <w:rPr>
           <w:rFonts w:ascii="Arial" w:hAnsi="Arial" w:cs="Arial"/>
         </w:rPr>
-        <w:t xml:space="preserve">Riley: probabilmente non sarei riuscito a risolvere questo problema non avendo un’esperienza molto avanzata con i </w:t>
-      </w:r>
-      <w:proofErr w:type="gramStart"/>
-      <w:r>
-        <w:rPr>
-          <w:rFonts w:ascii="Arial" w:hAnsi="Arial" w:cs="Arial"/>
-        </w:rPr>
-        <w:t>file .</w:t>
-      </w:r>
-      <w:proofErr w:type="spellStart"/>
-      <w:r>
-        <w:rPr>
-          <w:rFonts w:ascii="Arial" w:hAnsi="Arial" w:cs="Arial"/>
-        </w:rPr>
-        <w:t>gitignore</w:t>
-      </w:r>
-      <w:proofErr w:type="spellEnd"/>
-      <w:proofErr w:type="gramEnd"/>
+        <w:t>Riley: probabilmente non sarei riuscito a risolvere questo problema non avendo un’esperienza molto avanzata con i file .gitignore</w:t>
+      </w:r>
       <w:r>
         <w:rPr>
           <w:rFonts w:ascii="Arial" w:hAnsi="Arial" w:cs="Arial"/>
         </w:rPr>
         <w:br/>
-        <w:t xml:space="preserve">Bryan: Averi creato un’immagine su </w:t>
-      </w:r>
-      <w:proofErr w:type="spellStart"/>
-      <w:r>
-        <w:rPr>
-          <w:rFonts w:ascii="Arial" w:hAnsi="Arial" w:cs="Arial"/>
-        </w:rPr>
-        <w:t>paint</w:t>
-      </w:r>
-      <w:proofErr w:type="spellEnd"/>
-      <w:r>
-        <w:rPr>
-          <w:rFonts w:ascii="Arial" w:hAnsi="Arial" w:cs="Arial"/>
-        </w:rPr>
-        <w:t xml:space="preserve"> che avrebbe reso i </w:t>
-      </w:r>
-      <w:proofErr w:type="spellStart"/>
-      <w:r>
-        <w:rPr>
-          <w:rFonts w:ascii="Arial" w:hAnsi="Arial" w:cs="Arial"/>
-        </w:rPr>
-        <w:t>mockup</w:t>
-      </w:r>
-      <w:proofErr w:type="spellEnd"/>
-      <w:r>
-        <w:rPr>
-          <w:rFonts w:ascii="Arial" w:hAnsi="Arial" w:cs="Arial"/>
-        </w:rPr>
-        <w:t xml:space="preserve"> molto più confusi.</w:t>
+        <w:t>Bryan: Averi creato un’immagine su paint che avrebbe reso i mockup molto più confusi.</w:t>
       </w:r>
     </w:p>
     <w:p>
@@ -8077,21 +7727,7 @@
               <w:rPr>
                 <w:rFonts w:ascii="Arial" w:hAnsi="Arial" w:cs="Arial"/>
               </w:rPr>
-              <w:t xml:space="preserve">Inizio sviluppo </w:t>
-            </w:r>
-            <w:proofErr w:type="spellStart"/>
-            <w:r>
-              <w:rPr>
-                <w:rFonts w:ascii="Arial" w:hAnsi="Arial" w:cs="Arial"/>
-              </w:rPr>
-              <w:t>ui</w:t>
-            </w:r>
-            <w:proofErr w:type="spellEnd"/>
-            <w:r>
-              <w:rPr>
-                <w:rFonts w:ascii="Arial" w:hAnsi="Arial" w:cs="Arial"/>
-              </w:rPr>
-              <w:t xml:space="preserve"> statistiche</w:t>
+              <w:t>Inizio sviluppo ui statistiche</w:t>
             </w:r>
           </w:p>
         </w:tc>
@@ -8129,21 +7765,7 @@
               <w:rPr>
                 <w:rFonts w:ascii="Arial" w:hAnsi="Arial" w:cs="Arial"/>
               </w:rPr>
-              <w:t xml:space="preserve">Inizio sviluppo </w:t>
-            </w:r>
-            <w:proofErr w:type="spellStart"/>
-            <w:r>
-              <w:rPr>
-                <w:rFonts w:ascii="Arial" w:hAnsi="Arial" w:cs="Arial"/>
-              </w:rPr>
-              <w:t>ui</w:t>
-            </w:r>
-            <w:proofErr w:type="spellEnd"/>
-            <w:r>
-              <w:rPr>
-                <w:rFonts w:ascii="Arial" w:hAnsi="Arial" w:cs="Arial"/>
-              </w:rPr>
-              <w:t xml:space="preserve"> statistiche</w:t>
+              <w:t>Inizio sviluppo ui statistiche</w:t>
             </w:r>
           </w:p>
         </w:tc>
@@ -8376,21 +7998,7 @@
               <w:rPr>
                 <w:rFonts w:ascii="Arial" w:hAnsi="Arial" w:cs="Arial"/>
               </w:rPr>
-              <w:t xml:space="preserve">Completare la </w:t>
-            </w:r>
-            <w:proofErr w:type="spellStart"/>
-            <w:r>
-              <w:rPr>
-                <w:rFonts w:ascii="Arial" w:hAnsi="Arial" w:cs="Arial"/>
-              </w:rPr>
-              <w:t>ui</w:t>
-            </w:r>
-            <w:proofErr w:type="spellEnd"/>
-            <w:r>
-              <w:rPr>
-                <w:rFonts w:ascii="Arial" w:hAnsi="Arial" w:cs="Arial"/>
-              </w:rPr>
-              <w:t xml:space="preserve"> delle statistiche</w:t>
+              <w:t>Completare la ui delle statistiche</w:t>
             </w:r>
           </w:p>
         </w:tc>
@@ -8440,28 +8048,12 @@
                 <w:rFonts w:ascii="Arial" w:hAnsi="Arial" w:cs="Arial"/>
               </w:rPr>
             </w:pPr>
-            <w:proofErr w:type="spellStart"/>
-            <w:r>
-              <w:rPr>
-                <w:rFonts w:ascii="Arial" w:hAnsi="Arial" w:cs="Arial"/>
-              </w:rPr>
-              <w:t>Daily</w:t>
-            </w:r>
-            <w:proofErr w:type="spellEnd"/>
-            <w:r>
-              <w:rPr>
-                <w:rFonts w:ascii="Arial" w:hAnsi="Arial" w:cs="Arial"/>
-              </w:rPr>
-              <w:t xml:space="preserve"> </w:t>
-            </w:r>
-            <w:proofErr w:type="spellStart"/>
-            <w:r>
-              <w:rPr>
-                <w:rFonts w:ascii="Arial" w:hAnsi="Arial" w:cs="Arial"/>
-              </w:rPr>
-              <w:t>Scrum</w:t>
-            </w:r>
-            <w:proofErr w:type="spellEnd"/>
+            <w:r>
+              <w:rPr>
+                <w:rFonts w:ascii="Arial" w:hAnsi="Arial" w:cs="Arial"/>
+              </w:rPr>
+              <w:t>Daily Scrum</w:t>
+            </w:r>
           </w:p>
         </w:tc>
       </w:tr>
@@ -8509,35 +8101,7 @@
               <w:rPr>
                 <w:rFonts w:ascii="Arial" w:hAnsi="Arial" w:cs="Arial"/>
               </w:rPr>
-              <w:t xml:space="preserve">Introduzione ambiente </w:t>
-            </w:r>
-            <w:proofErr w:type="spellStart"/>
-            <w:r>
-              <w:rPr>
-                <w:rFonts w:ascii="Arial" w:hAnsi="Arial" w:cs="Arial"/>
-              </w:rPr>
-              <w:t>unity</w:t>
-            </w:r>
-            <w:proofErr w:type="spellEnd"/>
-            <w:r>
-              <w:rPr>
-                <w:rFonts w:ascii="Arial" w:hAnsi="Arial" w:cs="Arial"/>
-              </w:rPr>
-              <w:t xml:space="preserve"> e inizio </w:t>
-            </w:r>
-            <w:proofErr w:type="spellStart"/>
-            <w:r>
-              <w:rPr>
-                <w:rFonts w:ascii="Arial" w:hAnsi="Arial" w:cs="Arial"/>
-              </w:rPr>
-              <w:t>imostazione</w:t>
-            </w:r>
-            <w:proofErr w:type="spellEnd"/>
-            <w:r>
-              <w:rPr>
-                <w:rFonts w:ascii="Arial" w:hAnsi="Arial" w:cs="Arial"/>
-              </w:rPr>
-              <w:t xml:space="preserve"> layout statistiche</w:t>
+              <w:t>Introduzione ambiente unity e inizio imostazione layout statistiche</w:t>
             </w:r>
           </w:p>
         </w:tc>
@@ -8717,16 +8281,8 @@
               <w:rPr>
                 <w:rFonts w:ascii="Arial" w:hAnsi="Arial" w:cs="Arial"/>
               </w:rPr>
-              <w:t xml:space="preserve">Sprint </w:t>
-            </w:r>
-            <w:proofErr w:type="spellStart"/>
-            <w:r>
-              <w:rPr>
-                <w:rFonts w:ascii="Arial" w:hAnsi="Arial" w:cs="Arial"/>
-              </w:rPr>
-              <w:t>Retrospective</w:t>
-            </w:r>
-            <w:proofErr w:type="spellEnd"/>
+              <w:t>Sprint Retrospective</w:t>
+            </w:r>
           </w:p>
         </w:tc>
       </w:tr>
@@ -9687,44 +9243,8 @@
               <w:rPr>
                 <w:rFonts w:ascii="Arial" w:hAnsi="Arial" w:cs="Arial"/>
               </w:rPr>
-              <w:t xml:space="preserve">Ricerca e sviluppo per salvataggio statistiche su </w:t>
-            </w:r>
-            <w:proofErr w:type="spellStart"/>
-            <w:r>
-              <w:rPr>
-                <w:rFonts w:ascii="Arial" w:hAnsi="Arial" w:cs="Arial"/>
-              </w:rPr>
-              <w:t>json</w:t>
-            </w:r>
-            <w:proofErr w:type="spellEnd"/>
-            <w:r>
-              <w:rPr>
-                <w:rFonts w:ascii="Arial" w:hAnsi="Arial" w:cs="Arial"/>
-              </w:rPr>
-              <w:t xml:space="preserve">, non ancora completo, questo verrà utilizzato come test per verificare il funzionamento delle varie schermate </w:t>
-            </w:r>
-            <w:proofErr w:type="spellStart"/>
-            <w:r>
-              <w:rPr>
-                <w:rFonts w:ascii="Arial" w:hAnsi="Arial" w:cs="Arial"/>
-              </w:rPr>
-              <w:t>ui</w:t>
-            </w:r>
-            <w:proofErr w:type="spellEnd"/>
-            <w:r>
-              <w:rPr>
-                <w:rFonts w:ascii="Arial" w:hAnsi="Arial" w:cs="Arial"/>
-              </w:rPr>
-              <w:t xml:space="preserve"> poi verrà adattato per il </w:t>
-            </w:r>
-            <w:proofErr w:type="spellStart"/>
-            <w:r>
-              <w:rPr>
-                <w:rFonts w:ascii="Arial" w:hAnsi="Arial" w:cs="Arial"/>
-              </w:rPr>
-              <w:t>db</w:t>
-            </w:r>
-            <w:proofErr w:type="spellEnd"/>
+              <w:t>Ricerca e sviluppo per salvataggio statistiche su json, non ancora completo, questo verrà utilizzato come test per verificare il funzionamento delle varie schermate ui poi verrà adattato per il db</w:t>
+            </w:r>
           </w:p>
         </w:tc>
       </w:tr>
@@ -9878,21 +9398,7 @@
               <w:rPr>
                 <w:rFonts w:ascii="Arial" w:hAnsi="Arial" w:cs="Arial"/>
               </w:rPr>
-              <w:t xml:space="preserve">Non trovavo la cartella degli assets, risolto cercando su </w:t>
-            </w:r>
-            <w:proofErr w:type="spellStart"/>
-            <w:r>
-              <w:rPr>
-                <w:rFonts w:ascii="Arial" w:hAnsi="Arial" w:cs="Arial"/>
-              </w:rPr>
-              <w:t>google</w:t>
-            </w:r>
-            <w:proofErr w:type="spellEnd"/>
-            <w:r>
-              <w:rPr>
-                <w:rFonts w:ascii="Arial" w:hAnsi="Arial" w:cs="Arial"/>
-              </w:rPr>
-              <w:t>.</w:t>
+              <w:t>Non trovavo la cartella degli assets, risolto cercando su google.</w:t>
             </w:r>
           </w:p>
         </w:tc>
@@ -9950,21 +9456,7 @@
               <w:rPr>
                 <w:rFonts w:ascii="Arial" w:hAnsi="Arial" w:cs="Arial"/>
               </w:rPr>
-              <w:t xml:space="preserve">Le statistiche non sono concluse, manca una piccola parte della </w:t>
-            </w:r>
-            <w:proofErr w:type="spellStart"/>
-            <w:r>
-              <w:rPr>
-                <w:rFonts w:ascii="Arial" w:hAnsi="Arial" w:cs="Arial"/>
-              </w:rPr>
-              <w:t>ui</w:t>
-            </w:r>
-            <w:proofErr w:type="spellEnd"/>
-            <w:r>
-              <w:rPr>
-                <w:rFonts w:ascii="Arial" w:hAnsi="Arial" w:cs="Arial"/>
-              </w:rPr>
-              <w:t xml:space="preserve"> e la logica di salvataggio e caricamento</w:t>
+              <w:t>Le statistiche non sono concluse, manca una piccola parte della ui e la logica di salvataggio e caricamento</w:t>
             </w:r>
           </w:p>
         </w:tc>
@@ -10072,28 +9564,12 @@
                 <w:rFonts w:ascii="Arial" w:hAnsi="Arial" w:cs="Arial"/>
               </w:rPr>
             </w:pPr>
-            <w:proofErr w:type="spellStart"/>
-            <w:r>
-              <w:rPr>
-                <w:rFonts w:ascii="Arial" w:hAnsi="Arial" w:cs="Arial"/>
-              </w:rPr>
-              <w:t>Daily</w:t>
-            </w:r>
-            <w:proofErr w:type="spellEnd"/>
-            <w:r>
-              <w:rPr>
-                <w:rFonts w:ascii="Arial" w:hAnsi="Arial" w:cs="Arial"/>
-              </w:rPr>
-              <w:t xml:space="preserve"> </w:t>
-            </w:r>
-            <w:proofErr w:type="spellStart"/>
-            <w:r>
-              <w:rPr>
-                <w:rFonts w:ascii="Arial" w:hAnsi="Arial" w:cs="Arial"/>
-              </w:rPr>
-              <w:t>Scrum</w:t>
-            </w:r>
-            <w:proofErr w:type="spellEnd"/>
+            <w:r>
+              <w:rPr>
+                <w:rFonts w:ascii="Arial" w:hAnsi="Arial" w:cs="Arial"/>
+              </w:rPr>
+              <w:t>Daily Scrum</w:t>
+            </w:r>
           </w:p>
         </w:tc>
       </w:tr>
@@ -10141,35 +9617,7 @@
               <w:rPr>
                 <w:rFonts w:ascii="Arial" w:hAnsi="Arial" w:cs="Arial"/>
               </w:rPr>
-              <w:t xml:space="preserve">Entrambi completeremo la </w:t>
-            </w:r>
-            <w:proofErr w:type="spellStart"/>
-            <w:r>
-              <w:rPr>
-                <w:rFonts w:ascii="Arial" w:hAnsi="Arial" w:cs="Arial"/>
-              </w:rPr>
-              <w:t>ui</w:t>
-            </w:r>
-            <w:proofErr w:type="spellEnd"/>
-            <w:r>
-              <w:rPr>
-                <w:rFonts w:ascii="Arial" w:hAnsi="Arial" w:cs="Arial"/>
-              </w:rPr>
-              <w:t xml:space="preserve"> delle statistiche in modo tale che ci ambientiamo completamente per lo sviluppo 2D e gli script C# per poterci permettere di lavorare separatamente in </w:t>
-            </w:r>
-            <w:proofErr w:type="spellStart"/>
-            <w:r>
-              <w:rPr>
-                <w:rFonts w:ascii="Arial" w:hAnsi="Arial" w:cs="Arial"/>
-              </w:rPr>
-              <w:t>fututro</w:t>
-            </w:r>
-            <w:proofErr w:type="spellEnd"/>
-            <w:r>
-              <w:rPr>
-                <w:rFonts w:ascii="Arial" w:hAnsi="Arial" w:cs="Arial"/>
-              </w:rPr>
-              <w:t>.</w:t>
+              <w:t>Entrambi completeremo la ui delle statistiche in modo tale che ci ambientiamo completamente per lo sviluppo 2D e gli script C# per poterci permettere di lavorare separatamente in fututro.</w:t>
             </w:r>
           </w:p>
         </w:tc>
@@ -10349,16 +9797,8 @@
               <w:rPr>
                 <w:rFonts w:ascii="Arial" w:hAnsi="Arial" w:cs="Arial"/>
               </w:rPr>
-              <w:t xml:space="preserve">Sprint </w:t>
-            </w:r>
-            <w:proofErr w:type="spellStart"/>
-            <w:r>
-              <w:rPr>
-                <w:rFonts w:ascii="Arial" w:hAnsi="Arial" w:cs="Arial"/>
-              </w:rPr>
-              <w:t>Retrospective</w:t>
-            </w:r>
-            <w:proofErr w:type="spellEnd"/>
+              <w:t>Sprint Retrospective</w:t>
+            </w:r>
           </w:p>
         </w:tc>
       </w:tr>
@@ -10850,30 +10290,8 @@
             <w:rPr>
               <w:rFonts w:ascii="Arial" w:hAnsi="Arial" w:cs="Arial"/>
             </w:rPr>
-            <w:t xml:space="preserve">Riley: aiutami a comprendere come salvare dei dati </w:t>
-          </w:r>
-          <w:proofErr w:type="spellStart"/>
-          <w:r>
-            <w:rPr>
-              <w:rFonts w:ascii="Arial" w:hAnsi="Arial" w:cs="Arial"/>
-            </w:rPr>
-            <w:t>unity</w:t>
-          </w:r>
-          <w:proofErr w:type="spellEnd"/>
-          <w:r>
-            <w:rPr>
-              <w:rFonts w:ascii="Arial" w:hAnsi="Arial" w:cs="Arial"/>
-            </w:rPr>
-            <w:t xml:space="preserve"> su un </w:t>
-          </w:r>
-          <w:proofErr w:type="spellStart"/>
-          <w:r>
-            <w:rPr>
-              <w:rFonts w:ascii="Arial" w:hAnsi="Arial" w:cs="Arial"/>
-            </w:rPr>
-            <w:t>json</w:t>
-          </w:r>
-          <w:proofErr w:type="spellEnd"/>
+            <w:t>Riley: aiutami a comprendere come salvare dei dati unity su un json</w:t>
+          </w:r>
         </w:p>
       </w:sdtContent>
     </w:sdt>
@@ -11385,21 +10803,7 @@
               <w:rPr>
                 <w:rFonts w:ascii="Arial" w:hAnsi="Arial" w:cs="Arial"/>
               </w:rPr>
-              <w:t xml:space="preserve">Terminato </w:t>
-            </w:r>
-            <w:proofErr w:type="spellStart"/>
-            <w:r>
-              <w:rPr>
-                <w:rFonts w:ascii="Arial" w:hAnsi="Arial" w:cs="Arial"/>
-              </w:rPr>
-              <w:t>ui</w:t>
-            </w:r>
-            <w:proofErr w:type="spellEnd"/>
-            <w:r>
-              <w:rPr>
-                <w:rFonts w:ascii="Arial" w:hAnsi="Arial" w:cs="Arial"/>
-              </w:rPr>
-              <w:t xml:space="preserve"> statistiche e iniziato quella delle impostazioni</w:t>
+              <w:t>Terminato ui statistiche e iniziato quella delle impostazioni</w:t>
             </w:r>
           </w:p>
         </w:tc>
@@ -11478,97 +10882,13 @@
               <w:rPr>
                 <w:rFonts w:ascii="Arial" w:hAnsi="Arial" w:cs="Arial"/>
               </w:rPr>
-              <w:t xml:space="preserve">Problemi di merge, risolto tramite una configurazione di un tool di </w:t>
-            </w:r>
-            <w:proofErr w:type="spellStart"/>
-            <w:r>
-              <w:rPr>
-                <w:rFonts w:ascii="Arial" w:hAnsi="Arial" w:cs="Arial"/>
-              </w:rPr>
-              <w:t>unity</w:t>
-            </w:r>
-            <w:proofErr w:type="spellEnd"/>
-            <w:r>
-              <w:rPr>
-                <w:rFonts w:ascii="Arial" w:hAnsi="Arial" w:cs="Arial"/>
-              </w:rPr>
-              <w:t xml:space="preserve"> che permette di risolvere automaticamente i conflitti, è stato fatto una configurazione che fa avvia un file .</w:t>
-            </w:r>
-            <w:proofErr w:type="spellStart"/>
-            <w:r>
-              <w:rPr>
-                <w:rFonts w:ascii="Arial" w:hAnsi="Arial" w:cs="Arial"/>
-              </w:rPr>
-              <w:t>cmd</w:t>
-            </w:r>
-            <w:proofErr w:type="spellEnd"/>
-            <w:r>
-              <w:rPr>
-                <w:rFonts w:ascii="Arial" w:hAnsi="Arial" w:cs="Arial"/>
-              </w:rPr>
-              <w:t xml:space="preserve"> sotto la cartella tools questo piccolo script prende i file con conflitti rilevati da </w:t>
-            </w:r>
-            <w:proofErr w:type="spellStart"/>
-            <w:r>
-              <w:rPr>
-                <w:rFonts w:ascii="Arial" w:hAnsi="Arial" w:cs="Arial"/>
-              </w:rPr>
-              <w:t>git</w:t>
-            </w:r>
-            <w:proofErr w:type="spellEnd"/>
-            <w:r>
-              <w:rPr>
-                <w:rFonts w:ascii="Arial" w:hAnsi="Arial" w:cs="Arial"/>
-              </w:rPr>
-              <w:t xml:space="preserve"> e li traduce per </w:t>
-            </w:r>
-            <w:proofErr w:type="spellStart"/>
-            <w:r>
-              <w:rPr>
-                <w:rFonts w:ascii="Arial" w:hAnsi="Arial" w:cs="Arial"/>
-              </w:rPr>
-              <w:t>unityyalmmerge</w:t>
-            </w:r>
-            <w:proofErr w:type="spellEnd"/>
-            <w:r>
-              <w:rPr>
-                <w:rFonts w:ascii="Arial" w:hAnsi="Arial" w:cs="Arial"/>
-              </w:rPr>
-              <w:t xml:space="preserve"> facendo in modo che una volta usato il comando </w:t>
-            </w:r>
-            <w:proofErr w:type="spellStart"/>
-            <w:r>
-              <w:rPr>
-                <w:rFonts w:ascii="Arial" w:hAnsi="Arial" w:cs="Arial"/>
-              </w:rPr>
-              <w:t>git</w:t>
-            </w:r>
-            <w:proofErr w:type="spellEnd"/>
-            <w:r>
-              <w:rPr>
-                <w:rFonts w:ascii="Arial" w:hAnsi="Arial" w:cs="Arial"/>
-              </w:rPr>
-              <w:t xml:space="preserve"> pull non risultino più errori.</w:t>
-            </w:r>
-            <w:r>
-              <w:rPr>
-                <w:rFonts w:ascii="Arial" w:hAnsi="Arial" w:cs="Arial"/>
-              </w:rPr>
-              <w:t xml:space="preserve"> </w:t>
-            </w:r>
-            <w:proofErr w:type="spellStart"/>
-            <w:r>
-              <w:rPr>
-                <w:rFonts w:ascii="Arial" w:hAnsi="Arial" w:cs="Arial"/>
-              </w:rPr>
-              <w:t>Chatgpt</w:t>
-            </w:r>
-            <w:proofErr w:type="spellEnd"/>
-            <w:r>
-              <w:rPr>
-                <w:rFonts w:ascii="Arial" w:hAnsi="Arial" w:cs="Arial"/>
-              </w:rPr>
-              <w:t xml:space="preserve"> mi ha supportato nella risoluzione di questo problema</w:t>
+              <w:t>Problemi di merge, risolto tramite una configurazione di un tool di unity che permette di risolvere automaticamente i conflitti, è stato fatto una configurazione che fa avvia un file .cmd sotto la cartella tools questo piccolo script prende i file con conflitti rilevati da git e li traduce per unityyalmmerge facendo in modo che una volta usato il comando git pull non risultino più errori.</w:t>
+            </w:r>
+            <w:r>
+              <w:rPr>
+                <w:rFonts w:ascii="Arial" w:hAnsi="Arial" w:cs="Arial"/>
+              </w:rPr>
+              <w:t xml:space="preserve"> Chatgpt mi ha supportato nella risoluzione di questo problema</w:t>
             </w:r>
           </w:p>
         </w:tc>
@@ -11664,21 +10984,7 @@
               <w:rPr>
                 <w:rFonts w:ascii="Arial" w:hAnsi="Arial" w:cs="Arial"/>
               </w:rPr>
-              <w:t xml:space="preserve">La </w:t>
-            </w:r>
-            <w:proofErr w:type="spellStart"/>
-            <w:r>
-              <w:rPr>
-                <w:rFonts w:ascii="Arial" w:hAnsi="Arial" w:cs="Arial"/>
-              </w:rPr>
-              <w:t>ui</w:t>
-            </w:r>
-            <w:proofErr w:type="spellEnd"/>
-            <w:r>
-              <w:rPr>
-                <w:rFonts w:ascii="Arial" w:hAnsi="Arial" w:cs="Arial"/>
-              </w:rPr>
-              <w:t xml:space="preserve"> delle statistiche è completa ma mancano alcune parti dello script, di conseguenza abbiamo un ritardo generale.</w:t>
+              <w:t>La ui delle statistiche è completa ma mancano alcune parti dello script, di conseguenza abbiamo un ritardo generale.</w:t>
             </w:r>
           </w:p>
         </w:tc>
@@ -11736,21 +11042,7 @@
               <w:rPr>
                 <w:rFonts w:ascii="Arial" w:hAnsi="Arial" w:cs="Arial"/>
               </w:rPr>
-              <w:t xml:space="preserve">Terminare script statistiche, continuare </w:t>
-            </w:r>
-            <w:proofErr w:type="spellStart"/>
-            <w:r>
-              <w:rPr>
-                <w:rFonts w:ascii="Arial" w:hAnsi="Arial" w:cs="Arial"/>
-              </w:rPr>
-              <w:t>ui</w:t>
-            </w:r>
-            <w:proofErr w:type="spellEnd"/>
-            <w:r>
-              <w:rPr>
-                <w:rFonts w:ascii="Arial" w:hAnsi="Arial" w:cs="Arial"/>
-              </w:rPr>
-              <w:t xml:space="preserve"> impostazioni</w:t>
+              <w:t>Terminare script statistiche, continuare ui impostazioni</w:t>
             </w:r>
           </w:p>
         </w:tc>
@@ -11800,28 +11092,12 @@
                 <w:rFonts w:ascii="Arial" w:hAnsi="Arial" w:cs="Arial"/>
               </w:rPr>
             </w:pPr>
-            <w:proofErr w:type="spellStart"/>
-            <w:r>
-              <w:rPr>
-                <w:rFonts w:ascii="Arial" w:hAnsi="Arial" w:cs="Arial"/>
-              </w:rPr>
-              <w:t>Daily</w:t>
-            </w:r>
-            <w:proofErr w:type="spellEnd"/>
-            <w:r>
-              <w:rPr>
-                <w:rFonts w:ascii="Arial" w:hAnsi="Arial" w:cs="Arial"/>
-              </w:rPr>
-              <w:t xml:space="preserve"> </w:t>
-            </w:r>
-            <w:proofErr w:type="spellStart"/>
-            <w:r>
-              <w:rPr>
-                <w:rFonts w:ascii="Arial" w:hAnsi="Arial" w:cs="Arial"/>
-              </w:rPr>
-              <w:t>Scrum</w:t>
-            </w:r>
-            <w:proofErr w:type="spellEnd"/>
+            <w:r>
+              <w:rPr>
+                <w:rFonts w:ascii="Arial" w:hAnsi="Arial" w:cs="Arial"/>
+              </w:rPr>
+              <w:t>Daily Scrum</w:t>
+            </w:r>
           </w:p>
         </w:tc>
       </w:tr>
@@ -11869,21 +11145,7 @@
               <w:rPr>
                 <w:rFonts w:ascii="Arial" w:hAnsi="Arial" w:cs="Arial"/>
               </w:rPr>
-              <w:t xml:space="preserve">Riley deve risolvere un problema di merge riscontrato al tentativo di pull e poi continuare con lo script delle statistiche, invece Bryan deve fine la </w:t>
-            </w:r>
-            <w:proofErr w:type="spellStart"/>
-            <w:r>
-              <w:rPr>
-                <w:rFonts w:ascii="Arial" w:hAnsi="Arial" w:cs="Arial"/>
-              </w:rPr>
-              <w:t>ui</w:t>
-            </w:r>
-            <w:proofErr w:type="spellEnd"/>
-            <w:r>
-              <w:rPr>
-                <w:rFonts w:ascii="Arial" w:hAnsi="Arial" w:cs="Arial"/>
-              </w:rPr>
-              <w:t xml:space="preserve"> delle statistiche e preferibilmente iniziare con le impostazioni.</w:t>
+              <w:t>Riley deve risolvere un problema di merge riscontrato al tentativo di pull e poi continuare con lo script delle statistiche, invece Bryan deve fine la ui delle statistiche e preferibilmente iniziare con le impostazioni.</w:t>
             </w:r>
           </w:p>
         </w:tc>
@@ -12063,16 +11325,8 @@
               <w:rPr>
                 <w:rFonts w:ascii="Arial" w:hAnsi="Arial" w:cs="Arial"/>
               </w:rPr>
-              <w:t xml:space="preserve">Sprint </w:t>
-            </w:r>
-            <w:proofErr w:type="spellStart"/>
-            <w:r>
-              <w:rPr>
-                <w:rFonts w:ascii="Arial" w:hAnsi="Arial" w:cs="Arial"/>
-              </w:rPr>
-              <w:t>Retrospective</w:t>
-            </w:r>
-            <w:proofErr w:type="spellEnd"/>
+              <w:t>Sprint Retrospective</w:t>
+            </w:r>
           </w:p>
         </w:tc>
       </w:tr>
@@ -12576,21 +11830,7 @@
             <w:rPr>
               <w:rFonts w:ascii="Arial" w:hAnsi="Arial" w:cs="Arial"/>
             </w:rPr>
-            <w:t xml:space="preserve">Ho riscontrato un problema di merge nonostante abbiamo impostato un sistema con un tool </w:t>
-          </w:r>
-          <w:proofErr w:type="spellStart"/>
-          <w:r>
-            <w:rPr>
-              <w:rFonts w:ascii="Arial" w:hAnsi="Arial" w:cs="Arial"/>
-            </w:rPr>
-            <w:t>unity</w:t>
-          </w:r>
-          <w:proofErr w:type="spellEnd"/>
-          <w:r>
-            <w:rPr>
-              <w:rFonts w:ascii="Arial" w:hAnsi="Arial" w:cs="Arial"/>
-            </w:rPr>
-            <w:t>, puoi dirmi cosa analizzare per risolvere?</w:t>
+            <w:t>Ho riscontrato un problema di merge nonostante abbiamo impostato un sistema con un tool unity, puoi dirmi cosa analizzare per risolvere?</w:t>
           </w:r>
         </w:p>
         <w:p>
@@ -12605,21 +11845,7 @@
             <w:rPr>
               <w:rFonts w:ascii="Arial" w:hAnsi="Arial" w:cs="Arial"/>
             </w:rPr>
-            <w:t xml:space="preserve">Bryan: come si implementa un font in </w:t>
-          </w:r>
-          <w:proofErr w:type="spellStart"/>
-          <w:r>
-            <w:rPr>
-              <w:rFonts w:ascii="Arial" w:hAnsi="Arial" w:cs="Arial"/>
-            </w:rPr>
-            <w:t>unity</w:t>
-          </w:r>
-          <w:proofErr w:type="spellEnd"/>
-          <w:r>
-            <w:rPr>
-              <w:rFonts w:ascii="Arial" w:hAnsi="Arial" w:cs="Arial"/>
-            </w:rPr>
-            <w:t>?</w:t>
+            <w:t>Bryan: come si implementa un font in unity?</w:t>
           </w:r>
         </w:p>
       </w:sdtContent>
@@ -13328,49 +12554,7 @@
               <w:rPr>
                 <w:rFonts w:ascii="Arial" w:hAnsi="Arial" w:cs="Arial"/>
               </w:rPr>
-              <w:t xml:space="preserve">Rispetto alla pianificazione abbiamo un leggero ritardo avendo finito solo oggi le statistiche, ma questo risulta recuperabile essendo che lavoriamo separatamente dividendo </w:t>
-            </w:r>
-            <w:proofErr w:type="spellStart"/>
-            <w:r>
-              <w:rPr>
-                <w:rFonts w:ascii="Arial" w:hAnsi="Arial" w:cs="Arial"/>
-              </w:rPr>
-              <w:t>ui</w:t>
-            </w:r>
-            <w:proofErr w:type="spellEnd"/>
-            <w:r>
-              <w:rPr>
-                <w:rFonts w:ascii="Arial" w:hAnsi="Arial" w:cs="Arial"/>
-              </w:rPr>
-              <w:t xml:space="preserve"> e scripting, infatti </w:t>
-            </w:r>
-            <w:proofErr w:type="spellStart"/>
-            <w:r>
-              <w:rPr>
-                <w:rFonts w:ascii="Arial" w:hAnsi="Arial" w:cs="Arial"/>
-              </w:rPr>
-              <w:t>bryan</w:t>
-            </w:r>
-            <w:proofErr w:type="spellEnd"/>
-            <w:r>
-              <w:rPr>
-                <w:rFonts w:ascii="Arial" w:hAnsi="Arial" w:cs="Arial"/>
-              </w:rPr>
-              <w:t xml:space="preserve"> ha iniziato la </w:t>
-            </w:r>
-            <w:proofErr w:type="spellStart"/>
-            <w:r>
-              <w:rPr>
-                <w:rFonts w:ascii="Arial" w:hAnsi="Arial" w:cs="Arial"/>
-              </w:rPr>
-              <w:t>ui</w:t>
-            </w:r>
-            <w:proofErr w:type="spellEnd"/>
-            <w:r>
-              <w:rPr>
-                <w:rFonts w:ascii="Arial" w:hAnsi="Arial" w:cs="Arial"/>
-              </w:rPr>
-              <w:t xml:space="preserve"> delle impostazioni il giorno previsto.</w:t>
+              <w:t>Rispetto alla pianificazione abbiamo un leggero ritardo avendo finito solo oggi le statistiche, ma questo risulta recuperabile essendo che lavoriamo separatamente dividendo ui e scripting, infatti bryan ha iniziato la ui delle impostazioni il giorno previsto.</w:t>
             </w:r>
           </w:p>
         </w:tc>
@@ -13491,28 +12675,12 @@
                 <w:rFonts w:ascii="Arial" w:hAnsi="Arial" w:cs="Arial"/>
               </w:rPr>
             </w:pPr>
-            <w:proofErr w:type="spellStart"/>
-            <w:r>
-              <w:rPr>
-                <w:rFonts w:ascii="Arial" w:hAnsi="Arial" w:cs="Arial"/>
-              </w:rPr>
-              <w:t>Daily</w:t>
-            </w:r>
-            <w:proofErr w:type="spellEnd"/>
-            <w:r>
-              <w:rPr>
-                <w:rFonts w:ascii="Arial" w:hAnsi="Arial" w:cs="Arial"/>
-              </w:rPr>
-              <w:t xml:space="preserve"> </w:t>
-            </w:r>
-            <w:proofErr w:type="spellStart"/>
-            <w:r>
-              <w:rPr>
-                <w:rFonts w:ascii="Arial" w:hAnsi="Arial" w:cs="Arial"/>
-              </w:rPr>
-              <w:t>Scrum</w:t>
-            </w:r>
-            <w:proofErr w:type="spellEnd"/>
+            <w:r>
+              <w:rPr>
+                <w:rFonts w:ascii="Arial" w:hAnsi="Arial" w:cs="Arial"/>
+              </w:rPr>
+              <w:t>Daily Scrum</w:t>
+            </w:r>
           </w:p>
         </w:tc>
       </w:tr>
@@ -13574,21 +12742,7 @@
               <w:rPr>
                 <w:rFonts w:ascii="Arial" w:hAnsi="Arial" w:cs="Arial"/>
               </w:rPr>
-              <w:t xml:space="preserve">Bryan: Finire la </w:t>
-            </w:r>
-            <w:proofErr w:type="spellStart"/>
-            <w:r>
-              <w:rPr>
-                <w:rFonts w:ascii="Arial" w:hAnsi="Arial" w:cs="Arial"/>
-              </w:rPr>
-              <w:t>ui</w:t>
-            </w:r>
-            <w:proofErr w:type="spellEnd"/>
-            <w:r>
-              <w:rPr>
-                <w:rFonts w:ascii="Arial" w:hAnsi="Arial" w:cs="Arial"/>
-              </w:rPr>
-              <w:t xml:space="preserve"> del</w:t>
+              <w:t>Bryan: Finire la ui del</w:t>
             </w:r>
             <w:r>
               <w:rPr>
@@ -13774,16 +12928,8 @@
               <w:rPr>
                 <w:rFonts w:ascii="Arial" w:hAnsi="Arial" w:cs="Arial"/>
               </w:rPr>
-              <w:t xml:space="preserve">Sprint </w:t>
-            </w:r>
-            <w:proofErr w:type="spellStart"/>
-            <w:r>
-              <w:rPr>
-                <w:rFonts w:ascii="Arial" w:hAnsi="Arial" w:cs="Arial"/>
-              </w:rPr>
-              <w:t>Retrospective</w:t>
-            </w:r>
-            <w:proofErr w:type="spellEnd"/>
+              <w:t>Sprint Retrospective</w:t>
+            </w:r>
           </w:p>
         </w:tc>
       </w:tr>
@@ -14275,35 +13421,7 @@
             <w:rPr>
               <w:rFonts w:ascii="Arial" w:hAnsi="Arial" w:cs="Arial"/>
             </w:rPr>
-            <w:t xml:space="preserve">Il numero inserito nel </w:t>
-          </w:r>
-          <w:proofErr w:type="spellStart"/>
-          <w:r>
-            <w:rPr>
-              <w:rFonts w:ascii="Arial" w:hAnsi="Arial" w:cs="Arial"/>
-            </w:rPr>
-            <w:t>json</w:t>
-          </w:r>
-          <w:proofErr w:type="spellEnd"/>
-          <w:r>
-            <w:rPr>
-              <w:rFonts w:ascii="Arial" w:hAnsi="Arial" w:cs="Arial"/>
-            </w:rPr>
-            <w:t xml:space="preserve"> risulta essere un numero che va dal miliardo in su, ma l’applicativo lo riduce a milioni, per caso i valori </w:t>
-          </w:r>
-          <w:proofErr w:type="spellStart"/>
-          <w:r>
-            <w:rPr>
-              <w:rFonts w:ascii="Arial" w:hAnsi="Arial" w:cs="Arial"/>
-            </w:rPr>
-            <w:t>int</w:t>
-          </w:r>
-          <w:proofErr w:type="spellEnd"/>
-          <w:r>
-            <w:rPr>
-              <w:rFonts w:ascii="Arial" w:hAnsi="Arial" w:cs="Arial"/>
-            </w:rPr>
-            <w:t xml:space="preserve"> non supportano i miliardi?</w:t>
+            <w:t>Il numero inserito nel json risulta essere un numero che va dal miliardo in su, ma l’applicativo lo riduce a milioni, per caso i valori int non supportano i miliardi?</w:t>
           </w:r>
           <w:r>
             <w:rPr>
@@ -14392,21 +13510,7 @@
             <w:rPr>
               <w:rFonts w:ascii="Arial" w:hAnsi="Arial" w:cs="Arial"/>
             </w:rPr>
-            <w:t xml:space="preserve">Mi ha detto che </w:t>
-          </w:r>
-          <w:proofErr w:type="spellStart"/>
-          <w:r>
-            <w:rPr>
-              <w:rFonts w:ascii="Arial" w:hAnsi="Arial" w:cs="Arial"/>
-            </w:rPr>
-            <w:t>int</w:t>
-          </w:r>
-          <w:proofErr w:type="spellEnd"/>
-          <w:r>
-            <w:rPr>
-              <w:rFonts w:ascii="Arial" w:hAnsi="Arial" w:cs="Arial"/>
-            </w:rPr>
-            <w:t xml:space="preserve"> supporta i miliardi ma che ha un massimo di circa 2,2 miliardi ed il numero risultava più grande quindi ho ripiegato su un long</w:t>
+            <w:t>Mi ha detto che int supporta i miliardi ma che ha un massimo di circa 2,2 miliardi ed il numero risultava più grande quindi ho ripiegato su un long</w:t>
           </w:r>
         </w:p>
       </w:sdtContent>
@@ -14915,21 +14019,7 @@
               <w:rPr>
                 <w:rFonts w:ascii="Arial" w:hAnsi="Arial" w:cs="Arial"/>
               </w:rPr>
-              <w:t xml:space="preserve">Ho notato come certe impostazioni non sono modificabili con variabili di </w:t>
-            </w:r>
-            <w:proofErr w:type="spellStart"/>
-            <w:r>
-              <w:rPr>
-                <w:rFonts w:ascii="Arial" w:hAnsi="Arial" w:cs="Arial"/>
-              </w:rPr>
-              <w:t>unity</w:t>
-            </w:r>
-            <w:proofErr w:type="spellEnd"/>
-            <w:r>
-              <w:rPr>
-                <w:rFonts w:ascii="Arial" w:hAnsi="Arial" w:cs="Arial"/>
-              </w:rPr>
-              <w:t xml:space="preserve"> e quindi ho usato del tempo per eseguire qualche ricerca.</w:t>
+              <w:t>Ho notato come certe impostazioni non sono modificabili con variabili di unity e quindi ho usato del tempo per eseguire qualche ricerca.</w:t>
             </w:r>
           </w:p>
         </w:tc>
@@ -15133,28 +14223,12 @@
                 <w:rFonts w:ascii="Arial" w:hAnsi="Arial" w:cs="Arial"/>
               </w:rPr>
             </w:pPr>
-            <w:proofErr w:type="spellStart"/>
-            <w:r>
-              <w:rPr>
-                <w:rFonts w:ascii="Arial" w:hAnsi="Arial" w:cs="Arial"/>
-              </w:rPr>
-              <w:t>Daily</w:t>
-            </w:r>
-            <w:proofErr w:type="spellEnd"/>
-            <w:r>
-              <w:rPr>
-                <w:rFonts w:ascii="Arial" w:hAnsi="Arial" w:cs="Arial"/>
-              </w:rPr>
-              <w:t xml:space="preserve"> </w:t>
-            </w:r>
-            <w:proofErr w:type="spellStart"/>
-            <w:r>
-              <w:rPr>
-                <w:rFonts w:ascii="Arial" w:hAnsi="Arial" w:cs="Arial"/>
-              </w:rPr>
-              <w:t>Scrum</w:t>
-            </w:r>
-            <w:proofErr w:type="spellEnd"/>
+            <w:r>
+              <w:rPr>
+                <w:rFonts w:ascii="Arial" w:hAnsi="Arial" w:cs="Arial"/>
+              </w:rPr>
+              <w:t>Daily Scrum</w:t>
+            </w:r>
           </w:p>
         </w:tc>
       </w:tr>
@@ -15402,16 +14476,8 @@
               <w:rPr>
                 <w:rFonts w:ascii="Arial" w:hAnsi="Arial" w:cs="Arial"/>
               </w:rPr>
-              <w:t xml:space="preserve">Sprint </w:t>
-            </w:r>
-            <w:proofErr w:type="spellStart"/>
-            <w:r>
-              <w:rPr>
-                <w:rFonts w:ascii="Arial" w:hAnsi="Arial" w:cs="Arial"/>
-              </w:rPr>
-              <w:t>Retrospective</w:t>
-            </w:r>
-            <w:proofErr w:type="spellEnd"/>
+              <w:t>Sprint Retrospective</w:t>
+            </w:r>
           </w:p>
         </w:tc>
       </w:tr>
@@ -15897,21 +14963,7 @@
             <w:rPr>
               <w:rFonts w:ascii="Arial" w:hAnsi="Arial" w:cs="Arial"/>
             </w:rPr>
-            <w:t xml:space="preserve">Riley: sto creando il file data per le impostazioni con questi valori: “valori”. Puoi dirmi che valore effettivo usa </w:t>
-          </w:r>
-          <w:proofErr w:type="spellStart"/>
-          <w:r>
-            <w:rPr>
-              <w:rFonts w:ascii="Arial" w:hAnsi="Arial" w:cs="Arial"/>
-            </w:rPr>
-            <w:t>unity</w:t>
-          </w:r>
-          <w:proofErr w:type="spellEnd"/>
-          <w:r>
-            <w:rPr>
-              <w:rFonts w:ascii="Arial" w:hAnsi="Arial" w:cs="Arial"/>
-            </w:rPr>
-            <w:t xml:space="preserve">? </w:t>
+            <w:t xml:space="preserve">Riley: sto creando il file data per le impostazioni con questi valori: “valori”. Puoi dirmi che valore effettivo usa unity? </w:t>
           </w:r>
         </w:p>
         <w:p>
@@ -15926,44 +14978,8 @@
             <w:rPr>
               <w:rFonts w:ascii="Arial" w:hAnsi="Arial" w:cs="Arial"/>
             </w:rPr>
-            <w:t xml:space="preserve">Bryan: Come creare un menu con componenti </w:t>
-          </w:r>
-          <w:proofErr w:type="spellStart"/>
-          <w:r>
-            <w:rPr>
-              <w:rFonts w:ascii="Arial" w:hAnsi="Arial" w:cs="Arial"/>
-            </w:rPr>
-            <w:t>ui</w:t>
-          </w:r>
-          <w:proofErr w:type="spellEnd"/>
-          <w:r>
-            <w:rPr>
-              <w:rFonts w:ascii="Arial" w:hAnsi="Arial" w:cs="Arial"/>
-            </w:rPr>
-            <w:t xml:space="preserve"> che si ripetono </w:t>
-          </w:r>
-          <w:proofErr w:type="spellStart"/>
-          <w:r>
-            <w:rPr>
-              <w:rFonts w:ascii="Arial" w:hAnsi="Arial" w:cs="Arial"/>
-            </w:rPr>
-            <w:t>modularmente</w:t>
-          </w:r>
-          <w:proofErr w:type="spellEnd"/>
-          <w:r>
-            <w:rPr>
-              <w:rFonts w:ascii="Arial" w:hAnsi="Arial" w:cs="Arial"/>
-            </w:rPr>
-            <w:t xml:space="preserve"> in </w:t>
-          </w:r>
-          <w:proofErr w:type="spellStart"/>
-          <w:r>
-            <w:rPr>
-              <w:rFonts w:ascii="Arial" w:hAnsi="Arial" w:cs="Arial"/>
-            </w:rPr>
-            <w:t>unity</w:t>
-          </w:r>
-          <w:proofErr w:type="spellEnd"/>
+            <w:t>Bryan: Come creare un menu con componenti ui che si ripetono modularmente in unity</w:t>
+          </w:r>
         </w:p>
       </w:sdtContent>
     </w:sdt>
@@ -16274,16 +15290,8 @@
         <w:rPr>
           <w:rFonts w:ascii="Arial" w:hAnsi="Arial" w:cs="Arial"/>
         </w:rPr>
-        <w:t xml:space="preserve">Bryan: averi cercato un tutorial su </w:t>
-      </w:r>
-      <w:proofErr w:type="spellStart"/>
-      <w:r>
-        <w:rPr>
-          <w:rFonts w:ascii="Arial" w:hAnsi="Arial" w:cs="Arial"/>
-        </w:rPr>
-        <w:t>youtube</w:t>
-      </w:r>
-      <w:proofErr w:type="spellEnd"/>
+        <w:t>Bryan: averi cercato un tutorial su youtube</w:t>
+      </w:r>
     </w:p>
     <w:p>
       <w:pPr>
@@ -16469,16 +15477,8 @@
               <w:rPr>
                 <w:rFonts w:ascii="Arial" w:hAnsi="Arial" w:cs="Arial"/>
               </w:rPr>
-              <w:t xml:space="preserve">Continuato script impostazioni per </w:t>
-            </w:r>
-            <w:proofErr w:type="spellStart"/>
-            <w:r>
-              <w:rPr>
-                <w:rFonts w:ascii="Arial" w:hAnsi="Arial" w:cs="Arial"/>
-              </w:rPr>
-              <w:t>ui</w:t>
-            </w:r>
-            <w:proofErr w:type="spellEnd"/>
+              <w:t>Continuato script impostazioni per ui</w:t>
+            </w:r>
           </w:p>
         </w:tc>
       </w:tr>
@@ -16594,35 +15594,7 @@
               <w:rPr>
                 <w:rFonts w:ascii="Arial" w:hAnsi="Arial" w:cs="Arial"/>
               </w:rPr>
-              <w:t xml:space="preserve">Alcuni problemi con i valori inviati dal </w:t>
-            </w:r>
-            <w:proofErr w:type="spellStart"/>
-            <w:r>
-              <w:rPr>
-                <w:rFonts w:ascii="Arial" w:hAnsi="Arial" w:cs="Arial"/>
-              </w:rPr>
-              <w:t>togglle</w:t>
-            </w:r>
-            <w:proofErr w:type="spellEnd"/>
-            <w:r>
-              <w:rPr>
-                <w:rFonts w:ascii="Arial" w:hAnsi="Arial" w:cs="Arial"/>
-              </w:rPr>
-              <w:t xml:space="preserve"> per </w:t>
-            </w:r>
-            <w:proofErr w:type="spellStart"/>
-            <w:r>
-              <w:rPr>
-                <w:rFonts w:ascii="Arial" w:hAnsi="Arial" w:cs="Arial"/>
-              </w:rPr>
-              <w:t>fullscreen</w:t>
-            </w:r>
-            <w:proofErr w:type="spellEnd"/>
-            <w:r>
-              <w:rPr>
-                <w:rFonts w:ascii="Arial" w:hAnsi="Arial" w:cs="Arial"/>
-              </w:rPr>
-              <w:t xml:space="preserve">, scoperto che avevo selezionato un valore statico e non dinamico dell’elemento </w:t>
+              <w:t xml:space="preserve">Alcuni problemi con i valori inviati dal togglle per fullscreen, scoperto che avevo selezionato un valore statico e non dinamico dell’elemento </w:t>
             </w:r>
           </w:p>
         </w:tc>
@@ -16788,21 +15760,7 @@
               <w:rPr>
                 <w:rFonts w:ascii="Arial" w:hAnsi="Arial" w:cs="Arial"/>
               </w:rPr>
-              <w:t xml:space="preserve"> iniziare a creare il </w:t>
-            </w:r>
-            <w:proofErr w:type="spellStart"/>
-            <w:r>
-              <w:rPr>
-                <w:rFonts w:ascii="Arial" w:hAnsi="Arial" w:cs="Arial"/>
-              </w:rPr>
-              <w:t>db</w:t>
-            </w:r>
-            <w:proofErr w:type="spellEnd"/>
-            <w:r>
-              <w:rPr>
-                <w:rFonts w:ascii="Arial" w:hAnsi="Arial" w:cs="Arial"/>
-              </w:rPr>
-              <w:t xml:space="preserve"> effettivo</w:t>
+              <w:t xml:space="preserve"> iniziare a creare il db effettivo</w:t>
             </w:r>
             <w:r>
               <w:rPr>
@@ -16858,28 +15816,12 @@
                 <w:rFonts w:ascii="Arial" w:hAnsi="Arial" w:cs="Arial"/>
               </w:rPr>
             </w:pPr>
-            <w:proofErr w:type="spellStart"/>
-            <w:r>
-              <w:rPr>
-                <w:rFonts w:ascii="Arial" w:hAnsi="Arial" w:cs="Arial"/>
-              </w:rPr>
-              <w:t>Daily</w:t>
-            </w:r>
-            <w:proofErr w:type="spellEnd"/>
-            <w:r>
-              <w:rPr>
-                <w:rFonts w:ascii="Arial" w:hAnsi="Arial" w:cs="Arial"/>
-              </w:rPr>
-              <w:t xml:space="preserve"> </w:t>
-            </w:r>
-            <w:proofErr w:type="spellStart"/>
-            <w:r>
-              <w:rPr>
-                <w:rFonts w:ascii="Arial" w:hAnsi="Arial" w:cs="Arial"/>
-              </w:rPr>
-              <w:t>Scrum</w:t>
-            </w:r>
-            <w:proofErr w:type="spellEnd"/>
+            <w:r>
+              <w:rPr>
+                <w:rFonts w:ascii="Arial" w:hAnsi="Arial" w:cs="Arial"/>
+              </w:rPr>
+              <w:t>Daily Scrum</w:t>
+            </w:r>
           </w:p>
         </w:tc>
       </w:tr>
@@ -16933,16 +15875,8 @@
               <w:rPr>
                 <w:rFonts w:ascii="Arial" w:hAnsi="Arial" w:cs="Arial"/>
               </w:rPr>
-              <w:t xml:space="preserve"> Terminare l’applicazione delle impostazioni nella </w:t>
-            </w:r>
-            <w:proofErr w:type="spellStart"/>
-            <w:r>
-              <w:rPr>
-                <w:rFonts w:ascii="Arial" w:hAnsi="Arial" w:cs="Arial"/>
-              </w:rPr>
-              <w:t>ui</w:t>
-            </w:r>
-            <w:proofErr w:type="spellEnd"/>
+              <w:t xml:space="preserve"> Terminare l’applicazione delle impostazioni nella ui</w:t>
+            </w:r>
           </w:p>
           <w:p>
             <w:pPr>
@@ -17153,16 +16087,8 @@
               <w:rPr>
                 <w:rFonts w:ascii="Arial" w:hAnsi="Arial" w:cs="Arial"/>
               </w:rPr>
-              <w:t xml:space="preserve">Sprint </w:t>
-            </w:r>
-            <w:proofErr w:type="spellStart"/>
-            <w:r>
-              <w:rPr>
-                <w:rFonts w:ascii="Arial" w:hAnsi="Arial" w:cs="Arial"/>
-              </w:rPr>
-              <w:t>Retrospective</w:t>
-            </w:r>
-            <w:proofErr w:type="spellEnd"/>
+              <w:t>Sprint Retrospective</w:t>
+            </w:r>
           </w:p>
         </w:tc>
       </w:tr>
@@ -18463,33 +17389,11 @@
                 <w:rFonts w:ascii="Arial" w:hAnsi="Arial" w:cs="Arial"/>
               </w:rPr>
             </w:pPr>
-            <w:proofErr w:type="spellStart"/>
-            <w:r>
-              <w:rPr>
-                <w:rFonts w:ascii="Arial" w:hAnsi="Arial" w:cs="Arial"/>
-              </w:rPr>
-              <w:t>Brayn</w:t>
-            </w:r>
-            <w:proofErr w:type="spellEnd"/>
-            <w:r>
-              <w:rPr>
-                <w:rFonts w:ascii="Arial" w:hAnsi="Arial" w:cs="Arial"/>
-              </w:rPr>
-              <w:t xml:space="preserve"> continuerà con lo sviluppo della mappa mentre Riley svilupperà il </w:t>
-            </w:r>
-            <w:proofErr w:type="spellStart"/>
-            <w:r>
-              <w:rPr>
-                <w:rFonts w:ascii="Arial" w:hAnsi="Arial" w:cs="Arial"/>
-              </w:rPr>
-              <w:t>db</w:t>
-            </w:r>
-            <w:proofErr w:type="spellEnd"/>
-            <w:r>
-              <w:rPr>
-                <w:rFonts w:ascii="Arial" w:hAnsi="Arial" w:cs="Arial"/>
-              </w:rPr>
-              <w:t xml:space="preserve"> effettivo</w:t>
+            <w:r>
+              <w:rPr>
+                <w:rFonts w:ascii="Arial" w:hAnsi="Arial" w:cs="Arial"/>
+              </w:rPr>
+              <w:t>Brayn continuerà con lo sviluppo della mappa mentre Riley svilupperà il db effettivo</w:t>
             </w:r>
           </w:p>
         </w:tc>
@@ -18539,28 +17443,12 @@
                 <w:rFonts w:ascii="Arial" w:hAnsi="Arial" w:cs="Arial"/>
               </w:rPr>
             </w:pPr>
-            <w:proofErr w:type="spellStart"/>
-            <w:r>
-              <w:rPr>
-                <w:rFonts w:ascii="Arial" w:hAnsi="Arial" w:cs="Arial"/>
-              </w:rPr>
-              <w:t>Daily</w:t>
-            </w:r>
-            <w:proofErr w:type="spellEnd"/>
-            <w:r>
-              <w:rPr>
-                <w:rFonts w:ascii="Arial" w:hAnsi="Arial" w:cs="Arial"/>
-              </w:rPr>
-              <w:t xml:space="preserve"> </w:t>
-            </w:r>
-            <w:proofErr w:type="spellStart"/>
-            <w:r>
-              <w:rPr>
-                <w:rFonts w:ascii="Arial" w:hAnsi="Arial" w:cs="Arial"/>
-              </w:rPr>
-              <w:t>Scrum</w:t>
-            </w:r>
-            <w:proofErr w:type="spellEnd"/>
+            <w:r>
+              <w:rPr>
+                <w:rFonts w:ascii="Arial" w:hAnsi="Arial" w:cs="Arial"/>
+              </w:rPr>
+              <w:t>Daily Scrum</w:t>
+            </w:r>
           </w:p>
         </w:tc>
       </w:tr>
@@ -18608,16 +17496,8 @@
               <w:rPr>
                 <w:rFonts w:ascii="Arial" w:hAnsi="Arial" w:cs="Arial"/>
               </w:rPr>
-              <w:t xml:space="preserve">Riley: Terminare l’applicazione delle impostazioni nella </w:t>
-            </w:r>
-            <w:proofErr w:type="spellStart"/>
-            <w:r>
-              <w:rPr>
-                <w:rFonts w:ascii="Arial" w:hAnsi="Arial" w:cs="Arial"/>
-              </w:rPr>
-              <w:t>ui</w:t>
-            </w:r>
-            <w:proofErr w:type="spellEnd"/>
+              <w:t>Riley: Terminare l’applicazione delle impostazioni nella ui</w:t>
+            </w:r>
           </w:p>
           <w:p>
             <w:pPr>
@@ -18816,16 +17696,8 @@
               <w:rPr>
                 <w:rFonts w:ascii="Arial" w:hAnsi="Arial" w:cs="Arial"/>
               </w:rPr>
-              <w:t xml:space="preserve">Sprint </w:t>
-            </w:r>
-            <w:proofErr w:type="spellStart"/>
-            <w:r>
-              <w:rPr>
-                <w:rFonts w:ascii="Arial" w:hAnsi="Arial" w:cs="Arial"/>
-              </w:rPr>
-              <w:t>Retrospective</w:t>
-            </w:r>
-            <w:proofErr w:type="spellEnd"/>
+              <w:t>Sprint Retrospective</w:t>
+            </w:r>
           </w:p>
         </w:tc>
       </w:tr>
@@ -19322,21 +18194,7 @@
             <w:rPr>
               <w:rFonts w:ascii="Arial" w:hAnsi="Arial" w:cs="Arial"/>
             </w:rPr>
-            <w:t xml:space="preserve">Lo script </w:t>
-          </w:r>
-          <w:proofErr w:type="spellStart"/>
-          <w:r>
-            <w:rPr>
-              <w:rFonts w:ascii="Arial" w:hAnsi="Arial" w:cs="Arial"/>
-            </w:rPr>
-            <w:t>SettingsUI</w:t>
-          </w:r>
-          <w:proofErr w:type="spellEnd"/>
-          <w:r>
-            <w:rPr>
-              <w:rFonts w:ascii="Arial" w:hAnsi="Arial" w:cs="Arial"/>
-            </w:rPr>
-            <w:t xml:space="preserve"> sembra essersi isolato dal resto del codice, cosa potrebbe essere la causa?</w:t>
+            <w:t>Lo script SettingsUI sembra essersi isolato dal resto del codice, cosa potrebbe essere la causa?</w:t>
           </w:r>
         </w:p>
         <w:p>
@@ -19867,30 +18725,8 @@
               <w:rPr>
                 <w:rFonts w:ascii="Arial" w:hAnsi="Arial" w:cs="Arial"/>
               </w:rPr>
-              <w:t xml:space="preserve">Inizio sviluppo </w:t>
-            </w:r>
-            <w:proofErr w:type="spellStart"/>
-            <w:r>
-              <w:rPr>
-                <w:rFonts w:ascii="Arial" w:hAnsi="Arial" w:cs="Arial"/>
-              </w:rPr>
-              <w:t>db</w:t>
-            </w:r>
-            <w:proofErr w:type="spellEnd"/>
-            <w:r>
-              <w:rPr>
-                <w:rFonts w:ascii="Arial" w:hAnsi="Arial" w:cs="Arial"/>
-              </w:rPr>
-              <w:t xml:space="preserve"> </w:t>
-            </w:r>
-            <w:proofErr w:type="spellStart"/>
-            <w:r>
-              <w:rPr>
-                <w:rFonts w:ascii="Arial" w:hAnsi="Arial" w:cs="Arial"/>
-              </w:rPr>
-              <w:t>sqlite</w:t>
-            </w:r>
-            <w:proofErr w:type="spellEnd"/>
+              <w:t>Inizio sviluppo db sqlite</w:t>
+            </w:r>
           </w:p>
         </w:tc>
       </w:tr>
@@ -20102,16 +18938,8 @@
               <w:rPr>
                 <w:rFonts w:ascii="Arial" w:hAnsi="Arial" w:cs="Arial"/>
               </w:rPr>
-              <w:t xml:space="preserve">Siamo in largo anticipo, per questo motivo Riley ha cominciato a creare un vero </w:t>
-            </w:r>
-            <w:proofErr w:type="spellStart"/>
-            <w:r>
-              <w:rPr>
-                <w:rFonts w:ascii="Arial" w:hAnsi="Arial" w:cs="Arial"/>
-              </w:rPr>
-              <w:t>db</w:t>
-            </w:r>
-            <w:proofErr w:type="spellEnd"/>
+              <w:t>Siamo in largo anticipo, per questo motivo Riley ha cominciato a creare un vero db</w:t>
+            </w:r>
           </w:p>
         </w:tc>
       </w:tr>
@@ -20168,21 +18996,7 @@
               <w:rPr>
                 <w:rFonts w:ascii="Arial" w:hAnsi="Arial" w:cs="Arial"/>
               </w:rPr>
-              <w:t xml:space="preserve">Continuare rispettivamente lo sviluppo del </w:t>
-            </w:r>
-            <w:proofErr w:type="spellStart"/>
-            <w:r>
-              <w:rPr>
-                <w:rFonts w:ascii="Arial" w:hAnsi="Arial" w:cs="Arial"/>
-              </w:rPr>
-              <w:t>db</w:t>
-            </w:r>
-            <w:proofErr w:type="spellEnd"/>
-            <w:r>
-              <w:rPr>
-                <w:rFonts w:ascii="Arial" w:hAnsi="Arial" w:cs="Arial"/>
-              </w:rPr>
-              <w:t xml:space="preserve"> e della mappa</w:t>
+              <w:t>Continuare rispettivamente lo sviluppo del db e della mappa</w:t>
             </w:r>
           </w:p>
         </w:tc>
@@ -20232,28 +19046,12 @@
                 <w:rFonts w:ascii="Arial" w:hAnsi="Arial" w:cs="Arial"/>
               </w:rPr>
             </w:pPr>
-            <w:proofErr w:type="spellStart"/>
-            <w:r>
-              <w:rPr>
-                <w:rFonts w:ascii="Arial" w:hAnsi="Arial" w:cs="Arial"/>
-              </w:rPr>
-              <w:t>Daily</w:t>
-            </w:r>
-            <w:proofErr w:type="spellEnd"/>
-            <w:r>
-              <w:rPr>
-                <w:rFonts w:ascii="Arial" w:hAnsi="Arial" w:cs="Arial"/>
-              </w:rPr>
-              <w:t xml:space="preserve"> </w:t>
-            </w:r>
-            <w:proofErr w:type="spellStart"/>
-            <w:r>
-              <w:rPr>
-                <w:rFonts w:ascii="Arial" w:hAnsi="Arial" w:cs="Arial"/>
-              </w:rPr>
-              <w:t>Scrum</w:t>
-            </w:r>
-            <w:proofErr w:type="spellEnd"/>
+            <w:r>
+              <w:rPr>
+                <w:rFonts w:ascii="Arial" w:hAnsi="Arial" w:cs="Arial"/>
+              </w:rPr>
+              <w:t>Daily Scrum</w:t>
+            </w:r>
           </w:p>
         </w:tc>
       </w:tr>
@@ -20301,16 +19099,8 @@
               <w:rPr>
                 <w:rFonts w:ascii="Arial" w:hAnsi="Arial" w:cs="Arial"/>
               </w:rPr>
-              <w:t xml:space="preserve">Riley: Inizio sviluppo </w:t>
-            </w:r>
-            <w:proofErr w:type="spellStart"/>
-            <w:r>
-              <w:rPr>
-                <w:rFonts w:ascii="Arial" w:hAnsi="Arial" w:cs="Arial"/>
-              </w:rPr>
-              <w:t>db</w:t>
-            </w:r>
-            <w:proofErr w:type="spellEnd"/>
+              <w:t>Riley: Inizio sviluppo db</w:t>
+            </w:r>
           </w:p>
           <w:p>
             <w:pPr>
@@ -20503,16 +19293,8 @@
               <w:rPr>
                 <w:rFonts w:ascii="Arial" w:hAnsi="Arial" w:cs="Arial"/>
               </w:rPr>
-              <w:t xml:space="preserve">Sprint </w:t>
-            </w:r>
-            <w:proofErr w:type="spellStart"/>
-            <w:r>
-              <w:rPr>
-                <w:rFonts w:ascii="Arial" w:hAnsi="Arial" w:cs="Arial"/>
-              </w:rPr>
-              <w:t>Retrospective</w:t>
-            </w:r>
-            <w:proofErr w:type="spellEnd"/>
+              <w:t>Sprint Retrospective</w:t>
+            </w:r>
           </w:p>
         </w:tc>
       </w:tr>
@@ -20740,25 +19522,7 @@
               <w:b/>
               <w:bCs/>
             </w:rPr>
-            <w:t xml:space="preserve">Nomi </w:t>
-          </w:r>
-          <w:proofErr w:type="gramStart"/>
-          <w:r>
-            <w:rPr>
-              <w:rStyle w:val="Testosegnaposto"/>
-              <w:b/>
-              <w:bCs/>
-            </w:rPr>
-            <w:t>AI</w:t>
-          </w:r>
-          <w:proofErr w:type="gramEnd"/>
-          <w:r>
-            <w:rPr>
-              <w:rStyle w:val="Testosegnaposto"/>
-              <w:b/>
-              <w:bCs/>
-            </w:rPr>
-            <w:t xml:space="preserve"> utilizzati</w:t>
+            <w:t>Nomi AI utilizzati</w:t>
           </w:r>
         </w:sdtContent>
       </w:sdt>
@@ -21756,21 +20520,7 @@
               <w:rPr>
                 <w:rFonts w:ascii="Arial" w:hAnsi="Arial" w:cs="Arial"/>
               </w:rPr>
-              <w:t xml:space="preserve">Rispetto al pianificato abbiamo qualche giornata, di lavoro, di anticipo infatti stiamo principalmente aggiungendo dettagli lavorando con un ritmo adeguato e sviluppando già un </w:t>
-            </w:r>
-            <w:proofErr w:type="spellStart"/>
-            <w:r>
-              <w:rPr>
-                <w:rFonts w:ascii="Arial" w:hAnsi="Arial" w:cs="Arial"/>
-              </w:rPr>
-              <w:t>db</w:t>
-            </w:r>
-            <w:proofErr w:type="spellEnd"/>
-            <w:r>
-              <w:rPr>
-                <w:rFonts w:ascii="Arial" w:hAnsi="Arial" w:cs="Arial"/>
-              </w:rPr>
-              <w:t xml:space="preserve"> più reale</w:t>
+              <w:t>Rispetto al pianificato abbiamo qualche giornata, di lavoro, di anticipo infatti stiamo principalmente aggiungendo dettagli lavorando con un ritmo adeguato e sviluppando già un db più reale</w:t>
             </w:r>
           </w:p>
         </w:tc>
@@ -21828,16 +20578,8 @@
               <w:rPr>
                 <w:rFonts w:ascii="Arial" w:hAnsi="Arial" w:cs="Arial"/>
               </w:rPr>
-              <w:t xml:space="preserve">Procedere con i vari l’aggiunta di dettagli e del </w:t>
-            </w:r>
-            <w:proofErr w:type="spellStart"/>
-            <w:r>
-              <w:rPr>
-                <w:rFonts w:ascii="Arial" w:hAnsi="Arial" w:cs="Arial"/>
-              </w:rPr>
-              <w:t>db</w:t>
-            </w:r>
-            <w:proofErr w:type="spellEnd"/>
+              <w:t>Procedere con i vari l’aggiunta di dettagli e del db</w:t>
+            </w:r>
           </w:p>
         </w:tc>
       </w:tr>
@@ -21886,28 +20628,12 @@
                 <w:rFonts w:ascii="Arial" w:hAnsi="Arial" w:cs="Arial"/>
               </w:rPr>
             </w:pPr>
-            <w:proofErr w:type="spellStart"/>
-            <w:r>
-              <w:rPr>
-                <w:rFonts w:ascii="Arial" w:hAnsi="Arial" w:cs="Arial"/>
-              </w:rPr>
-              <w:t>Daily</w:t>
-            </w:r>
-            <w:proofErr w:type="spellEnd"/>
-            <w:r>
-              <w:rPr>
-                <w:rFonts w:ascii="Arial" w:hAnsi="Arial" w:cs="Arial"/>
-              </w:rPr>
-              <w:t xml:space="preserve"> </w:t>
-            </w:r>
-            <w:proofErr w:type="spellStart"/>
-            <w:r>
-              <w:rPr>
-                <w:rFonts w:ascii="Arial" w:hAnsi="Arial" w:cs="Arial"/>
-              </w:rPr>
-              <w:t>Scrum</w:t>
-            </w:r>
-            <w:proofErr w:type="spellEnd"/>
+            <w:r>
+              <w:rPr>
+                <w:rFonts w:ascii="Arial" w:hAnsi="Arial" w:cs="Arial"/>
+              </w:rPr>
+              <w:t>Daily Scrum</w:t>
+            </w:r>
           </w:p>
         </w:tc>
       </w:tr>
@@ -21967,16 +20693,8 @@
               <w:rPr>
                 <w:rFonts w:ascii="Arial" w:hAnsi="Arial" w:cs="Arial"/>
               </w:rPr>
-              <w:t xml:space="preserve">ontinuo sviluppo </w:t>
-            </w:r>
-            <w:proofErr w:type="spellStart"/>
-            <w:r>
-              <w:rPr>
-                <w:rFonts w:ascii="Arial" w:hAnsi="Arial" w:cs="Arial"/>
-              </w:rPr>
-              <w:t>db</w:t>
-            </w:r>
-            <w:proofErr w:type="spellEnd"/>
+              <w:t>ontinuo sviluppo db</w:t>
+            </w:r>
           </w:p>
           <w:p>
             <w:pPr>
@@ -22169,16 +20887,8 @@
               <w:rPr>
                 <w:rFonts w:ascii="Arial" w:hAnsi="Arial" w:cs="Arial"/>
               </w:rPr>
-              <w:t xml:space="preserve">Sprint </w:t>
-            </w:r>
-            <w:proofErr w:type="spellStart"/>
-            <w:r>
-              <w:rPr>
-                <w:rFonts w:ascii="Arial" w:hAnsi="Arial" w:cs="Arial"/>
-              </w:rPr>
-              <w:t>Retrospective</w:t>
-            </w:r>
-            <w:proofErr w:type="spellEnd"/>
+              <w:t>Sprint Retrospective</w:t>
+            </w:r>
           </w:p>
         </w:tc>
       </w:tr>
@@ -22681,35 +21391,7 @@
             <w:rPr>
               <w:rFonts w:ascii="Arial" w:hAnsi="Arial" w:cs="Arial"/>
             </w:rPr>
-            <w:t xml:space="preserve">non ho fatto dei veri e propri </w:t>
-          </w:r>
-          <w:proofErr w:type="spellStart"/>
-          <w:r>
-            <w:rPr>
-              <w:rFonts w:ascii="Arial" w:hAnsi="Arial" w:cs="Arial"/>
-            </w:rPr>
-            <w:t>promt</w:t>
-          </w:r>
-          <w:proofErr w:type="spellEnd"/>
-          <w:r>
-            <w:rPr>
-              <w:rFonts w:ascii="Arial" w:hAnsi="Arial" w:cs="Arial"/>
-            </w:rPr>
-            <w:t xml:space="preserve"> oggi, ma mi sono cimentato nel procedere con una spiegazione guidata per applicare </w:t>
-          </w:r>
-          <w:proofErr w:type="spellStart"/>
-          <w:r>
-            <w:rPr>
-              <w:rFonts w:ascii="Arial" w:hAnsi="Arial" w:cs="Arial"/>
-            </w:rPr>
-            <w:t>SQLite</w:t>
-          </w:r>
-          <w:proofErr w:type="spellEnd"/>
-          <w:r>
-            <w:rPr>
-              <w:rFonts w:ascii="Arial" w:hAnsi="Arial" w:cs="Arial"/>
-            </w:rPr>
-            <w:t xml:space="preserve"> alla base di dati sviluppata finora.</w:t>
+            <w:t>non ho fatto dei veri e propri promt oggi, ma mi sono cimentato nel procedere con una spiegazione guidata per applicare SQLite alla base di dati sviluppata finora.</w:t>
           </w:r>
         </w:p>
         <w:p>
@@ -23302,21 +21984,7 @@
               <w:rPr>
                 <w:rFonts w:ascii="Arial" w:hAnsi="Arial" w:cs="Arial"/>
               </w:rPr>
-              <w:t xml:space="preserve">Ho sistemato un problema di animazione, creato </w:t>
-            </w:r>
-            <w:proofErr w:type="gramStart"/>
-            <w:r>
-              <w:rPr>
-                <w:rFonts w:ascii="Arial" w:hAnsi="Arial" w:cs="Arial"/>
-              </w:rPr>
-              <w:t>il build</w:t>
-            </w:r>
-            <w:proofErr w:type="gramEnd"/>
-            <w:r>
-              <w:rPr>
-                <w:rFonts w:ascii="Arial" w:hAnsi="Arial" w:cs="Arial"/>
-              </w:rPr>
-              <w:t xml:space="preserve"> del progetto per certi test, ricerca modifica materiali auto ed inizio menu garage</w:t>
+              <w:t>Ho sistemato un problema di animazione, creato il build del progetto per certi test, ricerca modifica materiali auto ed inizio menu garage</w:t>
             </w:r>
           </w:p>
         </w:tc>
@@ -23549,21 +22217,7 @@
               <w:rPr>
                 <w:rFonts w:ascii="Arial" w:hAnsi="Arial" w:cs="Arial"/>
               </w:rPr>
-              <w:t xml:space="preserve">Continuare sviluppo garage e </w:t>
-            </w:r>
-            <w:proofErr w:type="spellStart"/>
-            <w:r>
-              <w:rPr>
-                <w:rFonts w:ascii="Arial" w:hAnsi="Arial" w:cs="Arial"/>
-              </w:rPr>
-              <w:t>db</w:t>
-            </w:r>
-            <w:proofErr w:type="spellEnd"/>
-            <w:r>
-              <w:rPr>
-                <w:rFonts w:ascii="Arial" w:hAnsi="Arial" w:cs="Arial"/>
-              </w:rPr>
-              <w:t>.</w:t>
+              <w:t>Continuare sviluppo garage e db.</w:t>
             </w:r>
           </w:p>
         </w:tc>
@@ -23613,28 +22267,12 @@
                 <w:rFonts w:ascii="Arial" w:hAnsi="Arial" w:cs="Arial"/>
               </w:rPr>
             </w:pPr>
-            <w:proofErr w:type="spellStart"/>
-            <w:r>
-              <w:rPr>
-                <w:rFonts w:ascii="Arial" w:hAnsi="Arial" w:cs="Arial"/>
-              </w:rPr>
-              <w:t>Daily</w:t>
-            </w:r>
-            <w:proofErr w:type="spellEnd"/>
-            <w:r>
-              <w:rPr>
-                <w:rFonts w:ascii="Arial" w:hAnsi="Arial" w:cs="Arial"/>
-              </w:rPr>
-              <w:t xml:space="preserve"> </w:t>
-            </w:r>
-            <w:proofErr w:type="spellStart"/>
-            <w:r>
-              <w:rPr>
-                <w:rFonts w:ascii="Arial" w:hAnsi="Arial" w:cs="Arial"/>
-              </w:rPr>
-              <w:t>Scrum</w:t>
-            </w:r>
-            <w:proofErr w:type="spellEnd"/>
+            <w:r>
+              <w:rPr>
+                <w:rFonts w:ascii="Arial" w:hAnsi="Arial" w:cs="Arial"/>
+              </w:rPr>
+              <w:t>Daily Scrum</w:t>
+            </w:r>
           </w:p>
         </w:tc>
       </w:tr>
@@ -23682,16 +22320,8 @@
               <w:rPr>
                 <w:rFonts w:ascii="Arial" w:hAnsi="Arial" w:cs="Arial"/>
               </w:rPr>
-              <w:t xml:space="preserve">Riley: Continuo sviluppo </w:t>
-            </w:r>
-            <w:proofErr w:type="spellStart"/>
-            <w:r>
-              <w:rPr>
-                <w:rFonts w:ascii="Arial" w:hAnsi="Arial" w:cs="Arial"/>
-              </w:rPr>
-              <w:t>db</w:t>
-            </w:r>
-            <w:proofErr w:type="spellEnd"/>
+              <w:t>Riley: Continuo sviluppo db</w:t>
+            </w:r>
           </w:p>
           <w:p>
             <w:pPr>
@@ -23884,16 +22514,8 @@
               <w:rPr>
                 <w:rFonts w:ascii="Arial" w:hAnsi="Arial" w:cs="Arial"/>
               </w:rPr>
-              <w:t xml:space="preserve">Sprint </w:t>
-            </w:r>
-            <w:proofErr w:type="spellStart"/>
-            <w:r>
-              <w:rPr>
-                <w:rFonts w:ascii="Arial" w:hAnsi="Arial" w:cs="Arial"/>
-              </w:rPr>
-              <w:t>Retrospective</w:t>
-            </w:r>
-            <w:proofErr w:type="spellEnd"/>
+              <w:t>Sprint Retrospective</w:t>
+            </w:r>
           </w:p>
         </w:tc>
       </w:tr>
@@ -24121,25 +22743,7 @@
               <w:b/>
               <w:bCs/>
             </w:rPr>
-            <w:t xml:space="preserve">Nomi </w:t>
-          </w:r>
-          <w:proofErr w:type="gramStart"/>
-          <w:r>
-            <w:rPr>
-              <w:rStyle w:val="Testosegnaposto"/>
-              <w:b/>
-              <w:bCs/>
-            </w:rPr>
-            <w:t>AI</w:t>
-          </w:r>
-          <w:proofErr w:type="gramEnd"/>
-          <w:r>
-            <w:rPr>
-              <w:rStyle w:val="Testosegnaposto"/>
-              <w:b/>
-              <w:bCs/>
-            </w:rPr>
-            <w:t xml:space="preserve"> utilizzati</w:t>
+            <w:t>Nomi AI utilizzati</w:t>
           </w:r>
         </w:sdtContent>
       </w:sdt>
@@ -24918,16 +23522,8 @@
               <w:rPr>
                 <w:rFonts w:ascii="Arial" w:hAnsi="Arial" w:cs="Arial"/>
               </w:rPr>
-              <w:t xml:space="preserve">Continuato lo sviluppo del </w:t>
-            </w:r>
-            <w:proofErr w:type="spellStart"/>
-            <w:r>
-              <w:rPr>
-                <w:rFonts w:ascii="Arial" w:hAnsi="Arial" w:cs="Arial"/>
-              </w:rPr>
-              <w:t>db</w:t>
-            </w:r>
-            <w:proofErr w:type="spellEnd"/>
+              <w:t>Continuato lo sviluppo del db</w:t>
+            </w:r>
           </w:p>
         </w:tc>
       </w:tr>
@@ -25197,35 +23793,7 @@
               <w:rPr>
                 <w:rFonts w:ascii="Arial" w:hAnsi="Arial" w:cs="Arial"/>
               </w:rPr>
-              <w:t xml:space="preserve">Continuare ognuno con </w:t>
-            </w:r>
-            <w:proofErr w:type="gramStart"/>
-            <w:r>
-              <w:rPr>
-                <w:rFonts w:ascii="Arial" w:hAnsi="Arial" w:cs="Arial"/>
-              </w:rPr>
-              <w:t>i</w:t>
-            </w:r>
-            <w:proofErr w:type="gramEnd"/>
-            <w:r>
-              <w:rPr>
-                <w:rFonts w:ascii="Arial" w:hAnsi="Arial" w:cs="Arial"/>
-              </w:rPr>
-              <w:t xml:space="preserve"> sviluppi di </w:t>
-            </w:r>
-            <w:proofErr w:type="spellStart"/>
-            <w:r>
-              <w:rPr>
-                <w:rFonts w:ascii="Arial" w:hAnsi="Arial" w:cs="Arial"/>
-              </w:rPr>
-              <w:t>db</w:t>
-            </w:r>
-            <w:proofErr w:type="spellEnd"/>
-            <w:r>
-              <w:rPr>
-                <w:rFonts w:ascii="Arial" w:hAnsi="Arial" w:cs="Arial"/>
-              </w:rPr>
-              <w:t xml:space="preserve"> e garage</w:t>
+              <w:t>Continuare ognuno con i sviluppi di db e garage</w:t>
             </w:r>
           </w:p>
         </w:tc>
@@ -25275,28 +23843,12 @@
                 <w:rFonts w:ascii="Arial" w:hAnsi="Arial" w:cs="Arial"/>
               </w:rPr>
             </w:pPr>
-            <w:proofErr w:type="spellStart"/>
-            <w:r>
-              <w:rPr>
-                <w:rFonts w:ascii="Arial" w:hAnsi="Arial" w:cs="Arial"/>
-              </w:rPr>
-              <w:t>Daily</w:t>
-            </w:r>
-            <w:proofErr w:type="spellEnd"/>
-            <w:r>
-              <w:rPr>
-                <w:rFonts w:ascii="Arial" w:hAnsi="Arial" w:cs="Arial"/>
-              </w:rPr>
-              <w:t xml:space="preserve"> </w:t>
-            </w:r>
-            <w:proofErr w:type="spellStart"/>
-            <w:r>
-              <w:rPr>
-                <w:rFonts w:ascii="Arial" w:hAnsi="Arial" w:cs="Arial"/>
-              </w:rPr>
-              <w:t>Scrum</w:t>
-            </w:r>
-            <w:proofErr w:type="spellEnd"/>
+            <w:r>
+              <w:rPr>
+                <w:rFonts w:ascii="Arial" w:hAnsi="Arial" w:cs="Arial"/>
+              </w:rPr>
+              <w:t>Daily Scrum</w:t>
+            </w:r>
           </w:p>
         </w:tc>
       </w:tr>
@@ -25344,16 +23896,8 @@
               <w:rPr>
                 <w:rFonts w:ascii="Arial" w:hAnsi="Arial" w:cs="Arial"/>
               </w:rPr>
-              <w:t xml:space="preserve">Riley: Continuo sviluppo </w:t>
-            </w:r>
-            <w:proofErr w:type="spellStart"/>
-            <w:r>
-              <w:rPr>
-                <w:rFonts w:ascii="Arial" w:hAnsi="Arial" w:cs="Arial"/>
-              </w:rPr>
-              <w:t>db</w:t>
-            </w:r>
-            <w:proofErr w:type="spellEnd"/>
+              <w:t>Riley: Continuo sviluppo db</w:t>
+            </w:r>
           </w:p>
           <w:p>
             <w:pPr>
@@ -25546,16 +24090,8 @@
               <w:rPr>
                 <w:rFonts w:ascii="Arial" w:hAnsi="Arial" w:cs="Arial"/>
               </w:rPr>
-              <w:t xml:space="preserve">Sprint </w:t>
-            </w:r>
-            <w:proofErr w:type="spellStart"/>
-            <w:r>
-              <w:rPr>
-                <w:rFonts w:ascii="Arial" w:hAnsi="Arial" w:cs="Arial"/>
-              </w:rPr>
-              <w:t>Retrospective</w:t>
-            </w:r>
-            <w:proofErr w:type="spellEnd"/>
+              <w:t>Sprint Retrospective</w:t>
+            </w:r>
           </w:p>
         </w:tc>
       </w:tr>
@@ -26052,21 +24588,7 @@
             <w:rPr>
               <w:rFonts w:ascii="Arial" w:hAnsi="Arial" w:cs="Arial"/>
             </w:rPr>
-            <w:t xml:space="preserve">Dovrei introdurre nel </w:t>
-          </w:r>
-          <w:proofErr w:type="spellStart"/>
-          <w:r>
-            <w:rPr>
-              <w:rFonts w:ascii="Arial" w:hAnsi="Arial" w:cs="Arial"/>
-            </w:rPr>
-            <w:t>db</w:t>
-          </w:r>
-          <w:proofErr w:type="spellEnd"/>
-          <w:r>
-            <w:rPr>
-              <w:rFonts w:ascii="Arial" w:hAnsi="Arial" w:cs="Arial"/>
-            </w:rPr>
-            <w:t xml:space="preserve"> i comandi collegati alle impostazioni, ma la struttura usata è diversa da quelle precedenti, e viene usata una classe esterna.</w:t>
+            <w:t>Dovrei introdurre nel db i comandi collegati alle impostazioni, ma la struttura usata è diversa da quelle precedenti, e viene usata una classe esterna.</w:t>
           </w:r>
         </w:p>
         <w:p>
@@ -26513,13 +25035,7 @@
               <w:rPr>
                 <w:rFonts w:ascii="Arial" w:hAnsi="Arial" w:cs="Arial"/>
               </w:rPr>
-              <w:t>9</w:t>
-            </w:r>
-            <w:r>
-              <w:rPr>
-                <w:rFonts w:ascii="Arial" w:hAnsi="Arial" w:cs="Arial"/>
-              </w:rPr>
-              <w:t>.10.2026</w:t>
+              <w:t>9.10.2026</w:t>
             </w:r>
           </w:p>
         </w:tc>
@@ -26597,16 +25113,8 @@
               <w:rPr>
                 <w:rFonts w:ascii="Arial" w:hAnsi="Arial" w:cs="Arial"/>
               </w:rPr>
-              <w:t xml:space="preserve">Continuato lo sviluppo del </w:t>
-            </w:r>
-            <w:proofErr w:type="spellStart"/>
-            <w:r>
-              <w:rPr>
-                <w:rFonts w:ascii="Arial" w:hAnsi="Arial" w:cs="Arial"/>
-              </w:rPr>
-              <w:t>db</w:t>
-            </w:r>
-            <w:proofErr w:type="spellEnd"/>
+              <w:t>Terminato con le parti fondamentali per il DB</w:t>
+            </w:r>
           </w:p>
         </w:tc>
       </w:tr>
@@ -26643,7 +25151,7 @@
               <w:rPr>
                 <w:rFonts w:ascii="Arial" w:hAnsi="Arial" w:cs="Arial"/>
               </w:rPr>
-              <w:t>Continuato il garage</w:t>
+              <w:t>Finito animazioni menu, finiti collegamenti menu, inizio sviluppo extra garage</w:t>
             </w:r>
           </w:p>
         </w:tc>
@@ -26722,7 +25230,7 @@
               <w:rPr>
                 <w:rFonts w:ascii="Arial" w:hAnsi="Arial" w:cs="Arial"/>
               </w:rPr>
-              <w:t>Struttura di assegnazione tasti diversa rispetto al resto, perciò è stato necessario adattare i due metodi, ancora in sviluppo</w:t>
+              <w:t>Le statistiche erano scomparse, Bryan ha fatto un rollback e quando mi sono state passate non erano collegate in modo concreto, quindi non risultava funzionante. Per risolvere ho semplicemente inserito gli oggetti necessari nei campi dello script</w:t>
             </w:r>
           </w:p>
         </w:tc>
@@ -26760,7 +25268,7 @@
               <w:rPr>
                 <w:rFonts w:ascii="Arial" w:hAnsi="Arial" w:cs="Arial"/>
               </w:rPr>
-              <w:t>-</w:t>
+              <w:t>Non riuscivo a rendere cliccabile un bottone in una scena specifica, avevo provato a farmi risolvere il problema da un ai ma con scarsi risultati. Alla fine grazie a Riley siamo riusciti a capire dove si trovava il problema</w:t>
             </w:r>
           </w:p>
         </w:tc>
@@ -26818,7 +25326,7 @@
               <w:rPr>
                 <w:rFonts w:ascii="Arial" w:hAnsi="Arial" w:cs="Arial"/>
               </w:rPr>
-              <w:t>Lavori dello sprint già conclusi, stanno essendo svolti dei lavori extra</w:t>
+              <w:t>Perfettamente in orario ed allineati con grafica e backend</w:t>
             </w:r>
           </w:p>
         </w:tc>
@@ -26876,35 +25384,7 @@
               <w:rPr>
                 <w:rFonts w:ascii="Arial" w:hAnsi="Arial" w:cs="Arial"/>
               </w:rPr>
-              <w:t xml:space="preserve">Continuare ognuno con </w:t>
-            </w:r>
-            <w:proofErr w:type="gramStart"/>
-            <w:r>
-              <w:rPr>
-                <w:rFonts w:ascii="Arial" w:hAnsi="Arial" w:cs="Arial"/>
-              </w:rPr>
-              <w:t>i</w:t>
-            </w:r>
-            <w:proofErr w:type="gramEnd"/>
-            <w:r>
-              <w:rPr>
-                <w:rFonts w:ascii="Arial" w:hAnsi="Arial" w:cs="Arial"/>
-              </w:rPr>
-              <w:t xml:space="preserve"> sviluppi di </w:t>
-            </w:r>
-            <w:proofErr w:type="spellStart"/>
-            <w:r>
-              <w:rPr>
-                <w:rFonts w:ascii="Arial" w:hAnsi="Arial" w:cs="Arial"/>
-              </w:rPr>
-              <w:t>db</w:t>
-            </w:r>
-            <w:proofErr w:type="spellEnd"/>
-            <w:r>
-              <w:rPr>
-                <w:rFonts w:ascii="Arial" w:hAnsi="Arial" w:cs="Arial"/>
-              </w:rPr>
-              <w:t xml:space="preserve"> e garage</w:t>
+              <w:t>Fare lo sprint review e cominciare con il prossimo che riguarda la meccanica di movimento</w:t>
             </w:r>
           </w:p>
         </w:tc>
@@ -26954,28 +25434,12 @@
                 <w:rFonts w:ascii="Arial" w:hAnsi="Arial" w:cs="Arial"/>
               </w:rPr>
             </w:pPr>
-            <w:proofErr w:type="spellStart"/>
-            <w:r>
-              <w:rPr>
-                <w:rFonts w:ascii="Arial" w:hAnsi="Arial" w:cs="Arial"/>
-              </w:rPr>
-              <w:t>Daily</w:t>
-            </w:r>
-            <w:proofErr w:type="spellEnd"/>
-            <w:r>
-              <w:rPr>
-                <w:rFonts w:ascii="Arial" w:hAnsi="Arial" w:cs="Arial"/>
-              </w:rPr>
-              <w:t xml:space="preserve"> </w:t>
-            </w:r>
-            <w:proofErr w:type="spellStart"/>
-            <w:r>
-              <w:rPr>
-                <w:rFonts w:ascii="Arial" w:hAnsi="Arial" w:cs="Arial"/>
-              </w:rPr>
-              <w:t>Scrum</w:t>
-            </w:r>
-            <w:proofErr w:type="spellEnd"/>
+            <w:r>
+              <w:rPr>
+                <w:rFonts w:ascii="Arial" w:hAnsi="Arial" w:cs="Arial"/>
+              </w:rPr>
+              <w:t>Daily Scrum</w:t>
+            </w:r>
           </w:p>
         </w:tc>
       </w:tr>
@@ -27023,16 +25487,8 @@
               <w:rPr>
                 <w:rFonts w:ascii="Arial" w:hAnsi="Arial" w:cs="Arial"/>
               </w:rPr>
-              <w:t xml:space="preserve">Riley: Continuo sviluppo </w:t>
-            </w:r>
-            <w:proofErr w:type="spellStart"/>
-            <w:r>
-              <w:rPr>
-                <w:rFonts w:ascii="Arial" w:hAnsi="Arial" w:cs="Arial"/>
-              </w:rPr>
-              <w:t>db</w:t>
-            </w:r>
-            <w:proofErr w:type="spellEnd"/>
+              <w:t>Riley: Continuo sviluppo db</w:t>
+            </w:r>
           </w:p>
           <w:p>
             <w:pPr>
@@ -27225,16 +25681,8 @@
               <w:rPr>
                 <w:rFonts w:ascii="Arial" w:hAnsi="Arial" w:cs="Arial"/>
               </w:rPr>
-              <w:t xml:space="preserve">Sprint </w:t>
-            </w:r>
-            <w:proofErr w:type="spellStart"/>
-            <w:r>
-              <w:rPr>
-                <w:rFonts w:ascii="Arial" w:hAnsi="Arial" w:cs="Arial"/>
-              </w:rPr>
-              <w:t>Retrospective</w:t>
-            </w:r>
-            <w:proofErr w:type="spellEnd"/>
+              <w:t>Sprint Retrospective</w:t>
+            </w:r>
           </w:p>
         </w:tc>
       </w:tr>
@@ -27349,7 +25797,7 @@
           </w:rPr>
           <w:id w:val="-56011435"/>
           <w14:checkbox>
-            <w14:checked w14:val="1"/>
+            <w14:checked w14:val="0"/>
             <w14:checkedState w14:val="2612" w14:font="MS Gothic"/>
             <w14:uncheckedState w14:val="2610" w14:font="MS Gothic"/>
           </w14:checkbox>
@@ -27359,7 +25807,7 @@
             <w:rPr>
               <w:rFonts w:ascii="MS Gothic" w:eastAsia="MS Gothic" w:hAnsi="MS Gothic" w:cs="Segoe UI Symbol" w:hint="eastAsia"/>
             </w:rPr>
-            <w:t>☒</w:t>
+            <w:t>☐</w:t>
           </w:r>
         </w:sdtContent>
       </w:sdt>
@@ -27379,7 +25827,7 @@
           </w:rPr>
           <w:id w:val="-198240390"/>
           <w14:checkbox>
-            <w14:checked w14:val="0"/>
+            <w14:checked w14:val="1"/>
             <w14:checkedState w14:val="2612" w14:font="MS Gothic"/>
             <w14:uncheckedState w14:val="2610" w14:font="MS Gothic"/>
           </w14:checkbox>
@@ -27389,7 +25837,7 @@
             <w:rPr>
               <w:rFonts w:ascii="MS Gothic" w:eastAsia="MS Gothic" w:hAnsi="MS Gothic" w:cs="Segoe UI Symbol" w:hint="eastAsia"/>
             </w:rPr>
-            <w:t>☐</w:t>
+            <w:t>☒</w:t>
           </w:r>
         </w:sdtContent>
       </w:sdt>
@@ -27460,6 +25908,12 @@
               <w:rFonts w:ascii="Arial" w:hAnsi="Arial" w:cs="Arial"/>
             </w:rPr>
             <w:t>ChatGPT</w:t>
+          </w:r>
+          <w:r>
+            <w:rPr>
+              <w:rFonts w:ascii="Arial" w:hAnsi="Arial" w:cs="Arial"/>
+            </w:rPr>
+            <w:t>, Gemini</w:t>
           </w:r>
         </w:sdtContent>
       </w:sdt>
@@ -27557,7 +26011,7 @@
           </w:rPr>
           <w:id w:val="-1424412563"/>
           <w14:checkbox>
-            <w14:checked w14:val="0"/>
+            <w14:checked w14:val="1"/>
             <w14:checkedState w14:val="2612" w14:font="MS Gothic"/>
             <w14:uncheckedState w14:val="2610" w14:font="MS Gothic"/>
           </w14:checkbox>
@@ -27567,7 +26021,7 @@
             <w:rPr>
               <w:rFonts w:ascii="MS Gothic" w:eastAsia="MS Gothic" w:hAnsi="MS Gothic" w:cs="Segoe UI Symbol" w:hint="eastAsia"/>
             </w:rPr>
-            <w:t>☐</w:t>
+            <w:t>☒</w:t>
           </w:r>
         </w:sdtContent>
       </w:sdt>
@@ -27725,21 +26179,13 @@
             <w:rPr>
               <w:rFonts w:ascii="Arial" w:hAnsi="Arial" w:cs="Arial"/>
             </w:rPr>
-            <w:t xml:space="preserve">Riley: Dovrei introdurre nel </w:t>
-          </w:r>
-          <w:proofErr w:type="spellStart"/>
+            <w:t xml:space="preserve">Riley: </w:t>
+          </w:r>
           <w:r>
             <w:rPr>
               <w:rFonts w:ascii="Arial" w:hAnsi="Arial" w:cs="Arial"/>
             </w:rPr>
-            <w:t>db</w:t>
-          </w:r>
-          <w:proofErr w:type="spellEnd"/>
-          <w:r>
-            <w:rPr>
-              <w:rFonts w:ascii="Arial" w:hAnsi="Arial" w:cs="Arial"/>
-            </w:rPr>
-            <w:t xml:space="preserve"> i comandi collegati alle impostazioni, ma la struttura usata è diversa da quelle precedenti, e viene usata una classe esterna.</w:t>
+            <w:t>Vogliamo integrare una nuova tabella di auto per delle statistiche, puoi mostrarmi come, circa, adattare quest’aggiunta con il codice presente</w:t>
           </w:r>
         </w:p>
         <w:p>
@@ -27755,6 +26201,12 @@
               <w:rFonts w:ascii="Arial" w:hAnsi="Arial" w:cs="Arial"/>
             </w:rPr>
             <w:t xml:space="preserve">Bryan: </w:t>
+          </w:r>
+          <w:r>
+            <w:rPr>
+              <w:rFonts w:ascii="Arial" w:hAnsi="Arial" w:cs="Arial"/>
+            </w:rPr>
+            <w:t>Come posso risolvere questo errore che mi è uscito nel terminale: &lt;errore&gt;</w:t>
           </w:r>
         </w:p>
       </w:sdtContent>
@@ -27831,7 +26283,13 @@
             <w:rPr>
               <w:rFonts w:ascii="Arial" w:hAnsi="Arial" w:cs="Arial"/>
             </w:rPr>
-            <w:t>Riley: Mi è stato detto come alcune parti della struttura siano ancora usabili e mi è stato chiesto qualche dettaglio per i comandi per potermi fornire delle risposte più corrette</w:t>
+            <w:t xml:space="preserve">Riley: </w:t>
+          </w:r>
+          <w:r>
+            <w:rPr>
+              <w:rFonts w:ascii="Arial" w:hAnsi="Arial" w:cs="Arial"/>
+            </w:rPr>
+            <w:t>Mi ha spiegato il come fare ma purtroppo non è stato molto preciso e non sono riuscito ad usare bene la soluzione proposta</w:t>
           </w:r>
         </w:p>
         <w:p>
@@ -27847,6 +26305,12 @@
               <w:rFonts w:ascii="Arial" w:hAnsi="Arial" w:cs="Arial"/>
             </w:rPr>
             <w:t xml:space="preserve">Bryan: </w:t>
+          </w:r>
+          <w:r>
+            <w:rPr>
+              <w:rFonts w:ascii="Arial" w:hAnsi="Arial" w:cs="Arial"/>
+            </w:rPr>
+            <w:t>Un tentativo di risoluzione, che si è rilevato inutile nel mio caso</w:t>
           </w:r>
         </w:p>
       </w:sdtContent>
@@ -27889,7 +26353,7 @@
           </w:rPr>
           <w:id w:val="915982531"/>
           <w14:checkbox>
-            <w14:checked w14:val="0"/>
+            <w14:checked w14:val="1"/>
             <w14:checkedState w14:val="2612" w14:font="MS Gothic"/>
             <w14:uncheckedState w14:val="2610" w14:font="MS Gothic"/>
           </w14:checkbox>
@@ -27899,7 +26363,7 @@
             <w:rPr>
               <w:rFonts w:ascii="MS Gothic" w:eastAsia="MS Gothic" w:hAnsi="MS Gothic" w:cs="Segoe UI Symbol" w:hint="eastAsia"/>
             </w:rPr>
-            <w:t>☐</w:t>
+            <w:t>☒</w:t>
           </w:r>
         </w:sdtContent>
       </w:sdt>
@@ -27955,7 +26419,7 @@
           </w:rPr>
           <w:id w:val="1086198916"/>
           <w14:checkbox>
-            <w14:checked w14:val="0"/>
+            <w14:checked w14:val="1"/>
             <w14:checkedState w14:val="2612" w14:font="MS Gothic"/>
             <w14:uncheckedState w14:val="2610" w14:font="MS Gothic"/>
           </w14:checkbox>
@@ -27965,7 +26429,7 @@
             <w:rPr>
               <w:rFonts w:ascii="MS Gothic" w:eastAsia="MS Gothic" w:hAnsi="MS Gothic" w:cs="Segoe UI Symbol" w:hint="eastAsia"/>
             </w:rPr>
-            <w:t>☐</w:t>
+            <w:t>☒</w:t>
           </w:r>
         </w:sdtContent>
       </w:sdt>
@@ -28052,7 +26516,13 @@
         <w:rPr>
           <w:rFonts w:ascii="Arial" w:hAnsi="Arial" w:cs="Arial"/>
         </w:rPr>
-        <w:t>Riley: Avrei probabilmente cercato di comprendere il codice e chiesto a Bryan il funzionamento per potermi adattare</w:t>
+        <w:t xml:space="preserve">Riley: </w:t>
+      </w:r>
+      <w:r>
+        <w:rPr>
+          <w:rFonts w:ascii="Arial" w:hAnsi="Arial" w:cs="Arial"/>
+        </w:rPr>
+        <w:t>Avrei cercato di adattare basandomi su i file presenti.</w:t>
       </w:r>
     </w:p>
     <w:p>
@@ -28067,6 +26537,12 @@
           <w:rFonts w:ascii="Arial" w:hAnsi="Arial" w:cs="Arial"/>
         </w:rPr>
         <w:t>Bryan:</w:t>
+      </w:r>
+      <w:r>
+        <w:rPr>
+          <w:rFonts w:ascii="Arial" w:hAnsi="Arial" w:cs="Arial"/>
+        </w:rPr>
+        <w:t xml:space="preserve"> Debugging.</w:t>
       </w:r>
     </w:p>
     <w:p>
@@ -28294,17 +26770,8 @@
         <w:rFonts w:ascii="Arial" w:hAnsi="Arial" w:cs="Arial"/>
         <w:lang w:val="fr-CH"/>
       </w:rPr>
-      <w:t xml:space="preserve">Riley Bianchi &amp; Bryan </w:t>
+      <w:t>Riley Bianchi &amp; Bryan Ciaponi</w:t>
     </w:r>
-    <w:proofErr w:type="spellStart"/>
-    <w:r>
-      <w:rPr>
-        <w:rFonts w:ascii="Arial" w:hAnsi="Arial" w:cs="Arial"/>
-        <w:lang w:val="fr-CH"/>
-      </w:rPr>
-      <w:t>Ciaponi</w:t>
-    </w:r>
-    <w:proofErr w:type="spellEnd"/>
   </w:p>
 </w:hdr>
 </file>
@@ -33680,8 +32147,10 @@
     <w:rsid w:val="001A3B5C"/>
     <w:rsid w:val="001C42CE"/>
     <w:rsid w:val="00254718"/>
+    <w:rsid w:val="002B6D86"/>
     <w:rsid w:val="00352469"/>
     <w:rsid w:val="00356BEF"/>
+    <w:rsid w:val="003648DA"/>
     <w:rsid w:val="00396FDF"/>
     <w:rsid w:val="003B3A61"/>
     <w:rsid w:val="003C64D2"/>
@@ -33721,6 +32190,7 @@
     <w:rsid w:val="00A629CF"/>
     <w:rsid w:val="00A65B6C"/>
     <w:rsid w:val="00AA022F"/>
+    <w:rsid w:val="00AC4AC4"/>
     <w:rsid w:val="00AD46CF"/>
     <w:rsid w:val="00B06614"/>
     <w:rsid w:val="00B555FF"/>

</xml_diff>

<commit_message>
Creazione scena di gioco e sprint diario
</commit_message>
<xml_diff>
--- a/4_Diari/Diario.docx
+++ b/4_Diari/Diario.docx
@@ -193,7 +193,21 @@
               <w:rPr>
                 <w:rFonts w:ascii="Arial" w:hAnsi="Arial" w:cs="Arial"/>
               </w:rPr>
-              <w:t>Riflettuto sui requisiti e user story del gioco, creato i primi template per gantt e diario</w:t>
+              <w:t xml:space="preserve">Riflettuto sui requisiti e user story del gioco, creato i primi template per </w:t>
+            </w:r>
+            <w:proofErr w:type="spellStart"/>
+            <w:r>
+              <w:rPr>
+                <w:rFonts w:ascii="Arial" w:hAnsi="Arial" w:cs="Arial"/>
+              </w:rPr>
+              <w:t>gantt</w:t>
+            </w:r>
+            <w:proofErr w:type="spellEnd"/>
+            <w:r>
+              <w:rPr>
+                <w:rFonts w:ascii="Arial" w:hAnsi="Arial" w:cs="Arial"/>
+              </w:rPr>
+              <w:t xml:space="preserve"> e diario</w:t>
             </w:r>
           </w:p>
         </w:tc>
@@ -234,7 +248,21 @@
               <w:rPr>
                 <w:rFonts w:ascii="Arial" w:hAnsi="Arial" w:cs="Arial"/>
               </w:rPr>
-              <w:t>Riflettuto sui requisiti e user story del gioco, iniziato scrittura documentazione e sincronizzazione progetto a GitLab.</w:t>
+              <w:t xml:space="preserve">Riflettuto sui requisiti e user story del gioco, iniziato scrittura documentazione e sincronizzazione progetto a </w:t>
+            </w:r>
+            <w:proofErr w:type="spellStart"/>
+            <w:r>
+              <w:rPr>
+                <w:rFonts w:ascii="Arial" w:hAnsi="Arial" w:cs="Arial"/>
+              </w:rPr>
+              <w:t>GitLab</w:t>
+            </w:r>
+            <w:proofErr w:type="spellEnd"/>
+            <w:r>
+              <w:rPr>
+                <w:rFonts w:ascii="Arial" w:hAnsi="Arial" w:cs="Arial"/>
+              </w:rPr>
+              <w:t>.</w:t>
             </w:r>
           </w:p>
         </w:tc>
@@ -2234,7 +2262,21 @@
             <w:rPr>
               <w:rFonts w:ascii="Arial" w:hAnsi="Arial" w:cs="Arial"/>
             </w:rPr>
-            <w:t>Aitami a generare dei requesiti in base ai seguenti dati</w:t>
+            <w:t xml:space="preserve">Aitami a generare dei </w:t>
+          </w:r>
+          <w:proofErr w:type="spellStart"/>
+          <w:r>
+            <w:rPr>
+              <w:rFonts w:ascii="Arial" w:hAnsi="Arial" w:cs="Arial"/>
+            </w:rPr>
+            <w:t>requesiti</w:t>
+          </w:r>
+          <w:proofErr w:type="spellEnd"/>
+          <w:r>
+            <w:rPr>
+              <w:rFonts w:ascii="Arial" w:hAnsi="Arial" w:cs="Arial"/>
+            </w:rPr>
+            <w:t xml:space="preserve"> in base ai seguenti dati</w:t>
           </w:r>
         </w:p>
       </w:sdtContent>
@@ -2774,7 +2816,21 @@
               <w:rPr>
                 <w:rFonts w:ascii="Arial" w:hAnsi="Arial" w:cs="Arial"/>
               </w:rPr>
-              <w:t>Completata la analisi del dominio nella documentazione, inizio ricerche riguardo Unity.</w:t>
+              <w:t xml:space="preserve">Completata la analisi del dominio nella documentazione, inizio ricerche riguardo </w:t>
+            </w:r>
+            <w:proofErr w:type="spellStart"/>
+            <w:r>
+              <w:rPr>
+                <w:rFonts w:ascii="Arial" w:hAnsi="Arial" w:cs="Arial"/>
+              </w:rPr>
+              <w:t>Unity</w:t>
+            </w:r>
+            <w:proofErr w:type="spellEnd"/>
+            <w:r>
+              <w:rPr>
+                <w:rFonts w:ascii="Arial" w:hAnsi="Arial" w:cs="Arial"/>
+              </w:rPr>
+              <w:t>.</w:t>
             </w:r>
           </w:p>
         </w:tc>
@@ -3981,8 +4037,16 @@
               <w:rPr>
                 <w:rFonts w:ascii="Arial" w:hAnsi="Arial" w:cs="Arial"/>
               </w:rPr>
-              <w:t>Creato diagramma ER e modifiche strutturali gantt</w:t>
-            </w:r>
+              <w:t xml:space="preserve">Creato diagramma ER e modifiche strutturali </w:t>
+            </w:r>
+            <w:proofErr w:type="spellStart"/>
+            <w:r>
+              <w:rPr>
+                <w:rFonts w:ascii="Arial" w:hAnsi="Arial" w:cs="Arial"/>
+              </w:rPr>
+              <w:t>gantt</w:t>
+            </w:r>
+            <w:proofErr w:type="spellEnd"/>
           </w:p>
         </w:tc>
       </w:tr>
@@ -4730,12 +4794,20 @@
             <w:rPr>
               <w:rFonts w:ascii="Arial" w:hAnsi="Arial" w:cs="Arial"/>
             </w:rPr>
-            <w:t>uoi dirmi delle classiche impostazioni per un gioco di guida in stile br</w:t>
-          </w:r>
+            <w:t xml:space="preserve">uoi dirmi delle classiche impostazioni per un gioco di guida in stile </w:t>
+          </w:r>
+          <w:proofErr w:type="spellStart"/>
           <w:r>
             <w:rPr>
               <w:rFonts w:ascii="Arial" w:hAnsi="Arial" w:cs="Arial"/>
             </w:rPr>
+            <w:t>br</w:t>
+          </w:r>
+          <w:proofErr w:type="spellEnd"/>
+          <w:r>
+            <w:rPr>
+              <w:rFonts w:ascii="Arial" w:hAnsi="Arial" w:cs="Arial"/>
+            </w:rPr>
             <w:t xml:space="preserve">. </w:t>
           </w:r>
           <w:r>
@@ -4743,7 +4815,21 @@
               <w:rFonts w:ascii="Arial" w:hAnsi="Arial" w:cs="Arial"/>
             </w:rPr>
             <w:br/>
-            <w:t>Bryan: Spiegami Unity ed i suoi vantaggi.</w:t>
+            <w:t xml:space="preserve">Bryan: Spiegami </w:t>
+          </w:r>
+          <w:proofErr w:type="spellStart"/>
+          <w:r>
+            <w:rPr>
+              <w:rFonts w:ascii="Arial" w:hAnsi="Arial" w:cs="Arial"/>
+            </w:rPr>
+            <w:t>Unity</w:t>
+          </w:r>
+          <w:proofErr w:type="spellEnd"/>
+          <w:r>
+            <w:rPr>
+              <w:rFonts w:ascii="Arial" w:hAnsi="Arial" w:cs="Arial"/>
+            </w:rPr>
+            <w:t xml:space="preserve"> ed i suoi vantaggi.</w:t>
           </w:r>
         </w:p>
       </w:sdtContent>
@@ -5221,8 +5307,16 @@
               <w:rPr>
                 <w:rFonts w:ascii="Arial" w:hAnsi="Arial" w:cs="Arial"/>
               </w:rPr>
-              <w:t>Creato Diagramma ER e aggiornato gannt</w:t>
-            </w:r>
+              <w:t xml:space="preserve">Creato Diagramma ER e aggiornato </w:t>
+            </w:r>
+            <w:proofErr w:type="spellStart"/>
+            <w:r>
+              <w:rPr>
+                <w:rFonts w:ascii="Arial" w:hAnsi="Arial" w:cs="Arial"/>
+              </w:rPr>
+              <w:t>gannt</w:t>
+            </w:r>
+            <w:proofErr w:type="spellEnd"/>
           </w:p>
         </w:tc>
       </w:tr>
@@ -5259,7 +5353,21 @@
               <w:rPr>
                 <w:rFonts w:ascii="Arial" w:hAnsi="Arial" w:cs="Arial"/>
               </w:rPr>
-              <w:t>Use Case finito, Inizio creazione e documentazione mockup UI.</w:t>
+              <w:t xml:space="preserve">Use Case finito, Inizio creazione e documentazione </w:t>
+            </w:r>
+            <w:proofErr w:type="spellStart"/>
+            <w:r>
+              <w:rPr>
+                <w:rFonts w:ascii="Arial" w:hAnsi="Arial" w:cs="Arial"/>
+              </w:rPr>
+              <w:t>mockup</w:t>
+            </w:r>
+            <w:proofErr w:type="spellEnd"/>
+            <w:r>
+              <w:rPr>
+                <w:rFonts w:ascii="Arial" w:hAnsi="Arial" w:cs="Arial"/>
+              </w:rPr>
+              <w:t xml:space="preserve"> UI.</w:t>
             </w:r>
           </w:p>
         </w:tc>
@@ -5505,7 +5613,21 @@
               <w:rPr>
                 <w:rFonts w:ascii="Arial" w:hAnsi="Arial" w:cs="Arial"/>
               </w:rPr>
-              <w:t>Continuo creazione Mockup UI.</w:t>
+              <w:t xml:space="preserve">Continuo creazione </w:t>
+            </w:r>
+            <w:proofErr w:type="spellStart"/>
+            <w:r>
+              <w:rPr>
+                <w:rFonts w:ascii="Arial" w:hAnsi="Arial" w:cs="Arial"/>
+              </w:rPr>
+              <w:t>Mockup</w:t>
+            </w:r>
+            <w:proofErr w:type="spellEnd"/>
+            <w:r>
+              <w:rPr>
+                <w:rFonts w:ascii="Arial" w:hAnsi="Arial" w:cs="Arial"/>
+              </w:rPr>
+              <w:t xml:space="preserve"> UI.</w:t>
             </w:r>
           </w:p>
         </w:tc>
@@ -6076,8 +6198,16 @@
               <w:rFonts w:ascii="Arial" w:hAnsi="Arial" w:cs="Arial"/>
             </w:rPr>
             <w:br/>
-            <w:t>Bryan: Correzioni dello use case generato dal colega</w:t>
-          </w:r>
+            <w:t xml:space="preserve">Bryan: Correzioni dello use case generato dal </w:t>
+          </w:r>
+          <w:proofErr w:type="spellStart"/>
+          <w:r>
+            <w:rPr>
+              <w:rFonts w:ascii="Arial" w:hAnsi="Arial" w:cs="Arial"/>
+            </w:rPr>
+            <w:t>colega</w:t>
+          </w:r>
+          <w:proofErr w:type="spellEnd"/>
         </w:p>
       </w:sdtContent>
     </w:sdt>
@@ -6477,8 +6607,16 @@
               <w:rPr>
                 <w:rFonts w:ascii="Arial" w:hAnsi="Arial" w:cs="Arial"/>
               </w:rPr>
-              <w:t>Completata progettazione e creazione progetto unity</w:t>
-            </w:r>
+              <w:t xml:space="preserve">Completata progettazione e creazione progetto </w:t>
+            </w:r>
+            <w:proofErr w:type="spellStart"/>
+            <w:r>
+              <w:rPr>
+                <w:rFonts w:ascii="Arial" w:hAnsi="Arial" w:cs="Arial"/>
+              </w:rPr>
+              <w:t>unity</w:t>
+            </w:r>
+            <w:proofErr w:type="spellEnd"/>
           </w:p>
         </w:tc>
       </w:tr>
@@ -6515,8 +6653,16 @@
               <w:rPr>
                 <w:rFonts w:ascii="Arial" w:hAnsi="Arial" w:cs="Arial"/>
               </w:rPr>
-              <w:t>Fine Mockup</w:t>
-            </w:r>
+              <w:t xml:space="preserve">Fine </w:t>
+            </w:r>
+            <w:proofErr w:type="spellStart"/>
+            <w:r>
+              <w:rPr>
+                <w:rFonts w:ascii="Arial" w:hAnsi="Arial" w:cs="Arial"/>
+              </w:rPr>
+              <w:t>Mockup</w:t>
+            </w:r>
+            <w:proofErr w:type="spellEnd"/>
           </w:p>
         </w:tc>
       </w:tr>
@@ -6594,8 +6740,44 @@
               <w:rPr>
                 <w:rFonts w:ascii="Arial" w:hAnsi="Arial" w:cs="Arial"/>
               </w:rPr>
-              <w:t>Problemi nel pushare il progetto uinity, risolto grazie alla creazione di un file .gitignore</w:t>
-            </w:r>
+              <w:t xml:space="preserve">Problemi nel </w:t>
+            </w:r>
+            <w:proofErr w:type="spellStart"/>
+            <w:r>
+              <w:rPr>
+                <w:rFonts w:ascii="Arial" w:hAnsi="Arial" w:cs="Arial"/>
+              </w:rPr>
+              <w:t>pushare</w:t>
+            </w:r>
+            <w:proofErr w:type="spellEnd"/>
+            <w:r>
+              <w:rPr>
+                <w:rFonts w:ascii="Arial" w:hAnsi="Arial" w:cs="Arial"/>
+              </w:rPr>
+              <w:t xml:space="preserve"> il progetto </w:t>
+            </w:r>
+            <w:proofErr w:type="spellStart"/>
+            <w:r>
+              <w:rPr>
+                <w:rFonts w:ascii="Arial" w:hAnsi="Arial" w:cs="Arial"/>
+              </w:rPr>
+              <w:t>uinity</w:t>
+            </w:r>
+            <w:proofErr w:type="spellEnd"/>
+            <w:r>
+              <w:rPr>
+                <w:rFonts w:ascii="Arial" w:hAnsi="Arial" w:cs="Arial"/>
+              </w:rPr>
+              <w:t>, risolto grazie alla creazione di un file .</w:t>
+            </w:r>
+            <w:proofErr w:type="spellStart"/>
+            <w:r>
+              <w:rPr>
+                <w:rFonts w:ascii="Arial" w:hAnsi="Arial" w:cs="Arial"/>
+              </w:rPr>
+              <w:t>gitignore</w:t>
+            </w:r>
+            <w:proofErr w:type="spellEnd"/>
           </w:p>
         </w:tc>
       </w:tr>
@@ -6748,7 +6930,35 @@
               <w:rPr>
                 <w:rFonts w:ascii="Arial" w:hAnsi="Arial" w:cs="Arial"/>
               </w:rPr>
-              <w:t>Ambientarsi nel game engine di unity e quindi cominciare a creare la schermata di statistiche</w:t>
+              <w:t xml:space="preserve">Ambientarsi nel game </w:t>
+            </w:r>
+            <w:proofErr w:type="spellStart"/>
+            <w:r>
+              <w:rPr>
+                <w:rFonts w:ascii="Arial" w:hAnsi="Arial" w:cs="Arial"/>
+              </w:rPr>
+              <w:t>engine</w:t>
+            </w:r>
+            <w:proofErr w:type="spellEnd"/>
+            <w:r>
+              <w:rPr>
+                <w:rFonts w:ascii="Arial" w:hAnsi="Arial" w:cs="Arial"/>
+              </w:rPr>
+              <w:t xml:space="preserve"> di </w:t>
+            </w:r>
+            <w:proofErr w:type="spellStart"/>
+            <w:r>
+              <w:rPr>
+                <w:rFonts w:ascii="Arial" w:hAnsi="Arial" w:cs="Arial"/>
+              </w:rPr>
+              <w:t>unity</w:t>
+            </w:r>
+            <w:proofErr w:type="spellEnd"/>
+            <w:r>
+              <w:rPr>
+                <w:rFonts w:ascii="Arial" w:hAnsi="Arial" w:cs="Arial"/>
+              </w:rPr>
+              <w:t xml:space="preserve"> e quindi cominciare a creare la schermata di statistiche</w:t>
             </w:r>
           </w:p>
         </w:tc>
@@ -7220,7 +7430,21 @@
             <w:rPr>
               <w:rFonts w:ascii="Arial" w:hAnsi="Arial" w:cs="Arial"/>
             </w:rPr>
-            <w:t>Bryan: Generami un’immagine di mockup basandoti sul seguente stile: “stile”</w:t>
+            <w:t xml:space="preserve">Bryan: Generami un’immagine di </w:t>
+          </w:r>
+          <w:proofErr w:type="spellStart"/>
+          <w:r>
+            <w:rPr>
+              <w:rFonts w:ascii="Arial" w:hAnsi="Arial" w:cs="Arial"/>
+            </w:rPr>
+            <w:t>mockup</w:t>
+          </w:r>
+          <w:proofErr w:type="spellEnd"/>
+          <w:r>
+            <w:rPr>
+              <w:rFonts w:ascii="Arial" w:hAnsi="Arial" w:cs="Arial"/>
+            </w:rPr>
+            <w:t xml:space="preserve"> basandoti sul seguente stile: “stile”</w:t>
           </w:r>
         </w:p>
         <w:p>
@@ -7534,14 +7758,50 @@
         <w:rPr>
           <w:rFonts w:ascii="Arial" w:hAnsi="Arial" w:cs="Arial"/>
         </w:rPr>
-        <w:t>Riley: probabilmente non sarei riuscito a risolvere questo problema non avendo un’esperienza molto avanzata con i file .gitignore</w:t>
-      </w:r>
+        <w:t>Riley: probabilmente non sarei riuscito a risolvere questo problema non avendo un’esperienza molto avanzata con i file .</w:t>
+      </w:r>
+      <w:proofErr w:type="spellStart"/>
+      <w:r>
+        <w:rPr>
+          <w:rFonts w:ascii="Arial" w:hAnsi="Arial" w:cs="Arial"/>
+        </w:rPr>
+        <w:t>gitignore</w:t>
+      </w:r>
+      <w:proofErr w:type="spellEnd"/>
       <w:r>
         <w:rPr>
           <w:rFonts w:ascii="Arial" w:hAnsi="Arial" w:cs="Arial"/>
         </w:rPr>
         <w:br/>
-        <w:t>Bryan: Averi creato un’immagine su paint che avrebbe reso i mockup molto più confusi.</w:t>
+        <w:t xml:space="preserve">Bryan: Averi creato un’immagine su </w:t>
+      </w:r>
+      <w:proofErr w:type="spellStart"/>
+      <w:r>
+        <w:rPr>
+          <w:rFonts w:ascii="Arial" w:hAnsi="Arial" w:cs="Arial"/>
+        </w:rPr>
+        <w:t>paint</w:t>
+      </w:r>
+      <w:proofErr w:type="spellEnd"/>
+      <w:r>
+        <w:rPr>
+          <w:rFonts w:ascii="Arial" w:hAnsi="Arial" w:cs="Arial"/>
+        </w:rPr>
+        <w:t xml:space="preserve"> che avrebbe reso i </w:t>
+      </w:r>
+      <w:proofErr w:type="spellStart"/>
+      <w:r>
+        <w:rPr>
+          <w:rFonts w:ascii="Arial" w:hAnsi="Arial" w:cs="Arial"/>
+        </w:rPr>
+        <w:t>mockup</w:t>
+      </w:r>
+      <w:proofErr w:type="spellEnd"/>
+      <w:r>
+        <w:rPr>
+          <w:rFonts w:ascii="Arial" w:hAnsi="Arial" w:cs="Arial"/>
+        </w:rPr>
+        <w:t xml:space="preserve"> molto più confusi.</w:t>
       </w:r>
     </w:p>
     <w:p>
@@ -7727,7 +7987,21 @@
               <w:rPr>
                 <w:rFonts w:ascii="Arial" w:hAnsi="Arial" w:cs="Arial"/>
               </w:rPr>
-              <w:t>Inizio sviluppo ui statistiche</w:t>
+              <w:t xml:space="preserve">Inizio sviluppo </w:t>
+            </w:r>
+            <w:proofErr w:type="spellStart"/>
+            <w:r>
+              <w:rPr>
+                <w:rFonts w:ascii="Arial" w:hAnsi="Arial" w:cs="Arial"/>
+              </w:rPr>
+              <w:t>ui</w:t>
+            </w:r>
+            <w:proofErr w:type="spellEnd"/>
+            <w:r>
+              <w:rPr>
+                <w:rFonts w:ascii="Arial" w:hAnsi="Arial" w:cs="Arial"/>
+              </w:rPr>
+              <w:t xml:space="preserve"> statistiche</w:t>
             </w:r>
           </w:p>
         </w:tc>
@@ -7765,7 +8039,21 @@
               <w:rPr>
                 <w:rFonts w:ascii="Arial" w:hAnsi="Arial" w:cs="Arial"/>
               </w:rPr>
-              <w:t>Inizio sviluppo ui statistiche</w:t>
+              <w:t xml:space="preserve">Inizio sviluppo </w:t>
+            </w:r>
+            <w:proofErr w:type="spellStart"/>
+            <w:r>
+              <w:rPr>
+                <w:rFonts w:ascii="Arial" w:hAnsi="Arial" w:cs="Arial"/>
+              </w:rPr>
+              <w:t>ui</w:t>
+            </w:r>
+            <w:proofErr w:type="spellEnd"/>
+            <w:r>
+              <w:rPr>
+                <w:rFonts w:ascii="Arial" w:hAnsi="Arial" w:cs="Arial"/>
+              </w:rPr>
+              <w:t xml:space="preserve"> statistiche</w:t>
             </w:r>
           </w:p>
         </w:tc>
@@ -7998,7 +8286,21 @@
               <w:rPr>
                 <w:rFonts w:ascii="Arial" w:hAnsi="Arial" w:cs="Arial"/>
               </w:rPr>
-              <w:t>Completare la ui delle statistiche</w:t>
+              <w:t xml:space="preserve">Completare la </w:t>
+            </w:r>
+            <w:proofErr w:type="spellStart"/>
+            <w:r>
+              <w:rPr>
+                <w:rFonts w:ascii="Arial" w:hAnsi="Arial" w:cs="Arial"/>
+              </w:rPr>
+              <w:t>ui</w:t>
+            </w:r>
+            <w:proofErr w:type="spellEnd"/>
+            <w:r>
+              <w:rPr>
+                <w:rFonts w:ascii="Arial" w:hAnsi="Arial" w:cs="Arial"/>
+              </w:rPr>
+              <w:t xml:space="preserve"> delle statistiche</w:t>
             </w:r>
           </w:p>
         </w:tc>
@@ -8048,12 +8350,28 @@
                 <w:rFonts w:ascii="Arial" w:hAnsi="Arial" w:cs="Arial"/>
               </w:rPr>
             </w:pPr>
-            <w:r>
-              <w:rPr>
-                <w:rFonts w:ascii="Arial" w:hAnsi="Arial" w:cs="Arial"/>
-              </w:rPr>
-              <w:t>Daily Scrum</w:t>
-            </w:r>
+            <w:proofErr w:type="spellStart"/>
+            <w:r>
+              <w:rPr>
+                <w:rFonts w:ascii="Arial" w:hAnsi="Arial" w:cs="Arial"/>
+              </w:rPr>
+              <w:t>Daily</w:t>
+            </w:r>
+            <w:proofErr w:type="spellEnd"/>
+            <w:r>
+              <w:rPr>
+                <w:rFonts w:ascii="Arial" w:hAnsi="Arial" w:cs="Arial"/>
+              </w:rPr>
+              <w:t xml:space="preserve"> </w:t>
+            </w:r>
+            <w:proofErr w:type="spellStart"/>
+            <w:r>
+              <w:rPr>
+                <w:rFonts w:ascii="Arial" w:hAnsi="Arial" w:cs="Arial"/>
+              </w:rPr>
+              <w:t>Scrum</w:t>
+            </w:r>
+            <w:proofErr w:type="spellEnd"/>
           </w:p>
         </w:tc>
       </w:tr>
@@ -8101,7 +8419,35 @@
               <w:rPr>
                 <w:rFonts w:ascii="Arial" w:hAnsi="Arial" w:cs="Arial"/>
               </w:rPr>
-              <w:t>Introduzione ambiente unity e inizio imostazione layout statistiche</w:t>
+              <w:t xml:space="preserve">Introduzione ambiente </w:t>
+            </w:r>
+            <w:proofErr w:type="spellStart"/>
+            <w:r>
+              <w:rPr>
+                <w:rFonts w:ascii="Arial" w:hAnsi="Arial" w:cs="Arial"/>
+              </w:rPr>
+              <w:t>unity</w:t>
+            </w:r>
+            <w:proofErr w:type="spellEnd"/>
+            <w:r>
+              <w:rPr>
+                <w:rFonts w:ascii="Arial" w:hAnsi="Arial" w:cs="Arial"/>
+              </w:rPr>
+              <w:t xml:space="preserve"> e inizio </w:t>
+            </w:r>
+            <w:proofErr w:type="spellStart"/>
+            <w:r>
+              <w:rPr>
+                <w:rFonts w:ascii="Arial" w:hAnsi="Arial" w:cs="Arial"/>
+              </w:rPr>
+              <w:t>imostazione</w:t>
+            </w:r>
+            <w:proofErr w:type="spellEnd"/>
+            <w:r>
+              <w:rPr>
+                <w:rFonts w:ascii="Arial" w:hAnsi="Arial" w:cs="Arial"/>
+              </w:rPr>
+              <w:t xml:space="preserve"> layout statistiche</w:t>
             </w:r>
           </w:p>
         </w:tc>
@@ -8281,8 +8627,16 @@
               <w:rPr>
                 <w:rFonts w:ascii="Arial" w:hAnsi="Arial" w:cs="Arial"/>
               </w:rPr>
-              <w:t>Sprint Retrospective</w:t>
-            </w:r>
+              <w:t xml:space="preserve">Sprint </w:t>
+            </w:r>
+            <w:proofErr w:type="spellStart"/>
+            <w:r>
+              <w:rPr>
+                <w:rFonts w:ascii="Arial" w:hAnsi="Arial" w:cs="Arial"/>
+              </w:rPr>
+              <w:t>Retrospective</w:t>
+            </w:r>
+            <w:proofErr w:type="spellEnd"/>
           </w:p>
         </w:tc>
       </w:tr>
@@ -9243,8 +9597,44 @@
               <w:rPr>
                 <w:rFonts w:ascii="Arial" w:hAnsi="Arial" w:cs="Arial"/>
               </w:rPr>
-              <w:t>Ricerca e sviluppo per salvataggio statistiche su json, non ancora completo, questo verrà utilizzato come test per verificare il funzionamento delle varie schermate ui poi verrà adattato per il db</w:t>
-            </w:r>
+              <w:t xml:space="preserve">Ricerca e sviluppo per salvataggio statistiche su </w:t>
+            </w:r>
+            <w:proofErr w:type="spellStart"/>
+            <w:r>
+              <w:rPr>
+                <w:rFonts w:ascii="Arial" w:hAnsi="Arial" w:cs="Arial"/>
+              </w:rPr>
+              <w:t>json</w:t>
+            </w:r>
+            <w:proofErr w:type="spellEnd"/>
+            <w:r>
+              <w:rPr>
+                <w:rFonts w:ascii="Arial" w:hAnsi="Arial" w:cs="Arial"/>
+              </w:rPr>
+              <w:t xml:space="preserve">, non ancora completo, questo verrà utilizzato come test per verificare il funzionamento delle varie schermate </w:t>
+            </w:r>
+            <w:proofErr w:type="spellStart"/>
+            <w:r>
+              <w:rPr>
+                <w:rFonts w:ascii="Arial" w:hAnsi="Arial" w:cs="Arial"/>
+              </w:rPr>
+              <w:t>ui</w:t>
+            </w:r>
+            <w:proofErr w:type="spellEnd"/>
+            <w:r>
+              <w:rPr>
+                <w:rFonts w:ascii="Arial" w:hAnsi="Arial" w:cs="Arial"/>
+              </w:rPr>
+              <w:t xml:space="preserve"> poi verrà adattato per il </w:t>
+            </w:r>
+            <w:proofErr w:type="spellStart"/>
+            <w:r>
+              <w:rPr>
+                <w:rFonts w:ascii="Arial" w:hAnsi="Arial" w:cs="Arial"/>
+              </w:rPr>
+              <w:t>db</w:t>
+            </w:r>
+            <w:proofErr w:type="spellEnd"/>
           </w:p>
         </w:tc>
       </w:tr>
@@ -9398,7 +9788,21 @@
               <w:rPr>
                 <w:rFonts w:ascii="Arial" w:hAnsi="Arial" w:cs="Arial"/>
               </w:rPr>
-              <w:t>Non trovavo la cartella degli assets, risolto cercando su google.</w:t>
+              <w:t xml:space="preserve">Non trovavo la cartella degli assets, risolto cercando su </w:t>
+            </w:r>
+            <w:proofErr w:type="spellStart"/>
+            <w:r>
+              <w:rPr>
+                <w:rFonts w:ascii="Arial" w:hAnsi="Arial" w:cs="Arial"/>
+              </w:rPr>
+              <w:t>google</w:t>
+            </w:r>
+            <w:proofErr w:type="spellEnd"/>
+            <w:r>
+              <w:rPr>
+                <w:rFonts w:ascii="Arial" w:hAnsi="Arial" w:cs="Arial"/>
+              </w:rPr>
+              <w:t>.</w:t>
             </w:r>
           </w:p>
         </w:tc>
@@ -9456,7 +9860,21 @@
               <w:rPr>
                 <w:rFonts w:ascii="Arial" w:hAnsi="Arial" w:cs="Arial"/>
               </w:rPr>
-              <w:t>Le statistiche non sono concluse, manca una piccola parte della ui e la logica di salvataggio e caricamento</w:t>
+              <w:t xml:space="preserve">Le statistiche non sono concluse, manca una piccola parte della </w:t>
+            </w:r>
+            <w:proofErr w:type="spellStart"/>
+            <w:r>
+              <w:rPr>
+                <w:rFonts w:ascii="Arial" w:hAnsi="Arial" w:cs="Arial"/>
+              </w:rPr>
+              <w:t>ui</w:t>
+            </w:r>
+            <w:proofErr w:type="spellEnd"/>
+            <w:r>
+              <w:rPr>
+                <w:rFonts w:ascii="Arial" w:hAnsi="Arial" w:cs="Arial"/>
+              </w:rPr>
+              <w:t xml:space="preserve"> e la logica di salvataggio e caricamento</w:t>
             </w:r>
           </w:p>
         </w:tc>
@@ -9564,12 +9982,28 @@
                 <w:rFonts w:ascii="Arial" w:hAnsi="Arial" w:cs="Arial"/>
               </w:rPr>
             </w:pPr>
-            <w:r>
-              <w:rPr>
-                <w:rFonts w:ascii="Arial" w:hAnsi="Arial" w:cs="Arial"/>
-              </w:rPr>
-              <w:t>Daily Scrum</w:t>
-            </w:r>
+            <w:proofErr w:type="spellStart"/>
+            <w:r>
+              <w:rPr>
+                <w:rFonts w:ascii="Arial" w:hAnsi="Arial" w:cs="Arial"/>
+              </w:rPr>
+              <w:t>Daily</w:t>
+            </w:r>
+            <w:proofErr w:type="spellEnd"/>
+            <w:r>
+              <w:rPr>
+                <w:rFonts w:ascii="Arial" w:hAnsi="Arial" w:cs="Arial"/>
+              </w:rPr>
+              <w:t xml:space="preserve"> </w:t>
+            </w:r>
+            <w:proofErr w:type="spellStart"/>
+            <w:r>
+              <w:rPr>
+                <w:rFonts w:ascii="Arial" w:hAnsi="Arial" w:cs="Arial"/>
+              </w:rPr>
+              <w:t>Scrum</w:t>
+            </w:r>
+            <w:proofErr w:type="spellEnd"/>
           </w:p>
         </w:tc>
       </w:tr>
@@ -9617,7 +10051,35 @@
               <w:rPr>
                 <w:rFonts w:ascii="Arial" w:hAnsi="Arial" w:cs="Arial"/>
               </w:rPr>
-              <w:t>Entrambi completeremo la ui delle statistiche in modo tale che ci ambientiamo completamente per lo sviluppo 2D e gli script C# per poterci permettere di lavorare separatamente in fututro.</w:t>
+              <w:t xml:space="preserve">Entrambi completeremo la </w:t>
+            </w:r>
+            <w:proofErr w:type="spellStart"/>
+            <w:r>
+              <w:rPr>
+                <w:rFonts w:ascii="Arial" w:hAnsi="Arial" w:cs="Arial"/>
+              </w:rPr>
+              <w:t>ui</w:t>
+            </w:r>
+            <w:proofErr w:type="spellEnd"/>
+            <w:r>
+              <w:rPr>
+                <w:rFonts w:ascii="Arial" w:hAnsi="Arial" w:cs="Arial"/>
+              </w:rPr>
+              <w:t xml:space="preserve"> delle statistiche in modo tale che ci ambientiamo completamente per lo sviluppo 2D e gli script C# per poterci permettere di lavorare separatamente in </w:t>
+            </w:r>
+            <w:proofErr w:type="spellStart"/>
+            <w:r>
+              <w:rPr>
+                <w:rFonts w:ascii="Arial" w:hAnsi="Arial" w:cs="Arial"/>
+              </w:rPr>
+              <w:t>fututro</w:t>
+            </w:r>
+            <w:proofErr w:type="spellEnd"/>
+            <w:r>
+              <w:rPr>
+                <w:rFonts w:ascii="Arial" w:hAnsi="Arial" w:cs="Arial"/>
+              </w:rPr>
+              <w:t>.</w:t>
             </w:r>
           </w:p>
         </w:tc>
@@ -9797,8 +10259,16 @@
               <w:rPr>
                 <w:rFonts w:ascii="Arial" w:hAnsi="Arial" w:cs="Arial"/>
               </w:rPr>
-              <w:t>Sprint Retrospective</w:t>
-            </w:r>
+              <w:t xml:space="preserve">Sprint </w:t>
+            </w:r>
+            <w:proofErr w:type="spellStart"/>
+            <w:r>
+              <w:rPr>
+                <w:rFonts w:ascii="Arial" w:hAnsi="Arial" w:cs="Arial"/>
+              </w:rPr>
+              <w:t>Retrospective</w:t>
+            </w:r>
+            <w:proofErr w:type="spellEnd"/>
           </w:p>
         </w:tc>
       </w:tr>
@@ -10290,8 +10760,30 @@
             <w:rPr>
               <w:rFonts w:ascii="Arial" w:hAnsi="Arial" w:cs="Arial"/>
             </w:rPr>
-            <w:t>Riley: aiutami a comprendere come salvare dei dati unity su un json</w:t>
-          </w:r>
+            <w:t xml:space="preserve">Riley: aiutami a comprendere come salvare dei dati </w:t>
+          </w:r>
+          <w:proofErr w:type="spellStart"/>
+          <w:r>
+            <w:rPr>
+              <w:rFonts w:ascii="Arial" w:hAnsi="Arial" w:cs="Arial"/>
+            </w:rPr>
+            <w:t>unity</w:t>
+          </w:r>
+          <w:proofErr w:type="spellEnd"/>
+          <w:r>
+            <w:rPr>
+              <w:rFonts w:ascii="Arial" w:hAnsi="Arial" w:cs="Arial"/>
+            </w:rPr>
+            <w:t xml:space="preserve"> su un </w:t>
+          </w:r>
+          <w:proofErr w:type="spellStart"/>
+          <w:r>
+            <w:rPr>
+              <w:rFonts w:ascii="Arial" w:hAnsi="Arial" w:cs="Arial"/>
+            </w:rPr>
+            <w:t>json</w:t>
+          </w:r>
+          <w:proofErr w:type="spellEnd"/>
         </w:p>
       </w:sdtContent>
     </w:sdt>
@@ -10803,7 +11295,21 @@
               <w:rPr>
                 <w:rFonts w:ascii="Arial" w:hAnsi="Arial" w:cs="Arial"/>
               </w:rPr>
-              <w:t>Terminato ui statistiche e iniziato quella delle impostazioni</w:t>
+              <w:t xml:space="preserve">Terminato </w:t>
+            </w:r>
+            <w:proofErr w:type="spellStart"/>
+            <w:r>
+              <w:rPr>
+                <w:rFonts w:ascii="Arial" w:hAnsi="Arial" w:cs="Arial"/>
+              </w:rPr>
+              <w:t>ui</w:t>
+            </w:r>
+            <w:proofErr w:type="spellEnd"/>
+            <w:r>
+              <w:rPr>
+                <w:rFonts w:ascii="Arial" w:hAnsi="Arial" w:cs="Arial"/>
+              </w:rPr>
+              <w:t xml:space="preserve"> statistiche e iniziato quella delle impostazioni</w:t>
             </w:r>
           </w:p>
         </w:tc>
@@ -10882,13 +11388,97 @@
               <w:rPr>
                 <w:rFonts w:ascii="Arial" w:hAnsi="Arial" w:cs="Arial"/>
               </w:rPr>
-              <w:t>Problemi di merge, risolto tramite una configurazione di un tool di unity che permette di risolvere automaticamente i conflitti, è stato fatto una configurazione che fa avvia un file .cmd sotto la cartella tools questo piccolo script prende i file con conflitti rilevati da git e li traduce per unityyalmmerge facendo in modo che una volta usato il comando git pull non risultino più errori.</w:t>
-            </w:r>
-            <w:r>
-              <w:rPr>
-                <w:rFonts w:ascii="Arial" w:hAnsi="Arial" w:cs="Arial"/>
-              </w:rPr>
-              <w:t xml:space="preserve"> Chatgpt mi ha supportato nella risoluzione di questo problema</w:t>
+              <w:t xml:space="preserve">Problemi di merge, risolto tramite una configurazione di un tool di </w:t>
+            </w:r>
+            <w:proofErr w:type="spellStart"/>
+            <w:r>
+              <w:rPr>
+                <w:rFonts w:ascii="Arial" w:hAnsi="Arial" w:cs="Arial"/>
+              </w:rPr>
+              <w:t>unity</w:t>
+            </w:r>
+            <w:proofErr w:type="spellEnd"/>
+            <w:r>
+              <w:rPr>
+                <w:rFonts w:ascii="Arial" w:hAnsi="Arial" w:cs="Arial"/>
+              </w:rPr>
+              <w:t xml:space="preserve"> che permette di risolvere automaticamente i conflitti, è stato fatto una configurazione che fa avvia un file .</w:t>
+            </w:r>
+            <w:proofErr w:type="spellStart"/>
+            <w:r>
+              <w:rPr>
+                <w:rFonts w:ascii="Arial" w:hAnsi="Arial" w:cs="Arial"/>
+              </w:rPr>
+              <w:t>cmd</w:t>
+            </w:r>
+            <w:proofErr w:type="spellEnd"/>
+            <w:r>
+              <w:rPr>
+                <w:rFonts w:ascii="Arial" w:hAnsi="Arial" w:cs="Arial"/>
+              </w:rPr>
+              <w:t xml:space="preserve"> sotto la cartella tools questo piccolo script prende i file con conflitti rilevati da </w:t>
+            </w:r>
+            <w:proofErr w:type="spellStart"/>
+            <w:r>
+              <w:rPr>
+                <w:rFonts w:ascii="Arial" w:hAnsi="Arial" w:cs="Arial"/>
+              </w:rPr>
+              <w:t>git</w:t>
+            </w:r>
+            <w:proofErr w:type="spellEnd"/>
+            <w:r>
+              <w:rPr>
+                <w:rFonts w:ascii="Arial" w:hAnsi="Arial" w:cs="Arial"/>
+              </w:rPr>
+              <w:t xml:space="preserve"> e li traduce per </w:t>
+            </w:r>
+            <w:proofErr w:type="spellStart"/>
+            <w:r>
+              <w:rPr>
+                <w:rFonts w:ascii="Arial" w:hAnsi="Arial" w:cs="Arial"/>
+              </w:rPr>
+              <w:t>unityyalmmerge</w:t>
+            </w:r>
+            <w:proofErr w:type="spellEnd"/>
+            <w:r>
+              <w:rPr>
+                <w:rFonts w:ascii="Arial" w:hAnsi="Arial" w:cs="Arial"/>
+              </w:rPr>
+              <w:t xml:space="preserve"> facendo in modo che una volta usato il comando </w:t>
+            </w:r>
+            <w:proofErr w:type="spellStart"/>
+            <w:r>
+              <w:rPr>
+                <w:rFonts w:ascii="Arial" w:hAnsi="Arial" w:cs="Arial"/>
+              </w:rPr>
+              <w:t>git</w:t>
+            </w:r>
+            <w:proofErr w:type="spellEnd"/>
+            <w:r>
+              <w:rPr>
+                <w:rFonts w:ascii="Arial" w:hAnsi="Arial" w:cs="Arial"/>
+              </w:rPr>
+              <w:t xml:space="preserve"> pull non risultino più errori.</w:t>
+            </w:r>
+            <w:r>
+              <w:rPr>
+                <w:rFonts w:ascii="Arial" w:hAnsi="Arial" w:cs="Arial"/>
+              </w:rPr>
+              <w:t xml:space="preserve"> </w:t>
+            </w:r>
+            <w:proofErr w:type="spellStart"/>
+            <w:r>
+              <w:rPr>
+                <w:rFonts w:ascii="Arial" w:hAnsi="Arial" w:cs="Arial"/>
+              </w:rPr>
+              <w:t>Chatgpt</w:t>
+            </w:r>
+            <w:proofErr w:type="spellEnd"/>
+            <w:r>
+              <w:rPr>
+                <w:rFonts w:ascii="Arial" w:hAnsi="Arial" w:cs="Arial"/>
+              </w:rPr>
+              <w:t xml:space="preserve"> mi ha supportato nella risoluzione di questo problema</w:t>
             </w:r>
           </w:p>
         </w:tc>
@@ -10984,7 +11574,21 @@
               <w:rPr>
                 <w:rFonts w:ascii="Arial" w:hAnsi="Arial" w:cs="Arial"/>
               </w:rPr>
-              <w:t>La ui delle statistiche è completa ma mancano alcune parti dello script, di conseguenza abbiamo un ritardo generale.</w:t>
+              <w:t xml:space="preserve">La </w:t>
+            </w:r>
+            <w:proofErr w:type="spellStart"/>
+            <w:r>
+              <w:rPr>
+                <w:rFonts w:ascii="Arial" w:hAnsi="Arial" w:cs="Arial"/>
+              </w:rPr>
+              <w:t>ui</w:t>
+            </w:r>
+            <w:proofErr w:type="spellEnd"/>
+            <w:r>
+              <w:rPr>
+                <w:rFonts w:ascii="Arial" w:hAnsi="Arial" w:cs="Arial"/>
+              </w:rPr>
+              <w:t xml:space="preserve"> delle statistiche è completa ma mancano alcune parti dello script, di conseguenza abbiamo un ritardo generale.</w:t>
             </w:r>
           </w:p>
         </w:tc>
@@ -11042,7 +11646,21 @@
               <w:rPr>
                 <w:rFonts w:ascii="Arial" w:hAnsi="Arial" w:cs="Arial"/>
               </w:rPr>
-              <w:t>Terminare script statistiche, continuare ui impostazioni</w:t>
+              <w:t xml:space="preserve">Terminare script statistiche, continuare </w:t>
+            </w:r>
+            <w:proofErr w:type="spellStart"/>
+            <w:r>
+              <w:rPr>
+                <w:rFonts w:ascii="Arial" w:hAnsi="Arial" w:cs="Arial"/>
+              </w:rPr>
+              <w:t>ui</w:t>
+            </w:r>
+            <w:proofErr w:type="spellEnd"/>
+            <w:r>
+              <w:rPr>
+                <w:rFonts w:ascii="Arial" w:hAnsi="Arial" w:cs="Arial"/>
+              </w:rPr>
+              <w:t xml:space="preserve"> impostazioni</w:t>
             </w:r>
           </w:p>
         </w:tc>
@@ -11092,12 +11710,28 @@
                 <w:rFonts w:ascii="Arial" w:hAnsi="Arial" w:cs="Arial"/>
               </w:rPr>
             </w:pPr>
-            <w:r>
-              <w:rPr>
-                <w:rFonts w:ascii="Arial" w:hAnsi="Arial" w:cs="Arial"/>
-              </w:rPr>
-              <w:t>Daily Scrum</w:t>
-            </w:r>
+            <w:proofErr w:type="spellStart"/>
+            <w:r>
+              <w:rPr>
+                <w:rFonts w:ascii="Arial" w:hAnsi="Arial" w:cs="Arial"/>
+              </w:rPr>
+              <w:t>Daily</w:t>
+            </w:r>
+            <w:proofErr w:type="spellEnd"/>
+            <w:r>
+              <w:rPr>
+                <w:rFonts w:ascii="Arial" w:hAnsi="Arial" w:cs="Arial"/>
+              </w:rPr>
+              <w:t xml:space="preserve"> </w:t>
+            </w:r>
+            <w:proofErr w:type="spellStart"/>
+            <w:r>
+              <w:rPr>
+                <w:rFonts w:ascii="Arial" w:hAnsi="Arial" w:cs="Arial"/>
+              </w:rPr>
+              <w:t>Scrum</w:t>
+            </w:r>
+            <w:proofErr w:type="spellEnd"/>
           </w:p>
         </w:tc>
       </w:tr>
@@ -11145,7 +11779,21 @@
               <w:rPr>
                 <w:rFonts w:ascii="Arial" w:hAnsi="Arial" w:cs="Arial"/>
               </w:rPr>
-              <w:t>Riley deve risolvere un problema di merge riscontrato al tentativo di pull e poi continuare con lo script delle statistiche, invece Bryan deve fine la ui delle statistiche e preferibilmente iniziare con le impostazioni.</w:t>
+              <w:t xml:space="preserve">Riley deve risolvere un problema di merge riscontrato al tentativo di pull e poi continuare con lo script delle statistiche, invece Bryan deve fine la </w:t>
+            </w:r>
+            <w:proofErr w:type="spellStart"/>
+            <w:r>
+              <w:rPr>
+                <w:rFonts w:ascii="Arial" w:hAnsi="Arial" w:cs="Arial"/>
+              </w:rPr>
+              <w:t>ui</w:t>
+            </w:r>
+            <w:proofErr w:type="spellEnd"/>
+            <w:r>
+              <w:rPr>
+                <w:rFonts w:ascii="Arial" w:hAnsi="Arial" w:cs="Arial"/>
+              </w:rPr>
+              <w:t xml:space="preserve"> delle statistiche e preferibilmente iniziare con le impostazioni.</w:t>
             </w:r>
           </w:p>
         </w:tc>
@@ -11325,8 +11973,16 @@
               <w:rPr>
                 <w:rFonts w:ascii="Arial" w:hAnsi="Arial" w:cs="Arial"/>
               </w:rPr>
-              <w:t>Sprint Retrospective</w:t>
-            </w:r>
+              <w:t xml:space="preserve">Sprint </w:t>
+            </w:r>
+            <w:proofErr w:type="spellStart"/>
+            <w:r>
+              <w:rPr>
+                <w:rFonts w:ascii="Arial" w:hAnsi="Arial" w:cs="Arial"/>
+              </w:rPr>
+              <w:t>Retrospective</w:t>
+            </w:r>
+            <w:proofErr w:type="spellEnd"/>
           </w:p>
         </w:tc>
       </w:tr>
@@ -11830,7 +12486,21 @@
             <w:rPr>
               <w:rFonts w:ascii="Arial" w:hAnsi="Arial" w:cs="Arial"/>
             </w:rPr>
-            <w:t>Ho riscontrato un problema di merge nonostante abbiamo impostato un sistema con un tool unity, puoi dirmi cosa analizzare per risolvere?</w:t>
+            <w:t xml:space="preserve">Ho riscontrato un problema di merge nonostante abbiamo impostato un sistema con un tool </w:t>
+          </w:r>
+          <w:proofErr w:type="spellStart"/>
+          <w:r>
+            <w:rPr>
+              <w:rFonts w:ascii="Arial" w:hAnsi="Arial" w:cs="Arial"/>
+            </w:rPr>
+            <w:t>unity</w:t>
+          </w:r>
+          <w:proofErr w:type="spellEnd"/>
+          <w:r>
+            <w:rPr>
+              <w:rFonts w:ascii="Arial" w:hAnsi="Arial" w:cs="Arial"/>
+            </w:rPr>
+            <w:t>, puoi dirmi cosa analizzare per risolvere?</w:t>
           </w:r>
         </w:p>
         <w:p>
@@ -11845,7 +12515,21 @@
             <w:rPr>
               <w:rFonts w:ascii="Arial" w:hAnsi="Arial" w:cs="Arial"/>
             </w:rPr>
-            <w:t>Bryan: come si implementa un font in unity?</w:t>
+            <w:t xml:space="preserve">Bryan: come si implementa un font in </w:t>
+          </w:r>
+          <w:proofErr w:type="spellStart"/>
+          <w:r>
+            <w:rPr>
+              <w:rFonts w:ascii="Arial" w:hAnsi="Arial" w:cs="Arial"/>
+            </w:rPr>
+            <w:t>unity</w:t>
+          </w:r>
+          <w:proofErr w:type="spellEnd"/>
+          <w:r>
+            <w:rPr>
+              <w:rFonts w:ascii="Arial" w:hAnsi="Arial" w:cs="Arial"/>
+            </w:rPr>
+            <w:t>?</w:t>
           </w:r>
         </w:p>
       </w:sdtContent>
@@ -12554,7 +13238,49 @@
               <w:rPr>
                 <w:rFonts w:ascii="Arial" w:hAnsi="Arial" w:cs="Arial"/>
               </w:rPr>
-              <w:t>Rispetto alla pianificazione abbiamo un leggero ritardo avendo finito solo oggi le statistiche, ma questo risulta recuperabile essendo che lavoriamo separatamente dividendo ui e scripting, infatti bryan ha iniziato la ui delle impostazioni il giorno previsto.</w:t>
+              <w:t xml:space="preserve">Rispetto alla pianificazione abbiamo un leggero ritardo avendo finito solo oggi le statistiche, ma questo risulta recuperabile essendo che lavoriamo separatamente dividendo </w:t>
+            </w:r>
+            <w:proofErr w:type="spellStart"/>
+            <w:r>
+              <w:rPr>
+                <w:rFonts w:ascii="Arial" w:hAnsi="Arial" w:cs="Arial"/>
+              </w:rPr>
+              <w:t>ui</w:t>
+            </w:r>
+            <w:proofErr w:type="spellEnd"/>
+            <w:r>
+              <w:rPr>
+                <w:rFonts w:ascii="Arial" w:hAnsi="Arial" w:cs="Arial"/>
+              </w:rPr>
+              <w:t xml:space="preserve"> e scripting, infatti </w:t>
+            </w:r>
+            <w:proofErr w:type="spellStart"/>
+            <w:r>
+              <w:rPr>
+                <w:rFonts w:ascii="Arial" w:hAnsi="Arial" w:cs="Arial"/>
+              </w:rPr>
+              <w:t>bryan</w:t>
+            </w:r>
+            <w:proofErr w:type="spellEnd"/>
+            <w:r>
+              <w:rPr>
+                <w:rFonts w:ascii="Arial" w:hAnsi="Arial" w:cs="Arial"/>
+              </w:rPr>
+              <w:t xml:space="preserve"> ha iniziato la </w:t>
+            </w:r>
+            <w:proofErr w:type="spellStart"/>
+            <w:r>
+              <w:rPr>
+                <w:rFonts w:ascii="Arial" w:hAnsi="Arial" w:cs="Arial"/>
+              </w:rPr>
+              <w:t>ui</w:t>
+            </w:r>
+            <w:proofErr w:type="spellEnd"/>
+            <w:r>
+              <w:rPr>
+                <w:rFonts w:ascii="Arial" w:hAnsi="Arial" w:cs="Arial"/>
+              </w:rPr>
+              <w:t xml:space="preserve"> delle impostazioni il giorno previsto.</w:t>
             </w:r>
           </w:p>
         </w:tc>
@@ -12675,12 +13401,28 @@
                 <w:rFonts w:ascii="Arial" w:hAnsi="Arial" w:cs="Arial"/>
               </w:rPr>
             </w:pPr>
-            <w:r>
-              <w:rPr>
-                <w:rFonts w:ascii="Arial" w:hAnsi="Arial" w:cs="Arial"/>
-              </w:rPr>
-              <w:t>Daily Scrum</w:t>
-            </w:r>
+            <w:proofErr w:type="spellStart"/>
+            <w:r>
+              <w:rPr>
+                <w:rFonts w:ascii="Arial" w:hAnsi="Arial" w:cs="Arial"/>
+              </w:rPr>
+              <w:t>Daily</w:t>
+            </w:r>
+            <w:proofErr w:type="spellEnd"/>
+            <w:r>
+              <w:rPr>
+                <w:rFonts w:ascii="Arial" w:hAnsi="Arial" w:cs="Arial"/>
+              </w:rPr>
+              <w:t xml:space="preserve"> </w:t>
+            </w:r>
+            <w:proofErr w:type="spellStart"/>
+            <w:r>
+              <w:rPr>
+                <w:rFonts w:ascii="Arial" w:hAnsi="Arial" w:cs="Arial"/>
+              </w:rPr>
+              <w:t>Scrum</w:t>
+            </w:r>
+            <w:proofErr w:type="spellEnd"/>
           </w:p>
         </w:tc>
       </w:tr>
@@ -12742,7 +13484,21 @@
               <w:rPr>
                 <w:rFonts w:ascii="Arial" w:hAnsi="Arial" w:cs="Arial"/>
               </w:rPr>
-              <w:t>Bryan: Finire la ui del</w:t>
+              <w:t xml:space="preserve">Bryan: Finire la </w:t>
+            </w:r>
+            <w:proofErr w:type="spellStart"/>
+            <w:r>
+              <w:rPr>
+                <w:rFonts w:ascii="Arial" w:hAnsi="Arial" w:cs="Arial"/>
+              </w:rPr>
+              <w:t>ui</w:t>
+            </w:r>
+            <w:proofErr w:type="spellEnd"/>
+            <w:r>
+              <w:rPr>
+                <w:rFonts w:ascii="Arial" w:hAnsi="Arial" w:cs="Arial"/>
+              </w:rPr>
+              <w:t xml:space="preserve"> del</w:t>
             </w:r>
             <w:r>
               <w:rPr>
@@ -12928,8 +13684,16 @@
               <w:rPr>
                 <w:rFonts w:ascii="Arial" w:hAnsi="Arial" w:cs="Arial"/>
               </w:rPr>
-              <w:t>Sprint Retrospective</w:t>
-            </w:r>
+              <w:t xml:space="preserve">Sprint </w:t>
+            </w:r>
+            <w:proofErr w:type="spellStart"/>
+            <w:r>
+              <w:rPr>
+                <w:rFonts w:ascii="Arial" w:hAnsi="Arial" w:cs="Arial"/>
+              </w:rPr>
+              <w:t>Retrospective</w:t>
+            </w:r>
+            <w:proofErr w:type="spellEnd"/>
           </w:p>
         </w:tc>
       </w:tr>
@@ -13421,7 +14185,35 @@
             <w:rPr>
               <w:rFonts w:ascii="Arial" w:hAnsi="Arial" w:cs="Arial"/>
             </w:rPr>
-            <w:t>Il numero inserito nel json risulta essere un numero che va dal miliardo in su, ma l’applicativo lo riduce a milioni, per caso i valori int non supportano i miliardi?</w:t>
+            <w:t xml:space="preserve">Il numero inserito nel </w:t>
+          </w:r>
+          <w:proofErr w:type="spellStart"/>
+          <w:r>
+            <w:rPr>
+              <w:rFonts w:ascii="Arial" w:hAnsi="Arial" w:cs="Arial"/>
+            </w:rPr>
+            <w:t>json</w:t>
+          </w:r>
+          <w:proofErr w:type="spellEnd"/>
+          <w:r>
+            <w:rPr>
+              <w:rFonts w:ascii="Arial" w:hAnsi="Arial" w:cs="Arial"/>
+            </w:rPr>
+            <w:t xml:space="preserve"> risulta essere un numero che va dal miliardo in su, ma l’applicativo lo riduce a milioni, per caso i valori </w:t>
+          </w:r>
+          <w:proofErr w:type="spellStart"/>
+          <w:r>
+            <w:rPr>
+              <w:rFonts w:ascii="Arial" w:hAnsi="Arial" w:cs="Arial"/>
+            </w:rPr>
+            <w:t>int</w:t>
+          </w:r>
+          <w:proofErr w:type="spellEnd"/>
+          <w:r>
+            <w:rPr>
+              <w:rFonts w:ascii="Arial" w:hAnsi="Arial" w:cs="Arial"/>
+            </w:rPr>
+            <w:t xml:space="preserve"> non supportano i miliardi?</w:t>
           </w:r>
           <w:r>
             <w:rPr>
@@ -13510,7 +14302,21 @@
             <w:rPr>
               <w:rFonts w:ascii="Arial" w:hAnsi="Arial" w:cs="Arial"/>
             </w:rPr>
-            <w:t>Mi ha detto che int supporta i miliardi ma che ha un massimo di circa 2,2 miliardi ed il numero risultava più grande quindi ho ripiegato su un long</w:t>
+            <w:t xml:space="preserve">Mi ha detto che </w:t>
+          </w:r>
+          <w:proofErr w:type="spellStart"/>
+          <w:r>
+            <w:rPr>
+              <w:rFonts w:ascii="Arial" w:hAnsi="Arial" w:cs="Arial"/>
+            </w:rPr>
+            <w:t>int</w:t>
+          </w:r>
+          <w:proofErr w:type="spellEnd"/>
+          <w:r>
+            <w:rPr>
+              <w:rFonts w:ascii="Arial" w:hAnsi="Arial" w:cs="Arial"/>
+            </w:rPr>
+            <w:t xml:space="preserve"> supporta i miliardi ma che ha un massimo di circa 2,2 miliardi ed il numero risultava più grande quindi ho ripiegato su un long</w:t>
           </w:r>
         </w:p>
       </w:sdtContent>
@@ -14019,7 +14825,21 @@
               <w:rPr>
                 <w:rFonts w:ascii="Arial" w:hAnsi="Arial" w:cs="Arial"/>
               </w:rPr>
-              <w:t>Ho notato come certe impostazioni non sono modificabili con variabili di unity e quindi ho usato del tempo per eseguire qualche ricerca.</w:t>
+              <w:t xml:space="preserve">Ho notato come certe impostazioni non sono modificabili con variabili di </w:t>
+            </w:r>
+            <w:proofErr w:type="spellStart"/>
+            <w:r>
+              <w:rPr>
+                <w:rFonts w:ascii="Arial" w:hAnsi="Arial" w:cs="Arial"/>
+              </w:rPr>
+              <w:t>unity</w:t>
+            </w:r>
+            <w:proofErr w:type="spellEnd"/>
+            <w:r>
+              <w:rPr>
+                <w:rFonts w:ascii="Arial" w:hAnsi="Arial" w:cs="Arial"/>
+              </w:rPr>
+              <w:t xml:space="preserve"> e quindi ho usato del tempo per eseguire qualche ricerca.</w:t>
             </w:r>
           </w:p>
         </w:tc>
@@ -14223,12 +15043,28 @@
                 <w:rFonts w:ascii="Arial" w:hAnsi="Arial" w:cs="Arial"/>
               </w:rPr>
             </w:pPr>
-            <w:r>
-              <w:rPr>
-                <w:rFonts w:ascii="Arial" w:hAnsi="Arial" w:cs="Arial"/>
-              </w:rPr>
-              <w:t>Daily Scrum</w:t>
-            </w:r>
+            <w:proofErr w:type="spellStart"/>
+            <w:r>
+              <w:rPr>
+                <w:rFonts w:ascii="Arial" w:hAnsi="Arial" w:cs="Arial"/>
+              </w:rPr>
+              <w:t>Daily</w:t>
+            </w:r>
+            <w:proofErr w:type="spellEnd"/>
+            <w:r>
+              <w:rPr>
+                <w:rFonts w:ascii="Arial" w:hAnsi="Arial" w:cs="Arial"/>
+              </w:rPr>
+              <w:t xml:space="preserve"> </w:t>
+            </w:r>
+            <w:proofErr w:type="spellStart"/>
+            <w:r>
+              <w:rPr>
+                <w:rFonts w:ascii="Arial" w:hAnsi="Arial" w:cs="Arial"/>
+              </w:rPr>
+              <w:t>Scrum</w:t>
+            </w:r>
+            <w:proofErr w:type="spellEnd"/>
           </w:p>
         </w:tc>
       </w:tr>
@@ -14476,8 +15312,16 @@
               <w:rPr>
                 <w:rFonts w:ascii="Arial" w:hAnsi="Arial" w:cs="Arial"/>
               </w:rPr>
-              <w:t>Sprint Retrospective</w:t>
-            </w:r>
+              <w:t xml:space="preserve">Sprint </w:t>
+            </w:r>
+            <w:proofErr w:type="spellStart"/>
+            <w:r>
+              <w:rPr>
+                <w:rFonts w:ascii="Arial" w:hAnsi="Arial" w:cs="Arial"/>
+              </w:rPr>
+              <w:t>Retrospective</w:t>
+            </w:r>
+            <w:proofErr w:type="spellEnd"/>
           </w:p>
         </w:tc>
       </w:tr>
@@ -14963,7 +15807,21 @@
             <w:rPr>
               <w:rFonts w:ascii="Arial" w:hAnsi="Arial" w:cs="Arial"/>
             </w:rPr>
-            <w:t xml:space="preserve">Riley: sto creando il file data per le impostazioni con questi valori: “valori”. Puoi dirmi che valore effettivo usa unity? </w:t>
+            <w:t xml:space="preserve">Riley: sto creando il file data per le impostazioni con questi valori: “valori”. Puoi dirmi che valore effettivo usa </w:t>
+          </w:r>
+          <w:proofErr w:type="spellStart"/>
+          <w:r>
+            <w:rPr>
+              <w:rFonts w:ascii="Arial" w:hAnsi="Arial" w:cs="Arial"/>
+            </w:rPr>
+            <w:t>unity</w:t>
+          </w:r>
+          <w:proofErr w:type="spellEnd"/>
+          <w:r>
+            <w:rPr>
+              <w:rFonts w:ascii="Arial" w:hAnsi="Arial" w:cs="Arial"/>
+            </w:rPr>
+            <w:t xml:space="preserve">? </w:t>
           </w:r>
         </w:p>
         <w:p>
@@ -14978,8 +15836,44 @@
             <w:rPr>
               <w:rFonts w:ascii="Arial" w:hAnsi="Arial" w:cs="Arial"/>
             </w:rPr>
-            <w:t>Bryan: Come creare un menu con componenti ui che si ripetono modularmente in unity</w:t>
-          </w:r>
+            <w:t xml:space="preserve">Bryan: Come creare un menu con componenti </w:t>
+          </w:r>
+          <w:proofErr w:type="spellStart"/>
+          <w:r>
+            <w:rPr>
+              <w:rFonts w:ascii="Arial" w:hAnsi="Arial" w:cs="Arial"/>
+            </w:rPr>
+            <w:t>ui</w:t>
+          </w:r>
+          <w:proofErr w:type="spellEnd"/>
+          <w:r>
+            <w:rPr>
+              <w:rFonts w:ascii="Arial" w:hAnsi="Arial" w:cs="Arial"/>
+            </w:rPr>
+            <w:t xml:space="preserve"> che si ripetono </w:t>
+          </w:r>
+          <w:proofErr w:type="spellStart"/>
+          <w:r>
+            <w:rPr>
+              <w:rFonts w:ascii="Arial" w:hAnsi="Arial" w:cs="Arial"/>
+            </w:rPr>
+            <w:t>modularmente</w:t>
+          </w:r>
+          <w:proofErr w:type="spellEnd"/>
+          <w:r>
+            <w:rPr>
+              <w:rFonts w:ascii="Arial" w:hAnsi="Arial" w:cs="Arial"/>
+            </w:rPr>
+            <w:t xml:space="preserve"> in </w:t>
+          </w:r>
+          <w:proofErr w:type="spellStart"/>
+          <w:r>
+            <w:rPr>
+              <w:rFonts w:ascii="Arial" w:hAnsi="Arial" w:cs="Arial"/>
+            </w:rPr>
+            <w:t>unity</w:t>
+          </w:r>
+          <w:proofErr w:type="spellEnd"/>
         </w:p>
       </w:sdtContent>
     </w:sdt>
@@ -15290,8 +16184,16 @@
         <w:rPr>
           <w:rFonts w:ascii="Arial" w:hAnsi="Arial" w:cs="Arial"/>
         </w:rPr>
-        <w:t>Bryan: averi cercato un tutorial su youtube</w:t>
-      </w:r>
+        <w:t xml:space="preserve">Bryan: averi cercato un tutorial su </w:t>
+      </w:r>
+      <w:proofErr w:type="spellStart"/>
+      <w:r>
+        <w:rPr>
+          <w:rFonts w:ascii="Arial" w:hAnsi="Arial" w:cs="Arial"/>
+        </w:rPr>
+        <w:t>youtube</w:t>
+      </w:r>
+      <w:proofErr w:type="spellEnd"/>
     </w:p>
     <w:p>
       <w:pPr>
@@ -15477,8 +16379,16 @@
               <w:rPr>
                 <w:rFonts w:ascii="Arial" w:hAnsi="Arial" w:cs="Arial"/>
               </w:rPr>
-              <w:t>Continuato script impostazioni per ui</w:t>
-            </w:r>
+              <w:t xml:space="preserve">Continuato script impostazioni per </w:t>
+            </w:r>
+            <w:proofErr w:type="spellStart"/>
+            <w:r>
+              <w:rPr>
+                <w:rFonts w:ascii="Arial" w:hAnsi="Arial" w:cs="Arial"/>
+              </w:rPr>
+              <w:t>ui</w:t>
+            </w:r>
+            <w:proofErr w:type="spellEnd"/>
           </w:p>
         </w:tc>
       </w:tr>
@@ -15594,7 +16504,35 @@
               <w:rPr>
                 <w:rFonts w:ascii="Arial" w:hAnsi="Arial" w:cs="Arial"/>
               </w:rPr>
-              <w:t xml:space="preserve">Alcuni problemi con i valori inviati dal togglle per fullscreen, scoperto che avevo selezionato un valore statico e non dinamico dell’elemento </w:t>
+              <w:t xml:space="preserve">Alcuni problemi con i valori inviati dal </w:t>
+            </w:r>
+            <w:proofErr w:type="spellStart"/>
+            <w:r>
+              <w:rPr>
+                <w:rFonts w:ascii="Arial" w:hAnsi="Arial" w:cs="Arial"/>
+              </w:rPr>
+              <w:t>togglle</w:t>
+            </w:r>
+            <w:proofErr w:type="spellEnd"/>
+            <w:r>
+              <w:rPr>
+                <w:rFonts w:ascii="Arial" w:hAnsi="Arial" w:cs="Arial"/>
+              </w:rPr>
+              <w:t xml:space="preserve"> per </w:t>
+            </w:r>
+            <w:proofErr w:type="spellStart"/>
+            <w:r>
+              <w:rPr>
+                <w:rFonts w:ascii="Arial" w:hAnsi="Arial" w:cs="Arial"/>
+              </w:rPr>
+              <w:t>fullscreen</w:t>
+            </w:r>
+            <w:proofErr w:type="spellEnd"/>
+            <w:r>
+              <w:rPr>
+                <w:rFonts w:ascii="Arial" w:hAnsi="Arial" w:cs="Arial"/>
+              </w:rPr>
+              <w:t xml:space="preserve">, scoperto che avevo selezionato un valore statico e non dinamico dell’elemento </w:t>
             </w:r>
           </w:p>
         </w:tc>
@@ -15760,7 +16698,21 @@
               <w:rPr>
                 <w:rFonts w:ascii="Arial" w:hAnsi="Arial" w:cs="Arial"/>
               </w:rPr>
-              <w:t xml:space="preserve"> iniziare a creare il db effettivo</w:t>
+              <w:t xml:space="preserve"> iniziare a creare il </w:t>
+            </w:r>
+            <w:proofErr w:type="spellStart"/>
+            <w:r>
+              <w:rPr>
+                <w:rFonts w:ascii="Arial" w:hAnsi="Arial" w:cs="Arial"/>
+              </w:rPr>
+              <w:t>db</w:t>
+            </w:r>
+            <w:proofErr w:type="spellEnd"/>
+            <w:r>
+              <w:rPr>
+                <w:rFonts w:ascii="Arial" w:hAnsi="Arial" w:cs="Arial"/>
+              </w:rPr>
+              <w:t xml:space="preserve"> effettivo</w:t>
             </w:r>
             <w:r>
               <w:rPr>
@@ -15816,12 +16768,28 @@
                 <w:rFonts w:ascii="Arial" w:hAnsi="Arial" w:cs="Arial"/>
               </w:rPr>
             </w:pPr>
-            <w:r>
-              <w:rPr>
-                <w:rFonts w:ascii="Arial" w:hAnsi="Arial" w:cs="Arial"/>
-              </w:rPr>
-              <w:t>Daily Scrum</w:t>
-            </w:r>
+            <w:proofErr w:type="spellStart"/>
+            <w:r>
+              <w:rPr>
+                <w:rFonts w:ascii="Arial" w:hAnsi="Arial" w:cs="Arial"/>
+              </w:rPr>
+              <w:t>Daily</w:t>
+            </w:r>
+            <w:proofErr w:type="spellEnd"/>
+            <w:r>
+              <w:rPr>
+                <w:rFonts w:ascii="Arial" w:hAnsi="Arial" w:cs="Arial"/>
+              </w:rPr>
+              <w:t xml:space="preserve"> </w:t>
+            </w:r>
+            <w:proofErr w:type="spellStart"/>
+            <w:r>
+              <w:rPr>
+                <w:rFonts w:ascii="Arial" w:hAnsi="Arial" w:cs="Arial"/>
+              </w:rPr>
+              <w:t>Scrum</w:t>
+            </w:r>
+            <w:proofErr w:type="spellEnd"/>
           </w:p>
         </w:tc>
       </w:tr>
@@ -15875,8 +16843,16 @@
               <w:rPr>
                 <w:rFonts w:ascii="Arial" w:hAnsi="Arial" w:cs="Arial"/>
               </w:rPr>
-              <w:t xml:space="preserve"> Terminare l’applicazione delle impostazioni nella ui</w:t>
-            </w:r>
+              <w:t xml:space="preserve"> Terminare l’applicazione delle impostazioni nella </w:t>
+            </w:r>
+            <w:proofErr w:type="spellStart"/>
+            <w:r>
+              <w:rPr>
+                <w:rFonts w:ascii="Arial" w:hAnsi="Arial" w:cs="Arial"/>
+              </w:rPr>
+              <w:t>ui</w:t>
+            </w:r>
+            <w:proofErr w:type="spellEnd"/>
           </w:p>
           <w:p>
             <w:pPr>
@@ -16087,8 +17063,16 @@
               <w:rPr>
                 <w:rFonts w:ascii="Arial" w:hAnsi="Arial" w:cs="Arial"/>
               </w:rPr>
-              <w:t>Sprint Retrospective</w:t>
-            </w:r>
+              <w:t xml:space="preserve">Sprint </w:t>
+            </w:r>
+            <w:proofErr w:type="spellStart"/>
+            <w:r>
+              <w:rPr>
+                <w:rFonts w:ascii="Arial" w:hAnsi="Arial" w:cs="Arial"/>
+              </w:rPr>
+              <w:t>Retrospective</w:t>
+            </w:r>
+            <w:proofErr w:type="spellEnd"/>
           </w:p>
         </w:tc>
       </w:tr>
@@ -17389,11 +18373,33 @@
                 <w:rFonts w:ascii="Arial" w:hAnsi="Arial" w:cs="Arial"/>
               </w:rPr>
             </w:pPr>
-            <w:r>
-              <w:rPr>
-                <w:rFonts w:ascii="Arial" w:hAnsi="Arial" w:cs="Arial"/>
-              </w:rPr>
-              <w:t>Brayn continuerà con lo sviluppo della mappa mentre Riley svilupperà il db effettivo</w:t>
+            <w:proofErr w:type="spellStart"/>
+            <w:r>
+              <w:rPr>
+                <w:rFonts w:ascii="Arial" w:hAnsi="Arial" w:cs="Arial"/>
+              </w:rPr>
+              <w:t>Brayn</w:t>
+            </w:r>
+            <w:proofErr w:type="spellEnd"/>
+            <w:r>
+              <w:rPr>
+                <w:rFonts w:ascii="Arial" w:hAnsi="Arial" w:cs="Arial"/>
+              </w:rPr>
+              <w:t xml:space="preserve"> continuerà con lo sviluppo della mappa mentre Riley svilupperà il </w:t>
+            </w:r>
+            <w:proofErr w:type="spellStart"/>
+            <w:r>
+              <w:rPr>
+                <w:rFonts w:ascii="Arial" w:hAnsi="Arial" w:cs="Arial"/>
+              </w:rPr>
+              <w:t>db</w:t>
+            </w:r>
+            <w:proofErr w:type="spellEnd"/>
+            <w:r>
+              <w:rPr>
+                <w:rFonts w:ascii="Arial" w:hAnsi="Arial" w:cs="Arial"/>
+              </w:rPr>
+              <w:t xml:space="preserve"> effettivo</w:t>
             </w:r>
           </w:p>
         </w:tc>
@@ -17443,12 +18449,28 @@
                 <w:rFonts w:ascii="Arial" w:hAnsi="Arial" w:cs="Arial"/>
               </w:rPr>
             </w:pPr>
-            <w:r>
-              <w:rPr>
-                <w:rFonts w:ascii="Arial" w:hAnsi="Arial" w:cs="Arial"/>
-              </w:rPr>
-              <w:t>Daily Scrum</w:t>
-            </w:r>
+            <w:proofErr w:type="spellStart"/>
+            <w:r>
+              <w:rPr>
+                <w:rFonts w:ascii="Arial" w:hAnsi="Arial" w:cs="Arial"/>
+              </w:rPr>
+              <w:t>Daily</w:t>
+            </w:r>
+            <w:proofErr w:type="spellEnd"/>
+            <w:r>
+              <w:rPr>
+                <w:rFonts w:ascii="Arial" w:hAnsi="Arial" w:cs="Arial"/>
+              </w:rPr>
+              <w:t xml:space="preserve"> </w:t>
+            </w:r>
+            <w:proofErr w:type="spellStart"/>
+            <w:r>
+              <w:rPr>
+                <w:rFonts w:ascii="Arial" w:hAnsi="Arial" w:cs="Arial"/>
+              </w:rPr>
+              <w:t>Scrum</w:t>
+            </w:r>
+            <w:proofErr w:type="spellEnd"/>
           </w:p>
         </w:tc>
       </w:tr>
@@ -17496,8 +18518,16 @@
               <w:rPr>
                 <w:rFonts w:ascii="Arial" w:hAnsi="Arial" w:cs="Arial"/>
               </w:rPr>
-              <w:t>Riley: Terminare l’applicazione delle impostazioni nella ui</w:t>
-            </w:r>
+              <w:t xml:space="preserve">Riley: Terminare l’applicazione delle impostazioni nella </w:t>
+            </w:r>
+            <w:proofErr w:type="spellStart"/>
+            <w:r>
+              <w:rPr>
+                <w:rFonts w:ascii="Arial" w:hAnsi="Arial" w:cs="Arial"/>
+              </w:rPr>
+              <w:t>ui</w:t>
+            </w:r>
+            <w:proofErr w:type="spellEnd"/>
           </w:p>
           <w:p>
             <w:pPr>
@@ -17696,8 +18726,16 @@
               <w:rPr>
                 <w:rFonts w:ascii="Arial" w:hAnsi="Arial" w:cs="Arial"/>
               </w:rPr>
-              <w:t>Sprint Retrospective</w:t>
-            </w:r>
+              <w:t xml:space="preserve">Sprint </w:t>
+            </w:r>
+            <w:proofErr w:type="spellStart"/>
+            <w:r>
+              <w:rPr>
+                <w:rFonts w:ascii="Arial" w:hAnsi="Arial" w:cs="Arial"/>
+              </w:rPr>
+              <w:t>Retrospective</w:t>
+            </w:r>
+            <w:proofErr w:type="spellEnd"/>
           </w:p>
         </w:tc>
       </w:tr>
@@ -18194,7 +19232,21 @@
             <w:rPr>
               <w:rFonts w:ascii="Arial" w:hAnsi="Arial" w:cs="Arial"/>
             </w:rPr>
-            <w:t>Lo script SettingsUI sembra essersi isolato dal resto del codice, cosa potrebbe essere la causa?</w:t>
+            <w:t xml:space="preserve">Lo script </w:t>
+          </w:r>
+          <w:proofErr w:type="spellStart"/>
+          <w:r>
+            <w:rPr>
+              <w:rFonts w:ascii="Arial" w:hAnsi="Arial" w:cs="Arial"/>
+            </w:rPr>
+            <w:t>SettingsUI</w:t>
+          </w:r>
+          <w:proofErr w:type="spellEnd"/>
+          <w:r>
+            <w:rPr>
+              <w:rFonts w:ascii="Arial" w:hAnsi="Arial" w:cs="Arial"/>
+            </w:rPr>
+            <w:t xml:space="preserve"> sembra essersi isolato dal resto del codice, cosa potrebbe essere la causa?</w:t>
           </w:r>
         </w:p>
         <w:p>
@@ -18725,8 +19777,30 @@
               <w:rPr>
                 <w:rFonts w:ascii="Arial" w:hAnsi="Arial" w:cs="Arial"/>
               </w:rPr>
-              <w:t>Inizio sviluppo db sqlite</w:t>
-            </w:r>
+              <w:t xml:space="preserve">Inizio sviluppo </w:t>
+            </w:r>
+            <w:proofErr w:type="spellStart"/>
+            <w:r>
+              <w:rPr>
+                <w:rFonts w:ascii="Arial" w:hAnsi="Arial" w:cs="Arial"/>
+              </w:rPr>
+              <w:t>db</w:t>
+            </w:r>
+            <w:proofErr w:type="spellEnd"/>
+            <w:r>
+              <w:rPr>
+                <w:rFonts w:ascii="Arial" w:hAnsi="Arial" w:cs="Arial"/>
+              </w:rPr>
+              <w:t xml:space="preserve"> </w:t>
+            </w:r>
+            <w:proofErr w:type="spellStart"/>
+            <w:r>
+              <w:rPr>
+                <w:rFonts w:ascii="Arial" w:hAnsi="Arial" w:cs="Arial"/>
+              </w:rPr>
+              <w:t>sqlite</w:t>
+            </w:r>
+            <w:proofErr w:type="spellEnd"/>
           </w:p>
         </w:tc>
       </w:tr>
@@ -18938,8 +20012,16 @@
               <w:rPr>
                 <w:rFonts w:ascii="Arial" w:hAnsi="Arial" w:cs="Arial"/>
               </w:rPr>
-              <w:t>Siamo in largo anticipo, per questo motivo Riley ha cominciato a creare un vero db</w:t>
-            </w:r>
+              <w:t xml:space="preserve">Siamo in largo anticipo, per questo motivo Riley ha cominciato a creare un vero </w:t>
+            </w:r>
+            <w:proofErr w:type="spellStart"/>
+            <w:r>
+              <w:rPr>
+                <w:rFonts w:ascii="Arial" w:hAnsi="Arial" w:cs="Arial"/>
+              </w:rPr>
+              <w:t>db</w:t>
+            </w:r>
+            <w:proofErr w:type="spellEnd"/>
           </w:p>
         </w:tc>
       </w:tr>
@@ -18996,7 +20078,21 @@
               <w:rPr>
                 <w:rFonts w:ascii="Arial" w:hAnsi="Arial" w:cs="Arial"/>
               </w:rPr>
-              <w:t>Continuare rispettivamente lo sviluppo del db e della mappa</w:t>
+              <w:t xml:space="preserve">Continuare rispettivamente lo sviluppo del </w:t>
+            </w:r>
+            <w:proofErr w:type="spellStart"/>
+            <w:r>
+              <w:rPr>
+                <w:rFonts w:ascii="Arial" w:hAnsi="Arial" w:cs="Arial"/>
+              </w:rPr>
+              <w:t>db</w:t>
+            </w:r>
+            <w:proofErr w:type="spellEnd"/>
+            <w:r>
+              <w:rPr>
+                <w:rFonts w:ascii="Arial" w:hAnsi="Arial" w:cs="Arial"/>
+              </w:rPr>
+              <w:t xml:space="preserve"> e della mappa</w:t>
             </w:r>
           </w:p>
         </w:tc>
@@ -19046,12 +20142,28 @@
                 <w:rFonts w:ascii="Arial" w:hAnsi="Arial" w:cs="Arial"/>
               </w:rPr>
             </w:pPr>
-            <w:r>
-              <w:rPr>
-                <w:rFonts w:ascii="Arial" w:hAnsi="Arial" w:cs="Arial"/>
-              </w:rPr>
-              <w:t>Daily Scrum</w:t>
-            </w:r>
+            <w:proofErr w:type="spellStart"/>
+            <w:r>
+              <w:rPr>
+                <w:rFonts w:ascii="Arial" w:hAnsi="Arial" w:cs="Arial"/>
+              </w:rPr>
+              <w:t>Daily</w:t>
+            </w:r>
+            <w:proofErr w:type="spellEnd"/>
+            <w:r>
+              <w:rPr>
+                <w:rFonts w:ascii="Arial" w:hAnsi="Arial" w:cs="Arial"/>
+              </w:rPr>
+              <w:t xml:space="preserve"> </w:t>
+            </w:r>
+            <w:proofErr w:type="spellStart"/>
+            <w:r>
+              <w:rPr>
+                <w:rFonts w:ascii="Arial" w:hAnsi="Arial" w:cs="Arial"/>
+              </w:rPr>
+              <w:t>Scrum</w:t>
+            </w:r>
+            <w:proofErr w:type="spellEnd"/>
           </w:p>
         </w:tc>
       </w:tr>
@@ -19099,8 +20211,16 @@
               <w:rPr>
                 <w:rFonts w:ascii="Arial" w:hAnsi="Arial" w:cs="Arial"/>
               </w:rPr>
-              <w:t>Riley: Inizio sviluppo db</w:t>
-            </w:r>
+              <w:t xml:space="preserve">Riley: Inizio sviluppo </w:t>
+            </w:r>
+            <w:proofErr w:type="spellStart"/>
+            <w:r>
+              <w:rPr>
+                <w:rFonts w:ascii="Arial" w:hAnsi="Arial" w:cs="Arial"/>
+              </w:rPr>
+              <w:t>db</w:t>
+            </w:r>
+            <w:proofErr w:type="spellEnd"/>
           </w:p>
           <w:p>
             <w:pPr>
@@ -19293,8 +20413,16 @@
               <w:rPr>
                 <w:rFonts w:ascii="Arial" w:hAnsi="Arial" w:cs="Arial"/>
               </w:rPr>
-              <w:t>Sprint Retrospective</w:t>
-            </w:r>
+              <w:t xml:space="preserve">Sprint </w:t>
+            </w:r>
+            <w:proofErr w:type="spellStart"/>
+            <w:r>
+              <w:rPr>
+                <w:rFonts w:ascii="Arial" w:hAnsi="Arial" w:cs="Arial"/>
+              </w:rPr>
+              <w:t>Retrospective</w:t>
+            </w:r>
+            <w:proofErr w:type="spellEnd"/>
           </w:p>
         </w:tc>
       </w:tr>
@@ -20520,7 +21648,21 @@
               <w:rPr>
                 <w:rFonts w:ascii="Arial" w:hAnsi="Arial" w:cs="Arial"/>
               </w:rPr>
-              <w:t>Rispetto al pianificato abbiamo qualche giornata, di lavoro, di anticipo infatti stiamo principalmente aggiungendo dettagli lavorando con un ritmo adeguato e sviluppando già un db più reale</w:t>
+              <w:t xml:space="preserve">Rispetto al pianificato abbiamo qualche giornata, di lavoro, di anticipo infatti stiamo principalmente aggiungendo dettagli lavorando con un ritmo adeguato e sviluppando già un </w:t>
+            </w:r>
+            <w:proofErr w:type="spellStart"/>
+            <w:r>
+              <w:rPr>
+                <w:rFonts w:ascii="Arial" w:hAnsi="Arial" w:cs="Arial"/>
+              </w:rPr>
+              <w:t>db</w:t>
+            </w:r>
+            <w:proofErr w:type="spellEnd"/>
+            <w:r>
+              <w:rPr>
+                <w:rFonts w:ascii="Arial" w:hAnsi="Arial" w:cs="Arial"/>
+              </w:rPr>
+              <w:t xml:space="preserve"> più reale</w:t>
             </w:r>
           </w:p>
         </w:tc>
@@ -20578,8 +21720,16 @@
               <w:rPr>
                 <w:rFonts w:ascii="Arial" w:hAnsi="Arial" w:cs="Arial"/>
               </w:rPr>
-              <w:t>Procedere con i vari l’aggiunta di dettagli e del db</w:t>
-            </w:r>
+              <w:t xml:space="preserve">Procedere con i vari l’aggiunta di dettagli e del </w:t>
+            </w:r>
+            <w:proofErr w:type="spellStart"/>
+            <w:r>
+              <w:rPr>
+                <w:rFonts w:ascii="Arial" w:hAnsi="Arial" w:cs="Arial"/>
+              </w:rPr>
+              <w:t>db</w:t>
+            </w:r>
+            <w:proofErr w:type="spellEnd"/>
           </w:p>
         </w:tc>
       </w:tr>
@@ -20628,12 +21778,28 @@
                 <w:rFonts w:ascii="Arial" w:hAnsi="Arial" w:cs="Arial"/>
               </w:rPr>
             </w:pPr>
-            <w:r>
-              <w:rPr>
-                <w:rFonts w:ascii="Arial" w:hAnsi="Arial" w:cs="Arial"/>
-              </w:rPr>
-              <w:t>Daily Scrum</w:t>
-            </w:r>
+            <w:proofErr w:type="spellStart"/>
+            <w:r>
+              <w:rPr>
+                <w:rFonts w:ascii="Arial" w:hAnsi="Arial" w:cs="Arial"/>
+              </w:rPr>
+              <w:t>Daily</w:t>
+            </w:r>
+            <w:proofErr w:type="spellEnd"/>
+            <w:r>
+              <w:rPr>
+                <w:rFonts w:ascii="Arial" w:hAnsi="Arial" w:cs="Arial"/>
+              </w:rPr>
+              <w:t xml:space="preserve"> </w:t>
+            </w:r>
+            <w:proofErr w:type="spellStart"/>
+            <w:r>
+              <w:rPr>
+                <w:rFonts w:ascii="Arial" w:hAnsi="Arial" w:cs="Arial"/>
+              </w:rPr>
+              <w:t>Scrum</w:t>
+            </w:r>
+            <w:proofErr w:type="spellEnd"/>
           </w:p>
         </w:tc>
       </w:tr>
@@ -20693,8 +21859,16 @@
               <w:rPr>
                 <w:rFonts w:ascii="Arial" w:hAnsi="Arial" w:cs="Arial"/>
               </w:rPr>
-              <w:t>ontinuo sviluppo db</w:t>
-            </w:r>
+              <w:t xml:space="preserve">ontinuo sviluppo </w:t>
+            </w:r>
+            <w:proofErr w:type="spellStart"/>
+            <w:r>
+              <w:rPr>
+                <w:rFonts w:ascii="Arial" w:hAnsi="Arial" w:cs="Arial"/>
+              </w:rPr>
+              <w:t>db</w:t>
+            </w:r>
+            <w:proofErr w:type="spellEnd"/>
           </w:p>
           <w:p>
             <w:pPr>
@@ -20887,8 +22061,16 @@
               <w:rPr>
                 <w:rFonts w:ascii="Arial" w:hAnsi="Arial" w:cs="Arial"/>
               </w:rPr>
-              <w:t>Sprint Retrospective</w:t>
-            </w:r>
+              <w:t xml:space="preserve">Sprint </w:t>
+            </w:r>
+            <w:proofErr w:type="spellStart"/>
+            <w:r>
+              <w:rPr>
+                <w:rFonts w:ascii="Arial" w:hAnsi="Arial" w:cs="Arial"/>
+              </w:rPr>
+              <w:t>Retrospective</w:t>
+            </w:r>
+            <w:proofErr w:type="spellEnd"/>
           </w:p>
         </w:tc>
       </w:tr>
@@ -21391,7 +22573,35 @@
             <w:rPr>
               <w:rFonts w:ascii="Arial" w:hAnsi="Arial" w:cs="Arial"/>
             </w:rPr>
-            <w:t>non ho fatto dei veri e propri promt oggi, ma mi sono cimentato nel procedere con una spiegazione guidata per applicare SQLite alla base di dati sviluppata finora.</w:t>
+            <w:t xml:space="preserve">non ho fatto dei veri e propri </w:t>
+          </w:r>
+          <w:proofErr w:type="spellStart"/>
+          <w:r>
+            <w:rPr>
+              <w:rFonts w:ascii="Arial" w:hAnsi="Arial" w:cs="Arial"/>
+            </w:rPr>
+            <w:t>promt</w:t>
+          </w:r>
+          <w:proofErr w:type="spellEnd"/>
+          <w:r>
+            <w:rPr>
+              <w:rFonts w:ascii="Arial" w:hAnsi="Arial" w:cs="Arial"/>
+            </w:rPr>
+            <w:t xml:space="preserve"> oggi, ma mi sono cimentato nel procedere con una spiegazione guidata per applicare </w:t>
+          </w:r>
+          <w:proofErr w:type="spellStart"/>
+          <w:r>
+            <w:rPr>
+              <w:rFonts w:ascii="Arial" w:hAnsi="Arial" w:cs="Arial"/>
+            </w:rPr>
+            <w:t>SQLite</w:t>
+          </w:r>
+          <w:proofErr w:type="spellEnd"/>
+          <w:r>
+            <w:rPr>
+              <w:rFonts w:ascii="Arial" w:hAnsi="Arial" w:cs="Arial"/>
+            </w:rPr>
+            <w:t xml:space="preserve"> alla base di dati sviluppata finora.</w:t>
           </w:r>
         </w:p>
         <w:p>
@@ -22217,7 +23427,21 @@
               <w:rPr>
                 <w:rFonts w:ascii="Arial" w:hAnsi="Arial" w:cs="Arial"/>
               </w:rPr>
-              <w:t>Continuare sviluppo garage e db.</w:t>
+              <w:t xml:space="preserve">Continuare sviluppo garage e </w:t>
+            </w:r>
+            <w:proofErr w:type="spellStart"/>
+            <w:r>
+              <w:rPr>
+                <w:rFonts w:ascii="Arial" w:hAnsi="Arial" w:cs="Arial"/>
+              </w:rPr>
+              <w:t>db</w:t>
+            </w:r>
+            <w:proofErr w:type="spellEnd"/>
+            <w:r>
+              <w:rPr>
+                <w:rFonts w:ascii="Arial" w:hAnsi="Arial" w:cs="Arial"/>
+              </w:rPr>
+              <w:t>.</w:t>
             </w:r>
           </w:p>
         </w:tc>
@@ -22267,12 +23491,28 @@
                 <w:rFonts w:ascii="Arial" w:hAnsi="Arial" w:cs="Arial"/>
               </w:rPr>
             </w:pPr>
-            <w:r>
-              <w:rPr>
-                <w:rFonts w:ascii="Arial" w:hAnsi="Arial" w:cs="Arial"/>
-              </w:rPr>
-              <w:t>Daily Scrum</w:t>
-            </w:r>
+            <w:proofErr w:type="spellStart"/>
+            <w:r>
+              <w:rPr>
+                <w:rFonts w:ascii="Arial" w:hAnsi="Arial" w:cs="Arial"/>
+              </w:rPr>
+              <w:t>Daily</w:t>
+            </w:r>
+            <w:proofErr w:type="spellEnd"/>
+            <w:r>
+              <w:rPr>
+                <w:rFonts w:ascii="Arial" w:hAnsi="Arial" w:cs="Arial"/>
+              </w:rPr>
+              <w:t xml:space="preserve"> </w:t>
+            </w:r>
+            <w:proofErr w:type="spellStart"/>
+            <w:r>
+              <w:rPr>
+                <w:rFonts w:ascii="Arial" w:hAnsi="Arial" w:cs="Arial"/>
+              </w:rPr>
+              <w:t>Scrum</w:t>
+            </w:r>
+            <w:proofErr w:type="spellEnd"/>
           </w:p>
         </w:tc>
       </w:tr>
@@ -22320,8 +23560,16 @@
               <w:rPr>
                 <w:rFonts w:ascii="Arial" w:hAnsi="Arial" w:cs="Arial"/>
               </w:rPr>
-              <w:t>Riley: Continuo sviluppo db</w:t>
-            </w:r>
+              <w:t xml:space="preserve">Riley: Continuo sviluppo </w:t>
+            </w:r>
+            <w:proofErr w:type="spellStart"/>
+            <w:r>
+              <w:rPr>
+                <w:rFonts w:ascii="Arial" w:hAnsi="Arial" w:cs="Arial"/>
+              </w:rPr>
+              <w:t>db</w:t>
+            </w:r>
+            <w:proofErr w:type="spellEnd"/>
           </w:p>
           <w:p>
             <w:pPr>
@@ -22514,8 +23762,16 @@
               <w:rPr>
                 <w:rFonts w:ascii="Arial" w:hAnsi="Arial" w:cs="Arial"/>
               </w:rPr>
-              <w:t>Sprint Retrospective</w:t>
-            </w:r>
+              <w:t xml:space="preserve">Sprint </w:t>
+            </w:r>
+            <w:proofErr w:type="spellStart"/>
+            <w:r>
+              <w:rPr>
+                <w:rFonts w:ascii="Arial" w:hAnsi="Arial" w:cs="Arial"/>
+              </w:rPr>
+              <w:t>Retrospective</w:t>
+            </w:r>
+            <w:proofErr w:type="spellEnd"/>
           </w:p>
         </w:tc>
       </w:tr>
@@ -23522,8 +24778,16 @@
               <w:rPr>
                 <w:rFonts w:ascii="Arial" w:hAnsi="Arial" w:cs="Arial"/>
               </w:rPr>
-              <w:t>Continuato lo sviluppo del db</w:t>
-            </w:r>
+              <w:t xml:space="preserve">Continuato lo sviluppo del </w:t>
+            </w:r>
+            <w:proofErr w:type="spellStart"/>
+            <w:r>
+              <w:rPr>
+                <w:rFonts w:ascii="Arial" w:hAnsi="Arial" w:cs="Arial"/>
+              </w:rPr>
+              <w:t>db</w:t>
+            </w:r>
+            <w:proofErr w:type="spellEnd"/>
           </w:p>
         </w:tc>
       </w:tr>
@@ -23793,7 +25057,21 @@
               <w:rPr>
                 <w:rFonts w:ascii="Arial" w:hAnsi="Arial" w:cs="Arial"/>
               </w:rPr>
-              <w:t>Continuare ognuno con i sviluppi di db e garage</w:t>
+              <w:t xml:space="preserve">Continuare ognuno con i sviluppi di </w:t>
+            </w:r>
+            <w:proofErr w:type="spellStart"/>
+            <w:r>
+              <w:rPr>
+                <w:rFonts w:ascii="Arial" w:hAnsi="Arial" w:cs="Arial"/>
+              </w:rPr>
+              <w:t>db</w:t>
+            </w:r>
+            <w:proofErr w:type="spellEnd"/>
+            <w:r>
+              <w:rPr>
+                <w:rFonts w:ascii="Arial" w:hAnsi="Arial" w:cs="Arial"/>
+              </w:rPr>
+              <w:t xml:space="preserve"> e garage</w:t>
             </w:r>
           </w:p>
         </w:tc>
@@ -23843,12 +25121,28 @@
                 <w:rFonts w:ascii="Arial" w:hAnsi="Arial" w:cs="Arial"/>
               </w:rPr>
             </w:pPr>
-            <w:r>
-              <w:rPr>
-                <w:rFonts w:ascii="Arial" w:hAnsi="Arial" w:cs="Arial"/>
-              </w:rPr>
-              <w:t>Daily Scrum</w:t>
-            </w:r>
+            <w:proofErr w:type="spellStart"/>
+            <w:r>
+              <w:rPr>
+                <w:rFonts w:ascii="Arial" w:hAnsi="Arial" w:cs="Arial"/>
+              </w:rPr>
+              <w:t>Daily</w:t>
+            </w:r>
+            <w:proofErr w:type="spellEnd"/>
+            <w:r>
+              <w:rPr>
+                <w:rFonts w:ascii="Arial" w:hAnsi="Arial" w:cs="Arial"/>
+              </w:rPr>
+              <w:t xml:space="preserve"> </w:t>
+            </w:r>
+            <w:proofErr w:type="spellStart"/>
+            <w:r>
+              <w:rPr>
+                <w:rFonts w:ascii="Arial" w:hAnsi="Arial" w:cs="Arial"/>
+              </w:rPr>
+              <w:t>Scrum</w:t>
+            </w:r>
+            <w:proofErr w:type="spellEnd"/>
           </w:p>
         </w:tc>
       </w:tr>
@@ -23896,8 +25190,16 @@
               <w:rPr>
                 <w:rFonts w:ascii="Arial" w:hAnsi="Arial" w:cs="Arial"/>
               </w:rPr>
-              <w:t>Riley: Continuo sviluppo db</w:t>
-            </w:r>
+              <w:t xml:space="preserve">Riley: Continuo sviluppo </w:t>
+            </w:r>
+            <w:proofErr w:type="spellStart"/>
+            <w:r>
+              <w:rPr>
+                <w:rFonts w:ascii="Arial" w:hAnsi="Arial" w:cs="Arial"/>
+              </w:rPr>
+              <w:t>db</w:t>
+            </w:r>
+            <w:proofErr w:type="spellEnd"/>
           </w:p>
           <w:p>
             <w:pPr>
@@ -24090,8 +25392,16 @@
               <w:rPr>
                 <w:rFonts w:ascii="Arial" w:hAnsi="Arial" w:cs="Arial"/>
               </w:rPr>
-              <w:t>Sprint Retrospective</w:t>
-            </w:r>
+              <w:t xml:space="preserve">Sprint </w:t>
+            </w:r>
+            <w:proofErr w:type="spellStart"/>
+            <w:r>
+              <w:rPr>
+                <w:rFonts w:ascii="Arial" w:hAnsi="Arial" w:cs="Arial"/>
+              </w:rPr>
+              <w:t>Retrospective</w:t>
+            </w:r>
+            <w:proofErr w:type="spellEnd"/>
           </w:p>
         </w:tc>
       </w:tr>
@@ -24588,7 +25898,21 @@
             <w:rPr>
               <w:rFonts w:ascii="Arial" w:hAnsi="Arial" w:cs="Arial"/>
             </w:rPr>
-            <w:t>Dovrei introdurre nel db i comandi collegati alle impostazioni, ma la struttura usata è diversa da quelle precedenti, e viene usata una classe esterna.</w:t>
+            <w:t xml:space="preserve">Dovrei introdurre nel </w:t>
+          </w:r>
+          <w:proofErr w:type="spellStart"/>
+          <w:r>
+            <w:rPr>
+              <w:rFonts w:ascii="Arial" w:hAnsi="Arial" w:cs="Arial"/>
+            </w:rPr>
+            <w:t>db</w:t>
+          </w:r>
+          <w:proofErr w:type="spellEnd"/>
+          <w:r>
+            <w:rPr>
+              <w:rFonts w:ascii="Arial" w:hAnsi="Arial" w:cs="Arial"/>
+            </w:rPr>
+            <w:t xml:space="preserve"> i comandi collegati alle impostazioni, ma la struttura usata è diversa da quelle precedenti, e viene usata una classe esterna.</w:t>
           </w:r>
         </w:p>
         <w:p>
@@ -25230,7 +26554,21 @@
               <w:rPr>
                 <w:rFonts w:ascii="Arial" w:hAnsi="Arial" w:cs="Arial"/>
               </w:rPr>
-              <w:t>Le statistiche erano scomparse, Bryan ha fatto un rollback e quando mi sono state passate non erano collegate in modo concreto, quindi non risultava funzionante. Per risolvere ho semplicemente inserito gli oggetti necessari nei campi dello script</w:t>
+              <w:t xml:space="preserve">Le statistiche erano scomparse, Bryan ha fatto un </w:t>
+            </w:r>
+            <w:proofErr w:type="spellStart"/>
+            <w:r>
+              <w:rPr>
+                <w:rFonts w:ascii="Arial" w:hAnsi="Arial" w:cs="Arial"/>
+              </w:rPr>
+              <w:t>rollback</w:t>
+            </w:r>
+            <w:proofErr w:type="spellEnd"/>
+            <w:r>
+              <w:rPr>
+                <w:rFonts w:ascii="Arial" w:hAnsi="Arial" w:cs="Arial"/>
+              </w:rPr>
+              <w:t xml:space="preserve"> e quando mi sono state passate non erano collegate in modo concreto, quindi non risultava funzionante. Per risolvere ho semplicemente inserito gli oggetti necessari nei campi dello script</w:t>
             </w:r>
           </w:p>
         </w:tc>
@@ -25326,8 +26664,16 @@
               <w:rPr>
                 <w:rFonts w:ascii="Arial" w:hAnsi="Arial" w:cs="Arial"/>
               </w:rPr>
-              <w:t>Perfettamente in orario ed allineati con grafica e backend</w:t>
-            </w:r>
+              <w:t xml:space="preserve">Perfettamente in orario ed allineati con grafica e </w:t>
+            </w:r>
+            <w:proofErr w:type="spellStart"/>
+            <w:r>
+              <w:rPr>
+                <w:rFonts w:ascii="Arial" w:hAnsi="Arial" w:cs="Arial"/>
+              </w:rPr>
+              <w:t>backend</w:t>
+            </w:r>
+            <w:proofErr w:type="spellEnd"/>
           </w:p>
         </w:tc>
       </w:tr>
@@ -25434,12 +26780,28 @@
                 <w:rFonts w:ascii="Arial" w:hAnsi="Arial" w:cs="Arial"/>
               </w:rPr>
             </w:pPr>
-            <w:r>
-              <w:rPr>
-                <w:rFonts w:ascii="Arial" w:hAnsi="Arial" w:cs="Arial"/>
-              </w:rPr>
-              <w:t>Daily Scrum</w:t>
-            </w:r>
+            <w:proofErr w:type="spellStart"/>
+            <w:r>
+              <w:rPr>
+                <w:rFonts w:ascii="Arial" w:hAnsi="Arial" w:cs="Arial"/>
+              </w:rPr>
+              <w:t>Daily</w:t>
+            </w:r>
+            <w:proofErr w:type="spellEnd"/>
+            <w:r>
+              <w:rPr>
+                <w:rFonts w:ascii="Arial" w:hAnsi="Arial" w:cs="Arial"/>
+              </w:rPr>
+              <w:t xml:space="preserve"> </w:t>
+            </w:r>
+            <w:proofErr w:type="spellStart"/>
+            <w:r>
+              <w:rPr>
+                <w:rFonts w:ascii="Arial" w:hAnsi="Arial" w:cs="Arial"/>
+              </w:rPr>
+              <w:t>Scrum</w:t>
+            </w:r>
+            <w:proofErr w:type="spellEnd"/>
           </w:p>
         </w:tc>
       </w:tr>
@@ -25487,8 +26849,16 @@
               <w:rPr>
                 <w:rFonts w:ascii="Arial" w:hAnsi="Arial" w:cs="Arial"/>
               </w:rPr>
-              <w:t>Riley: Continuo sviluppo db</w:t>
-            </w:r>
+              <w:t xml:space="preserve">Riley: Continuo sviluppo </w:t>
+            </w:r>
+            <w:proofErr w:type="spellStart"/>
+            <w:r>
+              <w:rPr>
+                <w:rFonts w:ascii="Arial" w:hAnsi="Arial" w:cs="Arial"/>
+              </w:rPr>
+              <w:t>db</w:t>
+            </w:r>
+            <w:proofErr w:type="spellEnd"/>
           </w:p>
           <w:p>
             <w:pPr>
@@ -25681,8 +27051,16 @@
               <w:rPr>
                 <w:rFonts w:ascii="Arial" w:hAnsi="Arial" w:cs="Arial"/>
               </w:rPr>
-              <w:t>Sprint Retrospective</w:t>
-            </w:r>
+              <w:t xml:space="preserve">Sprint </w:t>
+            </w:r>
+            <w:proofErr w:type="spellStart"/>
+            <w:r>
+              <w:rPr>
+                <w:rFonts w:ascii="Arial" w:hAnsi="Arial" w:cs="Arial"/>
+              </w:rPr>
+              <w:t>Retrospective</w:t>
+            </w:r>
+            <w:proofErr w:type="spellEnd"/>
           </w:p>
         </w:tc>
       </w:tr>
@@ -26522,7 +27900,21 @@
         <w:rPr>
           <w:rFonts w:ascii="Arial" w:hAnsi="Arial" w:cs="Arial"/>
         </w:rPr>
-        <w:t>Avrei cercato di adattare basandomi su i file presenti.</w:t>
+        <w:t xml:space="preserve">Avrei cercato di adattare basandomi </w:t>
+      </w:r>
+      <w:proofErr w:type="spellStart"/>
+      <w:r>
+        <w:rPr>
+          <w:rFonts w:ascii="Arial" w:hAnsi="Arial" w:cs="Arial"/>
+        </w:rPr>
+        <w:t>su i</w:t>
+      </w:r>
+      <w:proofErr w:type="spellEnd"/>
+      <w:r>
+        <w:rPr>
+          <w:rFonts w:ascii="Arial" w:hAnsi="Arial" w:cs="Arial"/>
+        </w:rPr>
+        <w:t xml:space="preserve"> file presenti.</w:t>
       </w:r>
     </w:p>
     <w:p>
@@ -26543,6 +27935,1689 @@
           <w:rFonts w:ascii="Arial" w:hAnsi="Arial" w:cs="Arial"/>
         </w:rPr>
         <w:t xml:space="preserve"> Debugging.</w:t>
+      </w:r>
+    </w:p>
+    <w:p>
+      <w:pPr>
+        <w:rPr>
+          <w:rFonts w:ascii="Arial" w:hAnsi="Arial" w:cs="Arial"/>
+        </w:rPr>
+      </w:pPr>
+      <w:r>
+        <w:rPr>
+          <w:rFonts w:ascii="Arial" w:hAnsi="Arial" w:cs="Arial"/>
+        </w:rPr>
+        <w:br w:type="page"/>
+      </w:r>
+    </w:p>
+    <w:tbl>
+      <w:tblPr>
+        <w:tblStyle w:val="Grigliatabella"/>
+        <w:tblW w:w="5000" w:type="pct"/>
+        <w:tblLook w:val="04A0" w:firstRow="1" w:lastRow="0" w:firstColumn="1" w:lastColumn="0" w:noHBand="0" w:noVBand="1"/>
+      </w:tblPr>
+      <w:tblGrid>
+        <w:gridCol w:w="2407"/>
+        <w:gridCol w:w="7221"/>
+      </w:tblGrid>
+      <w:tr>
+        <w:trPr>
+          <w:trHeight w:val="199"/>
+        </w:trPr>
+        <w:tc>
+          <w:tcPr>
+            <w:tcW w:w="1250" w:type="pct"/>
+            <w:vAlign w:val="center"/>
+          </w:tcPr>
+          <w:p>
+            <w:pPr>
+              <w:rPr>
+                <w:rFonts w:ascii="Arial" w:hAnsi="Arial" w:cs="Arial"/>
+              </w:rPr>
+            </w:pPr>
+            <w:r>
+              <w:rPr>
+                <w:rFonts w:ascii="Arial" w:hAnsi="Arial" w:cs="Arial"/>
+              </w:rPr>
+              <w:lastRenderedPageBreak/>
+              <w:t>Luogo</w:t>
+            </w:r>
+          </w:p>
+        </w:tc>
+        <w:tc>
+          <w:tcPr>
+            <w:tcW w:w="3750" w:type="pct"/>
+            <w:vAlign w:val="center"/>
+          </w:tcPr>
+          <w:p>
+            <w:pPr>
+              <w:rPr>
+                <w:rFonts w:ascii="Arial" w:hAnsi="Arial" w:cs="Arial"/>
+              </w:rPr>
+            </w:pPr>
+            <w:r>
+              <w:rPr>
+                <w:rFonts w:ascii="Arial" w:hAnsi="Arial" w:cs="Arial"/>
+              </w:rPr>
+              <w:t>Scuola Arti e Mestieri Trevano</w:t>
+            </w:r>
+          </w:p>
+        </w:tc>
+      </w:tr>
+      <w:tr>
+        <w:trPr>
+          <w:trHeight w:val="196"/>
+        </w:trPr>
+        <w:tc>
+          <w:tcPr>
+            <w:tcW w:w="1250" w:type="pct"/>
+            <w:vAlign w:val="center"/>
+          </w:tcPr>
+          <w:p>
+            <w:pPr>
+              <w:rPr>
+                <w:rFonts w:ascii="Arial" w:hAnsi="Arial" w:cs="Arial"/>
+              </w:rPr>
+            </w:pPr>
+            <w:r>
+              <w:rPr>
+                <w:rFonts w:ascii="Arial" w:hAnsi="Arial" w:cs="Arial"/>
+              </w:rPr>
+              <w:t>Data</w:t>
+            </w:r>
+          </w:p>
+        </w:tc>
+        <w:tc>
+          <w:tcPr>
+            <w:tcW w:w="3750" w:type="pct"/>
+            <w:vAlign w:val="center"/>
+          </w:tcPr>
+          <w:p>
+            <w:pPr>
+              <w:rPr>
+                <w:rFonts w:ascii="Arial" w:hAnsi="Arial" w:cs="Arial"/>
+              </w:rPr>
+            </w:pPr>
+            <w:r>
+              <w:rPr>
+                <w:rFonts w:ascii="Arial" w:hAnsi="Arial" w:cs="Arial"/>
+              </w:rPr>
+              <w:t>12</w:t>
+            </w:r>
+            <w:r>
+              <w:rPr>
+                <w:rFonts w:ascii="Arial" w:hAnsi="Arial" w:cs="Arial"/>
+              </w:rPr>
+              <w:t>.10.2026</w:t>
+            </w:r>
+          </w:p>
+        </w:tc>
+      </w:tr>
+    </w:tbl>
+    <w:p>
+      <w:pPr>
+        <w:rPr>
+          <w:rFonts w:ascii="Arial" w:hAnsi="Arial" w:cs="Arial"/>
+        </w:rPr>
+      </w:pPr>
+    </w:p>
+    <w:tbl>
+      <w:tblPr>
+        <w:tblStyle w:val="Grigliatabella"/>
+        <w:tblW w:w="0" w:type="auto"/>
+        <w:tblLook w:val="04A0" w:firstRow="1" w:lastRow="0" w:firstColumn="1" w:lastColumn="0" w:noHBand="0" w:noVBand="1"/>
+      </w:tblPr>
+      <w:tblGrid>
+        <w:gridCol w:w="1271"/>
+        <w:gridCol w:w="8357"/>
+      </w:tblGrid>
+      <w:tr>
+        <w:tc>
+          <w:tcPr>
+            <w:tcW w:w="9628" w:type="dxa"/>
+            <w:gridSpan w:val="2"/>
+            <w:shd w:val="clear" w:color="auto" w:fill="D9D9D9" w:themeFill="background1" w:themeFillShade="D9"/>
+          </w:tcPr>
+          <w:p>
+            <w:pPr>
+              <w:rPr>
+                <w:rFonts w:ascii="Arial" w:hAnsi="Arial" w:cs="Arial"/>
+              </w:rPr>
+            </w:pPr>
+            <w:r>
+              <w:rPr>
+                <w:rFonts w:ascii="Arial" w:hAnsi="Arial" w:cs="Arial"/>
+              </w:rPr>
+              <w:t>Lavori svolti</w:t>
+            </w:r>
+          </w:p>
+        </w:tc>
+      </w:tr>
+      <w:tr>
+        <w:tc>
+          <w:tcPr>
+            <w:tcW w:w="1271" w:type="dxa"/>
+          </w:tcPr>
+          <w:p>
+            <w:pPr>
+              <w:rPr>
+                <w:rFonts w:ascii="Arial" w:hAnsi="Arial" w:cs="Arial"/>
+              </w:rPr>
+            </w:pPr>
+            <w:r>
+              <w:rPr>
+                <w:rFonts w:ascii="Arial" w:hAnsi="Arial" w:cs="Arial"/>
+              </w:rPr>
+              <w:t>Riley</w:t>
+            </w:r>
+          </w:p>
+        </w:tc>
+        <w:tc>
+          <w:tcPr>
+            <w:tcW w:w="8357" w:type="dxa"/>
+          </w:tcPr>
+          <w:p>
+            <w:pPr>
+              <w:rPr>
+                <w:rFonts w:ascii="Arial" w:hAnsi="Arial" w:cs="Arial"/>
+              </w:rPr>
+            </w:pPr>
+            <w:r>
+              <w:rPr>
+                <w:rFonts w:ascii="Arial" w:hAnsi="Arial" w:cs="Arial"/>
+              </w:rPr>
+              <w:t>Terminato con le parti fondamentali per il DB</w:t>
+            </w:r>
+          </w:p>
+        </w:tc>
+      </w:tr>
+      <w:tr>
+        <w:tc>
+          <w:tcPr>
+            <w:tcW w:w="1271" w:type="dxa"/>
+          </w:tcPr>
+          <w:p>
+            <w:pPr>
+              <w:rPr>
+                <w:rFonts w:ascii="Arial" w:hAnsi="Arial" w:cs="Arial"/>
+              </w:rPr>
+            </w:pPr>
+            <w:r>
+              <w:rPr>
+                <w:rFonts w:ascii="Arial" w:hAnsi="Arial" w:cs="Arial"/>
+              </w:rPr>
+              <w:t>Bryan</w:t>
+            </w:r>
+          </w:p>
+        </w:tc>
+        <w:tc>
+          <w:tcPr>
+            <w:tcW w:w="8357" w:type="dxa"/>
+          </w:tcPr>
+          <w:p>
+            <w:pPr>
+              <w:rPr>
+                <w:rFonts w:ascii="Arial" w:hAnsi="Arial" w:cs="Arial"/>
+              </w:rPr>
+            </w:pPr>
+            <w:r>
+              <w:rPr>
+                <w:rFonts w:ascii="Arial" w:hAnsi="Arial" w:cs="Arial"/>
+              </w:rPr>
+              <w:t>Finito animazioni menu, finiti collegamenti menu, inizio sviluppo extra garage</w:t>
+            </w:r>
+          </w:p>
+        </w:tc>
+      </w:tr>
+    </w:tbl>
+    <w:p>
+      <w:pPr>
+        <w:rPr>
+          <w:rFonts w:ascii="Arial" w:hAnsi="Arial" w:cs="Arial"/>
+        </w:rPr>
+      </w:pPr>
+    </w:p>
+    <w:tbl>
+      <w:tblPr>
+        <w:tblStyle w:val="Grigliatabella"/>
+        <w:tblW w:w="0" w:type="auto"/>
+        <w:tblInd w:w="-5" w:type="dxa"/>
+        <w:tblLook w:val="04A0" w:firstRow="1" w:lastRow="0" w:firstColumn="1" w:lastColumn="0" w:noHBand="0" w:noVBand="1"/>
+      </w:tblPr>
+      <w:tblGrid>
+        <w:gridCol w:w="1276"/>
+        <w:gridCol w:w="8357"/>
+      </w:tblGrid>
+      <w:tr>
+        <w:tc>
+          <w:tcPr>
+            <w:tcW w:w="9628" w:type="dxa"/>
+            <w:gridSpan w:val="2"/>
+            <w:shd w:val="clear" w:color="auto" w:fill="D9D9D9" w:themeFill="background1" w:themeFillShade="D9"/>
+          </w:tcPr>
+          <w:p>
+            <w:pPr>
+              <w:rPr>
+                <w:rFonts w:ascii="Arial" w:hAnsi="Arial" w:cs="Arial"/>
+              </w:rPr>
+            </w:pPr>
+            <w:r>
+              <w:rPr>
+                <w:rFonts w:ascii="Arial" w:hAnsi="Arial" w:cs="Arial"/>
+              </w:rPr>
+              <w:t>Problemi riscontrati e soluzioni adottate</w:t>
+            </w:r>
+          </w:p>
+        </w:tc>
+      </w:tr>
+      <w:tr>
+        <w:tc>
+          <w:tcPr>
+            <w:tcW w:w="1276" w:type="dxa"/>
+          </w:tcPr>
+          <w:p>
+            <w:pPr>
+              <w:rPr>
+                <w:rFonts w:ascii="Arial" w:hAnsi="Arial" w:cs="Arial"/>
+              </w:rPr>
+            </w:pPr>
+            <w:r>
+              <w:rPr>
+                <w:rFonts w:ascii="Arial" w:hAnsi="Arial" w:cs="Arial"/>
+              </w:rPr>
+              <w:t>Riley</w:t>
+            </w:r>
+          </w:p>
+        </w:tc>
+        <w:tc>
+          <w:tcPr>
+            <w:tcW w:w="8357" w:type="dxa"/>
+          </w:tcPr>
+          <w:p>
+            <w:pPr>
+              <w:rPr>
+                <w:rFonts w:ascii="Arial" w:hAnsi="Arial" w:cs="Arial"/>
+              </w:rPr>
+            </w:pPr>
+            <w:r>
+              <w:rPr>
+                <w:rFonts w:ascii="Arial" w:hAnsi="Arial" w:cs="Arial"/>
+              </w:rPr>
+              <w:t xml:space="preserve">Le statistiche erano scomparse, Bryan ha fatto un </w:t>
+            </w:r>
+            <w:proofErr w:type="spellStart"/>
+            <w:r>
+              <w:rPr>
+                <w:rFonts w:ascii="Arial" w:hAnsi="Arial" w:cs="Arial"/>
+              </w:rPr>
+              <w:t>rollback</w:t>
+            </w:r>
+            <w:proofErr w:type="spellEnd"/>
+            <w:r>
+              <w:rPr>
+                <w:rFonts w:ascii="Arial" w:hAnsi="Arial" w:cs="Arial"/>
+              </w:rPr>
+              <w:t xml:space="preserve"> e quando mi sono state passate non erano collegate in modo concreto, quindi non risultava funzionante. Per risolvere ho semplicemente inserito gli oggetti necessari nei campi dello script</w:t>
+            </w:r>
+          </w:p>
+        </w:tc>
+      </w:tr>
+      <w:tr>
+        <w:tc>
+          <w:tcPr>
+            <w:tcW w:w="1276" w:type="dxa"/>
+          </w:tcPr>
+          <w:p>
+            <w:pPr>
+              <w:rPr>
+                <w:rFonts w:ascii="Arial" w:hAnsi="Arial" w:cs="Arial"/>
+              </w:rPr>
+            </w:pPr>
+            <w:r>
+              <w:rPr>
+                <w:rFonts w:ascii="Arial" w:hAnsi="Arial" w:cs="Arial"/>
+              </w:rPr>
+              <w:t>Bryan</w:t>
+            </w:r>
+          </w:p>
+        </w:tc>
+        <w:tc>
+          <w:tcPr>
+            <w:tcW w:w="8357" w:type="dxa"/>
+          </w:tcPr>
+          <w:p>
+            <w:pPr>
+              <w:rPr>
+                <w:rFonts w:ascii="Arial" w:hAnsi="Arial" w:cs="Arial"/>
+              </w:rPr>
+            </w:pPr>
+            <w:r>
+              <w:rPr>
+                <w:rFonts w:ascii="Arial" w:hAnsi="Arial" w:cs="Arial"/>
+              </w:rPr>
+              <w:t>Non riuscivo a rendere cliccabile un bottone in una scena specifica, avevo provato a farmi risolvere il problema da un ai ma con scarsi risultati. Alla fine grazie a Riley siamo riusciti a capire dove si trovava il problema</w:t>
+            </w:r>
+          </w:p>
+        </w:tc>
+      </w:tr>
+    </w:tbl>
+    <w:p>
+      <w:pPr>
+        <w:rPr>
+          <w:rFonts w:ascii="Arial" w:hAnsi="Arial" w:cs="Arial"/>
+        </w:rPr>
+      </w:pPr>
+    </w:p>
+    <w:tbl>
+      <w:tblPr>
+        <w:tblStyle w:val="Grigliatabella"/>
+        <w:tblW w:w="0" w:type="auto"/>
+        <w:tblLook w:val="04A0" w:firstRow="1" w:lastRow="0" w:firstColumn="1" w:lastColumn="0" w:noHBand="0" w:noVBand="1"/>
+      </w:tblPr>
+      <w:tblGrid>
+        <w:gridCol w:w="9628"/>
+      </w:tblGrid>
+      <w:tr>
+        <w:tc>
+          <w:tcPr>
+            <w:tcW w:w="9854" w:type="dxa"/>
+            <w:shd w:val="clear" w:color="auto" w:fill="D9D9D9" w:themeFill="background1" w:themeFillShade="D9"/>
+          </w:tcPr>
+          <w:p>
+            <w:pPr>
+              <w:rPr>
+                <w:rFonts w:ascii="Arial" w:hAnsi="Arial" w:cs="Arial"/>
+              </w:rPr>
+            </w:pPr>
+            <w:r>
+              <w:rPr>
+                <w:rFonts w:ascii="Arial" w:hAnsi="Arial" w:cs="Arial"/>
+              </w:rPr>
+              <w:t>Punto della situazione rispetto alla pianificazione</w:t>
+            </w:r>
+          </w:p>
+        </w:tc>
+      </w:tr>
+      <w:tr>
+        <w:tc>
+          <w:tcPr>
+            <w:tcW w:w="9854" w:type="dxa"/>
+          </w:tcPr>
+          <w:p>
+            <w:pPr>
+              <w:rPr>
+                <w:rFonts w:ascii="Arial" w:hAnsi="Arial" w:cs="Arial"/>
+              </w:rPr>
+            </w:pPr>
+            <w:r>
+              <w:rPr>
+                <w:rFonts w:ascii="Arial" w:hAnsi="Arial" w:cs="Arial"/>
+              </w:rPr>
+              <w:t xml:space="preserve">Perfettamente in orario ed allineati con grafica e </w:t>
+            </w:r>
+            <w:proofErr w:type="spellStart"/>
+            <w:r>
+              <w:rPr>
+                <w:rFonts w:ascii="Arial" w:hAnsi="Arial" w:cs="Arial"/>
+              </w:rPr>
+              <w:t>backend</w:t>
+            </w:r>
+            <w:proofErr w:type="spellEnd"/>
+          </w:p>
+        </w:tc>
+      </w:tr>
+    </w:tbl>
+    <w:p>
+      <w:pPr>
+        <w:rPr>
+          <w:rFonts w:ascii="Arial" w:hAnsi="Arial" w:cs="Arial"/>
+        </w:rPr>
+      </w:pPr>
+    </w:p>
+    <w:tbl>
+      <w:tblPr>
+        <w:tblStyle w:val="Grigliatabella"/>
+        <w:tblW w:w="0" w:type="auto"/>
+        <w:tblLook w:val="04A0" w:firstRow="1" w:lastRow="0" w:firstColumn="1" w:lastColumn="0" w:noHBand="0" w:noVBand="1"/>
+      </w:tblPr>
+      <w:tblGrid>
+        <w:gridCol w:w="9628"/>
+      </w:tblGrid>
+      <w:tr>
+        <w:tc>
+          <w:tcPr>
+            <w:tcW w:w="9854" w:type="dxa"/>
+            <w:shd w:val="clear" w:color="auto" w:fill="D9D9D9" w:themeFill="background1" w:themeFillShade="D9"/>
+          </w:tcPr>
+          <w:p>
+            <w:pPr>
+              <w:rPr>
+                <w:rFonts w:ascii="Arial" w:hAnsi="Arial" w:cs="Arial"/>
+              </w:rPr>
+            </w:pPr>
+            <w:r>
+              <w:rPr>
+                <w:rFonts w:ascii="Arial" w:hAnsi="Arial" w:cs="Arial"/>
+              </w:rPr>
+              <w:t>Programma di massima per la prossima giornata di lavoro</w:t>
+            </w:r>
+          </w:p>
+        </w:tc>
+      </w:tr>
+      <w:tr>
+        <w:tc>
+          <w:tcPr>
+            <w:tcW w:w="9854" w:type="dxa"/>
+          </w:tcPr>
+          <w:p>
+            <w:pPr>
+              <w:rPr>
+                <w:rFonts w:ascii="Arial" w:hAnsi="Arial" w:cs="Arial"/>
+              </w:rPr>
+            </w:pPr>
+            <w:r>
+              <w:rPr>
+                <w:rFonts w:ascii="Arial" w:hAnsi="Arial" w:cs="Arial"/>
+              </w:rPr>
+              <w:t>Fare lo sprint review e cominciare con il prossimo che riguarda la meccanica di movimento</w:t>
+            </w:r>
+          </w:p>
+        </w:tc>
+      </w:tr>
+    </w:tbl>
+    <w:p>
+      <w:pPr>
+        <w:rPr>
+          <w:rFonts w:ascii="Arial" w:hAnsi="Arial" w:cs="Arial"/>
+        </w:rPr>
+      </w:pPr>
+    </w:p>
+    <w:p>
+      <w:pPr>
+        <w:pStyle w:val="Titolo1"/>
+      </w:pPr>
+      <w:r>
+        <w:t>Agile - Resoconto</w:t>
+      </w:r>
+    </w:p>
+    <w:tbl>
+      <w:tblPr>
+        <w:tblStyle w:val="Grigliatabella"/>
+        <w:tblW w:w="0" w:type="auto"/>
+        <w:tblLook w:val="04A0" w:firstRow="1" w:lastRow="0" w:firstColumn="1" w:lastColumn="0" w:noHBand="0" w:noVBand="1"/>
+      </w:tblPr>
+      <w:tblGrid>
+        <w:gridCol w:w="9628"/>
+      </w:tblGrid>
+      <w:tr>
+        <w:tc>
+          <w:tcPr>
+            <w:tcW w:w="9628" w:type="dxa"/>
+            <w:tcBorders>
+              <w:top w:val="single" w:sz="4" w:space="0" w:color="auto"/>
+              <w:left w:val="single" w:sz="4" w:space="0" w:color="auto"/>
+              <w:bottom w:val="single" w:sz="4" w:space="0" w:color="auto"/>
+              <w:right w:val="single" w:sz="4" w:space="0" w:color="auto"/>
+            </w:tcBorders>
+            <w:shd w:val="clear" w:color="auto" w:fill="D9D9D9" w:themeFill="background1" w:themeFillShade="D9"/>
+            <w:hideMark/>
+          </w:tcPr>
+          <w:p>
+            <w:pPr>
+              <w:spacing w:after="200" w:line="276" w:lineRule="auto"/>
+              <w:rPr>
+                <w:rFonts w:ascii="Arial" w:hAnsi="Arial" w:cs="Arial"/>
+              </w:rPr>
+            </w:pPr>
+            <w:proofErr w:type="spellStart"/>
+            <w:r>
+              <w:rPr>
+                <w:rFonts w:ascii="Arial" w:hAnsi="Arial" w:cs="Arial"/>
+              </w:rPr>
+              <w:t>Daily</w:t>
+            </w:r>
+            <w:proofErr w:type="spellEnd"/>
+            <w:r>
+              <w:rPr>
+                <w:rFonts w:ascii="Arial" w:hAnsi="Arial" w:cs="Arial"/>
+              </w:rPr>
+              <w:t xml:space="preserve"> </w:t>
+            </w:r>
+            <w:proofErr w:type="spellStart"/>
+            <w:r>
+              <w:rPr>
+                <w:rFonts w:ascii="Arial" w:hAnsi="Arial" w:cs="Arial"/>
+              </w:rPr>
+              <w:t>Scrum</w:t>
+            </w:r>
+            <w:proofErr w:type="spellEnd"/>
+          </w:p>
+        </w:tc>
+      </w:tr>
+      <w:tr>
+        <w:tc>
+          <w:tcPr>
+            <w:tcW w:w="9628" w:type="dxa"/>
+            <w:tcBorders>
+              <w:top w:val="single" w:sz="4" w:space="0" w:color="auto"/>
+              <w:left w:val="single" w:sz="4" w:space="0" w:color="auto"/>
+              <w:bottom w:val="single" w:sz="4" w:space="0" w:color="auto"/>
+              <w:right w:val="single" w:sz="4" w:space="0" w:color="auto"/>
+            </w:tcBorders>
+            <w:hideMark/>
+          </w:tcPr>
+          <w:p>
+            <w:pPr>
+              <w:spacing w:after="200" w:line="276" w:lineRule="auto"/>
+              <w:rPr>
+                <w:rFonts w:ascii="Arial" w:hAnsi="Arial" w:cs="Arial"/>
+              </w:rPr>
+            </w:pPr>
+          </w:p>
+        </w:tc>
+      </w:tr>
+      <w:tr>
+        <w:tc>
+          <w:tcPr>
+            <w:tcW w:w="9628" w:type="dxa"/>
+            <w:tcBorders>
+              <w:top w:val="single" w:sz="4" w:space="0" w:color="auto"/>
+              <w:left w:val="single" w:sz="4" w:space="0" w:color="auto"/>
+              <w:bottom w:val="single" w:sz="4" w:space="0" w:color="auto"/>
+              <w:right w:val="single" w:sz="4" w:space="0" w:color="auto"/>
+            </w:tcBorders>
+          </w:tcPr>
+          <w:p>
+            <w:pPr>
+              <w:spacing w:after="200" w:line="276" w:lineRule="auto"/>
+              <w:rPr>
+                <w:rFonts w:ascii="Arial" w:hAnsi="Arial" w:cs="Arial"/>
+              </w:rPr>
+            </w:pPr>
+            <w:r>
+              <w:rPr>
+                <w:rFonts w:ascii="Arial" w:hAnsi="Arial" w:cs="Arial"/>
+              </w:rPr>
+              <w:t xml:space="preserve">Riley: </w:t>
+            </w:r>
+            <w:r>
+              <w:rPr>
+                <w:rFonts w:ascii="Arial" w:hAnsi="Arial" w:cs="Arial"/>
+              </w:rPr>
+              <w:t>Creazione scena di gioco</w:t>
+            </w:r>
+          </w:p>
+          <w:p>
+            <w:pPr>
+              <w:spacing w:after="200" w:line="276" w:lineRule="auto"/>
+              <w:rPr>
+                <w:rFonts w:ascii="Arial" w:hAnsi="Arial" w:cs="Arial"/>
+              </w:rPr>
+            </w:pPr>
+            <w:r>
+              <w:rPr>
+                <w:rFonts w:ascii="Arial" w:hAnsi="Arial" w:cs="Arial"/>
+              </w:rPr>
+              <w:t xml:space="preserve">Bryan: </w:t>
+            </w:r>
+            <w:r>
+              <w:rPr>
+                <w:rFonts w:ascii="Arial" w:hAnsi="Arial" w:cs="Arial"/>
+              </w:rPr>
+              <w:t>Continua a essere gay Ricerca per sistema di movimento</w:t>
+            </w:r>
+          </w:p>
+        </w:tc>
+      </w:tr>
+    </w:tbl>
+    <w:p>
+      <w:pPr>
+        <w:rPr>
+          <w:rFonts w:ascii="Arial" w:hAnsi="Arial" w:cs="Arial"/>
+        </w:rPr>
+      </w:pPr>
+    </w:p>
+    <w:tbl>
+      <w:tblPr>
+        <w:tblStyle w:val="Grigliatabella"/>
+        <w:tblW w:w="0" w:type="auto"/>
+        <w:tblLook w:val="04A0" w:firstRow="1" w:lastRow="0" w:firstColumn="1" w:lastColumn="0" w:noHBand="0" w:noVBand="1"/>
+      </w:tblPr>
+      <w:tblGrid>
+        <w:gridCol w:w="9628"/>
+      </w:tblGrid>
+      <w:tr>
+        <w:tc>
+          <w:tcPr>
+            <w:tcW w:w="9854" w:type="dxa"/>
+            <w:tcBorders>
+              <w:top w:val="single" w:sz="4" w:space="0" w:color="auto"/>
+              <w:left w:val="single" w:sz="4" w:space="0" w:color="auto"/>
+              <w:bottom w:val="single" w:sz="4" w:space="0" w:color="auto"/>
+              <w:right w:val="single" w:sz="4" w:space="0" w:color="auto"/>
+            </w:tcBorders>
+            <w:shd w:val="clear" w:color="auto" w:fill="D9D9D9" w:themeFill="background1" w:themeFillShade="D9"/>
+            <w:hideMark/>
+          </w:tcPr>
+          <w:p>
+            <w:pPr>
+              <w:spacing w:after="200" w:line="276" w:lineRule="auto"/>
+              <w:rPr>
+                <w:rFonts w:ascii="Arial" w:hAnsi="Arial" w:cs="Arial"/>
+              </w:rPr>
+            </w:pPr>
+            <w:r>
+              <w:rPr>
+                <w:rFonts w:ascii="Arial" w:hAnsi="Arial" w:cs="Arial"/>
+              </w:rPr>
+              <w:t>Sprint Planning</w:t>
+            </w:r>
+          </w:p>
+        </w:tc>
+      </w:tr>
+      <w:tr>
+        <w:tc>
+          <w:tcPr>
+            <w:tcW w:w="9854" w:type="dxa"/>
+            <w:tcBorders>
+              <w:top w:val="single" w:sz="4" w:space="0" w:color="auto"/>
+              <w:left w:val="single" w:sz="4" w:space="0" w:color="auto"/>
+              <w:bottom w:val="single" w:sz="4" w:space="0" w:color="auto"/>
+              <w:right w:val="single" w:sz="4" w:space="0" w:color="auto"/>
+            </w:tcBorders>
+          </w:tcPr>
+          <w:p>
+            <w:pPr>
+              <w:spacing w:after="200" w:line="276" w:lineRule="auto"/>
+              <w:rPr>
+                <w:rFonts w:ascii="Arial" w:hAnsi="Arial" w:cs="Arial"/>
+              </w:rPr>
+            </w:pPr>
+            <w:r>
+              <w:rPr>
+                <w:rFonts w:ascii="Arial" w:hAnsi="Arial" w:cs="Arial"/>
+              </w:rPr>
+              <w:t xml:space="preserve">Abbiamo deciso che per il momento Bryan cercherà informazioni e tutorial per quello che riguarda il movimento di un’auto e nel mentre Riley si dedicherà alla creazione della nuova scena di gioco, in seguito probabilmente lavoreremo assieme in modo che entrambi potremmo comprendere le meccaniche </w:t>
+            </w:r>
+          </w:p>
+        </w:tc>
+      </w:tr>
+    </w:tbl>
+    <w:p>
+      <w:pPr>
+        <w:rPr>
+          <w:rFonts w:ascii="Arial" w:hAnsi="Arial" w:cs="Arial"/>
+        </w:rPr>
+      </w:pPr>
+    </w:p>
+    <w:tbl>
+      <w:tblPr>
+        <w:tblStyle w:val="Grigliatabella"/>
+        <w:tblW w:w="0" w:type="auto"/>
+        <w:tblLook w:val="04A0" w:firstRow="1" w:lastRow="0" w:firstColumn="1" w:lastColumn="0" w:noHBand="0" w:noVBand="1"/>
+      </w:tblPr>
+      <w:tblGrid>
+        <w:gridCol w:w="9628"/>
+      </w:tblGrid>
+      <w:tr>
+        <w:tc>
+          <w:tcPr>
+            <w:tcW w:w="9854" w:type="dxa"/>
+            <w:tcBorders>
+              <w:top w:val="single" w:sz="4" w:space="0" w:color="auto"/>
+              <w:left w:val="single" w:sz="4" w:space="0" w:color="auto"/>
+              <w:bottom w:val="single" w:sz="4" w:space="0" w:color="auto"/>
+              <w:right w:val="single" w:sz="4" w:space="0" w:color="auto"/>
+            </w:tcBorders>
+            <w:shd w:val="clear" w:color="auto" w:fill="D9D9D9" w:themeFill="background1" w:themeFillShade="D9"/>
+            <w:hideMark/>
+          </w:tcPr>
+          <w:p>
+            <w:pPr>
+              <w:spacing w:after="200" w:line="276" w:lineRule="auto"/>
+              <w:rPr>
+                <w:rFonts w:ascii="Arial" w:hAnsi="Arial" w:cs="Arial"/>
+              </w:rPr>
+            </w:pPr>
+            <w:r>
+              <w:rPr>
+                <w:rFonts w:ascii="Arial" w:hAnsi="Arial" w:cs="Arial"/>
+              </w:rPr>
+              <w:t>Sprint Review</w:t>
+            </w:r>
+          </w:p>
+        </w:tc>
+      </w:tr>
+      <w:tr>
+        <w:tc>
+          <w:tcPr>
+            <w:tcW w:w="9854" w:type="dxa"/>
+            <w:tcBorders>
+              <w:top w:val="single" w:sz="4" w:space="0" w:color="auto"/>
+              <w:left w:val="single" w:sz="4" w:space="0" w:color="auto"/>
+              <w:bottom w:val="single" w:sz="4" w:space="0" w:color="auto"/>
+              <w:right w:val="single" w:sz="4" w:space="0" w:color="auto"/>
+            </w:tcBorders>
+          </w:tcPr>
+          <w:p>
+            <w:pPr>
+              <w:spacing w:after="200" w:line="276" w:lineRule="auto"/>
+              <w:rPr>
+                <w:rFonts w:ascii="Arial" w:hAnsi="Arial" w:cs="Arial"/>
+              </w:rPr>
+            </w:pPr>
+            <w:r>
+              <w:rPr>
+                <w:rFonts w:ascii="Arial" w:hAnsi="Arial" w:cs="Arial"/>
+              </w:rPr>
+              <w:t>Nel complesso la Review è andata a buon fine, con alcuni appunti sul garage nello specifico per l’ingresso alle statistiche considerato non molto autoesplicativo, e sul fatto che molte delle impostazioni mostrate non siano ancora applicate.</w:t>
+            </w:r>
+          </w:p>
+        </w:tc>
+      </w:tr>
+    </w:tbl>
+    <w:p>
+      <w:pPr>
+        <w:rPr>
+          <w:rFonts w:ascii="Arial" w:hAnsi="Arial" w:cs="Arial"/>
+        </w:rPr>
+      </w:pPr>
+    </w:p>
+    <w:p>
+      <w:pPr>
+        <w:rPr>
+          <w:rFonts w:ascii="Arial" w:hAnsi="Arial" w:cs="Arial"/>
+        </w:rPr>
+      </w:pPr>
+      <w:r>
+        <w:rPr>
+          <w:rFonts w:ascii="Arial" w:hAnsi="Arial" w:cs="Arial"/>
+        </w:rPr>
+        <w:br w:type="page"/>
+      </w:r>
+    </w:p>
+    <w:p>
+      <w:pPr>
+        <w:rPr>
+          <w:rFonts w:ascii="Arial" w:hAnsi="Arial" w:cs="Arial"/>
+        </w:rPr>
+      </w:pPr>
+    </w:p>
+    <w:tbl>
+      <w:tblPr>
+        <w:tblStyle w:val="Grigliatabella"/>
+        <w:tblW w:w="0" w:type="auto"/>
+        <w:tblLook w:val="04A0" w:firstRow="1" w:lastRow="0" w:firstColumn="1" w:lastColumn="0" w:noHBand="0" w:noVBand="1"/>
+      </w:tblPr>
+      <w:tblGrid>
+        <w:gridCol w:w="9628"/>
+      </w:tblGrid>
+      <w:tr>
+        <w:tc>
+          <w:tcPr>
+            <w:tcW w:w="9854" w:type="dxa"/>
+            <w:tcBorders>
+              <w:top w:val="single" w:sz="4" w:space="0" w:color="auto"/>
+              <w:left w:val="single" w:sz="4" w:space="0" w:color="auto"/>
+              <w:bottom w:val="single" w:sz="4" w:space="0" w:color="auto"/>
+              <w:right w:val="single" w:sz="4" w:space="0" w:color="auto"/>
+            </w:tcBorders>
+            <w:shd w:val="clear" w:color="auto" w:fill="D9D9D9" w:themeFill="background1" w:themeFillShade="D9"/>
+            <w:hideMark/>
+          </w:tcPr>
+          <w:p>
+            <w:pPr>
+              <w:spacing w:after="200" w:line="276" w:lineRule="auto"/>
+              <w:rPr>
+                <w:rFonts w:ascii="Arial" w:hAnsi="Arial" w:cs="Arial"/>
+              </w:rPr>
+            </w:pPr>
+            <w:r>
+              <w:rPr>
+                <w:rFonts w:ascii="Arial" w:hAnsi="Arial" w:cs="Arial"/>
+              </w:rPr>
+              <w:t xml:space="preserve">Sprint </w:t>
+            </w:r>
+            <w:proofErr w:type="spellStart"/>
+            <w:r>
+              <w:rPr>
+                <w:rFonts w:ascii="Arial" w:hAnsi="Arial" w:cs="Arial"/>
+              </w:rPr>
+              <w:t>Retrospective</w:t>
+            </w:r>
+            <w:proofErr w:type="spellEnd"/>
+          </w:p>
+        </w:tc>
+      </w:tr>
+      <w:tr>
+        <w:tc>
+          <w:tcPr>
+            <w:tcW w:w="9854" w:type="dxa"/>
+            <w:tcBorders>
+              <w:top w:val="single" w:sz="4" w:space="0" w:color="auto"/>
+              <w:left w:val="single" w:sz="4" w:space="0" w:color="auto"/>
+              <w:bottom w:val="single" w:sz="4" w:space="0" w:color="auto"/>
+              <w:right w:val="single" w:sz="4" w:space="0" w:color="auto"/>
+            </w:tcBorders>
+          </w:tcPr>
+          <w:p>
+            <w:pPr>
+              <w:spacing w:after="200" w:line="276" w:lineRule="auto"/>
+              <w:rPr>
+                <w:rFonts w:ascii="Arial" w:hAnsi="Arial" w:cs="Arial"/>
+              </w:rPr>
+            </w:pPr>
+            <w:r>
+              <w:rPr>
+                <w:rFonts w:ascii="Arial" w:hAnsi="Arial" w:cs="Arial"/>
+              </w:rPr>
+              <w:t>La suddivisione dei compiti e gestita bene e ognuno è in grado di lavorare autonomamente senza creare problemi all’altro. Purtroppo qualche piccolo problema di comunicazione ha creato qualche imprevisto.</w:t>
+            </w:r>
+          </w:p>
+        </w:tc>
+      </w:tr>
+    </w:tbl>
+    <w:p>
+      <w:pPr>
+        <w:rPr>
+          <w:rFonts w:ascii="Arial" w:eastAsiaTheme="majorEastAsia" w:hAnsi="Arial" w:cs="Arial"/>
+          <w:b/>
+          <w:bCs/>
+          <w:sz w:val="26"/>
+          <w:szCs w:val="26"/>
+        </w:rPr>
+      </w:pPr>
+      <w:r>
+        <w:br w:type="page"/>
+      </w:r>
+    </w:p>
+    <w:p>
+      <w:pPr>
+        <w:pStyle w:val="Titolo2"/>
+        <w:pBdr>
+          <w:bottom w:val="single" w:sz="4" w:space="1" w:color="auto"/>
+        </w:pBdr>
+      </w:pPr>
+      <w:r>
+        <w:lastRenderedPageBreak/>
+        <w:t>Utilizzo Intelligenza Artificiale</w:t>
+      </w:r>
+      <w:r>
+        <w:t xml:space="preserve"> nella giornata</w:t>
+      </w:r>
+    </w:p>
+    <w:p>
+      <w:pPr>
+        <w:pStyle w:val="Nessunaspaziatura"/>
+        <w:rPr>
+          <w:rFonts w:ascii="Arial" w:hAnsi="Arial" w:cs="Arial"/>
+          <w:b/>
+          <w:bCs/>
+        </w:rPr>
+      </w:pPr>
+    </w:p>
+    <w:p>
+      <w:pPr>
+        <w:pStyle w:val="Nessunaspaziatura"/>
+        <w:rPr>
+          <w:rFonts w:ascii="Arial" w:hAnsi="Arial" w:cs="Arial"/>
+        </w:rPr>
+      </w:pPr>
+      <w:sdt>
+        <w:sdtPr>
+          <w:rPr>
+            <w:rFonts w:ascii="Segoe UI Symbol" w:hAnsi="Segoe UI Symbol" w:cs="Segoe UI Symbol"/>
+          </w:rPr>
+          <w:id w:val="893315268"/>
+          <w14:checkbox>
+            <w14:checked w14:val="0"/>
+            <w14:checkedState w14:val="2612" w14:font="MS Gothic"/>
+            <w14:uncheckedState w14:val="2610" w14:font="MS Gothic"/>
+          </w14:checkbox>
+        </w:sdtPr>
+        <w:sdtContent>
+          <w:r>
+            <w:rPr>
+              <w:rFonts w:ascii="MS Gothic" w:eastAsia="MS Gothic" w:hAnsi="MS Gothic" w:cs="Segoe UI Symbol" w:hint="eastAsia"/>
+            </w:rPr>
+            <w:t>☐</w:t>
+          </w:r>
+        </w:sdtContent>
+      </w:sdt>
+      <w:r>
+        <w:rPr>
+          <w:rFonts w:ascii="Arial" w:hAnsi="Arial" w:cs="Arial"/>
+        </w:rPr>
+        <w:t xml:space="preserve"> Nessuno</w:t>
+      </w:r>
+      <w:r>
+        <w:br/>
+      </w:r>
+      <w:sdt>
+        <w:sdtPr>
+          <w:rPr>
+            <w:rFonts w:ascii="Segoe UI Symbol" w:hAnsi="Segoe UI Symbol" w:cs="Segoe UI Symbol"/>
+          </w:rPr>
+          <w:id w:val="253941003"/>
+          <w14:checkbox>
+            <w14:checked w14:val="0"/>
+            <w14:checkedState w14:val="2612" w14:font="MS Gothic"/>
+            <w14:uncheckedState w14:val="2610" w14:font="MS Gothic"/>
+          </w14:checkbox>
+        </w:sdtPr>
+        <w:sdtContent>
+          <w:r>
+            <w:rPr>
+              <w:rFonts w:ascii="MS Gothic" w:eastAsia="MS Gothic" w:hAnsi="MS Gothic" w:cs="Segoe UI Symbol" w:hint="eastAsia"/>
+            </w:rPr>
+            <w:t>☐</w:t>
+          </w:r>
+        </w:sdtContent>
+      </w:sdt>
+      <w:r>
+        <w:rPr>
+          <w:rFonts w:ascii="Arial" w:hAnsi="Arial" w:cs="Arial"/>
+        </w:rPr>
+        <w:t xml:space="preserve"> Occasionale</w:t>
+      </w:r>
+      <w:r>
+        <w:br/>
+      </w:r>
+      <w:sdt>
+        <w:sdtPr>
+          <w:rPr>
+            <w:rFonts w:ascii="Segoe UI Symbol" w:hAnsi="Segoe UI Symbol" w:cs="Segoe UI Symbol"/>
+          </w:rPr>
+          <w:id w:val="-2112040350"/>
+          <w14:checkbox>
+            <w14:checked w14:val="0"/>
+            <w14:checkedState w14:val="2612" w14:font="MS Gothic"/>
+            <w14:uncheckedState w14:val="2610" w14:font="MS Gothic"/>
+          </w14:checkbox>
+        </w:sdtPr>
+        <w:sdtContent>
+          <w:r>
+            <w:rPr>
+              <w:rFonts w:ascii="MS Gothic" w:eastAsia="MS Gothic" w:hAnsi="MS Gothic" w:cs="Segoe UI Symbol" w:hint="eastAsia"/>
+            </w:rPr>
+            <w:t>☐</w:t>
+          </w:r>
+        </w:sdtContent>
+      </w:sdt>
+      <w:r>
+        <w:rPr>
+          <w:rFonts w:ascii="Arial" w:hAnsi="Arial" w:cs="Arial"/>
+        </w:rPr>
+        <w:t xml:space="preserve"> Frequente</w:t>
+      </w:r>
+    </w:p>
+    <w:p>
+      <w:pPr>
+        <w:pStyle w:val="Nessunaspaziatura"/>
+        <w:rPr>
+          <w:rFonts w:ascii="Arial" w:hAnsi="Arial" w:cs="Arial"/>
+        </w:rPr>
+      </w:pPr>
+    </w:p>
+    <w:p>
+      <w:pPr>
+        <w:pStyle w:val="Nessunaspaziatura"/>
+        <w:spacing w:line="276" w:lineRule="auto"/>
+        <w:rPr>
+          <w:rFonts w:ascii="Arial" w:hAnsi="Arial" w:cs="Arial"/>
+        </w:rPr>
+      </w:pPr>
+      <w:r>
+        <w:rPr>
+          <w:rFonts w:ascii="Arial" w:hAnsi="Arial" w:cs="Arial"/>
+          <w:b/>
+          <w:bCs/>
+        </w:rPr>
+        <w:t>Strumento/i utilizzato/i</w:t>
+      </w:r>
+      <w:r>
+        <w:rPr>
+          <w:rFonts w:ascii="Arial" w:hAnsi="Arial" w:cs="Arial"/>
+          <w:b/>
+          <w:bCs/>
+        </w:rPr>
+        <w:t xml:space="preserve"> </w:t>
+      </w:r>
+      <w:r>
+        <w:rPr>
+          <w:rFonts w:ascii="Arial" w:hAnsi="Arial" w:cs="Arial"/>
+        </w:rPr>
+        <w:t>(es. ChatGPT)</w:t>
+      </w:r>
+      <w:r>
+        <w:rPr>
+          <w:rFonts w:ascii="Arial" w:hAnsi="Arial" w:cs="Arial"/>
+        </w:rPr>
+        <w:t xml:space="preserve">: </w:t>
+      </w:r>
+      <w:sdt>
+        <w:sdtPr>
+          <w:rPr>
+            <w:rFonts w:ascii="Arial" w:hAnsi="Arial" w:cs="Arial"/>
+          </w:rPr>
+          <w:id w:val="1541701243"/>
+          <w:placeholder>
+            <w:docPart w:val="7D644EFFF4284E2489622850D492EBB1"/>
+          </w:placeholder>
+        </w:sdtPr>
+        <w:sdtContent>
+          <w:r>
+            <w:rPr>
+              <w:rFonts w:ascii="Arial" w:hAnsi="Arial" w:cs="Arial"/>
+            </w:rPr>
+            <w:t>ChatGPT, Gemini</w:t>
+          </w:r>
+        </w:sdtContent>
+      </w:sdt>
+    </w:p>
+    <w:p>
+      <w:pPr>
+        <w:pStyle w:val="Nessunaspaziatura"/>
+        <w:rPr>
+          <w:rFonts w:ascii="Arial" w:hAnsi="Arial" w:cs="Arial"/>
+        </w:rPr>
+      </w:pPr>
+    </w:p>
+    <w:p>
+      <w:pPr>
+        <w:pStyle w:val="Nessunaspaziatura"/>
+        <w:rPr>
+          <w:rFonts w:ascii="Arial" w:hAnsi="Arial" w:cs="Arial"/>
+        </w:rPr>
+      </w:pPr>
+      <w:r>
+        <w:rPr>
+          <w:rFonts w:ascii="Arial" w:hAnsi="Arial" w:cs="Arial"/>
+          <w:b/>
+          <w:bCs/>
+        </w:rPr>
+        <w:t>Per cosa l’ho usata oggi</w:t>
+      </w:r>
+      <w:r>
+        <w:br/>
+      </w:r>
+      <w:sdt>
+        <w:sdtPr>
+          <w:rPr>
+            <w:rFonts w:ascii="Segoe UI Symbol" w:hAnsi="Segoe UI Symbol" w:cs="Segoe UI Symbol"/>
+          </w:rPr>
+          <w:id w:val="-1948684327"/>
+          <w14:checkbox>
+            <w14:checked w14:val="1"/>
+            <w14:checkedState w14:val="2612" w14:font="MS Gothic"/>
+            <w14:uncheckedState w14:val="2610" w14:font="MS Gothic"/>
+          </w14:checkbox>
+        </w:sdtPr>
+        <w:sdtContent>
+          <w:r>
+            <w:rPr>
+              <w:rFonts w:ascii="MS Gothic" w:eastAsia="MS Gothic" w:hAnsi="MS Gothic" w:cs="Segoe UI Symbol" w:hint="eastAsia"/>
+            </w:rPr>
+            <w:t>☒</w:t>
+          </w:r>
+        </w:sdtContent>
+      </w:sdt>
+      <w:r>
+        <w:rPr>
+          <w:rFonts w:ascii="Arial" w:hAnsi="Arial" w:cs="Arial"/>
+        </w:rPr>
+        <w:t xml:space="preserve"> Chiarire concetti</w:t>
+      </w:r>
+      <w:r>
+        <w:br/>
+      </w:r>
+      <w:sdt>
+        <w:sdtPr>
+          <w:rPr>
+            <w:rFonts w:ascii="Segoe UI Symbol" w:hAnsi="Segoe UI Symbol" w:cs="Segoe UI Symbol"/>
+          </w:rPr>
+          <w:id w:val="1022590107"/>
+          <w14:checkbox>
+            <w14:checked w14:val="1"/>
+            <w14:checkedState w14:val="2612" w14:font="MS Gothic"/>
+            <w14:uncheckedState w14:val="2610" w14:font="MS Gothic"/>
+          </w14:checkbox>
+        </w:sdtPr>
+        <w:sdtContent>
+          <w:r>
+            <w:rPr>
+              <w:rFonts w:ascii="MS Gothic" w:eastAsia="MS Gothic" w:hAnsi="MS Gothic" w:cs="Segoe UI Symbol" w:hint="eastAsia"/>
+            </w:rPr>
+            <w:t>☒</w:t>
+          </w:r>
+        </w:sdtContent>
+      </w:sdt>
+      <w:r>
+        <w:rPr>
+          <w:rFonts w:ascii="Arial" w:hAnsi="Arial" w:cs="Arial"/>
+        </w:rPr>
+        <w:t xml:space="preserve"> Supporto al codice</w:t>
+      </w:r>
+      <w:r>
+        <w:br/>
+      </w:r>
+      <w:sdt>
+        <w:sdtPr>
+          <w:rPr>
+            <w:rFonts w:ascii="Segoe UI Symbol" w:hAnsi="Segoe UI Symbol" w:cs="Segoe UI Symbol"/>
+          </w:rPr>
+          <w:id w:val="-1457329596"/>
+          <w14:checkbox>
+            <w14:checked w14:val="1"/>
+            <w14:checkedState w14:val="2612" w14:font="MS Gothic"/>
+            <w14:uncheckedState w14:val="2610" w14:font="MS Gothic"/>
+          </w14:checkbox>
+        </w:sdtPr>
+        <w:sdtContent>
+          <w:r>
+            <w:rPr>
+              <w:rFonts w:ascii="MS Gothic" w:eastAsia="MS Gothic" w:hAnsi="MS Gothic" w:cs="Segoe UI Symbol" w:hint="eastAsia"/>
+            </w:rPr>
+            <w:t>☒</w:t>
+          </w:r>
+        </w:sdtContent>
+      </w:sdt>
+      <w:r>
+        <w:rPr>
+          <w:rFonts w:ascii="Arial" w:hAnsi="Arial" w:cs="Arial"/>
+        </w:rPr>
+        <w:t xml:space="preserve"> Debug</w:t>
+      </w:r>
+      <w:r>
+        <w:br/>
+      </w:r>
+      <w:sdt>
+        <w:sdtPr>
+          <w:rPr>
+            <w:rFonts w:ascii="Segoe UI Symbol" w:hAnsi="Segoe UI Symbol" w:cs="Segoe UI Symbol"/>
+          </w:rPr>
+          <w:id w:val="-1835608919"/>
+          <w14:checkbox>
+            <w14:checked w14:val="0"/>
+            <w14:checkedState w14:val="2612" w14:font="MS Gothic"/>
+            <w14:uncheckedState w14:val="2610" w14:font="MS Gothic"/>
+          </w14:checkbox>
+        </w:sdtPr>
+        <w:sdtContent>
+          <w:r>
+            <w:rPr>
+              <w:rFonts w:ascii="MS Gothic" w:eastAsia="MS Gothic" w:hAnsi="MS Gothic" w:cs="Segoe UI Symbol" w:hint="eastAsia"/>
+            </w:rPr>
+            <w:t>☐</w:t>
+          </w:r>
+        </w:sdtContent>
+      </w:sdt>
+      <w:r>
+        <w:rPr>
+          <w:rFonts w:ascii="Arial" w:hAnsi="Arial" w:cs="Arial"/>
+        </w:rPr>
+        <w:t xml:space="preserve"> Riorganizzare idee / testi</w:t>
+      </w:r>
+      <w:r>
+        <w:br/>
+      </w:r>
+      <w:sdt>
+        <w:sdtPr>
+          <w:rPr>
+            <w:rFonts w:ascii="Segoe UI Symbol" w:hAnsi="Segoe UI Symbol" w:cs="Segoe UI Symbol"/>
+          </w:rPr>
+          <w:id w:val="-919026502"/>
+          <w14:checkbox>
+            <w14:checked w14:val="0"/>
+            <w14:checkedState w14:val="2612" w14:font="MS Gothic"/>
+            <w14:uncheckedState w14:val="2610" w14:font="MS Gothic"/>
+          </w14:checkbox>
+        </w:sdtPr>
+        <w:sdtContent>
+          <w:r>
+            <w:rPr>
+              <w:rFonts w:ascii="MS Gothic" w:eastAsia="MS Gothic" w:hAnsi="MS Gothic" w:cs="Segoe UI Symbol" w:hint="eastAsia"/>
+            </w:rPr>
+            <w:t>☐</w:t>
+          </w:r>
+        </w:sdtContent>
+      </w:sdt>
+      <w:r>
+        <w:rPr>
+          <w:rFonts w:ascii="Arial" w:hAnsi="Arial" w:cs="Arial"/>
+        </w:rPr>
+        <w:t xml:space="preserve"> Altro: …</w:t>
+      </w:r>
+    </w:p>
+    <w:p>
+      <w:pPr>
+        <w:pStyle w:val="Nessunaspaziatura"/>
+        <w:rPr>
+          <w:rFonts w:ascii="Arial" w:hAnsi="Arial" w:cs="Arial"/>
+        </w:rPr>
+      </w:pPr>
+    </w:p>
+    <w:p>
+      <w:pPr>
+        <w:pStyle w:val="Nessunaspaziatura"/>
+        <w:rPr>
+          <w:rFonts w:ascii="Arial" w:hAnsi="Arial" w:cs="Arial"/>
+          <w:b/>
+          <w:bCs/>
+        </w:rPr>
+      </w:pPr>
+      <w:r>
+        <w:rPr>
+          <w:rFonts w:ascii="Arial" w:hAnsi="Arial" w:cs="Arial"/>
+          <w:b/>
+          <w:bCs/>
+        </w:rPr>
+        <w:t>Esempio significativo di utilizzo (UNO SOLO)</w:t>
+      </w:r>
+    </w:p>
+    <w:p>
+      <w:pPr>
+        <w:pStyle w:val="Nessunaspaziatura"/>
+        <w:rPr>
+          <w:rFonts w:ascii="Arial" w:hAnsi="Arial" w:cs="Arial"/>
+        </w:rPr>
+      </w:pPr>
+      <w:r>
+        <w:rPr>
+          <w:rFonts w:ascii="Arial" w:hAnsi="Arial" w:cs="Arial"/>
+        </w:rPr>
+        <w:t xml:space="preserve">Riporta </w:t>
+      </w:r>
+      <w:r>
+        <w:rPr>
+          <w:rFonts w:ascii="Arial" w:hAnsi="Arial" w:cs="Arial"/>
+          <w:i/>
+          <w:iCs/>
+        </w:rPr>
+        <w:t>un</w:t>
+      </w:r>
+      <w:r>
+        <w:rPr>
+          <w:rFonts w:ascii="Arial" w:hAnsi="Arial" w:cs="Arial"/>
+        </w:rPr>
+        <w:t xml:space="preserve"> prompt rilevante oppure descrivilo a parole se ce ne sono stati molti.</w:t>
+      </w:r>
+    </w:p>
+    <w:p>
+      <w:pPr>
+        <w:pStyle w:val="Nessunaspaziatura"/>
+        <w:rPr>
+          <w:rFonts w:ascii="Arial" w:hAnsi="Arial" w:cs="Arial"/>
+        </w:rPr>
+      </w:pPr>
+    </w:p>
+    <w:sdt>
+      <w:sdtPr>
+        <w:rPr>
+          <w:rFonts w:ascii="Arial" w:hAnsi="Arial" w:cs="Arial"/>
+        </w:rPr>
+        <w:alias w:val="Prompt AI"/>
+        <w:tag w:val="Prompt AI"/>
+        <w:id w:val="1915585782"/>
+        <w:placeholder>
+          <w:docPart w:val="15680BF63C5143CCB7DE05BC2C4EB6F6"/>
+        </w:placeholder>
+        <w15:color w:val="C0C0C0"/>
+      </w:sdtPr>
+      <w:sdtContent>
+        <w:p>
+          <w:pPr>
+            <w:pStyle w:val="Nessunaspaziatura"/>
+            <w:rPr>
+              <w:rFonts w:ascii="Arial" w:hAnsi="Arial" w:cs="Arial"/>
+            </w:rPr>
+          </w:pPr>
+          <w:r>
+            <w:rPr>
+              <w:rFonts w:ascii="Arial" w:hAnsi="Arial" w:cs="Arial"/>
+            </w:rPr>
+            <w:t>Riley: Vogliamo integrare una nuova tabella di auto per delle statistiche, puoi mostrarmi come, circa, adattare quest’aggiunta con il codice presente</w:t>
+          </w:r>
+        </w:p>
+        <w:p>
+          <w:pPr>
+            <w:pStyle w:val="Nessunaspaziatura"/>
+            <w:spacing w:line="276" w:lineRule="auto"/>
+            <w:rPr>
+              <w:rFonts w:ascii="Arial" w:hAnsi="Arial" w:cs="Arial"/>
+            </w:rPr>
+          </w:pPr>
+          <w:r>
+            <w:rPr>
+              <w:rFonts w:ascii="Arial" w:hAnsi="Arial" w:cs="Arial"/>
+            </w:rPr>
+            <w:t>Bryan: Come posso risolvere questo errore che mi è uscito nel terminale: &lt;errore&gt;</w:t>
+          </w:r>
+        </w:p>
+      </w:sdtContent>
+    </w:sdt>
+    <w:p>
+      <w:pPr>
+        <w:pStyle w:val="Nessunaspaziatura"/>
+        <w:rPr>
+          <w:rFonts w:ascii="Arial" w:hAnsi="Arial" w:cs="Arial"/>
+        </w:rPr>
+      </w:pPr>
+    </w:p>
+    <w:p>
+      <w:pPr>
+        <w:pStyle w:val="Nessunaspaziatura"/>
+        <w:rPr>
+          <w:rFonts w:ascii="Arial" w:hAnsi="Arial" w:cs="Arial"/>
+        </w:rPr>
+      </w:pPr>
+      <w:r>
+        <w:rPr>
+          <w:rFonts w:ascii="Arial" w:hAnsi="Arial" w:cs="Arial"/>
+          <w:b/>
+          <w:bCs/>
+        </w:rPr>
+        <w:t>Cosa mi ha dato l’AI</w:t>
+      </w:r>
+    </w:p>
+    <w:p>
+      <w:pPr>
+        <w:pStyle w:val="Nessunaspaziatura"/>
+        <w:rPr>
+          <w:rFonts w:ascii="Arial" w:hAnsi="Arial" w:cs="Arial"/>
+        </w:rPr>
+      </w:pPr>
+      <w:r>
+        <w:rPr>
+          <w:rFonts w:ascii="Arial" w:hAnsi="Arial" w:cs="Arial"/>
+        </w:rPr>
+        <w:t>Spiegazione, esempio, soluzione, suggerimento…</w:t>
+      </w:r>
+    </w:p>
+    <w:p>
+      <w:pPr>
+        <w:pStyle w:val="Nessunaspaziatura"/>
+        <w:rPr>
+          <w:rFonts w:ascii="Arial" w:hAnsi="Arial" w:cs="Arial"/>
+        </w:rPr>
+      </w:pPr>
+    </w:p>
+    <w:sdt>
+      <w:sdtPr>
+        <w:rPr>
+          <w:rFonts w:ascii="Arial" w:hAnsi="Arial" w:cs="Arial"/>
+        </w:rPr>
+        <w:alias w:val="Risposta AI"/>
+        <w:tag w:val="Risposta AI"/>
+        <w:id w:val="1024681737"/>
+        <w:placeholder>
+          <w:docPart w:val="7EC9343563FA49C9BEB0ED6725A7F0B1"/>
+        </w:placeholder>
+        <w15:color w:val="C0C0C0"/>
+      </w:sdtPr>
+      <w:sdtContent>
+        <w:p>
+          <w:pPr>
+            <w:pStyle w:val="Nessunaspaziatura"/>
+            <w:spacing w:line="276" w:lineRule="auto"/>
+            <w:rPr>
+              <w:rFonts w:ascii="Arial" w:hAnsi="Arial" w:cs="Arial"/>
+            </w:rPr>
+          </w:pPr>
+          <w:r>
+            <w:rPr>
+              <w:rFonts w:ascii="Arial" w:hAnsi="Arial" w:cs="Arial"/>
+            </w:rPr>
+            <w:t>Riley: Mi ha spiegato il come fare ma purtroppo non è stato molto preciso e non sono riuscito ad usare bene la soluzione proposta</w:t>
+          </w:r>
+        </w:p>
+        <w:p>
+          <w:pPr>
+            <w:pStyle w:val="Nessunaspaziatura"/>
+            <w:spacing w:line="276" w:lineRule="auto"/>
+            <w:rPr>
+              <w:rFonts w:ascii="Arial" w:hAnsi="Arial" w:cs="Arial"/>
+            </w:rPr>
+          </w:pPr>
+          <w:r>
+            <w:rPr>
+              <w:rFonts w:ascii="Arial" w:hAnsi="Arial" w:cs="Arial"/>
+            </w:rPr>
+            <w:t>Bryan: Un tentativo di risoluzione, che si è rilevato inutile nel mio caso</w:t>
+          </w:r>
+        </w:p>
+      </w:sdtContent>
+    </w:sdt>
+    <w:p>
+      <w:pPr>
+        <w:pStyle w:val="Nessunaspaziatura"/>
+        <w:rPr>
+          <w:rFonts w:ascii="Arial" w:hAnsi="Arial" w:cs="Arial"/>
+          <w:b/>
+          <w:bCs/>
+        </w:rPr>
+      </w:pPr>
+    </w:p>
+    <w:p>
+      <w:pPr>
+        <w:pStyle w:val="Nessunaspaziatura"/>
+        <w:rPr>
+          <w:rFonts w:ascii="Arial" w:hAnsi="Arial" w:cs="Arial"/>
+        </w:rPr>
+      </w:pPr>
+      <w:r>
+        <w:rPr>
+          <w:rFonts w:ascii="Arial" w:hAnsi="Arial" w:cs="Arial"/>
+          <w:b/>
+          <w:bCs/>
+        </w:rPr>
+        <w:t>Come l’ho usato io</w:t>
+      </w:r>
+      <w:r>
+        <w:rPr>
+          <w:rFonts w:ascii="Arial" w:hAnsi="Arial" w:cs="Arial"/>
+        </w:rPr>
+        <w:br/>
+      </w:r>
+      <w:sdt>
+        <w:sdtPr>
+          <w:rPr>
+            <w:rFonts w:ascii="Segoe UI Symbol" w:hAnsi="Segoe UI Symbol" w:cs="Segoe UI Symbol"/>
+          </w:rPr>
+          <w:id w:val="244082423"/>
+          <w14:checkbox>
+            <w14:checked w14:val="1"/>
+            <w14:checkedState w14:val="2612" w14:font="MS Gothic"/>
+            <w14:uncheckedState w14:val="2610" w14:font="MS Gothic"/>
+          </w14:checkbox>
+        </w:sdtPr>
+        <w:sdtContent>
+          <w:r>
+            <w:rPr>
+              <w:rFonts w:ascii="MS Gothic" w:eastAsia="MS Gothic" w:hAnsi="MS Gothic" w:cs="Segoe UI Symbol" w:hint="eastAsia"/>
+            </w:rPr>
+            <w:t>☒</w:t>
+          </w:r>
+        </w:sdtContent>
+      </w:sdt>
+      <w:r>
+        <w:rPr>
+          <w:rFonts w:ascii="Arial" w:hAnsi="Arial" w:cs="Arial"/>
+        </w:rPr>
+        <w:t xml:space="preserve"> Copiato</w:t>
+      </w:r>
+      <w:r>
+        <w:rPr>
+          <w:rFonts w:ascii="Arial" w:hAnsi="Arial" w:cs="Arial"/>
+        </w:rPr>
+        <w:br/>
+      </w:r>
+      <w:sdt>
+        <w:sdtPr>
+          <w:rPr>
+            <w:rFonts w:ascii="Segoe UI Symbol" w:hAnsi="Segoe UI Symbol" w:cs="Segoe UI Symbol"/>
+          </w:rPr>
+          <w:id w:val="1700666521"/>
+          <w14:checkbox>
+            <w14:checked w14:val="1"/>
+            <w14:checkedState w14:val="2612" w14:font="MS Gothic"/>
+            <w14:uncheckedState w14:val="2610" w14:font="MS Gothic"/>
+          </w14:checkbox>
+        </w:sdtPr>
+        <w:sdtContent>
+          <w:r>
+            <w:rPr>
+              <w:rFonts w:ascii="MS Gothic" w:eastAsia="MS Gothic" w:hAnsi="MS Gothic" w:cs="Segoe UI Symbol" w:hint="eastAsia"/>
+            </w:rPr>
+            <w:t>☒</w:t>
+          </w:r>
+        </w:sdtContent>
+      </w:sdt>
+      <w:r>
+        <w:rPr>
+          <w:rFonts w:ascii="Arial" w:hAnsi="Arial" w:cs="Arial"/>
+        </w:rPr>
+        <w:t xml:space="preserve"> Adattato</w:t>
+      </w:r>
+      <w:r>
+        <w:rPr>
+          <w:rFonts w:ascii="Arial" w:hAnsi="Arial" w:cs="Arial"/>
+        </w:rPr>
+        <w:br/>
+      </w:r>
+      <w:sdt>
+        <w:sdtPr>
+          <w:rPr>
+            <w:rFonts w:ascii="Segoe UI Symbol" w:hAnsi="Segoe UI Symbol" w:cs="Segoe UI Symbol"/>
+          </w:rPr>
+          <w:id w:val="1861167932"/>
+          <w14:checkbox>
+            <w14:checked w14:val="1"/>
+            <w14:checkedState w14:val="2612" w14:font="MS Gothic"/>
+            <w14:uncheckedState w14:val="2610" w14:font="MS Gothic"/>
+          </w14:checkbox>
+        </w:sdtPr>
+        <w:sdtContent>
+          <w:r>
+            <w:rPr>
+              <w:rFonts w:ascii="MS Gothic" w:eastAsia="MS Gothic" w:hAnsi="MS Gothic" w:cs="Segoe UI Symbol" w:hint="eastAsia"/>
+            </w:rPr>
+            <w:t>☒</w:t>
+          </w:r>
+        </w:sdtContent>
+      </w:sdt>
+      <w:r>
+        <w:rPr>
+          <w:rFonts w:ascii="Arial" w:hAnsi="Arial" w:cs="Arial"/>
+        </w:rPr>
+        <w:t xml:space="preserve"> Usato solo per capire</w:t>
+      </w:r>
+      <w:r>
+        <w:rPr>
+          <w:rFonts w:ascii="Arial" w:hAnsi="Arial" w:cs="Arial"/>
+        </w:rPr>
+        <w:br/>
+      </w:r>
+      <w:sdt>
+        <w:sdtPr>
+          <w:rPr>
+            <w:rFonts w:ascii="Segoe UI Symbol" w:hAnsi="Segoe UI Symbol" w:cs="Segoe UI Symbol"/>
+          </w:rPr>
+          <w:id w:val="-158456225"/>
+          <w14:checkbox>
+            <w14:checked w14:val="0"/>
+            <w14:checkedState w14:val="2612" w14:font="MS Gothic"/>
+            <w14:uncheckedState w14:val="2610" w14:font="MS Gothic"/>
+          </w14:checkbox>
+        </w:sdtPr>
+        <w:sdtContent>
+          <w:r>
+            <w:rPr>
+              <w:rFonts w:ascii="MS Gothic" w:eastAsia="MS Gothic" w:hAnsi="MS Gothic" w:cs="Segoe UI Symbol" w:hint="eastAsia"/>
+            </w:rPr>
+            <w:t>☐</w:t>
+          </w:r>
+        </w:sdtContent>
+      </w:sdt>
+      <w:r>
+        <w:rPr>
+          <w:rFonts w:ascii="Arial" w:hAnsi="Arial" w:cs="Arial"/>
+        </w:rPr>
+        <w:t xml:space="preserve"> Scartato</w:t>
+      </w:r>
+    </w:p>
+    <w:p>
+      <w:pPr>
+        <w:pStyle w:val="Nessunaspaziatura"/>
+        <w:rPr>
+          <w:rFonts w:ascii="Arial" w:hAnsi="Arial" w:cs="Arial"/>
+        </w:rPr>
+      </w:pPr>
+    </w:p>
+    <w:p>
+      <w:pPr>
+        <w:pStyle w:val="Nessunaspaziatura"/>
+        <w:rPr>
+          <w:rFonts w:ascii="Arial" w:hAnsi="Arial" w:cs="Arial"/>
+        </w:rPr>
+      </w:pPr>
+    </w:p>
+    <w:p>
+      <w:pPr>
+        <w:pStyle w:val="Nessunaspaziatura"/>
+        <w:rPr>
+          <w:rFonts w:ascii="Arial" w:hAnsi="Arial" w:cs="Arial"/>
+        </w:rPr>
+      </w:pPr>
+      <w:r>
+        <w:rPr>
+          <w:rFonts w:ascii="Arial" w:hAnsi="Arial" w:cs="Arial"/>
+          <w:b/>
+          <w:bCs/>
+        </w:rPr>
+        <w:t>Cosa avrei fatto senza AI?</w:t>
+      </w:r>
+    </w:p>
+    <w:p>
+      <w:pPr>
+        <w:pStyle w:val="Nessunaspaziatura"/>
+        <w:rPr>
+          <w:rFonts w:ascii="Arial" w:hAnsi="Arial" w:cs="Arial"/>
+        </w:rPr>
+      </w:pPr>
+      <w:r>
+        <w:rPr>
+          <w:rFonts w:ascii="Arial" w:hAnsi="Arial" w:cs="Arial"/>
+        </w:rPr>
+        <w:t xml:space="preserve">Riley: Avrei cercato di adattare basandomi </w:t>
+      </w:r>
+      <w:proofErr w:type="spellStart"/>
+      <w:r>
+        <w:rPr>
+          <w:rFonts w:ascii="Arial" w:hAnsi="Arial" w:cs="Arial"/>
+        </w:rPr>
+        <w:t>su i</w:t>
+      </w:r>
+      <w:proofErr w:type="spellEnd"/>
+      <w:r>
+        <w:rPr>
+          <w:rFonts w:ascii="Arial" w:hAnsi="Arial" w:cs="Arial"/>
+        </w:rPr>
+        <w:t xml:space="preserve"> file presenti.</w:t>
+      </w:r>
+    </w:p>
+    <w:p>
+      <w:pPr>
+        <w:pStyle w:val="Nessunaspaziatura"/>
+        <w:rPr>
+          <w:rFonts w:ascii="Arial" w:hAnsi="Arial" w:cs="Arial"/>
+        </w:rPr>
+      </w:pPr>
+      <w:r>
+        <w:rPr>
+          <w:rFonts w:ascii="Arial" w:hAnsi="Arial" w:cs="Arial"/>
+        </w:rPr>
+        <w:t>Bryan: Debugging.</w:t>
       </w:r>
     </w:p>
     <w:p>
@@ -26770,8 +29845,17 @@
         <w:rFonts w:ascii="Arial" w:hAnsi="Arial" w:cs="Arial"/>
         <w:lang w:val="fr-CH"/>
       </w:rPr>
-      <w:t>Riley Bianchi &amp; Bryan Ciaponi</w:t>
+      <w:t xml:space="preserve">Riley Bianchi &amp; Bryan </w:t>
     </w:r>
+    <w:proofErr w:type="spellStart"/>
+    <w:r>
+      <w:rPr>
+        <w:rFonts w:ascii="Arial" w:hAnsi="Arial" w:cs="Arial"/>
+        <w:lang w:val="fr-CH"/>
+      </w:rPr>
+      <w:t>Ciaponi</w:t>
+    </w:r>
+    <w:proofErr w:type="spellEnd"/>
   </w:p>
 </w:hdr>
 </file>
@@ -32005,6 +35089,107 @@
         </w:p>
       </w:docPartBody>
     </w:docPart>
+    <w:docPart>
+      <w:docPartPr>
+        <w:name w:val="7D644EFFF4284E2489622850D492EBB1"/>
+        <w:category>
+          <w:name w:val="Generale"/>
+          <w:gallery w:val="placeholder"/>
+        </w:category>
+        <w:types>
+          <w:type w:val="bbPlcHdr"/>
+        </w:types>
+        <w:behaviors>
+          <w:behavior w:val="content"/>
+        </w:behaviors>
+        <w:guid w:val="{3D19DC39-9E89-4B14-BE57-51314B952C84}"/>
+      </w:docPartPr>
+      <w:docPartBody>
+        <w:p>
+          <w:pPr>
+            <w:pStyle w:val="7D644EFFF4284E2489622850D492EBB1"/>
+          </w:pPr>
+          <w:r>
+            <w:rPr>
+              <w:rStyle w:val="Testosegnaposto"/>
+              <w:b/>
+              <w:bCs/>
+            </w:rPr>
+            <w:t>Nomi AI utilizzati</w:t>
+          </w:r>
+        </w:p>
+      </w:docPartBody>
+    </w:docPart>
+    <w:docPart>
+      <w:docPartPr>
+        <w:name w:val="15680BF63C5143CCB7DE05BC2C4EB6F6"/>
+        <w:category>
+          <w:name w:val="Generale"/>
+          <w:gallery w:val="placeholder"/>
+        </w:category>
+        <w:types>
+          <w:type w:val="bbPlcHdr"/>
+        </w:types>
+        <w:behaviors>
+          <w:behavior w:val="content"/>
+        </w:behaviors>
+        <w:guid w:val="{203213B2-A0C0-47D5-9A11-0E88FD3F05C6}"/>
+      </w:docPartPr>
+      <w:docPartBody>
+        <w:p>
+          <w:pPr>
+            <w:pStyle w:val="15680BF63C5143CCB7DE05BC2C4EB6F6"/>
+          </w:pPr>
+          <w:r>
+            <w:rPr>
+              <w:rStyle w:val="Testosegnaposto"/>
+            </w:rPr>
+            <w:t>Fare clic o toccare qui per immettere il testo.</w:t>
+          </w:r>
+        </w:p>
+      </w:docPartBody>
+    </w:docPart>
+    <w:docPart>
+      <w:docPartPr>
+        <w:name w:val="7EC9343563FA49C9BEB0ED6725A7F0B1"/>
+        <w:category>
+          <w:name w:val="Generale"/>
+          <w:gallery w:val="placeholder"/>
+        </w:category>
+        <w:types>
+          <w:type w:val="bbPlcHdr"/>
+        </w:types>
+        <w:behaviors>
+          <w:behavior w:val="content"/>
+        </w:behaviors>
+        <w:guid w:val="{255CDAEC-0C75-412C-AC93-4325650D13C8}"/>
+      </w:docPartPr>
+      <w:docPartBody>
+        <w:p>
+          <w:pPr>
+            <w:pStyle w:val="7EC9343563FA49C9BEB0ED6725A7F0B1"/>
+          </w:pPr>
+          <w:r>
+            <w:rPr>
+              <w:rStyle w:val="Testosegnaposto"/>
+            </w:rPr>
+            <w:t xml:space="preserve">Fare clic o toccare qui per </w:t>
+          </w:r>
+          <w:r>
+            <w:rPr>
+              <w:rStyle w:val="Testosegnaposto"/>
+            </w:rPr>
+            <w:t>immettere</w:t>
+          </w:r>
+          <w:r>
+            <w:rPr>
+              <w:rStyle w:val="Testosegnaposto"/>
+            </w:rPr>
+            <w:t xml:space="preserve"> il testo.</w:t>
+          </w:r>
+        </w:p>
+      </w:docPartBody>
+    </w:docPart>
   </w:docParts>
 </w:glossaryDocument>
 </file>
@@ -32150,6 +35335,7 @@
     <w:rsid w:val="002B6D86"/>
     <w:rsid w:val="00352469"/>
     <w:rsid w:val="00356BEF"/>
+    <w:rsid w:val="003628E9"/>
     <w:rsid w:val="003648DA"/>
     <w:rsid w:val="00396FDF"/>
     <w:rsid w:val="003B3A61"/>
@@ -32162,6 +35348,7 @@
     <w:rsid w:val="00530FEF"/>
     <w:rsid w:val="00534571"/>
     <w:rsid w:val="00565B11"/>
+    <w:rsid w:val="00633F3C"/>
     <w:rsid w:val="0063588A"/>
     <w:rsid w:val="0066686E"/>
     <w:rsid w:val="00715227"/>
@@ -32223,6 +35410,7 @@
     <w:rsid w:val="00F50717"/>
     <w:rsid w:val="00F726EC"/>
     <w:rsid w:val="00F8713D"/>
+    <w:rsid w:val="00FC7DDF"/>
   </w:rsids>
   <m:mathPr>
     <m:mathFont m:val="Cambria Math"/>
@@ -32678,7 +35866,7 @@
     <w:basedOn w:val="Carpredefinitoparagrafo"/>
     <w:uiPriority w:val="99"/>
     <w:semiHidden/>
-    <w:rsid w:val="00080FDE"/>
+    <w:rsid w:val="003628E9"/>
     <w:rPr>
       <w:color w:val="666666"/>
     </w:rPr>
@@ -32943,6 +36131,18 @@
   <w:style w:type="paragraph" w:customStyle="1" w:styleId="3904DA71E4554269B7BAF466427E6984">
     <w:name w:val="3904DA71E4554269B7BAF466427E6984"/>
     <w:rsid w:val="00080FDE"/>
+  </w:style>
+  <w:style w:type="paragraph" w:customStyle="1" w:styleId="7D644EFFF4284E2489622850D492EBB1">
+    <w:name w:val="7D644EFFF4284E2489622850D492EBB1"/>
+    <w:rsid w:val="003628E9"/>
+  </w:style>
+  <w:style w:type="paragraph" w:customStyle="1" w:styleId="15680BF63C5143CCB7DE05BC2C4EB6F6">
+    <w:name w:val="15680BF63C5143CCB7DE05BC2C4EB6F6"/>
+    <w:rsid w:val="003628E9"/>
+  </w:style>
+  <w:style w:type="paragraph" w:customStyle="1" w:styleId="7EC9343563FA49C9BEB0ED6725A7F0B1">
+    <w:name w:val="7EC9343563FA49C9BEB0ED6725A7F0B1"/>
+    <w:rsid w:val="003628E9"/>
   </w:style>
 </w:styles>
 </file>

</xml_diff>

<commit_message>
aggiunto script per controllo visuale e sezione diario
</commit_message>
<xml_diff>
--- a/4_Diari/Diario.docx
+++ b/4_Diari/Diario.docx
@@ -193,21 +193,7 @@
               <w:rPr>
                 <w:rFonts w:ascii="Arial" w:hAnsi="Arial" w:cs="Arial"/>
               </w:rPr>
-              <w:t xml:space="preserve">Riflettuto sui requisiti e user story del gioco, creato i primi template per </w:t>
-            </w:r>
-            <w:proofErr w:type="spellStart"/>
-            <w:r>
-              <w:rPr>
-                <w:rFonts w:ascii="Arial" w:hAnsi="Arial" w:cs="Arial"/>
-              </w:rPr>
-              <w:t>gantt</w:t>
-            </w:r>
-            <w:proofErr w:type="spellEnd"/>
-            <w:r>
-              <w:rPr>
-                <w:rFonts w:ascii="Arial" w:hAnsi="Arial" w:cs="Arial"/>
-              </w:rPr>
-              <w:t xml:space="preserve"> e diario</w:t>
+              <w:t>Riflettuto sui requisiti e user story del gioco, creato i primi template per gantt e diario</w:t>
             </w:r>
           </w:p>
         </w:tc>
@@ -248,21 +234,7 @@
               <w:rPr>
                 <w:rFonts w:ascii="Arial" w:hAnsi="Arial" w:cs="Arial"/>
               </w:rPr>
-              <w:t xml:space="preserve">Riflettuto sui requisiti e user story del gioco, iniziato scrittura documentazione e sincronizzazione progetto a </w:t>
-            </w:r>
-            <w:proofErr w:type="spellStart"/>
-            <w:r>
-              <w:rPr>
-                <w:rFonts w:ascii="Arial" w:hAnsi="Arial" w:cs="Arial"/>
-              </w:rPr>
-              <w:t>GitLab</w:t>
-            </w:r>
-            <w:proofErr w:type="spellEnd"/>
-            <w:r>
-              <w:rPr>
-                <w:rFonts w:ascii="Arial" w:hAnsi="Arial" w:cs="Arial"/>
-              </w:rPr>
-              <w:t>.</w:t>
+              <w:t>Riflettuto sui requisiti e user story del gioco, iniziato scrittura documentazione e sincronizzazione progetto a GitLab.</w:t>
             </w:r>
           </w:p>
         </w:tc>
@@ -703,25 +675,7 @@
               <w:b/>
               <w:bCs/>
             </w:rPr>
-            <w:t xml:space="preserve">Nomi </w:t>
-          </w:r>
-          <w:proofErr w:type="gramStart"/>
-          <w:r>
-            <w:rPr>
-              <w:rStyle w:val="Testosegnaposto"/>
-              <w:b/>
-              <w:bCs/>
-            </w:rPr>
-            <w:t>AI</w:t>
-          </w:r>
-          <w:proofErr w:type="gramEnd"/>
-          <w:r>
-            <w:rPr>
-              <w:rStyle w:val="Testosegnaposto"/>
-              <w:b/>
-              <w:bCs/>
-            </w:rPr>
-            <w:t xml:space="preserve"> utilizzati</w:t>
+            <w:t>Nomi AI utilizzati</w:t>
           </w:r>
         </w:sdtContent>
       </w:sdt>
@@ -1802,21 +1756,7 @@
               <w:rPr>
                 <w:rFonts w:ascii="Arial" w:hAnsi="Arial" w:cs="Arial"/>
               </w:rPr>
-              <w:t xml:space="preserve">Iniziare e completare analisi dei mezzi, creare </w:t>
-            </w:r>
-            <w:proofErr w:type="gramStart"/>
-            <w:r>
-              <w:rPr>
-                <w:rFonts w:ascii="Arial" w:hAnsi="Arial" w:cs="Arial"/>
-              </w:rPr>
-              <w:t>lo use</w:t>
-            </w:r>
-            <w:proofErr w:type="gramEnd"/>
-            <w:r>
-              <w:rPr>
-                <w:rFonts w:ascii="Arial" w:hAnsi="Arial" w:cs="Arial"/>
-              </w:rPr>
-              <w:t xml:space="preserve"> case</w:t>
+              <w:t>Iniziare e completare analisi dei mezzi, creare lo use case</w:t>
             </w:r>
             <w:r>
               <w:rPr>
@@ -2294,21 +2234,7 @@
             <w:rPr>
               <w:rFonts w:ascii="Arial" w:hAnsi="Arial" w:cs="Arial"/>
             </w:rPr>
-            <w:t xml:space="preserve">Aitami a generare dei </w:t>
-          </w:r>
-          <w:proofErr w:type="spellStart"/>
-          <w:r>
-            <w:rPr>
-              <w:rFonts w:ascii="Arial" w:hAnsi="Arial" w:cs="Arial"/>
-            </w:rPr>
-            <w:t>requesiti</w:t>
-          </w:r>
-          <w:proofErr w:type="spellEnd"/>
-          <w:r>
-            <w:rPr>
-              <w:rFonts w:ascii="Arial" w:hAnsi="Arial" w:cs="Arial"/>
-            </w:rPr>
-            <w:t xml:space="preserve"> in base ai seguenti dati</w:t>
+            <w:t>Aitami a generare dei requesiti in base ai seguenti dati</w:t>
           </w:r>
         </w:p>
       </w:sdtContent>
@@ -2848,21 +2774,7 @@
               <w:rPr>
                 <w:rFonts w:ascii="Arial" w:hAnsi="Arial" w:cs="Arial"/>
               </w:rPr>
-              <w:t xml:space="preserve">Completata la analisi del dominio nella documentazione, inizio ricerche riguardo </w:t>
-            </w:r>
-            <w:proofErr w:type="spellStart"/>
-            <w:r>
-              <w:rPr>
-                <w:rFonts w:ascii="Arial" w:hAnsi="Arial" w:cs="Arial"/>
-              </w:rPr>
-              <w:t>Unity</w:t>
-            </w:r>
-            <w:proofErr w:type="spellEnd"/>
-            <w:r>
-              <w:rPr>
-                <w:rFonts w:ascii="Arial" w:hAnsi="Arial" w:cs="Arial"/>
-              </w:rPr>
-              <w:t>.</w:t>
+              <w:t>Completata la analisi del dominio nella documentazione, inizio ricerche riguardo Unity.</w:t>
             </w:r>
           </w:p>
         </w:tc>
@@ -3037,21 +2949,7 @@
               <w:rPr>
                 <w:rFonts w:ascii="Arial" w:hAnsi="Arial" w:cs="Arial"/>
               </w:rPr>
-              <w:t xml:space="preserve">Il diagramma ER non è completo e </w:t>
-            </w:r>
-            <w:proofErr w:type="gramStart"/>
-            <w:r>
-              <w:rPr>
-                <w:rFonts w:ascii="Arial" w:hAnsi="Arial" w:cs="Arial"/>
-              </w:rPr>
-              <w:t>lo use</w:t>
-            </w:r>
-            <w:proofErr w:type="gramEnd"/>
-            <w:r>
-              <w:rPr>
-                <w:rFonts w:ascii="Arial" w:hAnsi="Arial" w:cs="Arial"/>
-              </w:rPr>
-              <w:t xml:space="preserve"> case non è stato iniziato, analisi dei mezzi non ancora completata.</w:t>
+              <w:t>Il diagramma ER non è completo e lo use case non è stato iniziato, analisi dei mezzi non ancora completata.</w:t>
             </w:r>
           </w:p>
         </w:tc>
@@ -4083,16 +3981,8 @@
               <w:rPr>
                 <w:rFonts w:ascii="Arial" w:hAnsi="Arial" w:cs="Arial"/>
               </w:rPr>
-              <w:t xml:space="preserve">Creato diagramma ER e modifiche strutturali </w:t>
-            </w:r>
-            <w:proofErr w:type="spellStart"/>
-            <w:r>
-              <w:rPr>
-                <w:rFonts w:ascii="Arial" w:hAnsi="Arial" w:cs="Arial"/>
-              </w:rPr>
-              <w:t>gantt</w:t>
-            </w:r>
-            <w:proofErr w:type="spellEnd"/>
+              <w:t>Creato diagramma ER e modifiche strutturali gantt</w:t>
+            </w:r>
           </w:p>
         </w:tc>
       </w:tr>
@@ -4840,42 +4730,20 @@
             <w:rPr>
               <w:rFonts w:ascii="Arial" w:hAnsi="Arial" w:cs="Arial"/>
             </w:rPr>
-            <w:t xml:space="preserve">uoi dirmi delle classiche impostazioni per un gioco di guida in stile </w:t>
-          </w:r>
-          <w:proofErr w:type="spellStart"/>
+            <w:t>uoi dirmi delle classiche impostazioni per un gioco di guida in stile br</w:t>
+          </w:r>
           <w:r>
             <w:rPr>
               <w:rFonts w:ascii="Arial" w:hAnsi="Arial" w:cs="Arial"/>
             </w:rPr>
-            <w:t>br</w:t>
-          </w:r>
-          <w:proofErr w:type="spellEnd"/>
+            <w:t xml:space="preserve">. </w:t>
+          </w:r>
           <w:r>
             <w:rPr>
               <w:rFonts w:ascii="Arial" w:hAnsi="Arial" w:cs="Arial"/>
             </w:rPr>
-            <w:t xml:space="preserve">. </w:t>
-          </w:r>
-          <w:r>
-            <w:rPr>
-              <w:rFonts w:ascii="Arial" w:hAnsi="Arial" w:cs="Arial"/>
-            </w:rPr>
             <w:br/>
-            <w:t xml:space="preserve">Bryan: Spiegami </w:t>
-          </w:r>
-          <w:proofErr w:type="spellStart"/>
-          <w:r>
-            <w:rPr>
-              <w:rFonts w:ascii="Arial" w:hAnsi="Arial" w:cs="Arial"/>
-            </w:rPr>
-            <w:t>Unity</w:t>
-          </w:r>
-          <w:proofErr w:type="spellEnd"/>
-          <w:r>
-            <w:rPr>
-              <w:rFonts w:ascii="Arial" w:hAnsi="Arial" w:cs="Arial"/>
-            </w:rPr>
-            <w:t xml:space="preserve"> ed i suoi vantaggi.</w:t>
+            <w:t>Bryan: Spiegami Unity ed i suoi vantaggi.</w:t>
           </w:r>
         </w:p>
       </w:sdtContent>
@@ -5353,16 +5221,8 @@
               <w:rPr>
                 <w:rFonts w:ascii="Arial" w:hAnsi="Arial" w:cs="Arial"/>
               </w:rPr>
-              <w:t xml:space="preserve">Creato Diagramma ER e aggiornato </w:t>
-            </w:r>
-            <w:proofErr w:type="spellStart"/>
-            <w:r>
-              <w:rPr>
-                <w:rFonts w:ascii="Arial" w:hAnsi="Arial" w:cs="Arial"/>
-              </w:rPr>
-              <w:t>gannt</w:t>
-            </w:r>
-            <w:proofErr w:type="spellEnd"/>
+              <w:t>Creato Diagramma ER e aggiornato gannt</w:t>
+            </w:r>
           </w:p>
         </w:tc>
       </w:tr>
@@ -5399,21 +5259,7 @@
               <w:rPr>
                 <w:rFonts w:ascii="Arial" w:hAnsi="Arial" w:cs="Arial"/>
               </w:rPr>
-              <w:t xml:space="preserve">Use Case finito, Inizio creazione e documentazione </w:t>
-            </w:r>
-            <w:proofErr w:type="spellStart"/>
-            <w:r>
-              <w:rPr>
-                <w:rFonts w:ascii="Arial" w:hAnsi="Arial" w:cs="Arial"/>
-              </w:rPr>
-              <w:t>mockup</w:t>
-            </w:r>
-            <w:proofErr w:type="spellEnd"/>
-            <w:r>
-              <w:rPr>
-                <w:rFonts w:ascii="Arial" w:hAnsi="Arial" w:cs="Arial"/>
-              </w:rPr>
-              <w:t xml:space="preserve"> UI.</w:t>
+              <w:t>Use Case finito, Inizio creazione e documentazione mockup UI.</w:t>
             </w:r>
           </w:p>
         </w:tc>
@@ -5530,21 +5376,7 @@
               <w:rPr>
                 <w:rFonts w:ascii="Arial" w:hAnsi="Arial" w:cs="Arial"/>
               </w:rPr>
-              <w:t xml:space="preserve">Riuscire a definire le azioni degli attori </w:t>
-            </w:r>
-            <w:proofErr w:type="gramStart"/>
-            <w:r>
-              <w:rPr>
-                <w:rFonts w:ascii="Arial" w:hAnsi="Arial" w:cs="Arial"/>
-              </w:rPr>
-              <w:t>nel Use</w:t>
-            </w:r>
-            <w:proofErr w:type="gramEnd"/>
-            <w:r>
-              <w:rPr>
-                <w:rFonts w:ascii="Arial" w:hAnsi="Arial" w:cs="Arial"/>
-              </w:rPr>
-              <w:t xml:space="preserve"> Case, risolto approfondendo meglio.</w:t>
+              <w:t>Riuscire a definire le azioni degli attori nel Use Case, risolto approfondendo meglio.</w:t>
             </w:r>
           </w:p>
         </w:tc>
@@ -5673,21 +5505,7 @@
               <w:rPr>
                 <w:rFonts w:ascii="Arial" w:hAnsi="Arial" w:cs="Arial"/>
               </w:rPr>
-              <w:t xml:space="preserve">Continuo creazione </w:t>
-            </w:r>
-            <w:proofErr w:type="spellStart"/>
-            <w:r>
-              <w:rPr>
-                <w:rFonts w:ascii="Arial" w:hAnsi="Arial" w:cs="Arial"/>
-              </w:rPr>
-              <w:t>Mockup</w:t>
-            </w:r>
-            <w:proofErr w:type="spellEnd"/>
-            <w:r>
-              <w:rPr>
-                <w:rFonts w:ascii="Arial" w:hAnsi="Arial" w:cs="Arial"/>
-              </w:rPr>
-              <w:t xml:space="preserve"> UI.</w:t>
+              <w:t>Continuo creazione Mockup UI.</w:t>
             </w:r>
           </w:p>
         </w:tc>
@@ -6258,30 +6076,8 @@
               <w:rFonts w:ascii="Arial" w:hAnsi="Arial" w:cs="Arial"/>
             </w:rPr>
             <w:br/>
-            <w:t xml:space="preserve">Bryan: Correzioni </w:t>
-          </w:r>
-          <w:proofErr w:type="gramStart"/>
-          <w:r>
-            <w:rPr>
-              <w:rFonts w:ascii="Arial" w:hAnsi="Arial" w:cs="Arial"/>
-            </w:rPr>
-            <w:t>dello use</w:t>
-          </w:r>
-          <w:proofErr w:type="gramEnd"/>
-          <w:r>
-            <w:rPr>
-              <w:rFonts w:ascii="Arial" w:hAnsi="Arial" w:cs="Arial"/>
-            </w:rPr>
-            <w:t xml:space="preserve"> case generato dal </w:t>
-          </w:r>
-          <w:proofErr w:type="spellStart"/>
-          <w:r>
-            <w:rPr>
-              <w:rFonts w:ascii="Arial" w:hAnsi="Arial" w:cs="Arial"/>
-            </w:rPr>
-            <w:t>colega</w:t>
-          </w:r>
-          <w:proofErr w:type="spellEnd"/>
+            <w:t>Bryan: Correzioni dello use case generato dal colega</w:t>
+          </w:r>
         </w:p>
       </w:sdtContent>
     </w:sdt>
@@ -6681,16 +6477,8 @@
               <w:rPr>
                 <w:rFonts w:ascii="Arial" w:hAnsi="Arial" w:cs="Arial"/>
               </w:rPr>
-              <w:t xml:space="preserve">Completata progettazione e creazione progetto </w:t>
-            </w:r>
-            <w:proofErr w:type="spellStart"/>
-            <w:r>
-              <w:rPr>
-                <w:rFonts w:ascii="Arial" w:hAnsi="Arial" w:cs="Arial"/>
-              </w:rPr>
-              <w:t>unity</w:t>
-            </w:r>
-            <w:proofErr w:type="spellEnd"/>
+              <w:t>Completata progettazione e creazione progetto unity</w:t>
+            </w:r>
           </w:p>
         </w:tc>
       </w:tr>
@@ -6727,16 +6515,8 @@
               <w:rPr>
                 <w:rFonts w:ascii="Arial" w:hAnsi="Arial" w:cs="Arial"/>
               </w:rPr>
-              <w:t xml:space="preserve">Fine </w:t>
-            </w:r>
-            <w:proofErr w:type="spellStart"/>
-            <w:r>
-              <w:rPr>
-                <w:rFonts w:ascii="Arial" w:hAnsi="Arial" w:cs="Arial"/>
-              </w:rPr>
-              <w:t>Mockup</w:t>
-            </w:r>
-            <w:proofErr w:type="spellEnd"/>
+              <w:t>Fine Mockup</w:t>
+            </w:r>
           </w:p>
         </w:tc>
       </w:tr>
@@ -6814,52 +6594,8 @@
               <w:rPr>
                 <w:rFonts w:ascii="Arial" w:hAnsi="Arial" w:cs="Arial"/>
               </w:rPr>
-              <w:t xml:space="preserve">Problemi nel </w:t>
-            </w:r>
-            <w:proofErr w:type="spellStart"/>
-            <w:r>
-              <w:rPr>
-                <w:rFonts w:ascii="Arial" w:hAnsi="Arial" w:cs="Arial"/>
-              </w:rPr>
-              <w:t>pushare</w:t>
-            </w:r>
-            <w:proofErr w:type="spellEnd"/>
-            <w:r>
-              <w:rPr>
-                <w:rFonts w:ascii="Arial" w:hAnsi="Arial" w:cs="Arial"/>
-              </w:rPr>
-              <w:t xml:space="preserve"> il progetto </w:t>
-            </w:r>
-            <w:proofErr w:type="spellStart"/>
-            <w:r>
-              <w:rPr>
-                <w:rFonts w:ascii="Arial" w:hAnsi="Arial" w:cs="Arial"/>
-              </w:rPr>
-              <w:t>uinity</w:t>
-            </w:r>
-            <w:proofErr w:type="spellEnd"/>
-            <w:r>
-              <w:rPr>
-                <w:rFonts w:ascii="Arial" w:hAnsi="Arial" w:cs="Arial"/>
-              </w:rPr>
-              <w:t xml:space="preserve">, risolto grazie alla creazione di un </w:t>
-            </w:r>
-            <w:proofErr w:type="gramStart"/>
-            <w:r>
-              <w:rPr>
-                <w:rFonts w:ascii="Arial" w:hAnsi="Arial" w:cs="Arial"/>
-              </w:rPr>
-              <w:t>file .</w:t>
-            </w:r>
-            <w:proofErr w:type="spellStart"/>
-            <w:r>
-              <w:rPr>
-                <w:rFonts w:ascii="Arial" w:hAnsi="Arial" w:cs="Arial"/>
-              </w:rPr>
-              <w:t>gitignore</w:t>
-            </w:r>
-            <w:proofErr w:type="spellEnd"/>
-            <w:proofErr w:type="gramEnd"/>
+              <w:t>Problemi nel pushare il progetto uinity, risolto grazie alla creazione di un file .gitignore</w:t>
+            </w:r>
           </w:p>
         </w:tc>
       </w:tr>
@@ -7012,35 +6748,7 @@
               <w:rPr>
                 <w:rFonts w:ascii="Arial" w:hAnsi="Arial" w:cs="Arial"/>
               </w:rPr>
-              <w:t xml:space="preserve">Ambientarsi nel game </w:t>
-            </w:r>
-            <w:proofErr w:type="spellStart"/>
-            <w:r>
-              <w:rPr>
-                <w:rFonts w:ascii="Arial" w:hAnsi="Arial" w:cs="Arial"/>
-              </w:rPr>
-              <w:t>engine</w:t>
-            </w:r>
-            <w:proofErr w:type="spellEnd"/>
-            <w:r>
-              <w:rPr>
-                <w:rFonts w:ascii="Arial" w:hAnsi="Arial" w:cs="Arial"/>
-              </w:rPr>
-              <w:t xml:space="preserve"> di </w:t>
-            </w:r>
-            <w:proofErr w:type="spellStart"/>
-            <w:r>
-              <w:rPr>
-                <w:rFonts w:ascii="Arial" w:hAnsi="Arial" w:cs="Arial"/>
-              </w:rPr>
-              <w:t>unity</w:t>
-            </w:r>
-            <w:proofErr w:type="spellEnd"/>
-            <w:r>
-              <w:rPr>
-                <w:rFonts w:ascii="Arial" w:hAnsi="Arial" w:cs="Arial"/>
-              </w:rPr>
-              <w:t xml:space="preserve"> e quindi cominciare a creare la schermata di statistiche</w:t>
+              <w:t>Ambientarsi nel game engine di unity e quindi cominciare a creare la schermata di statistiche</w:t>
             </w:r>
           </w:p>
         </w:tc>
@@ -7512,21 +7220,7 @@
             <w:rPr>
               <w:rFonts w:ascii="Arial" w:hAnsi="Arial" w:cs="Arial"/>
             </w:rPr>
-            <w:t xml:space="preserve">Bryan: Generami un’immagine di </w:t>
-          </w:r>
-          <w:proofErr w:type="spellStart"/>
-          <w:r>
-            <w:rPr>
-              <w:rFonts w:ascii="Arial" w:hAnsi="Arial" w:cs="Arial"/>
-            </w:rPr>
-            <w:t>mockup</w:t>
-          </w:r>
-          <w:proofErr w:type="spellEnd"/>
-          <w:r>
-            <w:rPr>
-              <w:rFonts w:ascii="Arial" w:hAnsi="Arial" w:cs="Arial"/>
-            </w:rPr>
-            <w:t xml:space="preserve"> basandoti sul seguente stile: “stile”</w:t>
+            <w:t>Bryan: Generami un’immagine di mockup basandoti sul seguente stile: “stile”</w:t>
           </w:r>
         </w:p>
         <w:p>
@@ -7840,58 +7534,14 @@
         <w:rPr>
           <w:rFonts w:ascii="Arial" w:hAnsi="Arial" w:cs="Arial"/>
         </w:rPr>
-        <w:t xml:space="preserve">Riley: probabilmente non sarei riuscito a risolvere questo problema non avendo un’esperienza molto avanzata con i </w:t>
-      </w:r>
-      <w:proofErr w:type="gramStart"/>
-      <w:r>
-        <w:rPr>
-          <w:rFonts w:ascii="Arial" w:hAnsi="Arial" w:cs="Arial"/>
-        </w:rPr>
-        <w:t>file .</w:t>
-      </w:r>
-      <w:proofErr w:type="spellStart"/>
-      <w:r>
-        <w:rPr>
-          <w:rFonts w:ascii="Arial" w:hAnsi="Arial" w:cs="Arial"/>
-        </w:rPr>
-        <w:t>gitignore</w:t>
-      </w:r>
-      <w:proofErr w:type="spellEnd"/>
-      <w:proofErr w:type="gramEnd"/>
+        <w:t>Riley: probabilmente non sarei riuscito a risolvere questo problema non avendo un’esperienza molto avanzata con i file .gitignore</w:t>
+      </w:r>
       <w:r>
         <w:rPr>
           <w:rFonts w:ascii="Arial" w:hAnsi="Arial" w:cs="Arial"/>
         </w:rPr>
         <w:br/>
-        <w:t xml:space="preserve">Bryan: Averi creato un’immagine su </w:t>
-      </w:r>
-      <w:proofErr w:type="spellStart"/>
-      <w:r>
-        <w:rPr>
-          <w:rFonts w:ascii="Arial" w:hAnsi="Arial" w:cs="Arial"/>
-        </w:rPr>
-        <w:t>paint</w:t>
-      </w:r>
-      <w:proofErr w:type="spellEnd"/>
-      <w:r>
-        <w:rPr>
-          <w:rFonts w:ascii="Arial" w:hAnsi="Arial" w:cs="Arial"/>
-        </w:rPr>
-        <w:t xml:space="preserve"> che avrebbe reso i </w:t>
-      </w:r>
-      <w:proofErr w:type="spellStart"/>
-      <w:r>
-        <w:rPr>
-          <w:rFonts w:ascii="Arial" w:hAnsi="Arial" w:cs="Arial"/>
-        </w:rPr>
-        <w:t>mockup</w:t>
-      </w:r>
-      <w:proofErr w:type="spellEnd"/>
-      <w:r>
-        <w:rPr>
-          <w:rFonts w:ascii="Arial" w:hAnsi="Arial" w:cs="Arial"/>
-        </w:rPr>
-        <w:t xml:space="preserve"> molto più confusi.</w:t>
+        <w:t>Bryan: Averi creato un’immagine su paint che avrebbe reso i mockup molto più confusi.</w:t>
       </w:r>
     </w:p>
     <w:p>
@@ -8077,21 +7727,7 @@
               <w:rPr>
                 <w:rFonts w:ascii="Arial" w:hAnsi="Arial" w:cs="Arial"/>
               </w:rPr>
-              <w:t xml:space="preserve">Inizio sviluppo </w:t>
-            </w:r>
-            <w:proofErr w:type="spellStart"/>
-            <w:r>
-              <w:rPr>
-                <w:rFonts w:ascii="Arial" w:hAnsi="Arial" w:cs="Arial"/>
-              </w:rPr>
-              <w:t>ui</w:t>
-            </w:r>
-            <w:proofErr w:type="spellEnd"/>
-            <w:r>
-              <w:rPr>
-                <w:rFonts w:ascii="Arial" w:hAnsi="Arial" w:cs="Arial"/>
-              </w:rPr>
-              <w:t xml:space="preserve"> statistiche</w:t>
+              <w:t>Inizio sviluppo ui statistiche</w:t>
             </w:r>
           </w:p>
         </w:tc>
@@ -8129,21 +7765,7 @@
               <w:rPr>
                 <w:rFonts w:ascii="Arial" w:hAnsi="Arial" w:cs="Arial"/>
               </w:rPr>
-              <w:t xml:space="preserve">Inizio sviluppo </w:t>
-            </w:r>
-            <w:proofErr w:type="spellStart"/>
-            <w:r>
-              <w:rPr>
-                <w:rFonts w:ascii="Arial" w:hAnsi="Arial" w:cs="Arial"/>
-              </w:rPr>
-              <w:t>ui</w:t>
-            </w:r>
-            <w:proofErr w:type="spellEnd"/>
-            <w:r>
-              <w:rPr>
-                <w:rFonts w:ascii="Arial" w:hAnsi="Arial" w:cs="Arial"/>
-              </w:rPr>
-              <w:t xml:space="preserve"> statistiche</w:t>
+              <w:t>Inizio sviluppo ui statistiche</w:t>
             </w:r>
           </w:p>
         </w:tc>
@@ -8376,21 +7998,7 @@
               <w:rPr>
                 <w:rFonts w:ascii="Arial" w:hAnsi="Arial" w:cs="Arial"/>
               </w:rPr>
-              <w:t xml:space="preserve">Completare la </w:t>
-            </w:r>
-            <w:proofErr w:type="spellStart"/>
-            <w:r>
-              <w:rPr>
-                <w:rFonts w:ascii="Arial" w:hAnsi="Arial" w:cs="Arial"/>
-              </w:rPr>
-              <w:t>ui</w:t>
-            </w:r>
-            <w:proofErr w:type="spellEnd"/>
-            <w:r>
-              <w:rPr>
-                <w:rFonts w:ascii="Arial" w:hAnsi="Arial" w:cs="Arial"/>
-              </w:rPr>
-              <w:t xml:space="preserve"> delle statistiche</w:t>
+              <w:t>Completare la ui delle statistiche</w:t>
             </w:r>
           </w:p>
         </w:tc>
@@ -8440,28 +8048,12 @@
                 <w:rFonts w:ascii="Arial" w:hAnsi="Arial" w:cs="Arial"/>
               </w:rPr>
             </w:pPr>
-            <w:proofErr w:type="spellStart"/>
-            <w:r>
-              <w:rPr>
-                <w:rFonts w:ascii="Arial" w:hAnsi="Arial" w:cs="Arial"/>
-              </w:rPr>
-              <w:t>Daily</w:t>
-            </w:r>
-            <w:proofErr w:type="spellEnd"/>
-            <w:r>
-              <w:rPr>
-                <w:rFonts w:ascii="Arial" w:hAnsi="Arial" w:cs="Arial"/>
-              </w:rPr>
-              <w:t xml:space="preserve"> </w:t>
-            </w:r>
-            <w:proofErr w:type="spellStart"/>
-            <w:r>
-              <w:rPr>
-                <w:rFonts w:ascii="Arial" w:hAnsi="Arial" w:cs="Arial"/>
-              </w:rPr>
-              <w:t>Scrum</w:t>
-            </w:r>
-            <w:proofErr w:type="spellEnd"/>
+            <w:r>
+              <w:rPr>
+                <w:rFonts w:ascii="Arial" w:hAnsi="Arial" w:cs="Arial"/>
+              </w:rPr>
+              <w:t>Daily Scrum</w:t>
+            </w:r>
           </w:p>
         </w:tc>
       </w:tr>
@@ -8509,35 +8101,7 @@
               <w:rPr>
                 <w:rFonts w:ascii="Arial" w:hAnsi="Arial" w:cs="Arial"/>
               </w:rPr>
-              <w:t xml:space="preserve">Introduzione ambiente </w:t>
-            </w:r>
-            <w:proofErr w:type="spellStart"/>
-            <w:r>
-              <w:rPr>
-                <w:rFonts w:ascii="Arial" w:hAnsi="Arial" w:cs="Arial"/>
-              </w:rPr>
-              <w:t>unity</w:t>
-            </w:r>
-            <w:proofErr w:type="spellEnd"/>
-            <w:r>
-              <w:rPr>
-                <w:rFonts w:ascii="Arial" w:hAnsi="Arial" w:cs="Arial"/>
-              </w:rPr>
-              <w:t xml:space="preserve"> e inizio </w:t>
-            </w:r>
-            <w:proofErr w:type="spellStart"/>
-            <w:r>
-              <w:rPr>
-                <w:rFonts w:ascii="Arial" w:hAnsi="Arial" w:cs="Arial"/>
-              </w:rPr>
-              <w:t>imostazione</w:t>
-            </w:r>
-            <w:proofErr w:type="spellEnd"/>
-            <w:r>
-              <w:rPr>
-                <w:rFonts w:ascii="Arial" w:hAnsi="Arial" w:cs="Arial"/>
-              </w:rPr>
-              <w:t xml:space="preserve"> layout statistiche</w:t>
+              <w:t>Introduzione ambiente unity e inizio imostazione layout statistiche</w:t>
             </w:r>
           </w:p>
         </w:tc>
@@ -8717,16 +8281,8 @@
               <w:rPr>
                 <w:rFonts w:ascii="Arial" w:hAnsi="Arial" w:cs="Arial"/>
               </w:rPr>
-              <w:t xml:space="preserve">Sprint </w:t>
-            </w:r>
-            <w:proofErr w:type="spellStart"/>
-            <w:r>
-              <w:rPr>
-                <w:rFonts w:ascii="Arial" w:hAnsi="Arial" w:cs="Arial"/>
-              </w:rPr>
-              <w:t>Retrospective</w:t>
-            </w:r>
-            <w:proofErr w:type="spellEnd"/>
+              <w:t>Sprint Retrospective</w:t>
+            </w:r>
           </w:p>
         </w:tc>
       </w:tr>
@@ -9687,44 +9243,8 @@
               <w:rPr>
                 <w:rFonts w:ascii="Arial" w:hAnsi="Arial" w:cs="Arial"/>
               </w:rPr>
-              <w:t xml:space="preserve">Ricerca e sviluppo per salvataggio statistiche su </w:t>
-            </w:r>
-            <w:proofErr w:type="spellStart"/>
-            <w:r>
-              <w:rPr>
-                <w:rFonts w:ascii="Arial" w:hAnsi="Arial" w:cs="Arial"/>
-              </w:rPr>
-              <w:t>json</w:t>
-            </w:r>
-            <w:proofErr w:type="spellEnd"/>
-            <w:r>
-              <w:rPr>
-                <w:rFonts w:ascii="Arial" w:hAnsi="Arial" w:cs="Arial"/>
-              </w:rPr>
-              <w:t xml:space="preserve">, non ancora completo, questo verrà utilizzato come test per verificare il funzionamento delle varie schermate </w:t>
-            </w:r>
-            <w:proofErr w:type="spellStart"/>
-            <w:r>
-              <w:rPr>
-                <w:rFonts w:ascii="Arial" w:hAnsi="Arial" w:cs="Arial"/>
-              </w:rPr>
-              <w:t>ui</w:t>
-            </w:r>
-            <w:proofErr w:type="spellEnd"/>
-            <w:r>
-              <w:rPr>
-                <w:rFonts w:ascii="Arial" w:hAnsi="Arial" w:cs="Arial"/>
-              </w:rPr>
-              <w:t xml:space="preserve"> poi verrà adattato per il </w:t>
-            </w:r>
-            <w:proofErr w:type="spellStart"/>
-            <w:r>
-              <w:rPr>
-                <w:rFonts w:ascii="Arial" w:hAnsi="Arial" w:cs="Arial"/>
-              </w:rPr>
-              <w:t>db</w:t>
-            </w:r>
-            <w:proofErr w:type="spellEnd"/>
+              <w:t>Ricerca e sviluppo per salvataggio statistiche su json, non ancora completo, questo verrà utilizzato come test per verificare il funzionamento delle varie schermate ui poi verrà adattato per il db</w:t>
+            </w:r>
           </w:p>
         </w:tc>
       </w:tr>
@@ -9878,21 +9398,7 @@
               <w:rPr>
                 <w:rFonts w:ascii="Arial" w:hAnsi="Arial" w:cs="Arial"/>
               </w:rPr>
-              <w:t xml:space="preserve">Non trovavo la cartella degli assets, risolto cercando su </w:t>
-            </w:r>
-            <w:proofErr w:type="spellStart"/>
-            <w:r>
-              <w:rPr>
-                <w:rFonts w:ascii="Arial" w:hAnsi="Arial" w:cs="Arial"/>
-              </w:rPr>
-              <w:t>google</w:t>
-            </w:r>
-            <w:proofErr w:type="spellEnd"/>
-            <w:r>
-              <w:rPr>
-                <w:rFonts w:ascii="Arial" w:hAnsi="Arial" w:cs="Arial"/>
-              </w:rPr>
-              <w:t>.</w:t>
+              <w:t>Non trovavo la cartella degli assets, risolto cercando su google.</w:t>
             </w:r>
           </w:p>
         </w:tc>
@@ -9950,21 +9456,7 @@
               <w:rPr>
                 <w:rFonts w:ascii="Arial" w:hAnsi="Arial" w:cs="Arial"/>
               </w:rPr>
-              <w:t xml:space="preserve">Le statistiche non sono concluse, manca una piccola parte della </w:t>
-            </w:r>
-            <w:proofErr w:type="spellStart"/>
-            <w:r>
-              <w:rPr>
-                <w:rFonts w:ascii="Arial" w:hAnsi="Arial" w:cs="Arial"/>
-              </w:rPr>
-              <w:t>ui</w:t>
-            </w:r>
-            <w:proofErr w:type="spellEnd"/>
-            <w:r>
-              <w:rPr>
-                <w:rFonts w:ascii="Arial" w:hAnsi="Arial" w:cs="Arial"/>
-              </w:rPr>
-              <w:t xml:space="preserve"> e la logica di salvataggio e caricamento</w:t>
+              <w:t>Le statistiche non sono concluse, manca una piccola parte della ui e la logica di salvataggio e caricamento</w:t>
             </w:r>
           </w:p>
         </w:tc>
@@ -10072,28 +9564,12 @@
                 <w:rFonts w:ascii="Arial" w:hAnsi="Arial" w:cs="Arial"/>
               </w:rPr>
             </w:pPr>
-            <w:proofErr w:type="spellStart"/>
-            <w:r>
-              <w:rPr>
-                <w:rFonts w:ascii="Arial" w:hAnsi="Arial" w:cs="Arial"/>
-              </w:rPr>
-              <w:t>Daily</w:t>
-            </w:r>
-            <w:proofErr w:type="spellEnd"/>
-            <w:r>
-              <w:rPr>
-                <w:rFonts w:ascii="Arial" w:hAnsi="Arial" w:cs="Arial"/>
-              </w:rPr>
-              <w:t xml:space="preserve"> </w:t>
-            </w:r>
-            <w:proofErr w:type="spellStart"/>
-            <w:r>
-              <w:rPr>
-                <w:rFonts w:ascii="Arial" w:hAnsi="Arial" w:cs="Arial"/>
-              </w:rPr>
-              <w:t>Scrum</w:t>
-            </w:r>
-            <w:proofErr w:type="spellEnd"/>
+            <w:r>
+              <w:rPr>
+                <w:rFonts w:ascii="Arial" w:hAnsi="Arial" w:cs="Arial"/>
+              </w:rPr>
+              <w:t>Daily Scrum</w:t>
+            </w:r>
           </w:p>
         </w:tc>
       </w:tr>
@@ -10141,35 +9617,7 @@
               <w:rPr>
                 <w:rFonts w:ascii="Arial" w:hAnsi="Arial" w:cs="Arial"/>
               </w:rPr>
-              <w:t xml:space="preserve">Entrambi completeremo la </w:t>
-            </w:r>
-            <w:proofErr w:type="spellStart"/>
-            <w:r>
-              <w:rPr>
-                <w:rFonts w:ascii="Arial" w:hAnsi="Arial" w:cs="Arial"/>
-              </w:rPr>
-              <w:t>ui</w:t>
-            </w:r>
-            <w:proofErr w:type="spellEnd"/>
-            <w:r>
-              <w:rPr>
-                <w:rFonts w:ascii="Arial" w:hAnsi="Arial" w:cs="Arial"/>
-              </w:rPr>
-              <w:t xml:space="preserve"> delle statistiche in modo tale che ci ambientiamo completamente per lo sviluppo 2D e gli script C# per poterci permettere di lavorare separatamente in </w:t>
-            </w:r>
-            <w:proofErr w:type="spellStart"/>
-            <w:r>
-              <w:rPr>
-                <w:rFonts w:ascii="Arial" w:hAnsi="Arial" w:cs="Arial"/>
-              </w:rPr>
-              <w:t>fututro</w:t>
-            </w:r>
-            <w:proofErr w:type="spellEnd"/>
-            <w:r>
-              <w:rPr>
-                <w:rFonts w:ascii="Arial" w:hAnsi="Arial" w:cs="Arial"/>
-              </w:rPr>
-              <w:t>.</w:t>
+              <w:t>Entrambi completeremo la ui delle statistiche in modo tale che ci ambientiamo completamente per lo sviluppo 2D e gli script C# per poterci permettere di lavorare separatamente in fututro.</w:t>
             </w:r>
           </w:p>
         </w:tc>
@@ -10349,16 +9797,8 @@
               <w:rPr>
                 <w:rFonts w:ascii="Arial" w:hAnsi="Arial" w:cs="Arial"/>
               </w:rPr>
-              <w:t xml:space="preserve">Sprint </w:t>
-            </w:r>
-            <w:proofErr w:type="spellStart"/>
-            <w:r>
-              <w:rPr>
-                <w:rFonts w:ascii="Arial" w:hAnsi="Arial" w:cs="Arial"/>
-              </w:rPr>
-              <w:t>Retrospective</w:t>
-            </w:r>
-            <w:proofErr w:type="spellEnd"/>
+              <w:t>Sprint Retrospective</w:t>
+            </w:r>
           </w:p>
         </w:tc>
       </w:tr>
@@ -10850,30 +10290,8 @@
             <w:rPr>
               <w:rFonts w:ascii="Arial" w:hAnsi="Arial" w:cs="Arial"/>
             </w:rPr>
-            <w:t xml:space="preserve">Riley: aiutami a comprendere come salvare dei dati </w:t>
-          </w:r>
-          <w:proofErr w:type="spellStart"/>
-          <w:r>
-            <w:rPr>
-              <w:rFonts w:ascii="Arial" w:hAnsi="Arial" w:cs="Arial"/>
-            </w:rPr>
-            <w:t>unity</w:t>
-          </w:r>
-          <w:proofErr w:type="spellEnd"/>
-          <w:r>
-            <w:rPr>
-              <w:rFonts w:ascii="Arial" w:hAnsi="Arial" w:cs="Arial"/>
-            </w:rPr>
-            <w:t xml:space="preserve"> su un </w:t>
-          </w:r>
-          <w:proofErr w:type="spellStart"/>
-          <w:r>
-            <w:rPr>
-              <w:rFonts w:ascii="Arial" w:hAnsi="Arial" w:cs="Arial"/>
-            </w:rPr>
-            <w:t>json</w:t>
-          </w:r>
-          <w:proofErr w:type="spellEnd"/>
+            <w:t>Riley: aiutami a comprendere come salvare dei dati unity su un json</w:t>
+          </w:r>
         </w:p>
       </w:sdtContent>
     </w:sdt>
@@ -11385,21 +10803,7 @@
               <w:rPr>
                 <w:rFonts w:ascii="Arial" w:hAnsi="Arial" w:cs="Arial"/>
               </w:rPr>
-              <w:t xml:space="preserve">Terminato </w:t>
-            </w:r>
-            <w:proofErr w:type="spellStart"/>
-            <w:r>
-              <w:rPr>
-                <w:rFonts w:ascii="Arial" w:hAnsi="Arial" w:cs="Arial"/>
-              </w:rPr>
-              <w:t>ui</w:t>
-            </w:r>
-            <w:proofErr w:type="spellEnd"/>
-            <w:r>
-              <w:rPr>
-                <w:rFonts w:ascii="Arial" w:hAnsi="Arial" w:cs="Arial"/>
-              </w:rPr>
-              <w:t xml:space="preserve"> statistiche e iniziato quella delle impostazioni</w:t>
+              <w:t>Terminato ui statistiche e iniziato quella delle impostazioni</w:t>
             </w:r>
           </w:p>
         </w:tc>
@@ -11478,97 +10882,13 @@
               <w:rPr>
                 <w:rFonts w:ascii="Arial" w:hAnsi="Arial" w:cs="Arial"/>
               </w:rPr>
-              <w:t xml:space="preserve">Problemi di merge, risolto tramite una configurazione di un tool di </w:t>
-            </w:r>
-            <w:proofErr w:type="spellStart"/>
-            <w:r>
-              <w:rPr>
-                <w:rFonts w:ascii="Arial" w:hAnsi="Arial" w:cs="Arial"/>
-              </w:rPr>
-              <w:t>unity</w:t>
-            </w:r>
-            <w:proofErr w:type="spellEnd"/>
-            <w:r>
-              <w:rPr>
-                <w:rFonts w:ascii="Arial" w:hAnsi="Arial" w:cs="Arial"/>
-              </w:rPr>
-              <w:t xml:space="preserve"> che permette di risolvere automaticamente i conflitti, è stato fatto una configurazione che fa avvia un file .</w:t>
-            </w:r>
-            <w:proofErr w:type="spellStart"/>
-            <w:r>
-              <w:rPr>
-                <w:rFonts w:ascii="Arial" w:hAnsi="Arial" w:cs="Arial"/>
-              </w:rPr>
-              <w:t>cmd</w:t>
-            </w:r>
-            <w:proofErr w:type="spellEnd"/>
-            <w:r>
-              <w:rPr>
-                <w:rFonts w:ascii="Arial" w:hAnsi="Arial" w:cs="Arial"/>
-              </w:rPr>
-              <w:t xml:space="preserve"> sotto la cartella tools questo piccolo script prende i file con conflitti rilevati da </w:t>
-            </w:r>
-            <w:proofErr w:type="spellStart"/>
-            <w:r>
-              <w:rPr>
-                <w:rFonts w:ascii="Arial" w:hAnsi="Arial" w:cs="Arial"/>
-              </w:rPr>
-              <w:t>git</w:t>
-            </w:r>
-            <w:proofErr w:type="spellEnd"/>
-            <w:r>
-              <w:rPr>
-                <w:rFonts w:ascii="Arial" w:hAnsi="Arial" w:cs="Arial"/>
-              </w:rPr>
-              <w:t xml:space="preserve"> e li traduce per </w:t>
-            </w:r>
-            <w:proofErr w:type="spellStart"/>
-            <w:r>
-              <w:rPr>
-                <w:rFonts w:ascii="Arial" w:hAnsi="Arial" w:cs="Arial"/>
-              </w:rPr>
-              <w:t>unityyalmmerge</w:t>
-            </w:r>
-            <w:proofErr w:type="spellEnd"/>
-            <w:r>
-              <w:rPr>
-                <w:rFonts w:ascii="Arial" w:hAnsi="Arial" w:cs="Arial"/>
-              </w:rPr>
-              <w:t xml:space="preserve"> facendo in modo che una volta usato il comando </w:t>
-            </w:r>
-            <w:proofErr w:type="spellStart"/>
-            <w:r>
-              <w:rPr>
-                <w:rFonts w:ascii="Arial" w:hAnsi="Arial" w:cs="Arial"/>
-              </w:rPr>
-              <w:t>git</w:t>
-            </w:r>
-            <w:proofErr w:type="spellEnd"/>
-            <w:r>
-              <w:rPr>
-                <w:rFonts w:ascii="Arial" w:hAnsi="Arial" w:cs="Arial"/>
-              </w:rPr>
-              <w:t xml:space="preserve"> pull non risultino più errori.</w:t>
-            </w:r>
-            <w:r>
-              <w:rPr>
-                <w:rFonts w:ascii="Arial" w:hAnsi="Arial" w:cs="Arial"/>
-              </w:rPr>
-              <w:t xml:space="preserve"> </w:t>
-            </w:r>
-            <w:proofErr w:type="spellStart"/>
-            <w:r>
-              <w:rPr>
-                <w:rFonts w:ascii="Arial" w:hAnsi="Arial" w:cs="Arial"/>
-              </w:rPr>
-              <w:t>Chatgpt</w:t>
-            </w:r>
-            <w:proofErr w:type="spellEnd"/>
-            <w:r>
-              <w:rPr>
-                <w:rFonts w:ascii="Arial" w:hAnsi="Arial" w:cs="Arial"/>
-              </w:rPr>
-              <w:t xml:space="preserve"> mi ha supportato nella risoluzione di questo problema</w:t>
+              <w:t>Problemi di merge, risolto tramite una configurazione di un tool di unity che permette di risolvere automaticamente i conflitti, è stato fatto una configurazione che fa avvia un file .cmd sotto la cartella tools questo piccolo script prende i file con conflitti rilevati da git e li traduce per unityyalmmerge facendo in modo che una volta usato il comando git pull non risultino più errori.</w:t>
+            </w:r>
+            <w:r>
+              <w:rPr>
+                <w:rFonts w:ascii="Arial" w:hAnsi="Arial" w:cs="Arial"/>
+              </w:rPr>
+              <w:t xml:space="preserve"> Chatgpt mi ha supportato nella risoluzione di questo problema</w:t>
             </w:r>
           </w:p>
         </w:tc>
@@ -11664,21 +10984,7 @@
               <w:rPr>
                 <w:rFonts w:ascii="Arial" w:hAnsi="Arial" w:cs="Arial"/>
               </w:rPr>
-              <w:t xml:space="preserve">La </w:t>
-            </w:r>
-            <w:proofErr w:type="spellStart"/>
-            <w:r>
-              <w:rPr>
-                <w:rFonts w:ascii="Arial" w:hAnsi="Arial" w:cs="Arial"/>
-              </w:rPr>
-              <w:t>ui</w:t>
-            </w:r>
-            <w:proofErr w:type="spellEnd"/>
-            <w:r>
-              <w:rPr>
-                <w:rFonts w:ascii="Arial" w:hAnsi="Arial" w:cs="Arial"/>
-              </w:rPr>
-              <w:t xml:space="preserve"> delle statistiche è completa ma mancano alcune parti dello script, di conseguenza abbiamo un ritardo generale.</w:t>
+              <w:t>La ui delle statistiche è completa ma mancano alcune parti dello script, di conseguenza abbiamo un ritardo generale.</w:t>
             </w:r>
           </w:p>
         </w:tc>
@@ -11736,21 +11042,7 @@
               <w:rPr>
                 <w:rFonts w:ascii="Arial" w:hAnsi="Arial" w:cs="Arial"/>
               </w:rPr>
-              <w:t xml:space="preserve">Terminare script statistiche, continuare </w:t>
-            </w:r>
-            <w:proofErr w:type="spellStart"/>
-            <w:r>
-              <w:rPr>
-                <w:rFonts w:ascii="Arial" w:hAnsi="Arial" w:cs="Arial"/>
-              </w:rPr>
-              <w:t>ui</w:t>
-            </w:r>
-            <w:proofErr w:type="spellEnd"/>
-            <w:r>
-              <w:rPr>
-                <w:rFonts w:ascii="Arial" w:hAnsi="Arial" w:cs="Arial"/>
-              </w:rPr>
-              <w:t xml:space="preserve"> impostazioni</w:t>
+              <w:t>Terminare script statistiche, continuare ui impostazioni</w:t>
             </w:r>
           </w:p>
         </w:tc>
@@ -11800,28 +11092,12 @@
                 <w:rFonts w:ascii="Arial" w:hAnsi="Arial" w:cs="Arial"/>
               </w:rPr>
             </w:pPr>
-            <w:proofErr w:type="spellStart"/>
-            <w:r>
-              <w:rPr>
-                <w:rFonts w:ascii="Arial" w:hAnsi="Arial" w:cs="Arial"/>
-              </w:rPr>
-              <w:t>Daily</w:t>
-            </w:r>
-            <w:proofErr w:type="spellEnd"/>
-            <w:r>
-              <w:rPr>
-                <w:rFonts w:ascii="Arial" w:hAnsi="Arial" w:cs="Arial"/>
-              </w:rPr>
-              <w:t xml:space="preserve"> </w:t>
-            </w:r>
-            <w:proofErr w:type="spellStart"/>
-            <w:r>
-              <w:rPr>
-                <w:rFonts w:ascii="Arial" w:hAnsi="Arial" w:cs="Arial"/>
-              </w:rPr>
-              <w:t>Scrum</w:t>
-            </w:r>
-            <w:proofErr w:type="spellEnd"/>
+            <w:r>
+              <w:rPr>
+                <w:rFonts w:ascii="Arial" w:hAnsi="Arial" w:cs="Arial"/>
+              </w:rPr>
+              <w:t>Daily Scrum</w:t>
+            </w:r>
           </w:p>
         </w:tc>
       </w:tr>
@@ -11869,21 +11145,7 @@
               <w:rPr>
                 <w:rFonts w:ascii="Arial" w:hAnsi="Arial" w:cs="Arial"/>
               </w:rPr>
-              <w:t xml:space="preserve">Riley deve risolvere un problema di merge riscontrato al tentativo di pull e poi continuare con lo script delle statistiche, invece Bryan deve fine la </w:t>
-            </w:r>
-            <w:proofErr w:type="spellStart"/>
-            <w:r>
-              <w:rPr>
-                <w:rFonts w:ascii="Arial" w:hAnsi="Arial" w:cs="Arial"/>
-              </w:rPr>
-              <w:t>ui</w:t>
-            </w:r>
-            <w:proofErr w:type="spellEnd"/>
-            <w:r>
-              <w:rPr>
-                <w:rFonts w:ascii="Arial" w:hAnsi="Arial" w:cs="Arial"/>
-              </w:rPr>
-              <w:t xml:space="preserve"> delle statistiche e preferibilmente iniziare con le impostazioni.</w:t>
+              <w:t>Riley deve risolvere un problema di merge riscontrato al tentativo di pull e poi continuare con lo script delle statistiche, invece Bryan deve fine la ui delle statistiche e preferibilmente iniziare con le impostazioni.</w:t>
             </w:r>
           </w:p>
         </w:tc>
@@ -12063,16 +11325,8 @@
               <w:rPr>
                 <w:rFonts w:ascii="Arial" w:hAnsi="Arial" w:cs="Arial"/>
               </w:rPr>
-              <w:t xml:space="preserve">Sprint </w:t>
-            </w:r>
-            <w:proofErr w:type="spellStart"/>
-            <w:r>
-              <w:rPr>
-                <w:rFonts w:ascii="Arial" w:hAnsi="Arial" w:cs="Arial"/>
-              </w:rPr>
-              <w:t>Retrospective</w:t>
-            </w:r>
-            <w:proofErr w:type="spellEnd"/>
+              <w:t>Sprint Retrospective</w:t>
+            </w:r>
           </w:p>
         </w:tc>
       </w:tr>
@@ -12576,21 +11830,7 @@
             <w:rPr>
               <w:rFonts w:ascii="Arial" w:hAnsi="Arial" w:cs="Arial"/>
             </w:rPr>
-            <w:t xml:space="preserve">Ho riscontrato un problema di merge nonostante abbiamo impostato un sistema con un tool </w:t>
-          </w:r>
-          <w:proofErr w:type="spellStart"/>
-          <w:r>
-            <w:rPr>
-              <w:rFonts w:ascii="Arial" w:hAnsi="Arial" w:cs="Arial"/>
-            </w:rPr>
-            <w:t>unity</w:t>
-          </w:r>
-          <w:proofErr w:type="spellEnd"/>
-          <w:r>
-            <w:rPr>
-              <w:rFonts w:ascii="Arial" w:hAnsi="Arial" w:cs="Arial"/>
-            </w:rPr>
-            <w:t>, puoi dirmi cosa analizzare per risolvere?</w:t>
+            <w:t>Ho riscontrato un problema di merge nonostante abbiamo impostato un sistema con un tool unity, puoi dirmi cosa analizzare per risolvere?</w:t>
           </w:r>
         </w:p>
         <w:p>
@@ -12605,21 +11845,7 @@
             <w:rPr>
               <w:rFonts w:ascii="Arial" w:hAnsi="Arial" w:cs="Arial"/>
             </w:rPr>
-            <w:t xml:space="preserve">Bryan: come si implementa un font in </w:t>
-          </w:r>
-          <w:proofErr w:type="spellStart"/>
-          <w:r>
-            <w:rPr>
-              <w:rFonts w:ascii="Arial" w:hAnsi="Arial" w:cs="Arial"/>
-            </w:rPr>
-            <w:t>unity</w:t>
-          </w:r>
-          <w:proofErr w:type="spellEnd"/>
-          <w:r>
-            <w:rPr>
-              <w:rFonts w:ascii="Arial" w:hAnsi="Arial" w:cs="Arial"/>
-            </w:rPr>
-            <w:t>?</w:t>
+            <w:t>Bryan: come si implementa un font in unity?</w:t>
           </w:r>
         </w:p>
       </w:sdtContent>
@@ -13328,49 +12554,7 @@
               <w:rPr>
                 <w:rFonts w:ascii="Arial" w:hAnsi="Arial" w:cs="Arial"/>
               </w:rPr>
-              <w:t xml:space="preserve">Rispetto alla pianificazione abbiamo un leggero ritardo avendo finito solo oggi le statistiche, ma questo risulta recuperabile essendo che lavoriamo separatamente dividendo </w:t>
-            </w:r>
-            <w:proofErr w:type="spellStart"/>
-            <w:r>
-              <w:rPr>
-                <w:rFonts w:ascii="Arial" w:hAnsi="Arial" w:cs="Arial"/>
-              </w:rPr>
-              <w:t>ui</w:t>
-            </w:r>
-            <w:proofErr w:type="spellEnd"/>
-            <w:r>
-              <w:rPr>
-                <w:rFonts w:ascii="Arial" w:hAnsi="Arial" w:cs="Arial"/>
-              </w:rPr>
-              <w:t xml:space="preserve"> e scripting, infatti </w:t>
-            </w:r>
-            <w:proofErr w:type="spellStart"/>
-            <w:r>
-              <w:rPr>
-                <w:rFonts w:ascii="Arial" w:hAnsi="Arial" w:cs="Arial"/>
-              </w:rPr>
-              <w:t>bryan</w:t>
-            </w:r>
-            <w:proofErr w:type="spellEnd"/>
-            <w:r>
-              <w:rPr>
-                <w:rFonts w:ascii="Arial" w:hAnsi="Arial" w:cs="Arial"/>
-              </w:rPr>
-              <w:t xml:space="preserve"> ha iniziato la </w:t>
-            </w:r>
-            <w:proofErr w:type="spellStart"/>
-            <w:r>
-              <w:rPr>
-                <w:rFonts w:ascii="Arial" w:hAnsi="Arial" w:cs="Arial"/>
-              </w:rPr>
-              <w:t>ui</w:t>
-            </w:r>
-            <w:proofErr w:type="spellEnd"/>
-            <w:r>
-              <w:rPr>
-                <w:rFonts w:ascii="Arial" w:hAnsi="Arial" w:cs="Arial"/>
-              </w:rPr>
-              <w:t xml:space="preserve"> delle impostazioni il giorno previsto.</w:t>
+              <w:t>Rispetto alla pianificazione abbiamo un leggero ritardo avendo finito solo oggi le statistiche, ma questo risulta recuperabile essendo che lavoriamo separatamente dividendo ui e scripting, infatti bryan ha iniziato la ui delle impostazioni il giorno previsto.</w:t>
             </w:r>
           </w:p>
         </w:tc>
@@ -13491,28 +12675,12 @@
                 <w:rFonts w:ascii="Arial" w:hAnsi="Arial" w:cs="Arial"/>
               </w:rPr>
             </w:pPr>
-            <w:proofErr w:type="spellStart"/>
-            <w:r>
-              <w:rPr>
-                <w:rFonts w:ascii="Arial" w:hAnsi="Arial" w:cs="Arial"/>
-              </w:rPr>
-              <w:t>Daily</w:t>
-            </w:r>
-            <w:proofErr w:type="spellEnd"/>
-            <w:r>
-              <w:rPr>
-                <w:rFonts w:ascii="Arial" w:hAnsi="Arial" w:cs="Arial"/>
-              </w:rPr>
-              <w:t xml:space="preserve"> </w:t>
-            </w:r>
-            <w:proofErr w:type="spellStart"/>
-            <w:r>
-              <w:rPr>
-                <w:rFonts w:ascii="Arial" w:hAnsi="Arial" w:cs="Arial"/>
-              </w:rPr>
-              <w:t>Scrum</w:t>
-            </w:r>
-            <w:proofErr w:type="spellEnd"/>
+            <w:r>
+              <w:rPr>
+                <w:rFonts w:ascii="Arial" w:hAnsi="Arial" w:cs="Arial"/>
+              </w:rPr>
+              <w:t>Daily Scrum</w:t>
+            </w:r>
           </w:p>
         </w:tc>
       </w:tr>
@@ -13574,21 +12742,7 @@
               <w:rPr>
                 <w:rFonts w:ascii="Arial" w:hAnsi="Arial" w:cs="Arial"/>
               </w:rPr>
-              <w:t xml:space="preserve">Bryan: Finire la </w:t>
-            </w:r>
-            <w:proofErr w:type="spellStart"/>
-            <w:r>
-              <w:rPr>
-                <w:rFonts w:ascii="Arial" w:hAnsi="Arial" w:cs="Arial"/>
-              </w:rPr>
-              <w:t>ui</w:t>
-            </w:r>
-            <w:proofErr w:type="spellEnd"/>
-            <w:r>
-              <w:rPr>
-                <w:rFonts w:ascii="Arial" w:hAnsi="Arial" w:cs="Arial"/>
-              </w:rPr>
-              <w:t xml:space="preserve"> del</w:t>
+              <w:t>Bryan: Finire la ui del</w:t>
             </w:r>
             <w:r>
               <w:rPr>
@@ -13774,16 +12928,8 @@
               <w:rPr>
                 <w:rFonts w:ascii="Arial" w:hAnsi="Arial" w:cs="Arial"/>
               </w:rPr>
-              <w:t xml:space="preserve">Sprint </w:t>
-            </w:r>
-            <w:proofErr w:type="spellStart"/>
-            <w:r>
-              <w:rPr>
-                <w:rFonts w:ascii="Arial" w:hAnsi="Arial" w:cs="Arial"/>
-              </w:rPr>
-              <w:t>Retrospective</w:t>
-            </w:r>
-            <w:proofErr w:type="spellEnd"/>
+              <w:t>Sprint Retrospective</w:t>
+            </w:r>
           </w:p>
         </w:tc>
       </w:tr>
@@ -14275,35 +13421,7 @@
             <w:rPr>
               <w:rFonts w:ascii="Arial" w:hAnsi="Arial" w:cs="Arial"/>
             </w:rPr>
-            <w:t xml:space="preserve">Il numero inserito nel </w:t>
-          </w:r>
-          <w:proofErr w:type="spellStart"/>
-          <w:r>
-            <w:rPr>
-              <w:rFonts w:ascii="Arial" w:hAnsi="Arial" w:cs="Arial"/>
-            </w:rPr>
-            <w:t>json</w:t>
-          </w:r>
-          <w:proofErr w:type="spellEnd"/>
-          <w:r>
-            <w:rPr>
-              <w:rFonts w:ascii="Arial" w:hAnsi="Arial" w:cs="Arial"/>
-            </w:rPr>
-            <w:t xml:space="preserve"> risulta essere un numero che va dal miliardo in su, ma l’applicativo lo riduce a milioni, per caso i valori </w:t>
-          </w:r>
-          <w:proofErr w:type="spellStart"/>
-          <w:r>
-            <w:rPr>
-              <w:rFonts w:ascii="Arial" w:hAnsi="Arial" w:cs="Arial"/>
-            </w:rPr>
-            <w:t>int</w:t>
-          </w:r>
-          <w:proofErr w:type="spellEnd"/>
-          <w:r>
-            <w:rPr>
-              <w:rFonts w:ascii="Arial" w:hAnsi="Arial" w:cs="Arial"/>
-            </w:rPr>
-            <w:t xml:space="preserve"> non supportano i miliardi?</w:t>
+            <w:t>Il numero inserito nel json risulta essere un numero che va dal miliardo in su, ma l’applicativo lo riduce a milioni, per caso i valori int non supportano i miliardi?</w:t>
           </w:r>
           <w:r>
             <w:rPr>
@@ -14392,21 +13510,7 @@
             <w:rPr>
               <w:rFonts w:ascii="Arial" w:hAnsi="Arial" w:cs="Arial"/>
             </w:rPr>
-            <w:t xml:space="preserve">Mi ha detto che </w:t>
-          </w:r>
-          <w:proofErr w:type="spellStart"/>
-          <w:r>
-            <w:rPr>
-              <w:rFonts w:ascii="Arial" w:hAnsi="Arial" w:cs="Arial"/>
-            </w:rPr>
-            <w:t>int</w:t>
-          </w:r>
-          <w:proofErr w:type="spellEnd"/>
-          <w:r>
-            <w:rPr>
-              <w:rFonts w:ascii="Arial" w:hAnsi="Arial" w:cs="Arial"/>
-            </w:rPr>
-            <w:t xml:space="preserve"> supporta i miliardi ma che ha un massimo di circa 2,2 miliardi ed il numero risultava più grande quindi ho ripiegato su un long</w:t>
+            <w:t>Mi ha detto che int supporta i miliardi ma che ha un massimo di circa 2,2 miliardi ed il numero risultava più grande quindi ho ripiegato su un long</w:t>
           </w:r>
         </w:p>
       </w:sdtContent>
@@ -14915,21 +14019,7 @@
               <w:rPr>
                 <w:rFonts w:ascii="Arial" w:hAnsi="Arial" w:cs="Arial"/>
               </w:rPr>
-              <w:t xml:space="preserve">Ho notato come certe impostazioni non sono modificabili con variabili di </w:t>
-            </w:r>
-            <w:proofErr w:type="spellStart"/>
-            <w:r>
-              <w:rPr>
-                <w:rFonts w:ascii="Arial" w:hAnsi="Arial" w:cs="Arial"/>
-              </w:rPr>
-              <w:t>unity</w:t>
-            </w:r>
-            <w:proofErr w:type="spellEnd"/>
-            <w:r>
-              <w:rPr>
-                <w:rFonts w:ascii="Arial" w:hAnsi="Arial" w:cs="Arial"/>
-              </w:rPr>
-              <w:t xml:space="preserve"> e quindi ho usato del tempo per eseguire qualche ricerca.</w:t>
+              <w:t>Ho notato come certe impostazioni non sono modificabili con variabili di unity e quindi ho usato del tempo per eseguire qualche ricerca.</w:t>
             </w:r>
           </w:p>
         </w:tc>
@@ -15133,28 +14223,12 @@
                 <w:rFonts w:ascii="Arial" w:hAnsi="Arial" w:cs="Arial"/>
               </w:rPr>
             </w:pPr>
-            <w:proofErr w:type="spellStart"/>
-            <w:r>
-              <w:rPr>
-                <w:rFonts w:ascii="Arial" w:hAnsi="Arial" w:cs="Arial"/>
-              </w:rPr>
-              <w:t>Daily</w:t>
-            </w:r>
-            <w:proofErr w:type="spellEnd"/>
-            <w:r>
-              <w:rPr>
-                <w:rFonts w:ascii="Arial" w:hAnsi="Arial" w:cs="Arial"/>
-              </w:rPr>
-              <w:t xml:space="preserve"> </w:t>
-            </w:r>
-            <w:proofErr w:type="spellStart"/>
-            <w:r>
-              <w:rPr>
-                <w:rFonts w:ascii="Arial" w:hAnsi="Arial" w:cs="Arial"/>
-              </w:rPr>
-              <w:t>Scrum</w:t>
-            </w:r>
-            <w:proofErr w:type="spellEnd"/>
+            <w:r>
+              <w:rPr>
+                <w:rFonts w:ascii="Arial" w:hAnsi="Arial" w:cs="Arial"/>
+              </w:rPr>
+              <w:t>Daily Scrum</w:t>
+            </w:r>
           </w:p>
         </w:tc>
       </w:tr>
@@ -15402,16 +14476,8 @@
               <w:rPr>
                 <w:rFonts w:ascii="Arial" w:hAnsi="Arial" w:cs="Arial"/>
               </w:rPr>
-              <w:t xml:space="preserve">Sprint </w:t>
-            </w:r>
-            <w:proofErr w:type="spellStart"/>
-            <w:r>
-              <w:rPr>
-                <w:rFonts w:ascii="Arial" w:hAnsi="Arial" w:cs="Arial"/>
-              </w:rPr>
-              <w:t>Retrospective</w:t>
-            </w:r>
-            <w:proofErr w:type="spellEnd"/>
+              <w:t>Sprint Retrospective</w:t>
+            </w:r>
           </w:p>
         </w:tc>
       </w:tr>
@@ -15897,21 +14963,7 @@
             <w:rPr>
               <w:rFonts w:ascii="Arial" w:hAnsi="Arial" w:cs="Arial"/>
             </w:rPr>
-            <w:t xml:space="preserve">Riley: sto creando il file data per le impostazioni con questi valori: “valori”. Puoi dirmi che valore effettivo usa </w:t>
-          </w:r>
-          <w:proofErr w:type="spellStart"/>
-          <w:r>
-            <w:rPr>
-              <w:rFonts w:ascii="Arial" w:hAnsi="Arial" w:cs="Arial"/>
-            </w:rPr>
-            <w:t>unity</w:t>
-          </w:r>
-          <w:proofErr w:type="spellEnd"/>
-          <w:r>
-            <w:rPr>
-              <w:rFonts w:ascii="Arial" w:hAnsi="Arial" w:cs="Arial"/>
-            </w:rPr>
-            <w:t xml:space="preserve">? </w:t>
+            <w:t xml:space="preserve">Riley: sto creando il file data per le impostazioni con questi valori: “valori”. Puoi dirmi che valore effettivo usa unity? </w:t>
           </w:r>
         </w:p>
         <w:p>
@@ -15926,44 +14978,8 @@
             <w:rPr>
               <w:rFonts w:ascii="Arial" w:hAnsi="Arial" w:cs="Arial"/>
             </w:rPr>
-            <w:t xml:space="preserve">Bryan: Come creare un menu con componenti </w:t>
-          </w:r>
-          <w:proofErr w:type="spellStart"/>
-          <w:r>
-            <w:rPr>
-              <w:rFonts w:ascii="Arial" w:hAnsi="Arial" w:cs="Arial"/>
-            </w:rPr>
-            <w:t>ui</w:t>
-          </w:r>
-          <w:proofErr w:type="spellEnd"/>
-          <w:r>
-            <w:rPr>
-              <w:rFonts w:ascii="Arial" w:hAnsi="Arial" w:cs="Arial"/>
-            </w:rPr>
-            <w:t xml:space="preserve"> che si ripetono </w:t>
-          </w:r>
-          <w:proofErr w:type="spellStart"/>
-          <w:r>
-            <w:rPr>
-              <w:rFonts w:ascii="Arial" w:hAnsi="Arial" w:cs="Arial"/>
-            </w:rPr>
-            <w:t>modularmente</w:t>
-          </w:r>
-          <w:proofErr w:type="spellEnd"/>
-          <w:r>
-            <w:rPr>
-              <w:rFonts w:ascii="Arial" w:hAnsi="Arial" w:cs="Arial"/>
-            </w:rPr>
-            <w:t xml:space="preserve"> in </w:t>
-          </w:r>
-          <w:proofErr w:type="spellStart"/>
-          <w:r>
-            <w:rPr>
-              <w:rFonts w:ascii="Arial" w:hAnsi="Arial" w:cs="Arial"/>
-            </w:rPr>
-            <w:t>unity</w:t>
-          </w:r>
-          <w:proofErr w:type="spellEnd"/>
+            <w:t>Bryan: Come creare un menu con componenti ui che si ripetono modularmente in unity</w:t>
+          </w:r>
         </w:p>
       </w:sdtContent>
     </w:sdt>
@@ -16274,16 +15290,8 @@
         <w:rPr>
           <w:rFonts w:ascii="Arial" w:hAnsi="Arial" w:cs="Arial"/>
         </w:rPr>
-        <w:t xml:space="preserve">Bryan: averi cercato un tutorial su </w:t>
-      </w:r>
-      <w:proofErr w:type="spellStart"/>
-      <w:r>
-        <w:rPr>
-          <w:rFonts w:ascii="Arial" w:hAnsi="Arial" w:cs="Arial"/>
-        </w:rPr>
-        <w:t>youtube</w:t>
-      </w:r>
-      <w:proofErr w:type="spellEnd"/>
+        <w:t>Bryan: averi cercato un tutorial su youtube</w:t>
+      </w:r>
     </w:p>
     <w:p>
       <w:pPr>
@@ -16469,16 +15477,8 @@
               <w:rPr>
                 <w:rFonts w:ascii="Arial" w:hAnsi="Arial" w:cs="Arial"/>
               </w:rPr>
-              <w:t xml:space="preserve">Continuato script impostazioni per </w:t>
-            </w:r>
-            <w:proofErr w:type="spellStart"/>
-            <w:r>
-              <w:rPr>
-                <w:rFonts w:ascii="Arial" w:hAnsi="Arial" w:cs="Arial"/>
-              </w:rPr>
-              <w:t>ui</w:t>
-            </w:r>
-            <w:proofErr w:type="spellEnd"/>
+              <w:t>Continuato script impostazioni per ui</w:t>
+            </w:r>
           </w:p>
         </w:tc>
       </w:tr>
@@ -16594,35 +15594,7 @@
               <w:rPr>
                 <w:rFonts w:ascii="Arial" w:hAnsi="Arial" w:cs="Arial"/>
               </w:rPr>
-              <w:t xml:space="preserve">Alcuni problemi con i valori inviati dal </w:t>
-            </w:r>
-            <w:proofErr w:type="spellStart"/>
-            <w:r>
-              <w:rPr>
-                <w:rFonts w:ascii="Arial" w:hAnsi="Arial" w:cs="Arial"/>
-              </w:rPr>
-              <w:t>togglle</w:t>
-            </w:r>
-            <w:proofErr w:type="spellEnd"/>
-            <w:r>
-              <w:rPr>
-                <w:rFonts w:ascii="Arial" w:hAnsi="Arial" w:cs="Arial"/>
-              </w:rPr>
-              <w:t xml:space="preserve"> per </w:t>
-            </w:r>
-            <w:proofErr w:type="spellStart"/>
-            <w:r>
-              <w:rPr>
-                <w:rFonts w:ascii="Arial" w:hAnsi="Arial" w:cs="Arial"/>
-              </w:rPr>
-              <w:t>fullscreen</w:t>
-            </w:r>
-            <w:proofErr w:type="spellEnd"/>
-            <w:r>
-              <w:rPr>
-                <w:rFonts w:ascii="Arial" w:hAnsi="Arial" w:cs="Arial"/>
-              </w:rPr>
-              <w:t xml:space="preserve">, scoperto che avevo selezionato un valore statico e non dinamico dell’elemento </w:t>
+              <w:t xml:space="preserve">Alcuni problemi con i valori inviati dal togglle per fullscreen, scoperto che avevo selezionato un valore statico e non dinamico dell’elemento </w:t>
             </w:r>
           </w:p>
         </w:tc>
@@ -16788,21 +15760,7 @@
               <w:rPr>
                 <w:rFonts w:ascii="Arial" w:hAnsi="Arial" w:cs="Arial"/>
               </w:rPr>
-              <w:t xml:space="preserve"> iniziare a creare il </w:t>
-            </w:r>
-            <w:proofErr w:type="spellStart"/>
-            <w:r>
-              <w:rPr>
-                <w:rFonts w:ascii="Arial" w:hAnsi="Arial" w:cs="Arial"/>
-              </w:rPr>
-              <w:t>db</w:t>
-            </w:r>
-            <w:proofErr w:type="spellEnd"/>
-            <w:r>
-              <w:rPr>
-                <w:rFonts w:ascii="Arial" w:hAnsi="Arial" w:cs="Arial"/>
-              </w:rPr>
-              <w:t xml:space="preserve"> effettivo</w:t>
+              <w:t xml:space="preserve"> iniziare a creare il db effettivo</w:t>
             </w:r>
             <w:r>
               <w:rPr>
@@ -16858,28 +15816,12 @@
                 <w:rFonts w:ascii="Arial" w:hAnsi="Arial" w:cs="Arial"/>
               </w:rPr>
             </w:pPr>
-            <w:proofErr w:type="spellStart"/>
-            <w:r>
-              <w:rPr>
-                <w:rFonts w:ascii="Arial" w:hAnsi="Arial" w:cs="Arial"/>
-              </w:rPr>
-              <w:t>Daily</w:t>
-            </w:r>
-            <w:proofErr w:type="spellEnd"/>
-            <w:r>
-              <w:rPr>
-                <w:rFonts w:ascii="Arial" w:hAnsi="Arial" w:cs="Arial"/>
-              </w:rPr>
-              <w:t xml:space="preserve"> </w:t>
-            </w:r>
-            <w:proofErr w:type="spellStart"/>
-            <w:r>
-              <w:rPr>
-                <w:rFonts w:ascii="Arial" w:hAnsi="Arial" w:cs="Arial"/>
-              </w:rPr>
-              <w:t>Scrum</w:t>
-            </w:r>
-            <w:proofErr w:type="spellEnd"/>
+            <w:r>
+              <w:rPr>
+                <w:rFonts w:ascii="Arial" w:hAnsi="Arial" w:cs="Arial"/>
+              </w:rPr>
+              <w:t>Daily Scrum</w:t>
+            </w:r>
           </w:p>
         </w:tc>
       </w:tr>
@@ -16933,16 +15875,8 @@
               <w:rPr>
                 <w:rFonts w:ascii="Arial" w:hAnsi="Arial" w:cs="Arial"/>
               </w:rPr>
-              <w:t xml:space="preserve"> Terminare l’applicazione delle impostazioni nella </w:t>
-            </w:r>
-            <w:proofErr w:type="spellStart"/>
-            <w:r>
-              <w:rPr>
-                <w:rFonts w:ascii="Arial" w:hAnsi="Arial" w:cs="Arial"/>
-              </w:rPr>
-              <w:t>ui</w:t>
-            </w:r>
-            <w:proofErr w:type="spellEnd"/>
+              <w:t xml:space="preserve"> Terminare l’applicazione delle impostazioni nella ui</w:t>
+            </w:r>
           </w:p>
           <w:p>
             <w:pPr>
@@ -17153,16 +16087,8 @@
               <w:rPr>
                 <w:rFonts w:ascii="Arial" w:hAnsi="Arial" w:cs="Arial"/>
               </w:rPr>
-              <w:t xml:space="preserve">Sprint </w:t>
-            </w:r>
-            <w:proofErr w:type="spellStart"/>
-            <w:r>
-              <w:rPr>
-                <w:rFonts w:ascii="Arial" w:hAnsi="Arial" w:cs="Arial"/>
-              </w:rPr>
-              <w:t>Retrospective</w:t>
-            </w:r>
-            <w:proofErr w:type="spellEnd"/>
+              <w:t>Sprint Retrospective</w:t>
+            </w:r>
           </w:p>
         </w:tc>
       </w:tr>
@@ -18463,33 +17389,11 @@
                 <w:rFonts w:ascii="Arial" w:hAnsi="Arial" w:cs="Arial"/>
               </w:rPr>
             </w:pPr>
-            <w:proofErr w:type="spellStart"/>
-            <w:r>
-              <w:rPr>
-                <w:rFonts w:ascii="Arial" w:hAnsi="Arial" w:cs="Arial"/>
-              </w:rPr>
-              <w:t>Brayn</w:t>
-            </w:r>
-            <w:proofErr w:type="spellEnd"/>
-            <w:r>
-              <w:rPr>
-                <w:rFonts w:ascii="Arial" w:hAnsi="Arial" w:cs="Arial"/>
-              </w:rPr>
-              <w:t xml:space="preserve"> continuerà con lo sviluppo della mappa mentre Riley svilupperà il </w:t>
-            </w:r>
-            <w:proofErr w:type="spellStart"/>
-            <w:r>
-              <w:rPr>
-                <w:rFonts w:ascii="Arial" w:hAnsi="Arial" w:cs="Arial"/>
-              </w:rPr>
-              <w:t>db</w:t>
-            </w:r>
-            <w:proofErr w:type="spellEnd"/>
-            <w:r>
-              <w:rPr>
-                <w:rFonts w:ascii="Arial" w:hAnsi="Arial" w:cs="Arial"/>
-              </w:rPr>
-              <w:t xml:space="preserve"> effettivo</w:t>
+            <w:r>
+              <w:rPr>
+                <w:rFonts w:ascii="Arial" w:hAnsi="Arial" w:cs="Arial"/>
+              </w:rPr>
+              <w:t>Brayn continuerà con lo sviluppo della mappa mentre Riley svilupperà il db effettivo</w:t>
             </w:r>
           </w:p>
         </w:tc>
@@ -18539,28 +17443,12 @@
                 <w:rFonts w:ascii="Arial" w:hAnsi="Arial" w:cs="Arial"/>
               </w:rPr>
             </w:pPr>
-            <w:proofErr w:type="spellStart"/>
-            <w:r>
-              <w:rPr>
-                <w:rFonts w:ascii="Arial" w:hAnsi="Arial" w:cs="Arial"/>
-              </w:rPr>
-              <w:t>Daily</w:t>
-            </w:r>
-            <w:proofErr w:type="spellEnd"/>
-            <w:r>
-              <w:rPr>
-                <w:rFonts w:ascii="Arial" w:hAnsi="Arial" w:cs="Arial"/>
-              </w:rPr>
-              <w:t xml:space="preserve"> </w:t>
-            </w:r>
-            <w:proofErr w:type="spellStart"/>
-            <w:r>
-              <w:rPr>
-                <w:rFonts w:ascii="Arial" w:hAnsi="Arial" w:cs="Arial"/>
-              </w:rPr>
-              <w:t>Scrum</w:t>
-            </w:r>
-            <w:proofErr w:type="spellEnd"/>
+            <w:r>
+              <w:rPr>
+                <w:rFonts w:ascii="Arial" w:hAnsi="Arial" w:cs="Arial"/>
+              </w:rPr>
+              <w:t>Daily Scrum</w:t>
+            </w:r>
           </w:p>
         </w:tc>
       </w:tr>
@@ -18608,16 +17496,8 @@
               <w:rPr>
                 <w:rFonts w:ascii="Arial" w:hAnsi="Arial" w:cs="Arial"/>
               </w:rPr>
-              <w:t xml:space="preserve">Riley: Terminare l’applicazione delle impostazioni nella </w:t>
-            </w:r>
-            <w:proofErr w:type="spellStart"/>
-            <w:r>
-              <w:rPr>
-                <w:rFonts w:ascii="Arial" w:hAnsi="Arial" w:cs="Arial"/>
-              </w:rPr>
-              <w:t>ui</w:t>
-            </w:r>
-            <w:proofErr w:type="spellEnd"/>
+              <w:t>Riley: Terminare l’applicazione delle impostazioni nella ui</w:t>
+            </w:r>
           </w:p>
           <w:p>
             <w:pPr>
@@ -18816,16 +17696,8 @@
               <w:rPr>
                 <w:rFonts w:ascii="Arial" w:hAnsi="Arial" w:cs="Arial"/>
               </w:rPr>
-              <w:t xml:space="preserve">Sprint </w:t>
-            </w:r>
-            <w:proofErr w:type="spellStart"/>
-            <w:r>
-              <w:rPr>
-                <w:rFonts w:ascii="Arial" w:hAnsi="Arial" w:cs="Arial"/>
-              </w:rPr>
-              <w:t>Retrospective</w:t>
-            </w:r>
-            <w:proofErr w:type="spellEnd"/>
+              <w:t>Sprint Retrospective</w:t>
+            </w:r>
           </w:p>
         </w:tc>
       </w:tr>
@@ -19322,21 +18194,7 @@
             <w:rPr>
               <w:rFonts w:ascii="Arial" w:hAnsi="Arial" w:cs="Arial"/>
             </w:rPr>
-            <w:t xml:space="preserve">Lo script </w:t>
-          </w:r>
-          <w:proofErr w:type="spellStart"/>
-          <w:r>
-            <w:rPr>
-              <w:rFonts w:ascii="Arial" w:hAnsi="Arial" w:cs="Arial"/>
-            </w:rPr>
-            <w:t>SettingsUI</w:t>
-          </w:r>
-          <w:proofErr w:type="spellEnd"/>
-          <w:r>
-            <w:rPr>
-              <w:rFonts w:ascii="Arial" w:hAnsi="Arial" w:cs="Arial"/>
-            </w:rPr>
-            <w:t xml:space="preserve"> sembra essersi isolato dal resto del codice, cosa potrebbe essere la causa?</w:t>
+            <w:t>Lo script SettingsUI sembra essersi isolato dal resto del codice, cosa potrebbe essere la causa?</w:t>
           </w:r>
         </w:p>
         <w:p>
@@ -19867,30 +18725,8 @@
               <w:rPr>
                 <w:rFonts w:ascii="Arial" w:hAnsi="Arial" w:cs="Arial"/>
               </w:rPr>
-              <w:t xml:space="preserve">Inizio sviluppo </w:t>
-            </w:r>
-            <w:proofErr w:type="spellStart"/>
-            <w:r>
-              <w:rPr>
-                <w:rFonts w:ascii="Arial" w:hAnsi="Arial" w:cs="Arial"/>
-              </w:rPr>
-              <w:t>db</w:t>
-            </w:r>
-            <w:proofErr w:type="spellEnd"/>
-            <w:r>
-              <w:rPr>
-                <w:rFonts w:ascii="Arial" w:hAnsi="Arial" w:cs="Arial"/>
-              </w:rPr>
-              <w:t xml:space="preserve"> </w:t>
-            </w:r>
-            <w:proofErr w:type="spellStart"/>
-            <w:r>
-              <w:rPr>
-                <w:rFonts w:ascii="Arial" w:hAnsi="Arial" w:cs="Arial"/>
-              </w:rPr>
-              <w:t>sqlite</w:t>
-            </w:r>
-            <w:proofErr w:type="spellEnd"/>
+              <w:t>Inizio sviluppo db sqlite</w:t>
+            </w:r>
           </w:p>
         </w:tc>
       </w:tr>
@@ -20102,16 +18938,8 @@
               <w:rPr>
                 <w:rFonts w:ascii="Arial" w:hAnsi="Arial" w:cs="Arial"/>
               </w:rPr>
-              <w:t xml:space="preserve">Siamo in largo anticipo, per questo motivo Riley ha cominciato a creare un vero </w:t>
-            </w:r>
-            <w:proofErr w:type="spellStart"/>
-            <w:r>
-              <w:rPr>
-                <w:rFonts w:ascii="Arial" w:hAnsi="Arial" w:cs="Arial"/>
-              </w:rPr>
-              <w:t>db</w:t>
-            </w:r>
-            <w:proofErr w:type="spellEnd"/>
+              <w:t>Siamo in largo anticipo, per questo motivo Riley ha cominciato a creare un vero db</w:t>
+            </w:r>
           </w:p>
         </w:tc>
       </w:tr>
@@ -20168,21 +18996,7 @@
               <w:rPr>
                 <w:rFonts w:ascii="Arial" w:hAnsi="Arial" w:cs="Arial"/>
               </w:rPr>
-              <w:t xml:space="preserve">Continuare rispettivamente lo sviluppo del </w:t>
-            </w:r>
-            <w:proofErr w:type="spellStart"/>
-            <w:r>
-              <w:rPr>
-                <w:rFonts w:ascii="Arial" w:hAnsi="Arial" w:cs="Arial"/>
-              </w:rPr>
-              <w:t>db</w:t>
-            </w:r>
-            <w:proofErr w:type="spellEnd"/>
-            <w:r>
-              <w:rPr>
-                <w:rFonts w:ascii="Arial" w:hAnsi="Arial" w:cs="Arial"/>
-              </w:rPr>
-              <w:t xml:space="preserve"> e della mappa</w:t>
+              <w:t>Continuare rispettivamente lo sviluppo del db e della mappa</w:t>
             </w:r>
           </w:p>
         </w:tc>
@@ -20232,28 +19046,12 @@
                 <w:rFonts w:ascii="Arial" w:hAnsi="Arial" w:cs="Arial"/>
               </w:rPr>
             </w:pPr>
-            <w:proofErr w:type="spellStart"/>
-            <w:r>
-              <w:rPr>
-                <w:rFonts w:ascii="Arial" w:hAnsi="Arial" w:cs="Arial"/>
-              </w:rPr>
-              <w:t>Daily</w:t>
-            </w:r>
-            <w:proofErr w:type="spellEnd"/>
-            <w:r>
-              <w:rPr>
-                <w:rFonts w:ascii="Arial" w:hAnsi="Arial" w:cs="Arial"/>
-              </w:rPr>
-              <w:t xml:space="preserve"> </w:t>
-            </w:r>
-            <w:proofErr w:type="spellStart"/>
-            <w:r>
-              <w:rPr>
-                <w:rFonts w:ascii="Arial" w:hAnsi="Arial" w:cs="Arial"/>
-              </w:rPr>
-              <w:t>Scrum</w:t>
-            </w:r>
-            <w:proofErr w:type="spellEnd"/>
+            <w:r>
+              <w:rPr>
+                <w:rFonts w:ascii="Arial" w:hAnsi="Arial" w:cs="Arial"/>
+              </w:rPr>
+              <w:t>Daily Scrum</w:t>
+            </w:r>
           </w:p>
         </w:tc>
       </w:tr>
@@ -20301,16 +19099,8 @@
               <w:rPr>
                 <w:rFonts w:ascii="Arial" w:hAnsi="Arial" w:cs="Arial"/>
               </w:rPr>
-              <w:t xml:space="preserve">Riley: Inizio sviluppo </w:t>
-            </w:r>
-            <w:proofErr w:type="spellStart"/>
-            <w:r>
-              <w:rPr>
-                <w:rFonts w:ascii="Arial" w:hAnsi="Arial" w:cs="Arial"/>
-              </w:rPr>
-              <w:t>db</w:t>
-            </w:r>
-            <w:proofErr w:type="spellEnd"/>
+              <w:t>Riley: Inizio sviluppo db</w:t>
+            </w:r>
           </w:p>
           <w:p>
             <w:pPr>
@@ -20503,16 +19293,8 @@
               <w:rPr>
                 <w:rFonts w:ascii="Arial" w:hAnsi="Arial" w:cs="Arial"/>
               </w:rPr>
-              <w:t xml:space="preserve">Sprint </w:t>
-            </w:r>
-            <w:proofErr w:type="spellStart"/>
-            <w:r>
-              <w:rPr>
-                <w:rFonts w:ascii="Arial" w:hAnsi="Arial" w:cs="Arial"/>
-              </w:rPr>
-              <w:t>Retrospective</w:t>
-            </w:r>
-            <w:proofErr w:type="spellEnd"/>
+              <w:t>Sprint Retrospective</w:t>
+            </w:r>
           </w:p>
         </w:tc>
       </w:tr>
@@ -20740,25 +19522,7 @@
               <w:b/>
               <w:bCs/>
             </w:rPr>
-            <w:t xml:space="preserve">Nomi </w:t>
-          </w:r>
-          <w:proofErr w:type="gramStart"/>
-          <w:r>
-            <w:rPr>
-              <w:rStyle w:val="Testosegnaposto"/>
-              <w:b/>
-              <w:bCs/>
-            </w:rPr>
-            <w:t>AI</w:t>
-          </w:r>
-          <w:proofErr w:type="gramEnd"/>
-          <w:r>
-            <w:rPr>
-              <w:rStyle w:val="Testosegnaposto"/>
-              <w:b/>
-              <w:bCs/>
-            </w:rPr>
-            <w:t xml:space="preserve"> utilizzati</w:t>
+            <w:t>Nomi AI utilizzati</w:t>
           </w:r>
         </w:sdtContent>
       </w:sdt>
@@ -21756,21 +20520,7 @@
               <w:rPr>
                 <w:rFonts w:ascii="Arial" w:hAnsi="Arial" w:cs="Arial"/>
               </w:rPr>
-              <w:t xml:space="preserve">Rispetto al pianificato abbiamo qualche giornata, di lavoro, di anticipo infatti stiamo principalmente aggiungendo dettagli lavorando con un ritmo adeguato e sviluppando già un </w:t>
-            </w:r>
-            <w:proofErr w:type="spellStart"/>
-            <w:r>
-              <w:rPr>
-                <w:rFonts w:ascii="Arial" w:hAnsi="Arial" w:cs="Arial"/>
-              </w:rPr>
-              <w:t>db</w:t>
-            </w:r>
-            <w:proofErr w:type="spellEnd"/>
-            <w:r>
-              <w:rPr>
-                <w:rFonts w:ascii="Arial" w:hAnsi="Arial" w:cs="Arial"/>
-              </w:rPr>
-              <w:t xml:space="preserve"> più reale</w:t>
+              <w:t>Rispetto al pianificato abbiamo qualche giornata, di lavoro, di anticipo infatti stiamo principalmente aggiungendo dettagli lavorando con un ritmo adeguato e sviluppando già un db più reale</w:t>
             </w:r>
           </w:p>
         </w:tc>
@@ -21828,16 +20578,8 @@
               <w:rPr>
                 <w:rFonts w:ascii="Arial" w:hAnsi="Arial" w:cs="Arial"/>
               </w:rPr>
-              <w:t xml:space="preserve">Procedere con i vari l’aggiunta di dettagli e del </w:t>
-            </w:r>
-            <w:proofErr w:type="spellStart"/>
-            <w:r>
-              <w:rPr>
-                <w:rFonts w:ascii="Arial" w:hAnsi="Arial" w:cs="Arial"/>
-              </w:rPr>
-              <w:t>db</w:t>
-            </w:r>
-            <w:proofErr w:type="spellEnd"/>
+              <w:t>Procedere con i vari l’aggiunta di dettagli e del db</w:t>
+            </w:r>
           </w:p>
         </w:tc>
       </w:tr>
@@ -21886,28 +20628,12 @@
                 <w:rFonts w:ascii="Arial" w:hAnsi="Arial" w:cs="Arial"/>
               </w:rPr>
             </w:pPr>
-            <w:proofErr w:type="spellStart"/>
-            <w:r>
-              <w:rPr>
-                <w:rFonts w:ascii="Arial" w:hAnsi="Arial" w:cs="Arial"/>
-              </w:rPr>
-              <w:t>Daily</w:t>
-            </w:r>
-            <w:proofErr w:type="spellEnd"/>
-            <w:r>
-              <w:rPr>
-                <w:rFonts w:ascii="Arial" w:hAnsi="Arial" w:cs="Arial"/>
-              </w:rPr>
-              <w:t xml:space="preserve"> </w:t>
-            </w:r>
-            <w:proofErr w:type="spellStart"/>
-            <w:r>
-              <w:rPr>
-                <w:rFonts w:ascii="Arial" w:hAnsi="Arial" w:cs="Arial"/>
-              </w:rPr>
-              <w:t>Scrum</w:t>
-            </w:r>
-            <w:proofErr w:type="spellEnd"/>
+            <w:r>
+              <w:rPr>
+                <w:rFonts w:ascii="Arial" w:hAnsi="Arial" w:cs="Arial"/>
+              </w:rPr>
+              <w:t>Daily Scrum</w:t>
+            </w:r>
           </w:p>
         </w:tc>
       </w:tr>
@@ -21967,16 +20693,8 @@
               <w:rPr>
                 <w:rFonts w:ascii="Arial" w:hAnsi="Arial" w:cs="Arial"/>
               </w:rPr>
-              <w:t xml:space="preserve">ontinuo sviluppo </w:t>
-            </w:r>
-            <w:proofErr w:type="spellStart"/>
-            <w:r>
-              <w:rPr>
-                <w:rFonts w:ascii="Arial" w:hAnsi="Arial" w:cs="Arial"/>
-              </w:rPr>
-              <w:t>db</w:t>
-            </w:r>
-            <w:proofErr w:type="spellEnd"/>
+              <w:t>ontinuo sviluppo db</w:t>
+            </w:r>
           </w:p>
           <w:p>
             <w:pPr>
@@ -22169,16 +20887,8 @@
               <w:rPr>
                 <w:rFonts w:ascii="Arial" w:hAnsi="Arial" w:cs="Arial"/>
               </w:rPr>
-              <w:t xml:space="preserve">Sprint </w:t>
-            </w:r>
-            <w:proofErr w:type="spellStart"/>
-            <w:r>
-              <w:rPr>
-                <w:rFonts w:ascii="Arial" w:hAnsi="Arial" w:cs="Arial"/>
-              </w:rPr>
-              <w:t>Retrospective</w:t>
-            </w:r>
-            <w:proofErr w:type="spellEnd"/>
+              <w:t>Sprint Retrospective</w:t>
+            </w:r>
           </w:p>
         </w:tc>
       </w:tr>
@@ -22681,35 +21391,7 @@
             <w:rPr>
               <w:rFonts w:ascii="Arial" w:hAnsi="Arial" w:cs="Arial"/>
             </w:rPr>
-            <w:t xml:space="preserve">non ho fatto dei veri e propri </w:t>
-          </w:r>
-          <w:proofErr w:type="spellStart"/>
-          <w:r>
-            <w:rPr>
-              <w:rFonts w:ascii="Arial" w:hAnsi="Arial" w:cs="Arial"/>
-            </w:rPr>
-            <w:t>promt</w:t>
-          </w:r>
-          <w:proofErr w:type="spellEnd"/>
-          <w:r>
-            <w:rPr>
-              <w:rFonts w:ascii="Arial" w:hAnsi="Arial" w:cs="Arial"/>
-            </w:rPr>
-            <w:t xml:space="preserve"> oggi, ma mi sono cimentato nel procedere con una spiegazione guidata per applicare </w:t>
-          </w:r>
-          <w:proofErr w:type="spellStart"/>
-          <w:r>
-            <w:rPr>
-              <w:rFonts w:ascii="Arial" w:hAnsi="Arial" w:cs="Arial"/>
-            </w:rPr>
-            <w:t>SQLite</w:t>
-          </w:r>
-          <w:proofErr w:type="spellEnd"/>
-          <w:r>
-            <w:rPr>
-              <w:rFonts w:ascii="Arial" w:hAnsi="Arial" w:cs="Arial"/>
-            </w:rPr>
-            <w:t xml:space="preserve"> alla base di dati sviluppata finora.</w:t>
+            <w:t>non ho fatto dei veri e propri promt oggi, ma mi sono cimentato nel procedere con una spiegazione guidata per applicare SQLite alla base di dati sviluppata finora.</w:t>
           </w:r>
         </w:p>
         <w:p>
@@ -23302,21 +21984,7 @@
               <w:rPr>
                 <w:rFonts w:ascii="Arial" w:hAnsi="Arial" w:cs="Arial"/>
               </w:rPr>
-              <w:t xml:space="preserve">Ho sistemato un problema di animazione, creato </w:t>
-            </w:r>
-            <w:proofErr w:type="gramStart"/>
-            <w:r>
-              <w:rPr>
-                <w:rFonts w:ascii="Arial" w:hAnsi="Arial" w:cs="Arial"/>
-              </w:rPr>
-              <w:t>il build</w:t>
-            </w:r>
-            <w:proofErr w:type="gramEnd"/>
-            <w:r>
-              <w:rPr>
-                <w:rFonts w:ascii="Arial" w:hAnsi="Arial" w:cs="Arial"/>
-              </w:rPr>
-              <w:t xml:space="preserve"> del progetto per certi test, ricerca modifica materiali auto ed inizio menu garage</w:t>
+              <w:t>Ho sistemato un problema di animazione, creato il build del progetto per certi test, ricerca modifica materiali auto ed inizio menu garage</w:t>
             </w:r>
           </w:p>
         </w:tc>
@@ -23549,21 +22217,7 @@
               <w:rPr>
                 <w:rFonts w:ascii="Arial" w:hAnsi="Arial" w:cs="Arial"/>
               </w:rPr>
-              <w:t xml:space="preserve">Continuare sviluppo garage e </w:t>
-            </w:r>
-            <w:proofErr w:type="spellStart"/>
-            <w:r>
-              <w:rPr>
-                <w:rFonts w:ascii="Arial" w:hAnsi="Arial" w:cs="Arial"/>
-              </w:rPr>
-              <w:t>db</w:t>
-            </w:r>
-            <w:proofErr w:type="spellEnd"/>
-            <w:r>
-              <w:rPr>
-                <w:rFonts w:ascii="Arial" w:hAnsi="Arial" w:cs="Arial"/>
-              </w:rPr>
-              <w:t>.</w:t>
+              <w:t>Continuare sviluppo garage e db.</w:t>
             </w:r>
           </w:p>
         </w:tc>
@@ -23613,28 +22267,12 @@
                 <w:rFonts w:ascii="Arial" w:hAnsi="Arial" w:cs="Arial"/>
               </w:rPr>
             </w:pPr>
-            <w:proofErr w:type="spellStart"/>
-            <w:r>
-              <w:rPr>
-                <w:rFonts w:ascii="Arial" w:hAnsi="Arial" w:cs="Arial"/>
-              </w:rPr>
-              <w:t>Daily</w:t>
-            </w:r>
-            <w:proofErr w:type="spellEnd"/>
-            <w:r>
-              <w:rPr>
-                <w:rFonts w:ascii="Arial" w:hAnsi="Arial" w:cs="Arial"/>
-              </w:rPr>
-              <w:t xml:space="preserve"> </w:t>
-            </w:r>
-            <w:proofErr w:type="spellStart"/>
-            <w:r>
-              <w:rPr>
-                <w:rFonts w:ascii="Arial" w:hAnsi="Arial" w:cs="Arial"/>
-              </w:rPr>
-              <w:t>Scrum</w:t>
-            </w:r>
-            <w:proofErr w:type="spellEnd"/>
+            <w:r>
+              <w:rPr>
+                <w:rFonts w:ascii="Arial" w:hAnsi="Arial" w:cs="Arial"/>
+              </w:rPr>
+              <w:t>Daily Scrum</w:t>
+            </w:r>
           </w:p>
         </w:tc>
       </w:tr>
@@ -23682,16 +22320,8 @@
               <w:rPr>
                 <w:rFonts w:ascii="Arial" w:hAnsi="Arial" w:cs="Arial"/>
               </w:rPr>
-              <w:t xml:space="preserve">Riley: Continuo sviluppo </w:t>
-            </w:r>
-            <w:proofErr w:type="spellStart"/>
-            <w:r>
-              <w:rPr>
-                <w:rFonts w:ascii="Arial" w:hAnsi="Arial" w:cs="Arial"/>
-              </w:rPr>
-              <w:t>db</w:t>
-            </w:r>
-            <w:proofErr w:type="spellEnd"/>
+              <w:t>Riley: Continuo sviluppo db</w:t>
+            </w:r>
           </w:p>
           <w:p>
             <w:pPr>
@@ -23884,16 +22514,8 @@
               <w:rPr>
                 <w:rFonts w:ascii="Arial" w:hAnsi="Arial" w:cs="Arial"/>
               </w:rPr>
-              <w:t xml:space="preserve">Sprint </w:t>
-            </w:r>
-            <w:proofErr w:type="spellStart"/>
-            <w:r>
-              <w:rPr>
-                <w:rFonts w:ascii="Arial" w:hAnsi="Arial" w:cs="Arial"/>
-              </w:rPr>
-              <w:t>Retrospective</w:t>
-            </w:r>
-            <w:proofErr w:type="spellEnd"/>
+              <w:t>Sprint Retrospective</w:t>
+            </w:r>
           </w:p>
         </w:tc>
       </w:tr>
@@ -24121,25 +22743,7 @@
               <w:b/>
               <w:bCs/>
             </w:rPr>
-            <w:t xml:space="preserve">Nomi </w:t>
-          </w:r>
-          <w:proofErr w:type="gramStart"/>
-          <w:r>
-            <w:rPr>
-              <w:rStyle w:val="Testosegnaposto"/>
-              <w:b/>
-              <w:bCs/>
-            </w:rPr>
-            <w:t>AI</w:t>
-          </w:r>
-          <w:proofErr w:type="gramEnd"/>
-          <w:r>
-            <w:rPr>
-              <w:rStyle w:val="Testosegnaposto"/>
-              <w:b/>
-              <w:bCs/>
-            </w:rPr>
-            <w:t xml:space="preserve"> utilizzati</w:t>
+            <w:t>Nomi AI utilizzati</w:t>
           </w:r>
         </w:sdtContent>
       </w:sdt>
@@ -24918,16 +23522,8 @@
               <w:rPr>
                 <w:rFonts w:ascii="Arial" w:hAnsi="Arial" w:cs="Arial"/>
               </w:rPr>
-              <w:t xml:space="preserve">Continuato lo sviluppo del </w:t>
-            </w:r>
-            <w:proofErr w:type="spellStart"/>
-            <w:r>
-              <w:rPr>
-                <w:rFonts w:ascii="Arial" w:hAnsi="Arial" w:cs="Arial"/>
-              </w:rPr>
-              <w:t>db</w:t>
-            </w:r>
-            <w:proofErr w:type="spellEnd"/>
+              <w:t>Continuato lo sviluppo del db</w:t>
+            </w:r>
           </w:p>
         </w:tc>
       </w:tr>
@@ -25197,35 +23793,7 @@
               <w:rPr>
                 <w:rFonts w:ascii="Arial" w:hAnsi="Arial" w:cs="Arial"/>
               </w:rPr>
-              <w:t xml:space="preserve">Continuare ognuno con </w:t>
-            </w:r>
-            <w:proofErr w:type="gramStart"/>
-            <w:r>
-              <w:rPr>
-                <w:rFonts w:ascii="Arial" w:hAnsi="Arial" w:cs="Arial"/>
-              </w:rPr>
-              <w:t>i</w:t>
-            </w:r>
-            <w:proofErr w:type="gramEnd"/>
-            <w:r>
-              <w:rPr>
-                <w:rFonts w:ascii="Arial" w:hAnsi="Arial" w:cs="Arial"/>
-              </w:rPr>
-              <w:t xml:space="preserve"> sviluppi di </w:t>
-            </w:r>
-            <w:proofErr w:type="spellStart"/>
-            <w:r>
-              <w:rPr>
-                <w:rFonts w:ascii="Arial" w:hAnsi="Arial" w:cs="Arial"/>
-              </w:rPr>
-              <w:t>db</w:t>
-            </w:r>
-            <w:proofErr w:type="spellEnd"/>
-            <w:r>
-              <w:rPr>
-                <w:rFonts w:ascii="Arial" w:hAnsi="Arial" w:cs="Arial"/>
-              </w:rPr>
-              <w:t xml:space="preserve"> e garage</w:t>
+              <w:t>Continuare ognuno con i sviluppi di db e garage</w:t>
             </w:r>
           </w:p>
         </w:tc>
@@ -25275,28 +23843,12 @@
                 <w:rFonts w:ascii="Arial" w:hAnsi="Arial" w:cs="Arial"/>
               </w:rPr>
             </w:pPr>
-            <w:proofErr w:type="spellStart"/>
-            <w:r>
-              <w:rPr>
-                <w:rFonts w:ascii="Arial" w:hAnsi="Arial" w:cs="Arial"/>
-              </w:rPr>
-              <w:t>Daily</w:t>
-            </w:r>
-            <w:proofErr w:type="spellEnd"/>
-            <w:r>
-              <w:rPr>
-                <w:rFonts w:ascii="Arial" w:hAnsi="Arial" w:cs="Arial"/>
-              </w:rPr>
-              <w:t xml:space="preserve"> </w:t>
-            </w:r>
-            <w:proofErr w:type="spellStart"/>
-            <w:r>
-              <w:rPr>
-                <w:rFonts w:ascii="Arial" w:hAnsi="Arial" w:cs="Arial"/>
-              </w:rPr>
-              <w:t>Scrum</w:t>
-            </w:r>
-            <w:proofErr w:type="spellEnd"/>
+            <w:r>
+              <w:rPr>
+                <w:rFonts w:ascii="Arial" w:hAnsi="Arial" w:cs="Arial"/>
+              </w:rPr>
+              <w:t>Daily Scrum</w:t>
+            </w:r>
           </w:p>
         </w:tc>
       </w:tr>
@@ -25344,16 +23896,8 @@
               <w:rPr>
                 <w:rFonts w:ascii="Arial" w:hAnsi="Arial" w:cs="Arial"/>
               </w:rPr>
-              <w:t xml:space="preserve">Riley: Continuo sviluppo </w:t>
-            </w:r>
-            <w:proofErr w:type="spellStart"/>
-            <w:r>
-              <w:rPr>
-                <w:rFonts w:ascii="Arial" w:hAnsi="Arial" w:cs="Arial"/>
-              </w:rPr>
-              <w:t>db</w:t>
-            </w:r>
-            <w:proofErr w:type="spellEnd"/>
+              <w:t>Riley: Continuo sviluppo db</w:t>
+            </w:r>
           </w:p>
           <w:p>
             <w:pPr>
@@ -25546,16 +24090,8 @@
               <w:rPr>
                 <w:rFonts w:ascii="Arial" w:hAnsi="Arial" w:cs="Arial"/>
               </w:rPr>
-              <w:t xml:space="preserve">Sprint </w:t>
-            </w:r>
-            <w:proofErr w:type="spellStart"/>
-            <w:r>
-              <w:rPr>
-                <w:rFonts w:ascii="Arial" w:hAnsi="Arial" w:cs="Arial"/>
-              </w:rPr>
-              <w:t>Retrospective</w:t>
-            </w:r>
-            <w:proofErr w:type="spellEnd"/>
+              <w:t>Sprint Retrospective</w:t>
+            </w:r>
           </w:p>
         </w:tc>
       </w:tr>
@@ -26052,21 +24588,7 @@
             <w:rPr>
               <w:rFonts w:ascii="Arial" w:hAnsi="Arial" w:cs="Arial"/>
             </w:rPr>
-            <w:t xml:space="preserve">Dovrei introdurre nel </w:t>
-          </w:r>
-          <w:proofErr w:type="spellStart"/>
-          <w:r>
-            <w:rPr>
-              <w:rFonts w:ascii="Arial" w:hAnsi="Arial" w:cs="Arial"/>
-            </w:rPr>
-            <w:t>db</w:t>
-          </w:r>
-          <w:proofErr w:type="spellEnd"/>
-          <w:r>
-            <w:rPr>
-              <w:rFonts w:ascii="Arial" w:hAnsi="Arial" w:cs="Arial"/>
-            </w:rPr>
-            <w:t xml:space="preserve"> i comandi collegati alle impostazioni, ma la struttura usata è diversa da quelle precedenti, e viene usata una classe esterna.</w:t>
+            <w:t>Dovrei introdurre nel db i comandi collegati alle impostazioni, ma la struttura usata è diversa da quelle precedenti, e viene usata una classe esterna.</w:t>
           </w:r>
         </w:p>
         <w:p>
@@ -26708,21 +25230,7 @@
               <w:rPr>
                 <w:rFonts w:ascii="Arial" w:hAnsi="Arial" w:cs="Arial"/>
               </w:rPr>
-              <w:t xml:space="preserve">Le statistiche erano scomparse, Bryan ha fatto un </w:t>
-            </w:r>
-            <w:proofErr w:type="spellStart"/>
-            <w:r>
-              <w:rPr>
-                <w:rFonts w:ascii="Arial" w:hAnsi="Arial" w:cs="Arial"/>
-              </w:rPr>
-              <w:t>rollback</w:t>
-            </w:r>
-            <w:proofErr w:type="spellEnd"/>
-            <w:r>
-              <w:rPr>
-                <w:rFonts w:ascii="Arial" w:hAnsi="Arial" w:cs="Arial"/>
-              </w:rPr>
-              <w:t xml:space="preserve"> e quando mi sono state passate non erano collegate in modo concreto, quindi non risultava funzionante. Per risolvere ho semplicemente inserito gli oggetti necessari nei campi dello script</w:t>
+              <w:t>Le statistiche erano scomparse, Bryan ha fatto un rollback e quando mi sono state passate non erano collegate in modo concreto, quindi non risultava funzionante. Per risolvere ho semplicemente inserito gli oggetti necessari nei campi dello script</w:t>
             </w:r>
           </w:p>
         </w:tc>
@@ -26818,16 +25326,8 @@
               <w:rPr>
                 <w:rFonts w:ascii="Arial" w:hAnsi="Arial" w:cs="Arial"/>
               </w:rPr>
-              <w:t xml:space="preserve">Perfettamente in orario ed allineati con grafica e </w:t>
-            </w:r>
-            <w:proofErr w:type="spellStart"/>
-            <w:r>
-              <w:rPr>
-                <w:rFonts w:ascii="Arial" w:hAnsi="Arial" w:cs="Arial"/>
-              </w:rPr>
-              <w:t>backend</w:t>
-            </w:r>
-            <w:proofErr w:type="spellEnd"/>
+              <w:t>Perfettamente in orario ed allineati con grafica e backend</w:t>
+            </w:r>
           </w:p>
         </w:tc>
       </w:tr>
@@ -26934,28 +25434,12 @@
                 <w:rFonts w:ascii="Arial" w:hAnsi="Arial" w:cs="Arial"/>
               </w:rPr>
             </w:pPr>
-            <w:proofErr w:type="spellStart"/>
-            <w:r>
-              <w:rPr>
-                <w:rFonts w:ascii="Arial" w:hAnsi="Arial" w:cs="Arial"/>
-              </w:rPr>
-              <w:t>Daily</w:t>
-            </w:r>
-            <w:proofErr w:type="spellEnd"/>
-            <w:r>
-              <w:rPr>
-                <w:rFonts w:ascii="Arial" w:hAnsi="Arial" w:cs="Arial"/>
-              </w:rPr>
-              <w:t xml:space="preserve"> </w:t>
-            </w:r>
-            <w:proofErr w:type="spellStart"/>
-            <w:r>
-              <w:rPr>
-                <w:rFonts w:ascii="Arial" w:hAnsi="Arial" w:cs="Arial"/>
-              </w:rPr>
-              <w:t>Scrum</w:t>
-            </w:r>
-            <w:proofErr w:type="spellEnd"/>
+            <w:r>
+              <w:rPr>
+                <w:rFonts w:ascii="Arial" w:hAnsi="Arial" w:cs="Arial"/>
+              </w:rPr>
+              <w:t>Daily Scrum</w:t>
+            </w:r>
           </w:p>
         </w:tc>
       </w:tr>
@@ -27003,16 +25487,8 @@
               <w:rPr>
                 <w:rFonts w:ascii="Arial" w:hAnsi="Arial" w:cs="Arial"/>
               </w:rPr>
-              <w:t xml:space="preserve">Riley: Continuo sviluppo </w:t>
-            </w:r>
-            <w:proofErr w:type="spellStart"/>
-            <w:r>
-              <w:rPr>
-                <w:rFonts w:ascii="Arial" w:hAnsi="Arial" w:cs="Arial"/>
-              </w:rPr>
-              <w:t>db</w:t>
-            </w:r>
-            <w:proofErr w:type="spellEnd"/>
+              <w:t>Riley: Continuo sviluppo db</w:t>
+            </w:r>
           </w:p>
           <w:p>
             <w:pPr>
@@ -27205,16 +25681,8 @@
               <w:rPr>
                 <w:rFonts w:ascii="Arial" w:hAnsi="Arial" w:cs="Arial"/>
               </w:rPr>
-              <w:t xml:space="preserve">Sprint </w:t>
-            </w:r>
-            <w:proofErr w:type="spellStart"/>
-            <w:r>
-              <w:rPr>
-                <w:rFonts w:ascii="Arial" w:hAnsi="Arial" w:cs="Arial"/>
-              </w:rPr>
-              <w:t>Retrospective</w:t>
-            </w:r>
-            <w:proofErr w:type="spellEnd"/>
+              <w:t>Sprint Retrospective</w:t>
+            </w:r>
           </w:p>
         </w:tc>
       </w:tr>
@@ -28054,21 +26522,7 @@
         <w:rPr>
           <w:rFonts w:ascii="Arial" w:hAnsi="Arial" w:cs="Arial"/>
         </w:rPr>
-        <w:t xml:space="preserve">Avrei cercato di adattare basandomi </w:t>
-      </w:r>
-      <w:proofErr w:type="spellStart"/>
-      <w:r>
-        <w:rPr>
-          <w:rFonts w:ascii="Arial" w:hAnsi="Arial" w:cs="Arial"/>
-        </w:rPr>
-        <w:t>su i</w:t>
-      </w:r>
-      <w:proofErr w:type="spellEnd"/>
-      <w:r>
-        <w:rPr>
-          <w:rFonts w:ascii="Arial" w:hAnsi="Arial" w:cs="Arial"/>
-        </w:rPr>
-        <w:t xml:space="preserve"> file presenti.</w:t>
+        <w:t>Avrei cercato di adattare basandomi su i file presenti.</w:t>
       </w:r>
     </w:p>
     <w:p>
@@ -28601,28 +27055,12 @@
                 <w:rFonts w:ascii="Arial" w:hAnsi="Arial" w:cs="Arial"/>
               </w:rPr>
             </w:pPr>
-            <w:proofErr w:type="spellStart"/>
-            <w:r>
-              <w:rPr>
-                <w:rFonts w:ascii="Arial" w:hAnsi="Arial" w:cs="Arial"/>
-              </w:rPr>
-              <w:t>Daily</w:t>
-            </w:r>
-            <w:proofErr w:type="spellEnd"/>
-            <w:r>
-              <w:rPr>
-                <w:rFonts w:ascii="Arial" w:hAnsi="Arial" w:cs="Arial"/>
-              </w:rPr>
-              <w:t xml:space="preserve"> </w:t>
-            </w:r>
-            <w:proofErr w:type="spellStart"/>
-            <w:r>
-              <w:rPr>
-                <w:rFonts w:ascii="Arial" w:hAnsi="Arial" w:cs="Arial"/>
-              </w:rPr>
-              <w:t>Scrum</w:t>
-            </w:r>
-            <w:proofErr w:type="spellEnd"/>
+            <w:r>
+              <w:rPr>
+                <w:rFonts w:ascii="Arial" w:hAnsi="Arial" w:cs="Arial"/>
+              </w:rPr>
+              <w:t>Daily Scrum</w:t>
+            </w:r>
           </w:p>
         </w:tc>
       </w:tr>
@@ -28908,16 +27346,8 @@
                 <w:rFonts w:ascii="Arial" w:hAnsi="Arial" w:cs="Arial"/>
               </w:rPr>
               <w:lastRenderedPageBreak/>
-              <w:t xml:space="preserve">Sprint </w:t>
-            </w:r>
-            <w:proofErr w:type="spellStart"/>
-            <w:r>
-              <w:rPr>
-                <w:rFonts w:ascii="Arial" w:hAnsi="Arial" w:cs="Arial"/>
-              </w:rPr>
-              <w:t>Retrospective</w:t>
-            </w:r>
-            <w:proofErr w:type="spellEnd"/>
+              <w:t>Sprint Retrospective</w:t>
+            </w:r>
           </w:p>
         </w:tc>
       </w:tr>
@@ -29414,21 +27844,7 @@
             <w:rPr>
               <w:rFonts w:ascii="Arial" w:hAnsi="Arial" w:cs="Arial"/>
             </w:rPr>
-            <w:t xml:space="preserve">Recentemente ho eseguito un pull e sembra che il </w:t>
-          </w:r>
-          <w:proofErr w:type="spellStart"/>
-          <w:r>
-            <w:rPr>
-              <w:rFonts w:ascii="Arial" w:hAnsi="Arial" w:cs="Arial"/>
-            </w:rPr>
-            <w:t>mergetool</w:t>
-          </w:r>
-          <w:proofErr w:type="spellEnd"/>
-          <w:r>
-            <w:rPr>
-              <w:rFonts w:ascii="Arial" w:hAnsi="Arial" w:cs="Arial"/>
-            </w:rPr>
-            <w:t xml:space="preserve"> sembra non funzionare: &lt;errore&gt;</w:t>
+            <w:t>Recentemente ho eseguito un pull e sembra che il mergetool sembra non funzionare: &lt;errore&gt;</w:t>
           </w:r>
         </w:p>
         <w:p>
@@ -29526,21 +27942,7 @@
             <w:rPr>
               <w:rFonts w:ascii="Arial" w:hAnsi="Arial" w:cs="Arial"/>
             </w:rPr>
-            <w:t xml:space="preserve">Mi ha specificato quale risultava il problema e ha proposto delle soluzioni per sistemare il </w:t>
-          </w:r>
-          <w:proofErr w:type="spellStart"/>
-          <w:r>
-            <w:rPr>
-              <w:rFonts w:ascii="Arial" w:hAnsi="Arial" w:cs="Arial"/>
-            </w:rPr>
-            <w:t>mergetool</w:t>
-          </w:r>
-          <w:proofErr w:type="spellEnd"/>
-          <w:r>
-            <w:rPr>
-              <w:rFonts w:ascii="Arial" w:hAnsi="Arial" w:cs="Arial"/>
-            </w:rPr>
-            <w:t>, poi ho compreso che il problema risultava solo la modifica del medesimo componente nella stessa scena, questo mi ha fatto comprendere i limiti di questo tool.</w:t>
+            <w:t>Mi ha specificato quale risultava il problema e ha proposto delle soluzioni per sistemare il mergetool, poi ho compreso che il problema risultava solo la modifica del medesimo componente nella stessa scena, questo mi ha fatto comprendere i limiti di questo tool.</w:t>
           </w:r>
         </w:p>
         <w:p>
@@ -30300,28 +28702,12 @@
                 <w:rFonts w:ascii="Arial" w:hAnsi="Arial" w:cs="Arial"/>
               </w:rPr>
             </w:pPr>
-            <w:proofErr w:type="spellStart"/>
-            <w:r>
-              <w:rPr>
-                <w:rFonts w:ascii="Arial" w:hAnsi="Arial" w:cs="Arial"/>
-              </w:rPr>
-              <w:t>Daily</w:t>
-            </w:r>
-            <w:proofErr w:type="spellEnd"/>
-            <w:r>
-              <w:rPr>
-                <w:rFonts w:ascii="Arial" w:hAnsi="Arial" w:cs="Arial"/>
-              </w:rPr>
-              <w:t xml:space="preserve"> </w:t>
-            </w:r>
-            <w:proofErr w:type="spellStart"/>
-            <w:r>
-              <w:rPr>
-                <w:rFonts w:ascii="Arial" w:hAnsi="Arial" w:cs="Arial"/>
-              </w:rPr>
-              <w:t>Scrum</w:t>
-            </w:r>
-            <w:proofErr w:type="spellEnd"/>
+            <w:r>
+              <w:rPr>
+                <w:rFonts w:ascii="Arial" w:hAnsi="Arial" w:cs="Arial"/>
+              </w:rPr>
+              <w:t>Daily Scrum</w:t>
+            </w:r>
           </w:p>
         </w:tc>
       </w:tr>
@@ -30569,16 +28955,8 @@
               <w:rPr>
                 <w:rFonts w:ascii="Arial" w:hAnsi="Arial" w:cs="Arial"/>
               </w:rPr>
-              <w:t xml:space="preserve">Sprint </w:t>
-            </w:r>
-            <w:proofErr w:type="spellStart"/>
-            <w:r>
-              <w:rPr>
-                <w:rFonts w:ascii="Arial" w:hAnsi="Arial" w:cs="Arial"/>
-              </w:rPr>
-              <w:t>Retrospective</w:t>
-            </w:r>
-            <w:proofErr w:type="spellEnd"/>
+              <w:t>Sprint Retrospective</w:t>
+            </w:r>
           </w:p>
         </w:tc>
       </w:tr>
@@ -31069,21 +29447,7 @@
             <w:rPr>
               <w:rFonts w:ascii="Arial" w:hAnsi="Arial" w:cs="Arial"/>
             </w:rPr>
-            <w:t xml:space="preserve">Come posso cambiare una scena su </w:t>
-          </w:r>
-          <w:proofErr w:type="spellStart"/>
-          <w:r>
-            <w:rPr>
-              <w:rFonts w:ascii="Arial" w:hAnsi="Arial" w:cs="Arial"/>
-            </w:rPr>
-            <w:t>unity</w:t>
-          </w:r>
-          <w:proofErr w:type="spellEnd"/>
-          <w:r>
-            <w:rPr>
-              <w:rFonts w:ascii="Arial" w:hAnsi="Arial" w:cs="Arial"/>
-            </w:rPr>
-            <w:t>?</w:t>
+            <w:t>Come posso cambiare una scena su unity?</w:t>
           </w:r>
         </w:p>
         <w:p>
@@ -31409,6 +29773,1591 @@
           <w:rFonts w:ascii="Arial" w:hAnsi="Arial" w:cs="Arial"/>
         </w:rPr>
         <w:t>Averi cercato su delle documentazioni ufficiali.</w:t>
+      </w:r>
+    </w:p>
+    <w:p>
+      <w:pPr>
+        <w:pStyle w:val="Nessunaspaziatura"/>
+        <w:rPr>
+          <w:rFonts w:ascii="Arial" w:hAnsi="Arial" w:cs="Arial"/>
+        </w:rPr>
+      </w:pPr>
+      <w:r>
+        <w:rPr>
+          <w:rFonts w:ascii="Arial" w:hAnsi="Arial" w:cs="Arial"/>
+        </w:rPr>
+        <w:t>Bryan:</w:t>
+      </w:r>
+    </w:p>
+    <w:p>
+      <w:pPr>
+        <w:rPr>
+          <w:rFonts w:ascii="Arial" w:hAnsi="Arial" w:cs="Arial"/>
+        </w:rPr>
+      </w:pPr>
+      <w:r>
+        <w:rPr>
+          <w:rFonts w:ascii="Arial" w:hAnsi="Arial" w:cs="Arial"/>
+        </w:rPr>
+        <w:br w:type="page"/>
+      </w:r>
+    </w:p>
+    <w:tbl>
+      <w:tblPr>
+        <w:tblStyle w:val="Grigliatabella"/>
+        <w:tblW w:w="5000" w:type="pct"/>
+        <w:tblLook w:val="04A0" w:firstRow="1" w:lastRow="0" w:firstColumn="1" w:lastColumn="0" w:noHBand="0" w:noVBand="1"/>
+      </w:tblPr>
+      <w:tblGrid>
+        <w:gridCol w:w="2407"/>
+        <w:gridCol w:w="7221"/>
+      </w:tblGrid>
+      <w:tr>
+        <w:trPr>
+          <w:trHeight w:val="199"/>
+        </w:trPr>
+        <w:tc>
+          <w:tcPr>
+            <w:tcW w:w="1250" w:type="pct"/>
+            <w:vAlign w:val="center"/>
+          </w:tcPr>
+          <w:p>
+            <w:pPr>
+              <w:rPr>
+                <w:rFonts w:ascii="Arial" w:hAnsi="Arial" w:cs="Arial"/>
+              </w:rPr>
+            </w:pPr>
+            <w:r>
+              <w:rPr>
+                <w:rFonts w:ascii="Arial" w:hAnsi="Arial" w:cs="Arial"/>
+              </w:rPr>
+              <w:lastRenderedPageBreak/>
+              <w:t>Luogo</w:t>
+            </w:r>
+          </w:p>
+        </w:tc>
+        <w:tc>
+          <w:tcPr>
+            <w:tcW w:w="3750" w:type="pct"/>
+            <w:vAlign w:val="center"/>
+          </w:tcPr>
+          <w:p>
+            <w:pPr>
+              <w:rPr>
+                <w:rFonts w:ascii="Arial" w:hAnsi="Arial" w:cs="Arial"/>
+              </w:rPr>
+            </w:pPr>
+            <w:r>
+              <w:rPr>
+                <w:rFonts w:ascii="Arial" w:hAnsi="Arial" w:cs="Arial"/>
+              </w:rPr>
+              <w:t>Scuola Arti e Mestieri Trevano</w:t>
+            </w:r>
+          </w:p>
+        </w:tc>
+      </w:tr>
+      <w:tr>
+        <w:trPr>
+          <w:trHeight w:val="196"/>
+        </w:trPr>
+        <w:tc>
+          <w:tcPr>
+            <w:tcW w:w="1250" w:type="pct"/>
+            <w:vAlign w:val="center"/>
+          </w:tcPr>
+          <w:p>
+            <w:pPr>
+              <w:rPr>
+                <w:rFonts w:ascii="Arial" w:hAnsi="Arial" w:cs="Arial"/>
+              </w:rPr>
+            </w:pPr>
+            <w:r>
+              <w:rPr>
+                <w:rFonts w:ascii="Arial" w:hAnsi="Arial" w:cs="Arial"/>
+              </w:rPr>
+              <w:t>Data</w:t>
+            </w:r>
+          </w:p>
+        </w:tc>
+        <w:tc>
+          <w:tcPr>
+            <w:tcW w:w="3750" w:type="pct"/>
+            <w:vAlign w:val="center"/>
+          </w:tcPr>
+          <w:p>
+            <w:pPr>
+              <w:rPr>
+                <w:rFonts w:ascii="Arial" w:hAnsi="Arial" w:cs="Arial"/>
+              </w:rPr>
+            </w:pPr>
+            <w:r>
+              <w:rPr>
+                <w:rFonts w:ascii="Arial" w:hAnsi="Arial" w:cs="Arial"/>
+              </w:rPr>
+              <w:t>13.10.2026</w:t>
+            </w:r>
+          </w:p>
+        </w:tc>
+      </w:tr>
+    </w:tbl>
+    <w:p>
+      <w:pPr>
+        <w:rPr>
+          <w:rFonts w:ascii="Arial" w:hAnsi="Arial" w:cs="Arial"/>
+        </w:rPr>
+      </w:pPr>
+    </w:p>
+    <w:tbl>
+      <w:tblPr>
+        <w:tblStyle w:val="Grigliatabella"/>
+        <w:tblW w:w="0" w:type="auto"/>
+        <w:tblLook w:val="04A0" w:firstRow="1" w:lastRow="0" w:firstColumn="1" w:lastColumn="0" w:noHBand="0" w:noVBand="1"/>
+      </w:tblPr>
+      <w:tblGrid>
+        <w:gridCol w:w="1271"/>
+        <w:gridCol w:w="8357"/>
+      </w:tblGrid>
+      <w:tr>
+        <w:tc>
+          <w:tcPr>
+            <w:tcW w:w="9628" w:type="dxa"/>
+            <w:gridSpan w:val="2"/>
+            <w:shd w:val="clear" w:color="auto" w:fill="D9D9D9" w:themeFill="background1" w:themeFillShade="D9"/>
+          </w:tcPr>
+          <w:p>
+            <w:pPr>
+              <w:rPr>
+                <w:rFonts w:ascii="Arial" w:hAnsi="Arial" w:cs="Arial"/>
+              </w:rPr>
+            </w:pPr>
+            <w:r>
+              <w:rPr>
+                <w:rFonts w:ascii="Arial" w:hAnsi="Arial" w:cs="Arial"/>
+              </w:rPr>
+              <w:t>Lavori svolti</w:t>
+            </w:r>
+          </w:p>
+        </w:tc>
+      </w:tr>
+      <w:tr>
+        <w:tc>
+          <w:tcPr>
+            <w:tcW w:w="1271" w:type="dxa"/>
+          </w:tcPr>
+          <w:p>
+            <w:pPr>
+              <w:rPr>
+                <w:rFonts w:ascii="Arial" w:hAnsi="Arial" w:cs="Arial"/>
+              </w:rPr>
+            </w:pPr>
+            <w:r>
+              <w:rPr>
+                <w:rFonts w:ascii="Arial" w:hAnsi="Arial" w:cs="Arial"/>
+              </w:rPr>
+              <w:t>Riley</w:t>
+            </w:r>
+          </w:p>
+        </w:tc>
+        <w:tc>
+          <w:tcPr>
+            <w:tcW w:w="8357" w:type="dxa"/>
+          </w:tcPr>
+          <w:p>
+            <w:pPr>
+              <w:rPr>
+                <w:rFonts w:ascii="Arial" w:hAnsi="Arial" w:cs="Arial"/>
+              </w:rPr>
+            </w:pPr>
+            <w:r>
+              <w:rPr>
+                <w:rFonts w:ascii="Arial" w:hAnsi="Arial" w:cs="Arial"/>
+              </w:rPr>
+              <w:t>Permesso un cambiamento della scena, ancora migliorabile, potrebbe avere delle falle, e cominciato con un’analisi per creare il controllo della telecamera</w:t>
+            </w:r>
+          </w:p>
+        </w:tc>
+      </w:tr>
+      <w:tr>
+        <w:tc>
+          <w:tcPr>
+            <w:tcW w:w="1271" w:type="dxa"/>
+          </w:tcPr>
+          <w:p>
+            <w:pPr>
+              <w:rPr>
+                <w:rFonts w:ascii="Arial" w:hAnsi="Arial" w:cs="Arial"/>
+              </w:rPr>
+            </w:pPr>
+            <w:r>
+              <w:rPr>
+                <w:rFonts w:ascii="Arial" w:hAnsi="Arial" w:cs="Arial"/>
+              </w:rPr>
+              <w:t>Bryan</w:t>
+            </w:r>
+          </w:p>
+        </w:tc>
+        <w:tc>
+          <w:tcPr>
+            <w:tcW w:w="8357" w:type="dxa"/>
+          </w:tcPr>
+          <w:p>
+            <w:pPr>
+              <w:rPr>
+                <w:rFonts w:ascii="Arial" w:hAnsi="Arial" w:cs="Arial"/>
+              </w:rPr>
+            </w:pPr>
+            <w:r>
+              <w:rPr>
+                <w:rFonts w:ascii="Arial" w:hAnsi="Arial" w:cs="Arial"/>
+              </w:rPr>
+              <w:t>Applicato collisioni e fisiche prima di iniziare il movimento</w:t>
+            </w:r>
+          </w:p>
+        </w:tc>
+      </w:tr>
+    </w:tbl>
+    <w:p>
+      <w:pPr>
+        <w:rPr>
+          <w:rFonts w:ascii="Arial" w:hAnsi="Arial" w:cs="Arial"/>
+        </w:rPr>
+      </w:pPr>
+    </w:p>
+    <w:tbl>
+      <w:tblPr>
+        <w:tblStyle w:val="Grigliatabella"/>
+        <w:tblW w:w="0" w:type="auto"/>
+        <w:tblInd w:w="-5" w:type="dxa"/>
+        <w:tblLook w:val="04A0" w:firstRow="1" w:lastRow="0" w:firstColumn="1" w:lastColumn="0" w:noHBand="0" w:noVBand="1"/>
+      </w:tblPr>
+      <w:tblGrid>
+        <w:gridCol w:w="1276"/>
+        <w:gridCol w:w="8357"/>
+      </w:tblGrid>
+      <w:tr>
+        <w:tc>
+          <w:tcPr>
+            <w:tcW w:w="9628" w:type="dxa"/>
+            <w:gridSpan w:val="2"/>
+            <w:shd w:val="clear" w:color="auto" w:fill="D9D9D9" w:themeFill="background1" w:themeFillShade="D9"/>
+          </w:tcPr>
+          <w:p>
+            <w:pPr>
+              <w:rPr>
+                <w:rFonts w:ascii="Arial" w:hAnsi="Arial" w:cs="Arial"/>
+              </w:rPr>
+            </w:pPr>
+            <w:r>
+              <w:rPr>
+                <w:rFonts w:ascii="Arial" w:hAnsi="Arial" w:cs="Arial"/>
+              </w:rPr>
+              <w:t>Problemi riscontrati e soluzioni adottate</w:t>
+            </w:r>
+          </w:p>
+        </w:tc>
+      </w:tr>
+      <w:tr>
+        <w:tc>
+          <w:tcPr>
+            <w:tcW w:w="1276" w:type="dxa"/>
+          </w:tcPr>
+          <w:p>
+            <w:pPr>
+              <w:rPr>
+                <w:rFonts w:ascii="Arial" w:hAnsi="Arial" w:cs="Arial"/>
+              </w:rPr>
+            </w:pPr>
+            <w:r>
+              <w:rPr>
+                <w:rFonts w:ascii="Arial" w:hAnsi="Arial" w:cs="Arial"/>
+              </w:rPr>
+              <w:t>Riley</w:t>
+            </w:r>
+          </w:p>
+        </w:tc>
+        <w:tc>
+          <w:tcPr>
+            <w:tcW w:w="8357" w:type="dxa"/>
+          </w:tcPr>
+          <w:p>
+            <w:pPr>
+              <w:rPr>
+                <w:rFonts w:ascii="Arial" w:hAnsi="Arial" w:cs="Arial"/>
+              </w:rPr>
+            </w:pPr>
+            <w:r>
+              <w:rPr>
+                <w:rFonts w:ascii="Arial" w:hAnsi="Arial" w:cs="Arial"/>
+              </w:rPr>
+              <w:t>-</w:t>
+            </w:r>
+          </w:p>
+        </w:tc>
+      </w:tr>
+      <w:tr>
+        <w:tc>
+          <w:tcPr>
+            <w:tcW w:w="1276" w:type="dxa"/>
+          </w:tcPr>
+          <w:p>
+            <w:pPr>
+              <w:rPr>
+                <w:rFonts w:ascii="Arial" w:hAnsi="Arial" w:cs="Arial"/>
+              </w:rPr>
+            </w:pPr>
+            <w:r>
+              <w:rPr>
+                <w:rFonts w:ascii="Arial" w:hAnsi="Arial" w:cs="Arial"/>
+              </w:rPr>
+              <w:t>Bryan</w:t>
+            </w:r>
+          </w:p>
+        </w:tc>
+        <w:tc>
+          <w:tcPr>
+            <w:tcW w:w="8357" w:type="dxa"/>
+          </w:tcPr>
+          <w:p>
+            <w:pPr>
+              <w:rPr>
+                <w:rFonts w:ascii="Arial" w:hAnsi="Arial" w:cs="Arial"/>
+              </w:rPr>
+            </w:pPr>
+            <w:r>
+              <w:rPr>
+                <w:rFonts w:ascii="Arial" w:hAnsi="Arial" w:cs="Arial"/>
+              </w:rPr>
+              <w:t>-</w:t>
+            </w:r>
+          </w:p>
+        </w:tc>
+      </w:tr>
+    </w:tbl>
+    <w:p>
+      <w:pPr>
+        <w:rPr>
+          <w:rFonts w:ascii="Arial" w:hAnsi="Arial" w:cs="Arial"/>
+        </w:rPr>
+      </w:pPr>
+    </w:p>
+    <w:tbl>
+      <w:tblPr>
+        <w:tblStyle w:val="Grigliatabella"/>
+        <w:tblW w:w="0" w:type="auto"/>
+        <w:tblLook w:val="04A0" w:firstRow="1" w:lastRow="0" w:firstColumn="1" w:lastColumn="0" w:noHBand="0" w:noVBand="1"/>
+      </w:tblPr>
+      <w:tblGrid>
+        <w:gridCol w:w="9628"/>
+      </w:tblGrid>
+      <w:tr>
+        <w:tc>
+          <w:tcPr>
+            <w:tcW w:w="9854" w:type="dxa"/>
+            <w:shd w:val="clear" w:color="auto" w:fill="D9D9D9" w:themeFill="background1" w:themeFillShade="D9"/>
+          </w:tcPr>
+          <w:p>
+            <w:pPr>
+              <w:rPr>
+                <w:rFonts w:ascii="Arial" w:hAnsi="Arial" w:cs="Arial"/>
+              </w:rPr>
+            </w:pPr>
+            <w:r>
+              <w:rPr>
+                <w:rFonts w:ascii="Arial" w:hAnsi="Arial" w:cs="Arial"/>
+              </w:rPr>
+              <w:t>Punto della situazione rispetto alla pianificazione</w:t>
+            </w:r>
+          </w:p>
+        </w:tc>
+      </w:tr>
+      <w:tr>
+        <w:tc>
+          <w:tcPr>
+            <w:tcW w:w="9854" w:type="dxa"/>
+          </w:tcPr>
+          <w:p>
+            <w:pPr>
+              <w:rPr>
+                <w:rFonts w:ascii="Arial" w:hAnsi="Arial" w:cs="Arial"/>
+              </w:rPr>
+            </w:pPr>
+            <w:r>
+              <w:rPr>
+                <w:rFonts w:ascii="Arial" w:hAnsi="Arial" w:cs="Arial"/>
+              </w:rPr>
+              <w:t>Procedendo come previsto</w:t>
+            </w:r>
+          </w:p>
+        </w:tc>
+      </w:tr>
+    </w:tbl>
+    <w:p>
+      <w:pPr>
+        <w:rPr>
+          <w:rFonts w:ascii="Arial" w:hAnsi="Arial" w:cs="Arial"/>
+        </w:rPr>
+      </w:pPr>
+    </w:p>
+    <w:tbl>
+      <w:tblPr>
+        <w:tblStyle w:val="Grigliatabella"/>
+        <w:tblW w:w="0" w:type="auto"/>
+        <w:tblLook w:val="04A0" w:firstRow="1" w:lastRow="0" w:firstColumn="1" w:lastColumn="0" w:noHBand="0" w:noVBand="1"/>
+      </w:tblPr>
+      <w:tblGrid>
+        <w:gridCol w:w="9628"/>
+      </w:tblGrid>
+      <w:tr>
+        <w:tc>
+          <w:tcPr>
+            <w:tcW w:w="9854" w:type="dxa"/>
+            <w:shd w:val="clear" w:color="auto" w:fill="D9D9D9" w:themeFill="background1" w:themeFillShade="D9"/>
+          </w:tcPr>
+          <w:p>
+            <w:pPr>
+              <w:rPr>
+                <w:rFonts w:ascii="Arial" w:hAnsi="Arial" w:cs="Arial"/>
+              </w:rPr>
+            </w:pPr>
+            <w:r>
+              <w:rPr>
+                <w:rFonts w:ascii="Arial" w:hAnsi="Arial" w:cs="Arial"/>
+              </w:rPr>
+              <w:t>Programma di massima per la prossima giornata di lavoro</w:t>
+            </w:r>
+          </w:p>
+        </w:tc>
+      </w:tr>
+      <w:tr>
+        <w:tc>
+          <w:tcPr>
+            <w:tcW w:w="9854" w:type="dxa"/>
+          </w:tcPr>
+          <w:p>
+            <w:pPr>
+              <w:rPr>
+                <w:rFonts w:ascii="Arial" w:hAnsi="Arial" w:cs="Arial"/>
+              </w:rPr>
+            </w:pPr>
+            <w:r>
+              <w:rPr>
+                <w:rFonts w:ascii="Arial" w:hAnsi="Arial" w:cs="Arial"/>
+              </w:rPr>
+              <w:t>Procedere con il movimento della telecamera ed il movimento</w:t>
+            </w:r>
+          </w:p>
+        </w:tc>
+      </w:tr>
+    </w:tbl>
+    <w:p>
+      <w:pPr>
+        <w:rPr>
+          <w:rFonts w:ascii="Arial" w:hAnsi="Arial" w:cs="Arial"/>
+        </w:rPr>
+      </w:pPr>
+    </w:p>
+    <w:p>
+      <w:pPr>
+        <w:pStyle w:val="Titolo1"/>
+      </w:pPr>
+      <w:r>
+        <w:t>Agile - Resoconto</w:t>
+      </w:r>
+    </w:p>
+    <w:tbl>
+      <w:tblPr>
+        <w:tblStyle w:val="Grigliatabella"/>
+        <w:tblW w:w="0" w:type="auto"/>
+        <w:tblLook w:val="04A0" w:firstRow="1" w:lastRow="0" w:firstColumn="1" w:lastColumn="0" w:noHBand="0" w:noVBand="1"/>
+      </w:tblPr>
+      <w:tblGrid>
+        <w:gridCol w:w="9628"/>
+      </w:tblGrid>
+      <w:tr>
+        <w:tc>
+          <w:tcPr>
+            <w:tcW w:w="9628" w:type="dxa"/>
+            <w:tcBorders>
+              <w:top w:val="single" w:sz="4" w:space="0" w:color="auto"/>
+              <w:left w:val="single" w:sz="4" w:space="0" w:color="auto"/>
+              <w:bottom w:val="single" w:sz="4" w:space="0" w:color="auto"/>
+              <w:right w:val="single" w:sz="4" w:space="0" w:color="auto"/>
+            </w:tcBorders>
+            <w:shd w:val="clear" w:color="auto" w:fill="D9D9D9" w:themeFill="background1" w:themeFillShade="D9"/>
+            <w:hideMark/>
+          </w:tcPr>
+          <w:p>
+            <w:pPr>
+              <w:spacing w:after="200" w:line="276" w:lineRule="auto"/>
+              <w:rPr>
+                <w:rFonts w:ascii="Arial" w:hAnsi="Arial" w:cs="Arial"/>
+              </w:rPr>
+            </w:pPr>
+            <w:r>
+              <w:rPr>
+                <w:rFonts w:ascii="Arial" w:hAnsi="Arial" w:cs="Arial"/>
+              </w:rPr>
+              <w:t>Daily Scrum</w:t>
+            </w:r>
+          </w:p>
+        </w:tc>
+      </w:tr>
+      <w:tr>
+        <w:tc>
+          <w:tcPr>
+            <w:tcW w:w="9628" w:type="dxa"/>
+            <w:tcBorders>
+              <w:top w:val="single" w:sz="4" w:space="0" w:color="auto"/>
+              <w:left w:val="single" w:sz="4" w:space="0" w:color="auto"/>
+              <w:bottom w:val="single" w:sz="4" w:space="0" w:color="auto"/>
+              <w:right w:val="single" w:sz="4" w:space="0" w:color="auto"/>
+            </w:tcBorders>
+            <w:hideMark/>
+          </w:tcPr>
+          <w:p>
+            <w:pPr>
+              <w:spacing w:after="200" w:line="276" w:lineRule="auto"/>
+              <w:rPr>
+                <w:rFonts w:ascii="Arial" w:hAnsi="Arial" w:cs="Arial"/>
+              </w:rPr>
+            </w:pPr>
+          </w:p>
+        </w:tc>
+      </w:tr>
+      <w:tr>
+        <w:tc>
+          <w:tcPr>
+            <w:tcW w:w="9628" w:type="dxa"/>
+            <w:tcBorders>
+              <w:top w:val="single" w:sz="4" w:space="0" w:color="auto"/>
+              <w:left w:val="single" w:sz="4" w:space="0" w:color="auto"/>
+              <w:bottom w:val="single" w:sz="4" w:space="0" w:color="auto"/>
+              <w:right w:val="single" w:sz="4" w:space="0" w:color="auto"/>
+            </w:tcBorders>
+          </w:tcPr>
+          <w:p>
+            <w:pPr>
+              <w:spacing w:after="200" w:line="276" w:lineRule="auto"/>
+              <w:rPr>
+                <w:rFonts w:ascii="Arial" w:hAnsi="Arial" w:cs="Arial"/>
+              </w:rPr>
+            </w:pPr>
+            <w:r>
+              <w:rPr>
+                <w:rFonts w:ascii="Arial" w:hAnsi="Arial" w:cs="Arial"/>
+              </w:rPr>
+              <w:t xml:space="preserve">Riley: </w:t>
+            </w:r>
+            <w:r>
+              <w:rPr>
+                <w:rFonts w:ascii="Arial" w:hAnsi="Arial" w:cs="Arial"/>
+              </w:rPr>
+              <w:t>Sviluppo movimento telecamera e cambiamento sensibilità</w:t>
+            </w:r>
+          </w:p>
+          <w:p>
+            <w:pPr>
+              <w:spacing w:after="200" w:line="276" w:lineRule="auto"/>
+              <w:rPr>
+                <w:rFonts w:ascii="Arial" w:hAnsi="Arial" w:cs="Arial"/>
+              </w:rPr>
+            </w:pPr>
+            <w:r>
+              <w:rPr>
+                <w:rFonts w:ascii="Arial" w:hAnsi="Arial" w:cs="Arial"/>
+              </w:rPr>
+              <w:t>Bryan:</w:t>
+            </w:r>
+            <w:r>
+              <w:rPr>
+                <w:rFonts w:ascii="Arial" w:hAnsi="Arial" w:cs="Arial"/>
+              </w:rPr>
+              <w:t xml:space="preserve"> Continuo</w:t>
+            </w:r>
+            <w:r>
+              <w:rPr>
+                <w:rFonts w:ascii="Arial" w:hAnsi="Arial" w:cs="Arial"/>
+              </w:rPr>
+              <w:t xml:space="preserve"> sviluppo sistema movimento</w:t>
+            </w:r>
+          </w:p>
+        </w:tc>
+      </w:tr>
+    </w:tbl>
+    <w:p>
+      <w:pPr>
+        <w:rPr>
+          <w:rFonts w:ascii="Arial" w:hAnsi="Arial" w:cs="Arial"/>
+        </w:rPr>
+      </w:pPr>
+    </w:p>
+    <w:tbl>
+      <w:tblPr>
+        <w:tblStyle w:val="Grigliatabella"/>
+        <w:tblW w:w="0" w:type="auto"/>
+        <w:tblLook w:val="04A0" w:firstRow="1" w:lastRow="0" w:firstColumn="1" w:lastColumn="0" w:noHBand="0" w:noVBand="1"/>
+      </w:tblPr>
+      <w:tblGrid>
+        <w:gridCol w:w="9628"/>
+      </w:tblGrid>
+      <w:tr>
+        <w:tc>
+          <w:tcPr>
+            <w:tcW w:w="9854" w:type="dxa"/>
+            <w:tcBorders>
+              <w:top w:val="single" w:sz="4" w:space="0" w:color="auto"/>
+              <w:left w:val="single" w:sz="4" w:space="0" w:color="auto"/>
+              <w:bottom w:val="single" w:sz="4" w:space="0" w:color="auto"/>
+              <w:right w:val="single" w:sz="4" w:space="0" w:color="auto"/>
+            </w:tcBorders>
+            <w:shd w:val="clear" w:color="auto" w:fill="D9D9D9" w:themeFill="background1" w:themeFillShade="D9"/>
+            <w:hideMark/>
+          </w:tcPr>
+          <w:p>
+            <w:pPr>
+              <w:spacing w:after="200" w:line="276" w:lineRule="auto"/>
+              <w:rPr>
+                <w:rFonts w:ascii="Arial" w:hAnsi="Arial" w:cs="Arial"/>
+              </w:rPr>
+            </w:pPr>
+            <w:r>
+              <w:rPr>
+                <w:rFonts w:ascii="Arial" w:hAnsi="Arial" w:cs="Arial"/>
+              </w:rPr>
+              <w:t>Sprint Planning</w:t>
+            </w:r>
+          </w:p>
+        </w:tc>
+      </w:tr>
+      <w:tr>
+        <w:tc>
+          <w:tcPr>
+            <w:tcW w:w="9854" w:type="dxa"/>
+            <w:tcBorders>
+              <w:top w:val="single" w:sz="4" w:space="0" w:color="auto"/>
+              <w:left w:val="single" w:sz="4" w:space="0" w:color="auto"/>
+              <w:bottom w:val="single" w:sz="4" w:space="0" w:color="auto"/>
+              <w:right w:val="single" w:sz="4" w:space="0" w:color="auto"/>
+            </w:tcBorders>
+          </w:tcPr>
+          <w:p>
+            <w:pPr>
+              <w:spacing w:after="200" w:line="276" w:lineRule="auto"/>
+              <w:rPr>
+                <w:rFonts w:ascii="Arial" w:hAnsi="Arial" w:cs="Arial"/>
+              </w:rPr>
+            </w:pPr>
+          </w:p>
+        </w:tc>
+      </w:tr>
+    </w:tbl>
+    <w:p>
+      <w:pPr>
+        <w:rPr>
+          <w:rFonts w:ascii="Arial" w:hAnsi="Arial" w:cs="Arial"/>
+        </w:rPr>
+      </w:pPr>
+    </w:p>
+    <w:tbl>
+      <w:tblPr>
+        <w:tblStyle w:val="Grigliatabella"/>
+        <w:tblW w:w="0" w:type="auto"/>
+        <w:tblLook w:val="04A0" w:firstRow="1" w:lastRow="0" w:firstColumn="1" w:lastColumn="0" w:noHBand="0" w:noVBand="1"/>
+      </w:tblPr>
+      <w:tblGrid>
+        <w:gridCol w:w="9628"/>
+      </w:tblGrid>
+      <w:tr>
+        <w:tc>
+          <w:tcPr>
+            <w:tcW w:w="9854" w:type="dxa"/>
+            <w:tcBorders>
+              <w:top w:val="single" w:sz="4" w:space="0" w:color="auto"/>
+              <w:left w:val="single" w:sz="4" w:space="0" w:color="auto"/>
+              <w:bottom w:val="single" w:sz="4" w:space="0" w:color="auto"/>
+              <w:right w:val="single" w:sz="4" w:space="0" w:color="auto"/>
+            </w:tcBorders>
+            <w:shd w:val="clear" w:color="auto" w:fill="D9D9D9" w:themeFill="background1" w:themeFillShade="D9"/>
+            <w:hideMark/>
+          </w:tcPr>
+          <w:p>
+            <w:pPr>
+              <w:spacing w:after="200" w:line="276" w:lineRule="auto"/>
+              <w:rPr>
+                <w:rFonts w:ascii="Arial" w:hAnsi="Arial" w:cs="Arial"/>
+              </w:rPr>
+            </w:pPr>
+            <w:r>
+              <w:rPr>
+                <w:rFonts w:ascii="Arial" w:hAnsi="Arial" w:cs="Arial"/>
+              </w:rPr>
+              <w:t>Sprint Review</w:t>
+            </w:r>
+          </w:p>
+        </w:tc>
+      </w:tr>
+      <w:tr>
+        <w:tc>
+          <w:tcPr>
+            <w:tcW w:w="9854" w:type="dxa"/>
+            <w:tcBorders>
+              <w:top w:val="single" w:sz="4" w:space="0" w:color="auto"/>
+              <w:left w:val="single" w:sz="4" w:space="0" w:color="auto"/>
+              <w:bottom w:val="single" w:sz="4" w:space="0" w:color="auto"/>
+              <w:right w:val="single" w:sz="4" w:space="0" w:color="auto"/>
+            </w:tcBorders>
+          </w:tcPr>
+          <w:p>
+            <w:pPr>
+              <w:spacing w:after="200" w:line="276" w:lineRule="auto"/>
+              <w:rPr>
+                <w:rFonts w:ascii="Arial" w:hAnsi="Arial" w:cs="Arial"/>
+              </w:rPr>
+            </w:pPr>
+          </w:p>
+        </w:tc>
+      </w:tr>
+    </w:tbl>
+    <w:p>
+      <w:pPr>
+        <w:rPr>
+          <w:rFonts w:ascii="Arial" w:hAnsi="Arial" w:cs="Arial"/>
+        </w:rPr>
+      </w:pPr>
+    </w:p>
+    <w:tbl>
+      <w:tblPr>
+        <w:tblStyle w:val="Grigliatabella"/>
+        <w:tblW w:w="0" w:type="auto"/>
+        <w:tblLook w:val="04A0" w:firstRow="1" w:lastRow="0" w:firstColumn="1" w:lastColumn="0" w:noHBand="0" w:noVBand="1"/>
+      </w:tblPr>
+      <w:tblGrid>
+        <w:gridCol w:w="9628"/>
+      </w:tblGrid>
+      <w:tr>
+        <w:tc>
+          <w:tcPr>
+            <w:tcW w:w="9854" w:type="dxa"/>
+            <w:tcBorders>
+              <w:top w:val="single" w:sz="4" w:space="0" w:color="auto"/>
+              <w:left w:val="single" w:sz="4" w:space="0" w:color="auto"/>
+              <w:bottom w:val="single" w:sz="4" w:space="0" w:color="auto"/>
+              <w:right w:val="single" w:sz="4" w:space="0" w:color="auto"/>
+            </w:tcBorders>
+            <w:shd w:val="clear" w:color="auto" w:fill="D9D9D9" w:themeFill="background1" w:themeFillShade="D9"/>
+            <w:hideMark/>
+          </w:tcPr>
+          <w:p>
+            <w:pPr>
+              <w:spacing w:after="200" w:line="276" w:lineRule="auto"/>
+              <w:rPr>
+                <w:rFonts w:ascii="Arial" w:hAnsi="Arial" w:cs="Arial"/>
+              </w:rPr>
+            </w:pPr>
+            <w:r>
+              <w:rPr>
+                <w:rFonts w:ascii="Arial" w:hAnsi="Arial" w:cs="Arial"/>
+              </w:rPr>
+              <w:t>Sprint Retrospective</w:t>
+            </w:r>
+          </w:p>
+        </w:tc>
+      </w:tr>
+      <w:tr>
+        <w:tc>
+          <w:tcPr>
+            <w:tcW w:w="9854" w:type="dxa"/>
+            <w:tcBorders>
+              <w:top w:val="single" w:sz="4" w:space="0" w:color="auto"/>
+              <w:left w:val="single" w:sz="4" w:space="0" w:color="auto"/>
+              <w:bottom w:val="single" w:sz="4" w:space="0" w:color="auto"/>
+              <w:right w:val="single" w:sz="4" w:space="0" w:color="auto"/>
+            </w:tcBorders>
+          </w:tcPr>
+          <w:p>
+            <w:pPr>
+              <w:spacing w:after="200" w:line="276" w:lineRule="auto"/>
+              <w:rPr>
+                <w:rFonts w:ascii="Arial" w:hAnsi="Arial" w:cs="Arial"/>
+              </w:rPr>
+            </w:pPr>
+          </w:p>
+        </w:tc>
+      </w:tr>
+    </w:tbl>
+    <w:p>
+      <w:pPr>
+        <w:rPr>
+          <w:rFonts w:ascii="Arial" w:eastAsiaTheme="majorEastAsia" w:hAnsi="Arial" w:cs="Arial"/>
+          <w:b/>
+          <w:bCs/>
+          <w:sz w:val="26"/>
+          <w:szCs w:val="26"/>
+        </w:rPr>
+      </w:pPr>
+      <w:r>
+        <w:br w:type="page"/>
+      </w:r>
+    </w:p>
+    <w:p>
+      <w:pPr>
+        <w:pStyle w:val="Titolo2"/>
+        <w:pBdr>
+          <w:bottom w:val="single" w:sz="4" w:space="1" w:color="auto"/>
+        </w:pBdr>
+      </w:pPr>
+      <w:r>
+        <w:lastRenderedPageBreak/>
+        <w:t>Utilizzo Intelligenza Artificiale</w:t>
+      </w:r>
+      <w:r>
+        <w:t xml:space="preserve"> nella giornata</w:t>
+      </w:r>
+    </w:p>
+    <w:p>
+      <w:pPr>
+        <w:pStyle w:val="Nessunaspaziatura"/>
+        <w:rPr>
+          <w:rFonts w:ascii="Arial" w:hAnsi="Arial" w:cs="Arial"/>
+          <w:b/>
+          <w:bCs/>
+        </w:rPr>
+      </w:pPr>
+    </w:p>
+    <w:p>
+      <w:pPr>
+        <w:pStyle w:val="Nessunaspaziatura"/>
+        <w:rPr>
+          <w:rFonts w:ascii="Arial" w:hAnsi="Arial" w:cs="Arial"/>
+        </w:rPr>
+      </w:pPr>
+      <w:sdt>
+        <w:sdtPr>
+          <w:rPr>
+            <w:rFonts w:ascii="Segoe UI Symbol" w:hAnsi="Segoe UI Symbol" w:cs="Segoe UI Symbol"/>
+          </w:rPr>
+          <w:id w:val="-1288121869"/>
+          <w14:checkbox>
+            <w14:checked w14:val="0"/>
+            <w14:checkedState w14:val="2612" w14:font="MS Gothic"/>
+            <w14:uncheckedState w14:val="2610" w14:font="MS Gothic"/>
+          </w14:checkbox>
+        </w:sdtPr>
+        <w:sdtContent>
+          <w:r>
+            <w:rPr>
+              <w:rFonts w:ascii="MS Gothic" w:eastAsia="MS Gothic" w:hAnsi="MS Gothic" w:cs="Segoe UI Symbol" w:hint="eastAsia"/>
+            </w:rPr>
+            <w:t>☐</w:t>
+          </w:r>
+        </w:sdtContent>
+      </w:sdt>
+      <w:r>
+        <w:rPr>
+          <w:rFonts w:ascii="Arial" w:hAnsi="Arial" w:cs="Arial"/>
+        </w:rPr>
+        <w:t xml:space="preserve"> Nessuno</w:t>
+      </w:r>
+      <w:r>
+        <w:br/>
+      </w:r>
+      <w:sdt>
+        <w:sdtPr>
+          <w:rPr>
+            <w:rFonts w:ascii="Segoe UI Symbol" w:hAnsi="Segoe UI Symbol" w:cs="Segoe UI Symbol"/>
+          </w:rPr>
+          <w:id w:val="-1019461785"/>
+          <w14:checkbox>
+            <w14:checked w14:val="1"/>
+            <w14:checkedState w14:val="2612" w14:font="MS Gothic"/>
+            <w14:uncheckedState w14:val="2610" w14:font="MS Gothic"/>
+          </w14:checkbox>
+        </w:sdtPr>
+        <w:sdtContent>
+          <w:r>
+            <w:rPr>
+              <w:rFonts w:ascii="MS Gothic" w:eastAsia="MS Gothic" w:hAnsi="MS Gothic" w:cs="Segoe UI Symbol" w:hint="eastAsia"/>
+            </w:rPr>
+            <w:t>☒</w:t>
+          </w:r>
+        </w:sdtContent>
+      </w:sdt>
+      <w:r>
+        <w:rPr>
+          <w:rFonts w:ascii="Arial" w:hAnsi="Arial" w:cs="Arial"/>
+        </w:rPr>
+        <w:t xml:space="preserve"> Occasionale</w:t>
+      </w:r>
+      <w:r>
+        <w:br/>
+      </w:r>
+      <w:sdt>
+        <w:sdtPr>
+          <w:rPr>
+            <w:rFonts w:ascii="Segoe UI Symbol" w:hAnsi="Segoe UI Symbol" w:cs="Segoe UI Symbol"/>
+          </w:rPr>
+          <w:id w:val="-1318492450"/>
+          <w14:checkbox>
+            <w14:checked w14:val="0"/>
+            <w14:checkedState w14:val="2612" w14:font="MS Gothic"/>
+            <w14:uncheckedState w14:val="2610" w14:font="MS Gothic"/>
+          </w14:checkbox>
+        </w:sdtPr>
+        <w:sdtContent>
+          <w:r>
+            <w:rPr>
+              <w:rFonts w:ascii="MS Gothic" w:eastAsia="MS Gothic" w:hAnsi="MS Gothic" w:cs="Segoe UI Symbol" w:hint="eastAsia"/>
+            </w:rPr>
+            <w:t>☐</w:t>
+          </w:r>
+        </w:sdtContent>
+      </w:sdt>
+      <w:r>
+        <w:rPr>
+          <w:rFonts w:ascii="Arial" w:hAnsi="Arial" w:cs="Arial"/>
+        </w:rPr>
+        <w:t xml:space="preserve"> Frequente</w:t>
+      </w:r>
+    </w:p>
+    <w:p>
+      <w:pPr>
+        <w:pStyle w:val="Nessunaspaziatura"/>
+        <w:rPr>
+          <w:rFonts w:ascii="Arial" w:hAnsi="Arial" w:cs="Arial"/>
+        </w:rPr>
+      </w:pPr>
+    </w:p>
+    <w:p>
+      <w:pPr>
+        <w:pStyle w:val="Nessunaspaziatura"/>
+        <w:spacing w:line="276" w:lineRule="auto"/>
+        <w:rPr>
+          <w:rFonts w:ascii="Arial" w:hAnsi="Arial" w:cs="Arial"/>
+        </w:rPr>
+      </w:pPr>
+      <w:r>
+        <w:rPr>
+          <w:rFonts w:ascii="Arial" w:hAnsi="Arial" w:cs="Arial"/>
+          <w:b/>
+          <w:bCs/>
+        </w:rPr>
+        <w:t>Strumento/i utilizzato/i</w:t>
+      </w:r>
+      <w:r>
+        <w:rPr>
+          <w:rFonts w:ascii="Arial" w:hAnsi="Arial" w:cs="Arial"/>
+          <w:b/>
+          <w:bCs/>
+        </w:rPr>
+        <w:t xml:space="preserve"> </w:t>
+      </w:r>
+      <w:r>
+        <w:rPr>
+          <w:rFonts w:ascii="Arial" w:hAnsi="Arial" w:cs="Arial"/>
+        </w:rPr>
+        <w:t>(es. ChatGPT)</w:t>
+      </w:r>
+      <w:r>
+        <w:rPr>
+          <w:rFonts w:ascii="Arial" w:hAnsi="Arial" w:cs="Arial"/>
+        </w:rPr>
+        <w:t xml:space="preserve">: </w:t>
+      </w:r>
+      <w:sdt>
+        <w:sdtPr>
+          <w:rPr>
+            <w:rFonts w:ascii="Arial" w:hAnsi="Arial" w:cs="Arial"/>
+          </w:rPr>
+          <w:id w:val="-1534716258"/>
+          <w:placeholder>
+            <w:docPart w:val="7727E2509E20420C8E7C198C6558A1A2"/>
+          </w:placeholder>
+        </w:sdtPr>
+        <w:sdtContent>
+          <w:r>
+            <w:rPr>
+              <w:rFonts w:ascii="Arial" w:hAnsi="Arial" w:cs="Arial"/>
+            </w:rPr>
+            <w:t>ChatGPT</w:t>
+          </w:r>
+        </w:sdtContent>
+      </w:sdt>
+    </w:p>
+    <w:p>
+      <w:pPr>
+        <w:pStyle w:val="Nessunaspaziatura"/>
+        <w:rPr>
+          <w:rFonts w:ascii="Arial" w:hAnsi="Arial" w:cs="Arial"/>
+        </w:rPr>
+      </w:pPr>
+    </w:p>
+    <w:p>
+      <w:pPr>
+        <w:pStyle w:val="Nessunaspaziatura"/>
+        <w:rPr>
+          <w:rFonts w:ascii="Arial" w:hAnsi="Arial" w:cs="Arial"/>
+        </w:rPr>
+      </w:pPr>
+      <w:r>
+        <w:rPr>
+          <w:rFonts w:ascii="Arial" w:hAnsi="Arial" w:cs="Arial"/>
+          <w:b/>
+          <w:bCs/>
+        </w:rPr>
+        <w:t>Per cosa l’ho usata oggi</w:t>
+      </w:r>
+      <w:r>
+        <w:br/>
+      </w:r>
+      <w:sdt>
+        <w:sdtPr>
+          <w:rPr>
+            <w:rFonts w:ascii="Segoe UI Symbol" w:hAnsi="Segoe UI Symbol" w:cs="Segoe UI Symbol"/>
+          </w:rPr>
+          <w:id w:val="-262761622"/>
+          <w14:checkbox>
+            <w14:checked w14:val="0"/>
+            <w14:checkedState w14:val="2612" w14:font="MS Gothic"/>
+            <w14:uncheckedState w14:val="2610" w14:font="MS Gothic"/>
+          </w14:checkbox>
+        </w:sdtPr>
+        <w:sdtContent>
+          <w:r>
+            <w:rPr>
+              <w:rFonts w:ascii="MS Gothic" w:eastAsia="MS Gothic" w:hAnsi="MS Gothic" w:cs="Segoe UI Symbol" w:hint="eastAsia"/>
+            </w:rPr>
+            <w:t>☐</w:t>
+          </w:r>
+        </w:sdtContent>
+      </w:sdt>
+      <w:r>
+        <w:rPr>
+          <w:rFonts w:ascii="Arial" w:hAnsi="Arial" w:cs="Arial"/>
+        </w:rPr>
+        <w:t xml:space="preserve"> Chiarire concetti</w:t>
+      </w:r>
+      <w:r>
+        <w:br/>
+      </w:r>
+      <w:sdt>
+        <w:sdtPr>
+          <w:rPr>
+            <w:rFonts w:ascii="Segoe UI Symbol" w:hAnsi="Segoe UI Symbol" w:cs="Segoe UI Symbol"/>
+          </w:rPr>
+          <w:id w:val="-1148204309"/>
+          <w14:checkbox>
+            <w14:checked w14:val="1"/>
+            <w14:checkedState w14:val="2612" w14:font="MS Gothic"/>
+            <w14:uncheckedState w14:val="2610" w14:font="MS Gothic"/>
+          </w14:checkbox>
+        </w:sdtPr>
+        <w:sdtContent>
+          <w:r>
+            <w:rPr>
+              <w:rFonts w:ascii="MS Gothic" w:eastAsia="MS Gothic" w:hAnsi="MS Gothic" w:cs="Segoe UI Symbol" w:hint="eastAsia"/>
+            </w:rPr>
+            <w:t>☒</w:t>
+          </w:r>
+        </w:sdtContent>
+      </w:sdt>
+      <w:r>
+        <w:rPr>
+          <w:rFonts w:ascii="Arial" w:hAnsi="Arial" w:cs="Arial"/>
+        </w:rPr>
+        <w:t xml:space="preserve"> Supporto al codice</w:t>
+      </w:r>
+      <w:r>
+        <w:br/>
+      </w:r>
+      <w:sdt>
+        <w:sdtPr>
+          <w:rPr>
+            <w:rFonts w:ascii="Segoe UI Symbol" w:hAnsi="Segoe UI Symbol" w:cs="Segoe UI Symbol"/>
+          </w:rPr>
+          <w:id w:val="-259443959"/>
+          <w14:checkbox>
+            <w14:checked w14:val="0"/>
+            <w14:checkedState w14:val="2612" w14:font="MS Gothic"/>
+            <w14:uncheckedState w14:val="2610" w14:font="MS Gothic"/>
+          </w14:checkbox>
+        </w:sdtPr>
+        <w:sdtContent>
+          <w:r>
+            <w:rPr>
+              <w:rFonts w:ascii="MS Gothic" w:eastAsia="MS Gothic" w:hAnsi="MS Gothic" w:cs="Segoe UI Symbol" w:hint="eastAsia"/>
+            </w:rPr>
+            <w:t>☐</w:t>
+          </w:r>
+        </w:sdtContent>
+      </w:sdt>
+      <w:r>
+        <w:rPr>
+          <w:rFonts w:ascii="Arial" w:hAnsi="Arial" w:cs="Arial"/>
+        </w:rPr>
+        <w:t xml:space="preserve"> Debug</w:t>
+      </w:r>
+      <w:r>
+        <w:br/>
+      </w:r>
+      <w:sdt>
+        <w:sdtPr>
+          <w:rPr>
+            <w:rFonts w:ascii="Segoe UI Symbol" w:hAnsi="Segoe UI Symbol" w:cs="Segoe UI Symbol"/>
+          </w:rPr>
+          <w:id w:val="883454685"/>
+          <w14:checkbox>
+            <w14:checked w14:val="0"/>
+            <w14:checkedState w14:val="2612" w14:font="MS Gothic"/>
+            <w14:uncheckedState w14:val="2610" w14:font="MS Gothic"/>
+          </w14:checkbox>
+        </w:sdtPr>
+        <w:sdtContent>
+          <w:r>
+            <w:rPr>
+              <w:rFonts w:ascii="MS Gothic" w:eastAsia="MS Gothic" w:hAnsi="MS Gothic" w:cs="Segoe UI Symbol" w:hint="eastAsia"/>
+            </w:rPr>
+            <w:t>☐</w:t>
+          </w:r>
+        </w:sdtContent>
+      </w:sdt>
+      <w:r>
+        <w:rPr>
+          <w:rFonts w:ascii="Arial" w:hAnsi="Arial" w:cs="Arial"/>
+        </w:rPr>
+        <w:t xml:space="preserve"> Riorganizzare idee / testi</w:t>
+      </w:r>
+      <w:r>
+        <w:br/>
+      </w:r>
+      <w:sdt>
+        <w:sdtPr>
+          <w:rPr>
+            <w:rFonts w:ascii="Segoe UI Symbol" w:hAnsi="Segoe UI Symbol" w:cs="Segoe UI Symbol"/>
+          </w:rPr>
+          <w:id w:val="-704024661"/>
+          <w14:checkbox>
+            <w14:checked w14:val="0"/>
+            <w14:checkedState w14:val="2612" w14:font="MS Gothic"/>
+            <w14:uncheckedState w14:val="2610" w14:font="MS Gothic"/>
+          </w14:checkbox>
+        </w:sdtPr>
+        <w:sdtContent>
+          <w:r>
+            <w:rPr>
+              <w:rFonts w:ascii="MS Gothic" w:eastAsia="MS Gothic" w:hAnsi="MS Gothic" w:cs="Segoe UI Symbol" w:hint="eastAsia"/>
+            </w:rPr>
+            <w:t>☐</w:t>
+          </w:r>
+        </w:sdtContent>
+      </w:sdt>
+      <w:r>
+        <w:rPr>
+          <w:rFonts w:ascii="Arial" w:hAnsi="Arial" w:cs="Arial"/>
+        </w:rPr>
+        <w:t xml:space="preserve"> Altro: …</w:t>
+      </w:r>
+    </w:p>
+    <w:p>
+      <w:pPr>
+        <w:pStyle w:val="Nessunaspaziatura"/>
+        <w:rPr>
+          <w:rFonts w:ascii="Arial" w:hAnsi="Arial" w:cs="Arial"/>
+        </w:rPr>
+      </w:pPr>
+    </w:p>
+    <w:p>
+      <w:pPr>
+        <w:pStyle w:val="Nessunaspaziatura"/>
+        <w:rPr>
+          <w:rFonts w:ascii="Arial" w:hAnsi="Arial" w:cs="Arial"/>
+          <w:b/>
+          <w:bCs/>
+        </w:rPr>
+      </w:pPr>
+      <w:r>
+        <w:rPr>
+          <w:rFonts w:ascii="Arial" w:hAnsi="Arial" w:cs="Arial"/>
+          <w:b/>
+          <w:bCs/>
+        </w:rPr>
+        <w:t>Esempio significativo di utilizzo (UNO SOLO)</w:t>
+      </w:r>
+    </w:p>
+    <w:p>
+      <w:pPr>
+        <w:pStyle w:val="Nessunaspaziatura"/>
+        <w:rPr>
+          <w:rFonts w:ascii="Arial" w:hAnsi="Arial" w:cs="Arial"/>
+        </w:rPr>
+      </w:pPr>
+      <w:r>
+        <w:rPr>
+          <w:rFonts w:ascii="Arial" w:hAnsi="Arial" w:cs="Arial"/>
+        </w:rPr>
+        <w:t xml:space="preserve">Riporta </w:t>
+      </w:r>
+      <w:r>
+        <w:rPr>
+          <w:rFonts w:ascii="Arial" w:hAnsi="Arial" w:cs="Arial"/>
+          <w:i/>
+          <w:iCs/>
+        </w:rPr>
+        <w:t>un</w:t>
+      </w:r>
+      <w:r>
+        <w:rPr>
+          <w:rFonts w:ascii="Arial" w:hAnsi="Arial" w:cs="Arial"/>
+        </w:rPr>
+        <w:t xml:space="preserve"> prompt rilevante oppure descrivilo a parole se ce ne sono stati molti.</w:t>
+      </w:r>
+    </w:p>
+    <w:p>
+      <w:pPr>
+        <w:pStyle w:val="Nessunaspaziatura"/>
+        <w:rPr>
+          <w:rFonts w:ascii="Arial" w:hAnsi="Arial" w:cs="Arial"/>
+        </w:rPr>
+      </w:pPr>
+    </w:p>
+    <w:sdt>
+      <w:sdtPr>
+        <w:rPr>
+          <w:rFonts w:ascii="Arial" w:hAnsi="Arial" w:cs="Arial"/>
+        </w:rPr>
+        <w:alias w:val="Prompt AI"/>
+        <w:tag w:val="Prompt AI"/>
+        <w:id w:val="1339659329"/>
+        <w:placeholder>
+          <w:docPart w:val="EA56D7B4D4DA4266B62B2D6CBFE8005C"/>
+        </w:placeholder>
+        <w15:color w:val="C0C0C0"/>
+      </w:sdtPr>
+      <w:sdtContent>
+        <w:p>
+          <w:pPr>
+            <w:pStyle w:val="Nessunaspaziatura"/>
+            <w:rPr>
+              <w:rFonts w:ascii="Arial" w:hAnsi="Arial" w:cs="Arial"/>
+            </w:rPr>
+          </w:pPr>
+          <w:r>
+            <w:rPr>
+              <w:rFonts w:ascii="Arial" w:hAnsi="Arial" w:cs="Arial"/>
+            </w:rPr>
+            <w:t>Riley: Come posso cambiare una scena su unity?</w:t>
+          </w:r>
+        </w:p>
+        <w:p>
+          <w:pPr>
+            <w:pStyle w:val="Nessunaspaziatura"/>
+            <w:spacing w:line="276" w:lineRule="auto"/>
+            <w:rPr>
+              <w:rFonts w:ascii="Arial" w:hAnsi="Arial" w:cs="Arial"/>
+            </w:rPr>
+          </w:pPr>
+          <w:r>
+            <w:rPr>
+              <w:rFonts w:ascii="Arial" w:hAnsi="Arial" w:cs="Arial"/>
+            </w:rPr>
+            <w:t xml:space="preserve">Bryan: </w:t>
+          </w:r>
+        </w:p>
+      </w:sdtContent>
+    </w:sdt>
+    <w:p>
+      <w:pPr>
+        <w:pStyle w:val="Nessunaspaziatura"/>
+        <w:rPr>
+          <w:rFonts w:ascii="Arial" w:hAnsi="Arial" w:cs="Arial"/>
+        </w:rPr>
+      </w:pPr>
+    </w:p>
+    <w:p>
+      <w:pPr>
+        <w:pStyle w:val="Nessunaspaziatura"/>
+        <w:rPr>
+          <w:rFonts w:ascii="Arial" w:hAnsi="Arial" w:cs="Arial"/>
+        </w:rPr>
+      </w:pPr>
+      <w:r>
+        <w:rPr>
+          <w:rFonts w:ascii="Arial" w:hAnsi="Arial" w:cs="Arial"/>
+          <w:b/>
+          <w:bCs/>
+        </w:rPr>
+        <w:t>Cosa mi ha dato l’AI</w:t>
+      </w:r>
+    </w:p>
+    <w:p>
+      <w:pPr>
+        <w:pStyle w:val="Nessunaspaziatura"/>
+        <w:rPr>
+          <w:rFonts w:ascii="Arial" w:hAnsi="Arial" w:cs="Arial"/>
+        </w:rPr>
+      </w:pPr>
+      <w:r>
+        <w:rPr>
+          <w:rFonts w:ascii="Arial" w:hAnsi="Arial" w:cs="Arial"/>
+        </w:rPr>
+        <w:t>Spiegazione, esempio, soluzione, suggerimento…</w:t>
+      </w:r>
+    </w:p>
+    <w:p>
+      <w:pPr>
+        <w:pStyle w:val="Nessunaspaziatura"/>
+        <w:rPr>
+          <w:rFonts w:ascii="Arial" w:hAnsi="Arial" w:cs="Arial"/>
+        </w:rPr>
+      </w:pPr>
+    </w:p>
+    <w:sdt>
+      <w:sdtPr>
+        <w:rPr>
+          <w:rFonts w:ascii="Arial" w:hAnsi="Arial" w:cs="Arial"/>
+        </w:rPr>
+        <w:alias w:val="Risposta AI"/>
+        <w:tag w:val="Risposta AI"/>
+        <w:id w:val="-659315039"/>
+        <w:placeholder>
+          <w:docPart w:val="B9585D849BDA427789669C4ED285EA7E"/>
+        </w:placeholder>
+        <w15:color w:val="C0C0C0"/>
+      </w:sdtPr>
+      <w:sdtContent>
+        <w:p>
+          <w:pPr>
+            <w:pStyle w:val="Nessunaspaziatura"/>
+            <w:spacing w:line="276" w:lineRule="auto"/>
+            <w:rPr>
+              <w:rFonts w:ascii="Arial" w:hAnsi="Arial" w:cs="Arial"/>
+            </w:rPr>
+          </w:pPr>
+          <w:r>
+            <w:rPr>
+              <w:rFonts w:ascii="Arial" w:hAnsi="Arial" w:cs="Arial"/>
+            </w:rPr>
+            <w:t>Riley: Mi ha fornito un esempio di codice, basandosi anche su quello che gli ho raccontato in precedenza.</w:t>
+          </w:r>
+        </w:p>
+        <w:p>
+          <w:pPr>
+            <w:pStyle w:val="Nessunaspaziatura"/>
+            <w:spacing w:line="276" w:lineRule="auto"/>
+            <w:rPr>
+              <w:rFonts w:ascii="Arial" w:hAnsi="Arial" w:cs="Arial"/>
+            </w:rPr>
+          </w:pPr>
+          <w:r>
+            <w:rPr>
+              <w:rFonts w:ascii="Arial" w:hAnsi="Arial" w:cs="Arial"/>
+            </w:rPr>
+            <w:t xml:space="preserve">Bryan: </w:t>
+          </w:r>
+        </w:p>
+      </w:sdtContent>
+    </w:sdt>
+    <w:p>
+      <w:pPr>
+        <w:pStyle w:val="Nessunaspaziatura"/>
+        <w:rPr>
+          <w:rFonts w:ascii="Arial" w:hAnsi="Arial" w:cs="Arial"/>
+          <w:b/>
+          <w:bCs/>
+        </w:rPr>
+      </w:pPr>
+    </w:p>
+    <w:p>
+      <w:pPr>
+        <w:pStyle w:val="Nessunaspaziatura"/>
+        <w:rPr>
+          <w:rFonts w:ascii="Arial" w:hAnsi="Arial" w:cs="Arial"/>
+        </w:rPr>
+      </w:pPr>
+      <w:r>
+        <w:rPr>
+          <w:rFonts w:ascii="Arial" w:hAnsi="Arial" w:cs="Arial"/>
+          <w:b/>
+          <w:bCs/>
+        </w:rPr>
+        <w:t>Come l’ho usato io</w:t>
+      </w:r>
+      <w:r>
+        <w:rPr>
+          <w:rFonts w:ascii="Arial" w:hAnsi="Arial" w:cs="Arial"/>
+        </w:rPr>
+        <w:br/>
+      </w:r>
+      <w:sdt>
+        <w:sdtPr>
+          <w:rPr>
+            <w:rFonts w:ascii="Segoe UI Symbol" w:hAnsi="Segoe UI Symbol" w:cs="Segoe UI Symbol"/>
+          </w:rPr>
+          <w:id w:val="-1061174849"/>
+          <w14:checkbox>
+            <w14:checked w14:val="0"/>
+            <w14:checkedState w14:val="2612" w14:font="MS Gothic"/>
+            <w14:uncheckedState w14:val="2610" w14:font="MS Gothic"/>
+          </w14:checkbox>
+        </w:sdtPr>
+        <w:sdtContent>
+          <w:r>
+            <w:rPr>
+              <w:rFonts w:ascii="MS Gothic" w:eastAsia="MS Gothic" w:hAnsi="MS Gothic" w:cs="Segoe UI Symbol" w:hint="eastAsia"/>
+            </w:rPr>
+            <w:t>☐</w:t>
+          </w:r>
+        </w:sdtContent>
+      </w:sdt>
+      <w:r>
+        <w:rPr>
+          <w:rFonts w:ascii="Arial" w:hAnsi="Arial" w:cs="Arial"/>
+        </w:rPr>
+        <w:t xml:space="preserve"> Copiato</w:t>
+      </w:r>
+      <w:r>
+        <w:rPr>
+          <w:rFonts w:ascii="Arial" w:hAnsi="Arial" w:cs="Arial"/>
+        </w:rPr>
+        <w:br/>
+      </w:r>
+      <w:sdt>
+        <w:sdtPr>
+          <w:rPr>
+            <w:rFonts w:ascii="Segoe UI Symbol" w:hAnsi="Segoe UI Symbol" w:cs="Segoe UI Symbol"/>
+          </w:rPr>
+          <w:id w:val="584348365"/>
+          <w14:checkbox>
+            <w14:checked w14:val="0"/>
+            <w14:checkedState w14:val="2612" w14:font="MS Gothic"/>
+            <w14:uncheckedState w14:val="2610" w14:font="MS Gothic"/>
+          </w14:checkbox>
+        </w:sdtPr>
+        <w:sdtContent>
+          <w:r>
+            <w:rPr>
+              <w:rFonts w:ascii="MS Gothic" w:eastAsia="MS Gothic" w:hAnsi="MS Gothic" w:cs="Segoe UI Symbol" w:hint="eastAsia"/>
+            </w:rPr>
+            <w:t>☐</w:t>
+          </w:r>
+        </w:sdtContent>
+      </w:sdt>
+      <w:r>
+        <w:rPr>
+          <w:rFonts w:ascii="Arial" w:hAnsi="Arial" w:cs="Arial"/>
+        </w:rPr>
+        <w:t xml:space="preserve"> Adattato</w:t>
+      </w:r>
+      <w:r>
+        <w:rPr>
+          <w:rFonts w:ascii="Arial" w:hAnsi="Arial" w:cs="Arial"/>
+        </w:rPr>
+        <w:br/>
+      </w:r>
+      <w:sdt>
+        <w:sdtPr>
+          <w:rPr>
+            <w:rFonts w:ascii="Segoe UI Symbol" w:hAnsi="Segoe UI Symbol" w:cs="Segoe UI Symbol"/>
+          </w:rPr>
+          <w:id w:val="-2037879159"/>
+          <w14:checkbox>
+            <w14:checked w14:val="1"/>
+            <w14:checkedState w14:val="2612" w14:font="MS Gothic"/>
+            <w14:uncheckedState w14:val="2610" w14:font="MS Gothic"/>
+          </w14:checkbox>
+        </w:sdtPr>
+        <w:sdtContent>
+          <w:r>
+            <w:rPr>
+              <w:rFonts w:ascii="MS Gothic" w:eastAsia="MS Gothic" w:hAnsi="MS Gothic" w:cs="Segoe UI Symbol" w:hint="eastAsia"/>
+            </w:rPr>
+            <w:t>☒</w:t>
+          </w:r>
+        </w:sdtContent>
+      </w:sdt>
+      <w:r>
+        <w:rPr>
+          <w:rFonts w:ascii="Arial" w:hAnsi="Arial" w:cs="Arial"/>
+        </w:rPr>
+        <w:t xml:space="preserve"> Usato solo per capire</w:t>
+      </w:r>
+      <w:r>
+        <w:rPr>
+          <w:rFonts w:ascii="Arial" w:hAnsi="Arial" w:cs="Arial"/>
+        </w:rPr>
+        <w:br/>
+      </w:r>
+      <w:sdt>
+        <w:sdtPr>
+          <w:rPr>
+            <w:rFonts w:ascii="Segoe UI Symbol" w:hAnsi="Segoe UI Symbol" w:cs="Segoe UI Symbol"/>
+          </w:rPr>
+          <w:id w:val="-604804457"/>
+          <w14:checkbox>
+            <w14:checked w14:val="0"/>
+            <w14:checkedState w14:val="2612" w14:font="MS Gothic"/>
+            <w14:uncheckedState w14:val="2610" w14:font="MS Gothic"/>
+          </w14:checkbox>
+        </w:sdtPr>
+        <w:sdtContent>
+          <w:r>
+            <w:rPr>
+              <w:rFonts w:ascii="MS Gothic" w:eastAsia="MS Gothic" w:hAnsi="MS Gothic" w:cs="Segoe UI Symbol" w:hint="eastAsia"/>
+            </w:rPr>
+            <w:t>☐</w:t>
+          </w:r>
+        </w:sdtContent>
+      </w:sdt>
+      <w:r>
+        <w:rPr>
+          <w:rFonts w:ascii="Arial" w:hAnsi="Arial" w:cs="Arial"/>
+        </w:rPr>
+        <w:t xml:space="preserve"> Scartato</w:t>
+      </w:r>
+    </w:p>
+    <w:p>
+      <w:pPr>
+        <w:pStyle w:val="Nessunaspaziatura"/>
+        <w:rPr>
+          <w:rFonts w:ascii="Arial" w:hAnsi="Arial" w:cs="Arial"/>
+        </w:rPr>
+      </w:pPr>
+    </w:p>
+    <w:p>
+      <w:pPr>
+        <w:pStyle w:val="Nessunaspaziatura"/>
+        <w:rPr>
+          <w:rFonts w:ascii="Arial" w:hAnsi="Arial" w:cs="Arial"/>
+        </w:rPr>
+      </w:pPr>
+    </w:p>
+    <w:p>
+      <w:pPr>
+        <w:pStyle w:val="Nessunaspaziatura"/>
+        <w:rPr>
+          <w:rFonts w:ascii="Arial" w:hAnsi="Arial" w:cs="Arial"/>
+        </w:rPr>
+      </w:pPr>
+      <w:r>
+        <w:rPr>
+          <w:rFonts w:ascii="Arial" w:hAnsi="Arial" w:cs="Arial"/>
+          <w:b/>
+          <w:bCs/>
+        </w:rPr>
+        <w:t>Cosa avrei fatto senza AI?</w:t>
+      </w:r>
+    </w:p>
+    <w:p>
+      <w:pPr>
+        <w:pStyle w:val="Nessunaspaziatura"/>
+        <w:rPr>
+          <w:rFonts w:ascii="Arial" w:hAnsi="Arial" w:cs="Arial"/>
+        </w:rPr>
+      </w:pPr>
+      <w:r>
+        <w:rPr>
+          <w:rFonts w:ascii="Arial" w:hAnsi="Arial" w:cs="Arial"/>
+        </w:rPr>
+        <w:t>Riley: Averi cercato su delle documentazioni ufficiali.</w:t>
       </w:r>
     </w:p>
     <w:p>
@@ -31650,17 +31599,8 @@
         <w:rFonts w:ascii="Arial" w:hAnsi="Arial" w:cs="Arial"/>
         <w:lang w:val="fr-CH"/>
       </w:rPr>
-      <w:t xml:space="preserve">Riley Bianchi &amp; Bryan </w:t>
+      <w:t>Riley Bianchi &amp; Bryan Ciaponi</w:t>
     </w:r>
-    <w:proofErr w:type="spellStart"/>
-    <w:r>
-      <w:rPr>
-        <w:rFonts w:ascii="Arial" w:hAnsi="Arial" w:cs="Arial"/>
-        <w:lang w:val="fr-CH"/>
-      </w:rPr>
-      <w:t>Ciaponi</w:t>
-    </w:r>
-    <w:proofErr w:type="spellEnd"/>
   </w:p>
 </w:hdr>
 </file>
@@ -37096,6 +37036,107 @@
         </w:p>
       </w:docPartBody>
     </w:docPart>
+    <w:docPart>
+      <w:docPartPr>
+        <w:name w:val="7727E2509E20420C8E7C198C6558A1A2"/>
+        <w:category>
+          <w:name w:val="Generale"/>
+          <w:gallery w:val="placeholder"/>
+        </w:category>
+        <w:types>
+          <w:type w:val="bbPlcHdr"/>
+        </w:types>
+        <w:behaviors>
+          <w:behavior w:val="content"/>
+        </w:behaviors>
+        <w:guid w:val="{0ED906BC-BCEE-402A-8541-967D2FC4FD86}"/>
+      </w:docPartPr>
+      <w:docPartBody>
+        <w:p>
+          <w:pPr>
+            <w:pStyle w:val="7727E2509E20420C8E7C198C6558A1A2"/>
+          </w:pPr>
+          <w:r>
+            <w:rPr>
+              <w:rStyle w:val="Testosegnaposto"/>
+              <w:b/>
+              <w:bCs/>
+            </w:rPr>
+            <w:t>Nomi AI utilizzati</w:t>
+          </w:r>
+        </w:p>
+      </w:docPartBody>
+    </w:docPart>
+    <w:docPart>
+      <w:docPartPr>
+        <w:name w:val="EA56D7B4D4DA4266B62B2D6CBFE8005C"/>
+        <w:category>
+          <w:name w:val="Generale"/>
+          <w:gallery w:val="placeholder"/>
+        </w:category>
+        <w:types>
+          <w:type w:val="bbPlcHdr"/>
+        </w:types>
+        <w:behaviors>
+          <w:behavior w:val="content"/>
+        </w:behaviors>
+        <w:guid w:val="{0BAFC5BB-DF19-4324-BEB3-98CD607EE1DF}"/>
+      </w:docPartPr>
+      <w:docPartBody>
+        <w:p>
+          <w:pPr>
+            <w:pStyle w:val="EA56D7B4D4DA4266B62B2D6CBFE8005C"/>
+          </w:pPr>
+          <w:r>
+            <w:rPr>
+              <w:rStyle w:val="Testosegnaposto"/>
+            </w:rPr>
+            <w:t>Fare clic o toccare qui per immettere il testo.</w:t>
+          </w:r>
+        </w:p>
+      </w:docPartBody>
+    </w:docPart>
+    <w:docPart>
+      <w:docPartPr>
+        <w:name w:val="B9585D849BDA427789669C4ED285EA7E"/>
+        <w:category>
+          <w:name w:val="Generale"/>
+          <w:gallery w:val="placeholder"/>
+        </w:category>
+        <w:types>
+          <w:type w:val="bbPlcHdr"/>
+        </w:types>
+        <w:behaviors>
+          <w:behavior w:val="content"/>
+        </w:behaviors>
+        <w:guid w:val="{8F43A553-46D8-4788-823E-B2748D561DCD}"/>
+      </w:docPartPr>
+      <w:docPartBody>
+        <w:p>
+          <w:pPr>
+            <w:pStyle w:val="B9585D849BDA427789669C4ED285EA7E"/>
+          </w:pPr>
+          <w:r>
+            <w:rPr>
+              <w:rStyle w:val="Testosegnaposto"/>
+            </w:rPr>
+            <w:t xml:space="preserve">Fare clic o toccare qui per </w:t>
+          </w:r>
+          <w:r>
+            <w:rPr>
+              <w:rStyle w:val="Testosegnaposto"/>
+            </w:rPr>
+            <w:t>immettere</w:t>
+          </w:r>
+          <w:r>
+            <w:rPr>
+              <w:rStyle w:val="Testosegnaposto"/>
+            </w:rPr>
+            <w:t xml:space="preserve"> il testo.</w:t>
+          </w:r>
+        </w:p>
+      </w:docPartBody>
+    </w:docPart>
   </w:docParts>
 </w:glossaryDocument>
 </file>
@@ -37259,6 +37300,7 @@
     <w:rsid w:val="00565B11"/>
     <w:rsid w:val="00633F3C"/>
     <w:rsid w:val="0063588A"/>
+    <w:rsid w:val="00657C43"/>
     <w:rsid w:val="0066686E"/>
     <w:rsid w:val="00715227"/>
     <w:rsid w:val="00727854"/>
@@ -37275,6 +37317,7 @@
     <w:rsid w:val="0080736A"/>
     <w:rsid w:val="00832BBC"/>
     <w:rsid w:val="008736ED"/>
+    <w:rsid w:val="00880E40"/>
     <w:rsid w:val="0089581E"/>
     <w:rsid w:val="008A28AA"/>
     <w:rsid w:val="008A2EC3"/>
@@ -37323,6 +37366,7 @@
     <w:rsid w:val="00F726EC"/>
     <w:rsid w:val="00F8713D"/>
     <w:rsid w:val="00F963D8"/>
+    <w:rsid w:val="00FD20CA"/>
   </w:rsids>
   <m:mathPr>
     <m:mathFont m:val="Cambria Math"/>
@@ -37778,7 +37822,7 @@
     <w:basedOn w:val="Carpredefinitoparagrafo"/>
     <w:uiPriority w:val="99"/>
     <w:semiHidden/>
-    <w:rsid w:val="00F963D8"/>
+    <w:rsid w:val="00880E40"/>
     <w:rPr>
       <w:color w:val="666666"/>
     </w:rPr>
@@ -38067,6 +38111,18 @@
   <w:style w:type="paragraph" w:customStyle="1" w:styleId="DB932D863FC9416EB139C30BF564B463">
     <w:name w:val="DB932D863FC9416EB139C30BF564B463"/>
     <w:rsid w:val="00F963D8"/>
+  </w:style>
+  <w:style w:type="paragraph" w:customStyle="1" w:styleId="7727E2509E20420C8E7C198C6558A1A2">
+    <w:name w:val="7727E2509E20420C8E7C198C6558A1A2"/>
+    <w:rsid w:val="00880E40"/>
+  </w:style>
+  <w:style w:type="paragraph" w:customStyle="1" w:styleId="EA56D7B4D4DA4266B62B2D6CBFE8005C">
+    <w:name w:val="EA56D7B4D4DA4266B62B2D6CBFE8005C"/>
+    <w:rsid w:val="00880E40"/>
+  </w:style>
+  <w:style w:type="paragraph" w:customStyle="1" w:styleId="B9585D849BDA427789669C4ED285EA7E">
+    <w:name w:val="B9585D849BDA427789669C4ED285EA7E"/>
+    <w:rsid w:val="00880E40"/>
   </w:style>
 </w:styles>
 </file>

</xml_diff>

<commit_message>
completamento script visuale e diario
</commit_message>
<xml_diff>
--- a/4_Diari/Diario.docx
+++ b/4_Diari/Diario.docx
@@ -29894,7 +29894,19 @@
               <w:rPr>
                 <w:rFonts w:ascii="Arial" w:hAnsi="Arial" w:cs="Arial"/>
               </w:rPr>
-              <w:t>13.10.2026</w:t>
+              <w:t>1</w:t>
+            </w:r>
+            <w:r>
+              <w:rPr>
+                <w:rFonts w:ascii="Arial" w:hAnsi="Arial" w:cs="Arial"/>
+              </w:rPr>
+              <w:t>4</w:t>
+            </w:r>
+            <w:r>
+              <w:rPr>
+                <w:rFonts w:ascii="Arial" w:hAnsi="Arial" w:cs="Arial"/>
+              </w:rPr>
+              <w:t>.10.2026</w:t>
             </w:r>
           </w:p>
         </w:tc>
@@ -29972,7 +29984,7 @@
               <w:rPr>
                 <w:rFonts w:ascii="Arial" w:hAnsi="Arial" w:cs="Arial"/>
               </w:rPr>
-              <w:t>Permesso un cambiamento della scena, ancora migliorabile, potrebbe avere delle falle, e cominciato con un’analisi per creare il controllo della telecamera</w:t>
+              <w:t>Creato script per gestire movimento della telecamera</w:t>
             </w:r>
           </w:p>
         </w:tc>
@@ -30010,7 +30022,7 @@
               <w:rPr>
                 <w:rFonts w:ascii="Arial" w:hAnsi="Arial" w:cs="Arial"/>
               </w:rPr>
-              <w:t>Applicato collisioni e fisiche prima di iniziare il movimento</w:t>
+              <w:t>Eseguito un refactor delle dimensioni degli elementi dato che la gravità era troppo bassa.</w:t>
             </w:r>
           </w:p>
         </w:tc>
@@ -30243,7 +30255,25 @@
               <w:rPr>
                 <w:rFonts w:ascii="Arial" w:hAnsi="Arial" w:cs="Arial"/>
               </w:rPr>
-              <w:t>Procedere con il movimento della telecamera ed il movimento</w:t>
+              <w:t>Collegare lo script di</w:t>
+            </w:r>
+            <w:r>
+              <w:rPr>
+                <w:rFonts w:ascii="Arial" w:hAnsi="Arial" w:cs="Arial"/>
+              </w:rPr>
+              <w:t xml:space="preserve"> movimento della telecamera e</w:t>
+            </w:r>
+            <w:r>
+              <w:rPr>
+                <w:rFonts w:ascii="Arial" w:hAnsi="Arial" w:cs="Arial"/>
+              </w:rPr>
+              <w:t xml:space="preserve"> sviluppare</w:t>
+            </w:r>
+            <w:r>
+              <w:rPr>
+                <w:rFonts w:ascii="Arial" w:hAnsi="Arial" w:cs="Arial"/>
+              </w:rPr>
+              <w:t xml:space="preserve"> il movimento</w:t>
             </w:r>
           </w:p>
         </w:tc>
@@ -30346,13 +30376,7 @@
               <w:rPr>
                 <w:rFonts w:ascii="Arial" w:hAnsi="Arial" w:cs="Arial"/>
               </w:rPr>
-              <w:t xml:space="preserve">Riley: </w:t>
-            </w:r>
-            <w:r>
-              <w:rPr>
-                <w:rFonts w:ascii="Arial" w:hAnsi="Arial" w:cs="Arial"/>
-              </w:rPr>
-              <w:t>Sviluppo movimento telecamera e cambiamento sensibilità</w:t>
+              <w:t>Riley: Sviluppo movimento telecamera e cambiamento sensibilità</w:t>
             </w:r>
           </w:p>
           <w:p>
@@ -30366,19 +30390,7 @@
               <w:rPr>
                 <w:rFonts w:ascii="Arial" w:hAnsi="Arial" w:cs="Arial"/>
               </w:rPr>
-              <w:t>Bryan:</w:t>
-            </w:r>
-            <w:r>
-              <w:rPr>
-                <w:rFonts w:ascii="Arial" w:hAnsi="Arial" w:cs="Arial"/>
-              </w:rPr>
-              <w:t xml:space="preserve"> Continuo</w:t>
-            </w:r>
-            <w:r>
-              <w:rPr>
-                <w:rFonts w:ascii="Arial" w:hAnsi="Arial" w:cs="Arial"/>
-              </w:rPr>
-              <w:t xml:space="preserve"> sviluppo sistema movimento</w:t>
+              <w:t>Bryan: Continuo sviluppo sistema movimento</w:t>
             </w:r>
           </w:p>
         </w:tc>
@@ -31044,7 +31056,13 @@
             <w:rPr>
               <w:rFonts w:ascii="Arial" w:hAnsi="Arial" w:cs="Arial"/>
             </w:rPr>
-            <w:t>Riley: Come posso cambiare una scena su unity?</w:t>
+            <w:t xml:space="preserve">Riley: </w:t>
+          </w:r>
+          <w:r>
+            <w:rPr>
+              <w:rFonts w:ascii="Arial" w:hAnsi="Arial" w:cs="Arial"/>
+            </w:rPr>
+            <w:t>Come funziona un sistema di movimento della visuale su unity?</w:t>
           </w:r>
         </w:p>
         <w:p>
@@ -31136,7 +31154,13 @@
             <w:rPr>
               <w:rFonts w:ascii="Arial" w:hAnsi="Arial" w:cs="Arial"/>
             </w:rPr>
-            <w:t>Riley: Mi ha fornito un esempio di codice, basandosi anche su quello che gli ho raccontato in precedenza.</w:t>
+            <w:t xml:space="preserve">Riley: </w:t>
+          </w:r>
+          <w:r>
+            <w:rPr>
+              <w:rFonts w:ascii="Arial" w:hAnsi="Arial" w:cs="Arial"/>
+            </w:rPr>
+            <w:t>Mi sono state presentate 3 tipi di visuale che richiedono più o meno telecamere e due tipi di gestione degli input, con in seguito una spiegazione generale del funzionamento. Ho mandato dei dettagli per avere un output più preciso e utile.</w:t>
           </w:r>
         </w:p>
         <w:p>
@@ -31194,7 +31218,7 @@
           </w:rPr>
           <w:id w:val="-1061174849"/>
           <w14:checkbox>
-            <w14:checked w14:val="0"/>
+            <w14:checked w14:val="1"/>
             <w14:checkedState w14:val="2612" w14:font="MS Gothic"/>
             <w14:uncheckedState w14:val="2610" w14:font="MS Gothic"/>
           </w14:checkbox>
@@ -31204,7 +31228,7 @@
             <w:rPr>
               <w:rFonts w:ascii="MS Gothic" w:eastAsia="MS Gothic" w:hAnsi="MS Gothic" w:cs="Segoe UI Symbol" w:hint="eastAsia"/>
             </w:rPr>
-            <w:t>☐</w:t>
+            <w:t>☒</w:t>
           </w:r>
         </w:sdtContent>
       </w:sdt>
@@ -31227,7 +31251,7 @@
           </w:rPr>
           <w:id w:val="584348365"/>
           <w14:checkbox>
-            <w14:checked w14:val="0"/>
+            <w14:checked w14:val="1"/>
             <w14:checkedState w14:val="2612" w14:font="MS Gothic"/>
             <w14:uncheckedState w14:val="2610" w14:font="MS Gothic"/>
           </w14:checkbox>
@@ -31237,7 +31261,7 @@
             <w:rPr>
               <w:rFonts w:ascii="MS Gothic" w:eastAsia="MS Gothic" w:hAnsi="MS Gothic" w:cs="Segoe UI Symbol" w:hint="eastAsia"/>
             </w:rPr>
-            <w:t>☐</w:t>
+            <w:t>☒</w:t>
           </w:r>
         </w:sdtContent>
       </w:sdt>
@@ -31260,7 +31284,7 @@
           </w:rPr>
           <w:id w:val="-2037879159"/>
           <w14:checkbox>
-            <w14:checked w14:val="1"/>
+            <w14:checked w14:val="0"/>
             <w14:checkedState w14:val="2612" w14:font="MS Gothic"/>
             <w14:uncheckedState w14:val="2610" w14:font="MS Gothic"/>
           </w14:checkbox>
@@ -31270,7 +31294,7 @@
             <w:rPr>
               <w:rFonts w:ascii="MS Gothic" w:eastAsia="MS Gothic" w:hAnsi="MS Gothic" w:cs="Segoe UI Symbol" w:hint="eastAsia"/>
             </w:rPr>
-            <w:t>☒</w:t>
+            <w:t>☐</w:t>
           </w:r>
         </w:sdtContent>
       </w:sdt>
@@ -31357,7 +31381,13 @@
         <w:rPr>
           <w:rFonts w:ascii="Arial" w:hAnsi="Arial" w:cs="Arial"/>
         </w:rPr>
-        <w:t>Riley: Averi cercato su delle documentazioni ufficiali.</w:t>
+        <w:t>Riley: Averi cercato su delle documentazioni ufficiali</w:t>
+      </w:r>
+      <w:r>
+        <w:rPr>
+          <w:rFonts w:ascii="Arial" w:hAnsi="Arial" w:cs="Arial"/>
+        </w:rPr>
+        <w:t xml:space="preserve"> ed eventuali forum</w:t>
       </w:r>
     </w:p>
     <w:p>
@@ -37294,6 +37324,7 @@
     <w:rsid w:val="00434CC7"/>
     <w:rsid w:val="00461467"/>
     <w:rsid w:val="004834F6"/>
+    <w:rsid w:val="00485B61"/>
     <w:rsid w:val="004B57DE"/>
     <w:rsid w:val="00530FEF"/>
     <w:rsid w:val="00534571"/>
@@ -37305,6 +37336,7 @@
     <w:rsid w:val="00715227"/>
     <w:rsid w:val="00727854"/>
     <w:rsid w:val="007312C2"/>
+    <w:rsid w:val="007525FE"/>
     <w:rsid w:val="00753720"/>
     <w:rsid w:val="00754A35"/>
     <w:rsid w:val="00780E37"/>
@@ -37340,6 +37372,7 @@
     <w:rsid w:val="00BE72BC"/>
     <w:rsid w:val="00C00D0B"/>
     <w:rsid w:val="00C120D8"/>
+    <w:rsid w:val="00C537F1"/>
     <w:rsid w:val="00C60D7D"/>
     <w:rsid w:val="00D0757F"/>
     <w:rsid w:val="00D53511"/>

</xml_diff>

<commit_message>
creazione base movimento visuale e sezione diario
</commit_message>
<xml_diff>
--- a/4_Diari/Diario.docx
+++ b/4_Diari/Diario.docx
@@ -193,7 +193,21 @@
               <w:rPr>
                 <w:rFonts w:ascii="Arial" w:hAnsi="Arial" w:cs="Arial"/>
               </w:rPr>
-              <w:t>Riflettuto sui requisiti e user story del gioco, creato i primi template per gantt e diario</w:t>
+              <w:t xml:space="preserve">Riflettuto sui requisiti e user story del gioco, creato i primi template per </w:t>
+            </w:r>
+            <w:proofErr w:type="spellStart"/>
+            <w:r>
+              <w:rPr>
+                <w:rFonts w:ascii="Arial" w:hAnsi="Arial" w:cs="Arial"/>
+              </w:rPr>
+              <w:t>gantt</w:t>
+            </w:r>
+            <w:proofErr w:type="spellEnd"/>
+            <w:r>
+              <w:rPr>
+                <w:rFonts w:ascii="Arial" w:hAnsi="Arial" w:cs="Arial"/>
+              </w:rPr>
+              <w:t xml:space="preserve"> e diario</w:t>
             </w:r>
           </w:p>
         </w:tc>
@@ -234,7 +248,21 @@
               <w:rPr>
                 <w:rFonts w:ascii="Arial" w:hAnsi="Arial" w:cs="Arial"/>
               </w:rPr>
-              <w:t>Riflettuto sui requisiti e user story del gioco, iniziato scrittura documentazione e sincronizzazione progetto a GitLab.</w:t>
+              <w:t xml:space="preserve">Riflettuto sui requisiti e user story del gioco, iniziato scrittura documentazione e sincronizzazione progetto a </w:t>
+            </w:r>
+            <w:proofErr w:type="spellStart"/>
+            <w:r>
+              <w:rPr>
+                <w:rFonts w:ascii="Arial" w:hAnsi="Arial" w:cs="Arial"/>
+              </w:rPr>
+              <w:t>GitLab</w:t>
+            </w:r>
+            <w:proofErr w:type="spellEnd"/>
+            <w:r>
+              <w:rPr>
+                <w:rFonts w:ascii="Arial" w:hAnsi="Arial" w:cs="Arial"/>
+              </w:rPr>
+              <w:t>.</w:t>
             </w:r>
           </w:p>
         </w:tc>
@@ -675,7 +703,25 @@
               <w:b/>
               <w:bCs/>
             </w:rPr>
-            <w:t>Nomi AI utilizzati</w:t>
+            <w:t xml:space="preserve">Nomi </w:t>
+          </w:r>
+          <w:proofErr w:type="gramStart"/>
+          <w:r>
+            <w:rPr>
+              <w:rStyle w:val="Testosegnaposto"/>
+              <w:b/>
+              <w:bCs/>
+            </w:rPr>
+            <w:t>AI</w:t>
+          </w:r>
+          <w:proofErr w:type="gramEnd"/>
+          <w:r>
+            <w:rPr>
+              <w:rStyle w:val="Testosegnaposto"/>
+              <w:b/>
+              <w:bCs/>
+            </w:rPr>
+            <w:t xml:space="preserve"> utilizzati</w:t>
           </w:r>
         </w:sdtContent>
       </w:sdt>
@@ -1756,7 +1802,21 @@
               <w:rPr>
                 <w:rFonts w:ascii="Arial" w:hAnsi="Arial" w:cs="Arial"/>
               </w:rPr>
-              <w:t>Iniziare e completare analisi dei mezzi, creare lo use case</w:t>
+              <w:t xml:space="preserve">Iniziare e completare analisi dei mezzi, creare </w:t>
+            </w:r>
+            <w:proofErr w:type="gramStart"/>
+            <w:r>
+              <w:rPr>
+                <w:rFonts w:ascii="Arial" w:hAnsi="Arial" w:cs="Arial"/>
+              </w:rPr>
+              <w:t>lo use</w:t>
+            </w:r>
+            <w:proofErr w:type="gramEnd"/>
+            <w:r>
+              <w:rPr>
+                <w:rFonts w:ascii="Arial" w:hAnsi="Arial" w:cs="Arial"/>
+              </w:rPr>
+              <w:t xml:space="preserve"> case</w:t>
             </w:r>
             <w:r>
               <w:rPr>
@@ -2234,7 +2294,21 @@
             <w:rPr>
               <w:rFonts w:ascii="Arial" w:hAnsi="Arial" w:cs="Arial"/>
             </w:rPr>
-            <w:t>Aitami a generare dei requesiti in base ai seguenti dati</w:t>
+            <w:t xml:space="preserve">Aitami a generare dei </w:t>
+          </w:r>
+          <w:proofErr w:type="spellStart"/>
+          <w:r>
+            <w:rPr>
+              <w:rFonts w:ascii="Arial" w:hAnsi="Arial" w:cs="Arial"/>
+            </w:rPr>
+            <w:t>requesiti</w:t>
+          </w:r>
+          <w:proofErr w:type="spellEnd"/>
+          <w:r>
+            <w:rPr>
+              <w:rFonts w:ascii="Arial" w:hAnsi="Arial" w:cs="Arial"/>
+            </w:rPr>
+            <w:t xml:space="preserve"> in base ai seguenti dati</w:t>
           </w:r>
         </w:p>
       </w:sdtContent>
@@ -2774,7 +2848,21 @@
               <w:rPr>
                 <w:rFonts w:ascii="Arial" w:hAnsi="Arial" w:cs="Arial"/>
               </w:rPr>
-              <w:t>Completata la analisi del dominio nella documentazione, inizio ricerche riguardo Unity.</w:t>
+              <w:t xml:space="preserve">Completata la analisi del dominio nella documentazione, inizio ricerche riguardo </w:t>
+            </w:r>
+            <w:proofErr w:type="spellStart"/>
+            <w:r>
+              <w:rPr>
+                <w:rFonts w:ascii="Arial" w:hAnsi="Arial" w:cs="Arial"/>
+              </w:rPr>
+              <w:t>Unity</w:t>
+            </w:r>
+            <w:proofErr w:type="spellEnd"/>
+            <w:r>
+              <w:rPr>
+                <w:rFonts w:ascii="Arial" w:hAnsi="Arial" w:cs="Arial"/>
+              </w:rPr>
+              <w:t>.</w:t>
             </w:r>
           </w:p>
         </w:tc>
@@ -2949,7 +3037,21 @@
               <w:rPr>
                 <w:rFonts w:ascii="Arial" w:hAnsi="Arial" w:cs="Arial"/>
               </w:rPr>
-              <w:t>Il diagramma ER non è completo e lo use case non è stato iniziato, analisi dei mezzi non ancora completata.</w:t>
+              <w:t xml:space="preserve">Il diagramma ER non è completo e </w:t>
+            </w:r>
+            <w:proofErr w:type="gramStart"/>
+            <w:r>
+              <w:rPr>
+                <w:rFonts w:ascii="Arial" w:hAnsi="Arial" w:cs="Arial"/>
+              </w:rPr>
+              <w:t>lo use</w:t>
+            </w:r>
+            <w:proofErr w:type="gramEnd"/>
+            <w:r>
+              <w:rPr>
+                <w:rFonts w:ascii="Arial" w:hAnsi="Arial" w:cs="Arial"/>
+              </w:rPr>
+              <w:t xml:space="preserve"> case non è stato iniziato, analisi dei mezzi non ancora completata.</w:t>
             </w:r>
           </w:p>
         </w:tc>
@@ -3981,8 +4083,16 @@
               <w:rPr>
                 <w:rFonts w:ascii="Arial" w:hAnsi="Arial" w:cs="Arial"/>
               </w:rPr>
-              <w:t>Creato diagramma ER e modifiche strutturali gantt</w:t>
-            </w:r>
+              <w:t xml:space="preserve">Creato diagramma ER e modifiche strutturali </w:t>
+            </w:r>
+            <w:proofErr w:type="spellStart"/>
+            <w:r>
+              <w:rPr>
+                <w:rFonts w:ascii="Arial" w:hAnsi="Arial" w:cs="Arial"/>
+              </w:rPr>
+              <w:t>gantt</w:t>
+            </w:r>
+            <w:proofErr w:type="spellEnd"/>
           </w:p>
         </w:tc>
       </w:tr>
@@ -4730,12 +4840,20 @@
             <w:rPr>
               <w:rFonts w:ascii="Arial" w:hAnsi="Arial" w:cs="Arial"/>
             </w:rPr>
-            <w:t>uoi dirmi delle classiche impostazioni per un gioco di guida in stile br</w:t>
-          </w:r>
+            <w:t xml:space="preserve">uoi dirmi delle classiche impostazioni per un gioco di guida in stile </w:t>
+          </w:r>
+          <w:proofErr w:type="spellStart"/>
           <w:r>
             <w:rPr>
               <w:rFonts w:ascii="Arial" w:hAnsi="Arial" w:cs="Arial"/>
             </w:rPr>
+            <w:t>br</w:t>
+          </w:r>
+          <w:proofErr w:type="spellEnd"/>
+          <w:r>
+            <w:rPr>
+              <w:rFonts w:ascii="Arial" w:hAnsi="Arial" w:cs="Arial"/>
+            </w:rPr>
             <w:t xml:space="preserve">. </w:t>
           </w:r>
           <w:r>
@@ -4743,7 +4861,21 @@
               <w:rFonts w:ascii="Arial" w:hAnsi="Arial" w:cs="Arial"/>
             </w:rPr>
             <w:br/>
-            <w:t>Bryan: Spiegami Unity ed i suoi vantaggi.</w:t>
+            <w:t xml:space="preserve">Bryan: Spiegami </w:t>
+          </w:r>
+          <w:proofErr w:type="spellStart"/>
+          <w:r>
+            <w:rPr>
+              <w:rFonts w:ascii="Arial" w:hAnsi="Arial" w:cs="Arial"/>
+            </w:rPr>
+            <w:t>Unity</w:t>
+          </w:r>
+          <w:proofErr w:type="spellEnd"/>
+          <w:r>
+            <w:rPr>
+              <w:rFonts w:ascii="Arial" w:hAnsi="Arial" w:cs="Arial"/>
+            </w:rPr>
+            <w:t xml:space="preserve"> ed i suoi vantaggi.</w:t>
           </w:r>
         </w:p>
       </w:sdtContent>
@@ -5221,8 +5353,16 @@
               <w:rPr>
                 <w:rFonts w:ascii="Arial" w:hAnsi="Arial" w:cs="Arial"/>
               </w:rPr>
-              <w:t>Creato Diagramma ER e aggiornato gannt</w:t>
-            </w:r>
+              <w:t xml:space="preserve">Creato Diagramma ER e aggiornato </w:t>
+            </w:r>
+            <w:proofErr w:type="spellStart"/>
+            <w:r>
+              <w:rPr>
+                <w:rFonts w:ascii="Arial" w:hAnsi="Arial" w:cs="Arial"/>
+              </w:rPr>
+              <w:t>gannt</w:t>
+            </w:r>
+            <w:proofErr w:type="spellEnd"/>
           </w:p>
         </w:tc>
       </w:tr>
@@ -5259,7 +5399,21 @@
               <w:rPr>
                 <w:rFonts w:ascii="Arial" w:hAnsi="Arial" w:cs="Arial"/>
               </w:rPr>
-              <w:t>Use Case finito, Inizio creazione e documentazione mockup UI.</w:t>
+              <w:t xml:space="preserve">Use Case finito, Inizio creazione e documentazione </w:t>
+            </w:r>
+            <w:proofErr w:type="spellStart"/>
+            <w:r>
+              <w:rPr>
+                <w:rFonts w:ascii="Arial" w:hAnsi="Arial" w:cs="Arial"/>
+              </w:rPr>
+              <w:t>mockup</w:t>
+            </w:r>
+            <w:proofErr w:type="spellEnd"/>
+            <w:r>
+              <w:rPr>
+                <w:rFonts w:ascii="Arial" w:hAnsi="Arial" w:cs="Arial"/>
+              </w:rPr>
+              <w:t xml:space="preserve"> UI.</w:t>
             </w:r>
           </w:p>
         </w:tc>
@@ -5376,7 +5530,21 @@
               <w:rPr>
                 <w:rFonts w:ascii="Arial" w:hAnsi="Arial" w:cs="Arial"/>
               </w:rPr>
-              <w:t>Riuscire a definire le azioni degli attori nel Use Case, risolto approfondendo meglio.</w:t>
+              <w:t xml:space="preserve">Riuscire a definire le azioni degli attori </w:t>
+            </w:r>
+            <w:proofErr w:type="gramStart"/>
+            <w:r>
+              <w:rPr>
+                <w:rFonts w:ascii="Arial" w:hAnsi="Arial" w:cs="Arial"/>
+              </w:rPr>
+              <w:t>nel Use</w:t>
+            </w:r>
+            <w:proofErr w:type="gramEnd"/>
+            <w:r>
+              <w:rPr>
+                <w:rFonts w:ascii="Arial" w:hAnsi="Arial" w:cs="Arial"/>
+              </w:rPr>
+              <w:t xml:space="preserve"> Case, risolto approfondendo meglio.</w:t>
             </w:r>
           </w:p>
         </w:tc>
@@ -5505,7 +5673,21 @@
               <w:rPr>
                 <w:rFonts w:ascii="Arial" w:hAnsi="Arial" w:cs="Arial"/>
               </w:rPr>
-              <w:t>Continuo creazione Mockup UI.</w:t>
+              <w:t xml:space="preserve">Continuo creazione </w:t>
+            </w:r>
+            <w:proofErr w:type="spellStart"/>
+            <w:r>
+              <w:rPr>
+                <w:rFonts w:ascii="Arial" w:hAnsi="Arial" w:cs="Arial"/>
+              </w:rPr>
+              <w:t>Mockup</w:t>
+            </w:r>
+            <w:proofErr w:type="spellEnd"/>
+            <w:r>
+              <w:rPr>
+                <w:rFonts w:ascii="Arial" w:hAnsi="Arial" w:cs="Arial"/>
+              </w:rPr>
+              <w:t xml:space="preserve"> UI.</w:t>
             </w:r>
           </w:p>
         </w:tc>
@@ -6076,8 +6258,30 @@
               <w:rFonts w:ascii="Arial" w:hAnsi="Arial" w:cs="Arial"/>
             </w:rPr>
             <w:br/>
-            <w:t>Bryan: Correzioni dello use case generato dal colega</w:t>
-          </w:r>
+            <w:t xml:space="preserve">Bryan: Correzioni </w:t>
+          </w:r>
+          <w:proofErr w:type="gramStart"/>
+          <w:r>
+            <w:rPr>
+              <w:rFonts w:ascii="Arial" w:hAnsi="Arial" w:cs="Arial"/>
+            </w:rPr>
+            <w:t>dello use</w:t>
+          </w:r>
+          <w:proofErr w:type="gramEnd"/>
+          <w:r>
+            <w:rPr>
+              <w:rFonts w:ascii="Arial" w:hAnsi="Arial" w:cs="Arial"/>
+            </w:rPr>
+            <w:t xml:space="preserve"> case generato dal </w:t>
+          </w:r>
+          <w:proofErr w:type="spellStart"/>
+          <w:r>
+            <w:rPr>
+              <w:rFonts w:ascii="Arial" w:hAnsi="Arial" w:cs="Arial"/>
+            </w:rPr>
+            <w:t>colega</w:t>
+          </w:r>
+          <w:proofErr w:type="spellEnd"/>
         </w:p>
       </w:sdtContent>
     </w:sdt>
@@ -6477,8 +6681,16 @@
               <w:rPr>
                 <w:rFonts w:ascii="Arial" w:hAnsi="Arial" w:cs="Arial"/>
               </w:rPr>
-              <w:t>Completata progettazione e creazione progetto unity</w:t>
-            </w:r>
+              <w:t xml:space="preserve">Completata progettazione e creazione progetto </w:t>
+            </w:r>
+            <w:proofErr w:type="spellStart"/>
+            <w:r>
+              <w:rPr>
+                <w:rFonts w:ascii="Arial" w:hAnsi="Arial" w:cs="Arial"/>
+              </w:rPr>
+              <w:t>unity</w:t>
+            </w:r>
+            <w:proofErr w:type="spellEnd"/>
           </w:p>
         </w:tc>
       </w:tr>
@@ -6515,8 +6727,16 @@
               <w:rPr>
                 <w:rFonts w:ascii="Arial" w:hAnsi="Arial" w:cs="Arial"/>
               </w:rPr>
-              <w:t>Fine Mockup</w:t>
-            </w:r>
+              <w:t xml:space="preserve">Fine </w:t>
+            </w:r>
+            <w:proofErr w:type="spellStart"/>
+            <w:r>
+              <w:rPr>
+                <w:rFonts w:ascii="Arial" w:hAnsi="Arial" w:cs="Arial"/>
+              </w:rPr>
+              <w:t>Mockup</w:t>
+            </w:r>
+            <w:proofErr w:type="spellEnd"/>
           </w:p>
         </w:tc>
       </w:tr>
@@ -6594,8 +6814,52 @@
               <w:rPr>
                 <w:rFonts w:ascii="Arial" w:hAnsi="Arial" w:cs="Arial"/>
               </w:rPr>
-              <w:t>Problemi nel pushare il progetto uinity, risolto grazie alla creazione di un file .gitignore</w:t>
-            </w:r>
+              <w:t xml:space="preserve">Problemi nel </w:t>
+            </w:r>
+            <w:proofErr w:type="spellStart"/>
+            <w:r>
+              <w:rPr>
+                <w:rFonts w:ascii="Arial" w:hAnsi="Arial" w:cs="Arial"/>
+              </w:rPr>
+              <w:t>pushare</w:t>
+            </w:r>
+            <w:proofErr w:type="spellEnd"/>
+            <w:r>
+              <w:rPr>
+                <w:rFonts w:ascii="Arial" w:hAnsi="Arial" w:cs="Arial"/>
+              </w:rPr>
+              <w:t xml:space="preserve"> il progetto </w:t>
+            </w:r>
+            <w:proofErr w:type="spellStart"/>
+            <w:r>
+              <w:rPr>
+                <w:rFonts w:ascii="Arial" w:hAnsi="Arial" w:cs="Arial"/>
+              </w:rPr>
+              <w:t>uinity</w:t>
+            </w:r>
+            <w:proofErr w:type="spellEnd"/>
+            <w:r>
+              <w:rPr>
+                <w:rFonts w:ascii="Arial" w:hAnsi="Arial" w:cs="Arial"/>
+              </w:rPr>
+              <w:t xml:space="preserve">, risolto grazie alla creazione di un </w:t>
+            </w:r>
+            <w:proofErr w:type="gramStart"/>
+            <w:r>
+              <w:rPr>
+                <w:rFonts w:ascii="Arial" w:hAnsi="Arial" w:cs="Arial"/>
+              </w:rPr>
+              <w:t>file .</w:t>
+            </w:r>
+            <w:proofErr w:type="spellStart"/>
+            <w:r>
+              <w:rPr>
+                <w:rFonts w:ascii="Arial" w:hAnsi="Arial" w:cs="Arial"/>
+              </w:rPr>
+              <w:t>gitignore</w:t>
+            </w:r>
+            <w:proofErr w:type="spellEnd"/>
+            <w:proofErr w:type="gramEnd"/>
           </w:p>
         </w:tc>
       </w:tr>
@@ -6748,7 +7012,35 @@
               <w:rPr>
                 <w:rFonts w:ascii="Arial" w:hAnsi="Arial" w:cs="Arial"/>
               </w:rPr>
-              <w:t>Ambientarsi nel game engine di unity e quindi cominciare a creare la schermata di statistiche</w:t>
+              <w:t xml:space="preserve">Ambientarsi nel game </w:t>
+            </w:r>
+            <w:proofErr w:type="spellStart"/>
+            <w:r>
+              <w:rPr>
+                <w:rFonts w:ascii="Arial" w:hAnsi="Arial" w:cs="Arial"/>
+              </w:rPr>
+              <w:t>engine</w:t>
+            </w:r>
+            <w:proofErr w:type="spellEnd"/>
+            <w:r>
+              <w:rPr>
+                <w:rFonts w:ascii="Arial" w:hAnsi="Arial" w:cs="Arial"/>
+              </w:rPr>
+              <w:t xml:space="preserve"> di </w:t>
+            </w:r>
+            <w:proofErr w:type="spellStart"/>
+            <w:r>
+              <w:rPr>
+                <w:rFonts w:ascii="Arial" w:hAnsi="Arial" w:cs="Arial"/>
+              </w:rPr>
+              <w:t>unity</w:t>
+            </w:r>
+            <w:proofErr w:type="spellEnd"/>
+            <w:r>
+              <w:rPr>
+                <w:rFonts w:ascii="Arial" w:hAnsi="Arial" w:cs="Arial"/>
+              </w:rPr>
+              <w:t xml:space="preserve"> e quindi cominciare a creare la schermata di statistiche</w:t>
             </w:r>
           </w:p>
         </w:tc>
@@ -7220,7 +7512,21 @@
             <w:rPr>
               <w:rFonts w:ascii="Arial" w:hAnsi="Arial" w:cs="Arial"/>
             </w:rPr>
-            <w:t>Bryan: Generami un’immagine di mockup basandoti sul seguente stile: “stile”</w:t>
+            <w:t xml:space="preserve">Bryan: Generami un’immagine di </w:t>
+          </w:r>
+          <w:proofErr w:type="spellStart"/>
+          <w:r>
+            <w:rPr>
+              <w:rFonts w:ascii="Arial" w:hAnsi="Arial" w:cs="Arial"/>
+            </w:rPr>
+            <w:t>mockup</w:t>
+          </w:r>
+          <w:proofErr w:type="spellEnd"/>
+          <w:r>
+            <w:rPr>
+              <w:rFonts w:ascii="Arial" w:hAnsi="Arial" w:cs="Arial"/>
+            </w:rPr>
+            <w:t xml:space="preserve"> basandoti sul seguente stile: “stile”</w:t>
           </w:r>
         </w:p>
         <w:p>
@@ -7534,14 +7840,58 @@
         <w:rPr>
           <w:rFonts w:ascii="Arial" w:hAnsi="Arial" w:cs="Arial"/>
         </w:rPr>
-        <w:t>Riley: probabilmente non sarei riuscito a risolvere questo problema non avendo un’esperienza molto avanzata con i file .gitignore</w:t>
-      </w:r>
+        <w:t xml:space="preserve">Riley: probabilmente non sarei riuscito a risolvere questo problema non avendo un’esperienza molto avanzata con i </w:t>
+      </w:r>
+      <w:proofErr w:type="gramStart"/>
+      <w:r>
+        <w:rPr>
+          <w:rFonts w:ascii="Arial" w:hAnsi="Arial" w:cs="Arial"/>
+        </w:rPr>
+        <w:t>file .</w:t>
+      </w:r>
+      <w:proofErr w:type="spellStart"/>
+      <w:r>
+        <w:rPr>
+          <w:rFonts w:ascii="Arial" w:hAnsi="Arial" w:cs="Arial"/>
+        </w:rPr>
+        <w:t>gitignore</w:t>
+      </w:r>
+      <w:proofErr w:type="spellEnd"/>
+      <w:proofErr w:type="gramEnd"/>
       <w:r>
         <w:rPr>
           <w:rFonts w:ascii="Arial" w:hAnsi="Arial" w:cs="Arial"/>
         </w:rPr>
         <w:br/>
-        <w:t>Bryan: Averi creato un’immagine su paint che avrebbe reso i mockup molto più confusi.</w:t>
+        <w:t xml:space="preserve">Bryan: Averi creato un’immagine su </w:t>
+      </w:r>
+      <w:proofErr w:type="spellStart"/>
+      <w:r>
+        <w:rPr>
+          <w:rFonts w:ascii="Arial" w:hAnsi="Arial" w:cs="Arial"/>
+        </w:rPr>
+        <w:t>paint</w:t>
+      </w:r>
+      <w:proofErr w:type="spellEnd"/>
+      <w:r>
+        <w:rPr>
+          <w:rFonts w:ascii="Arial" w:hAnsi="Arial" w:cs="Arial"/>
+        </w:rPr>
+        <w:t xml:space="preserve"> che avrebbe reso i </w:t>
+      </w:r>
+      <w:proofErr w:type="spellStart"/>
+      <w:r>
+        <w:rPr>
+          <w:rFonts w:ascii="Arial" w:hAnsi="Arial" w:cs="Arial"/>
+        </w:rPr>
+        <w:t>mockup</w:t>
+      </w:r>
+      <w:proofErr w:type="spellEnd"/>
+      <w:r>
+        <w:rPr>
+          <w:rFonts w:ascii="Arial" w:hAnsi="Arial" w:cs="Arial"/>
+        </w:rPr>
+        <w:t xml:space="preserve"> molto più confusi.</w:t>
       </w:r>
     </w:p>
     <w:p>
@@ -7727,7 +8077,21 @@
               <w:rPr>
                 <w:rFonts w:ascii="Arial" w:hAnsi="Arial" w:cs="Arial"/>
               </w:rPr>
-              <w:t>Inizio sviluppo ui statistiche</w:t>
+              <w:t xml:space="preserve">Inizio sviluppo </w:t>
+            </w:r>
+            <w:proofErr w:type="spellStart"/>
+            <w:r>
+              <w:rPr>
+                <w:rFonts w:ascii="Arial" w:hAnsi="Arial" w:cs="Arial"/>
+              </w:rPr>
+              <w:t>ui</w:t>
+            </w:r>
+            <w:proofErr w:type="spellEnd"/>
+            <w:r>
+              <w:rPr>
+                <w:rFonts w:ascii="Arial" w:hAnsi="Arial" w:cs="Arial"/>
+              </w:rPr>
+              <w:t xml:space="preserve"> statistiche</w:t>
             </w:r>
           </w:p>
         </w:tc>
@@ -7765,7 +8129,21 @@
               <w:rPr>
                 <w:rFonts w:ascii="Arial" w:hAnsi="Arial" w:cs="Arial"/>
               </w:rPr>
-              <w:t>Inizio sviluppo ui statistiche</w:t>
+              <w:t xml:space="preserve">Inizio sviluppo </w:t>
+            </w:r>
+            <w:proofErr w:type="spellStart"/>
+            <w:r>
+              <w:rPr>
+                <w:rFonts w:ascii="Arial" w:hAnsi="Arial" w:cs="Arial"/>
+              </w:rPr>
+              <w:t>ui</w:t>
+            </w:r>
+            <w:proofErr w:type="spellEnd"/>
+            <w:r>
+              <w:rPr>
+                <w:rFonts w:ascii="Arial" w:hAnsi="Arial" w:cs="Arial"/>
+              </w:rPr>
+              <w:t xml:space="preserve"> statistiche</w:t>
             </w:r>
           </w:p>
         </w:tc>
@@ -7998,7 +8376,21 @@
               <w:rPr>
                 <w:rFonts w:ascii="Arial" w:hAnsi="Arial" w:cs="Arial"/>
               </w:rPr>
-              <w:t>Completare la ui delle statistiche</w:t>
+              <w:t xml:space="preserve">Completare la </w:t>
+            </w:r>
+            <w:proofErr w:type="spellStart"/>
+            <w:r>
+              <w:rPr>
+                <w:rFonts w:ascii="Arial" w:hAnsi="Arial" w:cs="Arial"/>
+              </w:rPr>
+              <w:t>ui</w:t>
+            </w:r>
+            <w:proofErr w:type="spellEnd"/>
+            <w:r>
+              <w:rPr>
+                <w:rFonts w:ascii="Arial" w:hAnsi="Arial" w:cs="Arial"/>
+              </w:rPr>
+              <w:t xml:space="preserve"> delle statistiche</w:t>
             </w:r>
           </w:p>
         </w:tc>
@@ -8048,12 +8440,28 @@
                 <w:rFonts w:ascii="Arial" w:hAnsi="Arial" w:cs="Arial"/>
               </w:rPr>
             </w:pPr>
-            <w:r>
-              <w:rPr>
-                <w:rFonts w:ascii="Arial" w:hAnsi="Arial" w:cs="Arial"/>
-              </w:rPr>
-              <w:t>Daily Scrum</w:t>
-            </w:r>
+            <w:proofErr w:type="spellStart"/>
+            <w:r>
+              <w:rPr>
+                <w:rFonts w:ascii="Arial" w:hAnsi="Arial" w:cs="Arial"/>
+              </w:rPr>
+              <w:t>Daily</w:t>
+            </w:r>
+            <w:proofErr w:type="spellEnd"/>
+            <w:r>
+              <w:rPr>
+                <w:rFonts w:ascii="Arial" w:hAnsi="Arial" w:cs="Arial"/>
+              </w:rPr>
+              <w:t xml:space="preserve"> </w:t>
+            </w:r>
+            <w:proofErr w:type="spellStart"/>
+            <w:r>
+              <w:rPr>
+                <w:rFonts w:ascii="Arial" w:hAnsi="Arial" w:cs="Arial"/>
+              </w:rPr>
+              <w:t>Scrum</w:t>
+            </w:r>
+            <w:proofErr w:type="spellEnd"/>
           </w:p>
         </w:tc>
       </w:tr>
@@ -8101,7 +8509,35 @@
               <w:rPr>
                 <w:rFonts w:ascii="Arial" w:hAnsi="Arial" w:cs="Arial"/>
               </w:rPr>
-              <w:t>Introduzione ambiente unity e inizio imostazione layout statistiche</w:t>
+              <w:t xml:space="preserve">Introduzione ambiente </w:t>
+            </w:r>
+            <w:proofErr w:type="spellStart"/>
+            <w:r>
+              <w:rPr>
+                <w:rFonts w:ascii="Arial" w:hAnsi="Arial" w:cs="Arial"/>
+              </w:rPr>
+              <w:t>unity</w:t>
+            </w:r>
+            <w:proofErr w:type="spellEnd"/>
+            <w:r>
+              <w:rPr>
+                <w:rFonts w:ascii="Arial" w:hAnsi="Arial" w:cs="Arial"/>
+              </w:rPr>
+              <w:t xml:space="preserve"> e inizio </w:t>
+            </w:r>
+            <w:proofErr w:type="spellStart"/>
+            <w:r>
+              <w:rPr>
+                <w:rFonts w:ascii="Arial" w:hAnsi="Arial" w:cs="Arial"/>
+              </w:rPr>
+              <w:t>imostazione</w:t>
+            </w:r>
+            <w:proofErr w:type="spellEnd"/>
+            <w:r>
+              <w:rPr>
+                <w:rFonts w:ascii="Arial" w:hAnsi="Arial" w:cs="Arial"/>
+              </w:rPr>
+              <w:t xml:space="preserve"> layout statistiche</w:t>
             </w:r>
           </w:p>
         </w:tc>
@@ -8281,8 +8717,16 @@
               <w:rPr>
                 <w:rFonts w:ascii="Arial" w:hAnsi="Arial" w:cs="Arial"/>
               </w:rPr>
-              <w:t>Sprint Retrospective</w:t>
-            </w:r>
+              <w:t xml:space="preserve">Sprint </w:t>
+            </w:r>
+            <w:proofErr w:type="spellStart"/>
+            <w:r>
+              <w:rPr>
+                <w:rFonts w:ascii="Arial" w:hAnsi="Arial" w:cs="Arial"/>
+              </w:rPr>
+              <w:t>Retrospective</w:t>
+            </w:r>
+            <w:proofErr w:type="spellEnd"/>
           </w:p>
         </w:tc>
       </w:tr>
@@ -9243,8 +9687,44 @@
               <w:rPr>
                 <w:rFonts w:ascii="Arial" w:hAnsi="Arial" w:cs="Arial"/>
               </w:rPr>
-              <w:t>Ricerca e sviluppo per salvataggio statistiche su json, non ancora completo, questo verrà utilizzato come test per verificare il funzionamento delle varie schermate ui poi verrà adattato per il db</w:t>
-            </w:r>
+              <w:t xml:space="preserve">Ricerca e sviluppo per salvataggio statistiche su </w:t>
+            </w:r>
+            <w:proofErr w:type="spellStart"/>
+            <w:r>
+              <w:rPr>
+                <w:rFonts w:ascii="Arial" w:hAnsi="Arial" w:cs="Arial"/>
+              </w:rPr>
+              <w:t>json</w:t>
+            </w:r>
+            <w:proofErr w:type="spellEnd"/>
+            <w:r>
+              <w:rPr>
+                <w:rFonts w:ascii="Arial" w:hAnsi="Arial" w:cs="Arial"/>
+              </w:rPr>
+              <w:t xml:space="preserve">, non ancora completo, questo verrà utilizzato come test per verificare il funzionamento delle varie schermate </w:t>
+            </w:r>
+            <w:proofErr w:type="spellStart"/>
+            <w:r>
+              <w:rPr>
+                <w:rFonts w:ascii="Arial" w:hAnsi="Arial" w:cs="Arial"/>
+              </w:rPr>
+              <w:t>ui</w:t>
+            </w:r>
+            <w:proofErr w:type="spellEnd"/>
+            <w:r>
+              <w:rPr>
+                <w:rFonts w:ascii="Arial" w:hAnsi="Arial" w:cs="Arial"/>
+              </w:rPr>
+              <w:t xml:space="preserve"> poi verrà adattato per il </w:t>
+            </w:r>
+            <w:proofErr w:type="spellStart"/>
+            <w:r>
+              <w:rPr>
+                <w:rFonts w:ascii="Arial" w:hAnsi="Arial" w:cs="Arial"/>
+              </w:rPr>
+              <w:t>db</w:t>
+            </w:r>
+            <w:proofErr w:type="spellEnd"/>
           </w:p>
         </w:tc>
       </w:tr>
@@ -9398,7 +9878,21 @@
               <w:rPr>
                 <w:rFonts w:ascii="Arial" w:hAnsi="Arial" w:cs="Arial"/>
               </w:rPr>
-              <w:t>Non trovavo la cartella degli assets, risolto cercando su google.</w:t>
+              <w:t xml:space="preserve">Non trovavo la cartella degli assets, risolto cercando su </w:t>
+            </w:r>
+            <w:proofErr w:type="spellStart"/>
+            <w:r>
+              <w:rPr>
+                <w:rFonts w:ascii="Arial" w:hAnsi="Arial" w:cs="Arial"/>
+              </w:rPr>
+              <w:t>google</w:t>
+            </w:r>
+            <w:proofErr w:type="spellEnd"/>
+            <w:r>
+              <w:rPr>
+                <w:rFonts w:ascii="Arial" w:hAnsi="Arial" w:cs="Arial"/>
+              </w:rPr>
+              <w:t>.</w:t>
             </w:r>
           </w:p>
         </w:tc>
@@ -9456,7 +9950,21 @@
               <w:rPr>
                 <w:rFonts w:ascii="Arial" w:hAnsi="Arial" w:cs="Arial"/>
               </w:rPr>
-              <w:t>Le statistiche non sono concluse, manca una piccola parte della ui e la logica di salvataggio e caricamento</w:t>
+              <w:t xml:space="preserve">Le statistiche non sono concluse, manca una piccola parte della </w:t>
+            </w:r>
+            <w:proofErr w:type="spellStart"/>
+            <w:r>
+              <w:rPr>
+                <w:rFonts w:ascii="Arial" w:hAnsi="Arial" w:cs="Arial"/>
+              </w:rPr>
+              <w:t>ui</w:t>
+            </w:r>
+            <w:proofErr w:type="spellEnd"/>
+            <w:r>
+              <w:rPr>
+                <w:rFonts w:ascii="Arial" w:hAnsi="Arial" w:cs="Arial"/>
+              </w:rPr>
+              <w:t xml:space="preserve"> e la logica di salvataggio e caricamento</w:t>
             </w:r>
           </w:p>
         </w:tc>
@@ -9564,12 +10072,28 @@
                 <w:rFonts w:ascii="Arial" w:hAnsi="Arial" w:cs="Arial"/>
               </w:rPr>
             </w:pPr>
-            <w:r>
-              <w:rPr>
-                <w:rFonts w:ascii="Arial" w:hAnsi="Arial" w:cs="Arial"/>
-              </w:rPr>
-              <w:t>Daily Scrum</w:t>
-            </w:r>
+            <w:proofErr w:type="spellStart"/>
+            <w:r>
+              <w:rPr>
+                <w:rFonts w:ascii="Arial" w:hAnsi="Arial" w:cs="Arial"/>
+              </w:rPr>
+              <w:t>Daily</w:t>
+            </w:r>
+            <w:proofErr w:type="spellEnd"/>
+            <w:r>
+              <w:rPr>
+                <w:rFonts w:ascii="Arial" w:hAnsi="Arial" w:cs="Arial"/>
+              </w:rPr>
+              <w:t xml:space="preserve"> </w:t>
+            </w:r>
+            <w:proofErr w:type="spellStart"/>
+            <w:r>
+              <w:rPr>
+                <w:rFonts w:ascii="Arial" w:hAnsi="Arial" w:cs="Arial"/>
+              </w:rPr>
+              <w:t>Scrum</w:t>
+            </w:r>
+            <w:proofErr w:type="spellEnd"/>
           </w:p>
         </w:tc>
       </w:tr>
@@ -9617,7 +10141,35 @@
               <w:rPr>
                 <w:rFonts w:ascii="Arial" w:hAnsi="Arial" w:cs="Arial"/>
               </w:rPr>
-              <w:t>Entrambi completeremo la ui delle statistiche in modo tale che ci ambientiamo completamente per lo sviluppo 2D e gli script C# per poterci permettere di lavorare separatamente in fututro.</w:t>
+              <w:t xml:space="preserve">Entrambi completeremo la </w:t>
+            </w:r>
+            <w:proofErr w:type="spellStart"/>
+            <w:r>
+              <w:rPr>
+                <w:rFonts w:ascii="Arial" w:hAnsi="Arial" w:cs="Arial"/>
+              </w:rPr>
+              <w:t>ui</w:t>
+            </w:r>
+            <w:proofErr w:type="spellEnd"/>
+            <w:r>
+              <w:rPr>
+                <w:rFonts w:ascii="Arial" w:hAnsi="Arial" w:cs="Arial"/>
+              </w:rPr>
+              <w:t xml:space="preserve"> delle statistiche in modo tale che ci ambientiamo completamente per lo sviluppo 2D e gli script C# per poterci permettere di lavorare separatamente in </w:t>
+            </w:r>
+            <w:proofErr w:type="spellStart"/>
+            <w:r>
+              <w:rPr>
+                <w:rFonts w:ascii="Arial" w:hAnsi="Arial" w:cs="Arial"/>
+              </w:rPr>
+              <w:t>fututro</w:t>
+            </w:r>
+            <w:proofErr w:type="spellEnd"/>
+            <w:r>
+              <w:rPr>
+                <w:rFonts w:ascii="Arial" w:hAnsi="Arial" w:cs="Arial"/>
+              </w:rPr>
+              <w:t>.</w:t>
             </w:r>
           </w:p>
         </w:tc>
@@ -9797,8 +10349,16 @@
               <w:rPr>
                 <w:rFonts w:ascii="Arial" w:hAnsi="Arial" w:cs="Arial"/>
               </w:rPr>
-              <w:t>Sprint Retrospective</w:t>
-            </w:r>
+              <w:t xml:space="preserve">Sprint </w:t>
+            </w:r>
+            <w:proofErr w:type="spellStart"/>
+            <w:r>
+              <w:rPr>
+                <w:rFonts w:ascii="Arial" w:hAnsi="Arial" w:cs="Arial"/>
+              </w:rPr>
+              <w:t>Retrospective</w:t>
+            </w:r>
+            <w:proofErr w:type="spellEnd"/>
           </w:p>
         </w:tc>
       </w:tr>
@@ -10290,8 +10850,30 @@
             <w:rPr>
               <w:rFonts w:ascii="Arial" w:hAnsi="Arial" w:cs="Arial"/>
             </w:rPr>
-            <w:t>Riley: aiutami a comprendere come salvare dei dati unity su un json</w:t>
-          </w:r>
+            <w:t xml:space="preserve">Riley: aiutami a comprendere come salvare dei dati </w:t>
+          </w:r>
+          <w:proofErr w:type="spellStart"/>
+          <w:r>
+            <w:rPr>
+              <w:rFonts w:ascii="Arial" w:hAnsi="Arial" w:cs="Arial"/>
+            </w:rPr>
+            <w:t>unity</w:t>
+          </w:r>
+          <w:proofErr w:type="spellEnd"/>
+          <w:r>
+            <w:rPr>
+              <w:rFonts w:ascii="Arial" w:hAnsi="Arial" w:cs="Arial"/>
+            </w:rPr>
+            <w:t xml:space="preserve"> su un </w:t>
+          </w:r>
+          <w:proofErr w:type="spellStart"/>
+          <w:r>
+            <w:rPr>
+              <w:rFonts w:ascii="Arial" w:hAnsi="Arial" w:cs="Arial"/>
+            </w:rPr>
+            <w:t>json</w:t>
+          </w:r>
+          <w:proofErr w:type="spellEnd"/>
         </w:p>
       </w:sdtContent>
     </w:sdt>
@@ -10803,7 +11385,21 @@
               <w:rPr>
                 <w:rFonts w:ascii="Arial" w:hAnsi="Arial" w:cs="Arial"/>
               </w:rPr>
-              <w:t>Terminato ui statistiche e iniziato quella delle impostazioni</w:t>
+              <w:t xml:space="preserve">Terminato </w:t>
+            </w:r>
+            <w:proofErr w:type="spellStart"/>
+            <w:r>
+              <w:rPr>
+                <w:rFonts w:ascii="Arial" w:hAnsi="Arial" w:cs="Arial"/>
+              </w:rPr>
+              <w:t>ui</w:t>
+            </w:r>
+            <w:proofErr w:type="spellEnd"/>
+            <w:r>
+              <w:rPr>
+                <w:rFonts w:ascii="Arial" w:hAnsi="Arial" w:cs="Arial"/>
+              </w:rPr>
+              <w:t xml:space="preserve"> statistiche e iniziato quella delle impostazioni</w:t>
             </w:r>
           </w:p>
         </w:tc>
@@ -10882,13 +11478,97 @@
               <w:rPr>
                 <w:rFonts w:ascii="Arial" w:hAnsi="Arial" w:cs="Arial"/>
               </w:rPr>
-              <w:t>Problemi di merge, risolto tramite una configurazione di un tool di unity che permette di risolvere automaticamente i conflitti, è stato fatto una configurazione che fa avvia un file .cmd sotto la cartella tools questo piccolo script prende i file con conflitti rilevati da git e li traduce per unityyalmmerge facendo in modo che una volta usato il comando git pull non risultino più errori.</w:t>
-            </w:r>
-            <w:r>
-              <w:rPr>
-                <w:rFonts w:ascii="Arial" w:hAnsi="Arial" w:cs="Arial"/>
-              </w:rPr>
-              <w:t xml:space="preserve"> Chatgpt mi ha supportato nella risoluzione di questo problema</w:t>
+              <w:t xml:space="preserve">Problemi di merge, risolto tramite una configurazione di un tool di </w:t>
+            </w:r>
+            <w:proofErr w:type="spellStart"/>
+            <w:r>
+              <w:rPr>
+                <w:rFonts w:ascii="Arial" w:hAnsi="Arial" w:cs="Arial"/>
+              </w:rPr>
+              <w:t>unity</w:t>
+            </w:r>
+            <w:proofErr w:type="spellEnd"/>
+            <w:r>
+              <w:rPr>
+                <w:rFonts w:ascii="Arial" w:hAnsi="Arial" w:cs="Arial"/>
+              </w:rPr>
+              <w:t xml:space="preserve"> che permette di risolvere automaticamente i conflitti, è stato fatto una configurazione che fa avvia un file .</w:t>
+            </w:r>
+            <w:proofErr w:type="spellStart"/>
+            <w:r>
+              <w:rPr>
+                <w:rFonts w:ascii="Arial" w:hAnsi="Arial" w:cs="Arial"/>
+              </w:rPr>
+              <w:t>cmd</w:t>
+            </w:r>
+            <w:proofErr w:type="spellEnd"/>
+            <w:r>
+              <w:rPr>
+                <w:rFonts w:ascii="Arial" w:hAnsi="Arial" w:cs="Arial"/>
+              </w:rPr>
+              <w:t xml:space="preserve"> sotto la cartella tools questo piccolo script prende i file con conflitti rilevati da </w:t>
+            </w:r>
+            <w:proofErr w:type="spellStart"/>
+            <w:r>
+              <w:rPr>
+                <w:rFonts w:ascii="Arial" w:hAnsi="Arial" w:cs="Arial"/>
+              </w:rPr>
+              <w:t>git</w:t>
+            </w:r>
+            <w:proofErr w:type="spellEnd"/>
+            <w:r>
+              <w:rPr>
+                <w:rFonts w:ascii="Arial" w:hAnsi="Arial" w:cs="Arial"/>
+              </w:rPr>
+              <w:t xml:space="preserve"> e li traduce per </w:t>
+            </w:r>
+            <w:proofErr w:type="spellStart"/>
+            <w:r>
+              <w:rPr>
+                <w:rFonts w:ascii="Arial" w:hAnsi="Arial" w:cs="Arial"/>
+              </w:rPr>
+              <w:t>unityyalmmerge</w:t>
+            </w:r>
+            <w:proofErr w:type="spellEnd"/>
+            <w:r>
+              <w:rPr>
+                <w:rFonts w:ascii="Arial" w:hAnsi="Arial" w:cs="Arial"/>
+              </w:rPr>
+              <w:t xml:space="preserve"> facendo in modo che una volta usato il comando </w:t>
+            </w:r>
+            <w:proofErr w:type="spellStart"/>
+            <w:r>
+              <w:rPr>
+                <w:rFonts w:ascii="Arial" w:hAnsi="Arial" w:cs="Arial"/>
+              </w:rPr>
+              <w:t>git</w:t>
+            </w:r>
+            <w:proofErr w:type="spellEnd"/>
+            <w:r>
+              <w:rPr>
+                <w:rFonts w:ascii="Arial" w:hAnsi="Arial" w:cs="Arial"/>
+              </w:rPr>
+              <w:t xml:space="preserve"> pull non risultino più errori.</w:t>
+            </w:r>
+            <w:r>
+              <w:rPr>
+                <w:rFonts w:ascii="Arial" w:hAnsi="Arial" w:cs="Arial"/>
+              </w:rPr>
+              <w:t xml:space="preserve"> </w:t>
+            </w:r>
+            <w:proofErr w:type="spellStart"/>
+            <w:r>
+              <w:rPr>
+                <w:rFonts w:ascii="Arial" w:hAnsi="Arial" w:cs="Arial"/>
+              </w:rPr>
+              <w:t>Chatgpt</w:t>
+            </w:r>
+            <w:proofErr w:type="spellEnd"/>
+            <w:r>
+              <w:rPr>
+                <w:rFonts w:ascii="Arial" w:hAnsi="Arial" w:cs="Arial"/>
+              </w:rPr>
+              <w:t xml:space="preserve"> mi ha supportato nella risoluzione di questo problema</w:t>
             </w:r>
           </w:p>
         </w:tc>
@@ -10984,7 +11664,21 @@
               <w:rPr>
                 <w:rFonts w:ascii="Arial" w:hAnsi="Arial" w:cs="Arial"/>
               </w:rPr>
-              <w:t>La ui delle statistiche è completa ma mancano alcune parti dello script, di conseguenza abbiamo un ritardo generale.</w:t>
+              <w:t xml:space="preserve">La </w:t>
+            </w:r>
+            <w:proofErr w:type="spellStart"/>
+            <w:r>
+              <w:rPr>
+                <w:rFonts w:ascii="Arial" w:hAnsi="Arial" w:cs="Arial"/>
+              </w:rPr>
+              <w:t>ui</w:t>
+            </w:r>
+            <w:proofErr w:type="spellEnd"/>
+            <w:r>
+              <w:rPr>
+                <w:rFonts w:ascii="Arial" w:hAnsi="Arial" w:cs="Arial"/>
+              </w:rPr>
+              <w:t xml:space="preserve"> delle statistiche è completa ma mancano alcune parti dello script, di conseguenza abbiamo un ritardo generale.</w:t>
             </w:r>
           </w:p>
         </w:tc>
@@ -11042,7 +11736,21 @@
               <w:rPr>
                 <w:rFonts w:ascii="Arial" w:hAnsi="Arial" w:cs="Arial"/>
               </w:rPr>
-              <w:t>Terminare script statistiche, continuare ui impostazioni</w:t>
+              <w:t xml:space="preserve">Terminare script statistiche, continuare </w:t>
+            </w:r>
+            <w:proofErr w:type="spellStart"/>
+            <w:r>
+              <w:rPr>
+                <w:rFonts w:ascii="Arial" w:hAnsi="Arial" w:cs="Arial"/>
+              </w:rPr>
+              <w:t>ui</w:t>
+            </w:r>
+            <w:proofErr w:type="spellEnd"/>
+            <w:r>
+              <w:rPr>
+                <w:rFonts w:ascii="Arial" w:hAnsi="Arial" w:cs="Arial"/>
+              </w:rPr>
+              <w:t xml:space="preserve"> impostazioni</w:t>
             </w:r>
           </w:p>
         </w:tc>
@@ -11092,12 +11800,28 @@
                 <w:rFonts w:ascii="Arial" w:hAnsi="Arial" w:cs="Arial"/>
               </w:rPr>
             </w:pPr>
-            <w:r>
-              <w:rPr>
-                <w:rFonts w:ascii="Arial" w:hAnsi="Arial" w:cs="Arial"/>
-              </w:rPr>
-              <w:t>Daily Scrum</w:t>
-            </w:r>
+            <w:proofErr w:type="spellStart"/>
+            <w:r>
+              <w:rPr>
+                <w:rFonts w:ascii="Arial" w:hAnsi="Arial" w:cs="Arial"/>
+              </w:rPr>
+              <w:t>Daily</w:t>
+            </w:r>
+            <w:proofErr w:type="spellEnd"/>
+            <w:r>
+              <w:rPr>
+                <w:rFonts w:ascii="Arial" w:hAnsi="Arial" w:cs="Arial"/>
+              </w:rPr>
+              <w:t xml:space="preserve"> </w:t>
+            </w:r>
+            <w:proofErr w:type="spellStart"/>
+            <w:r>
+              <w:rPr>
+                <w:rFonts w:ascii="Arial" w:hAnsi="Arial" w:cs="Arial"/>
+              </w:rPr>
+              <w:t>Scrum</w:t>
+            </w:r>
+            <w:proofErr w:type="spellEnd"/>
           </w:p>
         </w:tc>
       </w:tr>
@@ -11145,7 +11869,21 @@
               <w:rPr>
                 <w:rFonts w:ascii="Arial" w:hAnsi="Arial" w:cs="Arial"/>
               </w:rPr>
-              <w:t>Riley deve risolvere un problema di merge riscontrato al tentativo di pull e poi continuare con lo script delle statistiche, invece Bryan deve fine la ui delle statistiche e preferibilmente iniziare con le impostazioni.</w:t>
+              <w:t xml:space="preserve">Riley deve risolvere un problema di merge riscontrato al tentativo di pull e poi continuare con lo script delle statistiche, invece Bryan deve fine la </w:t>
+            </w:r>
+            <w:proofErr w:type="spellStart"/>
+            <w:r>
+              <w:rPr>
+                <w:rFonts w:ascii="Arial" w:hAnsi="Arial" w:cs="Arial"/>
+              </w:rPr>
+              <w:t>ui</w:t>
+            </w:r>
+            <w:proofErr w:type="spellEnd"/>
+            <w:r>
+              <w:rPr>
+                <w:rFonts w:ascii="Arial" w:hAnsi="Arial" w:cs="Arial"/>
+              </w:rPr>
+              <w:t xml:space="preserve"> delle statistiche e preferibilmente iniziare con le impostazioni.</w:t>
             </w:r>
           </w:p>
         </w:tc>
@@ -11325,8 +12063,16 @@
               <w:rPr>
                 <w:rFonts w:ascii="Arial" w:hAnsi="Arial" w:cs="Arial"/>
               </w:rPr>
-              <w:t>Sprint Retrospective</w:t>
-            </w:r>
+              <w:t xml:space="preserve">Sprint </w:t>
+            </w:r>
+            <w:proofErr w:type="spellStart"/>
+            <w:r>
+              <w:rPr>
+                <w:rFonts w:ascii="Arial" w:hAnsi="Arial" w:cs="Arial"/>
+              </w:rPr>
+              <w:t>Retrospective</w:t>
+            </w:r>
+            <w:proofErr w:type="spellEnd"/>
           </w:p>
         </w:tc>
       </w:tr>
@@ -11830,7 +12576,21 @@
             <w:rPr>
               <w:rFonts w:ascii="Arial" w:hAnsi="Arial" w:cs="Arial"/>
             </w:rPr>
-            <w:t>Ho riscontrato un problema di merge nonostante abbiamo impostato un sistema con un tool unity, puoi dirmi cosa analizzare per risolvere?</w:t>
+            <w:t xml:space="preserve">Ho riscontrato un problema di merge nonostante abbiamo impostato un sistema con un tool </w:t>
+          </w:r>
+          <w:proofErr w:type="spellStart"/>
+          <w:r>
+            <w:rPr>
+              <w:rFonts w:ascii="Arial" w:hAnsi="Arial" w:cs="Arial"/>
+            </w:rPr>
+            <w:t>unity</w:t>
+          </w:r>
+          <w:proofErr w:type="spellEnd"/>
+          <w:r>
+            <w:rPr>
+              <w:rFonts w:ascii="Arial" w:hAnsi="Arial" w:cs="Arial"/>
+            </w:rPr>
+            <w:t>, puoi dirmi cosa analizzare per risolvere?</w:t>
           </w:r>
         </w:p>
         <w:p>
@@ -11845,7 +12605,21 @@
             <w:rPr>
               <w:rFonts w:ascii="Arial" w:hAnsi="Arial" w:cs="Arial"/>
             </w:rPr>
-            <w:t>Bryan: come si implementa un font in unity?</w:t>
+            <w:t xml:space="preserve">Bryan: come si implementa un font in </w:t>
+          </w:r>
+          <w:proofErr w:type="spellStart"/>
+          <w:r>
+            <w:rPr>
+              <w:rFonts w:ascii="Arial" w:hAnsi="Arial" w:cs="Arial"/>
+            </w:rPr>
+            <w:t>unity</w:t>
+          </w:r>
+          <w:proofErr w:type="spellEnd"/>
+          <w:r>
+            <w:rPr>
+              <w:rFonts w:ascii="Arial" w:hAnsi="Arial" w:cs="Arial"/>
+            </w:rPr>
+            <w:t>?</w:t>
           </w:r>
         </w:p>
       </w:sdtContent>
@@ -12554,7 +13328,49 @@
               <w:rPr>
                 <w:rFonts w:ascii="Arial" w:hAnsi="Arial" w:cs="Arial"/>
               </w:rPr>
-              <w:t>Rispetto alla pianificazione abbiamo un leggero ritardo avendo finito solo oggi le statistiche, ma questo risulta recuperabile essendo che lavoriamo separatamente dividendo ui e scripting, infatti bryan ha iniziato la ui delle impostazioni il giorno previsto.</w:t>
+              <w:t xml:space="preserve">Rispetto alla pianificazione abbiamo un leggero ritardo avendo finito solo oggi le statistiche, ma questo risulta recuperabile essendo che lavoriamo separatamente dividendo </w:t>
+            </w:r>
+            <w:proofErr w:type="spellStart"/>
+            <w:r>
+              <w:rPr>
+                <w:rFonts w:ascii="Arial" w:hAnsi="Arial" w:cs="Arial"/>
+              </w:rPr>
+              <w:t>ui</w:t>
+            </w:r>
+            <w:proofErr w:type="spellEnd"/>
+            <w:r>
+              <w:rPr>
+                <w:rFonts w:ascii="Arial" w:hAnsi="Arial" w:cs="Arial"/>
+              </w:rPr>
+              <w:t xml:space="preserve"> e scripting, infatti </w:t>
+            </w:r>
+            <w:proofErr w:type="spellStart"/>
+            <w:r>
+              <w:rPr>
+                <w:rFonts w:ascii="Arial" w:hAnsi="Arial" w:cs="Arial"/>
+              </w:rPr>
+              <w:t>bryan</w:t>
+            </w:r>
+            <w:proofErr w:type="spellEnd"/>
+            <w:r>
+              <w:rPr>
+                <w:rFonts w:ascii="Arial" w:hAnsi="Arial" w:cs="Arial"/>
+              </w:rPr>
+              <w:t xml:space="preserve"> ha iniziato la </w:t>
+            </w:r>
+            <w:proofErr w:type="spellStart"/>
+            <w:r>
+              <w:rPr>
+                <w:rFonts w:ascii="Arial" w:hAnsi="Arial" w:cs="Arial"/>
+              </w:rPr>
+              <w:t>ui</w:t>
+            </w:r>
+            <w:proofErr w:type="spellEnd"/>
+            <w:r>
+              <w:rPr>
+                <w:rFonts w:ascii="Arial" w:hAnsi="Arial" w:cs="Arial"/>
+              </w:rPr>
+              <w:t xml:space="preserve"> delle impostazioni il giorno previsto.</w:t>
             </w:r>
           </w:p>
         </w:tc>
@@ -12675,12 +13491,28 @@
                 <w:rFonts w:ascii="Arial" w:hAnsi="Arial" w:cs="Arial"/>
               </w:rPr>
             </w:pPr>
-            <w:r>
-              <w:rPr>
-                <w:rFonts w:ascii="Arial" w:hAnsi="Arial" w:cs="Arial"/>
-              </w:rPr>
-              <w:t>Daily Scrum</w:t>
-            </w:r>
+            <w:proofErr w:type="spellStart"/>
+            <w:r>
+              <w:rPr>
+                <w:rFonts w:ascii="Arial" w:hAnsi="Arial" w:cs="Arial"/>
+              </w:rPr>
+              <w:t>Daily</w:t>
+            </w:r>
+            <w:proofErr w:type="spellEnd"/>
+            <w:r>
+              <w:rPr>
+                <w:rFonts w:ascii="Arial" w:hAnsi="Arial" w:cs="Arial"/>
+              </w:rPr>
+              <w:t xml:space="preserve"> </w:t>
+            </w:r>
+            <w:proofErr w:type="spellStart"/>
+            <w:r>
+              <w:rPr>
+                <w:rFonts w:ascii="Arial" w:hAnsi="Arial" w:cs="Arial"/>
+              </w:rPr>
+              <w:t>Scrum</w:t>
+            </w:r>
+            <w:proofErr w:type="spellEnd"/>
           </w:p>
         </w:tc>
       </w:tr>
@@ -12742,7 +13574,21 @@
               <w:rPr>
                 <w:rFonts w:ascii="Arial" w:hAnsi="Arial" w:cs="Arial"/>
               </w:rPr>
-              <w:t>Bryan: Finire la ui del</w:t>
+              <w:t xml:space="preserve">Bryan: Finire la </w:t>
+            </w:r>
+            <w:proofErr w:type="spellStart"/>
+            <w:r>
+              <w:rPr>
+                <w:rFonts w:ascii="Arial" w:hAnsi="Arial" w:cs="Arial"/>
+              </w:rPr>
+              <w:t>ui</w:t>
+            </w:r>
+            <w:proofErr w:type="spellEnd"/>
+            <w:r>
+              <w:rPr>
+                <w:rFonts w:ascii="Arial" w:hAnsi="Arial" w:cs="Arial"/>
+              </w:rPr>
+              <w:t xml:space="preserve"> del</w:t>
             </w:r>
             <w:r>
               <w:rPr>
@@ -12928,8 +13774,16 @@
               <w:rPr>
                 <w:rFonts w:ascii="Arial" w:hAnsi="Arial" w:cs="Arial"/>
               </w:rPr>
-              <w:t>Sprint Retrospective</w:t>
-            </w:r>
+              <w:t xml:space="preserve">Sprint </w:t>
+            </w:r>
+            <w:proofErr w:type="spellStart"/>
+            <w:r>
+              <w:rPr>
+                <w:rFonts w:ascii="Arial" w:hAnsi="Arial" w:cs="Arial"/>
+              </w:rPr>
+              <w:t>Retrospective</w:t>
+            </w:r>
+            <w:proofErr w:type="spellEnd"/>
           </w:p>
         </w:tc>
       </w:tr>
@@ -13421,7 +14275,35 @@
             <w:rPr>
               <w:rFonts w:ascii="Arial" w:hAnsi="Arial" w:cs="Arial"/>
             </w:rPr>
-            <w:t>Il numero inserito nel json risulta essere un numero che va dal miliardo in su, ma l’applicativo lo riduce a milioni, per caso i valori int non supportano i miliardi?</w:t>
+            <w:t xml:space="preserve">Il numero inserito nel </w:t>
+          </w:r>
+          <w:proofErr w:type="spellStart"/>
+          <w:r>
+            <w:rPr>
+              <w:rFonts w:ascii="Arial" w:hAnsi="Arial" w:cs="Arial"/>
+            </w:rPr>
+            <w:t>json</w:t>
+          </w:r>
+          <w:proofErr w:type="spellEnd"/>
+          <w:r>
+            <w:rPr>
+              <w:rFonts w:ascii="Arial" w:hAnsi="Arial" w:cs="Arial"/>
+            </w:rPr>
+            <w:t xml:space="preserve"> risulta essere un numero che va dal miliardo in su, ma l’applicativo lo riduce a milioni, per caso i valori </w:t>
+          </w:r>
+          <w:proofErr w:type="spellStart"/>
+          <w:r>
+            <w:rPr>
+              <w:rFonts w:ascii="Arial" w:hAnsi="Arial" w:cs="Arial"/>
+            </w:rPr>
+            <w:t>int</w:t>
+          </w:r>
+          <w:proofErr w:type="spellEnd"/>
+          <w:r>
+            <w:rPr>
+              <w:rFonts w:ascii="Arial" w:hAnsi="Arial" w:cs="Arial"/>
+            </w:rPr>
+            <w:t xml:space="preserve"> non supportano i miliardi?</w:t>
           </w:r>
           <w:r>
             <w:rPr>
@@ -13510,7 +14392,21 @@
             <w:rPr>
               <w:rFonts w:ascii="Arial" w:hAnsi="Arial" w:cs="Arial"/>
             </w:rPr>
-            <w:t>Mi ha detto che int supporta i miliardi ma che ha un massimo di circa 2,2 miliardi ed il numero risultava più grande quindi ho ripiegato su un long</w:t>
+            <w:t xml:space="preserve">Mi ha detto che </w:t>
+          </w:r>
+          <w:proofErr w:type="spellStart"/>
+          <w:r>
+            <w:rPr>
+              <w:rFonts w:ascii="Arial" w:hAnsi="Arial" w:cs="Arial"/>
+            </w:rPr>
+            <w:t>int</w:t>
+          </w:r>
+          <w:proofErr w:type="spellEnd"/>
+          <w:r>
+            <w:rPr>
+              <w:rFonts w:ascii="Arial" w:hAnsi="Arial" w:cs="Arial"/>
+            </w:rPr>
+            <w:t xml:space="preserve"> supporta i miliardi ma che ha un massimo di circa 2,2 miliardi ed il numero risultava più grande quindi ho ripiegato su un long</w:t>
           </w:r>
         </w:p>
       </w:sdtContent>
@@ -14019,7 +14915,21 @@
               <w:rPr>
                 <w:rFonts w:ascii="Arial" w:hAnsi="Arial" w:cs="Arial"/>
               </w:rPr>
-              <w:t>Ho notato come certe impostazioni non sono modificabili con variabili di unity e quindi ho usato del tempo per eseguire qualche ricerca.</w:t>
+              <w:t xml:space="preserve">Ho notato come certe impostazioni non sono modificabili con variabili di </w:t>
+            </w:r>
+            <w:proofErr w:type="spellStart"/>
+            <w:r>
+              <w:rPr>
+                <w:rFonts w:ascii="Arial" w:hAnsi="Arial" w:cs="Arial"/>
+              </w:rPr>
+              <w:t>unity</w:t>
+            </w:r>
+            <w:proofErr w:type="spellEnd"/>
+            <w:r>
+              <w:rPr>
+                <w:rFonts w:ascii="Arial" w:hAnsi="Arial" w:cs="Arial"/>
+              </w:rPr>
+              <w:t xml:space="preserve"> e quindi ho usato del tempo per eseguire qualche ricerca.</w:t>
             </w:r>
           </w:p>
         </w:tc>
@@ -14223,12 +15133,28 @@
                 <w:rFonts w:ascii="Arial" w:hAnsi="Arial" w:cs="Arial"/>
               </w:rPr>
             </w:pPr>
-            <w:r>
-              <w:rPr>
-                <w:rFonts w:ascii="Arial" w:hAnsi="Arial" w:cs="Arial"/>
-              </w:rPr>
-              <w:t>Daily Scrum</w:t>
-            </w:r>
+            <w:proofErr w:type="spellStart"/>
+            <w:r>
+              <w:rPr>
+                <w:rFonts w:ascii="Arial" w:hAnsi="Arial" w:cs="Arial"/>
+              </w:rPr>
+              <w:t>Daily</w:t>
+            </w:r>
+            <w:proofErr w:type="spellEnd"/>
+            <w:r>
+              <w:rPr>
+                <w:rFonts w:ascii="Arial" w:hAnsi="Arial" w:cs="Arial"/>
+              </w:rPr>
+              <w:t xml:space="preserve"> </w:t>
+            </w:r>
+            <w:proofErr w:type="spellStart"/>
+            <w:r>
+              <w:rPr>
+                <w:rFonts w:ascii="Arial" w:hAnsi="Arial" w:cs="Arial"/>
+              </w:rPr>
+              <w:t>Scrum</w:t>
+            </w:r>
+            <w:proofErr w:type="spellEnd"/>
           </w:p>
         </w:tc>
       </w:tr>
@@ -14476,8 +15402,16 @@
               <w:rPr>
                 <w:rFonts w:ascii="Arial" w:hAnsi="Arial" w:cs="Arial"/>
               </w:rPr>
-              <w:t>Sprint Retrospective</w:t>
-            </w:r>
+              <w:t xml:space="preserve">Sprint </w:t>
+            </w:r>
+            <w:proofErr w:type="spellStart"/>
+            <w:r>
+              <w:rPr>
+                <w:rFonts w:ascii="Arial" w:hAnsi="Arial" w:cs="Arial"/>
+              </w:rPr>
+              <w:t>Retrospective</w:t>
+            </w:r>
+            <w:proofErr w:type="spellEnd"/>
           </w:p>
         </w:tc>
       </w:tr>
@@ -14963,7 +15897,21 @@
             <w:rPr>
               <w:rFonts w:ascii="Arial" w:hAnsi="Arial" w:cs="Arial"/>
             </w:rPr>
-            <w:t xml:space="preserve">Riley: sto creando il file data per le impostazioni con questi valori: “valori”. Puoi dirmi che valore effettivo usa unity? </w:t>
+            <w:t xml:space="preserve">Riley: sto creando il file data per le impostazioni con questi valori: “valori”. Puoi dirmi che valore effettivo usa </w:t>
+          </w:r>
+          <w:proofErr w:type="spellStart"/>
+          <w:r>
+            <w:rPr>
+              <w:rFonts w:ascii="Arial" w:hAnsi="Arial" w:cs="Arial"/>
+            </w:rPr>
+            <w:t>unity</w:t>
+          </w:r>
+          <w:proofErr w:type="spellEnd"/>
+          <w:r>
+            <w:rPr>
+              <w:rFonts w:ascii="Arial" w:hAnsi="Arial" w:cs="Arial"/>
+            </w:rPr>
+            <w:t xml:space="preserve">? </w:t>
           </w:r>
         </w:p>
         <w:p>
@@ -14978,8 +15926,44 @@
             <w:rPr>
               <w:rFonts w:ascii="Arial" w:hAnsi="Arial" w:cs="Arial"/>
             </w:rPr>
-            <w:t>Bryan: Come creare un menu con componenti ui che si ripetono modularmente in unity</w:t>
-          </w:r>
+            <w:t xml:space="preserve">Bryan: Come creare un menu con componenti </w:t>
+          </w:r>
+          <w:proofErr w:type="spellStart"/>
+          <w:r>
+            <w:rPr>
+              <w:rFonts w:ascii="Arial" w:hAnsi="Arial" w:cs="Arial"/>
+            </w:rPr>
+            <w:t>ui</w:t>
+          </w:r>
+          <w:proofErr w:type="spellEnd"/>
+          <w:r>
+            <w:rPr>
+              <w:rFonts w:ascii="Arial" w:hAnsi="Arial" w:cs="Arial"/>
+            </w:rPr>
+            <w:t xml:space="preserve"> che si ripetono </w:t>
+          </w:r>
+          <w:proofErr w:type="spellStart"/>
+          <w:r>
+            <w:rPr>
+              <w:rFonts w:ascii="Arial" w:hAnsi="Arial" w:cs="Arial"/>
+            </w:rPr>
+            <w:t>modularmente</w:t>
+          </w:r>
+          <w:proofErr w:type="spellEnd"/>
+          <w:r>
+            <w:rPr>
+              <w:rFonts w:ascii="Arial" w:hAnsi="Arial" w:cs="Arial"/>
+            </w:rPr>
+            <w:t xml:space="preserve"> in </w:t>
+          </w:r>
+          <w:proofErr w:type="spellStart"/>
+          <w:r>
+            <w:rPr>
+              <w:rFonts w:ascii="Arial" w:hAnsi="Arial" w:cs="Arial"/>
+            </w:rPr>
+            <w:t>unity</w:t>
+          </w:r>
+          <w:proofErr w:type="spellEnd"/>
         </w:p>
       </w:sdtContent>
     </w:sdt>
@@ -15290,8 +16274,16 @@
         <w:rPr>
           <w:rFonts w:ascii="Arial" w:hAnsi="Arial" w:cs="Arial"/>
         </w:rPr>
-        <w:t>Bryan: averi cercato un tutorial su youtube</w:t>
-      </w:r>
+        <w:t xml:space="preserve">Bryan: averi cercato un tutorial su </w:t>
+      </w:r>
+      <w:proofErr w:type="spellStart"/>
+      <w:r>
+        <w:rPr>
+          <w:rFonts w:ascii="Arial" w:hAnsi="Arial" w:cs="Arial"/>
+        </w:rPr>
+        <w:t>youtube</w:t>
+      </w:r>
+      <w:proofErr w:type="spellEnd"/>
     </w:p>
     <w:p>
       <w:pPr>
@@ -15477,8 +16469,16 @@
               <w:rPr>
                 <w:rFonts w:ascii="Arial" w:hAnsi="Arial" w:cs="Arial"/>
               </w:rPr>
-              <w:t>Continuato script impostazioni per ui</w:t>
-            </w:r>
+              <w:t xml:space="preserve">Continuato script impostazioni per </w:t>
+            </w:r>
+            <w:proofErr w:type="spellStart"/>
+            <w:r>
+              <w:rPr>
+                <w:rFonts w:ascii="Arial" w:hAnsi="Arial" w:cs="Arial"/>
+              </w:rPr>
+              <w:t>ui</w:t>
+            </w:r>
+            <w:proofErr w:type="spellEnd"/>
           </w:p>
         </w:tc>
       </w:tr>
@@ -15594,7 +16594,35 @@
               <w:rPr>
                 <w:rFonts w:ascii="Arial" w:hAnsi="Arial" w:cs="Arial"/>
               </w:rPr>
-              <w:t xml:space="preserve">Alcuni problemi con i valori inviati dal togglle per fullscreen, scoperto che avevo selezionato un valore statico e non dinamico dell’elemento </w:t>
+              <w:t xml:space="preserve">Alcuni problemi con i valori inviati dal </w:t>
+            </w:r>
+            <w:proofErr w:type="spellStart"/>
+            <w:r>
+              <w:rPr>
+                <w:rFonts w:ascii="Arial" w:hAnsi="Arial" w:cs="Arial"/>
+              </w:rPr>
+              <w:t>togglle</w:t>
+            </w:r>
+            <w:proofErr w:type="spellEnd"/>
+            <w:r>
+              <w:rPr>
+                <w:rFonts w:ascii="Arial" w:hAnsi="Arial" w:cs="Arial"/>
+              </w:rPr>
+              <w:t xml:space="preserve"> per </w:t>
+            </w:r>
+            <w:proofErr w:type="spellStart"/>
+            <w:r>
+              <w:rPr>
+                <w:rFonts w:ascii="Arial" w:hAnsi="Arial" w:cs="Arial"/>
+              </w:rPr>
+              <w:t>fullscreen</w:t>
+            </w:r>
+            <w:proofErr w:type="spellEnd"/>
+            <w:r>
+              <w:rPr>
+                <w:rFonts w:ascii="Arial" w:hAnsi="Arial" w:cs="Arial"/>
+              </w:rPr>
+              <w:t xml:space="preserve">, scoperto che avevo selezionato un valore statico e non dinamico dell’elemento </w:t>
             </w:r>
           </w:p>
         </w:tc>
@@ -15760,7 +16788,21 @@
               <w:rPr>
                 <w:rFonts w:ascii="Arial" w:hAnsi="Arial" w:cs="Arial"/>
               </w:rPr>
-              <w:t xml:space="preserve"> iniziare a creare il db effettivo</w:t>
+              <w:t xml:space="preserve"> iniziare a creare il </w:t>
+            </w:r>
+            <w:proofErr w:type="spellStart"/>
+            <w:r>
+              <w:rPr>
+                <w:rFonts w:ascii="Arial" w:hAnsi="Arial" w:cs="Arial"/>
+              </w:rPr>
+              <w:t>db</w:t>
+            </w:r>
+            <w:proofErr w:type="spellEnd"/>
+            <w:r>
+              <w:rPr>
+                <w:rFonts w:ascii="Arial" w:hAnsi="Arial" w:cs="Arial"/>
+              </w:rPr>
+              <w:t xml:space="preserve"> effettivo</w:t>
             </w:r>
             <w:r>
               <w:rPr>
@@ -15816,12 +16858,28 @@
                 <w:rFonts w:ascii="Arial" w:hAnsi="Arial" w:cs="Arial"/>
               </w:rPr>
             </w:pPr>
-            <w:r>
-              <w:rPr>
-                <w:rFonts w:ascii="Arial" w:hAnsi="Arial" w:cs="Arial"/>
-              </w:rPr>
-              <w:t>Daily Scrum</w:t>
-            </w:r>
+            <w:proofErr w:type="spellStart"/>
+            <w:r>
+              <w:rPr>
+                <w:rFonts w:ascii="Arial" w:hAnsi="Arial" w:cs="Arial"/>
+              </w:rPr>
+              <w:t>Daily</w:t>
+            </w:r>
+            <w:proofErr w:type="spellEnd"/>
+            <w:r>
+              <w:rPr>
+                <w:rFonts w:ascii="Arial" w:hAnsi="Arial" w:cs="Arial"/>
+              </w:rPr>
+              <w:t xml:space="preserve"> </w:t>
+            </w:r>
+            <w:proofErr w:type="spellStart"/>
+            <w:r>
+              <w:rPr>
+                <w:rFonts w:ascii="Arial" w:hAnsi="Arial" w:cs="Arial"/>
+              </w:rPr>
+              <w:t>Scrum</w:t>
+            </w:r>
+            <w:proofErr w:type="spellEnd"/>
           </w:p>
         </w:tc>
       </w:tr>
@@ -15875,8 +16933,16 @@
               <w:rPr>
                 <w:rFonts w:ascii="Arial" w:hAnsi="Arial" w:cs="Arial"/>
               </w:rPr>
-              <w:t xml:space="preserve"> Terminare l’applicazione delle impostazioni nella ui</w:t>
-            </w:r>
+              <w:t xml:space="preserve"> Terminare l’applicazione delle impostazioni nella </w:t>
+            </w:r>
+            <w:proofErr w:type="spellStart"/>
+            <w:r>
+              <w:rPr>
+                <w:rFonts w:ascii="Arial" w:hAnsi="Arial" w:cs="Arial"/>
+              </w:rPr>
+              <w:t>ui</w:t>
+            </w:r>
+            <w:proofErr w:type="spellEnd"/>
           </w:p>
           <w:p>
             <w:pPr>
@@ -16087,8 +17153,16 @@
               <w:rPr>
                 <w:rFonts w:ascii="Arial" w:hAnsi="Arial" w:cs="Arial"/>
               </w:rPr>
-              <w:t>Sprint Retrospective</w:t>
-            </w:r>
+              <w:t xml:space="preserve">Sprint </w:t>
+            </w:r>
+            <w:proofErr w:type="spellStart"/>
+            <w:r>
+              <w:rPr>
+                <w:rFonts w:ascii="Arial" w:hAnsi="Arial" w:cs="Arial"/>
+              </w:rPr>
+              <w:t>Retrospective</w:t>
+            </w:r>
+            <w:proofErr w:type="spellEnd"/>
           </w:p>
         </w:tc>
       </w:tr>
@@ -17389,11 +18463,33 @@
                 <w:rFonts w:ascii="Arial" w:hAnsi="Arial" w:cs="Arial"/>
               </w:rPr>
             </w:pPr>
-            <w:r>
-              <w:rPr>
-                <w:rFonts w:ascii="Arial" w:hAnsi="Arial" w:cs="Arial"/>
-              </w:rPr>
-              <w:t>Brayn continuerà con lo sviluppo della mappa mentre Riley svilupperà il db effettivo</w:t>
+            <w:proofErr w:type="spellStart"/>
+            <w:r>
+              <w:rPr>
+                <w:rFonts w:ascii="Arial" w:hAnsi="Arial" w:cs="Arial"/>
+              </w:rPr>
+              <w:t>Brayn</w:t>
+            </w:r>
+            <w:proofErr w:type="spellEnd"/>
+            <w:r>
+              <w:rPr>
+                <w:rFonts w:ascii="Arial" w:hAnsi="Arial" w:cs="Arial"/>
+              </w:rPr>
+              <w:t xml:space="preserve"> continuerà con lo sviluppo della mappa mentre Riley svilupperà il </w:t>
+            </w:r>
+            <w:proofErr w:type="spellStart"/>
+            <w:r>
+              <w:rPr>
+                <w:rFonts w:ascii="Arial" w:hAnsi="Arial" w:cs="Arial"/>
+              </w:rPr>
+              <w:t>db</w:t>
+            </w:r>
+            <w:proofErr w:type="spellEnd"/>
+            <w:r>
+              <w:rPr>
+                <w:rFonts w:ascii="Arial" w:hAnsi="Arial" w:cs="Arial"/>
+              </w:rPr>
+              <w:t xml:space="preserve"> effettivo</w:t>
             </w:r>
           </w:p>
         </w:tc>
@@ -17443,12 +18539,28 @@
                 <w:rFonts w:ascii="Arial" w:hAnsi="Arial" w:cs="Arial"/>
               </w:rPr>
             </w:pPr>
-            <w:r>
-              <w:rPr>
-                <w:rFonts w:ascii="Arial" w:hAnsi="Arial" w:cs="Arial"/>
-              </w:rPr>
-              <w:t>Daily Scrum</w:t>
-            </w:r>
+            <w:proofErr w:type="spellStart"/>
+            <w:r>
+              <w:rPr>
+                <w:rFonts w:ascii="Arial" w:hAnsi="Arial" w:cs="Arial"/>
+              </w:rPr>
+              <w:t>Daily</w:t>
+            </w:r>
+            <w:proofErr w:type="spellEnd"/>
+            <w:r>
+              <w:rPr>
+                <w:rFonts w:ascii="Arial" w:hAnsi="Arial" w:cs="Arial"/>
+              </w:rPr>
+              <w:t xml:space="preserve"> </w:t>
+            </w:r>
+            <w:proofErr w:type="spellStart"/>
+            <w:r>
+              <w:rPr>
+                <w:rFonts w:ascii="Arial" w:hAnsi="Arial" w:cs="Arial"/>
+              </w:rPr>
+              <w:t>Scrum</w:t>
+            </w:r>
+            <w:proofErr w:type="spellEnd"/>
           </w:p>
         </w:tc>
       </w:tr>
@@ -17496,8 +18608,16 @@
               <w:rPr>
                 <w:rFonts w:ascii="Arial" w:hAnsi="Arial" w:cs="Arial"/>
               </w:rPr>
-              <w:t>Riley: Terminare l’applicazione delle impostazioni nella ui</w:t>
-            </w:r>
+              <w:t xml:space="preserve">Riley: Terminare l’applicazione delle impostazioni nella </w:t>
+            </w:r>
+            <w:proofErr w:type="spellStart"/>
+            <w:r>
+              <w:rPr>
+                <w:rFonts w:ascii="Arial" w:hAnsi="Arial" w:cs="Arial"/>
+              </w:rPr>
+              <w:t>ui</w:t>
+            </w:r>
+            <w:proofErr w:type="spellEnd"/>
           </w:p>
           <w:p>
             <w:pPr>
@@ -17696,8 +18816,16 @@
               <w:rPr>
                 <w:rFonts w:ascii="Arial" w:hAnsi="Arial" w:cs="Arial"/>
               </w:rPr>
-              <w:t>Sprint Retrospective</w:t>
-            </w:r>
+              <w:t xml:space="preserve">Sprint </w:t>
+            </w:r>
+            <w:proofErr w:type="spellStart"/>
+            <w:r>
+              <w:rPr>
+                <w:rFonts w:ascii="Arial" w:hAnsi="Arial" w:cs="Arial"/>
+              </w:rPr>
+              <w:t>Retrospective</w:t>
+            </w:r>
+            <w:proofErr w:type="spellEnd"/>
           </w:p>
         </w:tc>
       </w:tr>
@@ -18194,7 +19322,21 @@
             <w:rPr>
               <w:rFonts w:ascii="Arial" w:hAnsi="Arial" w:cs="Arial"/>
             </w:rPr>
-            <w:t>Lo script SettingsUI sembra essersi isolato dal resto del codice, cosa potrebbe essere la causa?</w:t>
+            <w:t xml:space="preserve">Lo script </w:t>
+          </w:r>
+          <w:proofErr w:type="spellStart"/>
+          <w:r>
+            <w:rPr>
+              <w:rFonts w:ascii="Arial" w:hAnsi="Arial" w:cs="Arial"/>
+            </w:rPr>
+            <w:t>SettingsUI</w:t>
+          </w:r>
+          <w:proofErr w:type="spellEnd"/>
+          <w:r>
+            <w:rPr>
+              <w:rFonts w:ascii="Arial" w:hAnsi="Arial" w:cs="Arial"/>
+            </w:rPr>
+            <w:t xml:space="preserve"> sembra essersi isolato dal resto del codice, cosa potrebbe essere la causa?</w:t>
           </w:r>
         </w:p>
         <w:p>
@@ -18725,8 +19867,30 @@
               <w:rPr>
                 <w:rFonts w:ascii="Arial" w:hAnsi="Arial" w:cs="Arial"/>
               </w:rPr>
-              <w:t>Inizio sviluppo db sqlite</w:t>
-            </w:r>
+              <w:t xml:space="preserve">Inizio sviluppo </w:t>
+            </w:r>
+            <w:proofErr w:type="spellStart"/>
+            <w:r>
+              <w:rPr>
+                <w:rFonts w:ascii="Arial" w:hAnsi="Arial" w:cs="Arial"/>
+              </w:rPr>
+              <w:t>db</w:t>
+            </w:r>
+            <w:proofErr w:type="spellEnd"/>
+            <w:r>
+              <w:rPr>
+                <w:rFonts w:ascii="Arial" w:hAnsi="Arial" w:cs="Arial"/>
+              </w:rPr>
+              <w:t xml:space="preserve"> </w:t>
+            </w:r>
+            <w:proofErr w:type="spellStart"/>
+            <w:r>
+              <w:rPr>
+                <w:rFonts w:ascii="Arial" w:hAnsi="Arial" w:cs="Arial"/>
+              </w:rPr>
+              <w:t>sqlite</w:t>
+            </w:r>
+            <w:proofErr w:type="spellEnd"/>
           </w:p>
         </w:tc>
       </w:tr>
@@ -18938,8 +20102,16 @@
               <w:rPr>
                 <w:rFonts w:ascii="Arial" w:hAnsi="Arial" w:cs="Arial"/>
               </w:rPr>
-              <w:t>Siamo in largo anticipo, per questo motivo Riley ha cominciato a creare un vero db</w:t>
-            </w:r>
+              <w:t xml:space="preserve">Siamo in largo anticipo, per questo motivo Riley ha cominciato a creare un vero </w:t>
+            </w:r>
+            <w:proofErr w:type="spellStart"/>
+            <w:r>
+              <w:rPr>
+                <w:rFonts w:ascii="Arial" w:hAnsi="Arial" w:cs="Arial"/>
+              </w:rPr>
+              <w:t>db</w:t>
+            </w:r>
+            <w:proofErr w:type="spellEnd"/>
           </w:p>
         </w:tc>
       </w:tr>
@@ -18996,7 +20168,21 @@
               <w:rPr>
                 <w:rFonts w:ascii="Arial" w:hAnsi="Arial" w:cs="Arial"/>
               </w:rPr>
-              <w:t>Continuare rispettivamente lo sviluppo del db e della mappa</w:t>
+              <w:t xml:space="preserve">Continuare rispettivamente lo sviluppo del </w:t>
+            </w:r>
+            <w:proofErr w:type="spellStart"/>
+            <w:r>
+              <w:rPr>
+                <w:rFonts w:ascii="Arial" w:hAnsi="Arial" w:cs="Arial"/>
+              </w:rPr>
+              <w:t>db</w:t>
+            </w:r>
+            <w:proofErr w:type="spellEnd"/>
+            <w:r>
+              <w:rPr>
+                <w:rFonts w:ascii="Arial" w:hAnsi="Arial" w:cs="Arial"/>
+              </w:rPr>
+              <w:t xml:space="preserve"> e della mappa</w:t>
             </w:r>
           </w:p>
         </w:tc>
@@ -19046,12 +20232,28 @@
                 <w:rFonts w:ascii="Arial" w:hAnsi="Arial" w:cs="Arial"/>
               </w:rPr>
             </w:pPr>
-            <w:r>
-              <w:rPr>
-                <w:rFonts w:ascii="Arial" w:hAnsi="Arial" w:cs="Arial"/>
-              </w:rPr>
-              <w:t>Daily Scrum</w:t>
-            </w:r>
+            <w:proofErr w:type="spellStart"/>
+            <w:r>
+              <w:rPr>
+                <w:rFonts w:ascii="Arial" w:hAnsi="Arial" w:cs="Arial"/>
+              </w:rPr>
+              <w:t>Daily</w:t>
+            </w:r>
+            <w:proofErr w:type="spellEnd"/>
+            <w:r>
+              <w:rPr>
+                <w:rFonts w:ascii="Arial" w:hAnsi="Arial" w:cs="Arial"/>
+              </w:rPr>
+              <w:t xml:space="preserve"> </w:t>
+            </w:r>
+            <w:proofErr w:type="spellStart"/>
+            <w:r>
+              <w:rPr>
+                <w:rFonts w:ascii="Arial" w:hAnsi="Arial" w:cs="Arial"/>
+              </w:rPr>
+              <w:t>Scrum</w:t>
+            </w:r>
+            <w:proofErr w:type="spellEnd"/>
           </w:p>
         </w:tc>
       </w:tr>
@@ -19099,8 +20301,16 @@
               <w:rPr>
                 <w:rFonts w:ascii="Arial" w:hAnsi="Arial" w:cs="Arial"/>
               </w:rPr>
-              <w:t>Riley: Inizio sviluppo db</w:t>
-            </w:r>
+              <w:t xml:space="preserve">Riley: Inizio sviluppo </w:t>
+            </w:r>
+            <w:proofErr w:type="spellStart"/>
+            <w:r>
+              <w:rPr>
+                <w:rFonts w:ascii="Arial" w:hAnsi="Arial" w:cs="Arial"/>
+              </w:rPr>
+              <w:t>db</w:t>
+            </w:r>
+            <w:proofErr w:type="spellEnd"/>
           </w:p>
           <w:p>
             <w:pPr>
@@ -19293,8 +20503,16 @@
               <w:rPr>
                 <w:rFonts w:ascii="Arial" w:hAnsi="Arial" w:cs="Arial"/>
               </w:rPr>
-              <w:t>Sprint Retrospective</w:t>
-            </w:r>
+              <w:t xml:space="preserve">Sprint </w:t>
+            </w:r>
+            <w:proofErr w:type="spellStart"/>
+            <w:r>
+              <w:rPr>
+                <w:rFonts w:ascii="Arial" w:hAnsi="Arial" w:cs="Arial"/>
+              </w:rPr>
+              <w:t>Retrospective</w:t>
+            </w:r>
+            <w:proofErr w:type="spellEnd"/>
           </w:p>
         </w:tc>
       </w:tr>
@@ -19522,7 +20740,25 @@
               <w:b/>
               <w:bCs/>
             </w:rPr>
-            <w:t>Nomi AI utilizzati</w:t>
+            <w:t xml:space="preserve">Nomi </w:t>
+          </w:r>
+          <w:proofErr w:type="gramStart"/>
+          <w:r>
+            <w:rPr>
+              <w:rStyle w:val="Testosegnaposto"/>
+              <w:b/>
+              <w:bCs/>
+            </w:rPr>
+            <w:t>AI</w:t>
+          </w:r>
+          <w:proofErr w:type="gramEnd"/>
+          <w:r>
+            <w:rPr>
+              <w:rStyle w:val="Testosegnaposto"/>
+              <w:b/>
+              <w:bCs/>
+            </w:rPr>
+            <w:t xml:space="preserve"> utilizzati</w:t>
           </w:r>
         </w:sdtContent>
       </w:sdt>
@@ -20520,7 +21756,21 @@
               <w:rPr>
                 <w:rFonts w:ascii="Arial" w:hAnsi="Arial" w:cs="Arial"/>
               </w:rPr>
-              <w:t>Rispetto al pianificato abbiamo qualche giornata, di lavoro, di anticipo infatti stiamo principalmente aggiungendo dettagli lavorando con un ritmo adeguato e sviluppando già un db più reale</w:t>
+              <w:t xml:space="preserve">Rispetto al pianificato abbiamo qualche giornata, di lavoro, di anticipo infatti stiamo principalmente aggiungendo dettagli lavorando con un ritmo adeguato e sviluppando già un </w:t>
+            </w:r>
+            <w:proofErr w:type="spellStart"/>
+            <w:r>
+              <w:rPr>
+                <w:rFonts w:ascii="Arial" w:hAnsi="Arial" w:cs="Arial"/>
+              </w:rPr>
+              <w:t>db</w:t>
+            </w:r>
+            <w:proofErr w:type="spellEnd"/>
+            <w:r>
+              <w:rPr>
+                <w:rFonts w:ascii="Arial" w:hAnsi="Arial" w:cs="Arial"/>
+              </w:rPr>
+              <w:t xml:space="preserve"> più reale</w:t>
             </w:r>
           </w:p>
         </w:tc>
@@ -20578,8 +21828,16 @@
               <w:rPr>
                 <w:rFonts w:ascii="Arial" w:hAnsi="Arial" w:cs="Arial"/>
               </w:rPr>
-              <w:t>Procedere con i vari l’aggiunta di dettagli e del db</w:t>
-            </w:r>
+              <w:t xml:space="preserve">Procedere con i vari l’aggiunta di dettagli e del </w:t>
+            </w:r>
+            <w:proofErr w:type="spellStart"/>
+            <w:r>
+              <w:rPr>
+                <w:rFonts w:ascii="Arial" w:hAnsi="Arial" w:cs="Arial"/>
+              </w:rPr>
+              <w:t>db</w:t>
+            </w:r>
+            <w:proofErr w:type="spellEnd"/>
           </w:p>
         </w:tc>
       </w:tr>
@@ -20628,12 +21886,28 @@
                 <w:rFonts w:ascii="Arial" w:hAnsi="Arial" w:cs="Arial"/>
               </w:rPr>
             </w:pPr>
-            <w:r>
-              <w:rPr>
-                <w:rFonts w:ascii="Arial" w:hAnsi="Arial" w:cs="Arial"/>
-              </w:rPr>
-              <w:t>Daily Scrum</w:t>
-            </w:r>
+            <w:proofErr w:type="spellStart"/>
+            <w:r>
+              <w:rPr>
+                <w:rFonts w:ascii="Arial" w:hAnsi="Arial" w:cs="Arial"/>
+              </w:rPr>
+              <w:t>Daily</w:t>
+            </w:r>
+            <w:proofErr w:type="spellEnd"/>
+            <w:r>
+              <w:rPr>
+                <w:rFonts w:ascii="Arial" w:hAnsi="Arial" w:cs="Arial"/>
+              </w:rPr>
+              <w:t xml:space="preserve"> </w:t>
+            </w:r>
+            <w:proofErr w:type="spellStart"/>
+            <w:r>
+              <w:rPr>
+                <w:rFonts w:ascii="Arial" w:hAnsi="Arial" w:cs="Arial"/>
+              </w:rPr>
+              <w:t>Scrum</w:t>
+            </w:r>
+            <w:proofErr w:type="spellEnd"/>
           </w:p>
         </w:tc>
       </w:tr>
@@ -20693,8 +21967,16 @@
               <w:rPr>
                 <w:rFonts w:ascii="Arial" w:hAnsi="Arial" w:cs="Arial"/>
               </w:rPr>
-              <w:t>ontinuo sviluppo db</w:t>
-            </w:r>
+              <w:t xml:space="preserve">ontinuo sviluppo </w:t>
+            </w:r>
+            <w:proofErr w:type="spellStart"/>
+            <w:r>
+              <w:rPr>
+                <w:rFonts w:ascii="Arial" w:hAnsi="Arial" w:cs="Arial"/>
+              </w:rPr>
+              <w:t>db</w:t>
+            </w:r>
+            <w:proofErr w:type="spellEnd"/>
           </w:p>
           <w:p>
             <w:pPr>
@@ -20887,8 +22169,16 @@
               <w:rPr>
                 <w:rFonts w:ascii="Arial" w:hAnsi="Arial" w:cs="Arial"/>
               </w:rPr>
-              <w:t>Sprint Retrospective</w:t>
-            </w:r>
+              <w:t xml:space="preserve">Sprint </w:t>
+            </w:r>
+            <w:proofErr w:type="spellStart"/>
+            <w:r>
+              <w:rPr>
+                <w:rFonts w:ascii="Arial" w:hAnsi="Arial" w:cs="Arial"/>
+              </w:rPr>
+              <w:t>Retrospective</w:t>
+            </w:r>
+            <w:proofErr w:type="spellEnd"/>
           </w:p>
         </w:tc>
       </w:tr>
@@ -21391,7 +22681,35 @@
             <w:rPr>
               <w:rFonts w:ascii="Arial" w:hAnsi="Arial" w:cs="Arial"/>
             </w:rPr>
-            <w:t>non ho fatto dei veri e propri promt oggi, ma mi sono cimentato nel procedere con una spiegazione guidata per applicare SQLite alla base di dati sviluppata finora.</w:t>
+            <w:t xml:space="preserve">non ho fatto dei veri e propri </w:t>
+          </w:r>
+          <w:proofErr w:type="spellStart"/>
+          <w:r>
+            <w:rPr>
+              <w:rFonts w:ascii="Arial" w:hAnsi="Arial" w:cs="Arial"/>
+            </w:rPr>
+            <w:t>promt</w:t>
+          </w:r>
+          <w:proofErr w:type="spellEnd"/>
+          <w:r>
+            <w:rPr>
+              <w:rFonts w:ascii="Arial" w:hAnsi="Arial" w:cs="Arial"/>
+            </w:rPr>
+            <w:t xml:space="preserve"> oggi, ma mi sono cimentato nel procedere con una spiegazione guidata per applicare </w:t>
+          </w:r>
+          <w:proofErr w:type="spellStart"/>
+          <w:r>
+            <w:rPr>
+              <w:rFonts w:ascii="Arial" w:hAnsi="Arial" w:cs="Arial"/>
+            </w:rPr>
+            <w:t>SQLite</w:t>
+          </w:r>
+          <w:proofErr w:type="spellEnd"/>
+          <w:r>
+            <w:rPr>
+              <w:rFonts w:ascii="Arial" w:hAnsi="Arial" w:cs="Arial"/>
+            </w:rPr>
+            <w:t xml:space="preserve"> alla base di dati sviluppata finora.</w:t>
           </w:r>
         </w:p>
         <w:p>
@@ -21984,7 +23302,21 @@
               <w:rPr>
                 <w:rFonts w:ascii="Arial" w:hAnsi="Arial" w:cs="Arial"/>
               </w:rPr>
-              <w:t>Ho sistemato un problema di animazione, creato il build del progetto per certi test, ricerca modifica materiali auto ed inizio menu garage</w:t>
+              <w:t xml:space="preserve">Ho sistemato un problema di animazione, creato </w:t>
+            </w:r>
+            <w:proofErr w:type="gramStart"/>
+            <w:r>
+              <w:rPr>
+                <w:rFonts w:ascii="Arial" w:hAnsi="Arial" w:cs="Arial"/>
+              </w:rPr>
+              <w:t>il build</w:t>
+            </w:r>
+            <w:proofErr w:type="gramEnd"/>
+            <w:r>
+              <w:rPr>
+                <w:rFonts w:ascii="Arial" w:hAnsi="Arial" w:cs="Arial"/>
+              </w:rPr>
+              <w:t xml:space="preserve"> del progetto per certi test, ricerca modifica materiali auto ed inizio menu garage</w:t>
             </w:r>
           </w:p>
         </w:tc>
@@ -22217,7 +23549,21 @@
               <w:rPr>
                 <w:rFonts w:ascii="Arial" w:hAnsi="Arial" w:cs="Arial"/>
               </w:rPr>
-              <w:t>Continuare sviluppo garage e db.</w:t>
+              <w:t xml:space="preserve">Continuare sviluppo garage e </w:t>
+            </w:r>
+            <w:proofErr w:type="spellStart"/>
+            <w:r>
+              <w:rPr>
+                <w:rFonts w:ascii="Arial" w:hAnsi="Arial" w:cs="Arial"/>
+              </w:rPr>
+              <w:t>db</w:t>
+            </w:r>
+            <w:proofErr w:type="spellEnd"/>
+            <w:r>
+              <w:rPr>
+                <w:rFonts w:ascii="Arial" w:hAnsi="Arial" w:cs="Arial"/>
+              </w:rPr>
+              <w:t>.</w:t>
             </w:r>
           </w:p>
         </w:tc>
@@ -22267,12 +23613,28 @@
                 <w:rFonts w:ascii="Arial" w:hAnsi="Arial" w:cs="Arial"/>
               </w:rPr>
             </w:pPr>
-            <w:r>
-              <w:rPr>
-                <w:rFonts w:ascii="Arial" w:hAnsi="Arial" w:cs="Arial"/>
-              </w:rPr>
-              <w:t>Daily Scrum</w:t>
-            </w:r>
+            <w:proofErr w:type="spellStart"/>
+            <w:r>
+              <w:rPr>
+                <w:rFonts w:ascii="Arial" w:hAnsi="Arial" w:cs="Arial"/>
+              </w:rPr>
+              <w:t>Daily</w:t>
+            </w:r>
+            <w:proofErr w:type="spellEnd"/>
+            <w:r>
+              <w:rPr>
+                <w:rFonts w:ascii="Arial" w:hAnsi="Arial" w:cs="Arial"/>
+              </w:rPr>
+              <w:t xml:space="preserve"> </w:t>
+            </w:r>
+            <w:proofErr w:type="spellStart"/>
+            <w:r>
+              <w:rPr>
+                <w:rFonts w:ascii="Arial" w:hAnsi="Arial" w:cs="Arial"/>
+              </w:rPr>
+              <w:t>Scrum</w:t>
+            </w:r>
+            <w:proofErr w:type="spellEnd"/>
           </w:p>
         </w:tc>
       </w:tr>
@@ -22320,8 +23682,16 @@
               <w:rPr>
                 <w:rFonts w:ascii="Arial" w:hAnsi="Arial" w:cs="Arial"/>
               </w:rPr>
-              <w:t>Riley: Continuo sviluppo db</w:t>
-            </w:r>
+              <w:t xml:space="preserve">Riley: Continuo sviluppo </w:t>
+            </w:r>
+            <w:proofErr w:type="spellStart"/>
+            <w:r>
+              <w:rPr>
+                <w:rFonts w:ascii="Arial" w:hAnsi="Arial" w:cs="Arial"/>
+              </w:rPr>
+              <w:t>db</w:t>
+            </w:r>
+            <w:proofErr w:type="spellEnd"/>
           </w:p>
           <w:p>
             <w:pPr>
@@ -22514,8 +23884,16 @@
               <w:rPr>
                 <w:rFonts w:ascii="Arial" w:hAnsi="Arial" w:cs="Arial"/>
               </w:rPr>
-              <w:t>Sprint Retrospective</w:t>
-            </w:r>
+              <w:t xml:space="preserve">Sprint </w:t>
+            </w:r>
+            <w:proofErr w:type="spellStart"/>
+            <w:r>
+              <w:rPr>
+                <w:rFonts w:ascii="Arial" w:hAnsi="Arial" w:cs="Arial"/>
+              </w:rPr>
+              <w:t>Retrospective</w:t>
+            </w:r>
+            <w:proofErr w:type="spellEnd"/>
           </w:p>
         </w:tc>
       </w:tr>
@@ -22743,7 +24121,25 @@
               <w:b/>
               <w:bCs/>
             </w:rPr>
-            <w:t>Nomi AI utilizzati</w:t>
+            <w:t xml:space="preserve">Nomi </w:t>
+          </w:r>
+          <w:proofErr w:type="gramStart"/>
+          <w:r>
+            <w:rPr>
+              <w:rStyle w:val="Testosegnaposto"/>
+              <w:b/>
+              <w:bCs/>
+            </w:rPr>
+            <w:t>AI</w:t>
+          </w:r>
+          <w:proofErr w:type="gramEnd"/>
+          <w:r>
+            <w:rPr>
+              <w:rStyle w:val="Testosegnaposto"/>
+              <w:b/>
+              <w:bCs/>
+            </w:rPr>
+            <w:t xml:space="preserve"> utilizzati</w:t>
           </w:r>
         </w:sdtContent>
       </w:sdt>
@@ -23522,8 +24918,16 @@
               <w:rPr>
                 <w:rFonts w:ascii="Arial" w:hAnsi="Arial" w:cs="Arial"/>
               </w:rPr>
-              <w:t>Continuato lo sviluppo del db</w:t>
-            </w:r>
+              <w:t xml:space="preserve">Continuato lo sviluppo del </w:t>
+            </w:r>
+            <w:proofErr w:type="spellStart"/>
+            <w:r>
+              <w:rPr>
+                <w:rFonts w:ascii="Arial" w:hAnsi="Arial" w:cs="Arial"/>
+              </w:rPr>
+              <w:t>db</w:t>
+            </w:r>
+            <w:proofErr w:type="spellEnd"/>
           </w:p>
         </w:tc>
       </w:tr>
@@ -23793,7 +25197,35 @@
               <w:rPr>
                 <w:rFonts w:ascii="Arial" w:hAnsi="Arial" w:cs="Arial"/>
               </w:rPr>
-              <w:t>Continuare ognuno con i sviluppi di db e garage</w:t>
+              <w:t xml:space="preserve">Continuare ognuno con </w:t>
+            </w:r>
+            <w:proofErr w:type="gramStart"/>
+            <w:r>
+              <w:rPr>
+                <w:rFonts w:ascii="Arial" w:hAnsi="Arial" w:cs="Arial"/>
+              </w:rPr>
+              <w:t>i</w:t>
+            </w:r>
+            <w:proofErr w:type="gramEnd"/>
+            <w:r>
+              <w:rPr>
+                <w:rFonts w:ascii="Arial" w:hAnsi="Arial" w:cs="Arial"/>
+              </w:rPr>
+              <w:t xml:space="preserve"> sviluppi di </w:t>
+            </w:r>
+            <w:proofErr w:type="spellStart"/>
+            <w:r>
+              <w:rPr>
+                <w:rFonts w:ascii="Arial" w:hAnsi="Arial" w:cs="Arial"/>
+              </w:rPr>
+              <w:t>db</w:t>
+            </w:r>
+            <w:proofErr w:type="spellEnd"/>
+            <w:r>
+              <w:rPr>
+                <w:rFonts w:ascii="Arial" w:hAnsi="Arial" w:cs="Arial"/>
+              </w:rPr>
+              <w:t xml:space="preserve"> e garage</w:t>
             </w:r>
           </w:p>
         </w:tc>
@@ -23843,12 +25275,28 @@
                 <w:rFonts w:ascii="Arial" w:hAnsi="Arial" w:cs="Arial"/>
               </w:rPr>
             </w:pPr>
-            <w:r>
-              <w:rPr>
-                <w:rFonts w:ascii="Arial" w:hAnsi="Arial" w:cs="Arial"/>
-              </w:rPr>
-              <w:t>Daily Scrum</w:t>
-            </w:r>
+            <w:proofErr w:type="spellStart"/>
+            <w:r>
+              <w:rPr>
+                <w:rFonts w:ascii="Arial" w:hAnsi="Arial" w:cs="Arial"/>
+              </w:rPr>
+              <w:t>Daily</w:t>
+            </w:r>
+            <w:proofErr w:type="spellEnd"/>
+            <w:r>
+              <w:rPr>
+                <w:rFonts w:ascii="Arial" w:hAnsi="Arial" w:cs="Arial"/>
+              </w:rPr>
+              <w:t xml:space="preserve"> </w:t>
+            </w:r>
+            <w:proofErr w:type="spellStart"/>
+            <w:r>
+              <w:rPr>
+                <w:rFonts w:ascii="Arial" w:hAnsi="Arial" w:cs="Arial"/>
+              </w:rPr>
+              <w:t>Scrum</w:t>
+            </w:r>
+            <w:proofErr w:type="spellEnd"/>
           </w:p>
         </w:tc>
       </w:tr>
@@ -23896,8 +25344,16 @@
               <w:rPr>
                 <w:rFonts w:ascii="Arial" w:hAnsi="Arial" w:cs="Arial"/>
               </w:rPr>
-              <w:t>Riley: Continuo sviluppo db</w:t>
-            </w:r>
+              <w:t xml:space="preserve">Riley: Continuo sviluppo </w:t>
+            </w:r>
+            <w:proofErr w:type="spellStart"/>
+            <w:r>
+              <w:rPr>
+                <w:rFonts w:ascii="Arial" w:hAnsi="Arial" w:cs="Arial"/>
+              </w:rPr>
+              <w:t>db</w:t>
+            </w:r>
+            <w:proofErr w:type="spellEnd"/>
           </w:p>
           <w:p>
             <w:pPr>
@@ -24090,8 +25546,16 @@
               <w:rPr>
                 <w:rFonts w:ascii="Arial" w:hAnsi="Arial" w:cs="Arial"/>
               </w:rPr>
-              <w:t>Sprint Retrospective</w:t>
-            </w:r>
+              <w:t xml:space="preserve">Sprint </w:t>
+            </w:r>
+            <w:proofErr w:type="spellStart"/>
+            <w:r>
+              <w:rPr>
+                <w:rFonts w:ascii="Arial" w:hAnsi="Arial" w:cs="Arial"/>
+              </w:rPr>
+              <w:t>Retrospective</w:t>
+            </w:r>
+            <w:proofErr w:type="spellEnd"/>
           </w:p>
         </w:tc>
       </w:tr>
@@ -24588,7 +26052,21 @@
             <w:rPr>
               <w:rFonts w:ascii="Arial" w:hAnsi="Arial" w:cs="Arial"/>
             </w:rPr>
-            <w:t>Dovrei introdurre nel db i comandi collegati alle impostazioni, ma la struttura usata è diversa da quelle precedenti, e viene usata una classe esterna.</w:t>
+            <w:t xml:space="preserve">Dovrei introdurre nel </w:t>
+          </w:r>
+          <w:proofErr w:type="spellStart"/>
+          <w:r>
+            <w:rPr>
+              <w:rFonts w:ascii="Arial" w:hAnsi="Arial" w:cs="Arial"/>
+            </w:rPr>
+            <w:t>db</w:t>
+          </w:r>
+          <w:proofErr w:type="spellEnd"/>
+          <w:r>
+            <w:rPr>
+              <w:rFonts w:ascii="Arial" w:hAnsi="Arial" w:cs="Arial"/>
+            </w:rPr>
+            <w:t xml:space="preserve"> i comandi collegati alle impostazioni, ma la struttura usata è diversa da quelle precedenti, e viene usata una classe esterna.</w:t>
           </w:r>
         </w:p>
         <w:p>
@@ -25230,7 +26708,21 @@
               <w:rPr>
                 <w:rFonts w:ascii="Arial" w:hAnsi="Arial" w:cs="Arial"/>
               </w:rPr>
-              <w:t>Le statistiche erano scomparse, Bryan ha fatto un rollback e quando mi sono state passate non erano collegate in modo concreto, quindi non risultava funzionante. Per risolvere ho semplicemente inserito gli oggetti necessari nei campi dello script</w:t>
+              <w:t xml:space="preserve">Le statistiche erano scomparse, Bryan ha fatto un </w:t>
+            </w:r>
+            <w:proofErr w:type="spellStart"/>
+            <w:r>
+              <w:rPr>
+                <w:rFonts w:ascii="Arial" w:hAnsi="Arial" w:cs="Arial"/>
+              </w:rPr>
+              <w:t>rollback</w:t>
+            </w:r>
+            <w:proofErr w:type="spellEnd"/>
+            <w:r>
+              <w:rPr>
+                <w:rFonts w:ascii="Arial" w:hAnsi="Arial" w:cs="Arial"/>
+              </w:rPr>
+              <w:t xml:space="preserve"> e quando mi sono state passate non erano collegate in modo concreto, quindi non risultava funzionante. Per risolvere ho semplicemente inserito gli oggetti necessari nei campi dello script</w:t>
             </w:r>
           </w:p>
         </w:tc>
@@ -25326,8 +26818,16 @@
               <w:rPr>
                 <w:rFonts w:ascii="Arial" w:hAnsi="Arial" w:cs="Arial"/>
               </w:rPr>
-              <w:t>Perfettamente in orario ed allineati con grafica e backend</w:t>
-            </w:r>
+              <w:t xml:space="preserve">Perfettamente in orario ed allineati con grafica e </w:t>
+            </w:r>
+            <w:proofErr w:type="spellStart"/>
+            <w:r>
+              <w:rPr>
+                <w:rFonts w:ascii="Arial" w:hAnsi="Arial" w:cs="Arial"/>
+              </w:rPr>
+              <w:t>backend</w:t>
+            </w:r>
+            <w:proofErr w:type="spellEnd"/>
           </w:p>
         </w:tc>
       </w:tr>
@@ -25434,12 +26934,28 @@
                 <w:rFonts w:ascii="Arial" w:hAnsi="Arial" w:cs="Arial"/>
               </w:rPr>
             </w:pPr>
-            <w:r>
-              <w:rPr>
-                <w:rFonts w:ascii="Arial" w:hAnsi="Arial" w:cs="Arial"/>
-              </w:rPr>
-              <w:t>Daily Scrum</w:t>
-            </w:r>
+            <w:proofErr w:type="spellStart"/>
+            <w:r>
+              <w:rPr>
+                <w:rFonts w:ascii="Arial" w:hAnsi="Arial" w:cs="Arial"/>
+              </w:rPr>
+              <w:t>Daily</w:t>
+            </w:r>
+            <w:proofErr w:type="spellEnd"/>
+            <w:r>
+              <w:rPr>
+                <w:rFonts w:ascii="Arial" w:hAnsi="Arial" w:cs="Arial"/>
+              </w:rPr>
+              <w:t xml:space="preserve"> </w:t>
+            </w:r>
+            <w:proofErr w:type="spellStart"/>
+            <w:r>
+              <w:rPr>
+                <w:rFonts w:ascii="Arial" w:hAnsi="Arial" w:cs="Arial"/>
+              </w:rPr>
+              <w:t>Scrum</w:t>
+            </w:r>
+            <w:proofErr w:type="spellEnd"/>
           </w:p>
         </w:tc>
       </w:tr>
@@ -25487,8 +27003,16 @@
               <w:rPr>
                 <w:rFonts w:ascii="Arial" w:hAnsi="Arial" w:cs="Arial"/>
               </w:rPr>
-              <w:t>Riley: Continuo sviluppo db</w:t>
-            </w:r>
+              <w:t xml:space="preserve">Riley: Continuo sviluppo </w:t>
+            </w:r>
+            <w:proofErr w:type="spellStart"/>
+            <w:r>
+              <w:rPr>
+                <w:rFonts w:ascii="Arial" w:hAnsi="Arial" w:cs="Arial"/>
+              </w:rPr>
+              <w:t>db</w:t>
+            </w:r>
+            <w:proofErr w:type="spellEnd"/>
           </w:p>
           <w:p>
             <w:pPr>
@@ -25681,8 +27205,16 @@
               <w:rPr>
                 <w:rFonts w:ascii="Arial" w:hAnsi="Arial" w:cs="Arial"/>
               </w:rPr>
-              <w:t>Sprint Retrospective</w:t>
-            </w:r>
+              <w:t xml:space="preserve">Sprint </w:t>
+            </w:r>
+            <w:proofErr w:type="spellStart"/>
+            <w:r>
+              <w:rPr>
+                <w:rFonts w:ascii="Arial" w:hAnsi="Arial" w:cs="Arial"/>
+              </w:rPr>
+              <w:t>Retrospective</w:t>
+            </w:r>
+            <w:proofErr w:type="spellEnd"/>
           </w:p>
         </w:tc>
       </w:tr>
@@ -26522,7 +28054,21 @@
         <w:rPr>
           <w:rFonts w:ascii="Arial" w:hAnsi="Arial" w:cs="Arial"/>
         </w:rPr>
-        <w:t>Avrei cercato di adattare basandomi su i file presenti.</w:t>
+        <w:t xml:space="preserve">Avrei cercato di adattare basandomi </w:t>
+      </w:r>
+      <w:proofErr w:type="spellStart"/>
+      <w:r>
+        <w:rPr>
+          <w:rFonts w:ascii="Arial" w:hAnsi="Arial" w:cs="Arial"/>
+        </w:rPr>
+        <w:t>su i</w:t>
+      </w:r>
+      <w:proofErr w:type="spellEnd"/>
+      <w:r>
+        <w:rPr>
+          <w:rFonts w:ascii="Arial" w:hAnsi="Arial" w:cs="Arial"/>
+        </w:rPr>
+        <w:t xml:space="preserve"> file presenti.</w:t>
       </w:r>
     </w:p>
     <w:p>
@@ -27055,12 +28601,28 @@
                 <w:rFonts w:ascii="Arial" w:hAnsi="Arial" w:cs="Arial"/>
               </w:rPr>
             </w:pPr>
-            <w:r>
-              <w:rPr>
-                <w:rFonts w:ascii="Arial" w:hAnsi="Arial" w:cs="Arial"/>
-              </w:rPr>
-              <w:t>Daily Scrum</w:t>
-            </w:r>
+            <w:proofErr w:type="spellStart"/>
+            <w:r>
+              <w:rPr>
+                <w:rFonts w:ascii="Arial" w:hAnsi="Arial" w:cs="Arial"/>
+              </w:rPr>
+              <w:t>Daily</w:t>
+            </w:r>
+            <w:proofErr w:type="spellEnd"/>
+            <w:r>
+              <w:rPr>
+                <w:rFonts w:ascii="Arial" w:hAnsi="Arial" w:cs="Arial"/>
+              </w:rPr>
+              <w:t xml:space="preserve"> </w:t>
+            </w:r>
+            <w:proofErr w:type="spellStart"/>
+            <w:r>
+              <w:rPr>
+                <w:rFonts w:ascii="Arial" w:hAnsi="Arial" w:cs="Arial"/>
+              </w:rPr>
+              <w:t>Scrum</w:t>
+            </w:r>
+            <w:proofErr w:type="spellEnd"/>
           </w:p>
         </w:tc>
       </w:tr>
@@ -27346,8 +28908,16 @@
                 <w:rFonts w:ascii="Arial" w:hAnsi="Arial" w:cs="Arial"/>
               </w:rPr>
               <w:lastRenderedPageBreak/>
-              <w:t>Sprint Retrospective</w:t>
-            </w:r>
+              <w:t xml:space="preserve">Sprint </w:t>
+            </w:r>
+            <w:proofErr w:type="spellStart"/>
+            <w:r>
+              <w:rPr>
+                <w:rFonts w:ascii="Arial" w:hAnsi="Arial" w:cs="Arial"/>
+              </w:rPr>
+              <w:t>Retrospective</w:t>
+            </w:r>
+            <w:proofErr w:type="spellEnd"/>
           </w:p>
         </w:tc>
       </w:tr>
@@ -27844,7 +29414,21 @@
             <w:rPr>
               <w:rFonts w:ascii="Arial" w:hAnsi="Arial" w:cs="Arial"/>
             </w:rPr>
-            <w:t>Recentemente ho eseguito un pull e sembra che il mergetool sembra non funzionare: &lt;errore&gt;</w:t>
+            <w:t xml:space="preserve">Recentemente ho eseguito un pull e sembra che il </w:t>
+          </w:r>
+          <w:proofErr w:type="spellStart"/>
+          <w:r>
+            <w:rPr>
+              <w:rFonts w:ascii="Arial" w:hAnsi="Arial" w:cs="Arial"/>
+            </w:rPr>
+            <w:t>mergetool</w:t>
+          </w:r>
+          <w:proofErr w:type="spellEnd"/>
+          <w:r>
+            <w:rPr>
+              <w:rFonts w:ascii="Arial" w:hAnsi="Arial" w:cs="Arial"/>
+            </w:rPr>
+            <w:t xml:space="preserve"> sembra non funzionare: &lt;errore&gt;</w:t>
           </w:r>
         </w:p>
         <w:p>
@@ -27942,7 +29526,21 @@
             <w:rPr>
               <w:rFonts w:ascii="Arial" w:hAnsi="Arial" w:cs="Arial"/>
             </w:rPr>
-            <w:t>Mi ha specificato quale risultava il problema e ha proposto delle soluzioni per sistemare il mergetool, poi ho compreso che il problema risultava solo la modifica del medesimo componente nella stessa scena, questo mi ha fatto comprendere i limiti di questo tool.</w:t>
+            <w:t xml:space="preserve">Mi ha specificato quale risultava il problema e ha proposto delle soluzioni per sistemare il </w:t>
+          </w:r>
+          <w:proofErr w:type="spellStart"/>
+          <w:r>
+            <w:rPr>
+              <w:rFonts w:ascii="Arial" w:hAnsi="Arial" w:cs="Arial"/>
+            </w:rPr>
+            <w:t>mergetool</w:t>
+          </w:r>
+          <w:proofErr w:type="spellEnd"/>
+          <w:r>
+            <w:rPr>
+              <w:rFonts w:ascii="Arial" w:hAnsi="Arial" w:cs="Arial"/>
+            </w:rPr>
+            <w:t>, poi ho compreso che il problema risultava solo la modifica del medesimo componente nella stessa scena, questo mi ha fatto comprendere i limiti di questo tool.</w:t>
           </w:r>
         </w:p>
         <w:p>
@@ -28702,12 +30300,28 @@
                 <w:rFonts w:ascii="Arial" w:hAnsi="Arial" w:cs="Arial"/>
               </w:rPr>
             </w:pPr>
-            <w:r>
-              <w:rPr>
-                <w:rFonts w:ascii="Arial" w:hAnsi="Arial" w:cs="Arial"/>
-              </w:rPr>
-              <w:t>Daily Scrum</w:t>
-            </w:r>
+            <w:proofErr w:type="spellStart"/>
+            <w:r>
+              <w:rPr>
+                <w:rFonts w:ascii="Arial" w:hAnsi="Arial" w:cs="Arial"/>
+              </w:rPr>
+              <w:t>Daily</w:t>
+            </w:r>
+            <w:proofErr w:type="spellEnd"/>
+            <w:r>
+              <w:rPr>
+                <w:rFonts w:ascii="Arial" w:hAnsi="Arial" w:cs="Arial"/>
+              </w:rPr>
+              <w:t xml:space="preserve"> </w:t>
+            </w:r>
+            <w:proofErr w:type="spellStart"/>
+            <w:r>
+              <w:rPr>
+                <w:rFonts w:ascii="Arial" w:hAnsi="Arial" w:cs="Arial"/>
+              </w:rPr>
+              <w:t>Scrum</w:t>
+            </w:r>
+            <w:proofErr w:type="spellEnd"/>
           </w:p>
         </w:tc>
       </w:tr>
@@ -28955,8 +30569,16 @@
               <w:rPr>
                 <w:rFonts w:ascii="Arial" w:hAnsi="Arial" w:cs="Arial"/>
               </w:rPr>
-              <w:t>Sprint Retrospective</w:t>
-            </w:r>
+              <w:t xml:space="preserve">Sprint </w:t>
+            </w:r>
+            <w:proofErr w:type="spellStart"/>
+            <w:r>
+              <w:rPr>
+                <w:rFonts w:ascii="Arial" w:hAnsi="Arial" w:cs="Arial"/>
+              </w:rPr>
+              <w:t>Retrospective</w:t>
+            </w:r>
+            <w:proofErr w:type="spellEnd"/>
           </w:p>
         </w:tc>
       </w:tr>
@@ -29447,7 +31069,21 @@
             <w:rPr>
               <w:rFonts w:ascii="Arial" w:hAnsi="Arial" w:cs="Arial"/>
             </w:rPr>
-            <w:t>Come posso cambiare una scena su unity?</w:t>
+            <w:t xml:space="preserve">Come posso cambiare una scena su </w:t>
+          </w:r>
+          <w:proofErr w:type="spellStart"/>
+          <w:r>
+            <w:rPr>
+              <w:rFonts w:ascii="Arial" w:hAnsi="Arial" w:cs="Arial"/>
+            </w:rPr>
+            <w:t>unity</w:t>
+          </w:r>
+          <w:proofErr w:type="spellEnd"/>
+          <w:r>
+            <w:rPr>
+              <w:rFonts w:ascii="Arial" w:hAnsi="Arial" w:cs="Arial"/>
+            </w:rPr>
+            <w:t>?</w:t>
           </w:r>
         </w:p>
         <w:p>
@@ -30022,7 +31658,21 @@
               <w:rPr>
                 <w:rFonts w:ascii="Arial" w:hAnsi="Arial" w:cs="Arial"/>
               </w:rPr>
-              <w:t>Eseguito un refactor delle dimensioni degli elementi dato che la gravità era troppo bassa.</w:t>
+              <w:t xml:space="preserve">Eseguito un </w:t>
+            </w:r>
+            <w:proofErr w:type="spellStart"/>
+            <w:r>
+              <w:rPr>
+                <w:rFonts w:ascii="Arial" w:hAnsi="Arial" w:cs="Arial"/>
+              </w:rPr>
+              <w:t>refactor</w:t>
+            </w:r>
+            <w:proofErr w:type="spellEnd"/>
+            <w:r>
+              <w:rPr>
+                <w:rFonts w:ascii="Arial" w:hAnsi="Arial" w:cs="Arial"/>
+              </w:rPr>
+              <w:t xml:space="preserve"> delle dimensioni degli elementi dato che la gravità era troppo bassa.</w:t>
             </w:r>
           </w:p>
         </w:tc>
@@ -30323,12 +31973,28 @@
                 <w:rFonts w:ascii="Arial" w:hAnsi="Arial" w:cs="Arial"/>
               </w:rPr>
             </w:pPr>
-            <w:r>
-              <w:rPr>
-                <w:rFonts w:ascii="Arial" w:hAnsi="Arial" w:cs="Arial"/>
-              </w:rPr>
-              <w:t>Daily Scrum</w:t>
-            </w:r>
+            <w:proofErr w:type="spellStart"/>
+            <w:r>
+              <w:rPr>
+                <w:rFonts w:ascii="Arial" w:hAnsi="Arial" w:cs="Arial"/>
+              </w:rPr>
+              <w:t>Daily</w:t>
+            </w:r>
+            <w:proofErr w:type="spellEnd"/>
+            <w:r>
+              <w:rPr>
+                <w:rFonts w:ascii="Arial" w:hAnsi="Arial" w:cs="Arial"/>
+              </w:rPr>
+              <w:t xml:space="preserve"> </w:t>
+            </w:r>
+            <w:proofErr w:type="spellStart"/>
+            <w:r>
+              <w:rPr>
+                <w:rFonts w:ascii="Arial" w:hAnsi="Arial" w:cs="Arial"/>
+              </w:rPr>
+              <w:t>Scrum</w:t>
+            </w:r>
+            <w:proofErr w:type="spellEnd"/>
           </w:p>
         </w:tc>
       </w:tr>
@@ -30570,8 +32236,16 @@
               <w:rPr>
                 <w:rFonts w:ascii="Arial" w:hAnsi="Arial" w:cs="Arial"/>
               </w:rPr>
-              <w:t>Sprint Retrospective</w:t>
-            </w:r>
+              <w:t xml:space="preserve">Sprint </w:t>
+            </w:r>
+            <w:proofErr w:type="spellStart"/>
+            <w:r>
+              <w:rPr>
+                <w:rFonts w:ascii="Arial" w:hAnsi="Arial" w:cs="Arial"/>
+              </w:rPr>
+              <w:t>Retrospective</w:t>
+            </w:r>
+            <w:proofErr w:type="spellEnd"/>
           </w:p>
         </w:tc>
       </w:tr>
@@ -31062,7 +32736,21 @@
             <w:rPr>
               <w:rFonts w:ascii="Arial" w:hAnsi="Arial" w:cs="Arial"/>
             </w:rPr>
-            <w:t>Come funziona un sistema di movimento della visuale su unity?</w:t>
+            <w:t xml:space="preserve">Come funziona un sistema di movimento della visuale su </w:t>
+          </w:r>
+          <w:proofErr w:type="spellStart"/>
+          <w:r>
+            <w:rPr>
+              <w:rFonts w:ascii="Arial" w:hAnsi="Arial" w:cs="Arial"/>
+            </w:rPr>
+            <w:t>unity</w:t>
+          </w:r>
+          <w:proofErr w:type="spellEnd"/>
+          <w:r>
+            <w:rPr>
+              <w:rFonts w:ascii="Arial" w:hAnsi="Arial" w:cs="Arial"/>
+            </w:rPr>
+            <w:t>?</w:t>
           </w:r>
         </w:p>
         <w:p>
@@ -31388,6 +33076,1637 @@
           <w:rFonts w:ascii="Arial" w:hAnsi="Arial" w:cs="Arial"/>
         </w:rPr>
         <w:t xml:space="preserve"> ed eventuali forum</w:t>
+      </w:r>
+    </w:p>
+    <w:p>
+      <w:pPr>
+        <w:pStyle w:val="Nessunaspaziatura"/>
+        <w:rPr>
+          <w:rFonts w:ascii="Arial" w:hAnsi="Arial" w:cs="Arial"/>
+        </w:rPr>
+      </w:pPr>
+      <w:r>
+        <w:rPr>
+          <w:rFonts w:ascii="Arial" w:hAnsi="Arial" w:cs="Arial"/>
+        </w:rPr>
+        <w:t>Bryan:</w:t>
+      </w:r>
+    </w:p>
+    <w:p>
+      <w:pPr>
+        <w:rPr>
+          <w:rFonts w:ascii="Arial" w:hAnsi="Arial" w:cs="Arial"/>
+        </w:rPr>
+      </w:pPr>
+      <w:r>
+        <w:rPr>
+          <w:rFonts w:ascii="Arial" w:hAnsi="Arial" w:cs="Arial"/>
+        </w:rPr>
+        <w:br w:type="page"/>
+      </w:r>
+    </w:p>
+    <w:tbl>
+      <w:tblPr>
+        <w:tblStyle w:val="Grigliatabella"/>
+        <w:tblW w:w="5000" w:type="pct"/>
+        <w:tblLook w:val="04A0" w:firstRow="1" w:lastRow="0" w:firstColumn="1" w:lastColumn="0" w:noHBand="0" w:noVBand="1"/>
+      </w:tblPr>
+      <w:tblGrid>
+        <w:gridCol w:w="2407"/>
+        <w:gridCol w:w="7221"/>
+      </w:tblGrid>
+      <w:tr>
+        <w:trPr>
+          <w:trHeight w:val="199"/>
+        </w:trPr>
+        <w:tc>
+          <w:tcPr>
+            <w:tcW w:w="1250" w:type="pct"/>
+            <w:vAlign w:val="center"/>
+          </w:tcPr>
+          <w:p>
+            <w:pPr>
+              <w:rPr>
+                <w:rFonts w:ascii="Arial" w:hAnsi="Arial" w:cs="Arial"/>
+              </w:rPr>
+            </w:pPr>
+            <w:r>
+              <w:rPr>
+                <w:rFonts w:ascii="Arial" w:hAnsi="Arial" w:cs="Arial"/>
+              </w:rPr>
+              <w:lastRenderedPageBreak/>
+              <w:t>Luogo</w:t>
+            </w:r>
+          </w:p>
+        </w:tc>
+        <w:tc>
+          <w:tcPr>
+            <w:tcW w:w="3750" w:type="pct"/>
+            <w:vAlign w:val="center"/>
+          </w:tcPr>
+          <w:p>
+            <w:pPr>
+              <w:rPr>
+                <w:rFonts w:ascii="Arial" w:hAnsi="Arial" w:cs="Arial"/>
+              </w:rPr>
+            </w:pPr>
+            <w:r>
+              <w:rPr>
+                <w:rFonts w:ascii="Arial" w:hAnsi="Arial" w:cs="Arial"/>
+              </w:rPr>
+              <w:t>Scuola Arti e Mestieri Trevano</w:t>
+            </w:r>
+          </w:p>
+        </w:tc>
+      </w:tr>
+      <w:tr>
+        <w:trPr>
+          <w:trHeight w:val="196"/>
+        </w:trPr>
+        <w:tc>
+          <w:tcPr>
+            <w:tcW w:w="1250" w:type="pct"/>
+            <w:vAlign w:val="center"/>
+          </w:tcPr>
+          <w:p>
+            <w:pPr>
+              <w:rPr>
+                <w:rFonts w:ascii="Arial" w:hAnsi="Arial" w:cs="Arial"/>
+              </w:rPr>
+            </w:pPr>
+            <w:r>
+              <w:rPr>
+                <w:rFonts w:ascii="Arial" w:hAnsi="Arial" w:cs="Arial"/>
+              </w:rPr>
+              <w:t>Data</w:t>
+            </w:r>
+          </w:p>
+        </w:tc>
+        <w:tc>
+          <w:tcPr>
+            <w:tcW w:w="3750" w:type="pct"/>
+            <w:vAlign w:val="center"/>
+          </w:tcPr>
+          <w:p>
+            <w:pPr>
+              <w:rPr>
+                <w:rFonts w:ascii="Arial" w:hAnsi="Arial" w:cs="Arial"/>
+              </w:rPr>
+            </w:pPr>
+            <w:r>
+              <w:rPr>
+                <w:rFonts w:ascii="Arial" w:hAnsi="Arial" w:cs="Arial"/>
+              </w:rPr>
+              <w:t>14.10.2026</w:t>
+            </w:r>
+          </w:p>
+        </w:tc>
+      </w:tr>
+    </w:tbl>
+    <w:p>
+      <w:pPr>
+        <w:rPr>
+          <w:rFonts w:ascii="Arial" w:hAnsi="Arial" w:cs="Arial"/>
+        </w:rPr>
+      </w:pPr>
+    </w:p>
+    <w:tbl>
+      <w:tblPr>
+        <w:tblStyle w:val="Grigliatabella"/>
+        <w:tblW w:w="0" w:type="auto"/>
+        <w:tblLook w:val="04A0" w:firstRow="1" w:lastRow="0" w:firstColumn="1" w:lastColumn="0" w:noHBand="0" w:noVBand="1"/>
+      </w:tblPr>
+      <w:tblGrid>
+        <w:gridCol w:w="1271"/>
+        <w:gridCol w:w="8357"/>
+      </w:tblGrid>
+      <w:tr>
+        <w:tc>
+          <w:tcPr>
+            <w:tcW w:w="9628" w:type="dxa"/>
+            <w:gridSpan w:val="2"/>
+            <w:shd w:val="clear" w:color="auto" w:fill="D9D9D9" w:themeFill="background1" w:themeFillShade="D9"/>
+          </w:tcPr>
+          <w:p>
+            <w:pPr>
+              <w:rPr>
+                <w:rFonts w:ascii="Arial" w:hAnsi="Arial" w:cs="Arial"/>
+              </w:rPr>
+            </w:pPr>
+            <w:r>
+              <w:rPr>
+                <w:rFonts w:ascii="Arial" w:hAnsi="Arial" w:cs="Arial"/>
+              </w:rPr>
+              <w:t>Lavori svolti</w:t>
+            </w:r>
+          </w:p>
+        </w:tc>
+      </w:tr>
+      <w:tr>
+        <w:tc>
+          <w:tcPr>
+            <w:tcW w:w="1271" w:type="dxa"/>
+          </w:tcPr>
+          <w:p>
+            <w:pPr>
+              <w:rPr>
+                <w:rFonts w:ascii="Arial" w:hAnsi="Arial" w:cs="Arial"/>
+              </w:rPr>
+            </w:pPr>
+            <w:r>
+              <w:rPr>
+                <w:rFonts w:ascii="Arial" w:hAnsi="Arial" w:cs="Arial"/>
+              </w:rPr>
+              <w:t>Riley</w:t>
+            </w:r>
+          </w:p>
+        </w:tc>
+        <w:tc>
+          <w:tcPr>
+            <w:tcW w:w="8357" w:type="dxa"/>
+          </w:tcPr>
+          <w:p>
+            <w:pPr>
+              <w:rPr>
+                <w:rFonts w:ascii="Arial" w:hAnsi="Arial" w:cs="Arial"/>
+              </w:rPr>
+            </w:pPr>
+            <w:r>
+              <w:rPr>
+                <w:rFonts w:ascii="Arial" w:hAnsi="Arial" w:cs="Arial"/>
+              </w:rPr>
+              <w:t>Creato script per gestire movimento della telecamera</w:t>
+            </w:r>
+          </w:p>
+        </w:tc>
+      </w:tr>
+      <w:tr>
+        <w:tc>
+          <w:tcPr>
+            <w:tcW w:w="1271" w:type="dxa"/>
+          </w:tcPr>
+          <w:p>
+            <w:pPr>
+              <w:rPr>
+                <w:rFonts w:ascii="Arial" w:hAnsi="Arial" w:cs="Arial"/>
+              </w:rPr>
+            </w:pPr>
+            <w:r>
+              <w:rPr>
+                <w:rFonts w:ascii="Arial" w:hAnsi="Arial" w:cs="Arial"/>
+              </w:rPr>
+              <w:t>Bryan</w:t>
+            </w:r>
+          </w:p>
+        </w:tc>
+        <w:tc>
+          <w:tcPr>
+            <w:tcW w:w="8357" w:type="dxa"/>
+          </w:tcPr>
+          <w:p>
+            <w:pPr>
+              <w:rPr>
+                <w:rFonts w:ascii="Arial" w:hAnsi="Arial" w:cs="Arial"/>
+              </w:rPr>
+            </w:pPr>
+            <w:r>
+              <w:rPr>
+                <w:rFonts w:ascii="Arial" w:hAnsi="Arial" w:cs="Arial"/>
+              </w:rPr>
+              <w:t xml:space="preserve">Eseguito un </w:t>
+            </w:r>
+            <w:proofErr w:type="spellStart"/>
+            <w:r>
+              <w:rPr>
+                <w:rFonts w:ascii="Arial" w:hAnsi="Arial" w:cs="Arial"/>
+              </w:rPr>
+              <w:t>refactor</w:t>
+            </w:r>
+            <w:proofErr w:type="spellEnd"/>
+            <w:r>
+              <w:rPr>
+                <w:rFonts w:ascii="Arial" w:hAnsi="Arial" w:cs="Arial"/>
+              </w:rPr>
+              <w:t xml:space="preserve"> delle dimensioni degli elementi dato che la gravità era troppo bassa.</w:t>
+            </w:r>
+          </w:p>
+        </w:tc>
+      </w:tr>
+    </w:tbl>
+    <w:p>
+      <w:pPr>
+        <w:rPr>
+          <w:rFonts w:ascii="Arial" w:hAnsi="Arial" w:cs="Arial"/>
+        </w:rPr>
+      </w:pPr>
+    </w:p>
+    <w:tbl>
+      <w:tblPr>
+        <w:tblStyle w:val="Grigliatabella"/>
+        <w:tblW w:w="0" w:type="auto"/>
+        <w:tblInd w:w="-5" w:type="dxa"/>
+        <w:tblLook w:val="04A0" w:firstRow="1" w:lastRow="0" w:firstColumn="1" w:lastColumn="0" w:noHBand="0" w:noVBand="1"/>
+      </w:tblPr>
+      <w:tblGrid>
+        <w:gridCol w:w="1276"/>
+        <w:gridCol w:w="8357"/>
+      </w:tblGrid>
+      <w:tr>
+        <w:tc>
+          <w:tcPr>
+            <w:tcW w:w="9628" w:type="dxa"/>
+            <w:gridSpan w:val="2"/>
+            <w:shd w:val="clear" w:color="auto" w:fill="D9D9D9" w:themeFill="background1" w:themeFillShade="D9"/>
+          </w:tcPr>
+          <w:p>
+            <w:pPr>
+              <w:rPr>
+                <w:rFonts w:ascii="Arial" w:hAnsi="Arial" w:cs="Arial"/>
+              </w:rPr>
+            </w:pPr>
+            <w:r>
+              <w:rPr>
+                <w:rFonts w:ascii="Arial" w:hAnsi="Arial" w:cs="Arial"/>
+              </w:rPr>
+              <w:t>Problemi riscontrati e soluzioni adottate</w:t>
+            </w:r>
+          </w:p>
+        </w:tc>
+      </w:tr>
+      <w:tr>
+        <w:tc>
+          <w:tcPr>
+            <w:tcW w:w="1276" w:type="dxa"/>
+          </w:tcPr>
+          <w:p>
+            <w:pPr>
+              <w:rPr>
+                <w:rFonts w:ascii="Arial" w:hAnsi="Arial" w:cs="Arial"/>
+              </w:rPr>
+            </w:pPr>
+            <w:r>
+              <w:rPr>
+                <w:rFonts w:ascii="Arial" w:hAnsi="Arial" w:cs="Arial"/>
+              </w:rPr>
+              <w:t>Riley</w:t>
+            </w:r>
+          </w:p>
+        </w:tc>
+        <w:tc>
+          <w:tcPr>
+            <w:tcW w:w="8357" w:type="dxa"/>
+          </w:tcPr>
+          <w:p>
+            <w:pPr>
+              <w:rPr>
+                <w:rFonts w:ascii="Arial" w:hAnsi="Arial" w:cs="Arial"/>
+              </w:rPr>
+            </w:pPr>
+            <w:r>
+              <w:rPr>
+                <w:rFonts w:ascii="Arial" w:hAnsi="Arial" w:cs="Arial"/>
+              </w:rPr>
+              <w:t>-</w:t>
+            </w:r>
+          </w:p>
+        </w:tc>
+      </w:tr>
+      <w:tr>
+        <w:tc>
+          <w:tcPr>
+            <w:tcW w:w="1276" w:type="dxa"/>
+          </w:tcPr>
+          <w:p>
+            <w:pPr>
+              <w:rPr>
+                <w:rFonts w:ascii="Arial" w:hAnsi="Arial" w:cs="Arial"/>
+              </w:rPr>
+            </w:pPr>
+            <w:r>
+              <w:rPr>
+                <w:rFonts w:ascii="Arial" w:hAnsi="Arial" w:cs="Arial"/>
+              </w:rPr>
+              <w:t>Bryan</w:t>
+            </w:r>
+          </w:p>
+        </w:tc>
+        <w:tc>
+          <w:tcPr>
+            <w:tcW w:w="8357" w:type="dxa"/>
+          </w:tcPr>
+          <w:p>
+            <w:pPr>
+              <w:rPr>
+                <w:rFonts w:ascii="Arial" w:hAnsi="Arial" w:cs="Arial"/>
+              </w:rPr>
+            </w:pPr>
+            <w:r>
+              <w:rPr>
+                <w:rFonts w:ascii="Arial" w:hAnsi="Arial" w:cs="Arial"/>
+              </w:rPr>
+              <w:t>-</w:t>
+            </w:r>
+          </w:p>
+        </w:tc>
+      </w:tr>
+    </w:tbl>
+    <w:p>
+      <w:pPr>
+        <w:rPr>
+          <w:rFonts w:ascii="Arial" w:hAnsi="Arial" w:cs="Arial"/>
+        </w:rPr>
+      </w:pPr>
+    </w:p>
+    <w:tbl>
+      <w:tblPr>
+        <w:tblStyle w:val="Grigliatabella"/>
+        <w:tblW w:w="0" w:type="auto"/>
+        <w:tblLook w:val="04A0" w:firstRow="1" w:lastRow="0" w:firstColumn="1" w:lastColumn="0" w:noHBand="0" w:noVBand="1"/>
+      </w:tblPr>
+      <w:tblGrid>
+        <w:gridCol w:w="9628"/>
+      </w:tblGrid>
+      <w:tr>
+        <w:tc>
+          <w:tcPr>
+            <w:tcW w:w="9854" w:type="dxa"/>
+            <w:shd w:val="clear" w:color="auto" w:fill="D9D9D9" w:themeFill="background1" w:themeFillShade="D9"/>
+          </w:tcPr>
+          <w:p>
+            <w:pPr>
+              <w:rPr>
+                <w:rFonts w:ascii="Arial" w:hAnsi="Arial" w:cs="Arial"/>
+              </w:rPr>
+            </w:pPr>
+            <w:r>
+              <w:rPr>
+                <w:rFonts w:ascii="Arial" w:hAnsi="Arial" w:cs="Arial"/>
+              </w:rPr>
+              <w:t>Punto della situazione rispetto alla pianificazione</w:t>
+            </w:r>
+          </w:p>
+        </w:tc>
+      </w:tr>
+      <w:tr>
+        <w:tc>
+          <w:tcPr>
+            <w:tcW w:w="9854" w:type="dxa"/>
+          </w:tcPr>
+          <w:p>
+            <w:pPr>
+              <w:rPr>
+                <w:rFonts w:ascii="Arial" w:hAnsi="Arial" w:cs="Arial"/>
+              </w:rPr>
+            </w:pPr>
+            <w:r>
+              <w:rPr>
+                <w:rFonts w:ascii="Arial" w:hAnsi="Arial" w:cs="Arial"/>
+              </w:rPr>
+              <w:t>Procedendo come previsto</w:t>
+            </w:r>
+          </w:p>
+        </w:tc>
+      </w:tr>
+    </w:tbl>
+    <w:p>
+      <w:pPr>
+        <w:rPr>
+          <w:rFonts w:ascii="Arial" w:hAnsi="Arial" w:cs="Arial"/>
+        </w:rPr>
+      </w:pPr>
+    </w:p>
+    <w:tbl>
+      <w:tblPr>
+        <w:tblStyle w:val="Grigliatabella"/>
+        <w:tblW w:w="0" w:type="auto"/>
+        <w:tblLook w:val="04A0" w:firstRow="1" w:lastRow="0" w:firstColumn="1" w:lastColumn="0" w:noHBand="0" w:noVBand="1"/>
+      </w:tblPr>
+      <w:tblGrid>
+        <w:gridCol w:w="9628"/>
+      </w:tblGrid>
+      <w:tr>
+        <w:tc>
+          <w:tcPr>
+            <w:tcW w:w="9854" w:type="dxa"/>
+            <w:shd w:val="clear" w:color="auto" w:fill="D9D9D9" w:themeFill="background1" w:themeFillShade="D9"/>
+          </w:tcPr>
+          <w:p>
+            <w:pPr>
+              <w:rPr>
+                <w:rFonts w:ascii="Arial" w:hAnsi="Arial" w:cs="Arial"/>
+              </w:rPr>
+            </w:pPr>
+            <w:r>
+              <w:rPr>
+                <w:rFonts w:ascii="Arial" w:hAnsi="Arial" w:cs="Arial"/>
+              </w:rPr>
+              <w:t>Programma di massima per la prossima giornata di lavoro</w:t>
+            </w:r>
+          </w:p>
+        </w:tc>
+      </w:tr>
+      <w:tr>
+        <w:tc>
+          <w:tcPr>
+            <w:tcW w:w="9854" w:type="dxa"/>
+          </w:tcPr>
+          <w:p>
+            <w:pPr>
+              <w:rPr>
+                <w:rFonts w:ascii="Arial" w:hAnsi="Arial" w:cs="Arial"/>
+              </w:rPr>
+            </w:pPr>
+            <w:r>
+              <w:rPr>
+                <w:rFonts w:ascii="Arial" w:hAnsi="Arial" w:cs="Arial"/>
+              </w:rPr>
+              <w:t>Collegare lo script di movimento della telecamera e sviluppare il movimento</w:t>
+            </w:r>
+          </w:p>
+        </w:tc>
+      </w:tr>
+    </w:tbl>
+    <w:p>
+      <w:pPr>
+        <w:rPr>
+          <w:rFonts w:ascii="Arial" w:hAnsi="Arial" w:cs="Arial"/>
+        </w:rPr>
+      </w:pPr>
+    </w:p>
+    <w:p>
+      <w:pPr>
+        <w:pStyle w:val="Titolo1"/>
+      </w:pPr>
+      <w:r>
+        <w:t>Agile - Resoconto</w:t>
+      </w:r>
+    </w:p>
+    <w:tbl>
+      <w:tblPr>
+        <w:tblStyle w:val="Grigliatabella"/>
+        <w:tblW w:w="0" w:type="auto"/>
+        <w:tblLook w:val="04A0" w:firstRow="1" w:lastRow="0" w:firstColumn="1" w:lastColumn="0" w:noHBand="0" w:noVBand="1"/>
+      </w:tblPr>
+      <w:tblGrid>
+        <w:gridCol w:w="9628"/>
+      </w:tblGrid>
+      <w:tr>
+        <w:tc>
+          <w:tcPr>
+            <w:tcW w:w="9628" w:type="dxa"/>
+            <w:tcBorders>
+              <w:top w:val="single" w:sz="4" w:space="0" w:color="auto"/>
+              <w:left w:val="single" w:sz="4" w:space="0" w:color="auto"/>
+              <w:bottom w:val="single" w:sz="4" w:space="0" w:color="auto"/>
+              <w:right w:val="single" w:sz="4" w:space="0" w:color="auto"/>
+            </w:tcBorders>
+            <w:shd w:val="clear" w:color="auto" w:fill="D9D9D9" w:themeFill="background1" w:themeFillShade="D9"/>
+            <w:hideMark/>
+          </w:tcPr>
+          <w:p>
+            <w:pPr>
+              <w:spacing w:after="200" w:line="276" w:lineRule="auto"/>
+              <w:rPr>
+                <w:rFonts w:ascii="Arial" w:hAnsi="Arial" w:cs="Arial"/>
+              </w:rPr>
+            </w:pPr>
+            <w:proofErr w:type="spellStart"/>
+            <w:r>
+              <w:rPr>
+                <w:rFonts w:ascii="Arial" w:hAnsi="Arial" w:cs="Arial"/>
+              </w:rPr>
+              <w:t>Daily</w:t>
+            </w:r>
+            <w:proofErr w:type="spellEnd"/>
+            <w:r>
+              <w:rPr>
+                <w:rFonts w:ascii="Arial" w:hAnsi="Arial" w:cs="Arial"/>
+              </w:rPr>
+              <w:t xml:space="preserve"> </w:t>
+            </w:r>
+            <w:proofErr w:type="spellStart"/>
+            <w:r>
+              <w:rPr>
+                <w:rFonts w:ascii="Arial" w:hAnsi="Arial" w:cs="Arial"/>
+              </w:rPr>
+              <w:t>Scrum</w:t>
+            </w:r>
+            <w:proofErr w:type="spellEnd"/>
+          </w:p>
+        </w:tc>
+      </w:tr>
+      <w:tr>
+        <w:tc>
+          <w:tcPr>
+            <w:tcW w:w="9628" w:type="dxa"/>
+            <w:tcBorders>
+              <w:top w:val="single" w:sz="4" w:space="0" w:color="auto"/>
+              <w:left w:val="single" w:sz="4" w:space="0" w:color="auto"/>
+              <w:bottom w:val="single" w:sz="4" w:space="0" w:color="auto"/>
+              <w:right w:val="single" w:sz="4" w:space="0" w:color="auto"/>
+            </w:tcBorders>
+            <w:hideMark/>
+          </w:tcPr>
+          <w:p>
+            <w:pPr>
+              <w:spacing w:after="200" w:line="276" w:lineRule="auto"/>
+              <w:rPr>
+                <w:rFonts w:ascii="Arial" w:hAnsi="Arial" w:cs="Arial"/>
+              </w:rPr>
+            </w:pPr>
+          </w:p>
+        </w:tc>
+      </w:tr>
+      <w:tr>
+        <w:tc>
+          <w:tcPr>
+            <w:tcW w:w="9628" w:type="dxa"/>
+            <w:tcBorders>
+              <w:top w:val="single" w:sz="4" w:space="0" w:color="auto"/>
+              <w:left w:val="single" w:sz="4" w:space="0" w:color="auto"/>
+              <w:bottom w:val="single" w:sz="4" w:space="0" w:color="auto"/>
+              <w:right w:val="single" w:sz="4" w:space="0" w:color="auto"/>
+            </w:tcBorders>
+          </w:tcPr>
+          <w:p>
+            <w:pPr>
+              <w:spacing w:after="200" w:line="276" w:lineRule="auto"/>
+              <w:rPr>
+                <w:rFonts w:ascii="Arial" w:hAnsi="Arial" w:cs="Arial"/>
+              </w:rPr>
+            </w:pPr>
+            <w:r>
+              <w:rPr>
+                <w:rFonts w:ascii="Arial" w:hAnsi="Arial" w:cs="Arial"/>
+              </w:rPr>
+              <w:t xml:space="preserve">Riley: </w:t>
+            </w:r>
+            <w:r>
+              <w:rPr>
+                <w:rFonts w:ascii="Arial" w:hAnsi="Arial" w:cs="Arial"/>
+              </w:rPr>
+              <w:t>Continuo s</w:t>
+            </w:r>
+            <w:r>
+              <w:rPr>
+                <w:rFonts w:ascii="Arial" w:hAnsi="Arial" w:cs="Arial"/>
+              </w:rPr>
+              <w:t>viluppo movimento telecamera e cambiamento sensibilità</w:t>
+            </w:r>
+          </w:p>
+          <w:p>
+            <w:pPr>
+              <w:spacing w:after="200" w:line="276" w:lineRule="auto"/>
+              <w:rPr>
+                <w:rFonts w:ascii="Arial" w:hAnsi="Arial" w:cs="Arial"/>
+              </w:rPr>
+            </w:pPr>
+            <w:r>
+              <w:rPr>
+                <w:rFonts w:ascii="Arial" w:hAnsi="Arial" w:cs="Arial"/>
+              </w:rPr>
+              <w:t>Bryan: Continuo sviluppo sistema movimento</w:t>
+            </w:r>
+          </w:p>
+        </w:tc>
+      </w:tr>
+    </w:tbl>
+    <w:p>
+      <w:pPr>
+        <w:rPr>
+          <w:rFonts w:ascii="Arial" w:hAnsi="Arial" w:cs="Arial"/>
+        </w:rPr>
+      </w:pPr>
+    </w:p>
+    <w:tbl>
+      <w:tblPr>
+        <w:tblStyle w:val="Grigliatabella"/>
+        <w:tblW w:w="0" w:type="auto"/>
+        <w:tblLook w:val="04A0" w:firstRow="1" w:lastRow="0" w:firstColumn="1" w:lastColumn="0" w:noHBand="0" w:noVBand="1"/>
+      </w:tblPr>
+      <w:tblGrid>
+        <w:gridCol w:w="9628"/>
+      </w:tblGrid>
+      <w:tr>
+        <w:tc>
+          <w:tcPr>
+            <w:tcW w:w="9854" w:type="dxa"/>
+            <w:tcBorders>
+              <w:top w:val="single" w:sz="4" w:space="0" w:color="auto"/>
+              <w:left w:val="single" w:sz="4" w:space="0" w:color="auto"/>
+              <w:bottom w:val="single" w:sz="4" w:space="0" w:color="auto"/>
+              <w:right w:val="single" w:sz="4" w:space="0" w:color="auto"/>
+            </w:tcBorders>
+            <w:shd w:val="clear" w:color="auto" w:fill="D9D9D9" w:themeFill="background1" w:themeFillShade="D9"/>
+            <w:hideMark/>
+          </w:tcPr>
+          <w:p>
+            <w:pPr>
+              <w:spacing w:after="200" w:line="276" w:lineRule="auto"/>
+              <w:rPr>
+                <w:rFonts w:ascii="Arial" w:hAnsi="Arial" w:cs="Arial"/>
+              </w:rPr>
+            </w:pPr>
+            <w:r>
+              <w:rPr>
+                <w:rFonts w:ascii="Arial" w:hAnsi="Arial" w:cs="Arial"/>
+              </w:rPr>
+              <w:t>Sprint Planning</w:t>
+            </w:r>
+          </w:p>
+        </w:tc>
+      </w:tr>
+      <w:tr>
+        <w:tc>
+          <w:tcPr>
+            <w:tcW w:w="9854" w:type="dxa"/>
+            <w:tcBorders>
+              <w:top w:val="single" w:sz="4" w:space="0" w:color="auto"/>
+              <w:left w:val="single" w:sz="4" w:space="0" w:color="auto"/>
+              <w:bottom w:val="single" w:sz="4" w:space="0" w:color="auto"/>
+              <w:right w:val="single" w:sz="4" w:space="0" w:color="auto"/>
+            </w:tcBorders>
+          </w:tcPr>
+          <w:p>
+            <w:pPr>
+              <w:spacing w:after="200" w:line="276" w:lineRule="auto"/>
+              <w:rPr>
+                <w:rFonts w:ascii="Arial" w:hAnsi="Arial" w:cs="Arial"/>
+              </w:rPr>
+            </w:pPr>
+          </w:p>
+        </w:tc>
+      </w:tr>
+    </w:tbl>
+    <w:p>
+      <w:pPr>
+        <w:rPr>
+          <w:rFonts w:ascii="Arial" w:hAnsi="Arial" w:cs="Arial"/>
+        </w:rPr>
+      </w:pPr>
+    </w:p>
+    <w:tbl>
+      <w:tblPr>
+        <w:tblStyle w:val="Grigliatabella"/>
+        <w:tblW w:w="0" w:type="auto"/>
+        <w:tblLook w:val="04A0" w:firstRow="1" w:lastRow="0" w:firstColumn="1" w:lastColumn="0" w:noHBand="0" w:noVBand="1"/>
+      </w:tblPr>
+      <w:tblGrid>
+        <w:gridCol w:w="9628"/>
+      </w:tblGrid>
+      <w:tr>
+        <w:tc>
+          <w:tcPr>
+            <w:tcW w:w="9854" w:type="dxa"/>
+            <w:tcBorders>
+              <w:top w:val="single" w:sz="4" w:space="0" w:color="auto"/>
+              <w:left w:val="single" w:sz="4" w:space="0" w:color="auto"/>
+              <w:bottom w:val="single" w:sz="4" w:space="0" w:color="auto"/>
+              <w:right w:val="single" w:sz="4" w:space="0" w:color="auto"/>
+            </w:tcBorders>
+            <w:shd w:val="clear" w:color="auto" w:fill="D9D9D9" w:themeFill="background1" w:themeFillShade="D9"/>
+            <w:hideMark/>
+          </w:tcPr>
+          <w:p>
+            <w:pPr>
+              <w:spacing w:after="200" w:line="276" w:lineRule="auto"/>
+              <w:rPr>
+                <w:rFonts w:ascii="Arial" w:hAnsi="Arial" w:cs="Arial"/>
+              </w:rPr>
+            </w:pPr>
+            <w:r>
+              <w:rPr>
+                <w:rFonts w:ascii="Arial" w:hAnsi="Arial" w:cs="Arial"/>
+              </w:rPr>
+              <w:t>Sprint Review</w:t>
+            </w:r>
+          </w:p>
+        </w:tc>
+      </w:tr>
+      <w:tr>
+        <w:tc>
+          <w:tcPr>
+            <w:tcW w:w="9854" w:type="dxa"/>
+            <w:tcBorders>
+              <w:top w:val="single" w:sz="4" w:space="0" w:color="auto"/>
+              <w:left w:val="single" w:sz="4" w:space="0" w:color="auto"/>
+              <w:bottom w:val="single" w:sz="4" w:space="0" w:color="auto"/>
+              <w:right w:val="single" w:sz="4" w:space="0" w:color="auto"/>
+            </w:tcBorders>
+          </w:tcPr>
+          <w:p>
+            <w:pPr>
+              <w:spacing w:after="200" w:line="276" w:lineRule="auto"/>
+              <w:rPr>
+                <w:rFonts w:ascii="Arial" w:hAnsi="Arial" w:cs="Arial"/>
+              </w:rPr>
+            </w:pPr>
+          </w:p>
+        </w:tc>
+      </w:tr>
+    </w:tbl>
+    <w:p>
+      <w:pPr>
+        <w:rPr>
+          <w:rFonts w:ascii="Arial" w:hAnsi="Arial" w:cs="Arial"/>
+        </w:rPr>
+      </w:pPr>
+    </w:p>
+    <w:tbl>
+      <w:tblPr>
+        <w:tblStyle w:val="Grigliatabella"/>
+        <w:tblW w:w="0" w:type="auto"/>
+        <w:tblLook w:val="04A0" w:firstRow="1" w:lastRow="0" w:firstColumn="1" w:lastColumn="0" w:noHBand="0" w:noVBand="1"/>
+      </w:tblPr>
+      <w:tblGrid>
+        <w:gridCol w:w="9628"/>
+      </w:tblGrid>
+      <w:tr>
+        <w:tc>
+          <w:tcPr>
+            <w:tcW w:w="9854" w:type="dxa"/>
+            <w:tcBorders>
+              <w:top w:val="single" w:sz="4" w:space="0" w:color="auto"/>
+              <w:left w:val="single" w:sz="4" w:space="0" w:color="auto"/>
+              <w:bottom w:val="single" w:sz="4" w:space="0" w:color="auto"/>
+              <w:right w:val="single" w:sz="4" w:space="0" w:color="auto"/>
+            </w:tcBorders>
+            <w:shd w:val="clear" w:color="auto" w:fill="D9D9D9" w:themeFill="background1" w:themeFillShade="D9"/>
+            <w:hideMark/>
+          </w:tcPr>
+          <w:p>
+            <w:pPr>
+              <w:spacing w:after="200" w:line="276" w:lineRule="auto"/>
+              <w:rPr>
+                <w:rFonts w:ascii="Arial" w:hAnsi="Arial" w:cs="Arial"/>
+              </w:rPr>
+            </w:pPr>
+            <w:r>
+              <w:rPr>
+                <w:rFonts w:ascii="Arial" w:hAnsi="Arial" w:cs="Arial"/>
+              </w:rPr>
+              <w:t xml:space="preserve">Sprint </w:t>
+            </w:r>
+            <w:proofErr w:type="spellStart"/>
+            <w:r>
+              <w:rPr>
+                <w:rFonts w:ascii="Arial" w:hAnsi="Arial" w:cs="Arial"/>
+              </w:rPr>
+              <w:t>Retrospective</w:t>
+            </w:r>
+            <w:proofErr w:type="spellEnd"/>
+          </w:p>
+        </w:tc>
+      </w:tr>
+      <w:tr>
+        <w:tc>
+          <w:tcPr>
+            <w:tcW w:w="9854" w:type="dxa"/>
+            <w:tcBorders>
+              <w:top w:val="single" w:sz="4" w:space="0" w:color="auto"/>
+              <w:left w:val="single" w:sz="4" w:space="0" w:color="auto"/>
+              <w:bottom w:val="single" w:sz="4" w:space="0" w:color="auto"/>
+              <w:right w:val="single" w:sz="4" w:space="0" w:color="auto"/>
+            </w:tcBorders>
+          </w:tcPr>
+          <w:p>
+            <w:pPr>
+              <w:spacing w:after="200" w:line="276" w:lineRule="auto"/>
+              <w:rPr>
+                <w:rFonts w:ascii="Arial" w:hAnsi="Arial" w:cs="Arial"/>
+              </w:rPr>
+            </w:pPr>
+          </w:p>
+        </w:tc>
+      </w:tr>
+    </w:tbl>
+    <w:p>
+      <w:pPr>
+        <w:rPr>
+          <w:rFonts w:ascii="Arial" w:eastAsiaTheme="majorEastAsia" w:hAnsi="Arial" w:cs="Arial"/>
+          <w:b/>
+          <w:bCs/>
+          <w:sz w:val="26"/>
+          <w:szCs w:val="26"/>
+        </w:rPr>
+      </w:pPr>
+      <w:r>
+        <w:br w:type="page"/>
+      </w:r>
+    </w:p>
+    <w:p>
+      <w:pPr>
+        <w:pStyle w:val="Titolo2"/>
+        <w:pBdr>
+          <w:bottom w:val="single" w:sz="4" w:space="1" w:color="auto"/>
+        </w:pBdr>
+      </w:pPr>
+      <w:r>
+        <w:lastRenderedPageBreak/>
+        <w:t>Utilizzo Intelligenza Artificiale</w:t>
+      </w:r>
+      <w:r>
+        <w:t xml:space="preserve"> nella giornata</w:t>
+      </w:r>
+    </w:p>
+    <w:p>
+      <w:pPr>
+        <w:pStyle w:val="Nessunaspaziatura"/>
+        <w:rPr>
+          <w:rFonts w:ascii="Arial" w:hAnsi="Arial" w:cs="Arial"/>
+          <w:b/>
+          <w:bCs/>
+        </w:rPr>
+      </w:pPr>
+    </w:p>
+    <w:p>
+      <w:pPr>
+        <w:pStyle w:val="Nessunaspaziatura"/>
+        <w:rPr>
+          <w:rFonts w:ascii="Arial" w:hAnsi="Arial" w:cs="Arial"/>
+        </w:rPr>
+      </w:pPr>
+      <w:sdt>
+        <w:sdtPr>
+          <w:rPr>
+            <w:rFonts w:ascii="Segoe UI Symbol" w:hAnsi="Segoe UI Symbol" w:cs="Segoe UI Symbol"/>
+          </w:rPr>
+          <w:id w:val="1147854493"/>
+          <w14:checkbox>
+            <w14:checked w14:val="0"/>
+            <w14:checkedState w14:val="2612" w14:font="MS Gothic"/>
+            <w14:uncheckedState w14:val="2610" w14:font="MS Gothic"/>
+          </w14:checkbox>
+        </w:sdtPr>
+        <w:sdtContent>
+          <w:r>
+            <w:rPr>
+              <w:rFonts w:ascii="MS Gothic" w:eastAsia="MS Gothic" w:hAnsi="MS Gothic" w:cs="Segoe UI Symbol" w:hint="eastAsia"/>
+            </w:rPr>
+            <w:t>☐</w:t>
+          </w:r>
+        </w:sdtContent>
+      </w:sdt>
+      <w:r>
+        <w:rPr>
+          <w:rFonts w:ascii="Arial" w:hAnsi="Arial" w:cs="Arial"/>
+        </w:rPr>
+        <w:t xml:space="preserve"> Nessuno</w:t>
+      </w:r>
+      <w:r>
+        <w:br/>
+      </w:r>
+      <w:sdt>
+        <w:sdtPr>
+          <w:rPr>
+            <w:rFonts w:ascii="Segoe UI Symbol" w:hAnsi="Segoe UI Symbol" w:cs="Segoe UI Symbol"/>
+          </w:rPr>
+          <w:id w:val="-1616675094"/>
+          <w14:checkbox>
+            <w14:checked w14:val="1"/>
+            <w14:checkedState w14:val="2612" w14:font="MS Gothic"/>
+            <w14:uncheckedState w14:val="2610" w14:font="MS Gothic"/>
+          </w14:checkbox>
+        </w:sdtPr>
+        <w:sdtContent>
+          <w:r>
+            <w:rPr>
+              <w:rFonts w:ascii="MS Gothic" w:eastAsia="MS Gothic" w:hAnsi="MS Gothic" w:cs="Segoe UI Symbol" w:hint="eastAsia"/>
+            </w:rPr>
+            <w:t>☒</w:t>
+          </w:r>
+        </w:sdtContent>
+      </w:sdt>
+      <w:r>
+        <w:rPr>
+          <w:rFonts w:ascii="Arial" w:hAnsi="Arial" w:cs="Arial"/>
+        </w:rPr>
+        <w:t xml:space="preserve"> Occasionale</w:t>
+      </w:r>
+      <w:r>
+        <w:br/>
+      </w:r>
+      <w:sdt>
+        <w:sdtPr>
+          <w:rPr>
+            <w:rFonts w:ascii="Segoe UI Symbol" w:hAnsi="Segoe UI Symbol" w:cs="Segoe UI Symbol"/>
+          </w:rPr>
+          <w:id w:val="1123579246"/>
+          <w14:checkbox>
+            <w14:checked w14:val="0"/>
+            <w14:checkedState w14:val="2612" w14:font="MS Gothic"/>
+            <w14:uncheckedState w14:val="2610" w14:font="MS Gothic"/>
+          </w14:checkbox>
+        </w:sdtPr>
+        <w:sdtContent>
+          <w:r>
+            <w:rPr>
+              <w:rFonts w:ascii="MS Gothic" w:eastAsia="MS Gothic" w:hAnsi="MS Gothic" w:cs="Segoe UI Symbol" w:hint="eastAsia"/>
+            </w:rPr>
+            <w:t>☐</w:t>
+          </w:r>
+        </w:sdtContent>
+      </w:sdt>
+      <w:r>
+        <w:rPr>
+          <w:rFonts w:ascii="Arial" w:hAnsi="Arial" w:cs="Arial"/>
+        </w:rPr>
+        <w:t xml:space="preserve"> Frequente</w:t>
+      </w:r>
+    </w:p>
+    <w:p>
+      <w:pPr>
+        <w:pStyle w:val="Nessunaspaziatura"/>
+        <w:rPr>
+          <w:rFonts w:ascii="Arial" w:hAnsi="Arial" w:cs="Arial"/>
+        </w:rPr>
+      </w:pPr>
+    </w:p>
+    <w:p>
+      <w:pPr>
+        <w:pStyle w:val="Nessunaspaziatura"/>
+        <w:spacing w:line="276" w:lineRule="auto"/>
+        <w:rPr>
+          <w:rFonts w:ascii="Arial" w:hAnsi="Arial" w:cs="Arial"/>
+        </w:rPr>
+      </w:pPr>
+      <w:r>
+        <w:rPr>
+          <w:rFonts w:ascii="Arial" w:hAnsi="Arial" w:cs="Arial"/>
+          <w:b/>
+          <w:bCs/>
+        </w:rPr>
+        <w:t>Strumento/i utilizzato/i</w:t>
+      </w:r>
+      <w:r>
+        <w:rPr>
+          <w:rFonts w:ascii="Arial" w:hAnsi="Arial" w:cs="Arial"/>
+          <w:b/>
+          <w:bCs/>
+        </w:rPr>
+        <w:t xml:space="preserve"> </w:t>
+      </w:r>
+      <w:r>
+        <w:rPr>
+          <w:rFonts w:ascii="Arial" w:hAnsi="Arial" w:cs="Arial"/>
+        </w:rPr>
+        <w:t>(es. ChatGPT)</w:t>
+      </w:r>
+      <w:r>
+        <w:rPr>
+          <w:rFonts w:ascii="Arial" w:hAnsi="Arial" w:cs="Arial"/>
+        </w:rPr>
+        <w:t xml:space="preserve">: </w:t>
+      </w:r>
+      <w:sdt>
+        <w:sdtPr>
+          <w:rPr>
+            <w:rFonts w:ascii="Arial" w:hAnsi="Arial" w:cs="Arial"/>
+          </w:rPr>
+          <w:id w:val="1324548891"/>
+          <w:placeholder>
+            <w:docPart w:val="9FFF48F483504B658E077A2EADA3A288"/>
+          </w:placeholder>
+        </w:sdtPr>
+        <w:sdtContent>
+          <w:r>
+            <w:rPr>
+              <w:rFonts w:ascii="Arial" w:hAnsi="Arial" w:cs="Arial"/>
+            </w:rPr>
+            <w:t>ChatGPT</w:t>
+          </w:r>
+        </w:sdtContent>
+      </w:sdt>
+    </w:p>
+    <w:p>
+      <w:pPr>
+        <w:pStyle w:val="Nessunaspaziatura"/>
+        <w:rPr>
+          <w:rFonts w:ascii="Arial" w:hAnsi="Arial" w:cs="Arial"/>
+        </w:rPr>
+      </w:pPr>
+    </w:p>
+    <w:p>
+      <w:pPr>
+        <w:pStyle w:val="Nessunaspaziatura"/>
+        <w:rPr>
+          <w:rFonts w:ascii="Arial" w:hAnsi="Arial" w:cs="Arial"/>
+        </w:rPr>
+      </w:pPr>
+      <w:r>
+        <w:rPr>
+          <w:rFonts w:ascii="Arial" w:hAnsi="Arial" w:cs="Arial"/>
+          <w:b/>
+          <w:bCs/>
+        </w:rPr>
+        <w:t>Per cosa l’ho usata oggi</w:t>
+      </w:r>
+      <w:r>
+        <w:br/>
+      </w:r>
+      <w:sdt>
+        <w:sdtPr>
+          <w:rPr>
+            <w:rFonts w:ascii="Segoe UI Symbol" w:hAnsi="Segoe UI Symbol" w:cs="Segoe UI Symbol"/>
+          </w:rPr>
+          <w:id w:val="1506241665"/>
+          <w14:checkbox>
+            <w14:checked w14:val="0"/>
+            <w14:checkedState w14:val="2612" w14:font="MS Gothic"/>
+            <w14:uncheckedState w14:val="2610" w14:font="MS Gothic"/>
+          </w14:checkbox>
+        </w:sdtPr>
+        <w:sdtContent>
+          <w:r>
+            <w:rPr>
+              <w:rFonts w:ascii="MS Gothic" w:eastAsia="MS Gothic" w:hAnsi="MS Gothic" w:cs="Segoe UI Symbol" w:hint="eastAsia"/>
+            </w:rPr>
+            <w:t>☐</w:t>
+          </w:r>
+        </w:sdtContent>
+      </w:sdt>
+      <w:r>
+        <w:rPr>
+          <w:rFonts w:ascii="Arial" w:hAnsi="Arial" w:cs="Arial"/>
+        </w:rPr>
+        <w:t xml:space="preserve"> Chiarire concetti</w:t>
+      </w:r>
+      <w:r>
+        <w:br/>
+      </w:r>
+      <w:sdt>
+        <w:sdtPr>
+          <w:rPr>
+            <w:rFonts w:ascii="Segoe UI Symbol" w:hAnsi="Segoe UI Symbol" w:cs="Segoe UI Symbol"/>
+          </w:rPr>
+          <w:id w:val="-232937575"/>
+          <w14:checkbox>
+            <w14:checked w14:val="1"/>
+            <w14:checkedState w14:val="2612" w14:font="MS Gothic"/>
+            <w14:uncheckedState w14:val="2610" w14:font="MS Gothic"/>
+          </w14:checkbox>
+        </w:sdtPr>
+        <w:sdtContent>
+          <w:r>
+            <w:rPr>
+              <w:rFonts w:ascii="MS Gothic" w:eastAsia="MS Gothic" w:hAnsi="MS Gothic" w:cs="Segoe UI Symbol" w:hint="eastAsia"/>
+            </w:rPr>
+            <w:t>☒</w:t>
+          </w:r>
+        </w:sdtContent>
+      </w:sdt>
+      <w:r>
+        <w:rPr>
+          <w:rFonts w:ascii="Arial" w:hAnsi="Arial" w:cs="Arial"/>
+        </w:rPr>
+        <w:t xml:space="preserve"> Supporto al codice</w:t>
+      </w:r>
+      <w:r>
+        <w:br/>
+      </w:r>
+      <w:sdt>
+        <w:sdtPr>
+          <w:rPr>
+            <w:rFonts w:ascii="Segoe UI Symbol" w:hAnsi="Segoe UI Symbol" w:cs="Segoe UI Symbol"/>
+          </w:rPr>
+          <w:id w:val="230197897"/>
+          <w14:checkbox>
+            <w14:checked w14:val="0"/>
+            <w14:checkedState w14:val="2612" w14:font="MS Gothic"/>
+            <w14:uncheckedState w14:val="2610" w14:font="MS Gothic"/>
+          </w14:checkbox>
+        </w:sdtPr>
+        <w:sdtContent>
+          <w:r>
+            <w:rPr>
+              <w:rFonts w:ascii="MS Gothic" w:eastAsia="MS Gothic" w:hAnsi="MS Gothic" w:cs="Segoe UI Symbol" w:hint="eastAsia"/>
+            </w:rPr>
+            <w:t>☐</w:t>
+          </w:r>
+        </w:sdtContent>
+      </w:sdt>
+      <w:r>
+        <w:rPr>
+          <w:rFonts w:ascii="Arial" w:hAnsi="Arial" w:cs="Arial"/>
+        </w:rPr>
+        <w:t xml:space="preserve"> Debug</w:t>
+      </w:r>
+      <w:r>
+        <w:br/>
+      </w:r>
+      <w:sdt>
+        <w:sdtPr>
+          <w:rPr>
+            <w:rFonts w:ascii="Segoe UI Symbol" w:hAnsi="Segoe UI Symbol" w:cs="Segoe UI Symbol"/>
+          </w:rPr>
+          <w:id w:val="395940364"/>
+          <w14:checkbox>
+            <w14:checked w14:val="0"/>
+            <w14:checkedState w14:val="2612" w14:font="MS Gothic"/>
+            <w14:uncheckedState w14:val="2610" w14:font="MS Gothic"/>
+          </w14:checkbox>
+        </w:sdtPr>
+        <w:sdtContent>
+          <w:r>
+            <w:rPr>
+              <w:rFonts w:ascii="MS Gothic" w:eastAsia="MS Gothic" w:hAnsi="MS Gothic" w:cs="Segoe UI Symbol" w:hint="eastAsia"/>
+            </w:rPr>
+            <w:t>☐</w:t>
+          </w:r>
+        </w:sdtContent>
+      </w:sdt>
+      <w:r>
+        <w:rPr>
+          <w:rFonts w:ascii="Arial" w:hAnsi="Arial" w:cs="Arial"/>
+        </w:rPr>
+        <w:t xml:space="preserve"> Riorganizzare idee / testi</w:t>
+      </w:r>
+      <w:r>
+        <w:br/>
+      </w:r>
+      <w:sdt>
+        <w:sdtPr>
+          <w:rPr>
+            <w:rFonts w:ascii="Segoe UI Symbol" w:hAnsi="Segoe UI Symbol" w:cs="Segoe UI Symbol"/>
+          </w:rPr>
+          <w:id w:val="727347590"/>
+          <w14:checkbox>
+            <w14:checked w14:val="0"/>
+            <w14:checkedState w14:val="2612" w14:font="MS Gothic"/>
+            <w14:uncheckedState w14:val="2610" w14:font="MS Gothic"/>
+          </w14:checkbox>
+        </w:sdtPr>
+        <w:sdtContent>
+          <w:r>
+            <w:rPr>
+              <w:rFonts w:ascii="MS Gothic" w:eastAsia="MS Gothic" w:hAnsi="MS Gothic" w:cs="Segoe UI Symbol" w:hint="eastAsia"/>
+            </w:rPr>
+            <w:t>☐</w:t>
+          </w:r>
+        </w:sdtContent>
+      </w:sdt>
+      <w:r>
+        <w:rPr>
+          <w:rFonts w:ascii="Arial" w:hAnsi="Arial" w:cs="Arial"/>
+        </w:rPr>
+        <w:t xml:space="preserve"> Altro: …</w:t>
+      </w:r>
+    </w:p>
+    <w:p>
+      <w:pPr>
+        <w:pStyle w:val="Nessunaspaziatura"/>
+        <w:rPr>
+          <w:rFonts w:ascii="Arial" w:hAnsi="Arial" w:cs="Arial"/>
+        </w:rPr>
+      </w:pPr>
+    </w:p>
+    <w:p>
+      <w:pPr>
+        <w:pStyle w:val="Nessunaspaziatura"/>
+        <w:rPr>
+          <w:rFonts w:ascii="Arial" w:hAnsi="Arial" w:cs="Arial"/>
+          <w:b/>
+          <w:bCs/>
+        </w:rPr>
+      </w:pPr>
+      <w:r>
+        <w:rPr>
+          <w:rFonts w:ascii="Arial" w:hAnsi="Arial" w:cs="Arial"/>
+          <w:b/>
+          <w:bCs/>
+        </w:rPr>
+        <w:t>Esempio significativo di utilizzo (UNO SOLO)</w:t>
+      </w:r>
+    </w:p>
+    <w:p>
+      <w:pPr>
+        <w:pStyle w:val="Nessunaspaziatura"/>
+        <w:rPr>
+          <w:rFonts w:ascii="Arial" w:hAnsi="Arial" w:cs="Arial"/>
+        </w:rPr>
+      </w:pPr>
+      <w:r>
+        <w:rPr>
+          <w:rFonts w:ascii="Arial" w:hAnsi="Arial" w:cs="Arial"/>
+        </w:rPr>
+        <w:t xml:space="preserve">Riporta </w:t>
+      </w:r>
+      <w:r>
+        <w:rPr>
+          <w:rFonts w:ascii="Arial" w:hAnsi="Arial" w:cs="Arial"/>
+          <w:i/>
+          <w:iCs/>
+        </w:rPr>
+        <w:t>un</w:t>
+      </w:r>
+      <w:r>
+        <w:rPr>
+          <w:rFonts w:ascii="Arial" w:hAnsi="Arial" w:cs="Arial"/>
+        </w:rPr>
+        <w:t xml:space="preserve"> prompt rilevante oppure descrivilo a parole se ce ne sono stati molti.</w:t>
+      </w:r>
+    </w:p>
+    <w:p>
+      <w:pPr>
+        <w:pStyle w:val="Nessunaspaziatura"/>
+        <w:rPr>
+          <w:rFonts w:ascii="Arial" w:hAnsi="Arial" w:cs="Arial"/>
+        </w:rPr>
+      </w:pPr>
+    </w:p>
+    <w:sdt>
+      <w:sdtPr>
+        <w:rPr>
+          <w:rFonts w:ascii="Arial" w:hAnsi="Arial" w:cs="Arial"/>
+        </w:rPr>
+        <w:alias w:val="Prompt AI"/>
+        <w:tag w:val="Prompt AI"/>
+        <w:id w:val="1876428935"/>
+        <w:placeholder>
+          <w:docPart w:val="F3C749D6FEEB4FD2A14EFFA505438868"/>
+        </w:placeholder>
+        <w15:color w:val="C0C0C0"/>
+      </w:sdtPr>
+      <w:sdtContent>
+        <w:p>
+          <w:pPr>
+            <w:pStyle w:val="Nessunaspaziatura"/>
+            <w:rPr>
+              <w:rFonts w:ascii="Arial" w:hAnsi="Arial" w:cs="Arial"/>
+            </w:rPr>
+          </w:pPr>
+          <w:r>
+            <w:rPr>
+              <w:rFonts w:ascii="Arial" w:hAnsi="Arial" w:cs="Arial"/>
+            </w:rPr>
+            <w:t xml:space="preserve">Riley: Come funziona un sistema di movimento della visuale su </w:t>
+          </w:r>
+          <w:proofErr w:type="spellStart"/>
+          <w:r>
+            <w:rPr>
+              <w:rFonts w:ascii="Arial" w:hAnsi="Arial" w:cs="Arial"/>
+            </w:rPr>
+            <w:t>unity</w:t>
+          </w:r>
+          <w:proofErr w:type="spellEnd"/>
+          <w:r>
+            <w:rPr>
+              <w:rFonts w:ascii="Arial" w:hAnsi="Arial" w:cs="Arial"/>
+            </w:rPr>
+            <w:t>?</w:t>
+          </w:r>
+        </w:p>
+        <w:p>
+          <w:pPr>
+            <w:pStyle w:val="Nessunaspaziatura"/>
+            <w:spacing w:line="276" w:lineRule="auto"/>
+            <w:rPr>
+              <w:rFonts w:ascii="Arial" w:hAnsi="Arial" w:cs="Arial"/>
+            </w:rPr>
+          </w:pPr>
+          <w:r>
+            <w:rPr>
+              <w:rFonts w:ascii="Arial" w:hAnsi="Arial" w:cs="Arial"/>
+            </w:rPr>
+            <w:t xml:space="preserve">Bryan: </w:t>
+          </w:r>
+        </w:p>
+      </w:sdtContent>
+    </w:sdt>
+    <w:p>
+      <w:pPr>
+        <w:pStyle w:val="Nessunaspaziatura"/>
+        <w:rPr>
+          <w:rFonts w:ascii="Arial" w:hAnsi="Arial" w:cs="Arial"/>
+        </w:rPr>
+      </w:pPr>
+    </w:p>
+    <w:p>
+      <w:pPr>
+        <w:pStyle w:val="Nessunaspaziatura"/>
+        <w:rPr>
+          <w:rFonts w:ascii="Arial" w:hAnsi="Arial" w:cs="Arial"/>
+        </w:rPr>
+      </w:pPr>
+      <w:r>
+        <w:rPr>
+          <w:rFonts w:ascii="Arial" w:hAnsi="Arial" w:cs="Arial"/>
+          <w:b/>
+          <w:bCs/>
+        </w:rPr>
+        <w:t>Cosa mi ha dato l’AI</w:t>
+      </w:r>
+    </w:p>
+    <w:p>
+      <w:pPr>
+        <w:pStyle w:val="Nessunaspaziatura"/>
+        <w:rPr>
+          <w:rFonts w:ascii="Arial" w:hAnsi="Arial" w:cs="Arial"/>
+        </w:rPr>
+      </w:pPr>
+      <w:r>
+        <w:rPr>
+          <w:rFonts w:ascii="Arial" w:hAnsi="Arial" w:cs="Arial"/>
+        </w:rPr>
+        <w:t>Spiegazione, esempio, soluzione, suggerimento…</w:t>
+      </w:r>
+    </w:p>
+    <w:p>
+      <w:pPr>
+        <w:pStyle w:val="Nessunaspaziatura"/>
+        <w:rPr>
+          <w:rFonts w:ascii="Arial" w:hAnsi="Arial" w:cs="Arial"/>
+        </w:rPr>
+      </w:pPr>
+    </w:p>
+    <w:sdt>
+      <w:sdtPr>
+        <w:rPr>
+          <w:rFonts w:ascii="Arial" w:hAnsi="Arial" w:cs="Arial"/>
+        </w:rPr>
+        <w:alias w:val="Risposta AI"/>
+        <w:tag w:val="Risposta AI"/>
+        <w:id w:val="1567602410"/>
+        <w:placeholder>
+          <w:docPart w:val="BC5FB685A7D44D96ACB06DEAE73EF69A"/>
+        </w:placeholder>
+        <w15:color w:val="C0C0C0"/>
+      </w:sdtPr>
+      <w:sdtContent>
+        <w:p>
+          <w:pPr>
+            <w:pStyle w:val="Nessunaspaziatura"/>
+            <w:spacing w:line="276" w:lineRule="auto"/>
+            <w:rPr>
+              <w:rFonts w:ascii="Arial" w:hAnsi="Arial" w:cs="Arial"/>
+            </w:rPr>
+          </w:pPr>
+          <w:r>
+            <w:rPr>
+              <w:rFonts w:ascii="Arial" w:hAnsi="Arial" w:cs="Arial"/>
+            </w:rPr>
+            <w:t>Riley: Mi sono state presentate 3 tipi di visuale che richiedono più o meno telecamere e due tipi di gestione degli input, con in seguito una spiegazione generale del funzionamento. Ho mandato dei dettagli per avere un output più preciso e utile.</w:t>
+          </w:r>
+        </w:p>
+        <w:p>
+          <w:pPr>
+            <w:pStyle w:val="Nessunaspaziatura"/>
+            <w:spacing w:line="276" w:lineRule="auto"/>
+            <w:rPr>
+              <w:rFonts w:ascii="Arial" w:hAnsi="Arial" w:cs="Arial"/>
+            </w:rPr>
+          </w:pPr>
+          <w:r>
+            <w:rPr>
+              <w:rFonts w:ascii="Arial" w:hAnsi="Arial" w:cs="Arial"/>
+            </w:rPr>
+            <w:t xml:space="preserve">Bryan: </w:t>
+          </w:r>
+        </w:p>
+      </w:sdtContent>
+    </w:sdt>
+    <w:p>
+      <w:pPr>
+        <w:pStyle w:val="Nessunaspaziatura"/>
+        <w:rPr>
+          <w:rFonts w:ascii="Arial" w:hAnsi="Arial" w:cs="Arial"/>
+          <w:b/>
+          <w:bCs/>
+        </w:rPr>
+      </w:pPr>
+    </w:p>
+    <w:p>
+      <w:pPr>
+        <w:pStyle w:val="Nessunaspaziatura"/>
+        <w:rPr>
+          <w:rFonts w:ascii="Arial" w:hAnsi="Arial" w:cs="Arial"/>
+        </w:rPr>
+      </w:pPr>
+      <w:r>
+        <w:rPr>
+          <w:rFonts w:ascii="Arial" w:hAnsi="Arial" w:cs="Arial"/>
+          <w:b/>
+          <w:bCs/>
+        </w:rPr>
+        <w:t>Come l’ho usato io</w:t>
+      </w:r>
+      <w:r>
+        <w:rPr>
+          <w:rFonts w:ascii="Arial" w:hAnsi="Arial" w:cs="Arial"/>
+        </w:rPr>
+        <w:br/>
+      </w:r>
+      <w:sdt>
+        <w:sdtPr>
+          <w:rPr>
+            <w:rFonts w:ascii="Segoe UI Symbol" w:hAnsi="Segoe UI Symbol" w:cs="Segoe UI Symbol"/>
+          </w:rPr>
+          <w:id w:val="-1880391410"/>
+          <w14:checkbox>
+            <w14:checked w14:val="1"/>
+            <w14:checkedState w14:val="2612" w14:font="MS Gothic"/>
+            <w14:uncheckedState w14:val="2610" w14:font="MS Gothic"/>
+          </w14:checkbox>
+        </w:sdtPr>
+        <w:sdtContent>
+          <w:r>
+            <w:rPr>
+              <w:rFonts w:ascii="MS Gothic" w:eastAsia="MS Gothic" w:hAnsi="MS Gothic" w:cs="Segoe UI Symbol" w:hint="eastAsia"/>
+            </w:rPr>
+            <w:t>☒</w:t>
+          </w:r>
+        </w:sdtContent>
+      </w:sdt>
+      <w:r>
+        <w:rPr>
+          <w:rFonts w:ascii="Arial" w:hAnsi="Arial" w:cs="Arial"/>
+        </w:rPr>
+        <w:t xml:space="preserve"> Copiato</w:t>
+      </w:r>
+      <w:r>
+        <w:rPr>
+          <w:rFonts w:ascii="Arial" w:hAnsi="Arial" w:cs="Arial"/>
+        </w:rPr>
+        <w:br/>
+      </w:r>
+      <w:sdt>
+        <w:sdtPr>
+          <w:rPr>
+            <w:rFonts w:ascii="Segoe UI Symbol" w:hAnsi="Segoe UI Symbol" w:cs="Segoe UI Symbol"/>
+          </w:rPr>
+          <w:id w:val="1434550935"/>
+          <w14:checkbox>
+            <w14:checked w14:val="1"/>
+            <w14:checkedState w14:val="2612" w14:font="MS Gothic"/>
+            <w14:uncheckedState w14:val="2610" w14:font="MS Gothic"/>
+          </w14:checkbox>
+        </w:sdtPr>
+        <w:sdtContent>
+          <w:r>
+            <w:rPr>
+              <w:rFonts w:ascii="MS Gothic" w:eastAsia="MS Gothic" w:hAnsi="MS Gothic" w:cs="Segoe UI Symbol" w:hint="eastAsia"/>
+            </w:rPr>
+            <w:t>☒</w:t>
+          </w:r>
+        </w:sdtContent>
+      </w:sdt>
+      <w:r>
+        <w:rPr>
+          <w:rFonts w:ascii="Arial" w:hAnsi="Arial" w:cs="Arial"/>
+        </w:rPr>
+        <w:t xml:space="preserve"> Adattato</w:t>
+      </w:r>
+      <w:r>
+        <w:rPr>
+          <w:rFonts w:ascii="Arial" w:hAnsi="Arial" w:cs="Arial"/>
+        </w:rPr>
+        <w:br/>
+      </w:r>
+      <w:sdt>
+        <w:sdtPr>
+          <w:rPr>
+            <w:rFonts w:ascii="Segoe UI Symbol" w:hAnsi="Segoe UI Symbol" w:cs="Segoe UI Symbol"/>
+          </w:rPr>
+          <w:id w:val="1156658331"/>
+          <w14:checkbox>
+            <w14:checked w14:val="0"/>
+            <w14:checkedState w14:val="2612" w14:font="MS Gothic"/>
+            <w14:uncheckedState w14:val="2610" w14:font="MS Gothic"/>
+          </w14:checkbox>
+        </w:sdtPr>
+        <w:sdtContent>
+          <w:r>
+            <w:rPr>
+              <w:rFonts w:ascii="MS Gothic" w:eastAsia="MS Gothic" w:hAnsi="MS Gothic" w:cs="Segoe UI Symbol" w:hint="eastAsia"/>
+            </w:rPr>
+            <w:t>☐</w:t>
+          </w:r>
+        </w:sdtContent>
+      </w:sdt>
+      <w:r>
+        <w:rPr>
+          <w:rFonts w:ascii="Arial" w:hAnsi="Arial" w:cs="Arial"/>
+        </w:rPr>
+        <w:t xml:space="preserve"> Usato solo per capire</w:t>
+      </w:r>
+      <w:r>
+        <w:rPr>
+          <w:rFonts w:ascii="Arial" w:hAnsi="Arial" w:cs="Arial"/>
+        </w:rPr>
+        <w:br/>
+      </w:r>
+      <w:sdt>
+        <w:sdtPr>
+          <w:rPr>
+            <w:rFonts w:ascii="Segoe UI Symbol" w:hAnsi="Segoe UI Symbol" w:cs="Segoe UI Symbol"/>
+          </w:rPr>
+          <w:id w:val="-2133857728"/>
+          <w14:checkbox>
+            <w14:checked w14:val="0"/>
+            <w14:checkedState w14:val="2612" w14:font="MS Gothic"/>
+            <w14:uncheckedState w14:val="2610" w14:font="MS Gothic"/>
+          </w14:checkbox>
+        </w:sdtPr>
+        <w:sdtContent>
+          <w:r>
+            <w:rPr>
+              <w:rFonts w:ascii="MS Gothic" w:eastAsia="MS Gothic" w:hAnsi="MS Gothic" w:cs="Segoe UI Symbol" w:hint="eastAsia"/>
+            </w:rPr>
+            <w:t>☐</w:t>
+          </w:r>
+        </w:sdtContent>
+      </w:sdt>
+      <w:r>
+        <w:rPr>
+          <w:rFonts w:ascii="Arial" w:hAnsi="Arial" w:cs="Arial"/>
+        </w:rPr>
+        <w:t xml:space="preserve"> Scartato</w:t>
+      </w:r>
+    </w:p>
+    <w:p>
+      <w:pPr>
+        <w:pStyle w:val="Nessunaspaziatura"/>
+        <w:rPr>
+          <w:rFonts w:ascii="Arial" w:hAnsi="Arial" w:cs="Arial"/>
+        </w:rPr>
+      </w:pPr>
+    </w:p>
+    <w:p>
+      <w:pPr>
+        <w:pStyle w:val="Nessunaspaziatura"/>
+        <w:rPr>
+          <w:rFonts w:ascii="Arial" w:hAnsi="Arial" w:cs="Arial"/>
+        </w:rPr>
+      </w:pPr>
+    </w:p>
+    <w:p>
+      <w:pPr>
+        <w:pStyle w:val="Nessunaspaziatura"/>
+        <w:rPr>
+          <w:rFonts w:ascii="Arial" w:hAnsi="Arial" w:cs="Arial"/>
+        </w:rPr>
+      </w:pPr>
+      <w:r>
+        <w:rPr>
+          <w:rFonts w:ascii="Arial" w:hAnsi="Arial" w:cs="Arial"/>
+          <w:b/>
+          <w:bCs/>
+        </w:rPr>
+        <w:t>Cosa avrei fatto senza AI?</w:t>
+      </w:r>
+    </w:p>
+    <w:p>
+      <w:pPr>
+        <w:pStyle w:val="Nessunaspaziatura"/>
+        <w:rPr>
+          <w:rFonts w:ascii="Arial" w:hAnsi="Arial" w:cs="Arial"/>
+        </w:rPr>
+      </w:pPr>
+      <w:r>
+        <w:rPr>
+          <w:rFonts w:ascii="Arial" w:hAnsi="Arial" w:cs="Arial"/>
+        </w:rPr>
+        <w:t>Riley: Averi cercato su delle documentazioni ufficiali ed eventuali forum</w:t>
       </w:r>
     </w:p>
     <w:p>
@@ -31629,8 +34948,17 @@
         <w:rFonts w:ascii="Arial" w:hAnsi="Arial" w:cs="Arial"/>
         <w:lang w:val="fr-CH"/>
       </w:rPr>
-      <w:t>Riley Bianchi &amp; Bryan Ciaponi</w:t>
+      <w:t xml:space="preserve">Riley Bianchi &amp; Bryan </w:t>
     </w:r>
+    <w:proofErr w:type="spellStart"/>
+    <w:r>
+      <w:rPr>
+        <w:rFonts w:ascii="Arial" w:hAnsi="Arial" w:cs="Arial"/>
+        <w:lang w:val="fr-CH"/>
+      </w:rPr>
+      <w:t>Ciaponi</w:t>
+    </w:r>
+    <w:proofErr w:type="spellEnd"/>
   </w:p>
 </w:hdr>
 </file>
@@ -37167,6 +40495,107 @@
         </w:p>
       </w:docPartBody>
     </w:docPart>
+    <w:docPart>
+      <w:docPartPr>
+        <w:name w:val="9FFF48F483504B658E077A2EADA3A288"/>
+        <w:category>
+          <w:name w:val="Generale"/>
+          <w:gallery w:val="placeholder"/>
+        </w:category>
+        <w:types>
+          <w:type w:val="bbPlcHdr"/>
+        </w:types>
+        <w:behaviors>
+          <w:behavior w:val="content"/>
+        </w:behaviors>
+        <w:guid w:val="{6E68CDB0-A2AC-4811-A84D-53B31CC90E02}"/>
+      </w:docPartPr>
+      <w:docPartBody>
+        <w:p>
+          <w:pPr>
+            <w:pStyle w:val="9FFF48F483504B658E077A2EADA3A288"/>
+          </w:pPr>
+          <w:r>
+            <w:rPr>
+              <w:rStyle w:val="Testosegnaposto"/>
+              <w:b/>
+              <w:bCs/>
+            </w:rPr>
+            <w:t>Nomi AI utilizzati</w:t>
+          </w:r>
+        </w:p>
+      </w:docPartBody>
+    </w:docPart>
+    <w:docPart>
+      <w:docPartPr>
+        <w:name w:val="F3C749D6FEEB4FD2A14EFFA505438868"/>
+        <w:category>
+          <w:name w:val="Generale"/>
+          <w:gallery w:val="placeholder"/>
+        </w:category>
+        <w:types>
+          <w:type w:val="bbPlcHdr"/>
+        </w:types>
+        <w:behaviors>
+          <w:behavior w:val="content"/>
+        </w:behaviors>
+        <w:guid w:val="{721C11F6-D797-412A-B4E1-57AB1C35E75F}"/>
+      </w:docPartPr>
+      <w:docPartBody>
+        <w:p>
+          <w:pPr>
+            <w:pStyle w:val="F3C749D6FEEB4FD2A14EFFA505438868"/>
+          </w:pPr>
+          <w:r>
+            <w:rPr>
+              <w:rStyle w:val="Testosegnaposto"/>
+            </w:rPr>
+            <w:t>Fare clic o toccare qui per immettere il testo.</w:t>
+          </w:r>
+        </w:p>
+      </w:docPartBody>
+    </w:docPart>
+    <w:docPart>
+      <w:docPartPr>
+        <w:name w:val="BC5FB685A7D44D96ACB06DEAE73EF69A"/>
+        <w:category>
+          <w:name w:val="Generale"/>
+          <w:gallery w:val="placeholder"/>
+        </w:category>
+        <w:types>
+          <w:type w:val="bbPlcHdr"/>
+        </w:types>
+        <w:behaviors>
+          <w:behavior w:val="content"/>
+        </w:behaviors>
+        <w:guid w:val="{1D2FF777-0B7D-47E0-9201-D39352D589DD}"/>
+      </w:docPartPr>
+      <w:docPartBody>
+        <w:p>
+          <w:pPr>
+            <w:pStyle w:val="BC5FB685A7D44D96ACB06DEAE73EF69A"/>
+          </w:pPr>
+          <w:r>
+            <w:rPr>
+              <w:rStyle w:val="Testosegnaposto"/>
+            </w:rPr>
+            <w:t xml:space="preserve">Fare clic o toccare qui per </w:t>
+          </w:r>
+          <w:r>
+            <w:rPr>
+              <w:rStyle w:val="Testosegnaposto"/>
+            </w:rPr>
+            <w:t>immettere</w:t>
+          </w:r>
+          <w:r>
+            <w:rPr>
+              <w:rStyle w:val="Testosegnaposto"/>
+            </w:rPr>
+            <w:t xml:space="preserve"> il testo.</w:t>
+          </w:r>
+        </w:p>
+      </w:docPartBody>
+    </w:docPart>
   </w:docParts>
 </w:glossaryDocument>
 </file>
@@ -37299,6 +40728,7 @@
     <w:rsidRoot w:val="00BE72BC"/>
     <w:rsid w:val="00037477"/>
     <w:rsid w:val="00040D54"/>
+    <w:rsid w:val="000452F4"/>
     <w:rsid w:val="00045F3C"/>
     <w:rsid w:val="00080FDE"/>
     <w:rsid w:val="00083E28"/>
@@ -37358,6 +40788,7 @@
     <w:rsid w:val="009826E2"/>
     <w:rsid w:val="009A56C6"/>
     <w:rsid w:val="009D6A55"/>
+    <w:rsid w:val="009F76BC"/>
     <w:rsid w:val="00A04D62"/>
     <w:rsid w:val="00A27299"/>
     <w:rsid w:val="00A629CF"/>
@@ -37374,6 +40805,7 @@
     <w:rsid w:val="00C120D8"/>
     <w:rsid w:val="00C537F1"/>
     <w:rsid w:val="00C60D7D"/>
+    <w:rsid w:val="00CA345C"/>
     <w:rsid w:val="00D0757F"/>
     <w:rsid w:val="00D53511"/>
     <w:rsid w:val="00D86101"/>
@@ -37855,7 +41287,7 @@
     <w:basedOn w:val="Carpredefinitoparagrafo"/>
     <w:uiPriority w:val="99"/>
     <w:semiHidden/>
-    <w:rsid w:val="00880E40"/>
+    <w:rsid w:val="000452F4"/>
     <w:rPr>
       <w:color w:val="666666"/>
     </w:rPr>
@@ -38156,6 +41588,18 @@
   <w:style w:type="paragraph" w:customStyle="1" w:styleId="B9585D849BDA427789669C4ED285EA7E">
     <w:name w:val="B9585D849BDA427789669C4ED285EA7E"/>
     <w:rsid w:val="00880E40"/>
+  </w:style>
+  <w:style w:type="paragraph" w:customStyle="1" w:styleId="9FFF48F483504B658E077A2EADA3A288">
+    <w:name w:val="9FFF48F483504B658E077A2EADA3A288"/>
+    <w:rsid w:val="000452F4"/>
+  </w:style>
+  <w:style w:type="paragraph" w:customStyle="1" w:styleId="F3C749D6FEEB4FD2A14EFFA505438868">
+    <w:name w:val="F3C749D6FEEB4FD2A14EFFA505438868"/>
+    <w:rsid w:val="000452F4"/>
+  </w:style>
+  <w:style w:type="paragraph" w:customStyle="1" w:styleId="BC5FB685A7D44D96ACB06DEAE73EF69A">
+    <w:name w:val="BC5FB685A7D44D96ACB06DEAE73EF69A"/>
+    <w:rsid w:val="000452F4"/>
   </w:style>
 </w:styles>
 </file>

</xml_diff>

<commit_message>
completamento visuale, aggiornamento gannt e diario
</commit_message>
<xml_diff>
--- a/4_Diari/Diario.docx
+++ b/4_Diari/Diario.docx
@@ -193,21 +193,7 @@
               <w:rPr>
                 <w:rFonts w:ascii="Arial" w:hAnsi="Arial" w:cs="Arial"/>
               </w:rPr>
-              <w:t xml:space="preserve">Riflettuto sui requisiti e user story del gioco, creato i primi template per </w:t>
-            </w:r>
-            <w:proofErr w:type="spellStart"/>
-            <w:r>
-              <w:rPr>
-                <w:rFonts w:ascii="Arial" w:hAnsi="Arial" w:cs="Arial"/>
-              </w:rPr>
-              <w:t>gantt</w:t>
-            </w:r>
-            <w:proofErr w:type="spellEnd"/>
-            <w:r>
-              <w:rPr>
-                <w:rFonts w:ascii="Arial" w:hAnsi="Arial" w:cs="Arial"/>
-              </w:rPr>
-              <w:t xml:space="preserve"> e diario</w:t>
+              <w:t>Riflettuto sui requisiti e user story del gioco, creato i primi template per gantt e diario</w:t>
             </w:r>
           </w:p>
         </w:tc>
@@ -248,21 +234,7 @@
               <w:rPr>
                 <w:rFonts w:ascii="Arial" w:hAnsi="Arial" w:cs="Arial"/>
               </w:rPr>
-              <w:t xml:space="preserve">Riflettuto sui requisiti e user story del gioco, iniziato scrittura documentazione e sincronizzazione progetto a </w:t>
-            </w:r>
-            <w:proofErr w:type="spellStart"/>
-            <w:r>
-              <w:rPr>
-                <w:rFonts w:ascii="Arial" w:hAnsi="Arial" w:cs="Arial"/>
-              </w:rPr>
-              <w:t>GitLab</w:t>
-            </w:r>
-            <w:proofErr w:type="spellEnd"/>
-            <w:r>
-              <w:rPr>
-                <w:rFonts w:ascii="Arial" w:hAnsi="Arial" w:cs="Arial"/>
-              </w:rPr>
-              <w:t>.</w:t>
+              <w:t>Riflettuto sui requisiti e user story del gioco, iniziato scrittura documentazione e sincronizzazione progetto a GitLab.</w:t>
             </w:r>
           </w:p>
         </w:tc>
@@ -703,25 +675,7 @@
               <w:b/>
               <w:bCs/>
             </w:rPr>
-            <w:t xml:space="preserve">Nomi </w:t>
-          </w:r>
-          <w:proofErr w:type="gramStart"/>
-          <w:r>
-            <w:rPr>
-              <w:rStyle w:val="Testosegnaposto"/>
-              <w:b/>
-              <w:bCs/>
-            </w:rPr>
-            <w:t>AI</w:t>
-          </w:r>
-          <w:proofErr w:type="gramEnd"/>
-          <w:r>
-            <w:rPr>
-              <w:rStyle w:val="Testosegnaposto"/>
-              <w:b/>
-              <w:bCs/>
-            </w:rPr>
-            <w:t xml:space="preserve"> utilizzati</w:t>
+            <w:t>Nomi AI utilizzati</w:t>
           </w:r>
         </w:sdtContent>
       </w:sdt>
@@ -1802,21 +1756,7 @@
               <w:rPr>
                 <w:rFonts w:ascii="Arial" w:hAnsi="Arial" w:cs="Arial"/>
               </w:rPr>
-              <w:t xml:space="preserve">Iniziare e completare analisi dei mezzi, creare </w:t>
-            </w:r>
-            <w:proofErr w:type="gramStart"/>
-            <w:r>
-              <w:rPr>
-                <w:rFonts w:ascii="Arial" w:hAnsi="Arial" w:cs="Arial"/>
-              </w:rPr>
-              <w:t>lo use</w:t>
-            </w:r>
-            <w:proofErr w:type="gramEnd"/>
-            <w:r>
-              <w:rPr>
-                <w:rFonts w:ascii="Arial" w:hAnsi="Arial" w:cs="Arial"/>
-              </w:rPr>
-              <w:t xml:space="preserve"> case</w:t>
+              <w:t>Iniziare e completare analisi dei mezzi, creare lo use case</w:t>
             </w:r>
             <w:r>
               <w:rPr>
@@ -2294,21 +2234,7 @@
             <w:rPr>
               <w:rFonts w:ascii="Arial" w:hAnsi="Arial" w:cs="Arial"/>
             </w:rPr>
-            <w:t xml:space="preserve">Aitami a generare dei </w:t>
-          </w:r>
-          <w:proofErr w:type="spellStart"/>
-          <w:r>
-            <w:rPr>
-              <w:rFonts w:ascii="Arial" w:hAnsi="Arial" w:cs="Arial"/>
-            </w:rPr>
-            <w:t>requesiti</w:t>
-          </w:r>
-          <w:proofErr w:type="spellEnd"/>
-          <w:r>
-            <w:rPr>
-              <w:rFonts w:ascii="Arial" w:hAnsi="Arial" w:cs="Arial"/>
-            </w:rPr>
-            <w:t xml:space="preserve"> in base ai seguenti dati</w:t>
+            <w:t>Aitami a generare dei requesiti in base ai seguenti dati</w:t>
           </w:r>
         </w:p>
       </w:sdtContent>
@@ -2848,21 +2774,7 @@
               <w:rPr>
                 <w:rFonts w:ascii="Arial" w:hAnsi="Arial" w:cs="Arial"/>
               </w:rPr>
-              <w:t xml:space="preserve">Completata la analisi del dominio nella documentazione, inizio ricerche riguardo </w:t>
-            </w:r>
-            <w:proofErr w:type="spellStart"/>
-            <w:r>
-              <w:rPr>
-                <w:rFonts w:ascii="Arial" w:hAnsi="Arial" w:cs="Arial"/>
-              </w:rPr>
-              <w:t>Unity</w:t>
-            </w:r>
-            <w:proofErr w:type="spellEnd"/>
-            <w:r>
-              <w:rPr>
-                <w:rFonts w:ascii="Arial" w:hAnsi="Arial" w:cs="Arial"/>
-              </w:rPr>
-              <w:t>.</w:t>
+              <w:t>Completata la analisi del dominio nella documentazione, inizio ricerche riguardo Unity.</w:t>
             </w:r>
           </w:p>
         </w:tc>
@@ -3037,21 +2949,7 @@
               <w:rPr>
                 <w:rFonts w:ascii="Arial" w:hAnsi="Arial" w:cs="Arial"/>
               </w:rPr>
-              <w:t xml:space="preserve">Il diagramma ER non è completo e </w:t>
-            </w:r>
-            <w:proofErr w:type="gramStart"/>
-            <w:r>
-              <w:rPr>
-                <w:rFonts w:ascii="Arial" w:hAnsi="Arial" w:cs="Arial"/>
-              </w:rPr>
-              <w:t>lo use</w:t>
-            </w:r>
-            <w:proofErr w:type="gramEnd"/>
-            <w:r>
-              <w:rPr>
-                <w:rFonts w:ascii="Arial" w:hAnsi="Arial" w:cs="Arial"/>
-              </w:rPr>
-              <w:t xml:space="preserve"> case non è stato iniziato, analisi dei mezzi non ancora completata.</w:t>
+              <w:t>Il diagramma ER non è completo e lo use case non è stato iniziato, analisi dei mezzi non ancora completata.</w:t>
             </w:r>
           </w:p>
         </w:tc>
@@ -4083,16 +3981,8 @@
               <w:rPr>
                 <w:rFonts w:ascii="Arial" w:hAnsi="Arial" w:cs="Arial"/>
               </w:rPr>
-              <w:t xml:space="preserve">Creato diagramma ER e modifiche strutturali </w:t>
-            </w:r>
-            <w:proofErr w:type="spellStart"/>
-            <w:r>
-              <w:rPr>
-                <w:rFonts w:ascii="Arial" w:hAnsi="Arial" w:cs="Arial"/>
-              </w:rPr>
-              <w:t>gantt</w:t>
-            </w:r>
-            <w:proofErr w:type="spellEnd"/>
+              <w:t>Creato diagramma ER e modifiche strutturali gantt</w:t>
+            </w:r>
           </w:p>
         </w:tc>
       </w:tr>
@@ -4840,42 +4730,20 @@
             <w:rPr>
               <w:rFonts w:ascii="Arial" w:hAnsi="Arial" w:cs="Arial"/>
             </w:rPr>
-            <w:t xml:space="preserve">uoi dirmi delle classiche impostazioni per un gioco di guida in stile </w:t>
-          </w:r>
-          <w:proofErr w:type="spellStart"/>
+            <w:t>uoi dirmi delle classiche impostazioni per un gioco di guida in stile br</w:t>
+          </w:r>
           <w:r>
             <w:rPr>
               <w:rFonts w:ascii="Arial" w:hAnsi="Arial" w:cs="Arial"/>
             </w:rPr>
-            <w:t>br</w:t>
-          </w:r>
-          <w:proofErr w:type="spellEnd"/>
+            <w:t xml:space="preserve">. </w:t>
+          </w:r>
           <w:r>
             <w:rPr>
               <w:rFonts w:ascii="Arial" w:hAnsi="Arial" w:cs="Arial"/>
             </w:rPr>
-            <w:t xml:space="preserve">. </w:t>
-          </w:r>
-          <w:r>
-            <w:rPr>
-              <w:rFonts w:ascii="Arial" w:hAnsi="Arial" w:cs="Arial"/>
-            </w:rPr>
             <w:br/>
-            <w:t xml:space="preserve">Bryan: Spiegami </w:t>
-          </w:r>
-          <w:proofErr w:type="spellStart"/>
-          <w:r>
-            <w:rPr>
-              <w:rFonts w:ascii="Arial" w:hAnsi="Arial" w:cs="Arial"/>
-            </w:rPr>
-            <w:t>Unity</w:t>
-          </w:r>
-          <w:proofErr w:type="spellEnd"/>
-          <w:r>
-            <w:rPr>
-              <w:rFonts w:ascii="Arial" w:hAnsi="Arial" w:cs="Arial"/>
-            </w:rPr>
-            <w:t xml:space="preserve"> ed i suoi vantaggi.</w:t>
+            <w:t>Bryan: Spiegami Unity ed i suoi vantaggi.</w:t>
           </w:r>
         </w:p>
       </w:sdtContent>
@@ -5353,16 +5221,8 @@
               <w:rPr>
                 <w:rFonts w:ascii="Arial" w:hAnsi="Arial" w:cs="Arial"/>
               </w:rPr>
-              <w:t xml:space="preserve">Creato Diagramma ER e aggiornato </w:t>
-            </w:r>
-            <w:proofErr w:type="spellStart"/>
-            <w:r>
-              <w:rPr>
-                <w:rFonts w:ascii="Arial" w:hAnsi="Arial" w:cs="Arial"/>
-              </w:rPr>
-              <w:t>gannt</w:t>
-            </w:r>
-            <w:proofErr w:type="spellEnd"/>
+              <w:t>Creato Diagramma ER e aggiornato gannt</w:t>
+            </w:r>
           </w:p>
         </w:tc>
       </w:tr>
@@ -5399,21 +5259,7 @@
               <w:rPr>
                 <w:rFonts w:ascii="Arial" w:hAnsi="Arial" w:cs="Arial"/>
               </w:rPr>
-              <w:t xml:space="preserve">Use Case finito, Inizio creazione e documentazione </w:t>
-            </w:r>
-            <w:proofErr w:type="spellStart"/>
-            <w:r>
-              <w:rPr>
-                <w:rFonts w:ascii="Arial" w:hAnsi="Arial" w:cs="Arial"/>
-              </w:rPr>
-              <w:t>mockup</w:t>
-            </w:r>
-            <w:proofErr w:type="spellEnd"/>
-            <w:r>
-              <w:rPr>
-                <w:rFonts w:ascii="Arial" w:hAnsi="Arial" w:cs="Arial"/>
-              </w:rPr>
-              <w:t xml:space="preserve"> UI.</w:t>
+              <w:t>Use Case finito, Inizio creazione e documentazione mockup UI.</w:t>
             </w:r>
           </w:p>
         </w:tc>
@@ -5530,21 +5376,7 @@
               <w:rPr>
                 <w:rFonts w:ascii="Arial" w:hAnsi="Arial" w:cs="Arial"/>
               </w:rPr>
-              <w:t xml:space="preserve">Riuscire a definire le azioni degli attori </w:t>
-            </w:r>
-            <w:proofErr w:type="gramStart"/>
-            <w:r>
-              <w:rPr>
-                <w:rFonts w:ascii="Arial" w:hAnsi="Arial" w:cs="Arial"/>
-              </w:rPr>
-              <w:t>nel Use</w:t>
-            </w:r>
-            <w:proofErr w:type="gramEnd"/>
-            <w:r>
-              <w:rPr>
-                <w:rFonts w:ascii="Arial" w:hAnsi="Arial" w:cs="Arial"/>
-              </w:rPr>
-              <w:t xml:space="preserve"> Case, risolto approfondendo meglio.</w:t>
+              <w:t>Riuscire a definire le azioni degli attori nel Use Case, risolto approfondendo meglio.</w:t>
             </w:r>
           </w:p>
         </w:tc>
@@ -5673,21 +5505,7 @@
               <w:rPr>
                 <w:rFonts w:ascii="Arial" w:hAnsi="Arial" w:cs="Arial"/>
               </w:rPr>
-              <w:t xml:space="preserve">Continuo creazione </w:t>
-            </w:r>
-            <w:proofErr w:type="spellStart"/>
-            <w:r>
-              <w:rPr>
-                <w:rFonts w:ascii="Arial" w:hAnsi="Arial" w:cs="Arial"/>
-              </w:rPr>
-              <w:t>Mockup</w:t>
-            </w:r>
-            <w:proofErr w:type="spellEnd"/>
-            <w:r>
-              <w:rPr>
-                <w:rFonts w:ascii="Arial" w:hAnsi="Arial" w:cs="Arial"/>
-              </w:rPr>
-              <w:t xml:space="preserve"> UI.</w:t>
+              <w:t>Continuo creazione Mockup UI.</w:t>
             </w:r>
           </w:p>
         </w:tc>
@@ -6258,30 +6076,8 @@
               <w:rFonts w:ascii="Arial" w:hAnsi="Arial" w:cs="Arial"/>
             </w:rPr>
             <w:br/>
-            <w:t xml:space="preserve">Bryan: Correzioni </w:t>
-          </w:r>
-          <w:proofErr w:type="gramStart"/>
-          <w:r>
-            <w:rPr>
-              <w:rFonts w:ascii="Arial" w:hAnsi="Arial" w:cs="Arial"/>
-            </w:rPr>
-            <w:t>dello use</w:t>
-          </w:r>
-          <w:proofErr w:type="gramEnd"/>
-          <w:r>
-            <w:rPr>
-              <w:rFonts w:ascii="Arial" w:hAnsi="Arial" w:cs="Arial"/>
-            </w:rPr>
-            <w:t xml:space="preserve"> case generato dal </w:t>
-          </w:r>
-          <w:proofErr w:type="spellStart"/>
-          <w:r>
-            <w:rPr>
-              <w:rFonts w:ascii="Arial" w:hAnsi="Arial" w:cs="Arial"/>
-            </w:rPr>
-            <w:t>colega</w:t>
-          </w:r>
-          <w:proofErr w:type="spellEnd"/>
+            <w:t>Bryan: Correzioni dello use case generato dal colega</w:t>
+          </w:r>
         </w:p>
       </w:sdtContent>
     </w:sdt>
@@ -6681,16 +6477,8 @@
               <w:rPr>
                 <w:rFonts w:ascii="Arial" w:hAnsi="Arial" w:cs="Arial"/>
               </w:rPr>
-              <w:t xml:space="preserve">Completata progettazione e creazione progetto </w:t>
-            </w:r>
-            <w:proofErr w:type="spellStart"/>
-            <w:r>
-              <w:rPr>
-                <w:rFonts w:ascii="Arial" w:hAnsi="Arial" w:cs="Arial"/>
-              </w:rPr>
-              <w:t>unity</w:t>
-            </w:r>
-            <w:proofErr w:type="spellEnd"/>
+              <w:t>Completata progettazione e creazione progetto unity</w:t>
+            </w:r>
           </w:p>
         </w:tc>
       </w:tr>
@@ -6727,16 +6515,8 @@
               <w:rPr>
                 <w:rFonts w:ascii="Arial" w:hAnsi="Arial" w:cs="Arial"/>
               </w:rPr>
-              <w:t xml:space="preserve">Fine </w:t>
-            </w:r>
-            <w:proofErr w:type="spellStart"/>
-            <w:r>
-              <w:rPr>
-                <w:rFonts w:ascii="Arial" w:hAnsi="Arial" w:cs="Arial"/>
-              </w:rPr>
-              <w:t>Mockup</w:t>
-            </w:r>
-            <w:proofErr w:type="spellEnd"/>
+              <w:t>Fine Mockup</w:t>
+            </w:r>
           </w:p>
         </w:tc>
       </w:tr>
@@ -6814,52 +6594,8 @@
               <w:rPr>
                 <w:rFonts w:ascii="Arial" w:hAnsi="Arial" w:cs="Arial"/>
               </w:rPr>
-              <w:t xml:space="preserve">Problemi nel </w:t>
-            </w:r>
-            <w:proofErr w:type="spellStart"/>
-            <w:r>
-              <w:rPr>
-                <w:rFonts w:ascii="Arial" w:hAnsi="Arial" w:cs="Arial"/>
-              </w:rPr>
-              <w:t>pushare</w:t>
-            </w:r>
-            <w:proofErr w:type="spellEnd"/>
-            <w:r>
-              <w:rPr>
-                <w:rFonts w:ascii="Arial" w:hAnsi="Arial" w:cs="Arial"/>
-              </w:rPr>
-              <w:t xml:space="preserve"> il progetto </w:t>
-            </w:r>
-            <w:proofErr w:type="spellStart"/>
-            <w:r>
-              <w:rPr>
-                <w:rFonts w:ascii="Arial" w:hAnsi="Arial" w:cs="Arial"/>
-              </w:rPr>
-              <w:t>uinity</w:t>
-            </w:r>
-            <w:proofErr w:type="spellEnd"/>
-            <w:r>
-              <w:rPr>
-                <w:rFonts w:ascii="Arial" w:hAnsi="Arial" w:cs="Arial"/>
-              </w:rPr>
-              <w:t xml:space="preserve">, risolto grazie alla creazione di un </w:t>
-            </w:r>
-            <w:proofErr w:type="gramStart"/>
-            <w:r>
-              <w:rPr>
-                <w:rFonts w:ascii="Arial" w:hAnsi="Arial" w:cs="Arial"/>
-              </w:rPr>
-              <w:t>file .</w:t>
-            </w:r>
-            <w:proofErr w:type="spellStart"/>
-            <w:r>
-              <w:rPr>
-                <w:rFonts w:ascii="Arial" w:hAnsi="Arial" w:cs="Arial"/>
-              </w:rPr>
-              <w:t>gitignore</w:t>
-            </w:r>
-            <w:proofErr w:type="spellEnd"/>
-            <w:proofErr w:type="gramEnd"/>
+              <w:t>Problemi nel pushare il progetto uinity, risolto grazie alla creazione di un file .gitignore</w:t>
+            </w:r>
           </w:p>
         </w:tc>
       </w:tr>
@@ -7012,35 +6748,7 @@
               <w:rPr>
                 <w:rFonts w:ascii="Arial" w:hAnsi="Arial" w:cs="Arial"/>
               </w:rPr>
-              <w:t xml:space="preserve">Ambientarsi nel game </w:t>
-            </w:r>
-            <w:proofErr w:type="spellStart"/>
-            <w:r>
-              <w:rPr>
-                <w:rFonts w:ascii="Arial" w:hAnsi="Arial" w:cs="Arial"/>
-              </w:rPr>
-              <w:t>engine</w:t>
-            </w:r>
-            <w:proofErr w:type="spellEnd"/>
-            <w:r>
-              <w:rPr>
-                <w:rFonts w:ascii="Arial" w:hAnsi="Arial" w:cs="Arial"/>
-              </w:rPr>
-              <w:t xml:space="preserve"> di </w:t>
-            </w:r>
-            <w:proofErr w:type="spellStart"/>
-            <w:r>
-              <w:rPr>
-                <w:rFonts w:ascii="Arial" w:hAnsi="Arial" w:cs="Arial"/>
-              </w:rPr>
-              <w:t>unity</w:t>
-            </w:r>
-            <w:proofErr w:type="spellEnd"/>
-            <w:r>
-              <w:rPr>
-                <w:rFonts w:ascii="Arial" w:hAnsi="Arial" w:cs="Arial"/>
-              </w:rPr>
-              <w:t xml:space="preserve"> e quindi cominciare a creare la schermata di statistiche</w:t>
+              <w:t>Ambientarsi nel game engine di unity e quindi cominciare a creare la schermata di statistiche</w:t>
             </w:r>
           </w:p>
         </w:tc>
@@ -7512,21 +7220,7 @@
             <w:rPr>
               <w:rFonts w:ascii="Arial" w:hAnsi="Arial" w:cs="Arial"/>
             </w:rPr>
-            <w:t xml:space="preserve">Bryan: Generami un’immagine di </w:t>
-          </w:r>
-          <w:proofErr w:type="spellStart"/>
-          <w:r>
-            <w:rPr>
-              <w:rFonts w:ascii="Arial" w:hAnsi="Arial" w:cs="Arial"/>
-            </w:rPr>
-            <w:t>mockup</w:t>
-          </w:r>
-          <w:proofErr w:type="spellEnd"/>
-          <w:r>
-            <w:rPr>
-              <w:rFonts w:ascii="Arial" w:hAnsi="Arial" w:cs="Arial"/>
-            </w:rPr>
-            <w:t xml:space="preserve"> basandoti sul seguente stile: “stile”</w:t>
+            <w:t>Bryan: Generami un’immagine di mockup basandoti sul seguente stile: “stile”</w:t>
           </w:r>
         </w:p>
         <w:p>
@@ -7840,58 +7534,14 @@
         <w:rPr>
           <w:rFonts w:ascii="Arial" w:hAnsi="Arial" w:cs="Arial"/>
         </w:rPr>
-        <w:t xml:space="preserve">Riley: probabilmente non sarei riuscito a risolvere questo problema non avendo un’esperienza molto avanzata con i </w:t>
-      </w:r>
-      <w:proofErr w:type="gramStart"/>
-      <w:r>
-        <w:rPr>
-          <w:rFonts w:ascii="Arial" w:hAnsi="Arial" w:cs="Arial"/>
-        </w:rPr>
-        <w:t>file .</w:t>
-      </w:r>
-      <w:proofErr w:type="spellStart"/>
-      <w:r>
-        <w:rPr>
-          <w:rFonts w:ascii="Arial" w:hAnsi="Arial" w:cs="Arial"/>
-        </w:rPr>
-        <w:t>gitignore</w:t>
-      </w:r>
-      <w:proofErr w:type="spellEnd"/>
-      <w:proofErr w:type="gramEnd"/>
+        <w:t>Riley: probabilmente non sarei riuscito a risolvere questo problema non avendo un’esperienza molto avanzata con i file .gitignore</w:t>
+      </w:r>
       <w:r>
         <w:rPr>
           <w:rFonts w:ascii="Arial" w:hAnsi="Arial" w:cs="Arial"/>
         </w:rPr>
         <w:br/>
-        <w:t xml:space="preserve">Bryan: Averi creato un’immagine su </w:t>
-      </w:r>
-      <w:proofErr w:type="spellStart"/>
-      <w:r>
-        <w:rPr>
-          <w:rFonts w:ascii="Arial" w:hAnsi="Arial" w:cs="Arial"/>
-        </w:rPr>
-        <w:t>paint</w:t>
-      </w:r>
-      <w:proofErr w:type="spellEnd"/>
-      <w:r>
-        <w:rPr>
-          <w:rFonts w:ascii="Arial" w:hAnsi="Arial" w:cs="Arial"/>
-        </w:rPr>
-        <w:t xml:space="preserve"> che avrebbe reso i </w:t>
-      </w:r>
-      <w:proofErr w:type="spellStart"/>
-      <w:r>
-        <w:rPr>
-          <w:rFonts w:ascii="Arial" w:hAnsi="Arial" w:cs="Arial"/>
-        </w:rPr>
-        <w:t>mockup</w:t>
-      </w:r>
-      <w:proofErr w:type="spellEnd"/>
-      <w:r>
-        <w:rPr>
-          <w:rFonts w:ascii="Arial" w:hAnsi="Arial" w:cs="Arial"/>
-        </w:rPr>
-        <w:t xml:space="preserve"> molto più confusi.</w:t>
+        <w:t>Bryan: Averi creato un’immagine su paint che avrebbe reso i mockup molto più confusi.</w:t>
       </w:r>
     </w:p>
     <w:p>
@@ -8077,21 +7727,7 @@
               <w:rPr>
                 <w:rFonts w:ascii="Arial" w:hAnsi="Arial" w:cs="Arial"/>
               </w:rPr>
-              <w:t xml:space="preserve">Inizio sviluppo </w:t>
-            </w:r>
-            <w:proofErr w:type="spellStart"/>
-            <w:r>
-              <w:rPr>
-                <w:rFonts w:ascii="Arial" w:hAnsi="Arial" w:cs="Arial"/>
-              </w:rPr>
-              <w:t>ui</w:t>
-            </w:r>
-            <w:proofErr w:type="spellEnd"/>
-            <w:r>
-              <w:rPr>
-                <w:rFonts w:ascii="Arial" w:hAnsi="Arial" w:cs="Arial"/>
-              </w:rPr>
-              <w:t xml:space="preserve"> statistiche</w:t>
+              <w:t>Inizio sviluppo ui statistiche</w:t>
             </w:r>
           </w:p>
         </w:tc>
@@ -8129,21 +7765,7 @@
               <w:rPr>
                 <w:rFonts w:ascii="Arial" w:hAnsi="Arial" w:cs="Arial"/>
               </w:rPr>
-              <w:t xml:space="preserve">Inizio sviluppo </w:t>
-            </w:r>
-            <w:proofErr w:type="spellStart"/>
-            <w:r>
-              <w:rPr>
-                <w:rFonts w:ascii="Arial" w:hAnsi="Arial" w:cs="Arial"/>
-              </w:rPr>
-              <w:t>ui</w:t>
-            </w:r>
-            <w:proofErr w:type="spellEnd"/>
-            <w:r>
-              <w:rPr>
-                <w:rFonts w:ascii="Arial" w:hAnsi="Arial" w:cs="Arial"/>
-              </w:rPr>
-              <w:t xml:space="preserve"> statistiche</w:t>
+              <w:t>Inizio sviluppo ui statistiche</w:t>
             </w:r>
           </w:p>
         </w:tc>
@@ -8376,21 +7998,7 @@
               <w:rPr>
                 <w:rFonts w:ascii="Arial" w:hAnsi="Arial" w:cs="Arial"/>
               </w:rPr>
-              <w:t xml:space="preserve">Completare la </w:t>
-            </w:r>
-            <w:proofErr w:type="spellStart"/>
-            <w:r>
-              <w:rPr>
-                <w:rFonts w:ascii="Arial" w:hAnsi="Arial" w:cs="Arial"/>
-              </w:rPr>
-              <w:t>ui</w:t>
-            </w:r>
-            <w:proofErr w:type="spellEnd"/>
-            <w:r>
-              <w:rPr>
-                <w:rFonts w:ascii="Arial" w:hAnsi="Arial" w:cs="Arial"/>
-              </w:rPr>
-              <w:t xml:space="preserve"> delle statistiche</w:t>
+              <w:t>Completare la ui delle statistiche</w:t>
             </w:r>
           </w:p>
         </w:tc>
@@ -8440,28 +8048,12 @@
                 <w:rFonts w:ascii="Arial" w:hAnsi="Arial" w:cs="Arial"/>
               </w:rPr>
             </w:pPr>
-            <w:proofErr w:type="spellStart"/>
-            <w:r>
-              <w:rPr>
-                <w:rFonts w:ascii="Arial" w:hAnsi="Arial" w:cs="Arial"/>
-              </w:rPr>
-              <w:t>Daily</w:t>
-            </w:r>
-            <w:proofErr w:type="spellEnd"/>
-            <w:r>
-              <w:rPr>
-                <w:rFonts w:ascii="Arial" w:hAnsi="Arial" w:cs="Arial"/>
-              </w:rPr>
-              <w:t xml:space="preserve"> </w:t>
-            </w:r>
-            <w:proofErr w:type="spellStart"/>
-            <w:r>
-              <w:rPr>
-                <w:rFonts w:ascii="Arial" w:hAnsi="Arial" w:cs="Arial"/>
-              </w:rPr>
-              <w:t>Scrum</w:t>
-            </w:r>
-            <w:proofErr w:type="spellEnd"/>
+            <w:r>
+              <w:rPr>
+                <w:rFonts w:ascii="Arial" w:hAnsi="Arial" w:cs="Arial"/>
+              </w:rPr>
+              <w:t>Daily Scrum</w:t>
+            </w:r>
           </w:p>
         </w:tc>
       </w:tr>
@@ -8509,35 +8101,7 @@
               <w:rPr>
                 <w:rFonts w:ascii="Arial" w:hAnsi="Arial" w:cs="Arial"/>
               </w:rPr>
-              <w:t xml:space="preserve">Introduzione ambiente </w:t>
-            </w:r>
-            <w:proofErr w:type="spellStart"/>
-            <w:r>
-              <w:rPr>
-                <w:rFonts w:ascii="Arial" w:hAnsi="Arial" w:cs="Arial"/>
-              </w:rPr>
-              <w:t>unity</w:t>
-            </w:r>
-            <w:proofErr w:type="spellEnd"/>
-            <w:r>
-              <w:rPr>
-                <w:rFonts w:ascii="Arial" w:hAnsi="Arial" w:cs="Arial"/>
-              </w:rPr>
-              <w:t xml:space="preserve"> e inizio </w:t>
-            </w:r>
-            <w:proofErr w:type="spellStart"/>
-            <w:r>
-              <w:rPr>
-                <w:rFonts w:ascii="Arial" w:hAnsi="Arial" w:cs="Arial"/>
-              </w:rPr>
-              <w:t>imostazione</w:t>
-            </w:r>
-            <w:proofErr w:type="spellEnd"/>
-            <w:r>
-              <w:rPr>
-                <w:rFonts w:ascii="Arial" w:hAnsi="Arial" w:cs="Arial"/>
-              </w:rPr>
-              <w:t xml:space="preserve"> layout statistiche</w:t>
+              <w:t>Introduzione ambiente unity e inizio imostazione layout statistiche</w:t>
             </w:r>
           </w:p>
         </w:tc>
@@ -8717,16 +8281,8 @@
               <w:rPr>
                 <w:rFonts w:ascii="Arial" w:hAnsi="Arial" w:cs="Arial"/>
               </w:rPr>
-              <w:t xml:space="preserve">Sprint </w:t>
-            </w:r>
-            <w:proofErr w:type="spellStart"/>
-            <w:r>
-              <w:rPr>
-                <w:rFonts w:ascii="Arial" w:hAnsi="Arial" w:cs="Arial"/>
-              </w:rPr>
-              <w:t>Retrospective</w:t>
-            </w:r>
-            <w:proofErr w:type="spellEnd"/>
+              <w:t>Sprint Retrospective</w:t>
+            </w:r>
           </w:p>
         </w:tc>
       </w:tr>
@@ -9687,44 +9243,8 @@
               <w:rPr>
                 <w:rFonts w:ascii="Arial" w:hAnsi="Arial" w:cs="Arial"/>
               </w:rPr>
-              <w:t xml:space="preserve">Ricerca e sviluppo per salvataggio statistiche su </w:t>
-            </w:r>
-            <w:proofErr w:type="spellStart"/>
-            <w:r>
-              <w:rPr>
-                <w:rFonts w:ascii="Arial" w:hAnsi="Arial" w:cs="Arial"/>
-              </w:rPr>
-              <w:t>json</w:t>
-            </w:r>
-            <w:proofErr w:type="spellEnd"/>
-            <w:r>
-              <w:rPr>
-                <w:rFonts w:ascii="Arial" w:hAnsi="Arial" w:cs="Arial"/>
-              </w:rPr>
-              <w:t xml:space="preserve">, non ancora completo, questo verrà utilizzato come test per verificare il funzionamento delle varie schermate </w:t>
-            </w:r>
-            <w:proofErr w:type="spellStart"/>
-            <w:r>
-              <w:rPr>
-                <w:rFonts w:ascii="Arial" w:hAnsi="Arial" w:cs="Arial"/>
-              </w:rPr>
-              <w:t>ui</w:t>
-            </w:r>
-            <w:proofErr w:type="spellEnd"/>
-            <w:r>
-              <w:rPr>
-                <w:rFonts w:ascii="Arial" w:hAnsi="Arial" w:cs="Arial"/>
-              </w:rPr>
-              <w:t xml:space="preserve"> poi verrà adattato per il </w:t>
-            </w:r>
-            <w:proofErr w:type="spellStart"/>
-            <w:r>
-              <w:rPr>
-                <w:rFonts w:ascii="Arial" w:hAnsi="Arial" w:cs="Arial"/>
-              </w:rPr>
-              <w:t>db</w:t>
-            </w:r>
-            <w:proofErr w:type="spellEnd"/>
+              <w:t>Ricerca e sviluppo per salvataggio statistiche su json, non ancora completo, questo verrà utilizzato come test per verificare il funzionamento delle varie schermate ui poi verrà adattato per il db</w:t>
+            </w:r>
           </w:p>
         </w:tc>
       </w:tr>
@@ -9878,21 +9398,7 @@
               <w:rPr>
                 <w:rFonts w:ascii="Arial" w:hAnsi="Arial" w:cs="Arial"/>
               </w:rPr>
-              <w:t xml:space="preserve">Non trovavo la cartella degli assets, risolto cercando su </w:t>
-            </w:r>
-            <w:proofErr w:type="spellStart"/>
-            <w:r>
-              <w:rPr>
-                <w:rFonts w:ascii="Arial" w:hAnsi="Arial" w:cs="Arial"/>
-              </w:rPr>
-              <w:t>google</w:t>
-            </w:r>
-            <w:proofErr w:type="spellEnd"/>
-            <w:r>
-              <w:rPr>
-                <w:rFonts w:ascii="Arial" w:hAnsi="Arial" w:cs="Arial"/>
-              </w:rPr>
-              <w:t>.</w:t>
+              <w:t>Non trovavo la cartella degli assets, risolto cercando su google.</w:t>
             </w:r>
           </w:p>
         </w:tc>
@@ -9950,21 +9456,7 @@
               <w:rPr>
                 <w:rFonts w:ascii="Arial" w:hAnsi="Arial" w:cs="Arial"/>
               </w:rPr>
-              <w:t xml:space="preserve">Le statistiche non sono concluse, manca una piccola parte della </w:t>
-            </w:r>
-            <w:proofErr w:type="spellStart"/>
-            <w:r>
-              <w:rPr>
-                <w:rFonts w:ascii="Arial" w:hAnsi="Arial" w:cs="Arial"/>
-              </w:rPr>
-              <w:t>ui</w:t>
-            </w:r>
-            <w:proofErr w:type="spellEnd"/>
-            <w:r>
-              <w:rPr>
-                <w:rFonts w:ascii="Arial" w:hAnsi="Arial" w:cs="Arial"/>
-              </w:rPr>
-              <w:t xml:space="preserve"> e la logica di salvataggio e caricamento</w:t>
+              <w:t>Le statistiche non sono concluse, manca una piccola parte della ui e la logica di salvataggio e caricamento</w:t>
             </w:r>
           </w:p>
         </w:tc>
@@ -10072,28 +9564,12 @@
                 <w:rFonts w:ascii="Arial" w:hAnsi="Arial" w:cs="Arial"/>
               </w:rPr>
             </w:pPr>
-            <w:proofErr w:type="spellStart"/>
-            <w:r>
-              <w:rPr>
-                <w:rFonts w:ascii="Arial" w:hAnsi="Arial" w:cs="Arial"/>
-              </w:rPr>
-              <w:t>Daily</w:t>
-            </w:r>
-            <w:proofErr w:type="spellEnd"/>
-            <w:r>
-              <w:rPr>
-                <w:rFonts w:ascii="Arial" w:hAnsi="Arial" w:cs="Arial"/>
-              </w:rPr>
-              <w:t xml:space="preserve"> </w:t>
-            </w:r>
-            <w:proofErr w:type="spellStart"/>
-            <w:r>
-              <w:rPr>
-                <w:rFonts w:ascii="Arial" w:hAnsi="Arial" w:cs="Arial"/>
-              </w:rPr>
-              <w:t>Scrum</w:t>
-            </w:r>
-            <w:proofErr w:type="spellEnd"/>
+            <w:r>
+              <w:rPr>
+                <w:rFonts w:ascii="Arial" w:hAnsi="Arial" w:cs="Arial"/>
+              </w:rPr>
+              <w:t>Daily Scrum</w:t>
+            </w:r>
           </w:p>
         </w:tc>
       </w:tr>
@@ -10141,35 +9617,7 @@
               <w:rPr>
                 <w:rFonts w:ascii="Arial" w:hAnsi="Arial" w:cs="Arial"/>
               </w:rPr>
-              <w:t xml:space="preserve">Entrambi completeremo la </w:t>
-            </w:r>
-            <w:proofErr w:type="spellStart"/>
-            <w:r>
-              <w:rPr>
-                <w:rFonts w:ascii="Arial" w:hAnsi="Arial" w:cs="Arial"/>
-              </w:rPr>
-              <w:t>ui</w:t>
-            </w:r>
-            <w:proofErr w:type="spellEnd"/>
-            <w:r>
-              <w:rPr>
-                <w:rFonts w:ascii="Arial" w:hAnsi="Arial" w:cs="Arial"/>
-              </w:rPr>
-              <w:t xml:space="preserve"> delle statistiche in modo tale che ci ambientiamo completamente per lo sviluppo 2D e gli script C# per poterci permettere di lavorare separatamente in </w:t>
-            </w:r>
-            <w:proofErr w:type="spellStart"/>
-            <w:r>
-              <w:rPr>
-                <w:rFonts w:ascii="Arial" w:hAnsi="Arial" w:cs="Arial"/>
-              </w:rPr>
-              <w:t>fututro</w:t>
-            </w:r>
-            <w:proofErr w:type="spellEnd"/>
-            <w:r>
-              <w:rPr>
-                <w:rFonts w:ascii="Arial" w:hAnsi="Arial" w:cs="Arial"/>
-              </w:rPr>
-              <w:t>.</w:t>
+              <w:t>Entrambi completeremo la ui delle statistiche in modo tale che ci ambientiamo completamente per lo sviluppo 2D e gli script C# per poterci permettere di lavorare separatamente in fututro.</w:t>
             </w:r>
           </w:p>
         </w:tc>
@@ -10349,16 +9797,8 @@
               <w:rPr>
                 <w:rFonts w:ascii="Arial" w:hAnsi="Arial" w:cs="Arial"/>
               </w:rPr>
-              <w:t xml:space="preserve">Sprint </w:t>
-            </w:r>
-            <w:proofErr w:type="spellStart"/>
-            <w:r>
-              <w:rPr>
-                <w:rFonts w:ascii="Arial" w:hAnsi="Arial" w:cs="Arial"/>
-              </w:rPr>
-              <w:t>Retrospective</w:t>
-            </w:r>
-            <w:proofErr w:type="spellEnd"/>
+              <w:t>Sprint Retrospective</w:t>
+            </w:r>
           </w:p>
         </w:tc>
       </w:tr>
@@ -10850,30 +10290,8 @@
             <w:rPr>
               <w:rFonts w:ascii="Arial" w:hAnsi="Arial" w:cs="Arial"/>
             </w:rPr>
-            <w:t xml:space="preserve">Riley: aiutami a comprendere come salvare dei dati </w:t>
-          </w:r>
-          <w:proofErr w:type="spellStart"/>
-          <w:r>
-            <w:rPr>
-              <w:rFonts w:ascii="Arial" w:hAnsi="Arial" w:cs="Arial"/>
-            </w:rPr>
-            <w:t>unity</w:t>
-          </w:r>
-          <w:proofErr w:type="spellEnd"/>
-          <w:r>
-            <w:rPr>
-              <w:rFonts w:ascii="Arial" w:hAnsi="Arial" w:cs="Arial"/>
-            </w:rPr>
-            <w:t xml:space="preserve"> su un </w:t>
-          </w:r>
-          <w:proofErr w:type="spellStart"/>
-          <w:r>
-            <w:rPr>
-              <w:rFonts w:ascii="Arial" w:hAnsi="Arial" w:cs="Arial"/>
-            </w:rPr>
-            <w:t>json</w:t>
-          </w:r>
-          <w:proofErr w:type="spellEnd"/>
+            <w:t>Riley: aiutami a comprendere come salvare dei dati unity su un json</w:t>
+          </w:r>
         </w:p>
       </w:sdtContent>
     </w:sdt>
@@ -11385,21 +10803,7 @@
               <w:rPr>
                 <w:rFonts w:ascii="Arial" w:hAnsi="Arial" w:cs="Arial"/>
               </w:rPr>
-              <w:t xml:space="preserve">Terminato </w:t>
-            </w:r>
-            <w:proofErr w:type="spellStart"/>
-            <w:r>
-              <w:rPr>
-                <w:rFonts w:ascii="Arial" w:hAnsi="Arial" w:cs="Arial"/>
-              </w:rPr>
-              <w:t>ui</w:t>
-            </w:r>
-            <w:proofErr w:type="spellEnd"/>
-            <w:r>
-              <w:rPr>
-                <w:rFonts w:ascii="Arial" w:hAnsi="Arial" w:cs="Arial"/>
-              </w:rPr>
-              <w:t xml:space="preserve"> statistiche e iniziato quella delle impostazioni</w:t>
+              <w:t>Terminato ui statistiche e iniziato quella delle impostazioni</w:t>
             </w:r>
           </w:p>
         </w:tc>
@@ -11478,97 +10882,13 @@
               <w:rPr>
                 <w:rFonts w:ascii="Arial" w:hAnsi="Arial" w:cs="Arial"/>
               </w:rPr>
-              <w:t xml:space="preserve">Problemi di merge, risolto tramite una configurazione di un tool di </w:t>
-            </w:r>
-            <w:proofErr w:type="spellStart"/>
-            <w:r>
-              <w:rPr>
-                <w:rFonts w:ascii="Arial" w:hAnsi="Arial" w:cs="Arial"/>
-              </w:rPr>
-              <w:t>unity</w:t>
-            </w:r>
-            <w:proofErr w:type="spellEnd"/>
-            <w:r>
-              <w:rPr>
-                <w:rFonts w:ascii="Arial" w:hAnsi="Arial" w:cs="Arial"/>
-              </w:rPr>
-              <w:t xml:space="preserve"> che permette di risolvere automaticamente i conflitti, è stato fatto una configurazione che fa avvia un file .</w:t>
-            </w:r>
-            <w:proofErr w:type="spellStart"/>
-            <w:r>
-              <w:rPr>
-                <w:rFonts w:ascii="Arial" w:hAnsi="Arial" w:cs="Arial"/>
-              </w:rPr>
-              <w:t>cmd</w:t>
-            </w:r>
-            <w:proofErr w:type="spellEnd"/>
-            <w:r>
-              <w:rPr>
-                <w:rFonts w:ascii="Arial" w:hAnsi="Arial" w:cs="Arial"/>
-              </w:rPr>
-              <w:t xml:space="preserve"> sotto la cartella tools questo piccolo script prende i file con conflitti rilevati da </w:t>
-            </w:r>
-            <w:proofErr w:type="spellStart"/>
-            <w:r>
-              <w:rPr>
-                <w:rFonts w:ascii="Arial" w:hAnsi="Arial" w:cs="Arial"/>
-              </w:rPr>
-              <w:t>git</w:t>
-            </w:r>
-            <w:proofErr w:type="spellEnd"/>
-            <w:r>
-              <w:rPr>
-                <w:rFonts w:ascii="Arial" w:hAnsi="Arial" w:cs="Arial"/>
-              </w:rPr>
-              <w:t xml:space="preserve"> e li traduce per </w:t>
-            </w:r>
-            <w:proofErr w:type="spellStart"/>
-            <w:r>
-              <w:rPr>
-                <w:rFonts w:ascii="Arial" w:hAnsi="Arial" w:cs="Arial"/>
-              </w:rPr>
-              <w:t>unityyalmmerge</w:t>
-            </w:r>
-            <w:proofErr w:type="spellEnd"/>
-            <w:r>
-              <w:rPr>
-                <w:rFonts w:ascii="Arial" w:hAnsi="Arial" w:cs="Arial"/>
-              </w:rPr>
-              <w:t xml:space="preserve"> facendo in modo che una volta usato il comando </w:t>
-            </w:r>
-            <w:proofErr w:type="spellStart"/>
-            <w:r>
-              <w:rPr>
-                <w:rFonts w:ascii="Arial" w:hAnsi="Arial" w:cs="Arial"/>
-              </w:rPr>
-              <w:t>git</w:t>
-            </w:r>
-            <w:proofErr w:type="spellEnd"/>
-            <w:r>
-              <w:rPr>
-                <w:rFonts w:ascii="Arial" w:hAnsi="Arial" w:cs="Arial"/>
-              </w:rPr>
-              <w:t xml:space="preserve"> pull non risultino più errori.</w:t>
-            </w:r>
-            <w:r>
-              <w:rPr>
-                <w:rFonts w:ascii="Arial" w:hAnsi="Arial" w:cs="Arial"/>
-              </w:rPr>
-              <w:t xml:space="preserve"> </w:t>
-            </w:r>
-            <w:proofErr w:type="spellStart"/>
-            <w:r>
-              <w:rPr>
-                <w:rFonts w:ascii="Arial" w:hAnsi="Arial" w:cs="Arial"/>
-              </w:rPr>
-              <w:t>Chatgpt</w:t>
-            </w:r>
-            <w:proofErr w:type="spellEnd"/>
-            <w:r>
-              <w:rPr>
-                <w:rFonts w:ascii="Arial" w:hAnsi="Arial" w:cs="Arial"/>
-              </w:rPr>
-              <w:t xml:space="preserve"> mi ha supportato nella risoluzione di questo problema</w:t>
+              <w:t>Problemi di merge, risolto tramite una configurazione di un tool di unity che permette di risolvere automaticamente i conflitti, è stato fatto una configurazione che fa avvia un file .cmd sotto la cartella tools questo piccolo script prende i file con conflitti rilevati da git e li traduce per unityyalmmerge facendo in modo che una volta usato il comando git pull non risultino più errori.</w:t>
+            </w:r>
+            <w:r>
+              <w:rPr>
+                <w:rFonts w:ascii="Arial" w:hAnsi="Arial" w:cs="Arial"/>
+              </w:rPr>
+              <w:t xml:space="preserve"> Chatgpt mi ha supportato nella risoluzione di questo problema</w:t>
             </w:r>
           </w:p>
         </w:tc>
@@ -11664,21 +10984,7 @@
               <w:rPr>
                 <w:rFonts w:ascii="Arial" w:hAnsi="Arial" w:cs="Arial"/>
               </w:rPr>
-              <w:t xml:space="preserve">La </w:t>
-            </w:r>
-            <w:proofErr w:type="spellStart"/>
-            <w:r>
-              <w:rPr>
-                <w:rFonts w:ascii="Arial" w:hAnsi="Arial" w:cs="Arial"/>
-              </w:rPr>
-              <w:t>ui</w:t>
-            </w:r>
-            <w:proofErr w:type="spellEnd"/>
-            <w:r>
-              <w:rPr>
-                <w:rFonts w:ascii="Arial" w:hAnsi="Arial" w:cs="Arial"/>
-              </w:rPr>
-              <w:t xml:space="preserve"> delle statistiche è completa ma mancano alcune parti dello script, di conseguenza abbiamo un ritardo generale.</w:t>
+              <w:t>La ui delle statistiche è completa ma mancano alcune parti dello script, di conseguenza abbiamo un ritardo generale.</w:t>
             </w:r>
           </w:p>
         </w:tc>
@@ -11736,21 +11042,7 @@
               <w:rPr>
                 <w:rFonts w:ascii="Arial" w:hAnsi="Arial" w:cs="Arial"/>
               </w:rPr>
-              <w:t xml:space="preserve">Terminare script statistiche, continuare </w:t>
-            </w:r>
-            <w:proofErr w:type="spellStart"/>
-            <w:r>
-              <w:rPr>
-                <w:rFonts w:ascii="Arial" w:hAnsi="Arial" w:cs="Arial"/>
-              </w:rPr>
-              <w:t>ui</w:t>
-            </w:r>
-            <w:proofErr w:type="spellEnd"/>
-            <w:r>
-              <w:rPr>
-                <w:rFonts w:ascii="Arial" w:hAnsi="Arial" w:cs="Arial"/>
-              </w:rPr>
-              <w:t xml:space="preserve"> impostazioni</w:t>
+              <w:t>Terminare script statistiche, continuare ui impostazioni</w:t>
             </w:r>
           </w:p>
         </w:tc>
@@ -11800,28 +11092,12 @@
                 <w:rFonts w:ascii="Arial" w:hAnsi="Arial" w:cs="Arial"/>
               </w:rPr>
             </w:pPr>
-            <w:proofErr w:type="spellStart"/>
-            <w:r>
-              <w:rPr>
-                <w:rFonts w:ascii="Arial" w:hAnsi="Arial" w:cs="Arial"/>
-              </w:rPr>
-              <w:t>Daily</w:t>
-            </w:r>
-            <w:proofErr w:type="spellEnd"/>
-            <w:r>
-              <w:rPr>
-                <w:rFonts w:ascii="Arial" w:hAnsi="Arial" w:cs="Arial"/>
-              </w:rPr>
-              <w:t xml:space="preserve"> </w:t>
-            </w:r>
-            <w:proofErr w:type="spellStart"/>
-            <w:r>
-              <w:rPr>
-                <w:rFonts w:ascii="Arial" w:hAnsi="Arial" w:cs="Arial"/>
-              </w:rPr>
-              <w:t>Scrum</w:t>
-            </w:r>
-            <w:proofErr w:type="spellEnd"/>
+            <w:r>
+              <w:rPr>
+                <w:rFonts w:ascii="Arial" w:hAnsi="Arial" w:cs="Arial"/>
+              </w:rPr>
+              <w:t>Daily Scrum</w:t>
+            </w:r>
           </w:p>
         </w:tc>
       </w:tr>
@@ -11869,21 +11145,7 @@
               <w:rPr>
                 <w:rFonts w:ascii="Arial" w:hAnsi="Arial" w:cs="Arial"/>
               </w:rPr>
-              <w:t xml:space="preserve">Riley deve risolvere un problema di merge riscontrato al tentativo di pull e poi continuare con lo script delle statistiche, invece Bryan deve fine la </w:t>
-            </w:r>
-            <w:proofErr w:type="spellStart"/>
-            <w:r>
-              <w:rPr>
-                <w:rFonts w:ascii="Arial" w:hAnsi="Arial" w:cs="Arial"/>
-              </w:rPr>
-              <w:t>ui</w:t>
-            </w:r>
-            <w:proofErr w:type="spellEnd"/>
-            <w:r>
-              <w:rPr>
-                <w:rFonts w:ascii="Arial" w:hAnsi="Arial" w:cs="Arial"/>
-              </w:rPr>
-              <w:t xml:space="preserve"> delle statistiche e preferibilmente iniziare con le impostazioni.</w:t>
+              <w:t>Riley deve risolvere un problema di merge riscontrato al tentativo di pull e poi continuare con lo script delle statistiche, invece Bryan deve fine la ui delle statistiche e preferibilmente iniziare con le impostazioni.</w:t>
             </w:r>
           </w:p>
         </w:tc>
@@ -12063,16 +11325,8 @@
               <w:rPr>
                 <w:rFonts w:ascii="Arial" w:hAnsi="Arial" w:cs="Arial"/>
               </w:rPr>
-              <w:t xml:space="preserve">Sprint </w:t>
-            </w:r>
-            <w:proofErr w:type="spellStart"/>
-            <w:r>
-              <w:rPr>
-                <w:rFonts w:ascii="Arial" w:hAnsi="Arial" w:cs="Arial"/>
-              </w:rPr>
-              <w:t>Retrospective</w:t>
-            </w:r>
-            <w:proofErr w:type="spellEnd"/>
+              <w:t>Sprint Retrospective</w:t>
+            </w:r>
           </w:p>
         </w:tc>
       </w:tr>
@@ -12576,21 +11830,7 @@
             <w:rPr>
               <w:rFonts w:ascii="Arial" w:hAnsi="Arial" w:cs="Arial"/>
             </w:rPr>
-            <w:t xml:space="preserve">Ho riscontrato un problema di merge nonostante abbiamo impostato un sistema con un tool </w:t>
-          </w:r>
-          <w:proofErr w:type="spellStart"/>
-          <w:r>
-            <w:rPr>
-              <w:rFonts w:ascii="Arial" w:hAnsi="Arial" w:cs="Arial"/>
-            </w:rPr>
-            <w:t>unity</w:t>
-          </w:r>
-          <w:proofErr w:type="spellEnd"/>
-          <w:r>
-            <w:rPr>
-              <w:rFonts w:ascii="Arial" w:hAnsi="Arial" w:cs="Arial"/>
-            </w:rPr>
-            <w:t>, puoi dirmi cosa analizzare per risolvere?</w:t>
+            <w:t>Ho riscontrato un problema di merge nonostante abbiamo impostato un sistema con un tool unity, puoi dirmi cosa analizzare per risolvere?</w:t>
           </w:r>
         </w:p>
         <w:p>
@@ -12605,21 +11845,7 @@
             <w:rPr>
               <w:rFonts w:ascii="Arial" w:hAnsi="Arial" w:cs="Arial"/>
             </w:rPr>
-            <w:t xml:space="preserve">Bryan: come si implementa un font in </w:t>
-          </w:r>
-          <w:proofErr w:type="spellStart"/>
-          <w:r>
-            <w:rPr>
-              <w:rFonts w:ascii="Arial" w:hAnsi="Arial" w:cs="Arial"/>
-            </w:rPr>
-            <w:t>unity</w:t>
-          </w:r>
-          <w:proofErr w:type="spellEnd"/>
-          <w:r>
-            <w:rPr>
-              <w:rFonts w:ascii="Arial" w:hAnsi="Arial" w:cs="Arial"/>
-            </w:rPr>
-            <w:t>?</w:t>
+            <w:t>Bryan: come si implementa un font in unity?</w:t>
           </w:r>
         </w:p>
       </w:sdtContent>
@@ -13328,49 +12554,7 @@
               <w:rPr>
                 <w:rFonts w:ascii="Arial" w:hAnsi="Arial" w:cs="Arial"/>
               </w:rPr>
-              <w:t xml:space="preserve">Rispetto alla pianificazione abbiamo un leggero ritardo avendo finito solo oggi le statistiche, ma questo risulta recuperabile essendo che lavoriamo separatamente dividendo </w:t>
-            </w:r>
-            <w:proofErr w:type="spellStart"/>
-            <w:r>
-              <w:rPr>
-                <w:rFonts w:ascii="Arial" w:hAnsi="Arial" w:cs="Arial"/>
-              </w:rPr>
-              <w:t>ui</w:t>
-            </w:r>
-            <w:proofErr w:type="spellEnd"/>
-            <w:r>
-              <w:rPr>
-                <w:rFonts w:ascii="Arial" w:hAnsi="Arial" w:cs="Arial"/>
-              </w:rPr>
-              <w:t xml:space="preserve"> e scripting, infatti </w:t>
-            </w:r>
-            <w:proofErr w:type="spellStart"/>
-            <w:r>
-              <w:rPr>
-                <w:rFonts w:ascii="Arial" w:hAnsi="Arial" w:cs="Arial"/>
-              </w:rPr>
-              <w:t>bryan</w:t>
-            </w:r>
-            <w:proofErr w:type="spellEnd"/>
-            <w:r>
-              <w:rPr>
-                <w:rFonts w:ascii="Arial" w:hAnsi="Arial" w:cs="Arial"/>
-              </w:rPr>
-              <w:t xml:space="preserve"> ha iniziato la </w:t>
-            </w:r>
-            <w:proofErr w:type="spellStart"/>
-            <w:r>
-              <w:rPr>
-                <w:rFonts w:ascii="Arial" w:hAnsi="Arial" w:cs="Arial"/>
-              </w:rPr>
-              <w:t>ui</w:t>
-            </w:r>
-            <w:proofErr w:type="spellEnd"/>
-            <w:r>
-              <w:rPr>
-                <w:rFonts w:ascii="Arial" w:hAnsi="Arial" w:cs="Arial"/>
-              </w:rPr>
-              <w:t xml:space="preserve"> delle impostazioni il giorno previsto.</w:t>
+              <w:t>Rispetto alla pianificazione abbiamo un leggero ritardo avendo finito solo oggi le statistiche, ma questo risulta recuperabile essendo che lavoriamo separatamente dividendo ui e scripting, infatti bryan ha iniziato la ui delle impostazioni il giorno previsto.</w:t>
             </w:r>
           </w:p>
         </w:tc>
@@ -13491,28 +12675,12 @@
                 <w:rFonts w:ascii="Arial" w:hAnsi="Arial" w:cs="Arial"/>
               </w:rPr>
             </w:pPr>
-            <w:proofErr w:type="spellStart"/>
-            <w:r>
-              <w:rPr>
-                <w:rFonts w:ascii="Arial" w:hAnsi="Arial" w:cs="Arial"/>
-              </w:rPr>
-              <w:t>Daily</w:t>
-            </w:r>
-            <w:proofErr w:type="spellEnd"/>
-            <w:r>
-              <w:rPr>
-                <w:rFonts w:ascii="Arial" w:hAnsi="Arial" w:cs="Arial"/>
-              </w:rPr>
-              <w:t xml:space="preserve"> </w:t>
-            </w:r>
-            <w:proofErr w:type="spellStart"/>
-            <w:r>
-              <w:rPr>
-                <w:rFonts w:ascii="Arial" w:hAnsi="Arial" w:cs="Arial"/>
-              </w:rPr>
-              <w:t>Scrum</w:t>
-            </w:r>
-            <w:proofErr w:type="spellEnd"/>
+            <w:r>
+              <w:rPr>
+                <w:rFonts w:ascii="Arial" w:hAnsi="Arial" w:cs="Arial"/>
+              </w:rPr>
+              <w:t>Daily Scrum</w:t>
+            </w:r>
           </w:p>
         </w:tc>
       </w:tr>
@@ -13574,21 +12742,7 @@
               <w:rPr>
                 <w:rFonts w:ascii="Arial" w:hAnsi="Arial" w:cs="Arial"/>
               </w:rPr>
-              <w:t xml:space="preserve">Bryan: Finire la </w:t>
-            </w:r>
-            <w:proofErr w:type="spellStart"/>
-            <w:r>
-              <w:rPr>
-                <w:rFonts w:ascii="Arial" w:hAnsi="Arial" w:cs="Arial"/>
-              </w:rPr>
-              <w:t>ui</w:t>
-            </w:r>
-            <w:proofErr w:type="spellEnd"/>
-            <w:r>
-              <w:rPr>
-                <w:rFonts w:ascii="Arial" w:hAnsi="Arial" w:cs="Arial"/>
-              </w:rPr>
-              <w:t xml:space="preserve"> del</w:t>
+              <w:t>Bryan: Finire la ui del</w:t>
             </w:r>
             <w:r>
               <w:rPr>
@@ -13774,16 +12928,8 @@
               <w:rPr>
                 <w:rFonts w:ascii="Arial" w:hAnsi="Arial" w:cs="Arial"/>
               </w:rPr>
-              <w:t xml:space="preserve">Sprint </w:t>
-            </w:r>
-            <w:proofErr w:type="spellStart"/>
-            <w:r>
-              <w:rPr>
-                <w:rFonts w:ascii="Arial" w:hAnsi="Arial" w:cs="Arial"/>
-              </w:rPr>
-              <w:t>Retrospective</w:t>
-            </w:r>
-            <w:proofErr w:type="spellEnd"/>
+              <w:t>Sprint Retrospective</w:t>
+            </w:r>
           </w:p>
         </w:tc>
       </w:tr>
@@ -14275,35 +13421,7 @@
             <w:rPr>
               <w:rFonts w:ascii="Arial" w:hAnsi="Arial" w:cs="Arial"/>
             </w:rPr>
-            <w:t xml:space="preserve">Il numero inserito nel </w:t>
-          </w:r>
-          <w:proofErr w:type="spellStart"/>
-          <w:r>
-            <w:rPr>
-              <w:rFonts w:ascii="Arial" w:hAnsi="Arial" w:cs="Arial"/>
-            </w:rPr>
-            <w:t>json</w:t>
-          </w:r>
-          <w:proofErr w:type="spellEnd"/>
-          <w:r>
-            <w:rPr>
-              <w:rFonts w:ascii="Arial" w:hAnsi="Arial" w:cs="Arial"/>
-            </w:rPr>
-            <w:t xml:space="preserve"> risulta essere un numero che va dal miliardo in su, ma l’applicativo lo riduce a milioni, per caso i valori </w:t>
-          </w:r>
-          <w:proofErr w:type="spellStart"/>
-          <w:r>
-            <w:rPr>
-              <w:rFonts w:ascii="Arial" w:hAnsi="Arial" w:cs="Arial"/>
-            </w:rPr>
-            <w:t>int</w:t>
-          </w:r>
-          <w:proofErr w:type="spellEnd"/>
-          <w:r>
-            <w:rPr>
-              <w:rFonts w:ascii="Arial" w:hAnsi="Arial" w:cs="Arial"/>
-            </w:rPr>
-            <w:t xml:space="preserve"> non supportano i miliardi?</w:t>
+            <w:t>Il numero inserito nel json risulta essere un numero che va dal miliardo in su, ma l’applicativo lo riduce a milioni, per caso i valori int non supportano i miliardi?</w:t>
           </w:r>
           <w:r>
             <w:rPr>
@@ -14392,21 +13510,7 @@
             <w:rPr>
               <w:rFonts w:ascii="Arial" w:hAnsi="Arial" w:cs="Arial"/>
             </w:rPr>
-            <w:t xml:space="preserve">Mi ha detto che </w:t>
-          </w:r>
-          <w:proofErr w:type="spellStart"/>
-          <w:r>
-            <w:rPr>
-              <w:rFonts w:ascii="Arial" w:hAnsi="Arial" w:cs="Arial"/>
-            </w:rPr>
-            <w:t>int</w:t>
-          </w:r>
-          <w:proofErr w:type="spellEnd"/>
-          <w:r>
-            <w:rPr>
-              <w:rFonts w:ascii="Arial" w:hAnsi="Arial" w:cs="Arial"/>
-            </w:rPr>
-            <w:t xml:space="preserve"> supporta i miliardi ma che ha un massimo di circa 2,2 miliardi ed il numero risultava più grande quindi ho ripiegato su un long</w:t>
+            <w:t>Mi ha detto che int supporta i miliardi ma che ha un massimo di circa 2,2 miliardi ed il numero risultava più grande quindi ho ripiegato su un long</w:t>
           </w:r>
         </w:p>
       </w:sdtContent>
@@ -14915,21 +14019,7 @@
               <w:rPr>
                 <w:rFonts w:ascii="Arial" w:hAnsi="Arial" w:cs="Arial"/>
               </w:rPr>
-              <w:t xml:space="preserve">Ho notato come certe impostazioni non sono modificabili con variabili di </w:t>
-            </w:r>
-            <w:proofErr w:type="spellStart"/>
-            <w:r>
-              <w:rPr>
-                <w:rFonts w:ascii="Arial" w:hAnsi="Arial" w:cs="Arial"/>
-              </w:rPr>
-              <w:t>unity</w:t>
-            </w:r>
-            <w:proofErr w:type="spellEnd"/>
-            <w:r>
-              <w:rPr>
-                <w:rFonts w:ascii="Arial" w:hAnsi="Arial" w:cs="Arial"/>
-              </w:rPr>
-              <w:t xml:space="preserve"> e quindi ho usato del tempo per eseguire qualche ricerca.</w:t>
+              <w:t>Ho notato come certe impostazioni non sono modificabili con variabili di unity e quindi ho usato del tempo per eseguire qualche ricerca.</w:t>
             </w:r>
           </w:p>
         </w:tc>
@@ -15133,28 +14223,12 @@
                 <w:rFonts w:ascii="Arial" w:hAnsi="Arial" w:cs="Arial"/>
               </w:rPr>
             </w:pPr>
-            <w:proofErr w:type="spellStart"/>
-            <w:r>
-              <w:rPr>
-                <w:rFonts w:ascii="Arial" w:hAnsi="Arial" w:cs="Arial"/>
-              </w:rPr>
-              <w:t>Daily</w:t>
-            </w:r>
-            <w:proofErr w:type="spellEnd"/>
-            <w:r>
-              <w:rPr>
-                <w:rFonts w:ascii="Arial" w:hAnsi="Arial" w:cs="Arial"/>
-              </w:rPr>
-              <w:t xml:space="preserve"> </w:t>
-            </w:r>
-            <w:proofErr w:type="spellStart"/>
-            <w:r>
-              <w:rPr>
-                <w:rFonts w:ascii="Arial" w:hAnsi="Arial" w:cs="Arial"/>
-              </w:rPr>
-              <w:t>Scrum</w:t>
-            </w:r>
-            <w:proofErr w:type="spellEnd"/>
+            <w:r>
+              <w:rPr>
+                <w:rFonts w:ascii="Arial" w:hAnsi="Arial" w:cs="Arial"/>
+              </w:rPr>
+              <w:t>Daily Scrum</w:t>
+            </w:r>
           </w:p>
         </w:tc>
       </w:tr>
@@ -15402,16 +14476,8 @@
               <w:rPr>
                 <w:rFonts w:ascii="Arial" w:hAnsi="Arial" w:cs="Arial"/>
               </w:rPr>
-              <w:t xml:space="preserve">Sprint </w:t>
-            </w:r>
-            <w:proofErr w:type="spellStart"/>
-            <w:r>
-              <w:rPr>
-                <w:rFonts w:ascii="Arial" w:hAnsi="Arial" w:cs="Arial"/>
-              </w:rPr>
-              <w:t>Retrospective</w:t>
-            </w:r>
-            <w:proofErr w:type="spellEnd"/>
+              <w:t>Sprint Retrospective</w:t>
+            </w:r>
           </w:p>
         </w:tc>
       </w:tr>
@@ -15897,21 +14963,7 @@
             <w:rPr>
               <w:rFonts w:ascii="Arial" w:hAnsi="Arial" w:cs="Arial"/>
             </w:rPr>
-            <w:t xml:space="preserve">Riley: sto creando il file data per le impostazioni con questi valori: “valori”. Puoi dirmi che valore effettivo usa </w:t>
-          </w:r>
-          <w:proofErr w:type="spellStart"/>
-          <w:r>
-            <w:rPr>
-              <w:rFonts w:ascii="Arial" w:hAnsi="Arial" w:cs="Arial"/>
-            </w:rPr>
-            <w:t>unity</w:t>
-          </w:r>
-          <w:proofErr w:type="spellEnd"/>
-          <w:r>
-            <w:rPr>
-              <w:rFonts w:ascii="Arial" w:hAnsi="Arial" w:cs="Arial"/>
-            </w:rPr>
-            <w:t xml:space="preserve">? </w:t>
+            <w:t xml:space="preserve">Riley: sto creando il file data per le impostazioni con questi valori: “valori”. Puoi dirmi che valore effettivo usa unity? </w:t>
           </w:r>
         </w:p>
         <w:p>
@@ -15926,44 +14978,8 @@
             <w:rPr>
               <w:rFonts w:ascii="Arial" w:hAnsi="Arial" w:cs="Arial"/>
             </w:rPr>
-            <w:t xml:space="preserve">Bryan: Come creare un menu con componenti </w:t>
-          </w:r>
-          <w:proofErr w:type="spellStart"/>
-          <w:r>
-            <w:rPr>
-              <w:rFonts w:ascii="Arial" w:hAnsi="Arial" w:cs="Arial"/>
-            </w:rPr>
-            <w:t>ui</w:t>
-          </w:r>
-          <w:proofErr w:type="spellEnd"/>
-          <w:r>
-            <w:rPr>
-              <w:rFonts w:ascii="Arial" w:hAnsi="Arial" w:cs="Arial"/>
-            </w:rPr>
-            <w:t xml:space="preserve"> che si ripetono </w:t>
-          </w:r>
-          <w:proofErr w:type="spellStart"/>
-          <w:r>
-            <w:rPr>
-              <w:rFonts w:ascii="Arial" w:hAnsi="Arial" w:cs="Arial"/>
-            </w:rPr>
-            <w:t>modularmente</w:t>
-          </w:r>
-          <w:proofErr w:type="spellEnd"/>
-          <w:r>
-            <w:rPr>
-              <w:rFonts w:ascii="Arial" w:hAnsi="Arial" w:cs="Arial"/>
-            </w:rPr>
-            <w:t xml:space="preserve"> in </w:t>
-          </w:r>
-          <w:proofErr w:type="spellStart"/>
-          <w:r>
-            <w:rPr>
-              <w:rFonts w:ascii="Arial" w:hAnsi="Arial" w:cs="Arial"/>
-            </w:rPr>
-            <w:t>unity</w:t>
-          </w:r>
-          <w:proofErr w:type="spellEnd"/>
+            <w:t>Bryan: Come creare un menu con componenti ui che si ripetono modularmente in unity</w:t>
+          </w:r>
         </w:p>
       </w:sdtContent>
     </w:sdt>
@@ -16274,16 +15290,8 @@
         <w:rPr>
           <w:rFonts w:ascii="Arial" w:hAnsi="Arial" w:cs="Arial"/>
         </w:rPr>
-        <w:t xml:space="preserve">Bryan: averi cercato un tutorial su </w:t>
-      </w:r>
-      <w:proofErr w:type="spellStart"/>
-      <w:r>
-        <w:rPr>
-          <w:rFonts w:ascii="Arial" w:hAnsi="Arial" w:cs="Arial"/>
-        </w:rPr>
-        <w:t>youtube</w:t>
-      </w:r>
-      <w:proofErr w:type="spellEnd"/>
+        <w:t>Bryan: averi cercato un tutorial su youtube</w:t>
+      </w:r>
     </w:p>
     <w:p>
       <w:pPr>
@@ -16469,16 +15477,8 @@
               <w:rPr>
                 <w:rFonts w:ascii="Arial" w:hAnsi="Arial" w:cs="Arial"/>
               </w:rPr>
-              <w:t xml:space="preserve">Continuato script impostazioni per </w:t>
-            </w:r>
-            <w:proofErr w:type="spellStart"/>
-            <w:r>
-              <w:rPr>
-                <w:rFonts w:ascii="Arial" w:hAnsi="Arial" w:cs="Arial"/>
-              </w:rPr>
-              <w:t>ui</w:t>
-            </w:r>
-            <w:proofErr w:type="spellEnd"/>
+              <w:t>Continuato script impostazioni per ui</w:t>
+            </w:r>
           </w:p>
         </w:tc>
       </w:tr>
@@ -16594,35 +15594,7 @@
               <w:rPr>
                 <w:rFonts w:ascii="Arial" w:hAnsi="Arial" w:cs="Arial"/>
               </w:rPr>
-              <w:t xml:space="preserve">Alcuni problemi con i valori inviati dal </w:t>
-            </w:r>
-            <w:proofErr w:type="spellStart"/>
-            <w:r>
-              <w:rPr>
-                <w:rFonts w:ascii="Arial" w:hAnsi="Arial" w:cs="Arial"/>
-              </w:rPr>
-              <w:t>togglle</w:t>
-            </w:r>
-            <w:proofErr w:type="spellEnd"/>
-            <w:r>
-              <w:rPr>
-                <w:rFonts w:ascii="Arial" w:hAnsi="Arial" w:cs="Arial"/>
-              </w:rPr>
-              <w:t xml:space="preserve"> per </w:t>
-            </w:r>
-            <w:proofErr w:type="spellStart"/>
-            <w:r>
-              <w:rPr>
-                <w:rFonts w:ascii="Arial" w:hAnsi="Arial" w:cs="Arial"/>
-              </w:rPr>
-              <w:t>fullscreen</w:t>
-            </w:r>
-            <w:proofErr w:type="spellEnd"/>
-            <w:r>
-              <w:rPr>
-                <w:rFonts w:ascii="Arial" w:hAnsi="Arial" w:cs="Arial"/>
-              </w:rPr>
-              <w:t xml:space="preserve">, scoperto che avevo selezionato un valore statico e non dinamico dell’elemento </w:t>
+              <w:t xml:space="preserve">Alcuni problemi con i valori inviati dal togglle per fullscreen, scoperto che avevo selezionato un valore statico e non dinamico dell’elemento </w:t>
             </w:r>
           </w:p>
         </w:tc>
@@ -16788,21 +15760,7 @@
               <w:rPr>
                 <w:rFonts w:ascii="Arial" w:hAnsi="Arial" w:cs="Arial"/>
               </w:rPr>
-              <w:t xml:space="preserve"> iniziare a creare il </w:t>
-            </w:r>
-            <w:proofErr w:type="spellStart"/>
-            <w:r>
-              <w:rPr>
-                <w:rFonts w:ascii="Arial" w:hAnsi="Arial" w:cs="Arial"/>
-              </w:rPr>
-              <w:t>db</w:t>
-            </w:r>
-            <w:proofErr w:type="spellEnd"/>
-            <w:r>
-              <w:rPr>
-                <w:rFonts w:ascii="Arial" w:hAnsi="Arial" w:cs="Arial"/>
-              </w:rPr>
-              <w:t xml:space="preserve"> effettivo</w:t>
+              <w:t xml:space="preserve"> iniziare a creare il db effettivo</w:t>
             </w:r>
             <w:r>
               <w:rPr>
@@ -16858,28 +15816,12 @@
                 <w:rFonts w:ascii="Arial" w:hAnsi="Arial" w:cs="Arial"/>
               </w:rPr>
             </w:pPr>
-            <w:proofErr w:type="spellStart"/>
-            <w:r>
-              <w:rPr>
-                <w:rFonts w:ascii="Arial" w:hAnsi="Arial" w:cs="Arial"/>
-              </w:rPr>
-              <w:t>Daily</w:t>
-            </w:r>
-            <w:proofErr w:type="spellEnd"/>
-            <w:r>
-              <w:rPr>
-                <w:rFonts w:ascii="Arial" w:hAnsi="Arial" w:cs="Arial"/>
-              </w:rPr>
-              <w:t xml:space="preserve"> </w:t>
-            </w:r>
-            <w:proofErr w:type="spellStart"/>
-            <w:r>
-              <w:rPr>
-                <w:rFonts w:ascii="Arial" w:hAnsi="Arial" w:cs="Arial"/>
-              </w:rPr>
-              <w:t>Scrum</w:t>
-            </w:r>
-            <w:proofErr w:type="spellEnd"/>
+            <w:r>
+              <w:rPr>
+                <w:rFonts w:ascii="Arial" w:hAnsi="Arial" w:cs="Arial"/>
+              </w:rPr>
+              <w:t>Daily Scrum</w:t>
+            </w:r>
           </w:p>
         </w:tc>
       </w:tr>
@@ -16933,16 +15875,8 @@
               <w:rPr>
                 <w:rFonts w:ascii="Arial" w:hAnsi="Arial" w:cs="Arial"/>
               </w:rPr>
-              <w:t xml:space="preserve"> Terminare l’applicazione delle impostazioni nella </w:t>
-            </w:r>
-            <w:proofErr w:type="spellStart"/>
-            <w:r>
-              <w:rPr>
-                <w:rFonts w:ascii="Arial" w:hAnsi="Arial" w:cs="Arial"/>
-              </w:rPr>
-              <w:t>ui</w:t>
-            </w:r>
-            <w:proofErr w:type="spellEnd"/>
+              <w:t xml:space="preserve"> Terminare l’applicazione delle impostazioni nella ui</w:t>
+            </w:r>
           </w:p>
           <w:p>
             <w:pPr>
@@ -17153,16 +16087,8 @@
               <w:rPr>
                 <w:rFonts w:ascii="Arial" w:hAnsi="Arial" w:cs="Arial"/>
               </w:rPr>
-              <w:t xml:space="preserve">Sprint </w:t>
-            </w:r>
-            <w:proofErr w:type="spellStart"/>
-            <w:r>
-              <w:rPr>
-                <w:rFonts w:ascii="Arial" w:hAnsi="Arial" w:cs="Arial"/>
-              </w:rPr>
-              <w:t>Retrospective</w:t>
-            </w:r>
-            <w:proofErr w:type="spellEnd"/>
+              <w:t>Sprint Retrospective</w:t>
+            </w:r>
           </w:p>
         </w:tc>
       </w:tr>
@@ -18463,33 +17389,11 @@
                 <w:rFonts w:ascii="Arial" w:hAnsi="Arial" w:cs="Arial"/>
               </w:rPr>
             </w:pPr>
-            <w:proofErr w:type="spellStart"/>
-            <w:r>
-              <w:rPr>
-                <w:rFonts w:ascii="Arial" w:hAnsi="Arial" w:cs="Arial"/>
-              </w:rPr>
-              <w:t>Brayn</w:t>
-            </w:r>
-            <w:proofErr w:type="spellEnd"/>
-            <w:r>
-              <w:rPr>
-                <w:rFonts w:ascii="Arial" w:hAnsi="Arial" w:cs="Arial"/>
-              </w:rPr>
-              <w:t xml:space="preserve"> continuerà con lo sviluppo della mappa mentre Riley svilupperà il </w:t>
-            </w:r>
-            <w:proofErr w:type="spellStart"/>
-            <w:r>
-              <w:rPr>
-                <w:rFonts w:ascii="Arial" w:hAnsi="Arial" w:cs="Arial"/>
-              </w:rPr>
-              <w:t>db</w:t>
-            </w:r>
-            <w:proofErr w:type="spellEnd"/>
-            <w:r>
-              <w:rPr>
-                <w:rFonts w:ascii="Arial" w:hAnsi="Arial" w:cs="Arial"/>
-              </w:rPr>
-              <w:t xml:space="preserve"> effettivo</w:t>
+            <w:r>
+              <w:rPr>
+                <w:rFonts w:ascii="Arial" w:hAnsi="Arial" w:cs="Arial"/>
+              </w:rPr>
+              <w:t>Brayn continuerà con lo sviluppo della mappa mentre Riley svilupperà il db effettivo</w:t>
             </w:r>
           </w:p>
         </w:tc>
@@ -18539,28 +17443,12 @@
                 <w:rFonts w:ascii="Arial" w:hAnsi="Arial" w:cs="Arial"/>
               </w:rPr>
             </w:pPr>
-            <w:proofErr w:type="spellStart"/>
-            <w:r>
-              <w:rPr>
-                <w:rFonts w:ascii="Arial" w:hAnsi="Arial" w:cs="Arial"/>
-              </w:rPr>
-              <w:t>Daily</w:t>
-            </w:r>
-            <w:proofErr w:type="spellEnd"/>
-            <w:r>
-              <w:rPr>
-                <w:rFonts w:ascii="Arial" w:hAnsi="Arial" w:cs="Arial"/>
-              </w:rPr>
-              <w:t xml:space="preserve"> </w:t>
-            </w:r>
-            <w:proofErr w:type="spellStart"/>
-            <w:r>
-              <w:rPr>
-                <w:rFonts w:ascii="Arial" w:hAnsi="Arial" w:cs="Arial"/>
-              </w:rPr>
-              <w:t>Scrum</w:t>
-            </w:r>
-            <w:proofErr w:type="spellEnd"/>
+            <w:r>
+              <w:rPr>
+                <w:rFonts w:ascii="Arial" w:hAnsi="Arial" w:cs="Arial"/>
+              </w:rPr>
+              <w:t>Daily Scrum</w:t>
+            </w:r>
           </w:p>
         </w:tc>
       </w:tr>
@@ -18608,16 +17496,8 @@
               <w:rPr>
                 <w:rFonts w:ascii="Arial" w:hAnsi="Arial" w:cs="Arial"/>
               </w:rPr>
-              <w:t xml:space="preserve">Riley: Terminare l’applicazione delle impostazioni nella </w:t>
-            </w:r>
-            <w:proofErr w:type="spellStart"/>
-            <w:r>
-              <w:rPr>
-                <w:rFonts w:ascii="Arial" w:hAnsi="Arial" w:cs="Arial"/>
-              </w:rPr>
-              <w:t>ui</w:t>
-            </w:r>
-            <w:proofErr w:type="spellEnd"/>
+              <w:t>Riley: Terminare l’applicazione delle impostazioni nella ui</w:t>
+            </w:r>
           </w:p>
           <w:p>
             <w:pPr>
@@ -18816,16 +17696,8 @@
               <w:rPr>
                 <w:rFonts w:ascii="Arial" w:hAnsi="Arial" w:cs="Arial"/>
               </w:rPr>
-              <w:t xml:space="preserve">Sprint </w:t>
-            </w:r>
-            <w:proofErr w:type="spellStart"/>
-            <w:r>
-              <w:rPr>
-                <w:rFonts w:ascii="Arial" w:hAnsi="Arial" w:cs="Arial"/>
-              </w:rPr>
-              <w:t>Retrospective</w:t>
-            </w:r>
-            <w:proofErr w:type="spellEnd"/>
+              <w:t>Sprint Retrospective</w:t>
+            </w:r>
           </w:p>
         </w:tc>
       </w:tr>
@@ -19322,21 +18194,7 @@
             <w:rPr>
               <w:rFonts w:ascii="Arial" w:hAnsi="Arial" w:cs="Arial"/>
             </w:rPr>
-            <w:t xml:space="preserve">Lo script </w:t>
-          </w:r>
-          <w:proofErr w:type="spellStart"/>
-          <w:r>
-            <w:rPr>
-              <w:rFonts w:ascii="Arial" w:hAnsi="Arial" w:cs="Arial"/>
-            </w:rPr>
-            <w:t>SettingsUI</w:t>
-          </w:r>
-          <w:proofErr w:type="spellEnd"/>
-          <w:r>
-            <w:rPr>
-              <w:rFonts w:ascii="Arial" w:hAnsi="Arial" w:cs="Arial"/>
-            </w:rPr>
-            <w:t xml:space="preserve"> sembra essersi isolato dal resto del codice, cosa potrebbe essere la causa?</w:t>
+            <w:t>Lo script SettingsUI sembra essersi isolato dal resto del codice, cosa potrebbe essere la causa?</w:t>
           </w:r>
         </w:p>
         <w:p>
@@ -19867,30 +18725,8 @@
               <w:rPr>
                 <w:rFonts w:ascii="Arial" w:hAnsi="Arial" w:cs="Arial"/>
               </w:rPr>
-              <w:t xml:space="preserve">Inizio sviluppo </w:t>
-            </w:r>
-            <w:proofErr w:type="spellStart"/>
-            <w:r>
-              <w:rPr>
-                <w:rFonts w:ascii="Arial" w:hAnsi="Arial" w:cs="Arial"/>
-              </w:rPr>
-              <w:t>db</w:t>
-            </w:r>
-            <w:proofErr w:type="spellEnd"/>
-            <w:r>
-              <w:rPr>
-                <w:rFonts w:ascii="Arial" w:hAnsi="Arial" w:cs="Arial"/>
-              </w:rPr>
-              <w:t xml:space="preserve"> </w:t>
-            </w:r>
-            <w:proofErr w:type="spellStart"/>
-            <w:r>
-              <w:rPr>
-                <w:rFonts w:ascii="Arial" w:hAnsi="Arial" w:cs="Arial"/>
-              </w:rPr>
-              <w:t>sqlite</w:t>
-            </w:r>
-            <w:proofErr w:type="spellEnd"/>
+              <w:t>Inizio sviluppo db sqlite</w:t>
+            </w:r>
           </w:p>
         </w:tc>
       </w:tr>
@@ -20102,16 +18938,8 @@
               <w:rPr>
                 <w:rFonts w:ascii="Arial" w:hAnsi="Arial" w:cs="Arial"/>
               </w:rPr>
-              <w:t xml:space="preserve">Siamo in largo anticipo, per questo motivo Riley ha cominciato a creare un vero </w:t>
-            </w:r>
-            <w:proofErr w:type="spellStart"/>
-            <w:r>
-              <w:rPr>
-                <w:rFonts w:ascii="Arial" w:hAnsi="Arial" w:cs="Arial"/>
-              </w:rPr>
-              <w:t>db</w:t>
-            </w:r>
-            <w:proofErr w:type="spellEnd"/>
+              <w:t>Siamo in largo anticipo, per questo motivo Riley ha cominciato a creare un vero db</w:t>
+            </w:r>
           </w:p>
         </w:tc>
       </w:tr>
@@ -20168,21 +18996,7 @@
               <w:rPr>
                 <w:rFonts w:ascii="Arial" w:hAnsi="Arial" w:cs="Arial"/>
               </w:rPr>
-              <w:t xml:space="preserve">Continuare rispettivamente lo sviluppo del </w:t>
-            </w:r>
-            <w:proofErr w:type="spellStart"/>
-            <w:r>
-              <w:rPr>
-                <w:rFonts w:ascii="Arial" w:hAnsi="Arial" w:cs="Arial"/>
-              </w:rPr>
-              <w:t>db</w:t>
-            </w:r>
-            <w:proofErr w:type="spellEnd"/>
-            <w:r>
-              <w:rPr>
-                <w:rFonts w:ascii="Arial" w:hAnsi="Arial" w:cs="Arial"/>
-              </w:rPr>
-              <w:t xml:space="preserve"> e della mappa</w:t>
+              <w:t>Continuare rispettivamente lo sviluppo del db e della mappa</w:t>
             </w:r>
           </w:p>
         </w:tc>
@@ -20232,28 +19046,12 @@
                 <w:rFonts w:ascii="Arial" w:hAnsi="Arial" w:cs="Arial"/>
               </w:rPr>
             </w:pPr>
-            <w:proofErr w:type="spellStart"/>
-            <w:r>
-              <w:rPr>
-                <w:rFonts w:ascii="Arial" w:hAnsi="Arial" w:cs="Arial"/>
-              </w:rPr>
-              <w:t>Daily</w:t>
-            </w:r>
-            <w:proofErr w:type="spellEnd"/>
-            <w:r>
-              <w:rPr>
-                <w:rFonts w:ascii="Arial" w:hAnsi="Arial" w:cs="Arial"/>
-              </w:rPr>
-              <w:t xml:space="preserve"> </w:t>
-            </w:r>
-            <w:proofErr w:type="spellStart"/>
-            <w:r>
-              <w:rPr>
-                <w:rFonts w:ascii="Arial" w:hAnsi="Arial" w:cs="Arial"/>
-              </w:rPr>
-              <w:t>Scrum</w:t>
-            </w:r>
-            <w:proofErr w:type="spellEnd"/>
+            <w:r>
+              <w:rPr>
+                <w:rFonts w:ascii="Arial" w:hAnsi="Arial" w:cs="Arial"/>
+              </w:rPr>
+              <w:t>Daily Scrum</w:t>
+            </w:r>
           </w:p>
         </w:tc>
       </w:tr>
@@ -20301,16 +19099,8 @@
               <w:rPr>
                 <w:rFonts w:ascii="Arial" w:hAnsi="Arial" w:cs="Arial"/>
               </w:rPr>
-              <w:t xml:space="preserve">Riley: Inizio sviluppo </w:t>
-            </w:r>
-            <w:proofErr w:type="spellStart"/>
-            <w:r>
-              <w:rPr>
-                <w:rFonts w:ascii="Arial" w:hAnsi="Arial" w:cs="Arial"/>
-              </w:rPr>
-              <w:t>db</w:t>
-            </w:r>
-            <w:proofErr w:type="spellEnd"/>
+              <w:t>Riley: Inizio sviluppo db</w:t>
+            </w:r>
           </w:p>
           <w:p>
             <w:pPr>
@@ -20503,16 +19293,8 @@
               <w:rPr>
                 <w:rFonts w:ascii="Arial" w:hAnsi="Arial" w:cs="Arial"/>
               </w:rPr>
-              <w:t xml:space="preserve">Sprint </w:t>
-            </w:r>
-            <w:proofErr w:type="spellStart"/>
-            <w:r>
-              <w:rPr>
-                <w:rFonts w:ascii="Arial" w:hAnsi="Arial" w:cs="Arial"/>
-              </w:rPr>
-              <w:t>Retrospective</w:t>
-            </w:r>
-            <w:proofErr w:type="spellEnd"/>
+              <w:t>Sprint Retrospective</w:t>
+            </w:r>
           </w:p>
         </w:tc>
       </w:tr>
@@ -20740,25 +19522,7 @@
               <w:b/>
               <w:bCs/>
             </w:rPr>
-            <w:t xml:space="preserve">Nomi </w:t>
-          </w:r>
-          <w:proofErr w:type="gramStart"/>
-          <w:r>
-            <w:rPr>
-              <w:rStyle w:val="Testosegnaposto"/>
-              <w:b/>
-              <w:bCs/>
-            </w:rPr>
-            <w:t>AI</w:t>
-          </w:r>
-          <w:proofErr w:type="gramEnd"/>
-          <w:r>
-            <w:rPr>
-              <w:rStyle w:val="Testosegnaposto"/>
-              <w:b/>
-              <w:bCs/>
-            </w:rPr>
-            <w:t xml:space="preserve"> utilizzati</w:t>
+            <w:t>Nomi AI utilizzati</w:t>
           </w:r>
         </w:sdtContent>
       </w:sdt>
@@ -21756,21 +20520,7 @@
               <w:rPr>
                 <w:rFonts w:ascii="Arial" w:hAnsi="Arial" w:cs="Arial"/>
               </w:rPr>
-              <w:t xml:space="preserve">Rispetto al pianificato abbiamo qualche giornata, di lavoro, di anticipo infatti stiamo principalmente aggiungendo dettagli lavorando con un ritmo adeguato e sviluppando già un </w:t>
-            </w:r>
-            <w:proofErr w:type="spellStart"/>
-            <w:r>
-              <w:rPr>
-                <w:rFonts w:ascii="Arial" w:hAnsi="Arial" w:cs="Arial"/>
-              </w:rPr>
-              <w:t>db</w:t>
-            </w:r>
-            <w:proofErr w:type="spellEnd"/>
-            <w:r>
-              <w:rPr>
-                <w:rFonts w:ascii="Arial" w:hAnsi="Arial" w:cs="Arial"/>
-              </w:rPr>
-              <w:t xml:space="preserve"> più reale</w:t>
+              <w:t>Rispetto al pianificato abbiamo qualche giornata, di lavoro, di anticipo infatti stiamo principalmente aggiungendo dettagli lavorando con un ritmo adeguato e sviluppando già un db più reale</w:t>
             </w:r>
           </w:p>
         </w:tc>
@@ -21828,16 +20578,8 @@
               <w:rPr>
                 <w:rFonts w:ascii="Arial" w:hAnsi="Arial" w:cs="Arial"/>
               </w:rPr>
-              <w:t xml:space="preserve">Procedere con i vari l’aggiunta di dettagli e del </w:t>
-            </w:r>
-            <w:proofErr w:type="spellStart"/>
-            <w:r>
-              <w:rPr>
-                <w:rFonts w:ascii="Arial" w:hAnsi="Arial" w:cs="Arial"/>
-              </w:rPr>
-              <w:t>db</w:t>
-            </w:r>
-            <w:proofErr w:type="spellEnd"/>
+              <w:t>Procedere con i vari l’aggiunta di dettagli e del db</w:t>
+            </w:r>
           </w:p>
         </w:tc>
       </w:tr>
@@ -21886,28 +20628,12 @@
                 <w:rFonts w:ascii="Arial" w:hAnsi="Arial" w:cs="Arial"/>
               </w:rPr>
             </w:pPr>
-            <w:proofErr w:type="spellStart"/>
-            <w:r>
-              <w:rPr>
-                <w:rFonts w:ascii="Arial" w:hAnsi="Arial" w:cs="Arial"/>
-              </w:rPr>
-              <w:t>Daily</w:t>
-            </w:r>
-            <w:proofErr w:type="spellEnd"/>
-            <w:r>
-              <w:rPr>
-                <w:rFonts w:ascii="Arial" w:hAnsi="Arial" w:cs="Arial"/>
-              </w:rPr>
-              <w:t xml:space="preserve"> </w:t>
-            </w:r>
-            <w:proofErr w:type="spellStart"/>
-            <w:r>
-              <w:rPr>
-                <w:rFonts w:ascii="Arial" w:hAnsi="Arial" w:cs="Arial"/>
-              </w:rPr>
-              <w:t>Scrum</w:t>
-            </w:r>
-            <w:proofErr w:type="spellEnd"/>
+            <w:r>
+              <w:rPr>
+                <w:rFonts w:ascii="Arial" w:hAnsi="Arial" w:cs="Arial"/>
+              </w:rPr>
+              <w:t>Daily Scrum</w:t>
+            </w:r>
           </w:p>
         </w:tc>
       </w:tr>
@@ -21967,16 +20693,8 @@
               <w:rPr>
                 <w:rFonts w:ascii="Arial" w:hAnsi="Arial" w:cs="Arial"/>
               </w:rPr>
-              <w:t xml:space="preserve">ontinuo sviluppo </w:t>
-            </w:r>
-            <w:proofErr w:type="spellStart"/>
-            <w:r>
-              <w:rPr>
-                <w:rFonts w:ascii="Arial" w:hAnsi="Arial" w:cs="Arial"/>
-              </w:rPr>
-              <w:t>db</w:t>
-            </w:r>
-            <w:proofErr w:type="spellEnd"/>
+              <w:t>ontinuo sviluppo db</w:t>
+            </w:r>
           </w:p>
           <w:p>
             <w:pPr>
@@ -22169,16 +20887,8 @@
               <w:rPr>
                 <w:rFonts w:ascii="Arial" w:hAnsi="Arial" w:cs="Arial"/>
               </w:rPr>
-              <w:t xml:space="preserve">Sprint </w:t>
-            </w:r>
-            <w:proofErr w:type="spellStart"/>
-            <w:r>
-              <w:rPr>
-                <w:rFonts w:ascii="Arial" w:hAnsi="Arial" w:cs="Arial"/>
-              </w:rPr>
-              <w:t>Retrospective</w:t>
-            </w:r>
-            <w:proofErr w:type="spellEnd"/>
+              <w:t>Sprint Retrospective</w:t>
+            </w:r>
           </w:p>
         </w:tc>
       </w:tr>
@@ -22681,35 +21391,7 @@
             <w:rPr>
               <w:rFonts w:ascii="Arial" w:hAnsi="Arial" w:cs="Arial"/>
             </w:rPr>
-            <w:t xml:space="preserve">non ho fatto dei veri e propri </w:t>
-          </w:r>
-          <w:proofErr w:type="spellStart"/>
-          <w:r>
-            <w:rPr>
-              <w:rFonts w:ascii="Arial" w:hAnsi="Arial" w:cs="Arial"/>
-            </w:rPr>
-            <w:t>promt</w:t>
-          </w:r>
-          <w:proofErr w:type="spellEnd"/>
-          <w:r>
-            <w:rPr>
-              <w:rFonts w:ascii="Arial" w:hAnsi="Arial" w:cs="Arial"/>
-            </w:rPr>
-            <w:t xml:space="preserve"> oggi, ma mi sono cimentato nel procedere con una spiegazione guidata per applicare </w:t>
-          </w:r>
-          <w:proofErr w:type="spellStart"/>
-          <w:r>
-            <w:rPr>
-              <w:rFonts w:ascii="Arial" w:hAnsi="Arial" w:cs="Arial"/>
-            </w:rPr>
-            <w:t>SQLite</w:t>
-          </w:r>
-          <w:proofErr w:type="spellEnd"/>
-          <w:r>
-            <w:rPr>
-              <w:rFonts w:ascii="Arial" w:hAnsi="Arial" w:cs="Arial"/>
-            </w:rPr>
-            <w:t xml:space="preserve"> alla base di dati sviluppata finora.</w:t>
+            <w:t>non ho fatto dei veri e propri promt oggi, ma mi sono cimentato nel procedere con una spiegazione guidata per applicare SQLite alla base di dati sviluppata finora.</w:t>
           </w:r>
         </w:p>
         <w:p>
@@ -23302,21 +21984,7 @@
               <w:rPr>
                 <w:rFonts w:ascii="Arial" w:hAnsi="Arial" w:cs="Arial"/>
               </w:rPr>
-              <w:t xml:space="preserve">Ho sistemato un problema di animazione, creato </w:t>
-            </w:r>
-            <w:proofErr w:type="gramStart"/>
-            <w:r>
-              <w:rPr>
-                <w:rFonts w:ascii="Arial" w:hAnsi="Arial" w:cs="Arial"/>
-              </w:rPr>
-              <w:t>il build</w:t>
-            </w:r>
-            <w:proofErr w:type="gramEnd"/>
-            <w:r>
-              <w:rPr>
-                <w:rFonts w:ascii="Arial" w:hAnsi="Arial" w:cs="Arial"/>
-              </w:rPr>
-              <w:t xml:space="preserve"> del progetto per certi test, ricerca modifica materiali auto ed inizio menu garage</w:t>
+              <w:t>Ho sistemato un problema di animazione, creato il build del progetto per certi test, ricerca modifica materiali auto ed inizio menu garage</w:t>
             </w:r>
           </w:p>
         </w:tc>
@@ -23549,21 +22217,7 @@
               <w:rPr>
                 <w:rFonts w:ascii="Arial" w:hAnsi="Arial" w:cs="Arial"/>
               </w:rPr>
-              <w:t xml:space="preserve">Continuare sviluppo garage e </w:t>
-            </w:r>
-            <w:proofErr w:type="spellStart"/>
-            <w:r>
-              <w:rPr>
-                <w:rFonts w:ascii="Arial" w:hAnsi="Arial" w:cs="Arial"/>
-              </w:rPr>
-              <w:t>db</w:t>
-            </w:r>
-            <w:proofErr w:type="spellEnd"/>
-            <w:r>
-              <w:rPr>
-                <w:rFonts w:ascii="Arial" w:hAnsi="Arial" w:cs="Arial"/>
-              </w:rPr>
-              <w:t>.</w:t>
+              <w:t>Continuare sviluppo garage e db.</w:t>
             </w:r>
           </w:p>
         </w:tc>
@@ -23613,28 +22267,12 @@
                 <w:rFonts w:ascii="Arial" w:hAnsi="Arial" w:cs="Arial"/>
               </w:rPr>
             </w:pPr>
-            <w:proofErr w:type="spellStart"/>
-            <w:r>
-              <w:rPr>
-                <w:rFonts w:ascii="Arial" w:hAnsi="Arial" w:cs="Arial"/>
-              </w:rPr>
-              <w:t>Daily</w:t>
-            </w:r>
-            <w:proofErr w:type="spellEnd"/>
-            <w:r>
-              <w:rPr>
-                <w:rFonts w:ascii="Arial" w:hAnsi="Arial" w:cs="Arial"/>
-              </w:rPr>
-              <w:t xml:space="preserve"> </w:t>
-            </w:r>
-            <w:proofErr w:type="spellStart"/>
-            <w:r>
-              <w:rPr>
-                <w:rFonts w:ascii="Arial" w:hAnsi="Arial" w:cs="Arial"/>
-              </w:rPr>
-              <w:t>Scrum</w:t>
-            </w:r>
-            <w:proofErr w:type="spellEnd"/>
+            <w:r>
+              <w:rPr>
+                <w:rFonts w:ascii="Arial" w:hAnsi="Arial" w:cs="Arial"/>
+              </w:rPr>
+              <w:t>Daily Scrum</w:t>
+            </w:r>
           </w:p>
         </w:tc>
       </w:tr>
@@ -23682,16 +22320,8 @@
               <w:rPr>
                 <w:rFonts w:ascii="Arial" w:hAnsi="Arial" w:cs="Arial"/>
               </w:rPr>
-              <w:t xml:space="preserve">Riley: Continuo sviluppo </w:t>
-            </w:r>
-            <w:proofErr w:type="spellStart"/>
-            <w:r>
-              <w:rPr>
-                <w:rFonts w:ascii="Arial" w:hAnsi="Arial" w:cs="Arial"/>
-              </w:rPr>
-              <w:t>db</w:t>
-            </w:r>
-            <w:proofErr w:type="spellEnd"/>
+              <w:t>Riley: Continuo sviluppo db</w:t>
+            </w:r>
           </w:p>
           <w:p>
             <w:pPr>
@@ -23884,16 +22514,8 @@
               <w:rPr>
                 <w:rFonts w:ascii="Arial" w:hAnsi="Arial" w:cs="Arial"/>
               </w:rPr>
-              <w:t xml:space="preserve">Sprint </w:t>
-            </w:r>
-            <w:proofErr w:type="spellStart"/>
-            <w:r>
-              <w:rPr>
-                <w:rFonts w:ascii="Arial" w:hAnsi="Arial" w:cs="Arial"/>
-              </w:rPr>
-              <w:t>Retrospective</w:t>
-            </w:r>
-            <w:proofErr w:type="spellEnd"/>
+              <w:t>Sprint Retrospective</w:t>
+            </w:r>
           </w:p>
         </w:tc>
       </w:tr>
@@ -24121,25 +22743,7 @@
               <w:b/>
               <w:bCs/>
             </w:rPr>
-            <w:t xml:space="preserve">Nomi </w:t>
-          </w:r>
-          <w:proofErr w:type="gramStart"/>
-          <w:r>
-            <w:rPr>
-              <w:rStyle w:val="Testosegnaposto"/>
-              <w:b/>
-              <w:bCs/>
-            </w:rPr>
-            <w:t>AI</w:t>
-          </w:r>
-          <w:proofErr w:type="gramEnd"/>
-          <w:r>
-            <w:rPr>
-              <w:rStyle w:val="Testosegnaposto"/>
-              <w:b/>
-              <w:bCs/>
-            </w:rPr>
-            <w:t xml:space="preserve"> utilizzati</w:t>
+            <w:t>Nomi AI utilizzati</w:t>
           </w:r>
         </w:sdtContent>
       </w:sdt>
@@ -24918,16 +23522,8 @@
               <w:rPr>
                 <w:rFonts w:ascii="Arial" w:hAnsi="Arial" w:cs="Arial"/>
               </w:rPr>
-              <w:t xml:space="preserve">Continuato lo sviluppo del </w:t>
-            </w:r>
-            <w:proofErr w:type="spellStart"/>
-            <w:r>
-              <w:rPr>
-                <w:rFonts w:ascii="Arial" w:hAnsi="Arial" w:cs="Arial"/>
-              </w:rPr>
-              <w:t>db</w:t>
-            </w:r>
-            <w:proofErr w:type="spellEnd"/>
+              <w:t>Continuato lo sviluppo del db</w:t>
+            </w:r>
           </w:p>
         </w:tc>
       </w:tr>
@@ -25197,35 +23793,7 @@
               <w:rPr>
                 <w:rFonts w:ascii="Arial" w:hAnsi="Arial" w:cs="Arial"/>
               </w:rPr>
-              <w:t xml:space="preserve">Continuare ognuno con </w:t>
-            </w:r>
-            <w:proofErr w:type="gramStart"/>
-            <w:r>
-              <w:rPr>
-                <w:rFonts w:ascii="Arial" w:hAnsi="Arial" w:cs="Arial"/>
-              </w:rPr>
-              <w:t>i</w:t>
-            </w:r>
-            <w:proofErr w:type="gramEnd"/>
-            <w:r>
-              <w:rPr>
-                <w:rFonts w:ascii="Arial" w:hAnsi="Arial" w:cs="Arial"/>
-              </w:rPr>
-              <w:t xml:space="preserve"> sviluppi di </w:t>
-            </w:r>
-            <w:proofErr w:type="spellStart"/>
-            <w:r>
-              <w:rPr>
-                <w:rFonts w:ascii="Arial" w:hAnsi="Arial" w:cs="Arial"/>
-              </w:rPr>
-              <w:t>db</w:t>
-            </w:r>
-            <w:proofErr w:type="spellEnd"/>
-            <w:r>
-              <w:rPr>
-                <w:rFonts w:ascii="Arial" w:hAnsi="Arial" w:cs="Arial"/>
-              </w:rPr>
-              <w:t xml:space="preserve"> e garage</w:t>
+              <w:t>Continuare ognuno con i sviluppi di db e garage</w:t>
             </w:r>
           </w:p>
         </w:tc>
@@ -25275,28 +23843,12 @@
                 <w:rFonts w:ascii="Arial" w:hAnsi="Arial" w:cs="Arial"/>
               </w:rPr>
             </w:pPr>
-            <w:proofErr w:type="spellStart"/>
-            <w:r>
-              <w:rPr>
-                <w:rFonts w:ascii="Arial" w:hAnsi="Arial" w:cs="Arial"/>
-              </w:rPr>
-              <w:t>Daily</w:t>
-            </w:r>
-            <w:proofErr w:type="spellEnd"/>
-            <w:r>
-              <w:rPr>
-                <w:rFonts w:ascii="Arial" w:hAnsi="Arial" w:cs="Arial"/>
-              </w:rPr>
-              <w:t xml:space="preserve"> </w:t>
-            </w:r>
-            <w:proofErr w:type="spellStart"/>
-            <w:r>
-              <w:rPr>
-                <w:rFonts w:ascii="Arial" w:hAnsi="Arial" w:cs="Arial"/>
-              </w:rPr>
-              <w:t>Scrum</w:t>
-            </w:r>
-            <w:proofErr w:type="spellEnd"/>
+            <w:r>
+              <w:rPr>
+                <w:rFonts w:ascii="Arial" w:hAnsi="Arial" w:cs="Arial"/>
+              </w:rPr>
+              <w:t>Daily Scrum</w:t>
+            </w:r>
           </w:p>
         </w:tc>
       </w:tr>
@@ -25344,16 +23896,8 @@
               <w:rPr>
                 <w:rFonts w:ascii="Arial" w:hAnsi="Arial" w:cs="Arial"/>
               </w:rPr>
-              <w:t xml:space="preserve">Riley: Continuo sviluppo </w:t>
-            </w:r>
-            <w:proofErr w:type="spellStart"/>
-            <w:r>
-              <w:rPr>
-                <w:rFonts w:ascii="Arial" w:hAnsi="Arial" w:cs="Arial"/>
-              </w:rPr>
-              <w:t>db</w:t>
-            </w:r>
-            <w:proofErr w:type="spellEnd"/>
+              <w:t>Riley: Continuo sviluppo db</w:t>
+            </w:r>
           </w:p>
           <w:p>
             <w:pPr>
@@ -25546,16 +24090,8 @@
               <w:rPr>
                 <w:rFonts w:ascii="Arial" w:hAnsi="Arial" w:cs="Arial"/>
               </w:rPr>
-              <w:t xml:space="preserve">Sprint </w:t>
-            </w:r>
-            <w:proofErr w:type="spellStart"/>
-            <w:r>
-              <w:rPr>
-                <w:rFonts w:ascii="Arial" w:hAnsi="Arial" w:cs="Arial"/>
-              </w:rPr>
-              <w:t>Retrospective</w:t>
-            </w:r>
-            <w:proofErr w:type="spellEnd"/>
+              <w:t>Sprint Retrospective</w:t>
+            </w:r>
           </w:p>
         </w:tc>
       </w:tr>
@@ -26052,21 +24588,7 @@
             <w:rPr>
               <w:rFonts w:ascii="Arial" w:hAnsi="Arial" w:cs="Arial"/>
             </w:rPr>
-            <w:t xml:space="preserve">Dovrei introdurre nel </w:t>
-          </w:r>
-          <w:proofErr w:type="spellStart"/>
-          <w:r>
-            <w:rPr>
-              <w:rFonts w:ascii="Arial" w:hAnsi="Arial" w:cs="Arial"/>
-            </w:rPr>
-            <w:t>db</w:t>
-          </w:r>
-          <w:proofErr w:type="spellEnd"/>
-          <w:r>
-            <w:rPr>
-              <w:rFonts w:ascii="Arial" w:hAnsi="Arial" w:cs="Arial"/>
-            </w:rPr>
-            <w:t xml:space="preserve"> i comandi collegati alle impostazioni, ma la struttura usata è diversa da quelle precedenti, e viene usata una classe esterna.</w:t>
+            <w:t>Dovrei introdurre nel db i comandi collegati alle impostazioni, ma la struttura usata è diversa da quelle precedenti, e viene usata una classe esterna.</w:t>
           </w:r>
         </w:p>
         <w:p>
@@ -26708,21 +25230,7 @@
               <w:rPr>
                 <w:rFonts w:ascii="Arial" w:hAnsi="Arial" w:cs="Arial"/>
               </w:rPr>
-              <w:t xml:space="preserve">Le statistiche erano scomparse, Bryan ha fatto un </w:t>
-            </w:r>
-            <w:proofErr w:type="spellStart"/>
-            <w:r>
-              <w:rPr>
-                <w:rFonts w:ascii="Arial" w:hAnsi="Arial" w:cs="Arial"/>
-              </w:rPr>
-              <w:t>rollback</w:t>
-            </w:r>
-            <w:proofErr w:type="spellEnd"/>
-            <w:r>
-              <w:rPr>
-                <w:rFonts w:ascii="Arial" w:hAnsi="Arial" w:cs="Arial"/>
-              </w:rPr>
-              <w:t xml:space="preserve"> e quando mi sono state passate non erano collegate in modo concreto, quindi non risultava funzionante. Per risolvere ho semplicemente inserito gli oggetti necessari nei campi dello script</w:t>
+              <w:t>Le statistiche erano scomparse, Bryan ha fatto un rollback e quando mi sono state passate non erano collegate in modo concreto, quindi non risultava funzionante. Per risolvere ho semplicemente inserito gli oggetti necessari nei campi dello script</w:t>
             </w:r>
           </w:p>
         </w:tc>
@@ -26818,16 +25326,8 @@
               <w:rPr>
                 <w:rFonts w:ascii="Arial" w:hAnsi="Arial" w:cs="Arial"/>
               </w:rPr>
-              <w:t xml:space="preserve">Perfettamente in orario ed allineati con grafica e </w:t>
-            </w:r>
-            <w:proofErr w:type="spellStart"/>
-            <w:r>
-              <w:rPr>
-                <w:rFonts w:ascii="Arial" w:hAnsi="Arial" w:cs="Arial"/>
-              </w:rPr>
-              <w:t>backend</w:t>
-            </w:r>
-            <w:proofErr w:type="spellEnd"/>
+              <w:t>Perfettamente in orario ed allineati con grafica e backend</w:t>
+            </w:r>
           </w:p>
         </w:tc>
       </w:tr>
@@ -26934,28 +25434,12 @@
                 <w:rFonts w:ascii="Arial" w:hAnsi="Arial" w:cs="Arial"/>
               </w:rPr>
             </w:pPr>
-            <w:proofErr w:type="spellStart"/>
-            <w:r>
-              <w:rPr>
-                <w:rFonts w:ascii="Arial" w:hAnsi="Arial" w:cs="Arial"/>
-              </w:rPr>
-              <w:t>Daily</w:t>
-            </w:r>
-            <w:proofErr w:type="spellEnd"/>
-            <w:r>
-              <w:rPr>
-                <w:rFonts w:ascii="Arial" w:hAnsi="Arial" w:cs="Arial"/>
-              </w:rPr>
-              <w:t xml:space="preserve"> </w:t>
-            </w:r>
-            <w:proofErr w:type="spellStart"/>
-            <w:r>
-              <w:rPr>
-                <w:rFonts w:ascii="Arial" w:hAnsi="Arial" w:cs="Arial"/>
-              </w:rPr>
-              <w:t>Scrum</w:t>
-            </w:r>
-            <w:proofErr w:type="spellEnd"/>
+            <w:r>
+              <w:rPr>
+                <w:rFonts w:ascii="Arial" w:hAnsi="Arial" w:cs="Arial"/>
+              </w:rPr>
+              <w:t>Daily Scrum</w:t>
+            </w:r>
           </w:p>
         </w:tc>
       </w:tr>
@@ -27003,16 +25487,8 @@
               <w:rPr>
                 <w:rFonts w:ascii="Arial" w:hAnsi="Arial" w:cs="Arial"/>
               </w:rPr>
-              <w:t xml:space="preserve">Riley: Continuo sviluppo </w:t>
-            </w:r>
-            <w:proofErr w:type="spellStart"/>
-            <w:r>
-              <w:rPr>
-                <w:rFonts w:ascii="Arial" w:hAnsi="Arial" w:cs="Arial"/>
-              </w:rPr>
-              <w:t>db</w:t>
-            </w:r>
-            <w:proofErr w:type="spellEnd"/>
+              <w:t>Riley: Continuo sviluppo db</w:t>
+            </w:r>
           </w:p>
           <w:p>
             <w:pPr>
@@ -27205,16 +25681,8 @@
               <w:rPr>
                 <w:rFonts w:ascii="Arial" w:hAnsi="Arial" w:cs="Arial"/>
               </w:rPr>
-              <w:t xml:space="preserve">Sprint </w:t>
-            </w:r>
-            <w:proofErr w:type="spellStart"/>
-            <w:r>
-              <w:rPr>
-                <w:rFonts w:ascii="Arial" w:hAnsi="Arial" w:cs="Arial"/>
-              </w:rPr>
-              <w:t>Retrospective</w:t>
-            </w:r>
-            <w:proofErr w:type="spellEnd"/>
+              <w:t>Sprint Retrospective</w:t>
+            </w:r>
           </w:p>
         </w:tc>
       </w:tr>
@@ -28054,21 +26522,7 @@
         <w:rPr>
           <w:rFonts w:ascii="Arial" w:hAnsi="Arial" w:cs="Arial"/>
         </w:rPr>
-        <w:t xml:space="preserve">Avrei cercato di adattare basandomi </w:t>
-      </w:r>
-      <w:proofErr w:type="spellStart"/>
-      <w:r>
-        <w:rPr>
-          <w:rFonts w:ascii="Arial" w:hAnsi="Arial" w:cs="Arial"/>
-        </w:rPr>
-        <w:t>su i</w:t>
-      </w:r>
-      <w:proofErr w:type="spellEnd"/>
-      <w:r>
-        <w:rPr>
-          <w:rFonts w:ascii="Arial" w:hAnsi="Arial" w:cs="Arial"/>
-        </w:rPr>
-        <w:t xml:space="preserve"> file presenti.</w:t>
+        <w:t>Avrei cercato di adattare basandomi su i file presenti.</w:t>
       </w:r>
     </w:p>
     <w:p>
@@ -28601,28 +27055,12 @@
                 <w:rFonts w:ascii="Arial" w:hAnsi="Arial" w:cs="Arial"/>
               </w:rPr>
             </w:pPr>
-            <w:proofErr w:type="spellStart"/>
-            <w:r>
-              <w:rPr>
-                <w:rFonts w:ascii="Arial" w:hAnsi="Arial" w:cs="Arial"/>
-              </w:rPr>
-              <w:t>Daily</w:t>
-            </w:r>
-            <w:proofErr w:type="spellEnd"/>
-            <w:r>
-              <w:rPr>
-                <w:rFonts w:ascii="Arial" w:hAnsi="Arial" w:cs="Arial"/>
-              </w:rPr>
-              <w:t xml:space="preserve"> </w:t>
-            </w:r>
-            <w:proofErr w:type="spellStart"/>
-            <w:r>
-              <w:rPr>
-                <w:rFonts w:ascii="Arial" w:hAnsi="Arial" w:cs="Arial"/>
-              </w:rPr>
-              <w:t>Scrum</w:t>
-            </w:r>
-            <w:proofErr w:type="spellEnd"/>
+            <w:r>
+              <w:rPr>
+                <w:rFonts w:ascii="Arial" w:hAnsi="Arial" w:cs="Arial"/>
+              </w:rPr>
+              <w:t>Daily Scrum</w:t>
+            </w:r>
           </w:p>
         </w:tc>
       </w:tr>
@@ -28908,16 +27346,8 @@
                 <w:rFonts w:ascii="Arial" w:hAnsi="Arial" w:cs="Arial"/>
               </w:rPr>
               <w:lastRenderedPageBreak/>
-              <w:t xml:space="preserve">Sprint </w:t>
-            </w:r>
-            <w:proofErr w:type="spellStart"/>
-            <w:r>
-              <w:rPr>
-                <w:rFonts w:ascii="Arial" w:hAnsi="Arial" w:cs="Arial"/>
-              </w:rPr>
-              <w:t>Retrospective</w:t>
-            </w:r>
-            <w:proofErr w:type="spellEnd"/>
+              <w:t>Sprint Retrospective</w:t>
+            </w:r>
           </w:p>
         </w:tc>
       </w:tr>
@@ -29414,21 +27844,7 @@
             <w:rPr>
               <w:rFonts w:ascii="Arial" w:hAnsi="Arial" w:cs="Arial"/>
             </w:rPr>
-            <w:t xml:space="preserve">Recentemente ho eseguito un pull e sembra che il </w:t>
-          </w:r>
-          <w:proofErr w:type="spellStart"/>
-          <w:r>
-            <w:rPr>
-              <w:rFonts w:ascii="Arial" w:hAnsi="Arial" w:cs="Arial"/>
-            </w:rPr>
-            <w:t>mergetool</w:t>
-          </w:r>
-          <w:proofErr w:type="spellEnd"/>
-          <w:r>
-            <w:rPr>
-              <w:rFonts w:ascii="Arial" w:hAnsi="Arial" w:cs="Arial"/>
-            </w:rPr>
-            <w:t xml:space="preserve"> sembra non funzionare: &lt;errore&gt;</w:t>
+            <w:t>Recentemente ho eseguito un pull e sembra che il mergetool sembra non funzionare: &lt;errore&gt;</w:t>
           </w:r>
         </w:p>
         <w:p>
@@ -29526,21 +27942,7 @@
             <w:rPr>
               <w:rFonts w:ascii="Arial" w:hAnsi="Arial" w:cs="Arial"/>
             </w:rPr>
-            <w:t xml:space="preserve">Mi ha specificato quale risultava il problema e ha proposto delle soluzioni per sistemare il </w:t>
-          </w:r>
-          <w:proofErr w:type="spellStart"/>
-          <w:r>
-            <w:rPr>
-              <w:rFonts w:ascii="Arial" w:hAnsi="Arial" w:cs="Arial"/>
-            </w:rPr>
-            <w:t>mergetool</w:t>
-          </w:r>
-          <w:proofErr w:type="spellEnd"/>
-          <w:r>
-            <w:rPr>
-              <w:rFonts w:ascii="Arial" w:hAnsi="Arial" w:cs="Arial"/>
-            </w:rPr>
-            <w:t>, poi ho compreso che il problema risultava solo la modifica del medesimo componente nella stessa scena, questo mi ha fatto comprendere i limiti di questo tool.</w:t>
+            <w:t>Mi ha specificato quale risultava il problema e ha proposto delle soluzioni per sistemare il mergetool, poi ho compreso che il problema risultava solo la modifica del medesimo componente nella stessa scena, questo mi ha fatto comprendere i limiti di questo tool.</w:t>
           </w:r>
         </w:p>
         <w:p>
@@ -30300,28 +28702,12 @@
                 <w:rFonts w:ascii="Arial" w:hAnsi="Arial" w:cs="Arial"/>
               </w:rPr>
             </w:pPr>
-            <w:proofErr w:type="spellStart"/>
-            <w:r>
-              <w:rPr>
-                <w:rFonts w:ascii="Arial" w:hAnsi="Arial" w:cs="Arial"/>
-              </w:rPr>
-              <w:t>Daily</w:t>
-            </w:r>
-            <w:proofErr w:type="spellEnd"/>
-            <w:r>
-              <w:rPr>
-                <w:rFonts w:ascii="Arial" w:hAnsi="Arial" w:cs="Arial"/>
-              </w:rPr>
-              <w:t xml:space="preserve"> </w:t>
-            </w:r>
-            <w:proofErr w:type="spellStart"/>
-            <w:r>
-              <w:rPr>
-                <w:rFonts w:ascii="Arial" w:hAnsi="Arial" w:cs="Arial"/>
-              </w:rPr>
-              <w:t>Scrum</w:t>
-            </w:r>
-            <w:proofErr w:type="spellEnd"/>
+            <w:r>
+              <w:rPr>
+                <w:rFonts w:ascii="Arial" w:hAnsi="Arial" w:cs="Arial"/>
+              </w:rPr>
+              <w:t>Daily Scrum</w:t>
+            </w:r>
           </w:p>
         </w:tc>
       </w:tr>
@@ -30569,16 +28955,8 @@
               <w:rPr>
                 <w:rFonts w:ascii="Arial" w:hAnsi="Arial" w:cs="Arial"/>
               </w:rPr>
-              <w:t xml:space="preserve">Sprint </w:t>
-            </w:r>
-            <w:proofErr w:type="spellStart"/>
-            <w:r>
-              <w:rPr>
-                <w:rFonts w:ascii="Arial" w:hAnsi="Arial" w:cs="Arial"/>
-              </w:rPr>
-              <w:t>Retrospective</w:t>
-            </w:r>
-            <w:proofErr w:type="spellEnd"/>
+              <w:t>Sprint Retrospective</w:t>
+            </w:r>
           </w:p>
         </w:tc>
       </w:tr>
@@ -31069,21 +29447,7 @@
             <w:rPr>
               <w:rFonts w:ascii="Arial" w:hAnsi="Arial" w:cs="Arial"/>
             </w:rPr>
-            <w:t xml:space="preserve">Come posso cambiare una scena su </w:t>
-          </w:r>
-          <w:proofErr w:type="spellStart"/>
-          <w:r>
-            <w:rPr>
-              <w:rFonts w:ascii="Arial" w:hAnsi="Arial" w:cs="Arial"/>
-            </w:rPr>
-            <w:t>unity</w:t>
-          </w:r>
-          <w:proofErr w:type="spellEnd"/>
-          <w:r>
-            <w:rPr>
-              <w:rFonts w:ascii="Arial" w:hAnsi="Arial" w:cs="Arial"/>
-            </w:rPr>
-            <w:t>?</w:t>
+            <w:t>Come posso cambiare una scena su unity?</w:t>
           </w:r>
         </w:p>
         <w:p>
@@ -31536,7 +29900,7 @@
               <w:rPr>
                 <w:rFonts w:ascii="Arial" w:hAnsi="Arial" w:cs="Arial"/>
               </w:rPr>
-              <w:t>4</w:t>
+              <w:t>6</w:t>
             </w:r>
             <w:r>
               <w:rPr>
@@ -31620,7 +29984,7 @@
               <w:rPr>
                 <w:rFonts w:ascii="Arial" w:hAnsi="Arial" w:cs="Arial"/>
               </w:rPr>
-              <w:t>Creato script per gestire movimento della telecamera</w:t>
+              <w:t>Applicata la gestione della telecamera e aggiunto moltiplicatore in base al valore nelle impostazioi</w:t>
             </w:r>
           </w:p>
         </w:tc>
@@ -31658,21 +30022,7 @@
               <w:rPr>
                 <w:rFonts w:ascii="Arial" w:hAnsi="Arial" w:cs="Arial"/>
               </w:rPr>
-              <w:t xml:space="preserve">Eseguito un </w:t>
-            </w:r>
-            <w:proofErr w:type="spellStart"/>
-            <w:r>
-              <w:rPr>
-                <w:rFonts w:ascii="Arial" w:hAnsi="Arial" w:cs="Arial"/>
-              </w:rPr>
-              <w:t>refactor</w:t>
-            </w:r>
-            <w:proofErr w:type="spellEnd"/>
-            <w:r>
-              <w:rPr>
-                <w:rFonts w:ascii="Arial" w:hAnsi="Arial" w:cs="Arial"/>
-              </w:rPr>
-              <w:t xml:space="preserve"> delle dimensioni degli elementi dato che la gravità era troppo bassa.</w:t>
+              <w:t>Eseguito un refactor delle dimensioni degli elementi dato che la gravità era troppo bassa.</w:t>
             </w:r>
           </w:p>
         </w:tc>
@@ -31973,28 +30323,12 @@
                 <w:rFonts w:ascii="Arial" w:hAnsi="Arial" w:cs="Arial"/>
               </w:rPr>
             </w:pPr>
-            <w:proofErr w:type="spellStart"/>
-            <w:r>
-              <w:rPr>
-                <w:rFonts w:ascii="Arial" w:hAnsi="Arial" w:cs="Arial"/>
-              </w:rPr>
-              <w:t>Daily</w:t>
-            </w:r>
-            <w:proofErr w:type="spellEnd"/>
-            <w:r>
-              <w:rPr>
-                <w:rFonts w:ascii="Arial" w:hAnsi="Arial" w:cs="Arial"/>
-              </w:rPr>
-              <w:t xml:space="preserve"> </w:t>
-            </w:r>
-            <w:proofErr w:type="spellStart"/>
-            <w:r>
-              <w:rPr>
-                <w:rFonts w:ascii="Arial" w:hAnsi="Arial" w:cs="Arial"/>
-              </w:rPr>
-              <w:t>Scrum</w:t>
-            </w:r>
-            <w:proofErr w:type="spellEnd"/>
+            <w:r>
+              <w:rPr>
+                <w:rFonts w:ascii="Arial" w:hAnsi="Arial" w:cs="Arial"/>
+              </w:rPr>
+              <w:t>Daily Scrum</w:t>
+            </w:r>
           </w:p>
         </w:tc>
       </w:tr>
@@ -32236,16 +30570,8 @@
               <w:rPr>
                 <w:rFonts w:ascii="Arial" w:hAnsi="Arial" w:cs="Arial"/>
               </w:rPr>
-              <w:t xml:space="preserve">Sprint </w:t>
-            </w:r>
-            <w:proofErr w:type="spellStart"/>
-            <w:r>
-              <w:rPr>
-                <w:rFonts w:ascii="Arial" w:hAnsi="Arial" w:cs="Arial"/>
-              </w:rPr>
-              <w:t>Retrospective</w:t>
-            </w:r>
-            <w:proofErr w:type="spellEnd"/>
+              <w:t>Sprint Retrospective</w:t>
+            </w:r>
           </w:p>
         </w:tc>
       </w:tr>
@@ -32736,21 +31062,7 @@
             <w:rPr>
               <w:rFonts w:ascii="Arial" w:hAnsi="Arial" w:cs="Arial"/>
             </w:rPr>
-            <w:t xml:space="preserve">Come funziona un sistema di movimento della visuale su </w:t>
-          </w:r>
-          <w:proofErr w:type="spellStart"/>
-          <w:r>
-            <w:rPr>
-              <w:rFonts w:ascii="Arial" w:hAnsi="Arial" w:cs="Arial"/>
-            </w:rPr>
-            <w:t>unity</w:t>
-          </w:r>
-          <w:proofErr w:type="spellEnd"/>
-          <w:r>
-            <w:rPr>
-              <w:rFonts w:ascii="Arial" w:hAnsi="Arial" w:cs="Arial"/>
-            </w:rPr>
-            <w:t>?</w:t>
+            <w:t>Come funziona un sistema di movimento della visuale su unity?</w:t>
           </w:r>
         </w:p>
         <w:p>
@@ -33313,21 +31625,7 @@
               <w:rPr>
                 <w:rFonts w:ascii="Arial" w:hAnsi="Arial" w:cs="Arial"/>
               </w:rPr>
-              <w:t xml:space="preserve">Eseguito un </w:t>
-            </w:r>
-            <w:proofErr w:type="spellStart"/>
-            <w:r>
-              <w:rPr>
-                <w:rFonts w:ascii="Arial" w:hAnsi="Arial" w:cs="Arial"/>
-              </w:rPr>
-              <w:t>refactor</w:t>
-            </w:r>
-            <w:proofErr w:type="spellEnd"/>
-            <w:r>
-              <w:rPr>
-                <w:rFonts w:ascii="Arial" w:hAnsi="Arial" w:cs="Arial"/>
-              </w:rPr>
-              <w:t xml:space="preserve"> delle dimensioni degli elementi dato che la gravità era troppo bassa.</w:t>
+              <w:t>Inizio sviluppo logica movimento dell’auto, leggere modifiche alla fisica. Inizio logica drifting (EXTRA)</w:t>
             </w:r>
           </w:p>
         </w:tc>
@@ -33560,7 +31858,7 @@
               <w:rPr>
                 <w:rFonts w:ascii="Arial" w:hAnsi="Arial" w:cs="Arial"/>
               </w:rPr>
-              <w:t>Collegare lo script di movimento della telecamera e sviluppare il movimento</w:t>
+              <w:t>Finire logica di movimento dell’auto. Iniziare sviluppo audio.</w:t>
             </w:r>
           </w:p>
         </w:tc>
@@ -33610,28 +31908,12 @@
                 <w:rFonts w:ascii="Arial" w:hAnsi="Arial" w:cs="Arial"/>
               </w:rPr>
             </w:pPr>
-            <w:proofErr w:type="spellStart"/>
-            <w:r>
-              <w:rPr>
-                <w:rFonts w:ascii="Arial" w:hAnsi="Arial" w:cs="Arial"/>
-              </w:rPr>
-              <w:t>Daily</w:t>
-            </w:r>
-            <w:proofErr w:type="spellEnd"/>
-            <w:r>
-              <w:rPr>
-                <w:rFonts w:ascii="Arial" w:hAnsi="Arial" w:cs="Arial"/>
-              </w:rPr>
-              <w:t xml:space="preserve"> </w:t>
-            </w:r>
-            <w:proofErr w:type="spellStart"/>
-            <w:r>
-              <w:rPr>
-                <w:rFonts w:ascii="Arial" w:hAnsi="Arial" w:cs="Arial"/>
-              </w:rPr>
-              <w:t>Scrum</w:t>
-            </w:r>
-            <w:proofErr w:type="spellEnd"/>
+            <w:r>
+              <w:rPr>
+                <w:rFonts w:ascii="Arial" w:hAnsi="Arial" w:cs="Arial"/>
+              </w:rPr>
+              <w:t>Daily Scrum</w:t>
+            </w:r>
           </w:p>
         </w:tc>
       </w:tr>
@@ -33885,16 +32167,8 @@
               <w:rPr>
                 <w:rFonts w:ascii="Arial" w:hAnsi="Arial" w:cs="Arial"/>
               </w:rPr>
-              <w:t xml:space="preserve">Sprint </w:t>
-            </w:r>
-            <w:proofErr w:type="spellStart"/>
-            <w:r>
-              <w:rPr>
-                <w:rFonts w:ascii="Arial" w:hAnsi="Arial" w:cs="Arial"/>
-              </w:rPr>
-              <w:t>Retrospective</w:t>
-            </w:r>
-            <w:proofErr w:type="spellEnd"/>
+              <w:t>Sprint Retrospective</w:t>
+            </w:r>
           </w:p>
         </w:tc>
       </w:tr>
@@ -33971,7 +32245,7 @@
           <w:rPr>
             <w:rFonts w:ascii="Segoe UI Symbol" w:hAnsi="Segoe UI Symbol" w:cs="Segoe UI Symbol"/>
           </w:rPr>
-          <w:id w:val="1147854493"/>
+          <w:id w:val="1924221635"/>
           <w14:checkbox>
             <w14:checked w14:val="0"/>
             <w14:checkedState w14:val="2612" w14:font="MS Gothic"/>
@@ -34001,7 +32275,7 @@
           <w:rPr>
             <w:rFonts w:ascii="Segoe UI Symbol" w:hAnsi="Segoe UI Symbol" w:cs="Segoe UI Symbol"/>
           </w:rPr>
-          <w:id w:val="-1616675094"/>
+          <w:id w:val="1668666719"/>
           <w14:checkbox>
             <w14:checked w14:val="1"/>
             <w14:checkedState w14:val="2612" w14:font="MS Gothic"/>
@@ -34031,7 +32305,7 @@
           <w:rPr>
             <w:rFonts w:ascii="Segoe UI Symbol" w:hAnsi="Segoe UI Symbol" w:cs="Segoe UI Symbol"/>
           </w:rPr>
-          <w:id w:val="1123579246"/>
+          <w:id w:val="432175959"/>
           <w14:checkbox>
             <w14:checked w14:val="0"/>
             <w14:checkedState w14:val="2612" w14:font="MS Gothic"/>
@@ -34103,9 +32377,9 @@
           <w:rPr>
             <w:rFonts w:ascii="Arial" w:hAnsi="Arial" w:cs="Arial"/>
           </w:rPr>
-          <w:id w:val="1324548891"/>
+          <w:id w:val="314072173"/>
           <w:placeholder>
-            <w:docPart w:val="9FFF48F483504B658E077A2EADA3A288"/>
+            <w:docPart w:val="1D79481D3BA144E296B456F1BD184B33"/>
           </w:placeholder>
         </w:sdtPr>
         <w:sdtContent>
@@ -34114,6 +32388,12 @@
               <w:rFonts w:ascii="Arial" w:hAnsi="Arial" w:cs="Arial"/>
             </w:rPr>
             <w:t>ChatGPT</w:t>
+          </w:r>
+          <w:r>
+            <w:rPr>
+              <w:rFonts w:ascii="Arial" w:hAnsi="Arial" w:cs="Arial"/>
+            </w:rPr>
+            <w:t>, Gemini, Claude</w:t>
           </w:r>
         </w:sdtContent>
       </w:sdt>
@@ -34149,7 +32429,7 @@
           <w:rPr>
             <w:rFonts w:ascii="Segoe UI Symbol" w:hAnsi="Segoe UI Symbol" w:cs="Segoe UI Symbol"/>
           </w:rPr>
-          <w:id w:val="1506241665"/>
+          <w:id w:val="567547987"/>
           <w14:checkbox>
             <w14:checked w14:val="0"/>
             <w14:checkedState w14:val="2612" w14:font="MS Gothic"/>
@@ -34179,7 +32459,7 @@
           <w:rPr>
             <w:rFonts w:ascii="Segoe UI Symbol" w:hAnsi="Segoe UI Symbol" w:cs="Segoe UI Symbol"/>
           </w:rPr>
-          <w:id w:val="-232937575"/>
+          <w:id w:val="2010709823"/>
           <w14:checkbox>
             <w14:checked w14:val="1"/>
             <w14:checkedState w14:val="2612" w14:font="MS Gothic"/>
@@ -34209,7 +32489,7 @@
           <w:rPr>
             <w:rFonts w:ascii="Segoe UI Symbol" w:hAnsi="Segoe UI Symbol" w:cs="Segoe UI Symbol"/>
           </w:rPr>
-          <w:id w:val="230197897"/>
+          <w:id w:val="2100744086"/>
           <w14:checkbox>
             <w14:checked w14:val="0"/>
             <w14:checkedState w14:val="2612" w14:font="MS Gothic"/>
@@ -34239,7 +32519,7 @@
           <w:rPr>
             <w:rFonts w:ascii="Segoe UI Symbol" w:hAnsi="Segoe UI Symbol" w:cs="Segoe UI Symbol"/>
           </w:rPr>
-          <w:id w:val="395940364"/>
+          <w:id w:val="89978793"/>
           <w14:checkbox>
             <w14:checked w14:val="0"/>
             <w14:checkedState w14:val="2612" w14:font="MS Gothic"/>
@@ -34269,7 +32549,7 @@
           <w:rPr>
             <w:rFonts w:ascii="Segoe UI Symbol" w:hAnsi="Segoe UI Symbol" w:cs="Segoe UI Symbol"/>
           </w:rPr>
-          <w:id w:val="727347590"/>
+          <w:id w:val="1928765321"/>
           <w14:checkbox>
             <w14:checked w14:val="0"/>
             <w14:checkedState w14:val="2612" w14:font="MS Gothic"/>
@@ -34361,9 +32641,9 @@
         </w:rPr>
         <w:alias w:val="Prompt AI"/>
         <w:tag w:val="Prompt AI"/>
-        <w:id w:val="1876428935"/>
+        <w:id w:val="-1547833401"/>
         <w:placeholder>
-          <w:docPart w:val="F3C749D6FEEB4FD2A14EFFA505438868"/>
+          <w:docPart w:val="1B14BB495CB1402E9A41ECE297414746"/>
         </w:placeholder>
         <w15:color w:val="C0C0C0"/>
       </w:sdtPr>
@@ -34379,21 +32659,7 @@
             <w:rPr>
               <w:rFonts w:ascii="Arial" w:hAnsi="Arial" w:cs="Arial"/>
             </w:rPr>
-            <w:t xml:space="preserve">Riley: Come funziona un sistema di movimento della visuale su </w:t>
-          </w:r>
-          <w:proofErr w:type="spellStart"/>
-          <w:r>
-            <w:rPr>
-              <w:rFonts w:ascii="Arial" w:hAnsi="Arial" w:cs="Arial"/>
-            </w:rPr>
-            <w:t>unity</w:t>
-          </w:r>
-          <w:proofErr w:type="spellEnd"/>
-          <w:r>
-            <w:rPr>
-              <w:rFonts w:ascii="Arial" w:hAnsi="Arial" w:cs="Arial"/>
-            </w:rPr>
-            <w:t>?</w:t>
+            <w:t>Riley: Proceduto con il tutorial per la visuale analizzando codice e funzionalità</w:t>
           </w:r>
         </w:p>
         <w:p>
@@ -34410,6 +32676,12 @@
             </w:rPr>
             <w:t xml:space="preserve">Bryan: </w:t>
           </w:r>
+          <w:r>
+            <w:rPr>
+              <w:rFonts w:ascii="Arial" w:hAnsi="Arial" w:cs="Arial"/>
+            </w:rPr>
+            <w:t>Aiutami a creare una logica di movimento per un gioco di guida in Unity</w:t>
+          </w:r>
         </w:p>
       </w:sdtContent>
     </w:sdt>
@@ -34466,9 +32738,9 @@
         </w:rPr>
         <w:alias w:val="Risposta AI"/>
         <w:tag w:val="Risposta AI"/>
-        <w:id w:val="1567602410"/>
+        <w:id w:val="81662527"/>
         <w:placeholder>
-          <w:docPart w:val="BC5FB685A7D44D96ACB06DEAE73EF69A"/>
+          <w:docPart w:val="1B4474071921409F836C4E272E16D7E8"/>
         </w:placeholder>
         <w15:color w:val="C0C0C0"/>
       </w:sdtPr>
@@ -34485,7 +32757,19 @@
             <w:rPr>
               <w:rFonts w:ascii="Arial" w:hAnsi="Arial" w:cs="Arial"/>
             </w:rPr>
-            <w:t>Riley: Mi sono state presentate 3 tipi di visuale che richiedono più o meno telecamere e due tipi di gestione degli input, con in seguito una spiegazione generale del funzionamento. Ho mandato dei dettagli per avere un output più preciso e utile.</w:t>
+            <w:t xml:space="preserve">Riley: Mi ha spiegato cosa collegare e dove e come aggiungere il valore </w:t>
+          </w:r>
+          <w:r>
+            <w:rPr>
+              <w:rFonts w:ascii="Arial" w:hAnsi="Arial" w:cs="Arial"/>
+            </w:rPr>
+            <w:t>delle impostazioni</w:t>
+          </w:r>
+          <w:r>
+            <w:rPr>
+              <w:rFonts w:ascii="Arial" w:hAnsi="Arial" w:cs="Arial"/>
+            </w:rPr>
+            <w:t>, principalmente fornito la formula per il moltiplicatore finale</w:t>
           </w:r>
         </w:p>
         <w:p>
@@ -34502,6 +32786,12 @@
             </w:rPr>
             <w:t xml:space="preserve">Bryan: </w:t>
           </w:r>
+          <w:r>
+            <w:rPr>
+              <w:rFonts w:ascii="Arial" w:hAnsi="Arial" w:cs="Arial"/>
+            </w:rPr>
+            <w:t>Mi ha dato una bozza iniziale del codice tramite un controller generale.</w:t>
+          </w:r>
         </w:p>
       </w:sdtContent>
     </w:sdt>
@@ -34541,7 +32831,7 @@
           <w:rPr>
             <w:rFonts w:ascii="Segoe UI Symbol" w:hAnsi="Segoe UI Symbol" w:cs="Segoe UI Symbol"/>
           </w:rPr>
-          <w:id w:val="-1880391410"/>
+          <w:id w:val="1134983075"/>
           <w14:checkbox>
             <w14:checked w14:val="1"/>
             <w14:checkedState w14:val="2612" w14:font="MS Gothic"/>
@@ -34574,7 +32864,7 @@
           <w:rPr>
             <w:rFonts w:ascii="Segoe UI Symbol" w:hAnsi="Segoe UI Symbol" w:cs="Segoe UI Symbol"/>
           </w:rPr>
-          <w:id w:val="1434550935"/>
+          <w:id w:val="152732928"/>
           <w14:checkbox>
             <w14:checked w14:val="1"/>
             <w14:checkedState w14:val="2612" w14:font="MS Gothic"/>
@@ -34607,7 +32897,7 @@
           <w:rPr>
             <w:rFonts w:ascii="Segoe UI Symbol" w:hAnsi="Segoe UI Symbol" w:cs="Segoe UI Symbol"/>
           </w:rPr>
-          <w:id w:val="1156658331"/>
+          <w:id w:val="-1620528853"/>
           <w14:checkbox>
             <w14:checked w14:val="0"/>
             <w14:checkedState w14:val="2612" w14:font="MS Gothic"/>
@@ -34640,7 +32930,7 @@
           <w:rPr>
             <w:rFonts w:ascii="Segoe UI Symbol" w:hAnsi="Segoe UI Symbol" w:cs="Segoe UI Symbol"/>
           </w:rPr>
-          <w:id w:val="-2133857728"/>
+          <w:id w:val="802047222"/>
           <w14:checkbox>
             <w14:checked w14:val="0"/>
             <w14:checkedState w14:val="2612" w14:font="MS Gothic"/>
@@ -34706,7 +32996,7 @@
         <w:rPr>
           <w:rFonts w:ascii="Arial" w:hAnsi="Arial" w:cs="Arial"/>
         </w:rPr>
-        <w:t>Riley: Averi cercato su delle documentazioni ufficiali ed eventuali forum</w:t>
+        <w:t>Riley: I collegamenti gli avrei potuti fare tranquillamente da solo (mi è stato dato come prassi) e per l’applicazione del valore anche ma ci avrei messo più tempo.</w:t>
       </w:r>
     </w:p>
     <w:p>
@@ -34722,10 +33012,15 @@
         </w:rPr>
         <w:t>Bryan:</w:t>
       </w:r>
-    </w:p>
-    <w:p>
-      <w:pPr>
-        <w:pStyle w:val="Nessunaspaziatura"/>
+      <w:r>
+        <w:rPr>
+          <w:rFonts w:ascii="Arial" w:hAnsi="Arial" w:cs="Arial"/>
+        </w:rPr>
+        <w:t xml:space="preserve"> Avrei seguito un tutorial su Youtube.</w:t>
+      </w:r>
+    </w:p>
+    <w:p>
+      <w:pPr>
         <w:rPr>
           <w:rFonts w:ascii="Arial" w:hAnsi="Arial" w:cs="Arial"/>
         </w:rPr>
@@ -34948,17 +33243,8 @@
         <w:rFonts w:ascii="Arial" w:hAnsi="Arial" w:cs="Arial"/>
         <w:lang w:val="fr-CH"/>
       </w:rPr>
-      <w:t xml:space="preserve">Riley Bianchi &amp; Bryan </w:t>
+      <w:t>Riley Bianchi &amp; Bryan Ciaponi</w:t>
     </w:r>
-    <w:proofErr w:type="spellStart"/>
-    <w:r>
-      <w:rPr>
-        <w:rFonts w:ascii="Arial" w:hAnsi="Arial" w:cs="Arial"/>
-        <w:lang w:val="fr-CH"/>
-      </w:rPr>
-      <w:t>Ciaponi</w:t>
-    </w:r>
-    <w:proofErr w:type="spellEnd"/>
   </w:p>
 </w:hdr>
 </file>
@@ -40497,7 +38783,7 @@
     </w:docPart>
     <w:docPart>
       <w:docPartPr>
-        <w:name w:val="9FFF48F483504B658E077A2EADA3A288"/>
+        <w:name w:val="1D79481D3BA144E296B456F1BD184B33"/>
         <w:category>
           <w:name w:val="Generale"/>
           <w:gallery w:val="placeholder"/>
@@ -40508,12 +38794,12 @@
         <w:behaviors>
           <w:behavior w:val="content"/>
         </w:behaviors>
-        <w:guid w:val="{6E68CDB0-A2AC-4811-A84D-53B31CC90E02}"/>
+        <w:guid w:val="{7C1F01DF-9163-44CF-994F-631224CE5F1B}"/>
       </w:docPartPr>
       <w:docPartBody>
         <w:p>
           <w:pPr>
-            <w:pStyle w:val="9FFF48F483504B658E077A2EADA3A288"/>
+            <w:pStyle w:val="1D79481D3BA144E296B456F1BD184B33"/>
           </w:pPr>
           <w:r>
             <w:rPr>
@@ -40528,7 +38814,7 @@
     </w:docPart>
     <w:docPart>
       <w:docPartPr>
-        <w:name w:val="F3C749D6FEEB4FD2A14EFFA505438868"/>
+        <w:name w:val="1B14BB495CB1402E9A41ECE297414746"/>
         <w:category>
           <w:name w:val="Generale"/>
           <w:gallery w:val="placeholder"/>
@@ -40539,12 +38825,12 @@
         <w:behaviors>
           <w:behavior w:val="content"/>
         </w:behaviors>
-        <w:guid w:val="{721C11F6-D797-412A-B4E1-57AB1C35E75F}"/>
+        <w:guid w:val="{B70BCF04-5C37-4F01-83B5-8D2722F068D8}"/>
       </w:docPartPr>
       <w:docPartBody>
         <w:p>
           <w:pPr>
-            <w:pStyle w:val="F3C749D6FEEB4FD2A14EFFA505438868"/>
+            <w:pStyle w:val="1B14BB495CB1402E9A41ECE297414746"/>
           </w:pPr>
           <w:r>
             <w:rPr>
@@ -40557,7 +38843,7 @@
     </w:docPart>
     <w:docPart>
       <w:docPartPr>
-        <w:name w:val="BC5FB685A7D44D96ACB06DEAE73EF69A"/>
+        <w:name w:val="1B4474071921409F836C4E272E16D7E8"/>
         <w:category>
           <w:name w:val="Generale"/>
           <w:gallery w:val="placeholder"/>
@@ -40568,12 +38854,12 @@
         <w:behaviors>
           <w:behavior w:val="content"/>
         </w:behaviors>
-        <w:guid w:val="{1D2FF777-0B7D-47E0-9201-D39352D589DD}"/>
+        <w:guid w:val="{9F2AF05A-FDEB-412F-AD39-F60292BBFAB7}"/>
       </w:docPartPr>
       <w:docPartBody>
         <w:p>
           <w:pPr>
-            <w:pStyle w:val="BC5FB685A7D44D96ACB06DEAE73EF69A"/>
+            <w:pStyle w:val="1B4474071921409F836C4E272E16D7E8"/>
           </w:pPr>
           <w:r>
             <w:rPr>
@@ -40785,10 +39071,10 @@
     <w:rsid w:val="008A2EC3"/>
     <w:rsid w:val="00901364"/>
     <w:rsid w:val="00924F9E"/>
+    <w:rsid w:val="0094220E"/>
     <w:rsid w:val="009826E2"/>
     <w:rsid w:val="009A56C6"/>
     <w:rsid w:val="009D6A55"/>
-    <w:rsid w:val="009F76BC"/>
     <w:rsid w:val="00A04D62"/>
     <w:rsid w:val="00A27299"/>
     <w:rsid w:val="00A629CF"/>
@@ -41601,6 +39887,18 @@
     <w:name w:val="BC5FB685A7D44D96ACB06DEAE73EF69A"/>
     <w:rsid w:val="000452F4"/>
   </w:style>
+  <w:style w:type="paragraph" w:customStyle="1" w:styleId="1D79481D3BA144E296B456F1BD184B33">
+    <w:name w:val="1D79481D3BA144E296B456F1BD184B33"/>
+    <w:rsid w:val="000452F4"/>
+  </w:style>
+  <w:style w:type="paragraph" w:customStyle="1" w:styleId="1B14BB495CB1402E9A41ECE297414746">
+    <w:name w:val="1B14BB495CB1402E9A41ECE297414746"/>
+    <w:rsid w:val="000452F4"/>
+  </w:style>
+  <w:style w:type="paragraph" w:customStyle="1" w:styleId="1B4474071921409F836C4E272E16D7E8">
+    <w:name w:val="1B4474071921409F836C4E272E16D7E8"/>
+    <w:rsid w:val="000452F4"/>
+  </w:style>
 </w:styles>
 </file>
 

</xml_diff>

<commit_message>
completamento sistema audio e diario
</commit_message>
<xml_diff>
--- a/4_Diari/Diario.docx
+++ b/4_Diari/Diario.docx
@@ -193,7 +193,21 @@
               <w:rPr>
                 <w:rFonts w:ascii="Arial" w:hAnsi="Arial" w:cs="Arial"/>
               </w:rPr>
-              <w:t>Riflettuto sui requisiti e user story del gioco, creato i primi template per gantt e diario</w:t>
+              <w:t xml:space="preserve">Riflettuto sui requisiti e user story del gioco, creato i primi template per </w:t>
+            </w:r>
+            <w:proofErr w:type="spellStart"/>
+            <w:r>
+              <w:rPr>
+                <w:rFonts w:ascii="Arial" w:hAnsi="Arial" w:cs="Arial"/>
+              </w:rPr>
+              <w:t>gantt</w:t>
+            </w:r>
+            <w:proofErr w:type="spellEnd"/>
+            <w:r>
+              <w:rPr>
+                <w:rFonts w:ascii="Arial" w:hAnsi="Arial" w:cs="Arial"/>
+              </w:rPr>
+              <w:t xml:space="preserve"> e diario</w:t>
             </w:r>
           </w:p>
         </w:tc>
@@ -234,7 +248,21 @@
               <w:rPr>
                 <w:rFonts w:ascii="Arial" w:hAnsi="Arial" w:cs="Arial"/>
               </w:rPr>
-              <w:t>Riflettuto sui requisiti e user story del gioco, iniziato scrittura documentazione e sincronizzazione progetto a GitLab.</w:t>
+              <w:t xml:space="preserve">Riflettuto sui requisiti e user story del gioco, iniziato scrittura documentazione e sincronizzazione progetto a </w:t>
+            </w:r>
+            <w:proofErr w:type="spellStart"/>
+            <w:r>
+              <w:rPr>
+                <w:rFonts w:ascii="Arial" w:hAnsi="Arial" w:cs="Arial"/>
+              </w:rPr>
+              <w:t>GitLab</w:t>
+            </w:r>
+            <w:proofErr w:type="spellEnd"/>
+            <w:r>
+              <w:rPr>
+                <w:rFonts w:ascii="Arial" w:hAnsi="Arial" w:cs="Arial"/>
+              </w:rPr>
+              <w:t>.</w:t>
             </w:r>
           </w:p>
         </w:tc>
@@ -675,7 +703,25 @@
               <w:b/>
               <w:bCs/>
             </w:rPr>
-            <w:t>Nomi AI utilizzati</w:t>
+            <w:t xml:space="preserve">Nomi </w:t>
+          </w:r>
+          <w:proofErr w:type="gramStart"/>
+          <w:r>
+            <w:rPr>
+              <w:rStyle w:val="Testosegnaposto"/>
+              <w:b/>
+              <w:bCs/>
+            </w:rPr>
+            <w:t>AI</w:t>
+          </w:r>
+          <w:proofErr w:type="gramEnd"/>
+          <w:r>
+            <w:rPr>
+              <w:rStyle w:val="Testosegnaposto"/>
+              <w:b/>
+              <w:bCs/>
+            </w:rPr>
+            <w:t xml:space="preserve"> utilizzati</w:t>
           </w:r>
         </w:sdtContent>
       </w:sdt>
@@ -1756,7 +1802,21 @@
               <w:rPr>
                 <w:rFonts w:ascii="Arial" w:hAnsi="Arial" w:cs="Arial"/>
               </w:rPr>
-              <w:t>Iniziare e completare analisi dei mezzi, creare lo use case</w:t>
+              <w:t xml:space="preserve">Iniziare e completare analisi dei mezzi, creare </w:t>
+            </w:r>
+            <w:proofErr w:type="gramStart"/>
+            <w:r>
+              <w:rPr>
+                <w:rFonts w:ascii="Arial" w:hAnsi="Arial" w:cs="Arial"/>
+              </w:rPr>
+              <w:t>lo use</w:t>
+            </w:r>
+            <w:proofErr w:type="gramEnd"/>
+            <w:r>
+              <w:rPr>
+                <w:rFonts w:ascii="Arial" w:hAnsi="Arial" w:cs="Arial"/>
+              </w:rPr>
+              <w:t xml:space="preserve"> case</w:t>
             </w:r>
             <w:r>
               <w:rPr>
@@ -2234,7 +2294,21 @@
             <w:rPr>
               <w:rFonts w:ascii="Arial" w:hAnsi="Arial" w:cs="Arial"/>
             </w:rPr>
-            <w:t>Aitami a generare dei requesiti in base ai seguenti dati</w:t>
+            <w:t xml:space="preserve">Aitami a generare dei </w:t>
+          </w:r>
+          <w:proofErr w:type="spellStart"/>
+          <w:r>
+            <w:rPr>
+              <w:rFonts w:ascii="Arial" w:hAnsi="Arial" w:cs="Arial"/>
+            </w:rPr>
+            <w:t>requesiti</w:t>
+          </w:r>
+          <w:proofErr w:type="spellEnd"/>
+          <w:r>
+            <w:rPr>
+              <w:rFonts w:ascii="Arial" w:hAnsi="Arial" w:cs="Arial"/>
+            </w:rPr>
+            <w:t xml:space="preserve"> in base ai seguenti dati</w:t>
           </w:r>
         </w:p>
       </w:sdtContent>
@@ -2774,7 +2848,21 @@
               <w:rPr>
                 <w:rFonts w:ascii="Arial" w:hAnsi="Arial" w:cs="Arial"/>
               </w:rPr>
-              <w:t>Completata la analisi del dominio nella documentazione, inizio ricerche riguardo Unity.</w:t>
+              <w:t xml:space="preserve">Completata la analisi del dominio nella documentazione, inizio ricerche riguardo </w:t>
+            </w:r>
+            <w:proofErr w:type="spellStart"/>
+            <w:r>
+              <w:rPr>
+                <w:rFonts w:ascii="Arial" w:hAnsi="Arial" w:cs="Arial"/>
+              </w:rPr>
+              <w:t>Unity</w:t>
+            </w:r>
+            <w:proofErr w:type="spellEnd"/>
+            <w:r>
+              <w:rPr>
+                <w:rFonts w:ascii="Arial" w:hAnsi="Arial" w:cs="Arial"/>
+              </w:rPr>
+              <w:t>.</w:t>
             </w:r>
           </w:p>
         </w:tc>
@@ -2949,7 +3037,21 @@
               <w:rPr>
                 <w:rFonts w:ascii="Arial" w:hAnsi="Arial" w:cs="Arial"/>
               </w:rPr>
-              <w:t>Il diagramma ER non è completo e lo use case non è stato iniziato, analisi dei mezzi non ancora completata.</w:t>
+              <w:t xml:space="preserve">Il diagramma ER non è completo e </w:t>
+            </w:r>
+            <w:proofErr w:type="gramStart"/>
+            <w:r>
+              <w:rPr>
+                <w:rFonts w:ascii="Arial" w:hAnsi="Arial" w:cs="Arial"/>
+              </w:rPr>
+              <w:t>lo use</w:t>
+            </w:r>
+            <w:proofErr w:type="gramEnd"/>
+            <w:r>
+              <w:rPr>
+                <w:rFonts w:ascii="Arial" w:hAnsi="Arial" w:cs="Arial"/>
+              </w:rPr>
+              <w:t xml:space="preserve"> case non è stato iniziato, analisi dei mezzi non ancora completata.</w:t>
             </w:r>
           </w:p>
         </w:tc>
@@ -3981,8 +4083,16 @@
               <w:rPr>
                 <w:rFonts w:ascii="Arial" w:hAnsi="Arial" w:cs="Arial"/>
               </w:rPr>
-              <w:t>Creato diagramma ER e modifiche strutturali gantt</w:t>
-            </w:r>
+              <w:t xml:space="preserve">Creato diagramma ER e modifiche strutturali </w:t>
+            </w:r>
+            <w:proofErr w:type="spellStart"/>
+            <w:r>
+              <w:rPr>
+                <w:rFonts w:ascii="Arial" w:hAnsi="Arial" w:cs="Arial"/>
+              </w:rPr>
+              <w:t>gantt</w:t>
+            </w:r>
+            <w:proofErr w:type="spellEnd"/>
           </w:p>
         </w:tc>
       </w:tr>
@@ -4730,12 +4840,20 @@
             <w:rPr>
               <w:rFonts w:ascii="Arial" w:hAnsi="Arial" w:cs="Arial"/>
             </w:rPr>
-            <w:t>uoi dirmi delle classiche impostazioni per un gioco di guida in stile br</w:t>
-          </w:r>
+            <w:t xml:space="preserve">uoi dirmi delle classiche impostazioni per un gioco di guida in stile </w:t>
+          </w:r>
+          <w:proofErr w:type="spellStart"/>
           <w:r>
             <w:rPr>
               <w:rFonts w:ascii="Arial" w:hAnsi="Arial" w:cs="Arial"/>
             </w:rPr>
+            <w:t>br</w:t>
+          </w:r>
+          <w:proofErr w:type="spellEnd"/>
+          <w:r>
+            <w:rPr>
+              <w:rFonts w:ascii="Arial" w:hAnsi="Arial" w:cs="Arial"/>
+            </w:rPr>
             <w:t xml:space="preserve">. </w:t>
           </w:r>
           <w:r>
@@ -4743,7 +4861,21 @@
               <w:rFonts w:ascii="Arial" w:hAnsi="Arial" w:cs="Arial"/>
             </w:rPr>
             <w:br/>
-            <w:t>Bryan: Spiegami Unity ed i suoi vantaggi.</w:t>
+            <w:t xml:space="preserve">Bryan: Spiegami </w:t>
+          </w:r>
+          <w:proofErr w:type="spellStart"/>
+          <w:r>
+            <w:rPr>
+              <w:rFonts w:ascii="Arial" w:hAnsi="Arial" w:cs="Arial"/>
+            </w:rPr>
+            <w:t>Unity</w:t>
+          </w:r>
+          <w:proofErr w:type="spellEnd"/>
+          <w:r>
+            <w:rPr>
+              <w:rFonts w:ascii="Arial" w:hAnsi="Arial" w:cs="Arial"/>
+            </w:rPr>
+            <w:t xml:space="preserve"> ed i suoi vantaggi.</w:t>
           </w:r>
         </w:p>
       </w:sdtContent>
@@ -5221,8 +5353,16 @@
               <w:rPr>
                 <w:rFonts w:ascii="Arial" w:hAnsi="Arial" w:cs="Arial"/>
               </w:rPr>
-              <w:t>Creato Diagramma ER e aggiornato gannt</w:t>
-            </w:r>
+              <w:t xml:space="preserve">Creato Diagramma ER e aggiornato </w:t>
+            </w:r>
+            <w:proofErr w:type="spellStart"/>
+            <w:r>
+              <w:rPr>
+                <w:rFonts w:ascii="Arial" w:hAnsi="Arial" w:cs="Arial"/>
+              </w:rPr>
+              <w:t>gannt</w:t>
+            </w:r>
+            <w:proofErr w:type="spellEnd"/>
           </w:p>
         </w:tc>
       </w:tr>
@@ -5259,7 +5399,21 @@
               <w:rPr>
                 <w:rFonts w:ascii="Arial" w:hAnsi="Arial" w:cs="Arial"/>
               </w:rPr>
-              <w:t>Use Case finito, Inizio creazione e documentazione mockup UI.</w:t>
+              <w:t xml:space="preserve">Use Case finito, Inizio creazione e documentazione </w:t>
+            </w:r>
+            <w:proofErr w:type="spellStart"/>
+            <w:r>
+              <w:rPr>
+                <w:rFonts w:ascii="Arial" w:hAnsi="Arial" w:cs="Arial"/>
+              </w:rPr>
+              <w:t>mockup</w:t>
+            </w:r>
+            <w:proofErr w:type="spellEnd"/>
+            <w:r>
+              <w:rPr>
+                <w:rFonts w:ascii="Arial" w:hAnsi="Arial" w:cs="Arial"/>
+              </w:rPr>
+              <w:t xml:space="preserve"> UI.</w:t>
             </w:r>
           </w:p>
         </w:tc>
@@ -5376,7 +5530,21 @@
               <w:rPr>
                 <w:rFonts w:ascii="Arial" w:hAnsi="Arial" w:cs="Arial"/>
               </w:rPr>
-              <w:t>Riuscire a definire le azioni degli attori nel Use Case, risolto approfondendo meglio.</w:t>
+              <w:t xml:space="preserve">Riuscire a definire le azioni degli attori </w:t>
+            </w:r>
+            <w:proofErr w:type="gramStart"/>
+            <w:r>
+              <w:rPr>
+                <w:rFonts w:ascii="Arial" w:hAnsi="Arial" w:cs="Arial"/>
+              </w:rPr>
+              <w:t>nel Use</w:t>
+            </w:r>
+            <w:proofErr w:type="gramEnd"/>
+            <w:r>
+              <w:rPr>
+                <w:rFonts w:ascii="Arial" w:hAnsi="Arial" w:cs="Arial"/>
+              </w:rPr>
+              <w:t xml:space="preserve"> Case, risolto approfondendo meglio.</w:t>
             </w:r>
           </w:p>
         </w:tc>
@@ -5505,7 +5673,21 @@
               <w:rPr>
                 <w:rFonts w:ascii="Arial" w:hAnsi="Arial" w:cs="Arial"/>
               </w:rPr>
-              <w:t>Continuo creazione Mockup UI.</w:t>
+              <w:t xml:space="preserve">Continuo creazione </w:t>
+            </w:r>
+            <w:proofErr w:type="spellStart"/>
+            <w:r>
+              <w:rPr>
+                <w:rFonts w:ascii="Arial" w:hAnsi="Arial" w:cs="Arial"/>
+              </w:rPr>
+              <w:t>Mockup</w:t>
+            </w:r>
+            <w:proofErr w:type="spellEnd"/>
+            <w:r>
+              <w:rPr>
+                <w:rFonts w:ascii="Arial" w:hAnsi="Arial" w:cs="Arial"/>
+              </w:rPr>
+              <w:t xml:space="preserve"> UI.</w:t>
             </w:r>
           </w:p>
         </w:tc>
@@ -6076,8 +6258,30 @@
               <w:rFonts w:ascii="Arial" w:hAnsi="Arial" w:cs="Arial"/>
             </w:rPr>
             <w:br/>
-            <w:t>Bryan: Correzioni dello use case generato dal colega</w:t>
-          </w:r>
+            <w:t xml:space="preserve">Bryan: Correzioni </w:t>
+          </w:r>
+          <w:proofErr w:type="gramStart"/>
+          <w:r>
+            <w:rPr>
+              <w:rFonts w:ascii="Arial" w:hAnsi="Arial" w:cs="Arial"/>
+            </w:rPr>
+            <w:t>dello use</w:t>
+          </w:r>
+          <w:proofErr w:type="gramEnd"/>
+          <w:r>
+            <w:rPr>
+              <w:rFonts w:ascii="Arial" w:hAnsi="Arial" w:cs="Arial"/>
+            </w:rPr>
+            <w:t xml:space="preserve"> case generato dal </w:t>
+          </w:r>
+          <w:proofErr w:type="spellStart"/>
+          <w:r>
+            <w:rPr>
+              <w:rFonts w:ascii="Arial" w:hAnsi="Arial" w:cs="Arial"/>
+            </w:rPr>
+            <w:t>colega</w:t>
+          </w:r>
+          <w:proofErr w:type="spellEnd"/>
         </w:p>
       </w:sdtContent>
     </w:sdt>
@@ -6477,8 +6681,16 @@
               <w:rPr>
                 <w:rFonts w:ascii="Arial" w:hAnsi="Arial" w:cs="Arial"/>
               </w:rPr>
-              <w:t>Completata progettazione e creazione progetto unity</w:t>
-            </w:r>
+              <w:t xml:space="preserve">Completata progettazione e creazione progetto </w:t>
+            </w:r>
+            <w:proofErr w:type="spellStart"/>
+            <w:r>
+              <w:rPr>
+                <w:rFonts w:ascii="Arial" w:hAnsi="Arial" w:cs="Arial"/>
+              </w:rPr>
+              <w:t>unity</w:t>
+            </w:r>
+            <w:proofErr w:type="spellEnd"/>
           </w:p>
         </w:tc>
       </w:tr>
@@ -6515,8 +6727,16 @@
               <w:rPr>
                 <w:rFonts w:ascii="Arial" w:hAnsi="Arial" w:cs="Arial"/>
               </w:rPr>
-              <w:t>Fine Mockup</w:t>
-            </w:r>
+              <w:t xml:space="preserve">Fine </w:t>
+            </w:r>
+            <w:proofErr w:type="spellStart"/>
+            <w:r>
+              <w:rPr>
+                <w:rFonts w:ascii="Arial" w:hAnsi="Arial" w:cs="Arial"/>
+              </w:rPr>
+              <w:t>Mockup</w:t>
+            </w:r>
+            <w:proofErr w:type="spellEnd"/>
           </w:p>
         </w:tc>
       </w:tr>
@@ -6594,8 +6814,52 @@
               <w:rPr>
                 <w:rFonts w:ascii="Arial" w:hAnsi="Arial" w:cs="Arial"/>
               </w:rPr>
-              <w:t>Problemi nel pushare il progetto uinity, risolto grazie alla creazione di un file .gitignore</w:t>
-            </w:r>
+              <w:t xml:space="preserve">Problemi nel </w:t>
+            </w:r>
+            <w:proofErr w:type="spellStart"/>
+            <w:r>
+              <w:rPr>
+                <w:rFonts w:ascii="Arial" w:hAnsi="Arial" w:cs="Arial"/>
+              </w:rPr>
+              <w:t>pushare</w:t>
+            </w:r>
+            <w:proofErr w:type="spellEnd"/>
+            <w:r>
+              <w:rPr>
+                <w:rFonts w:ascii="Arial" w:hAnsi="Arial" w:cs="Arial"/>
+              </w:rPr>
+              <w:t xml:space="preserve"> il progetto </w:t>
+            </w:r>
+            <w:proofErr w:type="spellStart"/>
+            <w:r>
+              <w:rPr>
+                <w:rFonts w:ascii="Arial" w:hAnsi="Arial" w:cs="Arial"/>
+              </w:rPr>
+              <w:t>uinity</w:t>
+            </w:r>
+            <w:proofErr w:type="spellEnd"/>
+            <w:r>
+              <w:rPr>
+                <w:rFonts w:ascii="Arial" w:hAnsi="Arial" w:cs="Arial"/>
+              </w:rPr>
+              <w:t xml:space="preserve">, risolto grazie alla creazione di un </w:t>
+            </w:r>
+            <w:proofErr w:type="gramStart"/>
+            <w:r>
+              <w:rPr>
+                <w:rFonts w:ascii="Arial" w:hAnsi="Arial" w:cs="Arial"/>
+              </w:rPr>
+              <w:t>file .</w:t>
+            </w:r>
+            <w:proofErr w:type="spellStart"/>
+            <w:r>
+              <w:rPr>
+                <w:rFonts w:ascii="Arial" w:hAnsi="Arial" w:cs="Arial"/>
+              </w:rPr>
+              <w:t>gitignore</w:t>
+            </w:r>
+            <w:proofErr w:type="spellEnd"/>
+            <w:proofErr w:type="gramEnd"/>
           </w:p>
         </w:tc>
       </w:tr>
@@ -6748,7 +7012,35 @@
               <w:rPr>
                 <w:rFonts w:ascii="Arial" w:hAnsi="Arial" w:cs="Arial"/>
               </w:rPr>
-              <w:t>Ambientarsi nel game engine di unity e quindi cominciare a creare la schermata di statistiche</w:t>
+              <w:t xml:space="preserve">Ambientarsi nel game </w:t>
+            </w:r>
+            <w:proofErr w:type="spellStart"/>
+            <w:r>
+              <w:rPr>
+                <w:rFonts w:ascii="Arial" w:hAnsi="Arial" w:cs="Arial"/>
+              </w:rPr>
+              <w:t>engine</w:t>
+            </w:r>
+            <w:proofErr w:type="spellEnd"/>
+            <w:r>
+              <w:rPr>
+                <w:rFonts w:ascii="Arial" w:hAnsi="Arial" w:cs="Arial"/>
+              </w:rPr>
+              <w:t xml:space="preserve"> di </w:t>
+            </w:r>
+            <w:proofErr w:type="spellStart"/>
+            <w:r>
+              <w:rPr>
+                <w:rFonts w:ascii="Arial" w:hAnsi="Arial" w:cs="Arial"/>
+              </w:rPr>
+              <w:t>unity</w:t>
+            </w:r>
+            <w:proofErr w:type="spellEnd"/>
+            <w:r>
+              <w:rPr>
+                <w:rFonts w:ascii="Arial" w:hAnsi="Arial" w:cs="Arial"/>
+              </w:rPr>
+              <w:t xml:space="preserve"> e quindi cominciare a creare la schermata di statistiche</w:t>
             </w:r>
           </w:p>
         </w:tc>
@@ -7220,7 +7512,21 @@
             <w:rPr>
               <w:rFonts w:ascii="Arial" w:hAnsi="Arial" w:cs="Arial"/>
             </w:rPr>
-            <w:t>Bryan: Generami un’immagine di mockup basandoti sul seguente stile: “stile”</w:t>
+            <w:t xml:space="preserve">Bryan: Generami un’immagine di </w:t>
+          </w:r>
+          <w:proofErr w:type="spellStart"/>
+          <w:r>
+            <w:rPr>
+              <w:rFonts w:ascii="Arial" w:hAnsi="Arial" w:cs="Arial"/>
+            </w:rPr>
+            <w:t>mockup</w:t>
+          </w:r>
+          <w:proofErr w:type="spellEnd"/>
+          <w:r>
+            <w:rPr>
+              <w:rFonts w:ascii="Arial" w:hAnsi="Arial" w:cs="Arial"/>
+            </w:rPr>
+            <w:t xml:space="preserve"> basandoti sul seguente stile: “stile”</w:t>
           </w:r>
         </w:p>
         <w:p>
@@ -7534,14 +7840,58 @@
         <w:rPr>
           <w:rFonts w:ascii="Arial" w:hAnsi="Arial" w:cs="Arial"/>
         </w:rPr>
-        <w:t>Riley: probabilmente non sarei riuscito a risolvere questo problema non avendo un’esperienza molto avanzata con i file .gitignore</w:t>
-      </w:r>
+        <w:t xml:space="preserve">Riley: probabilmente non sarei riuscito a risolvere questo problema non avendo un’esperienza molto avanzata con i </w:t>
+      </w:r>
+      <w:proofErr w:type="gramStart"/>
+      <w:r>
+        <w:rPr>
+          <w:rFonts w:ascii="Arial" w:hAnsi="Arial" w:cs="Arial"/>
+        </w:rPr>
+        <w:t>file .</w:t>
+      </w:r>
+      <w:proofErr w:type="spellStart"/>
+      <w:r>
+        <w:rPr>
+          <w:rFonts w:ascii="Arial" w:hAnsi="Arial" w:cs="Arial"/>
+        </w:rPr>
+        <w:t>gitignore</w:t>
+      </w:r>
+      <w:proofErr w:type="spellEnd"/>
+      <w:proofErr w:type="gramEnd"/>
       <w:r>
         <w:rPr>
           <w:rFonts w:ascii="Arial" w:hAnsi="Arial" w:cs="Arial"/>
         </w:rPr>
         <w:br/>
-        <w:t>Bryan: Averi creato un’immagine su paint che avrebbe reso i mockup molto più confusi.</w:t>
+        <w:t xml:space="preserve">Bryan: Averi creato un’immagine su </w:t>
+      </w:r>
+      <w:proofErr w:type="spellStart"/>
+      <w:r>
+        <w:rPr>
+          <w:rFonts w:ascii="Arial" w:hAnsi="Arial" w:cs="Arial"/>
+        </w:rPr>
+        <w:t>paint</w:t>
+      </w:r>
+      <w:proofErr w:type="spellEnd"/>
+      <w:r>
+        <w:rPr>
+          <w:rFonts w:ascii="Arial" w:hAnsi="Arial" w:cs="Arial"/>
+        </w:rPr>
+        <w:t xml:space="preserve"> che avrebbe reso i </w:t>
+      </w:r>
+      <w:proofErr w:type="spellStart"/>
+      <w:r>
+        <w:rPr>
+          <w:rFonts w:ascii="Arial" w:hAnsi="Arial" w:cs="Arial"/>
+        </w:rPr>
+        <w:t>mockup</w:t>
+      </w:r>
+      <w:proofErr w:type="spellEnd"/>
+      <w:r>
+        <w:rPr>
+          <w:rFonts w:ascii="Arial" w:hAnsi="Arial" w:cs="Arial"/>
+        </w:rPr>
+        <w:t xml:space="preserve"> molto più confusi.</w:t>
       </w:r>
     </w:p>
     <w:p>
@@ -7727,7 +8077,21 @@
               <w:rPr>
                 <w:rFonts w:ascii="Arial" w:hAnsi="Arial" w:cs="Arial"/>
               </w:rPr>
-              <w:t>Inizio sviluppo ui statistiche</w:t>
+              <w:t xml:space="preserve">Inizio sviluppo </w:t>
+            </w:r>
+            <w:proofErr w:type="spellStart"/>
+            <w:r>
+              <w:rPr>
+                <w:rFonts w:ascii="Arial" w:hAnsi="Arial" w:cs="Arial"/>
+              </w:rPr>
+              <w:t>ui</w:t>
+            </w:r>
+            <w:proofErr w:type="spellEnd"/>
+            <w:r>
+              <w:rPr>
+                <w:rFonts w:ascii="Arial" w:hAnsi="Arial" w:cs="Arial"/>
+              </w:rPr>
+              <w:t xml:space="preserve"> statistiche</w:t>
             </w:r>
           </w:p>
         </w:tc>
@@ -7765,7 +8129,21 @@
               <w:rPr>
                 <w:rFonts w:ascii="Arial" w:hAnsi="Arial" w:cs="Arial"/>
               </w:rPr>
-              <w:t>Inizio sviluppo ui statistiche</w:t>
+              <w:t xml:space="preserve">Inizio sviluppo </w:t>
+            </w:r>
+            <w:proofErr w:type="spellStart"/>
+            <w:r>
+              <w:rPr>
+                <w:rFonts w:ascii="Arial" w:hAnsi="Arial" w:cs="Arial"/>
+              </w:rPr>
+              <w:t>ui</w:t>
+            </w:r>
+            <w:proofErr w:type="spellEnd"/>
+            <w:r>
+              <w:rPr>
+                <w:rFonts w:ascii="Arial" w:hAnsi="Arial" w:cs="Arial"/>
+              </w:rPr>
+              <w:t xml:space="preserve"> statistiche</w:t>
             </w:r>
           </w:p>
         </w:tc>
@@ -7998,7 +8376,21 @@
               <w:rPr>
                 <w:rFonts w:ascii="Arial" w:hAnsi="Arial" w:cs="Arial"/>
               </w:rPr>
-              <w:t>Completare la ui delle statistiche</w:t>
+              <w:t xml:space="preserve">Completare la </w:t>
+            </w:r>
+            <w:proofErr w:type="spellStart"/>
+            <w:r>
+              <w:rPr>
+                <w:rFonts w:ascii="Arial" w:hAnsi="Arial" w:cs="Arial"/>
+              </w:rPr>
+              <w:t>ui</w:t>
+            </w:r>
+            <w:proofErr w:type="spellEnd"/>
+            <w:r>
+              <w:rPr>
+                <w:rFonts w:ascii="Arial" w:hAnsi="Arial" w:cs="Arial"/>
+              </w:rPr>
+              <w:t xml:space="preserve"> delle statistiche</w:t>
             </w:r>
           </w:p>
         </w:tc>
@@ -8048,12 +8440,28 @@
                 <w:rFonts w:ascii="Arial" w:hAnsi="Arial" w:cs="Arial"/>
               </w:rPr>
             </w:pPr>
-            <w:r>
-              <w:rPr>
-                <w:rFonts w:ascii="Arial" w:hAnsi="Arial" w:cs="Arial"/>
-              </w:rPr>
-              <w:t>Daily Scrum</w:t>
-            </w:r>
+            <w:proofErr w:type="spellStart"/>
+            <w:r>
+              <w:rPr>
+                <w:rFonts w:ascii="Arial" w:hAnsi="Arial" w:cs="Arial"/>
+              </w:rPr>
+              <w:t>Daily</w:t>
+            </w:r>
+            <w:proofErr w:type="spellEnd"/>
+            <w:r>
+              <w:rPr>
+                <w:rFonts w:ascii="Arial" w:hAnsi="Arial" w:cs="Arial"/>
+              </w:rPr>
+              <w:t xml:space="preserve"> </w:t>
+            </w:r>
+            <w:proofErr w:type="spellStart"/>
+            <w:r>
+              <w:rPr>
+                <w:rFonts w:ascii="Arial" w:hAnsi="Arial" w:cs="Arial"/>
+              </w:rPr>
+              <w:t>Scrum</w:t>
+            </w:r>
+            <w:proofErr w:type="spellEnd"/>
           </w:p>
         </w:tc>
       </w:tr>
@@ -8101,7 +8509,35 @@
               <w:rPr>
                 <w:rFonts w:ascii="Arial" w:hAnsi="Arial" w:cs="Arial"/>
               </w:rPr>
-              <w:t>Introduzione ambiente unity e inizio imostazione layout statistiche</w:t>
+              <w:t xml:space="preserve">Introduzione ambiente </w:t>
+            </w:r>
+            <w:proofErr w:type="spellStart"/>
+            <w:r>
+              <w:rPr>
+                <w:rFonts w:ascii="Arial" w:hAnsi="Arial" w:cs="Arial"/>
+              </w:rPr>
+              <w:t>unity</w:t>
+            </w:r>
+            <w:proofErr w:type="spellEnd"/>
+            <w:r>
+              <w:rPr>
+                <w:rFonts w:ascii="Arial" w:hAnsi="Arial" w:cs="Arial"/>
+              </w:rPr>
+              <w:t xml:space="preserve"> e inizio </w:t>
+            </w:r>
+            <w:proofErr w:type="spellStart"/>
+            <w:r>
+              <w:rPr>
+                <w:rFonts w:ascii="Arial" w:hAnsi="Arial" w:cs="Arial"/>
+              </w:rPr>
+              <w:t>imostazione</w:t>
+            </w:r>
+            <w:proofErr w:type="spellEnd"/>
+            <w:r>
+              <w:rPr>
+                <w:rFonts w:ascii="Arial" w:hAnsi="Arial" w:cs="Arial"/>
+              </w:rPr>
+              <w:t xml:space="preserve"> layout statistiche</w:t>
             </w:r>
           </w:p>
         </w:tc>
@@ -8281,8 +8717,16 @@
               <w:rPr>
                 <w:rFonts w:ascii="Arial" w:hAnsi="Arial" w:cs="Arial"/>
               </w:rPr>
-              <w:t>Sprint Retrospective</w:t>
-            </w:r>
+              <w:t xml:space="preserve">Sprint </w:t>
+            </w:r>
+            <w:proofErr w:type="spellStart"/>
+            <w:r>
+              <w:rPr>
+                <w:rFonts w:ascii="Arial" w:hAnsi="Arial" w:cs="Arial"/>
+              </w:rPr>
+              <w:t>Retrospective</w:t>
+            </w:r>
+            <w:proofErr w:type="spellEnd"/>
           </w:p>
         </w:tc>
       </w:tr>
@@ -9243,8 +9687,44 @@
               <w:rPr>
                 <w:rFonts w:ascii="Arial" w:hAnsi="Arial" w:cs="Arial"/>
               </w:rPr>
-              <w:t>Ricerca e sviluppo per salvataggio statistiche su json, non ancora completo, questo verrà utilizzato come test per verificare il funzionamento delle varie schermate ui poi verrà adattato per il db</w:t>
-            </w:r>
+              <w:t xml:space="preserve">Ricerca e sviluppo per salvataggio statistiche su </w:t>
+            </w:r>
+            <w:proofErr w:type="spellStart"/>
+            <w:r>
+              <w:rPr>
+                <w:rFonts w:ascii="Arial" w:hAnsi="Arial" w:cs="Arial"/>
+              </w:rPr>
+              <w:t>json</w:t>
+            </w:r>
+            <w:proofErr w:type="spellEnd"/>
+            <w:r>
+              <w:rPr>
+                <w:rFonts w:ascii="Arial" w:hAnsi="Arial" w:cs="Arial"/>
+              </w:rPr>
+              <w:t xml:space="preserve">, non ancora completo, questo verrà utilizzato come test per verificare il funzionamento delle varie schermate </w:t>
+            </w:r>
+            <w:proofErr w:type="spellStart"/>
+            <w:r>
+              <w:rPr>
+                <w:rFonts w:ascii="Arial" w:hAnsi="Arial" w:cs="Arial"/>
+              </w:rPr>
+              <w:t>ui</w:t>
+            </w:r>
+            <w:proofErr w:type="spellEnd"/>
+            <w:r>
+              <w:rPr>
+                <w:rFonts w:ascii="Arial" w:hAnsi="Arial" w:cs="Arial"/>
+              </w:rPr>
+              <w:t xml:space="preserve"> poi verrà adattato per il </w:t>
+            </w:r>
+            <w:proofErr w:type="spellStart"/>
+            <w:r>
+              <w:rPr>
+                <w:rFonts w:ascii="Arial" w:hAnsi="Arial" w:cs="Arial"/>
+              </w:rPr>
+              <w:t>db</w:t>
+            </w:r>
+            <w:proofErr w:type="spellEnd"/>
           </w:p>
         </w:tc>
       </w:tr>
@@ -9398,7 +9878,21 @@
               <w:rPr>
                 <w:rFonts w:ascii="Arial" w:hAnsi="Arial" w:cs="Arial"/>
               </w:rPr>
-              <w:t>Non trovavo la cartella degli assets, risolto cercando su google.</w:t>
+              <w:t xml:space="preserve">Non trovavo la cartella degli assets, risolto cercando su </w:t>
+            </w:r>
+            <w:proofErr w:type="spellStart"/>
+            <w:r>
+              <w:rPr>
+                <w:rFonts w:ascii="Arial" w:hAnsi="Arial" w:cs="Arial"/>
+              </w:rPr>
+              <w:t>google</w:t>
+            </w:r>
+            <w:proofErr w:type="spellEnd"/>
+            <w:r>
+              <w:rPr>
+                <w:rFonts w:ascii="Arial" w:hAnsi="Arial" w:cs="Arial"/>
+              </w:rPr>
+              <w:t>.</w:t>
             </w:r>
           </w:p>
         </w:tc>
@@ -9456,7 +9950,21 @@
               <w:rPr>
                 <w:rFonts w:ascii="Arial" w:hAnsi="Arial" w:cs="Arial"/>
               </w:rPr>
-              <w:t>Le statistiche non sono concluse, manca una piccola parte della ui e la logica di salvataggio e caricamento</w:t>
+              <w:t xml:space="preserve">Le statistiche non sono concluse, manca una piccola parte della </w:t>
+            </w:r>
+            <w:proofErr w:type="spellStart"/>
+            <w:r>
+              <w:rPr>
+                <w:rFonts w:ascii="Arial" w:hAnsi="Arial" w:cs="Arial"/>
+              </w:rPr>
+              <w:t>ui</w:t>
+            </w:r>
+            <w:proofErr w:type="spellEnd"/>
+            <w:r>
+              <w:rPr>
+                <w:rFonts w:ascii="Arial" w:hAnsi="Arial" w:cs="Arial"/>
+              </w:rPr>
+              <w:t xml:space="preserve"> e la logica di salvataggio e caricamento</w:t>
             </w:r>
           </w:p>
         </w:tc>
@@ -9564,12 +10072,28 @@
                 <w:rFonts w:ascii="Arial" w:hAnsi="Arial" w:cs="Arial"/>
               </w:rPr>
             </w:pPr>
-            <w:r>
-              <w:rPr>
-                <w:rFonts w:ascii="Arial" w:hAnsi="Arial" w:cs="Arial"/>
-              </w:rPr>
-              <w:t>Daily Scrum</w:t>
-            </w:r>
+            <w:proofErr w:type="spellStart"/>
+            <w:r>
+              <w:rPr>
+                <w:rFonts w:ascii="Arial" w:hAnsi="Arial" w:cs="Arial"/>
+              </w:rPr>
+              <w:t>Daily</w:t>
+            </w:r>
+            <w:proofErr w:type="spellEnd"/>
+            <w:r>
+              <w:rPr>
+                <w:rFonts w:ascii="Arial" w:hAnsi="Arial" w:cs="Arial"/>
+              </w:rPr>
+              <w:t xml:space="preserve"> </w:t>
+            </w:r>
+            <w:proofErr w:type="spellStart"/>
+            <w:r>
+              <w:rPr>
+                <w:rFonts w:ascii="Arial" w:hAnsi="Arial" w:cs="Arial"/>
+              </w:rPr>
+              <w:t>Scrum</w:t>
+            </w:r>
+            <w:proofErr w:type="spellEnd"/>
           </w:p>
         </w:tc>
       </w:tr>
@@ -9617,7 +10141,35 @@
               <w:rPr>
                 <w:rFonts w:ascii="Arial" w:hAnsi="Arial" w:cs="Arial"/>
               </w:rPr>
-              <w:t>Entrambi completeremo la ui delle statistiche in modo tale che ci ambientiamo completamente per lo sviluppo 2D e gli script C# per poterci permettere di lavorare separatamente in fututro.</w:t>
+              <w:t xml:space="preserve">Entrambi completeremo la </w:t>
+            </w:r>
+            <w:proofErr w:type="spellStart"/>
+            <w:r>
+              <w:rPr>
+                <w:rFonts w:ascii="Arial" w:hAnsi="Arial" w:cs="Arial"/>
+              </w:rPr>
+              <w:t>ui</w:t>
+            </w:r>
+            <w:proofErr w:type="spellEnd"/>
+            <w:r>
+              <w:rPr>
+                <w:rFonts w:ascii="Arial" w:hAnsi="Arial" w:cs="Arial"/>
+              </w:rPr>
+              <w:t xml:space="preserve"> delle statistiche in modo tale che ci ambientiamo completamente per lo sviluppo 2D e gli script C# per poterci permettere di lavorare separatamente in </w:t>
+            </w:r>
+            <w:proofErr w:type="spellStart"/>
+            <w:r>
+              <w:rPr>
+                <w:rFonts w:ascii="Arial" w:hAnsi="Arial" w:cs="Arial"/>
+              </w:rPr>
+              <w:t>fututro</w:t>
+            </w:r>
+            <w:proofErr w:type="spellEnd"/>
+            <w:r>
+              <w:rPr>
+                <w:rFonts w:ascii="Arial" w:hAnsi="Arial" w:cs="Arial"/>
+              </w:rPr>
+              <w:t>.</w:t>
             </w:r>
           </w:p>
         </w:tc>
@@ -9797,8 +10349,16 @@
               <w:rPr>
                 <w:rFonts w:ascii="Arial" w:hAnsi="Arial" w:cs="Arial"/>
               </w:rPr>
-              <w:t>Sprint Retrospective</w:t>
-            </w:r>
+              <w:t xml:space="preserve">Sprint </w:t>
+            </w:r>
+            <w:proofErr w:type="spellStart"/>
+            <w:r>
+              <w:rPr>
+                <w:rFonts w:ascii="Arial" w:hAnsi="Arial" w:cs="Arial"/>
+              </w:rPr>
+              <w:t>Retrospective</w:t>
+            </w:r>
+            <w:proofErr w:type="spellEnd"/>
           </w:p>
         </w:tc>
       </w:tr>
@@ -10290,8 +10850,30 @@
             <w:rPr>
               <w:rFonts w:ascii="Arial" w:hAnsi="Arial" w:cs="Arial"/>
             </w:rPr>
-            <w:t>Riley: aiutami a comprendere come salvare dei dati unity su un json</w:t>
-          </w:r>
+            <w:t xml:space="preserve">Riley: aiutami a comprendere come salvare dei dati </w:t>
+          </w:r>
+          <w:proofErr w:type="spellStart"/>
+          <w:r>
+            <w:rPr>
+              <w:rFonts w:ascii="Arial" w:hAnsi="Arial" w:cs="Arial"/>
+            </w:rPr>
+            <w:t>unity</w:t>
+          </w:r>
+          <w:proofErr w:type="spellEnd"/>
+          <w:r>
+            <w:rPr>
+              <w:rFonts w:ascii="Arial" w:hAnsi="Arial" w:cs="Arial"/>
+            </w:rPr>
+            <w:t xml:space="preserve"> su un </w:t>
+          </w:r>
+          <w:proofErr w:type="spellStart"/>
+          <w:r>
+            <w:rPr>
+              <w:rFonts w:ascii="Arial" w:hAnsi="Arial" w:cs="Arial"/>
+            </w:rPr>
+            <w:t>json</w:t>
+          </w:r>
+          <w:proofErr w:type="spellEnd"/>
         </w:p>
       </w:sdtContent>
     </w:sdt>
@@ -10803,7 +11385,21 @@
               <w:rPr>
                 <w:rFonts w:ascii="Arial" w:hAnsi="Arial" w:cs="Arial"/>
               </w:rPr>
-              <w:t>Terminato ui statistiche e iniziato quella delle impostazioni</w:t>
+              <w:t xml:space="preserve">Terminato </w:t>
+            </w:r>
+            <w:proofErr w:type="spellStart"/>
+            <w:r>
+              <w:rPr>
+                <w:rFonts w:ascii="Arial" w:hAnsi="Arial" w:cs="Arial"/>
+              </w:rPr>
+              <w:t>ui</w:t>
+            </w:r>
+            <w:proofErr w:type="spellEnd"/>
+            <w:r>
+              <w:rPr>
+                <w:rFonts w:ascii="Arial" w:hAnsi="Arial" w:cs="Arial"/>
+              </w:rPr>
+              <w:t xml:space="preserve"> statistiche e iniziato quella delle impostazioni</w:t>
             </w:r>
           </w:p>
         </w:tc>
@@ -10882,13 +11478,97 @@
               <w:rPr>
                 <w:rFonts w:ascii="Arial" w:hAnsi="Arial" w:cs="Arial"/>
               </w:rPr>
-              <w:t>Problemi di merge, risolto tramite una configurazione di un tool di unity che permette di risolvere automaticamente i conflitti, è stato fatto una configurazione che fa avvia un file .cmd sotto la cartella tools questo piccolo script prende i file con conflitti rilevati da git e li traduce per unityyalmmerge facendo in modo che una volta usato il comando git pull non risultino più errori.</w:t>
-            </w:r>
-            <w:r>
-              <w:rPr>
-                <w:rFonts w:ascii="Arial" w:hAnsi="Arial" w:cs="Arial"/>
-              </w:rPr>
-              <w:t xml:space="preserve"> Chatgpt mi ha supportato nella risoluzione di questo problema</w:t>
+              <w:t xml:space="preserve">Problemi di merge, risolto tramite una configurazione di un tool di </w:t>
+            </w:r>
+            <w:proofErr w:type="spellStart"/>
+            <w:r>
+              <w:rPr>
+                <w:rFonts w:ascii="Arial" w:hAnsi="Arial" w:cs="Arial"/>
+              </w:rPr>
+              <w:t>unity</w:t>
+            </w:r>
+            <w:proofErr w:type="spellEnd"/>
+            <w:r>
+              <w:rPr>
+                <w:rFonts w:ascii="Arial" w:hAnsi="Arial" w:cs="Arial"/>
+              </w:rPr>
+              <w:t xml:space="preserve"> che permette di risolvere automaticamente i conflitti, è stato fatto una configurazione che fa avvia un file .</w:t>
+            </w:r>
+            <w:proofErr w:type="spellStart"/>
+            <w:r>
+              <w:rPr>
+                <w:rFonts w:ascii="Arial" w:hAnsi="Arial" w:cs="Arial"/>
+              </w:rPr>
+              <w:t>cmd</w:t>
+            </w:r>
+            <w:proofErr w:type="spellEnd"/>
+            <w:r>
+              <w:rPr>
+                <w:rFonts w:ascii="Arial" w:hAnsi="Arial" w:cs="Arial"/>
+              </w:rPr>
+              <w:t xml:space="preserve"> sotto la cartella tools questo piccolo script prende i file con conflitti rilevati da </w:t>
+            </w:r>
+            <w:proofErr w:type="spellStart"/>
+            <w:r>
+              <w:rPr>
+                <w:rFonts w:ascii="Arial" w:hAnsi="Arial" w:cs="Arial"/>
+              </w:rPr>
+              <w:t>git</w:t>
+            </w:r>
+            <w:proofErr w:type="spellEnd"/>
+            <w:r>
+              <w:rPr>
+                <w:rFonts w:ascii="Arial" w:hAnsi="Arial" w:cs="Arial"/>
+              </w:rPr>
+              <w:t xml:space="preserve"> e li traduce per </w:t>
+            </w:r>
+            <w:proofErr w:type="spellStart"/>
+            <w:r>
+              <w:rPr>
+                <w:rFonts w:ascii="Arial" w:hAnsi="Arial" w:cs="Arial"/>
+              </w:rPr>
+              <w:t>unityyalmmerge</w:t>
+            </w:r>
+            <w:proofErr w:type="spellEnd"/>
+            <w:r>
+              <w:rPr>
+                <w:rFonts w:ascii="Arial" w:hAnsi="Arial" w:cs="Arial"/>
+              </w:rPr>
+              <w:t xml:space="preserve"> facendo in modo che una volta usato il comando </w:t>
+            </w:r>
+            <w:proofErr w:type="spellStart"/>
+            <w:r>
+              <w:rPr>
+                <w:rFonts w:ascii="Arial" w:hAnsi="Arial" w:cs="Arial"/>
+              </w:rPr>
+              <w:t>git</w:t>
+            </w:r>
+            <w:proofErr w:type="spellEnd"/>
+            <w:r>
+              <w:rPr>
+                <w:rFonts w:ascii="Arial" w:hAnsi="Arial" w:cs="Arial"/>
+              </w:rPr>
+              <w:t xml:space="preserve"> pull non risultino più errori.</w:t>
+            </w:r>
+            <w:r>
+              <w:rPr>
+                <w:rFonts w:ascii="Arial" w:hAnsi="Arial" w:cs="Arial"/>
+              </w:rPr>
+              <w:t xml:space="preserve"> </w:t>
+            </w:r>
+            <w:proofErr w:type="spellStart"/>
+            <w:r>
+              <w:rPr>
+                <w:rFonts w:ascii="Arial" w:hAnsi="Arial" w:cs="Arial"/>
+              </w:rPr>
+              <w:t>Chatgpt</w:t>
+            </w:r>
+            <w:proofErr w:type="spellEnd"/>
+            <w:r>
+              <w:rPr>
+                <w:rFonts w:ascii="Arial" w:hAnsi="Arial" w:cs="Arial"/>
+              </w:rPr>
+              <w:t xml:space="preserve"> mi ha supportato nella risoluzione di questo problema</w:t>
             </w:r>
           </w:p>
         </w:tc>
@@ -10984,7 +11664,21 @@
               <w:rPr>
                 <w:rFonts w:ascii="Arial" w:hAnsi="Arial" w:cs="Arial"/>
               </w:rPr>
-              <w:t>La ui delle statistiche è completa ma mancano alcune parti dello script, di conseguenza abbiamo un ritardo generale.</w:t>
+              <w:t xml:space="preserve">La </w:t>
+            </w:r>
+            <w:proofErr w:type="spellStart"/>
+            <w:r>
+              <w:rPr>
+                <w:rFonts w:ascii="Arial" w:hAnsi="Arial" w:cs="Arial"/>
+              </w:rPr>
+              <w:t>ui</w:t>
+            </w:r>
+            <w:proofErr w:type="spellEnd"/>
+            <w:r>
+              <w:rPr>
+                <w:rFonts w:ascii="Arial" w:hAnsi="Arial" w:cs="Arial"/>
+              </w:rPr>
+              <w:t xml:space="preserve"> delle statistiche è completa ma mancano alcune parti dello script, di conseguenza abbiamo un ritardo generale.</w:t>
             </w:r>
           </w:p>
         </w:tc>
@@ -11042,7 +11736,21 @@
               <w:rPr>
                 <w:rFonts w:ascii="Arial" w:hAnsi="Arial" w:cs="Arial"/>
               </w:rPr>
-              <w:t>Terminare script statistiche, continuare ui impostazioni</w:t>
+              <w:t xml:space="preserve">Terminare script statistiche, continuare </w:t>
+            </w:r>
+            <w:proofErr w:type="spellStart"/>
+            <w:r>
+              <w:rPr>
+                <w:rFonts w:ascii="Arial" w:hAnsi="Arial" w:cs="Arial"/>
+              </w:rPr>
+              <w:t>ui</w:t>
+            </w:r>
+            <w:proofErr w:type="spellEnd"/>
+            <w:r>
+              <w:rPr>
+                <w:rFonts w:ascii="Arial" w:hAnsi="Arial" w:cs="Arial"/>
+              </w:rPr>
+              <w:t xml:space="preserve"> impostazioni</w:t>
             </w:r>
           </w:p>
         </w:tc>
@@ -11092,12 +11800,28 @@
                 <w:rFonts w:ascii="Arial" w:hAnsi="Arial" w:cs="Arial"/>
               </w:rPr>
             </w:pPr>
-            <w:r>
-              <w:rPr>
-                <w:rFonts w:ascii="Arial" w:hAnsi="Arial" w:cs="Arial"/>
-              </w:rPr>
-              <w:t>Daily Scrum</w:t>
-            </w:r>
+            <w:proofErr w:type="spellStart"/>
+            <w:r>
+              <w:rPr>
+                <w:rFonts w:ascii="Arial" w:hAnsi="Arial" w:cs="Arial"/>
+              </w:rPr>
+              <w:t>Daily</w:t>
+            </w:r>
+            <w:proofErr w:type="spellEnd"/>
+            <w:r>
+              <w:rPr>
+                <w:rFonts w:ascii="Arial" w:hAnsi="Arial" w:cs="Arial"/>
+              </w:rPr>
+              <w:t xml:space="preserve"> </w:t>
+            </w:r>
+            <w:proofErr w:type="spellStart"/>
+            <w:r>
+              <w:rPr>
+                <w:rFonts w:ascii="Arial" w:hAnsi="Arial" w:cs="Arial"/>
+              </w:rPr>
+              <w:t>Scrum</w:t>
+            </w:r>
+            <w:proofErr w:type="spellEnd"/>
           </w:p>
         </w:tc>
       </w:tr>
@@ -11145,7 +11869,21 @@
               <w:rPr>
                 <w:rFonts w:ascii="Arial" w:hAnsi="Arial" w:cs="Arial"/>
               </w:rPr>
-              <w:t>Riley deve risolvere un problema di merge riscontrato al tentativo di pull e poi continuare con lo script delle statistiche, invece Bryan deve fine la ui delle statistiche e preferibilmente iniziare con le impostazioni.</w:t>
+              <w:t xml:space="preserve">Riley deve risolvere un problema di merge riscontrato al tentativo di pull e poi continuare con lo script delle statistiche, invece Bryan deve fine la </w:t>
+            </w:r>
+            <w:proofErr w:type="spellStart"/>
+            <w:r>
+              <w:rPr>
+                <w:rFonts w:ascii="Arial" w:hAnsi="Arial" w:cs="Arial"/>
+              </w:rPr>
+              <w:t>ui</w:t>
+            </w:r>
+            <w:proofErr w:type="spellEnd"/>
+            <w:r>
+              <w:rPr>
+                <w:rFonts w:ascii="Arial" w:hAnsi="Arial" w:cs="Arial"/>
+              </w:rPr>
+              <w:t xml:space="preserve"> delle statistiche e preferibilmente iniziare con le impostazioni.</w:t>
             </w:r>
           </w:p>
         </w:tc>
@@ -11325,8 +12063,16 @@
               <w:rPr>
                 <w:rFonts w:ascii="Arial" w:hAnsi="Arial" w:cs="Arial"/>
               </w:rPr>
-              <w:t>Sprint Retrospective</w:t>
-            </w:r>
+              <w:t xml:space="preserve">Sprint </w:t>
+            </w:r>
+            <w:proofErr w:type="spellStart"/>
+            <w:r>
+              <w:rPr>
+                <w:rFonts w:ascii="Arial" w:hAnsi="Arial" w:cs="Arial"/>
+              </w:rPr>
+              <w:t>Retrospective</w:t>
+            </w:r>
+            <w:proofErr w:type="spellEnd"/>
           </w:p>
         </w:tc>
       </w:tr>
@@ -11830,7 +12576,21 @@
             <w:rPr>
               <w:rFonts w:ascii="Arial" w:hAnsi="Arial" w:cs="Arial"/>
             </w:rPr>
-            <w:t>Ho riscontrato un problema di merge nonostante abbiamo impostato un sistema con un tool unity, puoi dirmi cosa analizzare per risolvere?</w:t>
+            <w:t xml:space="preserve">Ho riscontrato un problema di merge nonostante abbiamo impostato un sistema con un tool </w:t>
+          </w:r>
+          <w:proofErr w:type="spellStart"/>
+          <w:r>
+            <w:rPr>
+              <w:rFonts w:ascii="Arial" w:hAnsi="Arial" w:cs="Arial"/>
+            </w:rPr>
+            <w:t>unity</w:t>
+          </w:r>
+          <w:proofErr w:type="spellEnd"/>
+          <w:r>
+            <w:rPr>
+              <w:rFonts w:ascii="Arial" w:hAnsi="Arial" w:cs="Arial"/>
+            </w:rPr>
+            <w:t>, puoi dirmi cosa analizzare per risolvere?</w:t>
           </w:r>
         </w:p>
         <w:p>
@@ -11845,7 +12605,21 @@
             <w:rPr>
               <w:rFonts w:ascii="Arial" w:hAnsi="Arial" w:cs="Arial"/>
             </w:rPr>
-            <w:t>Bryan: come si implementa un font in unity?</w:t>
+            <w:t xml:space="preserve">Bryan: come si implementa un font in </w:t>
+          </w:r>
+          <w:proofErr w:type="spellStart"/>
+          <w:r>
+            <w:rPr>
+              <w:rFonts w:ascii="Arial" w:hAnsi="Arial" w:cs="Arial"/>
+            </w:rPr>
+            <w:t>unity</w:t>
+          </w:r>
+          <w:proofErr w:type="spellEnd"/>
+          <w:r>
+            <w:rPr>
+              <w:rFonts w:ascii="Arial" w:hAnsi="Arial" w:cs="Arial"/>
+            </w:rPr>
+            <w:t>?</w:t>
           </w:r>
         </w:p>
       </w:sdtContent>
@@ -12554,7 +13328,49 @@
               <w:rPr>
                 <w:rFonts w:ascii="Arial" w:hAnsi="Arial" w:cs="Arial"/>
               </w:rPr>
-              <w:t>Rispetto alla pianificazione abbiamo un leggero ritardo avendo finito solo oggi le statistiche, ma questo risulta recuperabile essendo che lavoriamo separatamente dividendo ui e scripting, infatti bryan ha iniziato la ui delle impostazioni il giorno previsto.</w:t>
+              <w:t xml:space="preserve">Rispetto alla pianificazione abbiamo un leggero ritardo avendo finito solo oggi le statistiche, ma questo risulta recuperabile essendo che lavoriamo separatamente dividendo </w:t>
+            </w:r>
+            <w:proofErr w:type="spellStart"/>
+            <w:r>
+              <w:rPr>
+                <w:rFonts w:ascii="Arial" w:hAnsi="Arial" w:cs="Arial"/>
+              </w:rPr>
+              <w:t>ui</w:t>
+            </w:r>
+            <w:proofErr w:type="spellEnd"/>
+            <w:r>
+              <w:rPr>
+                <w:rFonts w:ascii="Arial" w:hAnsi="Arial" w:cs="Arial"/>
+              </w:rPr>
+              <w:t xml:space="preserve"> e scripting, infatti </w:t>
+            </w:r>
+            <w:proofErr w:type="spellStart"/>
+            <w:r>
+              <w:rPr>
+                <w:rFonts w:ascii="Arial" w:hAnsi="Arial" w:cs="Arial"/>
+              </w:rPr>
+              <w:t>bryan</w:t>
+            </w:r>
+            <w:proofErr w:type="spellEnd"/>
+            <w:r>
+              <w:rPr>
+                <w:rFonts w:ascii="Arial" w:hAnsi="Arial" w:cs="Arial"/>
+              </w:rPr>
+              <w:t xml:space="preserve"> ha iniziato la </w:t>
+            </w:r>
+            <w:proofErr w:type="spellStart"/>
+            <w:r>
+              <w:rPr>
+                <w:rFonts w:ascii="Arial" w:hAnsi="Arial" w:cs="Arial"/>
+              </w:rPr>
+              <w:t>ui</w:t>
+            </w:r>
+            <w:proofErr w:type="spellEnd"/>
+            <w:r>
+              <w:rPr>
+                <w:rFonts w:ascii="Arial" w:hAnsi="Arial" w:cs="Arial"/>
+              </w:rPr>
+              <w:t xml:space="preserve"> delle impostazioni il giorno previsto.</w:t>
             </w:r>
           </w:p>
         </w:tc>
@@ -12675,12 +13491,28 @@
                 <w:rFonts w:ascii="Arial" w:hAnsi="Arial" w:cs="Arial"/>
               </w:rPr>
             </w:pPr>
-            <w:r>
-              <w:rPr>
-                <w:rFonts w:ascii="Arial" w:hAnsi="Arial" w:cs="Arial"/>
-              </w:rPr>
-              <w:t>Daily Scrum</w:t>
-            </w:r>
+            <w:proofErr w:type="spellStart"/>
+            <w:r>
+              <w:rPr>
+                <w:rFonts w:ascii="Arial" w:hAnsi="Arial" w:cs="Arial"/>
+              </w:rPr>
+              <w:t>Daily</w:t>
+            </w:r>
+            <w:proofErr w:type="spellEnd"/>
+            <w:r>
+              <w:rPr>
+                <w:rFonts w:ascii="Arial" w:hAnsi="Arial" w:cs="Arial"/>
+              </w:rPr>
+              <w:t xml:space="preserve"> </w:t>
+            </w:r>
+            <w:proofErr w:type="spellStart"/>
+            <w:r>
+              <w:rPr>
+                <w:rFonts w:ascii="Arial" w:hAnsi="Arial" w:cs="Arial"/>
+              </w:rPr>
+              <w:t>Scrum</w:t>
+            </w:r>
+            <w:proofErr w:type="spellEnd"/>
           </w:p>
         </w:tc>
       </w:tr>
@@ -12742,7 +13574,21 @@
               <w:rPr>
                 <w:rFonts w:ascii="Arial" w:hAnsi="Arial" w:cs="Arial"/>
               </w:rPr>
-              <w:t>Bryan: Finire la ui del</w:t>
+              <w:t xml:space="preserve">Bryan: Finire la </w:t>
+            </w:r>
+            <w:proofErr w:type="spellStart"/>
+            <w:r>
+              <w:rPr>
+                <w:rFonts w:ascii="Arial" w:hAnsi="Arial" w:cs="Arial"/>
+              </w:rPr>
+              <w:t>ui</w:t>
+            </w:r>
+            <w:proofErr w:type="spellEnd"/>
+            <w:r>
+              <w:rPr>
+                <w:rFonts w:ascii="Arial" w:hAnsi="Arial" w:cs="Arial"/>
+              </w:rPr>
+              <w:t xml:space="preserve"> del</w:t>
             </w:r>
             <w:r>
               <w:rPr>
@@ -12928,8 +13774,16 @@
               <w:rPr>
                 <w:rFonts w:ascii="Arial" w:hAnsi="Arial" w:cs="Arial"/>
               </w:rPr>
-              <w:t>Sprint Retrospective</w:t>
-            </w:r>
+              <w:t xml:space="preserve">Sprint </w:t>
+            </w:r>
+            <w:proofErr w:type="spellStart"/>
+            <w:r>
+              <w:rPr>
+                <w:rFonts w:ascii="Arial" w:hAnsi="Arial" w:cs="Arial"/>
+              </w:rPr>
+              <w:t>Retrospective</w:t>
+            </w:r>
+            <w:proofErr w:type="spellEnd"/>
           </w:p>
         </w:tc>
       </w:tr>
@@ -13421,7 +14275,35 @@
             <w:rPr>
               <w:rFonts w:ascii="Arial" w:hAnsi="Arial" w:cs="Arial"/>
             </w:rPr>
-            <w:t>Il numero inserito nel json risulta essere un numero che va dal miliardo in su, ma l’applicativo lo riduce a milioni, per caso i valori int non supportano i miliardi?</w:t>
+            <w:t xml:space="preserve">Il numero inserito nel </w:t>
+          </w:r>
+          <w:proofErr w:type="spellStart"/>
+          <w:r>
+            <w:rPr>
+              <w:rFonts w:ascii="Arial" w:hAnsi="Arial" w:cs="Arial"/>
+            </w:rPr>
+            <w:t>json</w:t>
+          </w:r>
+          <w:proofErr w:type="spellEnd"/>
+          <w:r>
+            <w:rPr>
+              <w:rFonts w:ascii="Arial" w:hAnsi="Arial" w:cs="Arial"/>
+            </w:rPr>
+            <w:t xml:space="preserve"> risulta essere un numero che va dal miliardo in su, ma l’applicativo lo riduce a milioni, per caso i valori </w:t>
+          </w:r>
+          <w:proofErr w:type="spellStart"/>
+          <w:r>
+            <w:rPr>
+              <w:rFonts w:ascii="Arial" w:hAnsi="Arial" w:cs="Arial"/>
+            </w:rPr>
+            <w:t>int</w:t>
+          </w:r>
+          <w:proofErr w:type="spellEnd"/>
+          <w:r>
+            <w:rPr>
+              <w:rFonts w:ascii="Arial" w:hAnsi="Arial" w:cs="Arial"/>
+            </w:rPr>
+            <w:t xml:space="preserve"> non supportano i miliardi?</w:t>
           </w:r>
           <w:r>
             <w:rPr>
@@ -13510,7 +14392,21 @@
             <w:rPr>
               <w:rFonts w:ascii="Arial" w:hAnsi="Arial" w:cs="Arial"/>
             </w:rPr>
-            <w:t>Mi ha detto che int supporta i miliardi ma che ha un massimo di circa 2,2 miliardi ed il numero risultava più grande quindi ho ripiegato su un long</w:t>
+            <w:t xml:space="preserve">Mi ha detto che </w:t>
+          </w:r>
+          <w:proofErr w:type="spellStart"/>
+          <w:r>
+            <w:rPr>
+              <w:rFonts w:ascii="Arial" w:hAnsi="Arial" w:cs="Arial"/>
+            </w:rPr>
+            <w:t>int</w:t>
+          </w:r>
+          <w:proofErr w:type="spellEnd"/>
+          <w:r>
+            <w:rPr>
+              <w:rFonts w:ascii="Arial" w:hAnsi="Arial" w:cs="Arial"/>
+            </w:rPr>
+            <w:t xml:space="preserve"> supporta i miliardi ma che ha un massimo di circa 2,2 miliardi ed il numero risultava più grande quindi ho ripiegato su un long</w:t>
           </w:r>
         </w:p>
       </w:sdtContent>
@@ -14019,7 +14915,21 @@
               <w:rPr>
                 <w:rFonts w:ascii="Arial" w:hAnsi="Arial" w:cs="Arial"/>
               </w:rPr>
-              <w:t>Ho notato come certe impostazioni non sono modificabili con variabili di unity e quindi ho usato del tempo per eseguire qualche ricerca.</w:t>
+              <w:t xml:space="preserve">Ho notato come certe impostazioni non sono modificabili con variabili di </w:t>
+            </w:r>
+            <w:proofErr w:type="spellStart"/>
+            <w:r>
+              <w:rPr>
+                <w:rFonts w:ascii="Arial" w:hAnsi="Arial" w:cs="Arial"/>
+              </w:rPr>
+              <w:t>unity</w:t>
+            </w:r>
+            <w:proofErr w:type="spellEnd"/>
+            <w:r>
+              <w:rPr>
+                <w:rFonts w:ascii="Arial" w:hAnsi="Arial" w:cs="Arial"/>
+              </w:rPr>
+              <w:t xml:space="preserve"> e quindi ho usato del tempo per eseguire qualche ricerca.</w:t>
             </w:r>
           </w:p>
         </w:tc>
@@ -14223,12 +15133,28 @@
                 <w:rFonts w:ascii="Arial" w:hAnsi="Arial" w:cs="Arial"/>
               </w:rPr>
             </w:pPr>
-            <w:r>
-              <w:rPr>
-                <w:rFonts w:ascii="Arial" w:hAnsi="Arial" w:cs="Arial"/>
-              </w:rPr>
-              <w:t>Daily Scrum</w:t>
-            </w:r>
+            <w:proofErr w:type="spellStart"/>
+            <w:r>
+              <w:rPr>
+                <w:rFonts w:ascii="Arial" w:hAnsi="Arial" w:cs="Arial"/>
+              </w:rPr>
+              <w:t>Daily</w:t>
+            </w:r>
+            <w:proofErr w:type="spellEnd"/>
+            <w:r>
+              <w:rPr>
+                <w:rFonts w:ascii="Arial" w:hAnsi="Arial" w:cs="Arial"/>
+              </w:rPr>
+              <w:t xml:space="preserve"> </w:t>
+            </w:r>
+            <w:proofErr w:type="spellStart"/>
+            <w:r>
+              <w:rPr>
+                <w:rFonts w:ascii="Arial" w:hAnsi="Arial" w:cs="Arial"/>
+              </w:rPr>
+              <w:t>Scrum</w:t>
+            </w:r>
+            <w:proofErr w:type="spellEnd"/>
           </w:p>
         </w:tc>
       </w:tr>
@@ -14476,8 +15402,16 @@
               <w:rPr>
                 <w:rFonts w:ascii="Arial" w:hAnsi="Arial" w:cs="Arial"/>
               </w:rPr>
-              <w:t>Sprint Retrospective</w:t>
-            </w:r>
+              <w:t xml:space="preserve">Sprint </w:t>
+            </w:r>
+            <w:proofErr w:type="spellStart"/>
+            <w:r>
+              <w:rPr>
+                <w:rFonts w:ascii="Arial" w:hAnsi="Arial" w:cs="Arial"/>
+              </w:rPr>
+              <w:t>Retrospective</w:t>
+            </w:r>
+            <w:proofErr w:type="spellEnd"/>
           </w:p>
         </w:tc>
       </w:tr>
@@ -14963,7 +15897,21 @@
             <w:rPr>
               <w:rFonts w:ascii="Arial" w:hAnsi="Arial" w:cs="Arial"/>
             </w:rPr>
-            <w:t xml:space="preserve">Riley: sto creando il file data per le impostazioni con questi valori: “valori”. Puoi dirmi che valore effettivo usa unity? </w:t>
+            <w:t xml:space="preserve">Riley: sto creando il file data per le impostazioni con questi valori: “valori”. Puoi dirmi che valore effettivo usa </w:t>
+          </w:r>
+          <w:proofErr w:type="spellStart"/>
+          <w:r>
+            <w:rPr>
+              <w:rFonts w:ascii="Arial" w:hAnsi="Arial" w:cs="Arial"/>
+            </w:rPr>
+            <w:t>unity</w:t>
+          </w:r>
+          <w:proofErr w:type="spellEnd"/>
+          <w:r>
+            <w:rPr>
+              <w:rFonts w:ascii="Arial" w:hAnsi="Arial" w:cs="Arial"/>
+            </w:rPr>
+            <w:t xml:space="preserve">? </w:t>
           </w:r>
         </w:p>
         <w:p>
@@ -14978,8 +15926,44 @@
             <w:rPr>
               <w:rFonts w:ascii="Arial" w:hAnsi="Arial" w:cs="Arial"/>
             </w:rPr>
-            <w:t>Bryan: Come creare un menu con componenti ui che si ripetono modularmente in unity</w:t>
-          </w:r>
+            <w:t xml:space="preserve">Bryan: Come creare un menu con componenti </w:t>
+          </w:r>
+          <w:proofErr w:type="spellStart"/>
+          <w:r>
+            <w:rPr>
+              <w:rFonts w:ascii="Arial" w:hAnsi="Arial" w:cs="Arial"/>
+            </w:rPr>
+            <w:t>ui</w:t>
+          </w:r>
+          <w:proofErr w:type="spellEnd"/>
+          <w:r>
+            <w:rPr>
+              <w:rFonts w:ascii="Arial" w:hAnsi="Arial" w:cs="Arial"/>
+            </w:rPr>
+            <w:t xml:space="preserve"> che si ripetono </w:t>
+          </w:r>
+          <w:proofErr w:type="spellStart"/>
+          <w:r>
+            <w:rPr>
+              <w:rFonts w:ascii="Arial" w:hAnsi="Arial" w:cs="Arial"/>
+            </w:rPr>
+            <w:t>modularmente</w:t>
+          </w:r>
+          <w:proofErr w:type="spellEnd"/>
+          <w:r>
+            <w:rPr>
+              <w:rFonts w:ascii="Arial" w:hAnsi="Arial" w:cs="Arial"/>
+            </w:rPr>
+            <w:t xml:space="preserve"> in </w:t>
+          </w:r>
+          <w:proofErr w:type="spellStart"/>
+          <w:r>
+            <w:rPr>
+              <w:rFonts w:ascii="Arial" w:hAnsi="Arial" w:cs="Arial"/>
+            </w:rPr>
+            <w:t>unity</w:t>
+          </w:r>
+          <w:proofErr w:type="spellEnd"/>
         </w:p>
       </w:sdtContent>
     </w:sdt>
@@ -15290,8 +16274,16 @@
         <w:rPr>
           <w:rFonts w:ascii="Arial" w:hAnsi="Arial" w:cs="Arial"/>
         </w:rPr>
-        <w:t>Bryan: averi cercato un tutorial su youtube</w:t>
-      </w:r>
+        <w:t xml:space="preserve">Bryan: averi cercato un tutorial su </w:t>
+      </w:r>
+      <w:proofErr w:type="spellStart"/>
+      <w:r>
+        <w:rPr>
+          <w:rFonts w:ascii="Arial" w:hAnsi="Arial" w:cs="Arial"/>
+        </w:rPr>
+        <w:t>youtube</w:t>
+      </w:r>
+      <w:proofErr w:type="spellEnd"/>
     </w:p>
     <w:p>
       <w:pPr>
@@ -15477,8 +16469,16 @@
               <w:rPr>
                 <w:rFonts w:ascii="Arial" w:hAnsi="Arial" w:cs="Arial"/>
               </w:rPr>
-              <w:t>Continuato script impostazioni per ui</w:t>
-            </w:r>
+              <w:t xml:space="preserve">Continuato script impostazioni per </w:t>
+            </w:r>
+            <w:proofErr w:type="spellStart"/>
+            <w:r>
+              <w:rPr>
+                <w:rFonts w:ascii="Arial" w:hAnsi="Arial" w:cs="Arial"/>
+              </w:rPr>
+              <w:t>ui</w:t>
+            </w:r>
+            <w:proofErr w:type="spellEnd"/>
           </w:p>
         </w:tc>
       </w:tr>
@@ -15594,7 +16594,35 @@
               <w:rPr>
                 <w:rFonts w:ascii="Arial" w:hAnsi="Arial" w:cs="Arial"/>
               </w:rPr>
-              <w:t xml:space="preserve">Alcuni problemi con i valori inviati dal togglle per fullscreen, scoperto che avevo selezionato un valore statico e non dinamico dell’elemento </w:t>
+              <w:t xml:space="preserve">Alcuni problemi con i valori inviati dal </w:t>
+            </w:r>
+            <w:proofErr w:type="spellStart"/>
+            <w:r>
+              <w:rPr>
+                <w:rFonts w:ascii="Arial" w:hAnsi="Arial" w:cs="Arial"/>
+              </w:rPr>
+              <w:t>togglle</w:t>
+            </w:r>
+            <w:proofErr w:type="spellEnd"/>
+            <w:r>
+              <w:rPr>
+                <w:rFonts w:ascii="Arial" w:hAnsi="Arial" w:cs="Arial"/>
+              </w:rPr>
+              <w:t xml:space="preserve"> per </w:t>
+            </w:r>
+            <w:proofErr w:type="spellStart"/>
+            <w:r>
+              <w:rPr>
+                <w:rFonts w:ascii="Arial" w:hAnsi="Arial" w:cs="Arial"/>
+              </w:rPr>
+              <w:t>fullscreen</w:t>
+            </w:r>
+            <w:proofErr w:type="spellEnd"/>
+            <w:r>
+              <w:rPr>
+                <w:rFonts w:ascii="Arial" w:hAnsi="Arial" w:cs="Arial"/>
+              </w:rPr>
+              <w:t xml:space="preserve">, scoperto che avevo selezionato un valore statico e non dinamico dell’elemento </w:t>
             </w:r>
           </w:p>
         </w:tc>
@@ -15760,7 +16788,21 @@
               <w:rPr>
                 <w:rFonts w:ascii="Arial" w:hAnsi="Arial" w:cs="Arial"/>
               </w:rPr>
-              <w:t xml:space="preserve"> iniziare a creare il db effettivo</w:t>
+              <w:t xml:space="preserve"> iniziare a creare il </w:t>
+            </w:r>
+            <w:proofErr w:type="spellStart"/>
+            <w:r>
+              <w:rPr>
+                <w:rFonts w:ascii="Arial" w:hAnsi="Arial" w:cs="Arial"/>
+              </w:rPr>
+              <w:t>db</w:t>
+            </w:r>
+            <w:proofErr w:type="spellEnd"/>
+            <w:r>
+              <w:rPr>
+                <w:rFonts w:ascii="Arial" w:hAnsi="Arial" w:cs="Arial"/>
+              </w:rPr>
+              <w:t xml:space="preserve"> effettivo</w:t>
             </w:r>
             <w:r>
               <w:rPr>
@@ -15816,12 +16858,28 @@
                 <w:rFonts w:ascii="Arial" w:hAnsi="Arial" w:cs="Arial"/>
               </w:rPr>
             </w:pPr>
-            <w:r>
-              <w:rPr>
-                <w:rFonts w:ascii="Arial" w:hAnsi="Arial" w:cs="Arial"/>
-              </w:rPr>
-              <w:t>Daily Scrum</w:t>
-            </w:r>
+            <w:proofErr w:type="spellStart"/>
+            <w:r>
+              <w:rPr>
+                <w:rFonts w:ascii="Arial" w:hAnsi="Arial" w:cs="Arial"/>
+              </w:rPr>
+              <w:t>Daily</w:t>
+            </w:r>
+            <w:proofErr w:type="spellEnd"/>
+            <w:r>
+              <w:rPr>
+                <w:rFonts w:ascii="Arial" w:hAnsi="Arial" w:cs="Arial"/>
+              </w:rPr>
+              <w:t xml:space="preserve"> </w:t>
+            </w:r>
+            <w:proofErr w:type="spellStart"/>
+            <w:r>
+              <w:rPr>
+                <w:rFonts w:ascii="Arial" w:hAnsi="Arial" w:cs="Arial"/>
+              </w:rPr>
+              <w:t>Scrum</w:t>
+            </w:r>
+            <w:proofErr w:type="spellEnd"/>
           </w:p>
         </w:tc>
       </w:tr>
@@ -15875,8 +16933,16 @@
               <w:rPr>
                 <w:rFonts w:ascii="Arial" w:hAnsi="Arial" w:cs="Arial"/>
               </w:rPr>
-              <w:t xml:space="preserve"> Terminare l’applicazione delle impostazioni nella ui</w:t>
-            </w:r>
+              <w:t xml:space="preserve"> Terminare l’applicazione delle impostazioni nella </w:t>
+            </w:r>
+            <w:proofErr w:type="spellStart"/>
+            <w:r>
+              <w:rPr>
+                <w:rFonts w:ascii="Arial" w:hAnsi="Arial" w:cs="Arial"/>
+              </w:rPr>
+              <w:t>ui</w:t>
+            </w:r>
+            <w:proofErr w:type="spellEnd"/>
           </w:p>
           <w:p>
             <w:pPr>
@@ -16087,8 +17153,16 @@
               <w:rPr>
                 <w:rFonts w:ascii="Arial" w:hAnsi="Arial" w:cs="Arial"/>
               </w:rPr>
-              <w:t>Sprint Retrospective</w:t>
-            </w:r>
+              <w:t xml:space="preserve">Sprint </w:t>
+            </w:r>
+            <w:proofErr w:type="spellStart"/>
+            <w:r>
+              <w:rPr>
+                <w:rFonts w:ascii="Arial" w:hAnsi="Arial" w:cs="Arial"/>
+              </w:rPr>
+              <w:t>Retrospective</w:t>
+            </w:r>
+            <w:proofErr w:type="spellEnd"/>
           </w:p>
         </w:tc>
       </w:tr>
@@ -17389,11 +18463,33 @@
                 <w:rFonts w:ascii="Arial" w:hAnsi="Arial" w:cs="Arial"/>
               </w:rPr>
             </w:pPr>
-            <w:r>
-              <w:rPr>
-                <w:rFonts w:ascii="Arial" w:hAnsi="Arial" w:cs="Arial"/>
-              </w:rPr>
-              <w:t>Brayn continuerà con lo sviluppo della mappa mentre Riley svilupperà il db effettivo</w:t>
+            <w:proofErr w:type="spellStart"/>
+            <w:r>
+              <w:rPr>
+                <w:rFonts w:ascii="Arial" w:hAnsi="Arial" w:cs="Arial"/>
+              </w:rPr>
+              <w:t>Brayn</w:t>
+            </w:r>
+            <w:proofErr w:type="spellEnd"/>
+            <w:r>
+              <w:rPr>
+                <w:rFonts w:ascii="Arial" w:hAnsi="Arial" w:cs="Arial"/>
+              </w:rPr>
+              <w:t xml:space="preserve"> continuerà con lo sviluppo della mappa mentre Riley svilupperà il </w:t>
+            </w:r>
+            <w:proofErr w:type="spellStart"/>
+            <w:r>
+              <w:rPr>
+                <w:rFonts w:ascii="Arial" w:hAnsi="Arial" w:cs="Arial"/>
+              </w:rPr>
+              <w:t>db</w:t>
+            </w:r>
+            <w:proofErr w:type="spellEnd"/>
+            <w:r>
+              <w:rPr>
+                <w:rFonts w:ascii="Arial" w:hAnsi="Arial" w:cs="Arial"/>
+              </w:rPr>
+              <w:t xml:space="preserve"> effettivo</w:t>
             </w:r>
           </w:p>
         </w:tc>
@@ -17443,12 +18539,28 @@
                 <w:rFonts w:ascii="Arial" w:hAnsi="Arial" w:cs="Arial"/>
               </w:rPr>
             </w:pPr>
-            <w:r>
-              <w:rPr>
-                <w:rFonts w:ascii="Arial" w:hAnsi="Arial" w:cs="Arial"/>
-              </w:rPr>
-              <w:t>Daily Scrum</w:t>
-            </w:r>
+            <w:proofErr w:type="spellStart"/>
+            <w:r>
+              <w:rPr>
+                <w:rFonts w:ascii="Arial" w:hAnsi="Arial" w:cs="Arial"/>
+              </w:rPr>
+              <w:t>Daily</w:t>
+            </w:r>
+            <w:proofErr w:type="spellEnd"/>
+            <w:r>
+              <w:rPr>
+                <w:rFonts w:ascii="Arial" w:hAnsi="Arial" w:cs="Arial"/>
+              </w:rPr>
+              <w:t xml:space="preserve"> </w:t>
+            </w:r>
+            <w:proofErr w:type="spellStart"/>
+            <w:r>
+              <w:rPr>
+                <w:rFonts w:ascii="Arial" w:hAnsi="Arial" w:cs="Arial"/>
+              </w:rPr>
+              <w:t>Scrum</w:t>
+            </w:r>
+            <w:proofErr w:type="spellEnd"/>
           </w:p>
         </w:tc>
       </w:tr>
@@ -17496,8 +18608,16 @@
               <w:rPr>
                 <w:rFonts w:ascii="Arial" w:hAnsi="Arial" w:cs="Arial"/>
               </w:rPr>
-              <w:t>Riley: Terminare l’applicazione delle impostazioni nella ui</w:t>
-            </w:r>
+              <w:t xml:space="preserve">Riley: Terminare l’applicazione delle impostazioni nella </w:t>
+            </w:r>
+            <w:proofErr w:type="spellStart"/>
+            <w:r>
+              <w:rPr>
+                <w:rFonts w:ascii="Arial" w:hAnsi="Arial" w:cs="Arial"/>
+              </w:rPr>
+              <w:t>ui</w:t>
+            </w:r>
+            <w:proofErr w:type="spellEnd"/>
           </w:p>
           <w:p>
             <w:pPr>
@@ -17696,8 +18816,16 @@
               <w:rPr>
                 <w:rFonts w:ascii="Arial" w:hAnsi="Arial" w:cs="Arial"/>
               </w:rPr>
-              <w:t>Sprint Retrospective</w:t>
-            </w:r>
+              <w:t xml:space="preserve">Sprint </w:t>
+            </w:r>
+            <w:proofErr w:type="spellStart"/>
+            <w:r>
+              <w:rPr>
+                <w:rFonts w:ascii="Arial" w:hAnsi="Arial" w:cs="Arial"/>
+              </w:rPr>
+              <w:t>Retrospective</w:t>
+            </w:r>
+            <w:proofErr w:type="spellEnd"/>
           </w:p>
         </w:tc>
       </w:tr>
@@ -18194,7 +19322,21 @@
             <w:rPr>
               <w:rFonts w:ascii="Arial" w:hAnsi="Arial" w:cs="Arial"/>
             </w:rPr>
-            <w:t>Lo script SettingsUI sembra essersi isolato dal resto del codice, cosa potrebbe essere la causa?</w:t>
+            <w:t xml:space="preserve">Lo script </w:t>
+          </w:r>
+          <w:proofErr w:type="spellStart"/>
+          <w:r>
+            <w:rPr>
+              <w:rFonts w:ascii="Arial" w:hAnsi="Arial" w:cs="Arial"/>
+            </w:rPr>
+            <w:t>SettingsUI</w:t>
+          </w:r>
+          <w:proofErr w:type="spellEnd"/>
+          <w:r>
+            <w:rPr>
+              <w:rFonts w:ascii="Arial" w:hAnsi="Arial" w:cs="Arial"/>
+            </w:rPr>
+            <w:t xml:space="preserve"> sembra essersi isolato dal resto del codice, cosa potrebbe essere la causa?</w:t>
           </w:r>
         </w:p>
         <w:p>
@@ -18725,8 +19867,30 @@
               <w:rPr>
                 <w:rFonts w:ascii="Arial" w:hAnsi="Arial" w:cs="Arial"/>
               </w:rPr>
-              <w:t>Inizio sviluppo db sqlite</w:t>
-            </w:r>
+              <w:t xml:space="preserve">Inizio sviluppo </w:t>
+            </w:r>
+            <w:proofErr w:type="spellStart"/>
+            <w:r>
+              <w:rPr>
+                <w:rFonts w:ascii="Arial" w:hAnsi="Arial" w:cs="Arial"/>
+              </w:rPr>
+              <w:t>db</w:t>
+            </w:r>
+            <w:proofErr w:type="spellEnd"/>
+            <w:r>
+              <w:rPr>
+                <w:rFonts w:ascii="Arial" w:hAnsi="Arial" w:cs="Arial"/>
+              </w:rPr>
+              <w:t xml:space="preserve"> </w:t>
+            </w:r>
+            <w:proofErr w:type="spellStart"/>
+            <w:r>
+              <w:rPr>
+                <w:rFonts w:ascii="Arial" w:hAnsi="Arial" w:cs="Arial"/>
+              </w:rPr>
+              <w:t>sqlite</w:t>
+            </w:r>
+            <w:proofErr w:type="spellEnd"/>
           </w:p>
         </w:tc>
       </w:tr>
@@ -18938,8 +20102,16 @@
               <w:rPr>
                 <w:rFonts w:ascii="Arial" w:hAnsi="Arial" w:cs="Arial"/>
               </w:rPr>
-              <w:t>Siamo in largo anticipo, per questo motivo Riley ha cominciato a creare un vero db</w:t>
-            </w:r>
+              <w:t xml:space="preserve">Siamo in largo anticipo, per questo motivo Riley ha cominciato a creare un vero </w:t>
+            </w:r>
+            <w:proofErr w:type="spellStart"/>
+            <w:r>
+              <w:rPr>
+                <w:rFonts w:ascii="Arial" w:hAnsi="Arial" w:cs="Arial"/>
+              </w:rPr>
+              <w:t>db</w:t>
+            </w:r>
+            <w:proofErr w:type="spellEnd"/>
           </w:p>
         </w:tc>
       </w:tr>
@@ -18996,7 +20168,21 @@
               <w:rPr>
                 <w:rFonts w:ascii="Arial" w:hAnsi="Arial" w:cs="Arial"/>
               </w:rPr>
-              <w:t>Continuare rispettivamente lo sviluppo del db e della mappa</w:t>
+              <w:t xml:space="preserve">Continuare rispettivamente lo sviluppo del </w:t>
+            </w:r>
+            <w:proofErr w:type="spellStart"/>
+            <w:r>
+              <w:rPr>
+                <w:rFonts w:ascii="Arial" w:hAnsi="Arial" w:cs="Arial"/>
+              </w:rPr>
+              <w:t>db</w:t>
+            </w:r>
+            <w:proofErr w:type="spellEnd"/>
+            <w:r>
+              <w:rPr>
+                <w:rFonts w:ascii="Arial" w:hAnsi="Arial" w:cs="Arial"/>
+              </w:rPr>
+              <w:t xml:space="preserve"> e della mappa</w:t>
             </w:r>
           </w:p>
         </w:tc>
@@ -19046,12 +20232,28 @@
                 <w:rFonts w:ascii="Arial" w:hAnsi="Arial" w:cs="Arial"/>
               </w:rPr>
             </w:pPr>
-            <w:r>
-              <w:rPr>
-                <w:rFonts w:ascii="Arial" w:hAnsi="Arial" w:cs="Arial"/>
-              </w:rPr>
-              <w:t>Daily Scrum</w:t>
-            </w:r>
+            <w:proofErr w:type="spellStart"/>
+            <w:r>
+              <w:rPr>
+                <w:rFonts w:ascii="Arial" w:hAnsi="Arial" w:cs="Arial"/>
+              </w:rPr>
+              <w:t>Daily</w:t>
+            </w:r>
+            <w:proofErr w:type="spellEnd"/>
+            <w:r>
+              <w:rPr>
+                <w:rFonts w:ascii="Arial" w:hAnsi="Arial" w:cs="Arial"/>
+              </w:rPr>
+              <w:t xml:space="preserve"> </w:t>
+            </w:r>
+            <w:proofErr w:type="spellStart"/>
+            <w:r>
+              <w:rPr>
+                <w:rFonts w:ascii="Arial" w:hAnsi="Arial" w:cs="Arial"/>
+              </w:rPr>
+              <w:t>Scrum</w:t>
+            </w:r>
+            <w:proofErr w:type="spellEnd"/>
           </w:p>
         </w:tc>
       </w:tr>
@@ -19099,8 +20301,16 @@
               <w:rPr>
                 <w:rFonts w:ascii="Arial" w:hAnsi="Arial" w:cs="Arial"/>
               </w:rPr>
-              <w:t>Riley: Inizio sviluppo db</w:t>
-            </w:r>
+              <w:t xml:space="preserve">Riley: Inizio sviluppo </w:t>
+            </w:r>
+            <w:proofErr w:type="spellStart"/>
+            <w:r>
+              <w:rPr>
+                <w:rFonts w:ascii="Arial" w:hAnsi="Arial" w:cs="Arial"/>
+              </w:rPr>
+              <w:t>db</w:t>
+            </w:r>
+            <w:proofErr w:type="spellEnd"/>
           </w:p>
           <w:p>
             <w:pPr>
@@ -19293,8 +20503,16 @@
               <w:rPr>
                 <w:rFonts w:ascii="Arial" w:hAnsi="Arial" w:cs="Arial"/>
               </w:rPr>
-              <w:t>Sprint Retrospective</w:t>
-            </w:r>
+              <w:t xml:space="preserve">Sprint </w:t>
+            </w:r>
+            <w:proofErr w:type="spellStart"/>
+            <w:r>
+              <w:rPr>
+                <w:rFonts w:ascii="Arial" w:hAnsi="Arial" w:cs="Arial"/>
+              </w:rPr>
+              <w:t>Retrospective</w:t>
+            </w:r>
+            <w:proofErr w:type="spellEnd"/>
           </w:p>
         </w:tc>
       </w:tr>
@@ -19522,7 +20740,25 @@
               <w:b/>
               <w:bCs/>
             </w:rPr>
-            <w:t>Nomi AI utilizzati</w:t>
+            <w:t xml:space="preserve">Nomi </w:t>
+          </w:r>
+          <w:proofErr w:type="gramStart"/>
+          <w:r>
+            <w:rPr>
+              <w:rStyle w:val="Testosegnaposto"/>
+              <w:b/>
+              <w:bCs/>
+            </w:rPr>
+            <w:t>AI</w:t>
+          </w:r>
+          <w:proofErr w:type="gramEnd"/>
+          <w:r>
+            <w:rPr>
+              <w:rStyle w:val="Testosegnaposto"/>
+              <w:b/>
+              <w:bCs/>
+            </w:rPr>
+            <w:t xml:space="preserve"> utilizzati</w:t>
           </w:r>
         </w:sdtContent>
       </w:sdt>
@@ -20520,7 +21756,21 @@
               <w:rPr>
                 <w:rFonts w:ascii="Arial" w:hAnsi="Arial" w:cs="Arial"/>
               </w:rPr>
-              <w:t>Rispetto al pianificato abbiamo qualche giornata, di lavoro, di anticipo infatti stiamo principalmente aggiungendo dettagli lavorando con un ritmo adeguato e sviluppando già un db più reale</w:t>
+              <w:t xml:space="preserve">Rispetto al pianificato abbiamo qualche giornata, di lavoro, di anticipo infatti stiamo principalmente aggiungendo dettagli lavorando con un ritmo adeguato e sviluppando già un </w:t>
+            </w:r>
+            <w:proofErr w:type="spellStart"/>
+            <w:r>
+              <w:rPr>
+                <w:rFonts w:ascii="Arial" w:hAnsi="Arial" w:cs="Arial"/>
+              </w:rPr>
+              <w:t>db</w:t>
+            </w:r>
+            <w:proofErr w:type="spellEnd"/>
+            <w:r>
+              <w:rPr>
+                <w:rFonts w:ascii="Arial" w:hAnsi="Arial" w:cs="Arial"/>
+              </w:rPr>
+              <w:t xml:space="preserve"> più reale</w:t>
             </w:r>
           </w:p>
         </w:tc>
@@ -20578,8 +21828,16 @@
               <w:rPr>
                 <w:rFonts w:ascii="Arial" w:hAnsi="Arial" w:cs="Arial"/>
               </w:rPr>
-              <w:t>Procedere con i vari l’aggiunta di dettagli e del db</w:t>
-            </w:r>
+              <w:t xml:space="preserve">Procedere con i vari l’aggiunta di dettagli e del </w:t>
+            </w:r>
+            <w:proofErr w:type="spellStart"/>
+            <w:r>
+              <w:rPr>
+                <w:rFonts w:ascii="Arial" w:hAnsi="Arial" w:cs="Arial"/>
+              </w:rPr>
+              <w:t>db</w:t>
+            </w:r>
+            <w:proofErr w:type="spellEnd"/>
           </w:p>
         </w:tc>
       </w:tr>
@@ -20628,12 +21886,28 @@
                 <w:rFonts w:ascii="Arial" w:hAnsi="Arial" w:cs="Arial"/>
               </w:rPr>
             </w:pPr>
-            <w:r>
-              <w:rPr>
-                <w:rFonts w:ascii="Arial" w:hAnsi="Arial" w:cs="Arial"/>
-              </w:rPr>
-              <w:t>Daily Scrum</w:t>
-            </w:r>
+            <w:proofErr w:type="spellStart"/>
+            <w:r>
+              <w:rPr>
+                <w:rFonts w:ascii="Arial" w:hAnsi="Arial" w:cs="Arial"/>
+              </w:rPr>
+              <w:t>Daily</w:t>
+            </w:r>
+            <w:proofErr w:type="spellEnd"/>
+            <w:r>
+              <w:rPr>
+                <w:rFonts w:ascii="Arial" w:hAnsi="Arial" w:cs="Arial"/>
+              </w:rPr>
+              <w:t xml:space="preserve"> </w:t>
+            </w:r>
+            <w:proofErr w:type="spellStart"/>
+            <w:r>
+              <w:rPr>
+                <w:rFonts w:ascii="Arial" w:hAnsi="Arial" w:cs="Arial"/>
+              </w:rPr>
+              <w:t>Scrum</w:t>
+            </w:r>
+            <w:proofErr w:type="spellEnd"/>
           </w:p>
         </w:tc>
       </w:tr>
@@ -20693,8 +21967,16 @@
               <w:rPr>
                 <w:rFonts w:ascii="Arial" w:hAnsi="Arial" w:cs="Arial"/>
               </w:rPr>
-              <w:t>ontinuo sviluppo db</w:t>
-            </w:r>
+              <w:t xml:space="preserve">ontinuo sviluppo </w:t>
+            </w:r>
+            <w:proofErr w:type="spellStart"/>
+            <w:r>
+              <w:rPr>
+                <w:rFonts w:ascii="Arial" w:hAnsi="Arial" w:cs="Arial"/>
+              </w:rPr>
+              <w:t>db</w:t>
+            </w:r>
+            <w:proofErr w:type="spellEnd"/>
           </w:p>
           <w:p>
             <w:pPr>
@@ -20887,8 +22169,16 @@
               <w:rPr>
                 <w:rFonts w:ascii="Arial" w:hAnsi="Arial" w:cs="Arial"/>
               </w:rPr>
-              <w:t>Sprint Retrospective</w:t>
-            </w:r>
+              <w:t xml:space="preserve">Sprint </w:t>
+            </w:r>
+            <w:proofErr w:type="spellStart"/>
+            <w:r>
+              <w:rPr>
+                <w:rFonts w:ascii="Arial" w:hAnsi="Arial" w:cs="Arial"/>
+              </w:rPr>
+              <w:t>Retrospective</w:t>
+            </w:r>
+            <w:proofErr w:type="spellEnd"/>
           </w:p>
         </w:tc>
       </w:tr>
@@ -21391,7 +22681,35 @@
             <w:rPr>
               <w:rFonts w:ascii="Arial" w:hAnsi="Arial" w:cs="Arial"/>
             </w:rPr>
-            <w:t>non ho fatto dei veri e propri promt oggi, ma mi sono cimentato nel procedere con una spiegazione guidata per applicare SQLite alla base di dati sviluppata finora.</w:t>
+            <w:t xml:space="preserve">non ho fatto dei veri e propri </w:t>
+          </w:r>
+          <w:proofErr w:type="spellStart"/>
+          <w:r>
+            <w:rPr>
+              <w:rFonts w:ascii="Arial" w:hAnsi="Arial" w:cs="Arial"/>
+            </w:rPr>
+            <w:t>promt</w:t>
+          </w:r>
+          <w:proofErr w:type="spellEnd"/>
+          <w:r>
+            <w:rPr>
+              <w:rFonts w:ascii="Arial" w:hAnsi="Arial" w:cs="Arial"/>
+            </w:rPr>
+            <w:t xml:space="preserve"> oggi, ma mi sono cimentato nel procedere con una spiegazione guidata per applicare </w:t>
+          </w:r>
+          <w:proofErr w:type="spellStart"/>
+          <w:r>
+            <w:rPr>
+              <w:rFonts w:ascii="Arial" w:hAnsi="Arial" w:cs="Arial"/>
+            </w:rPr>
+            <w:t>SQLite</w:t>
+          </w:r>
+          <w:proofErr w:type="spellEnd"/>
+          <w:r>
+            <w:rPr>
+              <w:rFonts w:ascii="Arial" w:hAnsi="Arial" w:cs="Arial"/>
+            </w:rPr>
+            <w:t xml:space="preserve"> alla base di dati sviluppata finora.</w:t>
           </w:r>
         </w:p>
         <w:p>
@@ -21984,7 +23302,21 @@
               <w:rPr>
                 <w:rFonts w:ascii="Arial" w:hAnsi="Arial" w:cs="Arial"/>
               </w:rPr>
-              <w:t>Ho sistemato un problema di animazione, creato il build del progetto per certi test, ricerca modifica materiali auto ed inizio menu garage</w:t>
+              <w:t xml:space="preserve">Ho sistemato un problema di animazione, creato </w:t>
+            </w:r>
+            <w:proofErr w:type="gramStart"/>
+            <w:r>
+              <w:rPr>
+                <w:rFonts w:ascii="Arial" w:hAnsi="Arial" w:cs="Arial"/>
+              </w:rPr>
+              <w:t>il build</w:t>
+            </w:r>
+            <w:proofErr w:type="gramEnd"/>
+            <w:r>
+              <w:rPr>
+                <w:rFonts w:ascii="Arial" w:hAnsi="Arial" w:cs="Arial"/>
+              </w:rPr>
+              <w:t xml:space="preserve"> del progetto per certi test, ricerca modifica materiali auto ed inizio menu garage</w:t>
             </w:r>
           </w:p>
         </w:tc>
@@ -22217,7 +23549,21 @@
               <w:rPr>
                 <w:rFonts w:ascii="Arial" w:hAnsi="Arial" w:cs="Arial"/>
               </w:rPr>
-              <w:t>Continuare sviluppo garage e db.</w:t>
+              <w:t xml:space="preserve">Continuare sviluppo garage e </w:t>
+            </w:r>
+            <w:proofErr w:type="spellStart"/>
+            <w:r>
+              <w:rPr>
+                <w:rFonts w:ascii="Arial" w:hAnsi="Arial" w:cs="Arial"/>
+              </w:rPr>
+              <w:t>db</w:t>
+            </w:r>
+            <w:proofErr w:type="spellEnd"/>
+            <w:r>
+              <w:rPr>
+                <w:rFonts w:ascii="Arial" w:hAnsi="Arial" w:cs="Arial"/>
+              </w:rPr>
+              <w:t>.</w:t>
             </w:r>
           </w:p>
         </w:tc>
@@ -22267,12 +23613,28 @@
                 <w:rFonts w:ascii="Arial" w:hAnsi="Arial" w:cs="Arial"/>
               </w:rPr>
             </w:pPr>
-            <w:r>
-              <w:rPr>
-                <w:rFonts w:ascii="Arial" w:hAnsi="Arial" w:cs="Arial"/>
-              </w:rPr>
-              <w:t>Daily Scrum</w:t>
-            </w:r>
+            <w:proofErr w:type="spellStart"/>
+            <w:r>
+              <w:rPr>
+                <w:rFonts w:ascii="Arial" w:hAnsi="Arial" w:cs="Arial"/>
+              </w:rPr>
+              <w:t>Daily</w:t>
+            </w:r>
+            <w:proofErr w:type="spellEnd"/>
+            <w:r>
+              <w:rPr>
+                <w:rFonts w:ascii="Arial" w:hAnsi="Arial" w:cs="Arial"/>
+              </w:rPr>
+              <w:t xml:space="preserve"> </w:t>
+            </w:r>
+            <w:proofErr w:type="spellStart"/>
+            <w:r>
+              <w:rPr>
+                <w:rFonts w:ascii="Arial" w:hAnsi="Arial" w:cs="Arial"/>
+              </w:rPr>
+              <w:t>Scrum</w:t>
+            </w:r>
+            <w:proofErr w:type="spellEnd"/>
           </w:p>
         </w:tc>
       </w:tr>
@@ -22320,8 +23682,16 @@
               <w:rPr>
                 <w:rFonts w:ascii="Arial" w:hAnsi="Arial" w:cs="Arial"/>
               </w:rPr>
-              <w:t>Riley: Continuo sviluppo db</w:t>
-            </w:r>
+              <w:t xml:space="preserve">Riley: Continuo sviluppo </w:t>
+            </w:r>
+            <w:proofErr w:type="spellStart"/>
+            <w:r>
+              <w:rPr>
+                <w:rFonts w:ascii="Arial" w:hAnsi="Arial" w:cs="Arial"/>
+              </w:rPr>
+              <w:t>db</w:t>
+            </w:r>
+            <w:proofErr w:type="spellEnd"/>
           </w:p>
           <w:p>
             <w:pPr>
@@ -22514,8 +23884,16 @@
               <w:rPr>
                 <w:rFonts w:ascii="Arial" w:hAnsi="Arial" w:cs="Arial"/>
               </w:rPr>
-              <w:t>Sprint Retrospective</w:t>
-            </w:r>
+              <w:t xml:space="preserve">Sprint </w:t>
+            </w:r>
+            <w:proofErr w:type="spellStart"/>
+            <w:r>
+              <w:rPr>
+                <w:rFonts w:ascii="Arial" w:hAnsi="Arial" w:cs="Arial"/>
+              </w:rPr>
+              <w:t>Retrospective</w:t>
+            </w:r>
+            <w:proofErr w:type="spellEnd"/>
           </w:p>
         </w:tc>
       </w:tr>
@@ -22743,7 +24121,25 @@
               <w:b/>
               <w:bCs/>
             </w:rPr>
-            <w:t>Nomi AI utilizzati</w:t>
+            <w:t xml:space="preserve">Nomi </w:t>
+          </w:r>
+          <w:proofErr w:type="gramStart"/>
+          <w:r>
+            <w:rPr>
+              <w:rStyle w:val="Testosegnaposto"/>
+              <w:b/>
+              <w:bCs/>
+            </w:rPr>
+            <w:t>AI</w:t>
+          </w:r>
+          <w:proofErr w:type="gramEnd"/>
+          <w:r>
+            <w:rPr>
+              <w:rStyle w:val="Testosegnaposto"/>
+              <w:b/>
+              <w:bCs/>
+            </w:rPr>
+            <w:t xml:space="preserve"> utilizzati</w:t>
           </w:r>
         </w:sdtContent>
       </w:sdt>
@@ -23522,8 +24918,16 @@
               <w:rPr>
                 <w:rFonts w:ascii="Arial" w:hAnsi="Arial" w:cs="Arial"/>
               </w:rPr>
-              <w:t>Continuato lo sviluppo del db</w:t>
-            </w:r>
+              <w:t xml:space="preserve">Continuato lo sviluppo del </w:t>
+            </w:r>
+            <w:proofErr w:type="spellStart"/>
+            <w:r>
+              <w:rPr>
+                <w:rFonts w:ascii="Arial" w:hAnsi="Arial" w:cs="Arial"/>
+              </w:rPr>
+              <w:t>db</w:t>
+            </w:r>
+            <w:proofErr w:type="spellEnd"/>
           </w:p>
         </w:tc>
       </w:tr>
@@ -23793,7 +25197,35 @@
               <w:rPr>
                 <w:rFonts w:ascii="Arial" w:hAnsi="Arial" w:cs="Arial"/>
               </w:rPr>
-              <w:t>Continuare ognuno con i sviluppi di db e garage</w:t>
+              <w:t xml:space="preserve">Continuare ognuno con </w:t>
+            </w:r>
+            <w:proofErr w:type="gramStart"/>
+            <w:r>
+              <w:rPr>
+                <w:rFonts w:ascii="Arial" w:hAnsi="Arial" w:cs="Arial"/>
+              </w:rPr>
+              <w:t>i</w:t>
+            </w:r>
+            <w:proofErr w:type="gramEnd"/>
+            <w:r>
+              <w:rPr>
+                <w:rFonts w:ascii="Arial" w:hAnsi="Arial" w:cs="Arial"/>
+              </w:rPr>
+              <w:t xml:space="preserve"> sviluppi di </w:t>
+            </w:r>
+            <w:proofErr w:type="spellStart"/>
+            <w:r>
+              <w:rPr>
+                <w:rFonts w:ascii="Arial" w:hAnsi="Arial" w:cs="Arial"/>
+              </w:rPr>
+              <w:t>db</w:t>
+            </w:r>
+            <w:proofErr w:type="spellEnd"/>
+            <w:r>
+              <w:rPr>
+                <w:rFonts w:ascii="Arial" w:hAnsi="Arial" w:cs="Arial"/>
+              </w:rPr>
+              <w:t xml:space="preserve"> e garage</w:t>
             </w:r>
           </w:p>
         </w:tc>
@@ -23843,12 +25275,28 @@
                 <w:rFonts w:ascii="Arial" w:hAnsi="Arial" w:cs="Arial"/>
               </w:rPr>
             </w:pPr>
-            <w:r>
-              <w:rPr>
-                <w:rFonts w:ascii="Arial" w:hAnsi="Arial" w:cs="Arial"/>
-              </w:rPr>
-              <w:t>Daily Scrum</w:t>
-            </w:r>
+            <w:proofErr w:type="spellStart"/>
+            <w:r>
+              <w:rPr>
+                <w:rFonts w:ascii="Arial" w:hAnsi="Arial" w:cs="Arial"/>
+              </w:rPr>
+              <w:t>Daily</w:t>
+            </w:r>
+            <w:proofErr w:type="spellEnd"/>
+            <w:r>
+              <w:rPr>
+                <w:rFonts w:ascii="Arial" w:hAnsi="Arial" w:cs="Arial"/>
+              </w:rPr>
+              <w:t xml:space="preserve"> </w:t>
+            </w:r>
+            <w:proofErr w:type="spellStart"/>
+            <w:r>
+              <w:rPr>
+                <w:rFonts w:ascii="Arial" w:hAnsi="Arial" w:cs="Arial"/>
+              </w:rPr>
+              <w:t>Scrum</w:t>
+            </w:r>
+            <w:proofErr w:type="spellEnd"/>
           </w:p>
         </w:tc>
       </w:tr>
@@ -23896,8 +25344,16 @@
               <w:rPr>
                 <w:rFonts w:ascii="Arial" w:hAnsi="Arial" w:cs="Arial"/>
               </w:rPr>
-              <w:t>Riley: Continuo sviluppo db</w:t>
-            </w:r>
+              <w:t xml:space="preserve">Riley: Continuo sviluppo </w:t>
+            </w:r>
+            <w:proofErr w:type="spellStart"/>
+            <w:r>
+              <w:rPr>
+                <w:rFonts w:ascii="Arial" w:hAnsi="Arial" w:cs="Arial"/>
+              </w:rPr>
+              <w:t>db</w:t>
+            </w:r>
+            <w:proofErr w:type="spellEnd"/>
           </w:p>
           <w:p>
             <w:pPr>
@@ -24090,8 +25546,16 @@
               <w:rPr>
                 <w:rFonts w:ascii="Arial" w:hAnsi="Arial" w:cs="Arial"/>
               </w:rPr>
-              <w:t>Sprint Retrospective</w:t>
-            </w:r>
+              <w:t xml:space="preserve">Sprint </w:t>
+            </w:r>
+            <w:proofErr w:type="spellStart"/>
+            <w:r>
+              <w:rPr>
+                <w:rFonts w:ascii="Arial" w:hAnsi="Arial" w:cs="Arial"/>
+              </w:rPr>
+              <w:t>Retrospective</w:t>
+            </w:r>
+            <w:proofErr w:type="spellEnd"/>
           </w:p>
         </w:tc>
       </w:tr>
@@ -24588,7 +26052,21 @@
             <w:rPr>
               <w:rFonts w:ascii="Arial" w:hAnsi="Arial" w:cs="Arial"/>
             </w:rPr>
-            <w:t>Dovrei introdurre nel db i comandi collegati alle impostazioni, ma la struttura usata è diversa da quelle precedenti, e viene usata una classe esterna.</w:t>
+            <w:t xml:space="preserve">Dovrei introdurre nel </w:t>
+          </w:r>
+          <w:proofErr w:type="spellStart"/>
+          <w:r>
+            <w:rPr>
+              <w:rFonts w:ascii="Arial" w:hAnsi="Arial" w:cs="Arial"/>
+            </w:rPr>
+            <w:t>db</w:t>
+          </w:r>
+          <w:proofErr w:type="spellEnd"/>
+          <w:r>
+            <w:rPr>
+              <w:rFonts w:ascii="Arial" w:hAnsi="Arial" w:cs="Arial"/>
+            </w:rPr>
+            <w:t xml:space="preserve"> i comandi collegati alle impostazioni, ma la struttura usata è diversa da quelle precedenti, e viene usata una classe esterna.</w:t>
           </w:r>
         </w:p>
         <w:p>
@@ -25230,7 +26708,21 @@
               <w:rPr>
                 <w:rFonts w:ascii="Arial" w:hAnsi="Arial" w:cs="Arial"/>
               </w:rPr>
-              <w:t>Le statistiche erano scomparse, Bryan ha fatto un rollback e quando mi sono state passate non erano collegate in modo concreto, quindi non risultava funzionante. Per risolvere ho semplicemente inserito gli oggetti necessari nei campi dello script</w:t>
+              <w:t xml:space="preserve">Le statistiche erano scomparse, Bryan ha fatto un </w:t>
+            </w:r>
+            <w:proofErr w:type="spellStart"/>
+            <w:r>
+              <w:rPr>
+                <w:rFonts w:ascii="Arial" w:hAnsi="Arial" w:cs="Arial"/>
+              </w:rPr>
+              <w:t>rollback</w:t>
+            </w:r>
+            <w:proofErr w:type="spellEnd"/>
+            <w:r>
+              <w:rPr>
+                <w:rFonts w:ascii="Arial" w:hAnsi="Arial" w:cs="Arial"/>
+              </w:rPr>
+              <w:t xml:space="preserve"> e quando mi sono state passate non erano collegate in modo concreto, quindi non risultava funzionante. Per risolvere ho semplicemente inserito gli oggetti necessari nei campi dello script</w:t>
             </w:r>
           </w:p>
         </w:tc>
@@ -25326,8 +26818,16 @@
               <w:rPr>
                 <w:rFonts w:ascii="Arial" w:hAnsi="Arial" w:cs="Arial"/>
               </w:rPr>
-              <w:t>Perfettamente in orario ed allineati con grafica e backend</w:t>
-            </w:r>
+              <w:t xml:space="preserve">Perfettamente in orario ed allineati con grafica e </w:t>
+            </w:r>
+            <w:proofErr w:type="spellStart"/>
+            <w:r>
+              <w:rPr>
+                <w:rFonts w:ascii="Arial" w:hAnsi="Arial" w:cs="Arial"/>
+              </w:rPr>
+              <w:t>backend</w:t>
+            </w:r>
+            <w:proofErr w:type="spellEnd"/>
           </w:p>
         </w:tc>
       </w:tr>
@@ -25434,12 +26934,28 @@
                 <w:rFonts w:ascii="Arial" w:hAnsi="Arial" w:cs="Arial"/>
               </w:rPr>
             </w:pPr>
-            <w:r>
-              <w:rPr>
-                <w:rFonts w:ascii="Arial" w:hAnsi="Arial" w:cs="Arial"/>
-              </w:rPr>
-              <w:t>Daily Scrum</w:t>
-            </w:r>
+            <w:proofErr w:type="spellStart"/>
+            <w:r>
+              <w:rPr>
+                <w:rFonts w:ascii="Arial" w:hAnsi="Arial" w:cs="Arial"/>
+              </w:rPr>
+              <w:t>Daily</w:t>
+            </w:r>
+            <w:proofErr w:type="spellEnd"/>
+            <w:r>
+              <w:rPr>
+                <w:rFonts w:ascii="Arial" w:hAnsi="Arial" w:cs="Arial"/>
+              </w:rPr>
+              <w:t xml:space="preserve"> </w:t>
+            </w:r>
+            <w:proofErr w:type="spellStart"/>
+            <w:r>
+              <w:rPr>
+                <w:rFonts w:ascii="Arial" w:hAnsi="Arial" w:cs="Arial"/>
+              </w:rPr>
+              <w:t>Scrum</w:t>
+            </w:r>
+            <w:proofErr w:type="spellEnd"/>
           </w:p>
         </w:tc>
       </w:tr>
@@ -25487,8 +27003,16 @@
               <w:rPr>
                 <w:rFonts w:ascii="Arial" w:hAnsi="Arial" w:cs="Arial"/>
               </w:rPr>
-              <w:t>Riley: Continuo sviluppo db</w:t>
-            </w:r>
+              <w:t xml:space="preserve">Riley: Continuo sviluppo </w:t>
+            </w:r>
+            <w:proofErr w:type="spellStart"/>
+            <w:r>
+              <w:rPr>
+                <w:rFonts w:ascii="Arial" w:hAnsi="Arial" w:cs="Arial"/>
+              </w:rPr>
+              <w:t>db</w:t>
+            </w:r>
+            <w:proofErr w:type="spellEnd"/>
           </w:p>
           <w:p>
             <w:pPr>
@@ -25681,8 +27205,16 @@
               <w:rPr>
                 <w:rFonts w:ascii="Arial" w:hAnsi="Arial" w:cs="Arial"/>
               </w:rPr>
-              <w:t>Sprint Retrospective</w:t>
-            </w:r>
+              <w:t xml:space="preserve">Sprint </w:t>
+            </w:r>
+            <w:proofErr w:type="spellStart"/>
+            <w:r>
+              <w:rPr>
+                <w:rFonts w:ascii="Arial" w:hAnsi="Arial" w:cs="Arial"/>
+              </w:rPr>
+              <w:t>Retrospective</w:t>
+            </w:r>
+            <w:proofErr w:type="spellEnd"/>
           </w:p>
         </w:tc>
       </w:tr>
@@ -26522,7 +28054,21 @@
         <w:rPr>
           <w:rFonts w:ascii="Arial" w:hAnsi="Arial" w:cs="Arial"/>
         </w:rPr>
-        <w:t>Avrei cercato di adattare basandomi su i file presenti.</w:t>
+        <w:t xml:space="preserve">Avrei cercato di adattare basandomi </w:t>
+      </w:r>
+      <w:proofErr w:type="spellStart"/>
+      <w:r>
+        <w:rPr>
+          <w:rFonts w:ascii="Arial" w:hAnsi="Arial" w:cs="Arial"/>
+        </w:rPr>
+        <w:t>su i</w:t>
+      </w:r>
+      <w:proofErr w:type="spellEnd"/>
+      <w:r>
+        <w:rPr>
+          <w:rFonts w:ascii="Arial" w:hAnsi="Arial" w:cs="Arial"/>
+        </w:rPr>
+        <w:t xml:space="preserve"> file presenti.</w:t>
       </w:r>
     </w:p>
     <w:p>
@@ -27055,12 +28601,28 @@
                 <w:rFonts w:ascii="Arial" w:hAnsi="Arial" w:cs="Arial"/>
               </w:rPr>
             </w:pPr>
-            <w:r>
-              <w:rPr>
-                <w:rFonts w:ascii="Arial" w:hAnsi="Arial" w:cs="Arial"/>
-              </w:rPr>
-              <w:t>Daily Scrum</w:t>
-            </w:r>
+            <w:proofErr w:type="spellStart"/>
+            <w:r>
+              <w:rPr>
+                <w:rFonts w:ascii="Arial" w:hAnsi="Arial" w:cs="Arial"/>
+              </w:rPr>
+              <w:t>Daily</w:t>
+            </w:r>
+            <w:proofErr w:type="spellEnd"/>
+            <w:r>
+              <w:rPr>
+                <w:rFonts w:ascii="Arial" w:hAnsi="Arial" w:cs="Arial"/>
+              </w:rPr>
+              <w:t xml:space="preserve"> </w:t>
+            </w:r>
+            <w:proofErr w:type="spellStart"/>
+            <w:r>
+              <w:rPr>
+                <w:rFonts w:ascii="Arial" w:hAnsi="Arial" w:cs="Arial"/>
+              </w:rPr>
+              <w:t>Scrum</w:t>
+            </w:r>
+            <w:proofErr w:type="spellEnd"/>
           </w:p>
         </w:tc>
       </w:tr>
@@ -27346,8 +28908,16 @@
                 <w:rFonts w:ascii="Arial" w:hAnsi="Arial" w:cs="Arial"/>
               </w:rPr>
               <w:lastRenderedPageBreak/>
-              <w:t>Sprint Retrospective</w:t>
-            </w:r>
+              <w:t xml:space="preserve">Sprint </w:t>
+            </w:r>
+            <w:proofErr w:type="spellStart"/>
+            <w:r>
+              <w:rPr>
+                <w:rFonts w:ascii="Arial" w:hAnsi="Arial" w:cs="Arial"/>
+              </w:rPr>
+              <w:t>Retrospective</w:t>
+            </w:r>
+            <w:proofErr w:type="spellEnd"/>
           </w:p>
         </w:tc>
       </w:tr>
@@ -27844,7 +29414,21 @@
             <w:rPr>
               <w:rFonts w:ascii="Arial" w:hAnsi="Arial" w:cs="Arial"/>
             </w:rPr>
-            <w:t>Recentemente ho eseguito un pull e sembra che il mergetool sembra non funzionare: &lt;errore&gt;</w:t>
+            <w:t xml:space="preserve">Recentemente ho eseguito un pull e sembra che il </w:t>
+          </w:r>
+          <w:proofErr w:type="spellStart"/>
+          <w:r>
+            <w:rPr>
+              <w:rFonts w:ascii="Arial" w:hAnsi="Arial" w:cs="Arial"/>
+            </w:rPr>
+            <w:t>mergetool</w:t>
+          </w:r>
+          <w:proofErr w:type="spellEnd"/>
+          <w:r>
+            <w:rPr>
+              <w:rFonts w:ascii="Arial" w:hAnsi="Arial" w:cs="Arial"/>
+            </w:rPr>
+            <w:t xml:space="preserve"> sembra non funzionare: &lt;errore&gt;</w:t>
           </w:r>
         </w:p>
         <w:p>
@@ -27942,7 +29526,21 @@
             <w:rPr>
               <w:rFonts w:ascii="Arial" w:hAnsi="Arial" w:cs="Arial"/>
             </w:rPr>
-            <w:t>Mi ha specificato quale risultava il problema e ha proposto delle soluzioni per sistemare il mergetool, poi ho compreso che il problema risultava solo la modifica del medesimo componente nella stessa scena, questo mi ha fatto comprendere i limiti di questo tool.</w:t>
+            <w:t xml:space="preserve">Mi ha specificato quale risultava il problema e ha proposto delle soluzioni per sistemare il </w:t>
+          </w:r>
+          <w:proofErr w:type="spellStart"/>
+          <w:r>
+            <w:rPr>
+              <w:rFonts w:ascii="Arial" w:hAnsi="Arial" w:cs="Arial"/>
+            </w:rPr>
+            <w:t>mergetool</w:t>
+          </w:r>
+          <w:proofErr w:type="spellEnd"/>
+          <w:r>
+            <w:rPr>
+              <w:rFonts w:ascii="Arial" w:hAnsi="Arial" w:cs="Arial"/>
+            </w:rPr>
+            <w:t>, poi ho compreso che il problema risultava solo la modifica del medesimo componente nella stessa scena, questo mi ha fatto comprendere i limiti di questo tool.</w:t>
           </w:r>
         </w:p>
         <w:p>
@@ -28702,12 +30300,28 @@
                 <w:rFonts w:ascii="Arial" w:hAnsi="Arial" w:cs="Arial"/>
               </w:rPr>
             </w:pPr>
-            <w:r>
-              <w:rPr>
-                <w:rFonts w:ascii="Arial" w:hAnsi="Arial" w:cs="Arial"/>
-              </w:rPr>
-              <w:t>Daily Scrum</w:t>
-            </w:r>
+            <w:proofErr w:type="spellStart"/>
+            <w:r>
+              <w:rPr>
+                <w:rFonts w:ascii="Arial" w:hAnsi="Arial" w:cs="Arial"/>
+              </w:rPr>
+              <w:t>Daily</w:t>
+            </w:r>
+            <w:proofErr w:type="spellEnd"/>
+            <w:r>
+              <w:rPr>
+                <w:rFonts w:ascii="Arial" w:hAnsi="Arial" w:cs="Arial"/>
+              </w:rPr>
+              <w:t xml:space="preserve"> </w:t>
+            </w:r>
+            <w:proofErr w:type="spellStart"/>
+            <w:r>
+              <w:rPr>
+                <w:rFonts w:ascii="Arial" w:hAnsi="Arial" w:cs="Arial"/>
+              </w:rPr>
+              <w:t>Scrum</w:t>
+            </w:r>
+            <w:proofErr w:type="spellEnd"/>
           </w:p>
         </w:tc>
       </w:tr>
@@ -28955,8 +30569,16 @@
               <w:rPr>
                 <w:rFonts w:ascii="Arial" w:hAnsi="Arial" w:cs="Arial"/>
               </w:rPr>
-              <w:t>Sprint Retrospective</w:t>
-            </w:r>
+              <w:t xml:space="preserve">Sprint </w:t>
+            </w:r>
+            <w:proofErr w:type="spellStart"/>
+            <w:r>
+              <w:rPr>
+                <w:rFonts w:ascii="Arial" w:hAnsi="Arial" w:cs="Arial"/>
+              </w:rPr>
+              <w:t>Retrospective</w:t>
+            </w:r>
+            <w:proofErr w:type="spellEnd"/>
           </w:p>
         </w:tc>
       </w:tr>
@@ -29447,7 +31069,21 @@
             <w:rPr>
               <w:rFonts w:ascii="Arial" w:hAnsi="Arial" w:cs="Arial"/>
             </w:rPr>
-            <w:t>Come posso cambiare una scena su unity?</w:t>
+            <w:t xml:space="preserve">Come posso cambiare una scena su </w:t>
+          </w:r>
+          <w:proofErr w:type="spellStart"/>
+          <w:r>
+            <w:rPr>
+              <w:rFonts w:ascii="Arial" w:hAnsi="Arial" w:cs="Arial"/>
+            </w:rPr>
+            <w:t>unity</w:t>
+          </w:r>
+          <w:proofErr w:type="spellEnd"/>
+          <w:r>
+            <w:rPr>
+              <w:rFonts w:ascii="Arial" w:hAnsi="Arial" w:cs="Arial"/>
+            </w:rPr>
+            <w:t>?</w:t>
           </w:r>
         </w:p>
         <w:p>
@@ -29900,7 +31536,7 @@
               <w:rPr>
                 <w:rFonts w:ascii="Arial" w:hAnsi="Arial" w:cs="Arial"/>
               </w:rPr>
-              <w:t>6</w:t>
+              <w:t>4</w:t>
             </w:r>
             <w:r>
               <w:rPr>
@@ -29984,8 +31620,16 @@
               <w:rPr>
                 <w:rFonts w:ascii="Arial" w:hAnsi="Arial" w:cs="Arial"/>
               </w:rPr>
-              <w:t>Applicata la gestione della telecamera e aggiunto moltiplicatore in base al valore nelle impostazioi</w:t>
-            </w:r>
+              <w:t xml:space="preserve">Applicata la gestione della telecamera e aggiunto moltiplicatore in base al valore nelle </w:t>
+            </w:r>
+            <w:proofErr w:type="spellStart"/>
+            <w:r>
+              <w:rPr>
+                <w:rFonts w:ascii="Arial" w:hAnsi="Arial" w:cs="Arial"/>
+              </w:rPr>
+              <w:t>impostazioi</w:t>
+            </w:r>
+            <w:proofErr w:type="spellEnd"/>
           </w:p>
         </w:tc>
       </w:tr>
@@ -30022,7 +31666,21 @@
               <w:rPr>
                 <w:rFonts w:ascii="Arial" w:hAnsi="Arial" w:cs="Arial"/>
               </w:rPr>
-              <w:t>Eseguito un refactor delle dimensioni degli elementi dato che la gravità era troppo bassa.</w:t>
+              <w:t xml:space="preserve">Eseguito un </w:t>
+            </w:r>
+            <w:proofErr w:type="spellStart"/>
+            <w:r>
+              <w:rPr>
+                <w:rFonts w:ascii="Arial" w:hAnsi="Arial" w:cs="Arial"/>
+              </w:rPr>
+              <w:t>refactor</w:t>
+            </w:r>
+            <w:proofErr w:type="spellEnd"/>
+            <w:r>
+              <w:rPr>
+                <w:rFonts w:ascii="Arial" w:hAnsi="Arial" w:cs="Arial"/>
+              </w:rPr>
+              <w:t xml:space="preserve"> delle dimensioni degli elementi dato che la gravità era troppo bassa.</w:t>
             </w:r>
           </w:p>
         </w:tc>
@@ -30323,12 +31981,28 @@
                 <w:rFonts w:ascii="Arial" w:hAnsi="Arial" w:cs="Arial"/>
               </w:rPr>
             </w:pPr>
-            <w:r>
-              <w:rPr>
-                <w:rFonts w:ascii="Arial" w:hAnsi="Arial" w:cs="Arial"/>
-              </w:rPr>
-              <w:t>Daily Scrum</w:t>
-            </w:r>
+            <w:proofErr w:type="spellStart"/>
+            <w:r>
+              <w:rPr>
+                <w:rFonts w:ascii="Arial" w:hAnsi="Arial" w:cs="Arial"/>
+              </w:rPr>
+              <w:t>Daily</w:t>
+            </w:r>
+            <w:proofErr w:type="spellEnd"/>
+            <w:r>
+              <w:rPr>
+                <w:rFonts w:ascii="Arial" w:hAnsi="Arial" w:cs="Arial"/>
+              </w:rPr>
+              <w:t xml:space="preserve"> </w:t>
+            </w:r>
+            <w:proofErr w:type="spellStart"/>
+            <w:r>
+              <w:rPr>
+                <w:rFonts w:ascii="Arial" w:hAnsi="Arial" w:cs="Arial"/>
+              </w:rPr>
+              <w:t>Scrum</w:t>
+            </w:r>
+            <w:proofErr w:type="spellEnd"/>
           </w:p>
         </w:tc>
       </w:tr>
@@ -30570,8 +32244,16 @@
               <w:rPr>
                 <w:rFonts w:ascii="Arial" w:hAnsi="Arial" w:cs="Arial"/>
               </w:rPr>
-              <w:t>Sprint Retrospective</w:t>
-            </w:r>
+              <w:t xml:space="preserve">Sprint </w:t>
+            </w:r>
+            <w:proofErr w:type="spellStart"/>
+            <w:r>
+              <w:rPr>
+                <w:rFonts w:ascii="Arial" w:hAnsi="Arial" w:cs="Arial"/>
+              </w:rPr>
+              <w:t>Retrospective</w:t>
+            </w:r>
+            <w:proofErr w:type="spellEnd"/>
           </w:p>
         </w:tc>
       </w:tr>
@@ -31062,7 +32744,21 @@
             <w:rPr>
               <w:rFonts w:ascii="Arial" w:hAnsi="Arial" w:cs="Arial"/>
             </w:rPr>
-            <w:t>Come funziona un sistema di movimento della visuale su unity?</w:t>
+            <w:t xml:space="preserve">Come funziona un sistema di movimento della visuale su </w:t>
+          </w:r>
+          <w:proofErr w:type="spellStart"/>
+          <w:r>
+            <w:rPr>
+              <w:rFonts w:ascii="Arial" w:hAnsi="Arial" w:cs="Arial"/>
+            </w:rPr>
+            <w:t>unity</w:t>
+          </w:r>
+          <w:proofErr w:type="spellEnd"/>
+          <w:r>
+            <w:rPr>
+              <w:rFonts w:ascii="Arial" w:hAnsi="Arial" w:cs="Arial"/>
+            </w:rPr>
+            <w:t>?</w:t>
           </w:r>
         </w:p>
         <w:p>
@@ -31509,7 +33205,19 @@
               <w:rPr>
                 <w:rFonts w:ascii="Arial" w:hAnsi="Arial" w:cs="Arial"/>
               </w:rPr>
-              <w:t>14.10.2026</w:t>
+              <w:t>1</w:t>
+            </w:r>
+            <w:r>
+              <w:rPr>
+                <w:rFonts w:ascii="Arial" w:hAnsi="Arial" w:cs="Arial"/>
+              </w:rPr>
+              <w:t>6</w:t>
+            </w:r>
+            <w:r>
+              <w:rPr>
+                <w:rFonts w:ascii="Arial" w:hAnsi="Arial" w:cs="Arial"/>
+              </w:rPr>
+              <w:t>.10.2026</w:t>
             </w:r>
           </w:p>
         </w:tc>
@@ -31908,12 +33616,28 @@
                 <w:rFonts w:ascii="Arial" w:hAnsi="Arial" w:cs="Arial"/>
               </w:rPr>
             </w:pPr>
-            <w:r>
-              <w:rPr>
-                <w:rFonts w:ascii="Arial" w:hAnsi="Arial" w:cs="Arial"/>
-              </w:rPr>
-              <w:t>Daily Scrum</w:t>
-            </w:r>
+            <w:proofErr w:type="spellStart"/>
+            <w:r>
+              <w:rPr>
+                <w:rFonts w:ascii="Arial" w:hAnsi="Arial" w:cs="Arial"/>
+              </w:rPr>
+              <w:t>Daily</w:t>
+            </w:r>
+            <w:proofErr w:type="spellEnd"/>
+            <w:r>
+              <w:rPr>
+                <w:rFonts w:ascii="Arial" w:hAnsi="Arial" w:cs="Arial"/>
+              </w:rPr>
+              <w:t xml:space="preserve"> </w:t>
+            </w:r>
+            <w:proofErr w:type="spellStart"/>
+            <w:r>
+              <w:rPr>
+                <w:rFonts w:ascii="Arial" w:hAnsi="Arial" w:cs="Arial"/>
+              </w:rPr>
+              <w:t>Scrum</w:t>
+            </w:r>
+            <w:proofErr w:type="spellEnd"/>
           </w:p>
         </w:tc>
       </w:tr>
@@ -31961,19 +33685,7 @@
               <w:rPr>
                 <w:rFonts w:ascii="Arial" w:hAnsi="Arial" w:cs="Arial"/>
               </w:rPr>
-              <w:t xml:space="preserve">Riley: </w:t>
-            </w:r>
-            <w:r>
-              <w:rPr>
-                <w:rFonts w:ascii="Arial" w:hAnsi="Arial" w:cs="Arial"/>
-              </w:rPr>
-              <w:t>Continuo s</w:t>
-            </w:r>
-            <w:r>
-              <w:rPr>
-                <w:rFonts w:ascii="Arial" w:hAnsi="Arial" w:cs="Arial"/>
-              </w:rPr>
-              <w:t>viluppo movimento telecamera e cambiamento sensibilità</w:t>
+              <w:t>Riley: Continuo sviluppo movimento telecamera e cambiamento sensibilità</w:t>
             </w:r>
           </w:p>
           <w:p>
@@ -32167,8 +33879,16 @@
               <w:rPr>
                 <w:rFonts w:ascii="Arial" w:hAnsi="Arial" w:cs="Arial"/>
               </w:rPr>
-              <w:t>Sprint Retrospective</w:t>
-            </w:r>
+              <w:t xml:space="preserve">Sprint </w:t>
+            </w:r>
+            <w:proofErr w:type="spellStart"/>
+            <w:r>
+              <w:rPr>
+                <w:rFonts w:ascii="Arial" w:hAnsi="Arial" w:cs="Arial"/>
+              </w:rPr>
+              <w:t>Retrospective</w:t>
+            </w:r>
+            <w:proofErr w:type="spellEnd"/>
           </w:p>
         </w:tc>
       </w:tr>
@@ -32387,13 +34107,7 @@
             <w:rPr>
               <w:rFonts w:ascii="Arial" w:hAnsi="Arial" w:cs="Arial"/>
             </w:rPr>
-            <w:t>ChatGPT</w:t>
-          </w:r>
-          <w:r>
-            <w:rPr>
-              <w:rFonts w:ascii="Arial" w:hAnsi="Arial" w:cs="Arial"/>
-            </w:rPr>
-            <w:t>, Gemini, Claude</w:t>
+            <w:t>ChatGPT, Gemini, Claude</w:t>
           </w:r>
         </w:sdtContent>
       </w:sdt>
@@ -32674,14 +34388,16 @@
             <w:rPr>
               <w:rFonts w:ascii="Arial" w:hAnsi="Arial" w:cs="Arial"/>
             </w:rPr>
-            <w:t xml:space="preserve">Bryan: </w:t>
-          </w:r>
+            <w:t xml:space="preserve">Bryan: Aiutami a creare una logica di movimento per un gioco di guida in </w:t>
+          </w:r>
+          <w:proofErr w:type="spellStart"/>
           <w:r>
             <w:rPr>
               <w:rFonts w:ascii="Arial" w:hAnsi="Arial" w:cs="Arial"/>
             </w:rPr>
-            <w:t>Aiutami a creare una logica di movimento per un gioco di guida in Unity</w:t>
-          </w:r>
+            <w:t>Unity</w:t>
+          </w:r>
+          <w:proofErr w:type="spellEnd"/>
         </w:p>
       </w:sdtContent>
     </w:sdt>
@@ -32757,19 +34473,7 @@
             <w:rPr>
               <w:rFonts w:ascii="Arial" w:hAnsi="Arial" w:cs="Arial"/>
             </w:rPr>
-            <w:t xml:space="preserve">Riley: Mi ha spiegato cosa collegare e dove e come aggiungere il valore </w:t>
-          </w:r>
-          <w:r>
-            <w:rPr>
-              <w:rFonts w:ascii="Arial" w:hAnsi="Arial" w:cs="Arial"/>
-            </w:rPr>
-            <w:t>delle impostazioni</w:t>
-          </w:r>
-          <w:r>
-            <w:rPr>
-              <w:rFonts w:ascii="Arial" w:hAnsi="Arial" w:cs="Arial"/>
-            </w:rPr>
-            <w:t>, principalmente fornito la formula per il moltiplicatore finale</w:t>
+            <w:t>Riley: Mi ha spiegato cosa collegare e dove e come aggiungere il valore delle impostazioni, principalmente fornito la formula per il moltiplicatore finale</w:t>
           </w:r>
         </w:p>
         <w:p>
@@ -32784,13 +34488,7 @@
             <w:rPr>
               <w:rFonts w:ascii="Arial" w:hAnsi="Arial" w:cs="Arial"/>
             </w:rPr>
-            <w:t xml:space="preserve">Bryan: </w:t>
-          </w:r>
-          <w:r>
-            <w:rPr>
-              <w:rFonts w:ascii="Arial" w:hAnsi="Arial" w:cs="Arial"/>
-            </w:rPr>
-            <w:t>Mi ha dato una bozza iniziale del codice tramite un controller generale.</w:t>
+            <w:t>Bryan: Mi ha dato una bozza iniziale del codice tramite un controller generale.</w:t>
           </w:r>
         </w:p>
       </w:sdtContent>
@@ -33010,13 +34708,1664 @@
         <w:rPr>
           <w:rFonts w:ascii="Arial" w:hAnsi="Arial" w:cs="Arial"/>
         </w:rPr>
-        <w:t>Bryan:</w:t>
-      </w:r>
-      <w:r>
-        <w:rPr>
-          <w:rFonts w:ascii="Arial" w:hAnsi="Arial" w:cs="Arial"/>
-        </w:rPr>
-        <w:t xml:space="preserve"> Avrei seguito un tutorial su Youtube.</w:t>
+        <w:t xml:space="preserve">Bryan: Avrei seguito un tutorial su </w:t>
+      </w:r>
+      <w:proofErr w:type="spellStart"/>
+      <w:r>
+        <w:rPr>
+          <w:rFonts w:ascii="Arial" w:hAnsi="Arial" w:cs="Arial"/>
+        </w:rPr>
+        <w:t>Youtube</w:t>
+      </w:r>
+      <w:proofErr w:type="spellEnd"/>
+      <w:r>
+        <w:rPr>
+          <w:rFonts w:ascii="Arial" w:hAnsi="Arial" w:cs="Arial"/>
+        </w:rPr>
+        <w:t>.</w:t>
+      </w:r>
+    </w:p>
+    <w:p>
+      <w:pPr>
+        <w:rPr>
+          <w:rFonts w:ascii="Arial" w:hAnsi="Arial" w:cs="Arial"/>
+        </w:rPr>
+      </w:pPr>
+      <w:r>
+        <w:rPr>
+          <w:rFonts w:ascii="Arial" w:hAnsi="Arial" w:cs="Arial"/>
+        </w:rPr>
+        <w:br w:type="page"/>
+      </w:r>
+    </w:p>
+    <w:tbl>
+      <w:tblPr>
+        <w:tblStyle w:val="Grigliatabella"/>
+        <w:tblW w:w="5000" w:type="pct"/>
+        <w:tblLook w:val="04A0" w:firstRow="1" w:lastRow="0" w:firstColumn="1" w:lastColumn="0" w:noHBand="0" w:noVBand="1"/>
+      </w:tblPr>
+      <w:tblGrid>
+        <w:gridCol w:w="2407"/>
+        <w:gridCol w:w="7221"/>
+      </w:tblGrid>
+      <w:tr>
+        <w:trPr>
+          <w:trHeight w:val="199"/>
+        </w:trPr>
+        <w:tc>
+          <w:tcPr>
+            <w:tcW w:w="1250" w:type="pct"/>
+            <w:vAlign w:val="center"/>
+          </w:tcPr>
+          <w:p>
+            <w:pPr>
+              <w:rPr>
+                <w:rFonts w:ascii="Arial" w:hAnsi="Arial" w:cs="Arial"/>
+              </w:rPr>
+            </w:pPr>
+            <w:r>
+              <w:rPr>
+                <w:rFonts w:ascii="Arial" w:hAnsi="Arial" w:cs="Arial"/>
+              </w:rPr>
+              <w:lastRenderedPageBreak/>
+              <w:t>Luogo</w:t>
+            </w:r>
+          </w:p>
+        </w:tc>
+        <w:tc>
+          <w:tcPr>
+            <w:tcW w:w="3750" w:type="pct"/>
+            <w:vAlign w:val="center"/>
+          </w:tcPr>
+          <w:p>
+            <w:pPr>
+              <w:rPr>
+                <w:rFonts w:ascii="Arial" w:hAnsi="Arial" w:cs="Arial"/>
+              </w:rPr>
+            </w:pPr>
+            <w:r>
+              <w:rPr>
+                <w:rFonts w:ascii="Arial" w:hAnsi="Arial" w:cs="Arial"/>
+              </w:rPr>
+              <w:t>Scuola Arti e Mestieri Trevano</w:t>
+            </w:r>
+          </w:p>
+        </w:tc>
+      </w:tr>
+      <w:tr>
+        <w:trPr>
+          <w:trHeight w:val="196"/>
+        </w:trPr>
+        <w:tc>
+          <w:tcPr>
+            <w:tcW w:w="1250" w:type="pct"/>
+            <w:vAlign w:val="center"/>
+          </w:tcPr>
+          <w:p>
+            <w:pPr>
+              <w:rPr>
+                <w:rFonts w:ascii="Arial" w:hAnsi="Arial" w:cs="Arial"/>
+              </w:rPr>
+            </w:pPr>
+            <w:r>
+              <w:rPr>
+                <w:rFonts w:ascii="Arial" w:hAnsi="Arial" w:cs="Arial"/>
+              </w:rPr>
+              <w:t>Data</w:t>
+            </w:r>
+          </w:p>
+        </w:tc>
+        <w:tc>
+          <w:tcPr>
+            <w:tcW w:w="3750" w:type="pct"/>
+            <w:vAlign w:val="center"/>
+          </w:tcPr>
+          <w:p>
+            <w:pPr>
+              <w:rPr>
+                <w:rFonts w:ascii="Arial" w:hAnsi="Arial" w:cs="Arial"/>
+              </w:rPr>
+            </w:pPr>
+            <w:r>
+              <w:rPr>
+                <w:rFonts w:ascii="Arial" w:hAnsi="Arial" w:cs="Arial"/>
+              </w:rPr>
+              <w:t>19.10.2026</w:t>
+            </w:r>
+          </w:p>
+        </w:tc>
+      </w:tr>
+    </w:tbl>
+    <w:p>
+      <w:pPr>
+        <w:rPr>
+          <w:rFonts w:ascii="Arial" w:hAnsi="Arial" w:cs="Arial"/>
+        </w:rPr>
+      </w:pPr>
+    </w:p>
+    <w:tbl>
+      <w:tblPr>
+        <w:tblStyle w:val="Grigliatabella"/>
+        <w:tblW w:w="0" w:type="auto"/>
+        <w:tblLook w:val="04A0" w:firstRow="1" w:lastRow="0" w:firstColumn="1" w:lastColumn="0" w:noHBand="0" w:noVBand="1"/>
+      </w:tblPr>
+      <w:tblGrid>
+        <w:gridCol w:w="1271"/>
+        <w:gridCol w:w="8357"/>
+      </w:tblGrid>
+      <w:tr>
+        <w:tc>
+          <w:tcPr>
+            <w:tcW w:w="9628" w:type="dxa"/>
+            <w:gridSpan w:val="2"/>
+            <w:shd w:val="clear" w:color="auto" w:fill="D9D9D9" w:themeFill="background1" w:themeFillShade="D9"/>
+          </w:tcPr>
+          <w:p>
+            <w:pPr>
+              <w:rPr>
+                <w:rFonts w:ascii="Arial" w:hAnsi="Arial" w:cs="Arial"/>
+              </w:rPr>
+            </w:pPr>
+            <w:r>
+              <w:rPr>
+                <w:rFonts w:ascii="Arial" w:hAnsi="Arial" w:cs="Arial"/>
+              </w:rPr>
+              <w:t>Lavori svolti</w:t>
+            </w:r>
+          </w:p>
+        </w:tc>
+      </w:tr>
+      <w:tr>
+        <w:tc>
+          <w:tcPr>
+            <w:tcW w:w="1271" w:type="dxa"/>
+          </w:tcPr>
+          <w:p>
+            <w:pPr>
+              <w:rPr>
+                <w:rFonts w:ascii="Arial" w:hAnsi="Arial" w:cs="Arial"/>
+              </w:rPr>
+            </w:pPr>
+            <w:r>
+              <w:rPr>
+                <w:rFonts w:ascii="Arial" w:hAnsi="Arial" w:cs="Arial"/>
+              </w:rPr>
+              <w:t>Riley</w:t>
+            </w:r>
+          </w:p>
+        </w:tc>
+        <w:tc>
+          <w:tcPr>
+            <w:tcW w:w="8357" w:type="dxa"/>
+          </w:tcPr>
+          <w:p>
+            <w:pPr>
+              <w:rPr>
+                <w:rFonts w:ascii="Arial" w:hAnsi="Arial" w:cs="Arial"/>
+              </w:rPr>
+            </w:pPr>
+            <w:r>
+              <w:rPr>
+                <w:rFonts w:ascii="Arial" w:hAnsi="Arial" w:cs="Arial"/>
+              </w:rPr>
+              <w:t>Terminata è applicata la gestione audio, presenti degli audio di test non ufficiali, sarà poi necessario inserire e mappare i nuovi audio futuri.</w:t>
+            </w:r>
+          </w:p>
+        </w:tc>
+      </w:tr>
+      <w:tr>
+        <w:tc>
+          <w:tcPr>
+            <w:tcW w:w="1271" w:type="dxa"/>
+          </w:tcPr>
+          <w:p>
+            <w:pPr>
+              <w:rPr>
+                <w:rFonts w:ascii="Arial" w:hAnsi="Arial" w:cs="Arial"/>
+              </w:rPr>
+            </w:pPr>
+            <w:r>
+              <w:rPr>
+                <w:rFonts w:ascii="Arial" w:hAnsi="Arial" w:cs="Arial"/>
+              </w:rPr>
+              <w:t>Bryan</w:t>
+            </w:r>
+          </w:p>
+        </w:tc>
+        <w:tc>
+          <w:tcPr>
+            <w:tcW w:w="8357" w:type="dxa"/>
+          </w:tcPr>
+          <w:p>
+            <w:pPr>
+              <w:rPr>
+                <w:rFonts w:ascii="Arial" w:hAnsi="Arial" w:cs="Arial"/>
+              </w:rPr>
+            </w:pPr>
+            <w:r>
+              <w:rPr>
+                <w:rFonts w:ascii="Arial" w:hAnsi="Arial" w:cs="Arial"/>
+              </w:rPr>
+              <w:t>Modifiche mappa e fisiche. Movimento concluso ma può risultare ancora basilare, possibili modifiche e migliorie future.</w:t>
+            </w:r>
+          </w:p>
+        </w:tc>
+      </w:tr>
+    </w:tbl>
+    <w:p>
+      <w:pPr>
+        <w:rPr>
+          <w:rFonts w:ascii="Arial" w:hAnsi="Arial" w:cs="Arial"/>
+        </w:rPr>
+      </w:pPr>
+    </w:p>
+    <w:tbl>
+      <w:tblPr>
+        <w:tblStyle w:val="Grigliatabella"/>
+        <w:tblW w:w="0" w:type="auto"/>
+        <w:tblInd w:w="-5" w:type="dxa"/>
+        <w:tblLook w:val="04A0" w:firstRow="1" w:lastRow="0" w:firstColumn="1" w:lastColumn="0" w:noHBand="0" w:noVBand="1"/>
+      </w:tblPr>
+      <w:tblGrid>
+        <w:gridCol w:w="1276"/>
+        <w:gridCol w:w="8357"/>
+      </w:tblGrid>
+      <w:tr>
+        <w:tc>
+          <w:tcPr>
+            <w:tcW w:w="9628" w:type="dxa"/>
+            <w:gridSpan w:val="2"/>
+            <w:shd w:val="clear" w:color="auto" w:fill="D9D9D9" w:themeFill="background1" w:themeFillShade="D9"/>
+          </w:tcPr>
+          <w:p>
+            <w:pPr>
+              <w:rPr>
+                <w:rFonts w:ascii="Arial" w:hAnsi="Arial" w:cs="Arial"/>
+              </w:rPr>
+            </w:pPr>
+            <w:r>
+              <w:rPr>
+                <w:rFonts w:ascii="Arial" w:hAnsi="Arial" w:cs="Arial"/>
+              </w:rPr>
+              <w:t>Problemi riscontrati e soluzioni adottate</w:t>
+            </w:r>
+          </w:p>
+        </w:tc>
+      </w:tr>
+      <w:tr>
+        <w:tc>
+          <w:tcPr>
+            <w:tcW w:w="1276" w:type="dxa"/>
+          </w:tcPr>
+          <w:p>
+            <w:pPr>
+              <w:rPr>
+                <w:rFonts w:ascii="Arial" w:hAnsi="Arial" w:cs="Arial"/>
+              </w:rPr>
+            </w:pPr>
+            <w:r>
+              <w:rPr>
+                <w:rFonts w:ascii="Arial" w:hAnsi="Arial" w:cs="Arial"/>
+              </w:rPr>
+              <w:t>Riley</w:t>
+            </w:r>
+          </w:p>
+        </w:tc>
+        <w:tc>
+          <w:tcPr>
+            <w:tcW w:w="8357" w:type="dxa"/>
+          </w:tcPr>
+          <w:p>
+            <w:pPr>
+              <w:rPr>
+                <w:rFonts w:ascii="Arial" w:hAnsi="Arial" w:cs="Arial"/>
+              </w:rPr>
+            </w:pPr>
+            <w:r>
+              <w:rPr>
+                <w:rFonts w:ascii="Arial" w:hAnsi="Arial" w:cs="Arial"/>
+              </w:rPr>
+              <w:t xml:space="preserve">Slider del volume non </w:t>
+            </w:r>
+            <w:proofErr w:type="spellStart"/>
+            <w:r>
+              <w:rPr>
+                <w:rFonts w:ascii="Arial" w:hAnsi="Arial" w:cs="Arial"/>
+              </w:rPr>
+              <w:t>interagibili</w:t>
+            </w:r>
+            <w:proofErr w:type="spellEnd"/>
+            <w:r>
+              <w:rPr>
+                <w:rFonts w:ascii="Arial" w:hAnsi="Arial" w:cs="Arial"/>
+              </w:rPr>
+              <w:t xml:space="preserve"> nel 10% finale della parte destra, i testi delle percentuali coprivano quel punto sovrapponendo la collisione e non permettendo il click, risolto riducendo le grandezze del box.   </w:t>
+            </w:r>
+          </w:p>
+        </w:tc>
+      </w:tr>
+      <w:tr>
+        <w:tc>
+          <w:tcPr>
+            <w:tcW w:w="1276" w:type="dxa"/>
+          </w:tcPr>
+          <w:p>
+            <w:pPr>
+              <w:rPr>
+                <w:rFonts w:ascii="Arial" w:hAnsi="Arial" w:cs="Arial"/>
+              </w:rPr>
+            </w:pPr>
+            <w:r>
+              <w:rPr>
+                <w:rFonts w:ascii="Arial" w:hAnsi="Arial" w:cs="Arial"/>
+              </w:rPr>
+              <w:t>Bryan</w:t>
+            </w:r>
+          </w:p>
+        </w:tc>
+        <w:tc>
+          <w:tcPr>
+            <w:tcW w:w="8357" w:type="dxa"/>
+          </w:tcPr>
+          <w:p>
+            <w:pPr>
+              <w:rPr>
+                <w:rFonts w:ascii="Arial" w:hAnsi="Arial" w:cs="Arial"/>
+              </w:rPr>
+            </w:pPr>
+            <w:r>
+              <w:rPr>
+                <w:rFonts w:ascii="Arial" w:hAnsi="Arial" w:cs="Arial"/>
+              </w:rPr>
+              <w:t>-</w:t>
+            </w:r>
+          </w:p>
+        </w:tc>
+      </w:tr>
+    </w:tbl>
+    <w:p>
+      <w:pPr>
+        <w:rPr>
+          <w:rFonts w:ascii="Arial" w:hAnsi="Arial" w:cs="Arial"/>
+        </w:rPr>
+      </w:pPr>
+    </w:p>
+    <w:tbl>
+      <w:tblPr>
+        <w:tblStyle w:val="Grigliatabella"/>
+        <w:tblW w:w="0" w:type="auto"/>
+        <w:tblLook w:val="04A0" w:firstRow="1" w:lastRow="0" w:firstColumn="1" w:lastColumn="0" w:noHBand="0" w:noVBand="1"/>
+      </w:tblPr>
+      <w:tblGrid>
+        <w:gridCol w:w="9628"/>
+      </w:tblGrid>
+      <w:tr>
+        <w:tc>
+          <w:tcPr>
+            <w:tcW w:w="9854" w:type="dxa"/>
+            <w:shd w:val="clear" w:color="auto" w:fill="D9D9D9" w:themeFill="background1" w:themeFillShade="D9"/>
+          </w:tcPr>
+          <w:p>
+            <w:pPr>
+              <w:rPr>
+                <w:rFonts w:ascii="Arial" w:hAnsi="Arial" w:cs="Arial"/>
+              </w:rPr>
+            </w:pPr>
+            <w:r>
+              <w:rPr>
+                <w:rFonts w:ascii="Arial" w:hAnsi="Arial" w:cs="Arial"/>
+              </w:rPr>
+              <w:t>Punto della situazione rispetto alla pianificazione</w:t>
+            </w:r>
+          </w:p>
+        </w:tc>
+      </w:tr>
+      <w:tr>
+        <w:tc>
+          <w:tcPr>
+            <w:tcW w:w="9854" w:type="dxa"/>
+          </w:tcPr>
+          <w:p>
+            <w:pPr>
+              <w:rPr>
+                <w:rFonts w:ascii="Arial" w:hAnsi="Arial" w:cs="Arial"/>
+              </w:rPr>
+            </w:pPr>
+            <w:r>
+              <w:rPr>
+                <w:rFonts w:ascii="Arial" w:hAnsi="Arial" w:cs="Arial"/>
+              </w:rPr>
+              <w:t>Concettualmente le meccaniche richieste dallo sprint sono state completate ma possono essere affette a cambiamenti e migliorie</w:t>
+            </w:r>
+          </w:p>
+        </w:tc>
+      </w:tr>
+    </w:tbl>
+    <w:p>
+      <w:pPr>
+        <w:rPr>
+          <w:rFonts w:ascii="Arial" w:hAnsi="Arial" w:cs="Arial"/>
+        </w:rPr>
+      </w:pPr>
+    </w:p>
+    <w:tbl>
+      <w:tblPr>
+        <w:tblStyle w:val="Grigliatabella"/>
+        <w:tblW w:w="0" w:type="auto"/>
+        <w:tblLook w:val="04A0" w:firstRow="1" w:lastRow="0" w:firstColumn="1" w:lastColumn="0" w:noHBand="0" w:noVBand="1"/>
+      </w:tblPr>
+      <w:tblGrid>
+        <w:gridCol w:w="9628"/>
+      </w:tblGrid>
+      <w:tr>
+        <w:tc>
+          <w:tcPr>
+            <w:tcW w:w="9854" w:type="dxa"/>
+            <w:shd w:val="clear" w:color="auto" w:fill="D9D9D9" w:themeFill="background1" w:themeFillShade="D9"/>
+          </w:tcPr>
+          <w:p>
+            <w:pPr>
+              <w:rPr>
+                <w:rFonts w:ascii="Arial" w:hAnsi="Arial" w:cs="Arial"/>
+              </w:rPr>
+            </w:pPr>
+            <w:r>
+              <w:rPr>
+                <w:rFonts w:ascii="Arial" w:hAnsi="Arial" w:cs="Arial"/>
+              </w:rPr>
+              <w:t>Programma di massima per la prossima giornata di lavoro</w:t>
+            </w:r>
+          </w:p>
+        </w:tc>
+      </w:tr>
+      <w:tr>
+        <w:tc>
+          <w:tcPr>
+            <w:tcW w:w="9854" w:type="dxa"/>
+          </w:tcPr>
+          <w:p>
+            <w:pPr>
+              <w:rPr>
+                <w:rFonts w:ascii="Arial" w:hAnsi="Arial" w:cs="Arial"/>
+              </w:rPr>
+            </w:pPr>
+            <w:r>
+              <w:rPr>
+                <w:rFonts w:ascii="Arial" w:hAnsi="Arial" w:cs="Arial"/>
+              </w:rPr>
+              <w:t>Analisi per possibili migliorie movimento. Creazione menu in gioco per abbandonare e modificare le impostazioni.</w:t>
+            </w:r>
+          </w:p>
+        </w:tc>
+      </w:tr>
+    </w:tbl>
+    <w:p>
+      <w:pPr>
+        <w:rPr>
+          <w:rFonts w:ascii="Arial" w:hAnsi="Arial" w:cs="Arial"/>
+        </w:rPr>
+      </w:pPr>
+    </w:p>
+    <w:p>
+      <w:pPr>
+        <w:pStyle w:val="Titolo1"/>
+      </w:pPr>
+      <w:r>
+        <w:t>Agile - Resoconto</w:t>
+      </w:r>
+    </w:p>
+    <w:tbl>
+      <w:tblPr>
+        <w:tblStyle w:val="Grigliatabella"/>
+        <w:tblW w:w="0" w:type="auto"/>
+        <w:tblLook w:val="04A0" w:firstRow="1" w:lastRow="0" w:firstColumn="1" w:lastColumn="0" w:noHBand="0" w:noVBand="1"/>
+      </w:tblPr>
+      <w:tblGrid>
+        <w:gridCol w:w="9628"/>
+      </w:tblGrid>
+      <w:tr>
+        <w:tc>
+          <w:tcPr>
+            <w:tcW w:w="9628" w:type="dxa"/>
+            <w:tcBorders>
+              <w:top w:val="single" w:sz="4" w:space="0" w:color="auto"/>
+              <w:left w:val="single" w:sz="4" w:space="0" w:color="auto"/>
+              <w:bottom w:val="single" w:sz="4" w:space="0" w:color="auto"/>
+              <w:right w:val="single" w:sz="4" w:space="0" w:color="auto"/>
+            </w:tcBorders>
+            <w:shd w:val="clear" w:color="auto" w:fill="D9D9D9" w:themeFill="background1" w:themeFillShade="D9"/>
+            <w:hideMark/>
+          </w:tcPr>
+          <w:p>
+            <w:pPr>
+              <w:spacing w:after="200" w:line="276" w:lineRule="auto"/>
+              <w:rPr>
+                <w:rFonts w:ascii="Arial" w:hAnsi="Arial" w:cs="Arial"/>
+              </w:rPr>
+            </w:pPr>
+            <w:proofErr w:type="spellStart"/>
+            <w:r>
+              <w:rPr>
+                <w:rFonts w:ascii="Arial" w:hAnsi="Arial" w:cs="Arial"/>
+              </w:rPr>
+              <w:t>Daily</w:t>
+            </w:r>
+            <w:proofErr w:type="spellEnd"/>
+            <w:r>
+              <w:rPr>
+                <w:rFonts w:ascii="Arial" w:hAnsi="Arial" w:cs="Arial"/>
+              </w:rPr>
+              <w:t xml:space="preserve"> </w:t>
+            </w:r>
+            <w:proofErr w:type="spellStart"/>
+            <w:r>
+              <w:rPr>
+                <w:rFonts w:ascii="Arial" w:hAnsi="Arial" w:cs="Arial"/>
+              </w:rPr>
+              <w:t>Scrum</w:t>
+            </w:r>
+            <w:proofErr w:type="spellEnd"/>
+          </w:p>
+        </w:tc>
+      </w:tr>
+      <w:tr>
+        <w:tc>
+          <w:tcPr>
+            <w:tcW w:w="9628" w:type="dxa"/>
+            <w:tcBorders>
+              <w:top w:val="single" w:sz="4" w:space="0" w:color="auto"/>
+              <w:left w:val="single" w:sz="4" w:space="0" w:color="auto"/>
+              <w:bottom w:val="single" w:sz="4" w:space="0" w:color="auto"/>
+              <w:right w:val="single" w:sz="4" w:space="0" w:color="auto"/>
+            </w:tcBorders>
+            <w:hideMark/>
+          </w:tcPr>
+          <w:p>
+            <w:pPr>
+              <w:spacing w:after="200" w:line="276" w:lineRule="auto"/>
+              <w:rPr>
+                <w:rFonts w:ascii="Arial" w:hAnsi="Arial" w:cs="Arial"/>
+              </w:rPr>
+            </w:pPr>
+          </w:p>
+        </w:tc>
+      </w:tr>
+      <w:tr>
+        <w:tc>
+          <w:tcPr>
+            <w:tcW w:w="9628" w:type="dxa"/>
+            <w:tcBorders>
+              <w:top w:val="single" w:sz="4" w:space="0" w:color="auto"/>
+              <w:left w:val="single" w:sz="4" w:space="0" w:color="auto"/>
+              <w:bottom w:val="single" w:sz="4" w:space="0" w:color="auto"/>
+              <w:right w:val="single" w:sz="4" w:space="0" w:color="auto"/>
+            </w:tcBorders>
+          </w:tcPr>
+          <w:p>
+            <w:pPr>
+              <w:spacing w:after="200" w:line="276" w:lineRule="auto"/>
+              <w:rPr>
+                <w:rFonts w:ascii="Arial" w:hAnsi="Arial" w:cs="Arial"/>
+              </w:rPr>
+            </w:pPr>
+            <w:r>
+              <w:rPr>
+                <w:rFonts w:ascii="Arial" w:hAnsi="Arial" w:cs="Arial"/>
+              </w:rPr>
+              <w:t xml:space="preserve">Riley: </w:t>
+            </w:r>
+            <w:r>
+              <w:rPr>
+                <w:rFonts w:ascii="Arial" w:hAnsi="Arial" w:cs="Arial"/>
+              </w:rPr>
+              <w:t>Inizio sviluppo sistema audio</w:t>
+            </w:r>
+          </w:p>
+          <w:p>
+            <w:pPr>
+              <w:spacing w:after="200" w:line="276" w:lineRule="auto"/>
+              <w:rPr>
+                <w:rFonts w:ascii="Arial" w:hAnsi="Arial" w:cs="Arial"/>
+              </w:rPr>
+            </w:pPr>
+            <w:r>
+              <w:rPr>
+                <w:rFonts w:ascii="Arial" w:hAnsi="Arial" w:cs="Arial"/>
+              </w:rPr>
+              <w:t>Bryan: Continuo sviluppo sistema movimento</w:t>
+            </w:r>
+          </w:p>
+        </w:tc>
+      </w:tr>
+    </w:tbl>
+    <w:p>
+      <w:pPr>
+        <w:rPr>
+          <w:rFonts w:ascii="Arial" w:hAnsi="Arial" w:cs="Arial"/>
+        </w:rPr>
+      </w:pPr>
+    </w:p>
+    <w:tbl>
+      <w:tblPr>
+        <w:tblStyle w:val="Grigliatabella"/>
+        <w:tblW w:w="0" w:type="auto"/>
+        <w:tblLook w:val="04A0" w:firstRow="1" w:lastRow="0" w:firstColumn="1" w:lastColumn="0" w:noHBand="0" w:noVBand="1"/>
+      </w:tblPr>
+      <w:tblGrid>
+        <w:gridCol w:w="9628"/>
+      </w:tblGrid>
+      <w:tr>
+        <w:tc>
+          <w:tcPr>
+            <w:tcW w:w="9854" w:type="dxa"/>
+            <w:tcBorders>
+              <w:top w:val="single" w:sz="4" w:space="0" w:color="auto"/>
+              <w:left w:val="single" w:sz="4" w:space="0" w:color="auto"/>
+              <w:bottom w:val="single" w:sz="4" w:space="0" w:color="auto"/>
+              <w:right w:val="single" w:sz="4" w:space="0" w:color="auto"/>
+            </w:tcBorders>
+            <w:shd w:val="clear" w:color="auto" w:fill="D9D9D9" w:themeFill="background1" w:themeFillShade="D9"/>
+            <w:hideMark/>
+          </w:tcPr>
+          <w:p>
+            <w:pPr>
+              <w:spacing w:after="200" w:line="276" w:lineRule="auto"/>
+              <w:rPr>
+                <w:rFonts w:ascii="Arial" w:hAnsi="Arial" w:cs="Arial"/>
+              </w:rPr>
+            </w:pPr>
+            <w:r>
+              <w:rPr>
+                <w:rFonts w:ascii="Arial" w:hAnsi="Arial" w:cs="Arial"/>
+              </w:rPr>
+              <w:t>Sprint Planning</w:t>
+            </w:r>
+          </w:p>
+        </w:tc>
+      </w:tr>
+      <w:tr>
+        <w:tc>
+          <w:tcPr>
+            <w:tcW w:w="9854" w:type="dxa"/>
+            <w:tcBorders>
+              <w:top w:val="single" w:sz="4" w:space="0" w:color="auto"/>
+              <w:left w:val="single" w:sz="4" w:space="0" w:color="auto"/>
+              <w:bottom w:val="single" w:sz="4" w:space="0" w:color="auto"/>
+              <w:right w:val="single" w:sz="4" w:space="0" w:color="auto"/>
+            </w:tcBorders>
+          </w:tcPr>
+          <w:p>
+            <w:pPr>
+              <w:spacing w:after="200" w:line="276" w:lineRule="auto"/>
+              <w:rPr>
+                <w:rFonts w:ascii="Arial" w:hAnsi="Arial" w:cs="Arial"/>
+              </w:rPr>
+            </w:pPr>
+          </w:p>
+        </w:tc>
+      </w:tr>
+    </w:tbl>
+    <w:p>
+      <w:pPr>
+        <w:rPr>
+          <w:rFonts w:ascii="Arial" w:hAnsi="Arial" w:cs="Arial"/>
+        </w:rPr>
+      </w:pPr>
+    </w:p>
+    <w:tbl>
+      <w:tblPr>
+        <w:tblStyle w:val="Grigliatabella"/>
+        <w:tblW w:w="0" w:type="auto"/>
+        <w:tblLook w:val="04A0" w:firstRow="1" w:lastRow="0" w:firstColumn="1" w:lastColumn="0" w:noHBand="0" w:noVBand="1"/>
+      </w:tblPr>
+      <w:tblGrid>
+        <w:gridCol w:w="9628"/>
+      </w:tblGrid>
+      <w:tr>
+        <w:tc>
+          <w:tcPr>
+            <w:tcW w:w="9854" w:type="dxa"/>
+            <w:tcBorders>
+              <w:top w:val="single" w:sz="4" w:space="0" w:color="auto"/>
+              <w:left w:val="single" w:sz="4" w:space="0" w:color="auto"/>
+              <w:bottom w:val="single" w:sz="4" w:space="0" w:color="auto"/>
+              <w:right w:val="single" w:sz="4" w:space="0" w:color="auto"/>
+            </w:tcBorders>
+            <w:shd w:val="clear" w:color="auto" w:fill="D9D9D9" w:themeFill="background1" w:themeFillShade="D9"/>
+            <w:hideMark/>
+          </w:tcPr>
+          <w:p>
+            <w:pPr>
+              <w:spacing w:after="200" w:line="276" w:lineRule="auto"/>
+              <w:rPr>
+                <w:rFonts w:ascii="Arial" w:hAnsi="Arial" w:cs="Arial"/>
+              </w:rPr>
+            </w:pPr>
+            <w:r>
+              <w:rPr>
+                <w:rFonts w:ascii="Arial" w:hAnsi="Arial" w:cs="Arial"/>
+              </w:rPr>
+              <w:t>Sprint Review</w:t>
+            </w:r>
+          </w:p>
+        </w:tc>
+      </w:tr>
+      <w:tr>
+        <w:tc>
+          <w:tcPr>
+            <w:tcW w:w="9854" w:type="dxa"/>
+            <w:tcBorders>
+              <w:top w:val="single" w:sz="4" w:space="0" w:color="auto"/>
+              <w:left w:val="single" w:sz="4" w:space="0" w:color="auto"/>
+              <w:bottom w:val="single" w:sz="4" w:space="0" w:color="auto"/>
+              <w:right w:val="single" w:sz="4" w:space="0" w:color="auto"/>
+            </w:tcBorders>
+          </w:tcPr>
+          <w:p>
+            <w:pPr>
+              <w:spacing w:after="200" w:line="276" w:lineRule="auto"/>
+              <w:rPr>
+                <w:rFonts w:ascii="Arial" w:hAnsi="Arial" w:cs="Arial"/>
+              </w:rPr>
+            </w:pPr>
+          </w:p>
+        </w:tc>
+      </w:tr>
+    </w:tbl>
+    <w:p>
+      <w:pPr>
+        <w:rPr>
+          <w:rFonts w:ascii="Arial" w:hAnsi="Arial" w:cs="Arial"/>
+        </w:rPr>
+      </w:pPr>
+    </w:p>
+    <w:tbl>
+      <w:tblPr>
+        <w:tblStyle w:val="Grigliatabella"/>
+        <w:tblW w:w="0" w:type="auto"/>
+        <w:tblLook w:val="04A0" w:firstRow="1" w:lastRow="0" w:firstColumn="1" w:lastColumn="0" w:noHBand="0" w:noVBand="1"/>
+      </w:tblPr>
+      <w:tblGrid>
+        <w:gridCol w:w="9628"/>
+      </w:tblGrid>
+      <w:tr>
+        <w:tc>
+          <w:tcPr>
+            <w:tcW w:w="9854" w:type="dxa"/>
+            <w:tcBorders>
+              <w:top w:val="single" w:sz="4" w:space="0" w:color="auto"/>
+              <w:left w:val="single" w:sz="4" w:space="0" w:color="auto"/>
+              <w:bottom w:val="single" w:sz="4" w:space="0" w:color="auto"/>
+              <w:right w:val="single" w:sz="4" w:space="0" w:color="auto"/>
+            </w:tcBorders>
+            <w:shd w:val="clear" w:color="auto" w:fill="D9D9D9" w:themeFill="background1" w:themeFillShade="D9"/>
+            <w:hideMark/>
+          </w:tcPr>
+          <w:p>
+            <w:pPr>
+              <w:spacing w:after="200" w:line="276" w:lineRule="auto"/>
+              <w:rPr>
+                <w:rFonts w:ascii="Arial" w:hAnsi="Arial" w:cs="Arial"/>
+              </w:rPr>
+            </w:pPr>
+            <w:r>
+              <w:rPr>
+                <w:rFonts w:ascii="Arial" w:hAnsi="Arial" w:cs="Arial"/>
+              </w:rPr>
+              <w:t xml:space="preserve">Sprint </w:t>
+            </w:r>
+            <w:proofErr w:type="spellStart"/>
+            <w:r>
+              <w:rPr>
+                <w:rFonts w:ascii="Arial" w:hAnsi="Arial" w:cs="Arial"/>
+              </w:rPr>
+              <w:t>Retrospective</w:t>
+            </w:r>
+            <w:proofErr w:type="spellEnd"/>
+          </w:p>
+        </w:tc>
+      </w:tr>
+      <w:tr>
+        <w:tc>
+          <w:tcPr>
+            <w:tcW w:w="9854" w:type="dxa"/>
+            <w:tcBorders>
+              <w:top w:val="single" w:sz="4" w:space="0" w:color="auto"/>
+              <w:left w:val="single" w:sz="4" w:space="0" w:color="auto"/>
+              <w:bottom w:val="single" w:sz="4" w:space="0" w:color="auto"/>
+              <w:right w:val="single" w:sz="4" w:space="0" w:color="auto"/>
+            </w:tcBorders>
+          </w:tcPr>
+          <w:p>
+            <w:pPr>
+              <w:spacing w:after="200" w:line="276" w:lineRule="auto"/>
+              <w:rPr>
+                <w:rFonts w:ascii="Arial" w:hAnsi="Arial" w:cs="Arial"/>
+              </w:rPr>
+            </w:pPr>
+          </w:p>
+        </w:tc>
+      </w:tr>
+    </w:tbl>
+    <w:p>
+      <w:pPr>
+        <w:rPr>
+          <w:rFonts w:ascii="Arial" w:eastAsiaTheme="majorEastAsia" w:hAnsi="Arial" w:cs="Arial"/>
+          <w:b/>
+          <w:bCs/>
+          <w:sz w:val="26"/>
+          <w:szCs w:val="26"/>
+        </w:rPr>
+      </w:pPr>
+      <w:r>
+        <w:br w:type="page"/>
+      </w:r>
+    </w:p>
+    <w:p>
+      <w:pPr>
+        <w:pStyle w:val="Titolo2"/>
+        <w:pBdr>
+          <w:bottom w:val="single" w:sz="4" w:space="1" w:color="auto"/>
+        </w:pBdr>
+      </w:pPr>
+      <w:r>
+        <w:lastRenderedPageBreak/>
+        <w:t>Utilizzo Intelligenza Artificiale</w:t>
+      </w:r>
+      <w:r>
+        <w:t xml:space="preserve"> nella giornata</w:t>
+      </w:r>
+    </w:p>
+    <w:p>
+      <w:pPr>
+        <w:pStyle w:val="Nessunaspaziatura"/>
+        <w:rPr>
+          <w:rFonts w:ascii="Arial" w:hAnsi="Arial" w:cs="Arial"/>
+          <w:b/>
+          <w:bCs/>
+        </w:rPr>
+      </w:pPr>
+    </w:p>
+    <w:p>
+      <w:pPr>
+        <w:pStyle w:val="Nessunaspaziatura"/>
+        <w:rPr>
+          <w:rFonts w:ascii="Arial" w:hAnsi="Arial" w:cs="Arial"/>
+        </w:rPr>
+      </w:pPr>
+      <w:sdt>
+        <w:sdtPr>
+          <w:rPr>
+            <w:rFonts w:ascii="Segoe UI Symbol" w:hAnsi="Segoe UI Symbol" w:cs="Segoe UI Symbol"/>
+          </w:rPr>
+          <w:id w:val="-1300693553"/>
+          <w14:checkbox>
+            <w14:checked w14:val="0"/>
+            <w14:checkedState w14:val="2612" w14:font="MS Gothic"/>
+            <w14:uncheckedState w14:val="2610" w14:font="MS Gothic"/>
+          </w14:checkbox>
+        </w:sdtPr>
+        <w:sdtContent>
+          <w:r>
+            <w:rPr>
+              <w:rFonts w:ascii="MS Gothic" w:eastAsia="MS Gothic" w:hAnsi="MS Gothic" w:cs="Segoe UI Symbol" w:hint="eastAsia"/>
+            </w:rPr>
+            <w:t>☐</w:t>
+          </w:r>
+        </w:sdtContent>
+      </w:sdt>
+      <w:r>
+        <w:rPr>
+          <w:rFonts w:ascii="Arial" w:hAnsi="Arial" w:cs="Arial"/>
+        </w:rPr>
+        <w:t xml:space="preserve"> Nessuno</w:t>
+      </w:r>
+      <w:r>
+        <w:br/>
+      </w:r>
+      <w:sdt>
+        <w:sdtPr>
+          <w:rPr>
+            <w:rFonts w:ascii="Segoe UI Symbol" w:hAnsi="Segoe UI Symbol" w:cs="Segoe UI Symbol"/>
+          </w:rPr>
+          <w:id w:val="1658028974"/>
+          <w14:checkbox>
+            <w14:checked w14:val="1"/>
+            <w14:checkedState w14:val="2612" w14:font="MS Gothic"/>
+            <w14:uncheckedState w14:val="2610" w14:font="MS Gothic"/>
+          </w14:checkbox>
+        </w:sdtPr>
+        <w:sdtContent>
+          <w:r>
+            <w:rPr>
+              <w:rFonts w:ascii="MS Gothic" w:eastAsia="MS Gothic" w:hAnsi="MS Gothic" w:cs="Segoe UI Symbol" w:hint="eastAsia"/>
+            </w:rPr>
+            <w:t>☒</w:t>
+          </w:r>
+        </w:sdtContent>
+      </w:sdt>
+      <w:r>
+        <w:rPr>
+          <w:rFonts w:ascii="Arial" w:hAnsi="Arial" w:cs="Arial"/>
+        </w:rPr>
+        <w:t xml:space="preserve"> Occasionale</w:t>
+      </w:r>
+      <w:r>
+        <w:br/>
+      </w:r>
+      <w:sdt>
+        <w:sdtPr>
+          <w:rPr>
+            <w:rFonts w:ascii="Segoe UI Symbol" w:hAnsi="Segoe UI Symbol" w:cs="Segoe UI Symbol"/>
+          </w:rPr>
+          <w:id w:val="436109497"/>
+          <w14:checkbox>
+            <w14:checked w14:val="0"/>
+            <w14:checkedState w14:val="2612" w14:font="MS Gothic"/>
+            <w14:uncheckedState w14:val="2610" w14:font="MS Gothic"/>
+          </w14:checkbox>
+        </w:sdtPr>
+        <w:sdtContent>
+          <w:r>
+            <w:rPr>
+              <w:rFonts w:ascii="MS Gothic" w:eastAsia="MS Gothic" w:hAnsi="MS Gothic" w:cs="Segoe UI Symbol" w:hint="eastAsia"/>
+            </w:rPr>
+            <w:t>☐</w:t>
+          </w:r>
+        </w:sdtContent>
+      </w:sdt>
+      <w:r>
+        <w:rPr>
+          <w:rFonts w:ascii="Arial" w:hAnsi="Arial" w:cs="Arial"/>
+        </w:rPr>
+        <w:t xml:space="preserve"> Frequente</w:t>
+      </w:r>
+    </w:p>
+    <w:p>
+      <w:pPr>
+        <w:pStyle w:val="Nessunaspaziatura"/>
+        <w:rPr>
+          <w:rFonts w:ascii="Arial" w:hAnsi="Arial" w:cs="Arial"/>
+        </w:rPr>
+      </w:pPr>
+    </w:p>
+    <w:p>
+      <w:pPr>
+        <w:pStyle w:val="Nessunaspaziatura"/>
+        <w:spacing w:line="276" w:lineRule="auto"/>
+        <w:rPr>
+          <w:rFonts w:ascii="Arial" w:hAnsi="Arial" w:cs="Arial"/>
+        </w:rPr>
+      </w:pPr>
+      <w:r>
+        <w:rPr>
+          <w:rFonts w:ascii="Arial" w:hAnsi="Arial" w:cs="Arial"/>
+          <w:b/>
+          <w:bCs/>
+        </w:rPr>
+        <w:t>Strumento/i utilizzato/i</w:t>
+      </w:r>
+      <w:r>
+        <w:rPr>
+          <w:rFonts w:ascii="Arial" w:hAnsi="Arial" w:cs="Arial"/>
+          <w:b/>
+          <w:bCs/>
+        </w:rPr>
+        <w:t xml:space="preserve"> </w:t>
+      </w:r>
+      <w:r>
+        <w:rPr>
+          <w:rFonts w:ascii="Arial" w:hAnsi="Arial" w:cs="Arial"/>
+        </w:rPr>
+        <w:t>(es. ChatGPT)</w:t>
+      </w:r>
+      <w:r>
+        <w:rPr>
+          <w:rFonts w:ascii="Arial" w:hAnsi="Arial" w:cs="Arial"/>
+        </w:rPr>
+        <w:t xml:space="preserve">: </w:t>
+      </w:r>
+      <w:sdt>
+        <w:sdtPr>
+          <w:rPr>
+            <w:rFonts w:ascii="Arial" w:hAnsi="Arial" w:cs="Arial"/>
+          </w:rPr>
+          <w:id w:val="-1623999115"/>
+          <w:placeholder>
+            <w:docPart w:val="96D3DC2DCDBE4CCCBC2D967B2F1DD162"/>
+          </w:placeholder>
+        </w:sdtPr>
+        <w:sdtContent>
+          <w:r>
+            <w:rPr>
+              <w:rFonts w:ascii="Arial" w:hAnsi="Arial" w:cs="Arial"/>
+            </w:rPr>
+            <w:t>ChatGPT</w:t>
+          </w:r>
+        </w:sdtContent>
+      </w:sdt>
+    </w:p>
+    <w:p>
+      <w:pPr>
+        <w:pStyle w:val="Nessunaspaziatura"/>
+        <w:rPr>
+          <w:rFonts w:ascii="Arial" w:hAnsi="Arial" w:cs="Arial"/>
+        </w:rPr>
+      </w:pPr>
+    </w:p>
+    <w:p>
+      <w:pPr>
+        <w:pStyle w:val="Nessunaspaziatura"/>
+        <w:rPr>
+          <w:rFonts w:ascii="Arial" w:hAnsi="Arial" w:cs="Arial"/>
+        </w:rPr>
+      </w:pPr>
+      <w:r>
+        <w:rPr>
+          <w:rFonts w:ascii="Arial" w:hAnsi="Arial" w:cs="Arial"/>
+          <w:b/>
+          <w:bCs/>
+        </w:rPr>
+        <w:t>Per cosa l’ho usata oggi</w:t>
+      </w:r>
+      <w:r>
+        <w:br/>
+      </w:r>
+      <w:sdt>
+        <w:sdtPr>
+          <w:rPr>
+            <w:rFonts w:ascii="Segoe UI Symbol" w:hAnsi="Segoe UI Symbol" w:cs="Segoe UI Symbol"/>
+          </w:rPr>
+          <w:id w:val="-1693681696"/>
+          <w14:checkbox>
+            <w14:checked w14:val="1"/>
+            <w14:checkedState w14:val="2612" w14:font="MS Gothic"/>
+            <w14:uncheckedState w14:val="2610" w14:font="MS Gothic"/>
+          </w14:checkbox>
+        </w:sdtPr>
+        <w:sdtContent>
+          <w:r>
+            <w:rPr>
+              <w:rFonts w:ascii="MS Gothic" w:eastAsia="MS Gothic" w:hAnsi="MS Gothic" w:cs="Segoe UI Symbol" w:hint="eastAsia"/>
+            </w:rPr>
+            <w:t>☒</w:t>
+          </w:r>
+        </w:sdtContent>
+      </w:sdt>
+      <w:r>
+        <w:rPr>
+          <w:rFonts w:ascii="Arial" w:hAnsi="Arial" w:cs="Arial"/>
+        </w:rPr>
+        <w:t xml:space="preserve"> Chiarire concetti</w:t>
+      </w:r>
+      <w:r>
+        <w:br/>
+      </w:r>
+      <w:sdt>
+        <w:sdtPr>
+          <w:rPr>
+            <w:rFonts w:ascii="Segoe UI Symbol" w:hAnsi="Segoe UI Symbol" w:cs="Segoe UI Symbol"/>
+          </w:rPr>
+          <w:id w:val="437417599"/>
+          <w14:checkbox>
+            <w14:checked w14:val="1"/>
+            <w14:checkedState w14:val="2612" w14:font="MS Gothic"/>
+            <w14:uncheckedState w14:val="2610" w14:font="MS Gothic"/>
+          </w14:checkbox>
+        </w:sdtPr>
+        <w:sdtContent>
+          <w:r>
+            <w:rPr>
+              <w:rFonts w:ascii="MS Gothic" w:eastAsia="MS Gothic" w:hAnsi="MS Gothic" w:cs="Segoe UI Symbol" w:hint="eastAsia"/>
+            </w:rPr>
+            <w:t>☒</w:t>
+          </w:r>
+        </w:sdtContent>
+      </w:sdt>
+      <w:r>
+        <w:rPr>
+          <w:rFonts w:ascii="Arial" w:hAnsi="Arial" w:cs="Arial"/>
+        </w:rPr>
+        <w:t xml:space="preserve"> Supporto al codice</w:t>
+      </w:r>
+      <w:r>
+        <w:br/>
+      </w:r>
+      <w:sdt>
+        <w:sdtPr>
+          <w:rPr>
+            <w:rFonts w:ascii="Segoe UI Symbol" w:hAnsi="Segoe UI Symbol" w:cs="Segoe UI Symbol"/>
+          </w:rPr>
+          <w:id w:val="1252933871"/>
+          <w14:checkbox>
+            <w14:checked w14:val="0"/>
+            <w14:checkedState w14:val="2612" w14:font="MS Gothic"/>
+            <w14:uncheckedState w14:val="2610" w14:font="MS Gothic"/>
+          </w14:checkbox>
+        </w:sdtPr>
+        <w:sdtContent>
+          <w:r>
+            <w:rPr>
+              <w:rFonts w:ascii="MS Gothic" w:eastAsia="MS Gothic" w:hAnsi="MS Gothic" w:cs="Segoe UI Symbol" w:hint="eastAsia"/>
+            </w:rPr>
+            <w:t>☐</w:t>
+          </w:r>
+        </w:sdtContent>
+      </w:sdt>
+      <w:r>
+        <w:rPr>
+          <w:rFonts w:ascii="Arial" w:hAnsi="Arial" w:cs="Arial"/>
+        </w:rPr>
+        <w:t xml:space="preserve"> Debug</w:t>
+      </w:r>
+      <w:r>
+        <w:br/>
+      </w:r>
+      <w:sdt>
+        <w:sdtPr>
+          <w:rPr>
+            <w:rFonts w:ascii="Segoe UI Symbol" w:hAnsi="Segoe UI Symbol" w:cs="Segoe UI Symbol"/>
+          </w:rPr>
+          <w:id w:val="1604836284"/>
+          <w14:checkbox>
+            <w14:checked w14:val="0"/>
+            <w14:checkedState w14:val="2612" w14:font="MS Gothic"/>
+            <w14:uncheckedState w14:val="2610" w14:font="MS Gothic"/>
+          </w14:checkbox>
+        </w:sdtPr>
+        <w:sdtContent>
+          <w:r>
+            <w:rPr>
+              <w:rFonts w:ascii="MS Gothic" w:eastAsia="MS Gothic" w:hAnsi="MS Gothic" w:cs="Segoe UI Symbol" w:hint="eastAsia"/>
+            </w:rPr>
+            <w:t>☐</w:t>
+          </w:r>
+        </w:sdtContent>
+      </w:sdt>
+      <w:r>
+        <w:rPr>
+          <w:rFonts w:ascii="Arial" w:hAnsi="Arial" w:cs="Arial"/>
+        </w:rPr>
+        <w:t xml:space="preserve"> Riorganizzare idee / testi</w:t>
+      </w:r>
+      <w:r>
+        <w:br/>
+      </w:r>
+      <w:sdt>
+        <w:sdtPr>
+          <w:rPr>
+            <w:rFonts w:ascii="Segoe UI Symbol" w:hAnsi="Segoe UI Symbol" w:cs="Segoe UI Symbol"/>
+          </w:rPr>
+          <w:id w:val="827943583"/>
+          <w14:checkbox>
+            <w14:checked w14:val="0"/>
+            <w14:checkedState w14:val="2612" w14:font="MS Gothic"/>
+            <w14:uncheckedState w14:val="2610" w14:font="MS Gothic"/>
+          </w14:checkbox>
+        </w:sdtPr>
+        <w:sdtContent>
+          <w:r>
+            <w:rPr>
+              <w:rFonts w:ascii="MS Gothic" w:eastAsia="MS Gothic" w:hAnsi="MS Gothic" w:cs="Segoe UI Symbol" w:hint="eastAsia"/>
+            </w:rPr>
+            <w:t>☐</w:t>
+          </w:r>
+        </w:sdtContent>
+      </w:sdt>
+      <w:r>
+        <w:rPr>
+          <w:rFonts w:ascii="Arial" w:hAnsi="Arial" w:cs="Arial"/>
+        </w:rPr>
+        <w:t xml:space="preserve"> Altro: …</w:t>
+      </w:r>
+    </w:p>
+    <w:p>
+      <w:pPr>
+        <w:pStyle w:val="Nessunaspaziatura"/>
+        <w:rPr>
+          <w:rFonts w:ascii="Arial" w:hAnsi="Arial" w:cs="Arial"/>
+        </w:rPr>
+      </w:pPr>
+    </w:p>
+    <w:p>
+      <w:pPr>
+        <w:pStyle w:val="Nessunaspaziatura"/>
+        <w:rPr>
+          <w:rFonts w:ascii="Arial" w:hAnsi="Arial" w:cs="Arial"/>
+          <w:b/>
+          <w:bCs/>
+        </w:rPr>
+      </w:pPr>
+      <w:r>
+        <w:rPr>
+          <w:rFonts w:ascii="Arial" w:hAnsi="Arial" w:cs="Arial"/>
+          <w:b/>
+          <w:bCs/>
+        </w:rPr>
+        <w:t>Esempio significativo di utilizzo (UNO SOLO)</w:t>
+      </w:r>
+    </w:p>
+    <w:p>
+      <w:pPr>
+        <w:pStyle w:val="Nessunaspaziatura"/>
+        <w:rPr>
+          <w:rFonts w:ascii="Arial" w:hAnsi="Arial" w:cs="Arial"/>
+        </w:rPr>
+      </w:pPr>
+      <w:r>
+        <w:rPr>
+          <w:rFonts w:ascii="Arial" w:hAnsi="Arial" w:cs="Arial"/>
+        </w:rPr>
+        <w:t xml:space="preserve">Riporta </w:t>
+      </w:r>
+      <w:r>
+        <w:rPr>
+          <w:rFonts w:ascii="Arial" w:hAnsi="Arial" w:cs="Arial"/>
+          <w:i/>
+          <w:iCs/>
+        </w:rPr>
+        <w:t>un</w:t>
+      </w:r>
+      <w:r>
+        <w:rPr>
+          <w:rFonts w:ascii="Arial" w:hAnsi="Arial" w:cs="Arial"/>
+        </w:rPr>
+        <w:t xml:space="preserve"> prompt rilevante oppure descrivilo a parole se ce ne sono stati molti.</w:t>
+      </w:r>
+    </w:p>
+    <w:p>
+      <w:pPr>
+        <w:pStyle w:val="Nessunaspaziatura"/>
+        <w:rPr>
+          <w:rFonts w:ascii="Arial" w:hAnsi="Arial" w:cs="Arial"/>
+        </w:rPr>
+      </w:pPr>
+    </w:p>
+    <w:sdt>
+      <w:sdtPr>
+        <w:rPr>
+          <w:rFonts w:ascii="Arial" w:hAnsi="Arial" w:cs="Arial"/>
+        </w:rPr>
+        <w:alias w:val="Prompt AI"/>
+        <w:tag w:val="Prompt AI"/>
+        <w:id w:val="-1347944658"/>
+        <w:placeholder>
+          <w:docPart w:val="67EE0E83148649A58ADCEB364424B0B5"/>
+        </w:placeholder>
+        <w15:color w:val="C0C0C0"/>
+      </w:sdtPr>
+      <w:sdtContent>
+        <w:p>
+          <w:pPr>
+            <w:pStyle w:val="Nessunaspaziatura"/>
+            <w:rPr>
+              <w:rFonts w:ascii="Arial" w:hAnsi="Arial" w:cs="Arial"/>
+            </w:rPr>
+          </w:pPr>
+          <w:r>
+            <w:rPr>
+              <w:rFonts w:ascii="Arial" w:hAnsi="Arial" w:cs="Arial"/>
+            </w:rPr>
+            <w:t xml:space="preserve">Riley: </w:t>
+          </w:r>
+          <w:r>
+            <w:rPr>
+              <w:rFonts w:ascii="Arial" w:hAnsi="Arial" w:cs="Arial"/>
+            </w:rPr>
+            <w:t xml:space="preserve">Vorrei sapere come funziona l’audio in </w:t>
+          </w:r>
+          <w:proofErr w:type="spellStart"/>
+          <w:r>
+            <w:rPr>
+              <w:rFonts w:ascii="Arial" w:hAnsi="Arial" w:cs="Arial"/>
+            </w:rPr>
+            <w:t>unity</w:t>
+          </w:r>
+          <w:proofErr w:type="spellEnd"/>
+          <w:r>
+            <w:rPr>
+              <w:rFonts w:ascii="Arial" w:hAnsi="Arial" w:cs="Arial"/>
+            </w:rPr>
+            <w:t xml:space="preserve"> e come posso applicarlo</w:t>
+          </w:r>
+        </w:p>
+        <w:p>
+          <w:pPr>
+            <w:pStyle w:val="Nessunaspaziatura"/>
+            <w:spacing w:line="276" w:lineRule="auto"/>
+            <w:rPr>
+              <w:rFonts w:ascii="Arial" w:hAnsi="Arial" w:cs="Arial"/>
+            </w:rPr>
+          </w:pPr>
+          <w:r>
+            <w:rPr>
+              <w:rFonts w:ascii="Arial" w:hAnsi="Arial" w:cs="Arial"/>
+            </w:rPr>
+            <w:t xml:space="preserve">Bryan: </w:t>
+          </w:r>
+        </w:p>
+      </w:sdtContent>
+    </w:sdt>
+    <w:p>
+      <w:pPr>
+        <w:pStyle w:val="Nessunaspaziatura"/>
+        <w:rPr>
+          <w:rFonts w:ascii="Arial" w:hAnsi="Arial" w:cs="Arial"/>
+        </w:rPr>
+      </w:pPr>
+    </w:p>
+    <w:p>
+      <w:pPr>
+        <w:pStyle w:val="Nessunaspaziatura"/>
+        <w:rPr>
+          <w:rFonts w:ascii="Arial" w:hAnsi="Arial" w:cs="Arial"/>
+        </w:rPr>
+      </w:pPr>
+      <w:r>
+        <w:rPr>
+          <w:rFonts w:ascii="Arial" w:hAnsi="Arial" w:cs="Arial"/>
+          <w:b/>
+          <w:bCs/>
+        </w:rPr>
+        <w:t>Cosa mi ha dato l’AI</w:t>
+      </w:r>
+    </w:p>
+    <w:p>
+      <w:pPr>
+        <w:pStyle w:val="Nessunaspaziatura"/>
+        <w:rPr>
+          <w:rFonts w:ascii="Arial" w:hAnsi="Arial" w:cs="Arial"/>
+        </w:rPr>
+      </w:pPr>
+      <w:r>
+        <w:rPr>
+          <w:rFonts w:ascii="Arial" w:hAnsi="Arial" w:cs="Arial"/>
+        </w:rPr>
+        <w:t>Spiegazione, esempio, soluzione, suggerimento…</w:t>
+      </w:r>
+    </w:p>
+    <w:p>
+      <w:pPr>
+        <w:pStyle w:val="Nessunaspaziatura"/>
+        <w:rPr>
+          <w:rFonts w:ascii="Arial" w:hAnsi="Arial" w:cs="Arial"/>
+        </w:rPr>
+      </w:pPr>
+    </w:p>
+    <w:sdt>
+      <w:sdtPr>
+        <w:rPr>
+          <w:rFonts w:ascii="Arial" w:hAnsi="Arial" w:cs="Arial"/>
+        </w:rPr>
+        <w:alias w:val="Risposta AI"/>
+        <w:tag w:val="Risposta AI"/>
+        <w:id w:val="30997384"/>
+        <w:placeholder>
+          <w:docPart w:val="92EDCB26C02F4472A2DFBBE345CCBCFB"/>
+        </w:placeholder>
+        <w15:color w:val="C0C0C0"/>
+      </w:sdtPr>
+      <w:sdtContent>
+        <w:p>
+          <w:pPr>
+            <w:pStyle w:val="Nessunaspaziatura"/>
+            <w:spacing w:line="276" w:lineRule="auto"/>
+            <w:rPr>
+              <w:rFonts w:ascii="Arial" w:hAnsi="Arial" w:cs="Arial"/>
+            </w:rPr>
+          </w:pPr>
+          <w:r>
+            <w:rPr>
+              <w:rFonts w:ascii="Arial" w:hAnsi="Arial" w:cs="Arial"/>
+            </w:rPr>
+            <w:t xml:space="preserve">Riley: </w:t>
+          </w:r>
+          <w:r>
+            <w:rPr>
+              <w:rFonts w:ascii="Arial" w:hAnsi="Arial" w:cs="Arial"/>
+            </w:rPr>
+            <w:t>Mi ha fornito una spiegazione ed un esempio concreto sulla sua base di conoscenze del progetto.</w:t>
+          </w:r>
+        </w:p>
+        <w:p>
+          <w:pPr>
+            <w:pStyle w:val="Nessunaspaziatura"/>
+            <w:spacing w:line="276" w:lineRule="auto"/>
+            <w:rPr>
+              <w:rFonts w:ascii="Arial" w:hAnsi="Arial" w:cs="Arial"/>
+            </w:rPr>
+          </w:pPr>
+          <w:r>
+            <w:rPr>
+              <w:rFonts w:ascii="Arial" w:hAnsi="Arial" w:cs="Arial"/>
+            </w:rPr>
+            <w:t xml:space="preserve">Bryan: </w:t>
+          </w:r>
+        </w:p>
+      </w:sdtContent>
+    </w:sdt>
+    <w:p>
+      <w:pPr>
+        <w:pStyle w:val="Nessunaspaziatura"/>
+        <w:rPr>
+          <w:rFonts w:ascii="Arial" w:hAnsi="Arial" w:cs="Arial"/>
+          <w:b/>
+          <w:bCs/>
+        </w:rPr>
+      </w:pPr>
+    </w:p>
+    <w:p>
+      <w:pPr>
+        <w:pStyle w:val="Nessunaspaziatura"/>
+        <w:rPr>
+          <w:rFonts w:ascii="Arial" w:hAnsi="Arial" w:cs="Arial"/>
+        </w:rPr>
+      </w:pPr>
+      <w:r>
+        <w:rPr>
+          <w:rFonts w:ascii="Arial" w:hAnsi="Arial" w:cs="Arial"/>
+          <w:b/>
+          <w:bCs/>
+        </w:rPr>
+        <w:t>Come l’ho usato io</w:t>
+      </w:r>
+      <w:r>
+        <w:rPr>
+          <w:rFonts w:ascii="Arial" w:hAnsi="Arial" w:cs="Arial"/>
+        </w:rPr>
+        <w:br/>
+      </w:r>
+      <w:sdt>
+        <w:sdtPr>
+          <w:rPr>
+            <w:rFonts w:ascii="Segoe UI Symbol" w:hAnsi="Segoe UI Symbol" w:cs="Segoe UI Symbol"/>
+          </w:rPr>
+          <w:id w:val="60686777"/>
+          <w14:checkbox>
+            <w14:checked w14:val="1"/>
+            <w14:checkedState w14:val="2612" w14:font="MS Gothic"/>
+            <w14:uncheckedState w14:val="2610" w14:font="MS Gothic"/>
+          </w14:checkbox>
+        </w:sdtPr>
+        <w:sdtContent>
+          <w:r>
+            <w:rPr>
+              <w:rFonts w:ascii="MS Gothic" w:eastAsia="MS Gothic" w:hAnsi="MS Gothic" w:cs="Segoe UI Symbol" w:hint="eastAsia"/>
+            </w:rPr>
+            <w:t>☒</w:t>
+          </w:r>
+        </w:sdtContent>
+      </w:sdt>
+      <w:r>
+        <w:rPr>
+          <w:rFonts w:ascii="Arial" w:hAnsi="Arial" w:cs="Arial"/>
+        </w:rPr>
+        <w:t xml:space="preserve"> Copiato</w:t>
+      </w:r>
+      <w:r>
+        <w:rPr>
+          <w:rFonts w:ascii="Arial" w:hAnsi="Arial" w:cs="Arial"/>
+        </w:rPr>
+        <w:br/>
+      </w:r>
+      <w:sdt>
+        <w:sdtPr>
+          <w:rPr>
+            <w:rFonts w:ascii="Segoe UI Symbol" w:hAnsi="Segoe UI Symbol" w:cs="Segoe UI Symbol"/>
+          </w:rPr>
+          <w:id w:val="1775901356"/>
+          <w14:checkbox>
+            <w14:checked w14:val="1"/>
+            <w14:checkedState w14:val="2612" w14:font="MS Gothic"/>
+            <w14:uncheckedState w14:val="2610" w14:font="MS Gothic"/>
+          </w14:checkbox>
+        </w:sdtPr>
+        <w:sdtContent>
+          <w:r>
+            <w:rPr>
+              <w:rFonts w:ascii="MS Gothic" w:eastAsia="MS Gothic" w:hAnsi="MS Gothic" w:cs="Segoe UI Symbol" w:hint="eastAsia"/>
+            </w:rPr>
+            <w:t>☒</w:t>
+          </w:r>
+        </w:sdtContent>
+      </w:sdt>
+      <w:r>
+        <w:rPr>
+          <w:rFonts w:ascii="Arial" w:hAnsi="Arial" w:cs="Arial"/>
+        </w:rPr>
+        <w:t xml:space="preserve"> Adattato</w:t>
+      </w:r>
+      <w:r>
+        <w:rPr>
+          <w:rFonts w:ascii="Arial" w:hAnsi="Arial" w:cs="Arial"/>
+        </w:rPr>
+        <w:br/>
+      </w:r>
+      <w:sdt>
+        <w:sdtPr>
+          <w:rPr>
+            <w:rFonts w:ascii="Segoe UI Symbol" w:hAnsi="Segoe UI Symbol" w:cs="Segoe UI Symbol"/>
+          </w:rPr>
+          <w:id w:val="-1772851474"/>
+          <w14:checkbox>
+            <w14:checked w14:val="0"/>
+            <w14:checkedState w14:val="2612" w14:font="MS Gothic"/>
+            <w14:uncheckedState w14:val="2610" w14:font="MS Gothic"/>
+          </w14:checkbox>
+        </w:sdtPr>
+        <w:sdtContent>
+          <w:r>
+            <w:rPr>
+              <w:rFonts w:ascii="MS Gothic" w:eastAsia="MS Gothic" w:hAnsi="MS Gothic" w:cs="Segoe UI Symbol" w:hint="eastAsia"/>
+            </w:rPr>
+            <w:t>☐</w:t>
+          </w:r>
+        </w:sdtContent>
+      </w:sdt>
+      <w:r>
+        <w:rPr>
+          <w:rFonts w:ascii="Arial" w:hAnsi="Arial" w:cs="Arial"/>
+        </w:rPr>
+        <w:t xml:space="preserve"> Usato solo per capire</w:t>
+      </w:r>
+      <w:r>
+        <w:rPr>
+          <w:rFonts w:ascii="Arial" w:hAnsi="Arial" w:cs="Arial"/>
+        </w:rPr>
+        <w:br/>
+      </w:r>
+      <w:sdt>
+        <w:sdtPr>
+          <w:rPr>
+            <w:rFonts w:ascii="Segoe UI Symbol" w:hAnsi="Segoe UI Symbol" w:cs="Segoe UI Symbol"/>
+          </w:rPr>
+          <w:id w:val="71017917"/>
+          <w14:checkbox>
+            <w14:checked w14:val="0"/>
+            <w14:checkedState w14:val="2612" w14:font="MS Gothic"/>
+            <w14:uncheckedState w14:val="2610" w14:font="MS Gothic"/>
+          </w14:checkbox>
+        </w:sdtPr>
+        <w:sdtContent>
+          <w:r>
+            <w:rPr>
+              <w:rFonts w:ascii="MS Gothic" w:eastAsia="MS Gothic" w:hAnsi="MS Gothic" w:cs="Segoe UI Symbol" w:hint="eastAsia"/>
+            </w:rPr>
+            <w:t>☐</w:t>
+          </w:r>
+        </w:sdtContent>
+      </w:sdt>
+      <w:r>
+        <w:rPr>
+          <w:rFonts w:ascii="Arial" w:hAnsi="Arial" w:cs="Arial"/>
+        </w:rPr>
+        <w:t xml:space="preserve"> Scartato</w:t>
+      </w:r>
+    </w:p>
+    <w:p>
+      <w:pPr>
+        <w:pStyle w:val="Nessunaspaziatura"/>
+        <w:rPr>
+          <w:rFonts w:ascii="Arial" w:hAnsi="Arial" w:cs="Arial"/>
+        </w:rPr>
+      </w:pPr>
+    </w:p>
+    <w:p>
+      <w:pPr>
+        <w:pStyle w:val="Nessunaspaziatura"/>
+        <w:rPr>
+          <w:rFonts w:ascii="Arial" w:hAnsi="Arial" w:cs="Arial"/>
+        </w:rPr>
+      </w:pPr>
+    </w:p>
+    <w:p>
+      <w:pPr>
+        <w:pStyle w:val="Nessunaspaziatura"/>
+        <w:rPr>
+          <w:rFonts w:ascii="Arial" w:hAnsi="Arial" w:cs="Arial"/>
+        </w:rPr>
+      </w:pPr>
+      <w:r>
+        <w:rPr>
+          <w:rFonts w:ascii="Arial" w:hAnsi="Arial" w:cs="Arial"/>
+          <w:b/>
+          <w:bCs/>
+        </w:rPr>
+        <w:t>Cosa avrei fatto senza AI?</w:t>
+      </w:r>
+    </w:p>
+    <w:p>
+      <w:pPr>
+        <w:pStyle w:val="Nessunaspaziatura"/>
+        <w:rPr>
+          <w:rFonts w:ascii="Arial" w:hAnsi="Arial" w:cs="Arial"/>
+        </w:rPr>
+      </w:pPr>
+      <w:r>
+        <w:rPr>
+          <w:rFonts w:ascii="Arial" w:hAnsi="Arial" w:cs="Arial"/>
+        </w:rPr>
+        <w:t xml:space="preserve">Riley: </w:t>
+      </w:r>
+      <w:r>
+        <w:rPr>
+          <w:rFonts w:ascii="Arial" w:hAnsi="Arial" w:cs="Arial"/>
+        </w:rPr>
+        <w:t>Avrei cercato sulla documentazione ufficiale.</w:t>
+      </w:r>
+    </w:p>
+    <w:p>
+      <w:pPr>
+        <w:pStyle w:val="Nessunaspaziatura"/>
+        <w:rPr>
+          <w:rFonts w:ascii="Arial" w:hAnsi="Arial" w:cs="Arial"/>
+        </w:rPr>
+      </w:pPr>
+      <w:r>
+        <w:rPr>
+          <w:rFonts w:ascii="Arial" w:hAnsi="Arial" w:cs="Arial"/>
+        </w:rPr>
+        <w:t xml:space="preserve">Bryan: </w:t>
       </w:r>
     </w:p>
     <w:p>
@@ -33243,8 +36592,17 @@
         <w:rFonts w:ascii="Arial" w:hAnsi="Arial" w:cs="Arial"/>
         <w:lang w:val="fr-CH"/>
       </w:rPr>
-      <w:t>Riley Bianchi &amp; Bryan Ciaponi</w:t>
+      <w:t xml:space="preserve">Riley Bianchi &amp; Bryan </w:t>
     </w:r>
+    <w:proofErr w:type="spellStart"/>
+    <w:r>
+      <w:rPr>
+        <w:rFonts w:ascii="Arial" w:hAnsi="Arial" w:cs="Arial"/>
+        <w:lang w:val="fr-CH"/>
+      </w:rPr>
+      <w:t>Ciaponi</w:t>
+    </w:r>
+    <w:proofErr w:type="spellEnd"/>
   </w:p>
 </w:hdr>
 </file>
@@ -38882,6 +42240,107 @@
         </w:p>
       </w:docPartBody>
     </w:docPart>
+    <w:docPart>
+      <w:docPartPr>
+        <w:name w:val="96D3DC2DCDBE4CCCBC2D967B2F1DD162"/>
+        <w:category>
+          <w:name w:val="Generale"/>
+          <w:gallery w:val="placeholder"/>
+        </w:category>
+        <w:types>
+          <w:type w:val="bbPlcHdr"/>
+        </w:types>
+        <w:behaviors>
+          <w:behavior w:val="content"/>
+        </w:behaviors>
+        <w:guid w:val="{D9A044AD-2E49-4AE4-8C03-3AF65E13421D}"/>
+      </w:docPartPr>
+      <w:docPartBody>
+        <w:p>
+          <w:pPr>
+            <w:pStyle w:val="96D3DC2DCDBE4CCCBC2D967B2F1DD162"/>
+          </w:pPr>
+          <w:r>
+            <w:rPr>
+              <w:rStyle w:val="Testosegnaposto"/>
+              <w:b/>
+              <w:bCs/>
+            </w:rPr>
+            <w:t>Nomi AI utilizzati</w:t>
+          </w:r>
+        </w:p>
+      </w:docPartBody>
+    </w:docPart>
+    <w:docPart>
+      <w:docPartPr>
+        <w:name w:val="67EE0E83148649A58ADCEB364424B0B5"/>
+        <w:category>
+          <w:name w:val="Generale"/>
+          <w:gallery w:val="placeholder"/>
+        </w:category>
+        <w:types>
+          <w:type w:val="bbPlcHdr"/>
+        </w:types>
+        <w:behaviors>
+          <w:behavior w:val="content"/>
+        </w:behaviors>
+        <w:guid w:val="{5EC762B1-E67B-4539-A815-88AF2C7A4457}"/>
+      </w:docPartPr>
+      <w:docPartBody>
+        <w:p>
+          <w:pPr>
+            <w:pStyle w:val="67EE0E83148649A58ADCEB364424B0B5"/>
+          </w:pPr>
+          <w:r>
+            <w:rPr>
+              <w:rStyle w:val="Testosegnaposto"/>
+            </w:rPr>
+            <w:t>Fare clic o toccare qui per immettere il testo.</w:t>
+          </w:r>
+        </w:p>
+      </w:docPartBody>
+    </w:docPart>
+    <w:docPart>
+      <w:docPartPr>
+        <w:name w:val="92EDCB26C02F4472A2DFBBE345CCBCFB"/>
+        <w:category>
+          <w:name w:val="Generale"/>
+          <w:gallery w:val="placeholder"/>
+        </w:category>
+        <w:types>
+          <w:type w:val="bbPlcHdr"/>
+        </w:types>
+        <w:behaviors>
+          <w:behavior w:val="content"/>
+        </w:behaviors>
+        <w:guid w:val="{E8A40A28-C4AB-47C5-B543-6BC94737A498}"/>
+      </w:docPartPr>
+      <w:docPartBody>
+        <w:p>
+          <w:pPr>
+            <w:pStyle w:val="92EDCB26C02F4472A2DFBBE345CCBCFB"/>
+          </w:pPr>
+          <w:r>
+            <w:rPr>
+              <w:rStyle w:val="Testosegnaposto"/>
+            </w:rPr>
+            <w:t xml:space="preserve">Fare clic o toccare qui per </w:t>
+          </w:r>
+          <w:r>
+            <w:rPr>
+              <w:rStyle w:val="Testosegnaposto"/>
+            </w:rPr>
+            <w:t>immettere</w:t>
+          </w:r>
+          <w:r>
+            <w:rPr>
+              <w:rStyle w:val="Testosegnaposto"/>
+            </w:rPr>
+            <w:t xml:space="preserve"> il testo.</w:t>
+          </w:r>
+        </w:p>
+      </w:docPartBody>
+    </w:docPart>
   </w:docParts>
 </w:glossaryDocument>
 </file>
@@ -39027,6 +42486,7 @@
     <w:rsid w:val="001C42CE"/>
     <w:rsid w:val="00243248"/>
     <w:rsid w:val="00254718"/>
+    <w:rsid w:val="002663CA"/>
     <w:rsid w:val="002B6D86"/>
     <w:rsid w:val="00352469"/>
     <w:rsid w:val="00356BEF"/>
@@ -39045,6 +42505,7 @@
     <w:rsid w:val="00530FEF"/>
     <w:rsid w:val="00534571"/>
     <w:rsid w:val="00565B11"/>
+    <w:rsid w:val="005E5F97"/>
     <w:rsid w:val="00633F3C"/>
     <w:rsid w:val="0063588A"/>
     <w:rsid w:val="00657C43"/>
@@ -39055,10 +42516,12 @@
     <w:rsid w:val="007525FE"/>
     <w:rsid w:val="00753720"/>
     <w:rsid w:val="00754A35"/>
+    <w:rsid w:val="00774A20"/>
     <w:rsid w:val="00780E37"/>
     <w:rsid w:val="00786637"/>
     <w:rsid w:val="007B0D32"/>
     <w:rsid w:val="007B2F51"/>
+    <w:rsid w:val="007E4BCA"/>
     <w:rsid w:val="007E6540"/>
     <w:rsid w:val="007F4556"/>
     <w:rsid w:val="007F539F"/>
@@ -39082,6 +42545,7 @@
     <w:rsid w:val="00AA022F"/>
     <w:rsid w:val="00AC4AC4"/>
     <w:rsid w:val="00AD46CF"/>
+    <w:rsid w:val="00B04384"/>
     <w:rsid w:val="00B06614"/>
     <w:rsid w:val="00B555FF"/>
     <w:rsid w:val="00BD3686"/>
@@ -39089,6 +42553,7 @@
     <w:rsid w:val="00BE72BC"/>
     <w:rsid w:val="00C00D0B"/>
     <w:rsid w:val="00C120D8"/>
+    <w:rsid w:val="00C238B5"/>
     <w:rsid w:val="00C537F1"/>
     <w:rsid w:val="00C60D7D"/>
     <w:rsid w:val="00CA345C"/>
@@ -39573,7 +43038,7 @@
     <w:basedOn w:val="Carpredefinitoparagrafo"/>
     <w:uiPriority w:val="99"/>
     <w:semiHidden/>
-    <w:rsid w:val="000452F4"/>
+    <w:rsid w:val="00B04384"/>
     <w:rPr>
       <w:color w:val="666666"/>
     </w:rPr>
@@ -39899,6 +43364,18 @@
     <w:name w:val="1B4474071921409F836C4E272E16D7E8"/>
     <w:rsid w:val="000452F4"/>
   </w:style>
+  <w:style w:type="paragraph" w:customStyle="1" w:styleId="96D3DC2DCDBE4CCCBC2D967B2F1DD162">
+    <w:name w:val="96D3DC2DCDBE4CCCBC2D967B2F1DD162"/>
+    <w:rsid w:val="00B04384"/>
+  </w:style>
+  <w:style w:type="paragraph" w:customStyle="1" w:styleId="67EE0E83148649A58ADCEB364424B0B5">
+    <w:name w:val="67EE0E83148649A58ADCEB364424B0B5"/>
+    <w:rsid w:val="00B04384"/>
+  </w:style>
+  <w:style w:type="paragraph" w:customStyle="1" w:styleId="92EDCB26C02F4472A2DFBBE345CCBCFB">
+    <w:name w:val="92EDCB26C02F4472A2DFBBE345CCBCFB"/>
+    <w:rsid w:val="00B04384"/>
+  </w:style>
 </w:styles>
 </file>
 

</xml_diff>

<commit_message>
inizio UI in partita, modifiche UI menu e diario
</commit_message>
<xml_diff>
--- a/4_Diari/Diario.docx
+++ b/4_Diari/Diario.docx
@@ -703,25 +703,7 @@
               <w:b/>
               <w:bCs/>
             </w:rPr>
-            <w:t xml:space="preserve">Nomi </w:t>
-          </w:r>
-          <w:proofErr w:type="gramStart"/>
-          <w:r>
-            <w:rPr>
-              <w:rStyle w:val="Testosegnaposto"/>
-              <w:b/>
-              <w:bCs/>
-            </w:rPr>
-            <w:t>AI</w:t>
-          </w:r>
-          <w:proofErr w:type="gramEnd"/>
-          <w:r>
-            <w:rPr>
-              <w:rStyle w:val="Testosegnaposto"/>
-              <w:b/>
-              <w:bCs/>
-            </w:rPr>
-            <w:t xml:space="preserve"> utilizzati</w:t>
+            <w:t>Nomi AI utilizzati</w:t>
           </w:r>
         </w:sdtContent>
       </w:sdt>
@@ -1802,21 +1784,7 @@
               <w:rPr>
                 <w:rFonts w:ascii="Arial" w:hAnsi="Arial" w:cs="Arial"/>
               </w:rPr>
-              <w:t xml:space="preserve">Iniziare e completare analisi dei mezzi, creare </w:t>
-            </w:r>
-            <w:proofErr w:type="gramStart"/>
-            <w:r>
-              <w:rPr>
-                <w:rFonts w:ascii="Arial" w:hAnsi="Arial" w:cs="Arial"/>
-              </w:rPr>
-              <w:t>lo use</w:t>
-            </w:r>
-            <w:proofErr w:type="gramEnd"/>
-            <w:r>
-              <w:rPr>
-                <w:rFonts w:ascii="Arial" w:hAnsi="Arial" w:cs="Arial"/>
-              </w:rPr>
-              <w:t xml:space="preserve"> case</w:t>
+              <w:t>Iniziare e completare analisi dei mezzi, creare lo use case</w:t>
             </w:r>
             <w:r>
               <w:rPr>
@@ -3037,21 +3005,7 @@
               <w:rPr>
                 <w:rFonts w:ascii="Arial" w:hAnsi="Arial" w:cs="Arial"/>
               </w:rPr>
-              <w:t xml:space="preserve">Il diagramma ER non è completo e </w:t>
-            </w:r>
-            <w:proofErr w:type="gramStart"/>
-            <w:r>
-              <w:rPr>
-                <w:rFonts w:ascii="Arial" w:hAnsi="Arial" w:cs="Arial"/>
-              </w:rPr>
-              <w:t>lo use</w:t>
-            </w:r>
-            <w:proofErr w:type="gramEnd"/>
-            <w:r>
-              <w:rPr>
-                <w:rFonts w:ascii="Arial" w:hAnsi="Arial" w:cs="Arial"/>
-              </w:rPr>
-              <w:t xml:space="preserve"> case non è stato iniziato, analisi dei mezzi non ancora completata.</w:t>
+              <w:t>Il diagramma ER non è completo e lo use case non è stato iniziato, analisi dei mezzi non ancora completata.</w:t>
             </w:r>
           </w:p>
         </w:tc>
@@ -5530,21 +5484,7 @@
               <w:rPr>
                 <w:rFonts w:ascii="Arial" w:hAnsi="Arial" w:cs="Arial"/>
               </w:rPr>
-              <w:t xml:space="preserve">Riuscire a definire le azioni degli attori </w:t>
-            </w:r>
-            <w:proofErr w:type="gramStart"/>
-            <w:r>
-              <w:rPr>
-                <w:rFonts w:ascii="Arial" w:hAnsi="Arial" w:cs="Arial"/>
-              </w:rPr>
-              <w:t>nel Use</w:t>
-            </w:r>
-            <w:proofErr w:type="gramEnd"/>
-            <w:r>
-              <w:rPr>
-                <w:rFonts w:ascii="Arial" w:hAnsi="Arial" w:cs="Arial"/>
-              </w:rPr>
-              <w:t xml:space="preserve"> Case, risolto approfondendo meglio.</w:t>
+              <w:t>Riuscire a definire le azioni degli attori nel Use Case, risolto approfondendo meglio.</w:t>
             </w:r>
           </w:p>
         </w:tc>
@@ -6258,21 +6198,7 @@
               <w:rFonts w:ascii="Arial" w:hAnsi="Arial" w:cs="Arial"/>
             </w:rPr>
             <w:br/>
-            <w:t xml:space="preserve">Bryan: Correzioni </w:t>
-          </w:r>
-          <w:proofErr w:type="gramStart"/>
-          <w:r>
-            <w:rPr>
-              <w:rFonts w:ascii="Arial" w:hAnsi="Arial" w:cs="Arial"/>
-            </w:rPr>
-            <w:t>dello use</w:t>
-          </w:r>
-          <w:proofErr w:type="gramEnd"/>
-          <w:r>
-            <w:rPr>
-              <w:rFonts w:ascii="Arial" w:hAnsi="Arial" w:cs="Arial"/>
-            </w:rPr>
-            <w:t xml:space="preserve"> case generato dal </w:t>
+            <w:t xml:space="preserve">Bryan: Correzioni dello use case generato dal </w:t>
           </w:r>
           <w:proofErr w:type="spellStart"/>
           <w:r>
@@ -6842,14 +6768,7 @@
               <w:rPr>
                 <w:rFonts w:ascii="Arial" w:hAnsi="Arial" w:cs="Arial"/>
               </w:rPr>
-              <w:t xml:space="preserve">, risolto grazie alla creazione di un </w:t>
-            </w:r>
-            <w:proofErr w:type="gramStart"/>
-            <w:r>
-              <w:rPr>
-                <w:rFonts w:ascii="Arial" w:hAnsi="Arial" w:cs="Arial"/>
-              </w:rPr>
-              <w:t>file .</w:t>
+              <w:t>, risolto grazie alla creazione di un file .</w:t>
             </w:r>
             <w:proofErr w:type="spellStart"/>
             <w:r>
@@ -6859,7 +6778,6 @@
               <w:t>gitignore</w:t>
             </w:r>
             <w:proofErr w:type="spellEnd"/>
-            <w:proofErr w:type="gramEnd"/>
           </w:p>
         </w:tc>
       </w:tr>
@@ -7840,14 +7758,7 @@
         <w:rPr>
           <w:rFonts w:ascii="Arial" w:hAnsi="Arial" w:cs="Arial"/>
         </w:rPr>
-        <w:t xml:space="preserve">Riley: probabilmente non sarei riuscito a risolvere questo problema non avendo un’esperienza molto avanzata con i </w:t>
-      </w:r>
-      <w:proofErr w:type="gramStart"/>
-      <w:r>
-        <w:rPr>
-          <w:rFonts w:ascii="Arial" w:hAnsi="Arial" w:cs="Arial"/>
-        </w:rPr>
-        <w:t>file .</w:t>
+        <w:t>Riley: probabilmente non sarei riuscito a risolvere questo problema non avendo un’esperienza molto avanzata con i file .</w:t>
       </w:r>
       <w:proofErr w:type="spellStart"/>
       <w:r>
@@ -7857,7 +7768,6 @@
         <w:t>gitignore</w:t>
       </w:r>
       <w:proofErr w:type="spellEnd"/>
-      <w:proofErr w:type="gramEnd"/>
       <w:r>
         <w:rPr>
           <w:rFonts w:ascii="Arial" w:hAnsi="Arial" w:cs="Arial"/>
@@ -20740,25 +20650,7 @@
               <w:b/>
               <w:bCs/>
             </w:rPr>
-            <w:t xml:space="preserve">Nomi </w:t>
-          </w:r>
-          <w:proofErr w:type="gramStart"/>
-          <w:r>
-            <w:rPr>
-              <w:rStyle w:val="Testosegnaposto"/>
-              <w:b/>
-              <w:bCs/>
-            </w:rPr>
-            <w:t>AI</w:t>
-          </w:r>
-          <w:proofErr w:type="gramEnd"/>
-          <w:r>
-            <w:rPr>
-              <w:rStyle w:val="Testosegnaposto"/>
-              <w:b/>
-              <w:bCs/>
-            </w:rPr>
-            <w:t xml:space="preserve"> utilizzati</w:t>
+            <w:t>Nomi AI utilizzati</w:t>
           </w:r>
         </w:sdtContent>
       </w:sdt>
@@ -23302,21 +23194,7 @@
               <w:rPr>
                 <w:rFonts w:ascii="Arial" w:hAnsi="Arial" w:cs="Arial"/>
               </w:rPr>
-              <w:t xml:space="preserve">Ho sistemato un problema di animazione, creato </w:t>
-            </w:r>
-            <w:proofErr w:type="gramStart"/>
-            <w:r>
-              <w:rPr>
-                <w:rFonts w:ascii="Arial" w:hAnsi="Arial" w:cs="Arial"/>
-              </w:rPr>
-              <w:t>il build</w:t>
-            </w:r>
-            <w:proofErr w:type="gramEnd"/>
-            <w:r>
-              <w:rPr>
-                <w:rFonts w:ascii="Arial" w:hAnsi="Arial" w:cs="Arial"/>
-              </w:rPr>
-              <w:t xml:space="preserve"> del progetto per certi test, ricerca modifica materiali auto ed inizio menu garage</w:t>
+              <w:t>Ho sistemato un problema di animazione, creato il build del progetto per certi test, ricerca modifica materiali auto ed inizio menu garage</w:t>
             </w:r>
           </w:p>
         </w:tc>
@@ -24121,25 +23999,7 @@
               <w:b/>
               <w:bCs/>
             </w:rPr>
-            <w:t xml:space="preserve">Nomi </w:t>
-          </w:r>
-          <w:proofErr w:type="gramStart"/>
-          <w:r>
-            <w:rPr>
-              <w:rStyle w:val="Testosegnaposto"/>
-              <w:b/>
-              <w:bCs/>
-            </w:rPr>
-            <w:t>AI</w:t>
-          </w:r>
-          <w:proofErr w:type="gramEnd"/>
-          <w:r>
-            <w:rPr>
-              <w:rStyle w:val="Testosegnaposto"/>
-              <w:b/>
-              <w:bCs/>
-            </w:rPr>
-            <w:t xml:space="preserve"> utilizzati</w:t>
+            <w:t>Nomi AI utilizzati</w:t>
           </w:r>
         </w:sdtContent>
       </w:sdt>
@@ -25197,21 +25057,7 @@
               <w:rPr>
                 <w:rFonts w:ascii="Arial" w:hAnsi="Arial" w:cs="Arial"/>
               </w:rPr>
-              <w:t xml:space="preserve">Continuare ognuno con </w:t>
-            </w:r>
-            <w:proofErr w:type="gramStart"/>
-            <w:r>
-              <w:rPr>
-                <w:rFonts w:ascii="Arial" w:hAnsi="Arial" w:cs="Arial"/>
-              </w:rPr>
-              <w:t>i</w:t>
-            </w:r>
-            <w:proofErr w:type="gramEnd"/>
-            <w:r>
-              <w:rPr>
-                <w:rFonts w:ascii="Arial" w:hAnsi="Arial" w:cs="Arial"/>
-              </w:rPr>
-              <w:t xml:space="preserve"> sviluppi di </w:t>
+              <w:t xml:space="preserve">Continuare ognuno con i sviluppi di </w:t>
             </w:r>
             <w:proofErr w:type="spellStart"/>
             <w:r>
@@ -36352,6 +36198,1628 @@
           <w:rFonts w:ascii="Arial" w:hAnsi="Arial" w:cs="Arial"/>
         </w:rPr>
         <w:t>Avrei cercato sulla documentazione ufficiale.</w:t>
+      </w:r>
+    </w:p>
+    <w:p>
+      <w:pPr>
+        <w:pStyle w:val="Nessunaspaziatura"/>
+        <w:rPr>
+          <w:rFonts w:ascii="Arial" w:hAnsi="Arial" w:cs="Arial"/>
+        </w:rPr>
+      </w:pPr>
+      <w:r>
+        <w:rPr>
+          <w:rFonts w:ascii="Arial" w:hAnsi="Arial" w:cs="Arial"/>
+        </w:rPr>
+        <w:t xml:space="preserve">Bryan: </w:t>
+      </w:r>
+    </w:p>
+    <w:p>
+      <w:pPr>
+        <w:rPr>
+          <w:rFonts w:ascii="Arial" w:hAnsi="Arial" w:cs="Arial"/>
+        </w:rPr>
+      </w:pPr>
+      <w:r>
+        <w:rPr>
+          <w:rFonts w:ascii="Arial" w:hAnsi="Arial" w:cs="Arial"/>
+        </w:rPr>
+        <w:br w:type="page"/>
+      </w:r>
+    </w:p>
+    <w:tbl>
+      <w:tblPr>
+        <w:tblStyle w:val="Grigliatabella"/>
+        <w:tblW w:w="5000" w:type="pct"/>
+        <w:tblLook w:val="04A0" w:firstRow="1" w:lastRow="0" w:firstColumn="1" w:lastColumn="0" w:noHBand="0" w:noVBand="1"/>
+      </w:tblPr>
+      <w:tblGrid>
+        <w:gridCol w:w="2407"/>
+        <w:gridCol w:w="7221"/>
+      </w:tblGrid>
+      <w:tr>
+        <w:trPr>
+          <w:trHeight w:val="199"/>
+        </w:trPr>
+        <w:tc>
+          <w:tcPr>
+            <w:tcW w:w="1250" w:type="pct"/>
+            <w:vAlign w:val="center"/>
+          </w:tcPr>
+          <w:p>
+            <w:pPr>
+              <w:rPr>
+                <w:rFonts w:ascii="Arial" w:hAnsi="Arial" w:cs="Arial"/>
+              </w:rPr>
+            </w:pPr>
+            <w:r>
+              <w:rPr>
+                <w:rFonts w:ascii="Arial" w:hAnsi="Arial" w:cs="Arial"/>
+              </w:rPr>
+              <w:lastRenderedPageBreak/>
+              <w:t>Luogo</w:t>
+            </w:r>
+          </w:p>
+        </w:tc>
+        <w:tc>
+          <w:tcPr>
+            <w:tcW w:w="3750" w:type="pct"/>
+            <w:vAlign w:val="center"/>
+          </w:tcPr>
+          <w:p>
+            <w:pPr>
+              <w:rPr>
+                <w:rFonts w:ascii="Arial" w:hAnsi="Arial" w:cs="Arial"/>
+              </w:rPr>
+            </w:pPr>
+            <w:r>
+              <w:rPr>
+                <w:rFonts w:ascii="Arial" w:hAnsi="Arial" w:cs="Arial"/>
+              </w:rPr>
+              <w:t>Scuola Arti e Mestieri Trevano</w:t>
+            </w:r>
+          </w:p>
+        </w:tc>
+      </w:tr>
+      <w:tr>
+        <w:trPr>
+          <w:trHeight w:val="196"/>
+        </w:trPr>
+        <w:tc>
+          <w:tcPr>
+            <w:tcW w:w="1250" w:type="pct"/>
+            <w:vAlign w:val="center"/>
+          </w:tcPr>
+          <w:p>
+            <w:pPr>
+              <w:rPr>
+                <w:rFonts w:ascii="Arial" w:hAnsi="Arial" w:cs="Arial"/>
+              </w:rPr>
+            </w:pPr>
+            <w:r>
+              <w:rPr>
+                <w:rFonts w:ascii="Arial" w:hAnsi="Arial" w:cs="Arial"/>
+              </w:rPr>
+              <w:t>Data</w:t>
+            </w:r>
+          </w:p>
+        </w:tc>
+        <w:tc>
+          <w:tcPr>
+            <w:tcW w:w="3750" w:type="pct"/>
+            <w:vAlign w:val="center"/>
+          </w:tcPr>
+          <w:p>
+            <w:pPr>
+              <w:rPr>
+                <w:rFonts w:ascii="Arial" w:hAnsi="Arial" w:cs="Arial"/>
+              </w:rPr>
+            </w:pPr>
+            <w:r>
+              <w:rPr>
+                <w:rFonts w:ascii="Arial" w:hAnsi="Arial" w:cs="Arial"/>
+              </w:rPr>
+              <w:t>20</w:t>
+            </w:r>
+            <w:r>
+              <w:rPr>
+                <w:rFonts w:ascii="Arial" w:hAnsi="Arial" w:cs="Arial"/>
+              </w:rPr>
+              <w:t>.10.2026</w:t>
+            </w:r>
+          </w:p>
+        </w:tc>
+      </w:tr>
+    </w:tbl>
+    <w:p>
+      <w:pPr>
+        <w:rPr>
+          <w:rFonts w:ascii="Arial" w:hAnsi="Arial" w:cs="Arial"/>
+        </w:rPr>
+      </w:pPr>
+    </w:p>
+    <w:tbl>
+      <w:tblPr>
+        <w:tblStyle w:val="Grigliatabella"/>
+        <w:tblW w:w="0" w:type="auto"/>
+        <w:tblLook w:val="04A0" w:firstRow="1" w:lastRow="0" w:firstColumn="1" w:lastColumn="0" w:noHBand="0" w:noVBand="1"/>
+      </w:tblPr>
+      <w:tblGrid>
+        <w:gridCol w:w="1271"/>
+        <w:gridCol w:w="8357"/>
+      </w:tblGrid>
+      <w:tr>
+        <w:tc>
+          <w:tcPr>
+            <w:tcW w:w="9628" w:type="dxa"/>
+            <w:gridSpan w:val="2"/>
+            <w:shd w:val="clear" w:color="auto" w:fill="D9D9D9" w:themeFill="background1" w:themeFillShade="D9"/>
+          </w:tcPr>
+          <w:p>
+            <w:pPr>
+              <w:rPr>
+                <w:rFonts w:ascii="Arial" w:hAnsi="Arial" w:cs="Arial"/>
+              </w:rPr>
+            </w:pPr>
+            <w:r>
+              <w:rPr>
+                <w:rFonts w:ascii="Arial" w:hAnsi="Arial" w:cs="Arial"/>
+              </w:rPr>
+              <w:t>Lavori svolti</w:t>
+            </w:r>
+          </w:p>
+        </w:tc>
+      </w:tr>
+      <w:tr>
+        <w:tc>
+          <w:tcPr>
+            <w:tcW w:w="1271" w:type="dxa"/>
+          </w:tcPr>
+          <w:p>
+            <w:pPr>
+              <w:rPr>
+                <w:rFonts w:ascii="Arial" w:hAnsi="Arial" w:cs="Arial"/>
+              </w:rPr>
+            </w:pPr>
+            <w:r>
+              <w:rPr>
+                <w:rFonts w:ascii="Arial" w:hAnsi="Arial" w:cs="Arial"/>
+              </w:rPr>
+              <w:t>Riley</w:t>
+            </w:r>
+          </w:p>
+        </w:tc>
+        <w:tc>
+          <w:tcPr>
+            <w:tcW w:w="8357" w:type="dxa"/>
+          </w:tcPr>
+          <w:p>
+            <w:pPr>
+              <w:rPr>
+                <w:rFonts w:ascii="Arial" w:hAnsi="Arial" w:cs="Arial"/>
+              </w:rPr>
+            </w:pPr>
+            <w:r>
+              <w:rPr>
+                <w:rFonts w:ascii="Arial" w:hAnsi="Arial" w:cs="Arial"/>
+              </w:rPr>
+              <w:t>Inizio UI durante partita, tentativo di fix di adattamento verticale nella UI del menu.</w:t>
+            </w:r>
+          </w:p>
+        </w:tc>
+      </w:tr>
+      <w:tr>
+        <w:tc>
+          <w:tcPr>
+            <w:tcW w:w="1271" w:type="dxa"/>
+          </w:tcPr>
+          <w:p>
+            <w:pPr>
+              <w:rPr>
+                <w:rFonts w:ascii="Arial" w:hAnsi="Arial" w:cs="Arial"/>
+              </w:rPr>
+            </w:pPr>
+            <w:r>
+              <w:rPr>
+                <w:rFonts w:ascii="Arial" w:hAnsi="Arial" w:cs="Arial"/>
+              </w:rPr>
+              <w:t>Bryan</w:t>
+            </w:r>
+          </w:p>
+        </w:tc>
+        <w:tc>
+          <w:tcPr>
+            <w:tcW w:w="8357" w:type="dxa"/>
+          </w:tcPr>
+          <w:p>
+            <w:pPr>
+              <w:rPr>
+                <w:rFonts w:ascii="Arial" w:hAnsi="Arial" w:cs="Arial"/>
+                <w:u w:val="single"/>
+              </w:rPr>
+            </w:pPr>
+            <w:r>
+              <w:rPr>
+                <w:rFonts w:ascii="Arial" w:hAnsi="Arial" w:cs="Arial"/>
+              </w:rPr>
+              <w:t>Applicato alcune migliorie al movimento</w:t>
+            </w:r>
+          </w:p>
+        </w:tc>
+      </w:tr>
+    </w:tbl>
+    <w:p>
+      <w:pPr>
+        <w:rPr>
+          <w:rFonts w:ascii="Arial" w:hAnsi="Arial" w:cs="Arial"/>
+        </w:rPr>
+      </w:pPr>
+    </w:p>
+    <w:tbl>
+      <w:tblPr>
+        <w:tblStyle w:val="Grigliatabella"/>
+        <w:tblW w:w="0" w:type="auto"/>
+        <w:tblInd w:w="-5" w:type="dxa"/>
+        <w:tblLook w:val="04A0" w:firstRow="1" w:lastRow="0" w:firstColumn="1" w:lastColumn="0" w:noHBand="0" w:noVBand="1"/>
+      </w:tblPr>
+      <w:tblGrid>
+        <w:gridCol w:w="1276"/>
+        <w:gridCol w:w="8357"/>
+      </w:tblGrid>
+      <w:tr>
+        <w:tc>
+          <w:tcPr>
+            <w:tcW w:w="9628" w:type="dxa"/>
+            <w:gridSpan w:val="2"/>
+            <w:shd w:val="clear" w:color="auto" w:fill="D9D9D9" w:themeFill="background1" w:themeFillShade="D9"/>
+          </w:tcPr>
+          <w:p>
+            <w:pPr>
+              <w:rPr>
+                <w:rFonts w:ascii="Arial" w:hAnsi="Arial" w:cs="Arial"/>
+              </w:rPr>
+            </w:pPr>
+            <w:r>
+              <w:rPr>
+                <w:rFonts w:ascii="Arial" w:hAnsi="Arial" w:cs="Arial"/>
+              </w:rPr>
+              <w:t>Problemi riscontrati e soluzioni adottate</w:t>
+            </w:r>
+          </w:p>
+        </w:tc>
+      </w:tr>
+      <w:tr>
+        <w:tc>
+          <w:tcPr>
+            <w:tcW w:w="1276" w:type="dxa"/>
+          </w:tcPr>
+          <w:p>
+            <w:pPr>
+              <w:rPr>
+                <w:rFonts w:ascii="Arial" w:hAnsi="Arial" w:cs="Arial"/>
+              </w:rPr>
+            </w:pPr>
+            <w:r>
+              <w:rPr>
+                <w:rFonts w:ascii="Arial" w:hAnsi="Arial" w:cs="Arial"/>
+              </w:rPr>
+              <w:t>Riley</w:t>
+            </w:r>
+          </w:p>
+        </w:tc>
+        <w:tc>
+          <w:tcPr>
+            <w:tcW w:w="8357" w:type="dxa"/>
+          </w:tcPr>
+          <w:p>
+            <w:pPr>
+              <w:rPr>
+                <w:rFonts w:ascii="Arial" w:hAnsi="Arial" w:cs="Arial"/>
+              </w:rPr>
+            </w:pPr>
+            <w:r>
+              <w:rPr>
+                <w:rFonts w:ascii="Arial" w:hAnsi="Arial" w:cs="Arial"/>
+              </w:rPr>
+              <w:t>-</w:t>
+            </w:r>
+          </w:p>
+        </w:tc>
+      </w:tr>
+      <w:tr>
+        <w:tc>
+          <w:tcPr>
+            <w:tcW w:w="1276" w:type="dxa"/>
+          </w:tcPr>
+          <w:p>
+            <w:pPr>
+              <w:rPr>
+                <w:rFonts w:ascii="Arial" w:hAnsi="Arial" w:cs="Arial"/>
+              </w:rPr>
+            </w:pPr>
+            <w:r>
+              <w:rPr>
+                <w:rFonts w:ascii="Arial" w:hAnsi="Arial" w:cs="Arial"/>
+              </w:rPr>
+              <w:t>Bryan</w:t>
+            </w:r>
+          </w:p>
+        </w:tc>
+        <w:tc>
+          <w:tcPr>
+            <w:tcW w:w="8357" w:type="dxa"/>
+          </w:tcPr>
+          <w:p>
+            <w:pPr>
+              <w:rPr>
+                <w:rFonts w:ascii="Arial" w:hAnsi="Arial" w:cs="Arial"/>
+              </w:rPr>
+            </w:pPr>
+            <w:r>
+              <w:rPr>
+                <w:rFonts w:ascii="Arial" w:hAnsi="Arial" w:cs="Arial"/>
+              </w:rPr>
+              <w:t>-</w:t>
+            </w:r>
+          </w:p>
+        </w:tc>
+      </w:tr>
+    </w:tbl>
+    <w:p>
+      <w:pPr>
+        <w:rPr>
+          <w:rFonts w:ascii="Arial" w:hAnsi="Arial" w:cs="Arial"/>
+        </w:rPr>
+      </w:pPr>
+    </w:p>
+    <w:tbl>
+      <w:tblPr>
+        <w:tblStyle w:val="Grigliatabella"/>
+        <w:tblW w:w="0" w:type="auto"/>
+        <w:tblLook w:val="04A0" w:firstRow="1" w:lastRow="0" w:firstColumn="1" w:lastColumn="0" w:noHBand="0" w:noVBand="1"/>
+      </w:tblPr>
+      <w:tblGrid>
+        <w:gridCol w:w="9628"/>
+      </w:tblGrid>
+      <w:tr>
+        <w:tc>
+          <w:tcPr>
+            <w:tcW w:w="9854" w:type="dxa"/>
+            <w:shd w:val="clear" w:color="auto" w:fill="D9D9D9" w:themeFill="background1" w:themeFillShade="D9"/>
+          </w:tcPr>
+          <w:p>
+            <w:pPr>
+              <w:rPr>
+                <w:rFonts w:ascii="Arial" w:hAnsi="Arial" w:cs="Arial"/>
+              </w:rPr>
+            </w:pPr>
+            <w:r>
+              <w:rPr>
+                <w:rFonts w:ascii="Arial" w:hAnsi="Arial" w:cs="Arial"/>
+              </w:rPr>
+              <w:t>Punto della situazione rispetto alla pianificazione</w:t>
+            </w:r>
+          </w:p>
+        </w:tc>
+      </w:tr>
+      <w:tr>
+        <w:tc>
+          <w:tcPr>
+            <w:tcW w:w="9854" w:type="dxa"/>
+          </w:tcPr>
+          <w:p>
+            <w:pPr>
+              <w:rPr>
+                <w:rFonts w:ascii="Arial" w:hAnsi="Arial" w:cs="Arial"/>
+              </w:rPr>
+            </w:pPr>
+            <w:r>
+              <w:rPr>
+                <w:rFonts w:ascii="Arial" w:hAnsi="Arial" w:cs="Arial"/>
+              </w:rPr>
+              <w:t>Leggero anticipo</w:t>
+            </w:r>
+          </w:p>
+        </w:tc>
+      </w:tr>
+    </w:tbl>
+    <w:p>
+      <w:pPr>
+        <w:rPr>
+          <w:rFonts w:ascii="Arial" w:hAnsi="Arial" w:cs="Arial"/>
+        </w:rPr>
+      </w:pPr>
+    </w:p>
+    <w:tbl>
+      <w:tblPr>
+        <w:tblStyle w:val="Grigliatabella"/>
+        <w:tblW w:w="0" w:type="auto"/>
+        <w:tblLook w:val="04A0" w:firstRow="1" w:lastRow="0" w:firstColumn="1" w:lastColumn="0" w:noHBand="0" w:noVBand="1"/>
+      </w:tblPr>
+      <w:tblGrid>
+        <w:gridCol w:w="9628"/>
+      </w:tblGrid>
+      <w:tr>
+        <w:tc>
+          <w:tcPr>
+            <w:tcW w:w="9854" w:type="dxa"/>
+            <w:shd w:val="clear" w:color="auto" w:fill="D9D9D9" w:themeFill="background1" w:themeFillShade="D9"/>
+          </w:tcPr>
+          <w:p>
+            <w:pPr>
+              <w:rPr>
+                <w:rFonts w:ascii="Arial" w:hAnsi="Arial" w:cs="Arial"/>
+              </w:rPr>
+            </w:pPr>
+            <w:r>
+              <w:rPr>
+                <w:rFonts w:ascii="Arial" w:hAnsi="Arial" w:cs="Arial"/>
+              </w:rPr>
+              <w:t>Programma di massima per la prossima giornata di lavoro</w:t>
+            </w:r>
+          </w:p>
+        </w:tc>
+      </w:tr>
+      <w:tr>
+        <w:tc>
+          <w:tcPr>
+            <w:tcW w:w="9854" w:type="dxa"/>
+          </w:tcPr>
+          <w:p>
+            <w:pPr>
+              <w:rPr>
+                <w:rFonts w:ascii="Arial" w:hAnsi="Arial" w:cs="Arial"/>
+              </w:rPr>
+            </w:pPr>
+            <w:r>
+              <w:rPr>
+                <w:rFonts w:ascii="Arial" w:hAnsi="Arial" w:cs="Arial"/>
+              </w:rPr>
+              <w:t>Procedere con la UI in partita</w:t>
+            </w:r>
+          </w:p>
+        </w:tc>
+      </w:tr>
+    </w:tbl>
+    <w:p>
+      <w:pPr>
+        <w:rPr>
+          <w:rFonts w:ascii="Arial" w:hAnsi="Arial" w:cs="Arial"/>
+        </w:rPr>
+      </w:pPr>
+    </w:p>
+    <w:p>
+      <w:pPr>
+        <w:pStyle w:val="Titolo1"/>
+      </w:pPr>
+      <w:r>
+        <w:t>Agile - Resoconto</w:t>
+      </w:r>
+    </w:p>
+    <w:tbl>
+      <w:tblPr>
+        <w:tblStyle w:val="Grigliatabella"/>
+        <w:tblW w:w="0" w:type="auto"/>
+        <w:tblLook w:val="04A0" w:firstRow="1" w:lastRow="0" w:firstColumn="1" w:lastColumn="0" w:noHBand="0" w:noVBand="1"/>
+      </w:tblPr>
+      <w:tblGrid>
+        <w:gridCol w:w="9628"/>
+      </w:tblGrid>
+      <w:tr>
+        <w:tc>
+          <w:tcPr>
+            <w:tcW w:w="9628" w:type="dxa"/>
+            <w:tcBorders>
+              <w:top w:val="single" w:sz="4" w:space="0" w:color="auto"/>
+              <w:left w:val="single" w:sz="4" w:space="0" w:color="auto"/>
+              <w:bottom w:val="single" w:sz="4" w:space="0" w:color="auto"/>
+              <w:right w:val="single" w:sz="4" w:space="0" w:color="auto"/>
+            </w:tcBorders>
+            <w:shd w:val="clear" w:color="auto" w:fill="D9D9D9" w:themeFill="background1" w:themeFillShade="D9"/>
+            <w:hideMark/>
+          </w:tcPr>
+          <w:p>
+            <w:pPr>
+              <w:spacing w:after="200" w:line="276" w:lineRule="auto"/>
+              <w:rPr>
+                <w:rFonts w:ascii="Arial" w:hAnsi="Arial" w:cs="Arial"/>
+              </w:rPr>
+            </w:pPr>
+            <w:proofErr w:type="spellStart"/>
+            <w:r>
+              <w:rPr>
+                <w:rFonts w:ascii="Arial" w:hAnsi="Arial" w:cs="Arial"/>
+              </w:rPr>
+              <w:t>Daily</w:t>
+            </w:r>
+            <w:proofErr w:type="spellEnd"/>
+            <w:r>
+              <w:rPr>
+                <w:rFonts w:ascii="Arial" w:hAnsi="Arial" w:cs="Arial"/>
+              </w:rPr>
+              <w:t xml:space="preserve"> </w:t>
+            </w:r>
+            <w:proofErr w:type="spellStart"/>
+            <w:r>
+              <w:rPr>
+                <w:rFonts w:ascii="Arial" w:hAnsi="Arial" w:cs="Arial"/>
+              </w:rPr>
+              <w:t>Scrum</w:t>
+            </w:r>
+            <w:proofErr w:type="spellEnd"/>
+          </w:p>
+        </w:tc>
+      </w:tr>
+      <w:tr>
+        <w:tc>
+          <w:tcPr>
+            <w:tcW w:w="9628" w:type="dxa"/>
+            <w:tcBorders>
+              <w:top w:val="single" w:sz="4" w:space="0" w:color="auto"/>
+              <w:left w:val="single" w:sz="4" w:space="0" w:color="auto"/>
+              <w:bottom w:val="single" w:sz="4" w:space="0" w:color="auto"/>
+              <w:right w:val="single" w:sz="4" w:space="0" w:color="auto"/>
+            </w:tcBorders>
+            <w:hideMark/>
+          </w:tcPr>
+          <w:p>
+            <w:pPr>
+              <w:spacing w:after="200" w:line="276" w:lineRule="auto"/>
+              <w:rPr>
+                <w:rFonts w:ascii="Arial" w:hAnsi="Arial" w:cs="Arial"/>
+              </w:rPr>
+            </w:pPr>
+          </w:p>
+        </w:tc>
+      </w:tr>
+      <w:tr>
+        <w:tc>
+          <w:tcPr>
+            <w:tcW w:w="9628" w:type="dxa"/>
+            <w:tcBorders>
+              <w:top w:val="single" w:sz="4" w:space="0" w:color="auto"/>
+              <w:left w:val="single" w:sz="4" w:space="0" w:color="auto"/>
+              <w:bottom w:val="single" w:sz="4" w:space="0" w:color="auto"/>
+              <w:right w:val="single" w:sz="4" w:space="0" w:color="auto"/>
+            </w:tcBorders>
+          </w:tcPr>
+          <w:p>
+            <w:pPr>
+              <w:spacing w:after="200" w:line="276" w:lineRule="auto"/>
+              <w:rPr>
+                <w:rFonts w:ascii="Arial" w:hAnsi="Arial" w:cs="Arial"/>
+              </w:rPr>
+            </w:pPr>
+            <w:r>
+              <w:rPr>
+                <w:rFonts w:ascii="Arial" w:hAnsi="Arial" w:cs="Arial"/>
+              </w:rPr>
+              <w:t xml:space="preserve">Riley: </w:t>
+            </w:r>
+            <w:r>
+              <w:rPr>
+                <w:rFonts w:ascii="Arial" w:hAnsi="Arial" w:cs="Arial"/>
+              </w:rPr>
+              <w:t>Inizio sviluppo UI in partita</w:t>
+            </w:r>
+          </w:p>
+          <w:p>
+            <w:pPr>
+              <w:spacing w:after="200" w:line="276" w:lineRule="auto"/>
+              <w:rPr>
+                <w:rFonts w:ascii="Arial" w:hAnsi="Arial" w:cs="Arial"/>
+              </w:rPr>
+            </w:pPr>
+            <w:r>
+              <w:rPr>
+                <w:rFonts w:ascii="Arial" w:hAnsi="Arial" w:cs="Arial"/>
+              </w:rPr>
+              <w:t>Bryan: Continuo sviluppo sistema movimento</w:t>
+            </w:r>
+            <w:r>
+              <w:rPr>
+                <w:rFonts w:ascii="Arial" w:hAnsi="Arial" w:cs="Arial"/>
+              </w:rPr>
+              <w:t xml:space="preserve"> per migliorie</w:t>
+            </w:r>
+          </w:p>
+        </w:tc>
+      </w:tr>
+    </w:tbl>
+    <w:p>
+      <w:pPr>
+        <w:rPr>
+          <w:rFonts w:ascii="Arial" w:hAnsi="Arial" w:cs="Arial"/>
+        </w:rPr>
+      </w:pPr>
+    </w:p>
+    <w:tbl>
+      <w:tblPr>
+        <w:tblStyle w:val="Grigliatabella"/>
+        <w:tblW w:w="0" w:type="auto"/>
+        <w:tblLook w:val="04A0" w:firstRow="1" w:lastRow="0" w:firstColumn="1" w:lastColumn="0" w:noHBand="0" w:noVBand="1"/>
+      </w:tblPr>
+      <w:tblGrid>
+        <w:gridCol w:w="9628"/>
+      </w:tblGrid>
+      <w:tr>
+        <w:tc>
+          <w:tcPr>
+            <w:tcW w:w="9854" w:type="dxa"/>
+            <w:tcBorders>
+              <w:top w:val="single" w:sz="4" w:space="0" w:color="auto"/>
+              <w:left w:val="single" w:sz="4" w:space="0" w:color="auto"/>
+              <w:bottom w:val="single" w:sz="4" w:space="0" w:color="auto"/>
+              <w:right w:val="single" w:sz="4" w:space="0" w:color="auto"/>
+            </w:tcBorders>
+            <w:shd w:val="clear" w:color="auto" w:fill="D9D9D9" w:themeFill="background1" w:themeFillShade="D9"/>
+            <w:hideMark/>
+          </w:tcPr>
+          <w:p>
+            <w:pPr>
+              <w:spacing w:after="200" w:line="276" w:lineRule="auto"/>
+              <w:rPr>
+                <w:rFonts w:ascii="Arial" w:hAnsi="Arial" w:cs="Arial"/>
+              </w:rPr>
+            </w:pPr>
+            <w:r>
+              <w:rPr>
+                <w:rFonts w:ascii="Arial" w:hAnsi="Arial" w:cs="Arial"/>
+              </w:rPr>
+              <w:t>Sprint Planning</w:t>
+            </w:r>
+          </w:p>
+        </w:tc>
+      </w:tr>
+      <w:tr>
+        <w:tc>
+          <w:tcPr>
+            <w:tcW w:w="9854" w:type="dxa"/>
+            <w:tcBorders>
+              <w:top w:val="single" w:sz="4" w:space="0" w:color="auto"/>
+              <w:left w:val="single" w:sz="4" w:space="0" w:color="auto"/>
+              <w:bottom w:val="single" w:sz="4" w:space="0" w:color="auto"/>
+              <w:right w:val="single" w:sz="4" w:space="0" w:color="auto"/>
+            </w:tcBorders>
+          </w:tcPr>
+          <w:p>
+            <w:pPr>
+              <w:spacing w:after="200" w:line="276" w:lineRule="auto"/>
+              <w:rPr>
+                <w:rFonts w:ascii="Arial" w:hAnsi="Arial" w:cs="Arial"/>
+              </w:rPr>
+            </w:pPr>
+          </w:p>
+        </w:tc>
+      </w:tr>
+    </w:tbl>
+    <w:p>
+      <w:pPr>
+        <w:rPr>
+          <w:rFonts w:ascii="Arial" w:hAnsi="Arial" w:cs="Arial"/>
+        </w:rPr>
+      </w:pPr>
+    </w:p>
+    <w:tbl>
+      <w:tblPr>
+        <w:tblStyle w:val="Grigliatabella"/>
+        <w:tblW w:w="0" w:type="auto"/>
+        <w:tblLook w:val="04A0" w:firstRow="1" w:lastRow="0" w:firstColumn="1" w:lastColumn="0" w:noHBand="0" w:noVBand="1"/>
+      </w:tblPr>
+      <w:tblGrid>
+        <w:gridCol w:w="9628"/>
+      </w:tblGrid>
+      <w:tr>
+        <w:tc>
+          <w:tcPr>
+            <w:tcW w:w="9854" w:type="dxa"/>
+            <w:tcBorders>
+              <w:top w:val="single" w:sz="4" w:space="0" w:color="auto"/>
+              <w:left w:val="single" w:sz="4" w:space="0" w:color="auto"/>
+              <w:bottom w:val="single" w:sz="4" w:space="0" w:color="auto"/>
+              <w:right w:val="single" w:sz="4" w:space="0" w:color="auto"/>
+            </w:tcBorders>
+            <w:shd w:val="clear" w:color="auto" w:fill="D9D9D9" w:themeFill="background1" w:themeFillShade="D9"/>
+            <w:hideMark/>
+          </w:tcPr>
+          <w:p>
+            <w:pPr>
+              <w:spacing w:after="200" w:line="276" w:lineRule="auto"/>
+              <w:rPr>
+                <w:rFonts w:ascii="Arial" w:hAnsi="Arial" w:cs="Arial"/>
+              </w:rPr>
+            </w:pPr>
+            <w:r>
+              <w:rPr>
+                <w:rFonts w:ascii="Arial" w:hAnsi="Arial" w:cs="Arial"/>
+              </w:rPr>
+              <w:t>Sprint Review</w:t>
+            </w:r>
+          </w:p>
+        </w:tc>
+      </w:tr>
+      <w:tr>
+        <w:tc>
+          <w:tcPr>
+            <w:tcW w:w="9854" w:type="dxa"/>
+            <w:tcBorders>
+              <w:top w:val="single" w:sz="4" w:space="0" w:color="auto"/>
+              <w:left w:val="single" w:sz="4" w:space="0" w:color="auto"/>
+              <w:bottom w:val="single" w:sz="4" w:space="0" w:color="auto"/>
+              <w:right w:val="single" w:sz="4" w:space="0" w:color="auto"/>
+            </w:tcBorders>
+          </w:tcPr>
+          <w:p>
+            <w:pPr>
+              <w:spacing w:after="200" w:line="276" w:lineRule="auto"/>
+              <w:rPr>
+                <w:rFonts w:ascii="Arial" w:hAnsi="Arial" w:cs="Arial"/>
+              </w:rPr>
+            </w:pPr>
+          </w:p>
+        </w:tc>
+      </w:tr>
+    </w:tbl>
+    <w:p>
+      <w:pPr>
+        <w:rPr>
+          <w:rFonts w:ascii="Arial" w:hAnsi="Arial" w:cs="Arial"/>
+        </w:rPr>
+      </w:pPr>
+    </w:p>
+    <w:tbl>
+      <w:tblPr>
+        <w:tblStyle w:val="Grigliatabella"/>
+        <w:tblW w:w="0" w:type="auto"/>
+        <w:tblLook w:val="04A0" w:firstRow="1" w:lastRow="0" w:firstColumn="1" w:lastColumn="0" w:noHBand="0" w:noVBand="1"/>
+      </w:tblPr>
+      <w:tblGrid>
+        <w:gridCol w:w="9628"/>
+      </w:tblGrid>
+      <w:tr>
+        <w:tc>
+          <w:tcPr>
+            <w:tcW w:w="9854" w:type="dxa"/>
+            <w:tcBorders>
+              <w:top w:val="single" w:sz="4" w:space="0" w:color="auto"/>
+              <w:left w:val="single" w:sz="4" w:space="0" w:color="auto"/>
+              <w:bottom w:val="single" w:sz="4" w:space="0" w:color="auto"/>
+              <w:right w:val="single" w:sz="4" w:space="0" w:color="auto"/>
+            </w:tcBorders>
+            <w:shd w:val="clear" w:color="auto" w:fill="D9D9D9" w:themeFill="background1" w:themeFillShade="D9"/>
+            <w:hideMark/>
+          </w:tcPr>
+          <w:p>
+            <w:pPr>
+              <w:spacing w:after="200" w:line="276" w:lineRule="auto"/>
+              <w:rPr>
+                <w:rFonts w:ascii="Arial" w:hAnsi="Arial" w:cs="Arial"/>
+              </w:rPr>
+            </w:pPr>
+            <w:r>
+              <w:rPr>
+                <w:rFonts w:ascii="Arial" w:hAnsi="Arial" w:cs="Arial"/>
+              </w:rPr>
+              <w:t xml:space="preserve">Sprint </w:t>
+            </w:r>
+            <w:proofErr w:type="spellStart"/>
+            <w:r>
+              <w:rPr>
+                <w:rFonts w:ascii="Arial" w:hAnsi="Arial" w:cs="Arial"/>
+              </w:rPr>
+              <w:t>Retrospective</w:t>
+            </w:r>
+            <w:proofErr w:type="spellEnd"/>
+          </w:p>
+        </w:tc>
+      </w:tr>
+      <w:tr>
+        <w:tc>
+          <w:tcPr>
+            <w:tcW w:w="9854" w:type="dxa"/>
+            <w:tcBorders>
+              <w:top w:val="single" w:sz="4" w:space="0" w:color="auto"/>
+              <w:left w:val="single" w:sz="4" w:space="0" w:color="auto"/>
+              <w:bottom w:val="single" w:sz="4" w:space="0" w:color="auto"/>
+              <w:right w:val="single" w:sz="4" w:space="0" w:color="auto"/>
+            </w:tcBorders>
+          </w:tcPr>
+          <w:p>
+            <w:pPr>
+              <w:spacing w:after="200" w:line="276" w:lineRule="auto"/>
+              <w:rPr>
+                <w:rFonts w:ascii="Arial" w:hAnsi="Arial" w:cs="Arial"/>
+              </w:rPr>
+            </w:pPr>
+          </w:p>
+        </w:tc>
+      </w:tr>
+    </w:tbl>
+    <w:p>
+      <w:pPr>
+        <w:rPr>
+          <w:rFonts w:ascii="Arial" w:eastAsiaTheme="majorEastAsia" w:hAnsi="Arial" w:cs="Arial"/>
+          <w:b/>
+          <w:bCs/>
+          <w:sz w:val="26"/>
+          <w:szCs w:val="26"/>
+        </w:rPr>
+      </w:pPr>
+      <w:r>
+        <w:br w:type="page"/>
+      </w:r>
+    </w:p>
+    <w:p>
+      <w:pPr>
+        <w:pStyle w:val="Titolo2"/>
+        <w:pBdr>
+          <w:bottom w:val="single" w:sz="4" w:space="1" w:color="auto"/>
+        </w:pBdr>
+      </w:pPr>
+      <w:r>
+        <w:lastRenderedPageBreak/>
+        <w:t>Utilizzo Intelligenza Artificiale</w:t>
+      </w:r>
+      <w:r>
+        <w:t xml:space="preserve"> nella giornata</w:t>
+      </w:r>
+    </w:p>
+    <w:p>
+      <w:pPr>
+        <w:pStyle w:val="Nessunaspaziatura"/>
+        <w:rPr>
+          <w:rFonts w:ascii="Arial" w:hAnsi="Arial" w:cs="Arial"/>
+          <w:b/>
+          <w:bCs/>
+        </w:rPr>
+      </w:pPr>
+    </w:p>
+    <w:p>
+      <w:pPr>
+        <w:pStyle w:val="Nessunaspaziatura"/>
+        <w:rPr>
+          <w:rFonts w:ascii="Arial" w:hAnsi="Arial" w:cs="Arial"/>
+        </w:rPr>
+      </w:pPr>
+      <w:sdt>
+        <w:sdtPr>
+          <w:rPr>
+            <w:rFonts w:ascii="Segoe UI Symbol" w:hAnsi="Segoe UI Symbol" w:cs="Segoe UI Symbol"/>
+          </w:rPr>
+          <w:id w:val="-139427139"/>
+          <w14:checkbox>
+            <w14:checked w14:val="0"/>
+            <w14:checkedState w14:val="2612" w14:font="MS Gothic"/>
+            <w14:uncheckedState w14:val="2610" w14:font="MS Gothic"/>
+          </w14:checkbox>
+        </w:sdtPr>
+        <w:sdtContent>
+          <w:r>
+            <w:rPr>
+              <w:rFonts w:ascii="MS Gothic" w:eastAsia="MS Gothic" w:hAnsi="MS Gothic" w:cs="Segoe UI Symbol" w:hint="eastAsia"/>
+            </w:rPr>
+            <w:t>☐</w:t>
+          </w:r>
+        </w:sdtContent>
+      </w:sdt>
+      <w:r>
+        <w:rPr>
+          <w:rFonts w:ascii="Arial" w:hAnsi="Arial" w:cs="Arial"/>
+        </w:rPr>
+        <w:t xml:space="preserve"> Nessuno</w:t>
+      </w:r>
+      <w:r>
+        <w:br/>
+      </w:r>
+      <w:sdt>
+        <w:sdtPr>
+          <w:rPr>
+            <w:rFonts w:ascii="Segoe UI Symbol" w:hAnsi="Segoe UI Symbol" w:cs="Segoe UI Symbol"/>
+          </w:rPr>
+          <w:id w:val="-312177300"/>
+          <w14:checkbox>
+            <w14:checked w14:val="1"/>
+            <w14:checkedState w14:val="2612" w14:font="MS Gothic"/>
+            <w14:uncheckedState w14:val="2610" w14:font="MS Gothic"/>
+          </w14:checkbox>
+        </w:sdtPr>
+        <w:sdtContent>
+          <w:r>
+            <w:rPr>
+              <w:rFonts w:ascii="MS Gothic" w:eastAsia="MS Gothic" w:hAnsi="MS Gothic" w:cs="Segoe UI Symbol" w:hint="eastAsia"/>
+            </w:rPr>
+            <w:t>☒</w:t>
+          </w:r>
+        </w:sdtContent>
+      </w:sdt>
+      <w:r>
+        <w:rPr>
+          <w:rFonts w:ascii="Arial" w:hAnsi="Arial" w:cs="Arial"/>
+        </w:rPr>
+        <w:t xml:space="preserve"> Occasionale</w:t>
+      </w:r>
+      <w:r>
+        <w:br/>
+      </w:r>
+      <w:sdt>
+        <w:sdtPr>
+          <w:rPr>
+            <w:rFonts w:ascii="Segoe UI Symbol" w:hAnsi="Segoe UI Symbol" w:cs="Segoe UI Symbol"/>
+          </w:rPr>
+          <w:id w:val="-692691036"/>
+          <w14:checkbox>
+            <w14:checked w14:val="0"/>
+            <w14:checkedState w14:val="2612" w14:font="MS Gothic"/>
+            <w14:uncheckedState w14:val="2610" w14:font="MS Gothic"/>
+          </w14:checkbox>
+        </w:sdtPr>
+        <w:sdtContent>
+          <w:r>
+            <w:rPr>
+              <w:rFonts w:ascii="MS Gothic" w:eastAsia="MS Gothic" w:hAnsi="MS Gothic" w:cs="Segoe UI Symbol" w:hint="eastAsia"/>
+            </w:rPr>
+            <w:t>☐</w:t>
+          </w:r>
+        </w:sdtContent>
+      </w:sdt>
+      <w:r>
+        <w:rPr>
+          <w:rFonts w:ascii="Arial" w:hAnsi="Arial" w:cs="Arial"/>
+        </w:rPr>
+        <w:t xml:space="preserve"> Frequente</w:t>
+      </w:r>
+    </w:p>
+    <w:p>
+      <w:pPr>
+        <w:pStyle w:val="Nessunaspaziatura"/>
+        <w:rPr>
+          <w:rFonts w:ascii="Arial" w:hAnsi="Arial" w:cs="Arial"/>
+        </w:rPr>
+      </w:pPr>
+    </w:p>
+    <w:p>
+      <w:pPr>
+        <w:pStyle w:val="Nessunaspaziatura"/>
+        <w:spacing w:line="276" w:lineRule="auto"/>
+        <w:rPr>
+          <w:rFonts w:ascii="Arial" w:hAnsi="Arial" w:cs="Arial"/>
+        </w:rPr>
+      </w:pPr>
+      <w:r>
+        <w:rPr>
+          <w:rFonts w:ascii="Arial" w:hAnsi="Arial" w:cs="Arial"/>
+          <w:b/>
+          <w:bCs/>
+        </w:rPr>
+        <w:t>Strumento/i utilizzato/i</w:t>
+      </w:r>
+      <w:r>
+        <w:rPr>
+          <w:rFonts w:ascii="Arial" w:hAnsi="Arial" w:cs="Arial"/>
+          <w:b/>
+          <w:bCs/>
+        </w:rPr>
+        <w:t xml:space="preserve"> </w:t>
+      </w:r>
+      <w:r>
+        <w:rPr>
+          <w:rFonts w:ascii="Arial" w:hAnsi="Arial" w:cs="Arial"/>
+        </w:rPr>
+        <w:t>(es. ChatGPT)</w:t>
+      </w:r>
+      <w:r>
+        <w:rPr>
+          <w:rFonts w:ascii="Arial" w:hAnsi="Arial" w:cs="Arial"/>
+        </w:rPr>
+        <w:t xml:space="preserve">: </w:t>
+      </w:r>
+      <w:sdt>
+        <w:sdtPr>
+          <w:rPr>
+            <w:rFonts w:ascii="Arial" w:hAnsi="Arial" w:cs="Arial"/>
+          </w:rPr>
+          <w:id w:val="1915658689"/>
+          <w:placeholder>
+            <w:docPart w:val="80DEE09FC0BA479D941621AF26280C39"/>
+          </w:placeholder>
+        </w:sdtPr>
+        <w:sdtContent>
+          <w:r>
+            <w:rPr>
+              <w:rFonts w:ascii="Arial" w:hAnsi="Arial" w:cs="Arial"/>
+            </w:rPr>
+            <w:t>ChatGPT</w:t>
+          </w:r>
+        </w:sdtContent>
+      </w:sdt>
+    </w:p>
+    <w:p>
+      <w:pPr>
+        <w:pStyle w:val="Nessunaspaziatura"/>
+        <w:rPr>
+          <w:rFonts w:ascii="Arial" w:hAnsi="Arial" w:cs="Arial"/>
+        </w:rPr>
+      </w:pPr>
+    </w:p>
+    <w:p>
+      <w:pPr>
+        <w:pStyle w:val="Nessunaspaziatura"/>
+        <w:rPr>
+          <w:rFonts w:ascii="Arial" w:hAnsi="Arial" w:cs="Arial"/>
+        </w:rPr>
+      </w:pPr>
+      <w:r>
+        <w:rPr>
+          <w:rFonts w:ascii="Arial" w:hAnsi="Arial" w:cs="Arial"/>
+          <w:b/>
+          <w:bCs/>
+        </w:rPr>
+        <w:t>Per cosa l’ho usata oggi</w:t>
+      </w:r>
+      <w:r>
+        <w:br/>
+      </w:r>
+      <w:sdt>
+        <w:sdtPr>
+          <w:rPr>
+            <w:rFonts w:ascii="Segoe UI Symbol" w:hAnsi="Segoe UI Symbol" w:cs="Segoe UI Symbol"/>
+          </w:rPr>
+          <w:id w:val="-743101581"/>
+          <w14:checkbox>
+            <w14:checked w14:val="1"/>
+            <w14:checkedState w14:val="2612" w14:font="MS Gothic"/>
+            <w14:uncheckedState w14:val="2610" w14:font="MS Gothic"/>
+          </w14:checkbox>
+        </w:sdtPr>
+        <w:sdtContent>
+          <w:r>
+            <w:rPr>
+              <w:rFonts w:ascii="MS Gothic" w:eastAsia="MS Gothic" w:hAnsi="MS Gothic" w:cs="Segoe UI Symbol" w:hint="eastAsia"/>
+            </w:rPr>
+            <w:t>☒</w:t>
+          </w:r>
+        </w:sdtContent>
+      </w:sdt>
+      <w:r>
+        <w:rPr>
+          <w:rFonts w:ascii="Arial" w:hAnsi="Arial" w:cs="Arial"/>
+        </w:rPr>
+        <w:t xml:space="preserve"> Chiarire concetti</w:t>
+      </w:r>
+      <w:r>
+        <w:br/>
+      </w:r>
+      <w:sdt>
+        <w:sdtPr>
+          <w:rPr>
+            <w:rFonts w:ascii="Segoe UI Symbol" w:hAnsi="Segoe UI Symbol" w:cs="Segoe UI Symbol"/>
+          </w:rPr>
+          <w:id w:val="736448520"/>
+          <w14:checkbox>
+            <w14:checked w14:val="0"/>
+            <w14:checkedState w14:val="2612" w14:font="MS Gothic"/>
+            <w14:uncheckedState w14:val="2610" w14:font="MS Gothic"/>
+          </w14:checkbox>
+        </w:sdtPr>
+        <w:sdtContent>
+          <w:r>
+            <w:rPr>
+              <w:rFonts w:ascii="MS Gothic" w:eastAsia="MS Gothic" w:hAnsi="MS Gothic" w:cs="Segoe UI Symbol" w:hint="eastAsia"/>
+            </w:rPr>
+            <w:t>☐</w:t>
+          </w:r>
+        </w:sdtContent>
+      </w:sdt>
+      <w:r>
+        <w:rPr>
+          <w:rFonts w:ascii="Arial" w:hAnsi="Arial" w:cs="Arial"/>
+        </w:rPr>
+        <w:t xml:space="preserve"> Supporto al codice</w:t>
+      </w:r>
+      <w:r>
+        <w:br/>
+      </w:r>
+      <w:sdt>
+        <w:sdtPr>
+          <w:rPr>
+            <w:rFonts w:ascii="Segoe UI Symbol" w:hAnsi="Segoe UI Symbol" w:cs="Segoe UI Symbol"/>
+          </w:rPr>
+          <w:id w:val="-2030331954"/>
+          <w14:checkbox>
+            <w14:checked w14:val="0"/>
+            <w14:checkedState w14:val="2612" w14:font="MS Gothic"/>
+            <w14:uncheckedState w14:val="2610" w14:font="MS Gothic"/>
+          </w14:checkbox>
+        </w:sdtPr>
+        <w:sdtContent>
+          <w:r>
+            <w:rPr>
+              <w:rFonts w:ascii="MS Gothic" w:eastAsia="MS Gothic" w:hAnsi="MS Gothic" w:cs="Segoe UI Symbol" w:hint="eastAsia"/>
+            </w:rPr>
+            <w:t>☐</w:t>
+          </w:r>
+        </w:sdtContent>
+      </w:sdt>
+      <w:r>
+        <w:rPr>
+          <w:rFonts w:ascii="Arial" w:hAnsi="Arial" w:cs="Arial"/>
+        </w:rPr>
+        <w:t xml:space="preserve"> Debug</w:t>
+      </w:r>
+      <w:r>
+        <w:br/>
+      </w:r>
+      <w:sdt>
+        <w:sdtPr>
+          <w:rPr>
+            <w:rFonts w:ascii="Segoe UI Symbol" w:hAnsi="Segoe UI Symbol" w:cs="Segoe UI Symbol"/>
+          </w:rPr>
+          <w:id w:val="262960814"/>
+          <w14:checkbox>
+            <w14:checked w14:val="0"/>
+            <w14:checkedState w14:val="2612" w14:font="MS Gothic"/>
+            <w14:uncheckedState w14:val="2610" w14:font="MS Gothic"/>
+          </w14:checkbox>
+        </w:sdtPr>
+        <w:sdtContent>
+          <w:r>
+            <w:rPr>
+              <w:rFonts w:ascii="MS Gothic" w:eastAsia="MS Gothic" w:hAnsi="MS Gothic" w:cs="Segoe UI Symbol" w:hint="eastAsia"/>
+            </w:rPr>
+            <w:t>☐</w:t>
+          </w:r>
+        </w:sdtContent>
+      </w:sdt>
+      <w:r>
+        <w:rPr>
+          <w:rFonts w:ascii="Arial" w:hAnsi="Arial" w:cs="Arial"/>
+        </w:rPr>
+        <w:t xml:space="preserve"> Riorganizzare idee / testi</w:t>
+      </w:r>
+      <w:r>
+        <w:br/>
+      </w:r>
+      <w:sdt>
+        <w:sdtPr>
+          <w:rPr>
+            <w:rFonts w:ascii="Segoe UI Symbol" w:hAnsi="Segoe UI Symbol" w:cs="Segoe UI Symbol"/>
+          </w:rPr>
+          <w:id w:val="1252009118"/>
+          <w14:checkbox>
+            <w14:checked w14:val="0"/>
+            <w14:checkedState w14:val="2612" w14:font="MS Gothic"/>
+            <w14:uncheckedState w14:val="2610" w14:font="MS Gothic"/>
+          </w14:checkbox>
+        </w:sdtPr>
+        <w:sdtContent>
+          <w:r>
+            <w:rPr>
+              <w:rFonts w:ascii="MS Gothic" w:eastAsia="MS Gothic" w:hAnsi="MS Gothic" w:cs="Segoe UI Symbol" w:hint="eastAsia"/>
+            </w:rPr>
+            <w:t>☐</w:t>
+          </w:r>
+        </w:sdtContent>
+      </w:sdt>
+      <w:r>
+        <w:rPr>
+          <w:rFonts w:ascii="Arial" w:hAnsi="Arial" w:cs="Arial"/>
+        </w:rPr>
+        <w:t xml:space="preserve"> Altro: …</w:t>
+      </w:r>
+    </w:p>
+    <w:p>
+      <w:pPr>
+        <w:pStyle w:val="Nessunaspaziatura"/>
+        <w:rPr>
+          <w:rFonts w:ascii="Arial" w:hAnsi="Arial" w:cs="Arial"/>
+        </w:rPr>
+      </w:pPr>
+    </w:p>
+    <w:p>
+      <w:pPr>
+        <w:pStyle w:val="Nessunaspaziatura"/>
+        <w:rPr>
+          <w:rFonts w:ascii="Arial" w:hAnsi="Arial" w:cs="Arial"/>
+          <w:b/>
+          <w:bCs/>
+        </w:rPr>
+      </w:pPr>
+      <w:r>
+        <w:rPr>
+          <w:rFonts w:ascii="Arial" w:hAnsi="Arial" w:cs="Arial"/>
+          <w:b/>
+          <w:bCs/>
+        </w:rPr>
+        <w:t>Esempio significativo di utilizzo (UNO SOLO)</w:t>
+      </w:r>
+    </w:p>
+    <w:p>
+      <w:pPr>
+        <w:pStyle w:val="Nessunaspaziatura"/>
+        <w:rPr>
+          <w:rFonts w:ascii="Arial" w:hAnsi="Arial" w:cs="Arial"/>
+        </w:rPr>
+      </w:pPr>
+      <w:r>
+        <w:rPr>
+          <w:rFonts w:ascii="Arial" w:hAnsi="Arial" w:cs="Arial"/>
+        </w:rPr>
+        <w:t xml:space="preserve">Riporta </w:t>
+      </w:r>
+      <w:r>
+        <w:rPr>
+          <w:rFonts w:ascii="Arial" w:hAnsi="Arial" w:cs="Arial"/>
+          <w:i/>
+          <w:iCs/>
+        </w:rPr>
+        <w:t>un</w:t>
+      </w:r>
+      <w:r>
+        <w:rPr>
+          <w:rFonts w:ascii="Arial" w:hAnsi="Arial" w:cs="Arial"/>
+        </w:rPr>
+        <w:t xml:space="preserve"> prompt rilevante oppure descrivilo a parole se ce ne sono stati molti.</w:t>
+      </w:r>
+    </w:p>
+    <w:p>
+      <w:pPr>
+        <w:pStyle w:val="Nessunaspaziatura"/>
+        <w:rPr>
+          <w:rFonts w:ascii="Arial" w:hAnsi="Arial" w:cs="Arial"/>
+        </w:rPr>
+      </w:pPr>
+    </w:p>
+    <w:sdt>
+      <w:sdtPr>
+        <w:rPr>
+          <w:rFonts w:ascii="Arial" w:hAnsi="Arial" w:cs="Arial"/>
+        </w:rPr>
+        <w:alias w:val="Prompt AI"/>
+        <w:tag w:val="Prompt AI"/>
+        <w:id w:val="437028138"/>
+        <w:placeholder>
+          <w:docPart w:val="CA0F69338B894B0F9D546ED133851A14"/>
+        </w:placeholder>
+        <w15:color w:val="C0C0C0"/>
+      </w:sdtPr>
+      <w:sdtContent>
+        <w:p>
+          <w:pPr>
+            <w:pStyle w:val="Nessunaspaziatura"/>
+            <w:rPr>
+              <w:rFonts w:ascii="Arial" w:hAnsi="Arial" w:cs="Arial"/>
+            </w:rPr>
+          </w:pPr>
+          <w:r>
+            <w:rPr>
+              <w:rFonts w:ascii="Arial" w:hAnsi="Arial" w:cs="Arial"/>
+            </w:rPr>
+            <w:t xml:space="preserve">Riley: </w:t>
+          </w:r>
+          <w:r>
+            <w:rPr>
+              <w:rFonts w:ascii="Arial" w:hAnsi="Arial" w:cs="Arial"/>
+            </w:rPr>
+            <w:t>Come si modifica un anchor da codice</w:t>
+          </w:r>
+        </w:p>
+        <w:p>
+          <w:pPr>
+            <w:pStyle w:val="Nessunaspaziatura"/>
+            <w:spacing w:line="276" w:lineRule="auto"/>
+            <w:rPr>
+              <w:rFonts w:ascii="Arial" w:hAnsi="Arial" w:cs="Arial"/>
+            </w:rPr>
+          </w:pPr>
+          <w:r>
+            <w:rPr>
+              <w:rFonts w:ascii="Arial" w:hAnsi="Arial" w:cs="Arial"/>
+            </w:rPr>
+            <w:t xml:space="preserve">Bryan: </w:t>
+          </w:r>
+        </w:p>
+      </w:sdtContent>
+    </w:sdt>
+    <w:p>
+      <w:pPr>
+        <w:pStyle w:val="Nessunaspaziatura"/>
+        <w:rPr>
+          <w:rFonts w:ascii="Arial" w:hAnsi="Arial" w:cs="Arial"/>
+        </w:rPr>
+      </w:pPr>
+    </w:p>
+    <w:p>
+      <w:pPr>
+        <w:pStyle w:val="Nessunaspaziatura"/>
+        <w:rPr>
+          <w:rFonts w:ascii="Arial" w:hAnsi="Arial" w:cs="Arial"/>
+        </w:rPr>
+      </w:pPr>
+      <w:r>
+        <w:rPr>
+          <w:rFonts w:ascii="Arial" w:hAnsi="Arial" w:cs="Arial"/>
+          <w:b/>
+          <w:bCs/>
+        </w:rPr>
+        <w:t>Cosa mi ha dato l’AI</w:t>
+      </w:r>
+    </w:p>
+    <w:p>
+      <w:pPr>
+        <w:pStyle w:val="Nessunaspaziatura"/>
+        <w:rPr>
+          <w:rFonts w:ascii="Arial" w:hAnsi="Arial" w:cs="Arial"/>
+        </w:rPr>
+      </w:pPr>
+      <w:r>
+        <w:rPr>
+          <w:rFonts w:ascii="Arial" w:hAnsi="Arial" w:cs="Arial"/>
+        </w:rPr>
+        <w:t>Spiegazione, esempio, soluzione, suggerimento…</w:t>
+      </w:r>
+    </w:p>
+    <w:p>
+      <w:pPr>
+        <w:pStyle w:val="Nessunaspaziatura"/>
+        <w:rPr>
+          <w:rFonts w:ascii="Arial" w:hAnsi="Arial" w:cs="Arial"/>
+        </w:rPr>
+      </w:pPr>
+    </w:p>
+    <w:sdt>
+      <w:sdtPr>
+        <w:rPr>
+          <w:rFonts w:ascii="Arial" w:hAnsi="Arial" w:cs="Arial"/>
+        </w:rPr>
+        <w:alias w:val="Risposta AI"/>
+        <w:tag w:val="Risposta AI"/>
+        <w:id w:val="-269164971"/>
+        <w:placeholder>
+          <w:docPart w:val="71E68C4F4FC84004BF5FE0FB9931534E"/>
+        </w:placeholder>
+        <w15:color w:val="C0C0C0"/>
+      </w:sdtPr>
+      <w:sdtContent>
+        <w:p>
+          <w:pPr>
+            <w:pStyle w:val="Nessunaspaziatura"/>
+            <w:spacing w:line="276" w:lineRule="auto"/>
+            <w:rPr>
+              <w:rFonts w:ascii="Arial" w:hAnsi="Arial" w:cs="Arial"/>
+            </w:rPr>
+          </w:pPr>
+          <w:r>
+            <w:rPr>
+              <w:rFonts w:ascii="Arial" w:hAnsi="Arial" w:cs="Arial"/>
+            </w:rPr>
+            <w:t xml:space="preserve">Riley: </w:t>
+          </w:r>
+          <w:r>
+            <w:rPr>
+              <w:rFonts w:ascii="Arial" w:hAnsi="Arial" w:cs="Arial"/>
+            </w:rPr>
+            <w:t>Mi ha mostrato un esempio.</w:t>
+          </w:r>
+        </w:p>
+        <w:p>
+          <w:pPr>
+            <w:pStyle w:val="Nessunaspaziatura"/>
+            <w:spacing w:line="276" w:lineRule="auto"/>
+            <w:rPr>
+              <w:rFonts w:ascii="Arial" w:hAnsi="Arial" w:cs="Arial"/>
+            </w:rPr>
+          </w:pPr>
+          <w:r>
+            <w:rPr>
+              <w:rFonts w:ascii="Arial" w:hAnsi="Arial" w:cs="Arial"/>
+            </w:rPr>
+            <w:t xml:space="preserve">Bryan: </w:t>
+          </w:r>
+        </w:p>
+      </w:sdtContent>
+    </w:sdt>
+    <w:p>
+      <w:pPr>
+        <w:pStyle w:val="Nessunaspaziatura"/>
+        <w:rPr>
+          <w:rFonts w:ascii="Arial" w:hAnsi="Arial" w:cs="Arial"/>
+          <w:b/>
+          <w:bCs/>
+        </w:rPr>
+      </w:pPr>
+    </w:p>
+    <w:p>
+      <w:pPr>
+        <w:pStyle w:val="Nessunaspaziatura"/>
+        <w:rPr>
+          <w:rFonts w:ascii="Arial" w:hAnsi="Arial" w:cs="Arial"/>
+        </w:rPr>
+      </w:pPr>
+      <w:r>
+        <w:rPr>
+          <w:rFonts w:ascii="Arial" w:hAnsi="Arial" w:cs="Arial"/>
+          <w:b/>
+          <w:bCs/>
+        </w:rPr>
+        <w:t>Come l’ho usato io</w:t>
+      </w:r>
+      <w:r>
+        <w:rPr>
+          <w:rFonts w:ascii="Arial" w:hAnsi="Arial" w:cs="Arial"/>
+        </w:rPr>
+        <w:br/>
+      </w:r>
+      <w:sdt>
+        <w:sdtPr>
+          <w:rPr>
+            <w:rFonts w:ascii="Segoe UI Symbol" w:hAnsi="Segoe UI Symbol" w:cs="Segoe UI Symbol"/>
+          </w:rPr>
+          <w:id w:val="-763603986"/>
+          <w14:checkbox>
+            <w14:checked w14:val="0"/>
+            <w14:checkedState w14:val="2612" w14:font="MS Gothic"/>
+            <w14:uncheckedState w14:val="2610" w14:font="MS Gothic"/>
+          </w14:checkbox>
+        </w:sdtPr>
+        <w:sdtContent>
+          <w:r>
+            <w:rPr>
+              <w:rFonts w:ascii="MS Gothic" w:eastAsia="MS Gothic" w:hAnsi="MS Gothic" w:cs="Segoe UI Symbol" w:hint="eastAsia"/>
+            </w:rPr>
+            <w:t>☐</w:t>
+          </w:r>
+        </w:sdtContent>
+      </w:sdt>
+      <w:r>
+        <w:rPr>
+          <w:rFonts w:ascii="Arial" w:hAnsi="Arial" w:cs="Arial"/>
+        </w:rPr>
+        <w:t xml:space="preserve"> Copiato</w:t>
+      </w:r>
+      <w:r>
+        <w:rPr>
+          <w:rFonts w:ascii="Arial" w:hAnsi="Arial" w:cs="Arial"/>
+        </w:rPr>
+        <w:br/>
+      </w:r>
+      <w:sdt>
+        <w:sdtPr>
+          <w:rPr>
+            <w:rFonts w:ascii="Segoe UI Symbol" w:hAnsi="Segoe UI Symbol" w:cs="Segoe UI Symbol"/>
+          </w:rPr>
+          <w:id w:val="786315967"/>
+          <w14:checkbox>
+            <w14:checked w14:val="1"/>
+            <w14:checkedState w14:val="2612" w14:font="MS Gothic"/>
+            <w14:uncheckedState w14:val="2610" w14:font="MS Gothic"/>
+          </w14:checkbox>
+        </w:sdtPr>
+        <w:sdtContent>
+          <w:r>
+            <w:rPr>
+              <w:rFonts w:ascii="MS Gothic" w:eastAsia="MS Gothic" w:hAnsi="MS Gothic" w:cs="Segoe UI Symbol" w:hint="eastAsia"/>
+            </w:rPr>
+            <w:t>☒</w:t>
+          </w:r>
+        </w:sdtContent>
+      </w:sdt>
+      <w:r>
+        <w:rPr>
+          <w:rFonts w:ascii="Arial" w:hAnsi="Arial" w:cs="Arial"/>
+        </w:rPr>
+        <w:t xml:space="preserve"> Adattato</w:t>
+      </w:r>
+      <w:r>
+        <w:rPr>
+          <w:rFonts w:ascii="Arial" w:hAnsi="Arial" w:cs="Arial"/>
+        </w:rPr>
+        <w:br/>
+      </w:r>
+      <w:sdt>
+        <w:sdtPr>
+          <w:rPr>
+            <w:rFonts w:ascii="Segoe UI Symbol" w:hAnsi="Segoe UI Symbol" w:cs="Segoe UI Symbol"/>
+          </w:rPr>
+          <w:id w:val="271671470"/>
+          <w14:checkbox>
+            <w14:checked w14:val="0"/>
+            <w14:checkedState w14:val="2612" w14:font="MS Gothic"/>
+            <w14:uncheckedState w14:val="2610" w14:font="MS Gothic"/>
+          </w14:checkbox>
+        </w:sdtPr>
+        <w:sdtContent>
+          <w:r>
+            <w:rPr>
+              <w:rFonts w:ascii="MS Gothic" w:eastAsia="MS Gothic" w:hAnsi="MS Gothic" w:cs="Segoe UI Symbol" w:hint="eastAsia"/>
+            </w:rPr>
+            <w:t>☐</w:t>
+          </w:r>
+        </w:sdtContent>
+      </w:sdt>
+      <w:r>
+        <w:rPr>
+          <w:rFonts w:ascii="Arial" w:hAnsi="Arial" w:cs="Arial"/>
+        </w:rPr>
+        <w:t xml:space="preserve"> Usato solo per capire</w:t>
+      </w:r>
+      <w:r>
+        <w:rPr>
+          <w:rFonts w:ascii="Arial" w:hAnsi="Arial" w:cs="Arial"/>
+        </w:rPr>
+        <w:br/>
+      </w:r>
+      <w:sdt>
+        <w:sdtPr>
+          <w:rPr>
+            <w:rFonts w:ascii="Segoe UI Symbol" w:hAnsi="Segoe UI Symbol" w:cs="Segoe UI Symbol"/>
+          </w:rPr>
+          <w:id w:val="1323539990"/>
+          <w14:checkbox>
+            <w14:checked w14:val="0"/>
+            <w14:checkedState w14:val="2612" w14:font="MS Gothic"/>
+            <w14:uncheckedState w14:val="2610" w14:font="MS Gothic"/>
+          </w14:checkbox>
+        </w:sdtPr>
+        <w:sdtContent>
+          <w:r>
+            <w:rPr>
+              <w:rFonts w:ascii="MS Gothic" w:eastAsia="MS Gothic" w:hAnsi="MS Gothic" w:cs="Segoe UI Symbol" w:hint="eastAsia"/>
+            </w:rPr>
+            <w:t>☐</w:t>
+          </w:r>
+        </w:sdtContent>
+      </w:sdt>
+      <w:r>
+        <w:rPr>
+          <w:rFonts w:ascii="Arial" w:hAnsi="Arial" w:cs="Arial"/>
+        </w:rPr>
+        <w:t xml:space="preserve"> Scartato</w:t>
+      </w:r>
+    </w:p>
+    <w:p>
+      <w:pPr>
+        <w:pStyle w:val="Nessunaspaziatura"/>
+        <w:rPr>
+          <w:rFonts w:ascii="Arial" w:hAnsi="Arial" w:cs="Arial"/>
+        </w:rPr>
+      </w:pPr>
+    </w:p>
+    <w:p>
+      <w:pPr>
+        <w:pStyle w:val="Nessunaspaziatura"/>
+        <w:rPr>
+          <w:rFonts w:ascii="Arial" w:hAnsi="Arial" w:cs="Arial"/>
+        </w:rPr>
+      </w:pPr>
+    </w:p>
+    <w:p>
+      <w:pPr>
+        <w:pStyle w:val="Nessunaspaziatura"/>
+        <w:rPr>
+          <w:rFonts w:ascii="Arial" w:hAnsi="Arial" w:cs="Arial"/>
+        </w:rPr>
+      </w:pPr>
+      <w:r>
+        <w:rPr>
+          <w:rFonts w:ascii="Arial" w:hAnsi="Arial" w:cs="Arial"/>
+          <w:b/>
+          <w:bCs/>
+        </w:rPr>
+        <w:t>Cosa avrei fatto senza AI?</w:t>
+      </w:r>
+    </w:p>
+    <w:p>
+      <w:pPr>
+        <w:pStyle w:val="Nessunaspaziatura"/>
+        <w:rPr>
+          <w:rFonts w:ascii="Arial" w:hAnsi="Arial" w:cs="Arial"/>
+        </w:rPr>
+      </w:pPr>
+      <w:r>
+        <w:rPr>
+          <w:rFonts w:ascii="Arial" w:hAnsi="Arial" w:cs="Arial"/>
+        </w:rPr>
+        <w:t xml:space="preserve">Riley: </w:t>
       </w:r>
     </w:p>
     <w:p>
@@ -42341,6 +43809,107 @@
         </w:p>
       </w:docPartBody>
     </w:docPart>
+    <w:docPart>
+      <w:docPartPr>
+        <w:name w:val="80DEE09FC0BA479D941621AF26280C39"/>
+        <w:category>
+          <w:name w:val="Generale"/>
+          <w:gallery w:val="placeholder"/>
+        </w:category>
+        <w:types>
+          <w:type w:val="bbPlcHdr"/>
+        </w:types>
+        <w:behaviors>
+          <w:behavior w:val="content"/>
+        </w:behaviors>
+        <w:guid w:val="{21119C95-AA98-43E1-A6F7-3AD3688474CB}"/>
+      </w:docPartPr>
+      <w:docPartBody>
+        <w:p>
+          <w:pPr>
+            <w:pStyle w:val="80DEE09FC0BA479D941621AF26280C39"/>
+          </w:pPr>
+          <w:r>
+            <w:rPr>
+              <w:rStyle w:val="Testosegnaposto"/>
+              <w:b/>
+              <w:bCs/>
+            </w:rPr>
+            <w:t>Nomi AI utilizzati</w:t>
+          </w:r>
+        </w:p>
+      </w:docPartBody>
+    </w:docPart>
+    <w:docPart>
+      <w:docPartPr>
+        <w:name w:val="CA0F69338B894B0F9D546ED133851A14"/>
+        <w:category>
+          <w:name w:val="Generale"/>
+          <w:gallery w:val="placeholder"/>
+        </w:category>
+        <w:types>
+          <w:type w:val="bbPlcHdr"/>
+        </w:types>
+        <w:behaviors>
+          <w:behavior w:val="content"/>
+        </w:behaviors>
+        <w:guid w:val="{A078809F-EBFB-41F7-B757-91CFDB5A5BA1}"/>
+      </w:docPartPr>
+      <w:docPartBody>
+        <w:p>
+          <w:pPr>
+            <w:pStyle w:val="CA0F69338B894B0F9D546ED133851A14"/>
+          </w:pPr>
+          <w:r>
+            <w:rPr>
+              <w:rStyle w:val="Testosegnaposto"/>
+            </w:rPr>
+            <w:t>Fare clic o toccare qui per immettere il testo.</w:t>
+          </w:r>
+        </w:p>
+      </w:docPartBody>
+    </w:docPart>
+    <w:docPart>
+      <w:docPartPr>
+        <w:name w:val="71E68C4F4FC84004BF5FE0FB9931534E"/>
+        <w:category>
+          <w:name w:val="Generale"/>
+          <w:gallery w:val="placeholder"/>
+        </w:category>
+        <w:types>
+          <w:type w:val="bbPlcHdr"/>
+        </w:types>
+        <w:behaviors>
+          <w:behavior w:val="content"/>
+        </w:behaviors>
+        <w:guid w:val="{F071536D-CE3E-4D4A-BD12-6151635EF299}"/>
+      </w:docPartPr>
+      <w:docPartBody>
+        <w:p>
+          <w:pPr>
+            <w:pStyle w:val="71E68C4F4FC84004BF5FE0FB9931534E"/>
+          </w:pPr>
+          <w:r>
+            <w:rPr>
+              <w:rStyle w:val="Testosegnaposto"/>
+            </w:rPr>
+            <w:t xml:space="preserve">Fare clic o toccare qui per </w:t>
+          </w:r>
+          <w:r>
+            <w:rPr>
+              <w:rStyle w:val="Testosegnaposto"/>
+            </w:rPr>
+            <w:t>immettere</w:t>
+          </w:r>
+          <w:r>
+            <w:rPr>
+              <w:rStyle w:val="Testosegnaposto"/>
+            </w:rPr>
+            <w:t xml:space="preserve"> il testo.</w:t>
+          </w:r>
+        </w:p>
+      </w:docPartBody>
+    </w:docPart>
   </w:docParts>
 </w:glossaryDocument>
 </file>
@@ -42505,6 +44074,7 @@
     <w:rsid w:val="00530FEF"/>
     <w:rsid w:val="00534571"/>
     <w:rsid w:val="00565B11"/>
+    <w:rsid w:val="00592375"/>
     <w:rsid w:val="005E5F97"/>
     <w:rsid w:val="00633F3C"/>
     <w:rsid w:val="0063588A"/>
@@ -42536,10 +44106,12 @@
     <w:rsid w:val="00924F9E"/>
     <w:rsid w:val="0094220E"/>
     <w:rsid w:val="009826E2"/>
+    <w:rsid w:val="00992C85"/>
     <w:rsid w:val="009A56C6"/>
     <w:rsid w:val="009D6A55"/>
     <w:rsid w:val="00A04D62"/>
     <w:rsid w:val="00A27299"/>
+    <w:rsid w:val="00A43266"/>
     <w:rsid w:val="00A629CF"/>
     <w:rsid w:val="00A65B6C"/>
     <w:rsid w:val="00AA022F"/>
@@ -43038,7 +44610,7 @@
     <w:basedOn w:val="Carpredefinitoparagrafo"/>
     <w:uiPriority w:val="99"/>
     <w:semiHidden/>
-    <w:rsid w:val="00B04384"/>
+    <w:rsid w:val="00A43266"/>
     <w:rPr>
       <w:color w:val="666666"/>
     </w:rPr>
@@ -43376,6 +44948,18 @@
     <w:name w:val="92EDCB26C02F4472A2DFBBE345CCBCFB"/>
     <w:rsid w:val="00B04384"/>
   </w:style>
+  <w:style w:type="paragraph" w:customStyle="1" w:styleId="80DEE09FC0BA479D941621AF26280C39">
+    <w:name w:val="80DEE09FC0BA479D941621AF26280C39"/>
+    <w:rsid w:val="00A43266"/>
+  </w:style>
+  <w:style w:type="paragraph" w:customStyle="1" w:styleId="CA0F69338B894B0F9D546ED133851A14">
+    <w:name w:val="CA0F69338B894B0F9D546ED133851A14"/>
+    <w:rsid w:val="00A43266"/>
+  </w:style>
+  <w:style w:type="paragraph" w:customStyle="1" w:styleId="71E68C4F4FC84004BF5FE0FB9931534E">
+    <w:name w:val="71E68C4F4FC84004BF5FE0FB9931534E"/>
+    <w:rsid w:val="00A43266"/>
+  </w:style>
 </w:styles>
 </file>
 

</xml_diff>

<commit_message>
tentativo fix bug UI menu (non ancora riuscito)
</commit_message>
<xml_diff>
--- a/4_Diari/Diario.docx
+++ b/4_Diari/Diario.docx
@@ -193,21 +193,7 @@
               <w:rPr>
                 <w:rFonts w:ascii="Arial" w:hAnsi="Arial" w:cs="Arial"/>
               </w:rPr>
-              <w:t xml:space="preserve">Riflettuto sui requisiti e user story del gioco, creato i primi template per </w:t>
-            </w:r>
-            <w:proofErr w:type="spellStart"/>
-            <w:r>
-              <w:rPr>
-                <w:rFonts w:ascii="Arial" w:hAnsi="Arial" w:cs="Arial"/>
-              </w:rPr>
-              <w:t>gantt</w:t>
-            </w:r>
-            <w:proofErr w:type="spellEnd"/>
-            <w:r>
-              <w:rPr>
-                <w:rFonts w:ascii="Arial" w:hAnsi="Arial" w:cs="Arial"/>
-              </w:rPr>
-              <w:t xml:space="preserve"> e diario</w:t>
+              <w:t>Riflettuto sui requisiti e user story del gioco, creato i primi template per gantt e diario</w:t>
             </w:r>
           </w:p>
         </w:tc>
@@ -248,21 +234,7 @@
               <w:rPr>
                 <w:rFonts w:ascii="Arial" w:hAnsi="Arial" w:cs="Arial"/>
               </w:rPr>
-              <w:t xml:space="preserve">Riflettuto sui requisiti e user story del gioco, iniziato scrittura documentazione e sincronizzazione progetto a </w:t>
-            </w:r>
-            <w:proofErr w:type="spellStart"/>
-            <w:r>
-              <w:rPr>
-                <w:rFonts w:ascii="Arial" w:hAnsi="Arial" w:cs="Arial"/>
-              </w:rPr>
-              <w:t>GitLab</w:t>
-            </w:r>
-            <w:proofErr w:type="spellEnd"/>
-            <w:r>
-              <w:rPr>
-                <w:rFonts w:ascii="Arial" w:hAnsi="Arial" w:cs="Arial"/>
-              </w:rPr>
-              <w:t>.</w:t>
+              <w:t>Riflettuto sui requisiti e user story del gioco, iniziato scrittura documentazione e sincronizzazione progetto a GitLab.</w:t>
             </w:r>
           </w:p>
         </w:tc>
@@ -2262,21 +2234,7 @@
             <w:rPr>
               <w:rFonts w:ascii="Arial" w:hAnsi="Arial" w:cs="Arial"/>
             </w:rPr>
-            <w:t xml:space="preserve">Aitami a generare dei </w:t>
-          </w:r>
-          <w:proofErr w:type="spellStart"/>
-          <w:r>
-            <w:rPr>
-              <w:rFonts w:ascii="Arial" w:hAnsi="Arial" w:cs="Arial"/>
-            </w:rPr>
-            <w:t>requesiti</w:t>
-          </w:r>
-          <w:proofErr w:type="spellEnd"/>
-          <w:r>
-            <w:rPr>
-              <w:rFonts w:ascii="Arial" w:hAnsi="Arial" w:cs="Arial"/>
-            </w:rPr>
-            <w:t xml:space="preserve"> in base ai seguenti dati</w:t>
+            <w:t>Aitami a generare dei requesiti in base ai seguenti dati</w:t>
           </w:r>
         </w:p>
       </w:sdtContent>
@@ -2816,21 +2774,7 @@
               <w:rPr>
                 <w:rFonts w:ascii="Arial" w:hAnsi="Arial" w:cs="Arial"/>
               </w:rPr>
-              <w:t xml:space="preserve">Completata la analisi del dominio nella documentazione, inizio ricerche riguardo </w:t>
-            </w:r>
-            <w:proofErr w:type="spellStart"/>
-            <w:r>
-              <w:rPr>
-                <w:rFonts w:ascii="Arial" w:hAnsi="Arial" w:cs="Arial"/>
-              </w:rPr>
-              <w:t>Unity</w:t>
-            </w:r>
-            <w:proofErr w:type="spellEnd"/>
-            <w:r>
-              <w:rPr>
-                <w:rFonts w:ascii="Arial" w:hAnsi="Arial" w:cs="Arial"/>
-              </w:rPr>
-              <w:t>.</w:t>
+              <w:t>Completata la analisi del dominio nella documentazione, inizio ricerche riguardo Unity.</w:t>
             </w:r>
           </w:p>
         </w:tc>
@@ -4037,16 +3981,8 @@
               <w:rPr>
                 <w:rFonts w:ascii="Arial" w:hAnsi="Arial" w:cs="Arial"/>
               </w:rPr>
-              <w:t xml:space="preserve">Creato diagramma ER e modifiche strutturali </w:t>
-            </w:r>
-            <w:proofErr w:type="spellStart"/>
-            <w:r>
-              <w:rPr>
-                <w:rFonts w:ascii="Arial" w:hAnsi="Arial" w:cs="Arial"/>
-              </w:rPr>
-              <w:t>gantt</w:t>
-            </w:r>
-            <w:proofErr w:type="spellEnd"/>
+              <w:t>Creato diagramma ER e modifiche strutturali gantt</w:t>
+            </w:r>
           </w:p>
         </w:tc>
       </w:tr>
@@ -4794,42 +4730,20 @@
             <w:rPr>
               <w:rFonts w:ascii="Arial" w:hAnsi="Arial" w:cs="Arial"/>
             </w:rPr>
-            <w:t xml:space="preserve">uoi dirmi delle classiche impostazioni per un gioco di guida in stile </w:t>
-          </w:r>
-          <w:proofErr w:type="spellStart"/>
+            <w:t>uoi dirmi delle classiche impostazioni per un gioco di guida in stile br</w:t>
+          </w:r>
           <w:r>
             <w:rPr>
               <w:rFonts w:ascii="Arial" w:hAnsi="Arial" w:cs="Arial"/>
             </w:rPr>
-            <w:t>br</w:t>
-          </w:r>
-          <w:proofErr w:type="spellEnd"/>
+            <w:t xml:space="preserve">. </w:t>
+          </w:r>
           <w:r>
             <w:rPr>
               <w:rFonts w:ascii="Arial" w:hAnsi="Arial" w:cs="Arial"/>
             </w:rPr>
-            <w:t xml:space="preserve">. </w:t>
-          </w:r>
-          <w:r>
-            <w:rPr>
-              <w:rFonts w:ascii="Arial" w:hAnsi="Arial" w:cs="Arial"/>
-            </w:rPr>
             <w:br/>
-            <w:t xml:space="preserve">Bryan: Spiegami </w:t>
-          </w:r>
-          <w:proofErr w:type="spellStart"/>
-          <w:r>
-            <w:rPr>
-              <w:rFonts w:ascii="Arial" w:hAnsi="Arial" w:cs="Arial"/>
-            </w:rPr>
-            <w:t>Unity</w:t>
-          </w:r>
-          <w:proofErr w:type="spellEnd"/>
-          <w:r>
-            <w:rPr>
-              <w:rFonts w:ascii="Arial" w:hAnsi="Arial" w:cs="Arial"/>
-            </w:rPr>
-            <w:t xml:space="preserve"> ed i suoi vantaggi.</w:t>
+            <w:t>Bryan: Spiegami Unity ed i suoi vantaggi.</w:t>
           </w:r>
         </w:p>
       </w:sdtContent>
@@ -5307,16 +5221,8 @@
               <w:rPr>
                 <w:rFonts w:ascii="Arial" w:hAnsi="Arial" w:cs="Arial"/>
               </w:rPr>
-              <w:t xml:space="preserve">Creato Diagramma ER e aggiornato </w:t>
-            </w:r>
-            <w:proofErr w:type="spellStart"/>
-            <w:r>
-              <w:rPr>
-                <w:rFonts w:ascii="Arial" w:hAnsi="Arial" w:cs="Arial"/>
-              </w:rPr>
-              <w:t>gannt</w:t>
-            </w:r>
-            <w:proofErr w:type="spellEnd"/>
+              <w:t>Creato Diagramma ER e aggiornato gannt</w:t>
+            </w:r>
           </w:p>
         </w:tc>
       </w:tr>
@@ -5353,21 +5259,7 @@
               <w:rPr>
                 <w:rFonts w:ascii="Arial" w:hAnsi="Arial" w:cs="Arial"/>
               </w:rPr>
-              <w:t xml:space="preserve">Use Case finito, Inizio creazione e documentazione </w:t>
-            </w:r>
-            <w:proofErr w:type="spellStart"/>
-            <w:r>
-              <w:rPr>
-                <w:rFonts w:ascii="Arial" w:hAnsi="Arial" w:cs="Arial"/>
-              </w:rPr>
-              <w:t>mockup</w:t>
-            </w:r>
-            <w:proofErr w:type="spellEnd"/>
-            <w:r>
-              <w:rPr>
-                <w:rFonts w:ascii="Arial" w:hAnsi="Arial" w:cs="Arial"/>
-              </w:rPr>
-              <w:t xml:space="preserve"> UI.</w:t>
+              <w:t>Use Case finito, Inizio creazione e documentazione mockup UI.</w:t>
             </w:r>
           </w:p>
         </w:tc>
@@ -5613,21 +5505,7 @@
               <w:rPr>
                 <w:rFonts w:ascii="Arial" w:hAnsi="Arial" w:cs="Arial"/>
               </w:rPr>
-              <w:t xml:space="preserve">Continuo creazione </w:t>
-            </w:r>
-            <w:proofErr w:type="spellStart"/>
-            <w:r>
-              <w:rPr>
-                <w:rFonts w:ascii="Arial" w:hAnsi="Arial" w:cs="Arial"/>
-              </w:rPr>
-              <w:t>Mockup</w:t>
-            </w:r>
-            <w:proofErr w:type="spellEnd"/>
-            <w:r>
-              <w:rPr>
-                <w:rFonts w:ascii="Arial" w:hAnsi="Arial" w:cs="Arial"/>
-              </w:rPr>
-              <w:t xml:space="preserve"> UI.</w:t>
+              <w:t>Continuo creazione Mockup UI.</w:t>
             </w:r>
           </w:p>
         </w:tc>
@@ -6198,16 +6076,8 @@
               <w:rFonts w:ascii="Arial" w:hAnsi="Arial" w:cs="Arial"/>
             </w:rPr>
             <w:br/>
-            <w:t xml:space="preserve">Bryan: Correzioni dello use case generato dal </w:t>
-          </w:r>
-          <w:proofErr w:type="spellStart"/>
-          <w:r>
-            <w:rPr>
-              <w:rFonts w:ascii="Arial" w:hAnsi="Arial" w:cs="Arial"/>
-            </w:rPr>
-            <w:t>colega</w:t>
-          </w:r>
-          <w:proofErr w:type="spellEnd"/>
+            <w:t>Bryan: Correzioni dello use case generato dal colega</w:t>
+          </w:r>
         </w:p>
       </w:sdtContent>
     </w:sdt>
@@ -6607,16 +6477,8 @@
               <w:rPr>
                 <w:rFonts w:ascii="Arial" w:hAnsi="Arial" w:cs="Arial"/>
               </w:rPr>
-              <w:t xml:space="preserve">Completata progettazione e creazione progetto </w:t>
-            </w:r>
-            <w:proofErr w:type="spellStart"/>
-            <w:r>
-              <w:rPr>
-                <w:rFonts w:ascii="Arial" w:hAnsi="Arial" w:cs="Arial"/>
-              </w:rPr>
-              <w:t>unity</w:t>
-            </w:r>
-            <w:proofErr w:type="spellEnd"/>
+              <w:t>Completata progettazione e creazione progetto unity</w:t>
+            </w:r>
           </w:p>
         </w:tc>
       </w:tr>
@@ -6653,16 +6515,8 @@
               <w:rPr>
                 <w:rFonts w:ascii="Arial" w:hAnsi="Arial" w:cs="Arial"/>
               </w:rPr>
-              <w:t xml:space="preserve">Fine </w:t>
-            </w:r>
-            <w:proofErr w:type="spellStart"/>
-            <w:r>
-              <w:rPr>
-                <w:rFonts w:ascii="Arial" w:hAnsi="Arial" w:cs="Arial"/>
-              </w:rPr>
-              <w:t>Mockup</w:t>
-            </w:r>
-            <w:proofErr w:type="spellEnd"/>
+              <w:t>Fine Mockup</w:t>
+            </w:r>
           </w:p>
         </w:tc>
       </w:tr>
@@ -6740,44 +6594,8 @@
               <w:rPr>
                 <w:rFonts w:ascii="Arial" w:hAnsi="Arial" w:cs="Arial"/>
               </w:rPr>
-              <w:t xml:space="preserve">Problemi nel </w:t>
-            </w:r>
-            <w:proofErr w:type="spellStart"/>
-            <w:r>
-              <w:rPr>
-                <w:rFonts w:ascii="Arial" w:hAnsi="Arial" w:cs="Arial"/>
-              </w:rPr>
-              <w:t>pushare</w:t>
-            </w:r>
-            <w:proofErr w:type="spellEnd"/>
-            <w:r>
-              <w:rPr>
-                <w:rFonts w:ascii="Arial" w:hAnsi="Arial" w:cs="Arial"/>
-              </w:rPr>
-              <w:t xml:space="preserve"> il progetto </w:t>
-            </w:r>
-            <w:proofErr w:type="spellStart"/>
-            <w:r>
-              <w:rPr>
-                <w:rFonts w:ascii="Arial" w:hAnsi="Arial" w:cs="Arial"/>
-              </w:rPr>
-              <w:t>uinity</w:t>
-            </w:r>
-            <w:proofErr w:type="spellEnd"/>
-            <w:r>
-              <w:rPr>
-                <w:rFonts w:ascii="Arial" w:hAnsi="Arial" w:cs="Arial"/>
-              </w:rPr>
-              <w:t>, risolto grazie alla creazione di un file .</w:t>
-            </w:r>
-            <w:proofErr w:type="spellStart"/>
-            <w:r>
-              <w:rPr>
-                <w:rFonts w:ascii="Arial" w:hAnsi="Arial" w:cs="Arial"/>
-              </w:rPr>
-              <w:t>gitignore</w:t>
-            </w:r>
-            <w:proofErr w:type="spellEnd"/>
+              <w:t>Problemi nel pushare il progetto uinity, risolto grazie alla creazione di un file .gitignore</w:t>
+            </w:r>
           </w:p>
         </w:tc>
       </w:tr>
@@ -6930,35 +6748,7 @@
               <w:rPr>
                 <w:rFonts w:ascii="Arial" w:hAnsi="Arial" w:cs="Arial"/>
               </w:rPr>
-              <w:t xml:space="preserve">Ambientarsi nel game </w:t>
-            </w:r>
-            <w:proofErr w:type="spellStart"/>
-            <w:r>
-              <w:rPr>
-                <w:rFonts w:ascii="Arial" w:hAnsi="Arial" w:cs="Arial"/>
-              </w:rPr>
-              <w:t>engine</w:t>
-            </w:r>
-            <w:proofErr w:type="spellEnd"/>
-            <w:r>
-              <w:rPr>
-                <w:rFonts w:ascii="Arial" w:hAnsi="Arial" w:cs="Arial"/>
-              </w:rPr>
-              <w:t xml:space="preserve"> di </w:t>
-            </w:r>
-            <w:proofErr w:type="spellStart"/>
-            <w:r>
-              <w:rPr>
-                <w:rFonts w:ascii="Arial" w:hAnsi="Arial" w:cs="Arial"/>
-              </w:rPr>
-              <w:t>unity</w:t>
-            </w:r>
-            <w:proofErr w:type="spellEnd"/>
-            <w:r>
-              <w:rPr>
-                <w:rFonts w:ascii="Arial" w:hAnsi="Arial" w:cs="Arial"/>
-              </w:rPr>
-              <w:t xml:space="preserve"> e quindi cominciare a creare la schermata di statistiche</w:t>
+              <w:t>Ambientarsi nel game engine di unity e quindi cominciare a creare la schermata di statistiche</w:t>
             </w:r>
           </w:p>
         </w:tc>
@@ -7430,21 +7220,7 @@
             <w:rPr>
               <w:rFonts w:ascii="Arial" w:hAnsi="Arial" w:cs="Arial"/>
             </w:rPr>
-            <w:t xml:space="preserve">Bryan: Generami un’immagine di </w:t>
-          </w:r>
-          <w:proofErr w:type="spellStart"/>
-          <w:r>
-            <w:rPr>
-              <w:rFonts w:ascii="Arial" w:hAnsi="Arial" w:cs="Arial"/>
-            </w:rPr>
-            <w:t>mockup</w:t>
-          </w:r>
-          <w:proofErr w:type="spellEnd"/>
-          <w:r>
-            <w:rPr>
-              <w:rFonts w:ascii="Arial" w:hAnsi="Arial" w:cs="Arial"/>
-            </w:rPr>
-            <w:t xml:space="preserve"> basandoti sul seguente stile: “stile”</w:t>
+            <w:t>Bryan: Generami un’immagine di mockup basandoti sul seguente stile: “stile”</w:t>
           </w:r>
         </w:p>
         <w:p>
@@ -7758,50 +7534,14 @@
         <w:rPr>
           <w:rFonts w:ascii="Arial" w:hAnsi="Arial" w:cs="Arial"/>
         </w:rPr>
-        <w:t>Riley: probabilmente non sarei riuscito a risolvere questo problema non avendo un’esperienza molto avanzata con i file .</w:t>
-      </w:r>
-      <w:proofErr w:type="spellStart"/>
-      <w:r>
-        <w:rPr>
-          <w:rFonts w:ascii="Arial" w:hAnsi="Arial" w:cs="Arial"/>
-        </w:rPr>
-        <w:t>gitignore</w:t>
-      </w:r>
-      <w:proofErr w:type="spellEnd"/>
+        <w:t>Riley: probabilmente non sarei riuscito a risolvere questo problema non avendo un’esperienza molto avanzata con i file .gitignore</w:t>
+      </w:r>
       <w:r>
         <w:rPr>
           <w:rFonts w:ascii="Arial" w:hAnsi="Arial" w:cs="Arial"/>
         </w:rPr>
         <w:br/>
-        <w:t xml:space="preserve">Bryan: Averi creato un’immagine su </w:t>
-      </w:r>
-      <w:proofErr w:type="spellStart"/>
-      <w:r>
-        <w:rPr>
-          <w:rFonts w:ascii="Arial" w:hAnsi="Arial" w:cs="Arial"/>
-        </w:rPr>
-        <w:t>paint</w:t>
-      </w:r>
-      <w:proofErr w:type="spellEnd"/>
-      <w:r>
-        <w:rPr>
-          <w:rFonts w:ascii="Arial" w:hAnsi="Arial" w:cs="Arial"/>
-        </w:rPr>
-        <w:t xml:space="preserve"> che avrebbe reso i </w:t>
-      </w:r>
-      <w:proofErr w:type="spellStart"/>
-      <w:r>
-        <w:rPr>
-          <w:rFonts w:ascii="Arial" w:hAnsi="Arial" w:cs="Arial"/>
-        </w:rPr>
-        <w:t>mockup</w:t>
-      </w:r>
-      <w:proofErr w:type="spellEnd"/>
-      <w:r>
-        <w:rPr>
-          <w:rFonts w:ascii="Arial" w:hAnsi="Arial" w:cs="Arial"/>
-        </w:rPr>
-        <w:t xml:space="preserve"> molto più confusi.</w:t>
+        <w:t>Bryan: Averi creato un’immagine su paint che avrebbe reso i mockup molto più confusi.</w:t>
       </w:r>
     </w:p>
     <w:p>
@@ -7987,21 +7727,7 @@
               <w:rPr>
                 <w:rFonts w:ascii="Arial" w:hAnsi="Arial" w:cs="Arial"/>
               </w:rPr>
-              <w:t xml:space="preserve">Inizio sviluppo </w:t>
-            </w:r>
-            <w:proofErr w:type="spellStart"/>
-            <w:r>
-              <w:rPr>
-                <w:rFonts w:ascii="Arial" w:hAnsi="Arial" w:cs="Arial"/>
-              </w:rPr>
-              <w:t>ui</w:t>
-            </w:r>
-            <w:proofErr w:type="spellEnd"/>
-            <w:r>
-              <w:rPr>
-                <w:rFonts w:ascii="Arial" w:hAnsi="Arial" w:cs="Arial"/>
-              </w:rPr>
-              <w:t xml:space="preserve"> statistiche</w:t>
+              <w:t>Inizio sviluppo ui statistiche</w:t>
             </w:r>
           </w:p>
         </w:tc>
@@ -8039,21 +7765,7 @@
               <w:rPr>
                 <w:rFonts w:ascii="Arial" w:hAnsi="Arial" w:cs="Arial"/>
               </w:rPr>
-              <w:t xml:space="preserve">Inizio sviluppo </w:t>
-            </w:r>
-            <w:proofErr w:type="spellStart"/>
-            <w:r>
-              <w:rPr>
-                <w:rFonts w:ascii="Arial" w:hAnsi="Arial" w:cs="Arial"/>
-              </w:rPr>
-              <w:t>ui</w:t>
-            </w:r>
-            <w:proofErr w:type="spellEnd"/>
-            <w:r>
-              <w:rPr>
-                <w:rFonts w:ascii="Arial" w:hAnsi="Arial" w:cs="Arial"/>
-              </w:rPr>
-              <w:t xml:space="preserve"> statistiche</w:t>
+              <w:t>Inizio sviluppo ui statistiche</w:t>
             </w:r>
           </w:p>
         </w:tc>
@@ -8286,21 +7998,7 @@
               <w:rPr>
                 <w:rFonts w:ascii="Arial" w:hAnsi="Arial" w:cs="Arial"/>
               </w:rPr>
-              <w:t xml:space="preserve">Completare la </w:t>
-            </w:r>
-            <w:proofErr w:type="spellStart"/>
-            <w:r>
-              <w:rPr>
-                <w:rFonts w:ascii="Arial" w:hAnsi="Arial" w:cs="Arial"/>
-              </w:rPr>
-              <w:t>ui</w:t>
-            </w:r>
-            <w:proofErr w:type="spellEnd"/>
-            <w:r>
-              <w:rPr>
-                <w:rFonts w:ascii="Arial" w:hAnsi="Arial" w:cs="Arial"/>
-              </w:rPr>
-              <w:t xml:space="preserve"> delle statistiche</w:t>
+              <w:t>Completare la ui delle statistiche</w:t>
             </w:r>
           </w:p>
         </w:tc>
@@ -8350,28 +8048,12 @@
                 <w:rFonts w:ascii="Arial" w:hAnsi="Arial" w:cs="Arial"/>
               </w:rPr>
             </w:pPr>
-            <w:proofErr w:type="spellStart"/>
-            <w:r>
-              <w:rPr>
-                <w:rFonts w:ascii="Arial" w:hAnsi="Arial" w:cs="Arial"/>
-              </w:rPr>
-              <w:t>Daily</w:t>
-            </w:r>
-            <w:proofErr w:type="spellEnd"/>
-            <w:r>
-              <w:rPr>
-                <w:rFonts w:ascii="Arial" w:hAnsi="Arial" w:cs="Arial"/>
-              </w:rPr>
-              <w:t xml:space="preserve"> </w:t>
-            </w:r>
-            <w:proofErr w:type="spellStart"/>
-            <w:r>
-              <w:rPr>
-                <w:rFonts w:ascii="Arial" w:hAnsi="Arial" w:cs="Arial"/>
-              </w:rPr>
-              <w:t>Scrum</w:t>
-            </w:r>
-            <w:proofErr w:type="spellEnd"/>
+            <w:r>
+              <w:rPr>
+                <w:rFonts w:ascii="Arial" w:hAnsi="Arial" w:cs="Arial"/>
+              </w:rPr>
+              <w:t>Daily Scrum</w:t>
+            </w:r>
           </w:p>
         </w:tc>
       </w:tr>
@@ -8419,35 +8101,7 @@
               <w:rPr>
                 <w:rFonts w:ascii="Arial" w:hAnsi="Arial" w:cs="Arial"/>
               </w:rPr>
-              <w:t xml:space="preserve">Introduzione ambiente </w:t>
-            </w:r>
-            <w:proofErr w:type="spellStart"/>
-            <w:r>
-              <w:rPr>
-                <w:rFonts w:ascii="Arial" w:hAnsi="Arial" w:cs="Arial"/>
-              </w:rPr>
-              <w:t>unity</w:t>
-            </w:r>
-            <w:proofErr w:type="spellEnd"/>
-            <w:r>
-              <w:rPr>
-                <w:rFonts w:ascii="Arial" w:hAnsi="Arial" w:cs="Arial"/>
-              </w:rPr>
-              <w:t xml:space="preserve"> e inizio </w:t>
-            </w:r>
-            <w:proofErr w:type="spellStart"/>
-            <w:r>
-              <w:rPr>
-                <w:rFonts w:ascii="Arial" w:hAnsi="Arial" w:cs="Arial"/>
-              </w:rPr>
-              <w:t>imostazione</w:t>
-            </w:r>
-            <w:proofErr w:type="spellEnd"/>
-            <w:r>
-              <w:rPr>
-                <w:rFonts w:ascii="Arial" w:hAnsi="Arial" w:cs="Arial"/>
-              </w:rPr>
-              <w:t xml:space="preserve"> layout statistiche</w:t>
+              <w:t>Introduzione ambiente unity e inizio imostazione layout statistiche</w:t>
             </w:r>
           </w:p>
         </w:tc>
@@ -8627,16 +8281,8 @@
               <w:rPr>
                 <w:rFonts w:ascii="Arial" w:hAnsi="Arial" w:cs="Arial"/>
               </w:rPr>
-              <w:t xml:space="preserve">Sprint </w:t>
-            </w:r>
-            <w:proofErr w:type="spellStart"/>
-            <w:r>
-              <w:rPr>
-                <w:rFonts w:ascii="Arial" w:hAnsi="Arial" w:cs="Arial"/>
-              </w:rPr>
-              <w:t>Retrospective</w:t>
-            </w:r>
-            <w:proofErr w:type="spellEnd"/>
+              <w:t>Sprint Retrospective</w:t>
+            </w:r>
           </w:p>
         </w:tc>
       </w:tr>
@@ -9597,44 +9243,8 @@
               <w:rPr>
                 <w:rFonts w:ascii="Arial" w:hAnsi="Arial" w:cs="Arial"/>
               </w:rPr>
-              <w:t xml:space="preserve">Ricerca e sviluppo per salvataggio statistiche su </w:t>
-            </w:r>
-            <w:proofErr w:type="spellStart"/>
-            <w:r>
-              <w:rPr>
-                <w:rFonts w:ascii="Arial" w:hAnsi="Arial" w:cs="Arial"/>
-              </w:rPr>
-              <w:t>json</w:t>
-            </w:r>
-            <w:proofErr w:type="spellEnd"/>
-            <w:r>
-              <w:rPr>
-                <w:rFonts w:ascii="Arial" w:hAnsi="Arial" w:cs="Arial"/>
-              </w:rPr>
-              <w:t xml:space="preserve">, non ancora completo, questo verrà utilizzato come test per verificare il funzionamento delle varie schermate </w:t>
-            </w:r>
-            <w:proofErr w:type="spellStart"/>
-            <w:r>
-              <w:rPr>
-                <w:rFonts w:ascii="Arial" w:hAnsi="Arial" w:cs="Arial"/>
-              </w:rPr>
-              <w:t>ui</w:t>
-            </w:r>
-            <w:proofErr w:type="spellEnd"/>
-            <w:r>
-              <w:rPr>
-                <w:rFonts w:ascii="Arial" w:hAnsi="Arial" w:cs="Arial"/>
-              </w:rPr>
-              <w:t xml:space="preserve"> poi verrà adattato per il </w:t>
-            </w:r>
-            <w:proofErr w:type="spellStart"/>
-            <w:r>
-              <w:rPr>
-                <w:rFonts w:ascii="Arial" w:hAnsi="Arial" w:cs="Arial"/>
-              </w:rPr>
-              <w:t>db</w:t>
-            </w:r>
-            <w:proofErr w:type="spellEnd"/>
+              <w:t>Ricerca e sviluppo per salvataggio statistiche su json, non ancora completo, questo verrà utilizzato come test per verificare il funzionamento delle varie schermate ui poi verrà adattato per il db</w:t>
+            </w:r>
           </w:p>
         </w:tc>
       </w:tr>
@@ -9788,21 +9398,7 @@
               <w:rPr>
                 <w:rFonts w:ascii="Arial" w:hAnsi="Arial" w:cs="Arial"/>
               </w:rPr>
-              <w:t xml:space="preserve">Non trovavo la cartella degli assets, risolto cercando su </w:t>
-            </w:r>
-            <w:proofErr w:type="spellStart"/>
-            <w:r>
-              <w:rPr>
-                <w:rFonts w:ascii="Arial" w:hAnsi="Arial" w:cs="Arial"/>
-              </w:rPr>
-              <w:t>google</w:t>
-            </w:r>
-            <w:proofErr w:type="spellEnd"/>
-            <w:r>
-              <w:rPr>
-                <w:rFonts w:ascii="Arial" w:hAnsi="Arial" w:cs="Arial"/>
-              </w:rPr>
-              <w:t>.</w:t>
+              <w:t>Non trovavo la cartella degli assets, risolto cercando su google.</w:t>
             </w:r>
           </w:p>
         </w:tc>
@@ -9860,21 +9456,7 @@
               <w:rPr>
                 <w:rFonts w:ascii="Arial" w:hAnsi="Arial" w:cs="Arial"/>
               </w:rPr>
-              <w:t xml:space="preserve">Le statistiche non sono concluse, manca una piccola parte della </w:t>
-            </w:r>
-            <w:proofErr w:type="spellStart"/>
-            <w:r>
-              <w:rPr>
-                <w:rFonts w:ascii="Arial" w:hAnsi="Arial" w:cs="Arial"/>
-              </w:rPr>
-              <w:t>ui</w:t>
-            </w:r>
-            <w:proofErr w:type="spellEnd"/>
-            <w:r>
-              <w:rPr>
-                <w:rFonts w:ascii="Arial" w:hAnsi="Arial" w:cs="Arial"/>
-              </w:rPr>
-              <w:t xml:space="preserve"> e la logica di salvataggio e caricamento</w:t>
+              <w:t>Le statistiche non sono concluse, manca una piccola parte della ui e la logica di salvataggio e caricamento</w:t>
             </w:r>
           </w:p>
         </w:tc>
@@ -9982,28 +9564,12 @@
                 <w:rFonts w:ascii="Arial" w:hAnsi="Arial" w:cs="Arial"/>
               </w:rPr>
             </w:pPr>
-            <w:proofErr w:type="spellStart"/>
-            <w:r>
-              <w:rPr>
-                <w:rFonts w:ascii="Arial" w:hAnsi="Arial" w:cs="Arial"/>
-              </w:rPr>
-              <w:t>Daily</w:t>
-            </w:r>
-            <w:proofErr w:type="spellEnd"/>
-            <w:r>
-              <w:rPr>
-                <w:rFonts w:ascii="Arial" w:hAnsi="Arial" w:cs="Arial"/>
-              </w:rPr>
-              <w:t xml:space="preserve"> </w:t>
-            </w:r>
-            <w:proofErr w:type="spellStart"/>
-            <w:r>
-              <w:rPr>
-                <w:rFonts w:ascii="Arial" w:hAnsi="Arial" w:cs="Arial"/>
-              </w:rPr>
-              <w:t>Scrum</w:t>
-            </w:r>
-            <w:proofErr w:type="spellEnd"/>
+            <w:r>
+              <w:rPr>
+                <w:rFonts w:ascii="Arial" w:hAnsi="Arial" w:cs="Arial"/>
+              </w:rPr>
+              <w:t>Daily Scrum</w:t>
+            </w:r>
           </w:p>
         </w:tc>
       </w:tr>
@@ -10051,35 +9617,7 @@
               <w:rPr>
                 <w:rFonts w:ascii="Arial" w:hAnsi="Arial" w:cs="Arial"/>
               </w:rPr>
-              <w:t xml:space="preserve">Entrambi completeremo la </w:t>
-            </w:r>
-            <w:proofErr w:type="spellStart"/>
-            <w:r>
-              <w:rPr>
-                <w:rFonts w:ascii="Arial" w:hAnsi="Arial" w:cs="Arial"/>
-              </w:rPr>
-              <w:t>ui</w:t>
-            </w:r>
-            <w:proofErr w:type="spellEnd"/>
-            <w:r>
-              <w:rPr>
-                <w:rFonts w:ascii="Arial" w:hAnsi="Arial" w:cs="Arial"/>
-              </w:rPr>
-              <w:t xml:space="preserve"> delle statistiche in modo tale che ci ambientiamo completamente per lo sviluppo 2D e gli script C# per poterci permettere di lavorare separatamente in </w:t>
-            </w:r>
-            <w:proofErr w:type="spellStart"/>
-            <w:r>
-              <w:rPr>
-                <w:rFonts w:ascii="Arial" w:hAnsi="Arial" w:cs="Arial"/>
-              </w:rPr>
-              <w:t>fututro</w:t>
-            </w:r>
-            <w:proofErr w:type="spellEnd"/>
-            <w:r>
-              <w:rPr>
-                <w:rFonts w:ascii="Arial" w:hAnsi="Arial" w:cs="Arial"/>
-              </w:rPr>
-              <w:t>.</w:t>
+              <w:t>Entrambi completeremo la ui delle statistiche in modo tale che ci ambientiamo completamente per lo sviluppo 2D e gli script C# per poterci permettere di lavorare separatamente in fututro.</w:t>
             </w:r>
           </w:p>
         </w:tc>
@@ -10259,16 +9797,8 @@
               <w:rPr>
                 <w:rFonts w:ascii="Arial" w:hAnsi="Arial" w:cs="Arial"/>
               </w:rPr>
-              <w:t xml:space="preserve">Sprint </w:t>
-            </w:r>
-            <w:proofErr w:type="spellStart"/>
-            <w:r>
-              <w:rPr>
-                <w:rFonts w:ascii="Arial" w:hAnsi="Arial" w:cs="Arial"/>
-              </w:rPr>
-              <w:t>Retrospective</w:t>
-            </w:r>
-            <w:proofErr w:type="spellEnd"/>
+              <w:t>Sprint Retrospective</w:t>
+            </w:r>
           </w:p>
         </w:tc>
       </w:tr>
@@ -10760,30 +10290,8 @@
             <w:rPr>
               <w:rFonts w:ascii="Arial" w:hAnsi="Arial" w:cs="Arial"/>
             </w:rPr>
-            <w:t xml:space="preserve">Riley: aiutami a comprendere come salvare dei dati </w:t>
-          </w:r>
-          <w:proofErr w:type="spellStart"/>
-          <w:r>
-            <w:rPr>
-              <w:rFonts w:ascii="Arial" w:hAnsi="Arial" w:cs="Arial"/>
-            </w:rPr>
-            <w:t>unity</w:t>
-          </w:r>
-          <w:proofErr w:type="spellEnd"/>
-          <w:r>
-            <w:rPr>
-              <w:rFonts w:ascii="Arial" w:hAnsi="Arial" w:cs="Arial"/>
-            </w:rPr>
-            <w:t xml:space="preserve"> su un </w:t>
-          </w:r>
-          <w:proofErr w:type="spellStart"/>
-          <w:r>
-            <w:rPr>
-              <w:rFonts w:ascii="Arial" w:hAnsi="Arial" w:cs="Arial"/>
-            </w:rPr>
-            <w:t>json</w:t>
-          </w:r>
-          <w:proofErr w:type="spellEnd"/>
+            <w:t>Riley: aiutami a comprendere come salvare dei dati unity su un json</w:t>
+          </w:r>
         </w:p>
       </w:sdtContent>
     </w:sdt>
@@ -11295,21 +10803,7 @@
               <w:rPr>
                 <w:rFonts w:ascii="Arial" w:hAnsi="Arial" w:cs="Arial"/>
               </w:rPr>
-              <w:t xml:space="preserve">Terminato </w:t>
-            </w:r>
-            <w:proofErr w:type="spellStart"/>
-            <w:r>
-              <w:rPr>
-                <w:rFonts w:ascii="Arial" w:hAnsi="Arial" w:cs="Arial"/>
-              </w:rPr>
-              <w:t>ui</w:t>
-            </w:r>
-            <w:proofErr w:type="spellEnd"/>
-            <w:r>
-              <w:rPr>
-                <w:rFonts w:ascii="Arial" w:hAnsi="Arial" w:cs="Arial"/>
-              </w:rPr>
-              <w:t xml:space="preserve"> statistiche e iniziato quella delle impostazioni</w:t>
+              <w:t>Terminato ui statistiche e iniziato quella delle impostazioni</w:t>
             </w:r>
           </w:p>
         </w:tc>
@@ -11388,97 +10882,13 @@
               <w:rPr>
                 <w:rFonts w:ascii="Arial" w:hAnsi="Arial" w:cs="Arial"/>
               </w:rPr>
-              <w:t xml:space="preserve">Problemi di merge, risolto tramite una configurazione di un tool di </w:t>
-            </w:r>
-            <w:proofErr w:type="spellStart"/>
-            <w:r>
-              <w:rPr>
-                <w:rFonts w:ascii="Arial" w:hAnsi="Arial" w:cs="Arial"/>
-              </w:rPr>
-              <w:t>unity</w:t>
-            </w:r>
-            <w:proofErr w:type="spellEnd"/>
-            <w:r>
-              <w:rPr>
-                <w:rFonts w:ascii="Arial" w:hAnsi="Arial" w:cs="Arial"/>
-              </w:rPr>
-              <w:t xml:space="preserve"> che permette di risolvere automaticamente i conflitti, è stato fatto una configurazione che fa avvia un file .</w:t>
-            </w:r>
-            <w:proofErr w:type="spellStart"/>
-            <w:r>
-              <w:rPr>
-                <w:rFonts w:ascii="Arial" w:hAnsi="Arial" w:cs="Arial"/>
-              </w:rPr>
-              <w:t>cmd</w:t>
-            </w:r>
-            <w:proofErr w:type="spellEnd"/>
-            <w:r>
-              <w:rPr>
-                <w:rFonts w:ascii="Arial" w:hAnsi="Arial" w:cs="Arial"/>
-              </w:rPr>
-              <w:t xml:space="preserve"> sotto la cartella tools questo piccolo script prende i file con conflitti rilevati da </w:t>
-            </w:r>
-            <w:proofErr w:type="spellStart"/>
-            <w:r>
-              <w:rPr>
-                <w:rFonts w:ascii="Arial" w:hAnsi="Arial" w:cs="Arial"/>
-              </w:rPr>
-              <w:t>git</w:t>
-            </w:r>
-            <w:proofErr w:type="spellEnd"/>
-            <w:r>
-              <w:rPr>
-                <w:rFonts w:ascii="Arial" w:hAnsi="Arial" w:cs="Arial"/>
-              </w:rPr>
-              <w:t xml:space="preserve"> e li traduce per </w:t>
-            </w:r>
-            <w:proofErr w:type="spellStart"/>
-            <w:r>
-              <w:rPr>
-                <w:rFonts w:ascii="Arial" w:hAnsi="Arial" w:cs="Arial"/>
-              </w:rPr>
-              <w:t>unityyalmmerge</w:t>
-            </w:r>
-            <w:proofErr w:type="spellEnd"/>
-            <w:r>
-              <w:rPr>
-                <w:rFonts w:ascii="Arial" w:hAnsi="Arial" w:cs="Arial"/>
-              </w:rPr>
-              <w:t xml:space="preserve"> facendo in modo che una volta usato il comando </w:t>
-            </w:r>
-            <w:proofErr w:type="spellStart"/>
-            <w:r>
-              <w:rPr>
-                <w:rFonts w:ascii="Arial" w:hAnsi="Arial" w:cs="Arial"/>
-              </w:rPr>
-              <w:t>git</w:t>
-            </w:r>
-            <w:proofErr w:type="spellEnd"/>
-            <w:r>
-              <w:rPr>
-                <w:rFonts w:ascii="Arial" w:hAnsi="Arial" w:cs="Arial"/>
-              </w:rPr>
-              <w:t xml:space="preserve"> pull non risultino più errori.</w:t>
-            </w:r>
-            <w:r>
-              <w:rPr>
-                <w:rFonts w:ascii="Arial" w:hAnsi="Arial" w:cs="Arial"/>
-              </w:rPr>
-              <w:t xml:space="preserve"> </w:t>
-            </w:r>
-            <w:proofErr w:type="spellStart"/>
-            <w:r>
-              <w:rPr>
-                <w:rFonts w:ascii="Arial" w:hAnsi="Arial" w:cs="Arial"/>
-              </w:rPr>
-              <w:t>Chatgpt</w:t>
-            </w:r>
-            <w:proofErr w:type="spellEnd"/>
-            <w:r>
-              <w:rPr>
-                <w:rFonts w:ascii="Arial" w:hAnsi="Arial" w:cs="Arial"/>
-              </w:rPr>
-              <w:t xml:space="preserve"> mi ha supportato nella risoluzione di questo problema</w:t>
+              <w:t>Problemi di merge, risolto tramite una configurazione di un tool di unity che permette di risolvere automaticamente i conflitti, è stato fatto una configurazione che fa avvia un file .cmd sotto la cartella tools questo piccolo script prende i file con conflitti rilevati da git e li traduce per unityyalmmerge facendo in modo che una volta usato il comando git pull non risultino più errori.</w:t>
+            </w:r>
+            <w:r>
+              <w:rPr>
+                <w:rFonts w:ascii="Arial" w:hAnsi="Arial" w:cs="Arial"/>
+              </w:rPr>
+              <w:t xml:space="preserve"> Chatgpt mi ha supportato nella risoluzione di questo problema</w:t>
             </w:r>
           </w:p>
         </w:tc>
@@ -11574,21 +10984,7 @@
               <w:rPr>
                 <w:rFonts w:ascii="Arial" w:hAnsi="Arial" w:cs="Arial"/>
               </w:rPr>
-              <w:t xml:space="preserve">La </w:t>
-            </w:r>
-            <w:proofErr w:type="spellStart"/>
-            <w:r>
-              <w:rPr>
-                <w:rFonts w:ascii="Arial" w:hAnsi="Arial" w:cs="Arial"/>
-              </w:rPr>
-              <w:t>ui</w:t>
-            </w:r>
-            <w:proofErr w:type="spellEnd"/>
-            <w:r>
-              <w:rPr>
-                <w:rFonts w:ascii="Arial" w:hAnsi="Arial" w:cs="Arial"/>
-              </w:rPr>
-              <w:t xml:space="preserve"> delle statistiche è completa ma mancano alcune parti dello script, di conseguenza abbiamo un ritardo generale.</w:t>
+              <w:t>La ui delle statistiche è completa ma mancano alcune parti dello script, di conseguenza abbiamo un ritardo generale.</w:t>
             </w:r>
           </w:p>
         </w:tc>
@@ -11646,21 +11042,7 @@
               <w:rPr>
                 <w:rFonts w:ascii="Arial" w:hAnsi="Arial" w:cs="Arial"/>
               </w:rPr>
-              <w:t xml:space="preserve">Terminare script statistiche, continuare </w:t>
-            </w:r>
-            <w:proofErr w:type="spellStart"/>
-            <w:r>
-              <w:rPr>
-                <w:rFonts w:ascii="Arial" w:hAnsi="Arial" w:cs="Arial"/>
-              </w:rPr>
-              <w:t>ui</w:t>
-            </w:r>
-            <w:proofErr w:type="spellEnd"/>
-            <w:r>
-              <w:rPr>
-                <w:rFonts w:ascii="Arial" w:hAnsi="Arial" w:cs="Arial"/>
-              </w:rPr>
-              <w:t xml:space="preserve"> impostazioni</w:t>
+              <w:t>Terminare script statistiche, continuare ui impostazioni</w:t>
             </w:r>
           </w:p>
         </w:tc>
@@ -11710,28 +11092,12 @@
                 <w:rFonts w:ascii="Arial" w:hAnsi="Arial" w:cs="Arial"/>
               </w:rPr>
             </w:pPr>
-            <w:proofErr w:type="spellStart"/>
-            <w:r>
-              <w:rPr>
-                <w:rFonts w:ascii="Arial" w:hAnsi="Arial" w:cs="Arial"/>
-              </w:rPr>
-              <w:t>Daily</w:t>
-            </w:r>
-            <w:proofErr w:type="spellEnd"/>
-            <w:r>
-              <w:rPr>
-                <w:rFonts w:ascii="Arial" w:hAnsi="Arial" w:cs="Arial"/>
-              </w:rPr>
-              <w:t xml:space="preserve"> </w:t>
-            </w:r>
-            <w:proofErr w:type="spellStart"/>
-            <w:r>
-              <w:rPr>
-                <w:rFonts w:ascii="Arial" w:hAnsi="Arial" w:cs="Arial"/>
-              </w:rPr>
-              <w:t>Scrum</w:t>
-            </w:r>
-            <w:proofErr w:type="spellEnd"/>
+            <w:r>
+              <w:rPr>
+                <w:rFonts w:ascii="Arial" w:hAnsi="Arial" w:cs="Arial"/>
+              </w:rPr>
+              <w:t>Daily Scrum</w:t>
+            </w:r>
           </w:p>
         </w:tc>
       </w:tr>
@@ -11779,21 +11145,7 @@
               <w:rPr>
                 <w:rFonts w:ascii="Arial" w:hAnsi="Arial" w:cs="Arial"/>
               </w:rPr>
-              <w:t xml:space="preserve">Riley deve risolvere un problema di merge riscontrato al tentativo di pull e poi continuare con lo script delle statistiche, invece Bryan deve fine la </w:t>
-            </w:r>
-            <w:proofErr w:type="spellStart"/>
-            <w:r>
-              <w:rPr>
-                <w:rFonts w:ascii="Arial" w:hAnsi="Arial" w:cs="Arial"/>
-              </w:rPr>
-              <w:t>ui</w:t>
-            </w:r>
-            <w:proofErr w:type="spellEnd"/>
-            <w:r>
-              <w:rPr>
-                <w:rFonts w:ascii="Arial" w:hAnsi="Arial" w:cs="Arial"/>
-              </w:rPr>
-              <w:t xml:space="preserve"> delle statistiche e preferibilmente iniziare con le impostazioni.</w:t>
+              <w:t>Riley deve risolvere un problema di merge riscontrato al tentativo di pull e poi continuare con lo script delle statistiche, invece Bryan deve fine la ui delle statistiche e preferibilmente iniziare con le impostazioni.</w:t>
             </w:r>
           </w:p>
         </w:tc>
@@ -11973,16 +11325,8 @@
               <w:rPr>
                 <w:rFonts w:ascii="Arial" w:hAnsi="Arial" w:cs="Arial"/>
               </w:rPr>
-              <w:t xml:space="preserve">Sprint </w:t>
-            </w:r>
-            <w:proofErr w:type="spellStart"/>
-            <w:r>
-              <w:rPr>
-                <w:rFonts w:ascii="Arial" w:hAnsi="Arial" w:cs="Arial"/>
-              </w:rPr>
-              <w:t>Retrospective</w:t>
-            </w:r>
-            <w:proofErr w:type="spellEnd"/>
+              <w:t>Sprint Retrospective</w:t>
+            </w:r>
           </w:p>
         </w:tc>
       </w:tr>
@@ -12486,21 +11830,7 @@
             <w:rPr>
               <w:rFonts w:ascii="Arial" w:hAnsi="Arial" w:cs="Arial"/>
             </w:rPr>
-            <w:t xml:space="preserve">Ho riscontrato un problema di merge nonostante abbiamo impostato un sistema con un tool </w:t>
-          </w:r>
-          <w:proofErr w:type="spellStart"/>
-          <w:r>
-            <w:rPr>
-              <w:rFonts w:ascii="Arial" w:hAnsi="Arial" w:cs="Arial"/>
-            </w:rPr>
-            <w:t>unity</w:t>
-          </w:r>
-          <w:proofErr w:type="spellEnd"/>
-          <w:r>
-            <w:rPr>
-              <w:rFonts w:ascii="Arial" w:hAnsi="Arial" w:cs="Arial"/>
-            </w:rPr>
-            <w:t>, puoi dirmi cosa analizzare per risolvere?</w:t>
+            <w:t>Ho riscontrato un problema di merge nonostante abbiamo impostato un sistema con un tool unity, puoi dirmi cosa analizzare per risolvere?</w:t>
           </w:r>
         </w:p>
         <w:p>
@@ -12515,21 +11845,7 @@
             <w:rPr>
               <w:rFonts w:ascii="Arial" w:hAnsi="Arial" w:cs="Arial"/>
             </w:rPr>
-            <w:t xml:space="preserve">Bryan: come si implementa un font in </w:t>
-          </w:r>
-          <w:proofErr w:type="spellStart"/>
-          <w:r>
-            <w:rPr>
-              <w:rFonts w:ascii="Arial" w:hAnsi="Arial" w:cs="Arial"/>
-            </w:rPr>
-            <w:t>unity</w:t>
-          </w:r>
-          <w:proofErr w:type="spellEnd"/>
-          <w:r>
-            <w:rPr>
-              <w:rFonts w:ascii="Arial" w:hAnsi="Arial" w:cs="Arial"/>
-            </w:rPr>
-            <w:t>?</w:t>
+            <w:t>Bryan: come si implementa un font in unity?</w:t>
           </w:r>
         </w:p>
       </w:sdtContent>
@@ -13238,49 +12554,7 @@
               <w:rPr>
                 <w:rFonts w:ascii="Arial" w:hAnsi="Arial" w:cs="Arial"/>
               </w:rPr>
-              <w:t xml:space="preserve">Rispetto alla pianificazione abbiamo un leggero ritardo avendo finito solo oggi le statistiche, ma questo risulta recuperabile essendo che lavoriamo separatamente dividendo </w:t>
-            </w:r>
-            <w:proofErr w:type="spellStart"/>
-            <w:r>
-              <w:rPr>
-                <w:rFonts w:ascii="Arial" w:hAnsi="Arial" w:cs="Arial"/>
-              </w:rPr>
-              <w:t>ui</w:t>
-            </w:r>
-            <w:proofErr w:type="spellEnd"/>
-            <w:r>
-              <w:rPr>
-                <w:rFonts w:ascii="Arial" w:hAnsi="Arial" w:cs="Arial"/>
-              </w:rPr>
-              <w:t xml:space="preserve"> e scripting, infatti </w:t>
-            </w:r>
-            <w:proofErr w:type="spellStart"/>
-            <w:r>
-              <w:rPr>
-                <w:rFonts w:ascii="Arial" w:hAnsi="Arial" w:cs="Arial"/>
-              </w:rPr>
-              <w:t>bryan</w:t>
-            </w:r>
-            <w:proofErr w:type="spellEnd"/>
-            <w:r>
-              <w:rPr>
-                <w:rFonts w:ascii="Arial" w:hAnsi="Arial" w:cs="Arial"/>
-              </w:rPr>
-              <w:t xml:space="preserve"> ha iniziato la </w:t>
-            </w:r>
-            <w:proofErr w:type="spellStart"/>
-            <w:r>
-              <w:rPr>
-                <w:rFonts w:ascii="Arial" w:hAnsi="Arial" w:cs="Arial"/>
-              </w:rPr>
-              <w:t>ui</w:t>
-            </w:r>
-            <w:proofErr w:type="spellEnd"/>
-            <w:r>
-              <w:rPr>
-                <w:rFonts w:ascii="Arial" w:hAnsi="Arial" w:cs="Arial"/>
-              </w:rPr>
-              <w:t xml:space="preserve"> delle impostazioni il giorno previsto.</w:t>
+              <w:t>Rispetto alla pianificazione abbiamo un leggero ritardo avendo finito solo oggi le statistiche, ma questo risulta recuperabile essendo che lavoriamo separatamente dividendo ui e scripting, infatti bryan ha iniziato la ui delle impostazioni il giorno previsto.</w:t>
             </w:r>
           </w:p>
         </w:tc>
@@ -13401,28 +12675,12 @@
                 <w:rFonts w:ascii="Arial" w:hAnsi="Arial" w:cs="Arial"/>
               </w:rPr>
             </w:pPr>
-            <w:proofErr w:type="spellStart"/>
-            <w:r>
-              <w:rPr>
-                <w:rFonts w:ascii="Arial" w:hAnsi="Arial" w:cs="Arial"/>
-              </w:rPr>
-              <w:t>Daily</w:t>
-            </w:r>
-            <w:proofErr w:type="spellEnd"/>
-            <w:r>
-              <w:rPr>
-                <w:rFonts w:ascii="Arial" w:hAnsi="Arial" w:cs="Arial"/>
-              </w:rPr>
-              <w:t xml:space="preserve"> </w:t>
-            </w:r>
-            <w:proofErr w:type="spellStart"/>
-            <w:r>
-              <w:rPr>
-                <w:rFonts w:ascii="Arial" w:hAnsi="Arial" w:cs="Arial"/>
-              </w:rPr>
-              <w:t>Scrum</w:t>
-            </w:r>
-            <w:proofErr w:type="spellEnd"/>
+            <w:r>
+              <w:rPr>
+                <w:rFonts w:ascii="Arial" w:hAnsi="Arial" w:cs="Arial"/>
+              </w:rPr>
+              <w:t>Daily Scrum</w:t>
+            </w:r>
           </w:p>
         </w:tc>
       </w:tr>
@@ -13484,21 +12742,7 @@
               <w:rPr>
                 <w:rFonts w:ascii="Arial" w:hAnsi="Arial" w:cs="Arial"/>
               </w:rPr>
-              <w:t xml:space="preserve">Bryan: Finire la </w:t>
-            </w:r>
-            <w:proofErr w:type="spellStart"/>
-            <w:r>
-              <w:rPr>
-                <w:rFonts w:ascii="Arial" w:hAnsi="Arial" w:cs="Arial"/>
-              </w:rPr>
-              <w:t>ui</w:t>
-            </w:r>
-            <w:proofErr w:type="spellEnd"/>
-            <w:r>
-              <w:rPr>
-                <w:rFonts w:ascii="Arial" w:hAnsi="Arial" w:cs="Arial"/>
-              </w:rPr>
-              <w:t xml:space="preserve"> del</w:t>
+              <w:t>Bryan: Finire la ui del</w:t>
             </w:r>
             <w:r>
               <w:rPr>
@@ -13684,16 +12928,8 @@
               <w:rPr>
                 <w:rFonts w:ascii="Arial" w:hAnsi="Arial" w:cs="Arial"/>
               </w:rPr>
-              <w:t xml:space="preserve">Sprint </w:t>
-            </w:r>
-            <w:proofErr w:type="spellStart"/>
-            <w:r>
-              <w:rPr>
-                <w:rFonts w:ascii="Arial" w:hAnsi="Arial" w:cs="Arial"/>
-              </w:rPr>
-              <w:t>Retrospective</w:t>
-            </w:r>
-            <w:proofErr w:type="spellEnd"/>
+              <w:t>Sprint Retrospective</w:t>
+            </w:r>
           </w:p>
         </w:tc>
       </w:tr>
@@ -14185,35 +13421,7 @@
             <w:rPr>
               <w:rFonts w:ascii="Arial" w:hAnsi="Arial" w:cs="Arial"/>
             </w:rPr>
-            <w:t xml:space="preserve">Il numero inserito nel </w:t>
-          </w:r>
-          <w:proofErr w:type="spellStart"/>
-          <w:r>
-            <w:rPr>
-              <w:rFonts w:ascii="Arial" w:hAnsi="Arial" w:cs="Arial"/>
-            </w:rPr>
-            <w:t>json</w:t>
-          </w:r>
-          <w:proofErr w:type="spellEnd"/>
-          <w:r>
-            <w:rPr>
-              <w:rFonts w:ascii="Arial" w:hAnsi="Arial" w:cs="Arial"/>
-            </w:rPr>
-            <w:t xml:space="preserve"> risulta essere un numero che va dal miliardo in su, ma l’applicativo lo riduce a milioni, per caso i valori </w:t>
-          </w:r>
-          <w:proofErr w:type="spellStart"/>
-          <w:r>
-            <w:rPr>
-              <w:rFonts w:ascii="Arial" w:hAnsi="Arial" w:cs="Arial"/>
-            </w:rPr>
-            <w:t>int</w:t>
-          </w:r>
-          <w:proofErr w:type="spellEnd"/>
-          <w:r>
-            <w:rPr>
-              <w:rFonts w:ascii="Arial" w:hAnsi="Arial" w:cs="Arial"/>
-            </w:rPr>
-            <w:t xml:space="preserve"> non supportano i miliardi?</w:t>
+            <w:t>Il numero inserito nel json risulta essere un numero che va dal miliardo in su, ma l’applicativo lo riduce a milioni, per caso i valori int non supportano i miliardi?</w:t>
           </w:r>
           <w:r>
             <w:rPr>
@@ -14302,21 +13510,7 @@
             <w:rPr>
               <w:rFonts w:ascii="Arial" w:hAnsi="Arial" w:cs="Arial"/>
             </w:rPr>
-            <w:t xml:space="preserve">Mi ha detto che </w:t>
-          </w:r>
-          <w:proofErr w:type="spellStart"/>
-          <w:r>
-            <w:rPr>
-              <w:rFonts w:ascii="Arial" w:hAnsi="Arial" w:cs="Arial"/>
-            </w:rPr>
-            <w:t>int</w:t>
-          </w:r>
-          <w:proofErr w:type="spellEnd"/>
-          <w:r>
-            <w:rPr>
-              <w:rFonts w:ascii="Arial" w:hAnsi="Arial" w:cs="Arial"/>
-            </w:rPr>
-            <w:t xml:space="preserve"> supporta i miliardi ma che ha un massimo di circa 2,2 miliardi ed il numero risultava più grande quindi ho ripiegato su un long</w:t>
+            <w:t>Mi ha detto che int supporta i miliardi ma che ha un massimo di circa 2,2 miliardi ed il numero risultava più grande quindi ho ripiegato su un long</w:t>
           </w:r>
         </w:p>
       </w:sdtContent>
@@ -14825,21 +14019,7 @@
               <w:rPr>
                 <w:rFonts w:ascii="Arial" w:hAnsi="Arial" w:cs="Arial"/>
               </w:rPr>
-              <w:t xml:space="preserve">Ho notato come certe impostazioni non sono modificabili con variabili di </w:t>
-            </w:r>
-            <w:proofErr w:type="spellStart"/>
-            <w:r>
-              <w:rPr>
-                <w:rFonts w:ascii="Arial" w:hAnsi="Arial" w:cs="Arial"/>
-              </w:rPr>
-              <w:t>unity</w:t>
-            </w:r>
-            <w:proofErr w:type="spellEnd"/>
-            <w:r>
-              <w:rPr>
-                <w:rFonts w:ascii="Arial" w:hAnsi="Arial" w:cs="Arial"/>
-              </w:rPr>
-              <w:t xml:space="preserve"> e quindi ho usato del tempo per eseguire qualche ricerca.</w:t>
+              <w:t>Ho notato come certe impostazioni non sono modi